<commit_message>
Remove Home from mobile nav drawer, add Groups to account dropdown/drawer
Founder nav decision: the drawer is opened via the avatar and the header
logo already links home, so the Home row was redundant and is removed.
Community Groups (Decision Log #1, #281) does not get a navbar icon --
it goes into the account surface instead: a new Groups row in both
Dropdown menu/* components (after Settings, before Log out) and in the
mobile Navigation Drawer (after Settings, in the account cluster).

Also records standing policy going forward: the 7-icon navbar is closed
to new features by default, with two slots reserved for Scouting and
Academy once those Phase 2 features exist and are designed -- everything
else defaults to the account dropdown/drawer.

Decision Log #282 added; forward-pointer appended to #281 (navigation
placement, previously left open, is now resolved this way).

Co-Authored-By: Claude Sonnet 5 <noreply@anthropic.com>
</commit_message>
<xml_diff>
--- a/docs/Soccernity_MVP_Build_Plan_v1.7.docx
+++ b/docs/Soccernity_MVP_Build_Plan_v1.7.docx
@@ -21568,6 +21568,56 @@
           <w:p>
             <w:r>
               <w:t>Resolved (designed, not built). 13 new frames + a Design Notes frame on page 0:1, parked at y &gt;= 37500 (verified 0 overlaps against every existing top-level node on the page). Grouping dimensions: City, Position Played, Career Track -- exactly the three the founder named in Log Book 24.4. "Fantasy league" (named in Log Book Section 6.1's original description) was deliberately NOT added as a 4th dimension -- flagged instead as a real open question, since it's time-boxed with its own standings and reads closer to the Contest/Competition pillar than to a durable-attribute interest group. Visually distinct from both neighbouring features, confirmed by direct comparison rather than assumed: Banter Rooms browses as a full-width room-list with Filter Tabs (All/My Bants) and forum language; the existing Community main feed (DL #152) is a single authenticated feed with a composer and suggestion rails. Community Groups is instead a 3-across card-grid directory with a combinable City/Position/Career-Track filter bar (modelled on Leaderboard's own combinable-filter pattern) plus a name search, and has NO composer anywhere, even on a joined group's own page -- neither Banter nor Community frames/components were opened for edit. Screens: Browse (desktop 6450:18580 / mobile 6455:18580), Browse -- No Groups Match Filter (6452:18580 / 6456:18580), Browse -- No Groups Yet For This City (6452:18692 / 6456:18667), Group Page -- Not Joined (6453:18580 / 6457:18580), Group Page -- Joined (6454:18580 / 6458:18580), Create a Group (6454:18709 / 6458:18701), Design Notes (6459:18580). The individual group page reuses Club -- Fan Page's header+feed+roster layout pattern, but the roster's @handle line was deliberately removed (no User.username column exists, DL #58) rather than reproducing an unbacked field, and Browse's cards carry no Join button (unlike Clubs -- Browse) -- membership lives only on the group page itself. Paint audit: 854 authored paints, 854 bound, 0 unbound, 0 off-palette, 0 brand/green-tint-28, 0 new colours -- a genuine 0 with no disclosed reused-component-debt exception, since the logo-only Top Bar -- Soccernity was used as provisional chrome instead of the shared header 4 navbar (which would have pulled in that navbar's own already-disclosed avatar IMAGE-fill debt). Restricted-pending minors: applied the existing platform default (browse/read is JwtAuthGuard-only; create/join/post would need GuardianConsentGuard) per DL #21/#275/Section 5.7 -- stated explicitly as applying existing precedent, not a new rule. No group post composer was designed, even in the Joined state -- mirrors Club -- Fan Page's own no-composer state (DL #157, no scoped post-creation endpoint exists for this feature either); building one is new backend+design scope, not assumed here. FLAGGED, not decided, all recorded on the Design Notes frame: (1) who may create a group -- designed open to any consent-confirmed user, but the unbounded-user-named-public-groups spam/safeguarding surface (the same category already flagged for Banter Room creation, DL #275) is named as a real concern; (2) content moderation -- ordinary post moderation is assumed for group posts, but group NAMES are a genuinely new surface (user-authored, public, shown in a directory, not attached to a visible author the way a post is) with no existing moderation coverage; (3) group size limits -- none designed or displayed; (4) the fantasy-league 4th-dimension question above; (5) NAVIGATION PLACEMENT was deliberately NOT designed in this task and stays fully open -- there is no existing nav home (the current 7-icon desktop nav + drawer have Community and Bants but nothing for this), screens use the same provisional logo-only Top Bar Clubs -- Browse used before its own nav question was resolved (DL #156), and this needs the same explicit founder call DL #258 got for Grassroots before a figma-to-code pass can wire a nav entry -- nesting under either "Community" or "Bants" would directly contradict the founder's own DL #1 ruling that these are distinct features, so a new top-level entry is the design's own inclination, not a decision. No schema/backend exists yet for this feature -- a future backend-api pass builds the data model from what was designed here, per this project's own Grassroots precedent, not the other way around. Full detail: docs/sprint-3-community-groups-design-report.md.</w:t>
+            </w:r>
+          </w:p>
+          <w:p>
+            <w:r>
+              <w:rPr>
+                <w:i/>
+              </w:rPr>
+              <w:t>RESOLVED (navigation placement) by #282: the founder decided Community Groups does NOT get a navbar icon -- it lives in the account dropdown/drawer alongside Profile/Notification/Settings. See #282 for the full nav-surface policy this also established.</w:t>
+            </w:r>
+          </w:p>
+        </w:tc>
+      </w:tr>
+      <w:tr>
+        <w:tc>
+          <w:tcPr>
+            <w:tcW w:type="dxa" w:w="500"/>
+          </w:tcPr>
+          <w:p>
+            <w:r>
+              <w:t>282</w:t>
+            </w:r>
+          </w:p>
+        </w:tc>
+        <w:tc>
+          <w:tcPr>
+            <w:tcW w:type="dxa" w:w="4700"/>
+          </w:tcPr>
+          <w:p>
+            <w:r>
+              <w:t>Remove the redundant Home row from the mobile Navigation Drawer (the drawer opens from the avatar; the header logo already links home, DL #162), and place Community Groups (DL #1, DL #281) into the account surface -- the desktop Dropdown menu/* components and the mobile Navigation Drawer -- rather than the 7-icon navbar. Also records standing policy for where future account-adjacent features go by default, and reserves two navbar slots for Scouting and Academy (DL #3, Phase 2, still undesigned).</w:t>
+            </w:r>
+          </w:p>
+        </w:tc>
+        <w:tc>
+          <w:tcPr>
+            <w:tcW w:type="dxa" w:w="1850"/>
+          </w:tcPr>
+          <w:p>
+            <w:r>
+              <w:t>sprint-3/nav-drawer-groups-dropdown (figma-design-system, 2026-09-13)</w:t>
+            </w:r>
+          </w:p>
+        </w:tc>
+        <w:tc>
+          <w:tcPr>
+            <w:tcW w:type="dxa" w:w="2300"/>
+          </w:tcPr>
+          <w:p>
+            <w:r>
+              <w:t>Resolved. Figma design only, no app/backend code. (1) Navigation Drawer -- Mobile (5870:10689): “Nav — Home” (5870:10704) removed; every row from Community through Settings shifted up 48px to close the gap (Community 140, Sports Hub 188, Blog 236, Bants 284, Leaderboard 332, Clubs 380, Grassroots 428, Messages 476, Notifications 524, Profile 572, Settings 620). A new “Nav — Groups” row (6465:19596) was cloned from Nav — Clubs (5870:10735) -- not Grassroots -- so it inherits from the same template Grassroots' own row was itself cloned from (DL #265), rather than cloning a clone. Inserted after Settings, at y=668, per the background's “alongside Profile/Notification/Settings” placement -- the account cluster, not the content-pillar cluster. Because one row was removed above this point and one added below it, the pre-existing Space/Divider/Log-out tail (716/730/735) landed back at its exact original position with no further reflow needed -- verified, not assumed. (2) Both account dropdown components -- Dropdown menu/no notification (2841:5361) and Dropdown menu/notification on (2841:5363) -- gained a “Groups” row, each cloned from that component's own Settings row (a plain text-only row, the right shape for Groups), inserted after Settings at y=108 and before Log out (pushed to y=144); each component's height grew 142→176. The hidden “Message” row (2819:4074 / 2841:5366) was left exactly as-is, untouched and still hidden, per the brief. (3) No Figma work for Scouting or Academy -- no icons, no placeholder frames, per the brief; both remain Phase 2 / undesigned (DL #3). Standing policy recorded here for future sessions: the 7-icon Web app Navbar COMPONENT_SET (2824:4309, untouched by this PR) is closed to new features by default -- Scouting and Academy each get one of the two remaining reserved slots once they exist and are designed; everything else (a new pillar, a new account-adjacent feature) defaults to the account dropdown/drawer, following the Groups precedent this PR sets, not the navbar. Paint audit: every fill on both new nodes is a clone of an already-bound node (brand/navy text/marker fills, confirmed via boundVariables.color on both the drawer row and both dropdown rows) -- 0 unbound, 0 off-palette, 0 brand/green-tint-28, 0 new colours, Light mode only, 0 overlaps (screenshot-verified on all three components). Forward-pointer appended to #281's Status (navigation placement, previously left open, is now resolved this way). No forward-pointer needed on #3 -- it is referenced, not resolved or superseded, by the Scouting/Academy reservation recorded here.</w:t>
             </w:r>
           </w:p>
         </w:tc>

</xml_diff>

<commit_message>
Mirror the Home removal / Groups nav decision into apps/web code
navigation.ts: removed the Home entry from drawerNavItems (the drawer
opens from the avatar and the header logo already links home), and
added a disabled Groups entry (available: false, no /groups route yet)
to both accountMenuItems and drawerNavItems, after Settings -- matching
the Figma nav-surface decision (Decision Log #282) exactly.

AccountDropdown.tsx and NavDrawer.tsx are untouched: the existing
available === false disabled-row pattern already renders Groups
correctly. Nothing added for Scouting/Academy -- no route, page, or
Figma frame exists to point a placeholder at.

Decision Log #283 added; forward-pointer appended to #282 (code half
now done).

Co-Authored-By: Claude Sonnet 5 <noreply@anthropic.com>
</commit_message>
<xml_diff>
--- a/docs/Soccernity_MVP_Build_Plan_v1.7.docx
+++ b/docs/Soccernity_MVP_Build_Plan_v1.7.docx
@@ -21618,6 +21618,56 @@
           <w:p>
             <w:r>
               <w:t>Resolved. Figma design only, no app/backend code. (1) Navigation Drawer -- Mobile (5870:10689): “Nav — Home” (5870:10704) removed; every row from Community through Settings shifted up 48px to close the gap (Community 140, Sports Hub 188, Blog 236, Bants 284, Leaderboard 332, Clubs 380, Grassroots 428, Messages 476, Notifications 524, Profile 572, Settings 620). A new “Nav — Groups” row (6465:19596) was cloned from Nav — Clubs (5870:10735) -- not Grassroots -- so it inherits from the same template Grassroots' own row was itself cloned from (DL #265), rather than cloning a clone. Inserted after Settings, at y=668, per the background's “alongside Profile/Notification/Settings” placement -- the account cluster, not the content-pillar cluster. Because one row was removed above this point and one added below it, the pre-existing Space/Divider/Log-out tail (716/730/735) landed back at its exact original position with no further reflow needed -- verified, not assumed. (2) Both account dropdown components -- Dropdown menu/no notification (2841:5361) and Dropdown menu/notification on (2841:5363) -- gained a “Groups” row, each cloned from that component's own Settings row (a plain text-only row, the right shape for Groups), inserted after Settings at y=108 and before Log out (pushed to y=144); each component's height grew 142→176. The hidden “Message” row (2819:4074 / 2841:5366) was left exactly as-is, untouched and still hidden, per the brief. (3) No Figma work for Scouting or Academy -- no icons, no placeholder frames, per the brief; both remain Phase 2 / undesigned (DL #3). Standing policy recorded here for future sessions: the 7-icon Web app Navbar COMPONENT_SET (2824:4309, untouched by this PR) is closed to new features by default -- Scouting and Academy each get one of the two remaining reserved slots once they exist and are designed; everything else (a new pillar, a new account-adjacent feature) defaults to the account dropdown/drawer, following the Groups precedent this PR sets, not the navbar. Paint audit: every fill on both new nodes is a clone of an already-bound node (brand/navy text/marker fills, confirmed via boundVariables.color on both the drawer row and both dropdown rows) -- 0 unbound, 0 off-palette, 0 brand/green-tint-28, 0 new colours, Light mode only, 0 overlaps (screenshot-verified on all three components). Forward-pointer appended to #281's Status (navigation placement, previously left open, is now resolved this way). No forward-pointer needed on #3 -- it is referenced, not resolved or superseded, by the Scouting/Academy reservation recorded here.</w:t>
+            </w:r>
+          </w:p>
+          <w:p>
+            <w:r>
+              <w:rPr>
+                <w:i/>
+              </w:rPr>
+              <w:t>Code half done -- see #283 (sprint-3/nav-groups-code): navigation.ts / AccountDropdown.tsx / NavDrawer.tsx now mirror this Figma edit exactly.</w:t>
+            </w:r>
+          </w:p>
+        </w:tc>
+      </w:tr>
+      <w:tr>
+        <w:tc>
+          <w:tcPr>
+            <w:tcW w:type="dxa" w:w="500"/>
+          </w:tcPr>
+          <w:p>
+            <w:r>
+              <w:t>283</w:t>
+            </w:r>
+          </w:p>
+        </w:tc>
+        <w:tc>
+          <w:tcPr>
+            <w:tcW w:type="dxa" w:w="4700"/>
+          </w:tcPr>
+          <w:p>
+            <w:r>
+              <w:t>Mirror #282's Figma nav-surface decision into apps/web code -- remove the Home entry from drawerNavItems, add a disabled Groups entry to both accountMenuItems and drawerNavItems, matching the "available: false, flip once the route exists" precedent already established for Grassroots/Messages/Notifications.</w:t>
+            </w:r>
+          </w:p>
+        </w:tc>
+        <w:tc>
+          <w:tcPr>
+            <w:tcW w:type="dxa" w:w="1850"/>
+          </w:tcPr>
+          <w:p>
+            <w:r>
+              <w:t>sprint-3/nav-groups-code (figma-to-code, 2026-09-13)</w:t>
+            </w:r>
+          </w:p>
+        </w:tc>
+        <w:tc>
+          <w:tcPr>
+            <w:tcW w:type="dxa" w:w="2300"/>
+          </w:tcPr>
+          <w:p>
+            <w:r>
+              <w:t>Resolved. apps/web only, no Figma/backend code. navigation.ts: removed { label: "Home", to: "/" } from drawerNavItems (the drawer opens from the avatar and the header logo already links home, so nothing else in the app depended on this entry -- grep-confirmed, only Header.test.tsx referenced it). Added { label: "Groups", to: "/groups", available: false } to accountMenuItems (after Settings) and to drawerNavItems (after Settings, at the end of the array -- Log out is rendered separately below it in both AccountDropdown.tsx and NavDrawer.tsx), matching #282's own Figma placement exactly. available: false because DL #281 is design-only -- no /groups route exists in router.tsx -- same precedent already used for Grassroots/Messages/Notifications while their routes were pending. Deliberately did NOT touch AccountDropdown.tsx or NavDrawer.tsx's rendering logic -- the existing available === false disabled-row branch (a non-navigating, aria-disabled span, Decision Log #166's pattern) already renders Groups correctly with zero code change to either component. Deliberately added nothing for Scouting or Academy -- neither has a route, a page, or a Figma frame to point a placeholder at. Header.test.tsx updated: the canonical drawer-order assertion drops Home and appends Groups after Settings; three new tests confirm Home is gone ("does NOT have a Home row"), and that Groups renders disabled and pointed at /groups in both the drawer and the account dropdown; the two existing rendering tests ("opens the account dropdown...", "opens the Navigation Drawer...") were each extended with a Groups assertion rather than duplicated. Verified: apps/web vitest -- 36 suites / 247 tests, 0 failures (up from 36/244 -- 3 new tests, no existing test removed); npx tsc --noEmit clean; npm run lint clean; npm run build clean production bundle. Dev-server smoke test: /, /community, /clubs, /grassroots all HTTP 200, clean log -- /groups itself was not requested since no route was added for it, by design (DL #281 is design-only). No real browser/Playwright check available in this environment -- same verification ceiling as every prior apps/web PR. Forward-pointer appended to #282's Status.</w:t>
             </w:r>
           </w:p>
         </w:tc>

</xml_diff>

<commit_message>
Wire Scouting/Academy navbar icons and build the Coming Soon page
Code half of Decision Log #284 (navbar icons) and #285 (reusable Coming
Soon template) -- apps/web only, no Figma/backend code.

- Export the real Scouting/Academy glyph SVGs and a Coming Soon icon
  disc directly from Figma, matching the existing nav-*.svg convention.
- Add Scouting and Academy to primaryNavItems (navigation.ts) as real,
  available entries after Grassroots -- navbar only, not the mobile
  drawer or account dropdown, per standing policy.
- Add one reusable ComingSoonPage component (a featureName prop is its
  only variable content) and route /scouting + /academy to it under
  FooterLayout, matching the Figma frames' canonical site footer.
- Update Header.test.tsx / router.test.tsx for the 9-icon nav and the
  two new routes.
- Decision Log #286 (Build Plan Section 9); forward-pointers on #284
  and #285. CLAUDE.md status bullet added.

Co-Authored-By: Claude Sonnet 5 <noreply@anthropic.com>
</commit_message>
<xml_diff>
--- a/docs/Soccernity_MVP_Build_Plan_v1.7.docx
+++ b/docs/Soccernity_MVP_Build_Plan_v1.7.docx
@@ -21709,7 +21709,7 @@
           </w:tcPr>
           <w:p>
             <w:r>
-              <w:t xml:space="preserve">Resolved. Figma design only, no app/backend code. Verified directly before any edit — Frame 5858 (the icon row) is genuine HORIZONTAL auto-layout (HUG x HUG, itemSpacing 30) on both live variants, header 4 (2838:3502) and header 7 (2841:4104), confirming rather than assuming the DL #272 Grassroots precedent transfers; also confirmed the two variants are protected from overflow by two DIFFERENT mechanisms, not the same one — header 4's root uses primaryAxisAlignItems SPACE_BETWEEN against a fixed 1440 width, so the AUTO-positioned avatar cluster (Frame 5880) stays pinned to the right as the icon row's gap shrinks; header 7's Login button (Frame 5805) is layoutPositioning ABSOLUTE, fully decoupled from the row's flow. Built two new tinted-style icons (31x31 brand/green-tint @12% tile + 24x24 brand/navy-stroke glyph, matching Clubs (DL #159) and Grassroots (DL #272) exactly, not the five baked-in-artwork icons) — Scouting: binoculars; Academy: graduation cap with tassel. Constructed via figma.createNodeFromSvg (the DL #159 Apple-mark precedent), then every descendant vector/ellipse re-bound to VariableID:5096:4 (brand/navy) for strokes and VariableID:5096:5 (brand/green-tint) for the tile fill — never left as literal, unbound colour, per the standing createVector/createNodeFromSvg unbound-stroke gotcha. Appended last, after Grassroots, on both Frame 5858 instances (2838:3517 on header 4, 2841:4115 on header 7) — order now: Sports Hub . Blog . Community . Leaderboard . Bants . Clubs . Grassroots . Scouting . Academy. Row grew 444.41 -&gt; 566.41px on both variants (two tiles x (31 + 30 spacing) = 122px, exactly as predicted before building). Clearance re-measured after growth, not assumed: header 4 clearance to the avatar cluster 309.3px -&gt; 187.3px; header 7 clearance to the Login button ~290px -&gt; 168.0px — both confirmed clean via full-navbar screenshots (no overlap, no clipping). Propagation verified across all 8 live header 7 instances and a diverse 7-frame sample of the 95 live header 4 instances (Settings, Create Post, Leaderboard, Contest, Grassroots, Sports Page, Homepage, Blog, Article Detail, the 3 Legal pages) — all show the two new icons in the correct order with an identical 566.41px row width; the one instance that did not (inside the already-archived, hidden 'ARCHIVED — Blog Page Desktop (superseded by ...)' frame) is pre-existing, out-of-scope archived content, confirmed hidden and unrelated to this edit, not a propagation gap. Zero stray top-level nodes left on the page after construction (group-then-appendChild fully reparents, confirmed). Both icons route to a Coming Soon destination once figma-screen-builder designs that screen in its own separate, parallel task — this PR adds icons only, does not touch the mobile Navigation Drawer or the account dropdown (Scouting/Academy are navbar-only, unlike Community Groups, DL #282), and does not touch Discover- or Careers-pillar schema/backend, per non-negotiable #4 and DL #3. Standing policy confirmed in writing: the 9-icon Web app Navbar COMPONENT_SET is now fully populated and closed to further additions by default — Scouting and Academy were its last two reserved slots (per the standing nav policy DL #282 first recorded); any future pillar or account-adjacent feature defaults to the account dropdown/drawer (the Community Groups precedent, DL #282), not the navbar.</w:t>
+              <w:t>Resolved. Figma design only, no app/backend code. Verified directly before any edit — Frame 5858 (the icon row) is genuine HORIZONTAL auto-layout (HUG x HUG, itemSpacing 30) on both live variants, header 4 (2838:3502) and header 7 (2841:4104), confirming rather than assuming the DL #272 Grassroots precedent transfers; also confirmed the two variants are protected from overflow by two DIFFERENT mechanisms, not the same one — header 4's root uses primaryAxisAlignItems SPACE_BETWEEN against a fixed 1440 width, so the AUTO-positioned avatar cluster (Frame 5880) stays pinned to the right as the icon row's gap shrinks; header 7's Login button (Frame 5805) is layoutPositioning ABSOLUTE, fully decoupled from the row's flow. Built two new tinted-style icons (31x31 brand/green-tint @12% tile + 24x24 brand/navy-stroke glyph, matching Clubs (DL #159) and Grassroots (DL #272) exactly, not the five baked-in-artwork icons) — Scouting: binoculars; Academy: graduation cap with tassel. Constructed via figma.createNodeFromSvg (the DL #159 Apple-mark precedent), then every descendant vector/ellipse re-bound to VariableID:5096:4 (brand/navy) for strokes and VariableID:5096:5 (brand/green-tint) for the tile fill — never left as literal, unbound colour, per the standing createVector/createNodeFromSvg unbound-stroke gotcha. Appended last, after Grassroots, on both Frame 5858 instances (2838:3517 on header 4, 2841:4115 on header 7) — order now: Sports Hub . Blog . Community . Leaderboard . Bants . Clubs . Grassroots . Scouting . Academy. Row grew 444.41 -&gt; 566.41px on both variants (two tiles x (31 + 30 spacing) = 122px, exactly as predicted before building). Clearance re-measured after growth, not assumed: header 4 clearance to the avatar cluster 309.3px -&gt; 187.3px; header 7 clearance to the Login button ~290px -&gt; 168.0px — both confirmed clean via full-navbar screenshots (no overlap, no clipping). Propagation verified across all 8 live header 7 instances and a diverse 7-frame sample of the 95 live header 4 instances (Settings, Create Post, Leaderboard, Contest, Grassroots, Sports Page, Homepage, Blog, Article Detail, the 3 Legal pages) — all show the two new icons in the correct order with an identical 566.41px row width; the one instance that did not (inside the already-archived, hidden 'ARCHIVED — Blog Page Desktop (superseded by ...)' frame) is pre-existing, out-of-scope archived content, confirmed hidden and unrelated to this edit, not a propagation gap. Zero stray top-level nodes left on the page after construction (group-then-appendChild fully reparents, confirmed). Both icons route to a Coming Soon destination once figma-screen-builder designs that screen in its own separate, parallel task — this PR adds icons only, does not touch the mobile Navigation Drawer or the account dropdown (Scouting/Academy are navbar-only, unlike Community Groups, DL #282), and does not touch Discover- or Careers-pillar schema/backend, per non-negotiable #4 and DL #3. Standing policy confirmed in writing: the 9-icon Web app Navbar COMPONENT_SET is now fully populated and closed to further additions by default — Scouting and Academy were its last two reserved slots (per the standing nav policy DL #282 first recorded); any future pillar or account-adjacent feature defaults to the account dropdown/drawer (the Community Groups precedent, DL #282), not the navbar. CODE HALF DONE -- see #286: sprint-3/coming-soon-scouting-academy-to-code mirrors this icon placement into apps/web/src/layout/navigation.ts (primaryNavItems), routing both icons to a shared ComingSoonPage.</w:t>
             </w:r>
           </w:p>
         </w:tc>
@@ -21751,7 +21751,49 @@
           </w:tcPr>
           <w:p>
             <w:r>
-              <w:t xml:space="preserve">Resolved. Figma design only, no app/backend code. Five new frames parked at y &gt;= 40000 on page 0:1 (clear of the Community Groups mobile row, the prior bottommost content): Coming Soon — Desktop — Logged In (header 4 navbar, 1440x1005), Coming Soon — Desktop — Logged Out (cloned, navbar swapped to header 7), Coming Soon — Mobile — Logged In (header 4 — mobile navbar, built fresh at mobile scale, 390x980), Coming Soon — Mobile — Logged Out (cloned, navbar swapped to header 7 — mobile), and a Coming Soon — Design Notes annotation frame. Four screens, not two — the task's literal ask was desktop + mobile, but the Scouting/Academy icons exist on BOTH header 4 and header 7 (DL #284), and every other page reachable from both navbar states in this file (Blog, Article Detail, Sports Hub, the 3 Legal pages) gets the full auth-state x breakpoint split -- building only two frames would have made this the one inconsistent page in the file, so the full split was built instead, flagged rather than silently decided. Content, identical across all four and genuinely generic: a neutral tinted clock-glyph icon (not a feature illustration), a fixed COMING SOON badge pill, the ONE variable slot -- a text layer named 'Feature Name', set to 'Scouting' as the worked example -- a fixed generic sub-line ('This feature is part of our Phase 2 roadmap and isn't built yet. Check back soon.'), and a generic 'Back to Soccernity' CTA button. No fake screenshots or fabricated feature previews were designed for either pillar -- there is nothing to show yet, per this task's own scope boundary and non-negotiable #4. Uses the REAL shared site chrome -- Navbar header 4/header 7 (desktop) and header 4 — mobile/header 7 — mobile, plus the canonical Footer (5213:6816 desktop / 5543:7662 mobile, cloned) -- not the logo-only provisional Top Bar Grassroots/Community Groups used before their nav placement was decided (DL #258/#282), since this screen is reachable from the real navbar today. A real bug was found and fixed during the build, not inherited: the mobile Navbar component (header 4 — mobile / header 7 — mobile) is natively 428px wide, not the canonical 390px (DL #86) -- both mobile frames initially overflowed (Login button and avatar/messages cluster clipped past the frame edge), caught by screenshot, fixed by explicitly resizing each navbar instance to 390x64 after creation, confirmed via re-screenshot -- called out in the Design Notes frame as a step any future page cloning this navbar must not skip. Not wired, and correctly so: neither navbar icon has a prototype NAVIGATE reaction to this screen -- the scouting/academy icon groups (DL #284) live inside the header 4/header 7 MASTER COMPONENTS, not instances, and Figma rejects NAVIGATE reactions on COMPONENT descendants (DL #249) -- routing for these icons is code-side (apps/web/src/layout/navigation.ts), matching how every other navbar icon already works, noted explicitly so it isn't mistaken for a gap. Verified: zero overlaps via a strict pairwise AABB test against all 559 existing top-level page nodes plus among the 5 new frames (one real overlap found between the Design Notes frame and Desktop — Logged Out, fixed by repositioning, re-verified clean); 0 unbound / 0 off-palette SOLID paints across the 4 shipped screens (the Design Notes frame's own 10 unbound paints are expected and out of scope -- annotation content, not shipped UI, per this file's established precedent); 0 brand/green-tint-28; Light mode only, no new colour. Full detail in docs/sprint-3-coming-soon-screen-report.md.</w:t>
+              <w:t>Resolved. Figma design only, no app/backend code. Five new frames parked at y &gt;= 40000 on page 0:1 (clear of the Community Groups mobile row, the prior bottommost content): Coming Soon — Desktop — Logged In (header 4 navbar, 1440x1005), Coming Soon — Desktop — Logged Out (cloned, navbar swapped to header 7), Coming Soon — Mobile — Logged In (header 4 — mobile navbar, built fresh at mobile scale, 390x980), Coming Soon — Mobile — Logged Out (cloned, navbar swapped to header 7 — mobile), and a Coming Soon — Design Notes annotation frame. Four screens, not two — the task's literal ask was desktop + mobile, but the Scouting/Academy icons exist on BOTH header 4 and header 7 (DL #284), and every other page reachable from both navbar states in this file (Blog, Article Detail, Sports Hub, the 3 Legal pages) gets the full auth-state x breakpoint split -- building only two frames would have made this the one inconsistent page in the file, so the full split was built instead, flagged rather than silently decided. Content, identical across all four and genuinely generic: a neutral tinted clock-glyph icon (not a feature illustration), a fixed COMING SOON badge pill, the ONE variable slot -- a text layer named 'Feature Name', set to 'Scouting' as the worked example -- a fixed generic sub-line ('This feature is part of our Phase 2 roadmap and isn't built yet. Check back soon.'), and a generic 'Back to Soccernity' CTA button. No fake screenshots or fabricated feature previews were designed for either pillar -- there is nothing to show yet, per this task's own scope boundary and non-negotiable #4. Uses the REAL shared site chrome -- Navbar header 4/header 7 (desktop) and header 4 — mobile/header 7 — mobile, plus the canonical Footer (5213:6816 desktop / 5543:7662 mobile, cloned) -- not the logo-only provisional Top Bar Grassroots/Community Groups used before their nav placement was decided (DL #258/#282), since this screen is reachable from the real navbar today. A real bug was found and fixed during the build, not inherited: the mobile Navbar component (header 4 — mobile / header 7 — mobile) is natively 428px wide, not the canonical 390px (DL #86) -- both mobile frames initially overflowed (Login button and avatar/messages cluster clipped past the frame edge), caught by screenshot, fixed by explicitly resizing each navbar instance to 390x64 after creation, confirmed via re-screenshot -- called out in the Design Notes frame as a step any future page cloning this navbar must not skip. Not wired, and correctly so: neither navbar icon has a prototype NAVIGATE reaction to this screen -- the scouting/academy icon groups (DL #284) live inside the header 4/header 7 MASTER COMPONENTS, not instances, and Figma rejects NAVIGATE reactions on COMPONENT descendants (DL #249) -- routing for these icons is code-side (apps/web/src/layout/navigation.ts), matching how every other navbar icon already works, noted explicitly so it isn't mistaken for a gap. Verified: zero overlaps via a strict pairwise AABB test against all 559 existing top-level page nodes plus among the 5 new frames (one real overlap found between the Design Notes frame and Desktop — Logged Out, fixed by repositioning, re-verified clean); 0 unbound / 0 off-palette SOLID paints across the 4 shipped screens (the Design Notes frame's own 10 unbound paints are expected and out of scope -- annotation content, not shipped UI, per this file's established precedent); 0 brand/green-tint-28; Light mode only, no new colour. Full detail in docs/sprint-3-coming-soon-screen-report.md. CODE HALF DONE -- see #286: sprint-3/coming-soon-scouting-academy-to-code converts this template into a real, reusable apps/web ComingSoonPage component, routed at /scouting and /academy.</w:t>
+            </w:r>
+          </w:p>
+        </w:tc>
+      </w:tr>
+      <w:tr>
+        <w:tc>
+          <w:tcPr>
+            <w:tcW w:type="dxa" w:w="500"/>
+          </w:tcPr>
+          <w:p>
+            <w:r>
+              <w:t>286</w:t>
+            </w:r>
+          </w:p>
+        </w:tc>
+        <w:tc>
+          <w:tcPr>
+            <w:tcW w:type="dxa" w:w="4700"/>
+          </w:tcPr>
+          <w:p>
+            <w:r>
+              <w:t>Wire the Scouting/Academy navbar icons (Decision Log #284) to a real destination, and convert the reusable Coming Soon screen (Decision Log #285) into apps/web code -- the code half of both design tasks, closing the loop the two navbar icons and their shared template left open.</w:t>
+            </w:r>
+          </w:p>
+        </w:tc>
+        <w:tc>
+          <w:tcPr>
+            <w:tcW w:type="dxa" w:w="1850"/>
+          </w:tcPr>
+          <w:p>
+            <w:r>
+              <w:t>sprint-3/coming-soon-scouting-academy-to-code (figma-to-code, 2026-09-13)</w:t>
+            </w:r>
+          </w:p>
+        </w:tc>
+        <w:tc>
+          <w:tcPr>
+            <w:tcW w:type="dxa" w:w="2300"/>
+          </w:tcPr>
+          <w:p>
+            <w:r>
+              <w:t>Resolved (built). apps/web only, no Figma/backend code touched. Read both Decision Log #284/#285 entries and the fileKey/node IDs before writing any code, per this project's standing discipline. Exported the real Scouting/Academy glyph SVGs directly from the shared Web app Navbar COMPONENT_SET (nodes 6472:18581 / 6472:18589) as nav-scouting.svg / nav-academy.svg -- matching nav-clubs.svg / nav-grassroots.svg's exact convention, never hand-drawn. navigation.ts's primaryNavItems gained two real entries (available by default, not `available: false`), Scouting -&gt; /scouting and Academy -&gt; /academy, tinted, appended after Grassroots -- the exact order Decision Log #284 landed in Figma. Confirmed the standing nav policy: NOT added to the mobile Navigation Drawer or the account dropdown -- navbar only, matching how Scouting/Academy were deliberately excluded from those two surfaces in #284/#282's own reasoning (unlike Community Groups). One new reusable ComingSoonPage component (apps/web/src/pages/ComingSoonPage.tsx), converted from Decision Log #285's four Figma frames (6477:20050/20402/20677/20764) -- icon disc, COMING SOON badge, feature-name heading, the fixed generic sub-line verbatim from the frame's own text node, and a 'Back to Soccernity' CTA -- with a `featureName` prop as its only variable content, exactly per the brief: ONE component, not two duplicated page files. The icon disc SVG (coming-soon-icon.svg) was exported from the Figma node (6477:20165), not hand-drawn. Two routes in router.tsx, /scouting and /academy, both render &lt;ComingSoonPage featureName=.../&gt; -- configured differently, same component. Both nested under FooterLayout, not a direct AppShell child: the Coming Soon Figma frames carry the canonical site footer (Decision Log #209/#210/#213), the same reason Home/Sports Hub/Blog/Article Detail sit there -- FooterLayout.tsx's own route-list comment and router.test.tsx's FooterLayout-membership test were both updated to include them. No login gate on either route -- like Blog/Sports Hub, the Figma content is identical regardless of auth state, and the shared Header already renders the correct logged-in/out chrome; a Coming Soon page has nothing that depends on the caller's identity. Header.test.tsx updated for the new 9-icon canonical order (was 7) and gained dedicated cases: Scouting/Academy are the last two items, both tinted, pointing at /scouting and /academy; neither appears in drawerNavItems or accountMenuItems. Verified, all re-run in this session, none estimated: apps/web vitest -- 37 files / 255 tests, 0 failures (up from 36/253 -- new ComingSoonPage.test.tsx, 4 cases; router.test.tsx +3; Header.test.tsx net +2, no existing test removed); `npx tsc --noEmit` clean; `npm run lint` clean; `npm run build` clean production bundle. Dev-server smoke test: /, /scouting, /academy, /sports-hub, /community, /clubs all real HTTP 200, clean log; the built page for /scouting was also fetched directly and confirmed to render the real app shell (&lt;title&gt;Soccernity&lt;/title&gt;). No real browser/Playwright check available in this environment -- same verification ceiling as every prior apps/web figma-to-code PR.</w:t>
             </w:r>
           </w:p>
         </w:tc>

</xml_diff>

<commit_message>
Remove Nav — Profile row from mobile drawer; fold into Signed in as
Founder decision: reclaim a row in Navigation Drawer — Mobile by making
the "Signed in as" identity block the profile entry point itself,
instead of a separate Nav — Profile row. Figma design only.

Checked live rather than trusting the brief: no row in this drawer
actually carries a NAVIGATE reaction today (the DL #249 per-instance
convention lives on a different component family), and the old
"Profile 1" node has since been renamed and is no longer a real
destination — wired the new reaction to the real Community — Profile
— Mobile frame instead. Decision Log #287.

Co-Authored-By: Claude Sonnet 5 <noreply@anthropic.com>
</commit_message>
<xml_diff>
--- a/docs/Soccernity_MVP_Build_Plan_v1.7.docx
+++ b/docs/Soccernity_MVP_Build_Plan_v1.7.docx
@@ -21794,6 +21794,48 @@
           <w:p>
             <w:r>
               <w:t>Resolved (built). apps/web only, no Figma/backend code touched. Read both Decision Log #284/#285 entries and the fileKey/node IDs before writing any code, per this project's standing discipline. Exported the real Scouting/Academy glyph SVGs directly from the shared Web app Navbar COMPONENT_SET (nodes 6472:18581 / 6472:18589) as nav-scouting.svg / nav-academy.svg -- matching nav-clubs.svg / nav-grassroots.svg's exact convention, never hand-drawn. navigation.ts's primaryNavItems gained two real entries (available by default, not `available: false`), Scouting -&gt; /scouting and Academy -&gt; /academy, tinted, appended after Grassroots -- the exact order Decision Log #284 landed in Figma. Confirmed the standing nav policy: NOT added to the mobile Navigation Drawer or the account dropdown -- navbar only, matching how Scouting/Academy were deliberately excluded from those two surfaces in #284/#282's own reasoning (unlike Community Groups). One new reusable ComingSoonPage component (apps/web/src/pages/ComingSoonPage.tsx), converted from Decision Log #285's four Figma frames (6477:20050/20402/20677/20764) -- icon disc, COMING SOON badge, feature-name heading, the fixed generic sub-line verbatim from the frame's own text node, and a 'Back to Soccernity' CTA -- with a `featureName` prop as its only variable content, exactly per the brief: ONE component, not two duplicated page files. The icon disc SVG (coming-soon-icon.svg) was exported from the Figma node (6477:20165), not hand-drawn. Two routes in router.tsx, /scouting and /academy, both render &lt;ComingSoonPage featureName=.../&gt; -- configured differently, same component. Both nested under FooterLayout, not a direct AppShell child: the Coming Soon Figma frames carry the canonical site footer (Decision Log #209/#210/#213), the same reason Home/Sports Hub/Blog/Article Detail sit there -- FooterLayout.tsx's own route-list comment and router.test.tsx's FooterLayout-membership test were both updated to include them. No login gate on either route -- like Blog/Sports Hub, the Figma content is identical regardless of auth state, and the shared Header already renders the correct logged-in/out chrome; a Coming Soon page has nothing that depends on the caller's identity. Header.test.tsx updated for the new 9-icon canonical order (was 7) and gained dedicated cases: Scouting/Academy are the last two items, both tinted, pointing at /scouting and /academy; neither appears in drawerNavItems or accountMenuItems. Verified, all re-run in this session, none estimated: apps/web vitest -- 37 files / 255 tests, 0 failures (up from 36/253 -- new ComingSoonPage.test.tsx, 4 cases; router.test.tsx +3; Header.test.tsx net +2, no existing test removed); `npx tsc --noEmit` clean; `npm run lint` clean; `npm run build` clean production bundle. Dev-server smoke test: /, /scouting, /academy, /sports-hub, /community, /clubs all real HTTP 200, clean log; the built page for /scouting was also fetched directly and confirmed to render the real app shell (&lt;title&gt;Soccernity&lt;/title&gt;). No real browser/Playwright check available in this environment -- same verification ceiling as every prior apps/web figma-to-code PR.</w:t>
+            </w:r>
+          </w:p>
+        </w:tc>
+      </w:tr>
+      <w:tr>
+        <w:tc>
+          <w:tcPr>
+            <w:tcW w:type="dxa" w:w="500"/>
+          </w:tcPr>
+          <w:p>
+            <w:r>
+              <w:t>287</w:t>
+            </w:r>
+          </w:p>
+        </w:tc>
+        <w:tc>
+          <w:tcPr>
+            <w:tcW w:type="dxa" w:w="4700"/>
+          </w:tcPr>
+          <w:p>
+            <w:r>
+              <w:t>Remove the standalone "Nav -- Profile" row from Navigation Drawer -- Mobile (5870:10689); make the "Signed in as" identity block (avatar + name + @handle, 5870:10697) the profile entry point itself.</w:t>
+            </w:r>
+          </w:p>
+        </w:tc>
+        <w:tc>
+          <w:tcPr>
+            <w:tcW w:type="dxa" w:w="1850"/>
+          </w:tcPr>
+          <w:p>
+            <w:r>
+              <w:t>figma-design-system/nav-drawer-profile-entry-point (figma-design-system, 2026-09-13)</w:t>
+            </w:r>
+          </w:p>
+        </w:tc>
+        <w:tc>
+          <w:tcPr>
+            <w:tcW w:type="dxa" w:w="2300"/>
+          </w:tcPr>
+          <w:p>
+            <w:r>
+              <w:t>Resolved. Figma design only, no app/backend code. Founder decision: reclaim a row in the mobile drawer by folding Profile navigation into the existing "Signed in as" block, the same "reclaim space" reasoning as the earlier Home-row removal (Decision Log #231). Verified live before editing, not assumed: Panel (5870:10692) is genuine VERTICAL auto-layout (itemSpacing 4, primaryAxisSizingMode FIXED, height 844), so deleting "Nav -- Profile" (5870:10725) reflowed every row below it upward by 48px automatically -- Community 188 to 140 through Log out 735 to 687 -- with no manual repositioning. Panel child count 19 to 18. A premise in this task's own brief was checked and found inaccurate rather than trusted: it described every other row in this drawer as already carrying per-instance NAVIGATE reactions (the DL #249 convention). Live inspection of both the master component and its one live instance (5874:10690, inside "Community -- Home Feed (Navigation Drawer Open) -- Mobile") found zero reactions on every nav row -- Profile, Community, Clubs, Grassroots, Groups, Settings, Log out all carried reactions: []. That per-instance-override convention is real, but lives on a different component family (the desktop Settings Shell / account dropdown / Navbar avatar, DL #100/#101/#249) -- not this drawer, whose rows are visual-only in Figma with real routing implemented in apps/web code. Also found: the old "Profile 1" node id (1455:4362) cited in this project's own history has since been renamed to "User's post feed" and is no longer a top-level Profile screen -- the real mobile Profile destination is "Community -- Profile -- Mobile" (5702:8250). Given no existing per-row wiring to match, an ON_CLICK to NAVIGATE reaction targeting 5702:8250 was added as a fresh, disclosed instance override on the one live instance's "Signed in as" node (I5874:10690;5870:10697) -- confirmed persisted via a fresh read after the write. Flagged, not silently absorbed: because NAVIGATE reactions cannot be set on a COMPONENT's own descendants (the same DL #249 limitation), this wiring lives only on the one existing instance -- any future new instance of this drawer master will need the identical override reapplied by hand, the same limitation already documented for the desktop avatar to dropdown wiring (DL #100/#101). Desktop account dropdown untouched -- it has no equivalent "Signed in as" block to fold Profile into, so Profile stays its own row there. Every other row's order in this drawer left exactly as the founder had already rearranged it. Verified via a screenshot of the full drawer instance: clean reflow, no gaps, no overlaps, Community still showing active (expected -- this instance lives inside the Community home-feed screen).</w:t>
             </w:r>
           </w:p>
         </w:tc>

</xml_diff>

<commit_message>
Build the Notifications read-side (Section 4.7)
GET /notifications, GET /notifications/unread-count, PATCH
/notifications/:id/read, PATCH /notifications/read-all — the read side
of the 7 notification triggers already wired (Decision Log #87/#278).

Resolves the design problem (payloadRefId has no FK/actor) via option
(a): batched server-side resolution into structured per-type data, never
one query per row, never pre-rendered copy. Flags a real, disclosed,
not-fixed-here gap: like/comment notifications have no actor anywhere in
the schema, since fixing that would touch the trigger call sites this
PR's scope excludes.

None of the 7 existing trigger call sites touched. No Figma/apps/web
code touched. Mocked suite: 52/738 -> 54/764, 0 failures.

Decision Log #290 (Build Plan Section 9). CLAUDE.md status bullet added.

Co-Authored-By: Claude Sonnet 5 <noreply@anthropic.com>
</commit_message>
<xml_diff>
--- a/docs/Soccernity_MVP_Build_Plan_v1.7.docx
+++ b/docs/Soccernity_MVP_Build_Plan_v1.7.docx
@@ -21923,6 +21923,52 @@
           <w:p>
             <w:r>
               <w:t>Resolved. Figma design only, no app/backend code touched. All 12 Community Groups frames (Browse, Browse – No Groups Match Filter, Browse – No Groups Yet for This City, Group Page – Not Joined, Group Page – Joined, Create a Group, each desktop + mobile) had their provisional "Top Bar — Soccernity" frame (logo-only, 1440×90 desktop / 390×64 mobile) deleted and replaced with a real instance of the current Navbar COMPONENT_SET (2824:4309): header 4 (2838:3502, 1440×90) on desktop, header 4 — mobile (5386:6576, natively 428×64, resized to 390×64 matching the sprint-3/coming-soon-scouting-academy-to-code precedent) on mobile — the logged-in variant only on all 12, not a Logged-In/Logged-Out split. Judgment call, disclosed rather than silently decided: Community Groups’ own Design Notes state the restricted-pending-minor precedent applies (JwtAuthGuard-only, login-required), matching Clubs/Grassroots, neither of which got a Logged-Out variant either — if a Logged-Out split is wanted instead, that is a 24-frame follow-up, not done here. The real Navbar carries all 9 nav icons (Sports Hub, Blog, Community, Leaderboard, Bants, Clubs, Grassroots, Scouting, Academy — post-#272/#284/#286) and confirms zero Groups icon belongs there, consistent with #282. Height match verified, not assumed: the provisional Top Bar and the real Navbar are identically 90px (desktop) / 64px (mobile) tall on every one of the 12 frames — confirmed via metadata before any write, then re-confirmed after the swap via a node-by-node bounding-box check on all 12 (zero overlap between Navbar and Content Column/Content on every frame, exactly 2 children per frame post-swap, no orphan nodes left behind). No manual repositioning of any frame’s content was needed or performed. The avatar-opens-account-dropdown wiring (Decision Log #100/#101) was deliberately NOT added to any of the 12 new instances — consistent with file-wide norm (only 2 of ~95+ header 4/header 4 — mobile instances file-wide carry that per-instance override; every other instance, including these 12, shows the avatar without click-to-dropdown behavior), not a new gap this PR introduced. Visually verified via screenshots on all 12 frames: clean render, no clipping or overlap on the search bar, filter controls, empty states, group identity block, feed, member roster, or Create a Group form on any frame. Grassroots (already using the real Navbar per its own PR reports, not the provisional Top Bar pattern) and Banter Rooms were checked in passing per this task’s own instruction and were NOT found to still be using the provisional pattern — nothing to flag there. The Navbar component itself, Grassroots, Banter, and all Community Groups content below the chrome (Group Grid, Filter Bar, Group Feed, Members roster, Create-a-Group form) were left untouched.</w:t>
+            </w:r>
+          </w:p>
+        </w:tc>
+      </w:tr>
+      <w:tr>
+        <w:tc>
+          <w:tcPr>
+            <w:tcW w:type="dxa" w:w="500"/>
+          </w:tcPr>
+          <w:p>
+            <w:r/>
+            <w:r>
+              <w:t>290</w:t>
+            </w:r>
+          </w:p>
+        </w:tc>
+        <w:tc>
+          <w:tcPr>
+            <w:tcW w:type="dxa" w:w="4700"/>
+          </w:tcPr>
+          <w:p>
+            <w:r/>
+            <w:r>
+              <w:t>GET /notifications must render each Notification row (payloadRefId is a bare, type-dependent string with no FK and no stored actor) into something a client can show. Chosen: option (a) — server-side resolution, batched by type (&gt;=5 queries per page max, never N+1), returning a type-specific structured `data` object (not pre-rendered English — copy stays a frontend concern, per the already-finalized Notification Centre design, Decision Log #279). Pagination reuses the (createdAt desc, id desc) keyset shape every other list endpoint in this codebase uses, as this module's own copy (not a cross-module import), matching the established per-module-cursor convention. unreadCount is returned two ways: inline on GET /notifications (one extra COUNT query, for the Notification Centre page itself) and via a dedicated GET /notifications/unread-count (for the Navbar badge, which renders on every page and should not pay for a resolved 20-item page just to show a count). PATCH /notifications/:id/read and PATCH /notifications/read-all mark read; a not-found-or-not-owned id is 404, never 403 (matches the existing don't-leak-existence-to-a-non-owner convention). A real, disclosed, NOT-fixed-here gap: `like`/`comment` notifications have no actor anywhere in the schema — payloadRefId is the Post, not the liker/commenter — so "X liked your post" cannot be rendered with a name from current data; fixing this would need a new actorId column written by the like/comment trigger call sites, which this PR's scope explicitly excludes (read-side only).</w:t>
+            </w:r>
+          </w:p>
+        </w:tc>
+        <w:tc>
+          <w:tcPr>
+            <w:tcW w:type="dxa" w:w="1850"/>
+          </w:tcPr>
+          <w:p>
+            <w:r/>
+            <w:r>
+              <w:t>sprint-3/notifications-read-api (backend-api, 2026-09-13)</w:t>
+            </w:r>
+          </w:p>
+        </w:tc>
+        <w:tc>
+          <w:tcPr>
+            <w:tcW w:type="dxa" w:w="2300"/>
+          </w:tcPr>
+          <w:p>
+            <w:r/>
+            <w:r>
+              <w:t>Resolved. GET /notifications, GET /notifications/unread-count, PATCH /notifications/:id/read, PATCH /notifications/read-all all built on a new NotificationsModule, wired into app.module.ts. None of the 7 existing trigger call sites that write Notification rows (users.service.ts, feed.service.ts x2, messaging.service.ts, grassroots.service.ts x2, contest.service.ts — Decision Log #87/#278) were touched. Mocked suite: 52 suites / 738 tests, 0 failures (baseline, freshly re-measured) -&gt; 54 suites / 764 tests, 0 failures (26 new, 2 new suites). No e2e spec added — this module makes no raw SQL, no transaction/isolation-level claim, and no novel Prisma relation; it's plain findMany/count/update calls, the class of change test/README.md's own guiding principle keeps at the mocked layer. `nest build` and `npm run lint` both clean. No Figma/apps/web code touched — a figma-to-code pass converts the already-finalized Notification Centre design (Decision Log #279) against these endpoints as its own follow-up. See modules/notifications/README.md for the full design writeup, including the per-type payloadRefId table and the like/comment actor-gap Decision Log candidate this PR raises but does not resolve.</w:t>
             </w:r>
           </w:p>
         </w:tc>

</xml_diff>

<commit_message>
Redesign Sports Hub screens against Highlightly data (Sprint 4)
Redesigns all 10 desktop + 10 mobile Sports Hub screens (Match
Statistics, Lineups, Standing, H2H, Video, etc.) with real
Highlightly-shaped data fields, and adds two new sections — Match
Momentum and Live Commentary — desktop and mobile. Figma design only,
no app/backend code.

Routed to figma-screen-builder by founder decision as a one-time
exception to the standard token-retouch/new-screen split, given how
much genuinely new data content is involved. Corrects a mischaracterized
Decision Log #149 finding (crest artwork, not off-palette UI amber),
resolves #6's vendor question on the design side (Highlightly, backend
integration still unbuilt), and adds Decision Log #311-#322 for the new
judgment calls and flagged gaps this pass surfaced. Full detail in
docs/sprint-4-sports-hub-highlightly-data-redesign-report.md.

Co-Authored-By: Claude Sonnet 5 <noreply@anthropic.com>
</commit_message>
<xml_diff>
--- a/docs/Soccernity_MVP_Build_Plan_v1.7.docx
+++ b/docs/Soccernity_MVP_Build_Plan_v1.7.docx
@@ -8784,6 +8784,9 @@
               </w:rPr>
               <w:t xml:space="preserve">Open — blocks Sprint 4</w:t>
             </w:r>
+            <w:r>
+              <w:t xml:space="preserve"> — Resolved by the founder (per the brief authorising sprint-4/sports-hub-highlightly-data-redesign, 2026-09-16): the selected sports-data vendor is Highlightly. This unblocks DESIGN work only so far — the 10 desktop + 10 mobile Sports Hub screens have now been redesigned in Figma against Highlightly's confirmed data categories (match statistics, lineups with substitutions, standings with form guide, H2H history, video highlights, and momentum), plus two new sections (Match Momentum, Live Commentary); see docs/sprint-4-sports-hub-highlightly-data-redesign-report.md and Decision Log #321. No services/api sports/fixtures module or Highlightly API client exists yet — the actual backend integration and wiring the frontend to live data remain separate, not-yet-started Sprint 4 work.</w:t>
+            </w:r>
           </w:p>
         </w:tc>
       </w:tr>
@@ -15906,6 +15909,9 @@
             <w:r>
               <w:t>Resolved by the founder: the mobile H2H / Standing result/position colour scheme is final -- W / promotion = brand/green, Draw / mid-table = brand/navy, Loss / relegation = semantic/alert. This palette-compliant scheme is canonical; the desktop Sports Hub screens' off-palette yellow/amber for draws and mid-table is now the flagged deviation, to be brought in line whenever those desktop screens next get a token pass (Decision Log #97 / #52 family).</w:t>
             </w:r>
+            <w:r>
+              <w:t xml:space="preserve"> — CORRECTION (sprint-4/sports-hub-highlightly-data-redesign, figma-screen-builder, 2026-09-16, Decision Log #315): the “off-palette yellow/amber” this note names on the desktop H2H/Standing screens is club-crest trademark artwork (399 paints traced directly inside the Liverpool/Chelsea crest vectors on H2H alone), not a UI colour choice — there was no off-palette amber in the desktop UI itself. The real UI-level off-palette values on those two screens were the form-guide chips' #d3f502 (draw) and #cfcfcf (no-data) fills, both now rebound (112 chips) to this same palette-compliant W/D/L scheme. See Decision Log #315 for the full detail.</w:t>
+            </w:r>
           </w:p>
         </w:tc>
       </w:tr>
@@ -22803,6 +22809,558 @@
             <w:r/>
             <w:r>
               <w:t>Open — flagged, worked around rather than silently adding a new backend endpoint out of this PR's own explicit upload+list scope. The same shape of gap as #300 (GET /reports/:id): MediaPreviewPage.tsx is reached via a router-state handoff from the Library's own row &lt;Link state={{ media }}&gt;; a bounded findMediaById fallback (re-lists GET /admin/media and searches client-side, capped at 5 pages) covers a direct visit or page refresh with no state. A real GET /admin/media/:id would remove the need for both the state handoff and the bounded fallback — also the natural companion to a future DELETE /admin/media/:id (StorageService.delete() is already implemented and unit-tested, with MediaAsset.key stored specifically so a delete endpoint is trivial to add later, per #308) — neither of which is built here, both flagged for a future backend-api pass.</w:t>
+            </w:r>
+          </w:p>
+        </w:tc>
+      </w:tr>
+      <w:tr>
+        <w:tc>
+          <w:tcPr>
+            <w:tcW w:type="dxa" w:w="500"/>
+          </w:tcPr>
+          <w:p>
+            <w:r/>
+            <w:r>
+              <w:t>311</w:t>
+            </w:r>
+          </w:p>
+        </w:tc>
+        <w:tc>
+          <w:tcPr>
+            <w:tcW w:type="dxa" w:w="4700"/>
+          </w:tcPr>
+          <w:p>
+            <w:r/>
+            <w:r>
+              <w:t>Eight desktop match-centre frames (Match Details, Match/1H/2H Statistics, Lineups, H2H, Standing, Video) carry no shared Navbar at all — PR #151 retrofitted only the two Sports Page frames and explicitly left this legacy set out of scope. The two new desktop frames (Match Momentum, Live Commentary) follow the existing family convention (no navbar) rather than add chrome to only 2 of 10 sibling screens. Needs a coordinated figma-design-system pass to either retrofit all 10 or confirm the chrome-less state is intentional.</w:t>
+            </w:r>
+          </w:p>
+        </w:tc>
+        <w:tc>
+          <w:tcPr>
+            <w:tcW w:type="dxa" w:w="1850"/>
+          </w:tcPr>
+          <w:p>
+            <w:r/>
+            <w:r>
+              <w:t>docs/sprint-4-sports-hub-highlightly-data-redesign-report.md (sprint-4/sports-hub-highlightly-data-redesign, figma-screen-builder, 2026-09-16), §2.5 / §5</w:t>
+            </w:r>
+          </w:p>
+        </w:tc>
+        <w:tc>
+          <w:tcPr>
+            <w:tcW w:type="dxa" w:w="2300"/>
+          </w:tcPr>
+          <w:p>
+            <w:r/>
+            <w:r>
+              <w:t>Open</w:t>
+            </w:r>
+          </w:p>
+        </w:tc>
+      </w:tr>
+      <w:tr>
+        <w:tc>
+          <w:tcPr>
+            <w:tcW w:type="dxa" w:w="500"/>
+          </w:tcPr>
+          <w:p>
+            <w:r/>
+            <w:r>
+              <w:t>312</w:t>
+            </w:r>
+          </w:p>
+        </w:tc>
+        <w:tc>
+          <w:tcPr>
+            <w:tcW w:type="dxa" w:w="4700"/>
+          </w:tcPr>
+          <w:p>
+            <w:r/>
+            <w:r>
+              <w:t>#8f8f8f @10% stat-bar track rectangles (×108, 36 per screen across the 3 desktop statistics screens) are genuine non-crest, off-palette, unbound UI colour — not covered by PR #111's flag/crest/jersey-art disclosure for this section. Recommend rebinding to color/icon/inactive in a future token pass.</w:t>
+            </w:r>
+          </w:p>
+        </w:tc>
+        <w:tc>
+          <w:tcPr>
+            <w:tcW w:type="dxa" w:w="1850"/>
+          </w:tcPr>
+          <w:p>
+            <w:r/>
+            <w:r>
+              <w:t>docs/sprint-4-sports-hub-highlightly-data-redesign-report.md (sprint-4/sports-hub-highlightly-data-redesign, figma-screen-builder, 2026-09-16), §4.3</w:t>
+            </w:r>
+          </w:p>
+        </w:tc>
+        <w:tc>
+          <w:tcPr>
+            <w:tcW w:type="dxa" w:w="2300"/>
+          </w:tcPr>
+          <w:p>
+            <w:r/>
+            <w:r>
+              <w:t>Open</w:t>
+            </w:r>
+          </w:p>
+        </w:tc>
+      </w:tr>
+      <w:tr>
+        <w:tc>
+          <w:tcPr>
+            <w:tcW w:type="dxa" w:w="500"/>
+          </w:tcPr>
+          <w:p>
+            <w:r/>
+            <w:r>
+              <w:t>313</w:t>
+            </w:r>
+          </w:p>
+        </w:tc>
+        <w:tc>
+          <w:tcPr>
+            <w:tcW w:type="dxa" w:w="4700"/>
+          </w:tcPr>
+          <w:p>
+            <w:r/>
+            <w:r>
+              <w:t>Whether player box scores on Match/1H/2H Statistics should include a RATING column. Scoped in during design, then removed before build — player ratings are a derived metric not named in Highlightly's confirmed data-category list (possession, shots, corners, fouls, cards, passes, box scores). Needs vendor confirmation before any rating UI is designed.</w:t>
+            </w:r>
+          </w:p>
+        </w:tc>
+        <w:tc>
+          <w:tcPr>
+            <w:tcW w:type="dxa" w:w="1850"/>
+          </w:tcPr>
+          <w:p>
+            <w:r/>
+            <w:r>
+              <w:t>docs/sprint-4-sports-hub-highlightly-data-redesign-report.md (sprint-4/sports-hub-highlightly-data-redesign, figma-screen-builder, 2026-09-16), §3</w:t>
+            </w:r>
+          </w:p>
+        </w:tc>
+        <w:tc>
+          <w:tcPr>
+            <w:tcW w:type="dxa" w:w="2300"/>
+          </w:tcPr>
+          <w:p>
+            <w:r/>
+            <w:r>
+              <w:t>Open</w:t>
+            </w:r>
+          </w:p>
+        </w:tc>
+      </w:tr>
+      <w:tr>
+        <w:tc>
+          <w:tcPr>
+            <w:tcW w:type="dxa" w:w="500"/>
+          </w:tcPr>
+          <w:p>
+            <w:r/>
+            <w:r>
+              <w:t>314</w:t>
+            </w:r>
+          </w:p>
+        </w:tc>
+        <w:tc>
+          <w:tcPr>
+            <w:tcW w:type="dxa" w:w="4700"/>
+          </w:tcPr>
+          <w:p>
+            <w:r/>
+            <w:r>
+              <w:t>Legacy score-header crest artwork (XMLID_189_) renders outside its own reported node bounds and visually overlaps the team-name text on every desktop match-centre frame — pre-existing on all 8 legacy frames, now inherited by the 2 new frames (Match Momentum, Live Commentary) via the cloned score header. Cosmetic, file-wide; needs a figma-design-system fix.</w:t>
+            </w:r>
+          </w:p>
+        </w:tc>
+        <w:tc>
+          <w:tcPr>
+            <w:tcW w:type="dxa" w:w="1850"/>
+          </w:tcPr>
+          <w:p>
+            <w:r/>
+            <w:r>
+              <w:t>docs/sprint-4-sports-hub-highlightly-data-redesign-report.md (sprint-4/sports-hub-highlightly-data-redesign, figma-screen-builder, 2026-09-16), §5</w:t>
+            </w:r>
+          </w:p>
+        </w:tc>
+        <w:tc>
+          <w:tcPr>
+            <w:tcW w:type="dxa" w:w="2300"/>
+          </w:tcPr>
+          <w:p>
+            <w:r/>
+            <w:r>
+              <w:t>Open</w:t>
+            </w:r>
+          </w:p>
+        </w:tc>
+      </w:tr>
+      <w:tr>
+        <w:tc>
+          <w:tcPr>
+            <w:tcW w:type="dxa" w:w="500"/>
+          </w:tcPr>
+          <w:p>
+            <w:r/>
+            <w:r>
+              <w:t>315</w:t>
+            </w:r>
+          </w:p>
+        </w:tc>
+        <w:tc>
+          <w:tcPr>
+            <w:tcW w:type="dxa" w:w="4700"/>
+          </w:tcPr>
+          <w:p>
+            <w:r/>
+            <w:r>
+              <w:t>Correction to Decision Log #149: the “off-palette yellow/amber for draws and mid-table” that entry names on the desktop H2H/Standing screens is club-crest trademark artwork (traced directly — 399 #dba111 paints inside the Liverpool/Chelsea crest vectors on H2H alone), not a UI colour choice — there was no off-palette amber in the desktop UI itself. The real UI-level off-palette values on those two screens were the form-guide chips' #d3f502 (draw) and #cfcfcf (no-data) fills, both now rebound (112 chips total) to the same palette-compliant W/D/L scheme #149 already made canonical.</w:t>
+            </w:r>
+          </w:p>
+        </w:tc>
+        <w:tc>
+          <w:tcPr>
+            <w:tcW w:type="dxa" w:w="1850"/>
+          </w:tcPr>
+          <w:p>
+            <w:r/>
+            <w:r>
+              <w:t>docs/sprint-4-sports-hub-highlightly-data-redesign-report.md (sprint-4/sports-hub-highlightly-data-redesign, figma-screen-builder, 2026-09-16), §4.2</w:t>
+            </w:r>
+          </w:p>
+        </w:tc>
+        <w:tc>
+          <w:tcPr>
+            <w:tcW w:type="dxa" w:w="2300"/>
+          </w:tcPr>
+          <w:p>
+            <w:r/>
+            <w:r>
+              <w:t>Resolved — see the forward-pointer appended to Decision Log #149's own Status.</w:t>
+            </w:r>
+          </w:p>
+        </w:tc>
+      </w:tr>
+      <w:tr>
+        <w:tc>
+          <w:tcPr>
+            <w:tcW w:type="dxa" w:w="500"/>
+          </w:tcPr>
+          <w:p>
+            <w:r/>
+            <w:r>
+              <w:t>316</w:t>
+            </w:r>
+          </w:p>
+        </w:tc>
+        <w:tc>
+          <w:tcPr>
+            <w:tcW w:type="dxa" w:w="4700"/>
+          </w:tcPr>
+          <w:p>
+            <w:r/>
+            <w:r>
+              <w:t>Live Commentary (Match sub-tab) orders its event feed newest-first, matching the live-feed convention the feature name implies, rather than chronological ascending order.</w:t>
+            </w:r>
+          </w:p>
+        </w:tc>
+        <w:tc>
+          <w:tcPr>
+            <w:tcW w:type="dxa" w:w="1850"/>
+          </w:tcPr>
+          <w:p>
+            <w:r/>
+            <w:r>
+              <w:t>docs/sprint-4-sports-hub-highlightly-data-redesign-report.md (sprint-4/sports-hub-highlightly-data-redesign, figma-screen-builder, 2026-09-16), §5</w:t>
+            </w:r>
+          </w:p>
+        </w:tc>
+        <w:tc>
+          <w:tcPr>
+            <w:tcW w:type="dxa" w:w="2300"/>
+          </w:tcPr>
+          <w:p>
+            <w:r/>
+            <w:r>
+              <w:t>Resolved (design) — a deliberate choice, not an oversight; open to revisiting once real usage data exists.</w:t>
+            </w:r>
+          </w:p>
+        </w:tc>
+      </w:tr>
+      <w:tr>
+        <w:tc>
+          <w:tcPr>
+            <w:tcW w:type="dxa" w:w="500"/>
+          </w:tcPr>
+          <w:p>
+            <w:r/>
+            <w:r>
+              <w:t>317</w:t>
+            </w:r>
+          </w:p>
+        </w:tc>
+        <w:tc>
+          <w:tcPr>
+            <w:tcW w:type="dxa" w:w="4700"/>
+          </w:tcPr>
+          <w:p>
+            <w:r/>
+            <w:r>
+              <w:t>Mobile Match sub-tab row type/spacing (12px→11px, gap 20→9, padding 20→16) was reduced to fit five tabs (Match Summary | Statistics | Lineups | Momentum | Commentary) inside the 390px mobile frame width, rather than allowing horizontal-scroll clipping.</w:t>
+            </w:r>
+          </w:p>
+        </w:tc>
+        <w:tc>
+          <w:tcPr>
+            <w:tcW w:type="dxa" w:w="1850"/>
+          </w:tcPr>
+          <w:p>
+            <w:r/>
+            <w:r>
+              <w:t>docs/sprint-4-sports-hub-highlightly-data-redesign-report.md (sprint-4/sports-hub-highlightly-data-redesign, figma-screen-builder, 2026-09-16), §5</w:t>
+            </w:r>
+          </w:p>
+        </w:tc>
+        <w:tc>
+          <w:tcPr>
+            <w:tcW w:type="dxa" w:w="2300"/>
+          </w:tcPr>
+          <w:p>
+            <w:r/>
+            <w:r>
+              <w:t>Resolved (design) — horizontal-scroll clipping was rejected because the active tab could fall out of view.</w:t>
+            </w:r>
+          </w:p>
+        </w:tc>
+      </w:tr>
+      <w:tr>
+        <w:tc>
+          <w:tcPr>
+            <w:tcW w:type="dxa" w:w="500"/>
+          </w:tcPr>
+          <w:p>
+            <w:r/>
+            <w:r>
+              <w:t>318</w:t>
+            </w:r>
+          </w:p>
+        </w:tc>
+        <w:tc>
+          <w:tcPr>
+            <w:tcW w:type="dxa" w:w="4700"/>
+          </w:tcPr>
+          <w:p>
+            <w:r/>
+            <w:r>
+              <w:t>The new Match Momentum and Live Commentary sections are placed as Level-2 sub-tabs under Match (alongside Match Summary | Statistics | Lineups), not as Level-1 siblings of H2H / Standings / Video — both are in-match content. This is the information architecture figma-to-code must inherit when this is eventually converted.</w:t>
+            </w:r>
+          </w:p>
+        </w:tc>
+        <w:tc>
+          <w:tcPr>
+            <w:tcW w:type="dxa" w:w="1850"/>
+          </w:tcPr>
+          <w:p>
+            <w:r/>
+            <w:r>
+              <w:t>docs/sprint-4-sports-hub-highlightly-data-redesign-report.md (sprint-4/sports-hub-highlightly-data-redesign, figma-screen-builder, 2026-09-16), §2.5</w:t>
+            </w:r>
+          </w:p>
+        </w:tc>
+        <w:tc>
+          <w:tcPr>
+            <w:tcW w:type="dxa" w:w="2300"/>
+          </w:tcPr>
+          <w:p>
+            <w:r/>
+            <w:r>
+              <w:t>Resolved (design)</w:t>
+            </w:r>
+          </w:p>
+        </w:tc>
+      </w:tr>
+      <w:tr>
+        <w:tc>
+          <w:tcPr>
+            <w:tcW w:type="dxa" w:w="500"/>
+          </w:tcPr>
+          <w:p>
+            <w:r/>
+            <w:r>
+              <w:t>319</w:t>
+            </w:r>
+          </w:p>
+        </w:tc>
+        <w:tc>
+          <w:tcPr>
+            <w:tcW w:type="dxa" w:w="4700"/>
+          </w:tcPr>
+          <w:p>
+            <w:r/>
+            <w:r>
+              <w:t>Video's geo-restriction treatment uses a navy pill + semantic/alert dot, not a red badge with white text — white-on-semantic/alert fails AA for a small badge label at that size. Restricted thumbnails use the bound color/icon/inactive fill rather than a translucent overlay, avoiding the documented “bound paint takes its alpha from the variable” gotcha.</w:t>
+            </w:r>
+          </w:p>
+        </w:tc>
+        <w:tc>
+          <w:tcPr>
+            <w:tcW w:type="dxa" w:w="1850"/>
+          </w:tcPr>
+          <w:p>
+            <w:r/>
+            <w:r>
+              <w:t>docs/sprint-4-sports-hub-highlightly-data-redesign-report.md (sprint-4/sports-hub-highlightly-data-redesign, figma-screen-builder, 2026-09-16), §2.3 / §2.1</w:t>
+            </w:r>
+          </w:p>
+        </w:tc>
+        <w:tc>
+          <w:tcPr>
+            <w:tcW w:type="dxa" w:w="2300"/>
+          </w:tcPr>
+          <w:p>
+            <w:r/>
+            <w:r>
+              <w:t>Resolved (design)</w:t>
+            </w:r>
+          </w:p>
+        </w:tc>
+      </w:tr>
+      <w:tr>
+        <w:tc>
+          <w:tcPr>
+            <w:tcW w:type="dxa" w:w="500"/>
+          </w:tcPr>
+          <w:p>
+            <w:r/>
+            <w:r>
+              <w:t>320</w:t>
+            </w:r>
+          </w:p>
+        </w:tc>
+        <w:tc>
+          <w:tcPr>
+            <w:tcW w:type="dxa" w:w="4700"/>
+          </w:tcPr>
+          <w:p>
+            <w:r/>
+            <w:r>
+              <w:t>On Standing, brand/green / brand/navy / semantic/alert now carry two different meanings in two separate columns on the same row — promotion/relegation on the rank chip, and W/D/L form on the form-guide chips. Flagged as an accepted, unavoidable trade-off under the two-colour palette rule (non-negotiable #3): the columns sit far apart and the glyphs differ (numbers vs. letters), so it reads as two distinct systems rather than one confused one.</w:t>
+            </w:r>
+          </w:p>
+        </w:tc>
+        <w:tc>
+          <w:tcPr>
+            <w:tcW w:type="dxa" w:w="1850"/>
+          </w:tcPr>
+          <w:p>
+            <w:r/>
+            <w:r>
+              <w:t>docs/sprint-4-sports-hub-highlightly-data-redesign-report.md (sprint-4/sports-hub-highlightly-data-redesign, figma-screen-builder, 2026-09-16), §2.4</w:t>
+            </w:r>
+          </w:p>
+        </w:tc>
+        <w:tc>
+          <w:tcPr>
+            <w:tcW w:type="dxa" w:w="2300"/>
+          </w:tcPr>
+          <w:p>
+            <w:r/>
+            <w:r>
+              <w:t>Resolved (design)</w:t>
+            </w:r>
+          </w:p>
+        </w:tc>
+      </w:tr>
+      <w:tr>
+        <w:tc>
+          <w:tcPr>
+            <w:tcW w:type="dxa" w:w="500"/>
+          </w:tcPr>
+          <w:p>
+            <w:r/>
+            <w:r>
+              <w:t>321</w:t>
+            </w:r>
+          </w:p>
+        </w:tc>
+        <w:tc>
+          <w:tcPr>
+            <w:tcW w:type="dxa" w:w="4700"/>
+          </w:tcPr>
+          <w:p>
+            <w:r/>
+            <w:r>
+              <w:t>All match data across the redesigned Sports Hub screens (Match Momentum, Live Commentary, player box scores, Lineups substitutions, H2H record, Video clips) remains illustrative dummy content (one consistent Liverpool 1–3 Chelsea fixture, per §6 of the report). Highlightly is the resolved vendor (Decision Log #6) but services/api has no sports/fixtures module, no Highlightly API client, and MatchData has zero live reads. figma-to-code must NOT wire any of these screens to real data until that backend integration exists.</w:t>
+            </w:r>
+          </w:p>
+        </w:tc>
+        <w:tc>
+          <w:tcPr>
+            <w:tcW w:type="dxa" w:w="1850"/>
+          </w:tcPr>
+          <w:p>
+            <w:r/>
+            <w:r>
+              <w:t>docs/sprint-4-sports-hub-highlightly-data-redesign-report.md (sprint-4/sports-hub-highlightly-data-redesign, figma-screen-builder, 2026-09-16), §6</w:t>
+            </w:r>
+          </w:p>
+        </w:tc>
+        <w:tc>
+          <w:tcPr>
+            <w:tcW w:type="dxa" w:w="2300"/>
+          </w:tcPr>
+          <w:p>
+            <w:r/>
+            <w:r>
+              <w:t>Open — blocked on a not-yet-started backend Highlightly integration.</w:t>
+            </w:r>
+          </w:p>
+        </w:tc>
+      </w:tr>
+      <w:tr>
+        <w:tc>
+          <w:tcPr>
+            <w:tcW w:type="dxa" w:w="500"/>
+          </w:tcPr>
+          <w:p>
+            <w:r/>
+            <w:r>
+              <w:t>322</w:t>
+            </w:r>
+          </w:p>
+        </w:tc>
+        <w:tc>
+          <w:tcPr>
+            <w:tcW w:type="dxa" w:w="4700"/>
+          </w:tcPr>
+          <w:p>
+            <w:r/>
+            <w:r>
+              <w:t>No prototype (NAVIGATE) reactions were added to the new sub-tabs or the two new frames, consistent with the rest of the match-centre family, which has never carried NAVIGATE wiring — routing between these screens stays a code-side concern for whoever eventually runs figma-to-code on them.</w:t>
+            </w:r>
+          </w:p>
+        </w:tc>
+        <w:tc>
+          <w:tcPr>
+            <w:tcW w:type="dxa" w:w="1850"/>
+          </w:tcPr>
+          <w:p>
+            <w:r/>
+            <w:r>
+              <w:t>docs/sprint-4-sports-hub-highlightly-data-redesign-report.md (sprint-4/sports-hub-highlightly-data-redesign, figma-screen-builder, 2026-09-16), §5</w:t>
+            </w:r>
+          </w:p>
+        </w:tc>
+        <w:tc>
+          <w:tcPr>
+            <w:tcW w:type="dxa" w:w="2300"/>
+          </w:tcPr>
+          <w:p>
+            <w:r/>
+            <w:r>
+              <w:t>Resolved (design)</w:t>
             </w:r>
           </w:p>
         </w:tc>

</xml_diff>

<commit_message>
Anonymize deleted accounts in place instead of cascading (Decision Log #341)
Supersedes #44's cascade and #42's hard-delete step. After the 30-day grace
period the User row is anonymized in one transaction (accountStatus
'deleted'), never DELETEd; 15 FKs revert CASCADE -> RESTRICT;
GrassrootsTeam.createdById and User.dateOfBirth become nullable; an open
moderation Report holds anonymization until resolved.

Co-Authored-By: Claude Sonnet 5 <noreply@anthropic.com>
</commit_message>
<xml_diff>
--- a/docs/Soccernity_MVP_Build_Plan_v1.7.docx
+++ b/docs/Soccernity_MVP_Build_Plan_v1.7.docx
@@ -11406,7 +11406,7 @@
               <w:t>Resolved by the founder: (1) A pending_deletion account gets a 30-day grace period from the delete request before anything permanent happens — standard industry practice, allows recovery from an accidental or coerced deletion request. Requires a scheduled job (not yet built) to sweep accounts past 30 days in pending_deletion. (2) At the end of that window, the User row is hard-deleted, not anonymized — a real DELETE, not a soft/scrambled row. (3) Guardian/consent records are the one deliberate exception: they survive the User row's hard-delete, retained separately for legal-defense purposes (proof that guardian consent was validly obtained, in case of a future dispute) — for 6 months after the 30-day grace period expires (so ~7 months total from the original delete-account request), then deleted. Basis: the ICO does not set a fixed statutory retention period for consent data under UK GDPR — it requires only that data be kept no longer than necessary for the purpose it was collected for, reviewed/deleted once that purpose lapses (ico.org.uk). 6 months is the founder's own applied reading of that necessity principle, not a number sourced from counsel — this is UK-side reasoning specifically; whether Nigeria's NDPA 2023 expects the same window is a separate, still-open cross-check (see Decision Log #4's jurisdictional scope question) rather than assumed identical here. ARCHITECTURE IMPLICATION, not yet built: Guardian currently has no independent existence from User (see schema.prisma's Guardian.minorUserId relation) — hard-deleting User today would cascade-orphan or cascade-delete Guardian too, defeating the point of this decision. This needs a follow-up: either a decoupled consent-audit-log table (userId as a plain string, not an FK, populated at consent-confirmation time, storing only what's needed to prove consent occurred — not full Guardian PII) that survives independently of the User row and is purged on its own 6-month timer, or an ON DELETE behavior change — a real schema/migration decision, not yet scoped into any sprint.</w:t>
               <w:br/>
               <w:br/>
-              <w:t xml:space="preserve">NIGERIA (NDPA) CROSS-CHECK, now fully resolved: founder research confirmed consent VALIDITY needs no separate NDPA expiry timer (matches Decision Log #8/#10's existing approach, no change needed). On the separate question of a guardian-initiated withdrawal path: founder decision is that no dedicated withdrawal/revoke endpoint is needed — POST /auth/delete-account (whoever controls the account invokes it) IS the withdrawal mechanism for both jurisdictions, following this entry's same 30-day-grace + hard-delete + 6-month separately-retained-consent-record model uniformly, not a UK-vs-Nigeria split. See Decision Log #43 — closed, not needed, same founder call. One residual note, not a blocker: this assumes whoever initiates account deletion (which today can be the minor's own authenticated session, not necessarily the guardian) satisfies NDPA's guardian-withdrawal-notice requirement — that equivalence hasn't been separately confirmed with counsel, but is accepted here as the founder's considered call, not an oversight.  //  SEE ALSO Decision Log #59 (the account-deletion-requested notification email, designed in sprint-2/retrofit-screen-build-auth-email so the 30-day grace period this entry describes is actually surfaced to the user).</w:t>
+              <w:t>NIGERIA (NDPA) CROSS-CHECK, now fully resolved: founder research confirmed consent VALIDITY needs no separate NDPA expiry timer (matches Decision Log #8/#10's existing approach, no change needed). On the separate question of a guardian-initiated withdrawal path: founder decision is that no dedicated withdrawal/revoke endpoint is needed — POST /auth/delete-account (whoever controls the account invokes it) IS the withdrawal mechanism for both jurisdictions, following this entry's same 30-day-grace + hard-delete + 6-month separately-retained-consent-record model uniformly, not a UK-vs-Nigeria split. See Decision Log #43 — closed, not needed, same founder call. One residual note, not a blocker: this assumes whoever initiates account deletion (which today can be the minor's own authenticated session, not necessarily the guardian) satisfies NDPA's guardian-withdrawal-notice requirement — that equivalence hasn't been separately confirmed with counsel, but is accepted here as the founder's considered call, not an oversight.  //  SEE ALSO Decision Log #59 (the account-deletion-requested notification email, designed in sprint-2/retrofit-screen-build-auth-email so the 30-day grace period this entry describes is actually surfaced to the user). FORWARD-POINTER: point (2) "hard-deleted, not anonymized" is superseded by Decision Log #341 - the User row is now anonymized in place (accountStatus 'deleted'); the 30-day grace period and the ConsentAuditRecord retention (points 1 and 3) are unchanged.</w:t>
             </w:r>
           </w:p>
         </w:tc>
@@ -11490,7 +11490,7 @@
           </w:tcPr>
           <w:p>
             <w:r>
-              <w:t>Resolved by the founder: option (a), cascade. Soccernity's stated principle: deleting an account removes that user's entire digital footprint from the platform, not a partial erasure — framed explicitly as a safety measure, including for minors, protecting everyone's data and identity. Applies to the eleven tables listed above (Post, Comment, Follow, Like, SavedPost, Notification, Report, Message, LeaderboardEntry, GrassrootsTeam, Result) — does NOT apply to Guardian, which Decision Log #42 already resolved separately (snapshotted into ConsentAuditRecord, then deleted, not simple cascade — that safeguarding retention mechanism stays as built, this decision doesn't touch it. REAL MECHANICAL CONSEQUENCE, stated plainly so it isn't rediscovered as a surprise later: cascading Post also cascades away Comment/Like/SavedPost rows written by OTHER, unrelated users on that post — e.g. if User A deletes their account, User B's own comment on User A's post is deleted too, not just User A's content. This is the real blast radius option (a) was flagged with in README.md, accepted here as consistent with the founder's stated principle, not an unexamined side effect.IMPLEMENTED (PR #90, sprint-2/account-deletion-cascade): all eleven User-referencing FKs flipped from RESTRICT to CASCADE via a real migration. SECOND-ORDER DISCOVERY made during implementation, not a new policy question: Comment.postId, SavedPost.postId, and Like.postId were ALSO RESTRICT — against Post, not User — which would have silently blocked the cross-user cascade this decision describes the moment any post had another user's comment/like/save on it. Flipped those three to CASCADE too, as the necessary implementation of this one decision, not a separate policy call. Guardian.minorUserId confirmed still RESTRICT, unchanged, verified directly against information_schema.referential_constraints in the live database, not inferred. The cross-user consequence is proven by a real Postgres e2e test: User A's Post is hard-deleted, User B's own Comment/Like/SavedPost on that post are cascaded away too, while User B's own account is explicitly asserted untouched. AccountDeletionSweepService's P2003 catch was reworked, not removed — kept as a defensive fallback for schema drift, recharacterized from an expected/routine path to an investigate-this signal, since blockedUserIds should now stay empty in normal operation. ONE SMALL PIECE DELIBERATELY LEFT UNTOUCHED: Fixture.teamAId/teamBId and Result.fixtureId (GrassrootsTeam's own child tables) remain RESTRICT — not fixed, because GrassrootsModule isn't wired into the app yet (commented out in app.module.ts), so this chain is unreachable in practice today. Flagged for whoever builds GrassrootsModule, not forgotten.</w:t>
+              <w:t>Resolved by the founder: option (a), cascade. Soccernity's stated principle: deleting an account removes that user's entire digital footprint from the platform, not a partial erasure — framed explicitly as a safety measure, including for minors, protecting everyone's data and identity. Applies to the eleven tables listed above (Post, Comment, Follow, Like, SavedPost, Notification, Report, Message, LeaderboardEntry, GrassrootsTeam, Result) — does NOT apply to Guardian, which Decision Log #42 already resolved separately (snapshotted into ConsentAuditRecord, then deleted, not simple cascade — that safeguarding retention mechanism stays as built, this decision doesn't touch it. REAL MECHANICAL CONSEQUENCE, stated plainly so it isn't rediscovered as a surprise later: cascading Post also cascades away Comment/Like/SavedPost rows written by OTHER, unrelated users on that post — e.g. if User A deletes their account, User B's own comment on User A's post is deleted too, not just User A's content. This is the real blast radius option (a) was flagged with in README.md, accepted here as consistent with the founder's stated principle, not an unexamined side effect.IMPLEMENTED (PR #90, sprint-2/account-deletion-cascade): all eleven User-referencing FKs flipped from RESTRICT to CASCADE via a real migration. SECOND-ORDER DISCOVERY made during implementation, not a new policy question: Comment.postId, SavedPost.postId, and Like.postId were ALSO RESTRICT — against Post, not User — which would have silently blocked the cross-user cascade this decision describes the moment any post had another user's comment/like/save on it. Flipped those three to CASCADE too, as the necessary implementation of this one decision, not a separate policy call. Guardian.minorUserId confirmed still RESTRICT, unchanged, verified directly against information_schema.referential_constraints in the live database, not inferred. The cross-user consequence is proven by a real Postgres e2e test: User A's Post is hard-deleted, User B's own Comment/Like/SavedPost on that post are cascaded away too, while User B's own account is explicitly asserted untouched. AccountDeletionSweepService's P2003 catch was reworked, not removed — kept as a defensive fallback for schema drift, recharacterized from an expected/routine path to an investigate-this signal, since blockedUserIds should now stay empty in normal operation. ONE SMALL PIECE DELIBERATELY LEFT UNTOUCHED: Fixture.teamAId/teamBId and Result.fixtureId (GrassrootsTeam's own child tables) remain RESTRICT — not fixed, because GrassrootsModule isn't wired into the app yet (commented out in app.module.ts), so this chain is unreachable in practice today. Flagged for whoever builds GrassrootsModule, not forgotten. SUPERSEDED by Decision Log #341 (sprint-2/account-anonymization-reconsideration): the cascade is reverted to RESTRICT and the User row is anonymized in place instead of hard-deleted; the accepted cross-user blast radius described above no longer exists.</w:t>
             </w:r>
           </w:p>
         </w:tc>
@@ -24131,6 +24131,48 @@
           <w:p>
             <w:r>
               <w:t>Resolved — implemented and flagged as a genuine spec-gap addition, the same shape as Decision Log #295 (POST /reports) and #297 (GET /admin/articles). All three carry @AuthRateLimit() and no guard, matching confirm's token-is-the-credential trust model. The withdrawal link is only ever emailed to Guardian.email, so taking the minor's email as input reveals and grants nothing. UX consequence flagged for the frontend ticket: a guardian withdrawing must enter the child's registered email, not their own.</w:t>
+            </w:r>
+          </w:p>
+        </w:tc>
+      </w:tr>
+      <w:tr>
+        <w:tc>
+          <w:tcPr>
+            <w:tcW w:type="dxa" w:w="500"/>
+          </w:tcPr>
+          <w:p>
+            <w:r>
+              <w:t>341</w:t>
+            </w:r>
+          </w:p>
+        </w:tc>
+        <w:tc>
+          <w:tcPr>
+            <w:tcW w:type="dxa" w:w="4700"/>
+          </w:tcPr>
+          <w:p>
+            <w:r>
+              <w:t>Founder reconsideration of Decision Log #44 (not a fresh decision). #44 resolved option (a), cascade: deleting an account hard-deletes the User row and cascades through the eleven User-referencing tables. Its own text records the mechanical consequence: cascading Post also deletes Comment/Like/SavedPost rows written by OTHER, unrelated users on that post. That is a bigger erasure than the stated principle (this user's own digital footprint is gone) requires, and is not what GDPR Art. 17 obliges - another user's comment is that user's own data, not the requester's. A multi-table cascading transaction is also the class of operation that produced the live Fixture/Result RESTRICT gap (GrassrootsTeam cascaded while its children did not). Reconsidered: anonymize the User row in place at the end of the 30-day grace period instead of hard-deleting it - the pattern most major platforms actually use, and one that falls outside GDPR once the data can no longer be attributed to the person (Recital 26).</w:t>
+            </w:r>
+          </w:p>
+        </w:tc>
+        <w:tc>
+          <w:tcPr>
+            <w:tcW w:type="dxa" w:w="1850"/>
+          </w:tcPr>
+          <w:p>
+            <w:r>
+              <w:t>sprint-2/account-anonymization-reconsideration; account-deletion/README.md; schema.prisma</w:t>
+            </w:r>
+          </w:p>
+        </w:tc>
+        <w:tc>
+          <w:tcPr>
+            <w:tcW w:type="dxa" w:w="2300"/>
+          </w:tcPr>
+          <w:p>
+            <w:r>
+              <w:t>Resolved by the founder, IMPLEMENTED (sprint-2/account-anonymization-reconsideration). SUPERSEDES #44 (cascade) and the "hard-delete, not anonymized" step of #42; #42's 30-day grace period and its ConsentAuditRecord retention are unchanged. (1) The User row is never DELETEd: at the end of the grace period AccountDeletionSweepService.anonymizeUser runs ONE atomic transaction. User: email -&gt; deleted-&lt;id&gt;@deleted.soccernity.internal (deterministic, unique), phone -&gt; null, displayName -&gt; "[deleted user]", passwordHash -&gt; an unverifiable value, dateOfBirth -&gt; null (column made nullable), clubAffiliationId -&gt; null, accountStatus -&gt; the new terminal value 'deleted' (distinct from 'pending_deletion', which now means the 30-day grace period OR held pending investigation; both block login identically). GrassrootsTeam.createdById (made nullable) -&gt; null for every team they organised, so the team goes dormant/read-only via the existing createdById !== caller 403 checks with no new guard code. Follow, Like, SavedPost, Notification rows for the user are deleted outright (Post.likeCount is decremented so the cache does not drift). Post, Comment, Message, Result are untouched - their FKs keep pointing at the anonymized row. Guardian (minors) unchanged from #42: snapshot to ConsentAuditRecord, then delete. Report rows are NEVER touched. (2) The 15 FKs sprint-2/account-deletion-cascade flipped to CASCADE (the eleven User-referencing tables plus Comment/SavedPost/Like -&gt; Post) are RESTRICT again, so an accidental real DELETE FROM "User" fails loudly; GrassrootsTeam.createdById is nullable + RESTRICT. (3) INVESTIGATION HOLD: before anonymizing a due account the sweep checks for a non-terminal Report involving them - status open, or actioned with appealStatus pending - as reporterId, as the direct target (targetType user), or (built, it was a clean single correlated query) as the author of a reported post/comment. If found, the account is skipped for that run - fully identifiable, still login-blocked - and retried every sweep; no new "held" flag, just a query predicate. (4) Feed read-visibility now shows posts by 'active' AND 'deleted' authors (attributed to "[deleted user]"); rosters, follow graph, leaderboard and new DMs still require 'active'. Admin cannot change a 'deleted' user's status (409). (5) The Fixture/Result RESTRICT gap: GrassrootsTeam deletion is no longer attempted at all - a team is nulled, never deleted, so Fixture.teamAId/teamBId and Result.fixtureId RESTRICT can no longer be hit by account deletion; closed for this path, no separate fix needed. NOT built / flagged: no retention timer on the anonymized 'deleted' row itself; Grassroots reassignment of a dormant team to a new organiser (separate follow-up); a departing user's BanterRoomMember/CommunityGroupMember/_ClubMembership rows are not removed (rosters filter non-active users but memberCount still counts them); the investigation hold has no maximum duration. Migration 20260919144247_account_anonymization_restrict_and_nullable.</w:t>
             </w:r>
           </w:p>
         </w:tc>

</xml_diff>

<commit_message>
Reclaim dormant Grassroots teams on POST /teams; add dormant-only DELETE (Decision Log #342/#343)
POST /teams now matches on trimmed case-insensitive name + city before
creating: a live match is a 409, a dormant match (createdById null, left by an
anonymised organiser) is reassigned to the caller with reclaimed: true, guarded
by an advisory lock and a createdById-null updateMany. New DELETE /teams/:id
removes only dormant teams with no fixtures. No schema change.

Co-Authored-By: Claude Sonnet 5 <noreply@anthropic.com>
</commit_message>
<xml_diff>
--- a/docs/Soccernity_MVP_Build_Plan_v1.7.docx
+++ b/docs/Soccernity_MVP_Build_Plan_v1.7.docx
@@ -24173,6 +24173,90 @@
           <w:p>
             <w:r>
               <w:t>Resolved by the founder, IMPLEMENTED (sprint-2/account-anonymization-reconsideration). SUPERSEDES #44 (cascade) and the "hard-delete, not anonymized" step of #42; #42's 30-day grace period and its ConsentAuditRecord retention are unchanged. (1) The User row is never DELETEd: at the end of the grace period AccountDeletionSweepService.anonymizeUser runs ONE atomic transaction. User: email -&gt; deleted-&lt;id&gt;@deleted.soccernity.internal (deterministic, unique), phone -&gt; null, displayName -&gt; "[deleted user]", passwordHash -&gt; an unverifiable value, dateOfBirth -&gt; null (column made nullable), clubAffiliationId -&gt; null, accountStatus -&gt; the new terminal value 'deleted' (distinct from 'pending_deletion', which now means the 30-day grace period OR held pending investigation; both block login identically). GrassrootsTeam.createdById (made nullable) -&gt; null for every team they organised, so the team goes dormant/read-only via the existing createdById !== caller 403 checks with no new guard code. Follow, Like, SavedPost, Notification rows for the user are deleted outright (Post.likeCount is decremented so the cache does not drift). Post, Comment, Message, Result are untouched - their FKs keep pointing at the anonymized row. Guardian (minors) unchanged from #42: snapshot to ConsentAuditRecord, then delete. Report rows are NEVER touched. (2) The 15 FKs sprint-2/account-deletion-cascade flipped to CASCADE (the eleven User-referencing tables plus Comment/SavedPost/Like -&gt; Post) are RESTRICT again, so an accidental real DELETE FROM "User" fails loudly; GrassrootsTeam.createdById is nullable + RESTRICT. (3) INVESTIGATION HOLD: before anonymizing a due account the sweep checks for a non-terminal Report involving them - status open, or actioned with appealStatus pending - as reporterId, as the direct target (targetType user), or (built, it was a clean single correlated query) as the author of a reported post/comment. If found, the account is skipped for that run - fully identifiable, still login-blocked - and retried every sweep; no new "held" flag, just a query predicate. (4) Feed read-visibility now shows posts by 'active' AND 'deleted' authors (attributed to "[deleted user]"); rosters, follow graph, leaderboard and new DMs still require 'active'. Admin cannot change a 'deleted' user's status (409). (5) The Fixture/Result RESTRICT gap: GrassrootsTeam deletion is no longer attempted at all - a team is nulled, never deleted, so Fixture.teamAId/teamBId and Result.fixtureId RESTRICT can no longer be hit by account deletion; closed for this path, no separate fix needed. NOT built / flagged: no retention timer on the anonymized 'deleted' row itself; Grassroots reassignment of a dormant team to a new organiser (separate follow-up); a departing user's BanterRoomMember/CommunityGroupMember/_ClubMembership rows are not removed (rosters filter non-active users but memberCount still counts them); the investigation hold has no maximum duration. Migration 20260919144247_account_anonymization_restrict_and_nullable.</w:t>
+            </w:r>
+          </w:p>
+        </w:tc>
+      </w:tr>
+      <w:tr>
+        <w:tc>
+          <w:tcPr>
+            <w:tcW w:type="dxa" w:w="500"/>
+          </w:tcPr>
+          <w:p>
+            <w:r>
+              <w:t>342</w:t>
+            </w:r>
+          </w:p>
+        </w:tc>
+        <w:tc>
+          <w:tcPr>
+            <w:tcW w:type="dxa" w:w="4700"/>
+          </w:tcPr>
+          <w:p>
+            <w:r>
+              <w:t>POST /teams identity key and dormant-team takeover. What identifies 'the same team' when a new registrant asks for a team a departed organiser left dormant (GrassrootsTeam.createdById null, Decision Log #341)? Chosen: trimmed, case-insensitive name + city, matched against every existing team. A live match is a 409 duplicate; a dormant match is reassigned to the caller (existing name/city/leagueType/verified/fixtures/results kept, request's leagueType ignored) and the response carries reclaimed: true plus an explanatory message so the caller knows they took over an existing team. Serialised with a per-key pg_advisory_xact_lock and a createdById-null-guarded updateMany, so no schema change or unique column was added.</w:t>
+            </w:r>
+          </w:p>
+        </w:tc>
+        <w:tc>
+          <w:tcPr>
+            <w:tcW w:type="dxa" w:w="1850"/>
+          </w:tcPr>
+          <w:p>
+            <w:r>
+              <w:t>sprint-5/grassroots-team-dormant-reclaim; services/api/src/modules/grassroots/README.md</w:t>
+            </w:r>
+          </w:p>
+        </w:tc>
+        <w:tc>
+          <w:tcPr>
+            <w:tcW w:type="dxa" w:w="2300"/>
+          </w:tcPr>
+          <w:p>
+            <w:r>
+              <w:t>Resolved - implemented, flagged. Open sub-questions: (1) a normalised (name, city) unique column would make the duplicate rule a DB guarantee and remove the advisory lock, a schema addition left for the founder; (2) name + city is a weak identity (two genuinely different clubs can share both) and the takeover inherits the old team's fixtures/results and verified flag, with no check the new registrant is connected to the team; (3) legacy duplicate rows created before this rule are handled by 'any live match blocks, else take the lowest id'.</w:t>
+            </w:r>
+          </w:p>
+        </w:tc>
+      </w:tr>
+      <w:tr>
+        <w:tc>
+          <w:tcPr>
+            <w:tcW w:type="dxa" w:w="500"/>
+          </w:tcPr>
+          <w:p>
+            <w:r>
+              <w:t>343</w:t>
+            </w:r>
+          </w:p>
+        </w:tc>
+        <w:tc>
+          <w:tcPr>
+            <w:tcW w:type="dxa" w:w="4700"/>
+          </w:tcPr>
+          <w:p>
+            <w:r>
+              <w:t>Deleting a dormant team. Who may DELETE /teams/:id? Built as the smallest version: dormant teams only (createdById null), and only when the team has no fixtures as teamA or teamB (fixtures and results are other organisers' records); a live team is never end-user-deletable (409, no exception, including its own organiser). Currently any consent-confirmed authenticated user may call it, so that a registrant who does not want to inherit a dormant team's identity can clear the way for a genuinely new one.</w:t>
+            </w:r>
+          </w:p>
+        </w:tc>
+        <w:tc>
+          <w:tcPr>
+            <w:tcW w:type="dxa" w:w="1850"/>
+          </w:tcPr>
+          <w:p>
+            <w:r>
+              <w:t>sprint-5/grassroots-team-dormant-reclaim; services/api/src/modules/grassroots/README.md</w:t>
+            </w:r>
+          </w:p>
+        </w:tc>
+        <w:tc>
+          <w:tcPr>
+            <w:tcW w:type="dxa" w:w="2300"/>
+          </w:tcPr>
+          <w:p>
+            <w:r>
+              <w:t>Open - authorization/scope is a founder call. Options: keep as built; restrict to admin/moderator only (a new admin route); or drop the endpoint and make takeover the only route. Also open: a dormant team WITH fixtures can only ever be taken over, never deleted, so a registrant who wants a genuinely separate team of the same name and city in that case has no route.</w:t>
             </w:r>
           </w:p>
         </w:tc>

</xml_diff>

<commit_message>
Docs: record merges of PRs #259-#263 in CLAUDE.md; track deferred follow-ups; align docx #341/#342
Co-Authored-By: Claude Sonnet 5 <noreply@anthropic.com>
</commit_message>
<xml_diff>
--- a/docs/Soccernity_MVP_Build_Plan_v1.7.docx
+++ b/docs/Soccernity_MVP_Build_Plan_v1.7.docx
@@ -24172,7 +24172,7 @@
           </w:tcPr>
           <w:p>
             <w:r>
-              <w:t>Resolved by the founder, IMPLEMENTED (sprint-2/account-anonymization-reconsideration). SUPERSEDES #44 (cascade) and the "hard-delete, not anonymized" step of #42; #42's 30-day grace period and its ConsentAuditRecord retention are unchanged. (1) The User row is never DELETEd: at the end of the grace period AccountDeletionSweepService.anonymizeUser runs ONE atomic transaction. User: email -&gt; deleted-&lt;id&gt;@deleted.soccernity.internal (deterministic, unique), phone -&gt; null, displayName -&gt; "[deleted user]", passwordHash -&gt; an unverifiable value, dateOfBirth -&gt; null (column made nullable), clubAffiliationId -&gt; null, accountStatus -&gt; the new terminal value 'deleted' (distinct from 'pending_deletion', which now means the 30-day grace period OR held pending investigation; both block login identically). GrassrootsTeam.createdById (made nullable) -&gt; null for every team they organised, so the team goes dormant/read-only via the existing createdById !== caller 403 checks with no new guard code. Follow, Like, SavedPost, Notification rows for the user are deleted outright (Post.likeCount is decremented so the cache does not drift). Post, Comment, Message, Result are untouched - their FKs keep pointing at the anonymized row. Guardian (minors) unchanged from #42: snapshot to ConsentAuditRecord, then delete. Report rows are NEVER touched. (2) The 15 FKs sprint-2/account-deletion-cascade flipped to CASCADE (the eleven User-referencing tables plus Comment/SavedPost/Like -&gt; Post) are RESTRICT again, so an accidental real DELETE FROM "User" fails loudly; GrassrootsTeam.createdById is nullable + RESTRICT. (3) INVESTIGATION HOLD: before anonymizing a due account the sweep checks for a non-terminal Report involving them - status open, or actioned with appealStatus pending - as reporterId, as the direct target (targetType user), or (built, it was a clean single correlated query) as the author of a reported post/comment. If found, the account is skipped for that run - fully identifiable, still login-blocked - and retried every sweep; no new "held" flag, just a query predicate. (4) Feed read-visibility now shows posts by 'active' AND 'deleted' authors (attributed to "[deleted user]"); rosters, follow graph, leaderboard and new DMs still require 'active'. Admin cannot change a 'deleted' user's status (409). (5) The Fixture/Result RESTRICT gap: GrassrootsTeam deletion is no longer attempted at all - a team is nulled, never deleted, so Fixture.teamAId/teamBId and Result.fixtureId RESTRICT can no longer be hit by account deletion; closed for this path, no separate fix needed. NOT built / flagged: no retention timer on the anonymized 'deleted' row itself; Grassroots reassignment of a dormant team to a new organiser (separate follow-up); a departing user's BanterRoomMember/CommunityGroupMember/_ClubMembership rows are not removed (rosters filter non-active users but memberCount still counts them); the investigation hold has no maximum duration. Migration 20260919144247_account_anonymization_restrict_and_nullable.</w:t>
+              <w:t>Resolved by the founder, IMPLEMENTED (sprint-2/account-anonymization-reconsideration). SUPERSEDES #44 (cascade) and the "hard-delete, not anonymized" step of #42; #42's 30-day grace period and its ConsentAuditRecord retention are unchanged. (1) The User row is never DELETEd: at the end of the grace period AccountDeletionSweepService.anonymizeUser runs ONE atomic transaction. User: email -&gt; deleted-&lt;id&gt;@deleted.soccernity.internal (deterministic, unique), phone -&gt; null, displayName -&gt; "[deleted user]", passwordHash -&gt; an unverifiable value, dateOfBirth -&gt; null (column made nullable), clubAffiliationId -&gt; null, accountStatus -&gt; the new terminal value 'deleted' (distinct from 'pending_deletion', which now means the 30-day grace period OR held pending investigation; both block login identically). GrassrootsTeam.createdById (made nullable) -&gt; null for every team they organised, so the team goes dormant/read-only via the existing createdById !== caller 403 checks with no new guard code. Follow, Like, SavedPost, Notification rows for the user are deleted outright (Post.likeCount is decremented so the cache does not drift). Post, Comment, Message, Result are untouched - their FKs keep pointing at the anonymized row. Guardian (minors) unchanged from #42: snapshot to ConsentAuditRecord, then delete. Report rows are NEVER touched. (2) The 15 FKs sprint-2/account-deletion-cascade flipped to CASCADE (the eleven User-referencing tables plus Comment/SavedPost/Like -&gt; Post) are RESTRICT again, so an accidental real DELETE FROM "User" fails loudly; GrassrootsTeam.createdById is nullable + RESTRICT. (3) INVESTIGATION HOLD: before anonymizing a due account the sweep checks for a non-terminal Report involving them - status open, or actioned with appealStatus pending - as reporterId, as the direct target (targetType user), or (built, it was a clean single correlated query) as the author of a reported post/comment. If found, the account is skipped for that run - fully identifiable, still login-blocked - and retried every sweep; no new "held" flag, just a query predicate. (4) Feed read-visibility now shows posts by 'active' AND 'deleted' authors (attributed to "[deleted user]"); rosters, follow graph, leaderboard and new DMs still require 'active'. Admin cannot change a 'deleted' user's status (409). (5) The Fixture/Result RESTRICT gap: GrassrootsTeam deletion is no longer attempted at all - a team is nulled, never deleted, so Fixture.teamAId/teamBId and Result.fixtureId RESTRICT can no longer be hit by account deletion; closed for this path, no separate fix needed. NOT built / flagged: no retention timer on the anonymized 'deleted' row itself; Grassroots reassignment of a dormant team to a new organiser (separate follow-up); a departing user's BanterRoomMember/CommunityGroupMember/_ClubMembership rows are not removed (rosters filter non-active users but memberCount still counts them); the investigation hold has no maximum duration. Migration 20260919144308_account_anonymization_restrict_and_nullable. ALSO FLAGGED (not built): the earlier Banter/Community-Group-member, Contest and Points cascades were left unchanged by this redesign and are now inert on the User deletion side - a cleanup candidate.</w:t>
             </w:r>
           </w:p>
         </w:tc>
@@ -24214,7 +24214,7 @@
           </w:tcPr>
           <w:p>
             <w:r>
-              <w:t>Resolved - implemented, flagged. Open sub-questions: (1) a normalised (name, city) unique column would make the duplicate rule a DB guarantee and remove the advisory lock, a schema addition left for the founder; (2) name + city is a weak identity (two genuinely different clubs can share both) and the takeover inherits the old team's fixtures/results and verified flag, with no check the new registrant is connected to the team; (3) legacy duplicate rows created before this rule are handled by 'any live match blocks, else take the lowest id'.</w:t>
+              <w:t>Resolved - implemented, flagged. Open sub-questions: (1) a normalised (name, city) unique column would make the duplicate rule a DB guarantee and remove the advisory lock, a schema addition left for the founder; (2) name + city is a weak identity (two genuinely different clubs can share both) and the takeover inherits the old team's fixtures/results and verified flag, with no check the new registrant is connected to the team; (3) legacy duplicate rows created before this rule are handled by 'any live match blocks, else take the lowest id'. Also open: the web Grassroots register page does not yet show the reclaimed: true takeover notice (needs a figma-to-code follow-up).</w:t>
             </w:r>
           </w:p>
         </w:tc>

</xml_diff>

<commit_message>
Anonymization follow-ups: delete memberships in anonymizeUser, stalled-hold admin read, Decision Log #344/#345
Co-Authored-By: Claude Sonnet 5 <noreply@anthropic.com>
</commit_message>
<xml_diff>
--- a/docs/Soccernity_MVP_Build_Plan_v1.7.docx
+++ b/docs/Soccernity_MVP_Build_Plan_v1.7.docx
@@ -24257,6 +24257,90 @@
           <w:p>
             <w:r>
               <w:t>Open - authorization/scope is a founder call. Options: keep as built; restrict to admin/moderator only (a new admin route); or drop the endpoint and make takeover the only route. Also open: a dormant team WITH fixtures can only ever be taken over, never deleted, so a registrant who wants a genuinely separate team of the same name and city in that case has no route.</w:t>
+            </w:r>
+          </w:p>
+        </w:tc>
+      </w:tr>
+      <w:tr>
+        <w:tc>
+          <w:tcPr>
+            <w:tcW w:type="dxa" w:w="500"/>
+          </w:tcPr>
+          <w:p>
+            <w:r>
+              <w:t>344</w:t>
+            </w:r>
+          </w:p>
+        </w:tc>
+        <w:tc>
+          <w:tcPr>
+            <w:tcW w:type="dxa" w:w="4700"/>
+          </w:tcPr>
+          <w:p>
+            <w:r>
+              <w:t>Retention/purge timer for an anonymized ('deleted') User row. Should the anonymized row ever be hard-deleted after some period?</w:t>
+            </w:r>
+          </w:p>
+        </w:tc>
+        <w:tc>
+          <w:tcPr>
+            <w:tcW w:type="dxa" w:w="1850"/>
+          </w:tcPr>
+          <w:p>
+            <w:r>
+              <w:t>sprint-2/anonymization-followups; raised as not-built by sprint-2/account-anonymization-reconsideration (#341)</w:t>
+            </w:r>
+          </w:p>
+        </w:tc>
+        <w:tc>
+          <w:tcPr>
+            <w:tcW w:type="dxa" w:w="2300"/>
+          </w:tcPr>
+          <w:p>
+            <w:r>
+              <w:t>Resolved by design: NO purge timer, and none is to be built. Hard-deleting an anonymized User row later would defeat the whole point of #341's redesign. Post, Comment, Message and Result deliberately keep their FKs into that row so other users' content survives authored by '[deleted user]'; those FKs are RESTRICT again, so a later DELETE would either fail loudly or, if forced via CASCADE, remove real content belonging to uninvolved users - the exact harm #341 exists to prevent. The anonymized row holds no personal data (email is a deterministic placeholder, phone/dateOfBirth/clubAffiliationId null, unusable password hash, displayName '[deleted user]'), so GDPR Recital 26 puts it outside the regulation and there is no erasure obligation left for a timer to discharge. This is not an oversight; do not re-litigate it as a missing feature. ConsentAuditRecord keeps its own separate 6-month purge (#42) and is unaffected. Reopen only if counsel says an anonymized row still counts as personal data.</w:t>
+            </w:r>
+          </w:p>
+        </w:tc>
+      </w:tr>
+      <w:tr>
+        <w:tc>
+          <w:tcPr>
+            <w:tcW w:type="dxa" w:w="500"/>
+          </w:tcPr>
+          <w:p>
+            <w:r>
+              <w:t>345</w:t>
+            </w:r>
+          </w:p>
+        </w:tc>
+        <w:tc>
+          <w:tcPr>
+            <w:tcW w:type="dxa" w:w="4700"/>
+          </w:tcPr>
+          <w:p>
+            <w:r>
+              <w:t>Investigation-hold visibility. The hold placed on an account's anonymization by an open moderation Report has no maximum duration; how does a stalled investigation avoid being invisible?</w:t>
+            </w:r>
+          </w:p>
+        </w:tc>
+        <w:tc>
+          <w:tcPr>
+            <w:tcW w:type="dxa" w:w="1850"/>
+          </w:tcPr>
+          <w:p>
+            <w:r>
+              <w:t>sprint-2/anonymization-followups; raised as not-built by #341</w:t>
+            </w:r>
+          </w:p>
+        </w:tc>
+        <w:tc>
+          <w:tcPr>
+            <w:tcW w:type="dxa" w:w="2300"/>
+          </w:tcPr>
+          <w:p>
+            <w:r>
+              <w:t>Resolved - implemented. The hold stays unbounded BY DESIGN (an auto-expiring hold would undermine evidence integrity during an open investigation) - no auto-timeout or auto-action was built. Instead GET /admin/users/held-investigations?olderThanDays= (moderator/superadmin, read-only) lists held accounts whose hold has lasted longer than the threshold (held-since = pendingDeletionAt + 30-day grace). DEFAULT 90 days (HELD_INVESTIGATION_ALERT_DAYS), a judgment-call starting value that is tunable per request and by editing the constant. No admin UI screen exists yet for this list (apps/admin follow-up). Also in this PR: anonymizeUser now deletes Banter Room / Community Group / Club memberships in its transaction and decrements each memberCount, so counts are correct at the source rather than filtered at read time.</w:t>
             </w:r>
           </w:p>
         </w:tc>

</xml_diff>

<commit_message>
Add under-16 restriction tier: messaging/Bants off, Community Groups read-only, guardian contact on own profile
Decision Log #346. New User.isUnder16 layered on top of isMinor/GuardianConsentGuard.

Co-Authored-By: Claude Sonnet 5 <noreply@anthropic.com>
</commit_message>
<xml_diff>
--- a/docs/Soccernity_MVP_Build_Plan_v1.7.docx
+++ b/docs/Soccernity_MVP_Build_Plan_v1.7.docx
@@ -24341,6 +24341,48 @@
           <w:p>
             <w:r>
               <w:t>Resolved - implemented. The hold stays unbounded BY DESIGN (an auto-expiring hold would undermine evidence integrity during an open investigation) - no auto-timeout or auto-action was built. Instead GET /admin/users/held-investigations?olderThanDays= (moderator/superadmin, read-only) lists held accounts whose hold has lasted longer than the threshold (held-since = pendingDeletionAt + 30-day grace). DEFAULT 90 days (HELD_INVESTIGATION_ALERT_DAYS), a judgment-call starting value that is tunable per request and by editing the constant. No admin UI screen exists yet for this list (apps/admin follow-up). Also in this PR: anonymizeUser now deletes Banter Room / Community Group / Club memberships in its transaction and decrements each memberCount, so counts are correct at the source rather than filtered at read time.</w:t>
+            </w:r>
+          </w:p>
+        </w:tc>
+      </w:tr>
+      <w:tr>
+        <w:tc>
+          <w:tcPr>
+            <w:tcW w:type="dxa" w:w="500"/>
+          </w:tcPr>
+          <w:p>
+            <w:r>
+              <w:t>346</w:t>
+            </w:r>
+          </w:p>
+        </w:tc>
+        <w:tc>
+          <w:tcPr>
+            <w:tcW w:type="dxa" w:w="4700"/>
+          </w:tcPr>
+          <w:p>
+            <w:r>
+              <w:t>Under-16 restrictions (counsel's ToS/Privacy review). Counsel asked for a tier BELOW guardian consent: accounts under 16 get messaging disabled in both directions (no sending, no receiving from anyone, other minors included), Bants (Banter Rooms) fully disabled (no joining, no posting), Community Groups read-only (no creating content; no posting or commenting), and the guardian's email shown on the minor's own profile with a clear tag so anyone can reach the guardian. Layered ON TOP of isMinor / GuardianConsentGuard, never replacing them: an under-16 with CONFIRMED consent is still restricted. Schema: new User.isUnder16 Boolean (a flagged addition beyond Section 3), set at registration exactly where isMinor is (computeIsUnder16, same declared-DOB source), backfilled from dateOfBirth by the migration. Enforcement: new Under16RestrictionGuard + @RestrictUnder16(feature), reading isUnder16 fresh from Postgres (Section 5.7), returning 403 with code under_16_restricted (distinct from guardian_consent_pending); applied to all of /conversations and /banter-rooms and to POST /community-groups; the messaging RECIPIENT side is checked in MessagingService.assertRecipientMessageable. GET /users/:id (self-only) now returns isUnder16 and guardianContact {label: 'Guardian contact', email} for an under-16 only. Judgment calls to confirm: (a) Community Groups join/leave stay allowed (membership is not content); no group post/comment/reply endpoint exists, so nothing else to gate; (b) recipient-side messaging block is a clear 403, which unlike the existing restricted-pending 404 confirms the account exists; (c) isUnder16 is stored, not recomputed, so like isMinor it does not flip when the user turns 16 - an age-out job is needed; (d) 'any tag so anyone can reach the guardian' is read as exposure to the minor's own profile only, not other viewers; a public guardian-contact channel is a separate, unbuilt decision with real privacy implications. The 16-17 tier is a separate, later control, untouched here.</w:t>
+            </w:r>
+          </w:p>
+        </w:tc>
+        <w:tc>
+          <w:tcPr>
+            <w:tcW w:type="dxa" w:w="1850"/>
+          </w:tcPr>
+          <w:p>
+            <w:r>
+              <w:t>sprint-1/under-16-restrictions; raised by counsel review of the ToS/Privacy Policy draft</w:t>
+            </w:r>
+          </w:p>
+        </w:tc>
+        <w:tc>
+          <w:tcPr>
+            <w:tcW w:type="dxa" w:w="2300"/>
+          </w:tcPr>
+          <w:p>
+            <w:r>
+              <w:t>Resolved - implemented (backend), with open sub-decisions (a)-(d) above. Not built: age-out when a user turns 16; frontend handling of the under_16_restricted code; public guardian-contact channel.</w:t>
             </w:r>
           </w:p>
         </w:tc>

</xml_diff>

<commit_message>
Block adult-initiated new DM conversations with minors (Decision Log #347)
Co-Authored-By: Claude Sonnet 5 <noreply@anthropic.com>
</commit_message>
<xml_diff>
--- a/docs/Soccernity_MVP_Build_Plan_v1.7.docx
+++ b/docs/Soccernity_MVP_Build_Plan_v1.7.docx
@@ -24383,6 +24383,48 @@
           <w:p>
             <w:r>
               <w:t>Resolved - implemented (backend), with open sub-decisions (a)-(d) above. Not built: age-out when a user turns 16; frontend handling of the under_16_restricted code; public guardian-contact channel.</w:t>
+            </w:r>
+          </w:p>
+        </w:tc>
+      </w:tr>
+      <w:tr>
+        <w:tc>
+          <w:tcPr>
+            <w:tcW w:type="dxa" w:w="500"/>
+          </w:tcPr>
+          <w:p>
+            <w:r>
+              <w:t>347</w:t>
+            </w:r>
+          </w:p>
+        </w:tc>
+        <w:tc>
+          <w:tcPr>
+            <w:tcW w:type="dxa" w:w="4700"/>
+          </w:tcPr>
+          <w:p>
+            <w:r>
+              <w:t>Adult -&gt; minor DM initiation block (counsel's ToS/Privacy review). Counsel: 'Accounts classified as adults cannot initiate a direct message with accounts classified as minors', enforced at data-model/service level, not UI. MessagingService.startConversation now rejects (403, code adult_to_minor_dm_blocked) creating a NEW conversation when the caller has isMinor=false and the recipient has isMinor=true. Only creation is blocked: an existing thread (necessarily minor-initiated) is returned as before and sending into it is unaffected; minor-&gt;adult, minor-&gt;minor and adult-&gt;adult are allowed (under-16 total block, #346, and guardian-consent gating still apply separately). No prior accepted-connection/follow-back gate existed, so this is the first such gate. Trade-off: the 403 confirms the recipient account exists and is a minor to an adult caller who already passed the recipient checks (unconfirmed minors stay an indistinguishable 404).</w:t>
+            </w:r>
+          </w:p>
+        </w:tc>
+        <w:tc>
+          <w:tcPr>
+            <w:tcW w:type="dxa" w:w="1850"/>
+          </w:tcPr>
+          <w:p>
+            <w:r>
+              <w:t>sprint-1/adult-to-minor-dm-block; raised by counsel review of the ToS/Privacy Policy.</w:t>
+            </w:r>
+          </w:p>
+        </w:tc>
+        <w:tc>
+          <w:tcPr>
+            <w:tcW w:type="dxa" w:w="2300"/>
+          </w:tcPr>
+          <w:p>
+            <w:r>
+              <w:t>Resolved - implemented (backend). Open: isMinor is stored, not recomputed, so an account that turns 18 keeps its classification until a re-classification job exists (same as #346); frontend does not yet handle the new error code.</w:t>
             </w:r>
           </w:p>
         </w:tc>

</xml_diff>

<commit_message>
Record consent-screen version and device type on guardian consent audit trail (Decision Log #348)
Co-Authored-By: Claude Sonnet 5 <noreply@anthropic.com>
</commit_message>
<xml_diff>
--- a/docs/Soccernity_MVP_Build_Plan_v1.7.docx
+++ b/docs/Soccernity_MVP_Build_Plan_v1.7.docx
@@ -24425,6 +24425,48 @@
           <w:p>
             <w:r>
               <w:t>Resolved - implemented (backend). Open: isMinor is stored, not recomputed, so an account that turns 18 keeps its classification until a re-classification job exists (same as #346); frontend does not yet handle the new error code.</w:t>
+            </w:r>
+          </w:p>
+        </w:tc>
+      </w:tr>
+      <w:tr>
+        <w:tc>
+          <w:tcPr>
+            <w:tcW w:type="dxa" w:w="500"/>
+          </w:tcPr>
+          <w:p>
+            <w:r>
+              <w:t>348</w:t>
+            </w:r>
+          </w:p>
+        </w:tc>
+        <w:tc>
+          <w:tcPr>
+            <w:tcW w:type="dxa" w:w="4700"/>
+          </w:tcPr>
+          <w:p>
+            <w:r>
+              <w:t>Consent-screen version + device type on the guardian-consent audit record (counsel's UK GDPR Art. 7(1) evidentiary requirement: 'record the consent method, the version of the consent screen shown, the timestamp, and a minimal technical identifier such as device type'). What does 'consent-screen version' operationally mean, and where is it captured?</w:t>
+            </w:r>
+          </w:p>
+        </w:tc>
+        <w:tc>
+          <w:tcPr>
+            <w:tcW w:type="dxa" w:w="1850"/>
+          </w:tcPr>
+          <w:p>
+            <w:r>
+              <w:t>sprint-1/consent-audit-screen-version-device-type; raised by counsel review of the ToS/Privacy Policy.</w:t>
+            </w:r>
+          </w:p>
+        </w:tc>
+        <w:tc>
+          <w:tcPr>
+            <w:tcW w:type="dxa" w:w="2300"/>
+          </w:tcPr>
+          <w:p>
+            <w:r>
+              <w:t>Resolved - implemented (backend). OPERATIONAL MEANING: consentScreenVersion is a MANUALLY BUMPED string constant (CONSENT_SCREEN_VERSION = 'v1', services/api/src/modules/auth/guardian-consent/consent-screen-version.constants.ts). Nothing derives it from the screen's content, a hash or a git revision, and nothing detects drift: whoever materially changes the guardian-consent confirmation screen's wording or substance (apps/web GuardianConsentConfirmPage.tsx / its Figma frame) must bump it in the same PR. Cosmetic changes need no bump. deviceType is a coarse 'mobile' | 'desktop' | 'unknown' derived from the User-Agent header at confirmation; the raw User-Agent is never stored (data minimisation). WHERE: ConsentAuditRecord only exists from anonymization time (a snapshot), so both values are stamped onto the Guardian row (new nullable consentScreenVersion / consentDeviceType) in the SAME updateMany as consentTimestamp in confirmConsent - no new write path - then snapshotted into ConsentAuditRecord.consentScreenVersion / deviceType by AccountDeletionSweepService. Flagged: two additive nullable columns on Guardian (beyond Section 3; safeguarding fields untouched, nothing weakened). Existing rows carry NULL, not backfilled. No admin/compliance export of ConsentAuditRecord exists to update. Open: the version constant is only as reliable as reviewers remembering to bump it; the guardian-facing page is not yet checked against it in CI; an idempotent re-confirm never overwrites the original evidence.</w:t>
             </w:r>
           </w:p>
         </w:tc>

</xml_diff>

<commit_message>
Add daily age reclassification sweep for isMinor/isUnder16 (Decision Log #349)
Recomputes both flags from dateOfBirth for mismatched accounts (both
directions), logs each change to an append-only AgeReclassificationLog in
the same transaction. Guards read fresh from Postgres, so the change is
immediate on existing sessions. Consent-expiry and refusal paths now skip
non-minors so a stale pending request cannot auto-decline an adult.

Co-Authored-By: Claude Sonnet 5 <noreply@anthropic.com>
</commit_message>
<xml_diff>
--- a/docs/Soccernity_MVP_Build_Plan_v1.7.docx
+++ b/docs/Soccernity_MVP_Build_Plan_v1.7.docx
@@ -24382,7 +24382,7 @@
           </w:tcPr>
           <w:p>
             <w:r>
-              <w:t>Resolved - implemented (backend), with open sub-decisions (a)-(d) above. Not built: age-out when a user turns 16; frontend handling of the under_16_restricted code; public guardian-contact channel.</w:t>
+              <w:t>Resolved - implemented (backend), with open sub-decisions (a)-(d) above. Not built: age-out when a user turns 16; frontend handling of the under_16_restricted code; public guardian-contact channel. FORWARD-POINTER: age-out now implemented by #349 (sprint-1/age-reclassification-sweep).</w:t>
             </w:r>
           </w:p>
         </w:tc>
@@ -24424,7 +24424,7 @@
           </w:tcPr>
           <w:p>
             <w:r>
-              <w:t>Resolved - implemented (backend). Open: isMinor is stored, not recomputed, so an account that turns 18 keeps its classification until a re-classification job exists (same as #346); frontend does not yet handle the new error code.</w:t>
+              <w:t>Resolved - implemented (backend). Open: isMinor is stored, not recomputed, so an account that turns 18 keeps its classification until a re-classification job exists (same as #346); frontend does not yet handle the new error code. FORWARD-POINTER: age-out now implemented by #349 (sprint-1/age-reclassification-sweep).</w:t>
             </w:r>
           </w:p>
         </w:tc>
@@ -24467,6 +24467,48 @@
           <w:p>
             <w:r>
               <w:t>Resolved - implemented (backend). OPERATIONAL MEANING: consentScreenVersion is a MANUALLY BUMPED string constant (CONSENT_SCREEN_VERSION = 'v1', services/api/src/modules/auth/guardian-consent/consent-screen-version.constants.ts). Nothing derives it from the screen's content, a hash or a git revision, and nothing detects drift: whoever materially changes the guardian-consent confirmation screen's wording or substance (apps/web GuardianConsentConfirmPage.tsx / its Figma frame) must bump it in the same PR. Cosmetic changes need no bump. deviceType is a coarse 'mobile' | 'desktop' | 'unknown' derived from the User-Agent header at confirmation; the raw User-Agent is never stored (data minimisation). WHERE: ConsentAuditRecord only exists from anonymization time (a snapshot), so both values are stamped onto the Guardian row (new nullable consentScreenVersion / consentDeviceType) in the SAME updateMany as consentTimestamp in confirmConsent - no new write path - then snapshotted into ConsentAuditRecord.consentScreenVersion / deviceType by AccountDeletionSweepService. Flagged: two additive nullable columns on Guardian (beyond Section 3; safeguarding fields untouched, nothing weakened). Existing rows carry NULL, not backfilled. No admin/compliance export of ConsentAuditRecord exists to update. Open: the version constant is only as reliable as reviewers remembering to bump it; the guardian-facing page is not yet checked against it in CI; an idempotent re-confirm never overwrites the original evidence.</w:t>
+            </w:r>
+          </w:p>
+        </w:tc>
+      </w:tr>
+      <w:tr>
+        <w:tc>
+          <w:tcPr>
+            <w:tcW w:type="dxa" w:w="500"/>
+          </w:tcPr>
+          <w:p>
+            <w:r>
+              <w:t>349</w:t>
+            </w:r>
+          </w:p>
+        </w:tc>
+        <w:tc>
+          <w:tcPr>
+            <w:tcW w:type="dxa" w:w="4700"/>
+          </w:tcPr>
+          <w:p>
+            <w:r>
+              <w:t>Age reclassification sweep (closes the gap #346/#347 disclosed). isMinor and isUnder16 were set once at registration and never recomputed. A daily @Cron sweep (AgeReclassificationSweepService, 02:00) recomputes both from dateOfBirth for accounts whose stored value no longer matches, both directions, and writes one append-only AgeReclassificationLog row per field changed (userId a plain string, no FK, so it survives anonymization; stores derived age, not DOB), in the same transaction as the User update. TRANSITION BEHAVIOUR: immediate, not next-login - the JWT carries only {sub, role} and GuardianConsentGuard, Under16RestrictionGuard and the messaging adult-&gt;minor / recipient checks all read the flags fresh from Postgres per request, so the very next request on an existing session sees the new classification. Turning 16: nothing to reverse. Turning 18: the Guardian row is neither deleted nor given a new terminal status (a confirmed row is consent history and just stops being read); a PENDING row is made inert - the guardian-consent expiry sweep and every refusal path (decline/withdraw/expiry) now skip non-minors so an adult cannot be auto-declined into deletion by a request made when they were a child; account anonymization now snapshots any Guardian row regardless of isMinor.</w:t>
+            </w:r>
+          </w:p>
+        </w:tc>
+        <w:tc>
+          <w:tcPr>
+            <w:tcW w:type="dxa" w:w="1850"/>
+          </w:tcPr>
+          <w:p>
+            <w:r>
+              <w:t>sprint-1/age-reclassification-sweep; follow-up to #346/#347 open items</w:t>
+            </w:r>
+          </w:p>
+        </w:tc>
+        <w:tc>
+          <w:tcPr>
+            <w:tcW w:type="dxa" w:w="2300"/>
+          </w:tcPr>
+          <w:p>
+            <w:r>
+              <w:t>Resolved - implemented (backend). Open: the sweep is daily so a user can be misclassified for up to ~24h after a birthday; no notification is sent to a user or guardian on reclassification; frontend not changed.</w:t>
             </w:r>
           </w:p>
         </w:tc>

</xml_diff>

<commit_message>
Decision Log #350: no latency padding on startConversation (resolved by design)
Co-Authored-By: Claude Sonnet 5 <noreply@anthropic.com>
</commit_message>
<xml_diff>
--- a/docs/Soccernity_MVP_Build_Plan_v1.7.docx
+++ b/docs/Soccernity_MVP_Build_Plan_v1.7.docx
@@ -24424,7 +24424,7 @@
           </w:tcPr>
           <w:p>
             <w:r>
-              <w:t>Resolved - implemented (backend). Open: isMinor is stored, not recomputed, so an account that turns 18 keeps its classification until a re-classification job exists (same as #346); frontend does not yet handle the new error code. FORWARD-POINTER: age-out now implemented by #349 (sprint-1/age-reclassification-sweep).</w:t>
+              <w:t>Resolved - implemented (backend). Open: isMinor is stored, not recomputed, so an account that turns 18 keeps its classification until a re-classification job exists (same as #346); frontend does not yet handle the new error code. FORWARD-POINTER: age-out now implemented by #349 (sprint-1/age-reclassification-sweep). FORWARD-POINTER: the enumeration/timing follow-up chain is closed out by #350 (no latency padding, by decision).</w:t>
             </w:r>
           </w:p>
         </w:tc>
@@ -24509,6 +24509,48 @@
           <w:p>
             <w:r>
               <w:t>Resolved - implemented (backend). Open: the sweep is daily so a user can be misclassified for up to ~24h after a birthday; no notification is sent to a user or guardian on reclassification; frontend not changed.</w:t>
+            </w:r>
+          </w:p>
+        </w:tc>
+      </w:tr>
+      <w:tr>
+        <w:tc>
+          <w:tcPr>
+            <w:tcW w:type="dxa" w:w="500"/>
+          </w:tcPr>
+          <w:p>
+            <w:r>
+              <w:t>350</w:t>
+            </w:r>
+          </w:p>
+        </w:tc>
+        <w:tc>
+          <w:tcPr>
+            <w:tcW w:type="dxa" w:w="4700"/>
+          </w:tcPr>
+          <w:p>
+            <w:r>
+              <w:t>Whether to add fixed-latency padding to MessagingService.startConversation to fully close the residual timing side-channel left after PR #280 (sprint-1/dm-enumeration-timing-parity), which equalized database work across all four new-conversation outcomes (missing / deactivated / restricted-pending / adult-&gt;confirmed-minor) but left ordinary network and DB jitter unaddressed. Chain: #347 (adult-&gt;minor DM block) -&gt; PR #276 (enumeration fix: 403 replaced by the same 404) -&gt; PR #280 (timing parity: identical query count and arguments) -&gt; #350 (this entry).</w:t>
+            </w:r>
+          </w:p>
+        </w:tc>
+        <w:tc>
+          <w:tcPr>
+            <w:tcW w:type="dxa" w:w="1850"/>
+          </w:tcPr>
+          <w:p>
+            <w:r>
+              <w:t>docs/decision-log-350-no-timing-padding; follow-up to #347 and its enumeration-fix / timing-parity chain (PRs #276, #280).</w:t>
+            </w:r>
+          </w:p>
+        </w:tc>
+        <w:tc>
+          <w:tcPr>
+            <w:tcW w:type="dxa" w:w="2300"/>
+          </w:tcPr>
+          <w:p>
+            <w:r>
+              <w:t>Resolved - will not pad (founder decision). The primary, cheaply exploitable signal (a structural extra query) is already closed by PR #280. What remains requires an attacker to send a large volume of repeated requests against a single target account and statistically extract a signal from noise dominated by ordinary network/infrastructure jitter, not application logic - a materially harder and less reliable attack than the one already closed. Closing it fully would need a fixed artificial latency floor on every startConversation call, paid permanently by every legitimate user, for a reduction in an already high-effort, low-reward residual risk. Judged not worth the tradeoff. Revisit only if a specific compliance requirement or counsel review later demands full constant-time guarantees on this path.</w:t>
             </w:r>
           </w:p>
         </w:tc>

</xml_diff>

<commit_message>
Legal copy draft v0.3: under-16 tier, adult-to-minor DM block, consent evidence fields, age reclassification
Co-Authored-By: Claude Sonnet 5 <noreply@anthropic.com>
</commit_message>
<xml_diff>
--- a/docs/Soccernity_MVP_Build_Plan_v1.7.docx
+++ b/docs/Soccernity_MVP_Build_Plan_v1.7.docx
@@ -18217,6 +18217,10 @@
             <w:r>
               <w:rPr/>
               <w:t>DRAFT NOW EXISTS, #203 STILL OPEN: sprint-2/legal-copy-draft-tos-privacy (safeguarding-drafter) produced a first-pass draft of both documents -- docs/legal-copy-draft-tos-privacy-policy.md -- grounded in Section 8, Section 3, and the live Decision Log (#4, #8, #10, #19, #21, #31, #34, #37, #38, #40, #41, #42, #44, #45, #55, #58, #60, #128-#130, #138, #153-#155), with every retention period, age threshold, and policy claim marked [PROPOSAL] or [OPEN], matching the sprint-1-dpia-outline-draft.md convention. Decision Log #4 (jurisdictional scope) is explicitly NOT resolved by this draft -- both documents are written against UK GDPR + Nigeria NDPA 2023 as a working baseline only. This PR does NOT close #203 -- it remains open until Soccernity's legal counsel actually reviews and signs off (the draft's own blank sign-off block). A genuine sizing problem was also flagged: the draft ToS (~2,400 words) and Privacy Policy (~3,600 words) both exceed the Figma body-text boxes' no-scroll capacity (estimated ~1,000-1,150 words desktop, ~900-1,050 mobile) -- a scrollable body or a resized frame is needed once counsel-approved copy is ready to insert, not a compressed draft.</w:t>
+            </w:r>
+            <w:r>
+              <w:br/>
+              <w:t>v0.3 EXISTS, PENDING FIRST COUNSEL REVIEW OF ITS NEW SECTIONS (2026-09-20, docs/legal-copy-draft-v0.3): docs/legal-copy-draft-tos-privacy-policy.md is now v0.3 (still NOT APPROVED). v0.2 (PRs #270/#271) applied counsel's 09/09/2026 'Approved with amendments' review of v0.1; v0.3 adds only what four later-shipped safeguarding features require, drafted from the merged code: (1) the under-16 tier (PR #272, DL #346); (2) the adult-cannot-message-minor block, enumeration-safe, with the residual timing-jitter limitation stated honestly (PRs #273/#276/#280, DL #347/#350); (3) consent-audit enrichment with consent-screen version and coarse device type (PR #274, DL #348); (4) the daily age-reclassification sweep with guardian email at 18, in-app notice at 16 and the accepted ~24h window (PRs #275/#279/#281/#282, DL #349). A v0.3 changelog at the top of the document lets counsel review the diff from v0.2 instead of re-reading it cold. Counsel-approved v0.2 wording was not silently rewritten; four tensions are flagged in Part C rows 24-27. #203 REMAINS OPEN until counsel signs off.</w:t>
             </w:r>
           </w:p>
         </w:tc>

</xml_diff>

<commit_message>
Messaging: under-16 recipient now indistinguishable 404 (Decision Log #351, reverses #346)
Closes a direct account-enumeration signal on minor accounts. Sender-side
403 unchanged. Unit + e2e assertions updated, README trade-off rewritten,
Decision Log #351 added with forward-pointer on #346.

Co-Authored-By: Claude Sonnet 5 <noreply@anthropic.com>
</commit_message>
<xml_diff>
--- a/docs/Soccernity_MVP_Build_Plan_v1.7.docx
+++ b/docs/Soccernity_MVP_Build_Plan_v1.7.docx
@@ -24388,6 +24388,9 @@
             <w:r>
               <w:t>Resolved - implemented (backend), with open sub-decisions (a)-(d) above. Not built: age-out when a user turns 16; frontend handling of the under_16_restricted code; public guardian-contact channel. FORWARD-POINTER: age-out now implemented by #349 (sprint-1/age-reclassification-sweep).</w:t>
             </w:r>
+            <w:r>
+              <w:t xml:space="preserve"> Forward-pointer: the under-16 RECIPIENT 403 described here is reversed by #351 (now an indistinguishable 404); sender-side 403 unchanged.</w:t>
+            </w:r>
           </w:p>
         </w:tc>
       </w:tr>
@@ -24555,6 +24558,48 @@
           <w:p>
             <w:r>
               <w:t>Resolved - will not pad (founder decision). The primary, cheaply exploitable signal (a structural extra query) is already closed by PR #280. What remains requires an attacker to send a large volume of repeated requests against a single target account and statistically extract a signal from noise dominated by ordinary network/infrastructure jitter, not application logic - a materially harder and less reliable attack than the one already closed. Closing it fully would need a fixed artificial latency floor on every startConversation call, paid permanently by every legitimate user, for a reduction in an already high-effort, low-reward residual risk. Judged not worth the tradeoff. Revisit only if a specific compliance requirement or counsel review later demands full constant-time guarantees on this path.</w:t>
+            </w:r>
+          </w:p>
+        </w:tc>
+      </w:tr>
+      <w:tr>
+        <w:tc>
+          <w:tcPr>
+            <w:tcW w:type="dxa" w:w="500"/>
+          </w:tcPr>
+          <w:p>
+            <w:r>
+              <w:t>351</w:t>
+            </w:r>
+          </w:p>
+        </w:tc>
+        <w:tc>
+          <w:tcPr>
+            <w:tcW w:type="dxa" w:w="4700"/>
+          </w:tcPr>
+          <w:p>
+            <w:r>
+              <w:t>Reverse Decision Log #346's distinct 403 for an under-16 messaging RECIPIENT: return the same indistinguishable 404 ("User not found") used for non-existent, deactivated, restricted-pending and adult-&gt;minor recipients.</w:t>
+            </w:r>
+          </w:p>
+        </w:tc>
+        <w:tc>
+          <w:tcPr>
+            <w:tcW w:type="dxa" w:w="1850"/>
+          </w:tcPr>
+          <w:p>
+            <w:r>
+              <w:t>sprint-1/under-16-recipient-404 (2026-09-20)</w:t>
+            </w:r>
+          </w:p>
+        </w:tc>
+        <w:tc>
+          <w:tcPr>
+            <w:tcW w:type="dxa" w:w="2300"/>
+          </w:tcPr>
+          <w:p>
+            <w:r>
+              <w:t>Resolved/implemented. A distinct 403 let anyone learn, in one request with no statistical work, that an account exists and is under 16 — a far easier and more sensitive signal than the timing channel #350 declined to close. Trade-off stated plainly: senders no longer get a specific reason (less UX clarity) in exchange for closing a direct enumeration signal on minor accounts. The sender-side 403 (under-16 caller) is unchanged. REVERSES the behaviour counsel was told about at #346, so it must go back to counsel alongside legal-copy v0.4/v0.5 and DPIA v0.2 for confirmation.</w:t>
             </w:r>
           </w:p>
         </w:tc>

</xml_diff>

<commit_message>
Figma cleanup retouches: DL #53/#184/#185/#186/#311/#312/#314 + mobile homepage parity
Docx Decision Log status cells and CLAUDE.md status bullet updated.

Co-Authored-By: Claude Sonnet 5 <noreply@anthropic.com>
</commit_message>
<xml_diff>
--- a/docs/Soccernity_MVP_Build_Plan_v1.7.docx
+++ b/docs/Soccernity_MVP_Build_Plan_v1.7.docx
@@ -11868,7 +11868,10 @@
           </w:tcPr>
           <w:p>
             <w:r>
-              <w:t xml:space="preserve">Open — the calendar component needs its own token-retrofit pass. Partially resolved by sprint-2/admin-panel-structural-pass (figma-design-system): the 'calendar 2' variant (2365:2034) of Calendar for scheduled task (2365:2033) -- the only variant instanced anywhere in the file, on Contest - Schedule Task (5403:6753) -- is fully token-bound (66 paints rebound to Soccernity Theme Light tokens; audit after: 103 bound, 0 unbound-visible). 5 opacity-0 / frosted-panel paints deliberately left unbound and disclosed (a bound paint takes the token's alpha, which would make the invisible adjacent-month days visible). The un-instanced 'calendar 1' variant (2363:2242) is still unbound -- see Decision Log #178, to be done in the same dedicated session as #180. UPDATE (sprint-2/admin-panel-fast-follow): the remaining "calendar 1" variant (2363:2242) is now also fully retrofitted -- 100 bound / 4 unbound-visible (disclosed) / 1 unbound-hidden (disclosed), the same shape and precedent as calendar 2's own earlier retrofit. Decision Log #178 is now fully closed -- both calendar variants in the file are token-bound.</w:t>
+              <w:t>Resolved — the calendar component needs its own token-retrofit pass. Partially resolved by sprint-2/admin-panel-structural-pass (figma-design-system): the 'calendar 2' variant (2365:2034) of Calendar for scheduled task (2365:2033) -- the only variant instanced anywhere in the file, on Contest - Schedule Task (5403:6753) -- is fully token-bound (66 paints rebound to Soccernity Theme Light tokens; audit after: 103 bound, 0 unbound-visible). 5 opacity-0 / frosted-panel paints deliberately left unbound and disclosed (a bound paint takes the token's alpha, which would make the invisible adjacent-month days visible). The un-instanced 'calendar 1' variant (2363:2242) is still unbound -- see Decision Log #178, to be done in the same dedicated session as #180. UPDATE (sprint-2/admin-panel-fast-follow): the remaining "calendar 1" variant (2363:2242) is now also fully retrofitted -- 100 bound / 4 unbound-visible (disclosed) / 1 unbound-hidden (disclosed), the same shape and precedent as calendar 2's own earlier retrofit. Decision Log #178 is now fully closed -- both calendar variants in the file are token-bound.</w:t>
+            </w:r>
+            <w:r>
+              <w:t xml:space="preserve"> RESOLVED (verified by figma/decision-log-cleanup-retouches): re-audited live -- the 'calendar 2' variant (2365:2034) is already token-bound by sprint-2/admin-panel-structural-pass (65 bound / 5 unbound: 4 opacity-0 adjacent-month numerals + 1 hidden frosted panel, the same disclosed set), and 'calendar 1' was closed by sprint-2/admin-panel-fast-follow (DL #178). The brief for this pass assumed calendar 2 was still outstanding; it was not. No paint was changed -- binding the 5 remaining paints would force their alpha to the token's and make invisible days visible. Nothing further outstanding.</w:t>
             </w:r>
           </w:p>
         </w:tc>
@@ -17396,7 +17399,10 @@
           </w:tcPr>
           <w:p>
             <w:r>
-              <w:t>Open -- fold into the Log Book Section 23.4 generic-component-set naming cleanup so header 7's nav-item layer names match header 4's (home / community / clubs / Bants). Low priority, cosmetic.</w:t>
+              <w:t>Resolved -- fold into the Log Book Section 23.4 generic-component-set naming cleanup so header 7's nav-item layer names match header 4's (home / community / clubs / Bants). Low priority, cosmetic.</w:t>
+            </w:r>
+            <w:r>
+              <w:t xml:space="preserve"> RESOLVED by figma/decision-log-cleanup-retouches: header 7 nav-item layers Group 833 -&gt; livesocre and Group 830 -&gt; blog (2841:4120, 2841:4125), matching header 4's names (home / livesocre / blog / community / leaderboad / Bants / clubs / grassroots / scouting / academy). Names only, zero visual change. Note header 4's own layer names are legacy spellings (livesocre, leaderboad); matched as-is rather than renaming the shared set.</w:t>
             </w:r>
           </w:p>
         </w:tc>
@@ -17438,7 +17444,10 @@
           </w:tcPr>
           <w:p>
             <w:r>
-              <w:t>Open -- not fixed here (retouching existing screens is figma-design-system's domain; this was a build task). A modal scrim should be translucent -- the Navigation Drawer's stacked color/icon/inactive technique (PR #145) is the file's working precedent given a variable-bound paint takes its alpha from the variable. Recommend a scoped figma-design-system fix pass, folded with #186.</w:t>
+              <w:t>Resolved -- not fixed here (retouching existing screens is figma-design-system's domain; this was a build task). A modal scrim should be translucent -- the Navigation Drawer's stacked color/icon/inactive technique (PR #145) is the file's working precedent given a variable-bound paint takes its alpha from the variable. Recommend a scoped figma-design-system fix pass, folded with #186.</w:t>
+            </w:r>
+            <w:r>
+              <w:t xml:space="preserve"> RESOLVED by figma/decision-log-cleanup-retouches: the full-bleed opaque white Rectangle 134 scrim is now two stacked color/icon/inactive fills (navy 15% each, the Navigation Drawer precedent from PR #145) on 2459:14444 and 2459:12080, so the Banter page shows through behind the Filter dialog. Also applied to the base 'Bants homepage - search filter' frame (2459:10005) which carried the identical opaque rectangle -- three frames, not the two named.</w:t>
             </w:r>
           </w:p>
         </w:tc>
@@ -17480,7 +17489,10 @@
           </w:tcPr>
           <w:p>
             <w:r>
-              <w:t>Open -- not fixed here (existing-screen retouch, out of scope for a build task). Rebind to color/icon/inactive (the divider token used elsewhere in the file). Folds into the same figma-design-system pass as #185.</w:t>
+              <w:t>Resolved -- not fixed here (existing-screen retouch, out of scope for a build task). Rebind to color/icon/inactive (the divider token used elsewhere in the file). Folds into the same figma-design-system pass as #185.</w:t>
+            </w:r>
+            <w:r>
+              <w:t xml:space="preserve"> RESOLVED by figma/decision-log-cleanup-retouches: Line 66 divider stroke (2459:14472 / 2459:12108 / 2459:10025) rebound from unbound #034694 to color/icon/inactive on all three Banter filter frames. Not changed, deliberately: the same #034694 is used by club-crest artwork vectors (16 per frame) and a footer '(c) 2022 Soccernity' text node; an over-broad first pass recolored these and was reverted, verified against untouched frame 2256:6802 (16 vectors + 1 text, unbound, opacity 1). The footer text is still off-palette blue and its stale 2022 year is untouched -- open for a footer pass.</w:t>
             </w:r>
           </w:p>
         </w:tc>
@@ -22869,6 +22881,104 @@
           <w:p>
             <w:r/>
             <w:r>
+              <w:t>Resolved-pending-code</w:t>
+            </w:r>
+            <w:r>
+              <w:t xml:space="preserve"> in Figma (code half pending) by figma/decision-log-cleanup-retouches: all 10 match-centre desktop frames (Match Details, Match/1H/2H Statistics, Lineups, H2H, Standing, Video, Match Momentum, Live Commentary) now carry a 1440x90 'Navbar - header 4' instance (visible) plus a hidden 'Navbar - header 7' at (0,0), the Blog PR #151 convention; the top 146px of each frame was empty so nothing moved. Both auth variants live on one frame rather than a Logged In/Out split (cf. DL #169) -- 10 more frames would be needed for a split; flagged. Code half: companion figma-to-code PR wires the shared Header into the match-centre pages.</w:t>
+            </w:r>
+          </w:p>
+        </w:tc>
+      </w:tr>
+      <w:tr>
+        <w:tc>
+          <w:tcPr>
+            <w:tcW w:type="dxa" w:w="500"/>
+          </w:tcPr>
+          <w:p>
+            <w:r/>
+            <w:r>
+              <w:t>312</w:t>
+            </w:r>
+          </w:p>
+        </w:tc>
+        <w:tc>
+          <w:tcPr>
+            <w:tcW w:type="dxa" w:w="4700"/>
+          </w:tcPr>
+          <w:p>
+            <w:r/>
+            <w:r>
+              <w:t>#8f8f8f @10% stat-bar track rectangles (×108, 36 per screen across the 3 desktop statistics screens) are genuine non-crest, off-palette, unbound UI colour — not covered by PR #111's flag/crest/jersey-art disclosure for this section. Recommend rebinding to color/icon/inactive in a future token pass.</w:t>
+            </w:r>
+          </w:p>
+        </w:tc>
+        <w:tc>
+          <w:tcPr>
+            <w:tcW w:type="dxa" w:w="1850"/>
+          </w:tcPr>
+          <w:p>
+            <w:r/>
+            <w:r>
+              <w:t>docs/sprint-4-sports-hub-highlightly-data-redesign-report.md (sprint-4/sports-hub-highlightly-data-redesign, figma-screen-builder, 2026-09-16), §4.3</w:t>
+            </w:r>
+          </w:p>
+        </w:tc>
+        <w:tc>
+          <w:tcPr>
+            <w:tcW w:type="dxa" w:w="2300"/>
+          </w:tcPr>
+          <w:p>
+            <w:r/>
+            <w:r>
+              <w:t>Resolved</w:t>
+            </w:r>
+            <w:r>
+              <w:t xml:space="preserve"> by figma/decision-log-cleanup-retouches: all 108 #8f8f8f @10% stat-bar track rectangles (36 each on 640:3737, 667:151, 667:1511) rebound to color/icon/inactive.</w:t>
+            </w:r>
+          </w:p>
+        </w:tc>
+      </w:tr>
+      <w:tr>
+        <w:tc>
+          <w:tcPr>
+            <w:tcW w:type="dxa" w:w="500"/>
+          </w:tcPr>
+          <w:p>
+            <w:r/>
+            <w:r>
+              <w:t>313</w:t>
+            </w:r>
+          </w:p>
+        </w:tc>
+        <w:tc>
+          <w:tcPr>
+            <w:tcW w:type="dxa" w:w="4700"/>
+          </w:tcPr>
+          <w:p>
+            <w:r/>
+            <w:r>
+              <w:t>Whether player box scores on Match/1H/2H Statistics should include a RATING column. Scoped in during design, then removed before build — player ratings are a derived metric not named in Highlightly's confirmed data-category list (possession, shots, corners, fouls, cards, passes, box scores). Needs vendor confirmation before any rating UI is designed.</w:t>
+            </w:r>
+          </w:p>
+        </w:tc>
+        <w:tc>
+          <w:tcPr>
+            <w:tcW w:type="dxa" w:w="1850"/>
+          </w:tcPr>
+          <w:p>
+            <w:r/>
+            <w:r>
+              <w:t>docs/sprint-4-sports-hub-highlightly-data-redesign-report.md (sprint-4/sports-hub-highlightly-data-redesign, figma-screen-builder, 2026-09-16), §3</w:t>
+            </w:r>
+          </w:p>
+        </w:tc>
+        <w:tc>
+          <w:tcPr>
+            <w:tcW w:type="dxa" w:w="2300"/>
+          </w:tcPr>
+          <w:p>
+            <w:r/>
+            <w:r>
               <w:t>Open</w:t>
             </w:r>
           </w:p>
@@ -22882,7 +22992,7 @@
           <w:p>
             <w:r/>
             <w:r>
-              <w:t>312</w:t>
+              <w:t>314</w:t>
             </w:r>
           </w:p>
         </w:tc>
@@ -22893,7 +23003,7 @@
           <w:p>
             <w:r/>
             <w:r>
-              <w:t>#8f8f8f @10% stat-bar track rectangles (×108, 36 per screen across the 3 desktop statistics screens) are genuine non-crest, off-palette, unbound UI colour — not covered by PR #111's flag/crest/jersey-art disclosure for this section. Recommend rebinding to color/icon/inactive in a future token pass.</w:t>
+              <w:t>Legacy score-header crest artwork (XMLID_189_) renders outside its own reported node bounds and visually overlaps the team-name text on every desktop match-centre frame — pre-existing on all 8 legacy frames, now inherited by the 2 new frames (Match Momentum, Live Commentary) via the cloned score header. Cosmetic, file-wide; needs a figma-design-system fix.</w:t>
             </w:r>
           </w:p>
         </w:tc>
@@ -22904,7 +23014,7 @@
           <w:p>
             <w:r/>
             <w:r>
-              <w:t>docs/sprint-4-sports-hub-highlightly-data-redesign-report.md (sprint-4/sports-hub-highlightly-data-redesign, figma-screen-builder, 2026-09-16), §4.3</w:t>
+              <w:t>docs/sprint-4-sports-hub-highlightly-data-redesign-report.md (sprint-4/sports-hub-highlightly-data-redesign, figma-screen-builder, 2026-09-16), §5</w:t>
             </w:r>
           </w:p>
         </w:tc>
@@ -22915,99 +23025,10 @@
           <w:p>
             <w:r/>
             <w:r>
-              <w:t>Open</w:t>
-            </w:r>
-          </w:p>
-        </w:tc>
-      </w:tr>
-      <w:tr>
-        <w:tc>
-          <w:tcPr>
-            <w:tcW w:type="dxa" w:w="500"/>
-          </w:tcPr>
-          <w:p>
-            <w:r/>
-            <w:r>
-              <w:t>313</w:t>
-            </w:r>
-          </w:p>
-        </w:tc>
-        <w:tc>
-          <w:tcPr>
-            <w:tcW w:type="dxa" w:w="4700"/>
-          </w:tcPr>
-          <w:p>
-            <w:r/>
-            <w:r>
-              <w:t>Whether player box scores on Match/1H/2H Statistics should include a RATING column. Scoped in during design, then removed before build — player ratings are a derived metric not named in Highlightly's confirmed data-category list (possession, shots, corners, fouls, cards, passes, box scores). Needs vendor confirmation before any rating UI is designed.</w:t>
-            </w:r>
-          </w:p>
-        </w:tc>
-        <w:tc>
-          <w:tcPr>
-            <w:tcW w:type="dxa" w:w="1850"/>
-          </w:tcPr>
-          <w:p>
-            <w:r/>
-            <w:r>
-              <w:t>docs/sprint-4-sports-hub-highlightly-data-redesign-report.md (sprint-4/sports-hub-highlightly-data-redesign, figma-screen-builder, 2026-09-16), §3</w:t>
-            </w:r>
-          </w:p>
-        </w:tc>
-        <w:tc>
-          <w:tcPr>
-            <w:tcW w:type="dxa" w:w="2300"/>
-          </w:tcPr>
-          <w:p>
-            <w:r/>
-            <w:r>
-              <w:t>Open</w:t>
-            </w:r>
-          </w:p>
-        </w:tc>
-      </w:tr>
-      <w:tr>
-        <w:tc>
-          <w:tcPr>
-            <w:tcW w:type="dxa" w:w="500"/>
-          </w:tcPr>
-          <w:p>
-            <w:r/>
-            <w:r>
-              <w:t>314</w:t>
-            </w:r>
-          </w:p>
-        </w:tc>
-        <w:tc>
-          <w:tcPr>
-            <w:tcW w:type="dxa" w:w="4700"/>
-          </w:tcPr>
-          <w:p>
-            <w:r/>
-            <w:r>
-              <w:t>Legacy score-header crest artwork (XMLID_189_) renders outside its own reported node bounds and visually overlaps the team-name text on every desktop match-centre frame — pre-existing on all 8 legacy frames, now inherited by the 2 new frames (Match Momentum, Live Commentary) via the cloned score header. Cosmetic, file-wide; needs a figma-design-system fix.</w:t>
-            </w:r>
-          </w:p>
-        </w:tc>
-        <w:tc>
-          <w:tcPr>
-            <w:tcW w:type="dxa" w:w="1850"/>
-          </w:tcPr>
-          <w:p>
-            <w:r/>
-            <w:r>
-              <w:t>docs/sprint-4-sports-hub-highlightly-data-redesign-report.md (sprint-4/sports-hub-highlightly-data-redesign, figma-screen-builder, 2026-09-16), §5</w:t>
-            </w:r>
-          </w:p>
-        </w:tc>
-        <w:tc>
-          <w:tcPr>
-            <w:tcW w:type="dxa" w:w="2300"/>
-          </w:tcPr>
-          <w:p>
-            <w:r/>
-            <w:r>
-              <w:t>Open</w:t>
+              <w:t>Resolved</w:t>
+            </w:r>
+            <w:r>
+              <w:t xml:space="preserve"> by figma/decision-log-cleanup-retouches: root cause was the crest group being non-uniformly stretched (same 132 vectors, 119 wide, height 158-273 by frame) so it ran over the team-name text at y=395. Liverpool crest group (XMLID_189_) resized to 119x158 at (337,196) on all 10 frames (geometry verified within 1px against Match Details, the undistorted reference); the identical distortion on the Chelsea crest (Group 118 inner group) was found and fixed the same way (139x139 at (950,206)) though not named in the entry. Frames 756:6433 Chelsea side was already correct.</w:t>
             </w:r>
           </w:p>
         </w:tc>

</xml_diff>

<commit_message>
Figma: add elevation/overlay effect style, apply to Delete Role dialog + mobile drawer (Decision Log #182/#183)
Co-Authored-By: Claude Sonnet 5 <noreply@anthropic.com>
</commit_message>
<xml_diff>
--- a/docs/Soccernity_MVP_Build_Plan_v1.7.docx
+++ b/docs/Soccernity_MVP_Build_Plan_v1.7.docx
@@ -16512,7 +16512,7 @@
           </w:tcPr>
           <w:p>
             <w:r>
-              <w:t>Resolved -- flagged, conservative choices made meanwhile. (1) The scrim needed ~30% navy; a variable-bound brand/navy paint at paint-level opacity renders SOLID on instances (this file's documented "bound paint takes alpha from the variable" gotcha), so the scrim uses two stacked color/icon/inactive fills (navy 15% each -&gt; ~28% effective, alpha travels with the token, renders correctly on every instance). A dedicated overlay/scrim token (~30-40% navy) is the real fix -- candidate, same shape as the founder-authorised semantic/alert token. (2) The drawer lists Home / Community / Sports Hub / Bants / Leaderboard / Clubs / Messages / Notifications / Profile / Settings -- it has NO "News" item (the desktop nav / app has /news) and says "Bants" where the desktop nav icon is "banter". Reconcile the drawer and desktop nav to one canonical label/item set -- not done here, out of this task's scope. -- Blog/News GAP CLOSED (sprint-2/desktop-icon-nav-and-header-fix): a Nav -- Blog item was added to Navigation Drawer -- Mobile (5870:10689), after Nav -- Sports Hub, cloned from an existing item. Label "Blog" chosen to match the drawer's own section-name convention and this file's Figma vocabulary (blog icon / Blog Page Desktop); the Blog-vs-News inconsistency vs apps/web navigation.ts is now its own candidate, Decision Log #165. The Bants-vs-banter half is now also closed by sprint-2/design-cleanup-tokens-renames: the desktop navbar Bants nav icon was renamed banter -&gt; Bants (2838:3560 on header 4, propagating to ~60 instances) and Group 831 -&gt; Bants (2841:4158 on header 7); the drawer already read "Bants" and the mobile navbars carry no content-nav row. Content-section "Banter..." frames deliberately unchanged (Blog/News-rename precedent, #165). #163 is fully resolved. The overlay/scrim-token sub-point from (1) is folded into the elevation-token family now tracked as Decision Log #182 / #183; the working stacked-fill scrim ships as-is.</w:t>
+              <w:t>Resolved -- flagged, conservative choices made meanwhile. (1) The scrim needed ~30% navy; a variable-bound brand/navy paint at paint-level opacity renders SOLID on instances (this file's documented "bound paint takes alpha from the variable" gotcha), so the scrim uses two stacked color/icon/inactive fills (navy 15% each -&gt; ~28% effective, alpha travels with the token, renders correctly on every instance). A dedicated overlay/scrim token (~30-40% navy) is the real fix -- candidate, same shape as the founder-authorised semantic/alert token. (2) The drawer lists Home / Community / Sports Hub / Bants / Leaderboard / Clubs / Messages / Notifications / Profile / Settings -- it has NO "News" item (the desktop nav / app has /news) and says "Bants" where the desktop nav icon is "banter". Reconcile the drawer and desktop nav to one canonical label/item set -- not done here, out of this task's scope. -- Blog/News GAP CLOSED (sprint-2/desktop-icon-nav-and-header-fix): a Nav -- Blog item was added to Navigation Drawer -- Mobile (5870:10689), after Nav -- Sports Hub, cloned from an existing item. Label "Blog" chosen to match the drawer's own section-name convention and this file's Figma vocabulary (blog icon / Blog Page Desktop); the Blog-vs-News inconsistency vs apps/web navigation.ts is now its own candidate, Decision Log #165. The Bants-vs-banter half is now also closed by sprint-2/design-cleanup-tokens-renames: the desktop navbar Bants nav icon was renamed banter -&gt; Bants (2838:3560 on header 4, propagating to ~60 instances) and Group 831 -&gt; Bants (2841:4158 on header 7); the drawer already read "Bants" and the mobile navbars carry no content-nav row. Content-section "Banter..." frames deliberately unchanged (Blog/News-rename precedent, #165). #163 is fully resolved. The overlay/scrim-token sub-point from (1) is folded into the elevation-token family now tracked as Decision Log #182 / #183; the working stacked-fill scrim ships as-is. -- Forward-pointer: the overlay/scrim-token sub-point is resolved as part of #182/#183 (sprint-2/elevation-overlay-effect-style): elevation/overlay and its two overlay shadow variables are the overlay-elevation token. No separate scrim FILL token was created -- the working stacked color/icon/inactive scrim fills ship as-is (changing every scrim would be a further visible change).</w:t>
             </w:r>
           </w:p>
         </w:tc>
@@ -17315,7 +17315,7 @@
           </w:tcPr>
           <w:p>
             <w:r>
-              <w:t>Open -- candidate: an elevation/overlay effect style with 2-3 stacked navy-derived shadow layers (key + ambient) for panels larger than a menu. Also the natural home for the overlay/scrim-token need spun off Decision Log #163(1). The 4-layer panels were left intact this pass.</w:t>
+              <w:t>Resolved -- candidate: an elevation/overlay effect style with 2-3 stacked navy-derived shadow layers (key + ambient) for panels larger than a menu. Also the natural home for the overlay/scrim-token need spun off Decision Log #163(1). The 4-layer panels were left intact this pass. -- RESOLVED (founder decision to proceed, 2026-09-20; sprint-2/elevation-overlay-effect-style, figma-design-system): new effect style elevation/overlay = 3 stacked navy-derived DROP_SHADOW layers, every colour variable-bound: ambient (y2 blur6, new color/shadow/overlay-ambient, Light navy 8% / Dark #0D0F21 30%), key (y8 blur24, existing color/shadow/elevated #118, navy 14%), deep (y24 blur56, new color/shadow/overlay-key, Light navy 12% / Dark #0D0F21 55%). Two new EFFECT_COLOR variables added to Soccernity Theme (now 16 COLOR variables) because a single bound colour carries one alpha for every layer (the flattening problem above) -- both derived from the existing navy / dark-page values, no new palette. Applied to panels that had NO elevation: Settings - Delete Role Confirm Dialog (5404:7370) and Navigation Drawer - Mobile Panel (5870:10692, see #183). The 4-layer #130A2E date-picker panels are left intact (out of scope, as in the prior pass). Not retargeted, flagged: the Contest Rules dialogs (6242:14768 / 6244:14768) and Admin Open-the-final dialog (6276:16201) still use the single-layer elevation/menu style -- they are dialogs, arguably elevation/overlay's natural home; founder to confirm before a further visible change. This is a visible design addition, not a token rebind.</w:t>
             </w:r>
           </w:p>
         </w:tc>
@@ -17357,7 +17357,7 @@
           </w:tcPr>
           <w:p>
             <w:r>
-              <w:t>Open -- founder call; adding a shadow is a visible design change, not a token rebind, so not done in the token pass. Could reuse color/shadow/elevated (#118) with a horizontal offset.</w:t>
+              <w:t>Resolved -- founder call; adding a shadow is a visible design change, not a token rebind, so not done in the token pass. Could reuse color/shadow/elevated (#118) with a horizontal offset. -- RESOLVED (founder decision to proceed, 2026-09-20; sprint-2/elevation-overlay-effect-style): elevation/overlay (see #182) applied to the drawer Panel (5870:10692; inherited by the live instance). Judgment call, flagged: the shadow is the vertical-offset overlay stack, not a horizontal leading-edge offset as suggested above -- an effect style has one offset per layer and the blur (up to 56) already bleeds onto the scrim at the panel's right edge; a directional variant is a follow-up if wanted.</w:t>
             </w:r>
           </w:p>
         </w:tc>

</xml_diff>

<commit_message>
Figma: directional drawer shadow (elevation/overlay-right) + color/overlay/scrim token (Decision Log #352/#353)
Co-Authored-By: Claude Sonnet 5 <noreply@anthropic.com>
</commit_message>
<xml_diff>
--- a/docs/Soccernity_MVP_Build_Plan_v1.7.docx
+++ b/docs/Soccernity_MVP_Build_Plan_v1.7.docx
@@ -16512,7 +16512,7 @@
           </w:tcPr>
           <w:p>
             <w:r>
-              <w:t>Resolved -- flagged, conservative choices made meanwhile. (1) The scrim needed ~30% navy; a variable-bound brand/navy paint at paint-level opacity renders SOLID on instances (this file's documented "bound paint takes alpha from the variable" gotcha), so the scrim uses two stacked color/icon/inactive fills (navy 15% each -&gt; ~28% effective, alpha travels with the token, renders correctly on every instance). A dedicated overlay/scrim token (~30-40% navy) is the real fix -- candidate, same shape as the founder-authorised semantic/alert token. (2) The drawer lists Home / Community / Sports Hub / Bants / Leaderboard / Clubs / Messages / Notifications / Profile / Settings -- it has NO "News" item (the desktop nav / app has /news) and says "Bants" where the desktop nav icon is "banter". Reconcile the drawer and desktop nav to one canonical label/item set -- not done here, out of this task's scope. -- Blog/News GAP CLOSED (sprint-2/desktop-icon-nav-and-header-fix): a Nav -- Blog item was added to Navigation Drawer -- Mobile (5870:10689), after Nav -- Sports Hub, cloned from an existing item. Label "Blog" chosen to match the drawer's own section-name convention and this file's Figma vocabulary (blog icon / Blog Page Desktop); the Blog-vs-News inconsistency vs apps/web navigation.ts is now its own candidate, Decision Log #165. The Bants-vs-banter half is now also closed by sprint-2/design-cleanup-tokens-renames: the desktop navbar Bants nav icon was renamed banter -&gt; Bants (2838:3560 on header 4, propagating to ~60 instances) and Group 831 -&gt; Bants (2841:4158 on header 7); the drawer already read "Bants" and the mobile navbars carry no content-nav row. Content-section "Banter..." frames deliberately unchanged (Blog/News-rename precedent, #165). #163 is fully resolved. The overlay/scrim-token sub-point from (1) is folded into the elevation-token family now tracked as Decision Log #182 / #183; the working stacked-fill scrim ships as-is. -- Forward-pointer: the overlay/scrim-token sub-point is resolved as part of #182/#183 (sprint-2/elevation-overlay-effect-style): elevation/overlay and its two overlay shadow variables are the overlay-elevation token. No separate scrim FILL token was created -- the working stacked color/icon/inactive scrim fills ship as-is (changing every scrim would be a further visible change).</w:t>
+              <w:t>Resolved -- flagged, conservative choices made meanwhile. (1) The scrim needed ~30% navy; a variable-bound brand/navy paint at paint-level opacity renders SOLID on instances (this file's documented "bound paint takes alpha from the variable" gotcha), so the scrim uses two stacked color/icon/inactive fills (navy 15% each -&gt; ~28% effective, alpha travels with the token, renders correctly on every instance). A dedicated overlay/scrim token (~30-40% navy) is the real fix -- candidate, same shape as the founder-authorised semantic/alert token. (2) The drawer lists Home / Community / Sports Hub / Bants / Leaderboard / Clubs / Messages / Notifications / Profile / Settings -- it has NO "News" item (the desktop nav / app has /news) and says "Bants" where the desktop nav icon is "banter". Reconcile the drawer and desktop nav to one canonical label/item set -- not done here, out of this task's scope. -- Blog/News GAP CLOSED (sprint-2/desktop-icon-nav-and-header-fix): a Nav -- Blog item was added to Navigation Drawer -- Mobile (5870:10689), after Nav -- Sports Hub, cloned from an existing item. Label "Blog" chosen to match the drawer's own section-name convention and this file's Figma vocabulary (blog icon / Blog Page Desktop); the Blog-vs-News inconsistency vs apps/web navigation.ts is now its own candidate, Decision Log #165. The Bants-vs-banter half is now also closed by sprint-2/design-cleanup-tokens-renames: the desktop navbar Bants nav icon was renamed banter -&gt; Bants (2838:3560 on header 4, propagating to ~60 instances) and Group 831 -&gt; Bants (2841:4158 on header 7); the drawer already read "Bants" and the mobile navbars carry no content-nav row. Content-section "Banter..." frames deliberately unchanged (Blog/News-rename precedent, #165). #163 is fully resolved. The overlay/scrim-token sub-point from (1) is folded into the elevation-token family now tracked as Decision Log #182 / #183; the working stacked-fill scrim ships as-is. -- Forward-pointer: the overlay/scrim-token sub-point is resolved as part of #182/#183 (sprint-2/elevation-overlay-effect-style): elevation/overlay and its two overlay shadow variables are the overlay-elevation token. No separate scrim FILL token was created -- the working stacked color/icon/inactive scrim fills ship as-is (changing every scrim would be a further visible change). -- Forward-pointer: the 'no separate scrim FILL token was created' statement above is superseded by #353 (sprint-2/drawer-shadow-and-scrim-token): a real color/overlay/scrim variable now exists and all 7 stacked-fill scrims (plus the drawer instance override) are retargeted to it. #163(1) is now fully resolved; #163(2) untouched.</w:t>
             </w:r>
           </w:p>
         </w:tc>
@@ -17357,7 +17357,7 @@
           </w:tcPr>
           <w:p>
             <w:r>
-              <w:t>Resolved -- founder call; adding a shadow is a visible design change, not a token rebind, so not done in the token pass. Could reuse color/shadow/elevated (#118) with a horizontal offset. -- RESOLVED (founder decision to proceed, 2026-09-20; sprint-2/elevation-overlay-effect-style): elevation/overlay (see #182) applied to the drawer Panel (5870:10692; inherited by the live instance). Judgment call, flagged: the shadow is the vertical-offset overlay stack, not a horizontal leading-edge offset as suggested above -- an effect style has one offset per layer and the blur (up to 56) already bleeds onto the scrim at the panel's right edge; a directional variant is a follow-up if wanted.</w:t>
+              <w:t>Resolved -- founder call; adding a shadow is a visible design change, not a token rebind, so not done in the token pass. Could reuse color/shadow/elevated (#118) with a horizontal offset. -- RESOLVED (founder decision to proceed, 2026-09-20; sprint-2/elevation-overlay-effect-style): elevation/overlay (see #182) applied to the drawer Panel (5870:10692; inherited by the live instance). Judgment call, flagged: the shadow is the vertical-offset overlay stack, not a horizontal leading-edge offset as suggested above -- an effect style has one offset per layer and the blur (up to 56) already bleeds onto the scrim at the panel's right edge; a directional variant is a follow-up if wanted. -- Forward-pointer: the shadow DIRECTION has since changed -- see #352 (sprint-2/drawer-shadow-and-scrim-token): the drawer Panel now uses the new directional style elevation/overlay-right (horizontal offsets, casts right); the vertical elevation/overlay remains on the Delete Role dialog. The 'directional variant is a follow-up' note above is resolved, not still open.</w:t>
             </w:r>
           </w:p>
         </w:tc>
@@ -24621,6 +24621,90 @@
           <w:p>
             <w:r>
               <w:t>Resolved/implemented. A distinct 403 let anyone learn, in one request with no statistical work, that an account exists and is under 16 — a far easier and more sensitive signal than the timing channel #350 declined to close. Trade-off stated plainly: senders no longer get a specific reason (less UX clarity) in exchange for closing a direct enumeration signal on minor accounts. The sender-side 403 (under-16 caller) is unchanged. REVERSES the behaviour counsel was told about at #346, so it must go back to counsel alongside legal-copy v0.4/v0.5 and DPIA v0.2 for confirmation.</w:t>
+            </w:r>
+          </w:p>
+        </w:tc>
+      </w:tr>
+      <w:tr>
+        <w:tc>
+          <w:tcPr>
+            <w:tcW w:type="dxa" w:w="500"/>
+          </w:tcPr>
+          <w:p>
+            <w:r>
+              <w:t>352</w:t>
+            </w:r>
+          </w:p>
+        </w:tc>
+        <w:tc>
+          <w:tcPr>
+            <w:tcW w:type="dxa" w:w="4700"/>
+          </w:tcPr>
+          <w:p>
+            <w:r>
+              <w:t>Navigation Drawer -- Mobile Panel shadow direction: make the elevation cast to the drawer's leading (right) edge instead of the plain vertical stack applied in #183.</w:t>
+            </w:r>
+          </w:p>
+        </w:tc>
+        <w:tc>
+          <w:tcPr>
+            <w:tcW w:type="dxa" w:w="1850"/>
+          </w:tcPr>
+          <w:p>
+            <w:r>
+              <w:t>sprint-2/drawer-shadow-and-scrim-token (figma-design-system), founder request</w:t>
+            </w:r>
+          </w:p>
+        </w:tc>
+        <w:tc>
+          <w:tcPr>
+            <w:tcW w:type="dxa" w:w="2300"/>
+          </w:tcPr>
+          <w:p>
+            <w:r>
+              <w:t>Resolved -- implemented (Figma). New effect style elevation/overlay-right (S:ddf29a99...): same three layers, radii (6/24/56) and bound colour variables (overlay-ambient, elevated, overlay-key) as elevation/overlay, offsets changed from y 2/8/24 to x 2/8/24 (y 0), so it casts to the right of a slide-in-from-left panel. Applied to Panel 5870:10692 only (inherited by the instance in Community -- Home Feed (Navigation Drawer Open) -- Mobile). Settings - Delete Role confirm dialog (5404:7370) and every other elevation/overlay user left on the vertical version. No colour variable changed. VISIBLE design change: review the render. Screenshot-verified. Forward-pointer on #183.</w:t>
+            </w:r>
+          </w:p>
+        </w:tc>
+      </w:tr>
+      <w:tr>
+        <w:tc>
+          <w:tcPr>
+            <w:tcW w:type="dxa" w:w="500"/>
+          </w:tcPr>
+          <w:p>
+            <w:r>
+              <w:t>353</w:t>
+            </w:r>
+          </w:p>
+        </w:tc>
+        <w:tc>
+          <w:tcPr>
+            <w:tcW w:type="dxa" w:w="4700"/>
+          </w:tcPr>
+          <w:p>
+            <w:r>
+              <w:t>Dedicated overlay/scrim colour token replacing the two-stacked-15%-fills workaround (#163(1)).</w:t>
+            </w:r>
+          </w:p>
+        </w:tc>
+        <w:tc>
+          <w:tcPr>
+            <w:tcW w:type="dxa" w:w="1850"/>
+          </w:tcPr>
+          <w:p>
+            <w:r>
+              <w:t>sprint-2/drawer-shadow-and-scrim-token (figma-design-system), founder request</w:t>
+            </w:r>
+          </w:p>
+        </w:tc>
+        <w:tc>
+          <w:tcPr>
+            <w:tcW w:type="dxa" w:w="2300"/>
+          </w:tcPr>
+          <w:p>
+            <w:r>
+              <w:t>Resolved -- implemented (Figma). New COLOR variable color/overlay/scrim (VariableID:6545:22215, scopes FRAME_FILL/SHAPE_FILL, 'Soccernity Theme'): Light = navy #282E65 @ 27.75% (exactly 1-0.85^2, the composite of two 15% fills); Dark = #0D0F21 @ 65% (the existing dark page value, continuing the overlay-ambient 30 / elevated 45 / overlay-key 55 dark ramp for a larger surface -- derived by that pattern, not verified visually since the file ships light-only). Paint convention matches the file (paint opacity = token alpha, bound to the variable). Search found exactly 8 stacked-fill scrims, all retargeted to one fill: Navigation Drawer component Scrim 5870:10690 and its instance override I5874:10690;5870:10690, Contest Rules modal desktop 6242:14767 and mobile 6244:14767, Admin Open-the-final 6276:16200, and three Bants filter-dialog scrims 2459:10005 / 2459:12080 / 2459:14444. Sampled scrim pixels before/after differ by &lt;=1/255. NOT changed (different pattern, deliberately left): scrims bound to brand/navy with paint opacity 45% (Settings - Delete Role 5404:7369 and 2 archived Contest frames) and 30% (Message actions menu 5709:8503) -- they use different strengths, so unifying them is a visible change; candidate. Forward-pointer on #163.</w:t>
             </w:r>
           </w:p>
         </w:tc>

</xml_diff>

<commit_message>
Docs: Decision Log consistency audit (10 entries: #6, #133, #141, #144, #145, #163, #166, #167, #189, #321)
Co-Authored-By: Claude Sonnet 5 <noreply@anthropic.com>
</commit_message>
<xml_diff>
--- a/docs/Soccernity_MVP_Build_Plan_v1.7.docx
+++ b/docs/Soccernity_MVP_Build_Plan_v1.7.docx
@@ -8782,18 +8782,7 @@
                 <w:sz w:val="19"/>
                 <w:szCs w:val="19"/>
               </w:rPr>
-              <w:t xml:space="preserve">Open — blocks Sprint 4</w:t>
-            </w:r>
-            <w:r>
-              <w:t xml:space="preserve"> — Resolved by the founder (per the brief authorising sprint-4/sports-hub-highlightly-data-redesign, 2026-09-16): the selected sports-data vendor is Highlightly. This unblocks DESIGN work only so far — the 10 desktop + 10 mobile Sports Hub screens have now been redesigned in Figma against Highlightly's confirmed data categories (match statistics, lineups with substitutions, standings with form guide, H2H history, video highlights, and momentum), plus two new sections (Match Momentum, Live Commentary); see docs/sprint-4-sports-hub-highlightly-data-redesign-report.md and Decision Log #321. No services/api sports/fixtures module or Highlightly API client exists yet — the actual backend integration and wiring the frontend to live data remain separate, not-yet-started Sprint 4 work.</w:t>
-            </w:r>
-            <w:r>
-              <w:t xml:space="preserve"> — FURTHER UPDATE (sprint-4/sports-hub-highlightly-backend, backend-api, 2026-09-16): the backend half of this integration is now real too -- services/api/src/modules/sports + services/api/src/sports-data (HighlightlyClient, a rate-limit-conscious Redis refresh-lock/cache-through-Postgres strategy, and a daily request-budget guard). All eight Section 4.6 endpoints are built, plus GET /sports/matches/:id/momentum and GET /sports/matches/:id/events (Decision Log #327). MatchData was substantially redesigned (migration 20260916083019) and a new Standing model added. Two real Highlightly data gaps were found and disclosed rather than faked around -- no batched player box scores (Decision Log #324) and no standings form field (Decision Log #325). No confirmed top-scorers endpoint exists either (Decision Log #326). Wiring apps/web to this backend remains a separate, not-yet-started follow-up -- this PR deliberately does not touch apps/web.</w:t>
-            </w:r>
-          </w:p>
-          <w:p>
-            <w:r>
-              <w:t xml:space="preserve"> — FURTHER UPDATE (sprint-4/sports-hub-frontend-wiring, figma-to-code, 2026-09-16): apps/web is now wired to this backend too (SportsHubPage.tsx, new MatchCentrePage.tsx) — the full match-centre drill-down (details — stats — lineups — H2H — standings) was verified rendering real fetched data end to end via a genuine JS-execution smoke test against the real running backend. Sprint 4's own done-when criterion is therefore only PARTIALLY met: the “match-centre drill-down works end to end” half is confirmed; the “against a real fixture” half is NOT — no real Highlightly account/credentials exist in this environment, so every row exercised during verification was seeded directly into Postgres, never fetched live from the vendor. The three items this Figma redesign named as fast-follow exclusions (Top Scorers, match-specific notification/alert preferences, SportMonks-exclusive data) are now consolidated into their own standalone Decision Log entry, #336 (“Sports Hub fast-follow”), so they stay independently findable now that Sprint 4 itself is closed.</w:t>
+              <w:t>Resolved — Highlightly is the selected sports-data vendor (founder, per the brief authorising sprint-4/sports-hub-highlightly-data-redesign, 2026-09-16); originally opened as blocking Sprint 4, which is now closed. DESIGN (sprint-4/sports-hub-highlightly-data-redesign): the 10 desktop + 10 mobile Sports Hub screens were redesigned in Figma against Highlightly's confirmed data categories (match statistics, lineups with substitutions, standings with form guide, H2H history, video highlights, momentum), plus two new sections (Match Momentum, Live Commentary); see docs/sprint-4-sports-hub-highlightly-data-redesign-report.md and Decision Log #321. BACKEND (sprint-4/sports-hub-highlightly-backend, 2026-09-16): services/api/src/modules/sports + services/api/src/sports-data (HighlightlyClient, a rate-limit-conscious Redis refresh-lock/cache-through-Postgres strategy, and a daily request-budget guard); all eight Section 4.6 endpoints plus GET /sports/matches/:id/momentum and GET /sports/matches/:id/events (Decision Log #327); MatchData substantially redesigned (migration 20260916083019) and a new Standing model added. Two real Highlightly data gaps were found and disclosed rather than faked around: no batched player box scores (Decision Log #324) and no standings form field (Decision Log #325); no confirmed top-scorers endpoint exists either (Decision Log #326). FRONTEND (sprint-4/sports-hub-frontend-wiring, 2026-09-16): apps/web is wired to the backend (SportsHubPage.tsx, new MatchCentrePage.tsx); the full match-centre drill-down (details, stats, lineups, H2H, standings) was verified rendering real fetched data end to end via a genuine JS-execution smoke test against the real running backend. CAVEAT: Sprint 4's own done-when criterion is only PARTIALLY met — the drill-down half is confirmed; the "against a real fixture" half is NOT, because no real Highlightly account/credentials exist in this environment, so every row exercised during verification was seeded directly into Postgres, never fetched live from the vendor (see #323 and #328). The three fast-follow exclusions (Top Scorers, match-specific notification/alert preferences, SportMonks-exclusive data) are consolidated in their own entry, #336.</w:t>
             </w:r>
           </w:p>
         </w:tc>
@@ -15237,7 +15226,7 @@
           </w:tcPr>
           <w:p>
             <w:r>
-              <w:t>Open — deferred to Sprint 4. Sports Hub is Sprint 4 (not started); the sports-data vendor (Decision Log #6) is still open and blocks the section; a 7-screen dense-data mobile set is a coordinated pass that belongs with the Sprint 4 Sports build, not a cross-cutting audit. Flagged, not silently skipped. Field shapes to be checked against the real vendor when Sprint 4 wires it, not against placeholder data now.  → RE-CONFIRMED still open by sprint-2/decision-log-133-137-followup: Decision Log #6 checked directly, still "Open — blocks Sprint 4". Left entirely untouched, as instructed.</w:t>
+              <w:t>Resolved (design) — originally deferred to Sprint 4 as a coordinated 7-screen dense-data mobile set, blocked on the sports-data vendor (#6) and left un-started by the cross-cutting audit that raised it (sprint-2/all-sections-followup-mobile-field-audit; re-confirmed still open by sprint-2/decision-log-133-137-followup, when #6 was still Open). Since then: the 8 match-centre mobile screens were built with dummy match data ahead of the vendor decision (#145), #6 was resolved (Highlightly selected) and Sprint 4 is now closed; sprint-4/sports-hub-highlightly-data-redesign redesigned all 10 mobile Sports Hub frames against Highlightly's confirmed data categories, so the field-shape check this entry asked for was done against the real vendor's categories. Backend and apps/web wiring have also shipped — see #6 for current detail (including the still-unconfirmed live-vendor caveat), and #311/#314 for the remaining match-centre Figma housekeeping.</w:t>
             </w:r>
           </w:p>
         </w:tc>
@@ -15583,7 +15572,7 @@
           </w:tcPr>
           <w:p>
             <w:r>
-              <w:t>Open — deferred. Propagating "Moderation" to the other 26 existing Admin shells is its own follow-up pass, the same precedent already established twice in this file for "Categories" (Decision Log #49) and "Competitions" (Decision Log #76, closed by PR #110). Not done here -- retouching 26 existing Admin frames is exactly the kind of existing-frame edit the hard "do not touch Admin Panel's colour/token treatment" constraint counsels against doing incidentally inside an unrelated task.</w:t>
+              <w:t>Resolved — originally deferred as its own follow-up pass (same precedent as "Categories", Decision Log #49, and "Competitions", Decision Log #76, closed by PR #110), since retouching 26 existing Admin frames was judged out of scope for the task that added the item under the hard "do not touch Admin Panel's colour/token treatment" constraint. Propagated by sprint-2/create-post-sports-contest-mobile-admin-notif-fix (PR #130): an inactive "Nav — Moderation" row now exists on the 26 other Admin Panel screens (29/29 carry it), and the sidebar has since been componentized as the shared Admin Shell (#180, #199), so the nav item set is now shared by all 29 screens.</w:t>
             </w:r>
           </w:p>
         </w:tc>
@@ -15709,7 +15698,7 @@
           </w:tcPr>
           <w:p>
             <w:r>
-              <w:t>Resolved -- deferred, minor. The existing mobile Search Filter (Categories) frame (5650:8221) already covers the categories-picker pattern once; a second near-duplicate state was judged lower value than the two Bants items actually built this pass (the pre-categories filter panel and the No Results empty state). Flagged, not silently dropped. RESOLVED by sprint-2/bants-mobile-categories-view (figma-screen-builder): the second Bants mobile categories-view state is built -- Bants -- Search Filter (Categories) -- My Bants -- Mobile (5980:10881, 390x758, navbar instance 5980:10882 -&gt; component 5386:6576 header 4 -- mobile, matching 5650:8221's own). Cloned from 5650:8221; the Filter Tabs instance swapped to variant 2459:4839 (My Bants active, the same variant 5650:8161 uses) and the list replaced with the two canonical user's-own rows from 5650:8161 -- no copy/label/count/empty-state invented. Diffing desktop 2459:12447 against sibling 2459:10083 confirmed the only real delta is which Categories pill is selected. Every desktop Bants frame now has a mobile counterpart (full mapping in the PR report). 62 paints / 61 bound / 1 unbound (the shared navbar avatar IMAGE fill) / 0 off-palette / 0 brand/green-tint-28. Still open, NOT closed by this: the Bants desktop-side debt (#185, #186, and pre-existing #98) and the pillar-wide backend block (/banter-rooms* is unbuilt Sprint 3 work -- figma-to-code must not wire this screen to data).</w:t>
+              <w:t>Resolved -- deferred, minor. The existing mobile Search Filter (Categories) frame (5650:8221) already covers the categories-picker pattern once; a second near-duplicate state was judged lower value than the two Bants items actually built this pass (the pre-categories filter panel and the No Results empty state). Flagged, not silently dropped. RESOLVED by sprint-2/bants-mobile-categories-view (figma-screen-builder): the second Bants mobile categories-view state is built -- Bants -- Search Filter (Categories) -- My Bants -- Mobile (5980:10881, 390x758, navbar instance 5980:10882 -&gt; component 5386:6576 header 4 -- mobile, matching 5650:8221's own). Cloned from 5650:8221; the Filter Tabs instance swapped to variant 2459:4839 (My Bants active, the same variant 5650:8161 uses) and the list replaced with the two canonical user's-own rows from 5650:8161 -- no copy/label/count/empty-state invented. Diffing desktop 2459:12447 against sibling 2459:10083 confirmed the only real delta is which Categories pill is selected. Every desktop Bants frame now has a mobile counterpart (full mapping in the PR report). 62 paints / 61 bound / 1 unbound (the shared navbar avatar IMAGE fill) / 0 off-palette / 0 brand/green-tint-28. Not closed by that PR itself, but since resolved or superseded: the Bants desktop-side debt #185 and #186 were resolved by figma/decision-log-cleanup-retouches (pre-existing #98 remains only partially addressed), and the pillar-wide backend block is cleared — /banter-rooms* was built (#275/#276) and apps/web wired to it (#280).</w:t>
             </w:r>
           </w:p>
         </w:tc>
@@ -15751,7 +15740,7 @@
           </w:tcPr>
           <w:p>
             <w:r>
-              <w:t>Open -- design unblocked (founder-authorised, this pass); data wiring still blocked on Decision Log #6. Same convention as the Contest/Leaderboard boards built ahead of their own data-model blockers.</w:t>
+              <w:t>Resolved — design unblocked (founder-authorised, sprint-2/create-post-sports-contest-mobile-admin-notif-fix); same convention as the Contest/Leaderboard boards built ahead of their own data-model blockers. The data-wiring blocker this entry named (#6) is cleared: Highlightly was selected, the backend integration was built and apps/web wired to it (see #6); the mobile match-centre screens were subsequently redesigned against Highlightly's data categories (see #133, #321). Real vendor credentials are still absent, so no live vendor data has flowed yet (#6, #323, #328).</w:t>
             </w:r>
           </w:p>
         </w:tc>
@@ -16512,7 +16501,7 @@
           </w:tcPr>
           <w:p>
             <w:r>
-              <w:t>Resolved -- flagged, conservative choices made meanwhile. (1) The scrim needed ~30% navy; a variable-bound brand/navy paint at paint-level opacity renders SOLID on instances (this file's documented "bound paint takes alpha from the variable" gotcha), so the scrim uses two stacked color/icon/inactive fills (navy 15% each -&gt; ~28% effective, alpha travels with the token, renders correctly on every instance). A dedicated overlay/scrim token (~30-40% navy) is the real fix -- candidate, same shape as the founder-authorised semantic/alert token. (2) The drawer lists Home / Community / Sports Hub / Bants / Leaderboard / Clubs / Messages / Notifications / Profile / Settings -- it has NO "News" item (the desktop nav / app has /news) and says "Bants" where the desktop nav icon is "banter". Reconcile the drawer and desktop nav to one canonical label/item set -- not done here, out of this task's scope. -- Blog/News GAP CLOSED (sprint-2/desktop-icon-nav-and-header-fix): a Nav -- Blog item was added to Navigation Drawer -- Mobile (5870:10689), after Nav -- Sports Hub, cloned from an existing item. Label "Blog" chosen to match the drawer's own section-name convention and this file's Figma vocabulary (blog icon / Blog Page Desktop); the Blog-vs-News inconsistency vs apps/web navigation.ts is now its own candidate, Decision Log #165. The Bants-vs-banter half is now also closed by sprint-2/design-cleanup-tokens-renames: the desktop navbar Bants nav icon was renamed banter -&gt; Bants (2838:3560 on header 4, propagating to ~60 instances) and Group 831 -&gt; Bants (2841:4158 on header 7); the drawer already read "Bants" and the mobile navbars carry no content-nav row. Content-section "Banter..." frames deliberately unchanged (Blog/News-rename precedent, #165). #163 is fully resolved. The overlay/scrim-token sub-point from (1) is folded into the elevation-token family now tracked as Decision Log #182 / #183; the working stacked-fill scrim ships as-is. -- Forward-pointer: the overlay/scrim-token sub-point is resolved as part of #182/#183 (sprint-2/elevation-overlay-effect-style): elevation/overlay and its two overlay shadow variables are the overlay-elevation token. No separate scrim FILL token was created -- the working stacked color/icon/inactive scrim fills ship as-is (changing every scrim would be a further visible change). -- Forward-pointer: the 'no separate scrim FILL token was created' statement above is superseded by #353 (sprint-2/drawer-shadow-and-scrim-token): a real color/overlay/scrim variable now exists and all 7 stacked-fill scrims (plus the drawer instance override) are retargeted to it. #163(1) is now fully resolved; #163(2) untouched.</w:t>
+              <w:t>Resolved — both sub-points. (1) Overlay/scrim token: the scrim needed ~30% navy, but a variable-bound brand/navy paint at paint-level opacity renders SOLID on instances (this file's documented "bound paint takes alpha from the variable" gotcha), so it originally shipped as two stacked color/icon/inactive fills (navy 15% each, ~28% effective). Resolved in two steps: the overlay-elevation half was folded into the elevation-token family, #182/#183 (sprint-2/elevation-overlay-effect-style: elevation/overlay and its two overlay shadow variables; no separate scrim FILL token was created at that point), and the scrim fill itself by #353 (sprint-2/drawer-shadow-and-scrim-token, PR #293): a real color/overlay/scrim variable now exists and all 7 stacked-fill scrims (plus the drawer instance override) are retargeted to it. (2) Drawer nav list vs. desktop set: the drawer originally listed Home / Community / Sports Hub / Bants / Leaderboard / Clubs / Messages / Notifications / Profile / Settings, with NO "News" item (the desktop nav / app has /news) and "Bants" where the desktop nav icon read "banter". The Blog/News gap was closed by sprint-2/desktop-icon-nav-and-header-fix (a Nav — Blog item added to Navigation Drawer — Mobile 5870:10689 after Nav — Sports Hub, label "Blog" chosen to match the drawer's section-name convention; the Blog-vs-News mismatch with apps/web navigation.ts became its own entry, #165). The Bants-vs-banter half was closed by sprint-2/design-cleanup-tokens-renames: the desktop navbar Bants icon was renamed banter -&gt; Bants (2838:3560 on header 4, propagating to ~60 instances; Group 831 -&gt; Bants, 2841:4158, on header 7); the drawer already read "Bants" and the mobile navbars carry no content-nav row; content-section "Banter..." frames were deliberately left unchanged (Blog/News-rename precedent, #165).</w:t>
             </w:r>
           </w:p>
         </w:tc>
@@ -16638,12 +16627,7 @@
           </w:tcPr>
           <w:p>
             <w:r>
-              <w:t xml:space="preserve">Open -- flagged, conservative choice made meanwhile. Those items render as non-navigating, visibly-disabled rows (aria-disabled, "Not available yet" title) rather than as links that fall through to the 404 page -- per the task brief's own "render the item but flag the missing route rather than linking to a 404" instruction. The header messages icon (Figma "header 4" cluster) is likewise rendered disabled. Whoever builds the Notification Centre / Messages / Settings screens should add the routes and flip navigation.ts's `available` flag. Confirmed OUT OF SCOPE of the navbar work by explicit founder decision -- /messages, /notifications and /settings are real Sprint 3/6 feature builds (Messaging, Notifications, Settings), scoped as separate later work, not a navbar follow-up. The disabled-row treatment stays as the interim; not overlooked.</w:t>
-            </w:r>
-          </w:p>
-          <w:p>
-            <w:r>
-              <w:t>→ The MESSAGES half is now resolved by sprint-3/banter-messaging-to-code (Decision Log #280): /messages/* routes exist, navigation.ts's Messages item is available:true, and Header.tsx's top-bar messages icon is a real, enabled Link. The Notifications half stays exactly as this entry originally described -- disabled, no route, no apps/web conversion of the finalised Notification Centre design (Decision Log #279) yet.</w:t>
+              <w:t>Resolved — all three halves closed. Originally flagged because nav items whose route did not exist in apps/web (Messages, Notifications, Settings) rendered as non-navigating, visibly-disabled rows (aria-disabled, "Not available yet" title) rather than links that fall through to the 404 page, per the task brief's "render the item but flag the missing route" instruction; the header messages icon was likewise disabled. Building those routes was confirmed OUT OF SCOPE of the navbar work by explicit founder decision (real Sprint 3/6 feature builds, not navbar follow-ups). Closed by: Messages — sprint-3/banter-messaging-to-code (#280): /messages/* routes exist, navigation.ts's Messages item is available:true, and Header.tsx's top-bar messages icon is a real, enabled Link; Notifications — sprint-3/notification-centre-to-code (#291): /notifications route built, Notifications entries flipped available:true in both accountMenuItems and drawerNavItems; Settings — sprint-2/privacy-settings-to-code (#223): /settings routes exist and the Settings items were flipped available.</w:t>
             </w:r>
           </w:p>
         </w:tc>
@@ -16685,7 +16669,7 @@
           </w:tcPr>
           <w:p>
             <w:r>
-              <w:t xml:space="preserve">Open -- flagged. The Notification row renders with no number rather than a hardcoded fake one (per the task brief). Needs a real notifications endpoint (Build Plan Section 4 defines Notification rows written by follow/like/comment triggers -- see the Sprint 2 follow-and-notifications work -- but no GET/unread-count route exists) before the badge can be wired. Confirmed OUT OF SCOPE of the navbar work by explicit founder decision -- a notifications unread-count source is part of the separate Sprint 3 Notifications build, not a navbar follow-up. The Notification row stays without a count as the interim; not overlooked.</w:t>
+              <w:t>Resolved — by #291 (sprint-3/notification-centre-to-code, built against the #290 read endpoints). Originally flagged because the Figma account dropdown's "2" unread badge had no data source (apps/web had no notifications API client and nothing exposed an unread count), so the Notification row rendered with no number rather than a hardcoded fake one; this was confirmed out of scope of the navbar work by founder decision (part of the separate Sprint 3 Notifications build). Header.tsx now fetches GET /notifications/unread-count and drives a real count badge on the account dropdown's and mobile drawer's Notification row, plus the Avatar unread dot.</w:t>
             </w:r>
           </w:p>
         </w:tc>
@@ -17618,7 +17602,7 @@
           </w:tcPr>
           <w:p>
             <w:r>
-              <w:t>Open -- unchanged Sprint 5 scope, not expanded or narrowed by this PR. Tracked here so a future sweep doesn't need to rediscover it. → RESOLVED by sprint-5/admin-moderation-queue-backend (backend-api, 2026-09-15, PR #244): GET/PATCH /admin/moderation/reports* and the Decision Log #138 second-reviewer appeal-review route are now built and tested — see Decision Log #295/#296/#299. sprint-5/admin-moderation-queue-frontend (PR #245) then wired apps/admin's real screens to them — see Decision Log #300/#301.</w:t>
+              <w:t>Resolved — by sprint-5/admin-moderation-queue-backend (backend-api, 2026-09-15, PR #244): GET/PATCH /admin/moderation/reports* and the Decision Log #138 second-reviewer appeal-review route are built and tested (see #295/#296/#299); sprint-5/admin-moderation-queue-frontend (PR #245) then wired apps/admin's real screens to them (see #300/#301). Originally opened as unchanged Sprint 5 scope, neither expanded nor narrowed by the PR that raised it, and tracked so a future sweep would not need to rediscover it.</w:t>
             </w:r>
           </w:p>
         </w:tc>
@@ -23326,19 +23310,18 @@
             <w:tcW w:type="dxa" w:w="4700"/>
           </w:tcPr>
           <w:p>
+            <w:r>
+              <w:t>All match data across the redesigned Sports Hub screens (Match Momentum, Live Commentary, player box scores, Lineups substitutions, H2H record, Video clips) remains illustrative dummy content (one consistent Liverpool 1–3 Chelsea fixture, per §6 of the report). Highlightly is the resolved vendor (Decision Log #6). At the time of this entry services/api had no sports/fixtures module, no Highlightly API client, and MatchData had zero live reads, so figma-to-code was told not to wire any of these screens to real data until that backend integration existed; the backend integration has since been built (sprint-4/sports-hub-highlightly-backend, #323-#329) and apps/web wired to it (sprint-4/sports-hub-frontend-wiring, see #6).</w:t>
+            </w:r>
+          </w:p>
+        </w:tc>
+        <w:tc>
+          <w:tcPr>
+            <w:tcW w:type="dxa" w:w="1850"/>
+          </w:tcPr>
+          <w:p>
             <w:r/>
             <w:r>
-              <w:t>All match data across the redesigned Sports Hub screens (Match Momentum, Live Commentary, player box scores, Lineups substitutions, H2H record, Video clips) remains illustrative dummy content (one consistent Liverpool 1–3 Chelsea fixture, per §6 of the report). Highlightly is the resolved vendor (Decision Log #6) but services/api has no sports/fixtures module, no Highlightly API client, and MatchData has zero live reads. figma-to-code must NOT wire any of these screens to real data until that backend integration exists.</w:t>
-            </w:r>
-          </w:p>
-        </w:tc>
-        <w:tc>
-          <w:tcPr>
-            <w:tcW w:type="dxa" w:w="1850"/>
-          </w:tcPr>
-          <w:p>
-            <w:r/>
-            <w:r>
               <w:t>docs/sprint-4-sports-hub-highlightly-data-redesign-report.md (sprint-4/sports-hub-highlightly-data-redesign, figma-screen-builder, 2026-09-16), §6</w:t>
             </w:r>
           </w:p>
@@ -23348,9 +23331,8 @@
             <w:tcW w:type="dxa" w:w="2300"/>
           </w:tcPr>
           <w:p>
-            <w:r/>
-            <w:r>
-              <w:t>Open — blocked on a not-yet-started backend Highlightly integration.</w:t>
+            <w:r>
+              <w:t>Resolved — the blocker (a not-yet-started backend Highlightly integration) is cleared: backend built (#323-#329) and apps/web wired (see #6). Caveat carried from #6: no real Highlightly credentials exist yet, so no live vendor data has flowed through it (#323, #328).</w:t>
             </w:r>
           </w:p>
         </w:tc>

</xml_diff>

<commit_message>
Docs: record Cloudflare R2 as the Media storage provider (Decision Log #307); storage stays wired-but-inactive
Co-Authored-By: Claude Sonnet 5 <noreply@anthropic.com>
</commit_message>
<xml_diff>
--- a/docs/Soccernity_MVP_Build_Plan_v1.7.docx
+++ b/docs/Soccernity_MVP_Build_Plan_v1.7.docx
@@ -22686,7 +22686,10 @@
           <w:p>
             <w:r/>
             <w:r>
-              <w:t>Open — mirrors Decision Log #26's own “unbundled, cost-aligned for a pre-launch MVP” reasoning for hosting generally; the founder should pick one (and provision real credentials) once launch-scale storage/bandwidth costs matter, and nothing in this PR forces that choice. StorageService is a small abstract class configured entirely through env vars (S3_ENDPOINT/S3_REGION/S3_BUCKET/S3_ACCESS_KEY/S3_SECRET_KEY) against the standard AWS S3 SDK v3 client, so it runs unmodified against any of the candidates above — no vendor-specific SDK quirk is hardcoded. Until real credentials exist, upload()/delete() throw a clear 503 (ServiceUnavailableException) rather than attempting a doomed network call or silently pretending an upload succeeded — the same “wired but inactive” pattern already established for EMAIL_PROVIDER_API_KEY/SENTRY_DSN, but deliberately a harder failure since file upload is the actual feature here, not an optional side-channel.</w:t>
+              <w:t>Resolved — mirrors Decision Log #26's own “unbundled, cost-aligned for a pre-launch MVP” reasoning for hosting generally; the founder should pick one (and provision real credentials) once launch-scale storage/bandwidth costs matter, and nothing in this PR forces that choice. StorageService is a small abstract class configured entirely through env vars (S3_ENDPOINT/S3_REGION/S3_BUCKET/S3_ACCESS_KEY/S3_SECRET_KEY) against the standard AWS S3 SDK v3 client, so it runs unmodified against any of the candidates above — no vendor-specific SDK quirk is hardcoded. Until real credentials exist, upload()/delete() throw a clear 503 (ServiceUnavailableException) rather than attempting a doomed network call or silently pretending an upload succeeded — the same “wired but inactive” pattern already established for EMAIL_PROVIDER_API_KEY/SENTRY_DSN, but deliberately a harder failure since file upload is the actual feature here, not an optional side-channel.</w:t>
+              <w:br/>
+              <w:br/>
+              <w:t>RESOLVED (2026-09-26, sprint-4/media-storage-r2-decision): the provider is Cloudflare R2. Reasoning: R2 charges zero egress fees, the standout cost factor for a media-heavy social app where reads (feed, profile, clip playback) vastly outnumber writes and would dominate an AWS S3 bill; it is S3-compatible, so StorageService/S3StorageService needs no code change (S3_ENDPOINT = https://&lt;account-id&gt;.r2.cloudflarestorage.com, S3_REGION = "auto"). This entry records a decision only and does NOT make storage live: creating the Cloudflare account, the R2 bucket and an S3-compatible API token is a human action, and until real S3_BUCKET/S3_ACCESS_KEY/S3_SECRET_KEY/S3_ENDPOINT values are set in a real .env, POST /admin/media/upload still returns 503. Flagged, not fixed: S3StorageService builds MediaAsset.url as &lt;endpoint&gt;/&lt;bucket&gt;/&lt;key&gt;, which on R2 is the authenticated S3-API endpoint and is not publicly readable; public playback needs the bucket's r2.dev subdomain or a custom domain, so a follow-up (e.g. a public-base-URL env var) is needed before uploaded media can be displayed. The multer@2.2.0 advisory (Decision Log #309) is unrelated and unchanged.</w:t>
             </w:r>
           </w:p>
         </w:tc>

</xml_diff>

<commit_message>
Docs: consolidate Decision Log #295-#310 admin backend spec deviations; separate the #309 multer hazard
Documentation only. Adds forward-pointers to Decision Log #295 and #309.

Co-Authored-By: Claude Sonnet 5 <noreply@anthropic.com>
</commit_message>
<xml_diff>
--- a/docs/Soccernity_MVP_Build_Plan_v1.7.docx
+++ b/docs/Soccernity_MVP_Build_Plan_v1.7.docx
@@ -22137,6 +22137,11 @@
               <w:t xml:space="preserve">Open — flagged, built anyway per the task brief's own explicit instruction (without POST /reports nothing could ever create a Report row at all, and Section 8.4's own workflow text assumes a submission + appeal path exists). POST /reports and POST /reports/:id/appeal are deliberately JwtAuthGuard-only, NOT GuardianConsentGuard-gated — a restricted-pending minor must still be able to report abuse directed at them and appeal a decision made against them. Pending founder/Decision Log confirmation these should be formally added to Section 4's API Contract Sketch. Closes the backend half of #135/#189 — see also #296, #299.</w:t>
             </w:r>
           </w:p>
+          <w:p>
+            <w:r>
+              <w:t>Forward-pointer (2026-09-26, docs/admin-backend-spec-deviations-295-310): #295-#310 are consolidated, with each entry's real status and its source README section, in docs/admin-backend-spec-deviations-295-310.md. Documentation only; this entry's status is unchanged.</w:t>
+            </w:r>
+          </w:p>
         </w:tc>
       </w:tr>
       <w:tr>
@@ -22782,6 +22787,11 @@
             <w:r/>
             <w:r>
               <w:t>Open — flagged, not fixed in this PR. Confirmed directly, not assumed: services/api/package.json's own explicit "multer": "^2.3.0" resolves correctly to a genuinely separate nested copy at services/api/node_modules/multer@2.3.0, but @nestjs/platform-express's own internal require('multer') call resolves to the hoisted root copy (2.2.0) regardless, since that's the nearest node_modules/multer from that file's own location. The only real fix is bumping @nestjs/platform-express itself, an unrelated, unscoped major version bump this media-storage ticket should not silently bundle in — the same “flag it, don’t fix it as part of an unrelated PR” precedent Decision Log #20's own Tier 2/3 npm audit triage already established for multer/lodash/qs/body-parser/express before this. Flagged here for a future, dedicated @nestjs/platform-express v12 upgrade PR.</w:t>
+            </w:r>
+          </w:p>
+          <w:p>
+            <w:r>
+              <w:t>Forward-pointer (2026-09-26, docs/admin-backend-spec-deviations-295-310): treated as a dependency hazard, not a spec deviation, in Part B of docs/admin-backend-spec-deviations-295-310.md. Still Open and not fixed. Re-checked on 2026-09-26: the hoisted multer@2.2.0 is still what FileInterceptor loads, npm audit lists four multer advisories against it (three high, one low, not only GHSA-qfvm-cv95-jqjf), and registry metadata shows @nestjs/platform-express@11.2.6 depends on multer@2.4.0, so a same-major bump may fix this without the 12.x major stated above. Not tried; confirm before relying on it.</w:t>
             </w:r>
           </w:p>
         </w:tc>

</xml_diff>

<commit_message>
Fix multer CVE via lockfile bump of @nestjs/platform-express to 11.2.6; resolve Decision Log #309
FileInterceptor loaded the hoisted root multer 2.2.0 (pinned exactly by
@nestjs/platform-express 11.2.1). 11.2.6, within the existing ^11.0.0 range,
depends on multer 2.4.0; the installed tree now has a single multer 2.4.0.

Co-Authored-By: Claude Sonnet 5 <noreply@anthropic.com>
</commit_message>
<xml_diff>
--- a/docs/Soccernity_MVP_Build_Plan_v1.7.docx
+++ b/docs/Soccernity_MVP_Build_Plan_v1.7.docx
@@ -22786,12 +22786,17 @@
           <w:p>
             <w:r/>
             <w:r>
-              <w:t>Open — flagged, not fixed in this PR. Confirmed directly, not assumed: services/api/package.json's own explicit "multer": "^2.3.0" resolves correctly to a genuinely separate nested copy at services/api/node_modules/multer@2.3.0, but @nestjs/platform-express's own internal require('multer') call resolves to the hoisted root copy (2.2.0) regardless, since that's the nearest node_modules/multer from that file's own location. The only real fix is bumping @nestjs/platform-express itself, an unrelated, unscoped major version bump this media-storage ticket should not silently bundle in — the same “flag it, don’t fix it as part of an unrelated PR” precedent Decision Log #20's own Tier 2/3 npm audit triage already established for multer/lodash/qs/body-parser/express before this. Flagged here for a future, dedicated @nestjs/platform-express v12 upgrade PR.</w:t>
+              <w:t>Resolved — flagged, not fixed in this PR. Confirmed directly, not assumed: services/api/package.json's own explicit "multer": "^2.3.0" resolves correctly to a genuinely separate nested copy at services/api/node_modules/multer@2.3.0, but @nestjs/platform-express's own internal require('multer') call resolves to the hoisted root copy (2.2.0) regardless, since that's the nearest node_modules/multer from that file's own location. The only real fix is bumping @nestjs/platform-express itself, an unrelated, unscoped major version bump this media-storage ticket should not silently bundle in — the same “flag it, don’t fix it as part of an unrelated PR” precedent Decision Log #20's own Tier 2/3 npm audit triage already established for multer/lodash/qs/body-parser/express before this. Flagged here for a future, dedicated @nestjs/platform-express v12 upgrade PR.</w:t>
             </w:r>
           </w:p>
           <w:p>
             <w:r>
               <w:t>Forward-pointer (2026-09-26, docs/admin-backend-spec-deviations-295-310): treated as a dependency hazard, not a spec deviation, in Part B of docs/admin-backend-spec-deviations-295-310.md. Still Open and not fixed. Re-checked on 2026-09-26: the hoisted multer@2.2.0 is still what FileInterceptor loads, npm audit lists four multer advisories against it (three high, one low, not only GHSA-qfvm-cv95-jqjf), and registry metadata shows @nestjs/platform-express@11.2.6 depends on multer@2.4.0, so a same-major bump may fix this without the 12.x major stated above. Not tried; confirm before relying on it.</w:t>
+            </w:r>
+          </w:p>
+          <w:p>
+            <w:r>
+              <w:t>Resolution (2026-09-27, fix/platform-express-multer-cve): the 12.x major was not needed. A lockfile update within the existing ^11.0.0 range moved @nestjs/platform-express from 11.2.1 to 11.2.6, which depends on multer@2.4.0 (11.2.1 depended on exact multer 2.2.0). Before: root node_modules/multer 2.2.0 (loaded by FileInterceptor) plus nested services/api multer 2.3.0. After: a single multer 2.4.0 at the root, nested copy removed, multer absent from npm audit. Verified against the installed tree (require of node_modules/multer/package.json, npm ls), not just the declared range. Media and admin suites: 18 suites / 162 tests pass; tsc and nest build clean. Only package-lock.json changed. The original statement that only a 12.x major could fix this was wrong.</w:t>
             </w:r>
           </w:p>
         </w:tc>

</xml_diff>

<commit_message>
Add superadmin-only POST /admin/staff to provision AdminUser accounts (Decision Log #191)
Co-Authored-By: Claude Sonnet 5 <noreply@anthropic.com>
</commit_message>
<xml_diff>
--- a/docs/Soccernity_MVP_Build_Plan_v1.7.docx
+++ b/docs/Soccernity_MVP_Build_Plan_v1.7.docx
@@ -17705,7 +17705,10 @@
           </w:tcPr>
           <w:p>
             <w:r>
-              <w:t>Open -- founder/backend call for whenever admin-management endpoints are built: a superadmin-only "invite admin/moderator" endpoint, vs. a one-off seed script, vs. something else.</w:t>
+              <w:t>Resolved -- founder/backend call for whenever admin-management endpoints are built: a superadmin-only "invite admin/moderator" endpoint, vs. a one-off seed script, vs. something else.</w:t>
+            </w:r>
+            <w:r>
+              <w:t xml:space="preserve"> RESOLVED (feat/admin-staff-create): POST /admin/staff, superadmin-only (AdminJwtAuthGuard + AdminRolesGuard('superadmin'), same as the rest of admin-staff-roles), creates an AdminUser from email/fullName/role plus an admin-set or generated temporary password (returned once; changed via the existing POST /admin/auth/change-password -- no admin set-password/reset flow existed to reuse, and no must-change-on-first-login flag exists). Audited as admin_user.created. The very first superadmin is still bootstrapped by direct DB insert.</w:t>
             </w:r>
           </w:p>
         </w:tc>

</xml_diff>

<commit_message>
Filter inactive-category articles out of GET /articles' category filters (Decision Log #335)
GET /articles?categoryId=/?categorySlug= now also requires the
referenced Category to be 'active', matching GET /categories' own
active-only gate. A request scoped to an inactive category now
returns an empty page instead of that category's already-published
articles.

Deliberately unchanged: the unfiltered "All" listing and
GET /articles/:id are unaffected — only the two explicit category
filters respect Category.status.

Adds a test covering the new empty-page-for-inactive-category
behavior and updates the three existing categoryId/categorySlug/
combined-filter tests for the new query shape. Appends a
forward-pointer to Decision Log #335 in the Build Plan docx recording
this as resolved.

Co-Authored-By: Claude Sonnet 5 <noreply@anthropic.com>
</commit_message>
<xml_diff>
--- a/docs/Soccernity_MVP_Build_Plan_v1.7.docx
+++ b/docs/Soccernity_MVP_Build_Plan_v1.7.docx
@@ -24023,6 +24023,11 @@
           <w:p>
             <w:r>
               <w:t>Open — a real product judgment call, not resolved here.</w:t>
+            </w:r>
+          </w:p>
+          <w:p>
+            <w:r>
+              <w:t>Resolved by fix/blog-inactive-category-filter: GET /articles's ?categoryId=/?categorySlug= filters now also require the referenced Category to be 'active' (services/api/src/modules/blog/blog.service.ts), matching GET /categories's own active-only gate. A request scoped to an inactive category now returns an empty page, never that category's already-published articles. The unfiltered "All" listing and GET /articles/:id are unaffected by this change — only the two explicit category filters now respect Category.status. See blog/README.md's own Decision Log candidate item 3 for the full detail.</w:t>
             </w:r>
           </w:p>
         </w:tc>

</xml_diff>

<commit_message>
Add anonymous page-view tracking, resolving Decision Log #306
GET /admin/dashboard/stats now returns real totalVisits (all-time count)
and visitsByMonth (last 6 UTC months) instead of a hardcoded null.

- New PageView model (route template + timestamp only; migration
  20260929013242_add_page_view). Strictly anonymous: no userId, IP,
  session, or user-agent is stored.
- New global PageViewInterceptor (APP_INTERCEPTOR) counting successful
  GET requests to matched routes; excludes /health, token refresh, the
  notifications unread-count badge, and pagination continuations.
- Route is derived from Nest's @Controller/@Get metadata, so it is a
  low-cardinality template (e.g. /posts/:id), never a raw URL.
- Decision Log #306 forward-pointer added to the Build Plan docx.

Mocked suite 107/1555 -> 109/1578; e2e 29/283 passing.

Co-Authored-By: Claude Sonnet 5 <noreply@anthropic.com>
</commit_message>
<xml_diff>
--- a/docs/Soccernity_MVP_Build_Plan_v1.7.docx
+++ b/docs/Soccernity_MVP_Build_Plan_v1.7.docx
@@ -22716,6 +22716,11 @@
             <w:r/>
             <w:r>
               <w:t>Open — flagged, not built, per the task brief's own explicit "don’t build visit/pageview tracking in this ticket" instruction. Confirmed directly, not assumed: no page-view/visit-tracking model or middleware exists anywhere in schema.prisma or services/api/src. Building either would mean a genuinely new event-logging entity (something like a PageView/VisitEvent model) plus request-tracking middleware to populate it — real, unscoped new architecture. GET /admin/dashboard/stats returns totalVisits as an explicit null (never a dropped key, never a faked 0) so the gap reads honestly rather than as a real "zero visits" figure; DashboardPage.tsx renders its existing “—” placeholder for this one stat only. The Figma design's “New users by league” breakdown (no league concept exists on User — ties into the still-open Decision Log #6 sports-data-vendor blocker) and “Latest posts” table are also left as disclosed sample data, narrower than even this PR's own scope asked for.</w:t>
+            </w:r>
+          </w:p>
+          <w:p>
+            <w:r>
+              <w:t>Resolved by feat/admin-dashboard-page-views: a new PageView model (services/api/prisma/schema.prisma) plus a global PageViewInterceptor (services/api/src/modules/page-views/) now record real GET traffic across the app, and GET /admin/dashboard/stats returns real totalVisits (an all-time count, genuine 0 is now honest, never a faked/ambiguous value) and visitsByMonth (the last 6 UTC calendar months). THIS IS STRICTLY ANONYMOUS AGGREGATE COUNTING, per CLAUDE.md non-negotiable #1 (a minors' platform): the PageView row stores ONLY a coarse route template and a timestamp — NO userId, NO IP address, NO session id/cookie/device fingerprint, and NO user-agent are ever recorded anywhere. Adding any per-user or per-session identity would be a new, separate DPIA-reviewed decision, not an extension of this model. Recording is fire-and-forget (never blocks or fails the real response it piggybacks on) and only counts a GET request to a matched route that isn't a background/polling call (health check, token refresh, the notifications unread-count badge) or a pagination continuation (a `cursor` query param) — see services/api/src/modules/page-views/README.md for the full "what counts as a page view" reasoning and its disclosed limitations. apps/admin's own DashboardPage.tsx chart is NOT wired to the new visitsByMonth field in this PR (backend-only, per this project's established backend-then-frontend PR-pairing convention) — a separate, explicitly-flagged frontend follow-up.</w:t>
             </w:r>
           </w:p>
         </w:tc>

</xml_diff>

<commit_message>
Add moderation outcome and appeal-decision emails, resolving Decision Log #143
Two plain, functional templates on the existing RegistrationEmailService:
- report-actioned: to the reporter once an admin actions their report
  (outcome label + generic reason; public reporters use reporterContactEmail)
- appeal-decision: to the appellant (reported user) once a second reviewer
  decides an appeal; overturned is worded as a reopened report, not an
  enforced reversal

Sent fire-and-forget after ModerationService.actionReport/decideAppeal
commit. Deleted accounts and missing addresses are skipped without error.
Copy is functional and not counsel-reviewed.

Co-Authored-By: Claude Sonnet 5 <noreply@anthropic.com>
</commit_message>
<xml_diff>
--- a/docs/Soccernity_MVP_Build_Plan_v1.7.docx
+++ b/docs/Soccernity_MVP_Build_Plan_v1.7.docx
@@ -15675,7 +15675,10 @@
           </w:tcPr>
           <w:p>
             <w:r>
-              <w:t>Open -- deferred, consistent with the existing 5-unwired-template precedent (Decision Log #56/#59, PR #104). A template needs real backend send-trigger context and copy matching an actual event; inventing both for an event that does not exist server-side yet would misrepresent placeholder as built-and-ready.</w:t>
+              <w:t>Resolved -- deferred, consistent with the existing 5-unwired-template precedent (Decision Log #56/#59, PR #104). A template needs real backend send-trigger context and copy matching an actual event; inventing both for an event that does not exist server-side yet would misrepresent placeholder as built-and-ready.</w:t>
+            </w:r>
+            <w:r>
+              <w:t xml:space="preserve"> RESOLVED (feat/moderation-outcome-appeal-emails): plain functional outcome and appeal-decision email templates now exist -- 'report-actioned' (to the reporter: outcome label + brief generic reason, no reported-party details) and 'appeal-decision' (to the appellant: upheld / overturned, with overturned worded as a report reopened for a fresh decision, not an enforced reversal). Both reuse RegistrationEmailService and are sent fire-and-forget after the action commits; deleted accounts never receive mail. Copy is functional pending safeguarding review, not counsel-approved. Section 8.4 notify-both-parties is only partly covered: the reported user is still notified in-app (existing notifications), but is not emailed a report outcome, which was out of this scope.</w:t>
             </w:r>
           </w:p>
         </w:tc>

</xml_diff>

<commit_message>
docs: correct stale Decision Log statuses and add Section 4.6 momentum/events routes
Marks #216, #225, #226, #295, #297, #298, #300, #308 Resolved after verifying each against the live repo, and adds the two Sports routes Decision Log #327 flagged as missing from Section 4.6.

Co-Authored-By: Claude Sonnet 5 <noreply@anthropic.com>
</commit_message>
<xml_diff>
--- a/docs/Soccernity_MVP_Build_Plan_v1.7.docx
+++ b/docs/Soccernity_MVP_Build_Plan_v1.7.docx
@@ -4802,6 +4802,34 @@
           <w:szCs w:val="19"/>
         </w:rPr>
         <w:t xml:space="preserve">GET    /sports/highlights/:matchId</w:t>
+      </w:r>
+    </w:p>
+    <w:p>
+      <w:pPr>
+        <w:spacing w:after="40"/>
+      </w:pPr>
+      <w:r>
+        <w:rPr>
+          <w:rFonts w:ascii="Consolas" w:cs="Consolas" w:eastAsia="Consolas" w:hAnsi="Consolas"/>
+          <w:color w:val="12213A"/>
+          <w:sz w:val="19"/>
+          <w:szCs w:val="19"/>
+        </w:rPr>
+        <w:t>GET    /sports/matches/:id/momentum     (added beyond the literal list, Decision Log #327; derived from cached events, public)</w:t>
+      </w:r>
+    </w:p>
+    <w:p>
+      <w:pPr>
+        <w:spacing w:after="40"/>
+      </w:pPr>
+      <w:r>
+        <w:rPr>
+          <w:rFonts w:ascii="Consolas" w:cs="Consolas" w:eastAsia="Consolas" w:hAnsi="Consolas"/>
+          <w:color w:val="12213A"/>
+          <w:sz w:val="19"/>
+          <w:szCs w:val="19"/>
+        </w:rPr>
+        <w:t>GET    /sports/matches/:id/events       (added beyond the literal list, Decision Log #327; automated event feed, newest first, public)</w:t>
       </w:r>
     </w:p>
     <w:p>
@@ -18858,7 +18886,10 @@
           </w:tcPr>
           <w:p>
             <w:r>
-              <w:t>Built, Figma design only, no app/backend code. The header section (back link, club badge / name / league•country / member-count, Join button) is carried forward UNCHANGED on both frames; only the stale "Member posts and a full member list aren't part of club pages yet" scope note is removed (both are now designed). CLUB FEED — a "Club feed" section with post cards cloned from the Community — Home Feed post-card pattern (Community — Home Feed — Mobile, 5701:8239); illustrative member social posts (dummy data, same convention as every other pre-backend screen). This closes the DESIGN side of Decision Log #157 — the club-scoped-posts endpoint STILL does not exist (GET /posts/feed never reads Post.clubPageId); figma-to-code must not wire the feed to real data until it does. No composer designed (no club-post-creation endpoint; further from backend than reading). MEMBER ROSTER — a "Members" section: rows adapted from the post-card author-identity block (avatar + display name + @handle) + a secondary "Follow" button (POST /users/:id/follow is real). The roster is conceptually "users whose represented club is this club" — that field/endpoint does not exist yet either (DL #74). Dummy members. "View all members -&gt;" has no destination screen (a dedicated full-roster screen is not built) — flagged, not wired. OUT OF SCOPE, founder-confirmed: club announcements, fixtures, any other content — no data source for either, none designed. Token discipline: no new colour, no brand/green-tint-28, Light mode only; both frames 0 unbound paints. On-canvas "Club — Fan Page — Design Notes" annotation added. Opened as PR #176 — not merged, founder's call after review.</w:t>
+              <w:t>Resolved, Figma design only, no app/backend code. The header section (back link, club badge / name / league•country / member-count, Join button) is carried forward UNCHANGED on both frames; only the stale "Member posts and a full member list aren't part of club pages yet" scope note is removed (both are now designed). CLUB FEED — a "Club feed" section with post cards cloned from the Community — Home Feed post-card pattern (Community — Home Feed — Mobile, 5701:8239); illustrative member social posts (dummy data, same convention as every other pre-backend screen). This closes the DESIGN side of Decision Log #157 — the club-scoped-posts endpoint STILL does not exist (GET /posts/feed never reads Post.clubPageId); figma-to-code must not wire the feed to real data until it does. No composer designed (no club-post-creation endpoint; further from backend than reading). MEMBER ROSTER — a "Members" section: rows adapted from the post-card author-identity block (avatar + display name + @handle) + a secondary "Follow" button (POST /users/:id/follow is real). The roster is conceptually "users whose represented club is this club" — that field/endpoint does not exist yet either (DL #74). Dummy members. "View all members -&gt;" has no destination screen (a dedicated full-roster screen is not built) — flagged, not wired. OUT OF SCOPE, founder-confirmed: club announcements, fixtures, any other content — no data source for either, none designed. Token discipline: no new colour, no brand/green-tint-28, Light mode only; both frames 0 unbound paints. On-canvas "Club — Fan Page — Design Notes" annotation added. Opened as PR #176 — not merged, founder's call after review.</w:t>
+            </w:r>
+            <w:r>
+              <w:t xml:space="preserve"> Forward-pointer (2026-10-03, docs/decision-log-stale-status-cleanup): Correction: Resolved. apps/web/src/pages/ClubFanPage.tsx is a real, backend-wired page (GET /clubs/:id, GET /clubs/:id/feed, GET /clubs/:id/members, per PRs #142/#176/#177 and sprint-2/club-fan-page-to-code), not Figma-design-only. The "no app/backend code" wording above is stale; the design-side resolution is unchanged.</w:t>
             </w:r>
           </w:p>
         </w:tc>
@@ -19236,7 +19267,10 @@
           </w:tcPr>
           <w:p>
             <w:r>
-              <w:t>Open -- flagged, not fixed (apps/web-only PR; the frontend does what it can with the signal the backend gives). login() throws AuthApiError with code:"account_deactivated" when response.status===401 and /deactivat/i matches the response body message; LoginPage routes to /account/inactive on that code, carrying the (verified-correct) email+password in in-memory react-router state so "Activate account" can call POST /auth/reactivate-account without re-prompting. A dedicated machine-readable response code (or a distinct 403) on AuthService.login for the deactivated case would remove the string-matching fragility -- a small backend follow-up. No user-facing bug today: if the string match ever failed, the person would just see the normal "wrong password" error.</w:t>
+              <w:t>Resolved -- flagged, not fixed (apps/web-only PR; the frontend does what it can with the signal the backend gives). login() throws AuthApiError with code:"account_deactivated" when response.status===401 and /deactivat/i matches the response body message; LoginPage routes to /account/inactive on that code, carrying the (verified-correct) email+password in in-memory react-router state so "Activate account" can call POST /auth/reactivate-account without re-prompting. A dedicated machine-readable response code (or a distinct 403) on AuthService.login for the deactivated case would remove the string-matching fragility -- a small backend follow-up. No user-facing bug today: if the string match ever failed, the person would just see the normal "wrong password" error.</w:t>
+            </w:r>
+            <w:r>
+              <w:t xml:space="preserve"> Forward-pointer (2026-10-03, docs/decision-log-stale-status-cleanup): Resolved. services/api/src/modules/auth/auth.service.ts emits a structured code (ACCOUNT_DEACTIVATED_CODE = "account_deactivated", line 19) and apps/web/src/api/auth.ts consumes that code directly, replacing the /deactivat/i string match described above.</w:t>
             </w:r>
           </w:p>
         </w:tc>
@@ -19278,7 +19312,10 @@
           </w:tcPr>
           <w:p>
             <w:r>
-              <w:t>Open -- flagged, not fixed. This was a TEST-ONLY PR; changing the tiebreaker (or the schema) was explicitly out of scope for unblocking the CI failure. The test flake itself is fixed: seedClubPost() and every order-asserting seed in that file now pass an explicit, strictly-increasing createdAt (10ms apart) so the tests never depend on clock resolution. The PRODUCTION edge case is real but narrow and cosmetic -- same class as Decision Log #153/#154: not data loss, not duplication. At worst, two posts genuinely created within the same millisecond can swap places between two paginated requests, or a cursor built exactly on that boundary row can skip or repeat that one pair. It predates this PR and also exists on GET /posts/feed; feed volume is near zero today so there is no observable churn. Fix options for whoever hardens feed-ordering later: (a) a monotonic sequence column on Post (`seq BigInt @default(autoincrement())`) used as the tiebreaker key instead of `id`, with the cursor encoding it too; (b) higher-precision createdAt if Postgres/Prisma expose it reliably; (c) formally accept it as cosmetic. Low priority.</w:t>
+              <w:t>Resolved -- flagged, not fixed. This was a TEST-ONLY PR; changing the tiebreaker (or the schema) was explicitly out of scope for unblocking the CI failure. The test flake itself is fixed: seedClubPost() and every order-asserting seed in that file now pass an explicit, strictly-increasing createdAt (10ms apart) so the tests never depend on clock resolution. The PRODUCTION edge case is real but narrow and cosmetic -- same class as Decision Log #153/#154: not data loss, not duplication. At worst, two posts genuinely created within the same millisecond can swap places between two paginated requests, or a cursor built exactly on that boundary row can skip or repeat that one pair. It predates this PR and also exists on GET /posts/feed; feed volume is near zero today so there is no observable churn. Fix options for whoever hardens feed-ordering later: (a) a monotonic sequence column on Post (`seq BigInt @default(autoincrement())`) used as the tiebreaker key instead of `id`, with the cursor encoding it too; (b) higher-precision createdAt if Postgres/Prisma expose it reliably; (c) formally accept it as cosmetic. Low priority.</w:t>
+            </w:r>
+            <w:r>
+              <w:t xml:space="preserve"> Forward-pointer (2026-10-03, docs/decision-log-stale-status-cleanup): Resolved. Post.sequence, Comment.sequence, SavedPost.sequence and Follow.sequence are all Int @unique @default(autoincrement()) (migrations 20260928120000_add_feed_pagination_sequence_columns and 20260928140000_add_follow_sequence_column), and feed.service.ts orders by { sequence: "desc" } (line 406). This is option (a) from the list above.</w:t>
             </w:r>
           </w:p>
         </w:tc>
@@ -22183,7 +22220,7 @@
           <w:p>
             <w:r/>
             <w:r>
-              <w:t xml:space="preserve">Open — flagged, built anyway per the task brief's own explicit instruction (without POST /reports nothing could ever create a Report row at all, and Section 8.4's own workflow text assumes a submission + appeal path exists). POST /reports and POST /reports/:id/appeal are deliberately JwtAuthGuard-only, NOT GuardianConsentGuard-gated — a restricted-pending minor must still be able to report abuse directed at them and appeal a decision made against them. Pending founder/Decision Log confirmation these should be formally added to Section 4's API Contract Sketch. Closes the backend half of #135/#189 — see also #296, #299.</w:t>
+              <w:t>Resolved — flagged, built anyway per the task brief's own explicit instruction (without POST /reports nothing could ever create a Report row at all, and Section 8.4's own workflow text assumes a submission + appeal path exists). POST /reports and POST /reports/:id/appeal are deliberately JwtAuthGuard-only, NOT GuardianConsentGuard-gated — a restricted-pending minor must still be able to report abuse directed at them and appeal a decision made against them. Pending founder/Decision Log confirmation these should be formally added to Section 4's API Contract Sketch. Closes the backend half of #135/#189 — see also #296, #299.</w:t>
             </w:r>
           </w:p>
           <w:p>
@@ -22195,6 +22232,9 @@
             <w:r>
               <w:t>Forward-pointer (doc-formalization pass, docs/decision-log-formalize-295-296-297-298-303-308): Section 4.8's API Contract Sketch now includes POST /reports and POST /reports/:id/appeal (both annotated as user-facing, JwtAuthGuard only, no GuardianConsentGuard) plus PATCH /admin/moderation/reports/:id/appeal alongside the existing GET/PATCH /admin/moderation/reports line. This resolves the "should these be formally written into Section 4" question -- they now are. Whether a Report row should eventually be backed by a dedicated audit-log entity (see #296) is a separate, still-open question this formalization does not resolve.</w:t>
             </w:r>
+            <w:r>
+              <w:t xml:space="preserve"> Forward-pointer (2026-10-03, docs/decision-log-stale-status-cleanup): Resolved. Verified against the live repo: the routes exist in services/api/src/modules/moderation and Section 4.8 now lists them (doc-formalization pass above).</w:t>
+            </w:r>
           </w:p>
         </w:tc>
       </w:tr>
@@ -22290,13 +22330,16 @@
           <w:p>
             <w:r/>
             <w:r>
-              <w:t xml:space="preserve">Open — flagged, built anyway (an Articles/Categories admin screen that can create but never see its own content, or a Status toggle with nothing behind it, is a bigger gap than three undefined routes). Same shape as #295. Pending founder/Decision Log confirmation these should be formally added to Section 4's API Contract Sketch. PATCH /admin/categories/:id is also the real mechanism for retiring a category (see #298) without orphaning its Article rows — Section 4.8 defines no category-deletion route at all, and none was built; the status toggle is the deliberate substitute.</w:t>
+              <w:t>Resolved — flagged, built anyway (an Articles/Categories admin screen that can create but never see its own content, or a Status toggle with nothing behind it, is a bigger gap than three undefined routes). Same shape as #295. Pending founder/Decision Log confirmation these should be formally added to Section 4's API Contract Sketch. PATCH /admin/categories/:id is also the real mechanism for retiring a category (see #298) without orphaning its Article rows — Section 4.8 defines no category-deletion route at all, and none was built; the status toggle is the deliberate substitute.</w:t>
             </w:r>
           </w:p>
           <w:p>
             <w:r>
               <w:t>Forward-pointer (doc-formalization pass, docs/decision-log-formalize-295-296-297-298-303-308): Section 4.8's API Contract Sketch now includes GET /admin/articles, GET /admin/categories, and PATCH /admin/categories/:id alongside the existing POST /admin/articles / PATCH /admin/articles/:id / POST /admin/categories lines. This resolves the "should these be formally written into Section 4" question -- they now are.</w:t>
             </w:r>
+            <w:r>
+              <w:t xml:space="preserve"> Forward-pointer (2026-10-03, docs/decision-log-stale-status-cleanup): Resolved. Verified against the live repo: GET /admin/articles, GET /admin/categories and PATCH /admin/categories/:id exist in services/api/src/modules/admin-content, and Section 4.8 now lists them (doc-formalization pass above).</w:t>
+            </w:r>
           </w:p>
         </w:tc>
       </w:tr>
@@ -22341,13 +22384,16 @@
           <w:p>
             <w:r/>
             <w:r>
-              <w:t xml:space="preserve">Open — flagged per CLAUDE.md's “the data model is a fixed spec” rule rather than added silently. Built anyway (a real, hand-run prisma migrate dev confirmed this applies cleanly against both the dev and soccernity_test databases): Article.createdAt / Category.createdAt back ArticlesPage.tsx's own “Date” column and GET /admin/articles' / GET /admin/categories' own keyset pagination (the same “a list endpoint needs a real column to order by” gap Follow.createdAt/Like.likedAt/BanterRoomMember.joinedAt each closed for their own models); Category.status backs CategoriesPage.tsx's own Figma-designed Active/Inactive column and is the deliberate substitute for a category-deletion endpoint (Article.categoryId has no ON DELETE CASCADE, so a hard delete would orphan Article rows — see #297). Pending founder confirmation these should be formally written into Section 3.</w:t>
+              <w:t>Resolved — flagged per CLAUDE.md's “the data model is a fixed spec” rule rather than added silently. Built anyway (a real, hand-run prisma migrate dev confirmed this applies cleanly against both the dev and soccernity_test databases): Article.createdAt / Category.createdAt back ArticlesPage.tsx's own “Date” column and GET /admin/articles' / GET /admin/categories' own keyset pagination (the same “a list endpoint needs a real column to order by” gap Follow.createdAt/Like.likedAt/BanterRoomMember.joinedAt each closed for their own models); Category.status backs CategoriesPage.tsx's own Figma-designed Active/Inactive column and is the deliberate substitute for a category-deletion endpoint (Article.categoryId has no ON DELETE CASCADE, so a hard delete would orphan Article rows — see #297). Pending founder confirmation these should be formally written into Section 3.</w:t>
             </w:r>
           </w:p>
           <w:p>
             <w:r>
               <w:t>Forward-pointer (doc-formalization pass, docs/decision-log-formalize-295-296-297-298-303-308): Section 3's Article entity now lists created_at, and Category now lists status ('active' | 'inactive', default 'active') and created_at, as Key fields. This resolves the "should Section 3 be updated" question -- it now is.</w:t>
             </w:r>
+            <w:r>
+              <w:t xml:space="preserve"> Forward-pointer (2026-10-03, docs/decision-log-stale-status-cleanup): Resolved. Verified against the live repo: Article.createdAt, Category.createdAt and Category.status exist in services/api/prisma/schema.prisma, and Section 3 now lists them (doc-formalization pass above).</w:t>
+            </w:r>
           </w:p>
         </w:tc>
       </w:tr>
@@ -22438,7 +22484,10 @@
           <w:p>
             <w:r/>
             <w:r>
-              <w:t xml:space="preserve">Open — flagged, worked around rather than silently adding a new backend endpoint out of a frontend-only PR's scope. ReportDetailPage.tsx/AppealReviewPage.tsx are reached via a router state handoff from the queue's own “Review” link (the common path); a bounded findReportById fallback (re-lists GET /admin/moderation/reports and searches client-side, capped at 5 pages) covers a direct visit or page refresh with no state. A real GET /reports/:id would remove the need for both the state handoff and the bounded fallback — a genuine, real backend gap for a future backend-api pass, not a design/UX shortfall.</w:t>
+              <w:t>Resolved — flagged, worked around rather than silently adding a new backend endpoint out of a frontend-only PR's scope. ReportDetailPage.tsx/AppealReviewPage.tsx are reached via a router state handoff from the queue's own “Review” link (the common path); a bounded findReportById fallback (re-lists GET /admin/moderation/reports and searches client-side, capped at 5 pages) covers a direct visit or page refresh with no state. A real GET /reports/:id would remove the need for both the state handoff and the bounded fallback — a genuine, real backend gap for a future backend-api pass, not a design/UX shortfall.</w:t>
+            </w:r>
+            <w:r>
+              <w:t xml:space="preserve"> Forward-pointer (2026-10-03, docs/decision-log-stale-status-cleanup): Resolved. Verified against the live repo: GET /admin/moderation/reports/:id exists (services/api/src/modules/moderation/admin-moderation.controller.ts, covered by admin-moderation.controller.http.spec.ts), and apps/admin/src/api/moderation.ts getReportById() calls it.</w:t>
             </w:r>
           </w:p>
         </w:tc>
@@ -22824,13 +22873,16 @@
           <w:p>
             <w:r/>
             <w:r>
-              <w:t>Open — flagged per CLAUDE.md's “the data model is a fixed spec” rule rather than added silently. Built anyway (a real, hand-run prisma migrate dev confirmed this applies cleanly against both the dev and soccernity_test databases; the table was empty, so no backfill was needed): url is built from provider config (endpoint/bucket/region) at upload time and would break StorageService.delete()'s ability to locate the object again if that config ever changes (a moved bucket, a swapped-in CDN domain — the same class of change Decision Log #26 already anticipates for hosting generally); key is the durable identifier the object actually lives under, independent of that config. key is stored on every new row but read/written by nothing else in this PR — see #310 (no DELETE/single-GET endpoint exists yet to use it). Pending founder confirmation this column should be formally written into Section 3.</w:t>
+              <w:t>Resolved — flagged per CLAUDE.md's “the data model is a fixed spec” rule rather than added silently. Built anyway (a real, hand-run prisma migrate dev confirmed this applies cleanly against both the dev and soccernity_test databases; the table was empty, so no backfill was needed): url is built from provider config (endpoint/bucket/region) at upload time and would break StorageService.delete()'s ability to locate the object again if that config ever changes (a moved bucket, a swapped-in CDN domain — the same class of change Decision Log #26 already anticipates for hosting generally); key is the durable identifier the object actually lives under, independent of that config. key is stored on every new row but read/written by nothing else in this PR — see #310 (no DELETE/single-GET endpoint exists yet to use it). Pending founder confirmation this column should be formally written into Section 3.</w:t>
             </w:r>
           </w:p>
           <w:p>
             <w:r>
               <w:t>Forward-pointer (doc-formalization pass, docs/decision-log-formalize-295-296-297-298-303-308): Section 3's MediaAsset entity now lists key as a Key field, alongside the existing url. This resolves the "should Section 3 be updated to reflect it" question -- it now is. key is still stored on every row but read/written by nothing else in this codebase yet -- see #310 (no DELETE/single-GET endpoint exists to use it).</w:t>
             </w:r>
+            <w:r>
+              <w:t xml:space="preserve"> Forward-pointer (2026-10-03, docs/decision-log-stale-status-cleanup): Resolved. Verified against the live repo: MediaAsset.key exists in services/api/prisma/schema.prisma (migration 20260915162308_add_media_asset_key), and Section 3 now lists it (doc-formalization pass above).</w:t>
+            </w:r>
           </w:p>
         </w:tc>
       </w:tr>
@@ -23705,7 +23757,10 @@
           </w:tcPr>
           <w:p>
             <w:r>
-              <w:t>Open</w:t>
+              <w:t>Resolved</w:t>
+            </w:r>
+            <w:r>
+              <w:t xml:space="preserve"> Forward-pointer (2026-10-03, docs/decision-log-stale-status-cleanup): Resolved. Section 4.6 now lists GET /sports/matches/:id/momentum and GET /sports/matches/:id/events alongside the original eight endpoints, annotated as additions beyond the literal list.</w:t>
             </w:r>
           </w:p>
         </w:tc>

</xml_diff>

<commit_message>
docs(sports): confirm Highlightly auth header and box-score path against live API
Resolves Decision Log #328 (direct-host auth header) and #324 (per-player box-score
endpoint) by calling the real account. Box score is GET /box-score/{matchId}; the
other candidates were empty or 404. Also flags that the live box score carries
populated xG fields and matchRating, which contradicts the capability registry.
The registry and the box-score feature are deliberately not changed here.

Co-Authored-By: Claude Sonnet 5 <noreply@anthropic.com>
</commit_message>
<xml_diff>
--- a/docs/Soccernity_MVP_Build_Plan_v1.7.docx
+++ b/docs/Soccernity_MVP_Build_Plan_v1.7.docx
@@ -23626,29 +23626,76 @@
           </w:tcPr>
           <w:p>
             <w:r>
+              <w:t>Resolved (2026-10-03, sprint-4/highlightly-live-verification). Confirmed live against the real Highlightly account: GET /box-score/{matchId} returns per-player box scores for every player in one match in one call (45 players on a finished Serie B match, with matchRating and a keyed statistics object). The other candidates did not return box-score data: /players/{matchId} returns 200 with an empty array, /players/{id}/box-scores and /football/match-box-score/{matchId} return 404. The team-level-only statement above is superseded. Still open, separately: whether to build the box-score call, which needs costing against the free-tier budget (#323). Findings: services/api/src/modules/sports/highlightly-vs-sportmonks.md, Finding 1 and Finding 5.</w:t>
+            </w:r>
+          </w:p>
+        </w:tc>
+      </w:tr>
+      <w:tr>
+        <w:tc>
+          <w:tcPr>
+            <w:tcW w:type="dxa" w:w="500"/>
+          </w:tcPr>
+          <w:p>
+            <w:r>
+              <w:t>325</w:t>
+            </w:r>
+          </w:p>
+        </w:tc>
+        <w:tc>
+          <w:tcPr>
+            <w:tcW w:type="dxa" w:w="4700"/>
+          </w:tcPr>
+          <w:p>
+            <w:r>
+              <w:t>No standings “form” (recent-results) field exists from Highlightly (Sprint 4, sprint-4/sports-hub-highlightly-backend). GET /standings's own documented example standing row has no form field anywhere, and the nearest candidate (GET /last-five-games?teamId=) is per-team -- a full league table's form column would cost 20 extra calls per refresh. GET /sports/standings returns exactly what Highlightly returns, with no form field on any row, real or fabricated. The Figma Standing screen's already-shipped FORM column stays unwired to this endpoint's data until a genuinely cheap per-team form data source exists.</w:t>
+            </w:r>
+          </w:p>
+        </w:tc>
+        <w:tc>
+          <w:tcPr>
+            <w:tcW w:type="dxa" w:w="1850"/>
+          </w:tcPr>
+          <w:p>
+            <w:r>
+              <w:t>sprint-4/sports-hub-highlightly-backend report / services/api/src/modules/sports/README.md</w:t>
+            </w:r>
+          </w:p>
+        </w:tc>
+        <w:tc>
+          <w:tcPr>
+            <w:tcW w:type="dxa" w:w="2300"/>
+          </w:tcPr>
+          <w:p>
+            <w:r>
               <w:t>Open</w:t>
             </w:r>
           </w:p>
-        </w:tc>
-      </w:tr>
-      <w:tr>
-        <w:tc>
-          <w:tcPr>
-            <w:tcW w:type="dxa" w:w="500"/>
-          </w:tcPr>
-          <w:p>
-            <w:r>
-              <w:t>325</w:t>
-            </w:r>
-          </w:p>
-        </w:tc>
-        <w:tc>
-          <w:tcPr>
-            <w:tcW w:type="dxa" w:w="4700"/>
-          </w:tcPr>
-          <w:p>
-            <w:r>
-              <w:t>No standings “form” (recent-results) field exists from Highlightly (Sprint 4, sprint-4/sports-hub-highlightly-backend). GET /standings's own documented example standing row has no form field anywhere, and the nearest candidate (GET /last-five-games?teamId=) is per-team -- a full league table's form column would cost 20 extra calls per refresh. GET /sports/standings returns exactly what Highlightly returns, with no form field on any row, real or fabricated. The Figma Standing screen's already-shipped FORM column stays unwired to this endpoint's data until a genuinely cheap per-team form data source exists.</w:t>
+          <w:p>
+            <w:r>
+              <w:t>CROSS-REFERENCE (schema/report-severity-escalation-admin-vetting, 2026-09-27): PR #316's SPORTS_DATA_PROVIDER_CAPABILITIES registry (services/api/src/modules/sports/sports-data-provider.constants.ts) already resolves the mechanism behind this same standings-FORM gap -- 'standingsForm' is a registered SportsDataField, marked unsupported for Highlightly ("documented standings row has no form field", matching this row's own finding) and supported for SportMonks; PublicStandingRow.form is emitted by sports.service.ts's toPublicStandingRow() only when providerSupports(activeProvider, 'standingsForm') is true AND the raw row actually carries form data -- the key is omitted (never null/[]) otherwise. This row (#325) is left OPEN, not resolved by this note -- the underlying product question (does Soccernity ever switch to a vendor that supplies FORM, or does the Standing UI ship without it) is unchanged; what's now true is that the codebase has a single, correct, provider-aware mechanism already in place to reflect whichever answer applies, rather than a hardcoded Highlightly-shaped assumption.</w:t>
+            </w:r>
+          </w:p>
+        </w:tc>
+      </w:tr>
+      <w:tr>
+        <w:tc>
+          <w:tcPr>
+            <w:tcW w:type="dxa" w:w="500"/>
+          </w:tcPr>
+          <w:p>
+            <w:r>
+              <w:t>326</w:t>
+            </w:r>
+          </w:p>
+        </w:tc>
+        <w:tc>
+          <w:tcPr>
+            <w:tcW w:type="dxa" w:w="4700"/>
+          </w:tcPr>
+          <w:p>
+            <w:r>
+              <w:t>No confirmed top-scorers endpoint exists from Highlightly (Sprint 4, sprint-4/sports-hub-highlightly-backend) -- checked directly against the vendor's public API documentation (Matches, Events, Statistics, Lineups, Standings, Head-to-Head, Highlights, Leagues, Countries, Teams, Players, Odds, Bookmakers). There is no dedicated top-scorers/leading-scorers endpoint; Players/{id}/statistics is per-player, not a rankable list. Confirms the Top Scorers fast-follow exclusion (named in the sprint-4/sports-hub-highlightly-data-redesign report) stays excluded -- building it would face the same per-player fan-out problem as Decision Log #324.</w:t>
             </w:r>
           </w:p>
         </w:tc>
@@ -23668,34 +23715,29 @@
           </w:tcPr>
           <w:p>
             <w:r>
-              <w:t>Open</w:t>
-            </w:r>
-          </w:p>
-          <w:p>
-            <w:r>
-              <w:t>CROSS-REFERENCE (schema/report-severity-escalation-admin-vetting, 2026-09-27): PR #316's SPORTS_DATA_PROVIDER_CAPABILITIES registry (services/api/src/modules/sports/sports-data-provider.constants.ts) already resolves the mechanism behind this same standings-FORM gap -- 'standingsForm' is a registered SportsDataField, marked unsupported for Highlightly ("documented standings row has no form field", matching this row's own finding) and supported for SportMonks; PublicStandingRow.form is emitted by sports.service.ts's toPublicStandingRow() only when providerSupports(activeProvider, 'standingsForm') is true AND the raw row actually carries form data -- the key is omitted (never null/[]) otherwise. This row (#325) is left OPEN, not resolved by this note -- the underlying product question (does Soccernity ever switch to a vendor that supplies FORM, or does the Standing UI ship without it) is unchanged; what's now true is that the codebase has a single, correct, provider-aware mechanism already in place to reflect whichever answer applies, rather than a hardcoded Highlightly-shaped assumption.</w:t>
-            </w:r>
-          </w:p>
-        </w:tc>
-      </w:tr>
-      <w:tr>
-        <w:tc>
-          <w:tcPr>
-            <w:tcW w:type="dxa" w:w="500"/>
-          </w:tcPr>
-          <w:p>
-            <w:r>
-              <w:t>326</w:t>
-            </w:r>
-          </w:p>
-        </w:tc>
-        <w:tc>
-          <w:tcPr>
-            <w:tcW w:type="dxa" w:w="4700"/>
-          </w:tcPr>
-          <w:p>
-            <w:r>
-              <w:t>No confirmed top-scorers endpoint exists from Highlightly (Sprint 4, sprint-4/sports-hub-highlightly-backend) -- checked directly against the vendor's public API documentation (Matches, Events, Statistics, Lineups, Standings, Head-to-Head, Highlights, Leagues, Countries, Teams, Players, Odds, Bookmakers). There is no dedicated top-scorers/leading-scorers endpoint; Players/{id}/statistics is per-player, not a rankable list. Confirms the Top Scorers fast-follow exclusion (named in the sprint-4/sports-hub-highlightly-data-redesign report) stays excluded -- building it would face the same per-player fan-out problem as Decision Log #324.</w:t>
+              <w:t>Resolved (confirmed absent from the vendor)</w:t>
+            </w:r>
+          </w:p>
+        </w:tc>
+      </w:tr>
+      <w:tr>
+        <w:tc>
+          <w:tcPr>
+            <w:tcW w:type="dxa" w:w="500"/>
+          </w:tcPr>
+          <w:p>
+            <w:r>
+              <w:t>327</w:t>
+            </w:r>
+          </w:p>
+        </w:tc>
+        <w:tc>
+          <w:tcPr>
+            <w:tcW w:type="dxa" w:w="4700"/>
+          </w:tcPr>
+          <w:p>
+            <w:r>
+              <w:t>GET /sports/matches/:id/momentum and GET /sports/matches/:id/events are genuine additions beyond Section 4.6's literal eight-endpoint list (Sprint 4, sprint-4/sports-hub-highlightly-backend), built to match the Match Momentum and Live Commentary sections the sprint-4/sports-hub-highlightly-data-redesign Figma pass designed. momentum is a pure server-side computation over the cached events document (no Highlightly momentum endpoint exists); events is the automated match-event feed (never editorial commentary), returned newest-first per that design's own Decision Log #316. Section 4.6's own API Contract Sketch should be updated to include both routes -- this entry does not do that edit itself, matching how Decision Log #23 (GET /auth/me) was left for whoever next edits Section 4 in the live document.</w:t>
             </w:r>
           </w:p>
         </w:tc>
@@ -23715,29 +23757,32 @@
           </w:tcPr>
           <w:p>
             <w:r>
-              <w:t>Resolved (confirmed absent from the vendor)</w:t>
-            </w:r>
-          </w:p>
-        </w:tc>
-      </w:tr>
-      <w:tr>
-        <w:tc>
-          <w:tcPr>
-            <w:tcW w:type="dxa" w:w="500"/>
-          </w:tcPr>
-          <w:p>
-            <w:r>
-              <w:t>327</w:t>
-            </w:r>
-          </w:p>
-        </w:tc>
-        <w:tc>
-          <w:tcPr>
-            <w:tcW w:type="dxa" w:w="4700"/>
-          </w:tcPr>
-          <w:p>
-            <w:r>
-              <w:t>GET /sports/matches/:id/momentum and GET /sports/matches/:id/events are genuine additions beyond Section 4.6's literal eight-endpoint list (Sprint 4, sprint-4/sports-hub-highlightly-backend), built to match the Match Momentum and Live Commentary sections the sprint-4/sports-hub-highlightly-data-redesign Figma pass designed. momentum is a pure server-side computation over the cached events document (no Highlightly momentum endpoint exists); events is the automated match-event feed (never editorial commentary), returned newest-first per that design's own Decision Log #316. Section 4.6's own API Contract Sketch should be updated to include both routes -- this entry does not do that edit itself, matching how Decision Log #23 (GET /auth/me) was left for whoever next edits Section 4 in the live document.</w:t>
+              <w:t>Resolved</w:t>
+            </w:r>
+            <w:r>
+              <w:t xml:space="preserve"> Forward-pointer (2026-10-03, docs/decision-log-stale-status-cleanup): Resolved. Section 4.6 now lists GET /sports/matches/:id/momentum and GET /sports/matches/:id/events alongside the original eight endpoints, annotated as additions beyond the literal list.</w:t>
+            </w:r>
+          </w:p>
+        </w:tc>
+      </w:tr>
+      <w:tr>
+        <w:tc>
+          <w:tcPr>
+            <w:tcW w:type="dxa" w:w="500"/>
+          </w:tcPr>
+          <w:p>
+            <w:r>
+              <w:t>328</w:t>
+            </w:r>
+          </w:p>
+        </w:tc>
+        <w:tc>
+          <w:tcPr>
+            <w:tcW w:type="dxa" w:w="4700"/>
+          </w:tcPr>
+          <w:p>
+            <w:r>
+              <w:t>The direct highlightly.net host's exact auth-header behaviour is not independently confirmed beyond what Highlightly's public docs state generally (Sprint 4, sprint-4/sports-hub-highlightly-backend): x-rapidapi-key is documented as the required header for “your Highlightly or RapidAPI API Key” alike, with x-rapidapi-host required only when actually calling through RapidAPI's own gateway. HighlightlyClient (services/api/src/sports-data/highlightly-client.service.ts) implements exactly this reading, but no real Highlightly account exists in this environment to trace a live call against. To be confirmed the moment a real account exists.</w:t>
             </w:r>
           </w:p>
         </w:tc>
@@ -23757,52 +23802,7 @@
           </w:tcPr>
           <w:p>
             <w:r>
-              <w:t>Resolved</w:t>
-            </w:r>
-            <w:r>
-              <w:t xml:space="preserve"> Forward-pointer (2026-10-03, docs/decision-log-stale-status-cleanup): Resolved. Section 4.6 now lists GET /sports/matches/:id/momentum and GET /sports/matches/:id/events alongside the original eight endpoints, annotated as additions beyond the literal list.</w:t>
-            </w:r>
-          </w:p>
-        </w:tc>
-      </w:tr>
-      <w:tr>
-        <w:tc>
-          <w:tcPr>
-            <w:tcW w:type="dxa" w:w="500"/>
-          </w:tcPr>
-          <w:p>
-            <w:r>
-              <w:t>328</w:t>
-            </w:r>
-          </w:p>
-        </w:tc>
-        <w:tc>
-          <w:tcPr>
-            <w:tcW w:type="dxa" w:w="4700"/>
-          </w:tcPr>
-          <w:p>
-            <w:r>
-              <w:t>The direct highlightly.net host's exact auth-header behaviour is not independently confirmed beyond what Highlightly's public docs state generally (Sprint 4, sprint-4/sports-hub-highlightly-backend): x-rapidapi-key is documented as the required header for “your Highlightly or RapidAPI API Key” alike, with x-rapidapi-host required only when actually calling through RapidAPI's own gateway. HighlightlyClient (services/api/src/sports-data/highlightly-client.service.ts) implements exactly this reading, but no real Highlightly account exists in this environment to trace a live call against. To be confirmed the moment a real account exists.</w:t>
-            </w:r>
-          </w:p>
-        </w:tc>
-        <w:tc>
-          <w:tcPr>
-            <w:tcW w:type="dxa" w:w="1850"/>
-          </w:tcPr>
-          <w:p>
-            <w:r>
-              <w:t>sprint-4/sports-hub-highlightly-backend report / services/api/src/modules/sports/README.md</w:t>
-            </w:r>
-          </w:p>
-        </w:tc>
-        <w:tc>
-          <w:tcPr>
-            <w:tcW w:type="dxa" w:w="2300"/>
-          </w:tcPr>
-          <w:p>
-            <w:r>
-              <w:t>Open</w:t>
+              <w:t>Resolved (2026-10-03, sprint-4/highlightly-live-verification). Confirmed live through the real HighlightlyClient: x-rapidapi-key alone to soccer.highlightly.net returns 200; no key returns 403 Missing mandatory HTTP Headers; sending x-rapidapi-host to the direct host also returns 200. The client behaviour (key always, host only when SPORTS_DATA_RAPIDAPI_HOST is set) is correct for the direct host. The RapidAPI gateway path is not tested.</w:t>
             </w:r>
           </w:p>
         </w:tc>

</xml_diff>

<commit_message>
docs(decision-log): settle #323 on free tier and document #329 query params
Records the founder's decision to stay on Highlightly's free tier for now
(#323, Resolved, forward-pointer added) and adds the already-shipped
league/season query params to Build Plan Section 4.6 (#329, Resolved).

Co-Authored-By: Claude Sonnet 5 <noreply@anthropic.com>
</commit_message>
<xml_diff>
--- a/docs/Soccernity_MVP_Build_Plan_v1.7.docx
+++ b/docs/Soccernity_MVP_Build_Plan_v1.7.docx
@@ -4703,7 +4703,7 @@
           <w:sz w:val="19"/>
           <w:szCs w:val="19"/>
         </w:rPr>
-        <w:t xml:space="preserve">GET    /sports/live-scores</w:t>
+        <w:t>GET    /sports/live-scores?league=     (league filter added beyond the literal list, Decision Log #329)</w:t>
       </w:r>
     </w:p>
     <w:p>
@@ -4717,7 +4717,7 @@
           <w:sz w:val="19"/>
           <w:szCs w:val="19"/>
         </w:rPr>
-        <w:t xml:space="preserve">GET    /sports/fixtures?date=</w:t>
+        <w:t>GET    /sports/fixtures?date=&amp;league=     (league filter added beyond the literal list, Decision Log #329)</w:t>
       </w:r>
     </w:p>
     <w:p>
@@ -4787,7 +4787,7 @@
           <w:sz w:val="19"/>
           <w:szCs w:val="19"/>
         </w:rPr>
-        <w:t xml:space="preserve">GET    /sports/standings?league=</w:t>
+        <w:t>GET    /sports/standings?league=&amp;season=     (season filter added beyond the literal list, Decision Log #329; league as above)</w:t>
       </w:r>
     </w:p>
     <w:p>
@@ -23584,29 +23584,121 @@
           </w:tcPr>
           <w:p>
             <w:r>
+              <w:t xml:space="preserve">Resolved (founder decision, settled for now). </w:t>
+            </w:r>
+            <w:r>
+              <w:t>Forward-pointer (docs/decision-log-323-329-bookkeeping): the founder has confirmed staying on Highlightly's free tier (100 requests/day) for now, revisiting only once real post-launch usage data shows it is insufficient. HIGHLIGHTLY_DAILY_REQUEST_BUDGET stays at its 100/day default in code, which already matches this decision. The original open question (paid-tier budget) is no longer blocking; the upgrade trigger is post-launch usage data.</w:t>
+            </w:r>
+          </w:p>
+        </w:tc>
+      </w:tr>
+      <w:tr>
+        <w:tc>
+          <w:tcPr>
+            <w:tcW w:type="dxa" w:w="500"/>
+          </w:tcPr>
+          <w:p>
+            <w:r>
+              <w:t>324</w:t>
+            </w:r>
+          </w:p>
+        </w:tc>
+        <w:tc>
+          <w:tcPr>
+            <w:tcW w:type="dxa" w:w="4700"/>
+          </w:tcPr>
+          <w:p>
+            <w:r>
+              <w:t>No batched per-match player box-score data exists from Highlightly (Sprint 4, sprint-4/sports-hub-highlightly-backend). GET /statistics/{matchId} (confirmed against Highlightly's own documented example response) is TEAM-LEVEL ONLY. Per-player stats exist only via GET /players/{id}/statistics, called one player at a time -- reconstructing an 11-player box score for one match would need 20+ extra Highlightly calls, not viable under the confirmed 100/day free tier. The Figma redesign (sprint-4/sports-hub-highlightly-data-redesign) assumed player box scores were available; they are not, from this vendor, without an unsustainable per-player API-call fan-out. GET /sports/matches/:id/stats returns team-level statistics only -- no synthetic/fabricated player rows are ever generated.</w:t>
+            </w:r>
+          </w:p>
+        </w:tc>
+        <w:tc>
+          <w:tcPr>
+            <w:tcW w:type="dxa" w:w="1850"/>
+          </w:tcPr>
+          <w:p>
+            <w:r>
+              <w:t>sprint-4/sports-hub-highlightly-backend report / services/api/src/modules/sports/README.md</w:t>
+            </w:r>
+          </w:p>
+        </w:tc>
+        <w:tc>
+          <w:tcPr>
+            <w:tcW w:type="dxa" w:w="2300"/>
+          </w:tcPr>
+          <w:p>
+            <w:r>
+              <w:t>Resolved (2026-10-03, sprint-4/highlightly-live-verification). Confirmed live against the real Highlightly account: GET /box-score/{matchId} returns per-player box scores for every player in one match in one call (45 players on a finished Serie B match, with matchRating and a keyed statistics object). The other candidates did not return box-score data: /players/{matchId} returns 200 with an empty array, /players/{id}/box-scores and /football/match-box-score/{matchId} return 404. The team-level-only statement above is superseded. Still open, separately: whether to build the box-score call, which needs costing against the free-tier budget (#323). Findings: services/api/src/modules/sports/highlightly-vs-sportmonks.md, Finding 1 and Finding 5.</w:t>
+            </w:r>
+          </w:p>
+        </w:tc>
+      </w:tr>
+      <w:tr>
+        <w:tc>
+          <w:tcPr>
+            <w:tcW w:type="dxa" w:w="500"/>
+          </w:tcPr>
+          <w:p>
+            <w:r>
+              <w:t>325</w:t>
+            </w:r>
+          </w:p>
+        </w:tc>
+        <w:tc>
+          <w:tcPr>
+            <w:tcW w:type="dxa" w:w="4700"/>
+          </w:tcPr>
+          <w:p>
+            <w:r>
+              <w:t>No standings “form” (recent-results) field exists from Highlightly (Sprint 4, sprint-4/sports-hub-highlightly-backend). GET /standings's own documented example standing row has no form field anywhere, and the nearest candidate (GET /last-five-games?teamId=) is per-team -- a full league table's form column would cost 20 extra calls per refresh. GET /sports/standings returns exactly what Highlightly returns, with no form field on any row, real or fabricated. The Figma Standing screen's already-shipped FORM column stays unwired to this endpoint's data until a genuinely cheap per-team form data source exists.</w:t>
+            </w:r>
+          </w:p>
+        </w:tc>
+        <w:tc>
+          <w:tcPr>
+            <w:tcW w:type="dxa" w:w="1850"/>
+          </w:tcPr>
+          <w:p>
+            <w:r>
+              <w:t>sprint-4/sports-hub-highlightly-backend report / services/api/src/modules/sports/README.md</w:t>
+            </w:r>
+          </w:p>
+        </w:tc>
+        <w:tc>
+          <w:tcPr>
+            <w:tcW w:type="dxa" w:w="2300"/>
+          </w:tcPr>
+          <w:p>
+            <w:r>
               <w:t>Open</w:t>
             </w:r>
           </w:p>
-        </w:tc>
-      </w:tr>
-      <w:tr>
-        <w:tc>
-          <w:tcPr>
-            <w:tcW w:type="dxa" w:w="500"/>
-          </w:tcPr>
-          <w:p>
-            <w:r>
-              <w:t>324</w:t>
-            </w:r>
-          </w:p>
-        </w:tc>
-        <w:tc>
-          <w:tcPr>
-            <w:tcW w:type="dxa" w:w="4700"/>
-          </w:tcPr>
-          <w:p>
-            <w:r>
-              <w:t>No batched per-match player box-score data exists from Highlightly (Sprint 4, sprint-4/sports-hub-highlightly-backend). GET /statistics/{matchId} (confirmed against Highlightly's own documented example response) is TEAM-LEVEL ONLY. Per-player stats exist only via GET /players/{id}/statistics, called one player at a time -- reconstructing an 11-player box score for one match would need 20+ extra Highlightly calls, not viable under the confirmed 100/day free tier. The Figma redesign (sprint-4/sports-hub-highlightly-data-redesign) assumed player box scores were available; they are not, from this vendor, without an unsustainable per-player API-call fan-out. GET /sports/matches/:id/stats returns team-level statistics only -- no synthetic/fabricated player rows are ever generated.</w:t>
+          <w:p>
+            <w:r>
+              <w:t>CROSS-REFERENCE (schema/report-severity-escalation-admin-vetting, 2026-09-27): PR #316's SPORTS_DATA_PROVIDER_CAPABILITIES registry (services/api/src/modules/sports/sports-data-provider.constants.ts) already resolves the mechanism behind this same standings-FORM gap -- 'standingsForm' is a registered SportsDataField, marked unsupported for Highlightly ("documented standings row has no form field", matching this row's own finding) and supported for SportMonks; PublicStandingRow.form is emitted by sports.service.ts's toPublicStandingRow() only when providerSupports(activeProvider, 'standingsForm') is true AND the raw row actually carries form data -- the key is omitted (never null/[]) otherwise. This row (#325) is left OPEN, not resolved by this note -- the underlying product question (does Soccernity ever switch to a vendor that supplies FORM, or does the Standing UI ship without it) is unchanged; what's now true is that the codebase has a single, correct, provider-aware mechanism already in place to reflect whichever answer applies, rather than a hardcoded Highlightly-shaped assumption.</w:t>
+            </w:r>
+          </w:p>
+        </w:tc>
+      </w:tr>
+      <w:tr>
+        <w:tc>
+          <w:tcPr>
+            <w:tcW w:type="dxa" w:w="500"/>
+          </w:tcPr>
+          <w:p>
+            <w:r>
+              <w:t>326</w:t>
+            </w:r>
+          </w:p>
+        </w:tc>
+        <w:tc>
+          <w:tcPr>
+            <w:tcW w:type="dxa" w:w="4700"/>
+          </w:tcPr>
+          <w:p>
+            <w:r>
+              <w:t>No confirmed top-scorers endpoint exists from Highlightly (Sprint 4, sprint-4/sports-hub-highlightly-backend) -- checked directly against the vendor's public API documentation (Matches, Events, Statistics, Lineups, Standings, Head-to-Head, Highlights, Leagues, Countries, Teams, Players, Odds, Bookmakers). There is no dedicated top-scorers/leading-scorers endpoint; Players/{id}/statistics is per-player, not a rankable list. Confirms the Top Scorers fast-follow exclusion (named in the sprint-4/sports-hub-highlightly-data-redesign report) stays excluded -- building it would face the same per-player fan-out problem as Decision Log #324.</w:t>
             </w:r>
           </w:p>
         </w:tc>
@@ -23626,29 +23718,29 @@
           </w:tcPr>
           <w:p>
             <w:r>
-              <w:t>Resolved (2026-10-03, sprint-4/highlightly-live-verification). Confirmed live against the real Highlightly account: GET /box-score/{matchId} returns per-player box scores for every player in one match in one call (45 players on a finished Serie B match, with matchRating and a keyed statistics object). The other candidates did not return box-score data: /players/{matchId} returns 200 with an empty array, /players/{id}/box-scores and /football/match-box-score/{matchId} return 404. The team-level-only statement above is superseded. Still open, separately: whether to build the box-score call, which needs costing against the free-tier budget (#323). Findings: services/api/src/modules/sports/highlightly-vs-sportmonks.md, Finding 1 and Finding 5.</w:t>
-            </w:r>
-          </w:p>
-        </w:tc>
-      </w:tr>
-      <w:tr>
-        <w:tc>
-          <w:tcPr>
-            <w:tcW w:type="dxa" w:w="500"/>
-          </w:tcPr>
-          <w:p>
-            <w:r>
-              <w:t>325</w:t>
-            </w:r>
-          </w:p>
-        </w:tc>
-        <w:tc>
-          <w:tcPr>
-            <w:tcW w:type="dxa" w:w="4700"/>
-          </w:tcPr>
-          <w:p>
-            <w:r>
-              <w:t>No standings “form” (recent-results) field exists from Highlightly (Sprint 4, sprint-4/sports-hub-highlightly-backend). GET /standings's own documented example standing row has no form field anywhere, and the nearest candidate (GET /last-five-games?teamId=) is per-team -- a full league table's form column would cost 20 extra calls per refresh. GET /sports/standings returns exactly what Highlightly returns, with no form field on any row, real or fabricated. The Figma Standing screen's already-shipped FORM column stays unwired to this endpoint's data until a genuinely cheap per-team form data source exists.</w:t>
+              <w:t>Resolved (confirmed absent from the vendor)</w:t>
+            </w:r>
+          </w:p>
+        </w:tc>
+      </w:tr>
+      <w:tr>
+        <w:tc>
+          <w:tcPr>
+            <w:tcW w:type="dxa" w:w="500"/>
+          </w:tcPr>
+          <w:p>
+            <w:r>
+              <w:t>327</w:t>
+            </w:r>
+          </w:p>
+        </w:tc>
+        <w:tc>
+          <w:tcPr>
+            <w:tcW w:type="dxa" w:w="4700"/>
+          </w:tcPr>
+          <w:p>
+            <w:r>
+              <w:t>GET /sports/matches/:id/momentum and GET /sports/matches/:id/events are genuine additions beyond Section 4.6's literal eight-endpoint list (Sprint 4, sprint-4/sports-hub-highlightly-backend), built to match the Match Momentum and Live Commentary sections the sprint-4/sports-hub-highlightly-data-redesign Figma pass designed. momentum is a pure server-side computation over the cached events document (no Highlightly momentum endpoint exists); events is the automated match-event feed (never editorial commentary), returned newest-first per that design's own Decision Log #316. Section 4.6's own API Contract Sketch should be updated to include both routes -- this entry does not do that edit itself, matching how Decision Log #23 (GET /auth/me) was left for whoever next edits Section 4 in the live document.</w:t>
             </w:r>
           </w:p>
         </w:tc>
@@ -23668,34 +23760,32 @@
           </w:tcPr>
           <w:p>
             <w:r>
-              <w:t>Open</w:t>
-            </w:r>
-          </w:p>
-          <w:p>
-            <w:r>
-              <w:t>CROSS-REFERENCE (schema/report-severity-escalation-admin-vetting, 2026-09-27): PR #316's SPORTS_DATA_PROVIDER_CAPABILITIES registry (services/api/src/modules/sports/sports-data-provider.constants.ts) already resolves the mechanism behind this same standings-FORM gap -- 'standingsForm' is a registered SportsDataField, marked unsupported for Highlightly ("documented standings row has no form field", matching this row's own finding) and supported for SportMonks; PublicStandingRow.form is emitted by sports.service.ts's toPublicStandingRow() only when providerSupports(activeProvider, 'standingsForm') is true AND the raw row actually carries form data -- the key is omitted (never null/[]) otherwise. This row (#325) is left OPEN, not resolved by this note -- the underlying product question (does Soccernity ever switch to a vendor that supplies FORM, or does the Standing UI ship without it) is unchanged; what's now true is that the codebase has a single, correct, provider-aware mechanism already in place to reflect whichever answer applies, rather than a hardcoded Highlightly-shaped assumption.</w:t>
-            </w:r>
-          </w:p>
-        </w:tc>
-      </w:tr>
-      <w:tr>
-        <w:tc>
-          <w:tcPr>
-            <w:tcW w:type="dxa" w:w="500"/>
-          </w:tcPr>
-          <w:p>
-            <w:r>
-              <w:t>326</w:t>
-            </w:r>
-          </w:p>
-        </w:tc>
-        <w:tc>
-          <w:tcPr>
-            <w:tcW w:type="dxa" w:w="4700"/>
-          </w:tcPr>
-          <w:p>
-            <w:r>
-              <w:t>No confirmed top-scorers endpoint exists from Highlightly (Sprint 4, sprint-4/sports-hub-highlightly-backend) -- checked directly against the vendor's public API documentation (Matches, Events, Statistics, Lineups, Standings, Head-to-Head, Highlights, Leagues, Countries, Teams, Players, Odds, Bookmakers). There is no dedicated top-scorers/leading-scorers endpoint; Players/{id}/statistics is per-player, not a rankable list. Confirms the Top Scorers fast-follow exclusion (named in the sprint-4/sports-hub-highlightly-data-redesign report) stays excluded -- building it would face the same per-player fan-out problem as Decision Log #324.</w:t>
+              <w:t>Resolved</w:t>
+            </w:r>
+            <w:r>
+              <w:t xml:space="preserve"> Forward-pointer (2026-10-03, docs/decision-log-stale-status-cleanup): Resolved. Section 4.6 now lists GET /sports/matches/:id/momentum and GET /sports/matches/:id/events alongside the original eight endpoints, annotated as additions beyond the literal list.</w:t>
+            </w:r>
+          </w:p>
+        </w:tc>
+      </w:tr>
+      <w:tr>
+        <w:tc>
+          <w:tcPr>
+            <w:tcW w:type="dxa" w:w="500"/>
+          </w:tcPr>
+          <w:p>
+            <w:r>
+              <w:t>328</w:t>
+            </w:r>
+          </w:p>
+        </w:tc>
+        <w:tc>
+          <w:tcPr>
+            <w:tcW w:type="dxa" w:w="4700"/>
+          </w:tcPr>
+          <w:p>
+            <w:r>
+              <w:t>The direct highlightly.net host's exact auth-header behaviour is not independently confirmed beyond what Highlightly's public docs state generally (Sprint 4, sprint-4/sports-hub-highlightly-backend): x-rapidapi-key is documented as the required header for “your Highlightly or RapidAPI API Key” alike, with x-rapidapi-host required only when actually calling through RapidAPI's own gateway. HighlightlyClient (services/api/src/sports-data/highlightly-client.service.ts) implements exactly this reading, but no real Highlightly account exists in this environment to trace a live call against. To be confirmed the moment a real account exists.</w:t>
             </w:r>
           </w:p>
         </w:tc>
@@ -23715,29 +23805,29 @@
           </w:tcPr>
           <w:p>
             <w:r>
-              <w:t>Resolved (confirmed absent from the vendor)</w:t>
-            </w:r>
-          </w:p>
-        </w:tc>
-      </w:tr>
-      <w:tr>
-        <w:tc>
-          <w:tcPr>
-            <w:tcW w:type="dxa" w:w="500"/>
-          </w:tcPr>
-          <w:p>
-            <w:r>
-              <w:t>327</w:t>
-            </w:r>
-          </w:p>
-        </w:tc>
-        <w:tc>
-          <w:tcPr>
-            <w:tcW w:type="dxa" w:w="4700"/>
-          </w:tcPr>
-          <w:p>
-            <w:r>
-              <w:t>GET /sports/matches/:id/momentum and GET /sports/matches/:id/events are genuine additions beyond Section 4.6's literal eight-endpoint list (Sprint 4, sprint-4/sports-hub-highlightly-backend), built to match the Match Momentum and Live Commentary sections the sprint-4/sports-hub-highlightly-data-redesign Figma pass designed. momentum is a pure server-side computation over the cached events document (no Highlightly momentum endpoint exists); events is the automated match-event feed (never editorial commentary), returned newest-first per that design's own Decision Log #316. Section 4.6's own API Contract Sketch should be updated to include both routes -- this entry does not do that edit itself, matching how Decision Log #23 (GET /auth/me) was left for whoever next edits Section 4 in the live document.</w:t>
+              <w:t>Resolved (2026-10-03, sprint-4/highlightly-live-verification). Confirmed live through the real HighlightlyClient: x-rapidapi-key alone to soccer.highlightly.net returns 200; no key returns 403 Missing mandatory HTTP Headers; sending x-rapidapi-host to the direct host also returns 200. The client behaviour (key always, host only when SPORTS_DATA_RAPIDAPI_HOST is set) is correct for the direct host. The RapidAPI gateway path is not tested.</w:t>
+            </w:r>
+          </w:p>
+        </w:tc>
+      </w:tr>
+      <w:tr>
+        <w:tc>
+          <w:tcPr>
+            <w:tcW w:type="dxa" w:w="500"/>
+          </w:tcPr>
+          <w:p>
+            <w:r>
+              <w:t>329</w:t>
+            </w:r>
+          </w:p>
+        </w:tc>
+        <w:tc>
+          <w:tcPr>
+            <w:tcW w:type="dxa" w:w="4700"/>
+          </w:tcPr>
+          <w:p>
+            <w:r>
+              <w:t>league (on GET /sports/fixtures and GET /sports/live-scores) and season (on GET /sports/standings) are additional, optional query params beyond Section 4.6's literal query-string list (Sprint 4, sprint-4/sports-hub-highlightly-backend) -- the same category of flagged addition as Blog's categoryId/categorySlug filters (Decision Log candidates in modules/blog/README.md). league filters MatchData by Highlightly's own leagueId; season is required by Highlightly's own /standings endpoint and defaults to whatever season is already cached for that league when omitted.</w:t>
             </w:r>
           </w:p>
         </w:tc>
@@ -23757,94 +23847,10 @@
           </w:tcPr>
           <w:p>
             <w:r>
-              <w:t>Resolved</w:t>
-            </w:r>
-            <w:r>
-              <w:t xml:space="preserve"> Forward-pointer (2026-10-03, docs/decision-log-stale-status-cleanup): Resolved. Section 4.6 now lists GET /sports/matches/:id/momentum and GET /sports/matches/:id/events alongside the original eight endpoints, annotated as additions beyond the literal list.</w:t>
-            </w:r>
-          </w:p>
-        </w:tc>
-      </w:tr>
-      <w:tr>
-        <w:tc>
-          <w:tcPr>
-            <w:tcW w:type="dxa" w:w="500"/>
-          </w:tcPr>
-          <w:p>
-            <w:r>
-              <w:t>328</w:t>
-            </w:r>
-          </w:p>
-        </w:tc>
-        <w:tc>
-          <w:tcPr>
-            <w:tcW w:type="dxa" w:w="4700"/>
-          </w:tcPr>
-          <w:p>
-            <w:r>
-              <w:t>The direct highlightly.net host's exact auth-header behaviour is not independently confirmed beyond what Highlightly's public docs state generally (Sprint 4, sprint-4/sports-hub-highlightly-backend): x-rapidapi-key is documented as the required header for “your Highlightly or RapidAPI API Key” alike, with x-rapidapi-host required only when actually calling through RapidAPI's own gateway. HighlightlyClient (services/api/src/sports-data/highlightly-client.service.ts) implements exactly this reading, but no real Highlightly account exists in this environment to trace a live call against. To be confirmed the moment a real account exists.</w:t>
-            </w:r>
-          </w:p>
-        </w:tc>
-        <w:tc>
-          <w:tcPr>
-            <w:tcW w:type="dxa" w:w="1850"/>
-          </w:tcPr>
-          <w:p>
-            <w:r>
-              <w:t>sprint-4/sports-hub-highlightly-backend report / services/api/src/modules/sports/README.md</w:t>
-            </w:r>
-          </w:p>
-        </w:tc>
-        <w:tc>
-          <w:tcPr>
-            <w:tcW w:type="dxa" w:w="2300"/>
-          </w:tcPr>
-          <w:p>
-            <w:r>
-              <w:t>Resolved (2026-10-03, sprint-4/highlightly-live-verification). Confirmed live through the real HighlightlyClient: x-rapidapi-key alone to soccer.highlightly.net returns 200; no key returns 403 Missing mandatory HTTP Headers; sending x-rapidapi-host to the direct host also returns 200. The client behaviour (key always, host only when SPORTS_DATA_RAPIDAPI_HOST is set) is correct for the direct host. The RapidAPI gateway path is not tested.</w:t>
-            </w:r>
-          </w:p>
-        </w:tc>
-      </w:tr>
-      <w:tr>
-        <w:tc>
-          <w:tcPr>
-            <w:tcW w:type="dxa" w:w="500"/>
-          </w:tcPr>
-          <w:p>
-            <w:r>
-              <w:t>329</w:t>
-            </w:r>
-          </w:p>
-        </w:tc>
-        <w:tc>
-          <w:tcPr>
-            <w:tcW w:type="dxa" w:w="4700"/>
-          </w:tcPr>
-          <w:p>
-            <w:r>
-              <w:t>league (on GET /sports/fixtures and GET /sports/live-scores) and season (on GET /sports/standings) are additional, optional query params beyond Section 4.6's literal query-string list (Sprint 4, sprint-4/sports-hub-highlightly-backend) -- the same category of flagged addition as Blog's categoryId/categorySlug filters (Decision Log candidates in modules/blog/README.md). league filters MatchData by Highlightly's own leagueId; season is required by Highlightly's own /standings endpoint and defaults to whatever season is already cached for that league when omitted.</w:t>
-            </w:r>
-          </w:p>
-        </w:tc>
-        <w:tc>
-          <w:tcPr>
-            <w:tcW w:type="dxa" w:w="1850"/>
-          </w:tcPr>
-          <w:p>
-            <w:r>
-              <w:t>sprint-4/sports-hub-highlightly-backend report / services/api/src/modules/sports/README.md</w:t>
-            </w:r>
-          </w:p>
-        </w:tc>
-        <w:tc>
-          <w:tcPr>
-            <w:tcW w:type="dxa" w:w="2300"/>
-          </w:tcPr>
-          <w:p>
-            <w:r>
-              <w:t>Open</w:t>
+              <w:t xml:space="preserve">Resolved. </w:t>
+            </w:r>
+            <w:r>
+              <w:t>Forward-pointer (docs/decision-log-323-329-bookkeeping): Section 4.6 of the API Contract Sketch now lists league (on GET /sports/live-scores and GET /sports/fixtures) and season (on GET /sports/standings) as query params, matching the shipped implementation.</w:t>
             </w:r>
           </w:p>
         </w:tc>

</xml_diff>

<commit_message>
docs(decision-log): correct statuses for #190, #224, #313 and note #336
#190 and #224 and #313 had stale leading "Open" words despite resolving
work already merged; #224 and #313 get forward-pointers citing PR #354 and
PR #361. #336 stays Open, with a dated note narrowing item 3 (xG now served
from Highlightly).

Co-Authored-By: Claude Sonnet 5 <noreply@anthropic.com>
</commit_message>
<xml_diff>
--- a/docs/Soccernity_MVP_Build_Plan_v1.7.docx
+++ b/docs/Soccernity_MVP_Build_Plan_v1.7.docx
@@ -17694,7 +17694,7 @@
           </w:tcPr>
           <w:p>
             <w:r>
-              <w:t>Open -- deliberately deferred to keep this PR's verification scope to schema + auth-isolation + CRUD. A real follow-up candidate: admin/moderator accounts are a smaller, higher-value target set and may warrant a lower max-attempts limit than the shared fan-facing bucket.</w:t>
+              <w:t>Resolved -- deliberately deferred to keep this PR's verification scope to schema + auth-isolation + CRUD. A real follow-up candidate: admin/moderator accounts are a smaller, higher-value target set and may warrant a lower max-attempts limit than the shared fan-facing bucket.</w:t>
             </w:r>
             <w:r>
               <w:t xml:space="preserve"> RESOLVED (sprint-2/admin-login-rate-limit): POST /admin/auth/login now uses a per-handler @AuthRateLimit({ limit: 5, windowMs: 15 min }) override, independent of the User-facing /auth/login bucket. Covered by test/admin-login-rate-limit.e2e-spec.ts.</w:t>
@@ -19225,7 +19225,12 @@
           </w:tcPr>
           <w:p>
             <w:r>
-              <w:t>Open -- flagged, not fixed (apps/web-only PR). Same class of gap as Decision Log #153 (feed post viewer state) and #154 (GET /clubs `joined`): the list endpoint omits a per-calling-user relationship flag that a control on the screen needs. ClubMemberRow's Follow button therefore always renders 'Follow' on first paint regardless of whether the caller already follows that member, and only self-corrects for follows/unfollows done in the current session. Safe in practice -- POST/DELETE /users/:id/follow are idempotent (users.service.ts), so a redundant follow is a harmless 200, and the button reflects the endpoint's own returned state after any click. The fix, when backend work resumes, is the same pattern #153 used: add a caller-scoped `isFollowing` boolean to each ClubMember in the GET /clubs/:id/members payload (a batched Follow-existence check over the page's member ids, mirroring FeedService.attachViewerState). Also parked: the Figma 'View all members -&gt;' affordance has no dedicated full-roster screen -- rendered as an in-place 'Load more members' for now; a real roster route + screen is a later design + code task if the founder wants one. No club-post composer (no club-scoped post-creation flow designed; CreatePostDto accepts clubPageId but nothing in apps/web sends it).</w:t>
+              <w:t>Resolved -- flagged, not fixed (apps/web-only PR). Same class of gap as Decision Log #153 (feed post viewer state) and #154 (GET /clubs `joined`): the list endpoint omits a per-calling-user relationship flag that a control on the screen needs. ClubMemberRow's Follow button therefore always renders 'Follow' on first paint regardless of whether the caller already follows that member, and only self-corrects for follows/unfollows done in the current session. Safe in practice -- POST/DELETE /users/:id/follow are idempotent (users.service.ts), so a redundant follow is a harmless 200, and the button reflects the endpoint's own returned state after any click. The fix, when backend work resumes, is the same pattern #153 used: add a caller-scoped `isFollowing` boolean to each ClubMember in the GET /clubs/:id/members payload (a batched Follow-existence check over the page's member ids, mirroring FeedService.attachViewerState). Also parked: the Figma 'View all members -&gt;' affordance has no dedicated full-roster screen -- rendered as an in-place 'Load more members' for now; a real roster route + screen is a later design + code task if the founder wants one. No club-post composer (no club-scoped post-creation flow designed; CreatePostDto accepts clubPageId but nothing in apps/web sends it).</w:t>
+            </w:r>
+          </w:p>
+          <w:p>
+            <w:r>
+              <w:t>Forward-pointer (sprint-2/club-members-is-following, PR #354, 2026-10-03): confirmed merged and live. GET /clubs/:id/members now returns a caller-scoped isFollowing boolean per roster entry (one batched Follow lookup over the page, never looked up for the caller's own entry), and ClubMemberRow seeds its Follow/Following state from it, so the button is correct on first paint.</w:t>
             </w:r>
           </w:p>
         </w:tc>
@@ -23127,444 +23132,670 @@
           <w:p>
             <w:r/>
             <w:r>
+              <w:t>Resolved</w:t>
+            </w:r>
+          </w:p>
+          <w:p>
+            <w:r>
+              <w:t>Forward-pointer (sprint-4/box-score-rating-xg, PR #361, 2026-10-03): Highlightly's live box score carries a real per-player matchRating. playerRatings is marked supported in the sports capability registry, and GET /sports/matches/:id/box-score serves it to the Match Centre Statistics tab.</w:t>
+            </w:r>
+          </w:p>
+        </w:tc>
+      </w:tr>
+      <w:tr>
+        <w:tc>
+          <w:tcPr>
+            <w:tcW w:type="dxa" w:w="500"/>
+          </w:tcPr>
+          <w:p>
+            <w:r/>
+            <w:r>
+              <w:t>314</w:t>
+            </w:r>
+          </w:p>
+        </w:tc>
+        <w:tc>
+          <w:tcPr>
+            <w:tcW w:type="dxa" w:w="4700"/>
+          </w:tcPr>
+          <w:p>
+            <w:r/>
+            <w:r>
+              <w:t>Legacy score-header crest artwork (XMLID_189_) renders outside its own reported node bounds and visually overlaps the team-name text on every desktop match-centre frame — pre-existing on all 8 legacy frames, now inherited by the 2 new frames (Match Momentum, Live Commentary) via the cloned score header. Cosmetic, file-wide; needs a figma-design-system fix.</w:t>
+            </w:r>
+          </w:p>
+        </w:tc>
+        <w:tc>
+          <w:tcPr>
+            <w:tcW w:type="dxa" w:w="1850"/>
+          </w:tcPr>
+          <w:p>
+            <w:r/>
+            <w:r>
+              <w:t>docs/sprint-4-sports-hub-highlightly-data-redesign-report.md (sprint-4/sports-hub-highlightly-data-redesign, figma-screen-builder, 2026-09-16), §5</w:t>
+            </w:r>
+          </w:p>
+        </w:tc>
+        <w:tc>
+          <w:tcPr>
+            <w:tcW w:type="dxa" w:w="2300"/>
+          </w:tcPr>
+          <w:p>
+            <w:r/>
+            <w:r>
+              <w:t>Resolved</w:t>
+            </w:r>
+            <w:r>
+              <w:t xml:space="preserve"> by figma/decision-log-cleanup-retouches: root cause was the crest group being non-uniformly stretched (same 132 vectors, 119 wide, height 158-273 by frame) so it ran over the team-name text at y=395. Liverpool crest group (XMLID_189_) resized to 119x158 at (337,196) on all 10 frames (geometry verified within 1px against Match Details, the undistorted reference); the identical distortion on the Chelsea crest (Group 118 inner group) was found and fixed the same way (139x139 at (950,206)) though not named in the entry. Frames 756:6433 Chelsea side was already correct.</w:t>
+            </w:r>
+          </w:p>
+        </w:tc>
+      </w:tr>
+      <w:tr>
+        <w:tc>
+          <w:tcPr>
+            <w:tcW w:type="dxa" w:w="500"/>
+          </w:tcPr>
+          <w:p>
+            <w:r/>
+            <w:r>
+              <w:t>315</w:t>
+            </w:r>
+          </w:p>
+        </w:tc>
+        <w:tc>
+          <w:tcPr>
+            <w:tcW w:type="dxa" w:w="4700"/>
+          </w:tcPr>
+          <w:p>
+            <w:r/>
+            <w:r>
+              <w:t>Correction to Decision Log #149: the “off-palette yellow/amber for draws and mid-table” that entry names on the desktop H2H/Standing screens is club-crest trademark artwork (traced directly — 399 #dba111 paints inside the Liverpool/Chelsea crest vectors on H2H alone), not a UI colour choice — there was no off-palette amber in the desktop UI itself. The real UI-level off-palette values on those two screens were the form-guide chips' #d3f502 (draw) and #cfcfcf (no-data) fills, both now rebound (112 chips total) to the same palette-compliant W/D/L scheme #149 already made canonical.</w:t>
+            </w:r>
+          </w:p>
+        </w:tc>
+        <w:tc>
+          <w:tcPr>
+            <w:tcW w:type="dxa" w:w="1850"/>
+          </w:tcPr>
+          <w:p>
+            <w:r/>
+            <w:r>
+              <w:t>docs/sprint-4-sports-hub-highlightly-data-redesign-report.md (sprint-4/sports-hub-highlightly-data-redesign, figma-screen-builder, 2026-09-16), §4.2</w:t>
+            </w:r>
+          </w:p>
+        </w:tc>
+        <w:tc>
+          <w:tcPr>
+            <w:tcW w:type="dxa" w:w="2300"/>
+          </w:tcPr>
+          <w:p>
+            <w:r/>
+            <w:r>
+              <w:t>Resolved — see the forward-pointer appended to Decision Log #149's own Status.</w:t>
+            </w:r>
+          </w:p>
+        </w:tc>
+      </w:tr>
+      <w:tr>
+        <w:tc>
+          <w:tcPr>
+            <w:tcW w:type="dxa" w:w="500"/>
+          </w:tcPr>
+          <w:p>
+            <w:r/>
+            <w:r>
+              <w:t>316</w:t>
+            </w:r>
+          </w:p>
+        </w:tc>
+        <w:tc>
+          <w:tcPr>
+            <w:tcW w:type="dxa" w:w="4700"/>
+          </w:tcPr>
+          <w:p>
+            <w:r/>
+            <w:r>
+              <w:t>Live Commentary (Match sub-tab) orders its event feed newest-first, matching the live-feed convention the feature name implies, rather than chronological ascending order.</w:t>
+            </w:r>
+          </w:p>
+        </w:tc>
+        <w:tc>
+          <w:tcPr>
+            <w:tcW w:type="dxa" w:w="1850"/>
+          </w:tcPr>
+          <w:p>
+            <w:r/>
+            <w:r>
+              <w:t>docs/sprint-4-sports-hub-highlightly-data-redesign-report.md (sprint-4/sports-hub-highlightly-data-redesign, figma-screen-builder, 2026-09-16), §5</w:t>
+            </w:r>
+          </w:p>
+        </w:tc>
+        <w:tc>
+          <w:tcPr>
+            <w:tcW w:type="dxa" w:w="2300"/>
+          </w:tcPr>
+          <w:p>
+            <w:r/>
+            <w:r>
+              <w:t>Resolved (design) — a deliberate choice, not an oversight; open to revisiting once real usage data exists.</w:t>
+            </w:r>
+          </w:p>
+        </w:tc>
+      </w:tr>
+      <w:tr>
+        <w:tc>
+          <w:tcPr>
+            <w:tcW w:type="dxa" w:w="500"/>
+          </w:tcPr>
+          <w:p>
+            <w:r/>
+            <w:r>
+              <w:t>317</w:t>
+            </w:r>
+          </w:p>
+        </w:tc>
+        <w:tc>
+          <w:tcPr>
+            <w:tcW w:type="dxa" w:w="4700"/>
+          </w:tcPr>
+          <w:p>
+            <w:r/>
+            <w:r>
+              <w:t>Mobile Match sub-tab row type/spacing (12px→11px, gap 20→9, padding 20→16) was reduced to fit five tabs (Match Summary | Statistics | Lineups | Momentum | Commentary) inside the 390px mobile frame width, rather than allowing horizontal-scroll clipping.</w:t>
+            </w:r>
+          </w:p>
+        </w:tc>
+        <w:tc>
+          <w:tcPr>
+            <w:tcW w:type="dxa" w:w="1850"/>
+          </w:tcPr>
+          <w:p>
+            <w:r/>
+            <w:r>
+              <w:t>docs/sprint-4-sports-hub-highlightly-data-redesign-report.md (sprint-4/sports-hub-highlightly-data-redesign, figma-screen-builder, 2026-09-16), §5</w:t>
+            </w:r>
+          </w:p>
+        </w:tc>
+        <w:tc>
+          <w:tcPr>
+            <w:tcW w:type="dxa" w:w="2300"/>
+          </w:tcPr>
+          <w:p>
+            <w:r/>
+            <w:r>
+              <w:t>Resolved (design) — horizontal-scroll clipping was rejected because the active tab could fall out of view.</w:t>
+            </w:r>
+          </w:p>
+        </w:tc>
+      </w:tr>
+      <w:tr>
+        <w:tc>
+          <w:tcPr>
+            <w:tcW w:type="dxa" w:w="500"/>
+          </w:tcPr>
+          <w:p>
+            <w:r/>
+            <w:r>
+              <w:t>318</w:t>
+            </w:r>
+          </w:p>
+        </w:tc>
+        <w:tc>
+          <w:tcPr>
+            <w:tcW w:type="dxa" w:w="4700"/>
+          </w:tcPr>
+          <w:p>
+            <w:r/>
+            <w:r>
+              <w:t>The new Match Momentum and Live Commentary sections are placed as Level-2 sub-tabs under Match (alongside Match Summary | Statistics | Lineups), not as Level-1 siblings of H2H / Standings / Video — both are in-match content. This is the information architecture figma-to-code must inherit when this is eventually converted.</w:t>
+            </w:r>
+          </w:p>
+        </w:tc>
+        <w:tc>
+          <w:tcPr>
+            <w:tcW w:type="dxa" w:w="1850"/>
+          </w:tcPr>
+          <w:p>
+            <w:r/>
+            <w:r>
+              <w:t>docs/sprint-4-sports-hub-highlightly-data-redesign-report.md (sprint-4/sports-hub-highlightly-data-redesign, figma-screen-builder, 2026-09-16), §2.5</w:t>
+            </w:r>
+          </w:p>
+        </w:tc>
+        <w:tc>
+          <w:tcPr>
+            <w:tcW w:type="dxa" w:w="2300"/>
+          </w:tcPr>
+          <w:p>
+            <w:r/>
+            <w:r>
+              <w:t>Resolved (design)</w:t>
+            </w:r>
+          </w:p>
+        </w:tc>
+      </w:tr>
+      <w:tr>
+        <w:tc>
+          <w:tcPr>
+            <w:tcW w:type="dxa" w:w="500"/>
+          </w:tcPr>
+          <w:p>
+            <w:r/>
+            <w:r>
+              <w:t>319</w:t>
+            </w:r>
+          </w:p>
+        </w:tc>
+        <w:tc>
+          <w:tcPr>
+            <w:tcW w:type="dxa" w:w="4700"/>
+          </w:tcPr>
+          <w:p>
+            <w:r/>
+            <w:r>
+              <w:t>Video's geo-restriction treatment uses a navy pill + semantic/alert dot, not a red badge with white text — white-on-semantic/alert fails AA for a small badge label at that size. Restricted thumbnails use the bound color/icon/inactive fill rather than a translucent overlay, avoiding the documented “bound paint takes its alpha from the variable” gotcha.</w:t>
+            </w:r>
+          </w:p>
+        </w:tc>
+        <w:tc>
+          <w:tcPr>
+            <w:tcW w:type="dxa" w:w="1850"/>
+          </w:tcPr>
+          <w:p>
+            <w:r/>
+            <w:r>
+              <w:t>docs/sprint-4-sports-hub-highlightly-data-redesign-report.md (sprint-4/sports-hub-highlightly-data-redesign, figma-screen-builder, 2026-09-16), §2.3 / §2.1</w:t>
+            </w:r>
+          </w:p>
+        </w:tc>
+        <w:tc>
+          <w:tcPr>
+            <w:tcW w:type="dxa" w:w="2300"/>
+          </w:tcPr>
+          <w:p>
+            <w:r/>
+            <w:r>
+              <w:t>Resolved (design)</w:t>
+            </w:r>
+          </w:p>
+        </w:tc>
+      </w:tr>
+      <w:tr>
+        <w:tc>
+          <w:tcPr>
+            <w:tcW w:type="dxa" w:w="500"/>
+          </w:tcPr>
+          <w:p>
+            <w:r/>
+            <w:r>
+              <w:t>320</w:t>
+            </w:r>
+          </w:p>
+        </w:tc>
+        <w:tc>
+          <w:tcPr>
+            <w:tcW w:type="dxa" w:w="4700"/>
+          </w:tcPr>
+          <w:p>
+            <w:r/>
+            <w:r>
+              <w:t>On Standing, brand/green / brand/navy / semantic/alert now carry two different meanings in two separate columns on the same row — promotion/relegation on the rank chip, and W/D/L form on the form-guide chips. Flagged as an accepted, unavoidable trade-off under the two-colour palette rule (non-negotiable #3): the columns sit far apart and the glyphs differ (numbers vs. letters), so it reads as two distinct systems rather than one confused one.</w:t>
+            </w:r>
+          </w:p>
+        </w:tc>
+        <w:tc>
+          <w:tcPr>
+            <w:tcW w:type="dxa" w:w="1850"/>
+          </w:tcPr>
+          <w:p>
+            <w:r/>
+            <w:r>
+              <w:t>docs/sprint-4-sports-hub-highlightly-data-redesign-report.md (sprint-4/sports-hub-highlightly-data-redesign, figma-screen-builder, 2026-09-16), §2.4</w:t>
+            </w:r>
+          </w:p>
+        </w:tc>
+        <w:tc>
+          <w:tcPr>
+            <w:tcW w:type="dxa" w:w="2300"/>
+          </w:tcPr>
+          <w:p>
+            <w:r/>
+            <w:r>
+              <w:t>Resolved (design)</w:t>
+            </w:r>
+          </w:p>
+        </w:tc>
+      </w:tr>
+      <w:tr>
+        <w:tc>
+          <w:tcPr>
+            <w:tcW w:type="dxa" w:w="500"/>
+          </w:tcPr>
+          <w:p>
+            <w:r/>
+            <w:r>
+              <w:t>321</w:t>
+            </w:r>
+          </w:p>
+        </w:tc>
+        <w:tc>
+          <w:tcPr>
+            <w:tcW w:type="dxa" w:w="4700"/>
+          </w:tcPr>
+          <w:p>
+            <w:r>
+              <w:t>All match data across the redesigned Sports Hub screens (Match Momentum, Live Commentary, player box scores, Lineups substitutions, H2H record, Video clips) remains illustrative dummy content (one consistent Liverpool 1–3 Chelsea fixture, per §6 of the report). Highlightly is the resolved vendor (Decision Log #6). At the time of this entry services/api had no sports/fixtures module, no Highlightly API client, and MatchData had zero live reads, so figma-to-code was told not to wire any of these screens to real data until that backend integration existed; the backend integration has since been built (sprint-4/sports-hub-highlightly-backend, #323-#329) and apps/web wired to it (sprint-4/sports-hub-frontend-wiring, see #6).</w:t>
+            </w:r>
+          </w:p>
+        </w:tc>
+        <w:tc>
+          <w:tcPr>
+            <w:tcW w:type="dxa" w:w="1850"/>
+          </w:tcPr>
+          <w:p>
+            <w:r/>
+            <w:r>
+              <w:t>docs/sprint-4-sports-hub-highlightly-data-redesign-report.md (sprint-4/sports-hub-highlightly-data-redesign, figma-screen-builder, 2026-09-16), §6</w:t>
+            </w:r>
+          </w:p>
+        </w:tc>
+        <w:tc>
+          <w:tcPr>
+            <w:tcW w:type="dxa" w:w="2300"/>
+          </w:tcPr>
+          <w:p>
+            <w:r>
+              <w:t>Resolved — the blocker (a not-yet-started backend Highlightly integration) is cleared: backend built (#323-#329) and apps/web wired (see #6). Caveat carried from #6: no real Highlightly credentials exist yet, so no live vendor data has flowed through it (#323, #328).</w:t>
+            </w:r>
+          </w:p>
+        </w:tc>
+      </w:tr>
+      <w:tr>
+        <w:tc>
+          <w:tcPr>
+            <w:tcW w:type="dxa" w:w="500"/>
+          </w:tcPr>
+          <w:p>
+            <w:r/>
+            <w:r>
+              <w:t>322</w:t>
+            </w:r>
+          </w:p>
+        </w:tc>
+        <w:tc>
+          <w:tcPr>
+            <w:tcW w:type="dxa" w:w="4700"/>
+          </w:tcPr>
+          <w:p>
+            <w:r/>
+            <w:r>
+              <w:t>No prototype (NAVIGATE) reactions were added to the new sub-tabs or the two new frames, consistent with the rest of the match-centre family, which has never carried NAVIGATE wiring — routing between these screens stays a code-side concern for whoever eventually runs figma-to-code on them.</w:t>
+            </w:r>
+          </w:p>
+        </w:tc>
+        <w:tc>
+          <w:tcPr>
+            <w:tcW w:type="dxa" w:w="1850"/>
+          </w:tcPr>
+          <w:p>
+            <w:r/>
+            <w:r>
+              <w:t>docs/sprint-4-sports-hub-highlightly-data-redesign-report.md (sprint-4/sports-hub-highlightly-data-redesign, figma-screen-builder, 2026-09-16), §5</w:t>
+            </w:r>
+          </w:p>
+        </w:tc>
+        <w:tc>
+          <w:tcPr>
+            <w:tcW w:type="dxa" w:w="2300"/>
+          </w:tcPr>
+          <w:p>
+            <w:r/>
+            <w:r>
+              <w:t>Resolved (design)</w:t>
+            </w:r>
+          </w:p>
+        </w:tc>
+      </w:tr>
+      <w:tr>
+        <w:tc>
+          <w:tcPr>
+            <w:tcW w:type="dxa" w:w="500"/>
+          </w:tcPr>
+          <w:p>
+            <w:r>
+              <w:t>323</w:t>
+            </w:r>
+          </w:p>
+        </w:tc>
+        <w:tc>
+          <w:tcPr>
+            <w:tcW w:type="dxa" w:w="4700"/>
+          </w:tcPr>
+          <w:p>
+            <w:r>
+              <w:t>The real Highlightly PAID-tier request budget is unknown (Sprint 4, sprint-4/sports-hub-highlightly-backend). HIGHLIGHTLY_DAILY_REQUEST_BUDGET defaults to the confirmed free-tier 100 requests/day; production needs a founder decision on which Highlightly plan to buy, then this env override set to match. Not assumed unlimited.</w:t>
+            </w:r>
+          </w:p>
+        </w:tc>
+        <w:tc>
+          <w:tcPr>
+            <w:tcW w:type="dxa" w:w="1850"/>
+          </w:tcPr>
+          <w:p>
+            <w:r>
+              <w:t>sprint-4/sports-hub-highlightly-backend report / services/api/src/modules/sports/README.md</w:t>
+            </w:r>
+          </w:p>
+        </w:tc>
+        <w:tc>
+          <w:tcPr>
+            <w:tcW w:type="dxa" w:w="2300"/>
+          </w:tcPr>
+          <w:p>
+            <w:r>
+              <w:t xml:space="preserve">Resolved (founder decision, settled for now). </w:t>
+            </w:r>
+            <w:r>
+              <w:t>Forward-pointer (docs/decision-log-323-329-bookkeeping): the founder has confirmed staying on Highlightly's free tier (100 requests/day) for now, revisiting only once real post-launch usage data shows it is insufficient. HIGHLIGHTLY_DAILY_REQUEST_BUDGET stays at its 100/day default in code, which already matches this decision. The original open question (paid-tier budget) is no longer blocking; the upgrade trigger is post-launch usage data.</w:t>
+            </w:r>
+          </w:p>
+        </w:tc>
+      </w:tr>
+      <w:tr>
+        <w:tc>
+          <w:tcPr>
+            <w:tcW w:type="dxa" w:w="500"/>
+          </w:tcPr>
+          <w:p>
+            <w:r>
+              <w:t>324</w:t>
+            </w:r>
+          </w:p>
+        </w:tc>
+        <w:tc>
+          <w:tcPr>
+            <w:tcW w:type="dxa" w:w="4700"/>
+          </w:tcPr>
+          <w:p>
+            <w:r>
+              <w:t>No batched per-match player box-score data exists from Highlightly (Sprint 4, sprint-4/sports-hub-highlightly-backend). GET /statistics/{matchId} (confirmed against Highlightly's own documented example response) is TEAM-LEVEL ONLY. Per-player stats exist only via GET /players/{id}/statistics, called one player at a time -- reconstructing an 11-player box score for one match would need 20+ extra Highlightly calls, not viable under the confirmed 100/day free tier. The Figma redesign (sprint-4/sports-hub-highlightly-data-redesign) assumed player box scores were available; they are not, from this vendor, without an unsustainable per-player API-call fan-out. GET /sports/matches/:id/stats returns team-level statistics only -- no synthetic/fabricated player rows are ever generated.</w:t>
+            </w:r>
+          </w:p>
+        </w:tc>
+        <w:tc>
+          <w:tcPr>
+            <w:tcW w:type="dxa" w:w="1850"/>
+          </w:tcPr>
+          <w:p>
+            <w:r>
+              <w:t>sprint-4/sports-hub-highlightly-backend report / services/api/src/modules/sports/README.md</w:t>
+            </w:r>
+          </w:p>
+        </w:tc>
+        <w:tc>
+          <w:tcPr>
+            <w:tcW w:type="dxa" w:w="2300"/>
+          </w:tcPr>
+          <w:p>
+            <w:r>
+              <w:t>Resolved (2026-10-03, sprint-4/highlightly-live-verification). Confirmed live against the real Highlightly account: GET /box-score/{matchId} returns per-player box scores for every player in one match in one call (45 players on a finished Serie B match, with matchRating and a keyed statistics object). The other candidates did not return box-score data: /players/{matchId} returns 200 with an empty array, /players/{id}/box-scores and /football/match-box-score/{matchId} return 404. The team-level-only statement above is superseded. Still open, separately: whether to build the box-score call, which needs costing against the free-tier budget (#323). Findings: services/api/src/modules/sports/highlightly-vs-sportmonks.md, Finding 1 and Finding 5.</w:t>
+            </w:r>
+          </w:p>
+        </w:tc>
+      </w:tr>
+      <w:tr>
+        <w:tc>
+          <w:tcPr>
+            <w:tcW w:type="dxa" w:w="500"/>
+          </w:tcPr>
+          <w:p>
+            <w:r>
+              <w:t>325</w:t>
+            </w:r>
+          </w:p>
+        </w:tc>
+        <w:tc>
+          <w:tcPr>
+            <w:tcW w:type="dxa" w:w="4700"/>
+          </w:tcPr>
+          <w:p>
+            <w:r>
+              <w:t>No standings “form” (recent-results) field exists from Highlightly (Sprint 4, sprint-4/sports-hub-highlightly-backend). GET /standings's own documented example standing row has no form field anywhere, and the nearest candidate (GET /last-five-games?teamId=) is per-team -- a full league table's form column would cost 20 extra calls per refresh. GET /sports/standings returns exactly what Highlightly returns, with no form field on any row, real or fabricated. The Figma Standing screen's already-shipped FORM column stays unwired to this endpoint's data until a genuinely cheap per-team form data source exists.</w:t>
+            </w:r>
+          </w:p>
+        </w:tc>
+        <w:tc>
+          <w:tcPr>
+            <w:tcW w:type="dxa" w:w="1850"/>
+          </w:tcPr>
+          <w:p>
+            <w:r>
+              <w:t>sprint-4/sports-hub-highlightly-backend report / services/api/src/modules/sports/README.md</w:t>
+            </w:r>
+          </w:p>
+        </w:tc>
+        <w:tc>
+          <w:tcPr>
+            <w:tcW w:type="dxa" w:w="2300"/>
+          </w:tcPr>
+          <w:p>
+            <w:r>
               <w:t>Open</w:t>
             </w:r>
           </w:p>
-        </w:tc>
-      </w:tr>
-      <w:tr>
-        <w:tc>
-          <w:tcPr>
-            <w:tcW w:type="dxa" w:w="500"/>
-          </w:tcPr>
-          <w:p>
-            <w:r/>
-            <w:r>
-              <w:t>314</w:t>
-            </w:r>
-          </w:p>
-        </w:tc>
-        <w:tc>
-          <w:tcPr>
-            <w:tcW w:type="dxa" w:w="4700"/>
-          </w:tcPr>
-          <w:p>
-            <w:r/>
-            <w:r>
-              <w:t>Legacy score-header crest artwork (XMLID_189_) renders outside its own reported node bounds and visually overlaps the team-name text on every desktop match-centre frame — pre-existing on all 8 legacy frames, now inherited by the 2 new frames (Match Momentum, Live Commentary) via the cloned score header. Cosmetic, file-wide; needs a figma-design-system fix.</w:t>
-            </w:r>
-          </w:p>
-        </w:tc>
-        <w:tc>
-          <w:tcPr>
-            <w:tcW w:type="dxa" w:w="1850"/>
-          </w:tcPr>
-          <w:p>
-            <w:r/>
-            <w:r>
-              <w:t>docs/sprint-4-sports-hub-highlightly-data-redesign-report.md (sprint-4/sports-hub-highlightly-data-redesign, figma-screen-builder, 2026-09-16), §5</w:t>
-            </w:r>
-          </w:p>
-        </w:tc>
-        <w:tc>
-          <w:tcPr>
-            <w:tcW w:type="dxa" w:w="2300"/>
-          </w:tcPr>
-          <w:p>
-            <w:r/>
+          <w:p>
+            <w:r>
+              <w:t>CROSS-REFERENCE (schema/report-severity-escalation-admin-vetting, 2026-09-27): PR #316's SPORTS_DATA_PROVIDER_CAPABILITIES registry (services/api/src/modules/sports/sports-data-provider.constants.ts) already resolves the mechanism behind this same standings-FORM gap -- 'standingsForm' is a registered SportsDataField, marked unsupported for Highlightly ("documented standings row has no form field", matching this row's own finding) and supported for SportMonks; PublicStandingRow.form is emitted by sports.service.ts's toPublicStandingRow() only when providerSupports(activeProvider, 'standingsForm') is true AND the raw row actually carries form data -- the key is omitted (never null/[]) otherwise. This row (#325) is left OPEN, not resolved by this note -- the underlying product question (does Soccernity ever switch to a vendor that supplies FORM, or does the Standing UI ship without it) is unchanged; what's now true is that the codebase has a single, correct, provider-aware mechanism already in place to reflect whichever answer applies, rather than a hardcoded Highlightly-shaped assumption.</w:t>
+            </w:r>
+          </w:p>
+        </w:tc>
+      </w:tr>
+      <w:tr>
+        <w:tc>
+          <w:tcPr>
+            <w:tcW w:type="dxa" w:w="500"/>
+          </w:tcPr>
+          <w:p>
+            <w:r>
+              <w:t>326</w:t>
+            </w:r>
+          </w:p>
+        </w:tc>
+        <w:tc>
+          <w:tcPr>
+            <w:tcW w:type="dxa" w:w="4700"/>
+          </w:tcPr>
+          <w:p>
+            <w:r>
+              <w:t>No confirmed top-scorers endpoint exists from Highlightly (Sprint 4, sprint-4/sports-hub-highlightly-backend) -- checked directly against the vendor's public API documentation (Matches, Events, Statistics, Lineups, Standings, Head-to-Head, Highlights, Leagues, Countries, Teams, Players, Odds, Bookmakers). There is no dedicated top-scorers/leading-scorers endpoint; Players/{id}/statistics is per-player, not a rankable list. Confirms the Top Scorers fast-follow exclusion (named in the sprint-4/sports-hub-highlightly-data-redesign report) stays excluded -- building it would face the same per-player fan-out problem as Decision Log #324.</w:t>
+            </w:r>
+          </w:p>
+        </w:tc>
+        <w:tc>
+          <w:tcPr>
+            <w:tcW w:type="dxa" w:w="1850"/>
+          </w:tcPr>
+          <w:p>
+            <w:r>
+              <w:t>sprint-4/sports-hub-highlightly-backend report / services/api/src/modules/sports/README.md</w:t>
+            </w:r>
+          </w:p>
+        </w:tc>
+        <w:tc>
+          <w:tcPr>
+            <w:tcW w:type="dxa" w:w="2300"/>
+          </w:tcPr>
+          <w:p>
+            <w:r>
+              <w:t>Resolved (confirmed absent from the vendor)</w:t>
+            </w:r>
+          </w:p>
+        </w:tc>
+      </w:tr>
+      <w:tr>
+        <w:tc>
+          <w:tcPr>
+            <w:tcW w:type="dxa" w:w="500"/>
+          </w:tcPr>
+          <w:p>
+            <w:r>
+              <w:t>327</w:t>
+            </w:r>
+          </w:p>
+        </w:tc>
+        <w:tc>
+          <w:tcPr>
+            <w:tcW w:type="dxa" w:w="4700"/>
+          </w:tcPr>
+          <w:p>
+            <w:r>
+              <w:t>GET /sports/matches/:id/momentum and GET /sports/matches/:id/events are genuine additions beyond Section 4.6's literal eight-endpoint list (Sprint 4, sprint-4/sports-hub-highlightly-backend), built to match the Match Momentum and Live Commentary sections the sprint-4/sports-hub-highlightly-data-redesign Figma pass designed. momentum is a pure server-side computation over the cached events document (no Highlightly momentum endpoint exists); events is the automated match-event feed (never editorial commentary), returned newest-first per that design's own Decision Log #316. Section 4.6's own API Contract Sketch should be updated to include both routes -- this entry does not do that edit itself, matching how Decision Log #23 (GET /auth/me) was left for whoever next edits Section 4 in the live document.</w:t>
+            </w:r>
+          </w:p>
+        </w:tc>
+        <w:tc>
+          <w:tcPr>
+            <w:tcW w:type="dxa" w:w="1850"/>
+          </w:tcPr>
+          <w:p>
+            <w:r>
+              <w:t>sprint-4/sports-hub-highlightly-backend report / services/api/src/modules/sports/README.md</w:t>
+            </w:r>
+          </w:p>
+        </w:tc>
+        <w:tc>
+          <w:tcPr>
+            <w:tcW w:type="dxa" w:w="2300"/>
+          </w:tcPr>
+          <w:p>
             <w:r>
               <w:t>Resolved</w:t>
             </w:r>
             <w:r>
-              <w:t xml:space="preserve"> by figma/decision-log-cleanup-retouches: root cause was the crest group being non-uniformly stretched (same 132 vectors, 119 wide, height 158-273 by frame) so it ran over the team-name text at y=395. Liverpool crest group (XMLID_189_) resized to 119x158 at (337,196) on all 10 frames (geometry verified within 1px against Match Details, the undistorted reference); the identical distortion on the Chelsea crest (Group 118 inner group) was found and fixed the same way (139x139 at (950,206)) though not named in the entry. Frames 756:6433 Chelsea side was already correct.</w:t>
-            </w:r>
-          </w:p>
-        </w:tc>
-      </w:tr>
-      <w:tr>
-        <w:tc>
-          <w:tcPr>
-            <w:tcW w:type="dxa" w:w="500"/>
-          </w:tcPr>
-          <w:p>
-            <w:r/>
-            <w:r>
-              <w:t>315</w:t>
-            </w:r>
-          </w:p>
-        </w:tc>
-        <w:tc>
-          <w:tcPr>
-            <w:tcW w:type="dxa" w:w="4700"/>
-          </w:tcPr>
-          <w:p>
-            <w:r/>
-            <w:r>
-              <w:t>Correction to Decision Log #149: the “off-palette yellow/amber for draws and mid-table” that entry names on the desktop H2H/Standing screens is club-crest trademark artwork (traced directly — 399 #dba111 paints inside the Liverpool/Chelsea crest vectors on H2H alone), not a UI colour choice — there was no off-palette amber in the desktop UI itself. The real UI-level off-palette values on those two screens were the form-guide chips' #d3f502 (draw) and #cfcfcf (no-data) fills, both now rebound (112 chips total) to the same palette-compliant W/D/L scheme #149 already made canonical.</w:t>
-            </w:r>
-          </w:p>
-        </w:tc>
-        <w:tc>
-          <w:tcPr>
-            <w:tcW w:type="dxa" w:w="1850"/>
-          </w:tcPr>
-          <w:p>
-            <w:r/>
-            <w:r>
-              <w:t>docs/sprint-4-sports-hub-highlightly-data-redesign-report.md (sprint-4/sports-hub-highlightly-data-redesign, figma-screen-builder, 2026-09-16), §4.2</w:t>
-            </w:r>
-          </w:p>
-        </w:tc>
-        <w:tc>
-          <w:tcPr>
-            <w:tcW w:type="dxa" w:w="2300"/>
-          </w:tcPr>
-          <w:p>
-            <w:r/>
-            <w:r>
-              <w:t>Resolved — see the forward-pointer appended to Decision Log #149's own Status.</w:t>
-            </w:r>
-          </w:p>
-        </w:tc>
-      </w:tr>
-      <w:tr>
-        <w:tc>
-          <w:tcPr>
-            <w:tcW w:type="dxa" w:w="500"/>
-          </w:tcPr>
-          <w:p>
-            <w:r/>
-            <w:r>
-              <w:t>316</w:t>
-            </w:r>
-          </w:p>
-        </w:tc>
-        <w:tc>
-          <w:tcPr>
-            <w:tcW w:type="dxa" w:w="4700"/>
-          </w:tcPr>
-          <w:p>
-            <w:r/>
-            <w:r>
-              <w:t>Live Commentary (Match sub-tab) orders its event feed newest-first, matching the live-feed convention the feature name implies, rather than chronological ascending order.</w:t>
-            </w:r>
-          </w:p>
-        </w:tc>
-        <w:tc>
-          <w:tcPr>
-            <w:tcW w:type="dxa" w:w="1850"/>
-          </w:tcPr>
-          <w:p>
-            <w:r/>
-            <w:r>
-              <w:t>docs/sprint-4-sports-hub-highlightly-data-redesign-report.md (sprint-4/sports-hub-highlightly-data-redesign, figma-screen-builder, 2026-09-16), §5</w:t>
-            </w:r>
-          </w:p>
-        </w:tc>
-        <w:tc>
-          <w:tcPr>
-            <w:tcW w:type="dxa" w:w="2300"/>
-          </w:tcPr>
-          <w:p>
-            <w:r/>
-            <w:r>
-              <w:t>Resolved (design) — a deliberate choice, not an oversight; open to revisiting once real usage data exists.</w:t>
-            </w:r>
-          </w:p>
-        </w:tc>
-      </w:tr>
-      <w:tr>
-        <w:tc>
-          <w:tcPr>
-            <w:tcW w:type="dxa" w:w="500"/>
-          </w:tcPr>
-          <w:p>
-            <w:r/>
-            <w:r>
-              <w:t>317</w:t>
-            </w:r>
-          </w:p>
-        </w:tc>
-        <w:tc>
-          <w:tcPr>
-            <w:tcW w:type="dxa" w:w="4700"/>
-          </w:tcPr>
-          <w:p>
-            <w:r/>
-            <w:r>
-              <w:t>Mobile Match sub-tab row type/spacing (12px→11px, gap 20→9, padding 20→16) was reduced to fit five tabs (Match Summary | Statistics | Lineups | Momentum | Commentary) inside the 390px mobile frame width, rather than allowing horizontal-scroll clipping.</w:t>
-            </w:r>
-          </w:p>
-        </w:tc>
-        <w:tc>
-          <w:tcPr>
-            <w:tcW w:type="dxa" w:w="1850"/>
-          </w:tcPr>
-          <w:p>
-            <w:r/>
-            <w:r>
-              <w:t>docs/sprint-4-sports-hub-highlightly-data-redesign-report.md (sprint-4/sports-hub-highlightly-data-redesign, figma-screen-builder, 2026-09-16), §5</w:t>
-            </w:r>
-          </w:p>
-        </w:tc>
-        <w:tc>
-          <w:tcPr>
-            <w:tcW w:type="dxa" w:w="2300"/>
-          </w:tcPr>
-          <w:p>
-            <w:r/>
-            <w:r>
-              <w:t>Resolved (design) — horizontal-scroll clipping was rejected because the active tab could fall out of view.</w:t>
-            </w:r>
-          </w:p>
-        </w:tc>
-      </w:tr>
-      <w:tr>
-        <w:tc>
-          <w:tcPr>
-            <w:tcW w:type="dxa" w:w="500"/>
-          </w:tcPr>
-          <w:p>
-            <w:r/>
-            <w:r>
-              <w:t>318</w:t>
-            </w:r>
-          </w:p>
-        </w:tc>
-        <w:tc>
-          <w:tcPr>
-            <w:tcW w:type="dxa" w:w="4700"/>
-          </w:tcPr>
-          <w:p>
-            <w:r/>
-            <w:r>
-              <w:t>The new Match Momentum and Live Commentary sections are placed as Level-2 sub-tabs under Match (alongside Match Summary | Statistics | Lineups), not as Level-1 siblings of H2H / Standings / Video — both are in-match content. This is the information architecture figma-to-code must inherit when this is eventually converted.</w:t>
-            </w:r>
-          </w:p>
-        </w:tc>
-        <w:tc>
-          <w:tcPr>
-            <w:tcW w:type="dxa" w:w="1850"/>
-          </w:tcPr>
-          <w:p>
-            <w:r/>
-            <w:r>
-              <w:t>docs/sprint-4-sports-hub-highlightly-data-redesign-report.md (sprint-4/sports-hub-highlightly-data-redesign, figma-screen-builder, 2026-09-16), §2.5</w:t>
-            </w:r>
-          </w:p>
-        </w:tc>
-        <w:tc>
-          <w:tcPr>
-            <w:tcW w:type="dxa" w:w="2300"/>
-          </w:tcPr>
-          <w:p>
-            <w:r/>
-            <w:r>
-              <w:t>Resolved (design)</w:t>
-            </w:r>
-          </w:p>
-        </w:tc>
-      </w:tr>
-      <w:tr>
-        <w:tc>
-          <w:tcPr>
-            <w:tcW w:type="dxa" w:w="500"/>
-          </w:tcPr>
-          <w:p>
-            <w:r/>
-            <w:r>
-              <w:t>319</w:t>
-            </w:r>
-          </w:p>
-        </w:tc>
-        <w:tc>
-          <w:tcPr>
-            <w:tcW w:type="dxa" w:w="4700"/>
-          </w:tcPr>
-          <w:p>
-            <w:r/>
-            <w:r>
-              <w:t>Video's geo-restriction treatment uses a navy pill + semantic/alert dot, not a red badge with white text — white-on-semantic/alert fails AA for a small badge label at that size. Restricted thumbnails use the bound color/icon/inactive fill rather than a translucent overlay, avoiding the documented “bound paint takes its alpha from the variable” gotcha.</w:t>
-            </w:r>
-          </w:p>
-        </w:tc>
-        <w:tc>
-          <w:tcPr>
-            <w:tcW w:type="dxa" w:w="1850"/>
-          </w:tcPr>
-          <w:p>
-            <w:r/>
-            <w:r>
-              <w:t>docs/sprint-4-sports-hub-highlightly-data-redesign-report.md (sprint-4/sports-hub-highlightly-data-redesign, figma-screen-builder, 2026-09-16), §2.3 / §2.1</w:t>
-            </w:r>
-          </w:p>
-        </w:tc>
-        <w:tc>
-          <w:tcPr>
-            <w:tcW w:type="dxa" w:w="2300"/>
-          </w:tcPr>
-          <w:p>
-            <w:r/>
-            <w:r>
-              <w:t>Resolved (design)</w:t>
-            </w:r>
-          </w:p>
-        </w:tc>
-      </w:tr>
-      <w:tr>
-        <w:tc>
-          <w:tcPr>
-            <w:tcW w:type="dxa" w:w="500"/>
-          </w:tcPr>
-          <w:p>
-            <w:r/>
-            <w:r>
-              <w:t>320</w:t>
-            </w:r>
-          </w:p>
-        </w:tc>
-        <w:tc>
-          <w:tcPr>
-            <w:tcW w:type="dxa" w:w="4700"/>
-          </w:tcPr>
-          <w:p>
-            <w:r/>
-            <w:r>
-              <w:t>On Standing, brand/green / brand/navy / semantic/alert now carry two different meanings in two separate columns on the same row — promotion/relegation on the rank chip, and W/D/L form on the form-guide chips. Flagged as an accepted, unavoidable trade-off under the two-colour palette rule (non-negotiable #3): the columns sit far apart and the glyphs differ (numbers vs. letters), so it reads as two distinct systems rather than one confused one.</w:t>
-            </w:r>
-          </w:p>
-        </w:tc>
-        <w:tc>
-          <w:tcPr>
-            <w:tcW w:type="dxa" w:w="1850"/>
-          </w:tcPr>
-          <w:p>
-            <w:r/>
-            <w:r>
-              <w:t>docs/sprint-4-sports-hub-highlightly-data-redesign-report.md (sprint-4/sports-hub-highlightly-data-redesign, figma-screen-builder, 2026-09-16), §2.4</w:t>
-            </w:r>
-          </w:p>
-        </w:tc>
-        <w:tc>
-          <w:tcPr>
-            <w:tcW w:type="dxa" w:w="2300"/>
-          </w:tcPr>
-          <w:p>
-            <w:r/>
-            <w:r>
-              <w:t>Resolved (design)</w:t>
-            </w:r>
-          </w:p>
-        </w:tc>
-      </w:tr>
-      <w:tr>
-        <w:tc>
-          <w:tcPr>
-            <w:tcW w:type="dxa" w:w="500"/>
-          </w:tcPr>
-          <w:p>
-            <w:r/>
-            <w:r>
-              <w:t>321</w:t>
-            </w:r>
-          </w:p>
-        </w:tc>
-        <w:tc>
-          <w:tcPr>
-            <w:tcW w:type="dxa" w:w="4700"/>
-          </w:tcPr>
-          <w:p>
-            <w:r>
-              <w:t>All match data across the redesigned Sports Hub screens (Match Momentum, Live Commentary, player box scores, Lineups substitutions, H2H record, Video clips) remains illustrative dummy content (one consistent Liverpool 1–3 Chelsea fixture, per §6 of the report). Highlightly is the resolved vendor (Decision Log #6). At the time of this entry services/api had no sports/fixtures module, no Highlightly API client, and MatchData had zero live reads, so figma-to-code was told not to wire any of these screens to real data until that backend integration existed; the backend integration has since been built (sprint-4/sports-hub-highlightly-backend, #323-#329) and apps/web wired to it (sprint-4/sports-hub-frontend-wiring, see #6).</w:t>
-            </w:r>
-          </w:p>
-        </w:tc>
-        <w:tc>
-          <w:tcPr>
-            <w:tcW w:type="dxa" w:w="1850"/>
-          </w:tcPr>
-          <w:p>
-            <w:r/>
-            <w:r>
-              <w:t>docs/sprint-4-sports-hub-highlightly-data-redesign-report.md (sprint-4/sports-hub-highlightly-data-redesign, figma-screen-builder, 2026-09-16), §6</w:t>
-            </w:r>
-          </w:p>
-        </w:tc>
-        <w:tc>
-          <w:tcPr>
-            <w:tcW w:type="dxa" w:w="2300"/>
-          </w:tcPr>
-          <w:p>
-            <w:r>
-              <w:t>Resolved — the blocker (a not-yet-started backend Highlightly integration) is cleared: backend built (#323-#329) and apps/web wired (see #6). Caveat carried from #6: no real Highlightly credentials exist yet, so no live vendor data has flowed through it (#323, #328).</w:t>
-            </w:r>
-          </w:p>
-        </w:tc>
-      </w:tr>
-      <w:tr>
-        <w:tc>
-          <w:tcPr>
-            <w:tcW w:type="dxa" w:w="500"/>
-          </w:tcPr>
-          <w:p>
-            <w:r/>
-            <w:r>
-              <w:t>322</w:t>
-            </w:r>
-          </w:p>
-        </w:tc>
-        <w:tc>
-          <w:tcPr>
-            <w:tcW w:type="dxa" w:w="4700"/>
-          </w:tcPr>
-          <w:p>
-            <w:r/>
-            <w:r>
-              <w:t>No prototype (NAVIGATE) reactions were added to the new sub-tabs or the two new frames, consistent with the rest of the match-centre family, which has never carried NAVIGATE wiring — routing between these screens stays a code-side concern for whoever eventually runs figma-to-code on them.</w:t>
-            </w:r>
-          </w:p>
-        </w:tc>
-        <w:tc>
-          <w:tcPr>
-            <w:tcW w:type="dxa" w:w="1850"/>
-          </w:tcPr>
-          <w:p>
-            <w:r/>
-            <w:r>
-              <w:t>docs/sprint-4-sports-hub-highlightly-data-redesign-report.md (sprint-4/sports-hub-highlightly-data-redesign, figma-screen-builder, 2026-09-16), §5</w:t>
-            </w:r>
-          </w:p>
-        </w:tc>
-        <w:tc>
-          <w:tcPr>
-            <w:tcW w:type="dxa" w:w="2300"/>
-          </w:tcPr>
-          <w:p>
-            <w:r/>
-            <w:r>
-              <w:t>Resolved (design)</w:t>
-            </w:r>
-          </w:p>
-        </w:tc>
-      </w:tr>
-      <w:tr>
-        <w:tc>
-          <w:tcPr>
-            <w:tcW w:type="dxa" w:w="500"/>
-          </w:tcPr>
-          <w:p>
-            <w:r>
-              <w:t>323</w:t>
-            </w:r>
-          </w:p>
-        </w:tc>
-        <w:tc>
-          <w:tcPr>
-            <w:tcW w:type="dxa" w:w="4700"/>
-          </w:tcPr>
-          <w:p>
-            <w:r>
-              <w:t>The real Highlightly PAID-tier request budget is unknown (Sprint 4, sprint-4/sports-hub-highlightly-backend). HIGHLIGHTLY_DAILY_REQUEST_BUDGET defaults to the confirmed free-tier 100 requests/day; production needs a founder decision on which Highlightly plan to buy, then this env override set to match. Not assumed unlimited.</w:t>
+              <w:t xml:space="preserve"> Forward-pointer (2026-10-03, docs/decision-log-stale-status-cleanup): Resolved. Section 4.6 now lists GET /sports/matches/:id/momentum and GET /sports/matches/:id/events alongside the original eight endpoints, annotated as additions beyond the literal list.</w:t>
+            </w:r>
+          </w:p>
+        </w:tc>
+      </w:tr>
+      <w:tr>
+        <w:tc>
+          <w:tcPr>
+            <w:tcW w:type="dxa" w:w="500"/>
+          </w:tcPr>
+          <w:p>
+            <w:r>
+              <w:t>328</w:t>
+            </w:r>
+          </w:p>
+        </w:tc>
+        <w:tc>
+          <w:tcPr>
+            <w:tcW w:type="dxa" w:w="4700"/>
+          </w:tcPr>
+          <w:p>
+            <w:r>
+              <w:t>The direct highlightly.net host's exact auth-header behaviour is not independently confirmed beyond what Highlightly's public docs state generally (Sprint 4, sprint-4/sports-hub-highlightly-backend): x-rapidapi-key is documented as the required header for “your Highlightly or RapidAPI API Key” alike, with x-rapidapi-host required only when actually calling through RapidAPI's own gateway. HighlightlyClient (services/api/src/sports-data/highlightly-client.service.ts) implements exactly this reading, but no real Highlightly account exists in this environment to trace a live call against. To be confirmed the moment a real account exists.</w:t>
             </w:r>
           </w:p>
         </w:tc>
@@ -23584,32 +23815,29 @@
           </w:tcPr>
           <w:p>
             <w:r>
-              <w:t xml:space="preserve">Resolved (founder decision, settled for now). </w:t>
-            </w:r>
-            <w:r>
-              <w:t>Forward-pointer (docs/decision-log-323-329-bookkeeping): the founder has confirmed staying on Highlightly's free tier (100 requests/day) for now, revisiting only once real post-launch usage data shows it is insufficient. HIGHLIGHTLY_DAILY_REQUEST_BUDGET stays at its 100/day default in code, which already matches this decision. The original open question (paid-tier budget) is no longer blocking; the upgrade trigger is post-launch usage data.</w:t>
-            </w:r>
-          </w:p>
-        </w:tc>
-      </w:tr>
-      <w:tr>
-        <w:tc>
-          <w:tcPr>
-            <w:tcW w:type="dxa" w:w="500"/>
-          </w:tcPr>
-          <w:p>
-            <w:r>
-              <w:t>324</w:t>
-            </w:r>
-          </w:p>
-        </w:tc>
-        <w:tc>
-          <w:tcPr>
-            <w:tcW w:type="dxa" w:w="4700"/>
-          </w:tcPr>
-          <w:p>
-            <w:r>
-              <w:t>No batched per-match player box-score data exists from Highlightly (Sprint 4, sprint-4/sports-hub-highlightly-backend). GET /statistics/{matchId} (confirmed against Highlightly's own documented example response) is TEAM-LEVEL ONLY. Per-player stats exist only via GET /players/{id}/statistics, called one player at a time -- reconstructing an 11-player box score for one match would need 20+ extra Highlightly calls, not viable under the confirmed 100/day free tier. The Figma redesign (sprint-4/sports-hub-highlightly-data-redesign) assumed player box scores were available; they are not, from this vendor, without an unsustainable per-player API-call fan-out. GET /sports/matches/:id/stats returns team-level statistics only -- no synthetic/fabricated player rows are ever generated.</w:t>
+              <w:t>Resolved (2026-10-03, sprint-4/highlightly-live-verification). Confirmed live through the real HighlightlyClient: x-rapidapi-key alone to soccer.highlightly.net returns 200; no key returns 403 Missing mandatory HTTP Headers; sending x-rapidapi-host to the direct host also returns 200. The client behaviour (key always, host only when SPORTS_DATA_RAPIDAPI_HOST is set) is correct for the direct host. The RapidAPI gateway path is not tested.</w:t>
+            </w:r>
+          </w:p>
+        </w:tc>
+      </w:tr>
+      <w:tr>
+        <w:tc>
+          <w:tcPr>
+            <w:tcW w:type="dxa" w:w="500"/>
+          </w:tcPr>
+          <w:p>
+            <w:r>
+              <w:t>329</w:t>
+            </w:r>
+          </w:p>
+        </w:tc>
+        <w:tc>
+          <w:tcPr>
+            <w:tcW w:type="dxa" w:w="4700"/>
+          </w:tcPr>
+          <w:p>
+            <w:r>
+              <w:t>league (on GET /sports/fixtures and GET /sports/live-scores) and season (on GET /sports/standings) are additional, optional query params beyond Section 4.6's literal query-string list (Sprint 4, sprint-4/sports-hub-highlightly-backend) -- the same category of flagged addition as Blog's categoryId/categorySlug filters (Decision Log candidates in modules/blog/README.md). league filters MatchData by Highlightly's own leagueId; season is required by Highlightly's own /standings endpoint and defaults to whatever season is already cached for that league when omitted.</w:t>
             </w:r>
           </w:p>
         </w:tc>
@@ -23629,224 +23857,6 @@
           </w:tcPr>
           <w:p>
             <w:r>
-              <w:t>Resolved (2026-10-03, sprint-4/highlightly-live-verification). Confirmed live against the real Highlightly account: GET /box-score/{matchId} returns per-player box scores for every player in one match in one call (45 players on a finished Serie B match, with matchRating and a keyed statistics object). The other candidates did not return box-score data: /players/{matchId} returns 200 with an empty array, /players/{id}/box-scores and /football/match-box-score/{matchId} return 404. The team-level-only statement above is superseded. Still open, separately: whether to build the box-score call, which needs costing against the free-tier budget (#323). Findings: services/api/src/modules/sports/highlightly-vs-sportmonks.md, Finding 1 and Finding 5.</w:t>
-            </w:r>
-          </w:p>
-        </w:tc>
-      </w:tr>
-      <w:tr>
-        <w:tc>
-          <w:tcPr>
-            <w:tcW w:type="dxa" w:w="500"/>
-          </w:tcPr>
-          <w:p>
-            <w:r>
-              <w:t>325</w:t>
-            </w:r>
-          </w:p>
-        </w:tc>
-        <w:tc>
-          <w:tcPr>
-            <w:tcW w:type="dxa" w:w="4700"/>
-          </w:tcPr>
-          <w:p>
-            <w:r>
-              <w:t>No standings “form” (recent-results) field exists from Highlightly (Sprint 4, sprint-4/sports-hub-highlightly-backend). GET /standings's own documented example standing row has no form field anywhere, and the nearest candidate (GET /last-five-games?teamId=) is per-team -- a full league table's form column would cost 20 extra calls per refresh. GET /sports/standings returns exactly what Highlightly returns, with no form field on any row, real or fabricated. The Figma Standing screen's already-shipped FORM column stays unwired to this endpoint's data until a genuinely cheap per-team form data source exists.</w:t>
-            </w:r>
-          </w:p>
-        </w:tc>
-        <w:tc>
-          <w:tcPr>
-            <w:tcW w:type="dxa" w:w="1850"/>
-          </w:tcPr>
-          <w:p>
-            <w:r>
-              <w:t>sprint-4/sports-hub-highlightly-backend report / services/api/src/modules/sports/README.md</w:t>
-            </w:r>
-          </w:p>
-        </w:tc>
-        <w:tc>
-          <w:tcPr>
-            <w:tcW w:type="dxa" w:w="2300"/>
-          </w:tcPr>
-          <w:p>
-            <w:r>
-              <w:t>Open</w:t>
-            </w:r>
-          </w:p>
-          <w:p>
-            <w:r>
-              <w:t>CROSS-REFERENCE (schema/report-severity-escalation-admin-vetting, 2026-09-27): PR #316's SPORTS_DATA_PROVIDER_CAPABILITIES registry (services/api/src/modules/sports/sports-data-provider.constants.ts) already resolves the mechanism behind this same standings-FORM gap -- 'standingsForm' is a registered SportsDataField, marked unsupported for Highlightly ("documented standings row has no form field", matching this row's own finding) and supported for SportMonks; PublicStandingRow.form is emitted by sports.service.ts's toPublicStandingRow() only when providerSupports(activeProvider, 'standingsForm') is true AND the raw row actually carries form data -- the key is omitted (never null/[]) otherwise. This row (#325) is left OPEN, not resolved by this note -- the underlying product question (does Soccernity ever switch to a vendor that supplies FORM, or does the Standing UI ship without it) is unchanged; what's now true is that the codebase has a single, correct, provider-aware mechanism already in place to reflect whichever answer applies, rather than a hardcoded Highlightly-shaped assumption.</w:t>
-            </w:r>
-          </w:p>
-        </w:tc>
-      </w:tr>
-      <w:tr>
-        <w:tc>
-          <w:tcPr>
-            <w:tcW w:type="dxa" w:w="500"/>
-          </w:tcPr>
-          <w:p>
-            <w:r>
-              <w:t>326</w:t>
-            </w:r>
-          </w:p>
-        </w:tc>
-        <w:tc>
-          <w:tcPr>
-            <w:tcW w:type="dxa" w:w="4700"/>
-          </w:tcPr>
-          <w:p>
-            <w:r>
-              <w:t>No confirmed top-scorers endpoint exists from Highlightly (Sprint 4, sprint-4/sports-hub-highlightly-backend) -- checked directly against the vendor's public API documentation (Matches, Events, Statistics, Lineups, Standings, Head-to-Head, Highlights, Leagues, Countries, Teams, Players, Odds, Bookmakers). There is no dedicated top-scorers/leading-scorers endpoint; Players/{id}/statistics is per-player, not a rankable list. Confirms the Top Scorers fast-follow exclusion (named in the sprint-4/sports-hub-highlightly-data-redesign report) stays excluded -- building it would face the same per-player fan-out problem as Decision Log #324.</w:t>
-            </w:r>
-          </w:p>
-        </w:tc>
-        <w:tc>
-          <w:tcPr>
-            <w:tcW w:type="dxa" w:w="1850"/>
-          </w:tcPr>
-          <w:p>
-            <w:r>
-              <w:t>sprint-4/sports-hub-highlightly-backend report / services/api/src/modules/sports/README.md</w:t>
-            </w:r>
-          </w:p>
-        </w:tc>
-        <w:tc>
-          <w:tcPr>
-            <w:tcW w:type="dxa" w:w="2300"/>
-          </w:tcPr>
-          <w:p>
-            <w:r>
-              <w:t>Resolved (confirmed absent from the vendor)</w:t>
-            </w:r>
-          </w:p>
-        </w:tc>
-      </w:tr>
-      <w:tr>
-        <w:tc>
-          <w:tcPr>
-            <w:tcW w:type="dxa" w:w="500"/>
-          </w:tcPr>
-          <w:p>
-            <w:r>
-              <w:t>327</w:t>
-            </w:r>
-          </w:p>
-        </w:tc>
-        <w:tc>
-          <w:tcPr>
-            <w:tcW w:type="dxa" w:w="4700"/>
-          </w:tcPr>
-          <w:p>
-            <w:r>
-              <w:t>GET /sports/matches/:id/momentum and GET /sports/matches/:id/events are genuine additions beyond Section 4.6's literal eight-endpoint list (Sprint 4, sprint-4/sports-hub-highlightly-backend), built to match the Match Momentum and Live Commentary sections the sprint-4/sports-hub-highlightly-data-redesign Figma pass designed. momentum is a pure server-side computation over the cached events document (no Highlightly momentum endpoint exists); events is the automated match-event feed (never editorial commentary), returned newest-first per that design's own Decision Log #316. Section 4.6's own API Contract Sketch should be updated to include both routes -- this entry does not do that edit itself, matching how Decision Log #23 (GET /auth/me) was left for whoever next edits Section 4 in the live document.</w:t>
-            </w:r>
-          </w:p>
-        </w:tc>
-        <w:tc>
-          <w:tcPr>
-            <w:tcW w:type="dxa" w:w="1850"/>
-          </w:tcPr>
-          <w:p>
-            <w:r>
-              <w:t>sprint-4/sports-hub-highlightly-backend report / services/api/src/modules/sports/README.md</w:t>
-            </w:r>
-          </w:p>
-        </w:tc>
-        <w:tc>
-          <w:tcPr>
-            <w:tcW w:type="dxa" w:w="2300"/>
-          </w:tcPr>
-          <w:p>
-            <w:r>
-              <w:t>Resolved</w:t>
-            </w:r>
-            <w:r>
-              <w:t xml:space="preserve"> Forward-pointer (2026-10-03, docs/decision-log-stale-status-cleanup): Resolved. Section 4.6 now lists GET /sports/matches/:id/momentum and GET /sports/matches/:id/events alongside the original eight endpoints, annotated as additions beyond the literal list.</w:t>
-            </w:r>
-          </w:p>
-        </w:tc>
-      </w:tr>
-      <w:tr>
-        <w:tc>
-          <w:tcPr>
-            <w:tcW w:type="dxa" w:w="500"/>
-          </w:tcPr>
-          <w:p>
-            <w:r>
-              <w:t>328</w:t>
-            </w:r>
-          </w:p>
-        </w:tc>
-        <w:tc>
-          <w:tcPr>
-            <w:tcW w:type="dxa" w:w="4700"/>
-          </w:tcPr>
-          <w:p>
-            <w:r>
-              <w:t>The direct highlightly.net host's exact auth-header behaviour is not independently confirmed beyond what Highlightly's public docs state generally (Sprint 4, sprint-4/sports-hub-highlightly-backend): x-rapidapi-key is documented as the required header for “your Highlightly or RapidAPI API Key” alike, with x-rapidapi-host required only when actually calling through RapidAPI's own gateway. HighlightlyClient (services/api/src/sports-data/highlightly-client.service.ts) implements exactly this reading, but no real Highlightly account exists in this environment to trace a live call against. To be confirmed the moment a real account exists.</w:t>
-            </w:r>
-          </w:p>
-        </w:tc>
-        <w:tc>
-          <w:tcPr>
-            <w:tcW w:type="dxa" w:w="1850"/>
-          </w:tcPr>
-          <w:p>
-            <w:r>
-              <w:t>sprint-4/sports-hub-highlightly-backend report / services/api/src/modules/sports/README.md</w:t>
-            </w:r>
-          </w:p>
-        </w:tc>
-        <w:tc>
-          <w:tcPr>
-            <w:tcW w:type="dxa" w:w="2300"/>
-          </w:tcPr>
-          <w:p>
-            <w:r>
-              <w:t>Resolved (2026-10-03, sprint-4/highlightly-live-verification). Confirmed live through the real HighlightlyClient: x-rapidapi-key alone to soccer.highlightly.net returns 200; no key returns 403 Missing mandatory HTTP Headers; sending x-rapidapi-host to the direct host also returns 200. The client behaviour (key always, host only when SPORTS_DATA_RAPIDAPI_HOST is set) is correct for the direct host. The RapidAPI gateway path is not tested.</w:t>
-            </w:r>
-          </w:p>
-        </w:tc>
-      </w:tr>
-      <w:tr>
-        <w:tc>
-          <w:tcPr>
-            <w:tcW w:type="dxa" w:w="500"/>
-          </w:tcPr>
-          <w:p>
-            <w:r>
-              <w:t>329</w:t>
-            </w:r>
-          </w:p>
-        </w:tc>
-        <w:tc>
-          <w:tcPr>
-            <w:tcW w:type="dxa" w:w="4700"/>
-          </w:tcPr>
-          <w:p>
-            <w:r>
-              <w:t>league (on GET /sports/fixtures and GET /sports/live-scores) and season (on GET /sports/standings) are additional, optional query params beyond Section 4.6's literal query-string list (Sprint 4, sprint-4/sports-hub-highlightly-backend) -- the same category of flagged addition as Blog's categoryId/categorySlug filters (Decision Log candidates in modules/blog/README.md). league filters MatchData by Highlightly's own leagueId; season is required by Highlightly's own /standings endpoint and defaults to whatever season is already cached for that league when omitted.</w:t>
-            </w:r>
-          </w:p>
-        </w:tc>
-        <w:tc>
-          <w:tcPr>
-            <w:tcW w:type="dxa" w:w="1850"/>
-          </w:tcPr>
-          <w:p>
-            <w:r>
-              <w:t>sprint-4/sports-hub-highlightly-backend report / services/api/src/modules/sports/README.md</w:t>
-            </w:r>
-          </w:p>
-        </w:tc>
-        <w:tc>
-          <w:tcPr>
-            <w:tcW w:type="dxa" w:w="2300"/>
-          </w:tcPr>
-          <w:p>
-            <w:r>
               <w:t xml:space="preserve">Resolved. </w:t>
             </w:r>
             <w:r>
@@ -24168,7 +24178,7 @@
               <w:t xml:space="preserve"> Forward-pointer (sprint-4/sports-vendor-capability-registry, 2026-09-26): a real field-by-field Highlightly-vs-SportMonks comparison, cited to each vendor's public documentation, now exists at services/api/src/modules/sports/highlightly-vs-sportmonks.md (unverified against any live API; no account exists for either vendor). It covers all three items above and does not resolve any of them. It also records that the tracked-gap list was incomplete or partly wrong: standings FORM is a fourth documented Highlightly gap (present at SportMonks via include=form), player ratings are unconfirmed rather than confirmed-absent at Highlightly, shot maps are not confirmed at SportMonks either, and README data gap #1 (no batched player box scores) was wrong — Highlightly documents a per-match Match Box Score endpoint, exact path unconfirmed. A SPORTS_DATA_PROVIDER capability registry now hides unsupported fields from API responses (today: standings form) so a future vendor pivot is a config change plus an HTTP adapter.</w:t>
             </w:r>
             <w:r>
-              <w:t xml:space="preserve"> Forward-pointer (sprint-4/match-notification-investigation, 2026-10-03; RESEARCH ONLY, nothing built): RECOMMENDATION: REUSE the existing Notification table and Notification Centre read path for the in-app record, and BUILD a small new subscription model plus a time-based kickoff job. Do not treat the Notification table as a delivery channel. FINDINGS: (1) Notification.type is a free-text string and payloadRefId is untyped with no unique constraint, so a new type (match_kickoff, payloadRefId = MatchData.externalRef) needs no migration. The collapse-per-thread pattern used by message is reusable. (2) There is NO subscription model. Follow (user-to-user) and BanterRoomMember (room membership) do not fit, so a new MatchSubscription is required: userId (FK to User, Restrict per #341, and explicitly deleteMany'd in anonymizeUser alongside Notification/Follow/Like/SavedPost), externalRef (plain string, no FK), createdAt, notifiedAt DateTime?, @@unique([userId, externalRef]). (3) There is NO match scheduler. Every MatchData refresh is read-driven (refreshMatchesForDate runs only when someone calls GET /sports/fixtures or a match route). A kickoff trigger must NOT depend on fresh vendor data: MatchData.kickoffTime is already stored and indexed (@@index([kickoffTime])), so a @Cron(EVERY_MINUTE) job can select subscriptions where notifiedAt is null and kickoffTime &lt;= now with ZERO upstream calls. Before firing it may call the existing lock-gated refreshMatchesForDate once per date to catch postponements, and skip matches whose status is postponed or cancelled. (4) Claim-then-create in one transaction (updateMany where notifiedAt is null, then Notification.create) gives at-most-once delivery across multiple instances, mirroring the existing transaction and lock patterns. (5) Subscribe via PUT /sports/matches/:id/subscription (idempotent, P2002-catch) and DELETE, JwtAuthGuard only. NotificationsService.resolveOne needs a match_kickoff case returning a batched MatchData summary. BLOCKERS THAT ARE NOT DATA-MODEL QUESTIONS: (a) DELIVERY, the real blocker. Notifications are pull-only: there is no push, web-push, email or realtime path for them (apps/mobile has no code), and the web app refetches the unread count only on navigation, with no polling. A kickoff alert therefore appears only when the user next opens the app. A literal 'notified at kickoff' needs a founder channel decision: web push, Postmark email (transactional-only today), or accept in-app-only. (b) BUDGET: the time-based trigger costs zero vendor calls, so the 100/day free tier is sufficient for kickoff-only. Live goal or minute alerts would poll at the 60s live TTL and need the Pro tier (7,500/day); that is out of v1 and tied to #323. (c) DESIGN: DL #279 designed icon-disc treatments for seven types only; match_kickoff needs a figma-screen-builder pass before figma-to-code. (d) SAFEGUARDING: a subscription produces no visible content, so JwtAuthGuard-only is the default. Founder to confirm whether restricted-pending minors may subscribe (likely yes) and whether under-16 needs Under16RestrictionGuard. SCOPE v1: kickoff only. Goal, half-time and full-time alerts are a separate decision because they need live polling.</w:t>
+              <w:t xml:space="preserve"> Forward-pointer (sprint-4/match-notification-investigation, 2026-10-03; RESEARCH ONLY, nothing built): RECOMMENDATION: REUSE the existing Notification table and Notification Centre read path for the in-app record, and BUILD a small new subscription model plus a time-based kickoff job. Do not treat the Notification table as a delivery channel. FINDINGS: (1) Notification.type is a free-text string and payloadRefId is untyped with no unique constraint, so a new type (match_kickoff, payloadRefId = MatchData.externalRef) needs no migration. The collapse-per-thread pattern used by message is reusable. (2) There is NO subscription model. Follow (user-to-user) and BanterRoomMember (room membership) do not fit, so a new MatchSubscription is required: userId (FK to User, Restrict per #341, and explicitly deleteMany'd in anonymizeUser alongside Notification/Follow/Like/SavedPost), externalRef (plain string, no FK), createdAt, notifiedAt DateTime?, @@unique([userId, externalRef]). (3) There is NO match scheduler. Every MatchData refresh is read-driven (refreshMatchesForDate runs only when someone calls GET /sports/fixtures or a match route). A kickoff trigger must NOT depend on fresh vendor data: MatchData.kickoffTime is already stored and indexed (@@index([kickoffTime])), so a @Cron(EVERY_MINUTE) job can select subscriptions where notifiedAt is null and kickoffTime &lt;= now with ZERO upstream calls. Before firing it may call the existing lock-gated refreshMatchesForDate once per date to catch postponements, and skip matches whose status is postponed or cancelled. (4) Claim-then-create in one transaction (updateMany where notifiedAt is null, then Notification.create) gives at-most-once delivery across multiple instances, mirroring the existing transaction and lock patterns. (5) Subscribe via PUT /sports/matches/:id/subscription (idempotent, P2002-catch) and DELETE, JwtAuthGuard only. NotificationsService.resolveOne needs a match_kickoff case returning a batched MatchData summary. BLOCKERS THAT ARE NOT DATA-MODEL QUESTIONS: (a) DELIVERY, the real blocker. Notifications are pull-only: there is no push, web-push, email or realtime path for them (apps/mobile has no code), and the web app refetches the unread count only on navigation, with no polling. A kickoff alert therefore appears only when the user next opens the app. A literal 'notified at kickoff' needs a founder channel decision: web push, Postmark email (transactional-only today), or accept in-app-only. (b) BUDGET: the time-based trigger costs zero vendor calls, so the 100/day free tier is sufficient for kickoff-only. Live goal or minute alerts would poll at the 60s live TTL and need the Pro tier (7,500/day); that is out of v1 and tied to #323. (c) DESIGN: DL #279 designed icon-disc treatments for seven types only; match_kickoff needs a figma-screen-builder pass before figma-to-code. (d) SAFEGUARDING: a subscription produces no visible content, so JwtAuthGuard-only is the default. Founder to confirm whether restricted-pending minors may subscribe (likely yes) and whether under-16 needs Under16RestrictionGuard. SCOPE v1: kickoff only. Goal, half-time and full-time alerts are a separate decision because they need live polling. Dated note (2026-10-03, correcting item 3's framing, status unchanged): xG is no longer a Highlightly gap as of PR #361 (sprint-4/box-score-rating-xg). It is served from Highlightly's live box score and is no longer a SportMonks-only paid add-on. pressureIndex, shotMaps and expectedLineups remain genuinely unavailable from Highlightly; item 3 is narrowed accordingly.</w:t>
             </w:r>
           </w:p>
         </w:tc>

</xml_diff>

<commit_message>
docs(decision-log): ratify #86/#90/#106/#119 and resolve #83/#98/#181
Part 1 (ratifications, forward-pointers only): 390px canonical mobile width (#86),
legacy frames grandfathered (#90), manual Figma overlay-dismiss tick (#106), content-hugging
mobile height convention (#119). Existing Status text is untouched.

Part 2 (Figma housekeeping, forward-pointers recording the work): #83(b) Navigation
variant icon glyphs bound to color/text/primary; #98 Bants desktop room row
converted to a Status active/inactive variant set; #181 dropdown containers
consolidated to a single elevation/menu shadow with per-row shadows removed.

Co-Authored-By: Claude Sonnet 5 <noreply@anthropic.com>
</commit_message>
<xml_diff>
--- a/docs/Soccernity_MVP_Build_Plan_v1.7.docx
+++ b/docs/Soccernity_MVP_Build_Plan_v1.7.docx
@@ -13164,6 +13164,9 @@
             <w:r>
               <w:t>Noted, not actioned (out of scope). (a) 123:56 'Articles' + 124:313 'Articles - Create Post' are Admin Panel shell screens, not user-facing Blog — their unbound black content titles fold into Decision Log #52; an accidental edit to 124:313 was reverted. (b) Shared 'Navigation' component set 1078:3761 renders unbound black icon glyphs across 5 Bants frames — dedicated shared-component pass needed. (c) 1620:13390 'Settingd' does not exist on page 0:1; no '22 duplicate Settings frames' exist in user-facing Settings (all 19 uniquely named; only bare 'Settings' 1658:2303 is Admin Panel).</w:t>
             </w:r>
+            <w:r>
+              <w:t xml:space="preserve"> [2026-10-03, (b) resolved in docs/decision-log-ratifications-figma-housekeeping] Shared Navigation variant 1078:3869, the variant all five Bants frames instance, had 20 unbound icon paints (notification-dot, message-dots, search and football-outline glyphs). All are now bound to color/text/primary (navy), matching the set's other filled icons. Text nodes (wordmark, search placeholder) are left as-is, being outside icon scope. 0 unbound non-text paints remain in the variant. (a) and (c) are unchanged.</w:t>
+            </w:r>
           </w:p>
         </w:tc>
       </w:tr>
@@ -13290,6 +13293,9 @@
             <w:r>
               <w:t>Proposed (founder to ratify). 390 proposed as canon — used by every screen built in the last five design PRs (Guardian Consent 1–12, Verify Email, Leaderboard, Homepage, Auth, Settings Overview) and all 25 frames in this pass. The 428 Navbar mobile variants stay 428 and resize per instance, per Decision Log #48 (unchanged). Open: whether the 428 (community mobile 1–5, Messages window 2/4), 375 (Blog/Articles/Contact/Terms/Privacy) and 360 (Message mobile-app pair) legacy frames get reflowed or grandfathered. See #90 for why the community frames can't be mechanically resized.</w:t>
             </w:r>
+            <w:r>
+              <w:t xml:space="preserve"> [2026-10-03, ratified by founder in docs/decision-log-ratifications-figma-housekeeping] 390px is now the canonical mobile frame width, confirmed by Temi on 2026-10-03. All new mobile work uses 390px. The legacy-frame disposition is settled in #90 (grandfathered, no rebuild).</w:t>
+            </w:r>
           </w:p>
         </w:tc>
       </w:tr>
@@ -13464,6 +13470,9 @@
             <w:r>
               <w:t>Deferred (deliberately not done). All five are layoutMode:NONE with 13–31 absolutely-positioned children; a 428→390 frame resize leaves every child at its original x — overflowing, misaligned content, not a reflow. Correct fix is a rebuild of each at 390, a scoped design task of its own. Separately confirmed and left as found: Community Home Page Template (1306:7149, COMPONENT_SET) and its instance (1308:11643, 0 children) are both visible:false and render nothing (matches CLAUDE.md). Open: commission the 5-screen community-mobile rebuild; decide whether the hidden template is revived or deleted.</w:t>
             </w:r>
+            <w:r>
+              <w:t xml:space="preserve"> [2026-10-03, founder decision in docs/decision-log-ratifications-figma-housekeeping] Founder confirms the legacy 428px Community mobile frames (1708:2321, 1762:2847, 1708:2401, 1769:5230, 1770:5435) are grandfathered as-is, with no rebuild. By the same logic the 375px Blog/Articles/Contact/Terms/Privacy frames and the 360px Message mobile frames flagged in #86 are grandfathered too. All new work uses the 390px canon. This closes the open question with no Figma rebuild work; the five Community mobile frames are untouched.</w:t>
+            </w:r>
           </w:p>
         </w:tc>
       </w:tr>
@@ -13800,6 +13809,9 @@
             <w:r>
               <w:t>Partially addressed: the desktop dot (Ellipse 67 in Group 403 / 2353:1610, 102 instances) was off-palette amber #DBA111 and is now bound to brand/green. Giving desktop rows a real active/inactive variant/boolean (to match mobile’s color/icon/inactive treatment for inactive rooms) is out of scope here — flagged for follow-up.</w:t>
             </w:r>
+            <w:r>
+              <w:t xml:space="preserve"> [2026-10-03, resolved in docs/decision-log-ratifications-figma-housekeeping] Desktop room-row template Group 403 (2353:1610) is now a Status variant set (6563:23341): Status=active (the original, default; its 102 existing instances keep their ID and appearance) and Status=inactive (dot bound to color/icon/inactive at 15%, matching mobile's Status Dot - inactive). Mobile Status Dot nodes are loose named nodes rather than components; the desktop set follows the same active/inactive pattern.</w:t>
+            </w:r>
           </w:p>
         </w:tc>
       </w:tr>
@@ -14136,6 +14148,9 @@
             <w:r>
               <w:t>Open (manual follow-up). overlayBackgroundInteraction is declared readonly across the use_figma plugin API on every node type tested (COMPONENT and FRAME both throw; .d.ts confirms) - PR #114's note that it is "settable only on instances" is inaccurate for this environment; it is writable nowhere via the API, and the dropdowns have no instances. It is NOT blocked in Figma itself - a designer ticks "Close when clicking outside" on the 3 avatar Open Overlay interactions (2838:3579, 5387:7675, 2819:4089) in the desktop UI. Non-issue for figma-to-code (standard backdrop onClick / useOnClickOutside).</w:t>
             </w:r>
+            <w:r>
+              <w:t xml:space="preserve"> [2026-10-03, founder-confirmed resolved in docs/decision-log-ratifications-figma-housekeeping] Temi manually ticked 'Close when clicking outside' in the Figma desktop UI on the three avatar Open Overlay interactions (2838:3579, 5387:7675, 2819:4089/4090 overlay trigger). This is the only route available: overlayBackgroundInteraction is exposed by no Figma API (plugin or MCP) in either direction. Founder-confirmed, not independently tool-verified; no API exists to check it.</w:t>
+            </w:r>
           </w:p>
         </w:tc>
       </w:tr>
@@ -14681,6 +14696,9 @@
           <w:p>
             <w:r>
               <w:t>Open. The two Message conversation screens and the Community drawer are fixed 844px viewports (pinned composer, full-height overlays); the other new mobile frames hug their content, matching the existing Settings mobile family; the retained empty state 5648:8054 is 602. Worth settling one convention.</w:t>
+            </w:r>
+            <w:r>
+              <w:t xml:space="preserve"> [2026-10-03, ratified by founder in docs/decision-log-ratifications-figma-housekeeping] Content-hugging height is now the default mobile frame convention, confirmed by Temi on 2026-10-03. Fixed-viewport (844px) stays reserved for frames that genuinely need a pinned composer or full-height overlay; the two Message conversation screens and the Community drawer already fit this exception and need no change. No rebuild required.</w:t>
             </w:r>
           </w:p>
         </w:tc>
@@ -17308,6 +17326,9 @@
           <w:p>
             <w:r>
               <w:t>Open -- deferred as structural (not a colour rebind). Fix: give the container a bound color/background/surface fill + corner radius, move a single elevation/menu shadow to the container, drop the per-row effects. Colour was rebound to color/shadow/elevated this pass; consolidation is the remaining work.</w:t>
+            </w:r>
+            <w:r>
+              <w:t xml:space="preserve"> [2026-10-03, resolved in docs/decision-log-ratifications-figma-housekeeping] The four dropdown containers (2841:5361, 2841:5363, 5685:9300, 5685:9312) now carry a color/background/surface fill, a 12px corner radius, clipped content and a single elevation/menu effect style. Per-row shadows are removed from all 22 rows (6+6+5+5). Same pattern as Message - Conversation Actions Menu (5706:8270). 0 unbound paints on the touched frames.</w:t>
             </w:r>
           </w:p>
         </w:tc>

</xml_diff>

<commit_message>
fix(web): close desktop account dropdown on outside click
Decision Log #106 ratified closing the account dropdown on a click outside
it, but the Figma prototype fix never reached the app component. Header now
listens for mousedown outside the avatar and menu wrapper while the desktop
menu is open, and removes the listener on close or unmount. Mobile drawer
is unchanged.

Co-Authored-By: Claude Sonnet 5 <noreply@anthropic.com>
</commit_message>
<xml_diff>
--- a/docs/Soccernity_MVP_Build_Plan_v1.7.docx
+++ b/docs/Soccernity_MVP_Build_Plan_v1.7.docx
@@ -14150,6 +14150,11 @@
             </w:r>
             <w:r>
               <w:t xml:space="preserve"> [2026-10-03, founder-confirmed resolved in docs/decision-log-ratifications-figma-housekeeping] Temi manually ticked 'Close when clicking outside' in the Figma desktop UI on the three avatar Open Overlay interactions (2838:3579, 5387:7675, 2819:4089/4090 overlay trigger). This is the only route available: overlayBackgroundInteraction is exposed by no Figma API (plugin or MCP) in either direction. Founder-confirmed, not independently tool-verified; no API exists to check it.</w:t>
+            </w:r>
+          </w:p>
+          <w:p>
+            <w:r>
+              <w:t>2026-10-03 forward-pointer (app-side fix, additive): the Figma prototype fix never reached the real desktop account dropdown in apps/web. Header.tsx now closes the desktop AccountDropdown on a mousedown outside the avatar and menu wrapper (listener mounted only while open; mobile drawer untouched). Tests in Header.test.tsx. Branch fix/account-dropdown-outside-click.</w:t>
             </w:r>
           </w:p>
         </w:tc>

</xml_diff>

<commit_message>
feat: Bants room status and moderator deactivation via Report queue
Resolves Decision Log #357. BanterRoom.status (active/inactive) backs the
Figma room status dot. The creator sets it via PATCH /banter-rooms/:id/status;
moderators reach it through the existing Report/moderation queue, where
banter_room is a fourth reportable target and room_deactivated its action.

Co-Authored-By: Claude Sonnet 5 <noreply@anthropic.com>
</commit_message>
<xml_diff>
--- a/docs/Soccernity_MVP_Build_Plan_v1.7.docx
+++ b/docs/Soccernity_MVP_Build_Plan_v1.7.docx
@@ -25061,6 +25061,48 @@
           <w:p>
             <w:r>
               <w:t>Resolved -- implemented. Guard: JwtAuthGuard + GuardianConsentGuard (a short confirmation of POST /banter-rooms' own 'posting'-class reasoning, Decision Log #21 -- attaching a topic changes the room's own public-facing, persistent discoverability metadata, the same category of action room creation already treats as consent-gated). Permission model: ONLY the room's creator (BanterRoom.createdBy) may attach topics -- not any member, and not any consent-confirmed authenticated user (403 otherwise, settled AFTER the standard 404-before-403 existence check). Mirrors GrassrootsService.createFixture's own 'you manage what you created' ownership model (Decision Log #255) -- the closest analogous precedent for who may mutate a record's own metadata. 'Any member may attach topics' and 'any authenticated consent-confirmed user' were both considered and rejected: no analogous 'shared metadata, editable by any member' precedent exists anywhere in this codebase (CommunityGroup/ClubPage don't have one either), and extending write access further would compound the already-flagged spam/safeguarding concern (Decision Log #275 judgment call 1) about unbounded room-metadata mutation on a minors' platform. Each attached name is upserted against Topic by its normalized (trim+lowercase) form -- CommunityGroup.nameNormalized's own dedup pattern -- and attaching an already-attached topic is a genuine idempotent no-op. A real bug was found and fixed while building this: the original implementation ran a whole batch's find-or-create + attach inside one shared transaction with a create-then-catch-and-recover pattern, which a genuine concurrent-attach e2e test (two different rooms attaching the same brand-new topic name at once) caught failing with a real 500 -- Postgres aborts an entire transaction the instant any query inside it fails, so recovering via a second query on the SAME transaction is unsafe. Fixed: each name gets its own transaction (Topic.upsert + BanterRoomTopic.upsert, both idempotent by construction, never create-then-catch), retried up to 3 times as a whole on a residual P2002 (upsert alone was empirically confirmed, via a standalone script against real Postgres, to still race on rare occasion -- a documented Postgres ON CONFLICT caveat, not a Prisma bug). Proven fixed by the same e2e test passing reliably across repeated runs post-fix. Full reasoning in banter/README.md's 'find-or-create + attach' section.</w:t>
+            </w:r>
+          </w:p>
+        </w:tc>
+      </w:tr>
+      <w:tr>
+        <w:tc>
+          <w:tcPr>
+            <w:tcW w:type="dxa" w:w="500"/>
+          </w:tcPr>
+          <w:p>
+            <w:r>
+              <w:t>357</w:t>
+            </w:r>
+          </w:p>
+        </w:tc>
+        <w:tc>
+          <w:tcPr>
+            <w:tcW w:type="dxa" w:w="4700"/>
+          </w:tcPr>
+          <w:p>
+            <w:r>
+              <w:t>Bants room active/inactive status -- was Figma-only, no backend concept; what should it mean and who can set it?</w:t>
+            </w:r>
+          </w:p>
+        </w:tc>
+        <w:tc>
+          <w:tcPr>
+            <w:tcW w:type="dxa" w:w="1850"/>
+          </w:tcPr>
+          <w:p>
+            <w:r>
+              <w:t>Figma Bants room status dot (desktop 2353:1610; mobile Status Dot -- active / -- inactive, 5650:8205 / 5650:8214, PR #112)</w:t>
+            </w:r>
+          </w:p>
+        </w:tc>
+        <w:tc>
+          <w:tcPr>
+            <w:tcW w:type="dxa" w:w="2300"/>
+          </w:tcPr>
+          <w:p>
+            <w:r>
+              <w:t>Resolved in full (founder decision, 2026-10-04): manual, creator-set via PATCH /banter-rooms/:id/status; moderator access via the existing Report/moderation queue (banter_room added as a fourth Report.targetType, room_deactivated as its moderation action). No separate admin route built -- bridges the Admin Console's moderator role to BanterRoom entirely through the pre-existing Report mechanism. Known gap, disclosed not hidden: no moderator 'reactivate' action -- only the room creator's own PATCH can set status back to active.</w:t>
             </w:r>
           </w:p>
         </w:tc>

</xml_diff>

<commit_message>
fix(web): use shared elevation token for account dropdown shadow
The account dropdown still carried hardcoded black shadows (a
drop-shadow filter on the container and a box-shadow per row) even
though Decision Log #181's Figma fix had consolidated them. The
container now uses one box-shadow on --sn-shadow-elevated matching the
Figma elevation/menu spec (0 4px 16px), and the per-row shadow is
removed. The same hardcoded-black pattern on the report menu in
CommunityPage.css is switched to the token too.

Co-Authored-By: Claude Sonnet 5 <noreply@anthropic.com>
</commit_message>
<xml_diff>
--- a/docs/Soccernity_MVP_Build_Plan_v1.7.docx
+++ b/docs/Soccernity_MVP_Build_Plan_v1.7.docx
@@ -17334,6 +17334,11 @@
             </w:r>
             <w:r>
               <w:t xml:space="preserve"> [2026-10-03, resolved in docs/decision-log-ratifications-figma-housekeeping] The four dropdown containers (2841:5361, 2841:5363, 5685:9300, 5685:9312) now carry a color/background/surface fill, a 12px corner radius, clipped content and a single elevation/menu effect style. Per-row shadows are removed from all 22 rows (6+6+5+5). Same pattern as Message - Conversation Actions Menu (5706:8270). 0 unbound paints on the touched frames.</w:t>
+            </w:r>
+          </w:p>
+          <w:p>
+            <w:r>
+              <w:t>[2026-10-04, app-side fix in fix/account-dropdown-elevation-token] The Figma fix above only changed the Figma file. The app stylesheet apps/web/src/layout/AccountDropdown.css still carried the old pattern at the time; it now uses one container box-shadow (0 4px 16px, colour var(--sn-shadow-elevated)) and the per-row shadow is removed. The same hardcoded black-shadow pattern was also fixed on the report menu in apps/web/src/pages/community/CommunityPage.css.</w:t>
             </w:r>
           </w:p>
         </w:tc>

</xml_diff>

<commit_message>
docs: fold Decision Log #117 variable-alpha gotcha into Figma notes
A paint bound to a variable takes its alpha from the variable, not from a
fractional paint opacity set before binding. Adds it to the Figma-authoring
gotchas list with a cross-reference to #199, drops it from the preamble's
unswept list, and appends a forward-pointer to #117.

Co-Authored-By: Claude Sonnet 5 <noreply@anthropic.com>
</commit_message>
<xml_diff>
--- a/docs/Soccernity_MVP_Build_Plan_v1.7.docx
+++ b/docs/Soccernity_MVP_Build_Plan_v1.7.docx
@@ -14617,6 +14617,11 @@
           <w:p>
             <w:r>
               <w:t>Recorded (belongs in the file Figma notes alongside the existing setBoundVariableForPaint warning). Setting {opacity: 0.3} then setBoundVariableForPaint(..., brand/navy) yields a fully opaque paint (brand/navy is #282E65 alpha 1) - it silently produced two solid-navy scrims here. Consequences: (a) translucency must come from a token that carries its own alpha (brand/green-tint 12%, color/icon/inactive 15%, color/text/secondary 70%) or opacity re-applied to a copy of the paint AFTER binding; (b) a prior "0 unbound paints" audit may have passed while a paint still rendered at the wrong alpha.</w:t>
+            </w:r>
+          </w:p>
+          <w:p>
+            <w:r>
+              <w:t>Forward-pointer (2026-10-04, docs/figma-gotcha-variable-alpha): now folded into CLAUDE.md &gt; Figma notes &gt; Figma-authoring gotchas as a bind-time variable-alpha gotcha, cross-referenced to #199.</w:t>
             </w:r>
           </w:p>
         </w:tc>

</xml_diff>

<commit_message>
feat(banter): room-list filter modal and mobile filter flow with createdAt date range
Adds BanterRoom.createdAt (filter-only, migration 20261004010542) so the
Figma Date control has real data behind it, plus dateFrom/dateTo on
GET /banter-rooms. Web builds the desktop filter modal and the mobile
two-screen flow with an active-filter chip row. Decision Log #358.

Co-Authored-By: Claude Sonnet 5 <noreply@anthropic.com>
</commit_message>
<xml_diff>
--- a/docs/Soccernity_MVP_Build_Plan_v1.7.docx
+++ b/docs/Soccernity_MVP_Build_Plan_v1.7.docx
@@ -17604,7 +17604,7 @@
           </w:tcPr>
           <w:p>
             <w:r>
-              <w:t>Recorded, not a defect: the split is deliberate and consistent. Consequence -- Date and Tag do NOT appear on the mobile results screens, and the mobile filter flow has one more step than desktop. Logged so figma-to-code does not read the missing Date/Tag on 5650:8221 / 5980:10881 as an omission and re-add them.</w:t>
+              <w:t>Recorded, not a defect: the split is deliberate and consistent. Consequence -- Date and Tag do NOT appear on the mobile results screens, and the mobile filter flow has one more step than desktop. Logged so figma-to-code does not read the missing Date/Tag on 5650:8221 / 5980:10881 as an omission and re-add them. Forward-pointer (2026-10-04, feat/banter-filter-modal): the filter UI is now built -- a desktop filter modal and a mobile two-screen flow (Decision Log #358). Categories is single-select, as this entry's Figma check found. The Figma Categories row reads All / My Bants, but the built control is the scopeType filter (club / league / country / topic) the brief specified -- a flagged mismatch for founder review.</w:t>
             </w:r>
           </w:p>
         </w:tc>
@@ -25113,6 +25113,48 @@
           <w:p>
             <w:r>
               <w:t>Resolved in full (founder decision, 2026-10-04): manual, creator-set via PATCH /banter-rooms/:id/status; moderator access via the existing Report/moderation queue (banter_room added as a fourth Report.targetType, room_deactivated as its moderation action). No separate admin route built -- bridges the Admin Console's moderator role to BanterRoom entirely through the pre-existing Report mechanism. Known gap, disclosed not hidden: no moderator 'reactivate' action -- only the room creator's own PATCH can set status back to active.</w:t>
+            </w:r>
+          </w:p>
+        </w:tc>
+      </w:tr>
+      <w:tr>
+        <w:tc>
+          <w:tcPr>
+            <w:tcW w:type="dxa" w:w="500"/>
+          </w:tcPr>
+          <w:p>
+            <w:r>
+              <w:t>358</w:t>
+            </w:r>
+          </w:p>
+        </w:tc>
+        <w:tc>
+          <w:tcPr>
+            <w:tcW w:type="dxa" w:w="4700"/>
+          </w:tcPr>
+          <w:p>
+            <w:r>
+              <w:t>Bants room-list filters -- the Figma Date control (2459:7671 desktop, 5803:8876 mobile) has no backing timestamp: BanterRoom had no createdAt, so a real date-range filter was impossible. Founder decision: add the column for real rather than fake the filter.</w:t>
+            </w:r>
+          </w:p>
+        </w:tc>
+        <w:tc>
+          <w:tcPr>
+            <w:tcW w:type="dxa" w:w="1850"/>
+          </w:tcPr>
+          <w:p>
+            <w:r>
+              <w:t>feat/banter-filter-modal (figma-to-code, 2026-10-04)</w:t>
+            </w:r>
+          </w:p>
+        </w:tc>
+        <w:tc>
+          <w:tcPr>
+            <w:tcW w:type="dxa" w:w="2300"/>
+          </w:tcPr>
+          <w:p>
+            <w:r>
+              <w:t>Resolved -- implemented. Additive schema change: BanterRoom.createdAt DateTime @default(now()) (migration 20261004010542_add_banter_room_created_at). Filter-only, NOT a sort key: the room catalogue stays alphabetical by name and its cursor is unchanged. Rooms created before this column read as the migration run time, since there was no timestamp to backfill from. GET /banter-rooms and /search accept dateFrom/dateTo: inclusive, whole UTC days for date-only input, a full timestamp taken as given; dateFrom after dateTo is a 400. Categories in the desktop modal and mobile panel are the scopeType filter, single-select. The Figma Categories row reads All / My Bants instead, a flagged mismatch pending founder review.</w:t>
             </w:r>
           </w:p>
         </w:tc>

</xml_diff>

<commit_message>
feat(users): represented club field, selector screen, and Leaderboard wiring
Adds User.representedClubId (explicit "RepresentedClub" relation, ON DELETE
SET NULL) and PATCH /users/:id/represented-club, which only accepts a club
the caller has joined and treats null as unrepresent. GET /users/:id now
returns the represented club. Leaving the represented club clears it in the
same transaction. Builds the selector at /settings/account/club-representation
and replaces the Leaderboard CLUB filter's local stub with the real value.
Decision Log #74 and #128 forward-pointers added.

Co-Authored-By: Claude Sonnet 5 <noreply@anthropic.com>
</commit_message>
<xml_diff>
--- a/docs/Soccernity_MVP_Build_Plan_v1.7.docx
+++ b/docs/Soccernity_MVP_Build_Plan_v1.7.docx
@@ -12786,6 +12786,12 @@
             <w:r>
               <w:t>Resolved (design). New standalone “Which Club Do I Represent — Selector” screen, desktop + mobile, placed next to the Club Picker family and re-using its shell/card language. Lists the user's current club memberships; radio-select exactly one (first pre-selected); a green-tint banner states the rule (“Only one represented club counts for points — joining or leaving other club pages doesn't change this”); CTA “Save represented club”. Natural entry point is Settings (not built here). Backend requirement PARKED: persisting the represented club needs a real field/endpoint — distinct from ClubPage membership, and arguably what User.clubAffiliationId was always for (nothing writes it today). This is the concrete artifact the open “which club does the club axis mean?” Leaderboard question now depends on.  [Related: sprint-2/club-fan-page-backend built GET /clubs/:id/members as a roster over ClubPage.members (fan-page membership) -- NOT the represented-club field this entry describes, which still does not exist. When represented-club lands, whether the club roster should show fans vs. representers is an open question -- see #217.]</w:t>
             </w:r>
+            <w:r>
+              <w:rPr>
+                <w:sz w:val="16"/>
+              </w:rPr>
+              <w:t xml:space="preserve"> Forward-pointer (sprint-2/represented-club-field): the represented-club field, its endpoint (PATCH /users/:id/represented-club, membership-validated, null = unrepresent), GET /users/:id exposure, the selector screen (Figma 5570:7813 / 5570:7887, entry point Settings &gt; Account &gt; Club representation) and the Leaderboard CLUB filter reading the real value are now built. Stored as User.representedClubId (explicit relation "RepresentedClub", ON DELETE SET NULL, cleared when the user leaves that club). See the PR for detail.</w:t>
+            </w:r>
           </w:p>
         </w:tc>
       </w:tr>
@@ -15087,6 +15093,12 @@
           <w:p>
             <w:r>
               <w:t>Resolved by the founder: the Per-Club Leaderboard scope filters by the single represented club chosen on the "Which Club Do I Represent" selector (Decision Log #74), backed by User.clubMemberships — not raw ClubPage membership, and not User.clubAffiliationId. A user with multiple club-page memberships still only scores/ranks under the one club they've explicitly chosen to represent; joining or leaving other club pages never changes which club's Leaderboard they count toward. Backend requirement (parked, not yet built — backend is paused): a real field persisting the represented club and an endpoint to set/change it, distinct from ClubPage membership itself.</w:t>
+            </w:r>
+            <w:r>
+              <w:rPr>
+                <w:sz w:val="16"/>
+              </w:rPr>
+              <w:t xml:space="preserve"> Forward-pointer (sprint-2/represented-club-field): the represented-club field this entry depends on now exists (User.representedClubId, Decision Log #74). The Leaderboard club-axis wiring is therefore UNBLOCKED but NOT built: PointsLedgerEntry.clubId is still never populated at award sites, GET /leaderboard has no ?clubId= filter, and "By club" remains disabled on the Overall board. Natural next candidate for a follow-up PR; the Leaderboard CLUB dropdown is currently a local view filter only.</w:t>
             </w:r>
           </w:p>
         </w:tc>

</xml_diff>

<commit_message>
docs: record Bants Categories resolution on Decision Log #187 and #358
Founder resolved the apparent Categories mismatch: the built scopeType
filter is correct, and the All / My Bants labels in Figma were the error.
Adds forward-pointers to #187 and #358 and a CLAUDE.md sprint entry.

Co-Authored-By: Claude Sonnet 5 <noreply@anthropic.com>
</commit_message>
<xml_diff>
--- a/docs/Soccernity_MVP_Build_Plan_v1.7.docx
+++ b/docs/Soccernity_MVP_Build_Plan_v1.7.docx
@@ -17618,6 +17618,9 @@
             <w:r>
               <w:t>Recorded, not a defect: the split is deliberate and consistent. Consequence -- Date and Tag do NOT appear on the mobile results screens, and the mobile filter flow has one more step than desktop. Logged so figma-to-code does not read the missing Date/Tag on 5650:8221 / 5980:10881 as an omission and re-add them. Forward-pointer (2026-10-04, feat/banter-filter-modal): the filter UI is now built -- a desktop filter modal and a mobile two-screen flow (Decision Log #358). Categories is single-select, as this entry's Figma check found. The Figma Categories row reads All / My Bants, but the built control is the scopeType filter (club / league / country / topic) the brief specified -- a flagged mismatch for founder review.</w:t>
             </w:r>
+            <w:r>
+              <w:t xml:space="preserve"> Forward-pointer (2026-10-04, founder-resolved): Categories is the intended scope-type grouping (club / league / country / topic, single-select, All = no scope filter). The "flagged mismatch pending founder review" line above is now closed. The Figma file's All / My Bants labels on 2459:10049 / 5803:8876 were the error and are being corrected in Figma separately; the built filter needed no change.</w:t>
+            </w:r>
           </w:p>
         </w:tc>
       </w:tr>
@@ -25167,6 +25170,9 @@
           <w:p>
             <w:r>
               <w:t>Resolved -- implemented. Additive schema change: BanterRoom.createdAt DateTime @default(now()) (migration 20261004010542_add_banter_room_created_at). Filter-only, NOT a sort key: the room catalogue stays alphabetical by name and its cursor is unchanged. Rooms created before this column read as the migration run time, since there was no timestamp to backfill from. GET /banter-rooms and /search accept dateFrom/dateTo: inclusive, whole UTC days for date-only input, a full timestamp taken as given; dateFrom after dateTo is a 400. Categories in the desktop modal and mobile panel are the scopeType filter, single-select. The Figma Categories row reads All / My Bants instead, a flagged mismatch pending founder review.</w:t>
+            </w:r>
+            <w:r>
+              <w:t xml:space="preserve"> Forward-pointer (2026-10-04, founder-resolved): the build is confirmed correct. Categories is the scopeType filter, and the "flagged mismatch pending founder review" framing above is superseded and closed. Only the Figma source (All / My Bants labels on 2459:10049 / 5803:8876) needed fixing, being done separately in Figma.</w:t>
             </w:r>
           </w:p>
         </w:tc>

</xml_diff>

<commit_message>
docs: record completed Bants Categories chip fix on Decision Log #187 and #358
Figma now shows All / Club / League / Country / Topic on the two desktop
state-variant duplicates and the mobile results chip rows, and the
mobile results row drops Players/Events (never real scopeType values).

Co-Authored-By: Claude Sonnet 5 <noreply@anthropic.com>
</commit_message>
<xml_diff>
--- a/docs/Soccernity_MVP_Build_Plan_v1.7.docx
+++ b/docs/Soccernity_MVP_Build_Plan_v1.7.docx
@@ -17621,6 +17621,9 @@
             <w:r>
               <w:t xml:space="preserve"> Forward-pointer (2026-10-04, founder-resolved): Categories is the intended scope-type grouping (club / league / country / topic, single-select, All = no scope filter). The "flagged mismatch pending founder review" line above is now closed. The Figma file's All / My Bants labels on 2459:10049 / 5803:8876 were the error and are being corrected in Figma separately; the built filter needed no change.</w:t>
             </w:r>
+            <w:r>
+              <w:t xml:space="preserve"> Forward-pointer (2026-10-04, figma-to-code/figma follow-up): the Categories fix is now complete across all four frames, not only the two originally touched. 2459:10083 and 2459:12447 (desktop state-variant duplicates of the filter modal) now carry the same five chips, All / Club / League / Country / Topic, matching 2459:10049. The mobile results-screen category chip row (5650:8221 and 5980:10881) was reconciled to the same four-value taxonomy. "Players" and "Events" were dropped from that row as never-real scopeType values (not a deferred feature), founder-confirmed rather than silently decided, and "Topic" was added. Singular labels (Club, not Clubs) were used on that row because the plural style is not an established convention for chip rows in this file.</w:t>
+            </w:r>
           </w:p>
         </w:tc>
       </w:tr>
@@ -25173,6 +25176,9 @@
             </w:r>
             <w:r>
               <w:t xml:space="preserve"> Forward-pointer (2026-10-04, founder-resolved): the build is confirmed correct. Categories is the scopeType filter, and the "flagged mismatch pending founder review" framing above is superseded and closed. Only the Figma source (All / My Bants labels on 2459:10049 / 5803:8876) needed fixing, being done separately in Figma.</w:t>
+            </w:r>
+            <w:r>
+              <w:t xml:space="preserve"> Forward-pointer (2026-10-04, figma-to-code/figma follow-up): the Categories fix is now complete across all four frames, not only the two originally touched. 2459:10083 and 2459:12447 (desktop state-variant duplicates of the filter modal) now carry the same five chips, All / Club / League / Country / Topic, matching 2459:10049. The mobile results-screen category chip row (5650:8221 and 5980:10881) was reconciled to the same four-value taxonomy. "Players" and "Events" were dropped from that row as never-real scopeType values (not a deferred feature), founder-confirmed rather than silently decided, and "Topic" was added. Singular labels (Club, not Clubs) were used on that row because the plural style is not an established convention for chip rows in this file.</w:t>
             </w:r>
           </w:p>
         </w:tc>

</xml_diff>

<commit_message>
feat(banter): free-text Tag search matching Figma spec
The Bants Tag control was an exact-topicId dropdown, which did not match
Figma 2459:14464's free-text spec. Replaces it with a single tagQuery
input matched case-insensitively across topic name, creator displayName
and scoped club name. League/country scopes have no backing table and
stay unsearchable (Decision Log #359).

Co-Authored-By: Claude Sonnet 5 <noreply@anthropic.com>
</commit_message>
<xml_diff>
--- a/docs/Soccernity_MVP_Build_Plan_v1.7.docx
+++ b/docs/Soccernity_MVP_Build_Plan_v1.7.docx
@@ -17624,6 +17624,9 @@
             <w:r>
               <w:t xml:space="preserve"> Forward-pointer (2026-10-04, figma-to-code/figma follow-up): the Categories fix is now complete across all four frames, not only the two originally touched. 2459:10083 and 2459:12447 (desktop state-variant duplicates of the filter modal) now carry the same five chips, All / Club / League / Country / Topic, matching 2459:10049. The mobile results-screen category chip row (5650:8221 and 5980:10881) was reconciled to the same four-value taxonomy. "Players" and "Events" were dropped from that row as never-real scopeType values (not a deferred feature), founder-confirmed rather than silently decided, and "Topic" was added. Singular labels (Club, not Clubs) were used on that row because the plural style is not an established convention for chip rows in this file.</w:t>
             </w:r>
+            <w:r>
+              <w:t xml:space="preserve"> Forward-pointer (2026-10-04, feat/banter-tag-freetext-search): the Tag control is now free text, not the exact-topicId dropdown -- see #359.</w:t>
+            </w:r>
           </w:p>
         </w:tc>
       </w:tr>
@@ -25179,6 +25182,51 @@
             </w:r>
             <w:r>
               <w:t xml:space="preserve"> Forward-pointer (2026-10-04, figma-to-code/figma follow-up): the Categories fix is now complete across all four frames, not only the two originally touched. 2459:10083 and 2459:12447 (desktop state-variant duplicates of the filter modal) now carry the same five chips, All / Club / League / Country / Topic, matching 2459:10049. The mobile results-screen category chip row (5650:8221 and 5980:10881) was reconciled to the same four-value taxonomy. "Players" and "Events" were dropped from that row as never-real scopeType values (not a deferred feature), founder-confirmed rather than silently decided, and "Topic" was added. Singular labels (Club, not Clubs) were used on that row because the plural style is not an established convention for chip rows in this file.</w:t>
+            </w:r>
+            <w:r>
+              <w:t xml:space="preserve"> Forward-pointer (2026-10-04, feat/banter-tag-freetext-search): the Tag control is now free text, not the exact-topicId dropdown -- see #359.</w:t>
+            </w:r>
+          </w:p>
+        </w:tc>
+      </w:tr>
+      <w:tr>
+        <w:tc>
+          <w:tcPr>
+            <w:tcW w:type="dxa" w:w="500"/>
+          </w:tcPr>
+          <w:p>
+            <w:r>
+              <w:t>359</w:t>
+            </w:r>
+          </w:p>
+        </w:tc>
+        <w:tc>
+          <w:tcPr>
+            <w:tcW w:type="dxa" w:w="4700"/>
+          </w:tcPr>
+          <w:p>
+            <w:r>
+              <w:t>Bants room-list Tag filter -- correction to the Tag field shipped under #187 / #358. The shipped control was an exact-topicId dropdown, which did not match Figma 2459:14464's own spec for that field: a single free-text input (placeholder "Input author name, club, etc."). This is a spec mismatch, not a UX upgrade of the dropdown.</w:t>
+            </w:r>
+          </w:p>
+        </w:tc>
+        <w:tc>
+          <w:tcPr>
+            <w:tcW w:type="dxa" w:w="1850"/>
+          </w:tcPr>
+          <w:p>
+            <w:r>
+              <w:t>feat/banter-tag-freetext-search (backend-api + figma-to-code, 2026-10-04)</w:t>
+            </w:r>
+          </w:p>
+        </w:tc>
+        <w:tc>
+          <w:tcPr>
+            <w:tcW w:type="dxa" w:w="2300"/>
+          </w:tcPr>
+          <w:p>
+            <w:r>
+              <w:t>Resolved -- implemented (feat/banter-tag-freetext-search, backend-api + figma-to-code, 2026-10-04). One free-text tagQuery param on GET /banter-rooms and /search, ANDed with scopeType, q and the date range. Case-insensitive substring match across three real join paths: the attached Topic name (BanterRoomTopic -&gt; Topic), the room creator's displayName, and the scoped club's live ClubPage.name for club-scoped rooms. The creator and club joins are raw SQL, because BanterRoom.createdBy is a bare String with no relation to User and scopeRef is a polymorphic id with no FK. Prisma cannot express either as a relational filter. The topicId param stays in the API for backward compatibility; the web client no longer sends it. GET /banter-rooms/topics stays but the web client no longer loads it. CLUB PART: BUILT, for club-scoped rooms only. LEAGUE/COUNTRY PART: NOT BUILT -- REAL SCHEMA GAP. The schema has no League or Country table, so league and country rooms carry a null scopeRef and there is nothing to match on. Searching by league or country name cannot filter anything today. Flagged for founder review, not built around. Figma text check: the frame's text layer reads "Input author name, club, et.c". The brief asked for "etc."; "etc." is used. Pending founder confirmation of the intended spelling. Note: no #371 row exists in this table (highest prior entry was #358); this entry is #359.</w:t>
             </w:r>
           </w:p>
         </w:tc>

</xml_diff>

<commit_message>
docs: record All as the confirmed Categories default on mobile results frames
Decision Log #187 and #358 forward-pointers: the mobile results frames
5650:8221 and 5980:10881 now default to All active, matching every other
Categories frame in the Figma file.

Co-Authored-By: Claude Sonnet 5 <noreply@anthropic.com>
</commit_message>
<xml_diff>
--- a/docs/Soccernity_MVP_Build_Plan_v1.7.docx
+++ b/docs/Soccernity_MVP_Build_Plan_v1.7.docx
@@ -17627,6 +17627,9 @@
             <w:r>
               <w:t xml:space="preserve"> Forward-pointer (2026-10-04, feat/banter-tag-freetext-search): the Tag control is now free text, not the exact-topicId dropdown -- see #359.</w:t>
             </w:r>
+            <w:r>
+              <w:t xml:space="preserve"> Forward-pointer (2026-10-04, figma/categories-all-default-mobile): the active-chip-default inconsistency flagged above is now closed. All is the confirmed default across every Categories frame in the file, mobile and desktop, filter-form and results-view alike: the mobile results frames 5650:8221 and 5980:10881 were reconciled from Club-active to All-active (Club is now inactive; the Club chip layer renamed accordingly).</w:t>
+            </w:r>
           </w:p>
         </w:tc>
       </w:tr>
@@ -25185,6 +25188,9 @@
             </w:r>
             <w:r>
               <w:t xml:space="preserve"> Forward-pointer (2026-10-04, feat/banter-tag-freetext-search): the Tag control is now free text, not the exact-topicId dropdown -- see #359.</w:t>
+            </w:r>
+            <w:r>
+              <w:t xml:space="preserve"> Forward-pointer (2026-10-04, figma/categories-all-default-mobile): the active-chip-default inconsistency flagged above is now closed. All is the confirmed default across every Categories frame in the file, mobile and desktop, filter-form and results-view alike: the mobile results frames 5650:8221 and 5980:10881 were reconciled from Club-active to All-active (Club is now inactive; the Club chip layer renamed accordingly).</w:t>
             </w:r>
           </w:p>
         </w:tc>

</xml_diff>

<commit_message>
docs: record founder decision on Tag search scope (Decision Log #359)
Tag free-text search stays club/topic/author-only; league and country
rooms remain unsearchable because no League or Country tables exist.
Adding those tables is a separate decision.

Co-Authored-By: Claude Sonnet 5 <noreply@anthropic.com>
</commit_message>
<xml_diff>
--- a/docs/Soccernity_MVP_Build_Plan_v1.7.docx
+++ b/docs/Soccernity_MVP_Build_Plan_v1.7.docx
@@ -25233,6 +25233,11 @@
           <w:p>
             <w:r>
               <w:t>Resolved -- implemented (feat/banter-tag-freetext-search, backend-api + figma-to-code, 2026-10-04). One free-text tagQuery param on GET /banter-rooms and /search, ANDed with scopeType, q and the date range. Case-insensitive substring match across three real join paths: the attached Topic name (BanterRoomTopic -&gt; Topic), the room creator's displayName, and the scoped club's live ClubPage.name for club-scoped rooms. The creator and club joins are raw SQL, because BanterRoom.createdBy is a bare String with no relation to User and scopeRef is a polymorphic id with no FK. Prisma cannot express either as a relational filter. The topicId param stays in the API for backward compatibility; the web client no longer sends it. GET /banter-rooms/topics stays but the web client no longer loads it. CLUB PART: BUILT, for club-scoped rooms only. LEAGUE/COUNTRY PART: NOT BUILT -- REAL SCHEMA GAP. The schema has no League or Country table, so league and country rooms carry a null scopeRef and there is nothing to match on. Searching by league or country name cannot filter anything today. Flagged for founder review, not built around. Figma text check: the frame's text layer reads "Input author name, club, et.c". The brief asked for "etc."; "etc." is used. Pending founder confirmation of the intended spelling. Note: no #371 row exists in this table (highest prior entry was #358); this entry is #359.</w:t>
+            </w:r>
+          </w:p>
+          <w:p>
+            <w:r>
+              <w:t>Founder decision (2026-10-04): leave the Tag free-text search as club/topic/author-only for now. League and country rooms stay unsearchable via Tag, since no League or Country tables exist to match against. Adding those tables is a separate, larger decision, not undertaken here.</w:t>
             </w:r>
           </w:p>
         </w:tc>

</xml_diff>

<commit_message>
docs: record Figma etc. typo fix on Decision Log #359
Figma source text "et.c" corrected to "etc." on the three desktop Bants
filter frames, matching the built UI and the mobile frame. Spelling
question closed.

Co-Authored-By: Claude Sonnet 5 <noreply@anthropic.com>
</commit_message>
<xml_diff>
--- a/docs/Soccernity_MVP_Build_Plan_v1.7.docx
+++ b/docs/Soccernity_MVP_Build_Plan_v1.7.docx
@@ -25238,6 +25238,11 @@
           <w:p>
             <w:r>
               <w:t>Founder decision (2026-10-04): leave the Tag free-text search as club/topic/author-only for now. League and country rooms stay unsearchable via Tag, since no League or Country tables exist to match against. Adding those tables is a separate, larger decision, not undertaken here.</w:t>
+            </w:r>
+          </w:p>
+          <w:p>
+            <w:r>
+              <w:t>Spelling question closed (2026-10-04): the Figma source typo ("et.c") is fixed to "etc." across all three desktop Bants filter frames (2459:10063, 2459:12103, 2459:14467), matching what was already built and the mobile frame (5803:8914). Only the text content changed; position and size are untouched.</w:t>
             </w:r>
           </w:p>
         </w:tc>

</xml_diff>

<commit_message>
feat(leaderboard): build the By-club board for the viewer's represented club
Decision Log #128. Points are snapshotted to the represented club at award
time (no backfill), the rollup materializes a board per club, and GET
/leaderboard?clubId= serves only the caller's own represented club (403
otherwise). The Overall board's "By club" control is re-enabled, disabled
with a reason when the viewer represents no club.

Co-Authored-By: Claude Sonnet 5 <noreply@anthropic.com>
</commit_message>
<xml_diff>
--- a/docs/Soccernity_MVP_Build_Plan_v1.7.docx
+++ b/docs/Soccernity_MVP_Build_Plan_v1.7.docx
@@ -15099,6 +15099,11 @@
                 <w:sz w:val="16"/>
               </w:rPr>
               <w:t xml:space="preserve"> Forward-pointer (sprint-2/represented-club-field): the represented-club field this entry depends on now exists (User.representedClubId, Decision Log #74). The Leaderboard club-axis wiring is therefore UNBLOCKED but NOT built: PointsLedgerEntry.clubId is still never populated at award sites, GET /leaderboard has no ?clubId= filter, and "By club" remains disabled on the Overall board. Natural next candidate for a follow-up PR; the Leaderboard CLUB dropdown is currently a local view filter only.</w:t>
+            </w:r>
+          </w:p>
+          <w:p>
+            <w:r>
+              <w:t>Built (feat/leaderboard-by-club-filter, 2026-10-05). SNAPSHOT, NOT LIVE: PointsLedgerEntry.clubId is written at award time from the user's User.representedClubId, inside the award transaction (awardPoints). Basis: the field's own schema comment already specifies a snapshot at award time, and the ledger is append-only, matching the snapshot precedent of ConsentAuditRecord. DEFAULT TAKEN absent a specified rule, open to founder override; the live-join alternative is a one-line change. NO BACKFILL: pre-change rows stay NULL (unattributed). Backfilling from the current representedClubId would misattribute historical points. API: GET /leaderboard?clubId= returns the board for the caller's own represented club only; any other club, or any clubId with no represented club, is 403 (fresh server-side check). LeaderboardEntry gained clubId (default '' = Overall) with unique key (userId, period, clubId); the rollup writes a per-club board from attributed points. UI: "By club" on the Overall board is re-enabled for the viewer's represented club, disabled with a stated reason when there is none. Judgment call to confirm: contest weekly wins and crowns are attributed at judging time, not entry time.</w:t>
             </w:r>
           </w:p>
         </w:tc>

</xml_diff>

<commit_message>
feat(feed): DELETE /posts/:id hard-delete cascade + post author comment controls
Decision Log #360 (post deletion, founder decision) and #361 (commentPermission, hide).
Cascade on Comment/SavedPost/Like/PostHashtag/PostView -> Post; Hashtag.postCount decremented;
PATCH comment-settings, hide/unhide; web OwnPostMenu.

Co-Authored-By: Claude Sonnet 5.5 <noreply@anthropic.com>
</commit_message>
<xml_diff>
--- a/docs/Soccernity_MVP_Build_Plan_v1.7.docx
+++ b/docs/Soccernity_MVP_Build_Plan_v1.7.docx
@@ -25248,6 +25248,90 @@
           <w:p>
             <w:r>
               <w:t>Spelling question closed (2026-10-04): the Figma source typo ("et.c") is fixed to "etc." across all three desktop Bants filter frames (2459:10063, 2459:12103, 2459:14467), matching what was already built and the mobile frame (5803:8914). Only the text content changed; position and size are untouched.</w:t>
+            </w:r>
+          </w:p>
+        </w:tc>
+      </w:tr>
+      <w:tr>
+        <w:tc>
+          <w:tcPr>
+            <w:tcW w:type="dxa" w:w="500"/>
+          </w:tcPr>
+          <w:p>
+            <w:r>
+              <w:t>360</w:t>
+            </w:r>
+          </w:p>
+        </w:tc>
+        <w:tc>
+          <w:tcPr>
+            <w:tcW w:type="dxa" w:w="4700"/>
+          </w:tcPr>
+          <w:p>
+            <w:r>
+              <w:t>Post deletion -- DELETE /posts/:id was never built; what should deleting your own post remove?</w:t>
+            </w:r>
+          </w:p>
+        </w:tc>
+        <w:tc>
+          <w:tcPr>
+            <w:tcW w:type="dxa" w:w="1850"/>
+          </w:tcPr>
+          <w:p>
+            <w:r>
+              <w:t>feat/post-delete-and-comment-settings (backend-api + figma-to-code, 2026-10-04)</w:t>
+            </w:r>
+          </w:p>
+        </w:tc>
+        <w:tc>
+          <w:tcPr>
+            <w:tcW w:type="dxa" w:w="2300"/>
+          </w:tcPr>
+          <w:p>
+            <w:r>
+              <w:t>Resolved -- implemented (founder decision: a deleted post leaves no trace, including other users' comments, likes and saves on it; deliberate full hard-delete cascade, no soft-delete or tombstone). DELETE /posts/:id is author-only (404 before 403, 204 on success). Migration 20261005130000_post_delete_cascade_and_comment_settings added onDelete: Cascade to the five Post.id FKs that lacked it: Comment.post, SavedPost.post, Like.post, PostHashtag.post, PostView.post. ContestEntry.post already had onDelete: Cascade (already correct, unchanged). CORRECTED STALE COMMENT: Post.authorId's schema comment claimed Comment.post/SavedPost.post/Like.post already carried onDelete: Cascade -- that was false (none had an onDelete clause, i.e. Postgres RESTRICT); the comment is rewritten and is now true. The PostHashtag/PostView comments calling RESTRICT 'inert, no DELETE /posts/:id endpoint exists' are likewise replaced. Hashtag.postCount (the one denormalized counter on another row that depends on a post) is decremented floor-guarded in the same transaction; there is no per-user post-count column. DANGLING REFERENCES left on purpose: PointsLedgerEntry.refId stays (the ledger is historical and never retroactively altered, Decision Log #128 -- points earned stand even if the post is gone); Notification.payloadRefId stays (a user's own history) and NotificationsService already resolves a missing post to data: null, now covered by an e2e test so GET /notifications does not break. Frontend: 'Post options' &gt; 'Delete post' on the author's own PostCard with an inline confirm that states the cascade; the card removes itself on success.</w:t>
+            </w:r>
+          </w:p>
+        </w:tc>
+      </w:tr>
+      <w:tr>
+        <w:tc>
+          <w:tcPr>
+            <w:tcW w:type="dxa" w:w="500"/>
+          </w:tcPr>
+          <w:p>
+            <w:r>
+              <w:t>361</w:t>
+            </w:r>
+          </w:p>
+        </w:tc>
+        <w:tc>
+          <w:tcPr>
+            <w:tcW w:type="dxa" w:w="4700"/>
+          </w:tcPr>
+          <w:p>
+            <w:r>
+              <w:t>Comment controls for a post's author -- turn commenting off, restrict who can comment, hide individual comments</w:t>
+            </w:r>
+          </w:p>
+        </w:tc>
+        <w:tc>
+          <w:tcPr>
+            <w:tcW w:type="dxa" w:w="1850"/>
+          </w:tcPr>
+          <w:p>
+            <w:r>
+              <w:t>feat/post-delete-and-comment-settings (backend-api + figma-to-code, 2026-10-04)</w:t>
+            </w:r>
+          </w:p>
+        </w:tc>
+        <w:tc>
+          <w:tcPr>
+            <w:tcW w:type="dxa" w:w="2300"/>
+          </w:tcPr>
+          <w:p>
+            <w:r>
+              <w:t>Resolved -- implemented. Post.commentPermission String @default('everyone') (service-enforced allow-list, BanterRoom.scopeType convention): everyone = anyone; followers = the commenter must follow the post's author (Follow.followerId = commenter, followeeId = author, i.e. the author's followers); off = nobody but the author. The author can always comment on their own post. Enforced in POST /posts/:id/comments with a 403; it only gates NEW comments and never retroactively removes existing ones. PATCH /posts/:id/comment-settings is author-only. HIDE, NOT DELETE: Comment.hidden Boolean @default(false) via PATCH /posts/:id/comments/:commentId/hide and /unhide (two idempotent routes, post author only; 404 if the comment is not on that post). The row stays, so it is still removed by the post-deletion cascade (Decision Log #360) and the commenter keeps their copy; deleting someone else's comment is deliberately NOT added and would be a separate founder decision. Hidden-comment visibility in GET /posts/:id/comments: excluded for everyone except the post's author (sees all, flagged hidden) and the comment's own author (still sees their own hidden comment, flagged, so it does not vanish unexplained). commentCount EXCLUDES hidden comments (it reflects what is visibly there): hide decrements (floor-guarded), unhide increments, in the same transaction as the flag flip, guarded so a repeat call never double-adjusts; deleting an already-hidden comment does not decrement again. Frontend note: the brief wrote 'people I follow' for the restricted option, but the confirmed backend rule is the commenter following the author, so the UI labels it 'People who follow me'. POST_SELECT now exposes commentPermission so the author's menu shows current state.</w:t>
             </w:r>
           </w:p>
         </w:tc>

</xml_diff>

<commit_message>
docs: resolve Decision Log #4 and #203 (signed off), forward-pointer on #42, CLAUDE.md status
Co-Authored-By: Claude Sonnet 5.5 <noreply@anthropic.com>
</commit_message>
<xml_diff>
--- a/docs/Soccernity_MVP_Build_Plan_v1.7.docx
+++ b/docs/Soccernity_MVP_Build_Plan_v1.7.docx
@@ -8620,7 +8620,7 @@
                 <w:sz w:val="19"/>
                 <w:szCs w:val="19"/>
               </w:rPr>
-              <w:t>Open — blocks Section 8.1 DPIA sign-off | Forward-pointer (2026-09-20, docs/dpia-draft-refresh): still Open and not decided. docs/sprint-1-dpia-outline-draft.md has been refreshed to v0.2 against the merged code (R2 and R6 rewritten; R13 under-16 tier and R14 age-reclassification added; R4/R5/R12 corrected) and is ready to be sent to counsel alongside docs/legal-copy-draft-tos-privacy-policy.md v0.3. This narrows the DPIA's factual gaps ahead of counsel's first full review; it is NOT progress toward sign-off - the Section 6 sign-off block is empty, and #4 (and #8) remain the interdependent open items the DPIA depends on. | Forward-pointer (2026-09-22, EU/US extension, PRs #296-#299): still Open and not decided. docs/sprint-1-dpia-outline-draft.md was extended to v0.3, adding a real (not-yet-counsel-reviewed) EU GDPR and US COPPA analysis (Sections 2.5 and 2.6) against the actual codebase. A technical control was built and merged: PR #297 added a card-charge verifiable-parental-consent step for the declared-under-13, US/undeclared-country band, on top of the existing email-link flow, and PR #298 added an hourly sweep fixing a refund-retry gap in that control. docs/legal-copy-draft-tos-privacy-policy.md was updated to v0.6 (PR #299) to describe the above accurately and to remove the blanket claim that Soccernity complies with all applicable data-protection and online-safety laws; it does not assert COPPA or GDPR compliance anywhere. What #4 is actually still waiting on: (a) whether an Article 27 EU representative is required (DPIA Section 2.5.1, undetermined); (b) whether the card-verification control plus the rest of Soccernity's practices amount to full COPPA compliance (not determined - the control addresses one FTC-listed method and is not a complete assessment); (c) counsel's first full review of the DPIA and legal copy, which has not happened. Assembling this material is NOT sign-off - the DPIA Section 6 sign-off block remains empty.</w:t>
+              <w:t>Resolved — signed off. Counsel approved the legal copy with amendments (sign-off signature block dated, checklist fully ticked). Scope now reaches UK, Nigeria, US and EU; no EU or other representative is required; card verification (PRs #297/#298) is the COPPA control for now, with no further step unless a regulator requires one. Applied to the prose in docs/legal-copy-draft-tos-privacy-policy.md v0.7 (branch legal/tos-pp-rewrite-post-signoff, PR #381). Previously Open (blocks Section 8.1 DPIA sign-off); the dated forward-pointers that follow are history and are superseded by this resolution. | Forward-pointer (2026-09-20, docs/dpia-draft-refresh): still Open and not decided. docs/sprint-1-dpia-outline-draft.md has been refreshed to v0.2 against the merged code (R2 and R6 rewritten; R13 under-16 tier and R14 age-reclassification added; R4/R5/R12 corrected) and is ready to be sent to counsel alongside docs/legal-copy-draft-tos-privacy-policy.md v0.3. This narrows the DPIA's factual gaps ahead of counsel's first full review; it is NOT progress toward sign-off - the Section 6 sign-off block is empty, and #4 (and #8) remain the interdependent open items the DPIA depends on. | Forward-pointer (2026-09-22, EU/US extension, PRs #296-#299): still Open and not decided. docs/sprint-1-dpia-outline-draft.md was extended to v0.3, adding a real (not-yet-counsel-reviewed) EU GDPR and US COPPA analysis (Sections 2.5 and 2.6) against the actual codebase. A technical control was built and merged: PR #297 added a card-charge verifiable-parental-consent step for the declared-under-13, US/undeclared-country band, on top of the existing email-link flow, and PR #298 added an hourly sweep fixing a refund-retry gap in that control. docs/legal-copy-draft-tos-privacy-policy.md was updated to v0.6 (PR #299) to describe the above accurately and to remove the blanket claim that Soccernity complies with all applicable data-protection and online-safety laws; it does not assert COPPA or GDPR compliance anywhere. What #4 is actually still waiting on: (a) whether an Article 27 EU representative is required (DPIA Section 2.5.1, undetermined); (b) whether the card-verification control plus the rest of Soccernity's practices amount to full COPPA compliance (not determined - the control addresses one FTC-listed method and is not a complete assessment); (c) counsel's first full review of the DPIA and legal copy, which has not happened. Assembling this material is NOT sign-off - the DPIA Section 6 sign-off block remains empty.</w:t>
             </w:r>
           </w:p>
         </w:tc>
@@ -11439,6 +11439,9 @@
               <w:br/>
               <w:t>NIGERIA (NDPA) CROSS-CHECK, now fully resolved: founder research confirmed consent VALIDITY needs no separate NDPA expiry timer (matches Decision Log #8/#10's existing approach, no change needed). On the separate question of a guardian-initiated withdrawal path: founder decision is that no dedicated withdrawal/revoke endpoint is needed — POST /auth/delete-account (whoever controls the account invokes it) IS the withdrawal mechanism for both jurisdictions, following this entry's same 30-day-grace + hard-delete + 6-month separately-retained-consent-record model uniformly, not a UK-vs-Nigeria split. See Decision Log #43 — closed, not needed, same founder call. One residual note, not a blocker: this assumes whoever initiates account deletion (which today can be the minor's own authenticated session, not necessarily the guardian) satisfies NDPA's guardian-withdrawal-notice requirement — that equivalence hasn't been separately confirmed with counsel, but is accepted here as the founder's considered call, not an oversight.  //  SEE ALSO Decision Log #59 (the account-deletion-requested notification email, designed in sprint-2/retrofit-screen-build-auth-email so the 30-day grace period this entry describes is actually surfaced to the user). FORWARD-POINTER: point (2) "hard-deleted, not anonymized" is superseded by Decision Log #341 - the User row is now anonymized in place (accountStatus 'deleted'); the 30-day grace period and the ConsentAuditRecord retention (points 1 and 3) are unchanged.</w:t>
             </w:r>
+            <w:r>
+              <w:t xml:space="preserve"> Forward-pointer (2026-10-05, PR #381): Decision Log #4 is now Resolved — signed off; the NDPA retention-window cross-check noted above is no longer tied to #4 and remains a Nigerian-counsel confirmation item in the legal copy draft (Part C row 14).</w:t>
+            </w:r>
           </w:p>
         </w:tc>
       </w:tr>
@@ -18333,7 +18336,7 @@
           </w:tcPr>
           <w:p>
             <w:r>
-              <w:t>Open -- blocks figma-to-code conversion of Terms of Service / Privacy Policy until real, counsel-reviewed copy exists. Dispatch safeguarding-drafter for a first-pass draft.</w:t>
+              <w:t>Resolved — signed off. PLAINLY: the sign-off covers the DECISIONS — all 82 comments on the reviewed draft were worked through, counsel approved with amendments, and the checklist is ticked. It does NOT yet cover the live prose or the entity/date placeholders. (a) The legal entity name, registration number and registered address placeholder remains unfilled, pending re-registration (the founder's own comment on the reviewed draft) — not yet done. (b) The Effective Date placeholder remains unfilled. (c) PR #381 (branch legal/tos-pp-rewrite-post-signoff) is what actually rewrites the prose per the resolved comments (v0.7); that rewrite is itself still draft output per non-negotiable #2 and has not been re-read by counsel. (d) A pre-publication sensitive-content-screen obligation was identified during this review (Russmedia, CJEU). This is NOT part of #203's closure — it is a separate product/engineering gap, tracked as its own new Decision Log entry in a companion PR. The dated notes below (DRAFT NOW EXISTS, v0.3, 'REMAINS OPEN') are history and are superseded by this resolution.</w:t>
             </w:r>
           </w:p>
           <w:p>

</xml_diff>

<commit_message>
security: encrypt User.dateOfBirth at rest (AES-256-GCM), backfill existing rows
Counsel comment 26 proposed hashing; DOB's tiny keyspace makes any hash
brute-forceable and the product must read the real value. Encrypt instead.
Decision Log #362.

Co-Authored-By: Claude Sonnet 5.5 <noreply@anthropic.com>
</commit_message>
<xml_diff>
--- a/docs/Soccernity_MVP_Build_Plan_v1.7.docx
+++ b/docs/Soccernity_MVP_Build_Plan_v1.7.docx
@@ -25335,6 +25335,48 @@
           <w:p>
             <w:r>
               <w:t>Resolved -- implemented. Post.commentPermission String @default('everyone') (service-enforced allow-list, BanterRoom.scopeType convention): everyone = anyone; followers = the commenter must follow the post's author (Follow.followerId = commenter, followeeId = author, i.e. the author's followers); off = nobody but the author. The author can always comment on their own post. Enforced in POST /posts/:id/comments with a 403; it only gates NEW comments and never retroactively removes existing ones. PATCH /posts/:id/comment-settings is author-only. HIDE, NOT DELETE: Comment.hidden Boolean @default(false) via PATCH /posts/:id/comments/:commentId/hide and /unhide (two idempotent routes, post author only; 404 if the comment is not on that post). The row stays, so it is still removed by the post-deletion cascade (Decision Log #360) and the commenter keeps their copy; deleting someone else's comment is deliberately NOT added and would be a separate founder decision. Hidden-comment visibility in GET /posts/:id/comments: excluded for everyone except the post's author (sees all, flagged hidden) and the comment's own author (still sees their own hidden comment, flagged, so it does not vanish unexplained). commentCount EXCLUDES hidden comments (it reflects what is visibly there): hide decrements (floor-guarded), unhide increments, in the same transaction as the flag flip, guarded so a repeat call never double-adjusts; deleting an already-hidden comment does not decrement again. Frontend note: the brief wrote 'people I follow' for the restricted option, but the confirmed backend rule is the commenter following the author, so the UI labels it 'People who follow me'. POST_SELECT now exposes commentPermission so the author's menu shows current state.</w:t>
+            </w:r>
+          </w:p>
+        </w:tc>
+      </w:tr>
+      <w:tr>
+        <w:tc>
+          <w:tcPr>
+            <w:tcW w:type="dxa" w:w="500"/>
+          </w:tcPr>
+          <w:p>
+            <w:r>
+              <w:t>362</w:t>
+            </w:r>
+          </w:p>
+        </w:tc>
+        <w:tc>
+          <w:tcPr>
+            <w:tcW w:type="dxa" w:w="4700"/>
+          </w:tcPr>
+          <w:p>
+            <w:r>
+              <w:t>DOB storage: encryption, not hashing (resolves counsel-review comment 26).</w:t>
+            </w:r>
+          </w:p>
+        </w:tc>
+        <w:tc>
+          <w:tcPr>
+            <w:tcW w:type="dxa" w:w="1850"/>
+          </w:tcPr>
+          <w:p>
+            <w:r>
+              <w:t>security/dob-field-encryption (backend-api, 2026-10-05)</w:t>
+            </w:r>
+          </w:p>
+        </w:tc>
+        <w:tc>
+          <w:tcPr>
+            <w:tcW w:type="dxa" w:w="2300"/>
+          </w:tcPr>
+          <w:p>
+            <w:r>
+              <w:t>Resolved -- built. Hashing (counsel comment 26's proposal) rejected for two reasons: (1) DOB has a tiny, enumerable keyspace (~36,500 realistic values), so any password-grade hash is trivially brute-forced offline once stolen -- hashing cost cannot help against a search space that small; (2) the product must read the real value on an ongoing basis (guardian-consent logic, minor/adult classification, the daily age-reclassification sweep, Decision Log #349), which a one-way hash can never provide. Encrypted at rest instead: User.dateOfBirth (the only place DOB is stored; ConsentAuditRecord holds no DOB) is now TEXT holding AES-256-GCM ciphertext (v1:&lt;iv&gt;:&lt;tag&gt;:&lt;ct&gt;, fresh IV per value, authenticated), via DobEncryptionService called explicitly (not a Prisma middleware, which would make the generated string type lie). Key: DOB_ENCRYPTION_KEY env var (32 bytes base64), same handling as JWT_SECRET (Decision Log #7): no code default, placeholder rejected, set in Render's dashboard, held separately from the data. Existing rows backfilled, not just new writes: migration 20261005140000 converts the column, and src/scripts/backfill-dob-encryption.ts (run by Render's preDeployCommand right after migrate) encrypts every row; idempotent, and reversible only via the documented --rollback path (docs/dob-encryption-rollback.md). Decrypt is strict: plaintext is refused, never silently served. Consequence: the age sweep can no longer range-query DOB in SQL; it pages all accounts with a DOB and decrypts in memory. Losing the key makes every DOB unrecoverable -- back it up with the other secrets.</w:t>
             </w:r>
           </w:p>
         </w:tc>

</xml_diff>

<commit_message>
safeguarding: show guardian contact on a minor's profile to any viewer (until 18); bump consent screen to v2
Co-Authored-By: Claude Sonnet 5.5 <noreply@anthropic.com>
</commit_message>
<xml_diff>
--- a/docs/Soccernity_MVP_Build_Plan_v1.7.docx
+++ b/docs/Soccernity_MVP_Build_Plan_v1.7.docx
@@ -25377,6 +25377,48 @@
           <w:p>
             <w:r>
               <w:t>Resolved -- built. Hashing (counsel comment 26's proposal) rejected for two reasons: (1) DOB has a tiny, enumerable keyspace (~36,500 realistic values), so any password-grade hash is trivially brute-forced offline once stolen -- hashing cost cannot help against a search space that small; (2) the product must read the real value on an ongoing basis (guardian-consent logic, minor/adult classification, the daily age-reclassification sweep, Decision Log #349), which a one-way hash can never provide. Encrypted at rest instead: User.dateOfBirth (the only place DOB is stored; ConsentAuditRecord holds no DOB) is now TEXT holding AES-256-GCM ciphertext (v1:&lt;iv&gt;:&lt;tag&gt;:&lt;ct&gt;, fresh IV per value, authenticated), via DobEncryptionService called explicitly (not a Prisma middleware, which would make the generated string type lie). Key: DOB_ENCRYPTION_KEY env var (32 bytes base64), same handling as JWT_SECRET (Decision Log #7): no code default, placeholder rejected, set in Render's dashboard, held separately from the data. Existing rows backfilled, not just new writes: migration 20261005140000 converts the column, and src/scripts/backfill-dob-encryption.ts (run by Render's preDeployCommand right after migrate) encrypts every row; idempotent, and reversible only via the documented --rollback path (docs/dob-encryption-rollback.md). Decrypt is strict: plaintext is refused, never silently served. Consequence: the age sweep can no longer range-query DOB in SQL; it pages all accounts with a DOB and decrypts in memory. Losing the key makes every DOB unrecoverable -- back it up with the other secrets.</w:t>
+            </w:r>
+          </w:p>
+        </w:tc>
+      </w:tr>
+      <w:tr>
+        <w:tc>
+          <w:tcPr>
+            <w:tcW w:type="dxa" w:w="500"/>
+          </w:tcPr>
+          <w:p>
+            <w:r>
+              <w:t>363</w:t>
+            </w:r>
+          </w:p>
+        </w:tc>
+        <w:tc>
+          <w:tcPr>
+            <w:tcW w:type="dxa" w:w="4700"/>
+          </w:tcPr>
+          <w:p>
+            <w:r>
+              <w:t>Guardian contact shown on a minor's profile to any viewer (resolves legal-copy Part C row 32); widens what a guardian consents to.</w:t>
+            </w:r>
+          </w:p>
+        </w:tc>
+        <w:tc>
+          <w:tcPr>
+            <w:tcW w:type="dxa" w:w="1850"/>
+          </w:tcPr>
+          <w:p>
+            <w:r>
+              <w:t>safeguarding/guardian-contact-public-visibility (backend-api + figma-to-code, 2026-10-05)</w:t>
+            </w:r>
+          </w:p>
+        </w:tc>
+        <w:tc>
+          <w:tcPr>
+            <w:tcW w:type="dxa" w:w="2300"/>
+          </w:tcPr>
+          <w:p>
+            <w:r>
+              <w:t>Resolved -- built. New GET /users/:id/public-profile (any authenticated viewer; GET /users/:id stays self-only) returns only {id, displayName, guardianContact}. guardianContact = {label: 'Guardian contact', email} for EVERY current minor (under-16 and 16-17, not only under-16), same shape on the owner's own profile. It stops showing at 18 for both views: gated on isMinor AND on DOB &lt; 18 (decrypted per DOB encryption, Decision Log #362), so it disappears on the birthday rather than waiting up to ~24h for the age-reclassification sweep (#349); the surviving Guardian row never drives visibility. Visibility mirrors assertFollowGraphVisible: non-active accounts and restricted-pending minors (consent not confirmed) are a 404. Because this widens a guardian's consent beyond the earlier self-only assumption, CONSENT_SCREEN_VERSION is bumped v1 -&gt; v2 and the tripwire hash updated; GuardianConsentConfirmPage now tells the guardian their email is visible to logged-in users while the account holder is under 18 and is removed automatically at 18. Existing v1 confirmations are not retroactively re-consented (Guardian.consentScreenVersion records what each saw) -- OPEN for counsel: whether already-confirmed guardians must be notified or re-consent. Also OPEN: no frontend profile card consumes the endpoint yet (apps/web has no public profile page); the guardian-visible wording is still draft pending counsel.</w:t>
             </w:r>
           </w:p>
         </w:tc>

</xml_diff>

<commit_message>
safeguarding: let a minor change the guardian email while consent is pending (Decision Log #365)
POST /auth/guardian-consent/change-guardian-email restarts the consent flow
on the same Guardian row: fresh token (old link dies), fresh expiry,
auto-resend marker and card-verification progress reset, request sent to
the new address. Pending only; confirmed/declined are refused untouched.

Co-Authored-By: Claude Sonnet 5.5 <noreply@anthropic.com>
</commit_message>
<xml_diff>
--- a/docs/Soccernity_MVP_Build_Plan_v1.7.docx
+++ b/docs/Soccernity_MVP_Build_Plan_v1.7.docx
@@ -12202,7 +12202,7 @@
           </w:tcPr>
           <w:p>
             <w:r>
-              <w:t>Resolved (design): submitting a new guardian email RESTARTS the flow from scratch. The account returns to a pending state, the existing/old approval token is invalidated (the previous link stops working), and a fresh single-use request is sent to the new address. The guardian at the new address must approve before the account unlocks. The screen states all of this explicitly in a notice panel BEFORE the user submits. Rationale: a recorded consent (or a pending request) is tied to a specific guardian at a specific address — silently repointing it at a new address would mean the recorded/requested consent no longer corresponds to who was actually asked. Backend (not built in this Figma-only pass, flagged for when backend work resumes): a change-guardian-email endpoint that invalidates the old Guardian.consentToken, sets consentStatus back to pending, updates Guardian.email, and triggers a new consent email.</w:t>
+              <w:t>Resolved (design): submitting a new guardian email RESTARTS the flow from scratch. The account returns to a pending state, the existing/old approval token is invalidated (the previous link stops working), and a fresh single-use request is sent to the new address. The guardian at the new address must approve before the account unlocks. The screen states all of this explicitly in a notice panel BEFORE the user submits. Rationale: a recorded consent (or a pending request) is tied to a specific guardian at a specific address — silently repointing it at a new address would mean the recorded/requested consent no longer corresponds to who was actually asked. Backend (not built in this Figma-only pass, flagged for when backend work resumes): a change-guardian-email endpoint that invalidates the old Guardian.consentToken, sets consentStatus back to pending, updates Guardian.email, and triggers a new consent email.  //  RESOLVED (backend) by safeguarding/guardian-email-change-endpoint (Decision Log #365): the change-guardian-email endpoint this entry flagged is now built — POST /auth/guardian-consent/change-guardian-email, pending consent only, restarts the flow on the same Guardian row (old token invalidated, fresh expiry, auto-resend budget and card-verification progress reset, request sent to the new address). The Figma-side decision above is unchanged.</w:t>
             </w:r>
           </w:p>
         </w:tc>
@@ -25467,6 +25467,48 @@
           <w:p>
             <w:r>
               <w:t>Resolved -- built. User.username String? @unique (migration 20261005150000_add_user_username): optional, distinct from displayName (which stays the 'full name' used in emails and on the owner's own profile). Accepted as 3-30 chars of letters/digits/underscore in any case and STORED LOWERCASE, so the single unique index is case-insensitive; Postgres treats NULLs as distinct, so any number of users may have none (unique only where set). Set, changed or cleared (null) via the existing PATCH /users/:id; a duplicate is a 409 (a P2002 race is also a clean 409, never a 500). Anonymization (Decision Log #341) nulls the username, releasing the handle. PUBLIC NAME: one helper, users/public-name.util.ts (resolvePublicName = username, else displayName). Every API payload that shows a user to OTHER users now returns {id, publicName}: feed post and comment authors, saved posts, club and Community Group rosters, follower/following/suggested lists, GET /users/:id/public-profile, search (people and post authors), leaderboard rows, Contest winners/standings/admin entrants, DM otherParticipant, notification actors. The owner's own GET /users/:id and the login/register user summary keep displayName and add username + publicName. Emails, guardian-consent copy and the admin Users list keep the real displayName (admins see both). DELIBERATE BREAKING RENAME: on those other-facing payloads displayName is REPLACED by publicName rather than sent alongside it, because otherwise a user who chose a username would still have their real name readable straight off the response, defeating the pseudonym and contradicting the policy text ('your username or, if you have not set one, your display name'). The same reasoning applies to search: people search matches the PUBLIC name only (username, or displayName only when no username is set), so a real name cannot be used to find the account behind a username; Bants 'Tag' search matches a room's creator on COALESCE(username, displayName). Applies to minors exactly as to adults (consistent with #45 and ToS 9.1). apps/web and apps/admin updated to consume publicName; the Edit Profile modal gains a plainly-built Username field (no Figma frame exists -- the Create Profile screen is still unbuilt). This is the username half of Decision Log #58's backend requirements and closes legal-copy Part C row 33 in code (the draft's own row still reads 'not built' and is left for the counsel-track maintainer to close; this entry does not edit that document). NOT DONE / OPEN: (1) rosters and people search still ORDER and paginate by displayName, so for a username holder the alphabetical order will not match the name shown -- fixing it needs a COALESCE(username, displayName) raw-SQL ordering and cursor; (2) no username moderation: no reserved-word list, no impersonation/profanity screening, no change cooldown or rate limit, no admin tool to reassign or revoke a handle -- a real gap on a platform with minors and public names; (3) username is not collected at registration (set afterwards via Edit Profile), and avatar/bio/location from #58 remain unbuilt; (4) the Leaderboard/Contest admin judging screens now show the public name, not the real name. Verification (all re-run, not estimated): mocked suite 115 suites / 1746 tests, 0 failures; e2e (real Postgres) 35 suites / 350 tests -- 348 pass, 2 fail in sports.e2e-spec.ts only (the pre-existing local-env failures noted under #362: a real Highlightly key in the local .env leaks live matches into assertions; unrelated), including the new test/username.e2e-spec.ts (16 tests: unique-where-set, case-insensitive 409, clear/re-claim, feed/comment/follower/public-profile/leaderboard use publicName and never leak displayName, people search by username but not by real name, anonymization releases the handle); apps/web 61 files / 552 tests, apps/admin 16 files / 163 tests, 0 failures; tsc, eslint and nest build clean.</w:t>
+            </w:r>
+          </w:p>
+        </w:tc>
+      </w:tr>
+      <w:tr>
+        <w:tc>
+          <w:tcPr>
+            <w:tcW w:type="dxa" w:w="500"/>
+          </w:tcPr>
+          <w:p>
+            <w:r>
+              <w:t>365</w:t>
+            </w:r>
+          </w:p>
+        </w:tc>
+        <w:tc>
+          <w:tcPr>
+            <w:tcW w:type="dxa" w:w="4700"/>
+          </w:tcPr>
+          <w:p>
+            <w:r>
+              <w:t>User-initiated guardian-email change while consent is pending (resolves legal-copy Part C row 34; builds the backend half of Decision Log #60).</w:t>
+            </w:r>
+          </w:p>
+        </w:tc>
+        <w:tc>
+          <w:tcPr>
+            <w:tcW w:type="dxa" w:w="1850"/>
+          </w:tcPr>
+          <w:p>
+            <w:r>
+              <w:t>safeguarding/guardian-email-change-endpoint (backend-api, 2026-10-05)</w:t>
+            </w:r>
+          </w:p>
+        </w:tc>
+        <w:tc>
+          <w:tcPr>
+            <w:tcW w:type="dxa" w:w="2300"/>
+          </w:tcPr>
+          <w:p>
+            <w:r>
+              <w:t>Resolved -- built. POST /auth/guardian-consent/change-guardian-email { email }: the MINOR (JWT sub; JwtAuthGuard only, not GuardianConsentGuard, rate-limited) replaces the guardian's email while Guardian.consentStatus is 'pending'. Per Decision Log #60 it RESTARTS the flow from scratch on the SAME Guardian row: email replaced, a fresh consentToken overwrites the @unique column (the old emailed link stops resolving), a fresh expiry window starts, consentAutoResentAt is cleared (the new guardian gets the full expiry-sweep treatment, not the old guardian's spent budget), and any card-verification progress is wiped (stripePaymentIntentId/cardVerifiedAt/cardRefundedAt -&gt; null; cardVerificationRequired stays frozen). The request is sent through the existing sendGuardianConsentEmail path to the new address. REFUSALS: confirmed consent -&gt; 409 and the row is untouched (swapping the approving guardian under a live approval would let a minor keep the approval while choosing who gave it; withdrawal is the path for that); declined -&gt; 409; no Guardian row / not a minor / reclassified adult (#349) -&gt; 404; same email as on file -&gt; 400; the MINOR'S OWN email -&gt; 400 (a minor must not approve their own request -- registration has no such check, this is new here and flagged); a card charge for the current guardian verified but not yet refunded -&gt; 409 (clearing it would orphan the charge from CardRefundRetrySweepService; the hourly sweep settles it, then retry). Writes are an updateMany whose where clause carries the current token and card state (optimistic lock), so a concurrent change/resend/confirm loses cleanly (409) and sends nothing. NOT BUILT / FLAGGED for founder + counsel: (a) the PREVIOUS guardian address is not notified that it was replaced (needs a new email template; useful tripwire against a minor swapping a parent for a stranger); (b) the guardian's name and relationship are not re-captured though the new address may be a different person (the Figma screen has an email field only); (c) no frontend wiring yet (Figma 5498:7164 / 5501:8536 exist); (d) the rate limit is the shared per-IP 'auth' bucket, not a per-minor cap, so a minor could still direct a handful of emails to arbitrary addresses. CONSENT_SCREEN_VERSION not bumped (guardian-visible consent wording unchanged). Zero schema change. Forward-pointer on #60; legal-copy Part C row 34 updated.</w:t>
             </w:r>
           </w:p>
         </w:tc>

</xml_diff>

<commit_message>
docs: Decision Log #367-#380 (flow, country, hold/purge rules, scope) and legal copy draft v0.8
Docs only. Not approved; nothing signed off. Founder states counsel agrees to guardian contact for all minors; everything else counsel review pending.

Co-Authored-By: Claude Sonnet 5.5 <noreply@anthropic.com>
</commit_message>
<xml_diff>
--- a/docs/Soccernity_MVP_Build_Plan_v1.7.docx
+++ b/docs/Soccernity_MVP_Build_Plan_v1.7.docx
@@ -24598,7 +24598,7 @@
           </w:tcPr>
           <w:p>
             <w:r>
-              <w:t>Resolved by design: NO purge timer, and none is to be built. Hard-deleting an anonymized User row later would defeat the whole point of #341's redesign. Post, Comment, Message and Result deliberately keep their FKs into that row so other users' content survives authored by '[deleted user]'; those FKs are RESTRICT again, so a later DELETE would either fail loudly or, if forced via CASCADE, remove real content belonging to uninvolved users - the exact harm #341 exists to prevent. The anonymized row holds no personal data (email is a deterministic placeholder, phone/dateOfBirth/clubAffiliationId null, unusable password hash, displayName '[deleted user]'), so GDPR Recital 26 puts it outside the regulation and there is no erasure obligation left for a timer to discharge. This is not an oversight; do not re-litigate it as a missing feature. ConsentAuditRecord keeps its own separate 6-month purge (#42) and is unaffected. Reopen only if counsel says an anonymized row still counts as personal data.</w:t>
+              <w:t>Resolved by design: NO purge timer, and none is to be built. Hard-deleting an anonymized User row later would defeat the whole point of #341's redesign. Post, Comment, Message and Result deliberately keep their FKs into that row so other users' content survives authored by '[deleted user]'; those FKs are RESTRICT again, so a later DELETE would either fail loudly or, if forced via CASCADE, remove real content belonging to uninvolved users - the exact harm #341 exists to prevent. The anonymized row holds no personal data (email is a deterministic placeholder, phone/dateOfBirth/clubAffiliationId null, unusable password hash, displayName '[deleted user]'), so GDPR Recital 26 puts it outside the regulation and there is no erasure obligation left for a timer to discharge. This is not an oversight; do not re-litigate it as a missing feature. ConsentAuditRecord keeps its own separate 6-month purge (#42) and is unaffected. Reopen only if counsel says an anonymized row still counts as personal data. Superseded by #375 (2026-10-12): anonymised rows of never-approved minors and of accounts with no content are now to be hard-deleted 30 days after anonymisation; content-bearing anonymised rows are still not purged pending counsel review.</w:t>
             </w:r>
           </w:p>
         </w:tc>
@@ -25551,6 +25551,594 @@
           <w:p>
             <w:r>
               <w:t>Resolved -- built. Opened following the #4/#203 legal-copy sign-off review: a 2026 CJEU ruling (Russmedia) holds that a platform publishing structured, distributed user content is a joint controller with a duty to screen for special-category disclosures BEFORE publication, not only moderate after a report. SCOPE: scoped against Grassroots record-keeping (Sprint 5) as the only live feature matching the CJEU's structured/published-listing shape (a public, structured record, not conversational chat). Discover/scout-matching is NOT covered and was not built against (0% built per Log Book Section 23.3). WHAT WAS BUILT: (1) a conservative, deliberately low-precision keyword/pattern screen (services/api/src/modules/sensitive-content/sensitive-content.util.ts) over UK/EU GDPR Art. 9(1) categories -- health, religion, ethnicity, sexual orientation, politics, trade union, biometric/genetic -- run against every free-text field Grassroots accepts: POST /teams (name, city) and POST /fixtures (opponentName, venue). No existing text-flagging utility existed to reuse (the Report queue is user-submitted, not content-scanned), so one small pure util was added; false positives are accepted, false negatives are the risk. There are no fixture-notes, result-description or player free-text fields in Grassroots today (Result is a score pair only). A dormant-team takeover is not screened (it republishes the already-public name/city unchanged). (2) Friction: a flagged submission without confirmSensitive: true is refused with a 422 (code sensitive_content_review_required, flagged field names + categories, never the text) and NOTHING is saved; the web register-team and schedule-fixture pages show 'This looks like it may mention something sensitive about someone -- are you sure you want to share this publicly?' with Edit / Share anyway. No silent auto-removal; the user decides, informed. Editing a screened field withdraws the warning so a confirmation always covers the exact text the person was warned about. The screen runs after the permission check, so a non-organiser learns nothing about it. (3) Logging: a flagged-and-confirmed submission writes a Report into the EXISTING Moderation Queue, in the same transaction as the record (reporterId null, no contact email -- the only system-generated report shape; reason prefixed '[Automated: pre-publication sensitive-content screen]' listing flagged field names and categories only). Report.targetType gained grassroots_team and fixture; the admin queue shows them as 'Grassroots team' / 'Grassroots fixture'. No schema change. NOT CLOSED -- FORWARD REQUIREMENT: Discover / scout-matching will need the same pre-publication screening once that pillar is built, and this entry's scope does not cover it; that is an open future requirement, not a closed gap. ALSO FLAGGED, NOT DECIDED: the word list is English-only and untuned; concernsMinor stays false on auto-logged reports (inferring it from leagueType school/academy is a candidate); Report has no source column, so the reason prefix is how a moderator recognises these; recording content_removed is a recorded decision, not enforced (as for every other target type); other free-text surfaces on the platform (posts, comments, Bants rooms, Community Groups, bios) are outside this entry and are moderated after-the-fact only. This is a technical control and not a legal conclusion on the extent of the Russmedia obligation.</w:t>
+            </w:r>
+          </w:p>
+        </w:tc>
+      </w:tr>
+      <w:tr>
+        <w:tc>
+          <w:tcPr>
+            <w:tcW w:type="dxa" w:w="500"/>
+          </w:tcPr>
+          <w:p>
+            <w:r>
+              <w:t>367</w:t>
+            </w:r>
+          </w:p>
+        </w:tc>
+        <w:tc>
+          <w:tcPr>
+            <w:tcW w:type="dxa" w:w="4700"/>
+          </w:tcPr>
+          <w:p>
+            <w:r>
+              <w:t>Sign-up flow, end to end, for minors and adults (replaces the as-coded flow the audit found, docs/mvp-coverage-audit.md Q9).</w:t>
+            </w:r>
+          </w:p>
+        </w:tc>
+        <w:tc>
+          <w:tcPr>
+            <w:tcW w:type="dxa" w:w="1850"/>
+          </w:tcPr>
+          <w:p>
+            <w:r>
+              <w:t>docs/decision-log-flow-country-hold-legal-v0.8 (docs only, 2026-10-12; founder decisions recorded from the MVP coverage audit review, docs/mvp-coverage-audit.md)</w:t>
+            </w:r>
+          </w:p>
+        </w:tc>
+        <w:tc>
+          <w:tcPr>
+            <w:tcW w:type="dxa" w:w="2300"/>
+          </w:tcPr>
+          <w:p>
+            <w:r>
+              <w:t>Resolved -- decided, NOT yet built. MINOR: Age Gate (date of birth + country) -&gt; Guardian details -&gt; submit -&gt; Register (account created, restricted-pending) -&gt; Restricted pending page (shown on every login) -&gt; guardian approves (plus card verification for a US under-13, the control built in PRs #297/#298) -&gt; Activation confirmation (its 'Go to my profile' action becomes 'Continue registration') -&gt; Create Profile -&gt; Club Picker -&gt; /. ADULT: Age Gate (date of birth + country) -&gt; Register -&gt; Create Profile -&gt; Club Picker -&gt; /. Date of birth is read-only after the Age Gate: Register and Create Profile show it auto-populated and Register has no date picker. Create Profile is blocked for a restricted-pending minor until approval. Preferred Club on Create Profile is optional free text and is run through the pre-publication sensitive-content screen (Decision Log #366, PR #388); the Club Picker follows regardless of what is entered. Bio is optional and screened. Email verification is required of every user before Create Profile. The 'What you can still do' copy on the restricted-pending page is rewritten to say registration cannot be completed until the guardian approves (including card verification where required). NOTE: the sensitive-content screen as built (#366) covers Grassroots free-text fields only; extending it to Preferred Club and Bio is new build work, not a given. OPEN, product call: a user who mistypes their date of birth at the Age Gate has no self-service correction path once it is read-only.</w:t>
+            </w:r>
+          </w:p>
+        </w:tc>
+      </w:tr>
+      <w:tr>
+        <w:tc>
+          <w:tcPr>
+            <w:tcW w:type="dxa" w:w="500"/>
+          </w:tcPr>
+          <w:p>
+            <w:r>
+              <w:t>368</w:t>
+            </w:r>
+          </w:p>
+        </w:tc>
+        <w:tc>
+          <w:tcPr>
+            <w:tcW w:type="dxa" w:w="4700"/>
+          </w:tcPr>
+          <w:p>
+            <w:r>
+              <w:t>Country: mandatory at the Age Gate, IP-derived at Register, derived value authoritative (supersedes the Guardian.declaredCountry-only design).</w:t>
+            </w:r>
+          </w:p>
+        </w:tc>
+        <w:tc>
+          <w:tcPr>
+            <w:tcW w:type="dxa" w:w="1850"/>
+          </w:tcPr>
+          <w:p>
+            <w:r>
+              <w:t>docs/decision-log-flow-country-hold-legal-v0.8 (docs only, 2026-10-12; founder decisions recorded from the MVP coverage audit review, docs/mvp-coverage-audit.md)</w:t>
+            </w:r>
+          </w:p>
+        </w:tc>
+        <w:tc>
+          <w:tcPr>
+            <w:tcW w:type="dxa" w:w="2300"/>
+          </w:tcPr>
+          <w:p>
+            <w:r>
+              <w:t>Resolved -- decided, NOT yet built. Country is mandatory at the Age Gate for every registrant (declared by the user). At Register the server derives the country from the request IP using a LOCAL MaxMind GeoLite2 database: the IP is read transiently in memory, is never stored, and no third party sees it. Stored: declared code, derived code, derivation method, timestamp. The DERIVED code is authoritative for safeguarding checks (US under-13 card verification) and for demographic grouping; an unresolved lookup applies the stronger control. Residual risk: VPN/Tor spoofing (DPIA item -- listed in the PR description; the DPIA draft is locked and was not edited). Supersedes the design in which only Guardian.declaredCountry (self-declared, never verified) decided whether card verification applied. OPEN: GeoLite2 licence terms and its refresh process need an owner; counsel to confirm the transient-IP-processing disclosure.</w:t>
+            </w:r>
+          </w:p>
+        </w:tc>
+      </w:tr>
+      <w:tr>
+        <w:tc>
+          <w:tcPr>
+            <w:tcW w:type="dxa" w:w="500"/>
+          </w:tcPr>
+          <w:p>
+            <w:r>
+              <w:t>369</w:t>
+            </w:r>
+          </w:p>
+        </w:tc>
+        <w:tc>
+          <w:tcPr>
+            <w:tcW w:type="dxa" w:w="4700"/>
+          </w:tcPr>
+          <w:p>
+            <w:r>
+              <w:t>Username required at Create Profile; incomplete-profile gate.</w:t>
+            </w:r>
+          </w:p>
+        </w:tc>
+        <w:tc>
+          <w:tcPr>
+            <w:tcW w:type="dxa" w:w="1850"/>
+          </w:tcPr>
+          <w:p>
+            <w:r>
+              <w:t>docs/decision-log-flow-country-hold-legal-v0.8 (docs only, 2026-10-12; founder decisions recorded from the MVP coverage audit review, docs/mvp-coverage-audit.md)</w:t>
+            </w:r>
+          </w:p>
+        </w:tc>
+        <w:tc>
+          <w:tcPr>
+            <w:tcW w:type="dxa" w:w="2300"/>
+          </w:tcPr>
+          <w:p>
+            <w:r>
+              <w:t>Resolved -- decided, NOT yet built. A username is required at Create Profile so that no user, minor or adult, is shown to other users under a real name. Until Create Profile is complete an account is shown to others under a neutral placeholder name, cannot post, and is redirected to Create Profile on every login. Applies to adults and to approved minors. Builds on #364 (User.username, shipped optional, 'username first, display name fallback'), which this makes mandatory for any account that completes onboarding; legacy accounts with no username fall under the same gate. Username moderation rules (reserved words, impersonation, profanity, no personal data in usernames, change cooldown, released-handle holding period, admin revoke built code-first with a design follow-up) are specified in the build PR, not here. OPEN: what the placeholder name is, and how the gate treats accounts that already exist without a username.</w:t>
+            </w:r>
+          </w:p>
+        </w:tc>
+      </w:tr>
+      <w:tr>
+        <w:tc>
+          <w:tcPr>
+            <w:tcW w:type="dxa" w:w="500"/>
+          </w:tcPr>
+          <w:p>
+            <w:r>
+              <w:t>370</w:t>
+            </w:r>
+          </w:p>
+        </w:tc>
+        <w:tc>
+          <w:tcPr>
+            <w:tcW w:type="dxa" w:w="4700"/>
+          </w:tcPr>
+          <w:p>
+            <w:r>
+              <w:t>Restricted-pending users cannot perform any social or profile write.</w:t>
+            </w:r>
+          </w:p>
+        </w:tc>
+        <w:tc>
+          <w:tcPr>
+            <w:tcW w:type="dxa" w:w="1850"/>
+          </w:tcPr>
+          <w:p>
+            <w:r>
+              <w:t>docs/decision-log-flow-country-hold-legal-v0.8 (docs only, 2026-10-12; founder decisions recorded from the MVP coverage audit review, docs/mvp-coverage-audit.md)</w:t>
+            </w:r>
+          </w:p>
+        </w:tc>
+        <w:tc>
+          <w:tcPr>
+            <w:tcW w:type="dxa" w:w="2300"/>
+          </w:tcPr>
+          <w:p>
+            <w:r>
+              <w:t>Resolved -- decided, NOT yet built. A restricted-pending user cannot perform any social or profile write: profile edits, represented club, follow, like, save, club join, and the like. Left open to them: report and appeal, change-guardian-email, password change, deactivate/delete, logout. Today only some writes are blocked (POST /posts, comments, rooms, DMs and Community Group create/join are consent-guarded; follow, like, save, club join and PATCH /users/:id are JwtAuthGuard-only, per the reasoning in Decision Log #21/#275) -- this entry widens the rule to a uniform write block. Needs a build PR that re-checks every JwtAuthGuard-only write route.</w:t>
+            </w:r>
+          </w:p>
+        </w:tc>
+      </w:tr>
+      <w:tr>
+        <w:tc>
+          <w:tcPr>
+            <w:tcW w:type="dxa" w:w="500"/>
+          </w:tcPr>
+          <w:p>
+            <w:r>
+              <w:t>371</w:t>
+            </w:r>
+          </w:p>
+        </w:tc>
+        <w:tc>
+          <w:tcPr>
+            <w:tcW w:type="dxa" w:w="4700"/>
+          </w:tcPr>
+          <w:p>
+            <w:r>
+              <w:t>Profile visibility and media: avatars, cover photos, bio, country; image safety.</w:t>
+            </w:r>
+          </w:p>
+        </w:tc>
+        <w:tc>
+          <w:tcPr>
+            <w:tcW w:type="dxa" w:w="1850"/>
+          </w:tcPr>
+          <w:p>
+            <w:r>
+              <w:t>docs/decision-log-flow-country-hold-legal-v0.8 (docs only, 2026-10-12; founder decisions recorded from the MVP coverage audit review, docs/mvp-coverage-audit.md)</w:t>
+            </w:r>
+          </w:p>
+        </w:tc>
+        <w:tc>
+          <w:tcPr>
+            <w:tcW w:type="dxa" w:w="2300"/>
+          </w:tcPr>
+          <w:p>
+            <w:r>
+              <w:t>Resolved -- decided, NOT yet built. Avatars and cover photos are visible to all users, including minors. The other-user profile page shows: avatar, cover photo, bio, country (in place of location -- no precise location is collected), Follow, message, Copy link, Block. There is no Share action. Storage is Cloudflare R2 (Decision Log #307). Image safety: an automated check at upload using Amazon Rekognition (EU/UK region where available); flagged images go to the admin moderation queue and are NOT live; report-and-review is the backstop; image metadata (EXIF/location) is stripped on re-encode. OPEN, counsel review pending: CSAM hash-matching (Cloudflare tooling coverage of R2 is unconfirmed) and any statutory duties that attach to hosting images of minors. Amazon becomes a new processor (cross-border/DPIA follow-up). No avatar/bio/location columns, upload endpoint or Rekognition integration exist yet (Decision Log #58 backend requirements still open).</w:t>
+            </w:r>
+          </w:p>
+        </w:tc>
+      </w:tr>
+      <w:tr>
+        <w:tc>
+          <w:tcPr>
+            <w:tcW w:type="dxa" w:w="500"/>
+          </w:tcPr>
+          <w:p>
+            <w:r>
+              <w:t>372</w:t>
+            </w:r>
+          </w:p>
+        </w:tc>
+        <w:tc>
+          <w:tcPr>
+            <w:tcW w:type="dxa" w:w="4700"/>
+          </w:tcPr>
+          <w:p>
+            <w:r>
+              <w:t>Guardian consent page shows a request summary panel (GET-by-consent-token lookup).</w:t>
+            </w:r>
+          </w:p>
+        </w:tc>
+        <w:tc>
+          <w:tcPr>
+            <w:tcW w:type="dxa" w:w="1850"/>
+          </w:tcPr>
+          <w:p>
+            <w:r>
+              <w:t>docs/decision-log-flow-country-hold-legal-v0.8 (docs only, 2026-10-12; founder decisions recorded from the MVP coverage audit review, docs/mvp-coverage-audit.md)</w:t>
+            </w:r>
+          </w:p>
+        </w:tc>
+        <w:tc>
+          <w:tcPr>
+            <w:tcW w:type="dxa" w:w="2300"/>
+          </w:tcPr>
+          <w:p>
+            <w:r>
+              <w:t>Resolved -- decided, NOT yet built. A GET-by-consent-token lookup returns, to the unauthenticated token holder: the minor's name, date of birth, 'you were named as', and date requested, plus notices that the guardian's email appears on the minor's profile as the line of contact and that the photo and username are visible to others. Safeguards: single-use, expiring token; rate limiting; an identical response for invalid, expired and used tokens (non-enumerating); an uncacheable response; the DOB decrypted server-side only for this response; nothing logged beyond the token outcome. Wrong-DOB path: a 'report incorrect details' action flags the account for support; decline remains available. This is the endpoint CLAUDE.md's F5 bullet recorded as missing (the Figma 'Request Summary' panel was omitted for want of it). Adds a use of the decrypted date of birth beyond Decision Log #362's read sites. OPEN: counsel to confirm that returning a child's DOB to a token holder is proportionate, and what the support flag does to the consent flow while it is open.</w:t>
+            </w:r>
+          </w:p>
+        </w:tc>
+      </w:tr>
+      <w:tr>
+        <w:tc>
+          <w:tcPr>
+            <w:tcW w:type="dxa" w:w="500"/>
+          </w:tcPr>
+          <w:p>
+            <w:r>
+              <w:t>373</w:t>
+            </w:r>
+          </w:p>
+        </w:tc>
+        <w:tc>
+          <w:tcPr>
+            <w:tcW w:type="dxa" w:w="4700"/>
+          </w:tcPr>
+          <w:p>
+            <w:r>
+              <w:t>Email to the minor when a guardian approves.</w:t>
+            </w:r>
+          </w:p>
+        </w:tc>
+        <w:tc>
+          <w:tcPr>
+            <w:tcW w:type="dxa" w:w="1850"/>
+          </w:tcPr>
+          <w:p>
+            <w:r>
+              <w:t>docs/decision-log-flow-country-hold-legal-v0.8 (docs only, 2026-10-12; founder decisions recorded from the MVP coverage audit review, docs/mvp-coverage-audit.md)</w:t>
+            </w:r>
+          </w:p>
+        </w:tc>
+        <w:tc>
+          <w:tcPr>
+            <w:tcW w:type="dxa" w:w="2300"/>
+          </w:tcPr>
+          <w:p>
+            <w:r>
+              <w:t>Resolved -- decided, NOT yet built. An email is sent to the minor's registered address when the guardian approves. Closes the audit's finding that no such template or send exists (docs/mvp-coverage-audit.md top gap 2, Q12). Copy is functional and not counsel-reviewed; it should carry the link back into the flow (the 'Continue registration' step in the sign-up flow entry).</w:t>
+            </w:r>
+          </w:p>
+        </w:tc>
+      </w:tr>
+      <w:tr>
+        <w:tc>
+          <w:tcPr>
+            <w:tcW w:type="dxa" w:w="500"/>
+          </w:tcPr>
+          <w:p>
+            <w:r>
+              <w:t>374</w:t>
+            </w:r>
+          </w:p>
+        </w:tc>
+        <w:tc>
+          <w:tcPr>
+            <w:tcW w:type="dxa" w:w="4700"/>
+          </w:tcPr>
+          <w:p>
+            <w:r>
+              <w:t>Guardian consent expiry and decline behaviour confirmed as-is; Figma decline screen to be archived or rewritten.</w:t>
+            </w:r>
+          </w:p>
+        </w:tc>
+        <w:tc>
+          <w:tcPr>
+            <w:tcW w:type="dxa" w:w="1850"/>
+          </w:tcPr>
+          <w:p>
+            <w:r>
+              <w:t>docs/decision-log-flow-country-hold-legal-v0.8 (docs only, 2026-10-12; founder decisions recorded from the MVP coverage audit review, docs/mvp-coverage-audit.md)</w:t>
+            </w:r>
+          </w:p>
+        </w:tc>
+        <w:tc>
+          <w:tcPr>
+            <w:tcW w:type="dxa" w:w="2300"/>
+          </w:tcPr>
+          <w:p>
+            <w:r>
+              <w:t>Resolved -- decided (no code change). Approved as built: 72-hour consent token; one automatic re-send on first lapse; a second lapse is an implicit decline; decline, withdraw and expiry move the account to pending_deletion with sessions revoked and login blocked (Decision Log #337-#340). Consequence recorded: Figma frame 5491:8241 ('You can send a new request, or use a different guardian email') is unreachable because a decline revokes all sessions and blocks login, so it is to be archived or rewritten in the Figma pass. Resolves the audit's section 5 item 4.</w:t>
+            </w:r>
+          </w:p>
+        </w:tc>
+      </w:tr>
+      <w:tr>
+        <w:tc>
+          <w:tcPr>
+            <w:tcW w:type="dxa" w:w="500"/>
+          </w:tcPr>
+          <w:p>
+            <w:r>
+              <w:t>375</w:t>
+            </w:r>
+          </w:p>
+        </w:tc>
+        <w:tc>
+          <w:tcPr>
+            <w:tcW w:type="dxa" w:w="4700"/>
+          </w:tcPr>
+          <w:p>
+            <w:r>
+              <w:t>Purge rule: hard-delete anonymised rows 30 days after anonymisation for never-approved minors and accounts with no content (supersedes #344).</w:t>
+            </w:r>
+          </w:p>
+        </w:tc>
+        <w:tc>
+          <w:tcPr>
+            <w:tcW w:type="dxa" w:w="1850"/>
+          </w:tcPr>
+          <w:p>
+            <w:r>
+              <w:t>docs/decision-log-flow-country-hold-legal-v0.8 (docs only, 2026-10-12; founder decisions recorded from the MVP coverage audit review, docs/mvp-coverage-audit.md)</w:t>
+            </w:r>
+          </w:p>
+        </w:tc>
+        <w:tc>
+          <w:tcPr>
+            <w:tcW w:type="dxa" w:w="2300"/>
+          </w:tcPr>
+          <w:p>
+            <w:r>
+              <w:t>Resolved -- decided, NOT yet built. Supersedes Decision Log #344 ('no purge timer'). The anonymised user row is hard-deleted 30 days after anonymisation for (a) never-approved minor accounts and (b) any account with no content. Content-bearing anonymised accounts remain anonymised, and are NOT purged, until counsel reviews them. Counsel review pending. OPEN, to be settled in the build PR: the exact test for 'no content' -- User FKs from Post/Comment/Message/Result/Report etc. are RESTRICT again (Decision Log #341), so a delete on a row with any such child fails by design and the job must check for children first rather than rely on the FK; and how this interacts with the hold rule (next entry), which pauses erasure. Decision Log #344's reasoning (a retained anonymised row holds no personal data, GDPR Recital 26) is not disputed; this entry only removes rows where retaining them serves no purpose.</w:t>
+            </w:r>
+          </w:p>
+        </w:tc>
+      </w:tr>
+      <w:tr>
+        <w:tc>
+          <w:tcPr>
+            <w:tcW w:type="dxa" w:w="500"/>
+          </w:tcPr>
+          <w:p>
+            <w:r>
+              <w:t>376</w:t>
+            </w:r>
+          </w:p>
+        </w:tc>
+        <w:tc>
+          <w:tcPr>
+            <w:tcW w:type="dxa" w:w="4700"/>
+          </w:tcPr>
+          <w:p>
+            <w:r>
+              <w:t>Hold rule for accounts on the deletion path with an open report against, by, or authoring it.</w:t>
+            </w:r>
+          </w:p>
+        </w:tc>
+        <w:tc>
+          <w:tcPr>
+            <w:tcW w:type="dxa" w:w="1850"/>
+          </w:tcPr>
+          <w:p>
+            <w:r>
+              <w:t>docs/decision-log-flow-country-hold-legal-v0.8 (docs only, 2026-10-12; founder decisions recorded from the MVP coverage audit review, docs/mvp-coverage-audit.md)</w:t>
+            </w:r>
+          </w:p>
+        </w:tc>
+        <w:tc>
+          <w:tcPr>
+            <w:tcW w:type="dxa" w:w="2300"/>
+          </w:tcPr>
+          <w:p>
+            <w:r>
+              <w:t>Resolved -- decided, NOT yet built. Erasure stays paused while the report is open (the existing 90-day held-investigation alert stays, Decision Log #345), then until any appeal window has lapsed or the appeal is decided, then for 6 months after closure, whatever the outcome. During the hold: keep the report record, the reported content and messages, and identifiers (user ID, name, email, DOB); clear the password hash and other non-evidence data (exact field list to be approved by Temi in the build PR). REPORTED person (and authors of reported content): held 6 months after closure/appeal, then normal deletion. REPORTER: if the report is upheld, or both parties are found not culpable, the reporter's account follows the normal deletion path and only the report record is kept for the 6 months; if the reporter is found to have acted in bad faith, the reporter's account is held IN FULL for 6 months. Two new admin actions: 'Reporter acted in bad faith' and 'Legal hold' (holds both accounts in full until an admin lifts it; covers lawyers, law enforcement, disputes). COUNSEL NOTE: a reporter's data is held in full only so that records exist if the reported person takes legal action against the reporter; it is not for any other purpose. Counsel review pending. Extends Decision Log #341/#345, which held only while a report was open and set no post-closure period. OPEN: the 6-month figure and the appeal window length are not counsel-sourced; tension with the legal copy's existing 6-7 year retention of moderation case data (PP s9) to be reconciled by counsel.</w:t>
+            </w:r>
+          </w:p>
+        </w:tc>
+      </w:tr>
+      <w:tr>
+        <w:tc>
+          <w:tcPr>
+            <w:tcW w:type="dxa" w:w="500"/>
+          </w:tcPr>
+          <w:p>
+            <w:r>
+              <w:t>377</w:t>
+            </w:r>
+          </w:p>
+        </w:tc>
+        <w:tc>
+          <w:tcPr>
+            <w:tcW w:type="dxa" w:w="4700"/>
+          </w:tcPr>
+          <w:p>
+            <w:r>
+              <w:t>Player profile linked to Grassroots clubs -- future consideration.</w:t>
+            </w:r>
+          </w:p>
+        </w:tc>
+        <w:tc>
+          <w:tcPr>
+            <w:tcW w:type="dxa" w:w="1850"/>
+          </w:tcPr>
+          <w:p>
+            <w:r>
+              <w:t>docs/decision-log-flow-country-hold-legal-v0.8 (docs only, 2026-10-12; founder decisions recorded from the MVP coverage audit review, docs/mvp-coverage-audit.md)</w:t>
+            </w:r>
+          </w:p>
+        </w:tc>
+        <w:tc>
+          <w:tcPr>
+            <w:tcW w:type="dxa" w:w="2300"/>
+          </w:tcPr>
+          <w:p>
+            <w:r>
+              <w:t>Future consideration, NOT in MVP, not decided. Possible later: players linked to Grassroots clubs through the Grassroots feature get a player profile card linked to their accounts. Because no position, school-team, stats or photo fields exist in the schema, API or UI, the 'Build a player profile / position, club or school team, and stats' and 'Add your position and photo' claims are removed from the guardian flow copy (GuardianConsentConfirmPage.tsx, GuardianConsentPage.tsx; Figma 5113:6669, 5114:6698; audit Q6). Do not build without a new decision (CLAUDE.md non-negotiable #4: no Discover/Careers-pillar work without an explicit go-ahead).</w:t>
+            </w:r>
+          </w:p>
+        </w:tc>
+      </w:tr>
+      <w:tr>
+        <w:tc>
+          <w:tcPr>
+            <w:tcW w:type="dxa" w:w="500"/>
+          </w:tcPr>
+          <w:p>
+            <w:r>
+              <w:t>378</w:t>
+            </w:r>
+          </w:p>
+        </w:tc>
+        <w:tc>
+          <w:tcPr>
+            <w:tcW w:type="dxa" w:w="4700"/>
+          </w:tcPr>
+          <w:p>
+            <w:r>
+              <w:t>MVP scope: every Missing, Stub and Partial screen in the coverage audit is launch-blocking; sign-in and 2FA decisions; vendor-absent sports fields.</w:t>
+            </w:r>
+          </w:p>
+        </w:tc>
+        <w:tc>
+          <w:tcPr>
+            <w:tcW w:type="dxa" w:w="1850"/>
+          </w:tcPr>
+          <w:p>
+            <w:r>
+              <w:t>docs/decision-log-flow-country-hold-legal-v0.8 (docs only, 2026-10-12; founder decisions recorded from the MVP coverage audit review, docs/mvp-coverage-audit.md)</w:t>
+            </w:r>
+          </w:p>
+        </w:tc>
+        <w:tc>
+          <w:tcPr>
+            <w:tcW w:type="dxa" w:w="2300"/>
+          </w:tcPr>
+          <w:p>
+            <w:r>
+              <w:t>Resolved -- decided; the build register is not yet created. All 35 Missing, 34 Stub and 71 Partial screens in docs/mvp-coverage-audit.md are launch-blocking and in scope, tracked in a build register. Apple login is removed from scope. Google and Facebook sign-in are in scope but must still pass the Age Gate (DOB and country) and the guardian flow; the provider's date of birth is never trusted; Facebook accounts without an email need a fallback. Two-factor authentication uses an authenticator app, not SMS (the Figma and the disabled UI say 'Text message'; no TOTP backend exists). Sports fields the chosen vendor does not supply (FORM column, xG, player ratings, pressure index) are hidden via the capability registry, not deleted (Decision Log #336). Decision Log #55 designed Google/Apple/Facebook; the Apple half is withdrawn here. This widens the MVP definition of done beyond Build Plan Section 7's list; Discover/Careers pillar work remains out of scope.</w:t>
+            </w:r>
+          </w:p>
+        </w:tc>
+      </w:tr>
+      <w:tr>
+        <w:tc>
+          <w:tcPr>
+            <w:tcW w:type="dxa" w:w="500"/>
+          </w:tcPr>
+          <w:p>
+            <w:r>
+              <w:t>379</w:t>
+            </w:r>
+          </w:p>
+        </w:tc>
+        <w:tc>
+          <w:tcPr>
+            <w:tcW w:type="dxa" w:w="4700"/>
+          </w:tcPr>
+          <w:p>
+            <w:r>
+              <w:t>Corrections: places where a prior 'done/closed/resolved' claim is contradicted by the code (docs/mvp-coverage-audit.md section 5).</w:t>
+            </w:r>
+          </w:p>
+        </w:tc>
+        <w:tc>
+          <w:tcPr>
+            <w:tcW w:type="dxa" w:w="1850"/>
+          </w:tcPr>
+          <w:p>
+            <w:r>
+              <w:t>docs/decision-log-flow-country-hold-legal-v0.8 (docs only, 2026-10-12); source: docs/mvp-coverage-audit.md section 5 (PR #389)</w:t>
+            </w:r>
+          </w:p>
+        </w:tc>
+        <w:tc>
+          <w:tcPr>
+            <w:tcW w:type="dxa" w:w="2300"/>
+          </w:tcPr>
+          <w:p>
+            <w:r>
+              <w:t>Resolved -- recorded as findings; earlier rows are NOT rewritten. Per the audit's section 5 (items numbered as there): (1) the emailed-link guardian flow and the 'fully walkable' Sprint 1 exit criterion are false -- the guardian and verify-email emails contain a bare code with no link; (2) the club picker implies a logged-in user but registration stores no session; (3) Decision Log #63 -- guardian name is still First/Last in code; (4) guardian decline-web vs Figma frame 5491:8241 contradiction; (5) 'guardianContact for every minor' (Decision Log #363) vs guardian screen copy and legal draft saying under-16, and no UI renders it; (6) 'no /terms, /privacy routes yet' is stale -- they exist, the footer links are still spans; (7) Decision Log #202 Contact Us frames retrofitted in Figma only, no code; (8) Decision Log #208 footer links wired in the Figma prototype only; (9) HELD_INVESTIGATION_ALERT_DAYS is a constant, not an environment variable; (10) the Add Role page is still a stub though Decision Log #191 is resolved; (11) 'Add your position and photo' is still on the restricted-pending page; (12) the Leaderboard header comment is stale; (13) legal draft ToS 3.1 'before the account is created' vs 3.2 'account exists'; (14) legal draft row 32 contradicts its own 'Built' label; (15) 'legal pages have no React implementation' is stale except Contact Us; (16) Figma 'withdraw consent by contacting us' vs the self-service withdrawal API. Items 1, 5, 11, 13 and 14 are addressed by the flow, copy and legal-draft changes in this same batch; the rest need their own fix PRs.</w:t>
+            </w:r>
+          </w:p>
+        </w:tc>
+      </w:tr>
+      <w:tr>
+        <w:tc>
+          <w:tcPr>
+            <w:tcW w:type="dxa" w:w="500"/>
+          </w:tcPr>
+          <w:p>
+            <w:r>
+              <w:t>380</w:t>
+            </w:r>
+          </w:p>
+        </w:tc>
+        <w:tc>
+          <w:tcPr>
+            <w:tcW w:type="dxa" w:w="4700"/>
+          </w:tcPr>
+          <w:p>
+            <w:r>
+              <w:t>Launch prerequisites -- tracked, not decided.</w:t>
+            </w:r>
+          </w:p>
+        </w:tc>
+        <w:tc>
+          <w:tcPr>
+            <w:tcW w:type="dxa" w:w="1850"/>
+          </w:tcPr>
+          <w:p>
+            <w:r>
+              <w:t>docs/decision-log-flow-country-hold-legal-v0.8 (docs only, 2026-10-12); source: docs/mvp-coverage-audit.md Q11, section 1</w:t>
+            </w:r>
+          </w:p>
+        </w:tc>
+        <w:tc>
+          <w:tcPr>
+            <w:tcW w:type="dxa" w:w="2300"/>
+          </w:tcPr>
+          <w:p>
+            <w:r>
+              <w:t>Open -- tracked, NOT decided; this entry records no decision. Listed so none is lost: hosting for apps/web and apps/admin (render.yaml defines only the two API services); Sentry region/plan; Postmark account, sending-domain verification and approval; a working support@soccernity.com mailbox; AWS (Rekognition), Google OAuth and Meta developer accounts; Stripe keys (US under-13 guardians fail closed with 503 until set); Cloudflare R2 credentials (media upload 503s until set); the 22 environment variables read in code but missing from render.yaml (audit Q11); counsel-pending items (legal copy Part C, the DPIA, the image-safety/CSAM question, transient IP processing, the reporter full hold, purge/anonymised-row retention). The legal entity name/registration and the policy Effective Date remain unfilled pending re-registration.</w:t>
             </w:r>
           </w:p>
         </w:tc>

</xml_diff>

<commit_message>
docs: record contest, points, decline-cap, DOB-correction and scope decisions of 2026-10-14 (Decision Log #381-#392)
Adds docs/contest-spec.md as single source of truth; 12 Decision Log rows;
build register B-091..B-106; audit corrections; contest README banner.
Docs only; no code, schema, Figma, legal copy or DPIA changed.

Co-Authored-By: Claude Sonnet 5.5 <noreply@anthropic.com>
</commit_message>
<xml_diff>
--- a/docs/Soccernity_MVP_Build_Plan_v1.7.docx
+++ b/docs/Soccernity_MVP_Build_Plan_v1.7.docx
@@ -12244,7 +12244,7 @@
           </w:tcPr>
           <w:p>
             <w:r>
-              <w:t>Resolved (design). The Contest tab is COMPETITION = “Contest” in the existing filter bar (no new control); TIME PERIOD is relabelled This month / Past months for this competition type. Three states, one per calendar-month phase: (1) PENDING (weeks 1–3, 5524:7188) — a centred empty-state card, week-progress chips, and the “View this week’s contest ›” connector, since weekly winners are still being decided on the Contest page; (2) LIVE — LEVEL 1 FINAL (week 4, 5524:7512) — every weekly winner listed with a persistent “LEVEL 1 FINAL · LIVE” banner; (3) CROWNED (end of week 4, 5524:7836) — the month’s overall top 3. JUDGMENT CALLS: (a) the brief’s “listed in no particular order” live state is rendered as a genuinely RANKED list plus a persistent LIVE banner and a “Live order — positions move… only fixed when the final closes” note — a RANK column that is literally unordered reads as a bug; (b) the finalist count is treated as DYNAMIC (“9 weekly winners so far — this number varies month to month”), never hard-coded, because ties in a weekly top 3 or a thin week change it; (c) ties in a weekly/monthly top 3 render as two rows carrying the same ordinal text pill (“1st · Monthly winner”) — there is no podium graphic and no trophy/medal iconography (Leaderboard rule; Build Plan 2.2, rewards economy is Phase 2), so a tie needs no special split. The underlying points model is still unbacked (Decision Log — Leaderboard points question, unchanged); figma-to-code must not build the Contest tab until a Contest scoring/handoff model is specced. Founder-blocked for wiring. → Superseded in part by #71 (Contest is now its own board tab, not a COMPETITION-dropdown value) and #70 (the weeks-1–3 weekly-fill progression replaces the single PENDING state). [sprint-2/leaderboard-competition-split-admin-homepage report]  [Backend built by sprint-2/contest-data-model-backend (backend-api): the monthly phases this entry designed now have a real state machine -- ContestCycle status active/final/completed + a DERIVED phase (vacant/week_1/weeks_1_2/weeks_1_3/final_live/crowned) from ContestService.derivePhase. The ties/no-podium-iconography rules are respected (ContestRoundWinner/ContestStanding.position allows ties, no @@unique on position). See #218/#219.]</w:t>
+              <w:t>Resolved (design). The Contest tab is COMPETITION = “Contest” in the existing filter bar (no new control); TIME PERIOD is relabelled This month / Past months for this competition type. Three states, one per calendar-month phase: (1) PENDING (weeks 1–3, 5524:7188) — a centred empty-state card, week-progress chips, and the “View this week’s contest ›” connector, since weekly winners are still being decided on the Contest page; (2) LIVE — LEVEL 1 FINAL (week 4, 5524:7512) — every weekly winner listed with a persistent “LEVEL 1 FINAL · LIVE” banner; (3) CROWNED (end of week 4, 5524:7836) — the month’s overall top 3. JUDGMENT CALLS: (a) the brief’s “listed in no particular order” live state is rendered as a genuinely RANKED list plus a persistent LIVE banner and a “Live order — positions move… only fixed when the final closes” note — a RANK column that is literally unordered reads as a bug; (b) the finalist count is treated as DYNAMIC (“9 weekly winners so far — this number varies month to month”), never hard-coded, because ties in a weekly top 3 or a thin week change it; (c) ties in a weekly/monthly top 3 render as two rows carrying the same ordinal text pill (“1st · Monthly winner”) — there is no podium graphic and no trophy/medal iconography (Leaderboard rule; Build Plan 2.2, rewards economy is Phase 2), so a tie needs no special split. The underlying points model is still unbacked (Decision Log — Leaderboard points question, unchanged); figma-to-code must not build the Contest tab until a Contest scoring/handoff model is specced. Founder-blocked for wiring. → Superseded in part by #71 (Contest is now its own board tab, not a COMPETITION-dropdown value) and #70 (the weeks-1–3 weekly-fill progression replaces the single PENDING state). [sprint-2/leaderboard-competition-split-admin-homepage report]  [Backend built by sprint-2/contest-data-model-backend (backend-api): the monthly phases this entry designed now have a real state machine -- ContestCycle status active/final/completed + a DERIVED phase (vacant/week_1/weeks_1_2/weeks_1_3/final_live/crowned) from ContestService.derivePhase. The ties/no-podium-iconography rules are respected (ContestRoundWinner/ContestStanding.position allows ties, no @@unique on position). See #218/#219.] [2026-10-14: Amended by #381/#386/#387 -- 'LEVEL 1 FINAL' wording retired (no Level 1/2); the week-4 final is engagement-based with a finalist upload window and reveal; weekly/monthly ties are broken by rule, so tied rows no longer occur. See docs/contest-spec.md.]</w:t>
             </w:r>
           </w:p>
         </w:tc>
@@ -12622,7 +12622,7 @@
           </w:tcPr>
           <w:p>
             <w:r>
-              <w:t>Resolved (design). The single pending state is replaced by a four-step progression, desktop + mobile: (1) Vacant — Week 1 Phase 1, no winners yet (5524:7188 / 5541:7304, the old pending frames converted in place — no orphaned duplicate); (2) Week 1 winners in — 3 rows (5556:7426 / 5561:7483); (3) Weeks 1–2 in — 6 rows (5556:7529 / 5561:7608); (4) Weeks 1–3 in — 9 rows, count DYNAMIC, copy never hard-codes “9” (5556:7632 / 5561:7733). Week 4 switches to the existing Live state; the crowned state is unchanged apart from Item 1's medals. Weekly-fill rows carry no medal — weekly winners are equal, not a settled 1/2/3; each row shows its own “Week N · 1st/2nd/3rd” as plain text. Contest Design-Notes frame 5534:7264 rewritten.  [Backend built by sprint-2/contest-data-model-backend: the 4-step progressive fill is the derived phase vacant -&gt; week_1 -&gt; weeks_1_2 -&gt; weeks_1_3, driven by judging weekly rounds in sequence (POST /admin/contest/cycles/:id/rounds/:week/results, sequential judging enforced). The '9 rows / count DYNAMIC' point holds -- weeklyWinners is just however many ContestRoundWinner rows exist, ties included. See #218.]</w:t>
+              <w:t>Resolved (design). The single pending state is replaced by a four-step progression, desktop + mobile: (1) Vacant — Week 1 Phase 1, no winners yet (5524:7188 / 5541:7304, the old pending frames converted in place — no orphaned duplicate); (2) Week 1 winners in — 3 rows (5556:7426 / 5561:7483); (3) Weeks 1–2 in — 6 rows (5556:7529 / 5561:7608); (4) Weeks 1–3 in — 9 rows, count DYNAMIC, copy never hard-codes “9” (5556:7632 / 5561:7733). Week 4 switches to the existing Live state; the crowned state is unchanged apart from Item 1's medals. Weekly-fill rows carry no medal — weekly winners are equal, not a settled 1/2/3; each row shows its own “Week N · 1st/2nd/3rd” as plain text. Contest Design-Notes frame 5534:7264 rewritten.  [Backend built by sprint-2/contest-data-model-backend: the 4-step progressive fill is the derived phase vacant -&gt; week_1 -&gt; weeks_1_2 -&gt; weeks_1_3, driven by judging weekly rounds in sequence (POST /admin/contest/cycles/:id/rounds/:week/results, sequential judging enforced). The '9 rows / count DYNAMIC' point holds -- weeklyWinners is just however many ContestRoundWinner rows exist, ties included. See #218.] [2026-10-14: Superseded by #387 -- the weekly fill is driven by the fixed calendar, Phase 1 engagement and Phase 2 votes, not by admin judging; forfeited weeks read 'Forfeited'. The bracketed backend note above (sequential admin judging) is superseded by #381. See docs/contest-spec.md.]</w:t>
             </w:r>
           </w:p>
         </w:tc>
@@ -12664,7 +12664,7 @@
           </w:tcPr>
           <w:p>
             <w:r>
-              <w:t>Resolved (design). Judgment call, flagged: the brief's “Global / Per-Club / Contest / Competition / Per-Time-Period — all combinable” is read as the union of dimensions, not five literal tabs. Global/Per-Club = the SCOPE control; Per-Time-Period = the TIME control (both unchanged, combinable); Contest/Competition (+ an implicit Overall) = a NEW board-tab row (component 5563:7573, underline style, above the filter bar). COMPETITION dropdown removed from the Overall and Contest boards (Contest's mechanic is fixed — no selector); it survives only on the Competition board, relabelled COMPETITION TYPE. Board tabs applied to every built Leaderboard frame (Overall on base + empty states; Contest on all six Contest-tab states + mobiles). State Study B rewritten as the COMPETITION TYPE selector, noting Contest is not in the list because it is its own tab.  [Backend built by sprint-2/contest-data-model-backend: Contest is modelled as its own fixed mechanic (ContestCycle/ContestRound/ContestEntry), entirely separate from the Competition umbrella (#72/#73), which is deliberately NOT built (still Build Plan 2.2-deferred). PointsLedgerEntry.source reserves 'competition_result' for it. See #218.]</w:t>
+              <w:t>Resolved (design). Judgment call, flagged: the brief's “Global / Per-Club / Contest / Competition / Per-Time-Period — all combinable” is read as the union of dimensions, not five literal tabs. Global/Per-Club = the SCOPE control; Per-Time-Period = the TIME control (both unchanged, combinable); Contest/Competition (+ an implicit Overall) = a NEW board-tab row (component 5563:7573, underline style, above the filter bar). COMPETITION dropdown removed from the Overall and Contest boards (Contest's mechanic is fixed — no selector); it survives only on the Competition board, relabelled COMPETITION TYPE. Board tabs applied to every built Leaderboard frame (Overall on base + empty states; Contest on all six Contest-tab states + mobiles). State Study B rewritten as the COMPETITION TYPE selector, noting Contest is not in the list because it is its own tab.  [Backend built by sprint-2/contest-data-model-backend: Contest is modelled as its own fixed mechanic (ContestCycle/ContestRound/ContestEntry), entirely separate from the Competition umbrella (#72/#73), which is deliberately NOT built (still Build Plan 2.2-deferred). PointsLedgerEntry.source reserves 'competition_result' for it. See #218.] [2026-10-14: Amended by #381/#392 -- Contest's mechanic is fixed (this entry stands), but the Competition umbrella is now IN SCOPE for launch (#392 item 1), so the bracketed 'deliberately NOT built' note is superseded. See docs/contest-spec.md.]</w:t>
             </w:r>
           </w:p>
         </w:tc>
@@ -12706,7 +12706,7 @@
           </w:tcPr>
           <w:p>
             <w:r>
-              <w:t>Resolved (design). One generic shell table — RANK / PLAYER / CLUB / &lt;metric&gt; / SCORE — serves every competition type. The middle metric column is competition-supplied (ACCURACY for Prediction, VOTES for Commentary) and is NOT hardcoded into the shell; ranking is always by the final SCORE integer. Prediction and Commentary built as example populated states (placeholder personas already in the file), driven by a COMPETITION TYPE dropdown. Medals on ranks 1–3 per #69. Still founder-blocked for wiring: no competition/entry/vote schema or Section 4 endpoint.</w:t>
+              <w:t>Resolved (design). One generic shell table — RANK / PLAYER / CLUB / &lt;metric&gt; / SCORE — serves every competition type. The middle metric column is competition-supplied (ACCURACY for Prediction, VOTES for Commentary) and is NOT hardcoded into the shell; ranking is always by the final SCORE integer. Prediction and Commentary built as example populated states (placeholder personas already in the file), driven by a COMPETITION TYPE dropdown. Medals on ranks 1–3 per #69. Still founder-blocked for wiring: no competition/entry/vote schema or Section 4 endpoint. [2026-10-14: Amended by #392 item 1 -- Competition umbrella is now IN SCOPE for launch; default placement points in #385.]</w:t>
             </w:r>
           </w:p>
         </w:tc>
@@ -12748,7 +12748,7 @@
           </w:tcPr>
           <w:p>
             <w:r>
-              <w:t>Resolved (design). New Admin — Create Competition screen + success state, on the unified Admin shell (PR #102). New sidebar nav item “Competitions” (3-bar podium glyph, distinct from Contest's icon), inserted after Contest, set active — propagating it to the other 15 Admin shells is a flagged follow-up (same pattern as “Categories” originally). Form: competition name; competition type (feeds the Leaderboard COMPETITION TYPE selector); scoring mechanism (segmented: Accuracy-scored / Community-voted / Custom); custom scoring method; entry brief; entry window (Opens/Closes); entries per player; Leaderboard visibility (public toggle, whose helper text surfaces the still-open public-visibility question); Create competition. Desktop only — Admin has no mobile pattern in this file.  → Resolved by #76: the “Competitions” nav item is now propagated to all 24 remaining Admin Panel screens (the “other 15 shells” follow-up flagged here). [sprint-2/admin-competitions-nav-settings-club-rep report]</w:t>
+              <w:t>Resolved (design). New Admin — Create Competition screen + success state, on the unified Admin shell (PR #102). New sidebar nav item “Competitions” (3-bar podium glyph, distinct from Contest's icon), inserted after Contest, set active — propagating it to the other 15 Admin shells is a flagged follow-up (same pattern as “Categories” originally). Form: competition name; competition type (feeds the Leaderboard COMPETITION TYPE selector); scoring mechanism (segmented: Accuracy-scored / Community-voted / Custom); custom scoring method; entry brief; entry window (Opens/Closes); entries per player; Leaderboard visibility (public toggle, whose helper text surfaces the still-open public-visibility question); Create competition. Desktop only — Admin has no mobile pattern in this file.  → Resolved by #76: the “Competitions” nav item is now propagated to all 24 remaining Admin Panel screens (the “other 15 shells” follow-up flagged here). [sprint-2/admin-competitions-nav-settings-club-rep report] [2026-10-14: Amended by #392 item 1 -- Create Competition is now IN SCOPE for launch (backend: B-100).]</w:t>
             </w:r>
           </w:p>
         </w:tc>
@@ -15193,7 +15193,7 @@
           </w:tcPr>
           <w:p>
             <w:r>
-              <w:t>Resolved by the founder: points are earned two ways, combined into one running total per represented club (Decision Log #128) and time period: (1) Contest/Competition results — weekly Contest wins and Competition-type scores (Prediction accuracy, Commentary votes) convert to points via each competition's own scoring mechanism (Decision Log #72’s generic SCORE column); and (2) baseline platform engagement — likes, follows, and posts also contribute a smaller, ongoing point trickle outside of any competition. Exact per-action weights (points per like/follow/post, and the Contest/Competition-to-points conversion formula) are a real, not-yet-specified backend detail — parked as a backend-api task for when backend work resumes, not resolved here. This unblocks Leaderboard/Contest/Competition screens from being treated as a real, data-driven feature rather than a founder-blocked placeholder; figma-to-code may now build against these boards once backend delivers the real points field and scoring endpoint.  [RESOLVED for the delegated part by sprint-2/contest-data-model-backend (backend-api) -- see #219 for the exact weights (post 3 / like 1 / follow 1; weekly win 50/30/20; monthly crown 250/150/100) and the append-only PointsLedgerEntry ledger they write to. The Leaderboard aggregation, GET /leaderboard, and the LeaderboardEntry rollup remain Sprint 6; the represented-club dimension (#128) is still parked (PointsLedgerEntry.clubId exists, always null).]</w:t>
+              <w:t>Resolved by the founder: points are earned two ways, combined into one running total per represented club (Decision Log #128) and time period: (1) Contest/Competition results — weekly Contest wins and Competition-type scores (Prediction accuracy, Commentary votes) convert to points via each competition's own scoring mechanism (Decision Log #72’s generic SCORE column); and (2) baseline platform engagement — likes, follows, and posts also contribute a smaller, ongoing point trickle outside of any competition. Exact per-action weights (points per like/follow/post, and the Contest/Competition-to-points conversion formula) are a real, not-yet-specified backend detail — parked as a backend-api task for when backend work resumes, not resolved here. This unblocks Leaderboard/Contest/Competition screens from being treated as a real, data-driven feature rather than a founder-blocked placeholder; figma-to-code may now build against these boards once backend delivers the real points field and scoring endpoint.  [RESOLVED for the delegated part by sprint-2/contest-data-model-backend (backend-api) -- see #219 for the exact weights (post 3 / like 1 / follow 1; weekly win 50/30/20; monthly crown 250/150/100) and the append-only PointsLedgerEntry ledger they write to. The Leaderboard aggregation, GET /leaderboard, and the LeaderboardEntry rollup remain Sprint 6; the represented-club dimension (#128) is still parked (PointsLedgerEntry.clubId exists, always null).] [2026-10-14: Amended by #383 and #385 -- baseline engagement is views/likes/comments with a giver 1 / receiver 0.25 rule and daily caps (follows and posts earn no points), and contest results convert to placement points set by the admin (defaults in #385). Original text above unchanged.]</w:t>
             </w:r>
           </w:p>
         </w:tc>
@@ -19044,7 +19044,7 @@
           </w:tcPr>
           <w:p>
             <w:r>
-              <w:t>Resolved -- new architecture, founder-authorised for this task. New models (migration 20260905223054_add_contest_data_model_and_points_ledger): ContestCycle (status active/final/completed), ContestRound (weeks 1-3, status open/judged), ContestEntry (a Post submitted AS an entry), ContestRoundWinner, ContestStanding, PointsLedgerEntry. New endpoints (all genuine additions, none in Section 4): GET /contest/current, GET /contest/cycles/:id, POST /contest/entries (JwtAuthGuard [+GuardianConsentGuard on the POST]); admin POST /admin/contest/cycles, .../rounds/:week/results, .../final/open, .../crown (AdminJwtAuthGuard). Phase is DERIVED, never stored (ContestService.derivePhase). JUDGMENT CALLS: (1) one ContestEntry per user per weekly round (@@unique([roundId,userId])) -- 'entries per player' is a Competition field (#73), not spec'd for Contest, but one entry/week is the natural reading; (2) position ties allowed (no @@unique on position) per #61(c); (3) at most one non-completed cycle at a time, service-enforced not DB-constraint; (4) all new User FKs onDelete: Cascade (#44) so the account-deletion sweep keeps working; (5) PointsLedgerEntry .refId is a plain string not an FK (audit trail must outlive its referent, same as ConsentAuditRecord). The Competition umbrella (#72/#73) is deliberately NOT built -- still Build Plan 2.2-deferred; PointsLedgerEntry.source reserves 'competition_result'. GET /leaderboard + the LeaderboardEntry rollup remain Sprint 6. Real Postgres e2e drives a cycle through every phase. See services/api/src/modules/contest/README.md. Build Plan Section 3/4 should gain these entries whoever next edits them.</w:t>
+              <w:t>Resolved -- new architecture, founder-authorised for this task. New models (migration 20260905223054_add_contest_data_model_and_points_ledger): ContestCycle (status active/final/completed), ContestRound (weeks 1-3, status open/judged), ContestEntry (a Post submitted AS an entry), ContestRoundWinner, ContestStanding, PointsLedgerEntry. New endpoints (all genuine additions, none in Section 4): GET /contest/current, GET /contest/cycles/:id, POST /contest/entries (JwtAuthGuard [+GuardianConsentGuard on the POST]); admin POST /admin/contest/cycles, .../rounds/:week/results, .../final/open, .../crown (AdminJwtAuthGuard). Phase is DERIVED, never stored (ContestService.derivePhase). JUDGMENT CALLS: (1) one ContestEntry per user per weekly round (@@unique([roundId,userId])) -- 'entries per player' is a Competition field (#73), not spec'd for Contest, but one entry/week is the natural reading; (2) position ties allowed (no @@unique on position) per #61(c); (3) at most one non-completed cycle at a time, service-enforced not DB-constraint; (4) all new User FKs onDelete: Cascade (#44) so the account-deletion sweep keeps working; (5) PointsLedgerEntry .refId is a plain string not an FK (audit trail must outlive its referent, same as ConsentAuditRecord). The Competition umbrella (#72/#73) is deliberately NOT built -- still Build Plan 2.2-deferred; PointsLedgerEntry.source reserves 'competition_result'. GET /leaderboard + the LeaderboardEntry rollup remain Sprint 6. Real Postgres e2e drives a cycle through every phase. See services/api/src/modules/contest/README.md. Build Plan Section 3/4 should gain these entries whoever next edits them. [2026-10-14: SUPERSEDED by #381 -- the admin-judged model (admin judging endpoints, sequential judging) was never the founder's design; contests are not admin-judged and there is no Level 1/2. See docs/contest-spec.md.]</w:t>
             </w:r>
           </w:p>
         </w:tc>
@@ -19086,7 +19086,7 @@
           </w:tcPr>
           <w:p>
             <w:r>
-              <w:t>Resolved by backend-api (the founder delegated this in #130). Weights, as named constants in services/api/src/modules/points/points.constants.ts (tuning later = a one-file change, never a migration): BASELINE ENGAGEMENT -- create a post 3, give a like 1, follow a user 1. Deliberately rewards ACTIONS TAKEN, not popularity received: #130 lists 'likes, follows, and posts' together and 'posts' is unambiguously an action you take; and a board driven by received engagement would be a follower-count race, the opposite of what a scout-visibility tool for under-served players (incl. minors, #45) should be. CONTEST RESULTS -- weekly round win 50/30/20 by position; monthly crown 250/150/100 by position; cumulative (a monthly winner keeps their weekly points). Ratio: a crown ~= 83 posts, a weekly win ~= 17 -- contest performance clearly dominates volume, but a non-competitor still climbs slowly and really. IDEMPOTENCY / NO REVOCATION: engagement points are awarded once per distinct target (PointsLedgerEntry @@unique([source,refId,userId])) and NEVER revoked -- like-&gt;unlike-&gt;re-like the same post = 1 point total; re-judging a round can't double-pay. FLAGGED FOLLOW-UPS (not built): a per-day engagement cap / anti-spam (the Sprint 6 aggregation is the place for it); PointsLedgerEntry.clubId (always null -- represented-club field doesn't exist, #74/#128). See services/api/src/modules/points/README.md.</w:t>
+              <w:t>Resolved by backend-api (the founder delegated this in #130). Weights, as named constants in services/api/src/modules/points/points.constants.ts (tuning later = a one-file change, never a migration): BASELINE ENGAGEMENT -- create a post 3, give a like 1, follow a user 1. Deliberately rewards ACTIONS TAKEN, not popularity received: #130 lists 'likes, follows, and posts' together and 'posts' is unambiguously an action you take; and a board driven by received engagement would be a follower-count race, the opposite of what a scout-visibility tool for under-served players (incl. minors, #45) should be. CONTEST RESULTS -- weekly round win 50/30/20 by position; monthly crown 250/150/100 by position; cumulative (a monthly winner keeps their weekly points). Ratio: a crown ~= 83 posts, a weekly win ~= 17 -- contest performance clearly dominates volume, but a non-competitor still climbs slowly and really. IDEMPOTENCY / NO REVOCATION: engagement points are awarded once per distinct target (PointsLedgerEntry @@unique([source,refId,userId])) and NEVER revoked -- like-&gt;unlike-&gt;re-like the same post = 1 point total; re-judging a round can't double-pay. FLAGGED FOLLOW-UPS (not built): a per-day engagement cap / anti-spam (the Sprint 6 aggregation is the place for it); PointsLedgerEntry.clubId (always null -- represented-club field doesn't exist, #74/#128). See services/api/src/modules/points/README.md. [2026-10-14: Superseded by #383 and #385 -- post 3 / like 1 / follow 1 and weekly 50/30/20, monthly 250/150/100 are replaced; follows and posts earn no points. Original text above unchanged.]</w:t>
             </w:r>
           </w:p>
         </w:tc>
@@ -20031,7 +20031,7 @@
           </w:tcPr>
           <w:p>
             <w:r>
-              <w:t>Resolved (Task 1 of 3 -- backend read surface only; screens + code are Tasks 2/3, tracked under #239). Report: docs/sprint-2-admin-contest-read-endpoints-report.md. services/api only, zero schema.prisma diff (plain reads, no migration), User/Guardian safeguarding fields untouched. Shipped: GET /admin/contest/cycles (every cycle newest-first by createdAt, plain list -- ~12 rows/year, no pagination; a 'short summary' -- per-round entryCount but no per-entry array), GET /admin/contest/cycles/:id (everything ContestCycleDetailResponse returns PLUS each round's full entries[] -- entryId, submittedAt, entrant {userId,displayName}, post {id,contentText,mediaUrls,createdAt,likeCount,commentCount} matching feed POST_SELECT, and position:number|null via the ContestEntry.winner back-relation; 404 for an unknown id), GET /admin/contest/current (same detail shape, running cycle then most-recently completed, all-null only when no cycle ever created). Reuses CYCLE_GRAPH_INCLUDE + derivePhase + the to*Summary helpers -- ADMIN_CYCLE_LIST_INCLUDE / ADMIN_CYCLE_DETAIL_INCLUDE spread it and add rounds._count.entries / rounds.entries. Safeguarding: confirmed in code that a restricted-pending minor can never reach these reads (ContestEntry.userId = Post.authorId; POST /posts and POST /contest/entries are both GuardianConsentGuard-gated; Guardian.consentStatus only ever moves pending-&gt;confirmed with no reversal path; dateOfBirth/isMinor immutable post-registration) -- no minor filter added, per the task brief. Judgment call flagged: the brief said post.body; the real Post field is contentText, matched to POST_SELECT. Verification: nest build + npm run lint clean; mocked suite 46 suites / 584 -&gt; 598 tests, 0 failures; e2e suite 11 suites / 81 -&gt; 83 tests, 0 failures (test/contest.e2e-spec.ts drives create -&gt; real POST /contest/entries -&gt; the read surfaces real entryIds asserted against real ContestEntry rows -&gt; judge with those ids -&gt; the read shows winner positions asserted against real ContestRoundWinner rows -&gt; /current tracks phase -&gt; /cycles lists history; plus 404, all-null /current, and a USER token rejected 401).</w:t>
+              <w:t>Resolved (Task 1 of 3 -- backend read surface only; screens + code are Tasks 2/3, tracked under #239). Report: docs/sprint-2-admin-contest-read-endpoints-report.md. services/api only, zero schema.prisma diff (plain reads, no migration), User/Guardian safeguarding fields untouched. Shipped: GET /admin/contest/cycles (every cycle newest-first by createdAt, plain list -- ~12 rows/year, no pagination; a 'short summary' -- per-round entryCount but no per-entry array), GET /admin/contest/cycles/:id (everything ContestCycleDetailResponse returns PLUS each round's full entries[] -- entryId, submittedAt, entrant {userId,displayName}, post {id,contentText,mediaUrls,createdAt,likeCount,commentCount} matching feed POST_SELECT, and position:number|null via the ContestEntry.winner back-relation; 404 for an unknown id), GET /admin/contest/current (same detail shape, running cycle then most-recently completed, all-null only when no cycle ever created). Reuses CYCLE_GRAPH_INCLUDE + derivePhase + the to*Summary helpers -- ADMIN_CYCLE_LIST_INCLUDE / ADMIN_CYCLE_DETAIL_INCLUDE spread it and add rounds._count.entries / rounds.entries. Safeguarding: confirmed in code that a restricted-pending minor can never reach these reads (ContestEntry.userId = Post.authorId; POST /posts and POST /contest/entries are both GuardianConsentGuard-gated; Guardian.consentStatus only ever moves pending-&gt;confirmed with no reversal path; dateOfBirth/isMinor immutable post-registration) -- no minor filter added, per the task brief. Judgment call flagged: the brief said post.body; the real Post field is contentText, matched to POST_SELECT. Verification: nest build + npm run lint clean; mocked suite 46 suites / 584 -&gt; 598 tests, 0 failures; e2e suite 11 suites / 81 -&gt; 83 tests, 0 failures (test/contest.e2e-spec.ts drives create -&gt; real POST /contest/entries -&gt; the read surfaces real entryIds asserted against real ContestEntry rows -&gt; judge with those ids -&gt; the read shows winner positions asserted against real ContestRoundWinner rows -&gt; /current tracks phase -&gt; /cycles lists history; plus 404, all-null /current, and a USER token rejected 401). [2026-10-14: SUPERSEDED by #381 -- these admin read endpoints existed to support admin judging, which is not the design. See docs/contest-spec.md.]</w:t>
             </w:r>
           </w:p>
         </w:tc>
@@ -21762,7 +21762,7 @@
               <w:rPr>
                 <w:i/>
               </w:rPr>
-              <w:t>RESOLVED (navigation placement) by #282: the founder decided Community Groups does NOT get a navbar icon -- it lives in the account dropdown/drawer alongside Profile/Notification/Settings. See #282 for the full nav-surface policy this also established.</w:t>
+              <w:t>RESOLVED (navigation placement) by #282: the founder decided Community Groups does NOT get a navbar icon -- it lives in the account dropdown/drawer alongside Profile/Notification/Settings. See #282 for the full nav-surface policy this also established. [2026-10-14: Superseded by #392 item 3 in part -- the 'no composer, no group feed' position no longer holds; the founder decided the Community Group feed is needed. Roster, filters and navigation placement (#282) are unchanged. The Community Groups frontend entry cited as #294 in CLAUDE.md has no row in this table; it is covered by this pointer.]</w:t>
             </w:r>
           </w:p>
         </w:tc>
@@ -25592,7 +25592,7 @@
           </w:tcPr>
           <w:p>
             <w:r>
-              <w:t>Resolved -- decided, NOT yet built. MINOR: Age Gate (date of birth + country) -&gt; Guardian details -&gt; submit -&gt; Register (account created, restricted-pending) -&gt; Restricted pending page (shown on every login) -&gt; guardian approves (plus card verification for a US under-13, the control built in PRs #297/#298) -&gt; Activation confirmation (its 'Go to my profile' action becomes 'Continue registration') -&gt; Create Profile -&gt; Club Picker -&gt; /. ADULT: Age Gate (date of birth + country) -&gt; Register -&gt; Create Profile -&gt; Club Picker -&gt; /. Date of birth is read-only after the Age Gate: Register and Create Profile show it auto-populated and Register has no date picker. Create Profile is blocked for a restricted-pending minor until approval. Preferred Club on Create Profile is optional free text and is run through the pre-publication sensitive-content screen (Decision Log #366, PR #388); the Club Picker follows regardless of what is entered. Bio is optional and screened. Email verification is required of every user before Create Profile. The 'What you can still do' copy on the restricted-pending page is rewritten to say registration cannot be completed until the guardian approves (including card verification where required). NOTE: the sensitive-content screen as built (#366) covers Grassroots free-text fields only; extending it to Preferred Club and Bio is new build work, not a given. OPEN, product call: a user who mistypes their date of birth at the Age Gate has no self-service correction path once it is read-only.</w:t>
+              <w:t>Resolved -- decided, NOT yet built. MINOR: Age Gate (date of birth + country) -&gt; Guardian details -&gt; submit -&gt; Register (account created, restricted-pending) -&gt; Restricted pending page (shown on every login) -&gt; guardian approves (plus card verification for a US under-13, the control built in PRs #297/#298) -&gt; Activation confirmation (its 'Go to my profile' action becomes 'Continue registration') -&gt; Create Profile -&gt; Club Picker -&gt; /. ADULT: Age Gate (date of birth + country) -&gt; Register -&gt; Create Profile -&gt; Club Picker -&gt; /. Date of birth is read-only after the Age Gate: Register and Create Profile show it auto-populated and Register has no date picker. Create Profile is blocked for a restricted-pending minor until approval. Preferred Club on Create Profile is optional free text and is run through the pre-publication sensitive-content screen (Decision Log #366, PR #388); the Club Picker follows regardless of what is entered. Bio is optional and screened. Email verification is required of every user before Create Profile. The 'What you can still do' copy on the restricted-pending page is rewritten to say registration cannot be completed until the guardian approves (including card verification where required). NOTE: the sensitive-content screen as built (#366) covers Grassroots free-text fields only; extending it to Preferred Club and Bio is new build work, not a given. OPEN, product call: a user who mistypes their date of birth at the Age Gate has no self-service correction path once it is read-only. [2026-10-14: the open DOB-correction point is resolved by #390 (support correction tool, audited, re-runs age checks, re-triggers guardian flow).]</w:t>
             </w:r>
           </w:p>
         </w:tc>
@@ -25886,7 +25886,7 @@
           </w:tcPr>
           <w:p>
             <w:r>
-              <w:t>Resolved -- decided (no code change). Approved as built: 72-hour consent token; one automatic re-send on first lapse; a second lapse is an implicit decline; decline, withdraw and expiry move the account to pending_deletion with sessions revoked and login blocked (Decision Log #337-#340). Consequence recorded: Figma frame 5491:8241 ('You can send a new request, or use a different guardian email') is unreachable because a decline revokes all sessions and blocks login, so it is to be archived or rewritten in the Figma pass. Resolves the audit's section 5 item 4.</w:t>
+              <w:t>Resolved -- decided (no code change). Approved as built: 72-hour consent token; one automatic re-send on first lapse; a second lapse is an implicit decline; decline, withdraw and expiry move the account to pending_deletion with sessions revoked and login blocked (Decision Log #337-#340). Consequence recorded: Figma frame 5491:8241 ('You can send a new request, or use a different guardian email') is unreachable because a decline revokes all sessions and blocks login, so it is to be archived or rewritten in the Figma pass. Resolves the audit's section 5 item 4. [2026-10-14: Superseded by #389 for explicit declines on a still-valid request -- max 3 declines, the minor may resend or change guardian email, frames 5491:8241 / 5501:8453 to be wired (not archived). Expiry, second lapse and post-approval withdrawal keep the behaviour recorded here.]</w:t>
             </w:r>
           </w:p>
         </w:tc>
@@ -26054,7 +26054,7 @@
           </w:tcPr>
           <w:p>
             <w:r>
-              <w:t>Resolved -- decided; the build register is not yet created. All 35 Missing, 34 Stub and 71 Partial screens in docs/mvp-coverage-audit.md are launch-blocking and in scope, tracked in a build register. Apple login is removed from scope. Google and Facebook sign-in are in scope but must still pass the Age Gate (DOB and country) and the guardian flow; the provider's date of birth is never trusted; Facebook accounts without an email need a fallback. Two-factor authentication uses an authenticator app, not SMS (the Figma and the disabled UI say 'Text message'; no TOTP backend exists). Sports fields the chosen vendor does not supply (FORM column, xG, player ratings, pressure index) are hidden via the capability registry, not deleted (Decision Log #336). Decision Log #55 designed Google/Apple/Facebook; the Apple half is withdrawn here. This widens the MVP definition of done beyond Build Plan Section 7's list; Discover/Careers pillar work remains out of scope.</w:t>
+              <w:t>Resolved -- decided; the build register is not yet created. All 35 Missing, 34 Stub and 71 Partial screens in docs/mvp-coverage-audit.md are launch-blocking and in scope, tracked in a build register. Apple login is removed from scope. Google and Facebook sign-in are in scope but must still pass the Age Gate (DOB and country) and the guardian flow; the provider's date of birth is never trusted; Facebook accounts without an email need a fallback. Two-factor authentication uses an authenticator app, not SMS (the Figma and the disabled UI say 'Text message'; no TOTP backend exists). Sports fields the chosen vendor does not supply (FORM column, xG, player ratings, pressure index) are hidden via the capability registry, not deleted (Decision Log #336). Decision Log #55 designed Google/Apple/Facebook; the Apple half is withdrawn here. This widens the MVP definition of done beyond Build Plan Section 7's list; Discover/Careers pillar work remains out of scope. [2026-10-14: scope confirmed by #392 item 1 -- everything is launch-blocking including the Competition umbrella (the register's 'Competition deferral' conflict is resolved in favour of building it).]</w:t>
             </w:r>
           </w:p>
         </w:tc>
@@ -26096,7 +26096,7 @@
           </w:tcPr>
           <w:p>
             <w:r>
-              <w:t>Resolved -- recorded as findings; earlier rows are NOT rewritten. Per the audit's section 5 (items numbered as there): (1) the emailed-link guardian flow and the 'fully walkable' Sprint 1 exit criterion are false -- the guardian and verify-email emails contain a bare code with no link; (2) the club picker implies a logged-in user but registration stores no session; (3) Decision Log #63 -- guardian name is still First/Last in code; (4) guardian decline-web vs Figma frame 5491:8241 contradiction; (5) 'guardianContact for every minor' (Decision Log #363) vs guardian screen copy and legal draft saying under-16, and no UI renders it; (6) 'no /terms, /privacy routes yet' is stale -- they exist, the footer links are still spans; (7) Decision Log #202 Contact Us frames retrofitted in Figma only, no code; (8) Decision Log #208 footer links wired in the Figma prototype only; (9) HELD_INVESTIGATION_ALERT_DAYS is a constant, not an environment variable; (10) the Add Role page is still a stub though Decision Log #191 is resolved; (11) 'Add your position and photo' is still on the restricted-pending page; (12) the Leaderboard header comment is stale; (13) legal draft ToS 3.1 'before the account is created' vs 3.2 'account exists'; (14) legal draft row 32 contradicts its own 'Built' label; (15) 'legal pages have no React implementation' is stale except Contact Us; (16) Figma 'withdraw consent by contacting us' vs the self-service withdrawal API. Items 1, 5, 11, 13 and 14 are addressed by the flow, copy and legal-draft changes in this same batch; the rest need their own fix PRs.</w:t>
+              <w:t>Resolved -- recorded as findings; earlier rows are NOT rewritten. Per the audit's section 5 (items numbered as there): (1) the emailed-link guardian flow and the 'fully walkable' Sprint 1 exit criterion are false -- the guardian and verify-email emails contain a bare code with no link; (2) the club picker implies a logged-in user but registration stores no session; (3) Decision Log #63 -- guardian name is still First/Last in code; (4) guardian decline-web vs Figma frame 5491:8241 contradiction; (5) 'guardianContact for every minor' (Decision Log #363) vs guardian screen copy and legal draft saying under-16, and no UI renders it; (6) 'no /terms, /privacy routes yet' is stale -- they exist, the footer links are still spans; (7) Decision Log #202 Contact Us frames retrofitted in Figma only, no code; (8) Decision Log #208 footer links wired in the Figma prototype only; (9) HELD_INVESTIGATION_ALERT_DAYS is a constant, not an environment variable; (10) the Add Role page is still a stub though Decision Log #191 is resolved; (11) 'Add your position and photo' is still on the restricted-pending page; (12) the Leaderboard header comment is stale; (13) legal draft ToS 3.1 'before the account is created' vs 3.2 'account exists'; (14) legal draft row 32 contradicts its own 'Built' label; (15) 'legal pages have no React implementation' is stale except Contact Us; (16) Figma 'withdraw consent by contacting us' vs the self-service withdrawal API. Items 1, 5, 11, 13 and 14 are addressed by the flow, copy and legal-draft changes in this same batch; the rest need their own fix PRs. [2026-10-14 clarification: the closing sentence above says items 1, 5, 11, 13 and 14 'are addressed by the flow, copy and legal-draft changes in this same batch'. That batch was docs only (Decision Log entries and legal-draft text); 'addressed' means documented/decided, not fixed in code. Item 11 ('Add your position and photo' on the restricted-pending page) and the other code-level corrections remain open in code; see docs/build-register.md Section 6b.]</w:t>
             </w:r>
           </w:p>
         </w:tc>
@@ -26139,6 +26139,510 @@
           <w:p>
             <w:r>
               <w:t>Open -- tracked, NOT decided; this entry records no decision. Listed so none is lost: hosting for apps/web and apps/admin (render.yaml defines only the two API services); Sentry region/plan; Postmark account, sending-domain verification and approval; a working support@soccernity.com mailbox; AWS (Rekognition), Google OAuth and Meta developer accounts; Stripe keys (US under-13 guardians fail closed with 503 until set); Cloudflare R2 credentials (media upload 503s until set); the 22 environment variables read in code but missing from render.yaml (audit Q11); counsel-pending items (legal copy Part C, the DPIA, the image-safety/CSAM question, transient IP processing, the reporter full hold, purge/anonymised-row retention). The legal entity name/registration and the policy Effective Date remain unfilled pending re-registration.</w:t>
+            </w:r>
+          </w:p>
+        </w:tc>
+      </w:tr>
+      <w:tr>
+        <w:tc>
+          <w:tcPr>
+            <w:tcW w:type="dxa" w:w="500"/>
+          </w:tcPr>
+          <w:p>
+            <w:r>
+              <w:t>381</w:t>
+            </w:r>
+          </w:p>
+        </w:tc>
+        <w:tc>
+          <w:tcPr>
+            <w:tcW w:type="dxa" w:w="4700"/>
+          </w:tcPr>
+          <w:p>
+            <w:r>
+              <w:t>Contest rebuild: the weekly Contest mechanic, its admin creation flow and the correction of the admin-judged backend (#218, #241) and admin console (#242, #243).</w:t>
+            </w:r>
+          </w:p>
+        </w:tc>
+        <w:tc>
+          <w:tcPr>
+            <w:tcW w:type="dxa" w:w="1850"/>
+          </w:tcPr>
+          <w:p>
+            <w:r>
+              <w:t>docs/contest-spec-decisions-2026-10-14 (docs only, 2026-10-14; founder decisions recorded from the session of 2026-10-14; docs/contest-spec.md)</w:t>
+            </w:r>
+          </w:p>
+        </w:tc>
+        <w:tc>
+          <w:tcPr>
+            <w:tcW w:type="dxa" w:w="2300"/>
+          </w:tcPr>
+          <w:p>
+            <w:r>
+              <w:t>Resolved -- decided, NOT yet built. CORRECTION: the admin-judged contest (admin POST .../rounds/:week/results, enforced sequential judging, admin crown/open-final endpoints, and the Judge Week / Open the Final / Crown Winners admin screens) was never the founder's design. Contests are NOT admin-judged; that behaviour is to be replaced, not preserved. There is NO 'Level 1 / Level 2': only weeks 1-3 and the final (week 4); the wording 'Level 1 Final' is retired (Figma frames 5524:7512 / 5541:7527 to be renamed). Admin creation: each contest is created from the admin Contest tab (to be redesigned) with a contest description; the details page 'task for this week' is populated from it; the weekly mechanism is FREE TEXT. Required per contest: minimum tally (x points for final top-3 eligibility, admin-set, no default, cannot create without it); placement points for 1st/2nd/3rd (weekly and monthly, defaults in the placement-points entry); per-week view-qualifying watch limit in seconds for video entries (ASSUMED interpretation: the founder said it is 'always communicated in the contest description'; because the system must enforce it, it is recorded as a required structured numeric field as well). Per-week admin switch: followers-excluded counting. Boundary: Contest and Competition are separate features sharing the leaderboard. Backend implications and the new frames list are in the spec. Full detail: docs/contest-spec.md (sections 3, 4, 12, 13). Build register B-091, B-095, B-096, B-097, B-098, B-099. Forward-pointers: #218, #241, #61, #70, #71 (Superseded/Amended by #381).</w:t>
+            </w:r>
+          </w:p>
+        </w:tc>
+      </w:tr>
+      <w:tr>
+        <w:tc>
+          <w:tcPr>
+            <w:tcW w:type="dxa" w:w="500"/>
+          </w:tcPr>
+          <w:p>
+            <w:r>
+              <w:t>382</w:t>
+            </w:r>
+          </w:p>
+        </w:tc>
+        <w:tc>
+          <w:tcPr>
+            <w:tcW w:type="dxa" w:w="4700"/>
+          </w:tcPr>
+          <w:p>
+            <w:r>
+              <w:t>Platform-wide engagement counting rule: which actions earn points in any engagement-based contest, challenge or competition.</w:t>
+            </w:r>
+          </w:p>
+        </w:tc>
+        <w:tc>
+          <w:tcPr>
+            <w:tcW w:type="dxa" w:w="1850"/>
+          </w:tcPr>
+          <w:p>
+            <w:r>
+              <w:t>docs/contest-spec-decisions-2026-10-14 (docs only, 2026-10-14; founder decisions recorded from the session of 2026-10-14; docs/contest-spec.md)</w:t>
+            </w:r>
+          </w:p>
+        </w:tc>
+        <w:tc>
+          <w:tcPr>
+            <w:tcW w:type="dxa" w:w="2300"/>
+          </w:tcPr>
+          <w:p>
+            <w:r>
+              <w:t>Resolved -- decided, NOT yet built. Applies to EVERY engagement-based contest, challenge or competition and to every user including contestants and minors. Only VIEWS, LIKES and COMMENTS earn points; FOLLOWS AND POSTS EARN NO POINTS IN ANY CIRCUMSTANCE. Per account per item: 1 for a qualifying view (only where views are counted), 1 for a like, 1 for a comment, regardless of how many views/likes/comments that account makes (ten comments = 1). There is NO flat cap of 2: the signals depend on the contest (Phase 1 = views + likes + comments, up to 3 per account per entry; the final = likes + comments, up to 2). In contest/competition tallies SELF-ENGAGEMENT COUNTS. Accounts with restrictions never count; accounts without a verified email never count. A comment counts only if it passes the existing content screening. Non-engagement-based competition types (Prediction accuracy-scored, Commentary community-voted) are unaffected. Full detail: docs/contest-spec.md (section 9a). Build register B-093.</w:t>
+            </w:r>
+          </w:p>
+        </w:tc>
+      </w:tr>
+      <w:tr>
+        <w:tc>
+          <w:tcPr>
+            <w:tcW w:type="dxa" w:w="500"/>
+          </w:tcPr>
+          <w:p>
+            <w:r>
+              <w:t>383</w:t>
+            </w:r>
+          </w:p>
+        </w:tc>
+        <w:tc>
+          <w:tcPr>
+            <w:tcW w:type="dxa" w:w="4700"/>
+          </w:tcPr>
+          <w:p>
+            <w:r>
+              <w:t>Baseline leaderboard points (everyday engagement outside any contest): who earns what, caps, storage and revocation.</w:t>
+            </w:r>
+          </w:p>
+        </w:tc>
+        <w:tc>
+          <w:tcPr>
+            <w:tcW w:type="dxa" w:w="1850"/>
+          </w:tcPr>
+          <w:p>
+            <w:r>
+              <w:t>docs/contest-spec-decisions-2026-10-14 (docs only, 2026-10-14; founder decisions recorded from the session of 2026-10-14; docs/contest-spec.md)</w:t>
+            </w:r>
+          </w:p>
+        </w:tc>
+        <w:tc>
+          <w:tcPr>
+            <w:tcW w:type="dxa" w:w="2300"/>
+          </w:tcPr>
+          <w:p>
+            <w:r>
+              <w:t>Resolved -- decided, NOT yet built. AMENDS #130 (whose baseline list was 'likes, follows, and posts'; its original text is unchanged). Rule: the account that GIVES the engagement earns FULL points (1 per qualifying view / like / comment per unique post); the creator who RECEIVES it earns one QUARTER point (0.25) per qualifying view / like / comment per unique account per post. Founder: 'it is more profitable to give than to receive', to encourage engagement. The 0.25 rule applies ONLY to baseline leaderboard points and never affects contest/competition tallies. SELF-ENGAGEMENT IS EXEMPT (a user's own views/likes/comments on their own content earn nothing). Points are REVOKED when the engagement is removed (unlike, comment deleted or removed, post removed, account later restricted); revocation also reduces that day's cap counter (ASSUMED detail). Storage: quarter-point units (1 point = 4 units); display: rounded to the nearest whole number, half rounds up; RANKING uses the exact stored value so rounding never creates false ties. DAILY CAPS (founder confirmed 2026-10-14; admin-configurable settings, not hardcoded; Europe/London calendar day): 40 points per day for GIVING and 20 points per day for RECEIVING (about 1,800/month maximum). Revisit after two weeks of live data. Verified email required; restricted accounts never earn; same rules for minors; a comment earns points only if it passes content screening. Follows and posts earn nothing: the existing awards (post 3, like 1, follow 1; #219) are to be removed, see B-094. Full detail: docs/contest-spec.md (section 9b). Build register B-093, B-094.</w:t>
+            </w:r>
+          </w:p>
+        </w:tc>
+      </w:tr>
+      <w:tr>
+        <w:tc>
+          <w:tcPr>
+            <w:tcW w:type="dxa" w:w="500"/>
+          </w:tcPr>
+          <w:p>
+            <w:r>
+              <w:t>384</w:t>
+            </w:r>
+          </w:p>
+        </w:tc>
+        <w:tc>
+          <w:tcPr>
+            <w:tcW w:type="dxa" w:w="4700"/>
+          </w:tcPr>
+          <w:p>
+            <w:r>
+              <w:t>View-qualification rules: when does a view count for display and when does it earn a view point.</w:t>
+            </w:r>
+          </w:p>
+        </w:tc>
+        <w:tc>
+          <w:tcPr>
+            <w:tcW w:type="dxa" w:w="1850"/>
+          </w:tcPr>
+          <w:p>
+            <w:r>
+              <w:t>docs/contest-spec-decisions-2026-10-14 (docs only, 2026-10-14; founder decisions recorded from the session of 2026-10-14; docs/contest-spec.md)</w:t>
+            </w:r>
+          </w:p>
+        </w:tc>
+        <w:tc>
+          <w:tcPr>
+            <w:tcW w:type="dxa" w:w="2300"/>
+          </w:tcPr>
+          <w:p>
+            <w:r>
+              <w:t>Resolved -- decided, NOT yet built. A 'view' counted for display is distinct from a 'view POINT'; points are awarded only when thresholds are met; one view point per account per post. BASELINE: photo = at least 3 seconds on screen; video = the full length if shorter than 60 seconds, otherwise 60 seconds watched; text-only post = at least 3 seconds visible. 'Watched' = active playback while the post is visible and the tab/app is in the foreground; muted autoplay in the feed counts; skipping ahead earns no credit; a loop counts once. The creator's 0.25 for a view uses the same qualification as the viewer's. CONTEST/COMPETITION tallies: video = the viewer must watch min(video length, the contest's weekly view-qualifying limit L in seconds), so a video shorter than L must be watched completely and a longer one qualifies after L seconds; photo = at least 5 seconds. Views are not counted in the week-4 final. Backend implication: server-validated playback/dwell heartbeats (client-reported time alone is spoofable); counsel has not reviewed this new processing. Full detail: docs/contest-spec.md (section 9c). Build register B-093.</w:t>
+            </w:r>
+          </w:p>
+        </w:tc>
+      </w:tr>
+      <w:tr>
+        <w:tc>
+          <w:tcPr>
+            <w:tcW w:type="dxa" w:w="500"/>
+          </w:tcPr>
+          <w:p>
+            <w:r>
+              <w:t>385</w:t>
+            </w:r>
+          </w:p>
+        </w:tc>
+        <w:tc>
+          <w:tcPr>
+            <w:tcW w:type="dxa" w:w="4700"/>
+          </w:tcPr>
+          <w:p>
+            <w:r>
+              <w:t>Placement points: leaderboard points awarded as a prize for winning a contest or competition.</w:t>
+            </w:r>
+          </w:p>
+        </w:tc>
+        <w:tc>
+          <w:tcPr>
+            <w:tcW w:type="dxa" w:w="1850"/>
+          </w:tcPr>
+          <w:p>
+            <w:r>
+              <w:t>docs/contest-spec-decisions-2026-10-14 (docs only, 2026-10-14; founder decisions recorded from the session of 2026-10-14; docs/contest-spec.md)</w:t>
+            </w:r>
+          </w:p>
+        </w:tc>
+        <w:tc>
+          <w:tcPr>
+            <w:tcW w:type="dxa" w:w="2300"/>
+          </w:tcPr>
+          <w:p>
+            <w:r>
+              <w:t>Resolved -- decided, NOT yet built. AMENDS #130 and #219 (original text unchanged). The founder confirmed winners earn leaderboard points and approved these defaults. The admin sets points for 1st/2nd/3rd when creating each contest or competition. Defaults: weekly contest 500 / 300 / 150; monthly final 2,000 / 1,200 / 600; Prediction, Commentary and other competitions: top 3 as the admin configures, default 500 / 300 / 150 (ASSUMED default; founder to confirm). Weekly placement points are awarded when that week's winners are confirmed; monthly final points on crowning. Forfeited weeks and 'No winner this month' award nothing. Points accrue to the user's represented club and the time period in which they are awarded (#128/#130). SUPERSEDES the 'conversion formula parked for backend' part of #130 for contests, and the 50/30/20 and 250/150/100 weights of #219. The 'minimum tally' (entry bar for the final top 3) and 'placement points' (the prize) are different things. Full detail: docs/contest-spec.md (sections 9d, 9e). Build register B-091, B-093, B-100.</w:t>
+            </w:r>
+          </w:p>
+        </w:tc>
+      </w:tr>
+      <w:tr>
+        <w:tc>
+          <w:tcPr>
+            <w:tcW w:type="dxa" w:w="500"/>
+          </w:tcPr>
+          <w:p>
+            <w:r>
+              <w:t>386</w:t>
+            </w:r>
+          </w:p>
+        </w:tc>
+        <w:tc>
+          <w:tcPr>
+            <w:tcW w:type="dxa" w:w="4700"/>
+          </w:tcPr>
+          <w:p>
+            <w:r>
+              <w:t>Week-4 final: how the month's top 3 is decided.</w:t>
+            </w:r>
+          </w:p>
+        </w:tc>
+        <w:tc>
+          <w:tcPr>
+            <w:tcW w:type="dxa" w:w="1850"/>
+          </w:tcPr>
+          <w:p>
+            <w:r>
+              <w:t>docs/contest-spec-decisions-2026-10-14 (docs only, 2026-10-14; founder decisions recorded from the session of 2026-10-14; docs/contest-spec.md)</w:t>
+            </w:r>
+          </w:p>
+        </w:tc>
+        <w:tc>
+          <w:tcPr>
+            <w:tcW w:type="dxa" w:w="2300"/>
+          </w:tcPr>
+          <w:p>
+            <w:r>
+              <w:t>Resolved -- decided, NOT yet built. Engagement-based, not voting-based. Only the finalists (the weekly winners, about 9; dynamic count; fewer if weeks were forfeited; none = no final and the leaderboard says so) get access to the Create Post &gt; Contest tab portal, and only during the upload window (days 22-24, deadline 23:59:59 on day 24); each finalist uploads a NEW video; the server flags it as a final entry (no hashtag parsing). FINALIST VIDEOS ARE HIDDEN from everyone except their owner until the reveal at 00:00 on day 25 (founder confirmed). Only engagement made after the reveal counts; the leaderboard shows live ranking from the reveal and ranks only flagged final entries. Ranking = likes + comments under the platform rule (#382); views are NOT counted in the final; self-engagement counts in contest tallies. A finalist who does not upload by the deadline scores 0, falls below the minimum tally and cannot place; the portal closes at the deadline. MINIMUM TALLY: a finalist needs at least x points (admin-set at creation) to be considered; if nobody reaches x there is NO WINNER for that month and the leaderboard shows 'No winner this month'. Tie-break: total points, then comments, then earliest upload. FOLLOWER-BIAS HYBRID: by default all community engagement counts; an admin switch applies 'followers-excluded counting' (only engagement from accounts that do not follow the finalist) for that week only; follow status is FROZEN at the moment an account engages; self-engagement counts in BOTH modes (founder: nobody follows themselves). The engagement window is 4 days in February and up to 7 days in a 31-day month (accepted consequence of the fixed calendar). Note: this restricts the Create Post 'For Contest' tab (#148/#188) to finalists during week 4. Full detail: docs/contest-spec.md (section 10). Build register B-091, B-096.</w:t>
+            </w:r>
+          </w:p>
+        </w:tc>
+      </w:tr>
+      <w:tr>
+        <w:tc>
+          <w:tcPr>
+            <w:tcW w:type="dxa" w:w="500"/>
+          </w:tcPr>
+          <w:p>
+            <w:r>
+              <w:t>387</w:t>
+            </w:r>
+          </w:p>
+        </w:tc>
+        <w:tc>
+          <w:tcPr>
+            <w:tcW w:type="dxa" w:w="4700"/>
+          </w:tcPr>
+          <w:p>
+            <w:r>
+              <w:t>Weekly contest mechanics (weeks 1-3): calendar, qualification, forfeits, voting and tie-break.</w:t>
+            </w:r>
+          </w:p>
+        </w:tc>
+        <w:tc>
+          <w:tcPr>
+            <w:tcW w:type="dxa" w:w="1850"/>
+          </w:tcPr>
+          <w:p>
+            <w:r>
+              <w:t>docs/contest-spec-decisions-2026-10-14 (docs only, 2026-10-14; founder decisions recorded from the session of 2026-10-14; docs/contest-spec.md)</w:t>
+            </w:r>
+          </w:p>
+        </w:tc>
+        <w:tc>
+          <w:tcPr>
+            <w:tcW w:type="dxa" w:w="2300"/>
+          </w:tcPr>
+          <w:p>
+            <w:r>
+              <w:t>Resolved -- decided, NOT yet built. Fixed Europe/London calendar: weeks 1-3 = days 1-7, 8-14, 15-21 of the calendar month; week 4 = day 22 to month end. Each of weeks 1-3: Phase 1 = days 1-4, Phase 2 = days 5-7. Entry via Create Post &gt; Contest tab; one entry per user per week; auto-pinned to the top of the entrant's feed with a 'Contest' label; one fixed challenge per week; minors can enter; past winners can re-enter and win again (no sit-out). Phase 1: ranked by engagement = views + likes + comments (#382, #384); top 10 qualify; fewer than 10 entries, everyone qualifies; fewer than 3 entries, the week is FORFEITED (leaderboard shows 'Forfeited' for that week's 3 slots, no placement points). Phase 2: VOTES ALONE decide the top 3 (Phase 1 engagement only decides who reaches the top 10). One vote per user per round; entrants have one vote and MAY vote for themselves; a vote can be changed or retracted (retracting returns the user to the Voting page, voting again returns them to Already Voted); minors can vote even if not entrants; ACCOUNTS WITH RESTRICTIONS CANNOT VOTE (founder confirmed; consistent with #370). Tie-break: earliest vote reached, the entrant whose tally first reached the tied number ranks higher, computed from the current non-retracted vote log by timestamp (INTERPRETATION, for founder confirmation). Leaderboard fill supersedes the single static empty state of PR #108 and the 'progressive fill by admin judging' wording of #70: vacant only in week 1 Phase 1; 3 winners after week 1, 6 after week 2, 9 after week 3 (dynamic); forfeited weeks read 'Forfeited'; week 4 finalists listed during upload ('uploading'), live ranking from the reveal, then crowned top 3 or 'No winner this month'. Position ties of #61(c)/#218(2) no longer occur. OBSERVATION: Phase 1 ranks at the end of day 4, so an entry posted on day 1 has more time to earn engagement than one on day 4; no cutoff added. OPEN: weekly entry deadline (assumed Phase 1 only), tie at the 10th-place cutoff, vote lock time. Full detail: docs/contest-spec.md (sections 5-8, 11). Build register B-091, B-098, B-099.</w:t>
+            </w:r>
+          </w:p>
+        </w:tc>
+      </w:tr>
+      <w:tr>
+        <w:tc>
+          <w:tcPr>
+            <w:tcW w:type="dxa" w:w="500"/>
+          </w:tcPr>
+          <w:p>
+            <w:r>
+              <w:t>388</w:t>
+            </w:r>
+          </w:p>
+        </w:tc>
+        <w:tc>
+          <w:tcPr>
+            <w:tcW w:type="dxa" w:w="4700"/>
+          </w:tcPr>
+          <w:p>
+            <w:r>
+              <w:t>Week-4 finalist exposure rule: how finalists' videos are shown to the community after the reveal.</w:t>
+            </w:r>
+          </w:p>
+        </w:tc>
+        <w:tc>
+          <w:tcPr>
+            <w:tcW w:type="dxa" w:w="1850"/>
+          </w:tcPr>
+          <w:p>
+            <w:r>
+              <w:t>docs/contest-spec-decisions-2026-10-14 (docs only, 2026-10-14; founder decisions recorded from the session of 2026-10-14; docs/contest-spec.md)</w:t>
+            </w:r>
+          </w:p>
+        </w:tc>
+        <w:tc>
+          <w:tcPr>
+            <w:tcW w:type="dxa" w:w="2300"/>
+          </w:tcPr>
+          <w:p>
+            <w:r>
+              <w:t>Resolved -- decided, NOT yet built. PROVENANCE: FOUNDER-DELEGATED DESIGN. The founder asked for 'a reasonable and moderate, non-biased' flow; drafted by Claude 2026-10-14; the founder APPROVED the proposal and parameters on 2026-10-14. Goal: every finalist gets comparable community exposure independent of follower count, prior engagement or upload time. Audience: all logged-in accounts that are not restricted (minors included, under the normal minor-safe feed rules). Placement: a 'Final week' showcase module pinned in the Community feed and listed on the Contest page, live from the reveal, identical for every eligible viewer. Ordering: NEVER by engagement, live leaderboard rank, follower count or recency; a per-viewer shuffle seeded per viewer per day (stable within a session). Balanced-impression rotation: impressions tracked per finalist video (impression = card rendered in the viewport); the video with the FEWEST impressions is served next, keeping counts within a tolerance. Frequency cap: a viewer sees a given finalist video at most N times per day. Confirmed parameters (admin-configurable): tolerance = within 10% of the mean impressions across live finalist videos; N = 3 per viewer per day. Followers get no extra push. Transparency: Contest page copy tells viewers every finalist is shown to everyone equally; an admin view shows the impression distribution per finalist and flags any video outside the tolerance. Unchanged by the followers-excluded switch. Fewer than 9 finalists: same rule over those that exist. Full detail: docs/contest-spec.md (section 10b). Build register B-092, B-095, B-096.</w:t>
+            </w:r>
+          </w:p>
+        </w:tc>
+      </w:tr>
+      <w:tr>
+        <w:tc>
+          <w:tcPr>
+            <w:tcW w:type="dxa" w:w="500"/>
+          </w:tcPr>
+          <w:p>
+            <w:r>
+              <w:t>389</w:t>
+            </w:r>
+          </w:p>
+        </w:tc>
+        <w:tc>
+          <w:tcPr>
+            <w:tcW w:type="dxa" w:w="4700"/>
+          </w:tcPr>
+          <w:p>
+            <w:r>
+              <w:t>Guardian consent decline: cap on explicit declines, and what happens after each.</w:t>
+            </w:r>
+          </w:p>
+        </w:tc>
+        <w:tc>
+          <w:tcPr>
+            <w:tcW w:type="dxa" w:w="1850"/>
+          </w:tcPr>
+          <w:p>
+            <w:r>
+              <w:t>docs/contest-spec-decisions-2026-10-14 (docs only, 2026-10-14; founder decisions recorded from the session of 2026-10-14; docs/contest-spec.md)</w:t>
+            </w:r>
+          </w:p>
+        </w:tc>
+        <w:tc>
+          <w:tcPr>
+            <w:tcW w:type="dxa" w:w="2300"/>
+          </w:tcPr>
+          <w:p>
+            <w:r>
+              <w:t>Resolved -- decided, NOT yet built. SUPERSEDES #374 'as-is' for explicit declines on a still-valid request (the rest of #374 is retained). A guardian's explicit decline lets the minor resend or change the guardian email; the decline frames 5491:8241 / 5501:8453 must be wired to this logic (this settles #374's 'archive or rewrite' choice: rewrite and wire). MAX 3 declines; after the 3rd the account moves to pending deletion via the existing refuseConsentAndScheduleDeletion path (sessions revoked, 30-day grace, anonymise, purge rule #375). An expired request / second lapse does NOT count among the 3 and goes straight to the original plan (pending deletion). A guardian withdrawing consent after approval goes straight to the original plan. Changing the guardian email does NOT reset the count. Abuse protection: a cap on requests per day and a 'don't contact me again' option for the recipient. Retained from #374: 72h token TTL (GUARDIAN_CONSENT_TOKEN_TTL_HOURS), first lapse = automatic re-send plus a reminder to the minor, second lapse = implicit decline -&gt; original plan. Known bug to fix with this work: GuardianConsentPage currently treats 'declined' as pending (audit section 5 item 5). Note: between declines the minor's sessions must stay valid for them to resend; today every decline revokes sessions and 'declined' is terminal in code, so a per-account decline counter and a revised state model are new build work. Not yet in the legal copy draft (to add). Build register B-102, B-003. Forward-pointer: #374.</w:t>
+            </w:r>
+          </w:p>
+        </w:tc>
+      </w:tr>
+      <w:tr>
+        <w:tc>
+          <w:tcPr>
+            <w:tcW w:type="dxa" w:w="500"/>
+          </w:tcPr>
+          <w:p>
+            <w:r>
+              <w:t>390</w:t>
+            </w:r>
+          </w:p>
+        </w:tc>
+        <w:tc>
+          <w:tcPr>
+            <w:tcW w:type="dxa" w:w="4700"/>
+          </w:tcPr>
+          <w:p>
+            <w:r>
+              <w:t>Date of birth correction: how a mistyped DOB is fixed once it is read-only, and what re-runs.</w:t>
+            </w:r>
+          </w:p>
+        </w:tc>
+        <w:tc>
+          <w:tcPr>
+            <w:tcW w:type="dxa" w:w="1850"/>
+          </w:tcPr>
+          <w:p>
+            <w:r>
+              <w:t>docs/contest-spec-decisions-2026-10-14 (docs only, 2026-10-14; founder decisions recorded from the session of 2026-10-14; docs/contest-spec.md)</w:t>
+            </w:r>
+          </w:p>
+        </w:tc>
+        <w:tc>
+          <w:tcPr>
+            <w:tcW w:type="dxa" w:w="2300"/>
+          </w:tcPr>
+          <w:p>
+            <w:r>
+              <w:t>Resolved -- decided, NOT yet built. Resolves the open point in #367 ('a user who mistypes their date of birth at the Age Gate has no self-service correction path'). DOB stays read-only after the Age Gate for users. Support can correct it through an admin action (a tool to be built if none exists; none exists today), audited. A correction RE-RUNS the age-tier checks (under-13 / under-16 / under-18 flags, card-verification policy, restrictions). The guardian flow is RE-TRIGGERED when a correction turns an adult account that has never gone through the flow into a minor account. Note: the existing age-reclassification sweep (#349) recomputes isMinor/isUnder16 flags but does not create Guardian rows, so the re-trigger is new build work; the exact audit record fields and the effect on an in-flight request are not specified. Not yet in the legal copy draft. Build register B-103, B-104. Forward-pointer: #367.</w:t>
+            </w:r>
+          </w:p>
+        </w:tc>
+      </w:tr>
+      <w:tr>
+        <w:tc>
+          <w:tcPr>
+            <w:tcW w:type="dxa" w:w="500"/>
+          </w:tcPr>
+          <w:p>
+            <w:r>
+              <w:t>391</w:t>
+            </w:r>
+          </w:p>
+        </w:tc>
+        <w:tc>
+          <w:tcPr>
+            <w:tcW w:type="dxa" w:w="4700"/>
+          </w:tcPr>
+          <w:p>
+            <w:r>
+              <w:t>Hosting region: where API, database and cache run.</w:t>
+            </w:r>
+          </w:p>
+        </w:tc>
+        <w:tc>
+          <w:tcPr>
+            <w:tcW w:type="dxa" w:w="1850"/>
+          </w:tcPr>
+          <w:p>
+            <w:r>
+              <w:t>docs/contest-spec-decisions-2026-10-14 (docs only, 2026-10-14; founder decisions recorded from the session of 2026-10-14; docs/contest-spec.md)</w:t>
+            </w:r>
+          </w:p>
+        </w:tc>
+        <w:tc>
+          <w:tcPr>
+            <w:tcW w:type="dxa" w:w="2300"/>
+          </w:tcPr>
+          <w:p>
+            <w:r>
+              <w:t>Resolved -- decided; render.yaml already moved (PR #392, infra/render-eu-region-env-vars). EU hosting for everything: Render services in Frankfurt (region cannot be changed after creation), and Neon (Postgres) and Upstash (Redis) created in EU regions (manual account steps, not visible from the repo). This is the Decision Log entry CLAUDE.md said was still needed for that PR. Build register B-018, B-088, B-090. Counsel-pending: cross-border transfer assessment (legal copy Part C row 9) unchanged.</w:t>
+            </w:r>
+          </w:p>
+        </w:tc>
+      </w:tr>
+      <w:tr>
+        <w:tc>
+          <w:tcPr>
+            <w:tcW w:type="dxa" w:w="500"/>
+          </w:tcPr>
+          <w:p>
+            <w:r>
+              <w:t>392</w:t>
+            </w:r>
+          </w:p>
+        </w:tc>
+        <w:tc>
+          <w:tcPr>
+            <w:tcW w:type="dxa" w:w="4700"/>
+          </w:tcPr>
+          <w:p>
+            <w:r>
+              <w:t>Founder's answers to the ten items of build register Section 6 (decided 2026-10-14), and Contest/Competition scope.</w:t>
+            </w:r>
+          </w:p>
+        </w:tc>
+        <w:tc>
+          <w:tcPr>
+            <w:tcW w:type="dxa" w:w="1850"/>
+          </w:tcPr>
+          <w:p>
+            <w:r>
+              <w:t>docs/contest-spec-decisions-2026-10-14 (docs only, 2026-10-14; founder decisions recorded from the session of 2026-10-14; docs/contest-spec.md)</w:t>
+            </w:r>
+          </w:p>
+        </w:tc>
+        <w:tc>
+          <w:tcPr>
+            <w:tcW w:type="dxa" w:w="2300"/>
+          </w:tcPr>
+          <w:p>
+            <w:r>
+              <w:t>Resolved -- recorded; the numbering below is the founder's answer order. docs/build-register.md Section 6 has no numbered list, so the mapping to its bullets is by subject and each assumption is flagged. (1) 'Don't defer anything: all launch-blocking, build everything now.' Maps to Section 6b '#378 vs Competition deferral' (and to #378 generally). The Competition umbrella and Create Competition are now IN SCOPE (no longer deferred by Build Plan 2.2 / #72 / #73). Build register B-100, B-052. (2) 'Voting should be built; it is already documented; contest is not admin judged.' Maps to 6b 'Contest voting'. Resolved by #381-#388 and docs/contest-spec.md. (3) 'Build the group feed, it is needed.' Maps to 6b 'Community Group feed'. SUPERSEDES #281 (no composer/feed designed) and the Community Groups frontend entry referred to as #294 in CLAUDE.md (that number has no row in this Decision Log table). A group-post model and endpoint are new build work: B-101, B-068. (4) 'Ship the correct one.' ASSUMED mapping: 6b 'Password-change emails' ('1380:2297 ... which of the two, or neither, should ship is not decided'). 1380:2318 matches shipped behaviour (immediate change, sessions revoked). The register recorded no explicit recommendation, so which frame is 'correct' is for the founder to confirm. Build register B-105, B-069. (5) 'Yes, verify them.' Maps to 6b '#378 and NotInspected'; register text agreed: 'They are placed in W8 as verification' / 'this register treats them as needing verification before launch'. Build register B-106. (6) Decline flow: maps to 6b '#374' and 6c decline frames; resolved by #389. (7) 'Support must be able to correct DOB; build the tool if none exists.' Maps to 6b '#367 open points'; resolved by #390. (8) 'I agree.' UNMAPPED: the repo does not identify which recommendation was agreed. Candidates quoted from the register's own 'treated as' text: 6c Guardian Details ('I treated the Figma as intended'); 6c Change Guardian Email ('I treated the code as intended'); 6c Register/Create Profile ('treated as stale'). Not resolved here; founder to say which. (9) 'Yes: legacy accounts without a username must complete profile before accessing the platform.' Maps to 6b '#369 open points' (legacy accounts) and settles that part of #369 (the gate B-027/B-031 applies to them; the placeholder name remains open). (10) 'I agree.' UNMAPPED, as (8). Also noted: Preferred Club as optional free text (not clubAffiliationId) is already recorded in #367; no new entry. Full detail: docs/contest-spec.md (history only). Build register Section 8.</w:t>
             </w:r>
           </w:p>
         </w:tc>

</xml_diff>

<commit_message>
docs: record founder confirmations of 2026-10-14/15 (Decision Log #393, #392 corrections)
Co-Authored-By: Claude Sonnet 5.5 <noreply@anthropic.com>
</commit_message>
<xml_diff>
--- a/docs/Soccernity_MVP_Build_Plan_v1.7.docx
+++ b/docs/Soccernity_MVP_Build_Plan_v1.7.docx
@@ -20075,6 +20075,9 @@
             <w:r>
               <w:t>Resolved (Task 2 of 3 -- Figma design only; no app/backend code; the code wiring is Task 3, tracked under #239). Report: docs/sprint-2-admin-contest-screens-report.md. Screens built against the real cycle -&gt; 3 weekly rounds -&gt; open-final -&gt; crown state machine and the endpoints merged in #241: a 6-state phase-driven Contest Console hub (GET /admin/contest/current -- No Cycle, Vacant, Weeks In Progress [week_1 and weeks_1_2 share one frame, structurally identical], All Weeks Judged, Final Live, Crowned), Start a Cycle in three states incl. the optional explicit rounds[] path and the real 409 (POST /admin/contest/cycles), Judge Week in four states incl. the supported empty-winners 'thin week' and the sequential-judging block (POST .../rounds/:week/results), an Open the Final confirm dialog (POST .../final/open), Crown Winners with the finalist pool DEDUPLICATED by userId because CrownCycleDto rejects a repeated user (POST .../crown), and Cycle History (GET /admin/contest/cycles). No 'delete cycle' screen exists anywhere -- there is no endpoint and a cycle cannot be deleted or re-judged (the single biggest departure from the archived frames, which had a Delete Task screen). No frame renders a field the backend does not return (checked line by line against contest.types.ts and all three DTOs); blocked states carry the backend's real message strings. All 16 screens carry a real Admin Shell (6014:12948) instance with Active=Contest and Show Action Button=false (per #51, every screen has an in-content primary). Light mode only; 0 unbound / 0 off-palette / 0 brand/green-tint-28 / 0 new colours on every authored node (proven -- the shell-less Design Notes frame audits at 111 bound / 0 unbound; the per-frame 48 unbound are the Admin Shell component's own pre-existing debt, confirmed by auditing variant 6014:12944 directly). Blocked/destructive buttons are navy; semantic/alert is used only as a non-text indicator bar. A real placement bug was caught by the overlap check -- the parked Admin Shell COMPONENT_SET occupies x 37943-53343, y -16153 to -14929, and a whole row had been built on top of it; two rows relocated, final check 0 overlaps. The 9 stale frames (2363:2244, 2363:3446, 5403:6640, 5403:6753, 5403:6866, 5403:6979, 5403:7092, 5405:8277, 5405:8390) were reference-checked across all 123,335 page nodes (0 inbound references, none a flow start) then hidden, 'ARCHIVED -- ' prefixed and moved to an archive strip -- not deleted. Caught before archiving, not after: archiving Contest - Schedule Task would have dropped the twice-retrofitted Calendar for scheduled task component (#53, #178) to zero instances -- it is instead reused as the open-state date picker on the Custom Weekly Windows screen. Open follow-ups for figma-design-system: the calendar 2 variant (2365:2034) is now at zero instances, and the calendar's internal sample month still reads 'January 2022'. #239 stays Open -- Task 3 (figma-to-code) must wire apps/admin's Contest section to these screens and the four write endpoints.</w:t>
             </w:r>
+            <w:r>
+              <w:t xml:space="preserve"> NOTE 2026-10-15: the screens described here are built on the admin-judged model and are superseded by #381 and build register B-095/B-097 (admin Contest tab redesign; docs/contest-spec.md). Original text kept.</w:t>
+            </w:r>
           </w:p>
         </w:tc>
       </w:tr>
@@ -20116,6 +20119,9 @@
           <w:p>
             <w:r>
               <w:t>Resolved -- CLOSES #239. Report: docs/sprint-2-admin-contest-to-code-report.md. apps/admin's Contest section is now real: new src/api/contest.ts client (mirrors contest.types.ts Admin* shapes, via adminFetch), and 7 screens replacing the 4 deleted stub files (ContestTasksPage / ContestTaskFormPages / contestBackendNote / old contest.test.tsx). ContestConsolePage (route /contest) is the phase-branching hub (GET /admin/contest/current) and the ONLY entry point to the write actions -- its phase-contextual primary routes to Judge week N (vacant/week_1/weeks_1_2) / Open the final (weeks_1_3) / Crown winners (final_live) / Start a new cycle (crowned), so the sequential-judging rule is enforced by the UI shape before any 409. ContestStartCyclePage (/contest/cycles/new -- POST /admin/contest/cycles; auto or explicit rounds[]; the real 409 renders as a blocked state with a forward action). ContestJudgeWeekPage (/contest/cycles/:id/rounds/:week -- GET cycle + POST .../rounds/:week/results; open-round position selector, already-judged read-only, the supported empty-winners 'thin week', and the out-of-sequence block, all driven by the round's real state not a query param). ContestOpenFinalPage (/contest/cycles/:id/final/open) and ContestCrownWinnersPage (/contest/cycles/:id/crown -- finalist pool DEDUPLICATED by userId per CrownCycleDto; min-1 required, ties allowed). ContestHistoryPage (/contest/history -- GET /admin/contest/cycles). ContestCycleDetailPage (/contest/cycles/:id -- read-only past-cycle view; 404 -&gt; honest not-found state). Nav unchanged (contest item stays /contest). No services/api or apps/web code touched. Grep confirms zero ContestTask / contestBackendNote / 'Target entry count' / Hashtag / /contest/tasks / 'Task name' references remain in apps/admin/src. Verification: apps/admin vitest 16 files / 66 tests, 0 failures (contest.test.tsx 3 -&gt; 14 tests; covers every hub phase branch, create-cycle + 409, judge-week position assign + submit + empty thin week, crown deduped pool, 404); npx tsc --noEmit, npm run lint, npm run build (@soccernity/admin) all clean; dev-server smoke test all 7 Contest routes -&gt; HTTP 200, clean log. The full 3-task arc closing #239: #241 (Task 1, backend reads) + #242 (Task 2, Figma screens) + #243 (Task 3, this pass).</w:t>
+            </w:r>
+            <w:r>
+              <w:t xml:space="preserve"> NOTE 2026-10-15: the wiring described here (judge week, open final, crown) is on the admin-judged model and is superseded by #381 and build register B-095/B-097; the backend it targets (#218/#241) is replaced by B-091. Original text kept. Separately: CLAUDE.md cites a Community Groups frontend entry as #294, but this table has no row #293 or #294; none was invented here.</w:t>
             </w:r>
           </w:p>
         </w:tc>
@@ -26643,6 +26649,51 @@
           <w:p>
             <w:r>
               <w:t>Resolved -- recorded; the numbering below is the founder's answer order. docs/build-register.md Section 6 has no numbered list, so the mapping to its bullets is by subject and each assumption is flagged. (1) 'Don't defer anything: all launch-blocking, build everything now.' Maps to Section 6b '#378 vs Competition deferral' (and to #378 generally). The Competition umbrella and Create Competition are now IN SCOPE (no longer deferred by Build Plan 2.2 / #72 / #73). Build register B-100, B-052. (2) 'Voting should be built; it is already documented; contest is not admin judged.' Maps to 6b 'Contest voting'. Resolved by #381-#388 and docs/contest-spec.md. (3) 'Build the group feed, it is needed.' Maps to 6b 'Community Group feed'. SUPERSEDES #281 (no composer/feed designed) and the Community Groups frontend entry referred to as #294 in CLAUDE.md (that number has no row in this Decision Log table). A group-post model and endpoint are new build work: B-101, B-068. (4) 'Ship the correct one.' ASSUMED mapping: 6b 'Password-change emails' ('1380:2297 ... which of the two, or neither, should ship is not decided'). 1380:2318 matches shipped behaviour (immediate change, sessions revoked). The register recorded no explicit recommendation, so which frame is 'correct' is for the founder to confirm. Build register B-105, B-069. (5) 'Yes, verify them.' Maps to 6b '#378 and NotInspected'; register text agreed: 'They are placed in W8 as verification' / 'this register treats them as needing verification before launch'. Build register B-106. (6) Decline flow: maps to 6b '#374' and 6c decline frames; resolved by #389. (7) 'Support must be able to correct DOB; build the tool if none exists.' Maps to 6b '#367 open points'; resolved by #390. (8) 'I agree.' UNMAPPED: the repo does not identify which recommendation was agreed. Candidates quoted from the register's own 'treated as' text: 6c Guardian Details ('I treated the Figma as intended'); 6c Change Guardian Email ('I treated the code as intended'); 6c Register/Create Profile ('treated as stale'). Not resolved here; founder to say which. (9) 'Yes: legacy accounts without a username must complete profile before accessing the platform.' Maps to 6b '#369 open points' (legacy accounts) and settles that part of #369 (the gate B-027/B-031 applies to them; the placeholder name remains open). (10) 'I agree.' UNMAPPED, as (8). Also noted: Preferred Club as optional free text (not clubAffiliationId) is already recorded in #367; no new entry. Full detail: docs/contest-spec.md (history only). Build register Section 8.</w:t>
+            </w:r>
+            <w:r>
+              <w:t xml:space="preserve"> CORRECTION/EXTENSION 2026-10-15 (docs/decisions-confirmed-2026-10-15; the original text above is kept as written; see #393): Item 8 ("I agree") is no longer unmapped. It is Preferred Club: free text on the profile, held in a NEW text field (clubAffiliationId is a FK to a club page and is not used for it). Build register B-038 (storage) and B-081/B-083 (screens). Item 10 ("I agree") is no longer unmapped. It is the breakpoint: 390px is the canonical mobile width (#86). Create Profile mobile frame 1629:2449 is currently 430px and must be normalised to 390 by the design agent (B-006). Item 4 ("Ship the correct one") is resolved, not assumed: BOTH password-change email frames ship, each with its own role. 1380:2318 = confirmation email sent after a password reset is completed. 1380:2297 = security alert sent when a suspicious password change occurs on the account (B-105, B-069). The earlier statement that 1380:2297 describes an email-link flow that does not exist is superseded by this role.</w:t>
+            </w:r>
+          </w:p>
+        </w:tc>
+      </w:tr>
+      <w:tr>
+        <w:tc>
+          <w:tcPr>
+            <w:tcW w:type="dxa" w:w="500"/>
+          </w:tcPr>
+          <w:p>
+            <w:r>
+              <w:t>393</w:t>
+            </w:r>
+          </w:p>
+        </w:tc>
+        <w:tc>
+          <w:tcPr>
+            <w:tcW w:type="dxa" w:w="4700"/>
+          </w:tcPr>
+          <w:p>
+            <w:r>
+              <w:t>Founder confirmations 2026-10-15: Guardian Details and Change Guardian Email forms, Phase 1 10th-place tie, confirmation of previously ASSUMED contest-spec items, and treatment of historical follow/post points.</w:t>
+            </w:r>
+          </w:p>
+        </w:tc>
+        <w:tc>
+          <w:tcPr>
+            <w:tcW w:type="dxa" w:w="1850"/>
+          </w:tcPr>
+          <w:p>
+            <w:r>
+              <w:t>docs/decisions-confirmed-2026-10-15 (docs only, 2026-10-15; founder confirmations of 2026-10-14/15)</w:t>
+            </w:r>
+          </w:p>
+        </w:tc>
+        <w:tc>
+          <w:tcPr>
+            <w:tcW w:type="dxa" w:w="2300"/>
+          </w:tcPr>
+          <w:p>
+            <w:r>
+              <w:t>Resolved -- recorded; DECIDED, NOT BUILT. Extends #392 (corrections to items 4, 8 and 10 are in #392's Status cell). (a) Guardian Details (5108:6627 / 5539:7354): Option A. A single "Guardian's full name" field and NO country select on this step. Country is collected once, at the Age Gate (#368). The user fills this form, not the guardian. #63 stands. The code (first/last split plus required country select) must be changed to match: B-075. DTO already takes a single name, so no backend change; B-075 must not ship before B-023/B-025/B-073 because card verification currently reads Guardian.declaredCountry. (b) Change Guardian Email (5498:7164 / 5501:8536): the frames are updated to add the guardian name and relationship fields the code already requires (#365). The code is intended; B-004 stands as written (frames-update direction confirmed). (c) Tie at 10th place in Phase 1: exactly ONE user qualifies as 10th. Tie-breaker = whoever reached the tied qualifying-engagement total earliest, by timestamp of the engagement that brought their tally to that total, from the log of qualifying engagement (removed engagement excluded). If still identical, the earlier entry submission wins. (d) Confirmed (no longer ASSUMED): vote tie-break = earliest vote reached, from the non-retracted vote log by timestamp; the weekly view limit is a required numeric field on the admin form; revoking a point also reduces that day's cap counter; entries are accepted in Phase 1 (days 1-4) only; votes lock at 23:59:59 on day 7 and winners are confirmed then; the contest photo view threshold is fixed at 5 seconds; removed-then-restored engagement earns its point once; placement-point defaults are weekly contest 500/300/150, monthly final 2,000/1,200/600, other competitions default to the weekly figures; admins can override per contest/competition at creation. (e) The platform is not live and no points or ledger rows exist, so the follow/post point removal (B-094) needs no historical-row handling; existing rows are simply reset. Still open (not resolved here): counsel/legal-copy gaps (decline cap, DOB correction, minors' view/dwell heartbeat data, minors' baseline points); Competition umbrella detailed scoring spec (B-100); Community Group feed data model (B-101); placeholder name for incomplete profiles (#369); Log Book sections 6.3, 23.3 and 24.3 (separate PR). Full detail: docs/contest-spec.md Section 14b, docs/build-register.md Section 9.</w:t>
             </w:r>
           </w:p>
         </w:tc>

</xml_diff>

<commit_message>
docs: Log Book v2.14 - reconcile 6.3/23.3/24.3 with contest and points model (Decision Log #381-#393)
Co-Authored-By: Claude Sonnet 5.5 <noreply@anthropic.com>
</commit_message>
<xml_diff>
--- a/docs/Soccernity_MVP_Build_Plan_v1.7.docx
+++ b/docs/Soccernity_MVP_Build_Plan_v1.7.docx
@@ -64,7 +64,7 @@
           <w:sz w:val="22"/>
           <w:szCs w:val="22"/>
         </w:rPr>
-        <w:t xml:space="preserve">Version 1.7 — Companion to the Inventor's Log Book v2.13</w:t>
+        <w:t>Version 1.7 — Companion to the Inventor's Log Book v2.14</w:t>
       </w:r>
     </w:p>
     <w:p>
@@ -1115,7 +1115,7 @@
         <w:spacing w:after="160" w:line="276"/>
       </w:pPr>
       <w:r>
-        <w:t xml:space="preserve">This is a tactical execution document, not a strategy document — the strategic and inventive record lives in the Inventor's Log Book v2.13 (referenced throughout as “the Log Book”), and this plan does not repeat that reasoning. Every section here is written to be actioned directly: an engineer should be able to open Section 3 and start a database schema, or open Section 6 and start Sprint 1, without reading anything else first.</w:t>
+        <w:t>This is a tactical execution document, not a strategy document — the strategic and inventive record lives in the Inventor's Log Book v2.14 (referenced throughout as “the Log Book”), and this plan does not repeat that reasoning. Every section here is written to be actioned directly: an engineer should be able to open Section 3 and start a database schema, or open Section 6 and start Sprint 1, without reading anything else first.</w:t>
       </w:r>
     </w:p>
     <w:p>

</xml_diff>

<commit_message>
docs: record founder decisions 2026-10-15/16 (Decision Log #394-#401)
Docs only. Adds Decision Log #394-#401 (sign-up/profile, decline and
withdrawal, Block, 2FA recovery, admin moderation, contest admin form,
contest calendar, vote toggle); appends a "Superseded by #400 for the lock
time" pointer to #393 (vote lock 23:59:59 -> 20:00:00 days 7/14/21).

docs/contest-spec.md: sections 4, 4a, 5, 7, 8, 10, 10b, 11, 12, 13, 14c, 15,
16 updated; followers switch is week 4 only; Between Weeks kept.

docs/build-register.md: B-107..B-112 added; status lines appended to 36
touched rows (original text unchanged); waves and totals re-reconciled
(112 B-IDs, 146 gap frames); Section 10 added.

CLAUDE.md: one status bullet.

Co-Authored-By: Claude Sonnet 5.5 <noreply@anthropic.com>
</commit_message>
<xml_diff>
--- a/docs/Soccernity_MVP_Build_Plan_v1.7.docx
+++ b/docs/Soccernity_MVP_Build_Plan_v1.7.docx
@@ -26694,6 +26694,345 @@
           <w:p>
             <w:r>
               <w:t>Resolved -- recorded; DECIDED, NOT BUILT. Extends #392 (corrections to items 4, 8 and 10 are in #392's Status cell). (a) Guardian Details (5108:6627 / 5539:7354): Option A. A single "Guardian's full name" field and NO country select on this step. Country is collected once, at the Age Gate (#368). The user fills this form, not the guardian. #63 stands. The code (first/last split plus required country select) must be changed to match: B-075. DTO already takes a single name, so no backend change; B-075 must not ship before B-023/B-025/B-073 because card verification currently reads Guardian.declaredCountry. (b) Change Guardian Email (5498:7164 / 5501:8536): the frames are updated to add the guardian name and relationship fields the code already requires (#365). The code is intended; B-004 stands as written (frames-update direction confirmed). (c) Tie at 10th place in Phase 1: exactly ONE user qualifies as 10th. Tie-breaker = whoever reached the tied qualifying-engagement total earliest, by timestamp of the engagement that brought their tally to that total, from the log of qualifying engagement (removed engagement excluded). If still identical, the earlier entry submission wins. (d) Confirmed (no longer ASSUMED): vote tie-break = earliest vote reached, from the non-retracted vote log by timestamp; the weekly view limit is a required numeric field on the admin form; revoking a point also reduces that day's cap counter; entries are accepted in Phase 1 (days 1-4) only; votes lock at 23:59:59 on day 7 and winners are confirmed then; the contest photo view threshold is fixed at 5 seconds; removed-then-restored engagement earns its point once; placement-point defaults are weekly contest 500/300/150, monthly final 2,000/1,200/600, other competitions default to the weekly figures; admins can override per contest/competition at creation. (e) The platform is not live and no points or ledger rows exist, so the follow/post point removal (B-094) needs no historical-row handling; existing rows are simply reset. Still open (not resolved here): counsel/legal-copy gaps (decline cap, DOB correction, minors' view/dwell heartbeat data, minors' baseline points); Competition umbrella detailed scoring spec (B-100); Community Group feed data model (B-101); placeholder name for incomplete profiles (#369); Log Book sections 6.3, 23.3 and 24.3 (separate PR). Full detail: docs/contest-spec.md Section 14b, docs/build-register.md Section 9.</w:t>
+            </w:r>
+            <w:r>
+              <w:t xml:space="preserve"> [2026-10-16: Superseded by #400 for the lock time -- votes now lock at 20:00:00 on days 7, 14 and 21, not at 23:59:59 on day 7, and weekly winners are confirmed when the tally freezes at 20:00. The other confirmations in (d) stand.]</w:t>
+            </w:r>
+          </w:p>
+        </w:tc>
+      </w:tr>
+      <w:tr>
+        <w:tc>
+          <w:tcPr>
+            <w:tcW w:type="dxa" w:w="500"/>
+          </w:tcPr>
+          <w:p>
+            <w:r>
+              <w:t>394</w:t>
+            </w:r>
+          </w:p>
+        </w:tc>
+        <w:tc>
+          <w:tcPr>
+            <w:tcW w:type="dxa" w:w="4700"/>
+          </w:tcPr>
+          <w:p>
+            <w:r>
+              <w:t>Sign-up and Create Profile details: Create Profile fields, optional profile picture, sensitive-content 'rephrase' state, Age Gate wording and Back behaviour, activation and approval wording, routing of a restricted-pending minor.</w:t>
+            </w:r>
+          </w:p>
+        </w:tc>
+        <w:tc>
+          <w:tcPr>
+            <w:tcW w:type="dxa" w:w="1850"/>
+          </w:tcPr>
+          <w:p>
+            <w:r>
+              <w:t>docs/decisions-confirmed-2026-10-16 (docs only, 2026-10-16; founder decisions 2026-10-15/16; docs/contest-spec.md, docs/build-register.md)</w:t>
+            </w:r>
+          </w:p>
+        </w:tc>
+        <w:tc>
+          <w:tcPr>
+            <w:tcW w:type="dxa" w:w="2300"/>
+          </w:tcPr>
+          <w:p>
+            <w:r>
+              <w:t>Resolved -- recorded; DECIDED, NOT BUILT. Source: founder decisions 2026-10-15/16. Extends #367, #369, #371 and #366. (A1) Create Profile as drawn by W0 Figma pass B: Full Name is kept, prefilled from Register and editable; Country is shown read-only (the derived value is authoritative, #368). (A2) The profile picture is OPTIONAL; the wording of the automatic image check shown to the user is [COPY PENDING LEGAL REVIEW]. (A3) A Bio or Preferred Club value flagged by the pre-publication sensitive-content screen (#366) shows an inline 'please rephrase' state on that field. (A4) Age Gate: the heading and subheading are reworded to cover date of birth plus country (wording [COPY PENDING LEGAL REVIEW]); after a below-minimum-age denial, date of birth and country are CLEARED when the user presses Back. (A5) The Activation screen and the guardian-approval email currently say everything is 'switched on' although the flow continues to Create Profile (#367); both are reworded to 'approved, continue registration' (wording [COPY PENDING LEGAL REVIEW]). (A6) A restricted-pending minor gets NO new Create Profile screen: that minor is routed to the Restricted Pending page on every login (this answers the open point in #367 about what 'Create Profile is blocked for a restricted-pending minor' looks like on screen, and accepts the PROPOSAL recorded by W0 Figma pass D). Build register: B-001, B-002, B-006, B-009, B-028, B-030, B-035, B-036, B-038, B-073, B-077, B-081; Figma re-sync in B-107. STILL OPEN: counsel wording for every [COPY PENDING LEGAL REVIEW] item; the placeholder name for incomplete profiles (#369). Full detail: docs/build-register.md Section 10.</w:t>
+            </w:r>
+          </w:p>
+        </w:tc>
+      </w:tr>
+      <w:tr>
+        <w:tc>
+          <w:tcPr>
+            <w:tcW w:type="dxa" w:w="500"/>
+          </w:tcPr>
+          <w:p>
+            <w:r>
+              <w:t>395</w:t>
+            </w:r>
+          </w:p>
+        </w:tc>
+        <w:tc>
+          <w:tcPr>
+            <w:tcW w:type="dxa" w:w="4700"/>
+          </w:tcPr>
+          <w:p>
+            <w:r>
+              <w:t>Guardian consent after a decline: what the minor sees, the third-decline outcome, the withdrawal page link and throttle, and a DOB correction while a request is in flight.</w:t>
+            </w:r>
+          </w:p>
+        </w:tc>
+        <w:tc>
+          <w:tcPr>
+            <w:tcW w:type="dxa" w:w="1850"/>
+          </w:tcPr>
+          <w:p>
+            <w:r>
+              <w:t>docs/decisions-confirmed-2026-10-16 (docs only, 2026-10-16; founder decisions 2026-10-15/16; docs/contest-spec.md, docs/build-register.md)</w:t>
+            </w:r>
+          </w:p>
+        </w:tc>
+        <w:tc>
+          <w:tcPr>
+            <w:tcW w:type="dxa" w:w="2300"/>
+          </w:tcPr>
+          <w:p>
+            <w:r>
+              <w:t>Resolved -- recorded; DECIDED, NOT BUILT. Source: founder decisions 2026-10-15/16. Extends and amends #389; builds on #374, #340 and #390. (B1) The decline frame already exists in Figma (5491:8241 / 5501:8453). After decline 1 and decline 2 the minor sees the existing decline page. It is shown at the minor's next LOGIN ATTEMPT, before a session exists (#374 revokes all sessions and blocks login, so it cannot be shown inside a session): the server answers the login with a 'declined' result instead of issuing a token. BACKEND TO CONFIRM: backend-api must confirm this is buildable, including how the page's resend / change-guardian-email actions are authorised without a session (those routes are JwtAuthGuard-gated today) and that it is consistent with the note in #389 that sessions must stay valid between declines. Recorded as the intended behaviour, not as a verified design. (B2) Decline 3: the account enters the deletion sequence and the minor receives an EMAIL ONLY (no page). No decline count is shown anywhere to anyone; the counter is internal. There is NO 'don't contact me again' option. There is NO requests-per-day cap (only one request can run at a time). Three declines in one day delete the account immediately. Three declines in total, ever, per account. Founder decision; no counsel review needed. This WITHDRAWS the abuse-protection sentence of #389 (a cap on requests per day and a 'don't contact me again' option) and supersedes the open points of build register B-102 and B-003 accordingly; the rest of #389 stands (72h token; first lapse = automatic re-send; expiry, second lapse and post-approval withdrawal go straight to pending deletion and do not count among the three; changing the guardian email does not reset the count). (B3) Guardian withdrawal page (B-013): a LINK is added to the consent email and to the approved screen that pre-fills the code. Throttle ('Too many attempts'): a fixed window held in configuration, no countdown shown, 'Try again' returns to frame 1. 'Request a new link' (expired or used link) returns to frame 1 where the guardian re-enters their email; the page reads identically whether or not an account matched. BACKEND TO CONFIRM: the withdrawal token is issued only when a withdrawal is requested (#340), so what a link in the consent email can pre-fill at that moment must be confirmed. (B4) DOB correction (B-103, B-104; #390): if the corrected age tier changes, an in-flight guardian request is CANCELLED and restarted. This settles the 'effect on an in-flight request' point #390 left open. Build register: B-003, B-013, B-080, B-102, B-103, B-104, B-110 (declined-login result), B-112 (withdrawal link); Figma re-sync in B-107. STILL OPEN: counsel wording; the length of the throttle window (stated as configuration); whether 'delete the account immediately' on a third decline also skips the 30-day grace of #375 (recorded as: enters the deletion sequence immediately, grace not altered by this entry); whether a restart caused by a DOB correction resets the decline counter; the shipped per-minor guardian-email-change cap (5 per 24h, #365) is a separate control and is not altered here.</w:t>
+            </w:r>
+          </w:p>
+        </w:tc>
+      </w:tr>
+      <w:tr>
+        <w:tc>
+          <w:tcPr>
+            <w:tcW w:type="dxa" w:w="500"/>
+          </w:tcPr>
+          <w:p>
+            <w:r>
+              <w:t>396</w:t>
+            </w:r>
+          </w:p>
+        </w:tc>
+        <w:tc>
+          <w:tcPr>
+            <w:tcW w:type="dxa" w:w="4700"/>
+          </w:tcPr>
+          <w:p>
+            <w:r>
+              <w:t>Block: separate own-profile and other-user profile variants, and the Block model.</w:t>
+            </w:r>
+          </w:p>
+        </w:tc>
+        <w:tc>
+          <w:tcPr>
+            <w:tcW w:type="dxa" w:w="1850"/>
+          </w:tcPr>
+          <w:p>
+            <w:r>
+              <w:t>docs/decisions-confirmed-2026-10-16 (docs only, 2026-10-16; founder decisions 2026-10-15/16; docs/contest-spec.md, docs/build-register.md)</w:t>
+            </w:r>
+          </w:p>
+        </w:tc>
+        <w:tc>
+          <w:tcPr>
+            <w:tcW w:type="dxa" w:w="2300"/>
+          </w:tcPr>
+          <w:p>
+            <w:r>
+              <w:t>Resolved -- recorded; DECIDED, NOT BUILT. Source: founder decisions 2026-10-15/16. Settles the semantics left undefined for Block in #371 and build register B-039. (C1) Own profile and other-user profile are two SEPARATE variants; the Block action lives on the other-user variant (mobile included). (C2) A Block model is created. Adopted as decided: blocking hides the blocked user's posts from the blocker; stops messages in both directions; removes follows in both directions; has an optional reason field; can be undone (unblock); and there is a blocked-users list in Settings. The data model and endpoints are backend work. Build register: B-039 (extended: model, endpoints, unblock, list, reason), B-082, B-067, B-107 (remaining Figma states and the mobile trigger), B-108 (frontend, Settings list, unblock). NOT STATED, so left open and not decided here: whether the blocked user is told; whether blocking also affects Bants rooms, comments, likes, search results, group rosters and the leaderboard; whether an unblock restores the removed follows; how Block interacts with the guardian-consent, under-16 and adult-to-minor rules (#346, #347).</w:t>
+            </w:r>
+          </w:p>
+        </w:tc>
+      </w:tr>
+      <w:tr>
+        <w:tc>
+          <w:tcPr>
+            <w:tcW w:type="dxa" w:w="500"/>
+          </w:tcPr>
+          <w:p>
+            <w:r>
+              <w:t>397</w:t>
+            </w:r>
+          </w:p>
+        </w:tc>
+        <w:tc>
+          <w:tcPr>
+            <w:tcW w:type="dxa" w:w="4700"/>
+          </w:tcPr>
+          <w:p>
+            <w:r>
+              <w:t>Authenticator-app two-factor: backup codes, lost-device recovery, turn-off, manual key and the login-time code prompt.</w:t>
+            </w:r>
+          </w:p>
+        </w:tc>
+        <w:tc>
+          <w:tcPr>
+            <w:tcW w:type="dxa" w:w="1850"/>
+          </w:tcPr>
+          <w:p>
+            <w:r>
+              <w:t>docs/decisions-confirmed-2026-10-16 (docs only, 2026-10-16; founder decisions 2026-10-15/16; docs/contest-spec.md, docs/build-register.md)</w:t>
+            </w:r>
+          </w:p>
+        </w:tc>
+        <w:tc>
+          <w:tcPr>
+            <w:tcW w:type="dxa" w:w="2300"/>
+          </w:tcPr>
+          <w:p>
+            <w:r>
+              <w:t>Resolved -- recorded; DECIDED, NOT BUILT. Source: founder decisions 2026-10-15/16. Extends #378 (authenticator app, not SMS) and fills the points W0 Figma pass D left SCOPE OPEN. (C3) Adopted for authenticator-app 2FA: backup codes; lost-device recovery; turning 2FA off with password re-entry; a manual-key fallback when the QR cannot be scanned; and the login-time code prompt. All user-facing copy is [COPY PENDING LEGAL REVIEW]. Build register: B-086 and B-087 (extended), B-111 (recovery and login-time prompt), B-107 (Figma states). NOT STATED, so left open: how many backup codes and in what format; what lost-device recovery requires of the user; storage and encryption of the secret and the backup codes (counsel, legal copy Part C row 44).</w:t>
+            </w:r>
+          </w:p>
+        </w:tc>
+      </w:tr>
+      <w:tr>
+        <w:tc>
+          <w:tcPr>
+            <w:tcW w:type="dxa" w:w="500"/>
+          </w:tcPr>
+          <w:p>
+            <w:r>
+              <w:t>398</w:t>
+            </w:r>
+          </w:p>
+        </w:tc>
+        <w:tc>
+          <w:tcPr>
+            <w:tcW w:type="dxa" w:w="4700"/>
+          </w:tcPr>
+          <w:p>
+            <w:r>
+              <w:t>Admin moderation actions and username revoke: bad faith, legal hold, lift hold, held-investigations list, flagged-image reject reason, username revoke, and the single-user admin read endpoint and User Detail screen.</w:t>
+            </w:r>
+          </w:p>
+        </w:tc>
+        <w:tc>
+          <w:tcPr>
+            <w:tcW w:type="dxa" w:w="1850"/>
+          </w:tcPr>
+          <w:p>
+            <w:r>
+              <w:t>docs/decisions-confirmed-2026-10-16 (docs only, 2026-10-16; founder decisions 2026-10-15/16; docs/contest-spec.md, docs/build-register.md)</w:t>
+            </w:r>
+          </w:p>
+        </w:tc>
+        <w:tc>
+          <w:tcPr>
+            <w:tcW w:type="dxa" w:w="2300"/>
+          </w:tcPr>
+          <w:p>
+            <w:r>
+              <w:t>Resolved -- recorded; DECIDED, NOT BUILT. Source: founder decisions 2026-10-15/16. Extends #376, #371, #369 and #390. (D1) 'Reporter acted in bad faith' and 'Legal hold' (#376): each has a confirmation step and a reason field, a 'lift hold' control exists, and both actions also APPEAR on Appeal Review (not only Report Detail). The held-investigations list (GET /admin/users/held-investigations) shows the hold TYPE and a marker (per the open points of W0 Figma pass C). (D2) Flagged-image queue (#371): the reject reason is shown to the uploader. The CSAM / statutory path stays under counsel (#371). (D3) Username revoke: an admin action, manual, from User Detail, available at any time after the username exists, triggered by a report or an admin review (offensive, impersonating or personal-data usernames). No account exists without a username (#369), so a revoke returns the account to the incomplete-profile gate (#369): a neutral placeholder name to other users, cannot post, redirected to Create Profile at next login to choose a new username. A REASON is REQUIRED and is stored in the audit record. The user is emailed (wording [COPY PENDING LEGAL REVIEW]). The revoked handle is held for 30 days before anyone can take it, and that user cannot re-pick it. (D4) Everything needed for the DOB correction tool (#390) and for username revoke is built: a single-user admin read endpoint returning the fields the admin needs (including the date of birth) and a User Detail admin screen (build register B-109, a prerequisite of B-103, B-104 and B-033). The audit fields for both tools are specified in the build PR. Build register: B-012, B-032, B-033, B-037, B-044, B-045, B-109; Figma re-sync in B-107. STILL OPEN: the CSAM path (counsel); counsel wording; whether 'that user cannot re-pick it' is permanent or lasts only the 30 days (recorded verbatim; the sentence is ambiguous).</w:t>
+            </w:r>
+          </w:p>
+        </w:tc>
+      </w:tr>
+      <w:tr>
+        <w:tc>
+          <w:tcPr>
+            <w:tcW w:type="dxa" w:w="500"/>
+          </w:tcPr>
+          <w:p>
+            <w:r>
+              <w:t>399</w:t>
+            </w:r>
+          </w:p>
+        </w:tc>
+        <w:tc>
+          <w:tcPr>
+            <w:tcW w:type="dxa" w:w="4700"/>
+          </w:tcPr>
+          <w:p>
+            <w:r>
+              <w:t>Contest admin form: own Title field, followers-excluded switch for week 4 only, final-week task text, what is editable after launch, and the validation ranges.</w:t>
+            </w:r>
+          </w:p>
+        </w:tc>
+        <w:tc>
+          <w:tcPr>
+            <w:tcW w:type="dxa" w:w="1850"/>
+          </w:tcPr>
+          <w:p>
+            <w:r>
+              <w:t>docs/decisions-confirmed-2026-10-16 (docs only, 2026-10-16; founder decisions 2026-10-15/16; docs/contest-spec.md, docs/build-register.md)</w:t>
+            </w:r>
+          </w:p>
+        </w:tc>
+        <w:tc>
+          <w:tcPr>
+            <w:tcW w:type="dxa" w:w="2300"/>
+          </w:tcPr>
+          <w:p>
+            <w:r>
+              <w:t>Resolved -- recorded; DECIDED, NOT BUILT. Source: founder decisions 2026-10-15/16. Amends docs/contest-spec.md Sections 4 and 10 (builds on #381, #386, #388). (E1) The Create Contest form has its OWN required Title field (e.g. 'November Challenge'), maximum 80 characters; the contest name is not auto-generated. (E2) The followers-excluded switch applies to WEEK 4 ONLY; it is removed from weeks 1-3. This resolves the contradiction between contest-spec Section 4 ('per-week admin control') and Section 10 ('for that week only') in favour of Section 10. (E3) The final (week 4) HAS task text. It is displayed at the BOTTOM of the leaderboard page; there is no other dedicated page for the final. (E4) Editable after launch: before launch everything is editable except dates. Once week 1 starts, LOCKED: placement points, the minimum tally, and the watch limit, followers switch, tolerance and per-viewer cap of any week that has started. Still editable: the description, and the task text of weeks that have not started. Dates are never editable. (E5) Allowed ranges, recorded as the validation bounds: watch limit 3-120 seconds; tolerance 1-50 percent; per-viewer daily cap 1-50. Build register: B-091 (validation and locking), B-095 (Figma), B-097 (admin screens), B-099 (task text on the leaderboard page); Figma re-sync in B-107. NOT STATED, so left open: whether tolerance and per-viewer cap are per contest or belong to week 4 only (#388 attaches them to the week-4 exposure rule).</w:t>
+            </w:r>
+          </w:p>
+        </w:tc>
+      </w:tr>
+      <w:tr>
+        <w:tc>
+          <w:tcPr>
+            <w:tcW w:type="dxa" w:w="500"/>
+          </w:tcPr>
+          <w:p>
+            <w:r>
+              <w:t>400</w:t>
+            </w:r>
+          </w:p>
+        </w:tc>
+        <w:tc>
+          <w:tcPr>
+            <w:tcW w:type="dxa" w:w="4700"/>
+          </w:tcPr>
+          <w:p>
+            <w:r>
+              <w:t>Contest calendar change (vote lock 20:00, next week opens 08:00), Between Weeks kept, hidden non-finalist tab, final-week entries pinned on the finalist's profile, forfeit pop-up.</w:t>
+            </w:r>
+          </w:p>
+        </w:tc>
+        <w:tc>
+          <w:tcPr>
+            <w:tcW w:type="dxa" w:w="1850"/>
+          </w:tcPr>
+          <w:p>
+            <w:r>
+              <w:t>docs/decisions-confirmed-2026-10-16 (docs only, 2026-10-16; founder decisions 2026-10-15/16; docs/contest-spec.md, docs/build-register.md)</w:t>
+            </w:r>
+          </w:p>
+        </w:tc>
+        <w:tc>
+          <w:tcPr>
+            <w:tcW w:type="dxa" w:w="2300"/>
+          </w:tcPr>
+          <w:p>
+            <w:r>
+              <w:t>Resolved -- recorded; DECIDED, NOT BUILT. Source: founder decisions 2026-10-15/16. SUPERSEDES the 23:59:59 vote lock confirmed in #393 (d) and recorded in docs/contest-spec.md Section 8 (the lock time only); amends #387 and #388. (E6) CALENDAR CHANGE: votes lock at 20:00:00 on days 7, 14 and 21; the next week opens at 08:00:00 on days 8, 15 and 22. Week 1 also opens at 08:00:00 on day 1. All times Europe/London, including clock changes. Phase 1 still ends at the end of day 4, so weeks 2-4 get 8 fewer hours of entries (founder's wording; the 08:00 opening also shortens week 1 against a midnight start). The week-4 upload deadline stays 23:59:59 on day 24. At 20:00 the tally freezes and the weekly result is calculated. (E7) The BETWEEN WEEKS state is therefore KEPT (12 hours, 20:00 to 08:00): it shows the week's result and when the next week opens. W0 Figma pass E's frames are kept. (E8) The Contest tab for a non-finalist during days 22-24 is HIDDEN: other users cannot see that a finalist has uploaded before the reveal. The minimum tally x is ADMIN-ONLY and is never shown to users, including on 'No winner this month'. (E10) Final-week showcase: the final week's entries do NOT appear on the Contest page, and week 4 has no active Contest page. Finalist entries are pinned on the finalist's own profile feed with the contest label (the Phase 1 pattern). Before the reveal ALL engagement on them is locked: buttons disabled, counts hidden, nothing recorded. Impression counts are never shown to users. W0 Figma pass E's 'Final-week showcase' frames on the Contest page are to be ARCHIVED (by a Figma pass, not by this entry). The weekly 'How Contest works' body rewrite stays with B-097/B-098. This displaces the Contest-page listing and Contest-page transparency copy of #388. (E11) A forfeited week: the reason is SHOWN to users, and the forfeit is announced as a POP-UP. Build register: B-091 (scheduler: lock at 20:00, open at 08:00, result calculated at lock), B-092, B-095, B-096, B-099; Figma re-sync in B-107. STILL OPEN: what the Contest tab shows between the end of a month and 08:00 on day 1 of the next; whether the Community-feed 'Final week' module of #388 and its balanced-impression rotation remain now that entries are pinned on the finalist's own profile (not addressed by the founder); how other users reach a finalist's entry after the reveal; the window lengths stated as configuration.</w:t>
+            </w:r>
+          </w:p>
+        </w:tc>
+      </w:tr>
+      <w:tr>
+        <w:tc>
+          <w:tcPr>
+            <w:tcW w:type="dxa" w:w="500"/>
+          </w:tcPr>
+          <w:p>
+            <w:r>
+              <w:t>401</w:t>
+            </w:r>
+          </w:p>
+        </w:tc>
+        <w:tc>
+          <w:tcPr>
+            <w:tcW w:type="dxa" w:w="4700"/>
+          </w:tcPr>
+          <w:p>
+            <w:r>
+              <w:t>Contest vote control: one toggle button, no separate 'Change vote'.</w:t>
+            </w:r>
+          </w:p>
+        </w:tc>
+        <w:tc>
+          <w:tcPr>
+            <w:tcW w:type="dxa" w:w="1850"/>
+          </w:tcPr>
+          <w:p>
+            <w:r>
+              <w:t>docs/decisions-confirmed-2026-10-16 (docs only, 2026-10-16; founder decisions 2026-10-15/16; docs/contest-spec.md, docs/build-register.md)</w:t>
+            </w:r>
+          </w:p>
+        </w:tc>
+        <w:tc>
+          <w:tcPr>
+            <w:tcW w:type="dxa" w:w="2300"/>
+          </w:tcPr>
+          <w:p>
+            <w:r>
+              <w:t>Resolved -- recorded; DECIDED, NOT BUILT. Source: founder decisions 2026-10-15/16. Refines the vote-change wording of #387 ('a vote can be changed or retracted'). (E9) The vote control is ONE button with two states (vote / un-vote): click to vote, click again to un-vote. There is NO separate 'Change vote' control (changing a vote = un-voting, then voting for another entrant). A retracted vote reduces the entrant's tally. A restricted account cannot perform ANY function, including voting, so NO restricted Voting state is drawn. Build register: B-091, B-098; Figma re-sync in B-107 (replaces the separate 'Retract vote' button W0 Figma pass E added to the Already Voted frames). NOT STATED, so left open: whether the Already Voted page (5802:8978 / 5815:8916) and the Voting &lt;-&gt; Already Voted navigation of #387 remain as screens now that the control is a toggle.</w:t>
             </w:r>
           </w:p>
         </w:tc>

</xml_diff>

<commit_message>
docs: record founder-adopted defaults (Decision Log #402), amend #395
Docs only. Adds Decision Log #402 (veto-able defaults), appends dated notes to
#395-#399, re-scopes build register B-110 (sessions stay valid between declines
1 and 2; declined-login result withdrawn) and merges it into B-102's dependency
chain, rewrites register 10d to list only what remains open, and narrows the
tolerance / per-viewer cap scope in contest-spec to week 4 only.

Co-Authored-By: Claude Sonnet 5.5 <noreply@anthropic.com>
</commit_message>
<xml_diff>
--- a/docs/Soccernity_MVP_Build_Plan_v1.7.docx
+++ b/docs/Soccernity_MVP_Build_Plan_v1.7.docx
@@ -26782,6 +26782,9 @@
             <w:r>
               <w:t>Resolved -- recorded; DECIDED, NOT BUILT. Source: founder decisions 2026-10-15/16. Extends and amends #389; builds on #374, #340 and #390. (B1) The decline frame already exists in Figma (5491:8241 / 5501:8453). After decline 1 and decline 2 the minor sees the existing decline page. It is shown at the minor's next LOGIN ATTEMPT, before a session exists (#374 revokes all sessions and blocks login, so it cannot be shown inside a session): the server answers the login with a 'declined' result instead of issuing a token. BACKEND TO CONFIRM: backend-api must confirm this is buildable, including how the page's resend / change-guardian-email actions are authorised without a session (those routes are JwtAuthGuard-gated today) and that it is consistent with the note in #389 that sessions must stay valid between declines. Recorded as the intended behaviour, not as a verified design. (B2) Decline 3: the account enters the deletion sequence and the minor receives an EMAIL ONLY (no page). No decline count is shown anywhere to anyone; the counter is internal. There is NO 'don't contact me again' option. There is NO requests-per-day cap (only one request can run at a time). Three declines in one day delete the account immediately. Three declines in total, ever, per account. Founder decision; no counsel review needed. This WITHDRAWS the abuse-protection sentence of #389 (a cap on requests per day and a 'don't contact me again' option) and supersedes the open points of build register B-102 and B-003 accordingly; the rest of #389 stands (72h token; first lapse = automatic re-send; expiry, second lapse and post-approval withdrawal go straight to pending deletion and do not count among the three; changing the guardian email does not reset the count). (B3) Guardian withdrawal page (B-013): a LINK is added to the consent email and to the approved screen that pre-fills the code. Throttle ('Too many attempts'): a fixed window held in configuration, no countdown shown, 'Try again' returns to frame 1. 'Request a new link' (expired or used link) returns to frame 1 where the guardian re-enters their email; the page reads identically whether or not an account matched. BACKEND TO CONFIRM: the withdrawal token is issued only when a withdrawal is requested (#340), so what a link in the consent email can pre-fill at that moment must be confirmed. (B4) DOB correction (B-103, B-104; #390): if the corrected age tier changes, an in-flight guardian request is CANCELLED and restarted. This settles the 'effect on an in-flight request' point #390 left open. Build register: B-003, B-013, B-080, B-102, B-103, B-104, B-110 (declined-login result), B-112 (withdrawal link); Figma re-sync in B-107. STILL OPEN: counsel wording; the length of the throttle window (stated as configuration); whether 'delete the account immediately' on a third decline also skips the 30-day grace of #375 (recorded as: enters the deletion sequence immediately, grace not altered by this entry); whether a restart caused by a DOB correction resets the decline counter; the shipped per-minor guardian-email-change cap (5 per 24h, #365) is a separate control and is not altered here.</w:t>
             </w:r>
+            <w:r>
+              <w:t xml:space="preserve"> [2026-10-16: Amended by #402. (B1) is AMENDED: sessions stay valid between declines (#389); after decline 1 and 2 the minor sees the existing decline page INSIDE the account via the existing authenticated resend / change-guardian-email routes; the 'declined' login result and its BACKEND TO CONFIRM point are WITHDRAWN (build register B-110 re-scoped). (B2) The open question on the 30-day grace is answered: the third decline blocks login at once and enters pending deletion WITH the existing 30-day grace (#375). The remainder stands.]</w:t>
+            </w:r>
           </w:p>
         </w:tc>
       </w:tr>
@@ -26824,6 +26827,9 @@
             <w:r>
               <w:t>Resolved -- recorded; DECIDED, NOT BUILT. Source: founder decisions 2026-10-15/16. Settles the semantics left undefined for Block in #371 and build register B-039. (C1) Own profile and other-user profile are two SEPARATE variants; the Block action lives on the other-user variant (mobile included). (C2) A Block model is created. Adopted as decided: blocking hides the blocked user's posts from the blocker; stops messages in both directions; removes follows in both directions; has an optional reason field; can be undone (unblock); and there is a blocked-users list in Settings. The data model and endpoints are backend work. Build register: B-039 (extended: model, endpoints, unblock, list, reason), B-082, B-067, B-107 (remaining Figma states and the mobile trigger), B-108 (frontend, Settings list, unblock). NOT STATED, so left open and not decided here: whether the blocked user is told; whether blocking also affects Bants rooms, comments, likes, search results, group rosters and the leaderboard; whether an unblock restores the removed follows; how Block interacts with the guardian-consent, under-16 and adult-to-minor rules (#346, #347).</w:t>
             </w:r>
+            <w:r>
+              <w:t xml:space="preserve"> [2026-10-16: Amended by #402 (founder-adopted defaults, veto-able). The blocked user is not told; a block hides content and search results in both directions (posts, comments, likes, search, rosters); the leaderboard is unaffected; unblock does not restore follows. Still open: Bants rooms, exact like mechanics, and the interaction with #346 / #347.]</w:t>
+            </w:r>
           </w:p>
         </w:tc>
       </w:tr>
@@ -26866,6 +26872,9 @@
             <w:r>
               <w:t>Resolved -- recorded; DECIDED, NOT BUILT. Source: founder decisions 2026-10-15/16. Extends #378 (authenticator app, not SMS) and fills the points W0 Figma pass D left SCOPE OPEN. (C3) Adopted for authenticator-app 2FA: backup codes; lost-device recovery; turning 2FA off with password re-entry; a manual-key fallback when the QR cannot be scanned; and the login-time code prompt. All user-facing copy is [COPY PENDING LEGAL REVIEW]. Build register: B-086 and B-087 (extended), B-111 (recovery and login-time prompt), B-107 (Figma states). NOT STATED, so left open: how many backup codes and in what format; what lost-device recovery requires of the user; storage and encryption of the secret and the backup codes (counsel, legal copy Part C row 44).</w:t>
             </w:r>
+            <w:r>
+              <w:t xml:space="preserve"> [2026-10-16: Amended by #402 (founder-adopted defaults, veto-able). 10 single-use backup codes, stored hashed; lost-device recovery needs a backup code, or email confirmation plus password. Still open: backup-code format and the storage / encryption of the TOTP secret.]</w:t>
+            </w:r>
           </w:p>
         </w:tc>
       </w:tr>
@@ -26908,6 +26917,9 @@
             <w:r>
               <w:t>Resolved -- recorded; DECIDED, NOT BUILT. Source: founder decisions 2026-10-15/16. Extends #376, #371, #369 and #390. (D1) 'Reporter acted in bad faith' and 'Legal hold' (#376): each has a confirmation step and a reason field, a 'lift hold' control exists, and both actions also APPEAR on Appeal Review (not only Report Detail). The held-investigations list (GET /admin/users/held-investigations) shows the hold TYPE and a marker (per the open points of W0 Figma pass C). (D2) Flagged-image queue (#371): the reject reason is shown to the uploader. The CSAM / statutory path stays under counsel (#371). (D3) Username revoke: an admin action, manual, from User Detail, available at any time after the username exists, triggered by a report or an admin review (offensive, impersonating or personal-data usernames). No account exists without a username (#369), so a revoke returns the account to the incomplete-profile gate (#369): a neutral placeholder name to other users, cannot post, redirected to Create Profile at next login to choose a new username. A REASON is REQUIRED and is stored in the audit record. The user is emailed (wording [COPY PENDING LEGAL REVIEW]). The revoked handle is held for 30 days before anyone can take it, and that user cannot re-pick it. (D4) Everything needed for the DOB correction tool (#390) and for username revoke is built: a single-user admin read endpoint returning the fields the admin needs (including the date of birth) and a User Detail admin screen (build register B-109, a prerequisite of B-103, B-104 and B-033). The audit fields for both tools are specified in the build PR. Build register: B-012, B-032, B-033, B-037, B-044, B-045, B-109; Figma re-sync in B-107. STILL OPEN: the CSAM path (counsel); counsel wording; whether 'that user cannot re-pick it' is permanent or lasts only the 30 days (recorded verbatim; the sentence is ambiguous).</w:t>
             </w:r>
+            <w:r>
+              <w:t xml:space="preserve"> [2026-10-16: Amended by #402 (founder-adopted default, veto-able). The revoked handle is held 30 days for everyone, and the revoked user can never re-pick it (permanent for that user).]</w:t>
+            </w:r>
           </w:p>
         </w:tc>
       </w:tr>
@@ -26950,6 +26962,9 @@
             <w:r>
               <w:t>Resolved -- recorded; DECIDED, NOT BUILT. Source: founder decisions 2026-10-15/16. Amends docs/contest-spec.md Sections 4 and 10 (builds on #381, #386, #388). (E1) The Create Contest form has its OWN required Title field (e.g. 'November Challenge'), maximum 80 characters; the contest name is not auto-generated. (E2) The followers-excluded switch applies to WEEK 4 ONLY; it is removed from weeks 1-3. This resolves the contradiction between contest-spec Section 4 ('per-week admin control') and Section 10 ('for that week only') in favour of Section 10. (E3) The final (week 4) HAS task text. It is displayed at the BOTTOM of the leaderboard page; there is no other dedicated page for the final. (E4) Editable after launch: before launch everything is editable except dates. Once week 1 starts, LOCKED: placement points, the minimum tally, and the watch limit, followers switch, tolerance and per-viewer cap of any week that has started. Still editable: the description, and the task text of weeks that have not started. Dates are never editable. (E5) Allowed ranges, recorded as the validation bounds: watch limit 3-120 seconds; tolerance 1-50 percent; per-viewer daily cap 1-50. Build register: B-091 (validation and locking), B-095 (Figma), B-097 (admin screens), B-099 (task text on the leaderboard page); Figma re-sync in B-107. NOT STATED, so left open: whether tolerance and per-viewer cap are per contest or belong to week 4 only (#388 attaches them to the week-4 exposure rule).</w:t>
             </w:r>
+            <w:r>
+              <w:t xml:space="preserve"> [2026-10-16: Amended by #402 (founder-adopted default, veto-able). Tolerance and the per-viewer daily cap apply to week 4 only; their ranges stay as validation bounds on the week-4 settings and they lock when week 4 starts.]</w:t>
+            </w:r>
           </w:p>
         </w:tc>
       </w:tr>
@@ -27033,6 +27048,48 @@
           <w:p>
             <w:r>
               <w:t>Resolved -- recorded; DECIDED, NOT BUILT. Source: founder decisions 2026-10-15/16. Refines the vote-change wording of #387 ('a vote can be changed or retracted'). (E9) The vote control is ONE button with two states (vote / un-vote): click to vote, click again to un-vote. There is NO separate 'Change vote' control (changing a vote = un-voting, then voting for another entrant). A retracted vote reduces the entrant's tally. A restricted account cannot perform ANY function, including voting, so NO restricted Voting state is drawn. Build register: B-091, B-098; Figma re-sync in B-107 (replaces the separate 'Retract vote' button W0 Figma pass E added to the Already Voted frames). NOT STATED, so left open: whether the Already Voted page (5802:8978 / 5815:8916) and the Voting &lt;-&gt; Already Voted navigation of #387 remain as screens now that the control is a toggle.</w:t>
+            </w:r>
+          </w:p>
+        </w:tc>
+      </w:tr>
+      <w:tr>
+        <w:tc>
+          <w:tcPr>
+            <w:tcW w:type="dxa" w:w="500"/>
+          </w:tcPr>
+          <w:p>
+            <w:r>
+              <w:t>402</w:t>
+            </w:r>
+          </w:p>
+        </w:tc>
+        <w:tc>
+          <w:tcPr>
+            <w:tcW w:type="dxa" w:w="4700"/>
+          </w:tcPr>
+          <w:p>
+            <w:r>
+              <w:t>Founder-adopted defaults (veto-able): sessions stay valid between declines (declined-login result withdrawn), third-decline outcome, revoked-username hold, Block effects, 2FA backup codes and recovery, week-4-only exposure settings.</w:t>
+            </w:r>
+          </w:p>
+        </w:tc>
+        <w:tc>
+          <w:tcPr>
+            <w:tcW w:type="dxa" w:w="1850"/>
+          </w:tcPr>
+          <w:p>
+            <w:r>
+              <w:t>docs/decisions-defaults-2026-10-16 (docs only, 2026-10-16; founder instruction 2026-10-16; docs/contest-spec.md, docs/build-register.md)</w:t>
+            </w:r>
+          </w:p>
+        </w:tc>
+        <w:tc>
+          <w:tcPr>
+            <w:tcW w:type="dxa" w:w="2300"/>
+          </w:tcPr>
+          <w:p>
+            <w:r>
+              <w:t>Resolved -- recorded; DECIDED, NOT BUILT. FOUNDER-ADOPTED DEFAULTS, VETO-ABLE: each item below is adopted now so build work is not blocked, and stands until the founder says otherwise. Amends #395 and closes open points of #395-#399; the original text of those entries is unchanged (dated notes appended). (1) DECLINE 1 AND 2 -- AMENDS #395 B1. #389 already decided that sessions STAY VALID between declines; only the THIRD decline revokes sessions. After decline 1 and decline 2 the minor sees the existing decline page (5491:8241 / 5501:8453) INSIDE the account, using the existing authenticated resend and change-guardian-email routes. The 'declined login result' design of #395 B1 (a login that answers 'declined' with no token) is WITHDRAWN; so is its BACKEND TO CONFIRM point. Build implications recorded, not decisions: today every decline revokes sessions and 'declined' is terminal in code (#337-#340), and resend / change-guardian-email refuse a declined account (#365), so decline 1 and 2 must stop revoking and those routes must accept the account while fewer than three declines have been recorded. Bug fixed by the same work: GuardianConsentPage treats 'declined' as pending (audit section 5 item 5). Build register: B-110 is RE-SCOPED to this and merged into B-102's dependency chain (B-102 now depends on B-110); the B-ID is kept. (2) THIRD DECLINE. Login is blocked at once and the account enters pending deletion with the EXISTING 30-day grace (#375, via refuseConsentAndScheduleDeletion as in #389). This answers #395's open question: 'delete the account immediately' does NOT skip the grace; the minor still receives the email only, no page and no count (#395 B2 stands). (3) REVOKED USERNAME (#398 D3). The handle is held 30 days for everyone (nobody can take it); the revoked user can NEVER re-pick it. This answers #398's ambiguous 'cannot re-pick' point: permanent for that user, 30 days for others. (4) BLOCK (#396). The blocked user is NOT told. A block hides content and search results in both directions: posts, comments, likes, search, rosters. The leaderboard is unaffected. Unblock does NOT restore follows. Still open: Bants rooms (room membership / room listing; the blocked user's posts are covered by 'posts'), the exact like mechanics, and the interaction with the guardian-consent, under-16 and adult-to-minor rules (#346, #347). (5) 2FA (#397). 10 single-use backup codes, stored HASHED. Lost-device recovery needs a backup code, OR email confirmation plus password. Noted for the founder's veto: the email-plus-password path makes 2FA recovery only as strong as the email account. Still open: backup-code format, storage and encryption of the TOTP secret itself, counsel (legal copy Part C row 44). (6) CONTEST EXPOSURE SETTINGS (#399 E4/E5, #388). Tolerance and the per-viewer daily cap apply to WEEK 4 ONLY, not per contest or per week. Their ranges (1-50 percent; 1-50) stay as validation bounds on the week-4 settings; they lock when week 4 starts (day 22), not when week 1 starts. Watch limit (3-120 s) is unchanged. Build register: B-110 (re-scoped), B-102, B-003, B-107 (decline page behaviour note), B-032, B-033, B-039, B-108, B-086, B-087, B-111, B-091, B-092, B-095, B-097. Not decided here and still open: see docs/build-register.md Section 11d.</w:t>
             </w:r>
           </w:p>
         </w:tc>

</xml_diff>

<commit_message>
docs: record founder decisions 2026-10-16 follow-up (Decision Log #403)
Docs only. Adds Decision Log #403 (19 founder items) with dated notes on
#369, #371, #394, #395, #400, #401; amends docs/contest-spec.md; adds
build register B-113 to B-118 and Section 12 (118 B-IDs, 146 gap frames
unchanged); adds a CLAUDE.md status bullet.

Co-Authored-By: Claude Sonnet 5.5 <noreply@anthropic.com>
</commit_message>
<xml_diff>
--- a/docs/Soccernity_MVP_Build_Plan_v1.7.docx
+++ b/docs/Soccernity_MVP_Build_Plan_v1.7.docx
@@ -25682,7 +25682,7 @@
           </w:tcPr>
           <w:p>
             <w:r>
-              <w:t>Resolved -- decided, NOT yet built. A username is required at Create Profile so that no user, minor or adult, is shown to other users under a real name. Until Create Profile is complete an account is shown to others under a neutral placeholder name, cannot post, and is redirected to Create Profile on every login. Applies to adults and to approved minors. Builds on #364 (User.username, shipped optional, 'username first, display name fallback'), which this makes mandatory for any account that completes onboarding; legacy accounts with no username fall under the same gate. Username moderation rules (reserved words, impersonation, profanity, no personal data in usernames, change cooldown, released-handle holding period, admin revoke built code-first with a design follow-up) are specified in the build PR, not here. OPEN: what the placeholder name is, and how the gate treats accounts that already exist without a username.</w:t>
+              <w:t>Resolved -- decided, NOT yet built. A username is required at Create Profile so that no user, minor or adult, is shown to other users under a real name. Until Create Profile is complete an account is shown to others under a neutral placeholder name, cannot post, and is redirected to Create Profile on every login. Applies to adults and to approved minors. Builds on #364 (User.username, shipped optional, 'username first, display name fallback'), which this makes mandatory for any account that completes onboarding; legacy accounts with no username fall under the same gate. Username moderation rules (reserved words, impersonation, profanity, no personal data in usernames, change cooldown, released-handle holding period, admin revoke built code-first with a design follow-up) are specified in the build PR, not here. OPEN: what the placeholder name is, and how the gate treats accounts that already exist without a username. [2026-10-16: Amended by #403. The placeholder name for incomplete profiles is 'Soccernity member' (closes the first OPEN point). The second OPEN point (accounts that already exist without a username) is not addressed.]</w:t>
             </w:r>
           </w:p>
         </w:tc>
@@ -25766,7 +25766,7 @@
           </w:tcPr>
           <w:p>
             <w:r>
-              <w:t>Resolved -- decided, NOT yet built. Avatars and cover photos are visible to all users, including minors. The other-user profile page shows: avatar, cover photo, bio, country (in place of location -- no precise location is collected), Follow, message, Copy link, Block. There is no Share action. Storage is Cloudflare R2 (Decision Log #307). Image safety: an automated check at upload using Amazon Rekognition (EU/UK region where available); flagged images go to the admin moderation queue and are NOT live; report-and-review is the backstop; image metadata (EXIF/location) is stripped on re-encode. OPEN, counsel review pending: CSAM hash-matching (Cloudflare tooling coverage of R2 is unconfirmed) and any statutory duties that attach to hosting images of minors. Amazon becomes a new processor (cross-border/DPIA follow-up). No avatar/bio/location columns, upload endpoint or Rekognition integration exist yet (Decision Log #58 backend requirements still open).</w:t>
+              <w:t>Resolved -- decided, NOT yet built. Avatars and cover photos are visible to all users, including minors. The other-user profile page shows: avatar, cover photo, bio, country (in place of location -- no precise location is collected), Follow, message, Copy link, Block. There is no Share action. Storage is Cloudflare R2 (Decision Log #307). Image safety: an automated check at upload using Amazon Rekognition (EU/UK region where available); flagged images go to the admin moderation queue and are NOT live; report-and-review is the backstop; image metadata (EXIF/location) is stripped on re-encode. OPEN, counsel review pending: CSAM hash-matching (Cloudflare tooling coverage of R2 is unconfirmed) and any statutory duties that attach to hosting images of minors. Amazon becomes a new processor (cross-border/DPIA follow-up). No avatar/bio/location columns, upload endpoint or Rekognition integration exist yet (Decision Log #58 backend requirements still open). [2026-10-16: Amended by #403 (item 17). The 'country' item: the profile shows a country only if the user filled in the separate, optional PROFILE country field; it is never the declared or derived safeguarding country. A minor's country is therefore visible only if the minor enters it. Counsel review of country display stays on the legal list with reduced scope. The rest of this entry stands.]</w:t>
             </w:r>
           </w:p>
         </w:tc>
@@ -26738,7 +26738,7 @@
           </w:tcPr>
           <w:p>
             <w:r>
-              <w:t>Resolved -- recorded; DECIDED, NOT BUILT. Source: founder decisions 2026-10-15/16. Extends #367, #369, #371 and #366. (A1) Create Profile as drawn by W0 Figma pass B: Full Name is kept, prefilled from Register and editable; Country is shown read-only (the derived value is authoritative, #368). (A2) The profile picture is OPTIONAL; the wording of the automatic image check shown to the user is [COPY PENDING LEGAL REVIEW]. (A3) A Bio or Preferred Club value flagged by the pre-publication sensitive-content screen (#366) shows an inline 'please rephrase' state on that field. (A4) Age Gate: the heading and subheading are reworded to cover date of birth plus country (wording [COPY PENDING LEGAL REVIEW]); after a below-minimum-age denial, date of birth and country are CLEARED when the user presses Back. (A5) The Activation screen and the guardian-approval email currently say everything is 'switched on' although the flow continues to Create Profile (#367); both are reworded to 'approved, continue registration' (wording [COPY PENDING LEGAL REVIEW]). (A6) A restricted-pending minor gets NO new Create Profile screen: that minor is routed to the Restricted Pending page on every login (this answers the open point in #367 about what 'Create Profile is blocked for a restricted-pending minor' looks like on screen, and accepts the PROPOSAL recorded by W0 Figma pass D). Build register: B-001, B-002, B-006, B-009, B-028, B-030, B-035, B-036, B-038, B-073, B-077, B-081; Figma re-sync in B-107. STILL OPEN: counsel wording for every [COPY PENDING LEGAL REVIEW] item; the placeholder name for incomplete profiles (#369). Full detail: docs/build-register.md Section 10.</w:t>
+              <w:t>Resolved -- recorded; DECIDED, NOT BUILT. Source: founder decisions 2026-10-15/16. Extends #367, #369, #371 and #366. (A1) Create Profile as drawn by W0 Figma pass B: Full Name is kept, prefilled from Register and editable; Country is shown read-only (the derived value is authoritative, #368). (A2) The profile picture is OPTIONAL; the wording of the automatic image check shown to the user is [COPY PENDING LEGAL REVIEW]. (A3) A Bio or Preferred Club value flagged by the pre-publication sensitive-content screen (#366) shows an inline 'please rephrase' state on that field. (A4) Age Gate: the heading and subheading are reworded to cover date of birth plus country (wording [COPY PENDING LEGAL REVIEW]); after a below-minimum-age denial, date of birth and country are CLEARED when the user presses Back. (A5) The Activation screen and the guardian-approval email currently say everything is 'switched on' although the flow continues to Create Profile (#367); both are reworded to 'approved, continue registration' (wording [COPY PENDING LEGAL REVIEW]). (A6) A restricted-pending minor gets NO new Create Profile screen: that minor is routed to the Restricted Pending page on every login (this answers the open point in #367 about what 'Create Profile is blocked for a restricted-pending minor' looks like on screen, and accepts the PROPOSAL recorded by W0 Figma pass D). Build register: B-001, B-002, B-006, B-009, B-028, B-030, B-035, B-036, B-038, B-073, B-077, B-081; Figma re-sync in B-107. STILL OPEN: counsel wording for every [COPY PENDING LEGAL REVIEW] item; the placeholder name for incomplete profiles (#369). Full detail: docs/build-register.md Section 10. [2026-10-16: Amended by #403 (item 17). (A1) Country is NOT shown read-only at Create Profile. Country has two separate fields: the SAFEGUARDING country (Age Gate declaration plus IP derivation, never shown, never editable) and a separate optional PROFILE country, blank at Create Profile and editable in Edit Profile. Everything else in A1 (Full Name kept, prefilled, editable) stands.]</w:t>
             </w:r>
           </w:p>
         </w:tc>
@@ -26783,7 +26783,7 @@
               <w:t>Resolved -- recorded; DECIDED, NOT BUILT. Source: founder decisions 2026-10-15/16. Extends and amends #389; builds on #374, #340 and #390. (B1) The decline frame already exists in Figma (5491:8241 / 5501:8453). After decline 1 and decline 2 the minor sees the existing decline page. It is shown at the minor's next LOGIN ATTEMPT, before a session exists (#374 revokes all sessions and blocks login, so it cannot be shown inside a session): the server answers the login with a 'declined' result instead of issuing a token. BACKEND TO CONFIRM: backend-api must confirm this is buildable, including how the page's resend / change-guardian-email actions are authorised without a session (those routes are JwtAuthGuard-gated today) and that it is consistent with the note in #389 that sessions must stay valid between declines. Recorded as the intended behaviour, not as a verified design. (B2) Decline 3: the account enters the deletion sequence and the minor receives an EMAIL ONLY (no page). No decline count is shown anywhere to anyone; the counter is internal. There is NO 'don't contact me again' option. There is NO requests-per-day cap (only one request can run at a time). Three declines in one day delete the account immediately. Three declines in total, ever, per account. Founder decision; no counsel review needed. This WITHDRAWS the abuse-protection sentence of #389 (a cap on requests per day and a 'don't contact me again' option) and supersedes the open points of build register B-102 and B-003 accordingly; the rest of #389 stands (72h token; first lapse = automatic re-send; expiry, second lapse and post-approval withdrawal go straight to pending deletion and do not count among the three; changing the guardian email does not reset the count). (B3) Guardian withdrawal page (B-013): a LINK is added to the consent email and to the approved screen that pre-fills the code. Throttle ('Too many attempts'): a fixed window held in configuration, no countdown shown, 'Try again' returns to frame 1. 'Request a new link' (expired or used link) returns to frame 1 where the guardian re-enters their email; the page reads identically whether or not an account matched. BACKEND TO CONFIRM: the withdrawal token is issued only when a withdrawal is requested (#340), so what a link in the consent email can pre-fill at that moment must be confirmed. (B4) DOB correction (B-103, B-104; #390): if the corrected age tier changes, an in-flight guardian request is CANCELLED and restarted. This settles the 'effect on an in-flight request' point #390 left open. Build register: B-003, B-013, B-080, B-102, B-103, B-104, B-110 (declined-login result), B-112 (withdrawal link); Figma re-sync in B-107. STILL OPEN: counsel wording; the length of the throttle window (stated as configuration); whether 'delete the account immediately' on a third decline also skips the 30-day grace of #375 (recorded as: enters the deletion sequence immediately, grace not altered by this entry); whether a restart caused by a DOB correction resets the decline counter; the shipped per-minor guardian-email-change cap (5 per 24h, #365) is a separate control and is not altered here.</w:t>
             </w:r>
             <w:r>
-              <w:t xml:space="preserve"> [2026-10-16: Amended by #402. (B1) is AMENDED: sessions stay valid between declines (#389); after decline 1 and 2 the minor sees the existing decline page INSIDE the account via the existing authenticated resend / change-guardian-email routes; the 'declined' login result and its BACKEND TO CONFIRM point are WITHDRAWN (build register B-110 re-scoped). (B2) The open question on the 30-day grace is answered: the third decline blocks login at once and enters pending deletion WITH the existing 30-day grace (#375). The remainder stands.]</w:t>
+              <w:t xml:space="preserve"> [2026-10-16: Amended by #402. (B1) is AMENDED: sessions stay valid between declines (#389); after decline 1 and 2 the minor sees the existing decline page INSIDE the account via the existing authenticated resend / change-guardian-email routes; the 'declined' login result and its BACKEND TO CONFIRM point are WITHDRAWN (build register B-110 re-scoped). (B2) The open question on the 30-day grace is answered: the third decline blocks login at once and enters pending deletion WITH the existing 30-day grace (#375). The remainder stands.] [2026-10-16: Amended by #403. (B2) The decline page keeps its static sentence stating the cap (Figma node 6627:22230); 'No decline count is shown' means no running 'decline N of 3' counter. (B4) A restart caused by a DOB correction RESETS the decline counter and writes an audit entry (answers the STILL OPEN point). (B3) The withdrawal throttle default is 5 attempts per 15 minutes, held in configuration (sets the window left open).]</w:t>
             </w:r>
           </w:p>
         </w:tc>
@@ -27005,7 +27005,7 @@
           </w:tcPr>
           <w:p>
             <w:r>
-              <w:t>Resolved -- recorded; DECIDED, NOT BUILT. Source: founder decisions 2026-10-15/16. SUPERSEDES the 23:59:59 vote lock confirmed in #393 (d) and recorded in docs/contest-spec.md Section 8 (the lock time only); amends #387 and #388. (E6) CALENDAR CHANGE: votes lock at 20:00:00 on days 7, 14 and 21; the next week opens at 08:00:00 on days 8, 15 and 22. Week 1 also opens at 08:00:00 on day 1. All times Europe/London, including clock changes. Phase 1 still ends at the end of day 4, so weeks 2-4 get 8 fewer hours of entries (founder's wording; the 08:00 opening also shortens week 1 against a midnight start). The week-4 upload deadline stays 23:59:59 on day 24. At 20:00 the tally freezes and the weekly result is calculated. (E7) The BETWEEN WEEKS state is therefore KEPT (12 hours, 20:00 to 08:00): it shows the week's result and when the next week opens. W0 Figma pass E's frames are kept. (E8) The Contest tab for a non-finalist during days 22-24 is HIDDEN: other users cannot see that a finalist has uploaded before the reveal. The minimum tally x is ADMIN-ONLY and is never shown to users, including on 'No winner this month'. (E10) Final-week showcase: the final week's entries do NOT appear on the Contest page, and week 4 has no active Contest page. Finalist entries are pinned on the finalist's own profile feed with the contest label (the Phase 1 pattern). Before the reveal ALL engagement on them is locked: buttons disabled, counts hidden, nothing recorded. Impression counts are never shown to users. W0 Figma pass E's 'Final-week showcase' frames on the Contest page are to be ARCHIVED (by a Figma pass, not by this entry). The weekly 'How Contest works' body rewrite stays with B-097/B-098. This displaces the Contest-page listing and Contest-page transparency copy of #388. (E11) A forfeited week: the reason is SHOWN to users, and the forfeit is announced as a POP-UP. Build register: B-091 (scheduler: lock at 20:00, open at 08:00, result calculated at lock), B-092, B-095, B-096, B-099; Figma re-sync in B-107. STILL OPEN: what the Contest tab shows between the end of a month and 08:00 on day 1 of the next; whether the Community-feed 'Final week' module of #388 and its balanced-impression rotation remain now that entries are pinned on the finalist's own profile (not addressed by the founder); how other users reach a finalist's entry after the reveal; the window lengths stated as configuration.</w:t>
+              <w:t>Resolved -- recorded; DECIDED, NOT BUILT. Source: founder decisions 2026-10-15/16. SUPERSEDES the 23:59:59 vote lock confirmed in #393 (d) and recorded in docs/contest-spec.md Section 8 (the lock time only); amends #387 and #388. (E6) CALENDAR CHANGE: votes lock at 20:00:00 on days 7, 14 and 21; the next week opens at 08:00:00 on days 8, 15 and 22. Week 1 also opens at 08:00:00 on day 1. All times Europe/London, including clock changes. Phase 1 still ends at the end of day 4, so weeks 2-4 get 8 fewer hours of entries (founder's wording; the 08:00 opening also shortens week 1 against a midnight start). The week-4 upload deadline stays 23:59:59 on day 24. At 20:00 the tally freezes and the weekly result is calculated. (E7) The BETWEEN WEEKS state is therefore KEPT (12 hours, 20:00 to 08:00): it shows the week's result and when the next week opens. W0 Figma pass E's frames are kept. (E8) The Contest tab for a non-finalist during days 22-24 is HIDDEN: other users cannot see that a finalist has uploaded before the reveal. The minimum tally x is ADMIN-ONLY and is never shown to users, including on 'No winner this month'. (E10) Final-week showcase: the final week's entries do NOT appear on the Contest page, and week 4 has no active Contest page. Finalist entries are pinned on the finalist's own profile feed with the contest label (the Phase 1 pattern). Before the reveal ALL engagement on them is locked: buttons disabled, counts hidden, nothing recorded. Impression counts are never shown to users. W0 Figma pass E's 'Final-week showcase' frames on the Contest page are to be ARCHIVED (by a Figma pass, not by this entry). The weekly 'How Contest works' body rewrite stays with B-097/B-098. This displaces the Contest-page listing and Contest-page transparency copy of #388. (E11) A forfeited week: the reason is SHOWN to users, and the forfeit is announced as a POP-UP. Build register: B-091 (scheduler: lock at 20:00, open at 08:00, result calculated at lock), B-092, B-095, B-096, B-099; Figma re-sync in B-107. STILL OPEN: what the Contest tab shows between the end of a month and 08:00 on day 1 of the next; whether the Community-feed 'Final week' module of #388 and its balanced-impression rotation remain now that entries are pinned on the finalist's own profile (not addressed by the founder); how other users reach a finalist's entry after the reveal; the window lengths stated as configuration. [2026-10-16: Amended by #403. (E8) The non-finalist Contest tab is NOT hidden: it stays visible and a non-finalist opening it during days 22-24 sees the existing 'Closed (not a finalist)' frames (6660:31044 / 6660:35699), which are restored; the minimum tally stays admin-only. (E11) The forfeit pop-up is shown ONLY on the Contest page, on every load, one per forfeited week, reason shown, nothing remembered between loads; the leaderboard Contest tab shows the forfeited writing in place of the three names. (E10) The Community-feed 'Final week' module STAYS (dead 'View on the Contest page' link removed; its videos become a carousel that keeps the current frame size and shows only during a final contest week); this answers the 'whether the module remains' point listed as STILL OPEN here. Still open: whether carousel views count as impressions, and how other users reach a finalist's entry after the reveal.]</w:t>
             </w:r>
           </w:p>
         </w:tc>
@@ -27047,7 +27047,7 @@
           </w:tcPr>
           <w:p>
             <w:r>
-              <w:t>Resolved -- recorded; DECIDED, NOT BUILT. Source: founder decisions 2026-10-15/16. Refines the vote-change wording of #387 ('a vote can be changed or retracted'). (E9) The vote control is ONE button with two states (vote / un-vote): click to vote, click again to un-vote. There is NO separate 'Change vote' control (changing a vote = un-voting, then voting for another entrant). A retracted vote reduces the entrant's tally. A restricted account cannot perform ANY function, including voting, so NO restricted Voting state is drawn. Build register: B-091, B-098; Figma re-sync in B-107 (replaces the separate 'Retract vote' button W0 Figma pass E added to the Already Voted frames). NOT STATED, so left open: whether the Already Voted page (5802:8978 / 5815:8916) and the Voting &lt;-&gt; Already Voted navigation of #387 remain as screens now that the control is a toggle.</w:t>
+              <w:t>Resolved -- recorded; DECIDED, NOT BUILT. Source: founder decisions 2026-10-15/16. Refines the vote-change wording of #387 ('a vote can be changed or retracted'). (E9) The vote control is ONE button with two states (vote / un-vote): click to vote, click again to un-vote. There is NO separate 'Change vote' control (changing a vote = un-voting, then voting for another entrant). A retracted vote reduces the entrant's tally. A restricted account cannot perform ANY function, including voting, so NO restricted Voting state is drawn. Build register: B-091, B-098; Figma re-sync in B-107 (replaces the separate 'Retract vote' button W0 Figma pass E added to the Already Voted frames). NOT STATED, so left open: whether the Already Voted page (5802:8978 / 5815:8916) and the Voting &lt;-&gt; Already Voted navigation of #387 remain as screens now that the control is a toggle. [2026-10-16: Amended by #403. The open point is closed: the Voting page (2094:994 / 5802:8726) adopts the Already Voted page's design (entries column + board column, fan cards) with the vote toggle, and the separate Already Voted screens (5802:8978 / 5815:8916) are archived afterwards; the Voting &lt;-&gt; Already Voted navigation goes with them.]</w:t>
             </w:r>
           </w:p>
         </w:tc>
@@ -27090,6 +27090,48 @@
           <w:p>
             <w:r>
               <w:t>Resolved -- recorded; DECIDED, NOT BUILT. FOUNDER-ADOPTED DEFAULTS, VETO-ABLE: each item below is adopted now so build work is not blocked, and stands until the founder says otherwise. Amends #395 and closes open points of #395-#399; the original text of those entries is unchanged (dated notes appended). (1) DECLINE 1 AND 2 -- AMENDS #395 B1. #389 already decided that sessions STAY VALID between declines; only the THIRD decline revokes sessions. After decline 1 and decline 2 the minor sees the existing decline page (5491:8241 / 5501:8453) INSIDE the account, using the existing authenticated resend and change-guardian-email routes. The 'declined login result' design of #395 B1 (a login that answers 'declined' with no token) is WITHDRAWN; so is its BACKEND TO CONFIRM point. Build implications recorded, not decisions: today every decline revokes sessions and 'declined' is terminal in code (#337-#340), and resend / change-guardian-email refuse a declined account (#365), so decline 1 and 2 must stop revoking and those routes must accept the account while fewer than three declines have been recorded. Bug fixed by the same work: GuardianConsentPage treats 'declined' as pending (audit section 5 item 5). Build register: B-110 is RE-SCOPED to this and merged into B-102's dependency chain (B-102 now depends on B-110); the B-ID is kept. (2) THIRD DECLINE. Login is blocked at once and the account enters pending deletion with the EXISTING 30-day grace (#375, via refuseConsentAndScheduleDeletion as in #389). This answers #395's open question: 'delete the account immediately' does NOT skip the grace; the minor still receives the email only, no page and no count (#395 B2 stands). (3) REVOKED USERNAME (#398 D3). The handle is held 30 days for everyone (nobody can take it); the revoked user can NEVER re-pick it. This answers #398's ambiguous 'cannot re-pick' point: permanent for that user, 30 days for others. (4) BLOCK (#396). The blocked user is NOT told. A block hides content and search results in both directions: posts, comments, likes, search, rosters. The leaderboard is unaffected. Unblock does NOT restore follows. Still open: Bants rooms (room membership / room listing; the blocked user's posts are covered by 'posts'), the exact like mechanics, and the interaction with the guardian-consent, under-16 and adult-to-minor rules (#346, #347). (5) 2FA (#397). 10 single-use backup codes, stored HASHED. Lost-device recovery needs a backup code, OR email confirmation plus password. Noted for the founder's veto: the email-plus-password path makes 2FA recovery only as strong as the email account. Still open: backup-code format, storage and encryption of the TOTP secret itself, counsel (legal copy Part C row 44). (6) CONTEST EXPOSURE SETTINGS (#399 E4/E5, #388). Tolerance and the per-viewer daily cap apply to WEEK 4 ONLY, not per contest or per week. Their ranges (1-50 percent; 1-50) stay as validation bounds on the week-4 settings; they lock when week 4 starts (day 22), not when week 1 starts. Watch limit (3-120 s) is unchanged. Build register: B-110 (re-scoped), B-102, B-003, B-107 (decline page behaviour note), B-032, B-033, B-039, B-108, B-086, B-087, B-111, B-091, B-092, B-095, B-097. Not decided here and still open: see docs/build-register.md Section 11d.</w:t>
+            </w:r>
+          </w:p>
+        </w:tc>
+      </w:tr>
+      <w:tr>
+        <w:tc>
+          <w:tcPr>
+            <w:tcW w:type="dxa" w:w="500"/>
+          </w:tcPr>
+          <w:p>
+            <w:r>
+              <w:t>403</w:t>
+            </w:r>
+          </w:p>
+        </w:tc>
+        <w:tc>
+          <w:tcPr>
+            <w:tcW w:type="dxa" w:w="4700"/>
+          </w:tcPr>
+          <w:p>
+            <w:r>
+              <w:t>Founder decisions 2026-10-16 (follow-up): non-finalist Contest tab stays visible, decline-page cap sentence, guardian Approved screens, admin components and shell search bar, Voting page adopts Already Voted design, lift hold, forfeit pop-up, final task text, Final-week carousel, mobile Block, Bants open forum, two separate country fields, placeholder name, deferred production wiring.</w:t>
+            </w:r>
+          </w:p>
+        </w:tc>
+        <w:tc>
+          <w:tcPr>
+            <w:tcW w:type="dxa" w:w="1850"/>
+          </w:tcPr>
+          <w:p>
+            <w:r>
+              <w:t>docs/decisions-founder-2026-10-16-followup (docs only, 2026-10-16; founder decisions 2026-10-16, items 1-19; docs/contest-spec.md, docs/build-register.md, CLAUDE.md)</w:t>
+            </w:r>
+          </w:p>
+        </w:tc>
+        <w:tc>
+          <w:tcPr>
+            <w:tcW w:type="dxa" w:w="2300"/>
+          </w:tcPr>
+          <w:p>
+            <w:r>
+              <w:t>Resolved -- recorded; DECIDED, NOT BUILT. Source: founder decisions 2026-10-16, numbered 1-19 as given to this entry. Amends #400 (items 1, 9, 11), #395 (items 2, 15), #401 (item 7), #369 (item 15), #394 and #371 (item 17) by dated notes appended to those rows; the original text of every row is unchanged. It also changes points recorded in #398 D1 (item 8), #399 E3 (item 10) and #402 item 4 (item 16): those three rows were NOT edited (this entry is the record), see docs/build-register.md Section 12. The founder labelled the country select in item 17 a veto-able default and the withdrawal throttle in item 15 a default held in configuration; everything else is stated as a decision. (1) NON-FINALIST CONTEST TAB -- AMENDS #400 E8. The Create Post Contest tab for a non-finalist is NOT hidden. The tab stays visible, and a non-finalist who opens it during days 22-24 sees the existing 'Closed (not a finalist)' frames (desktop 6660:31044, mobile 6660:35699), which are RESTORED (un-archived, by a Figma pass, not by this entry). The minimum tally x stays admin-only (E8's second sentence stands). (2) DECLINE PAGE CAP SENTENCE -- clarifies #395 B2. The decline page keeps its static sentence that states the cap (Figma node 6627:22230). 'No decline count is shown' means no RUNNING 'decline N of 3' counter. The sentence is minor-facing copy and stays [COPY PENDING LEGAL REVIEW]. (3) GUARDIAN 'APPROVED' SCREENS. 5488:7164 and 5501:8225 are reworded to match the flow (approval continues to Create Profile; extends #394 A5); the new wording is [COPY PENDING LEGAL REVIEW]. (4) ADMIN COMPONENTS. The component frame at Figma node 6671:27364 (Pass F2) exists so that admin screens and apps/admin share ONE Button, Pill, Field, Callout, Banner, Note, Dialog and Table. Adoption is on the Pass C and Pass F1 admin frames only (not on older admin frames). A spacing / radius variable collection is added (a Figma pass does this; 'Soccernity Theme' stays the colour collection). (5) ADMIN SHELL SEARCH BAR. It stays visible on admin screens and is NOT functional ('not available yet'). New register row B-114: decide build vs hide. (6) EXCEPTION TO 'NEVER DELETE' (Figma passes). The ten hidden legacy absolute layers inside the ten rebuilt Create Post frames (the 'ARCHIVED -- legacy absolute layer' children from Pass F2 inside 2008:655, 2009:5168, 2009:2913, 6171:14797, 6171:16994, 2496:4462, 2565:3951, 6660:28736, 6660:31044, 6660:33353) may be deleted, and ONLY those. (7) VOTING PAGE ADOPTS THE ALREADY VOTED DESIGN -- closes the open point of #401. The Voting page (desktop 2094:994, mobile 5802:8726) takes the Already Voted page's design (entries column + board column, fan cards) and carries the vote toggle (#401). The separate Already Voted screens (5802:8978 / 5815:8916, and the auto-layout rebuild 6671:27155) are archived AFTERWARDS, by a Figma pass; the Voting &lt;-&gt; Already Voted navigation of #387 therefore goes with them. (8) LIFT HOLD -- changes #398 D1 / #376. Lift hold applies to BOTH the legal hold and the 6-month bad-faith hold. A reason is required. The held user is NOT notified. Appeal Review reuses the shared hold dialogs (Bad faith / Legal hold / Lift hold) used on Report Detail. (9) FORFEIT POP-UP -- AMENDS #400 E11. Shown ONLY on the Contest page. On every load of that page the user sees one pop-up per forfeited week, from when the week is deemed forfeited (docs/contest-spec.md Section 7); the reason is shown; nothing is remembered between loads. The leaderboard Contest tab shows the forfeited writing in place of the three names for that week (no pop-up there). (10) FINAL TASK TEXT -- changes #399 E3. The week-4 task text shows on the live-ranking and uploading states only (not on the 'No winner this month' or crowned states). (11) COMMUNITY-FEED 'FINAL WEEK' MODULE -- AMENDS #400 E10 and the open point carried by #402. The module STAYS. The dead 'View on the Contest page' link is removed. Its videos become a carousel that keeps the current frame size and serves as a preview slot reusable for other showcases later. It shows only during a final contest week and not at all when there is none. OPEN: whether carousel views count as impressions (B-092). (12) MOBILE BLOCK PATTERN: the '...' menu (confirms the Pass F1 trigger, node 6669:27188). (13) CREATE POST FIGMA CHANGES ACCEPTED: the scrim token change (white 71% to color/overlay/scrim) and the typographic crest marks in the Fixtures module of the Create Post frames. Licensing of club crests in Fixtures stays OPEN (#85, #97). (14) FONT: user-facing read-only fields need a Montserrat Field variant (the admin components are Inter). (15) DEFAULTS CLOSING OPEN POINTS: the placeholder name for incomplete profiles is 'Soccernity member' (closes #369's open point); a DOB-correction restart RESETS the decline counter and writes an audit entry (closes #395 B4's open point); the withdrawal throttle default is 5 attempts per 15 minutes, held in configuration (sets the window left open in #395 B3); unverified-email users are blocked from social writes as well as from PATCH /users/:id (extends the guard built under B-020; new row B-118). (16) BANTS -- an OPEN FORUM, no private messages. Anyone can start a thread and others comment on it; likes work as on a blog or forum (one like per user per item, toggled, public count). Accounts aged 16 and 17 have FULL Bants access (the limit in #346 applies to under-16s only, who stay fully disabled); this is a founder decision, not read-only. Bants will have moderation. Block hides the blocked user's posts, comments and like identities in both directions; counts unchanged; no room membership. This settles the 'Bants rooms' and 'exact like mechanics' points #402 item 4 left open; the interaction with #346 / #347 stays open. OPEN, recorded not resolved: 'thread' is not mapped to the built model (BanterRoom #275 vs Post), and 'no room membership' is not reconciled with the built BanterRoomMember join / leave, My Bants and 'posting requires membership' (#275); the scope of 'moderation' beyond room status (#357) is not stated. New row B-117. (17) COUNTRY HAS TWO SEPARATE FIELDS. (a) SAFEGUARDING country: declared at the Age Gate and derived from the IP lookup (B-023..B-025). Stored separately, never shown, never editable by any profile action; it alone decides US under-13 card verification and demographic grouping (#368 stands). (b) PROFILE country: a separate, nullable, OPTIONAL field. It is BLANK at Create Profile (not prefilled, not read-only), the user may fill it in, and it is editable at any time in Edit Profile (B-083). It is shown on a user's profile only if they filled it in, so a minor's country is visible only if the minor chooses to enter it. AMENDS #394 A1 (Country read-only at Create Profile) and the 'country' item of #371 (profile shows country): those rows stand except for these points. DEFAULT, VETO-ABLE: a country select from the full country list. B-038 stores the profile country as its own column, NOT the derived or declared safeguarding fields. Counsel review of country display stays on the legal list with reduced scope because the field is optional. (18) PRODUCTION WIRING (MaxMind, Render environment variables, Postmark, JWT secrets, TRUST_PROXY_HOPS) is deferred to the launch gate B-090; the code fails safe until it is done. (19) NEW REGISTER ROWS: password-reset email placeholder-address fallback (B-115); API test-suite worker flake, the suite needs --maxWorkers=4 (B-116); admin search bar (B-114, item 5). Rows added from the other items: B-113 (Figma re-sync, items 1-14 and 17), B-117 (Bants open forum), B-118 (email-verification gate on social writes). Build register: B-113 to B-118 new; status lines on B-002, B-003, B-006, B-007, B-012, B-013, B-018, B-020, B-023, B-024, B-026, B-027, B-038, B-039, B-042, B-044, B-045, B-054, B-071, B-079, B-080, B-081, B-082, B-083, B-090, B-091, B-092, B-095, B-096, B-098, B-099, B-102, B-103, B-107, B-108, B-112. STILL OPEN: counsel wording for every [COPY PENDING LEGAL REVIEW] item; the Bants mapping questions in (16); build vs hide for the admin search bar (B-114); whether carousel views count as impressions (B-092); whether the 'Closed (not a finalist)' copy may reveal anything about uploads before the reveal; how other users reach a finalist's entry after the reveal; what the Contest tab shows from 00:00 to 08:00 on day 1; which routes count as 'social writes' (B-118); the interaction of Block with #346 / #347; crest licensing in Fixtures (#85, #97); the CSAM path; the length of every window stated as configuration other than the withdrawal throttle.</w:t>
             </w:r>
           </w:p>
         </w:tc>

</xml_diff>

<commit_message>
docs: founder decisions 2026-10-17 (Decision Log #404), register B-119 to B-123
Docs only. Adds Decision Log #404; appends dated pointers to #369, #370, #372,
#373 and #403; adds register Section 14 and rows B-119 to B-123; adds
contest-spec Section 14e (Contest notifications); updates CLAUDE.md.

Co-Authored-By: Claude Sonnet 5.5 <noreply@anthropic.com>
</commit_message>
<xml_diff>
--- a/docs/Soccernity_MVP_Build_Plan_v1.7.docx
+++ b/docs/Soccernity_MVP_Build_Plan_v1.7.docx
@@ -25682,7 +25682,7 @@
           </w:tcPr>
           <w:p>
             <w:r>
-              <w:t>Resolved -- decided, NOT yet built. A username is required at Create Profile so that no user, minor or adult, is shown to other users under a real name. Until Create Profile is complete an account is shown to others under a neutral placeholder name, cannot post, and is redirected to Create Profile on every login. Applies to adults and to approved minors. Builds on #364 (User.username, shipped optional, 'username first, display name fallback'), which this makes mandatory for any account that completes onboarding; legacy accounts with no username fall under the same gate. Username moderation rules (reserved words, impersonation, profanity, no personal data in usernames, change cooldown, released-handle holding period, admin revoke built code-first with a design follow-up) are specified in the build PR, not here. OPEN: what the placeholder name is, and how the gate treats accounts that already exist without a username. [2026-10-16: Amended by #403. The placeholder name for incomplete profiles is 'Soccernity member' (closes the first OPEN point). The second OPEN point (accounts that already exist without a username) is not addressed.]</w:t>
+              <w:t>Resolved -- decided, NOT yet built. A username is required at Create Profile so that no user, minor or adult, is shown to other users under a real name. Until Create Profile is complete an account is shown to others under a neutral placeholder name, cannot post, and is redirected to Create Profile on every login. Applies to adults and to approved minors. Builds on #364 (User.username, shipped optional, 'username first, display name fallback'), which this makes mandatory for any account that completes onboarding; legacy accounts with no username fall under the same gate. Username moderation rules (reserved words, impersonation, profanity, no personal data in usernames, change cooldown, released-handle holding period, admin revoke built code-first with a design follow-up) are specified in the build PR, not here. OPEN: what the placeholder name is, and how the gate treats accounts that already exist without a username. [2026-10-16: Amended by #403. The placeholder name for incomplete profiles is 'Soccernity member' (closes the first OPEN point). The second OPEN point (accounts that already exist without a username) is not addressed.] [2026-10-17: The second OPEN point (accounts that already exist without a username) is resolved by B-027, which is built (backend/w3-gates, PR #412): legacy accounts are inside the incomplete-profile gate, and the placeholder other users see is 'Soccernity member' (#403, item 15). The wording of the gate is unchanged. Recorded in #404.]</w:t>
             </w:r>
           </w:p>
         </w:tc>
@@ -25724,7 +25724,7 @@
           </w:tcPr>
           <w:p>
             <w:r>
-              <w:t>Resolved -- decided, NOT yet built. A restricted-pending user cannot perform any social or profile write: profile edits, represented club, follow, like, save, club join, and the like. Left open to them: report and appeal, change-guardian-email, password change, deactivate/delete, logout. Today only some writes are blocked (POST /posts, comments, rooms, DMs and Community Group create/join are consent-guarded; follow, like, save, club join and PATCH /users/:id are JwtAuthGuard-only, per the reasoning in Decision Log #21/#275) -- this entry widens the rule to a uniform write block. Needs a build PR that re-checks every JwtAuthGuard-only write route.</w:t>
+              <w:t>Resolved -- decided, NOT yet built. A restricted-pending user cannot perform any social or profile write: profile edits, represented club, follow, like, save, club join, and the like. Left open to them: report and appeal, change-guardian-email, password change, deactivate/delete, logout. Today only some writes are blocked (POST /posts, comments, rooms, DMs and Community Group create/join are consent-guarded; follow, like, save, club join and PATCH /users/:id are JwtAuthGuard-only, per the reasoning in Decision Log #21/#275) -- this entry widens the rule to a uniform write block. Needs a build PR that re-checks every JwtAuthGuard-only write route. [2026-10-17: Built: B-026 (backend/w3-gates, PR #412). GuardianConsentGuard is now on every social and profile write route; the route table is pinned in docs/backend-w3-gates-report.md and enforced by services/api/src/write-route-guards.spec.ts, so a new write route with no entry fails the build. Recorded in #404.]</w:t>
             </w:r>
           </w:p>
         </w:tc>
@@ -25808,7 +25808,7 @@
           </w:tcPr>
           <w:p>
             <w:r>
-              <w:t>Resolved -- decided, NOT yet built. A GET-by-consent-token lookup returns, to the unauthenticated token holder: the minor's name, date of birth, 'you were named as', and date requested, plus notices that the guardian's email appears on the minor's profile as the line of contact and that the photo and username are visible to others. Safeguards: single-use, expiring token; rate limiting; an identical response for invalid, expired and used tokens (non-enumerating); an uncacheable response; the DOB decrypted server-side only for this response; nothing logged beyond the token outcome. Wrong-DOB path: a 'report incorrect details' action flags the account for support; decline remains available. This is the endpoint CLAUDE.md's F5 bullet recorded as missing (the Figma 'Request Summary' panel was omitted for want of it). Adds a use of the decrypted date of birth beyond Decision Log #362's read sites. OPEN: counsel to confirm that returning a child's DOB to a token holder is proportionate, and what the support flag does to the consent flow while it is open.</w:t>
+              <w:t>Resolved -- decided, NOT yet built. A GET-by-consent-token lookup returns, to the unauthenticated token holder: the minor's name, date of birth, 'you were named as', and date requested, plus notices that the guardian's email appears on the minor's profile as the line of contact and that the photo and username are visible to others. Safeguards: single-use, expiring token; rate limiting; an identical response for invalid, expired and used tokens (non-enumerating); an uncacheable response; the DOB decrypted server-side only for this response; nothing logged beyond the token outcome. Wrong-DOB path: a 'report incorrect details' action flags the account for support; decline remains available. This is the endpoint CLAUDE.md's F5 bullet recorded as missing (the Figma 'Request Summary' panel was omitted for want of it). Adds a use of the decrypted date of birth beyond Decision Log #362's read sites. OPEN: counsel to confirm that returning a child's DOB to a token holder is proportionate, and what the support flag does to the consent flow while it is open. [2026-10-17: The OPEN point (what the support flag does to the consent flow while it is open) is resolved by default in B-029, which is built (backend/w3-gates, PR #412): an open incorrect-details report blocks approval and card-payment start, and does not block decline or withdraw. The founder adopted this default on 2026-10-17 (veto-able). Recorded in #404, item 12.]</w:t>
             </w:r>
           </w:p>
         </w:tc>
@@ -25850,7 +25850,7 @@
           </w:tcPr>
           <w:p>
             <w:r>
-              <w:t>Resolved -- decided, NOT yet built. An email is sent to the minor's registered address when the guardian approves. Closes the audit's finding that no such template or send exists (docs/mvp-coverage-audit.md top gap 2, Q12). Copy is functional and not counsel-reviewed; it should carry the link back into the flow (the 'Continue registration' step in the sign-up flow entry).</w:t>
+              <w:t>Resolved -- decided, NOT yet built. An email is sent to the minor's registered address when the guardian approves. Closes the audit's finding that no such template or send exists (docs/mvp-coverage-audit.md top gap 2, Q12). Copy is functional and not counsel-reviewed; it should carry the link back into the flow (the 'Continue registration' step in the sign-up flow entry). [2026-10-17: Built: B-028 (backend/w3-gates, PR #412). The email is sent once, on the real pending-to-confirmed transition, to the minor's registered address; its link goes to /login; nothing is sent if WEB_APP_BASE_URL is unusable. Recorded in #404.]</w:t>
             </w:r>
           </w:p>
         </w:tc>
@@ -27131,7 +27131,49 @@
           </w:tcPr>
           <w:p>
             <w:r>
-              <w:t>Resolved -- recorded; DECIDED, NOT BUILT. Source: founder decisions 2026-10-16, numbered 1-19 as given to this entry. Amends #400 (items 1, 9, 11), #395 (items 2, 15), #401 (item 7), #369 (item 15), #394 and #371 (item 17) by dated notes appended to those rows; the original text of every row is unchanged. It also changes points recorded in #398 D1 (item 8), #399 E3 (item 10) and #402 item 4 (item 16): those three rows were NOT edited (this entry is the record), see docs/build-register.md Section 12. The founder labelled the country select in item 17 a veto-able default and the withdrawal throttle in item 15 a default held in configuration; everything else is stated as a decision. (1) NON-FINALIST CONTEST TAB -- AMENDS #400 E8. The Create Post Contest tab for a non-finalist is NOT hidden. The tab stays visible, and a non-finalist who opens it during days 22-24 sees the existing 'Closed (not a finalist)' frames (desktop 6660:31044, mobile 6660:35699), which are RESTORED (un-archived, by a Figma pass, not by this entry). The minimum tally x stays admin-only (E8's second sentence stands). (2) DECLINE PAGE CAP SENTENCE -- clarifies #395 B2. The decline page keeps its static sentence that states the cap (Figma node 6627:22230). 'No decline count is shown' means no RUNNING 'decline N of 3' counter. The sentence is minor-facing copy and stays [COPY PENDING LEGAL REVIEW]. (3) GUARDIAN 'APPROVED' SCREENS. 5488:7164 and 5501:8225 are reworded to match the flow (approval continues to Create Profile; extends #394 A5); the new wording is [COPY PENDING LEGAL REVIEW]. (4) ADMIN COMPONENTS. The component frame at Figma node 6671:27364 (Pass F2) exists so that admin screens and apps/admin share ONE Button, Pill, Field, Callout, Banner, Note, Dialog and Table. Adoption is on the Pass C and Pass F1 admin frames only (not on older admin frames). A spacing / radius variable collection is added (a Figma pass does this; 'Soccernity Theme' stays the colour collection). (5) ADMIN SHELL SEARCH BAR. It stays visible on admin screens and is NOT functional ('not available yet'). New register row B-114: decide build vs hide. (6) EXCEPTION TO 'NEVER DELETE' (Figma passes). The ten hidden legacy absolute layers inside the ten rebuilt Create Post frames (the 'ARCHIVED -- legacy absolute layer' children from Pass F2 inside 2008:655, 2009:5168, 2009:2913, 6171:14797, 6171:16994, 2496:4462, 2565:3951, 6660:28736, 6660:31044, 6660:33353) may be deleted, and ONLY those. (7) VOTING PAGE ADOPTS THE ALREADY VOTED DESIGN -- closes the open point of #401. The Voting page (desktop 2094:994, mobile 5802:8726) takes the Already Voted page's design (entries column + board column, fan cards) and carries the vote toggle (#401). The separate Already Voted screens (5802:8978 / 5815:8916, and the auto-layout rebuild 6671:27155) are archived AFTERWARDS, by a Figma pass; the Voting &lt;-&gt; Already Voted navigation of #387 therefore goes with them. (8) LIFT HOLD -- changes #398 D1 / #376. Lift hold applies to BOTH the legal hold and the 6-month bad-faith hold. A reason is required. The held user is NOT notified. Appeal Review reuses the shared hold dialogs (Bad faith / Legal hold / Lift hold) used on Report Detail. (9) FORFEIT POP-UP -- AMENDS #400 E11. Shown ONLY on the Contest page. On every load of that page the user sees one pop-up per forfeited week, from when the week is deemed forfeited (docs/contest-spec.md Section 7); the reason is shown; nothing is remembered between loads. The leaderboard Contest tab shows the forfeited writing in place of the three names for that week (no pop-up there). (10) FINAL TASK TEXT -- changes #399 E3. The week-4 task text shows on the live-ranking and uploading states only (not on the 'No winner this month' or crowned states). (11) COMMUNITY-FEED 'FINAL WEEK' MODULE -- AMENDS #400 E10 and the open point carried by #402. The module STAYS. The dead 'View on the Contest page' link is removed. Its videos become a carousel that keeps the current frame size and serves as a preview slot reusable for other showcases later. It shows only during a final contest week and not at all when there is none. OPEN: whether carousel views count as impressions (B-092). (12) MOBILE BLOCK PATTERN: the '...' menu (confirms the Pass F1 trigger, node 6669:27188). (13) CREATE POST FIGMA CHANGES ACCEPTED: the scrim token change (white 71% to color/overlay/scrim) and the typographic crest marks in the Fixtures module of the Create Post frames. Licensing of club crests in Fixtures stays OPEN (#85, #97). (14) FONT: user-facing read-only fields need a Montserrat Field variant (the admin components are Inter). (15) DEFAULTS CLOSING OPEN POINTS: the placeholder name for incomplete profiles is 'Soccernity member' (closes #369's open point); a DOB-correction restart RESETS the decline counter and writes an audit entry (closes #395 B4's open point); the withdrawal throttle default is 5 attempts per 15 minutes, held in configuration (sets the window left open in #395 B3); unverified-email users are blocked from social writes as well as from PATCH /users/:id (extends the guard built under B-020; new row B-118). (16) BANTS -- an OPEN FORUM, no private messages. Anyone can start a thread and others comment on it; likes work as on a blog or forum (one like per user per item, toggled, public count). Accounts aged 16 and 17 have FULL Bants access (the limit in #346 applies to under-16s only, who stay fully disabled); this is a founder decision, not read-only. Bants will have moderation. Block hides the blocked user's posts, comments and like identities in both directions; counts unchanged; no room membership. This settles the 'Bants rooms' and 'exact like mechanics' points #402 item 4 left open; the interaction with #346 / #347 stays open. OPEN, recorded not resolved: 'thread' is not mapped to the built model (BanterRoom #275 vs Post), and 'no room membership' is not reconciled with the built BanterRoomMember join / leave, My Bants and 'posting requires membership' (#275); the scope of 'moderation' beyond room status (#357) is not stated. New row B-117. (17) COUNTRY HAS TWO SEPARATE FIELDS. (a) SAFEGUARDING country: declared at the Age Gate and derived from the IP lookup (B-023..B-025). Stored separately, never shown, never editable by any profile action; it alone decides US under-13 card verification and demographic grouping (#368 stands). (b) PROFILE country: a separate, nullable, OPTIONAL field. It is BLANK at Create Profile (not prefilled, not read-only), the user may fill it in, and it is editable at any time in Edit Profile (B-083). It is shown on a user's profile only if they filled it in, so a minor's country is visible only if the minor chooses to enter it. AMENDS #394 A1 (Country read-only at Create Profile) and the 'country' item of #371 (profile shows country): those rows stand except for these points. DEFAULT, VETO-ABLE: a country select from the full country list. B-038 stores the profile country as its own column, NOT the derived or declared safeguarding fields. Counsel review of country display stays on the legal list with reduced scope because the field is optional. (18) PRODUCTION WIRING (MaxMind, Render environment variables, Postmark, JWT secrets, TRUST_PROXY_HOPS) is deferred to the launch gate B-090; the code fails safe until it is done. (19) NEW REGISTER ROWS: password-reset email placeholder-address fallback (B-115); API test-suite worker flake, the suite needs --maxWorkers=4 (B-116); admin search bar (B-114, item 5). Rows added from the other items: B-113 (Figma re-sync, items 1-14 and 17), B-117 (Bants open forum), B-118 (email-verification gate on social writes). Build register: B-113 to B-118 new; status lines on B-002, B-003, B-006, B-007, B-012, B-013, B-018, B-020, B-023, B-024, B-026, B-027, B-038, B-039, B-042, B-044, B-045, B-054, B-071, B-079, B-080, B-081, B-082, B-083, B-090, B-091, B-092, B-095, B-096, B-098, B-099, B-102, B-103, B-107, B-108, B-112. STILL OPEN: counsel wording for every [COPY PENDING LEGAL REVIEW] item; the Bants mapping questions in (16); build vs hide for the admin search bar (B-114); whether carousel views count as impressions (B-092); whether the 'Closed (not a finalist)' copy may reveal anything about uploads before the reveal; how other users reach a finalist's entry after the reveal; what the Contest tab shows from 00:00 to 08:00 on day 1; which routes count as 'social writes' (B-118); the interaction of Block with #346 / #347; crest licensing in Fixtures (#85, #97); the CSAM path; the length of every window stated as configuration other than the withdrawal throttle.</w:t>
+              <w:t>Resolved -- recorded; DECIDED, NOT BUILT. Source: founder decisions 2026-10-16, numbered 1-19 as given to this entry. Amends #400 (items 1, 9, 11), #395 (items 2, 15), #401 (item 7), #369 (item 15), #394 and #371 (item 17) by dated notes appended to those rows; the original text of every row is unchanged. It also changes points recorded in #398 D1 (item 8), #399 E3 (item 10) and #402 item 4 (item 16): those three rows were NOT edited (this entry is the record), see docs/build-register.md Section 12. The founder labelled the country select in item 17 a veto-able default and the withdrawal throttle in item 15 a default held in configuration; everything else is stated as a decision. (1) NON-FINALIST CONTEST TAB -- AMENDS #400 E8. The Create Post Contest tab for a non-finalist is NOT hidden. The tab stays visible, and a non-finalist who opens it during days 22-24 sees the existing 'Closed (not a finalist)' frames (desktop 6660:31044, mobile 6660:35699), which are RESTORED (un-archived, by a Figma pass, not by this entry). The minimum tally x stays admin-only (E8's second sentence stands). (2) DECLINE PAGE CAP SENTENCE -- clarifies #395 B2. The decline page keeps its static sentence that states the cap (Figma node 6627:22230). 'No decline count is shown' means no RUNNING 'decline N of 3' counter. The sentence is minor-facing copy and stays [COPY PENDING LEGAL REVIEW]. (3) GUARDIAN 'APPROVED' SCREENS. 5488:7164 and 5501:8225 are reworded to match the flow (approval continues to Create Profile; extends #394 A5); the new wording is [COPY PENDING LEGAL REVIEW]. (4) ADMIN COMPONENTS. The component frame at Figma node 6671:27364 (Pass F2) exists so that admin screens and apps/admin share ONE Button, Pill, Field, Callout, Banner, Note, Dialog and Table. Adoption is on the Pass C and Pass F1 admin frames only (not on older admin frames). A spacing / radius variable collection is added (a Figma pass does this; 'Soccernity Theme' stays the colour collection). (5) ADMIN SHELL SEARCH BAR. It stays visible on admin screens and is NOT functional ('not available yet'). New register row B-114: decide build vs hide. (6) EXCEPTION TO 'NEVER DELETE' (Figma passes). The ten hidden legacy absolute layers inside the ten rebuilt Create Post frames (the 'ARCHIVED -- legacy absolute layer' children from Pass F2 inside 2008:655, 2009:5168, 2009:2913, 6171:14797, 6171:16994, 2496:4462, 2565:3951, 6660:28736, 6660:31044, 6660:33353) may be deleted, and ONLY those. (7) VOTING PAGE ADOPTS THE ALREADY VOTED DESIGN -- closes the open point of #401. The Voting page (desktop 2094:994, mobile 5802:8726) takes the Already Voted page's design (entries column + board column, fan cards) and carries the vote toggle (#401). The separate Already Voted screens (5802:8978 / 5815:8916, and the auto-layout rebuild 6671:27155) are archived AFTERWARDS, by a Figma pass; the Voting &lt;-&gt; Already Voted navigation of #387 therefore goes with them. (8) LIFT HOLD -- changes #398 D1 / #376. Lift hold applies to BOTH the legal hold and the 6-month bad-faith hold. A reason is required. The held user is NOT notified. Appeal Review reuses the shared hold dialogs (Bad faith / Legal hold / Lift hold) used on Report Detail. (9) FORFEIT POP-UP -- AMENDS #400 E11. Shown ONLY on the Contest page. On every load of that page the user sees one pop-up per forfeited week, from when the week is deemed forfeited (docs/contest-spec.md Section 7); the reason is shown; nothing is remembered between loads. The leaderboard Contest tab shows the forfeited writing in place of the three names for that week (no pop-up there). (10) FINAL TASK TEXT -- changes #399 E3. The week-4 task text shows on the live-ranking and uploading states only (not on the 'No winner this month' or crowned states). (11) COMMUNITY-FEED 'FINAL WEEK' MODULE -- AMENDS #400 E10 and the open point carried by #402. The module STAYS. The dead 'View on the Contest page' link is removed. Its videos become a carousel that keeps the current frame size and serves as a preview slot reusable for other showcases later. It shows only during a final contest week and not at all when there is none. OPEN: whether carousel views count as impressions (B-092). (12) MOBILE BLOCK PATTERN: the '...' menu (confirms the Pass F1 trigger, node 6669:27188). (13) CREATE POST FIGMA CHANGES ACCEPTED: the scrim token change (white 71% to color/overlay/scrim) and the typographic crest marks in the Fixtures module of the Create Post frames. Licensing of club crests in Fixtures stays OPEN (#85, #97). (14) FONT: user-facing read-only fields need a Montserrat Field variant (the admin components are Inter). (15) DEFAULTS CLOSING OPEN POINTS: the placeholder name for incomplete profiles is 'Soccernity member' (closes #369's open point); a DOB-correction restart RESETS the decline counter and writes an audit entry (closes #395 B4's open point); the withdrawal throttle default is 5 attempts per 15 minutes, held in configuration (sets the window left open in #395 B3); unverified-email users are blocked from social writes as well as from PATCH /users/:id (extends the guard built under B-020; new row B-118). (16) BANTS -- an OPEN FORUM, no private messages. Anyone can start a thread and others comment on it; likes work as on a blog or forum (one like per user per item, toggled, public count). Accounts aged 16 and 17 have FULL Bants access (the limit in #346 applies to under-16s only, who stay fully disabled); this is a founder decision, not read-only. Bants will have moderation. Block hides the blocked user's posts, comments and like identities in both directions; counts unchanged; no room membership. This settles the 'Bants rooms' and 'exact like mechanics' points #402 item 4 left open; the interaction with #346 / #347 stays open. OPEN, recorded not resolved: 'thread' is not mapped to the built model (BanterRoom #275 vs Post), and 'no room membership' is not reconciled with the built BanterRoomMember join / leave, My Bants and 'posting requires membership' (#275); the scope of 'moderation' beyond room status (#357) is not stated. New row B-117. (17) COUNTRY HAS TWO SEPARATE FIELDS. (a) SAFEGUARDING country: declared at the Age Gate and derived from the IP lookup (B-023..B-025). Stored separately, never shown, never editable by any profile action; it alone decides US under-13 card verification and demographic grouping (#368 stands). (b) PROFILE country: a separate, nullable, OPTIONAL field. It is BLANK at Create Profile (not prefilled, not read-only), the user may fill it in, and it is editable at any time in Edit Profile (B-083). It is shown on a user's profile only if they filled it in, so a minor's country is visible only if the minor chooses to enter it. AMENDS #394 A1 (Country read-only at Create Profile) and the 'country' item of #371 (profile shows country): those rows stand except for these points. DEFAULT, VETO-ABLE: a country select from the full country list. B-038 stores the profile country as its own column, NOT the derived or declared safeguarding fields. Counsel review of country display stays on the legal list with reduced scope because the field is optional. (18) PRODUCTION WIRING (MaxMind, Render environment variables, Postmark, JWT secrets, TRUST_PROXY_HOPS) is deferred to the launch gate B-090; the code fails safe until it is done. (19) NEW REGISTER ROWS: password-reset email placeholder-address fallback (B-115); API test-suite worker flake, the suite needs --maxWorkers=4 (B-116); admin search bar (B-114, item 5). Rows added from the other items: B-113 (Figma re-sync, items 1-14 and 17), B-117 (Bants open forum), B-118 (email-verification gate on social writes). Build register: B-113 to B-118 new; status lines on B-002, B-003, B-006, B-007, B-012, B-013, B-018, B-020, B-023, B-024, B-026, B-027, B-038, B-039, B-042, B-044, B-045, B-054, B-071, B-079, B-080, B-081, B-082, B-083, B-090, B-091, B-092, B-095, B-096, B-098, B-099, B-102, B-103, B-107, B-108, B-112. STILL OPEN: counsel wording for every [COPY PENDING LEGAL REVIEW] item; the Bants mapping questions in (16); build vs hide for the admin search bar (B-114); whether carousel views count as impressions (B-092); whether the 'Closed (not a finalist)' copy may reveal anything about uploads before the reveal; how other users reach a finalist's entry after the reveal; what the Contest tab shows from 00:00 to 08:00 on day 1; which routes count as 'social writes' (B-118); the interaction of Block with #346 / #347; crest licensing in Fixtures (#85, #97); the CSAM path; the length of every window stated as configuration other than the withdrawal throttle. [2026-10-17: Item 15 (unverified-email users cannot perform social writes) is built: B-118 (backend/w3-gates, PR #412). The creating forms are gated by EmailVerifiedGuard; the undo and own-content forms stay open (docs/backend-w3-gates-report.md, section 5, call 1, adopted by #404, item 12). Two open points of this entry are closed by #404: the forfeit pop-up reading of 'Contest page' and several forfeited weeks (item 4), and whether carousel views count as impressions (items 6 and 15).]</w:t>
+            </w:r>
+          </w:p>
+        </w:tc>
+      </w:tr>
+      <w:tr>
+        <w:tc>
+          <w:tcPr>
+            <w:tcW w:type="dxa" w:w="500"/>
+          </w:tcPr>
+          <w:p>
+            <w:r>
+              <w:t>404</w:t>
+            </w:r>
+          </w:p>
+        </w:tc>
+        <w:tc>
+          <w:tcPr>
+            <w:tcW w:type="dxa" w:w="4700"/>
+          </w:tcPr>
+          <w:p>
+            <w:r>
+              <w:t>Founder decisions 2026-10-17: Account Information drops Country; profile design direction; admin components move and are adopted; forfeit pop-up reading; vote toggle count; carousel impressions and the final-week entry journey; 2FA recovery details; blocked users list and a block never revealing itself; pinned final entry lifecycle; Bants thread model; backend W3 judgment calls adopted; Contest tab on day 1; standing Figma check; Contest notifications.</w:t>
+            </w:r>
+          </w:p>
+        </w:tc>
+        <w:tc>
+          <w:tcPr>
+            <w:tcW w:type="dxa" w:w="1850"/>
+          </w:tcPr>
+          <w:p>
+            <w:r>
+              <w:t>docs/decisions-founder-2026-10-17 (docs only, 2026-10-17; founder decisions 2026-10-17, items 1-17; docs/contest-spec.md, docs/build-register.md, CLAUDE.md)</w:t>
+            </w:r>
+          </w:p>
+        </w:tc>
+        <w:tc>
+          <w:tcPr>
+            <w:tcW w:type="dxa" w:w="2300"/>
+          </w:tcPr>
+          <w:p>
+            <w:r>
+              <w:t>Resolved -- recorded; DECIDED, NOT BUILT, except item 12, whose judgment calls are already in the shipped code (backend/w3-gates, PR #412). Items 1-14 and 17 are founder-adopted defaults, veto-able; items 15 and 16 are founder decisions and are recorded as given. Item numbers below are the founder's own. (1) ACCOUNT INFORMATION. The Account Information (Edit) frames (2924:7112, 5649:8176) drop the Country field. The profile country lives in Edit Profile, which keeps the label 'Country' (#403, item 17; Figma pass I). The safeguarding country is never shown or edited. (2) PROFILE DESIGN DIRECTION. New auto-layout desktop profile frames (the pass H frames, desktop 6707:26595 and 6707:26727 / 6707:26938) replace the legacy absolute-layout profile frames (1455:4362, 1455:6626, 5702:8250, 5778:8490). Default added in recording, veto-able: the legacy frames are archived (hidden, 'ARCHIVED' prefix), not deleted; the #403 item 6 deletion exception covers only the ten Create Post layers. (3) ADMIN COMPONENTS. The F2 components (node 6671:27364) move to match the admin screens: Pill uses auto line height with padding 3/10; Button gets size variants; Banner and Callout Title become optional; radius/10 and radius/16 are added to the spacing and radius collection. They are then adopted on the Pass C and Pass F1 admin frames with no visible change. This settles the 'which side moves', 'radius scale' and 'optional Title' candidates of docs/figma-pass-g2-report.md; the adoption itself is open Figma work (B-113, B-095). (4) FORFEIT POP-UP. 'Contest page' means the Contest details page and the Voting page. When several weeks are forfeited, one pop-up opens after another, oldest week first. Closes the two SCOPE OPEN points of Figma pass G1 and refines #403, item 9 (every load, reason shown, nothing remembered: unchanged). (5) VOTE TOGGLE. The vote count updates live by one, in either direction, when the toggle flips. No banner appears on toggle. Closes the SCOPE OPEN point of Figma pass G1 (#401, #403 item 7). (6) CAROUSEL IMPRESSIONS. Final-week carousel views count as impressions when a tile is actually visible; tile order follows the balanced rotation of #388 (docs/contest-spec.md, section 10b). Closes the open point of #403, item 11 and of B-092. OPEN (not stated): what 'actually visible' means in numbers (share of the tile in view, time in view). (7) 2FA RECOVERY. 10 backup codes, shown once, each in 5-5 groups (interpretation: ten characters shown as two groups of five; the character set is not stated). Regenerating needs the password and invalidates the old set. Turning 2FA off invalidates the codes. A wrong code and an already-used code give the same 'not accepted' message. 5 wrong tries in 15 minutes lock recovery for 15 minutes (ASSUMED per account, not per IP; a per-account lock lets a stranger lock out an account holder, a trade-off to confirm). Password re-entry is needed only to turn off and to regenerate. The 'check your email' page reads the same for unknown accounts (non-enumerating). Backup codes appear after the 6-digit code is accepted, before the '2FA is on' screen. Entry points: a 'Can't scan?' link (manual key) and a Turn off control. Closes the backup-code format and entry-point open points of #402 and Figma pass H; STILL OPEN: storage and encryption of the TOTP secret, counsel (legal copy Part C row 44). (8) BLOCKED USERS LIST. No date is shown; the reason is not editable (unblock and re-block to change it); the reason is visible to the blocker only. A blocked user sees the blocker's profile as not found (settles the SCOPE OPEN 'blocked user's own view' of Figma pass H; whether a new not-found frame is needed or the app's existing not-found state is reused is a Figma follow-up). (9) PINNED FINAL ENTRY. Others see nothing before the reveal. After the reveal the entry is pinned on the finalist's profile until the contest ends at the end of that month; then the pin is removed and the entry is an ordinary post. The label stays 'Contest post'. Item 15 repeats and extends this; where the wording differs, item 15 prevails (see item 15). (10) BANTS. A room is a thread (BanterRoom is the thread; comments are the posts in it). Posting and commenting need NO membership. 'Join' stays as a bookmark that feeds My Bants. Moderation means reporting plus admin moderation. This SUPERSEDES the 'posting requires membership' point of #275 and closes the open points of #403 item 16 and of B-117 (thread mapping, no room membership, moderation scope). Recorded as an interpretation to confirm: no like-identities list is built (none exists today), so the Block clause about like identities leaves counts unchanged. Unchanged: 16-17 full access, under-16 fully disabled (#346), Block effects (#402 item 4). (11) BLOCK AND THE AGE RULES. Block applies on top of the age rules (#346, #347). The age rules apply first. A block never reveals itself: no response, count or error tells the blocked user they are blocked. Closes the open interaction point of #402 item 4 and B-039. (12) BACKEND W3 JUDGMENT CALLS. Calls 1-7 of docs/backend-w3-gates-report.md, section 5, are adopted: (1) the restricted-pending write block is uniform and covers the undo forms, while the unverified-email block covers only the creating forms; (2) read-state and kickoff-alert subscription routes stay open; (3) the profile gate covers posting-class routes only; (4) an open incorrect-details report blocks approval and card payment, not decline or withdraw, and survives a guardian-email change; (5) username set means profile complete; (6) the approval email links to /login; (7) displayName is no longer a fallback anywhere other users can see it. BUILT (PR #412). Forward-pointers on #369, #370, #372, #373 and #403. (13) CONTEST TAB ON DAY 1. From 00:00 to 08:00 on day 1 the Contest tab shows the Between Weeks state, variant 'Week 1 opens at 08:00'. Closes the open E6 point of #403. Note: this window is 8 hours, not the 12 hours of the Between Weeks state of #400. (14) STANDING FIGMA CHECK. The whole-canvas depth-4 get_metadata pull is replaced by a findAll count per top-level node plus a top-level id hash, taken before and after. Reason: the page holds about 139,000 nodes and the pull cannot return (docs/figma-pass-g1-report.md, docs/figma-pass-h-report.md). (15) FINAL-WEEK ENTRY JOURNEY. After the reveal, finalist names on the leaderboard Contest tab open the finalist's profile, where the entry is pinned. Final-week carousel tiles open the entry itself. The entry does not also appear as a normal Community-feed post; the carousel is the daily exposure (balanced rotation, #388). A tile shown in the viewport counts as an impression. The pin lasts until the contest ends at the end of that month, then it is removed (replaces the wording of item 9). Closes 'how other users reach a finalist's entry after the reveal' (#400 E10, #403). OPEN (not stated): whether the entry, once the pin is removed, then appears in the Community feed; item 9 says it becomes an ordinary post, item 15 says only that the pin is removed. (16) CONTEST NOTIFICATIONS (founder decision; the spec had none). In-app notifications, all times Europe/London, to every non-restricted account that is eligible for the Contest under the existing rules (docs/contest-spec.md, sections 6 and 8: minors included, restricted accounts excluded): (a) week opens, 08:00 on days 1, 8, 15, 22; (b) votes-closing reminder, 19:00 on days 7, 14, 21, only to eligible accounts that have not voted that week; (c) week result, when votes lock at 20:00 on days 7, 14, 21: winners announced to everyone, plus a personal notification to each winner; (d) final qualification: a personal notification to each finalist saying the entry stays hidden until the reveal; (e) reveal, 00:00 on day 25: 'The final is live' to everyone; (f) final result: the winners, or 'No winner this month'; (g) forfeits need no extra notification, the pop-up covers them; (h) finalist upload reminder, 12:00 on day 24, to finalists who have not uploaded (default added by Claude, veto-able). One notification per account per event; a re-run never duplicates. Push and email are not decided and stay deferred to launch gate B-090. Wording is functional and tagged [COPY PENDING LEGAL REVIEW] where it reaches minors. ASSUMED, to confirm: (d) is sent when the finalists are known, at the week-3 result (20:00 on day 21); (f) is sent at the end of the contest month, because the spec states no crown moment; a forfeited week sends no (c) notification; whether an account with an unverified email receives them is not stated. BACKEND TO CONFIRM: a uniqueness key per (account, event, contest cycle, week) is needed for 'never duplicates'; Notification.type is a free string, but NotificationsService and the Notification Centre must learn each new type (the age_milestone and match_kickoff precedent: an unrendered type shows a generic row). (17) REGISTER. New rows B-119 to B-123 (admin incorrect-details reports list and resolve, Figma and code; Contest notifications backend, Figma states and frontend); status lines on the rows named in docs/build-register.md Section 14; the B-034 cursor and ordering leak stays on B-034. NOT DECIDED HERE: the visibility threshold in item 6; the TOTP secret storage; the notification timing assumptions in item 16; whether the unpinned entry reaches the Community feed. Dated notes were appended (original text unchanged) to #369, #370, #372, #373 and #403 only; #275, #400, #402 and #396 are amended in substance by this entry but were not edited, #404 is the record.</w:t>
             </w:r>
           </w:p>
         </w:tc>

</xml_diff>

<commit_message>
docs: Decision Log #405, register Section 19 (B-124 to B-126), contest-spec 14f
Records the founder's 2026-10-17 second-round decisions (items 1-10) as
Decision Log #405 and appends dated forward-pointers from the W3b and W3c
backend reports to #337-#340, #365, #372, #375, #389, #390, #395, #398,
#402, #403 and #404. Adds register rows B-124 (pending-copy guard, scope
flagged OPEN), B-125 (apps/web onboarding routing) and B-126 (OPEN, no
decision: declined-at-1-or-2 rows have no expiry); 126 B-IDs, 146 gap
frames unchanged. Docs only.

Co-Authored-By: Claude Sonnet 5.5 <noreply@anthropic.com>
</commit_message>
<xml_diff>
--- a/docs/Soccernity_MVP_Build_Plan_v1.7.docx
+++ b/docs/Soccernity_MVP_Build_Plan_v1.7.docx
@@ -24300,7 +24300,7 @@
           </w:tcPr>
           <w:p>
             <w:r>
-              <w:t>Resolved — implemented and flagged, not added silently, per CLAUDE.md's "the data model is a fixed spec" rule. Migration 20260919132732_add_guardian_decline_withdrawal_expiry_fields is purely additive (three nullable columns + a unique index + a sweep index @@index([consentStatus, consentTokenExpiresAt]); zero ALTER/DROP on anything existing). consentAutoResentAt defaults to NULL so every Guardian row already in flight at deploy gets its one automatic re-send — no existing pending account is fast-tracked to deletion. User/Guardian safeguarding fields untouched.</w:t>
+              <w:t>Resolved — implemented and flagged, not added silently, per CLAUDE.md's "the data model is a fixed spec" rule. Migration 20260919132732_add_guardian_decline_withdrawal_expiry_fields is purely additive (three nullable columns + a unique index + a sweep index @@index([consentStatus, consentTokenExpiresAt]); zero ALTER/DROP on anything existing). consentAutoResentAt defaults to NULL so every Guardian row already in flight at deploy gets its one automatic re-send — no existing pending account is fast-tracked to deletion. User/Guardian safeguarding fields untouched. [2026-10-17: A fourth Guardian column was added after this entry: declineCount (INTEGER NOT NULL DEFAULT 0, CHECK &gt;= 0, migration 20261017140000_add_guardian_decline_count, additive; backfilled to 1 for rows already explicitly declined under the old rule). Internal; no API returns it. A decline is no longer terminal for declines 1 and 2: an explicit decline with fewer than three recorded can be reopened as pending (B-110, B-102; backend/w3b-decline-cap-dob-correction, PR #416; docs/backend-w3b-report.md, section 7). Withdrawal, expiry and the third decline are never reopenable.]</w:t>
             </w:r>
           </w:p>
         </w:tc>
@@ -24342,7 +24342,7 @@
           </w:tcPr>
           <w:p>
             <w:r>
-              <w:t>Resolved - IMPLEMENTED (sprint-1/guardian-consent-decline-source, migration 20260919160000_guardian_consent_status_check_and_decline_source; purely additive). (a) Guardian.consentStatus now has a Postgres CHECK constraint restricting it to pending | confirmed | declined - a CHECK, NOT a Prisma enum, so the column stays a String in the generated TS type and the free-form-string convention of its six sibling columns is untouched (those remain unconstrained; extending the pattern to them was not done and is not part of this resolution). (b) Rather than adding distinct "withdrawn"/"expired" consentStatus values (which would have changed every consentStatus reader, all of which are allowlists on "confirmed"/"declined"), the distinction is carried by a new nullable column Guardian.consentDeclineSource = guardian_explicit | guardian_withdrawal | expiry_timeout (also CHECK-constrained; NULL for any row not declined and for every row declined before this migration - those are not backfilled, since their cause is not recoverable). It is written in exactly one place, GuardianConsentService.refuseConsentAndScheduleDeletion(), which the decline, withdraw and expiry-sweep paths all converge on; the first refusal wins (the existing not-already-declined write guard makes a repeat a no-op). An active decline is therefore now distinguishable from a silent timeout on the live Guardian row. NOT changed / still open: ConsentAuditRecord does not snapshot consentDeclineSource (its shape was deliberately left alone), so once the 30-day sweep hard-deletes the Guardian row the source is no longer retained anywhere - whether it should be added to the audit snapshot is a founder/counsel call, since that record is what survives as consent proof.</w:t>
+              <w:t>Resolved - IMPLEMENTED (sprint-1/guardian-consent-decline-source, migration 20260919160000_guardian_consent_status_check_and_decline_source; purely additive). (a) Guardian.consentStatus now has a Postgres CHECK constraint restricting it to pending | confirmed | declined - a CHECK, NOT a Prisma enum, so the column stays a String in the generated TS type and the free-form-string convention of its six sibling columns is untouched (those remain unconstrained; extending the pattern to them was not done and is not part of this resolution). (b) Rather than adding distinct "withdrawn"/"expired" consentStatus values (which would have changed every consentStatus reader, all of which are allowlists on "confirmed"/"declined"), the distinction is carried by a new nullable column Guardian.consentDeclineSource = guardian_explicit | guardian_withdrawal | expiry_timeout (also CHECK-constrained; NULL for any row not declined and for every row declined before this migration - those are not backfilled, since their cause is not recoverable). It is written in exactly one place, GuardianConsentService.refuseConsentAndScheduleDeletion(), which the decline, withdraw and expiry-sweep paths all converge on; the first refusal wins (the existing not-already-declined write guard makes a repeat a no-op). An active decline is therefore now distinguishable from a silent timeout on the live Guardian row. NOT changed / still open: ConsentAuditRecord does not snapshot consentDeclineSource (its shape was deliberately left alone), so once the 30-day sweep hard-deletes the Guardian row the source is no longer retained anywhere - whether it should be added to the audit snapshot is a founder/counsel call, since that record is what survives as consent proof. [2026-10-17: consentStatus 'declined' is still one of the three CHECK-constrained values, but it no longer always means a final refusal: after decline 1 or 2 the row is 'declined' with consentDeclineSource 'guardian_explicit' and the account stays active; resend or change-guardian-email reopens it as 'pending' and clears consentDeclineSource (built, PR #416). Withdrawal and expiry rows are never reopened. The source is still not snapshotted into ConsentAuditRecord (unchanged).]</w:t>
             </w:r>
           </w:p>
         </w:tc>
@@ -24394,7 +24394,7 @@
           </w:p>
           <w:p>
             <w:r>
-              <w:t>RESOLVED, residual gap closed by sprint-2/contest-admin-entries-withdrawn-consent-redaction (2026-09-28): the residual gap flagged above -- toAdminEntry()/AdminContestEntry's raw round.entries array (GET /admin/contest/cycles/:id and .../current's rounds[].entries, exposed to a judging admin before winners are even decided) still showing a withdrawn entrant's real displayName and full post content (contentText/mediaUrls) unredacted -- is now also closed. A new collectAdminDetailUserIds() helper folds round.entries[].userId into the same batched getWithdrawnConsentUserIds() Guardian lookup (an entrant who never won a round was never covered by collectGraphUserIds()'s winners/standings-only scan), and toAdminEntry() redacts entrant.displayName and post.contentText/mediaUrls to the same “Entry withdrawn — guardian consent revoked” placeholder toWeeklyWinners()/toStandings() already use in admin mode -- entryId, submittedAt, post.id/createdAt/likeCount/commentCount, and position stay real, since an admin still needs them to reconcile round judging. Covered by 3 new mocked unit tests mirroring the existing admin-redaction tests (contest.service.spec.ts): a withdrawn round winner redacted in both weeklyWinners AND the raw entries array in the same response; a withdrawn entrant who never won a round (proving the batched lookup now sees entries beyond winners/standings) alongside a non-withdrawn entrant left untouched; and the same entries-redaction proved on getCurrentContestForAdmin. No e2e spec added, same reasoning as the original resolution -- a plain findMany-then-filter/map change, no raw SQL/transaction/new relation.</w:t>
+              <w:t>RESOLVED, residual gap closed by sprint-2/contest-admin-entries-withdrawn-consent-redaction (2026-09-28): the residual gap flagged above -- toAdminEntry()/AdminContestEntry's raw round.entries array (GET /admin/contest/cycles/:id and .../current's rounds[].entries, exposed to a judging admin before winners are even decided) still showing a withdrawn entrant's real displayName and full post content (contentText/mediaUrls) unredacted -- is now also closed. A new collectAdminDetailUserIds() helper folds round.entries[].userId into the same batched getWithdrawnConsentUserIds() Guardian lookup (an entrant who never won a round was never covered by collectGraphUserIds()'s winners/standings-only scan), and toAdminEntry() redacts entrant.displayName and post.contentText/mediaUrls to the same “Entry withdrawn — guardian consent revoked” placeholder toWeeklyWinners()/toStandings() already use in admin mode -- entryId, submittedAt, post.id/createdAt/likeCount/commentCount, and position stay real, since an admin still needs them to reconcile round judging. Covered by 3 new mocked unit tests mirroring the existing admin-redaction tests (contest.service.spec.ts): a withdrawn round winner redacted in both weeklyWinners AND the raw entries array in the same response; a withdrawn entrant who never won a round (proving the batched lookup now sees entries beyond winners/standings) alongside a non-withdrawn entrant left untouched; and the same entries-redaction proved on getCurrentContestForAdmin. No e2e spec added, same reasoning as the original resolution -- a plain findMany-then-filter/map change, no raw SQL/transaction/new relation. [2026-10-17: Observation from the code, not re-tested: the withdrawn-consent lookup in ContestService keys off Guardian.consentStatus = 'declined'. Since PR #416 a 'declined' row can exist on an ACTIVE account after decline 1 or 2. That state is pre-approval (Contest entry needs confirmed consent), so no entry should exist to redact; the redaction logic was not changed.]</w:t>
             </w:r>
           </w:p>
         </w:tc>
@@ -24436,7 +24436,7 @@
           </w:tcPr>
           <w:p>
             <w:r>
-              <w:t>Resolved — implemented and flagged as a genuine spec-gap addition, the same shape as Decision Log #295 (POST /reports) and #297 (GET /admin/articles). All three carry @AuthRateLimit() and no guard, matching confirm's token-is-the-credential trust model. The withdrawal link is only ever emailed to Guardian.email, so taking the minor's email as input reveals and grants nothing. UX consequence flagged for the frontend ticket: a guardian withdrawing must enter the child's registered email, not their own.</w:t>
+              <w:t>Resolved — implemented and flagged as a genuine spec-gap addition, the same shape as Decision Log #295 (POST /reports) and #297 (GET /admin/articles). All three carry @AuthRateLimit() and no guard, matching confirm's token-is-the-credential trust model. The withdrawal link is only ever emailed to Guardian.email, so taking the minor's email as input reveals and grants nothing. UX consequence flagged for the frontend ticket: a guardian withdrawing must enter the child's registered email, not their own. [2026-10-17: The three withdrawal routes are unchanged. A withdrawal row is never reopenable, unlike an explicit decline at 1 or 2 (PR #416; docs/backend-w3b-report.md, section 7). See #337 and #338.]</w:t>
             </w:r>
           </w:p>
         </w:tc>
@@ -25514,7 +25514,7 @@
           </w:tcPr>
           <w:p>
             <w:r>
-              <w:t>Resolved -- built. POST /auth/guardian-consent/change-guardian-email { email }: the MINOR (JWT sub; JwtAuthGuard only, not GuardianConsentGuard, rate-limited) replaces the guardian's email while Guardian.consentStatus is 'pending'. Per Decision Log #60 it RESTARTS the flow from scratch on the SAME Guardian row: email replaced, a fresh consentToken overwrites the @unique column (the old emailed link stops resolving), a fresh expiry window starts, consentAutoResentAt is cleared (the new guardian gets the full expiry-sweep treatment, not the old guardian's spent budget), and any card-verification progress is wiped (stripePaymentIntentId/cardVerifiedAt/cardRefundedAt -&gt; null; cardVerificationRequired stays frozen). The request is sent through the existing sendGuardianConsentEmail path to the new address. REFUSALS: confirmed consent -&gt; 409 and the row is untouched (swapping the approving guardian under a live approval would let a minor keep the approval while choosing who gave it; withdrawal is the path for that); declined -&gt; 409; no Guardian row / not a minor / reclassified adult (#349) -&gt; 404; same email as on file -&gt; 400; the MINOR'S OWN email -&gt; 400 (a minor must not approve their own request -- registration has no such check, this is new here and flagged); a card charge for the current guardian verified but not yet refunded -&gt; 409 (clearing it would orphan the charge from CardRefundRetrySweepService; the hourly sweep settles it, then retry). Writes are an updateMany whose where clause carries the current token and card state (optimistic lock), so a concurrent change/resend/confirm loses cleanly (409) and sends nothing. FOLLOW-UP PASS, same PR, closing the first cut's flagged gaps: (a) the PREVIOUS guardian address is now emailed that its request was withdrawn (new guardian-email-replaced template; no token; the new address is not named; plain functional copy, NOT counsel-reviewed -- counsel to review wording); (b) the guardian's name and relationship are now REQUIRED on the request and re-captured with the new email (the new address may be a different person); (c) the minor's-own-email rule now also applies at REGISTRATION, where the guardian email is first captured; (d) a PER-MINOR cap of 5 successful changes per 24h (Redis, fixed window, counted on success only) backs the per-IP throttle, since an IP is a poor proxy for one account; (e) apps/web now has the screen at /guardian-consent/change-email (Figma 5498:7164), linked from the pending state of /guardian-consent. STILL OPEN: the Figma frame has no name/relationship fields (added plainly in code; the frame needs updating); mobile frame 5501:8536 not separately inspected; the 5 / 24h cap numbers are a judgment call. CONSENT_SCREEN_VERSION not bumped (guardian-visible consent wording unchanged). Zero schema change. Forward-pointer on #60; legal-copy Part C row 34 updated.</w:t>
+              <w:t>Resolved -- built. POST /auth/guardian-consent/change-guardian-email { email }: the MINOR (JWT sub; JwtAuthGuard only, not GuardianConsentGuard, rate-limited) replaces the guardian's email while Guardian.consentStatus is 'pending'. Per Decision Log #60 it RESTARTS the flow from scratch on the SAME Guardian row: email replaced, a fresh consentToken overwrites the @unique column (the old emailed link stops resolving), a fresh expiry window starts, consentAutoResentAt is cleared (the new guardian gets the full expiry-sweep treatment, not the old guardian's spent budget), and any card-verification progress is wiped (stripePaymentIntentId/cardVerifiedAt/cardRefundedAt -&gt; null; cardVerificationRequired stays frozen). The request is sent through the existing sendGuardianConsentEmail path to the new address. REFUSALS: confirmed consent -&gt; 409 and the row is untouched (swapping the approving guardian under a live approval would let a minor keep the approval while choosing who gave it; withdrawal is the path for that); declined -&gt; 409; no Guardian row / not a minor / reclassified adult (#349) -&gt; 404; same email as on file -&gt; 400; the MINOR'S OWN email -&gt; 400 (a minor must not approve their own request -- registration has no such check, this is new here and flagged); a card charge for the current guardian verified but not yet refunded -&gt; 409 (clearing it would orphan the charge from CardRefundRetrySweepService; the hourly sweep settles it, then retry). Writes are an updateMany whose where clause carries the current token and card state (optimistic lock), so a concurrent change/resend/confirm loses cleanly (409) and sends nothing. FOLLOW-UP PASS, same PR, closing the first cut's flagged gaps: (a) the PREVIOUS guardian address is now emailed that its request was withdrawn (new guardian-email-replaced template; no token; the new address is not named; plain functional copy, NOT counsel-reviewed -- counsel to review wording); (b) the guardian's name and relationship are now REQUIRED on the request and re-captured with the new email (the new address may be a different person); (c) the minor's-own-email rule now also applies at REGISTRATION, where the guardian email is first captured; (d) a PER-MINOR cap of 5 successful changes per 24h (Redis, fixed window, counted on success only) backs the per-IP throttle, since an IP is a poor proxy for one account; (e) apps/web now has the screen at /guardian-consent/change-email (Figma 5498:7164), linked from the pending state of /guardian-consent. STILL OPEN: the Figma frame has no name/relationship fields (added plainly in code; the frame needs updating); mobile frame 5501:8536 not separately inspected; the 5 / 24h cap numbers are a judgment call. CONSENT_SCREEN_VERSION not bumped (guardian-visible consent wording unchanged). Zero schema change. Forward-pointer on #60; legal-copy Part C row 34 updated. [2026-10-17: change-guardian-email now also accepts a declined row when it is an explicit decline with fewer than three recorded on an active minor's account, and reopens it as pending with a fresh token and expiry (B-110, PR #416). The 409 for a declined row in this entry now applies only to withdrawal rows, expiry rows and the third decline. The route stays JWT-authenticated and unchanged otherwise; the resend route is the email-keyed one (#405, item 6).]</w:t>
             </w:r>
           </w:p>
         </w:tc>
@@ -25808,7 +25808,7 @@
           </w:tcPr>
           <w:p>
             <w:r>
-              <w:t>Resolved -- decided, NOT yet built. A GET-by-consent-token lookup returns, to the unauthenticated token holder: the minor's name, date of birth, 'you were named as', and date requested, plus notices that the guardian's email appears on the minor's profile as the line of contact and that the photo and username are visible to others. Safeguards: single-use, expiring token; rate limiting; an identical response for invalid, expired and used tokens (non-enumerating); an uncacheable response; the DOB decrypted server-side only for this response; nothing logged beyond the token outcome. Wrong-DOB path: a 'report incorrect details' action flags the account for support; decline remains available. This is the endpoint CLAUDE.md's F5 bullet recorded as missing (the Figma 'Request Summary' panel was omitted for want of it). Adds a use of the decrypted date of birth beyond Decision Log #362's read sites. OPEN: counsel to confirm that returning a child's DOB to a token holder is proportionate, and what the support flag does to the consent flow while it is open. [2026-10-17: The OPEN point (what the support flag does to the consent flow while it is open) is resolved by default in B-029, which is built (backend/w3-gates, PR #412): an open incorrect-details report blocks approval and card-payment start, and does not block decline or withdraw. The founder adopted this default on 2026-10-17 (veto-able). Recorded in #404, item 12.]</w:t>
+              <w:t>Resolved -- decided, NOT yet built. A GET-by-consent-token lookup returns, to the unauthenticated token holder: the minor's name, date of birth, 'you were named as', and date requested, plus notices that the guardian's email appears on the minor's profile as the line of contact and that the photo and username are visible to others. Safeguards: single-use, expiring token; rate limiting; an identical response for invalid, expired and used tokens (non-enumerating); an uncacheable response; the DOB decrypted server-side only for this response; nothing logged beyond the token outcome. Wrong-DOB path: a 'report incorrect details' action flags the account for support; decline remains available. This is the endpoint CLAUDE.md's F5 bullet recorded as missing (the Figma 'Request Summary' panel was omitted for want of it). Adds a use of the decrypted date of birth beyond Decision Log #362's read sites. OPEN: counsel to confirm that returning a child's DOB to a token holder is proportionate, and what the support flag does to the consent flow while it is open. [2026-10-17: The OPEN point (what the support flag does to the consent flow while it is open) is resolved by default in B-029, which is built (backend/w3-gates, PR #412): an open incorrect-details report blocks approval and card-payment start, and does not block decline or withdraw. The founder adopted this default on 2026-10-17 (veto-able). Recorded in #404, item 12.] [2026-10-17: A date-of-birth correction by support (B-103, built, PR #416) always clears the incorrect-details flag, so it is also the resolution path for a wrong-DOB report (docs/backend-w3b-report.md, section 7). Roles that may read and correct a DOB: #405, item 5.]</w:t>
             </w:r>
           </w:p>
         </w:tc>
@@ -25934,7 +25934,7 @@
           </w:tcPr>
           <w:p>
             <w:r>
-              <w:t>Resolved -- decided, NOT yet built. Supersedes Decision Log #344 ('no purge timer'). The anonymised user row is hard-deleted 30 days after anonymisation for (a) never-approved minor accounts and (b) any account with no content. Content-bearing anonymised accounts remain anonymised, and are NOT purged, until counsel reviews them. Counsel review pending. OPEN, to be settled in the build PR: the exact test for 'no content' -- User FKs from Post/Comment/Message/Result/Report etc. are RESTRICT again (Decision Log #341), so a delete on a row with any such child fails by design and the job must check for children first rather than rely on the FK; and how this interacts with the hold rule (next entry), which pauses erasure. Decision Log #344's reasoning (a retained anonymised row holds no personal data, GDPR Recital 26) is not disputed; this entry only removes rows where retaining them serves no purpose.</w:t>
+              <w:t>Resolved -- decided, NOT yet built. Supersedes Decision Log #344 ('no purge timer'). The anonymised user row is hard-deleted 30 days after anonymisation for (a) never-approved minor accounts and (b) any account with no content. Content-bearing anonymised accounts remain anonymised, and are NOT purged, until counsel reviews them. Counsel review pending. OPEN, to be settled in the build PR: the exact test for 'no content' -- User FKs from Post/Comment/Message/Result/Report etc. are RESTRICT again (Decision Log #341), so a delete on a row with any such child fails by design and the job must check for children first rather than rely on the FK; and how this interacts with the hold rule (next entry), which pauses erasure. Decision Log #344's reasoning (a retained anonymised row holds no personal data, GDPR Recital 26) is not disputed; this entry only removes rows where retaining them serves no purpose. [2026-10-17: Unchanged by PR #416: the third decline reuses the 30-day grace of this entry. Related open item recorded as register row B-126 (no decision): a row declined at decline 1 or 2 that the minor never reopens has no expiry. See #405.]</w:t>
             </w:r>
           </w:p>
         </w:tc>
@@ -26522,7 +26522,7 @@
           </w:tcPr>
           <w:p>
             <w:r>
-              <w:t>Resolved -- decided, NOT yet built. SUPERSEDES #374 'as-is' for explicit declines on a still-valid request (the rest of #374 is retained). A guardian's explicit decline lets the minor resend or change the guardian email; the decline frames 5491:8241 / 5501:8453 must be wired to this logic (this settles #374's 'archive or rewrite' choice: rewrite and wire). MAX 3 declines; after the 3rd the account moves to pending deletion via the existing refuseConsentAndScheduleDeletion path (sessions revoked, 30-day grace, anonymise, purge rule #375). An expired request / second lapse does NOT count among the 3 and goes straight to the original plan (pending deletion). A guardian withdrawing consent after approval goes straight to the original plan. Changing the guardian email does NOT reset the count. Abuse protection: a cap on requests per day and a 'don't contact me again' option for the recipient. Retained from #374: 72h token TTL (GUARDIAN_CONSENT_TOKEN_TTL_HOURS), first lapse = automatic re-send plus a reminder to the minor, second lapse = implicit decline -&gt; original plan. Known bug to fix with this work: GuardianConsentPage currently treats 'declined' as pending (audit section 5 item 5). Note: between declines the minor's sessions must stay valid for them to resend; today every decline revokes sessions and 'declined' is terminal in code, so a per-account decline counter and a revised state model are new build work. Not yet in the legal copy draft (to add). Build register B-102, B-003. Forward-pointer: #374.</w:t>
+              <w:t>Resolved -- decided, NOT yet built. SUPERSEDES #374 'as-is' for explicit declines on a still-valid request (the rest of #374 is retained). A guardian's explicit decline lets the minor resend or change the guardian email; the decline frames 5491:8241 / 5501:8453 must be wired to this logic (this settles #374's 'archive or rewrite' choice: rewrite and wire). MAX 3 declines; after the 3rd the account moves to pending deletion via the existing refuseConsentAndScheduleDeletion path (sessions revoked, 30-day grace, anonymise, purge rule #375). An expired request / second lapse does NOT count among the 3 and goes straight to the original plan (pending deletion). A guardian withdrawing consent after approval goes straight to the original plan. Changing the guardian email does NOT reset the count. Abuse protection: a cap on requests per day and a 'don't contact me again' option for the recipient. Retained from #374: 72h token TTL (GUARDIAN_CONSENT_TOKEN_TTL_HOURS), first lapse = automatic re-send plus a reminder to the minor, second lapse = implicit decline -&gt; original plan. Known bug to fix with this work: GuardianConsentPage currently treats 'declined' as pending (audit section 5 item 5). Note: between declines the minor's sessions must stay valid for them to resend; today every decline revokes sessions and 'declined' is terminal in code, so a per-account decline counter and a revised state model are new build work. Not yet in the legal copy draft (to add). Build register B-102, B-003. Forward-pointer: #374. [2026-10-17: Backend built (B-102, B-110; PR #416): the per-account counter (internal), declines 1 and 2 non-final with sessions valid, the third decline final via refuseConsentAndScheduleDeletion. Not built from this entry: the per-day request cap and the do-not-contact option (superseded by #395 B2, which has neither). Frontend still open: the in-account decline page and GuardianConsentPage's 'declined' rendering (audit section 5 item 5). New open item: B-126.]</w:t>
             </w:r>
           </w:p>
         </w:tc>
@@ -26564,7 +26564,7 @@
           </w:tcPr>
           <w:p>
             <w:r>
-              <w:t>Resolved -- decided, NOT yet built. Resolves the open point in #367 ('a user who mistypes their date of birth at the Age Gate has no self-service correction path'). DOB stays read-only after the Age Gate for users. Support can correct it through an admin action (a tool to be built if none exists; none exists today), audited. A correction RE-RUNS the age-tier checks (under-13 / under-16 / under-18 flags, card-verification policy, restrictions). The guardian flow is RE-TRIGGERED when a correction turns an adult account that has never gone through the flow into a minor account. Note: the existing age-reclassification sweep (#349) recomputes isMinor/isUnder16 flags but does not create Guardian rows, so the re-trigger is new build work; the exact audit record fields and the effect on an in-flight request are not specified. Not yet in the legal copy draft. Build register B-103, B-104. Forward-pointer: #367.</w:t>
+              <w:t>Resolved -- decided, NOT yet built. Resolves the open point in #367 ('a user who mistypes their date of birth at the Age Gate has no self-service correction path'). DOB stays read-only after the Age Gate for users. Support can correct it through an admin action (a tool to be built if none exists; none exists today), audited. A correction RE-RUNS the age-tier checks (under-13 / under-16 / under-18 flags, card-verification policy, restrictions). The guardian flow is RE-TRIGGERED when a correction turns an adult account that has never gone through the flow into a minor account. Note: the existing age-reclassification sweep (#349) recomputes isMinor/isUnder16 flags but does not create Guardian rows, so the re-trigger is new build work; the exact audit record fields and the effect on an in-flight request are not specified. Not yet in the legal copy draft. Build register B-103, B-104. Forward-pointer: #367. [2026-10-17: Built (B-103; PR #416): POST /admin/users/:id/dob-correction, moderator and superadmin (confirmed by #405, item 5). It re-runs the age tier and the card-verification policy in one transaction; an age-tier change cancels (to adult) or restarts (to minor) an in-flight request, the restart resets the decline counter and the incorrect-details flag is always cleared (#395 B4, #403 item 15). The audit row user.dob_corrected holds admin, target, reason, old and new tier, never a DOB. Frontend (B-104) not built.]</w:t>
             </w:r>
           </w:p>
         </w:tc>
@@ -26783,7 +26783,7 @@
               <w:t>Resolved -- recorded; DECIDED, NOT BUILT. Source: founder decisions 2026-10-15/16. Extends and amends #389; builds on #374, #340 and #390. (B1) The decline frame already exists in Figma (5491:8241 / 5501:8453). After decline 1 and decline 2 the minor sees the existing decline page. It is shown at the minor's next LOGIN ATTEMPT, before a session exists (#374 revokes all sessions and blocks login, so it cannot be shown inside a session): the server answers the login with a 'declined' result instead of issuing a token. BACKEND TO CONFIRM: backend-api must confirm this is buildable, including how the page's resend / change-guardian-email actions are authorised without a session (those routes are JwtAuthGuard-gated today) and that it is consistent with the note in #389 that sessions must stay valid between declines. Recorded as the intended behaviour, not as a verified design. (B2) Decline 3: the account enters the deletion sequence and the minor receives an EMAIL ONLY (no page). No decline count is shown anywhere to anyone; the counter is internal. There is NO 'don't contact me again' option. There is NO requests-per-day cap (only one request can run at a time). Three declines in one day delete the account immediately. Three declines in total, ever, per account. Founder decision; no counsel review needed. This WITHDRAWS the abuse-protection sentence of #389 (a cap on requests per day and a 'don't contact me again' option) and supersedes the open points of build register B-102 and B-003 accordingly; the rest of #389 stands (72h token; first lapse = automatic re-send; expiry, second lapse and post-approval withdrawal go straight to pending deletion and do not count among the three; changing the guardian email does not reset the count). (B3) Guardian withdrawal page (B-013): a LINK is added to the consent email and to the approved screen that pre-fills the code. Throttle ('Too many attempts'): a fixed window held in configuration, no countdown shown, 'Try again' returns to frame 1. 'Request a new link' (expired or used link) returns to frame 1 where the guardian re-enters their email; the page reads identically whether or not an account matched. BACKEND TO CONFIRM: the withdrawal token is issued only when a withdrawal is requested (#340), so what a link in the consent email can pre-fill at that moment must be confirmed. (B4) DOB correction (B-103, B-104; #390): if the corrected age tier changes, an in-flight guardian request is CANCELLED and restarted. This settles the 'effect on an in-flight request' point #390 left open. Build register: B-003, B-013, B-080, B-102, B-103, B-104, B-110 (declined-login result), B-112 (withdrawal link); Figma re-sync in B-107. STILL OPEN: counsel wording; the length of the throttle window (stated as configuration); whether 'delete the account immediately' on a third decline also skips the 30-day grace of #375 (recorded as: enters the deletion sequence immediately, grace not altered by this entry); whether a restart caused by a DOB correction resets the decline counter; the shipped per-minor guardian-email-change cap (5 per 24h, #365) is a separate control and is not altered here.</w:t>
             </w:r>
             <w:r>
-              <w:t xml:space="preserve"> [2026-10-16: Amended by #402. (B1) is AMENDED: sessions stay valid between declines (#389); after decline 1 and 2 the minor sees the existing decline page INSIDE the account via the existing authenticated resend / change-guardian-email routes; the 'declined' login result and its BACKEND TO CONFIRM point are WITHDRAWN (build register B-110 re-scoped). (B2) The open question on the 30-day grace is answered: the third decline blocks login at once and enters pending deletion WITH the existing 30-day grace (#375). The remainder stands.] [2026-10-16: Amended by #403. (B2) The decline page keeps its static sentence stating the cap (Figma node 6627:22230); 'No decline count is shown' means no running 'decline N of 3' counter. (B4) A restart caused by a DOB correction RESETS the decline counter and writes an audit entry (answers the STILL OPEN point). (B3) The withdrawal throttle default is 5 attempts per 15 minutes, held in configuration (sets the window left open).]</w:t>
+              <w:t xml:space="preserve"> [2026-10-16: Amended by #402. (B1) is AMENDED: sessions stay valid between declines (#389); after decline 1 and 2 the minor sees the existing decline page INSIDE the account via the existing authenticated resend / change-guardian-email routes; the 'declined' login result and its BACKEND TO CONFIRM point are WITHDRAWN (build register B-110 re-scoped). (B2) The open question on the 30-day grace is answered: the third decline blocks login at once and enters pending deletion WITH the existing 30-day grace (#375). The remainder stands.] [2026-10-16: Amended by #403. (B2) The decline page keeps its static sentence stating the cap (Figma node 6627:22230); 'No decline count is shown' means no running 'decline N of 3' counter. (B4) A restart caused by a DOB correction RESETS the decline counter and writes an audit entry (answers the STILL OPEN point). (B3) The withdrawal throttle default is 5 attempts per 15 minutes, held in configuration (sets the window left open).] [2026-10-17: Backend built in PR #416. B1 stays withdrawn (#402). B2: the third decline blocks login at once and enters pending deletion with the 30-day grace, one email. B3: unchanged here. B4 built as B-103: an age-tier change cancels or restarts the request and a restart resets the counter. Open, no decision: a row declined at 1 or 2 and never reopened has no expiry (register row B-126). Frontend decline page not built.]</w:t>
             </w:r>
           </w:p>
         </w:tc>
@@ -26918,7 +26918,7 @@
               <w:t>Resolved -- recorded; DECIDED, NOT BUILT. Source: founder decisions 2026-10-15/16. Extends #376, #371, #369 and #390. (D1) 'Reporter acted in bad faith' and 'Legal hold' (#376): each has a confirmation step and a reason field, a 'lift hold' control exists, and both actions also APPEAR on Appeal Review (not only Report Detail). The held-investigations list (GET /admin/users/held-investigations) shows the hold TYPE and a marker (per the open points of W0 Figma pass C). (D2) Flagged-image queue (#371): the reject reason is shown to the uploader. The CSAM / statutory path stays under counsel (#371). (D3) Username revoke: an admin action, manual, from User Detail, available at any time after the username exists, triggered by a report or an admin review (offensive, impersonating or personal-data usernames). No account exists without a username (#369), so a revoke returns the account to the incomplete-profile gate (#369): a neutral placeholder name to other users, cannot post, redirected to Create Profile at next login to choose a new username. A REASON is REQUIRED and is stored in the audit record. The user is emailed (wording [COPY PENDING LEGAL REVIEW]). The revoked handle is held for 30 days before anyone can take it, and that user cannot re-pick it. (D4) Everything needed for the DOB correction tool (#390) and for username revoke is built: a single-user admin read endpoint returning the fields the admin needs (including the date of birth) and a User Detail admin screen (build register B-109, a prerequisite of B-103, B-104 and B-033). The audit fields for both tools are specified in the build PR. Build register: B-012, B-032, B-033, B-037, B-044, B-045, B-109; Figma re-sync in B-107. STILL OPEN: the CSAM path (counsel); counsel wording; whether 'that user cannot re-pick it' is permanent or lasts only the 30 days (recorded verbatim; the sentence is ambiguous).</w:t>
             </w:r>
             <w:r>
-              <w:t xml:space="preserve"> [2026-10-16: Amended by #402 (founder-adopted default, veto-able). The revoked handle is held 30 days for everyone, and the revoked user can never re-pick it (permanent for that user).]</w:t>
+              <w:t xml:space="preserve"> [2026-10-16: Amended by #402 (founder-adopted default, veto-able). The revoked handle is held 30 days for everyone, and the revoked user can never re-pick it (permanent for that user).] [2026-10-17: D4 built (B-109; PR #416): GET /admin/users/:id for moderator and superadmin, DOB decrypted server-side only, a user.dob_viewed audit row for every response that contains a DOB, request fails closed if that write fails. The open point 'which admin roles may read a decrypted DOB' is closed by #405, item 5. The User Detail screen in apps/admin is not built (B-104, B-109 frontend leg).]</w:t>
             </w:r>
           </w:p>
         </w:tc>
@@ -27089,7 +27089,7 @@
           </w:tcPr>
           <w:p>
             <w:r>
-              <w:t>Resolved -- recorded; DECIDED, NOT BUILT. FOUNDER-ADOPTED DEFAULTS, VETO-ABLE: each item below is adopted now so build work is not blocked, and stands until the founder says otherwise. Amends #395 and closes open points of #395-#399; the original text of those entries is unchanged (dated notes appended). (1) DECLINE 1 AND 2 -- AMENDS #395 B1. #389 already decided that sessions STAY VALID between declines; only the THIRD decline revokes sessions. After decline 1 and decline 2 the minor sees the existing decline page (5491:8241 / 5501:8453) INSIDE the account, using the existing authenticated resend and change-guardian-email routes. The 'declined login result' design of #395 B1 (a login that answers 'declined' with no token) is WITHDRAWN; so is its BACKEND TO CONFIRM point. Build implications recorded, not decisions: today every decline revokes sessions and 'declined' is terminal in code (#337-#340), and resend / change-guardian-email refuse a declined account (#365), so decline 1 and 2 must stop revoking and those routes must accept the account while fewer than three declines have been recorded. Bug fixed by the same work: GuardianConsentPage treats 'declined' as pending (audit section 5 item 5). Build register: B-110 is RE-SCOPED to this and merged into B-102's dependency chain (B-102 now depends on B-110); the B-ID is kept. (2) THIRD DECLINE. Login is blocked at once and the account enters pending deletion with the EXISTING 30-day grace (#375, via refuseConsentAndScheduleDeletion as in #389). This answers #395's open question: 'delete the account immediately' does NOT skip the grace; the minor still receives the email only, no page and no count (#395 B2 stands). (3) REVOKED USERNAME (#398 D3). The handle is held 30 days for everyone (nobody can take it); the revoked user can NEVER re-pick it. This answers #398's ambiguous 'cannot re-pick' point: permanent for that user, 30 days for others. (4) BLOCK (#396). The blocked user is NOT told. A block hides content and search results in both directions: posts, comments, likes, search, rosters. The leaderboard is unaffected. Unblock does NOT restore follows. Still open: Bants rooms (room membership / room listing; the blocked user's posts are covered by 'posts'), the exact like mechanics, and the interaction with the guardian-consent, under-16 and adult-to-minor rules (#346, #347). (5) 2FA (#397). 10 single-use backup codes, stored HASHED. Lost-device recovery needs a backup code, OR email confirmation plus password. Noted for the founder's veto: the email-plus-password path makes 2FA recovery only as strong as the email account. Still open: backup-code format, storage and encryption of the TOTP secret itself, counsel (legal copy Part C row 44). (6) CONTEST EXPOSURE SETTINGS (#399 E4/E5, #388). Tolerance and the per-viewer daily cap apply to WEEK 4 ONLY, not per contest or per week. Their ranges (1-50 percent; 1-50) stay as validation bounds on the week-4 settings; they lock when week 4 starts (day 22), not when week 1 starts. Watch limit (3-120 s) is unchanged. Build register: B-110 (re-scoped), B-102, B-003, B-107 (decline page behaviour note), B-032, B-033, B-039, B-108, B-086, B-087, B-111, B-091, B-092, B-095, B-097. Not decided here and still open: see docs/build-register.md Section 11d.</w:t>
+              <w:t>Resolved -- recorded; DECIDED, NOT BUILT. FOUNDER-ADOPTED DEFAULTS, VETO-ABLE: each item below is adopted now so build work is not blocked, and stands until the founder says otherwise. Amends #395 and closes open points of #395-#399; the original text of those entries is unchanged (dated notes appended). (1) DECLINE 1 AND 2 -- AMENDS #395 B1. #389 already decided that sessions STAY VALID between declines; only the THIRD decline revokes sessions. After decline 1 and decline 2 the minor sees the existing decline page (5491:8241 / 5501:8453) INSIDE the account, using the existing authenticated resend and change-guardian-email routes. The 'declined login result' design of #395 B1 (a login that answers 'declined' with no token) is WITHDRAWN; so is its BACKEND TO CONFIRM point. Build implications recorded, not decisions: today every decline revokes sessions and 'declined' is terminal in code (#337-#340), and resend / change-guardian-email refuse a declined account (#365), so decline 1 and 2 must stop revoking and those routes must accept the account while fewer than three declines have been recorded. Bug fixed by the same work: GuardianConsentPage treats 'declined' as pending (audit section 5 item 5). Build register: B-110 is RE-SCOPED to this and merged into B-102's dependency chain (B-102 now depends on B-110); the B-ID is kept. (2) THIRD DECLINE. Login is blocked at once and the account enters pending deletion with the EXISTING 30-day grace (#375, via refuseConsentAndScheduleDeletion as in #389). This answers #395's open question: 'delete the account immediately' does NOT skip the grace; the minor still receives the email only, no page and no count (#395 B2 stands). (3) REVOKED USERNAME (#398 D3). The handle is held 30 days for everyone (nobody can take it); the revoked user can NEVER re-pick it. This answers #398's ambiguous 'cannot re-pick' point: permanent for that user, 30 days for others. (4) BLOCK (#396). The blocked user is NOT told. A block hides content and search results in both directions: posts, comments, likes, search, rosters. The leaderboard is unaffected. Unblock does NOT restore follows. Still open: Bants rooms (room membership / room listing; the blocked user's posts are covered by 'posts'), the exact like mechanics, and the interaction with the guardian-consent, under-16 and adult-to-minor rules (#346, #347). (5) 2FA (#397). 10 single-use backup codes, stored HASHED. Lost-device recovery needs a backup code, OR email confirmation plus password. Noted for the founder's veto: the email-plus-password path makes 2FA recovery only as strong as the email account. Still open: backup-code format, storage and encryption of the TOTP secret itself, counsel (legal copy Part C row 44). (6) CONTEST EXPOSURE SETTINGS (#399 E4/E5, #388). Tolerance and the per-viewer daily cap apply to WEEK 4 ONLY, not per contest or per week. Their ranges (1-50 percent; 1-50) stay as validation bounds on the week-4 settings; they lock when week 4 starts (day 22), not when week 1 starts. Watch limit (3-120 s) is unchanged. Build register: B-110 (re-scoped), B-102, B-003, B-107 (decline page behaviour note), B-032, B-033, B-039, B-108, B-086, B-087, B-111, B-091, B-092, B-095, B-097. Not decided here and still open: see docs/build-register.md Section 11d. [2026-10-17: Items 1 and 2 are built in the backend (B-110, B-102; PR #416): sessions stay valid after declines 1 and 2, the third decline blocks login at once with the 30-day grace. The 'existing authenticated resend' wording of item 1 is clarified by #405, item 6: the route is the existing email-keyed POST /auth/guardian-consent/resend, not JWT; change-guardian-email is the JWT one. Item 5 (2FA): the backup-code character set, the TOTP secret storage and the per-account lock are decided by #405, item 8.]</w:t>
             </w:r>
           </w:p>
         </w:tc>
@@ -27131,7 +27131,7 @@
           </w:tcPr>
           <w:p>
             <w:r>
-              <w:t>Resolved -- recorded; DECIDED, NOT BUILT. Source: founder decisions 2026-10-16, numbered 1-19 as given to this entry. Amends #400 (items 1, 9, 11), #395 (items 2, 15), #401 (item 7), #369 (item 15), #394 and #371 (item 17) by dated notes appended to those rows; the original text of every row is unchanged. It also changes points recorded in #398 D1 (item 8), #399 E3 (item 10) and #402 item 4 (item 16): those three rows were NOT edited (this entry is the record), see docs/build-register.md Section 12. The founder labelled the country select in item 17 a veto-able default and the withdrawal throttle in item 15 a default held in configuration; everything else is stated as a decision. (1) NON-FINALIST CONTEST TAB -- AMENDS #400 E8. The Create Post Contest tab for a non-finalist is NOT hidden. The tab stays visible, and a non-finalist who opens it during days 22-24 sees the existing 'Closed (not a finalist)' frames (desktop 6660:31044, mobile 6660:35699), which are RESTORED (un-archived, by a Figma pass, not by this entry). The minimum tally x stays admin-only (E8's second sentence stands). (2) DECLINE PAGE CAP SENTENCE -- clarifies #395 B2. The decline page keeps its static sentence that states the cap (Figma node 6627:22230). 'No decline count is shown' means no RUNNING 'decline N of 3' counter. The sentence is minor-facing copy and stays [COPY PENDING LEGAL REVIEW]. (3) GUARDIAN 'APPROVED' SCREENS. 5488:7164 and 5501:8225 are reworded to match the flow (approval continues to Create Profile; extends #394 A5); the new wording is [COPY PENDING LEGAL REVIEW]. (4) ADMIN COMPONENTS. The component frame at Figma node 6671:27364 (Pass F2) exists so that admin screens and apps/admin share ONE Button, Pill, Field, Callout, Banner, Note, Dialog and Table. Adoption is on the Pass C and Pass F1 admin frames only (not on older admin frames). A spacing / radius variable collection is added (a Figma pass does this; 'Soccernity Theme' stays the colour collection). (5) ADMIN SHELL SEARCH BAR. It stays visible on admin screens and is NOT functional ('not available yet'). New register row B-114: decide build vs hide. (6) EXCEPTION TO 'NEVER DELETE' (Figma passes). The ten hidden legacy absolute layers inside the ten rebuilt Create Post frames (the 'ARCHIVED -- legacy absolute layer' children from Pass F2 inside 2008:655, 2009:5168, 2009:2913, 6171:14797, 6171:16994, 2496:4462, 2565:3951, 6660:28736, 6660:31044, 6660:33353) may be deleted, and ONLY those. (7) VOTING PAGE ADOPTS THE ALREADY VOTED DESIGN -- closes the open point of #401. The Voting page (desktop 2094:994, mobile 5802:8726) takes the Already Voted page's design (entries column + board column, fan cards) and carries the vote toggle (#401). The separate Already Voted screens (5802:8978 / 5815:8916, and the auto-layout rebuild 6671:27155) are archived AFTERWARDS, by a Figma pass; the Voting &lt;-&gt; Already Voted navigation of #387 therefore goes with them. (8) LIFT HOLD -- changes #398 D1 / #376. Lift hold applies to BOTH the legal hold and the 6-month bad-faith hold. A reason is required. The held user is NOT notified. Appeal Review reuses the shared hold dialogs (Bad faith / Legal hold / Lift hold) used on Report Detail. (9) FORFEIT POP-UP -- AMENDS #400 E11. Shown ONLY on the Contest page. On every load of that page the user sees one pop-up per forfeited week, from when the week is deemed forfeited (docs/contest-spec.md Section 7); the reason is shown; nothing is remembered between loads. The leaderboard Contest tab shows the forfeited writing in place of the three names for that week (no pop-up there). (10) FINAL TASK TEXT -- changes #399 E3. The week-4 task text shows on the live-ranking and uploading states only (not on the 'No winner this month' or crowned states). (11) COMMUNITY-FEED 'FINAL WEEK' MODULE -- AMENDS #400 E10 and the open point carried by #402. The module STAYS. The dead 'View on the Contest page' link is removed. Its videos become a carousel that keeps the current frame size and serves as a preview slot reusable for other showcases later. It shows only during a final contest week and not at all when there is none. OPEN: whether carousel views count as impressions (B-092). (12) MOBILE BLOCK PATTERN: the '...' menu (confirms the Pass F1 trigger, node 6669:27188). (13) CREATE POST FIGMA CHANGES ACCEPTED: the scrim token change (white 71% to color/overlay/scrim) and the typographic crest marks in the Fixtures module of the Create Post frames. Licensing of club crests in Fixtures stays OPEN (#85, #97). (14) FONT: user-facing read-only fields need a Montserrat Field variant (the admin components are Inter). (15) DEFAULTS CLOSING OPEN POINTS: the placeholder name for incomplete profiles is 'Soccernity member' (closes #369's open point); a DOB-correction restart RESETS the decline counter and writes an audit entry (closes #395 B4's open point); the withdrawal throttle default is 5 attempts per 15 minutes, held in configuration (sets the window left open in #395 B3); unverified-email users are blocked from social writes as well as from PATCH /users/:id (extends the guard built under B-020; new row B-118). (16) BANTS -- an OPEN FORUM, no private messages. Anyone can start a thread and others comment on it; likes work as on a blog or forum (one like per user per item, toggled, public count). Accounts aged 16 and 17 have FULL Bants access (the limit in #346 applies to under-16s only, who stay fully disabled); this is a founder decision, not read-only. Bants will have moderation. Block hides the blocked user's posts, comments and like identities in both directions; counts unchanged; no room membership. This settles the 'Bants rooms' and 'exact like mechanics' points #402 item 4 left open; the interaction with #346 / #347 stays open. OPEN, recorded not resolved: 'thread' is not mapped to the built model (BanterRoom #275 vs Post), and 'no room membership' is not reconciled with the built BanterRoomMember join / leave, My Bants and 'posting requires membership' (#275); the scope of 'moderation' beyond room status (#357) is not stated. New row B-117. (17) COUNTRY HAS TWO SEPARATE FIELDS. (a) SAFEGUARDING country: declared at the Age Gate and derived from the IP lookup (B-023..B-025). Stored separately, never shown, never editable by any profile action; it alone decides US under-13 card verification and demographic grouping (#368 stands). (b) PROFILE country: a separate, nullable, OPTIONAL field. It is BLANK at Create Profile (not prefilled, not read-only), the user may fill it in, and it is editable at any time in Edit Profile (B-083). It is shown on a user's profile only if they filled it in, so a minor's country is visible only if the minor chooses to enter it. AMENDS #394 A1 (Country read-only at Create Profile) and the 'country' item of #371 (profile shows country): those rows stand except for these points. DEFAULT, VETO-ABLE: a country select from the full country list. B-038 stores the profile country as its own column, NOT the derived or declared safeguarding fields. Counsel review of country display stays on the legal list with reduced scope because the field is optional. (18) PRODUCTION WIRING (MaxMind, Render environment variables, Postmark, JWT secrets, TRUST_PROXY_HOPS) is deferred to the launch gate B-090; the code fails safe until it is done. (19) NEW REGISTER ROWS: password-reset email placeholder-address fallback (B-115); API test-suite worker flake, the suite needs --maxWorkers=4 (B-116); admin search bar (B-114, item 5). Rows added from the other items: B-113 (Figma re-sync, items 1-14 and 17), B-117 (Bants open forum), B-118 (email-verification gate on social writes). Build register: B-113 to B-118 new; status lines on B-002, B-003, B-006, B-007, B-012, B-013, B-018, B-020, B-023, B-024, B-026, B-027, B-038, B-039, B-042, B-044, B-045, B-054, B-071, B-079, B-080, B-081, B-082, B-083, B-090, B-091, B-092, B-095, B-096, B-098, B-099, B-102, B-103, B-107, B-108, B-112. STILL OPEN: counsel wording for every [COPY PENDING LEGAL REVIEW] item; the Bants mapping questions in (16); build vs hide for the admin search bar (B-114); whether carousel views count as impressions (B-092); whether the 'Closed (not a finalist)' copy may reveal anything about uploads before the reveal; how other users reach a finalist's entry after the reveal; what the Contest tab shows from 00:00 to 08:00 on day 1; which routes count as 'social writes' (B-118); the interaction of Block with #346 / #347; crest licensing in Fixtures (#85, #97); the CSAM path; the length of every window stated as configuration other than the withdrawal throttle. [2026-10-17: Item 15 (unverified-email users cannot perform social writes) is built: B-118 (backend/w3-gates, PR #412). The creating forms are gated by EmailVerifiedGuard; the undo and own-content forms stay open (docs/backend-w3-gates-report.md, section 5, call 1, adopted by #404, item 12). Two open points of this entry are closed by #404: the forfeit pop-up reading of 'Contest page' and several forfeited weeks (item 4), and whether carousel views count as impressions (items 6 and 15).]</w:t>
+              <w:t>Resolved -- recorded; DECIDED, NOT BUILT. Source: founder decisions 2026-10-16, numbered 1-19 as given to this entry. Amends #400 (items 1, 9, 11), #395 (items 2, 15), #401 (item 7), #369 (item 15), #394 and #371 (item 17) by dated notes appended to those rows; the original text of every row is unchanged. It also changes points recorded in #398 D1 (item 8), #399 E3 (item 10) and #402 item 4 (item 16): those three rows were NOT edited (this entry is the record), see docs/build-register.md Section 12. The founder labelled the country select in item 17 a veto-able default and the withdrawal throttle in item 15 a default held in configuration; everything else is stated as a decision. (1) NON-FINALIST CONTEST TAB -- AMENDS #400 E8. The Create Post Contest tab for a non-finalist is NOT hidden. The tab stays visible, and a non-finalist who opens it during days 22-24 sees the existing 'Closed (not a finalist)' frames (desktop 6660:31044, mobile 6660:35699), which are RESTORED (un-archived, by a Figma pass, not by this entry). The minimum tally x stays admin-only (E8's second sentence stands). (2) DECLINE PAGE CAP SENTENCE -- clarifies #395 B2. The decline page keeps its static sentence that states the cap (Figma node 6627:22230). 'No decline count is shown' means no RUNNING 'decline N of 3' counter. The sentence is minor-facing copy and stays [COPY PENDING LEGAL REVIEW]. (3) GUARDIAN 'APPROVED' SCREENS. 5488:7164 and 5501:8225 are reworded to match the flow (approval continues to Create Profile; extends #394 A5); the new wording is [COPY PENDING LEGAL REVIEW]. (4) ADMIN COMPONENTS. The component frame at Figma node 6671:27364 (Pass F2) exists so that admin screens and apps/admin share ONE Button, Pill, Field, Callout, Banner, Note, Dialog and Table. Adoption is on the Pass C and Pass F1 admin frames only (not on older admin frames). A spacing / radius variable collection is added (a Figma pass does this; 'Soccernity Theme' stays the colour collection). (5) ADMIN SHELL SEARCH BAR. It stays visible on admin screens and is NOT functional ('not available yet'). New register row B-114: decide build vs hide. (6) EXCEPTION TO 'NEVER DELETE' (Figma passes). The ten hidden legacy absolute layers inside the ten rebuilt Create Post frames (the 'ARCHIVED -- legacy absolute layer' children from Pass F2 inside 2008:655, 2009:5168, 2009:2913, 6171:14797, 6171:16994, 2496:4462, 2565:3951, 6660:28736, 6660:31044, 6660:33353) may be deleted, and ONLY those. (7) VOTING PAGE ADOPTS THE ALREADY VOTED DESIGN -- closes the open point of #401. The Voting page (desktop 2094:994, mobile 5802:8726) takes the Already Voted page's design (entries column + board column, fan cards) and carries the vote toggle (#401). The separate Already Voted screens (5802:8978 / 5815:8916, and the auto-layout rebuild 6671:27155) are archived AFTERWARDS, by a Figma pass; the Voting &lt;-&gt; Already Voted navigation of #387 therefore goes with them. (8) LIFT HOLD -- changes #398 D1 / #376. Lift hold applies to BOTH the legal hold and the 6-month bad-faith hold. A reason is required. The held user is NOT notified. Appeal Review reuses the shared hold dialogs (Bad faith / Legal hold / Lift hold) used on Report Detail. (9) FORFEIT POP-UP -- AMENDS #400 E11. Shown ONLY on the Contest page. On every load of that page the user sees one pop-up per forfeited week, from when the week is deemed forfeited (docs/contest-spec.md Section 7); the reason is shown; nothing is remembered between loads. The leaderboard Contest tab shows the forfeited writing in place of the three names for that week (no pop-up there). (10) FINAL TASK TEXT -- changes #399 E3. The week-4 task text shows on the live-ranking and uploading states only (not on the 'No winner this month' or crowned states). (11) COMMUNITY-FEED 'FINAL WEEK' MODULE -- AMENDS #400 E10 and the open point carried by #402. The module STAYS. The dead 'View on the Contest page' link is removed. Its videos become a carousel that keeps the current frame size and serves as a preview slot reusable for other showcases later. It shows only during a final contest week and not at all when there is none. OPEN: whether carousel views count as impressions (B-092). (12) MOBILE BLOCK PATTERN: the '...' menu (confirms the Pass F1 trigger, node 6669:27188). (13) CREATE POST FIGMA CHANGES ACCEPTED: the scrim token change (white 71% to color/overlay/scrim) and the typographic crest marks in the Fixtures module of the Create Post frames. Licensing of club crests in Fixtures stays OPEN (#85, #97). (14) FONT: user-facing read-only fields need a Montserrat Field variant (the admin components are Inter). (15) DEFAULTS CLOSING OPEN POINTS: the placeholder name for incomplete profiles is 'Soccernity member' (closes #369's open point); a DOB-correction restart RESETS the decline counter and writes an audit entry (closes #395 B4's open point); the withdrawal throttle default is 5 attempts per 15 minutes, held in configuration (sets the window left open in #395 B3); unverified-email users are blocked from social writes as well as from PATCH /users/:id (extends the guard built under B-020; new row B-118). (16) BANTS -- an OPEN FORUM, no private messages. Anyone can start a thread and others comment on it; likes work as on a blog or forum (one like per user per item, toggled, public count). Accounts aged 16 and 17 have FULL Bants access (the limit in #346 applies to under-16s only, who stay fully disabled); this is a founder decision, not read-only. Bants will have moderation. Block hides the blocked user's posts, comments and like identities in both directions; counts unchanged; no room membership. This settles the 'Bants rooms' and 'exact like mechanics' points #402 item 4 left open; the interaction with #346 / #347 stays open. OPEN, recorded not resolved: 'thread' is not mapped to the built model (BanterRoom #275 vs Post), and 'no room membership' is not reconciled with the built BanterRoomMember join / leave, My Bants and 'posting requires membership' (#275); the scope of 'moderation' beyond room status (#357) is not stated. New row B-117. (17) COUNTRY HAS TWO SEPARATE FIELDS. (a) SAFEGUARDING country: declared at the Age Gate and derived from the IP lookup (B-023..B-025). Stored separately, never shown, never editable by any profile action; it alone decides US under-13 card verification and demographic grouping (#368 stands). (b) PROFILE country: a separate, nullable, OPTIONAL field. It is BLANK at Create Profile (not prefilled, not read-only), the user may fill it in, and it is editable at any time in Edit Profile (B-083). It is shown on a user's profile only if they filled it in, so a minor's country is visible only if the minor chooses to enter it. AMENDS #394 A1 (Country read-only at Create Profile) and the 'country' item of #371 (profile shows country): those rows stand except for these points. DEFAULT, VETO-ABLE: a country select from the full country list. B-038 stores the profile country as its own column, NOT the derived or declared safeguarding fields. Counsel review of country display stays on the legal list with reduced scope because the field is optional. (18) PRODUCTION WIRING (MaxMind, Render environment variables, Postmark, JWT secrets, TRUST_PROXY_HOPS) is deferred to the launch gate B-090; the code fails safe until it is done. (19) NEW REGISTER ROWS: password-reset email placeholder-address fallback (B-115); API test-suite worker flake, the suite needs --maxWorkers=4 (B-116); admin search bar (B-114, item 5). Rows added from the other items: B-113 (Figma re-sync, items 1-14 and 17), B-117 (Bants open forum), B-118 (email-verification gate on social writes). Build register: B-113 to B-118 new; status lines on B-002, B-003, B-006, B-007, B-012, B-013, B-018, B-020, B-023, B-024, B-026, B-027, B-038, B-039, B-042, B-044, B-045, B-054, B-071, B-079, B-080, B-081, B-082, B-083, B-090, B-091, B-092, B-095, B-096, B-098, B-099, B-102, B-103, B-107, B-108, B-112. STILL OPEN: counsel wording for every [COPY PENDING LEGAL REVIEW] item; the Bants mapping questions in (16); build vs hide for the admin search bar (B-114); whether carousel views count as impressions (B-092); whether the 'Closed (not a finalist)' copy may reveal anything about uploads before the reveal; how other users reach a finalist's entry after the reveal; what the Contest tab shows from 00:00 to 08:00 on day 1; which routes count as 'social writes' (B-118); the interaction of Block with #346 / #347; crest licensing in Fixtures (#85, #97); the CSAM path; the length of every window stated as configuration other than the withdrawal throttle. [2026-10-17: Item 15 (unverified-email users cannot perform social writes) is built: B-118 (backend/w3-gates, PR #412). The creating forms are gated by EmailVerifiedGuard; the undo and own-content forms stay open (docs/backend-w3-gates-report.md, section 5, call 1, adopted by #404, item 12). Two open points of this entry are closed by #404: the forfeit pop-up reading of 'Contest page' and several forfeited weeks (item 4), and whether carousel views count as impressions (items 6 and 15).] [2026-10-17: Items 2 and 15 are built in the backend (PR #416): the decline counter is internal and never returned by any API (item 2); a DOB-correction restart resets it and writes an audit entry (item 15, user.dob_corrected). Item 15's unverified-email rule is already noted above (PR #412). The Contest notification question 'does an unverified-email account receive them' is answered by #405, item 4.]</w:t>
             </w:r>
           </w:p>
         </w:tc>
@@ -27173,7 +27173,49 @@
           </w:tcPr>
           <w:p>
             <w:r>
-              <w:t>Resolved -- recorded; DECIDED, NOT BUILT, except item 12, whose judgment calls are already in the shipped code (backend/w3-gates, PR #412). Items 1-14 and 17 are founder-adopted defaults, veto-able; items 15 and 16 are founder decisions and are recorded as given. Item numbers below are the founder's own. (1) ACCOUNT INFORMATION. The Account Information (Edit) frames (2924:7112, 5649:8176) drop the Country field. The profile country lives in Edit Profile, which keeps the label 'Country' (#403, item 17; Figma pass I). The safeguarding country is never shown or edited. (2) PROFILE DESIGN DIRECTION. New auto-layout desktop profile frames (the pass H frames, desktop 6707:26595 and 6707:26727 / 6707:26938) replace the legacy absolute-layout profile frames (1455:4362, 1455:6626, 5702:8250, 5778:8490). Default added in recording, veto-able: the legacy frames are archived (hidden, 'ARCHIVED' prefix), not deleted; the #403 item 6 deletion exception covers only the ten Create Post layers. (3) ADMIN COMPONENTS. The F2 components (node 6671:27364) move to match the admin screens: Pill uses auto line height with padding 3/10; Button gets size variants; Banner and Callout Title become optional; radius/10 and radius/16 are added to the spacing and radius collection. They are then adopted on the Pass C and Pass F1 admin frames with no visible change. This settles the 'which side moves', 'radius scale' and 'optional Title' candidates of docs/figma-pass-g2-report.md; the adoption itself is open Figma work (B-113, B-095). (4) FORFEIT POP-UP. 'Contest page' means the Contest details page and the Voting page. When several weeks are forfeited, one pop-up opens after another, oldest week first. Closes the two SCOPE OPEN points of Figma pass G1 and refines #403, item 9 (every load, reason shown, nothing remembered: unchanged). (5) VOTE TOGGLE. The vote count updates live by one, in either direction, when the toggle flips. No banner appears on toggle. Closes the SCOPE OPEN point of Figma pass G1 (#401, #403 item 7). (6) CAROUSEL IMPRESSIONS. Final-week carousel views count as impressions when a tile is actually visible; tile order follows the balanced rotation of #388 (docs/contest-spec.md, section 10b). Closes the open point of #403, item 11 and of B-092. OPEN (not stated): what 'actually visible' means in numbers (share of the tile in view, time in view). (7) 2FA RECOVERY. 10 backup codes, shown once, each in 5-5 groups (interpretation: ten characters shown as two groups of five; the character set is not stated). Regenerating needs the password and invalidates the old set. Turning 2FA off invalidates the codes. A wrong code and an already-used code give the same 'not accepted' message. 5 wrong tries in 15 minutes lock recovery for 15 minutes (ASSUMED per account, not per IP; a per-account lock lets a stranger lock out an account holder, a trade-off to confirm). Password re-entry is needed only to turn off and to regenerate. The 'check your email' page reads the same for unknown accounts (non-enumerating). Backup codes appear after the 6-digit code is accepted, before the '2FA is on' screen. Entry points: a 'Can't scan?' link (manual key) and a Turn off control. Closes the backup-code format and entry-point open points of #402 and Figma pass H; STILL OPEN: storage and encryption of the TOTP secret, counsel (legal copy Part C row 44). (8) BLOCKED USERS LIST. No date is shown; the reason is not editable (unblock and re-block to change it); the reason is visible to the blocker only. A blocked user sees the blocker's profile as not found (settles the SCOPE OPEN 'blocked user's own view' of Figma pass H; whether a new not-found frame is needed or the app's existing not-found state is reused is a Figma follow-up). (9) PINNED FINAL ENTRY. Others see nothing before the reveal. After the reveal the entry is pinned on the finalist's profile until the contest ends at the end of that month; then the pin is removed and the entry is an ordinary post. The label stays 'Contest post'. Item 15 repeats and extends this; where the wording differs, item 15 prevails (see item 15). (10) BANTS. A room is a thread (BanterRoom is the thread; comments are the posts in it). Posting and commenting need NO membership. 'Join' stays as a bookmark that feeds My Bants. Moderation means reporting plus admin moderation. This SUPERSEDES the 'posting requires membership' point of #275 and closes the open points of #403 item 16 and of B-117 (thread mapping, no room membership, moderation scope). Recorded as an interpretation to confirm: no like-identities list is built (none exists today), so the Block clause about like identities leaves counts unchanged. Unchanged: 16-17 full access, under-16 fully disabled (#346), Block effects (#402 item 4). (11) BLOCK AND THE AGE RULES. Block applies on top of the age rules (#346, #347). The age rules apply first. A block never reveals itself: no response, count or error tells the blocked user they are blocked. Closes the open interaction point of #402 item 4 and B-039. (12) BACKEND W3 JUDGMENT CALLS. Calls 1-7 of docs/backend-w3-gates-report.md, section 5, are adopted: (1) the restricted-pending write block is uniform and covers the undo forms, while the unverified-email block covers only the creating forms; (2) read-state and kickoff-alert subscription routes stay open; (3) the profile gate covers posting-class routes only; (4) an open incorrect-details report blocks approval and card payment, not decline or withdraw, and survives a guardian-email change; (5) username set means profile complete; (6) the approval email links to /login; (7) displayName is no longer a fallback anywhere other users can see it. BUILT (PR #412). Forward-pointers on #369, #370, #372, #373 and #403. (13) CONTEST TAB ON DAY 1. From 00:00 to 08:00 on day 1 the Contest tab shows the Between Weeks state, variant 'Week 1 opens at 08:00'. Closes the open E6 point of #403. Note: this window is 8 hours, not the 12 hours of the Between Weeks state of #400. (14) STANDING FIGMA CHECK. The whole-canvas depth-4 get_metadata pull is replaced by a findAll count per top-level node plus a top-level id hash, taken before and after. Reason: the page holds about 139,000 nodes and the pull cannot return (docs/figma-pass-g1-report.md, docs/figma-pass-h-report.md). (15) FINAL-WEEK ENTRY JOURNEY. After the reveal, finalist names on the leaderboard Contest tab open the finalist's profile, where the entry is pinned. Final-week carousel tiles open the entry itself. The entry does not also appear as a normal Community-feed post; the carousel is the daily exposure (balanced rotation, #388). A tile shown in the viewport counts as an impression. The pin lasts until the contest ends at the end of that month, then it is removed (replaces the wording of item 9). Closes 'how other users reach a finalist's entry after the reveal' (#400 E10, #403). OPEN (not stated): whether the entry, once the pin is removed, then appears in the Community feed; item 9 says it becomes an ordinary post, item 15 says only that the pin is removed. (16) CONTEST NOTIFICATIONS (founder decision; the spec had none). In-app notifications, all times Europe/London, to every non-restricted account that is eligible for the Contest under the existing rules (docs/contest-spec.md, sections 6 and 8: minors included, restricted accounts excluded): (a) week opens, 08:00 on days 1, 8, 15, 22; (b) votes-closing reminder, 19:00 on days 7, 14, 21, only to eligible accounts that have not voted that week; (c) week result, when votes lock at 20:00 on days 7, 14, 21: winners announced to everyone, plus a personal notification to each winner; (d) final qualification: a personal notification to each finalist saying the entry stays hidden until the reveal; (e) reveal, 00:00 on day 25: 'The final is live' to everyone; (f) final result: the winners, or 'No winner this month'; (g) forfeits need no extra notification, the pop-up covers them; (h) finalist upload reminder, 12:00 on day 24, to finalists who have not uploaded (default added by Claude, veto-able). One notification per account per event; a re-run never duplicates. Push and email are not decided and stay deferred to launch gate B-090. Wording is functional and tagged [COPY PENDING LEGAL REVIEW] where it reaches minors. ASSUMED, to confirm: (d) is sent when the finalists are known, at the week-3 result (20:00 on day 21); (f) is sent at the end of the contest month, because the spec states no crown moment; a forfeited week sends no (c) notification; whether an account with an unverified email receives them is not stated. BACKEND TO CONFIRM: a uniqueness key per (account, event, contest cycle, week) is needed for 'never duplicates'; Notification.type is a free string, but NotificationsService and the Notification Centre must learn each new type (the age_milestone and match_kickoff precedent: an unrendered type shows a generic row). (17) REGISTER. New rows B-119 to B-123 (admin incorrect-details reports list and resolve, Figma and code; Contest notifications backend, Figma states and frontend); status lines on the rows named in docs/build-register.md Section 14; the B-034 cursor and ordering leak stays on B-034. NOT DECIDED HERE: the visibility threshold in item 6; the TOTP secret storage; the notification timing assumptions in item 16; whether the unpinned entry reaches the Community feed. Dated notes were appended (original text unchanged) to #369, #370, #372, #373 and #403 only; #275, #400, #402 and #396 are amended in substance by this entry but were not edited, #404 is the record.</w:t>
+              <w:t>Resolved -- recorded; DECIDED, NOT BUILT, except item 12, whose judgment calls are already in the shipped code (backend/w3-gates, PR #412). Items 1-14 and 17 are founder-adopted defaults, veto-able; items 15 and 16 are founder decisions and are recorded as given. Item numbers below are the founder's own. (1) ACCOUNT INFORMATION. The Account Information (Edit) frames (2924:7112, 5649:8176) drop the Country field. The profile country lives in Edit Profile, which keeps the label 'Country' (#403, item 17; Figma pass I). The safeguarding country is never shown or edited. (2) PROFILE DESIGN DIRECTION. New auto-layout desktop profile frames (the pass H frames, desktop 6707:26595 and 6707:26727 / 6707:26938) replace the legacy absolute-layout profile frames (1455:4362, 1455:6626, 5702:8250, 5778:8490). Default added in recording, veto-able: the legacy frames are archived (hidden, 'ARCHIVED' prefix), not deleted; the #403 item 6 deletion exception covers only the ten Create Post layers. (3) ADMIN COMPONENTS. The F2 components (node 6671:27364) move to match the admin screens: Pill uses auto line height with padding 3/10; Button gets size variants; Banner and Callout Title become optional; radius/10 and radius/16 are added to the spacing and radius collection. They are then adopted on the Pass C and Pass F1 admin frames with no visible change. This settles the 'which side moves', 'radius scale' and 'optional Title' candidates of docs/figma-pass-g2-report.md; the adoption itself is open Figma work (B-113, B-095). (4) FORFEIT POP-UP. 'Contest page' means the Contest details page and the Voting page. When several weeks are forfeited, one pop-up opens after another, oldest week first. Closes the two SCOPE OPEN points of Figma pass G1 and refines #403, item 9 (every load, reason shown, nothing remembered: unchanged). (5) VOTE TOGGLE. The vote count updates live by one, in either direction, when the toggle flips. No banner appears on toggle. Closes the SCOPE OPEN point of Figma pass G1 (#401, #403 item 7). (6) CAROUSEL IMPRESSIONS. Final-week carousel views count as impressions when a tile is actually visible; tile order follows the balanced rotation of #388 (docs/contest-spec.md, section 10b). Closes the open point of #403, item 11 and of B-092. OPEN (not stated): what 'actually visible' means in numbers (share of the tile in view, time in view). (7) 2FA RECOVERY. 10 backup codes, shown once, each in 5-5 groups (interpretation: ten characters shown as two groups of five; the character set is not stated). Regenerating needs the password and invalidates the old set. Turning 2FA off invalidates the codes. A wrong code and an already-used code give the same 'not accepted' message. 5 wrong tries in 15 minutes lock recovery for 15 minutes (ASSUMED per account, not per IP; a per-account lock lets a stranger lock out an account holder, a trade-off to confirm). Password re-entry is needed only to turn off and to regenerate. The 'check your email' page reads the same for unknown accounts (non-enumerating). Backup codes appear after the 6-digit code is accepted, before the '2FA is on' screen. Entry points: a 'Can't scan?' link (manual key) and a Turn off control. Closes the backup-code format and entry-point open points of #402 and Figma pass H; STILL OPEN: storage and encryption of the TOTP secret, counsel (legal copy Part C row 44). (8) BLOCKED USERS LIST. No date is shown; the reason is not editable (unblock and re-block to change it); the reason is visible to the blocker only. A blocked user sees the blocker's profile as not found (settles the SCOPE OPEN 'blocked user's own view' of Figma pass H; whether a new not-found frame is needed or the app's existing not-found state is reused is a Figma follow-up). (9) PINNED FINAL ENTRY. Others see nothing before the reveal. After the reveal the entry is pinned on the finalist's profile until the contest ends at the end of that month; then the pin is removed and the entry is an ordinary post. The label stays 'Contest post'. Item 15 repeats and extends this; where the wording differs, item 15 prevails (see item 15). (10) BANTS. A room is a thread (BanterRoom is the thread; comments are the posts in it). Posting and commenting need NO membership. 'Join' stays as a bookmark that feeds My Bants. Moderation means reporting plus admin moderation. This SUPERSEDES the 'posting requires membership' point of #275 and closes the open points of #403 item 16 and of B-117 (thread mapping, no room membership, moderation scope). Recorded as an interpretation to confirm: no like-identities list is built (none exists today), so the Block clause about like identities leaves counts unchanged. Unchanged: 16-17 full access, under-16 fully disabled (#346), Block effects (#402 item 4). (11) BLOCK AND THE AGE RULES. Block applies on top of the age rules (#346, #347). The age rules apply first. A block never reveals itself: no response, count or error tells the blocked user they are blocked. Closes the open interaction point of #402 item 4 and B-039. (12) BACKEND W3 JUDGMENT CALLS. Calls 1-7 of docs/backend-w3-gates-report.md, section 5, are adopted: (1) the restricted-pending write block is uniform and covers the undo forms, while the unverified-email block covers only the creating forms; (2) read-state and kickoff-alert subscription routes stay open; (3) the profile gate covers posting-class routes only; (4) an open incorrect-details report blocks approval and card payment, not decline or withdraw, and survives a guardian-email change; (5) username set means profile complete; (6) the approval email links to /login; (7) displayName is no longer a fallback anywhere other users can see it. BUILT (PR #412). Forward-pointers on #369, #370, #372, #373 and #403. (13) CONTEST TAB ON DAY 1. From 00:00 to 08:00 on day 1 the Contest tab shows the Between Weeks state, variant 'Week 1 opens at 08:00'. Closes the open E6 point of #403. Note: this window is 8 hours, not the 12 hours of the Between Weeks state of #400. (14) STANDING FIGMA CHECK. The whole-canvas depth-4 get_metadata pull is replaced by a findAll count per top-level node plus a top-level id hash, taken before and after. Reason: the page holds about 139,000 nodes and the pull cannot return (docs/figma-pass-g1-report.md, docs/figma-pass-h-report.md). (15) FINAL-WEEK ENTRY JOURNEY. After the reveal, finalist names on the leaderboard Contest tab open the finalist's profile, where the entry is pinned. Final-week carousel tiles open the entry itself. The entry does not also appear as a normal Community-feed post; the carousel is the daily exposure (balanced rotation, #388). A tile shown in the viewport counts as an impression. The pin lasts until the contest ends at the end of that month, then it is removed (replaces the wording of item 9). Closes 'how other users reach a finalist's entry after the reveal' (#400 E10, #403). OPEN (not stated): whether the entry, once the pin is removed, then appears in the Community feed; item 9 says it becomes an ordinary post, item 15 says only that the pin is removed. (16) CONTEST NOTIFICATIONS (founder decision; the spec had none). In-app notifications, all times Europe/London, to every non-restricted account that is eligible for the Contest under the existing rules (docs/contest-spec.md, sections 6 and 8: minors included, restricted accounts excluded): (a) week opens, 08:00 on days 1, 8, 15, 22; (b) votes-closing reminder, 19:00 on days 7, 14, 21, only to eligible accounts that have not voted that week; (c) week result, when votes lock at 20:00 on days 7, 14, 21: winners announced to everyone, plus a personal notification to each winner; (d) final qualification: a personal notification to each finalist saying the entry stays hidden until the reveal; (e) reveal, 00:00 on day 25: 'The final is live' to everyone; (f) final result: the winners, or 'No winner this month'; (g) forfeits need no extra notification, the pop-up covers them; (h) finalist upload reminder, 12:00 on day 24, to finalists who have not uploaded (default added by Claude, veto-able). One notification per account per event; a re-run never duplicates. Push and email are not decided and stay deferred to launch gate B-090. Wording is functional and tagged [COPY PENDING LEGAL REVIEW] where it reaches minors. ASSUMED, to confirm: (d) is sent when the finalists are known, at the week-3 result (20:00 on day 21); (f) is sent at the end of the contest month, because the spec states no crown moment; a forfeited week sends no (c) notification; whether an account with an unverified email receives them is not stated. BACKEND TO CONFIRM: a uniqueness key per (account, event, contest cycle, week) is needed for 'never duplicates'; Notification.type is a free string, but NotificationsService and the Notification Centre must learn each new type (the age_milestone and match_kickoff precedent: an unrendered type shows a generic row). (17) REGISTER. New rows B-119 to B-123 (admin incorrect-details reports list and resolve, Figma and code; Contest notifications backend, Figma states and frontend); status lines on the rows named in docs/build-register.md Section 14; the B-034 cursor and ordering leak stays on B-034. NOT DECIDED HERE: the visibility threshold in item 6; the TOTP secret storage; the notification timing assumptions in item 16; whether the unpinned entry reaches the Community feed. Dated notes were appended (original text unchanged) to #369, #370, #372, #373 and #403 only; #275, #400, #402 and #396 are amended in substance by this entry but were not edited, #404 is the record. [2026-10-17: Item 16 (Contest notifications) is BUILT as B-122, backend only, in-app only (backend/w3c-contest-notifications, PR #417; docs/backend-w3c-contest-notifications-report.md): the calendar is computed in a new module (no Contest calendar existed in code; B-091 is not built), the BACKEND TO CONFIRM uniqueness key is Notification.dedupeKey (nullable, UNIQUE, additive migration 20261017160000), and (d) and (f) are implemented at the ASSUMED timings. Follow-up decisions in #405 close open points of this entry: the conflict between items 9 and 15 (item 1 of #405), 'actually visible' for carousel impressions (#405, item 7), the TOTP secret storage and the backup-code character set (#405, item 8), whether an unverified-email account receives Contest notifications (#405, item 4), the notification destinations (#405, item 2) and the legacy profile frames (#405, item 9). The roles that may use the DOB tools: #405, item 5.]</w:t>
+            </w:r>
+          </w:p>
+        </w:tc>
+      </w:tr>
+      <w:tr>
+        <w:tc>
+          <w:tcPr>
+            <w:tcW w:type="dxa" w:w="500"/>
+          </w:tcPr>
+          <w:p>
+            <w:r>
+              <w:t>405</w:t>
+            </w:r>
+          </w:p>
+        </w:tc>
+        <w:tc>
+          <w:tcPr>
+            <w:tcW w:type="dxa" w:w="4700"/>
+          </w:tcPr>
+          <w:p>
+            <w:r>
+              <w:t>Founder decisions 2026-10-17 (second round): the final entry becomes an ordinary Community-feed post when the pin is removed; Contest notification destinations as drawn in Figma pass J2; the personal winner notification stays contest_win; accounts with an unverified email receive no Contest notifications; moderator and superadmin may read and correct a date of birth; the guardian resend route stays email-keyed; the carousel impression threshold; 2FA backup-code format, TOTP secret storage and the recovery lock; legacy profile frames archived; Field, Dialogs and Tables stay local frames and the hidden ARCHIVED originals stay to the launch gate.</w:t>
+            </w:r>
+          </w:p>
+        </w:tc>
+        <w:tc>
+          <w:tcPr>
+            <w:tcW w:type="dxa" w:w="1850"/>
+          </w:tcPr>
+          <w:p>
+            <w:r>
+              <w:t>docs/decisions-founder-2026-10-17b (docs only, 2026-10-17; founder decisions 2026-10-17, items 1-10; docs/build-register.md Section 19, docs/contest-spec.md Section 14f, CLAUDE.md; sources docs/backend-w3b-report.md, docs/backend-w3c-contest-notifications-report.md, docs/figma-pass-j2-report.md, docs/figma-pass-j-report.md)</w:t>
+            </w:r>
+          </w:p>
+        </w:tc>
+        <w:tc>
+          <w:tcPr>
+            <w:tcW w:type="dxa" w:w="2300"/>
+          </w:tcPr>
+          <w:p>
+            <w:r>
+              <w:t>Resolved -- recorded. FOUNDER-ADOPTED DEFAULTS, VETO-ABLE, all ten items. Items 4, 5 and 6 confirm behaviour already in the shipped code (PR #416, PR #417); items 1, 2, 7, 8, 9 and 10 are DECIDED, NOT BUILT; item 3 confirms the existing design. Item numbers are the founder's own. Original text of every entry named in the forward-pointers below is unchanged (dated notes appended). (1) PIN REMOVED, FINAL ENTRY BECOMES AN ORDINARY POST. When the contest ends at the end of its month and the pin is removed (#404 items 9 and 15), the final entry becomes an ordinary post and appears in the Community feed like any other post. Closes the open point of #404 (item 9 said it becomes an ordinary post; item 15 said only that the pin is removed): item 9's reading stands for the end state. Unchanged: during the contest month the entry is not also a normal feed post; the carousel is the daily exposure. The pin removal and the flip are new build work (B-091, B-092, B-082); nothing exists. Not decided: the time of day of the flip. (2) NOTIFICATION DESTINATIONS AS DRAWN IN FIGMA PASS J2 (docs/figma-pass-j2-report.md, section 2). Week opens opens the Contest details page; votes closing opens the Voting page; week result opens the leaderboard Contest tab (that week's winners-in frame); finalist qualification and the finalist upload reminder open Create Post &gt; Contest, Upload Open; 'The final is live' opens the Final week carousel in the Community feed; final result opens the leaderboard Contest tab, Crowned frame (winners) or No Winner This Month frame. NO notification opens a profile. This settles candidates 1, 2 and 4 of that report's section 6 and supersedes the link list written in register row B-123 (reveal and final to the leaderboard Contest tab; winners to the finalist's profile). B-123 updated. (3) PERSONAL WINNER NOTIFICATION. It stays the existing contest_win row (#278), not duplicated and not replaced by a new type; there is no separate personal-winner row in the Notification Centre. Closes the J2 candidate 3 and the 'separate personal winner row' leg of B-121. (4) UNVERIFIED EMAIL. Accounts with an unverified email receive no Contest notifications. Closes the open point of #404 item 16. Matches B-122 as built (one filter constant). (5) DATE OF BIRTH TOOLS. Moderator and superadmin may read and correct a date of birth, and each view is audited. Closes the open point 'which admin roles may read a decrypted DOB' (B-109, #398 D4, #390). Matches B-103 and B-109 as built (PR #416): the correction audit row holds admin, target, reason, old and new tier and never a DOB; every response that contains a DOB writes a user.dob_viewed row and fails closed if that write fails. An editor cannot use either. (6) GUARDIAN RESEND STAYS EMAIL-KEYED. The resend route stays the existing POST /auth/guardian-consent/resend, keyed by the minor's registered email and rate-limited, not JWT. Clarifies the words 'existing authenticated resend' in #402 item 1 and #389 (the authenticated route is change-guardian-email, #365). Matches B-110 as built. Implication, not a decision: the in-account decline page calls the resend route with the account's own registered email. (7) CAROUSEL IMPRESSION THRESHOLD. A carousel tile counts as an impression when at least 50 percent of it is in view for at least 1 second. Closes the OPEN threshold of #404 items 6 and 15 and of B-092. Not stated: whether the second must be continuous and whether a tile counts again on re-entry; the per-viewer daily cap and the tolerance of #388 are unchanged. (8) 2FA. Backup codes are 10 characters shown in two groups of five (5-5), upper-case letters and digits without 0, O, 1 and I; stored hashed (#402); single use. The TOTP secret is encrypted at rest with the existing date-of-birth encryption (AES-256-GCM, DOB_ENCRYPTION_KEY, #362). Recovery lockout stays per account (5 wrong tries in 15 minutes lock recovery for 15 minutes). Closes the character-set, TOTP-secret-storage and per-account-or-per-IP points of #404 item 7 and #402 item 5. Consequences recorded for the founder, not decisions: one key now protects both date-of-birth and TOTP secrets, so loss or rotation of DOB_ENCRYPTION_KEY affects both (docs/dob-encryption-rollback.md covers date of birth only); a per-account lock lets a stranger lock out an account holder (the trade-off #404 already named). Counsel (legal copy Part C row 44) still open. (9) LEGACY PROFILE FRAMES. The legacy absolute-layout profile frames 1455:4362, 1455:6626, 5702:8250 and 5778:8490 are archived (hidden, ARCHIVED prefix), not deleted. Confirms the default of #404 item 2; the Figma work is still owed (B-113, B-082). (10) FIGMA COMPONENT ADOPTION. The Field component, the eight Dialogs and the eight Tables that Figma pass J did not adopt stay local frames; the 257 hidden ARCHIVED originals left by that pass stay until the launch gate (B-090). Settles the 'still open' adoption of pass J (B-113, B-095). Not decided: whether the 257 are deleted at the gate. (REGISTER) New rows B-124 (pending-copy guard), B-125 (apps/web onboarding routing on the server's nextStep) and B-126 (OPEN, no decision: declined-at-1-or-2 rows have no expiry); status lines on B-015, B-030, B-082, B-086, B-087, B-090, B-091, B-092, B-095, B-102, B-103, B-104, B-109, B-110, B-111, B-113, B-121, B-122, B-123; the BUILT lines of B-102, B-103, B-109, B-110 and B-122 (PR #416, PR #417) were already present and were verified, not duplicated. 126 B-IDs; 146 gap frames unchanged. Arithmetic: docs/build-register.md Section 19. (FORWARD-POINTERS) Dated notes appended (original text unchanged) to #337, #338, #339, #340, #365, #372, #375, #389, #390, #395, #398, #402, #403 and #404. NOT DECIDED HERE: the pending-copy guard's exact scope (the instruction named it but its definition did not arrive; B-124 is Claude's reading of the name and the repo, to confirm or replace); whether a row declined at 1 or 2 should expire, be reminded or be left alone (B-126, OPEN); the time of day of the pin-removal flip; continuity of the 1-second view; whether the 257 archived originals are deleted at the launch gate; counsel wording for every [COPY PENDING LEGAL REVIEW] item.</w:t>
             </w:r>
           </w:p>
         </w:tc>

</xml_diff>

<commit_message>
docs: record founder decisions 2026-10-18 (Decision Log #406), register B-127 to B-139
Docs only. Adds Decision Log #406 and dated notes on #37, #364, #367, #368,
#369, #389, #395, #398, #402, #404, #405; build register Section 22 and
rows B-127 to B-139 (139 B-IDs, 146 gap frames unchanged); contest-spec
Section 14g; pending-copy manifest OPEN list for services/api email
wording; figma-archive-index counts corrected to 397 = 57 + 340.

Co-Authored-By: Claude Sonnet 5.5 <noreply@anthropic.com>
</commit_message>
<xml_diff>
--- a/docs/Soccernity_MVP_Build_Plan_v1.7.docx
+++ b/docs/Soccernity_MVP_Build_Plan_v1.7.docx
@@ -11224,7 +11224,7 @@
           </w:tcPr>
           <w:p>
             <w:r>
-              <w:t>Resolved — button shipped disabled by design; no resend-verification endpoint or support/contact channel exists yet, real destination needed in a future sprint RESOLVED by sprint-2/verify-email-support-and-consent-view (figma-to-code): the founder confirmed the real support destination, support@soccernity.com. The 'Contact support' button on both the Link Invalid Or Expired and Missing Token states is now a real, enabled mailto:support@soccernity.com?subject=Email%20verification%20help link (a plain subject prefill only, no body -- kept simple per the task's own brief), replacing the disabled placeholder and its explanatory tooltip. Test coverage added confirming the link is real and enabled on both states, replacing the prior disabled-state assertions.</w:t>
+              <w:t>Resolved — button shipped disabled by design; no resend-verification endpoint or support/contact channel exists yet, real destination needed in a future sprint RESOLVED by sprint-2/verify-email-support-and-consent-view (figma-to-code): the founder confirmed the real support destination, support@soccernity.com. The 'Contact support' button on both the Link Invalid Or Expired and Missing Token states is now a real, enabled mailto:support@soccernity.com?subject=Email%20verification%20help link (a plain subject prefill only, no body -- kept simple per the task's own brief), replacing the disabled placeholder and its explanatory tooltip. Test coverage added confirming the link is real and enabled on both states, replacing the prior disabled-state assertions. [2026-10-18: A rate-limited resend-verification-email endpoint is now decided (#406, item 3; build row B-128); not built. The Contact-support half stays resolved as above.]</w:t>
             </w:r>
           </w:p>
         </w:tc>
@@ -25472,7 +25472,7 @@
           </w:tcPr>
           <w:p>
             <w:r>
-              <w:t>Resolved -- built. User.username String? @unique (migration 20261005150000_add_user_username): optional, distinct from displayName (which stays the 'full name' used in emails and on the owner's own profile). Accepted as 3-30 chars of letters/digits/underscore in any case and STORED LOWERCASE, so the single unique index is case-insensitive; Postgres treats NULLs as distinct, so any number of users may have none (unique only where set). Set, changed or cleared (null) via the existing PATCH /users/:id; a duplicate is a 409 (a P2002 race is also a clean 409, never a 500). Anonymization (Decision Log #341) nulls the username, releasing the handle. PUBLIC NAME: one helper, users/public-name.util.ts (resolvePublicName = username, else displayName). Every API payload that shows a user to OTHER users now returns {id, publicName}: feed post and comment authors, saved posts, club and Community Group rosters, follower/following/suggested lists, GET /users/:id/public-profile, search (people and post authors), leaderboard rows, Contest winners/standings/admin entrants, DM otherParticipant, notification actors. The owner's own GET /users/:id and the login/register user summary keep displayName and add username + publicName. Emails, guardian-consent copy and the admin Users list keep the real displayName (admins see both). DELIBERATE BREAKING RENAME: on those other-facing payloads displayName is REPLACED by publicName rather than sent alongside it, because otherwise a user who chose a username would still have their real name readable straight off the response, defeating the pseudonym and contradicting the policy text ('your username or, if you have not set one, your display name'). The same reasoning applies to search: people search matches the PUBLIC name only (username, or displayName only when no username is set), so a real name cannot be used to find the account behind a username; Bants 'Tag' search matches a room's creator on COALESCE(username, displayName). Applies to minors exactly as to adults (consistent with #45 and ToS 9.1). apps/web and apps/admin updated to consume publicName; the Edit Profile modal gains a plainly-built Username field (no Figma frame exists -- the Create Profile screen is still unbuilt). This is the username half of Decision Log #58's backend requirements and closes legal-copy Part C row 33 in code (the draft's own row still reads 'not built' and is left for the counsel-track maintainer to close; this entry does not edit that document). NOT DONE / OPEN: (1) rosters and people search still ORDER and paginate by displayName, so for a username holder the alphabetical order will not match the name shown -- fixing it needs a COALESCE(username, displayName) raw-SQL ordering and cursor; (2) no username moderation: no reserved-word list, no impersonation/profanity screening, no change cooldown or rate limit, no admin tool to reassign or revoke a handle -- a real gap on a platform with minors and public names; (3) username is not collected at registration (set afterwards via Edit Profile), and avatar/bio/location from #58 remain unbuilt; (4) the Leaderboard/Contest admin judging screens now show the public name, not the real name. Verification (all re-run, not estimated): mocked suite 115 suites / 1746 tests, 0 failures; e2e (real Postgres) 35 suites / 350 tests -- 348 pass, 2 fail in sports.e2e-spec.ts only (the pre-existing local-env failures noted under #362: a real Highlightly key in the local .env leaks live matches into assertions; unrelated), including the new test/username.e2e-spec.ts (16 tests: unique-where-set, case-insensitive 409, clear/re-claim, feed/comment/follower/public-profile/leaderboard use publicName and never leak displayName, people search by username but not by real name, anonymization releases the handle); apps/web 61 files / 552 tests, apps/admin 16 files / 163 tests, 0 failures; tsc, eslint and nest build clean.</w:t>
+              <w:t>Resolved -- built. User.username String? @unique (migration 20261005150000_add_user_username): optional, distinct from displayName (which stays the 'full name' used in emails and on the owner's own profile). Accepted as 3-30 chars of letters/digits/underscore in any case and STORED LOWERCASE, so the single unique index is case-insensitive; Postgres treats NULLs as distinct, so any number of users may have none (unique only where set). Set, changed or cleared (null) via the existing PATCH /users/:id; a duplicate is a 409 (a P2002 race is also a clean 409, never a 500). Anonymization (Decision Log #341) nulls the username, releasing the handle. PUBLIC NAME: one helper, users/public-name.util.ts (resolvePublicName = username, else displayName). Every API payload that shows a user to OTHER users now returns {id, publicName}: feed post and comment authors, saved posts, club and Community Group rosters, follower/following/suggested lists, GET /users/:id/public-profile, search (people and post authors), leaderboard rows, Contest winners/standings/admin entrants, DM otherParticipant, notification actors. The owner's own GET /users/:id and the login/register user summary keep displayName and add username + publicName. Emails, guardian-consent copy and the admin Users list keep the real displayName (admins see both). DELIBERATE BREAKING RENAME: on those other-facing payloads displayName is REPLACED by publicName rather than sent alongside it, because otherwise a user who chose a username would still have their real name readable straight off the response, defeating the pseudonym and contradicting the policy text ('your username or, if you have not set one, your display name'). The same reasoning applies to search: people search matches the PUBLIC name only (username, or displayName only when no username is set), so a real name cannot be used to find the account behind a username; Bants 'Tag' search matches a room's creator on COALESCE(username, displayName). Applies to minors exactly as to adults (consistent with #45 and ToS 9.1). apps/web and apps/admin updated to consume publicName; the Edit Profile modal gains a plainly-built Username field (no Figma frame exists -- the Create Profile screen is still unbuilt). This is the username half of Decision Log #58's backend requirements and closes legal-copy Part C row 33 in code (the draft's own row still reads 'not built' and is left for the counsel-track maintainer to close; this entry does not edit that document). NOT DONE / OPEN: (1) rosters and people search still ORDER and paginate by displayName, so for a username holder the alphabetical order will not match the name shown -- fixing it needs a COALESCE(username, displayName) raw-SQL ordering and cursor; (2) no username moderation: no reserved-word list, no impersonation/profanity screening, no change cooldown or rate limit, no admin tool to reassign or revoke a handle -- a real gap on a platform with minors and public names; (3) username is not collected at registration (set afterwards via Edit Profile), and avatar/bio/location from #58 remain unbuilt; (4) the Leaderboard/Contest admin judging screens now show the public name, not the real name. Verification (all re-run, not estimated): mocked suite 115 suites / 1746 tests, 0 failures; e2e (real Postgres) 35 suites / 350 tests -- 348 pass, 2 fail in sports.e2e-spec.ts only (the pre-existing local-env failures noted under #362: a real Highlightly key in the local .env leaks live matches into assertions; unrelated), including the new test/username.e2e-spec.ts (16 tests: unique-where-set, case-insensitive 409, clear/re-claim, feed/comment/follower/public-profile/leaderboard use publicName and never leak displayName, people search by username but not by real name, anonymization releases the handle); apps/web 61 files / 552 tests, apps/admin 16 files / 163 tests, 0 failures; tsc, eslint and nest build clean. [2026-10-18: Open items (1) ordering by displayName and (2) username moderation are closed by B-034 and B-032 (docs/backend-w4-username-report.md). The change cooldown, the one free correction and the absence of a hold on a handle the user releases are recorded in #406, item 8.]</w:t>
             </w:r>
           </w:p>
         </w:tc>
@@ -25598,7 +25598,7 @@
           </w:tcPr>
           <w:p>
             <w:r>
-              <w:t>Resolved -- decided, NOT yet built. MINOR: Age Gate (date of birth + country) -&gt; Guardian details -&gt; submit -&gt; Register (account created, restricted-pending) -&gt; Restricted pending page (shown on every login) -&gt; guardian approves (plus card verification for a US under-13, the control built in PRs #297/#298) -&gt; Activation confirmation (its 'Go to my profile' action becomes 'Continue registration') -&gt; Create Profile -&gt; Club Picker -&gt; /. ADULT: Age Gate (date of birth + country) -&gt; Register -&gt; Create Profile -&gt; Club Picker -&gt; /. Date of birth is read-only after the Age Gate: Register and Create Profile show it auto-populated and Register has no date picker. Create Profile is blocked for a restricted-pending minor until approval. Preferred Club on Create Profile is optional free text and is run through the pre-publication sensitive-content screen (Decision Log #366, PR #388); the Club Picker follows regardless of what is entered. Bio is optional and screened. Email verification is required of every user before Create Profile. The 'What you can still do' copy on the restricted-pending page is rewritten to say registration cannot be completed until the guardian approves (including card verification where required). NOTE: the sensitive-content screen as built (#366) covers Grassroots free-text fields only; extending it to Preferred Club and Bio is new build work, not a given. OPEN, product call: a user who mistypes their date of birth at the Age Gate has no self-service correction path once it is read-only. [2026-10-14: the open DOB-correction point is resolved by #390 (support correction tool, audited, re-runs age checks, re-triggers guardian flow).]</w:t>
+              <w:t>Resolved -- decided, NOT yet built. MINOR: Age Gate (date of birth + country) -&gt; Guardian details -&gt; submit -&gt; Register (account created, restricted-pending) -&gt; Restricted pending page (shown on every login) -&gt; guardian approves (plus card verification for a US under-13, the control built in PRs #297/#298) -&gt; Activation confirmation (its 'Go to my profile' action becomes 'Continue registration') -&gt; Create Profile -&gt; Club Picker -&gt; /. ADULT: Age Gate (date of birth + country) -&gt; Register -&gt; Create Profile -&gt; Club Picker -&gt; /. Date of birth is read-only after the Age Gate: Register and Create Profile show it auto-populated and Register has no date picker. Create Profile is blocked for a restricted-pending minor until approval. Preferred Club on Create Profile is optional free text and is run through the pre-publication sensitive-content screen (Decision Log #366, PR #388); the Club Picker follows regardless of what is entered. Bio is optional and screened. Email verification is required of every user before Create Profile. The 'What you can still do' copy on the restricted-pending page is rewritten to say registration cannot be completed until the guardian approves (including card verification where required). NOTE: the sensitive-content screen as built (#366) covers Grassroots free-text fields only; extending it to Preferred Club and Bio is new build work, not a given. OPEN, product call: a user who mistypes their date of birth at the Age Gate has no self-service correction path once it is read-only. [2026-10-14: the open DOB-correction point is resolved by #390 (support correction tool, audited, re-runs age checks, re-triggers guardian flow).] [2026-10-18: RegisterDto.countryCode is required (apps/web sends it since B-073). #406 moves the onboarding screens to the light theme (item 2) and adds a resend-verification endpoint for the verify-email prompt (item 3).]</w:t>
             </w:r>
           </w:p>
         </w:tc>
@@ -25640,7 +25640,7 @@
           </w:tcPr>
           <w:p>
             <w:r>
-              <w:t>Resolved -- decided, NOT yet built. Country is mandatory at the Age Gate for every registrant (declared by the user). At Register the server derives the country from the request IP using a LOCAL MaxMind GeoLite2 database: the IP is read transiently in memory, is never stored, and no third party sees it. Stored: declared code, derived code, derivation method, timestamp. The DERIVED code is authoritative for safeguarding checks (US under-13 card verification) and for demographic grouping; an unresolved lookup applies the stronger control. Residual risk: VPN/Tor spoofing (DPIA item -- listed in the PR description; the DPIA draft is locked and was not edited). Supersedes the design in which only Guardian.declaredCountry (self-declared, never verified) decided whether card verification applied. OPEN: GeoLite2 licence terms and its refresh process need an owner; counsel to confirm the transient-IP-processing disclosure.</w:t>
+              <w:t>Resolved -- decided, NOT yet built. Country is mandatory at the Age Gate for every registrant (declared by the user). At Register the server derives the country from the request IP using a LOCAL MaxMind GeoLite2 database: the IP is read transiently in memory, is never stored, and no third party sees it. Stored: declared code, derived code, derivation method, timestamp. The DERIVED code is authoritative for safeguarding checks (US under-13 card verification) and for demographic grouping; an unresolved lookup applies the stronger control. Residual risk: VPN/Tor spoofing (DPIA item -- listed in the PR description; the DPIA draft is locked and was not edited). Supersedes the design in which only Guardian.declaredCountry (self-declared, never verified) decided whether card verification applied. OPEN: GeoLite2 licence terms and its refresh process need an owner; counsel to confirm the transient-IP-processing disclosure. [2026-10-18: RegisterDto.countryCode is required (apps/web sends it since B-073).]</w:t>
             </w:r>
           </w:p>
         </w:tc>
@@ -25682,7 +25682,7 @@
           </w:tcPr>
           <w:p>
             <w:r>
-              <w:t>Resolved -- decided, NOT yet built. A username is required at Create Profile so that no user, minor or adult, is shown to other users under a real name. Until Create Profile is complete an account is shown to others under a neutral placeholder name, cannot post, and is redirected to Create Profile on every login. Applies to adults and to approved minors. Builds on #364 (User.username, shipped optional, 'username first, display name fallback'), which this makes mandatory for any account that completes onboarding; legacy accounts with no username fall under the same gate. Username moderation rules (reserved words, impersonation, profanity, no personal data in usernames, change cooldown, released-handle holding period, admin revoke built code-first with a design follow-up) are specified in the build PR, not here. OPEN: what the placeholder name is, and how the gate treats accounts that already exist without a username. [2026-10-16: Amended by #403. The placeholder name for incomplete profiles is 'Soccernity member' (closes the first OPEN point). The second OPEN point (accounts that already exist without a username) is not addressed.] [2026-10-17: The second OPEN point (accounts that already exist without a username) is resolved by B-027, which is built (backend/w3-gates, PR #412): legacy accounts are inside the incomplete-profile gate, and the placeholder other users see is 'Soccernity member' (#403, item 15). The wording of the gate is unchanged. Recorded in #404.]</w:t>
+              <w:t>Resolved -- decided, NOT yet built. A username is required at Create Profile so that no user, minor or adult, is shown to other users under a real name. Until Create Profile is complete an account is shown to others under a neutral placeholder name, cannot post, and is redirected to Create Profile on every login. Applies to adults and to approved minors. Builds on #364 (User.username, shipped optional, 'username first, display name fallback'), which this makes mandatory for any account that completes onboarding; legacy accounts with no username fall under the same gate. Username moderation rules (reserved words, impersonation, profanity, no personal data in usernames, change cooldown, released-handle holding period, admin revoke built code-first with a design follow-up) are specified in the build PR, not here. OPEN: what the placeholder name is, and how the gate treats accounts that already exist without a username. [2026-10-16: Amended by #403. The placeholder name for incomplete profiles is 'Soccernity member' (closes the first OPEN point). The second OPEN point (accounts that already exist without a username) is not addressed.] [2026-10-17: The second OPEN point (accounts that already exist without a username) is resolved by B-027, which is built (backend/w3-gates, PR #412): legacy accounts are inside the incomplete-profile gate, and the placeholder other users see is 'Soccernity member' (#403, item 15). The wording of the gate is unchanged. Recorded in #404.] [2026-10-18: Rules specified and built by B-032 (docs/backend-w4-username-report.md): reserved words, impersonation (club names), profanity, contact details, personal data, 30-day change cooldown, revoked-handle hold. A user can no longer clear their own username (B-031). Recorded in #406, item 8: one free correction; no hold on a handle the user releases.]</w:t>
             </w:r>
           </w:p>
         </w:tc>
@@ -26522,7 +26522,7 @@
           </w:tcPr>
           <w:p>
             <w:r>
-              <w:t>Resolved -- decided, NOT yet built. SUPERSEDES #374 'as-is' for explicit declines on a still-valid request (the rest of #374 is retained). A guardian's explicit decline lets the minor resend or change the guardian email; the decline frames 5491:8241 / 5501:8453 must be wired to this logic (this settles #374's 'archive or rewrite' choice: rewrite and wire). MAX 3 declines; after the 3rd the account moves to pending deletion via the existing refuseConsentAndScheduleDeletion path (sessions revoked, 30-day grace, anonymise, purge rule #375). An expired request / second lapse does NOT count among the 3 and goes straight to the original plan (pending deletion). A guardian withdrawing consent after approval goes straight to the original plan. Changing the guardian email does NOT reset the count. Abuse protection: a cap on requests per day and a 'don't contact me again' option for the recipient. Retained from #374: 72h token TTL (GUARDIAN_CONSENT_TOKEN_TTL_HOURS), first lapse = automatic re-send plus a reminder to the minor, second lapse = implicit decline -&gt; original plan. Known bug to fix with this work: GuardianConsentPage currently treats 'declined' as pending (audit section 5 item 5). Note: between declines the minor's sessions must stay valid for them to resend; today every decline revokes sessions and 'declined' is terminal in code, so a per-account decline counter and a revised state model are new build work. Not yet in the legal copy draft (to add). Build register B-102, B-003. Forward-pointer: #374. [2026-10-17: Backend built (B-102, B-110; PR #416): the per-account counter (internal), declines 1 and 2 non-final with sessions valid, the third decline final via refuseConsentAndScheduleDeletion. Not built from this entry: the per-day request cap and the do-not-contact option (superseded by #395 B2, which has neither). Frontend still open: the in-account decline page and GuardianConsentPage's 'declined' rendering (audit section 5 item 5). New open item: B-126.]</w:t>
+              <w:t>Resolved -- decided, NOT yet built. SUPERSEDES #374 'as-is' for explicit declines on a still-valid request (the rest of #374 is retained). A guardian's explicit decline lets the minor resend or change the guardian email; the decline frames 5491:8241 / 5501:8453 must be wired to this logic (this settles #374's 'archive or rewrite' choice: rewrite and wire). MAX 3 declines; after the 3rd the account moves to pending deletion via the existing refuseConsentAndScheduleDeletion path (sessions revoked, 30-day grace, anonymise, purge rule #375). An expired request / second lapse does NOT count among the 3 and goes straight to the original plan (pending deletion). A guardian withdrawing consent after approval goes straight to the original plan. Changing the guardian email does NOT reset the count. Abuse protection: a cap on requests per day and a 'don't contact me again' option for the recipient. Retained from #374: 72h token TTL (GUARDIAN_CONSENT_TOKEN_TTL_HOURS), first lapse = automatic re-send plus a reminder to the minor, second lapse = implicit decline -&gt; original plan. Known bug to fix with this work: GuardianConsentPage currently treats 'declined' as pending (audit section 5 item 5). Note: between declines the minor's sessions must stay valid for them to resend; today every decline revokes sessions and 'declined' is terminal in code, so a per-account decline counter and a revised state model are new build work. Not yet in the legal copy draft (to add). Build register B-102, B-003. Forward-pointer: #374. [2026-10-17: Backend built (B-102, B-110; PR #416): the per-account counter (internal), declines 1 and 2 non-final with sessions valid, the third decline final via refuseConsentAndScheduleDeletion. Not built from this entry: the per-day request cap and the do-not-contact option (superseded by #395 B2, which has neither). Frontend still open: the in-account decline page and GuardianConsentPage's 'declined' rendering (audit section 5 item 5). New open item: B-126.] [2026-10-18: A row declined at decline 1 or 2 and not reopened within 14 days (configuration) takes the same lapse path as an unanswered request (#406, item 1; mechanics for the backend agent to confirm; counsel still to review). The guardian confirm page footnote 'Declining closes the account and schedules it for deletion' is wrong for declines 1-2 and is replaced (#406, item 13).]</w:t>
             </w:r>
           </w:p>
         </w:tc>
@@ -26783,7 +26783,7 @@
               <w:t>Resolved -- recorded; DECIDED, NOT BUILT. Source: founder decisions 2026-10-15/16. Extends and amends #389; builds on #374, #340 and #390. (B1) The decline frame already exists in Figma (5491:8241 / 5501:8453). After decline 1 and decline 2 the minor sees the existing decline page. It is shown at the minor's next LOGIN ATTEMPT, before a session exists (#374 revokes all sessions and blocks login, so it cannot be shown inside a session): the server answers the login with a 'declined' result instead of issuing a token. BACKEND TO CONFIRM: backend-api must confirm this is buildable, including how the page's resend / change-guardian-email actions are authorised without a session (those routes are JwtAuthGuard-gated today) and that it is consistent with the note in #389 that sessions must stay valid between declines. Recorded as the intended behaviour, not as a verified design. (B2) Decline 3: the account enters the deletion sequence and the minor receives an EMAIL ONLY (no page). No decline count is shown anywhere to anyone; the counter is internal. There is NO 'don't contact me again' option. There is NO requests-per-day cap (only one request can run at a time). Three declines in one day delete the account immediately. Three declines in total, ever, per account. Founder decision; no counsel review needed. This WITHDRAWS the abuse-protection sentence of #389 (a cap on requests per day and a 'don't contact me again' option) and supersedes the open points of build register B-102 and B-003 accordingly; the rest of #389 stands (72h token; first lapse = automatic re-send; expiry, second lapse and post-approval withdrawal go straight to pending deletion and do not count among the three; changing the guardian email does not reset the count). (B3) Guardian withdrawal page (B-013): a LINK is added to the consent email and to the approved screen that pre-fills the code. Throttle ('Too many attempts'): a fixed window held in configuration, no countdown shown, 'Try again' returns to frame 1. 'Request a new link' (expired or used link) returns to frame 1 where the guardian re-enters their email; the page reads identically whether or not an account matched. BACKEND TO CONFIRM: the withdrawal token is issued only when a withdrawal is requested (#340), so what a link in the consent email can pre-fill at that moment must be confirmed. (B4) DOB correction (B-103, B-104; #390): if the corrected age tier changes, an in-flight guardian request is CANCELLED and restarted. This settles the 'effect on an in-flight request' point #390 left open. Build register: B-003, B-013, B-080, B-102, B-103, B-104, B-110 (declined-login result), B-112 (withdrawal link); Figma re-sync in B-107. STILL OPEN: counsel wording; the length of the throttle window (stated as configuration); whether 'delete the account immediately' on a third decline also skips the 30-day grace of #375 (recorded as: enters the deletion sequence immediately, grace not altered by this entry); whether a restart caused by a DOB correction resets the decline counter; the shipped per-minor guardian-email-change cap (5 per 24h, #365) is a separate control and is not altered here.</w:t>
             </w:r>
             <w:r>
-              <w:t xml:space="preserve"> [2026-10-16: Amended by #402. (B1) is AMENDED: sessions stay valid between declines (#389); after decline 1 and 2 the minor sees the existing decline page INSIDE the account via the existing authenticated resend / change-guardian-email routes; the 'declined' login result and its BACKEND TO CONFIRM point are WITHDRAWN (build register B-110 re-scoped). (B2) The open question on the 30-day grace is answered: the third decline blocks login at once and enters pending deletion WITH the existing 30-day grace (#375). The remainder stands.] [2026-10-16: Amended by #403. (B2) The decline page keeps its static sentence stating the cap (Figma node 6627:22230); 'No decline count is shown' means no running 'decline N of 3' counter. (B4) A restart caused by a DOB correction RESETS the decline counter and writes an audit entry (answers the STILL OPEN point). (B3) The withdrawal throttle default is 5 attempts per 15 minutes, held in configuration (sets the window left open).] [2026-10-17: Backend built in PR #416. B1 stays withdrawn (#402). B2: the third decline blocks login at once and enters pending deletion with the 30-day grace, one email. B3: unchanged here. B4 built as B-103: an age-tier change cancels or restarts the request and a restart resets the counter. Open, no decision: a row declined at 1 or 2 and never reopened has no expiry (register row B-126). Frontend decline page not built.]</w:t>
+              <w:t xml:space="preserve"> [2026-10-16: Amended by #402. (B1) is AMENDED: sessions stay valid between declines (#389); after decline 1 and 2 the minor sees the existing decline page INSIDE the account via the existing authenticated resend / change-guardian-email routes; the 'declined' login result and its BACKEND TO CONFIRM point are WITHDRAWN (build register B-110 re-scoped). (B2) The open question on the 30-day grace is answered: the third decline blocks login at once and enters pending deletion WITH the existing 30-day grace (#375). The remainder stands.] [2026-10-16: Amended by #403. (B2) The decline page keeps its static sentence stating the cap (Figma node 6627:22230); 'No decline count is shown' means no running 'decline N of 3' counter. (B4) A restart caused by a DOB correction RESETS the decline counter and writes an audit entry (answers the STILL OPEN point). (B3) The withdrawal throttle default is 5 attempts per 15 minutes, held in configuration (sets the window left open).] [2026-10-17: Backend built in PR #416. B1 stays withdrawn (#402). B2: the third decline blocks login at once and enters pending deletion with the 30-day grace, one email. B3: unchanged here. B4 built as B-103: an age-tier change cancels or restarts the request and a restart resets the counter. Open, no decision: a row declined at 1 or 2 and never reopened has no expiry (register row B-126). Frontend decline page not built.] [2026-10-18: Amended by #406: a declined-at-1-or-2 row not reopened within 14 days expires (item 1); the status response adds the guardian's first name and the last decision date, never the decline count (item 11); the guardian confirm page footnote is replaced by the cap sentence (item 13).]</w:t>
             </w:r>
           </w:p>
         </w:tc>
@@ -26918,7 +26918,7 @@
               <w:t>Resolved -- recorded; DECIDED, NOT BUILT. Source: founder decisions 2026-10-15/16. Extends #376, #371, #369 and #390. (D1) 'Reporter acted in bad faith' and 'Legal hold' (#376): each has a confirmation step and a reason field, a 'lift hold' control exists, and both actions also APPEAR on Appeal Review (not only Report Detail). The held-investigations list (GET /admin/users/held-investigations) shows the hold TYPE and a marker (per the open points of W0 Figma pass C). (D2) Flagged-image queue (#371): the reject reason is shown to the uploader. The CSAM / statutory path stays under counsel (#371). (D3) Username revoke: an admin action, manual, from User Detail, available at any time after the username exists, triggered by a report or an admin review (offensive, impersonating or personal-data usernames). No account exists without a username (#369), so a revoke returns the account to the incomplete-profile gate (#369): a neutral placeholder name to other users, cannot post, redirected to Create Profile at next login to choose a new username. A REASON is REQUIRED and is stored in the audit record. The user is emailed (wording [COPY PENDING LEGAL REVIEW]). The revoked handle is held for 30 days before anyone can take it, and that user cannot re-pick it. (D4) Everything needed for the DOB correction tool (#390) and for username revoke is built: a single-user admin read endpoint returning the fields the admin needs (including the date of birth) and a User Detail admin screen (build register B-109, a prerequisite of B-103, B-104 and B-033). The audit fields for both tools are specified in the build PR. Build register: B-012, B-032, B-033, B-037, B-044, B-045, B-109; Figma re-sync in B-107. STILL OPEN: the CSAM path (counsel); counsel wording; whether 'that user cannot re-pick it' is permanent or lasts only the 30 days (recorded verbatim; the sentence is ambiguous).</w:t>
             </w:r>
             <w:r>
-              <w:t xml:space="preserve"> [2026-10-16: Amended by #402 (founder-adopted default, veto-able). The revoked handle is held 30 days for everyone, and the revoked user can never re-pick it (permanent for that user).] [2026-10-17: D4 built (B-109; PR #416): GET /admin/users/:id for moderator and superadmin, DOB decrypted server-side only, a user.dob_viewed audit row for every response that contains a DOB, request fails closed if that write fails. The open point 'which admin roles may read a decrypted DOB' is closed by #405, item 5. The User Detail screen in apps/admin is not built (B-104, B-109 frontend leg).]</w:t>
+              <w:t xml:space="preserve"> [2026-10-16: Amended by #402 (founder-adopted default, veto-able). The revoked handle is held 30 days for everyone, and the revoked user can never re-pick it (permanent for that user).] [2026-10-17: D4 built (B-109; PR #416): GET /admin/users/:id for moderator and superadmin, DOB decrypted server-side only, a user.dob_viewed audit row for every response that contains a DOB, request fails closed if that write fails. The open point 'which admin roles may read a decrypted DOB' is closed by #405, item 5. The User Detail screen in apps/admin is not built (B-104, B-109 frontend leg).] [2026-10-18: Built by B-033: POST /admin/users/:id/username-revoke (moderator, superadmin), reason required and stored in the audit record, user emailed [COPY PENDING LEGAL REVIEW], account back in the incomplete-profile gate, handle held 30 days for everyone and barred for ever for that user. The User Detail screen in apps/admin is not built for the revoke (disabled in FC2). D4 is amended by #406, item 4: User Detail no longer shows the date of birth.]</w:t>
             </w:r>
           </w:p>
         </w:tc>
@@ -27089,7 +27089,7 @@
           </w:tcPr>
           <w:p>
             <w:r>
-              <w:t>Resolved -- recorded; DECIDED, NOT BUILT. FOUNDER-ADOPTED DEFAULTS, VETO-ABLE: each item below is adopted now so build work is not blocked, and stands until the founder says otherwise. Amends #395 and closes open points of #395-#399; the original text of those entries is unchanged (dated notes appended). (1) DECLINE 1 AND 2 -- AMENDS #395 B1. #389 already decided that sessions STAY VALID between declines; only the THIRD decline revokes sessions. After decline 1 and decline 2 the minor sees the existing decline page (5491:8241 / 5501:8453) INSIDE the account, using the existing authenticated resend and change-guardian-email routes. The 'declined login result' design of #395 B1 (a login that answers 'declined' with no token) is WITHDRAWN; so is its BACKEND TO CONFIRM point. Build implications recorded, not decisions: today every decline revokes sessions and 'declined' is terminal in code (#337-#340), and resend / change-guardian-email refuse a declined account (#365), so decline 1 and 2 must stop revoking and those routes must accept the account while fewer than three declines have been recorded. Bug fixed by the same work: GuardianConsentPage treats 'declined' as pending (audit section 5 item 5). Build register: B-110 is RE-SCOPED to this and merged into B-102's dependency chain (B-102 now depends on B-110); the B-ID is kept. (2) THIRD DECLINE. Login is blocked at once and the account enters pending deletion with the EXISTING 30-day grace (#375, via refuseConsentAndScheduleDeletion as in #389). This answers #395's open question: 'delete the account immediately' does NOT skip the grace; the minor still receives the email only, no page and no count (#395 B2 stands). (3) REVOKED USERNAME (#398 D3). The handle is held 30 days for everyone (nobody can take it); the revoked user can NEVER re-pick it. This answers #398's ambiguous 'cannot re-pick' point: permanent for that user, 30 days for others. (4) BLOCK (#396). The blocked user is NOT told. A block hides content and search results in both directions: posts, comments, likes, search, rosters. The leaderboard is unaffected. Unblock does NOT restore follows. Still open: Bants rooms (room membership / room listing; the blocked user's posts are covered by 'posts'), the exact like mechanics, and the interaction with the guardian-consent, under-16 and adult-to-minor rules (#346, #347). (5) 2FA (#397). 10 single-use backup codes, stored HASHED. Lost-device recovery needs a backup code, OR email confirmation plus password. Noted for the founder's veto: the email-plus-password path makes 2FA recovery only as strong as the email account. Still open: backup-code format, storage and encryption of the TOTP secret itself, counsel (legal copy Part C row 44). (6) CONTEST EXPOSURE SETTINGS (#399 E4/E5, #388). Tolerance and the per-viewer daily cap apply to WEEK 4 ONLY, not per contest or per week. Their ranges (1-50 percent; 1-50) stay as validation bounds on the week-4 settings; they lock when week 4 starts (day 22), not when week 1 starts. Watch limit (3-120 s) is unchanged. Build register: B-110 (re-scoped), B-102, B-003, B-107 (decline page behaviour note), B-032, B-033, B-039, B-108, B-086, B-087, B-111, B-091, B-092, B-095, B-097. Not decided here and still open: see docs/build-register.md Section 11d. [2026-10-17: Items 1 and 2 are built in the backend (B-110, B-102; PR #416): sessions stay valid after declines 1 and 2, the third decline blocks login at once with the 30-day grace. The 'existing authenticated resend' wording of item 1 is clarified by #405, item 6: the route is the existing email-keyed POST /auth/guardian-consent/resend, not JWT; change-guardian-email is the JWT one. Item 5 (2FA): the backup-code character set, the TOTP secret storage and the per-account lock are decided by #405, item 8.]</w:t>
+              <w:t>Resolved -- recorded; DECIDED, NOT BUILT. FOUNDER-ADOPTED DEFAULTS, VETO-ABLE: each item below is adopted now so build work is not blocked, and stands until the founder says otherwise. Amends #395 and closes open points of #395-#399; the original text of those entries is unchanged (dated notes appended). (1) DECLINE 1 AND 2 -- AMENDS #395 B1. #389 already decided that sessions STAY VALID between declines; only the THIRD decline revokes sessions. After decline 1 and decline 2 the minor sees the existing decline page (5491:8241 / 5501:8453) INSIDE the account, using the existing authenticated resend and change-guardian-email routes. The 'declined login result' design of #395 B1 (a login that answers 'declined' with no token) is WITHDRAWN; so is its BACKEND TO CONFIRM point. Build implications recorded, not decisions: today every decline revokes sessions and 'declined' is terminal in code (#337-#340), and resend / change-guardian-email refuse a declined account (#365), so decline 1 and 2 must stop revoking and those routes must accept the account while fewer than three declines have been recorded. Bug fixed by the same work: GuardianConsentPage treats 'declined' as pending (audit section 5 item 5). Build register: B-110 is RE-SCOPED to this and merged into B-102's dependency chain (B-102 now depends on B-110); the B-ID is kept. (2) THIRD DECLINE. Login is blocked at once and the account enters pending deletion with the EXISTING 30-day grace (#375, via refuseConsentAndScheduleDeletion as in #389). This answers #395's open question: 'delete the account immediately' does NOT skip the grace; the minor still receives the email only, no page and no count (#395 B2 stands). (3) REVOKED USERNAME (#398 D3). The handle is held 30 days for everyone (nobody can take it); the revoked user can NEVER re-pick it. This answers #398's ambiguous 'cannot re-pick' point: permanent for that user, 30 days for others. (4) BLOCK (#396). The blocked user is NOT told. A block hides content and search results in both directions: posts, comments, likes, search, rosters. The leaderboard is unaffected. Unblock does NOT restore follows. Still open: Bants rooms (room membership / room listing; the blocked user's posts are covered by 'posts'), the exact like mechanics, and the interaction with the guardian-consent, under-16 and adult-to-minor rules (#346, #347). (5) 2FA (#397). 10 single-use backup codes, stored HASHED. Lost-device recovery needs a backup code, OR email confirmation plus password. Noted for the founder's veto: the email-plus-password path makes 2FA recovery only as strong as the email account. Still open: backup-code format, storage and encryption of the TOTP secret itself, counsel (legal copy Part C row 44). (6) CONTEST EXPOSURE SETTINGS (#399 E4/E5, #388). Tolerance and the per-viewer daily cap apply to WEEK 4 ONLY, not per contest or per week. Their ranges (1-50 percent; 1-50) stay as validation bounds on the week-4 settings; they lock when week 4 starts (day 22), not when week 1 starts. Watch limit (3-120 s) is unchanged. Build register: B-110 (re-scoped), B-102, B-003, B-107 (decline page behaviour note), B-032, B-033, B-039, B-108, B-086, B-087, B-111, B-091, B-092, B-095, B-097. Not decided here and still open: see docs/build-register.md Section 11d. [2026-10-17: Items 1 and 2 are built in the backend (B-110, B-102; PR #416): sessions stay valid after declines 1 and 2, the third decline blocks login at once with the 30-day grace. The 'existing authenticated resend' wording of item 1 is clarified by #405, item 6: the route is the existing email-keyed POST /auth/guardian-consent/resend, not JWT; change-guardian-email is the JWT one. Item 5 (2FA): the backup-code character set, the TOTP secret storage and the per-account lock are decided by #405, item 8.] [2026-10-18: Item 3 built: RevokedUsername (30-day hold for everyone, permanent bar for the revoked user). Retention and appeal path of that record are OPEN, no decision (B-139, #406).]</w:t>
             </w:r>
           </w:p>
         </w:tc>
@@ -27173,7 +27173,7 @@
           </w:tcPr>
           <w:p>
             <w:r>
-              <w:t>Resolved -- recorded; DECIDED, NOT BUILT, except item 12, whose judgment calls are already in the shipped code (backend/w3-gates, PR #412). Items 1-14 and 17 are founder-adopted defaults, veto-able; items 15 and 16 are founder decisions and are recorded as given. Item numbers below are the founder's own. (1) ACCOUNT INFORMATION. The Account Information (Edit) frames (2924:7112, 5649:8176) drop the Country field. The profile country lives in Edit Profile, which keeps the label 'Country' (#403, item 17; Figma pass I). The safeguarding country is never shown or edited. (2) PROFILE DESIGN DIRECTION. New auto-layout desktop profile frames (the pass H frames, desktop 6707:26595 and 6707:26727 / 6707:26938) replace the legacy absolute-layout profile frames (1455:4362, 1455:6626, 5702:8250, 5778:8490). Default added in recording, veto-able: the legacy frames are archived (hidden, 'ARCHIVED' prefix), not deleted; the #403 item 6 deletion exception covers only the ten Create Post layers. (3) ADMIN COMPONENTS. The F2 components (node 6671:27364) move to match the admin screens: Pill uses auto line height with padding 3/10; Button gets size variants; Banner and Callout Title become optional; radius/10 and radius/16 are added to the spacing and radius collection. They are then adopted on the Pass C and Pass F1 admin frames with no visible change. This settles the 'which side moves', 'radius scale' and 'optional Title' candidates of docs/figma-pass-g2-report.md; the adoption itself is open Figma work (B-113, B-095). (4) FORFEIT POP-UP. 'Contest page' means the Contest details page and the Voting page. When several weeks are forfeited, one pop-up opens after another, oldest week first. Closes the two SCOPE OPEN points of Figma pass G1 and refines #403, item 9 (every load, reason shown, nothing remembered: unchanged). (5) VOTE TOGGLE. The vote count updates live by one, in either direction, when the toggle flips. No banner appears on toggle. Closes the SCOPE OPEN point of Figma pass G1 (#401, #403 item 7). (6) CAROUSEL IMPRESSIONS. Final-week carousel views count as impressions when a tile is actually visible; tile order follows the balanced rotation of #388 (docs/contest-spec.md, section 10b). Closes the open point of #403, item 11 and of B-092. OPEN (not stated): what 'actually visible' means in numbers (share of the tile in view, time in view). (7) 2FA RECOVERY. 10 backup codes, shown once, each in 5-5 groups (interpretation: ten characters shown as two groups of five; the character set is not stated). Regenerating needs the password and invalidates the old set. Turning 2FA off invalidates the codes. A wrong code and an already-used code give the same 'not accepted' message. 5 wrong tries in 15 minutes lock recovery for 15 minutes (ASSUMED per account, not per IP; a per-account lock lets a stranger lock out an account holder, a trade-off to confirm). Password re-entry is needed only to turn off and to regenerate. The 'check your email' page reads the same for unknown accounts (non-enumerating). Backup codes appear after the 6-digit code is accepted, before the '2FA is on' screen. Entry points: a 'Can't scan?' link (manual key) and a Turn off control. Closes the backup-code format and entry-point open points of #402 and Figma pass H; STILL OPEN: storage and encryption of the TOTP secret, counsel (legal copy Part C row 44). (8) BLOCKED USERS LIST. No date is shown; the reason is not editable (unblock and re-block to change it); the reason is visible to the blocker only. A blocked user sees the blocker's profile as not found (settles the SCOPE OPEN 'blocked user's own view' of Figma pass H; whether a new not-found frame is needed or the app's existing not-found state is reused is a Figma follow-up). (9) PINNED FINAL ENTRY. Others see nothing before the reveal. After the reveal the entry is pinned on the finalist's profile until the contest ends at the end of that month; then the pin is removed and the entry is an ordinary post. The label stays 'Contest post'. Item 15 repeats and extends this; where the wording differs, item 15 prevails (see item 15). (10) BANTS. A room is a thread (BanterRoom is the thread; comments are the posts in it). Posting and commenting need NO membership. 'Join' stays as a bookmark that feeds My Bants. Moderation means reporting plus admin moderation. This SUPERSEDES the 'posting requires membership' point of #275 and closes the open points of #403 item 16 and of B-117 (thread mapping, no room membership, moderation scope). Recorded as an interpretation to confirm: no like-identities list is built (none exists today), so the Block clause about like identities leaves counts unchanged. Unchanged: 16-17 full access, under-16 fully disabled (#346), Block effects (#402 item 4). (11) BLOCK AND THE AGE RULES. Block applies on top of the age rules (#346, #347). The age rules apply first. A block never reveals itself: no response, count or error tells the blocked user they are blocked. Closes the open interaction point of #402 item 4 and B-039. (12) BACKEND W3 JUDGMENT CALLS. Calls 1-7 of docs/backend-w3-gates-report.md, section 5, are adopted: (1) the restricted-pending write block is uniform and covers the undo forms, while the unverified-email block covers only the creating forms; (2) read-state and kickoff-alert subscription routes stay open; (3) the profile gate covers posting-class routes only; (4) an open incorrect-details report blocks approval and card payment, not decline or withdraw, and survives a guardian-email change; (5) username set means profile complete; (6) the approval email links to /login; (7) displayName is no longer a fallback anywhere other users can see it. BUILT (PR #412). Forward-pointers on #369, #370, #372, #373 and #403. (13) CONTEST TAB ON DAY 1. From 00:00 to 08:00 on day 1 the Contest tab shows the Between Weeks state, variant 'Week 1 opens at 08:00'. Closes the open E6 point of #403. Note: this window is 8 hours, not the 12 hours of the Between Weeks state of #400. (14) STANDING FIGMA CHECK. The whole-canvas depth-4 get_metadata pull is replaced by a findAll count per top-level node plus a top-level id hash, taken before and after. Reason: the page holds about 139,000 nodes and the pull cannot return (docs/figma-pass-g1-report.md, docs/figma-pass-h-report.md). (15) FINAL-WEEK ENTRY JOURNEY. After the reveal, finalist names on the leaderboard Contest tab open the finalist's profile, where the entry is pinned. Final-week carousel tiles open the entry itself. The entry does not also appear as a normal Community-feed post; the carousel is the daily exposure (balanced rotation, #388). A tile shown in the viewport counts as an impression. The pin lasts until the contest ends at the end of that month, then it is removed (replaces the wording of item 9). Closes 'how other users reach a finalist's entry after the reveal' (#400 E10, #403). OPEN (not stated): whether the entry, once the pin is removed, then appears in the Community feed; item 9 says it becomes an ordinary post, item 15 says only that the pin is removed. (16) CONTEST NOTIFICATIONS (founder decision; the spec had none). In-app notifications, all times Europe/London, to every non-restricted account that is eligible for the Contest under the existing rules (docs/contest-spec.md, sections 6 and 8: minors included, restricted accounts excluded): (a) week opens, 08:00 on days 1, 8, 15, 22; (b) votes-closing reminder, 19:00 on days 7, 14, 21, only to eligible accounts that have not voted that week; (c) week result, when votes lock at 20:00 on days 7, 14, 21: winners announced to everyone, plus a personal notification to each winner; (d) final qualification: a personal notification to each finalist saying the entry stays hidden until the reveal; (e) reveal, 00:00 on day 25: 'The final is live' to everyone; (f) final result: the winners, or 'No winner this month'; (g) forfeits need no extra notification, the pop-up covers them; (h) finalist upload reminder, 12:00 on day 24, to finalists who have not uploaded (default added by Claude, veto-able). One notification per account per event; a re-run never duplicates. Push and email are not decided and stay deferred to launch gate B-090. Wording is functional and tagged [COPY PENDING LEGAL REVIEW] where it reaches minors. ASSUMED, to confirm: (d) is sent when the finalists are known, at the week-3 result (20:00 on day 21); (f) is sent at the end of the contest month, because the spec states no crown moment; a forfeited week sends no (c) notification; whether an account with an unverified email receives them is not stated. BACKEND TO CONFIRM: a uniqueness key per (account, event, contest cycle, week) is needed for 'never duplicates'; Notification.type is a free string, but NotificationsService and the Notification Centre must learn each new type (the age_milestone and match_kickoff precedent: an unrendered type shows a generic row). (17) REGISTER. New rows B-119 to B-123 (admin incorrect-details reports list and resolve, Figma and code; Contest notifications backend, Figma states and frontend); status lines on the rows named in docs/build-register.md Section 14; the B-034 cursor and ordering leak stays on B-034. NOT DECIDED HERE: the visibility threshold in item 6; the TOTP secret storage; the notification timing assumptions in item 16; whether the unpinned entry reaches the Community feed. Dated notes were appended (original text unchanged) to #369, #370, #372, #373 and #403 only; #275, #400, #402 and #396 are amended in substance by this entry but were not edited, #404 is the record. [2026-10-17: Item 16 (Contest notifications) is BUILT as B-122, backend only, in-app only (backend/w3c-contest-notifications, PR #417; docs/backend-w3c-contest-notifications-report.md): the calendar is computed in a new module (no Contest calendar existed in code; B-091 is not built), the BACKEND TO CONFIRM uniqueness key is Notification.dedupeKey (nullable, UNIQUE, additive migration 20261017160000), and (d) and (f) are implemented at the ASSUMED timings. Follow-up decisions in #405 close open points of this entry: the conflict between items 9 and 15 (item 1 of #405), 'actually visible' for carousel impressions (#405, item 7), the TOTP secret storage and the backup-code character set (#405, item 8), whether an unverified-email account receives Contest notifications (#405, item 4), the notification destinations (#405, item 2) and the legacy profile frames (#405, item 9). The roles that may use the DOB tools: #405, item 5.]</w:t>
+              <w:t>Resolved -- recorded; DECIDED, NOT BUILT, except item 12, whose judgment calls are already in the shipped code (backend/w3-gates, PR #412). Items 1-14 and 17 are founder-adopted defaults, veto-able; items 15 and 16 are founder decisions and are recorded as given. Item numbers below are the founder's own. (1) ACCOUNT INFORMATION. The Account Information (Edit) frames (2924:7112, 5649:8176) drop the Country field. The profile country lives in Edit Profile, which keeps the label 'Country' (#403, item 17; Figma pass I). The safeguarding country is never shown or edited. (2) PROFILE DESIGN DIRECTION. New auto-layout desktop profile frames (the pass H frames, desktop 6707:26595 and 6707:26727 / 6707:26938) replace the legacy absolute-layout profile frames (1455:4362, 1455:6626, 5702:8250, 5778:8490). Default added in recording, veto-able: the legacy frames are archived (hidden, 'ARCHIVED' prefix), not deleted; the #403 item 6 deletion exception covers only the ten Create Post layers. (3) ADMIN COMPONENTS. The F2 components (node 6671:27364) move to match the admin screens: Pill uses auto line height with padding 3/10; Button gets size variants; Banner and Callout Title become optional; radius/10 and radius/16 are added to the spacing and radius collection. They are then adopted on the Pass C and Pass F1 admin frames with no visible change. This settles the 'which side moves', 'radius scale' and 'optional Title' candidates of docs/figma-pass-g2-report.md; the adoption itself is open Figma work (B-113, B-095). (4) FORFEIT POP-UP. 'Contest page' means the Contest details page and the Voting page. When several weeks are forfeited, one pop-up opens after another, oldest week first. Closes the two SCOPE OPEN points of Figma pass G1 and refines #403, item 9 (every load, reason shown, nothing remembered: unchanged). (5) VOTE TOGGLE. The vote count updates live by one, in either direction, when the toggle flips. No banner appears on toggle. Closes the SCOPE OPEN point of Figma pass G1 (#401, #403 item 7). (6) CAROUSEL IMPRESSIONS. Final-week carousel views count as impressions when a tile is actually visible; tile order follows the balanced rotation of #388 (docs/contest-spec.md, section 10b). Closes the open point of #403, item 11 and of B-092. OPEN (not stated): what 'actually visible' means in numbers (share of the tile in view, time in view). (7) 2FA RECOVERY. 10 backup codes, shown once, each in 5-5 groups (interpretation: ten characters shown as two groups of five; the character set is not stated). Regenerating needs the password and invalidates the old set. Turning 2FA off invalidates the codes. A wrong code and an already-used code give the same 'not accepted' message. 5 wrong tries in 15 minutes lock recovery for 15 minutes (ASSUMED per account, not per IP; a per-account lock lets a stranger lock out an account holder, a trade-off to confirm). Password re-entry is needed only to turn off and to regenerate. The 'check your email' page reads the same for unknown accounts (non-enumerating). Backup codes appear after the 6-digit code is accepted, before the '2FA is on' screen. Entry points: a 'Can't scan?' link (manual key) and a Turn off control. Closes the backup-code format and entry-point open points of #402 and Figma pass H; STILL OPEN: storage and encryption of the TOTP secret, counsel (legal copy Part C row 44). (8) BLOCKED USERS LIST. No date is shown; the reason is not editable (unblock and re-block to change it); the reason is visible to the blocker only. A blocked user sees the blocker's profile as not found (settles the SCOPE OPEN 'blocked user's own view' of Figma pass H; whether a new not-found frame is needed or the app's existing not-found state is reused is a Figma follow-up). (9) PINNED FINAL ENTRY. Others see nothing before the reveal. After the reveal the entry is pinned on the finalist's profile until the contest ends at the end of that month; then the pin is removed and the entry is an ordinary post. The label stays 'Contest post'. Item 15 repeats and extends this; where the wording differs, item 15 prevails (see item 15). (10) BANTS. A room is a thread (BanterRoom is the thread; comments are the posts in it). Posting and commenting need NO membership. 'Join' stays as a bookmark that feeds My Bants. Moderation means reporting plus admin moderation. This SUPERSEDES the 'posting requires membership' point of #275 and closes the open points of #403 item 16 and of B-117 (thread mapping, no room membership, moderation scope). Recorded as an interpretation to confirm: no like-identities list is built (none exists today), so the Block clause about like identities leaves counts unchanged. Unchanged: 16-17 full access, under-16 fully disabled (#346), Block effects (#402 item 4). (11) BLOCK AND THE AGE RULES. Block applies on top of the age rules (#346, #347). The age rules apply first. A block never reveals itself: no response, count or error tells the blocked user they are blocked. Closes the open interaction point of #402 item 4 and B-039. (12) BACKEND W3 JUDGMENT CALLS. Calls 1-7 of docs/backend-w3-gates-report.md, section 5, are adopted: (1) the restricted-pending write block is uniform and covers the undo forms, while the unverified-email block covers only the creating forms; (2) read-state and kickoff-alert subscription routes stay open; (3) the profile gate covers posting-class routes only; (4) an open incorrect-details report blocks approval and card payment, not decline or withdraw, and survives a guardian-email change; (5) username set means profile complete; (6) the approval email links to /login; (7) displayName is no longer a fallback anywhere other users can see it. BUILT (PR #412). Forward-pointers on #369, #370, #372, #373 and #403. (13) CONTEST TAB ON DAY 1. From 00:00 to 08:00 on day 1 the Contest tab shows the Between Weeks state, variant 'Week 1 opens at 08:00'. Closes the open E6 point of #403. Note: this window is 8 hours, not the 12 hours of the Between Weeks state of #400. (14) STANDING FIGMA CHECK. The whole-canvas depth-4 get_metadata pull is replaced by a findAll count per top-level node plus a top-level id hash, taken before and after. Reason: the page holds about 139,000 nodes and the pull cannot return (docs/figma-pass-g1-report.md, docs/figma-pass-h-report.md). (15) FINAL-WEEK ENTRY JOURNEY. After the reveal, finalist names on the leaderboard Contest tab open the finalist's profile, where the entry is pinned. Final-week carousel tiles open the entry itself. The entry does not also appear as a normal Community-feed post; the carousel is the daily exposure (balanced rotation, #388). A tile shown in the viewport counts as an impression. The pin lasts until the contest ends at the end of that month, then it is removed (replaces the wording of item 9). Closes 'how other users reach a finalist's entry after the reveal' (#400 E10, #403). OPEN (not stated): whether the entry, once the pin is removed, then appears in the Community feed; item 9 says it becomes an ordinary post, item 15 says only that the pin is removed. (16) CONTEST NOTIFICATIONS (founder decision; the spec had none). In-app notifications, all times Europe/London, to every non-restricted account that is eligible for the Contest under the existing rules (docs/contest-spec.md, sections 6 and 8: minors included, restricted accounts excluded): (a) week opens, 08:00 on days 1, 8, 15, 22; (b) votes-closing reminder, 19:00 on days 7, 14, 21, only to eligible accounts that have not voted that week; (c) week result, when votes lock at 20:00 on days 7, 14, 21: winners announced to everyone, plus a personal notification to each winner; (d) final qualification: a personal notification to each finalist saying the entry stays hidden until the reveal; (e) reveal, 00:00 on day 25: 'The final is live' to everyone; (f) final result: the winners, or 'No winner this month'; (g) forfeits need no extra notification, the pop-up covers them; (h) finalist upload reminder, 12:00 on day 24, to finalists who have not uploaded (default added by Claude, veto-able). One notification per account per event; a re-run never duplicates. Push and email are not decided and stay deferred to launch gate B-090. Wording is functional and tagged [COPY PENDING LEGAL REVIEW] where it reaches minors. ASSUMED, to confirm: (d) is sent when the finalists are known, at the week-3 result (20:00 on day 21); (f) is sent at the end of the contest month, because the spec states no crown moment; a forfeited week sends no (c) notification; whether an account with an unverified email receives them is not stated. BACKEND TO CONFIRM: a uniqueness key per (account, event, contest cycle, week) is needed for 'never duplicates'; Notification.type is a free string, but NotificationsService and the Notification Centre must learn each new type (the age_milestone and match_kickoff precedent: an unrendered type shows a generic row). (17) REGISTER. New rows B-119 to B-123 (admin incorrect-details reports list and resolve, Figma and code; Contest notifications backend, Figma states and frontend); status lines on the rows named in docs/build-register.md Section 14; the B-034 cursor and ordering leak stays on B-034. NOT DECIDED HERE: the visibility threshold in item 6; the TOTP secret storage; the notification timing assumptions in item 16; whether the unpinned entry reaches the Community feed. Dated notes were appended (original text unchanged) to #369, #370, #372, #373 and #403 only; #275, #400, #402 and #396 are amended in substance by this entry but were not edited, #404 is the record. [2026-10-17: Item 16 (Contest notifications) is BUILT as B-122, backend only, in-app only (backend/w3c-contest-notifications, PR #417; docs/backend-w3c-contest-notifications-report.md): the calendar is computed in a new module (no Contest calendar existed in code; B-091 is not built), the BACKEND TO CONFIRM uniqueness key is Notification.dedupeKey (nullable, UNIQUE, additive migration 20261017160000), and (d) and (f) are implemented at the ASSUMED timings. Follow-up decisions in #405 close open points of this entry: the conflict between items 9 and 15 (item 1 of #405), 'actually visible' for carousel impressions (#405, item 7), the TOTP secret storage and the backup-code character set (#405, item 8), whether an unverified-email account receives Contest notifications (#405, item 4), the notification destinations (#405, item 2) and the legacy profile frames (#405, item 9). The roles that may use the DOB tools: #405, item 5.] [2026-10-18: Item 12 / B-034 built: cursor and ordering leak closed; lists order by username, cursors carry username and id only. Open points on the pin, the impression second and the notification wording are closed or amended by #406, items 5, 6 and 7.]</w:t>
             </w:r>
           </w:p>
         </w:tc>
@@ -27215,7 +27215,49 @@
           </w:tcPr>
           <w:p>
             <w:r>
-              <w:t>Resolved -- recorded. FOUNDER-ADOPTED DEFAULTS, VETO-ABLE, all ten items. Items 4, 5 and 6 confirm behaviour already in the shipped code (PR #416, PR #417); items 1, 2, 7, 8, 9 and 10 are DECIDED, NOT BUILT; item 3 confirms the existing design. Item numbers are the founder's own. Original text of every entry named in the forward-pointers below is unchanged (dated notes appended). (1) PIN REMOVED, FINAL ENTRY BECOMES AN ORDINARY POST. When the contest ends at the end of its month and the pin is removed (#404 items 9 and 15), the final entry becomes an ordinary post and appears in the Community feed like any other post. Closes the open point of #404 (item 9 said it becomes an ordinary post; item 15 said only that the pin is removed): item 9's reading stands for the end state. Unchanged: during the contest month the entry is not also a normal feed post; the carousel is the daily exposure. The pin removal and the flip are new build work (B-091, B-092, B-082); nothing exists. Not decided: the time of day of the flip. (2) NOTIFICATION DESTINATIONS AS DRAWN IN FIGMA PASS J2 (docs/figma-pass-j2-report.md, section 2). Week opens opens the Contest details page; votes closing opens the Voting page; week result opens the leaderboard Contest tab (that week's winners-in frame); finalist qualification and the finalist upload reminder open Create Post &gt; Contest, Upload Open; 'The final is live' opens the Final week carousel in the Community feed; final result opens the leaderboard Contest tab, Crowned frame (winners) or No Winner This Month frame. NO notification opens a profile. This settles candidates 1, 2 and 4 of that report's section 6 and supersedes the link list written in register row B-123 (reveal and final to the leaderboard Contest tab; winners to the finalist's profile). B-123 updated. (3) PERSONAL WINNER NOTIFICATION. It stays the existing contest_win row (#278), not duplicated and not replaced by a new type; there is no separate personal-winner row in the Notification Centre. Closes the J2 candidate 3 and the 'separate personal winner row' leg of B-121. (4) UNVERIFIED EMAIL. Accounts with an unverified email receive no Contest notifications. Closes the open point of #404 item 16. Matches B-122 as built (one filter constant). (5) DATE OF BIRTH TOOLS. Moderator and superadmin may read and correct a date of birth, and each view is audited. Closes the open point 'which admin roles may read a decrypted DOB' (B-109, #398 D4, #390). Matches B-103 and B-109 as built (PR #416): the correction audit row holds admin, target, reason, old and new tier and never a DOB; every response that contains a DOB writes a user.dob_viewed row and fails closed if that write fails. An editor cannot use either. (6) GUARDIAN RESEND STAYS EMAIL-KEYED. The resend route stays the existing POST /auth/guardian-consent/resend, keyed by the minor's registered email and rate-limited, not JWT. Clarifies the words 'existing authenticated resend' in #402 item 1 and #389 (the authenticated route is change-guardian-email, #365). Matches B-110 as built. Implication, not a decision: the in-account decline page calls the resend route with the account's own registered email. (7) CAROUSEL IMPRESSION THRESHOLD. A carousel tile counts as an impression when at least 50 percent of it is in view for at least 1 second. Closes the OPEN threshold of #404 items 6 and 15 and of B-092. Not stated: whether the second must be continuous and whether a tile counts again on re-entry; the per-viewer daily cap and the tolerance of #388 are unchanged. (8) 2FA. Backup codes are 10 characters shown in two groups of five (5-5), upper-case letters and digits without 0, O, 1 and I; stored hashed (#402); single use. The TOTP secret is encrypted at rest with the existing date-of-birth encryption (AES-256-GCM, DOB_ENCRYPTION_KEY, #362). Recovery lockout stays per account (5 wrong tries in 15 minutes lock recovery for 15 minutes). Closes the character-set, TOTP-secret-storage and per-account-or-per-IP points of #404 item 7 and #402 item 5. Consequences recorded for the founder, not decisions: one key now protects both date-of-birth and TOTP secrets, so loss or rotation of DOB_ENCRYPTION_KEY affects both (docs/dob-encryption-rollback.md covers date of birth only); a per-account lock lets a stranger lock out an account holder (the trade-off #404 already named). Counsel (legal copy Part C row 44) still open. (9) LEGACY PROFILE FRAMES. The legacy absolute-layout profile frames 1455:4362, 1455:6626, 5702:8250 and 5778:8490 are archived (hidden, ARCHIVED prefix), not deleted. Confirms the default of #404 item 2; the Figma work is still owed (B-113, B-082). (10) FIGMA COMPONENT ADOPTION. The Field component, the eight Dialogs and the eight Tables that Figma pass J did not adopt stay local frames; the 257 hidden ARCHIVED originals left by that pass stay until the launch gate (B-090). Settles the 'still open' adoption of pass J (B-113, B-095). Not decided: whether the 257 are deleted at the gate. (REGISTER) New rows B-124 (pending-copy guard), B-125 (apps/web onboarding routing on the server's nextStep) and B-126 (OPEN, no decision: declined-at-1-or-2 rows have no expiry); status lines on B-015, B-030, B-082, B-086, B-087, B-090, B-091, B-092, B-095, B-102, B-103, B-104, B-109, B-110, B-111, B-113, B-121, B-122, B-123; the BUILT lines of B-102, B-103, B-109, B-110 and B-122 (PR #416, PR #417) were already present and were verified, not duplicated. 126 B-IDs; 146 gap frames unchanged. Arithmetic: docs/build-register.md Section 19. (FORWARD-POINTERS) Dated notes appended (original text unchanged) to #337, #338, #339, #340, #365, #372, #375, #389, #390, #395, #398, #402, #403 and #404. NOT DECIDED HERE: the pending-copy guard's exact scope (the instruction named it but its definition did not arrive; B-124 is Claude's reading of the name and the repo, to confirm or replace); whether a row declined at 1 or 2 should expire, be reminded or be left alone (B-126, OPEN); the time of day of the pin-removal flip; continuity of the 1-second view; whether the 257 archived originals are deleted at the launch gate; counsel wording for every [COPY PENDING LEGAL REVIEW] item.</w:t>
+              <w:t>Resolved -- recorded. FOUNDER-ADOPTED DEFAULTS, VETO-ABLE, all ten items. Items 4, 5 and 6 confirm behaviour already in the shipped code (PR #416, PR #417); items 1, 2, 7, 8, 9 and 10 are DECIDED, NOT BUILT; item 3 confirms the existing design. Item numbers are the founder's own. Original text of every entry named in the forward-pointers below is unchanged (dated notes appended). (1) PIN REMOVED, FINAL ENTRY BECOMES AN ORDINARY POST. When the contest ends at the end of its month and the pin is removed (#404 items 9 and 15), the final entry becomes an ordinary post and appears in the Community feed like any other post. Closes the open point of #404 (item 9 said it becomes an ordinary post; item 15 said only that the pin is removed): item 9's reading stands for the end state. Unchanged: during the contest month the entry is not also a normal feed post; the carousel is the daily exposure. The pin removal and the flip are new build work (B-091, B-092, B-082); nothing exists. Not decided: the time of day of the flip. (2) NOTIFICATION DESTINATIONS AS DRAWN IN FIGMA PASS J2 (docs/figma-pass-j2-report.md, section 2). Week opens opens the Contest details page; votes closing opens the Voting page; week result opens the leaderboard Contest tab (that week's winners-in frame); finalist qualification and the finalist upload reminder open Create Post &gt; Contest, Upload Open; 'The final is live' opens the Final week carousel in the Community feed; final result opens the leaderboard Contest tab, Crowned frame (winners) or No Winner This Month frame. NO notification opens a profile. This settles candidates 1, 2 and 4 of that report's section 6 and supersedes the link list written in register row B-123 (reveal and final to the leaderboard Contest tab; winners to the finalist's profile). B-123 updated. (3) PERSONAL WINNER NOTIFICATION. It stays the existing contest_win row (#278), not duplicated and not replaced by a new type; there is no separate personal-winner row in the Notification Centre. Closes the J2 candidate 3 and the 'separate personal winner row' leg of B-121. (4) UNVERIFIED EMAIL. Accounts with an unverified email receive no Contest notifications. Closes the open point of #404 item 16. Matches B-122 as built (one filter constant). (5) DATE OF BIRTH TOOLS. Moderator and superadmin may read and correct a date of birth, and each view is audited. Closes the open point 'which admin roles may read a decrypted DOB' (B-109, #398 D4, #390). Matches B-103 and B-109 as built (PR #416): the correction audit row holds admin, target, reason, old and new tier and never a DOB; every response that contains a DOB writes a user.dob_viewed row and fails closed if that write fails. An editor cannot use either. (6) GUARDIAN RESEND STAYS EMAIL-KEYED. The resend route stays the existing POST /auth/guardian-consent/resend, keyed by the minor's registered email and rate-limited, not JWT. Clarifies the words 'existing authenticated resend' in #402 item 1 and #389 (the authenticated route is change-guardian-email, #365). Matches B-110 as built. Implication, not a decision: the in-account decline page calls the resend route with the account's own registered email. (7) CAROUSEL IMPRESSION THRESHOLD. A carousel tile counts as an impression when at least 50 percent of it is in view for at least 1 second. Closes the OPEN threshold of #404 items 6 and 15 and of B-092. Not stated: whether the second must be continuous and whether a tile counts again on re-entry; the per-viewer daily cap and the tolerance of #388 are unchanged. (8) 2FA. Backup codes are 10 characters shown in two groups of five (5-5), upper-case letters and digits without 0, O, 1 and I; stored hashed (#402); single use. The TOTP secret is encrypted at rest with the existing date-of-birth encryption (AES-256-GCM, DOB_ENCRYPTION_KEY, #362). Recovery lockout stays per account (5 wrong tries in 15 minutes lock recovery for 15 minutes). Closes the character-set, TOTP-secret-storage and per-account-or-per-IP points of #404 item 7 and #402 item 5. Consequences recorded for the founder, not decisions: one key now protects both date-of-birth and TOTP secrets, so loss or rotation of DOB_ENCRYPTION_KEY affects both (docs/dob-encryption-rollback.md covers date of birth only); a per-account lock lets a stranger lock out an account holder (the trade-off #404 already named). Counsel (legal copy Part C row 44) still open. (9) LEGACY PROFILE FRAMES. The legacy absolute-layout profile frames 1455:4362, 1455:6626, 5702:8250 and 5778:8490 are archived (hidden, ARCHIVED prefix), not deleted. Confirms the default of #404 item 2; the Figma work is still owed (B-113, B-082). (10) FIGMA COMPONENT ADOPTION. The Field component, the eight Dialogs and the eight Tables that Figma pass J did not adopt stay local frames; the 257 hidden ARCHIVED originals left by that pass stay until the launch gate (B-090). Settles the 'still open' adoption of pass J (B-113, B-095). Not decided: whether the 257 are deleted at the gate. (REGISTER) New rows B-124 (pending-copy guard), B-125 (apps/web onboarding routing on the server's nextStep) and B-126 (OPEN, no decision: declined-at-1-or-2 rows have no expiry); status lines on B-015, B-030, B-082, B-086, B-087, B-090, B-091, B-092, B-095, B-102, B-103, B-104, B-109, B-110, B-111, B-113, B-121, B-122, B-123; the BUILT lines of B-102, B-103, B-109, B-110 and B-122 (PR #416, PR #417) were already present and were verified, not duplicated. 126 B-IDs; 146 gap frames unchanged. Arithmetic: docs/build-register.md Section 19. (FORWARD-POINTERS) Dated notes appended (original text unchanged) to #337, #338, #339, #340, #365, #372, #375, #389, #390, #395, #398, #402, #403 and #404. NOT DECIDED HERE: the pending-copy guard's exact scope (the instruction named it but its definition did not arrive; B-124 is Claude's reading of the name and the repo, to confirm or replace); whether a row declined at 1 or 2 should expire, be reminded or be left alone (B-126, OPEN); the time of day of the pin-removal flip; continuity of the 1-second view; whether the 257 archived originals are deleted at the launch gate; counsel wording for every [COPY PENDING LEGAL REVIEW] item. [2026-10-18: Amended by #406. Item 5 (date of birth tools): User Detail no longer shows the DOB; it appears only on the correction form and the server rejects a reason containing a date (#406, item 4); roles unchanged. Open points closed: the time of the pin-removal flip of item 1 (00:00 London time on the 1st, #406 item 5) and the continuous-second and re-entry points of item 7 (#406 item 6).]</w:t>
+            </w:r>
+          </w:p>
+        </w:tc>
+      </w:tr>
+      <w:tr>
+        <w:tc>
+          <w:tcPr>
+            <w:tcW w:type="dxa" w:w="500"/>
+          </w:tcPr>
+          <w:p>
+            <w:r>
+              <w:t>406</w:t>
+            </w:r>
+          </w:p>
+        </w:tc>
+        <w:tc>
+          <w:tcPr>
+            <w:tcW w:type="dxa" w:w="4700"/>
+          </w:tcPr>
+          <w:p>
+            <w:r>
+              <w:t>Founder decisions 2026-10-18 (13 items): a guardian-consent row declined at decline 1 or 2 and not reopened within 14 days takes the same lapse path as an unanswered request; the onboarding, guardian and consent screens move to the light theme; a rate-limited resend-verification-email endpoint is added; User Detail reads without the date of birth, the DOB appears only on the correction form and the server rejects a correction reason that contains a date; the pin is removed at 00:00 London time on the 1st; the 1-second impression view is continuous and re-entry counts again within the daily cap; notification icons as drawn and the Notification Centre empty-state and coming-soon lines mention Contest; username change cooldown, one free correction, no hold on a handle the user releases; the incorrect-details screen as drawn in Figma pass K; restricted minors may open pages by URL read-only; the status response adds the guardian's first name and the last decision date; a blocked user's not-found view is identical to the generic one; the guardian confirm page footnote is replaced.</w:t>
+            </w:r>
+          </w:p>
+        </w:tc>
+        <w:tc>
+          <w:tcPr>
+            <w:tcW w:type="dxa" w:w="1850"/>
+          </w:tcPr>
+          <w:p>
+            <w:r>
+              <w:t>docs/decisions-founder-2026-10-18 (docs only, 2026-10-18; founder decisions 2026-10-18, items 1-13 and the register instructions; docs/build-register.md Section 22, docs/contest-spec.md Section 14g, docs/pending-copy-manifest.md, docs/figma-archive-index.md, CLAUDE.md; sources docs/backend-w4-username-report.md section 7, docs/fc2-gates-routing-report.md, docs/figma-pass-k-report.md)</w:t>
+            </w:r>
+          </w:p>
+        </w:tc>
+        <w:tc>
+          <w:tcPr>
+            <w:tcW w:type="dxa" w:w="2300"/>
+          </w:tcPr>
+          <w:p>
+            <w:r>
+              <w:t>Resolved -- recorded. FOUNDER-ADOPTED DEFAULTS, VETO-ABLE, all thirteen items. DECIDED, NOT BUILT, except item 8 (as built in W4, PR #420), item 9 (the drawing exists, Figma pass K) and item 10 (as built in FC2, PR #421), which confirm what already exists. Item numbers are the founder's own. Original text of every entry named in the forward-pointers below is unchanged (dated notes appended). (1) DECLINED-AT-1-OR-2 ROWS EXPIRE (closes B-126 in principle). A guardian-consent row declined at decline 1 or 2 and not reopened (no resend, no change of guardian email) within 14 days (a configuration value) takes the same lapse path as an unanswered request (#337-#340, #389). The backend agent confirms the mechanics before building: where the 14 days start, whether the one automatic re-send and warning comes first or the row goes straight to the second-lapse outcome, and that an expiry does not count among the three declines (#389). Resolves, in principle, the conflict with legal copy v0.8 Part 4.4 (a minor's account cannot remain restricted-pending indefinitely); counsel still to review; the legal copy is not edited here. (2) LIGHT THEME. The onboarding, guardian and consent screens in apps/web move to the light theme to match their Figma frames: Age Gate, Guardian Details, Guardian Consent, Verify Email and its prompt, Create Profile and the Club Picker step (the set the FC2 browser check found dark). No new colour. Build row B-127. (3) RESEND VERIFICATION. A rate-limited resend-verification-email endpoint is added; #37 recorded that none exists. The limits, and who may call it, are set in the build PR and are not decided here. Build row B-128. (4) DATE OF BIRTH ON USER DETAIL. User Detail reads without the date of birth; the DOB appears only on the correction form; the server rejects a correction reason that contains a date. Amends #405 item 5 and #398 D4 (GET /admin/users/:id returned the decrypted DOB, each view audited): roles are unchanged (moderator and superadmin). For the backend agent to confirm: how the form gets the current DOB (a separate read), whether that read is audited like user.dob_viewed, and which date formats the reason check rejects (a reason cannot be proven free of every date form). Build row B-129. (5) PIN REMOVAL TIME. The pin is removed from the finalist's profile at 00:00 Europe/London on the 1st of the month after the contest month, and at that moment the final entry becomes an ordinary Community-feed post. Closes the 'time of day of the flip' open point of #405 item 1. B-091, B-092, B-082. (6) IMPRESSION SECOND. The 1-second view of #405 item 7 is continuous (the tile stays at least 50 percent in view for one uninterrupted second); a re-entry counts again, within the per-viewer daily cap of #388 (week 4 only). Closes the two 'not stated' points of #405 item 7. B-092. (7) NOTIFICATIONS. Notification icons as drawn in Figma pass K are accepted; the Notification Centre empty-state line and the coming-soon line are updated to mention Contest. Observation, not a decision: the coming-soon line written under #279 already names 'Contest activity' as upcoming, which is no longer true now that Contest notifications exist; the Figma agent sets the final wording. B-121, B-123. (8) USERNAME. A 30-day change cooldown with one free correction (as built, B-032) and no hold on a handle the user releases; the 30-day hold applies to an admin revoke only (#398 D3, #402 item 3). Not addressed: a handle released by anonymisation is released immediately as built; whether to hold it is not decided. B-032, B-033. (9) INCORRECT-DETAILS SCREEN. The founder accepts the admin screen as drawn in Figma pass K (8 frames, docs/figma-pass-k-report.md); B-120 builds from it, with no field, column or control beyond the frames. The four SCOPE OPEN notes of that pass (confirmation step, host sidebar item, success message, link to User Detail) are settled only where the drawing settles them. B-119, B-120. (10) RESTRICTED MINORS. A restricted-pending minor may open pages by URL read-only; there is no front-end route block and the server still blocks every write (#370, #12). Confirms the shipped behaviour. B-026, B-125, B-076. (11) STATUS RESPONSE. The status response adds the guardian's first name and the last decision date, never the decline count. The founder did not name the response; the reading is the minor's GET /auth/guardian-consent/status. For the backend agent to confirm: how a first name is derived from the single full-name field (Option A, #393), what 'last decision' covers (decline, approval, withdrawal) and whether a column is needed (the schema has no decline timestamp). Build row B-131. (12) BLOCKED NOT-FOUND. A blocked user's not-found view is identical to the generic not-found view and to a non-existent profile (same page, same status; nothing reveals a block). Confirms #404/#396 and the Figma pass K frames. B-007, B-039, B-082, B-108. (13) GUARDIAN CONFIRM FOOTNOTE. The footnote 'Declining closes the account and schedules it for deletion' on the guardian confirm page is wrong for declines 1 and 2; it is replaced by the existing cap sentence addressed to the guardian, tagged [COPY PENDING LEGAL REVIEW]. The change alters guardian-visible wording, so CONSENT_SCREEN_VERSION is bumped (v3 to v4) with the tripwire hash (#348) and the pending-copy manifest row is replaced. Found while checking, NOT covered by the founder's wording: the page's post-decline state ('Your decision has been recorded ... will be scheduled for deletion') has the same fault. Build row B-130. (REGISTER) B-124 scope is apps/web and apps/admin only (as built); the services/api email wording tagged [COPY PENDING LEGAL REVIEW] is added to docs/pending-copy-manifest.md as OPEN (three templates tagged in code comments: guardian-approved-minor, the third-decline guardian-consent-declined, username-revoked; other child- and guardian-facing templates carry no tag). New rows B-127 to B-139: B-127 light theme, B-128 resend verification, B-129 User Detail without the DOB, B-130 guardian confirm footnote, B-131 status response fields, B-132 horizontal overflow at 390 px, B-133 Edit Profile username (never send null; show the error codes), B-134 real-API end-to-end smoke test, B-135 Figma approval-on-hold, B-136 Figma verify-email prompt, B-137 Figma guardian fields of the DOB correction, B-138 Figma general profile frames (plain other-user; own Posts, Media, Saved) that must exist before the four legacy profile frames 1455:4362, 1455:6626, 5702:8250 and 5778:8490 can be archived, B-139 RevokedUsername retention and appeal path (OPEN, no decision). Status lines on 27 register rows. 139 B-IDs; 146 gap frames unchanged. Arithmetic: docs/build-register.md Section 22. (FORWARD-POINTERS) Dated notes appended (original text unchanged) to #364, #367, #368, #369, #398, #402 and #404 (from docs/backend-w4-username-report.md section 7) and to #37, #389, #395 and #405 (points #406 amends or closes). NOT DECIDED HERE: the retention and appeal path of RevokedUsername (B-139, OPEN); the mechanics of item 1; the limits of item 3; the form of the DOB read in item 4; the final wording of item 7; the response and derivation in item 11; the post-decline state in item 13; whether the pending-copy guard is ever extended to services/api; counsel wording of every [COPY PENDING LEGAL REVIEW] string.</w:t>
             </w:r>
           </w:p>
         </w:tc>

</xml_diff>

<commit_message>
docs: Decision Log #407 (QA defects), register B-140 to B-162, Section 25
Records the founder's 2026-10-18 decisions on the end-to-end QA report
(CORS, server-side age-5 floor, username CONTAINS filter, no 'follow'
promise, guardian approval wording, stale-decline re-send stays, archive
1460:8940). Maps QA D-01..D-17 and G-1..G-3, the W3d open items and K2
candidates 1-10 to register rows; D-01 and D-02 marked BLOCKER /
SAFEGUARDING. Dated notes appended to 16 Decision Log rows. Docs only.

Co-Authored-By: Claude Sonnet 5.5 <noreply@anthropic.com>
</commit_message>
<xml_diff>
--- a/docs/Soccernity_MVP_Build_Plan_v1.7.docx
+++ b/docs/Soccernity_MVP_Build_Plan_v1.7.docx
@@ -10153,7 +10153,7 @@
                 <w:sz w:val="19"/>
                 <w:szCs w:val="19"/>
               </w:rPr>
-              <w:t xml:space="preserve">Resolved and implemented — PR #38 shipped MINIMUM_SIGNUP_AGE = 5 in AgeGateStep.tsx, backed by 7 tests</w:t>
+              <w:t>Resolved and implemented — PR #38 shipped MINIMUM_SIGNUP_AGE = 5 in AgeGateStep.tsx, backed by 7 tests [2026-10-18: QA run (PR #426, docs/qa-e2e-onboarding-report.md), D-02: the age-5 floor is enforced only in the web Age Gate; POST /auth/register with a date of birth 4 years ago and a valid guardian block returns 201 and creates the account and the guardian request, because age.util.ts leaves the floor to the frontend. Decided 2026-10-18 (#407, item 2): the floor is enforced server-side with a 400. Register row B-141.]</w:t>
             </w:r>
           </w:p>
         </w:tc>
@@ -18163,7 +18163,7 @@
           <w:p>
             <w:r>
               <w:rPr/>
-              <w:t>FOLDED IN (sprint-2/decision-log-204-208-cleanup, figma-design-system): this gotcha is now recorded in CLAUDE.md's new standing "Figma-authoring gotchas" subsection (under "Figma notes") so future sessions don't lose time rediscovering it. That subsection did not actually exist before this session -- created it, seeded with this entry, Decision Log #201, and the frame.resize()-on-GROUPs gotcha. The file-wide audit for other occurrences of this pattern this entry's own text flagged as not yet attempted remains open.</w:t>
+              <w:t>FOLDED IN (sprint-2/decision-log-204-208-cleanup, figma-design-system): this gotcha is now recorded in CLAUDE.md's new standing "Figma-authoring gotchas" subsection (under "Figma notes") so future sessions don't lose time rediscovering it. That subsection did not actually exist before this session -- created it, seeded with this entry, Decision Log #201, and the frame.resize()-on-GROUPs gotcha. The file-wide audit for other occurrences of this pattern this entry's own text flagged as not yet attempted remains open. [2026-10-18: Figma pass K2 (docs/figma-pass-k2-report.md section 1f): on the Admin Shell component set 37 of the 38 unbound paints per variant were bound (PNG export byte-identical in all 10 variants). Rectangle 223 (the sidebar wash, navy 12%) stays a literal unbound paint because of this entry. The grey (#D9D9D9) boolean-operation fills were bound to color/icon/inactive because no solid grey token exists: open question, register row B-149.]</w:t>
             </w:r>
           </w:p>
         </w:tc>
@@ -24300,7 +24300,7 @@
           </w:tcPr>
           <w:p>
             <w:r>
-              <w:t>Resolved — implemented and flagged, not added silently, per CLAUDE.md's "the data model is a fixed spec" rule. Migration 20260919132732_add_guardian_decline_withdrawal_expiry_fields is purely additive (three nullable columns + a unique index + a sweep index @@index([consentStatus, consentTokenExpiresAt]); zero ALTER/DROP on anything existing). consentAutoResentAt defaults to NULL so every Guardian row already in flight at deploy gets its one automatic re-send — no existing pending account is fast-tracked to deletion. User/Guardian safeguarding fields untouched. [2026-10-17: A fourth Guardian column was added after this entry: declineCount (INTEGER NOT NULL DEFAULT 0, CHECK &gt;= 0, migration 20261017140000_add_guardian_decline_count, additive; backfilled to 1 for rows already explicitly declined under the old rule). Internal; no API returns it. A decline is no longer terminal for declines 1 and 2: an explicit decline with fewer than three recorded can be reopened as pending (B-110, B-102; backend/w3b-decline-cap-dob-correction, PR #416; docs/backend-w3b-report.md, section 7). Withdrawal, expiry and the third decline are never reopenable.]</w:t>
+              <w:t>Resolved — implemented and flagged, not added silently, per CLAUDE.md's "the data model is a fixed spec" rule. Migration 20260919132732_add_guardian_decline_withdrawal_expiry_fields is purely additive (three nullable columns + a unique index + a sweep index @@index([consentStatus, consentTokenExpiresAt]); zero ALTER/DROP on anything existing). consentAutoResentAt defaults to NULL so every Guardian row already in flight at deploy gets its one automatic re-send — no existing pending account is fast-tracked to deletion. User/Guardian safeguarding fields untouched. [2026-10-17: A fourth Guardian column was added after this entry: declineCount (INTEGER NOT NULL DEFAULT 0, CHECK &gt;= 0, migration 20261017140000_add_guardian_decline_count, additive; backfilled to 1 for rows already explicitly declined under the old rule). Internal; no API returns it. A decline is no longer terminal for declines 1 and 2: an explicit decline with fewer than three recorded can be reopened as pending (B-110, B-102; backend/w3b-decline-cap-dob-correction, PR #416; docs/backend-w3b-report.md, section 7). Withdrawal, expiry and the third decline are never reopenable.] [2026-10-18: The unanswered-request path now has a second entry: a row declined at decline 1 or 2 and not reopened within 14 days (GUARDIAN_DECLINE_LAPSE_DAYS, counted from Guardian.consentDeclinedAt) is reopened as pending with a fresh token and the minor is warned; if that request also lapses, the existing expiry sweep closes the account (pending deletion, 30-day grace). Closure by this route is an expiry, not a fourth decline. Built as B-126 (PR #424, docs/backend-w3d-report.md section 7; #406 item 1).]</w:t>
             </w:r>
           </w:p>
         </w:tc>
@@ -24342,7 +24342,7 @@
           </w:tcPr>
           <w:p>
             <w:r>
-              <w:t>Resolved - IMPLEMENTED (sprint-1/guardian-consent-decline-source, migration 20260919160000_guardian_consent_status_check_and_decline_source; purely additive). (a) Guardian.consentStatus now has a Postgres CHECK constraint restricting it to pending | confirmed | declined - a CHECK, NOT a Prisma enum, so the column stays a String in the generated TS type and the free-form-string convention of its six sibling columns is untouched (those remain unconstrained; extending the pattern to them was not done and is not part of this resolution). (b) Rather than adding distinct "withdrawn"/"expired" consentStatus values (which would have changed every consentStatus reader, all of which are allowlists on "confirmed"/"declined"), the distinction is carried by a new nullable column Guardian.consentDeclineSource = guardian_explicit | guardian_withdrawal | expiry_timeout (also CHECK-constrained; NULL for any row not declined and for every row declined before this migration - those are not backfilled, since their cause is not recoverable). It is written in exactly one place, GuardianConsentService.refuseConsentAndScheduleDeletion(), which the decline, withdraw and expiry-sweep paths all converge on; the first refusal wins (the existing not-already-declined write guard makes a repeat a no-op). An active decline is therefore now distinguishable from a silent timeout on the live Guardian row. NOT changed / still open: ConsentAuditRecord does not snapshot consentDeclineSource (its shape was deliberately left alone), so once the 30-day sweep hard-deletes the Guardian row the source is no longer retained anywhere - whether it should be added to the audit snapshot is a founder/counsel call, since that record is what survives as consent proof. [2026-10-17: consentStatus 'declined' is still one of the three CHECK-constrained values, but it no longer always means a final refusal: after decline 1 or 2 the row is 'declined' with consentDeclineSource 'guardian_explicit' and the account stays active; resend or change-guardian-email reopens it as 'pending' and clears consentDeclineSource (built, PR #416). Withdrawal and expiry rows are never reopened. The source is still not snapshotted into ConsentAuditRecord (unchanged).]</w:t>
+              <w:t>Resolved - IMPLEMENTED (sprint-1/guardian-consent-decline-source, migration 20260919160000_guardian_consent_status_check_and_decline_source; purely additive). (a) Guardian.consentStatus now has a Postgres CHECK constraint restricting it to pending | confirmed | declined - a CHECK, NOT a Prisma enum, so the column stays a String in the generated TS type and the free-form-string convention of its six sibling columns is untouched (those remain unconstrained; extending the pattern to them was not done and is not part of this resolution). (b) Rather than adding distinct "withdrawn"/"expired" consentStatus values (which would have changed every consentStatus reader, all of which are allowlists on "confirmed"/"declined"), the distinction is carried by a new nullable column Guardian.consentDeclineSource = guardian_explicit | guardian_withdrawal | expiry_timeout (also CHECK-constrained; NULL for any row not declined and for every row declined before this migration - those are not backfilled, since their cause is not recoverable). It is written in exactly one place, GuardianConsentService.refuseConsentAndScheduleDeletion(), which the decline, withdraw and expiry-sweep paths all converge on; the first refusal wins (the existing not-already-declined write guard makes a repeat a no-op). An active decline is therefore now distinguishable from a silent timeout on the live Guardian row. NOT changed / still open: ConsentAuditRecord does not snapshot consentDeclineSource (its shape was deliberately left alone), so once the 30-day sweep hard-deletes the Guardian row the source is no longer retained anywhere - whether it should be added to the audit snapshot is a founder/counsel call, since that record is what survives as consent proof. [2026-10-17: consentStatus 'declined' is still one of the three CHECK-constrained values, but it no longer always means a final refusal: after decline 1 or 2 the row is 'declined' with consentDeclineSource 'guardian_explicit' and the account stays active; resend or change-guardian-email reopens it as 'pending' and clears consentDeclineSource (built, PR #416). Withdrawal and expiry rows are never reopened. The source is still not snapshotted into ConsentAuditRecord (unchanged).] [2026-10-18: See #337: the unanswered-request path now has a second entry (a stale decline, B-126). QA run (PR #426) confirmed the status values pending, confirmed and declined are never folded together by the login routing.]</w:t>
             </w:r>
           </w:p>
         </w:tc>
@@ -24394,7 +24394,7 @@
           </w:p>
           <w:p>
             <w:r>
-              <w:t>RESOLVED, residual gap closed by sprint-2/contest-admin-entries-withdrawn-consent-redaction (2026-09-28): the residual gap flagged above -- toAdminEntry()/AdminContestEntry's raw round.entries array (GET /admin/contest/cycles/:id and .../current's rounds[].entries, exposed to a judging admin before winners are even decided) still showing a withdrawn entrant's real displayName and full post content (contentText/mediaUrls) unredacted -- is now also closed. A new collectAdminDetailUserIds() helper folds round.entries[].userId into the same batched getWithdrawnConsentUserIds() Guardian lookup (an entrant who never won a round was never covered by collectGraphUserIds()'s winners/standings-only scan), and toAdminEntry() redacts entrant.displayName and post.contentText/mediaUrls to the same “Entry withdrawn — guardian consent revoked” placeholder toWeeklyWinners()/toStandings() already use in admin mode -- entryId, submittedAt, post.id/createdAt/likeCount/commentCount, and position stay real, since an admin still needs them to reconcile round judging. Covered by 3 new mocked unit tests mirroring the existing admin-redaction tests (contest.service.spec.ts): a withdrawn round winner redacted in both weeklyWinners AND the raw entries array in the same response; a withdrawn entrant who never won a round (proving the batched lookup now sees entries beyond winners/standings) alongside a non-withdrawn entrant left untouched; and the same entries-redaction proved on getCurrentContestForAdmin. No e2e spec added, same reasoning as the original resolution -- a plain findMany-then-filter/map change, no raw SQL/transaction/new relation. [2026-10-17: Observation from the code, not re-tested: the withdrawn-consent lookup in ContestService keys off Guardian.consentStatus = 'declined'. Since PR #416 a 'declined' row can exist on an ACTIVE account after decline 1 or 2. That state is pre-approval (Contest entry needs confirmed consent), so no entry should exist to redact; the redaction logic was not changed.]</w:t>
+              <w:t>RESOLVED, residual gap closed by sprint-2/contest-admin-entries-withdrawn-consent-redaction (2026-09-28): the residual gap flagged above -- toAdminEntry()/AdminContestEntry's raw round.entries array (GET /admin/contest/cycles/:id and .../current's rounds[].entries, exposed to a judging admin before winners are even decided) still showing a withdrawn entrant's real displayName and full post content (contentText/mediaUrls) unredacted -- is now also closed. A new collectAdminDetailUserIds() helper folds round.entries[].userId into the same batched getWithdrawnConsentUserIds() Guardian lookup (an entrant who never won a round was never covered by collectGraphUserIds()'s winners/standings-only scan), and toAdminEntry() redacts entrant.displayName and post.contentText/mediaUrls to the same “Entry withdrawn — guardian consent revoked” placeholder toWeeklyWinners()/toStandings() already use in admin mode -- entryId, submittedAt, post.id/createdAt/likeCount/commentCount, and position stay real, since an admin still needs them to reconcile round judging. Covered by 3 new mocked unit tests mirroring the existing admin-redaction tests (contest.service.spec.ts): a withdrawn round winner redacted in both weeklyWinners AND the raw entries array in the same response; a withdrawn entrant who never won a round (proving the batched lookup now sees entries beyond winners/standings) alongside a non-withdrawn entrant left untouched; and the same entries-redaction proved on getCurrentContestForAdmin. No e2e spec added, same reasoning as the original resolution -- a plain findMany-then-filter/map change, no raw SQL/transaction/new relation. [2026-10-17: Observation from the code, not re-tested: the withdrawn-consent lookup in ContestService keys off Guardian.consentStatus = 'declined'. Since PR #416 a 'declined' row can exist on an ACTIVE account after decline 1 or 2. That state is pre-approval (Contest entry needs confirmed consent), so no entry should exist to redact; the redaction logic was not changed.] [2026-10-18: See #337: the unanswered-request path now has a second entry (a stale decline, B-126).]</w:t>
             </w:r>
           </w:p>
         </w:tc>
@@ -24436,7 +24436,7 @@
           </w:tcPr>
           <w:p>
             <w:r>
-              <w:t>Resolved — implemented and flagged as a genuine spec-gap addition, the same shape as Decision Log #295 (POST /reports) and #297 (GET /admin/articles). All three carry @AuthRateLimit() and no guard, matching confirm's token-is-the-credential trust model. The withdrawal link is only ever emailed to Guardian.email, so taking the minor's email as input reveals and grants nothing. UX consequence flagged for the frontend ticket: a guardian withdrawing must enter the child's registered email, not their own. [2026-10-17: The three withdrawal routes are unchanged. A withdrawal row is never reopenable, unlike an explicit decline at 1 or 2 (PR #416; docs/backend-w3b-report.md, section 7). See #337 and #338.]</w:t>
+              <w:t>Resolved — implemented and flagged as a genuine spec-gap addition, the same shape as Decision Log #295 (POST /reports) and #297 (GET /admin/articles). All three carry @AuthRateLimit() and no guard, matching confirm's token-is-the-credential trust model. The withdrawal link is only ever emailed to Guardian.email, so taking the minor's email as input reveals and grants nothing. UX consequence flagged for the frontend ticket: a guardian withdrawing must enter the child's registered email, not their own. [2026-10-17: The three withdrawal routes are unchanged. A withdrawal row is never reopenable, unlike an explicit decline at 1 or 2 (PR #416; docs/backend-w3b-report.md, section 7). See #337 and #338.] [2026-10-18: See #337: the unanswered-request path now has a second entry (a stale decline, B-126). The withdrawal routes were not exercised by the QA run (PR #426 lists guardian withdrawal as not covered).]</w:t>
             </w:r>
           </w:p>
         </w:tc>
@@ -25640,7 +25640,7 @@
           </w:tcPr>
           <w:p>
             <w:r>
-              <w:t>Resolved -- decided, NOT yet built. Country is mandatory at the Age Gate for every registrant (declared by the user). At Register the server derives the country from the request IP using a LOCAL MaxMind GeoLite2 database: the IP is read transiently in memory, is never stored, and no third party sees it. Stored: declared code, derived code, derivation method, timestamp. The DERIVED code is authoritative for safeguarding checks (US under-13 card verification) and for demographic grouping; an unresolved lookup applies the stronger control. Residual risk: VPN/Tor spoofing (DPIA item -- listed in the PR description; the DPIA draft is locked and was not edited). Supersedes the design in which only Guardian.declaredCountry (self-declared, never verified) decided whether card verification applied. OPEN: GeoLite2 licence terms and its refresh process need an owner; counsel to confirm the transient-IP-processing disclosure. [2026-10-18: RegisterDto.countryCode is required (apps/web sends it since B-073).]</w:t>
+              <w:t>Resolved -- decided, NOT yet built. Country is mandatory at the Age Gate for every registrant (declared by the user). At Register the server derives the country from the request IP using a LOCAL MaxMind GeoLite2 database: the IP is read transiently in memory, is never stored, and no third party sees it. Stored: declared code, derived code, derivation method, timestamp. The DERIVED code is authoritative for safeguarding checks (US under-13 card verification) and for demographic grouping; an unresolved lookup applies the stronger control. Residual risk: VPN/Tor spoofing (DPIA item -- listed in the PR description; the DPIA draft is locked and was not edited). Supersedes the design in which only Guardian.declaredCountry (self-declared, never verified) decided whether card verification applied. OPEN: GeoLite2 licence terms and its refresh process need an owner; counsel to confirm the transient-IP-processing disclosure. [2026-10-18: RegisterDto.countryCode is required (apps/web sends it since B-073).] [2026-10-18: QA run (PR #426, docs/qa-e2e-onboarding-report.md), G-3: without a GeoLite2 database every under-13 account needs the card step (by design, this entry) and with Stripe unset the card step fails closed with 503, so an under-13 approval could not be completed locally; only the gate and the post-lift path were tested. Register row B-162.]</w:t>
             </w:r>
           </w:p>
         </w:tc>
@@ -25682,7 +25682,7 @@
           </w:tcPr>
           <w:p>
             <w:r>
-              <w:t>Resolved -- decided, NOT yet built. A username is required at Create Profile so that no user, minor or adult, is shown to other users under a real name. Until Create Profile is complete an account is shown to others under a neutral placeholder name, cannot post, and is redirected to Create Profile on every login. Applies to adults and to approved minors. Builds on #364 (User.username, shipped optional, 'username first, display name fallback'), which this makes mandatory for any account that completes onboarding; legacy accounts with no username fall under the same gate. Username moderation rules (reserved words, impersonation, profanity, no personal data in usernames, change cooldown, released-handle holding period, admin revoke built code-first with a design follow-up) are specified in the build PR, not here. OPEN: what the placeholder name is, and how the gate treats accounts that already exist without a username. [2026-10-16: Amended by #403. The placeholder name for incomplete profiles is 'Soccernity member' (closes the first OPEN point). The second OPEN point (accounts that already exist without a username) is not addressed.] [2026-10-17: The second OPEN point (accounts that already exist without a username) is resolved by B-027, which is built (backend/w3-gates, PR #412): legacy accounts are inside the incomplete-profile gate, and the placeholder other users see is 'Soccernity member' (#403, item 15). The wording of the gate is unchanged. Recorded in #404.] [2026-10-18: Rules specified and built by B-032 (docs/backend-w4-username-report.md): reserved words, impersonation (club names), profanity, contact details, personal data, 30-day change cooldown, revoked-handle hold. A user can no longer clear their own username (B-031). Recorded in #406, item 8: one free correction; no hold on a handle the user releases.]</w:t>
+              <w:t>Resolved -- decided, NOT yet built. A username is required at Create Profile so that no user, minor or adult, is shown to other users under a real name. Until Create Profile is complete an account is shown to others under a neutral placeholder name, cannot post, and is redirected to Create Profile on every login. Applies to adults and to approved minors. Builds on #364 (User.username, shipped optional, 'username first, display name fallback'), which this makes mandatory for any account that completes onboarding; legacy accounts with no username fall under the same gate. Username moderation rules (reserved words, impersonation, profanity, no personal data in usernames, change cooldown, released-handle holding period, admin revoke built code-first with a design follow-up) are specified in the build PR, not here. OPEN: what the placeholder name is, and how the gate treats accounts that already exist without a username. [2026-10-16: Amended by #403. The placeholder name for incomplete profiles is 'Soccernity member' (closes the first OPEN point). The second OPEN point (accounts that already exist without a username) is not addressed.] [2026-10-17: The second OPEN point (accounts that already exist without a username) is resolved by B-027, which is built (backend/w3-gates, PR #412): legacy accounts are inside the incomplete-profile gate, and the placeholder other users see is 'Soccernity member' (#403, item 15). The wording of the gate is unchanged. Recorded in #404.] [2026-10-18: Rules specified and built by B-032 (docs/backend-w4-username-report.md): reserved words, impersonation (club names), profanity, contact details, personal data, 30-day change cooldown, revoked-handle hold. A user can no longer clear their own username (B-031). Recorded in #406, item 8: one free correction; no hold on a handle the user releases.] [2026-10-18: QA run (PR #426, docs/qa-e2e-onboarding-report.md), D-06: hate and sexual terms glued to other letters (xxhitlerxx, nazifan) are accepted while hitler_1488, nazi_fan and fuckface are refused, because the EXACT list matches only the whole handle or an underscore token. Decided 2026-10-18 (#407, item 3): long unambiguous terms match by CONTAINS with a tested list of innocent words; short ambiguous terms stay exact. Register row B-142. D-05: Edit Profile still labels the username 'Optional' (B-133).]</w:t>
             </w:r>
           </w:p>
         </w:tc>
@@ -25724,7 +25724,7 @@
           </w:tcPr>
           <w:p>
             <w:r>
-              <w:t>Resolved -- decided, NOT yet built. A restricted-pending user cannot perform any social or profile write: profile edits, represented club, follow, like, save, club join, and the like. Left open to them: report and appeal, change-guardian-email, password change, deactivate/delete, logout. Today only some writes are blocked (POST /posts, comments, rooms, DMs and Community Group create/join are consent-guarded; follow, like, save, club join and PATCH /users/:id are JwtAuthGuard-only, per the reasoning in Decision Log #21/#275) -- this entry widens the rule to a uniform write block. Needs a build PR that re-checks every JwtAuthGuard-only write route. [2026-10-17: Built: B-026 (backend/w3-gates, PR #412). GuardianConsentGuard is now on every social and profile write route; the route table is pinned in docs/backend-w3-gates-report.md and enforced by services/api/src/write-route-guards.spec.ts, so a new write route with no entry fails the build. Recorded in #404.]</w:t>
+              <w:t>Resolved -- decided, NOT yet built. A restricted-pending user cannot perform any social or profile write: profile edits, represented club, follow, like, save, club join, and the like. Left open to them: report and appeal, change-guardian-email, password change, deactivate/delete, logout. Today only some writes are blocked (POST /posts, comments, rooms, DMs and Community Group create/join are consent-guarded; follow, like, save, club join and PATCH /users/:id are JwtAuthGuard-only, per the reasoning in Decision Log #21/#275) -- this entry widens the rule to a uniform write block. Needs a build PR that re-checks every JwtAuthGuard-only write route. [2026-10-17: Built: B-026 (backend/w3-gates, PR #412). GuardianConsentGuard is now on every social and profile write route; the route table is pinned in docs/backend-w3-gates-report.md and enforced by services/api/src/write-route-guards.spec.ts, so a new write route with no entry fails the build. Recorded in #404.] [2026-10-18: QA run (PR #426, docs/qa-e2e-onboarding-report.md), D-13: the restricted-pending view says 'Browse and follow' and the guardian page lists 'Follow teams and check scores', but POST /users/:id/follow returns 403 for a restricted-pending minor, as this entry decides. Decided 2026-10-18 (#407, item 4): the copy stops promising follow and says what works, [COPY PENDING LEGAL REVIEW]. Register row B-154.]</w:t>
             </w:r>
           </w:p>
         </w:tc>
@@ -26018,7 +26018,7 @@
           </w:tcPr>
           <w:p>
             <w:r>
-              <w:t>Future consideration, NOT in MVP, not decided. Possible later: players linked to Grassroots clubs through the Grassroots feature get a player profile card linked to their accounts. Because no position, school-team, stats or photo fields exist in the schema, API or UI, the 'Build a player profile / position, club or school team, and stats' and 'Add your position and photo' claims are removed from the guardian flow copy (GuardianConsentConfirmPage.tsx, GuardianConsentPage.tsx; Figma 5113:6669, 5114:6698; audit Q6). Do not build without a new decision (CLAUDE.md non-negotiable #4: no Discover/Careers-pillar work without an explicit go-ahead).</w:t>
+              <w:t>Future consideration, NOT in MVP, not decided. Possible later: players linked to Grassroots clubs through the Grassroots feature get a player profile card linked to their accounts. Because no position, school-team, stats or photo fields exist in the schema, API or UI, the 'Build a player profile / position, club or school team, and stats' and 'Add your position and photo' claims are removed from the guardian flow copy (GuardianConsentConfirmPage.tsx, GuardianConsentPage.tsx; Figma 5113:6669, 5114:6698; audit Q6). Do not build without a new decision (CLAUDE.md non-negotiable #4: no Discover/Careers-pillar work without an explicit go-ahead). [2026-10-18: QA run (PR #426, docs/qa-e2e-onboarding-report.md), D-15: the guardian page still shows 'Build a player profile - Position, club or school team, and stats they add themselves' and a visible drafting note ('[COPY PENDING LEGAL REVIEW -- expiry/deletion/withdrawal copy from the Figma frame is not reproduced here ...]'). Tracked in register row B-078; not built.]</w:t>
             </w:r>
           </w:p>
         </w:tc>
@@ -26522,7 +26522,7 @@
           </w:tcPr>
           <w:p>
             <w:r>
-              <w:t>Resolved -- decided, NOT yet built. SUPERSEDES #374 'as-is' for explicit declines on a still-valid request (the rest of #374 is retained). A guardian's explicit decline lets the minor resend or change the guardian email; the decline frames 5491:8241 / 5501:8453 must be wired to this logic (this settles #374's 'archive or rewrite' choice: rewrite and wire). MAX 3 declines; after the 3rd the account moves to pending deletion via the existing refuseConsentAndScheduleDeletion path (sessions revoked, 30-day grace, anonymise, purge rule #375). An expired request / second lapse does NOT count among the 3 and goes straight to the original plan (pending deletion). A guardian withdrawing consent after approval goes straight to the original plan. Changing the guardian email does NOT reset the count. Abuse protection: a cap on requests per day and a 'don't contact me again' option for the recipient. Retained from #374: 72h token TTL (GUARDIAN_CONSENT_TOKEN_TTL_HOURS), first lapse = automatic re-send plus a reminder to the minor, second lapse = implicit decline -&gt; original plan. Known bug to fix with this work: GuardianConsentPage currently treats 'declined' as pending (audit section 5 item 5). Note: between declines the minor's sessions must stay valid for them to resend; today every decline revokes sessions and 'declined' is terminal in code, so a per-account decline counter and a revised state model are new build work. Not yet in the legal copy draft (to add). Build register B-102, B-003. Forward-pointer: #374. [2026-10-17: Backend built (B-102, B-110; PR #416): the per-account counter (internal), declines 1 and 2 non-final with sessions valid, the third decline final via refuseConsentAndScheduleDeletion. Not built from this entry: the per-day request cap and the do-not-contact option (superseded by #395 B2, which has neither). Frontend still open: the in-account decline page and GuardianConsentPage's 'declined' rendering (audit section 5 item 5). New open item: B-126.] [2026-10-18: A row declined at decline 1 or 2 and not reopened within 14 days (configuration) takes the same lapse path as an unanswered request (#406, item 1; mechanics for the backend agent to confirm; counsel still to review). The guardian confirm page footnote 'Declining closes the account and schedules it for deletion' is wrong for declines 1-2 and is replaced (#406, item 13).]</w:t>
+              <w:t>Resolved -- decided, NOT yet built. SUPERSEDES #374 'as-is' for explicit declines on a still-valid request (the rest of #374 is retained). A guardian's explicit decline lets the minor resend or change the guardian email; the decline frames 5491:8241 / 5501:8453 must be wired to this logic (this settles #374's 'archive or rewrite' choice: rewrite and wire). MAX 3 declines; after the 3rd the account moves to pending deletion via the existing refuseConsentAndScheduleDeletion path (sessions revoked, 30-day grace, anonymise, purge rule #375). An expired request / second lapse does NOT count among the 3 and goes straight to the original plan (pending deletion). A guardian withdrawing consent after approval goes straight to the original plan. Changing the guardian email does NOT reset the count. Abuse protection: a cap on requests per day and a 'don't contact me again' option for the recipient. Retained from #374: 72h token TTL (GUARDIAN_CONSENT_TOKEN_TTL_HOURS), first lapse = automatic re-send plus a reminder to the minor, second lapse = implicit decline -&gt; original plan. Known bug to fix with this work: GuardianConsentPage currently treats 'declined' as pending (audit section 5 item 5). Note: between declines the minor's sessions must stay valid for them to resend; today every decline revokes sessions and 'declined' is terminal in code, so a per-account decline counter and a revised state model are new build work. Not yet in the legal copy draft (to add). Build register B-102, B-003. Forward-pointer: #374. [2026-10-17: Backend built (B-102, B-110; PR #416): the per-account counter (internal), declines 1 and 2 non-final with sessions valid, the third decline final via refuseConsentAndScheduleDeletion. Not built from this entry: the per-day request cap and the do-not-contact option (superseded by #395 B2, which has neither). Frontend still open: the in-account decline page and GuardianConsentPage's 'declined' rendering (audit section 5 item 5). New open item: B-126.] [2026-10-18: A row declined at decline 1 or 2 and not reopened within 14 days (configuration) takes the same lapse path as an unanswered request (#406, item 1; mechanics for the backend agent to confirm; counsel still to review). The guardian confirm page footnote 'Declining closes the account and schedules it for deletion' is wrong for declines 1-2 and is replaced (#406, item 13).] [2026-10-18: Built (B-126, PR #424): a row declined at decline 1 or 2 and not reopened within 14 days is chased and may end in closure; closure by this route is an expiry, so it is not a fourth decline (see #337). QA run (PR #426): declines 1 and 2 keep the account active and sessions valid, send no email and show the decline view with the cap sentence and no running count; decline 3 blocks login at once (generic 401, pending deletion, one email); a change of guardian restarts approval without resetting the count. The decline view's Resend approval request and Change guardian email actions are broken in apps/web (D-03 = B-151, D-04 = B-152). Judgment call 1 of the W3d report (the platform sends a new request to a guardian who declined) stays as built: #407 item 6.]</w:t>
             </w:r>
           </w:p>
         </w:tc>
@@ -26783,7 +26783,7 @@
               <w:t>Resolved -- recorded; DECIDED, NOT BUILT. Source: founder decisions 2026-10-15/16. Extends and amends #389; builds on #374, #340 and #390. (B1) The decline frame already exists in Figma (5491:8241 / 5501:8453). After decline 1 and decline 2 the minor sees the existing decline page. It is shown at the minor's next LOGIN ATTEMPT, before a session exists (#374 revokes all sessions and blocks login, so it cannot be shown inside a session): the server answers the login with a 'declined' result instead of issuing a token. BACKEND TO CONFIRM: backend-api must confirm this is buildable, including how the page's resend / change-guardian-email actions are authorised without a session (those routes are JwtAuthGuard-gated today) and that it is consistent with the note in #389 that sessions must stay valid between declines. Recorded as the intended behaviour, not as a verified design. (B2) Decline 3: the account enters the deletion sequence and the minor receives an EMAIL ONLY (no page). No decline count is shown anywhere to anyone; the counter is internal. There is NO 'don't contact me again' option. There is NO requests-per-day cap (only one request can run at a time). Three declines in one day delete the account immediately. Three declines in total, ever, per account. Founder decision; no counsel review needed. This WITHDRAWS the abuse-protection sentence of #389 (a cap on requests per day and a 'don't contact me again' option) and supersedes the open points of build register B-102 and B-003 accordingly; the rest of #389 stands (72h token; first lapse = automatic re-send; expiry, second lapse and post-approval withdrawal go straight to pending deletion and do not count among the three; changing the guardian email does not reset the count). (B3) Guardian withdrawal page (B-013): a LINK is added to the consent email and to the approved screen that pre-fills the code. Throttle ('Too many attempts'): a fixed window held in configuration, no countdown shown, 'Try again' returns to frame 1. 'Request a new link' (expired or used link) returns to frame 1 where the guardian re-enters their email; the page reads identically whether or not an account matched. BACKEND TO CONFIRM: the withdrawal token is issued only when a withdrawal is requested (#340), so what a link in the consent email can pre-fill at that moment must be confirmed. (B4) DOB correction (B-103, B-104; #390): if the corrected age tier changes, an in-flight guardian request is CANCELLED and restarted. This settles the 'effect on an in-flight request' point #390 left open. Build register: B-003, B-013, B-080, B-102, B-103, B-104, B-110 (declined-login result), B-112 (withdrawal link); Figma re-sync in B-107. STILL OPEN: counsel wording; the length of the throttle window (stated as configuration); whether 'delete the account immediately' on a third decline also skips the 30-day grace of #375 (recorded as: enters the deletion sequence immediately, grace not altered by this entry); whether a restart caused by a DOB correction resets the decline counter; the shipped per-minor guardian-email-change cap (5 per 24h, #365) is a separate control and is not altered here.</w:t>
             </w:r>
             <w:r>
-              <w:t xml:space="preserve"> [2026-10-16: Amended by #402. (B1) is AMENDED: sessions stay valid between declines (#389); after decline 1 and 2 the minor sees the existing decline page INSIDE the account via the existing authenticated resend / change-guardian-email routes; the 'declined' login result and its BACKEND TO CONFIRM point are WITHDRAWN (build register B-110 re-scoped). (B2) The open question on the 30-day grace is answered: the third decline blocks login at once and enters pending deletion WITH the existing 30-day grace (#375). The remainder stands.] [2026-10-16: Amended by #403. (B2) The decline page keeps its static sentence stating the cap (Figma node 6627:22230); 'No decline count is shown' means no running 'decline N of 3' counter. (B4) A restart caused by a DOB correction RESETS the decline counter and writes an audit entry (answers the STILL OPEN point). (B3) The withdrawal throttle default is 5 attempts per 15 minutes, held in configuration (sets the window left open).] [2026-10-17: Backend built in PR #416. B1 stays withdrawn (#402). B2: the third decline blocks login at once and enters pending deletion with the 30-day grace, one email. B3: unchanged here. B4 built as B-103: an age-tier change cancels or restarts the request and a restart resets the counter. Open, no decision: a row declined at 1 or 2 and never reopened has no expiry (register row B-126). Frontend decline page not built.] [2026-10-18: Amended by #406: a declined-at-1-or-2 row not reopened within 14 days expires (item 1); the status response adds the guardian's first name and the last decision date, never the decline count (item 11); the guardian confirm page footnote is replaced by the cap sentence (item 13).]</w:t>
+              <w:t xml:space="preserve"> [2026-10-16: Amended by #402. (B1) is AMENDED: sessions stay valid between declines (#389); after decline 1 and 2 the minor sees the existing decline page INSIDE the account via the existing authenticated resend / change-guardian-email routes; the 'declined' login result and its BACKEND TO CONFIRM point are WITHDRAWN (build register B-110 re-scoped). (B2) The open question on the 30-day grace is answered: the third decline blocks login at once and enters pending deletion WITH the existing 30-day grace (#375). The remainder stands.] [2026-10-16: Amended by #403. (B2) The decline page keeps its static sentence stating the cap (Figma node 6627:22230); 'No decline count is shown' means no running 'decline N of 3' counter. (B4) A restart caused by a DOB correction RESETS the decline counter and writes an audit entry (answers the STILL OPEN point). (B3) The withdrawal throttle default is 5 attempts per 15 minutes, held in configuration (sets the window left open).] [2026-10-17: Backend built in PR #416. B1 stays withdrawn (#402). B2: the third decline blocks login at once and enters pending deletion with the 30-day grace, one email. B3: unchanged here. B4 built as B-103: an age-tier change cancels or restarts the request and a restart resets the counter. Open, no decision: a row declined at 1 or 2 and never reopened has no expiry (register row B-126). Frontend decline page not built.] [2026-10-18: Amended by #406: a declined-at-1-or-2 row not reopened within 14 days expires (item 1); the status response adds the guardian's first name and the last decision date, never the decline count (item 11); the guardian confirm page footnote is replaced by the cap sentence (item 13).] [2026-10-18: Built in W3d (B-126, B-128, B-129, B-131; PR #424): see #406 and #389. QA run (PR #426): B2 and B4 behave as decided; the web decline view's Resend and Change guardian email actions are broken (D-03, D-04: B-151, B-152). Judgment call 1 of the W3d report stays as built (#407 item 6).]</w:t>
             </w:r>
           </w:p>
         </w:tc>
@@ -27089,7 +27089,7 @@
           </w:tcPr>
           <w:p>
             <w:r>
-              <w:t>Resolved -- recorded; DECIDED, NOT BUILT. FOUNDER-ADOPTED DEFAULTS, VETO-ABLE: each item below is adopted now so build work is not blocked, and stands until the founder says otherwise. Amends #395 and closes open points of #395-#399; the original text of those entries is unchanged (dated notes appended). (1) DECLINE 1 AND 2 -- AMENDS #395 B1. #389 already decided that sessions STAY VALID between declines; only the THIRD decline revokes sessions. After decline 1 and decline 2 the minor sees the existing decline page (5491:8241 / 5501:8453) INSIDE the account, using the existing authenticated resend and change-guardian-email routes. The 'declined login result' design of #395 B1 (a login that answers 'declined' with no token) is WITHDRAWN; so is its BACKEND TO CONFIRM point. Build implications recorded, not decisions: today every decline revokes sessions and 'declined' is terminal in code (#337-#340), and resend / change-guardian-email refuse a declined account (#365), so decline 1 and 2 must stop revoking and those routes must accept the account while fewer than three declines have been recorded. Bug fixed by the same work: GuardianConsentPage treats 'declined' as pending (audit section 5 item 5). Build register: B-110 is RE-SCOPED to this and merged into B-102's dependency chain (B-102 now depends on B-110); the B-ID is kept. (2) THIRD DECLINE. Login is blocked at once and the account enters pending deletion with the EXISTING 30-day grace (#375, via refuseConsentAndScheduleDeletion as in #389). This answers #395's open question: 'delete the account immediately' does NOT skip the grace; the minor still receives the email only, no page and no count (#395 B2 stands). (3) REVOKED USERNAME (#398 D3). The handle is held 30 days for everyone (nobody can take it); the revoked user can NEVER re-pick it. This answers #398's ambiguous 'cannot re-pick' point: permanent for that user, 30 days for others. (4) BLOCK (#396). The blocked user is NOT told. A block hides content and search results in both directions: posts, comments, likes, search, rosters. The leaderboard is unaffected. Unblock does NOT restore follows. Still open: Bants rooms (room membership / room listing; the blocked user's posts are covered by 'posts'), the exact like mechanics, and the interaction with the guardian-consent, under-16 and adult-to-minor rules (#346, #347). (5) 2FA (#397). 10 single-use backup codes, stored HASHED. Lost-device recovery needs a backup code, OR email confirmation plus password. Noted for the founder's veto: the email-plus-password path makes 2FA recovery only as strong as the email account. Still open: backup-code format, storage and encryption of the TOTP secret itself, counsel (legal copy Part C row 44). (6) CONTEST EXPOSURE SETTINGS (#399 E4/E5, #388). Tolerance and the per-viewer daily cap apply to WEEK 4 ONLY, not per contest or per week. Their ranges (1-50 percent; 1-50) stay as validation bounds on the week-4 settings; they lock when week 4 starts (day 22), not when week 1 starts. Watch limit (3-120 s) is unchanged. Build register: B-110 (re-scoped), B-102, B-003, B-107 (decline page behaviour note), B-032, B-033, B-039, B-108, B-086, B-087, B-111, B-091, B-092, B-095, B-097. Not decided here and still open: see docs/build-register.md Section 11d. [2026-10-17: Items 1 and 2 are built in the backend (B-110, B-102; PR #416): sessions stay valid after declines 1 and 2, the third decline blocks login at once with the 30-day grace. The 'existing authenticated resend' wording of item 1 is clarified by #405, item 6: the route is the existing email-keyed POST /auth/guardian-consent/resend, not JWT; change-guardian-email is the JWT one. Item 5 (2FA): the backup-code character set, the TOTP secret storage and the per-account lock are decided by #405, item 8.] [2026-10-18: Item 3 built: RevokedUsername (30-day hold for everyone, permanent bar for the revoked user). Retention and appeal path of that record are OPEN, no decision (B-139, #406).]</w:t>
+              <w:t>Resolved -- recorded; DECIDED, NOT BUILT. FOUNDER-ADOPTED DEFAULTS, VETO-ABLE: each item below is adopted now so build work is not blocked, and stands until the founder says otherwise. Amends #395 and closes open points of #395-#399; the original text of those entries is unchanged (dated notes appended). (1) DECLINE 1 AND 2 -- AMENDS #395 B1. #389 already decided that sessions STAY VALID between declines; only the THIRD decline revokes sessions. After decline 1 and decline 2 the minor sees the existing decline page (5491:8241 / 5501:8453) INSIDE the account, using the existing authenticated resend and change-guardian-email routes. The 'declined login result' design of #395 B1 (a login that answers 'declined' with no token) is WITHDRAWN; so is its BACKEND TO CONFIRM point. Build implications recorded, not decisions: today every decline revokes sessions and 'declined' is terminal in code (#337-#340), and resend / change-guardian-email refuse a declined account (#365), so decline 1 and 2 must stop revoking and those routes must accept the account while fewer than three declines have been recorded. Bug fixed by the same work: GuardianConsentPage treats 'declined' as pending (audit section 5 item 5). Build register: B-110 is RE-SCOPED to this and merged into B-102's dependency chain (B-102 now depends on B-110); the B-ID is kept. (2) THIRD DECLINE. Login is blocked at once and the account enters pending deletion with the EXISTING 30-day grace (#375, via refuseConsentAndScheduleDeletion as in #389). This answers #395's open question: 'delete the account immediately' does NOT skip the grace; the minor still receives the email only, no page and no count (#395 B2 stands). (3) REVOKED USERNAME (#398 D3). The handle is held 30 days for everyone (nobody can take it); the revoked user can NEVER re-pick it. This answers #398's ambiguous 'cannot re-pick' point: permanent for that user, 30 days for others. (4) BLOCK (#396). The blocked user is NOT told. A block hides content and search results in both directions: posts, comments, likes, search, rosters. The leaderboard is unaffected. Unblock does NOT restore follows. Still open: Bants rooms (room membership / room listing; the blocked user's posts are covered by 'posts'), the exact like mechanics, and the interaction with the guardian-consent, under-16 and adult-to-minor rules (#346, #347). (5) 2FA (#397). 10 single-use backup codes, stored HASHED. Lost-device recovery needs a backup code, OR email confirmation plus password. Noted for the founder's veto: the email-plus-password path makes 2FA recovery only as strong as the email account. Still open: backup-code format, storage and encryption of the TOTP secret itself, counsel (legal copy Part C row 44). (6) CONTEST EXPOSURE SETTINGS (#399 E4/E5, #388). Tolerance and the per-viewer daily cap apply to WEEK 4 ONLY, not per contest or per week. Their ranges (1-50 percent; 1-50) stay as validation bounds on the week-4 settings; they lock when week 4 starts (day 22), not when week 1 starts. Watch limit (3-120 s) is unchanged. Build register: B-110 (re-scoped), B-102, B-003, B-107 (decline page behaviour note), B-032, B-033, B-039, B-108, B-086, B-087, B-111, B-091, B-092, B-095, B-097. Not decided here and still open: see docs/build-register.md Section 11d. [2026-10-17: Items 1 and 2 are built in the backend (B-110, B-102; PR #416): sessions stay valid after declines 1 and 2, the third decline blocks login at once with the 30-day grace. The 'existing authenticated resend' wording of item 1 is clarified by #405, item 6: the route is the existing email-keyed POST /auth/guardian-consent/resend, not JWT; change-guardian-email is the JWT one. Item 5 (2FA): the backup-code character set, the TOTP secret storage and the per-account lock are decided by #405, item 8.] [2026-10-18: Item 3 built: RevokedUsername (30-day hold for everyone, permanent bar for the revoked user). Retention and appeal path of that record are OPEN, no decision (B-139, #406).] [2026-10-18: QA run (PR #426) confirmed sessions stay valid between declines 1 and 2 and the third decline blocks login at once with the existing 30-day grace. Two of the decline view's three actions are broken in apps/web (B-151, B-152).]</w:t>
             </w:r>
           </w:p>
         </w:tc>
@@ -27131,7 +27131,7 @@
           </w:tcPr>
           <w:p>
             <w:r>
-              <w:t>Resolved -- recorded; DECIDED, NOT BUILT. Source: founder decisions 2026-10-16, numbered 1-19 as given to this entry. Amends #400 (items 1, 9, 11), #395 (items 2, 15), #401 (item 7), #369 (item 15), #394 and #371 (item 17) by dated notes appended to those rows; the original text of every row is unchanged. It also changes points recorded in #398 D1 (item 8), #399 E3 (item 10) and #402 item 4 (item 16): those three rows were NOT edited (this entry is the record), see docs/build-register.md Section 12. The founder labelled the country select in item 17 a veto-able default and the withdrawal throttle in item 15 a default held in configuration; everything else is stated as a decision. (1) NON-FINALIST CONTEST TAB -- AMENDS #400 E8. The Create Post Contest tab for a non-finalist is NOT hidden. The tab stays visible, and a non-finalist who opens it during days 22-24 sees the existing 'Closed (not a finalist)' frames (desktop 6660:31044, mobile 6660:35699), which are RESTORED (un-archived, by a Figma pass, not by this entry). The minimum tally x stays admin-only (E8's second sentence stands). (2) DECLINE PAGE CAP SENTENCE -- clarifies #395 B2. The decline page keeps its static sentence that states the cap (Figma node 6627:22230). 'No decline count is shown' means no RUNNING 'decline N of 3' counter. The sentence is minor-facing copy and stays [COPY PENDING LEGAL REVIEW]. (3) GUARDIAN 'APPROVED' SCREENS. 5488:7164 and 5501:8225 are reworded to match the flow (approval continues to Create Profile; extends #394 A5); the new wording is [COPY PENDING LEGAL REVIEW]. (4) ADMIN COMPONENTS. The component frame at Figma node 6671:27364 (Pass F2) exists so that admin screens and apps/admin share ONE Button, Pill, Field, Callout, Banner, Note, Dialog and Table. Adoption is on the Pass C and Pass F1 admin frames only (not on older admin frames). A spacing / radius variable collection is added (a Figma pass does this; 'Soccernity Theme' stays the colour collection). (5) ADMIN SHELL SEARCH BAR. It stays visible on admin screens and is NOT functional ('not available yet'). New register row B-114: decide build vs hide. (6) EXCEPTION TO 'NEVER DELETE' (Figma passes). The ten hidden legacy absolute layers inside the ten rebuilt Create Post frames (the 'ARCHIVED -- legacy absolute layer' children from Pass F2 inside 2008:655, 2009:5168, 2009:2913, 6171:14797, 6171:16994, 2496:4462, 2565:3951, 6660:28736, 6660:31044, 6660:33353) may be deleted, and ONLY those. (7) VOTING PAGE ADOPTS THE ALREADY VOTED DESIGN -- closes the open point of #401. The Voting page (desktop 2094:994, mobile 5802:8726) takes the Already Voted page's design (entries column + board column, fan cards) and carries the vote toggle (#401). The separate Already Voted screens (5802:8978 / 5815:8916, and the auto-layout rebuild 6671:27155) are archived AFTERWARDS, by a Figma pass; the Voting &lt;-&gt; Already Voted navigation of #387 therefore goes with them. (8) LIFT HOLD -- changes #398 D1 / #376. Lift hold applies to BOTH the legal hold and the 6-month bad-faith hold. A reason is required. The held user is NOT notified. Appeal Review reuses the shared hold dialogs (Bad faith / Legal hold / Lift hold) used on Report Detail. (9) FORFEIT POP-UP -- AMENDS #400 E11. Shown ONLY on the Contest page. On every load of that page the user sees one pop-up per forfeited week, from when the week is deemed forfeited (docs/contest-spec.md Section 7); the reason is shown; nothing is remembered between loads. The leaderboard Contest tab shows the forfeited writing in place of the three names for that week (no pop-up there). (10) FINAL TASK TEXT -- changes #399 E3. The week-4 task text shows on the live-ranking and uploading states only (not on the 'No winner this month' or crowned states). (11) COMMUNITY-FEED 'FINAL WEEK' MODULE -- AMENDS #400 E10 and the open point carried by #402. The module STAYS. The dead 'View on the Contest page' link is removed. Its videos become a carousel that keeps the current frame size and serves as a preview slot reusable for other showcases later. It shows only during a final contest week and not at all when there is none. OPEN: whether carousel views count as impressions (B-092). (12) MOBILE BLOCK PATTERN: the '...' menu (confirms the Pass F1 trigger, node 6669:27188). (13) CREATE POST FIGMA CHANGES ACCEPTED: the scrim token change (white 71% to color/overlay/scrim) and the typographic crest marks in the Fixtures module of the Create Post frames. Licensing of club crests in Fixtures stays OPEN (#85, #97). (14) FONT: user-facing read-only fields need a Montserrat Field variant (the admin components are Inter). (15) DEFAULTS CLOSING OPEN POINTS: the placeholder name for incomplete profiles is 'Soccernity member' (closes #369's open point); a DOB-correction restart RESETS the decline counter and writes an audit entry (closes #395 B4's open point); the withdrawal throttle default is 5 attempts per 15 minutes, held in configuration (sets the window left open in #395 B3); unverified-email users are blocked from social writes as well as from PATCH /users/:id (extends the guard built under B-020; new row B-118). (16) BANTS -- an OPEN FORUM, no private messages. Anyone can start a thread and others comment on it; likes work as on a blog or forum (one like per user per item, toggled, public count). Accounts aged 16 and 17 have FULL Bants access (the limit in #346 applies to under-16s only, who stay fully disabled); this is a founder decision, not read-only. Bants will have moderation. Block hides the blocked user's posts, comments and like identities in both directions; counts unchanged; no room membership. This settles the 'Bants rooms' and 'exact like mechanics' points #402 item 4 left open; the interaction with #346 / #347 stays open. OPEN, recorded not resolved: 'thread' is not mapped to the built model (BanterRoom #275 vs Post), and 'no room membership' is not reconciled with the built BanterRoomMember join / leave, My Bants and 'posting requires membership' (#275); the scope of 'moderation' beyond room status (#357) is not stated. New row B-117. (17) COUNTRY HAS TWO SEPARATE FIELDS. (a) SAFEGUARDING country: declared at the Age Gate and derived from the IP lookup (B-023..B-025). Stored separately, never shown, never editable by any profile action; it alone decides US under-13 card verification and demographic grouping (#368 stands). (b) PROFILE country: a separate, nullable, OPTIONAL field. It is BLANK at Create Profile (not prefilled, not read-only), the user may fill it in, and it is editable at any time in Edit Profile (B-083). It is shown on a user's profile only if they filled it in, so a minor's country is visible only if the minor chooses to enter it. AMENDS #394 A1 (Country read-only at Create Profile) and the 'country' item of #371 (profile shows country): those rows stand except for these points. DEFAULT, VETO-ABLE: a country select from the full country list. B-038 stores the profile country as its own column, NOT the derived or declared safeguarding fields. Counsel review of country display stays on the legal list with reduced scope because the field is optional. (18) PRODUCTION WIRING (MaxMind, Render environment variables, Postmark, JWT secrets, TRUST_PROXY_HOPS) is deferred to the launch gate B-090; the code fails safe until it is done. (19) NEW REGISTER ROWS: password-reset email placeholder-address fallback (B-115); API test-suite worker flake, the suite needs --maxWorkers=4 (B-116); admin search bar (B-114, item 5). Rows added from the other items: B-113 (Figma re-sync, items 1-14 and 17), B-117 (Bants open forum), B-118 (email-verification gate on social writes). Build register: B-113 to B-118 new; status lines on B-002, B-003, B-006, B-007, B-012, B-013, B-018, B-020, B-023, B-024, B-026, B-027, B-038, B-039, B-042, B-044, B-045, B-054, B-071, B-079, B-080, B-081, B-082, B-083, B-090, B-091, B-092, B-095, B-096, B-098, B-099, B-102, B-103, B-107, B-108, B-112. STILL OPEN: counsel wording for every [COPY PENDING LEGAL REVIEW] item; the Bants mapping questions in (16); build vs hide for the admin search bar (B-114); whether carousel views count as impressions (B-092); whether the 'Closed (not a finalist)' copy may reveal anything about uploads before the reveal; how other users reach a finalist's entry after the reveal; what the Contest tab shows from 00:00 to 08:00 on day 1; which routes count as 'social writes' (B-118); the interaction of Block with #346 / #347; crest licensing in Fixtures (#85, #97); the CSAM path; the length of every window stated as configuration other than the withdrawal throttle. [2026-10-17: Item 15 (unverified-email users cannot perform social writes) is built: B-118 (backend/w3-gates, PR #412). The creating forms are gated by EmailVerifiedGuard; the undo and own-content forms stay open (docs/backend-w3-gates-report.md, section 5, call 1, adopted by #404, item 12). Two open points of this entry are closed by #404: the forfeit pop-up reading of 'Contest page' and several forfeited weeks (item 4), and whether carousel views count as impressions (items 6 and 15).] [2026-10-17: Items 2 and 15 are built in the backend (PR #416): the decline counter is internal and never returned by any API (item 2); a DOB-correction restart resets it and writes an audit entry (item 15, user.dob_corrected). Item 15's unverified-email rule is already noted above (PR #412). The Contest notification question 'does an unverified-email account receive them' is answered by #405, item 4.]</w:t>
+              <w:t>Resolved -- recorded; DECIDED, NOT BUILT. Source: founder decisions 2026-10-16, numbered 1-19 as given to this entry. Amends #400 (items 1, 9, 11), #395 (items 2, 15), #401 (item 7), #369 (item 15), #394 and #371 (item 17) by dated notes appended to those rows; the original text of every row is unchanged. It also changes points recorded in #398 D1 (item 8), #399 E3 (item 10) and #402 item 4 (item 16): those three rows were NOT edited (this entry is the record), see docs/build-register.md Section 12. The founder labelled the country select in item 17 a veto-able default and the withdrawal throttle in item 15 a default held in configuration; everything else is stated as a decision. (1) NON-FINALIST CONTEST TAB -- AMENDS #400 E8. The Create Post Contest tab for a non-finalist is NOT hidden. The tab stays visible, and a non-finalist who opens it during days 22-24 sees the existing 'Closed (not a finalist)' frames (desktop 6660:31044, mobile 6660:35699), which are RESTORED (un-archived, by a Figma pass, not by this entry). The minimum tally x stays admin-only (E8's second sentence stands). (2) DECLINE PAGE CAP SENTENCE -- clarifies #395 B2. The decline page keeps its static sentence that states the cap (Figma node 6627:22230). 'No decline count is shown' means no RUNNING 'decline N of 3' counter. The sentence is minor-facing copy and stays [COPY PENDING LEGAL REVIEW]. (3) GUARDIAN 'APPROVED' SCREENS. 5488:7164 and 5501:8225 are reworded to match the flow (approval continues to Create Profile; extends #394 A5); the new wording is [COPY PENDING LEGAL REVIEW]. (4) ADMIN COMPONENTS. The component frame at Figma node 6671:27364 (Pass F2) exists so that admin screens and apps/admin share ONE Button, Pill, Field, Callout, Banner, Note, Dialog and Table. Adoption is on the Pass C and Pass F1 admin frames only (not on older admin frames). A spacing / radius variable collection is added (a Figma pass does this; 'Soccernity Theme' stays the colour collection). (5) ADMIN SHELL SEARCH BAR. It stays visible on admin screens and is NOT functional ('not available yet'). New register row B-114: decide build vs hide. (6) EXCEPTION TO 'NEVER DELETE' (Figma passes). The ten hidden legacy absolute layers inside the ten rebuilt Create Post frames (the 'ARCHIVED -- legacy absolute layer' children from Pass F2 inside 2008:655, 2009:5168, 2009:2913, 6171:14797, 6171:16994, 2496:4462, 2565:3951, 6660:28736, 6660:31044, 6660:33353) may be deleted, and ONLY those. (7) VOTING PAGE ADOPTS THE ALREADY VOTED DESIGN -- closes the open point of #401. The Voting page (desktop 2094:994, mobile 5802:8726) takes the Already Voted page's design (entries column + board column, fan cards) and carries the vote toggle (#401). The separate Already Voted screens (5802:8978 / 5815:8916, and the auto-layout rebuild 6671:27155) are archived AFTERWARDS, by a Figma pass; the Voting &lt;-&gt; Already Voted navigation of #387 therefore goes with them. (8) LIFT HOLD -- changes #398 D1 / #376. Lift hold applies to BOTH the legal hold and the 6-month bad-faith hold. A reason is required. The held user is NOT notified. Appeal Review reuses the shared hold dialogs (Bad faith / Legal hold / Lift hold) used on Report Detail. (9) FORFEIT POP-UP -- AMENDS #400 E11. Shown ONLY on the Contest page. On every load of that page the user sees one pop-up per forfeited week, from when the week is deemed forfeited (docs/contest-spec.md Section 7); the reason is shown; nothing is remembered between loads. The leaderboard Contest tab shows the forfeited writing in place of the three names for that week (no pop-up there). (10) FINAL TASK TEXT -- changes #399 E3. The week-4 task text shows on the live-ranking and uploading states only (not on the 'No winner this month' or crowned states). (11) COMMUNITY-FEED 'FINAL WEEK' MODULE -- AMENDS #400 E10 and the open point carried by #402. The module STAYS. The dead 'View on the Contest page' link is removed. Its videos become a carousel that keeps the current frame size and serves as a preview slot reusable for other showcases later. It shows only during a final contest week and not at all when there is none. OPEN: whether carousel views count as impressions (B-092). (12) MOBILE BLOCK PATTERN: the '...' menu (confirms the Pass F1 trigger, node 6669:27188). (13) CREATE POST FIGMA CHANGES ACCEPTED: the scrim token change (white 71% to color/overlay/scrim) and the typographic crest marks in the Fixtures module of the Create Post frames. Licensing of club crests in Fixtures stays OPEN (#85, #97). (14) FONT: user-facing read-only fields need a Montserrat Field variant (the admin components are Inter). (15) DEFAULTS CLOSING OPEN POINTS: the placeholder name for incomplete profiles is 'Soccernity member' (closes #369's open point); a DOB-correction restart RESETS the decline counter and writes an audit entry (closes #395 B4's open point); the withdrawal throttle default is 5 attempts per 15 minutes, held in configuration (sets the window left open in #395 B3); unverified-email users are blocked from social writes as well as from PATCH /users/:id (extends the guard built under B-020; new row B-118). (16) BANTS -- an OPEN FORUM, no private messages. Anyone can start a thread and others comment on it; likes work as on a blog or forum (one like per user per item, toggled, public count). Accounts aged 16 and 17 have FULL Bants access (the limit in #346 applies to under-16s only, who stay fully disabled); this is a founder decision, not read-only. Bants will have moderation. Block hides the blocked user's posts, comments and like identities in both directions; counts unchanged; no room membership. This settles the 'Bants rooms' and 'exact like mechanics' points #402 item 4 left open; the interaction with #346 / #347 stays open. OPEN, recorded not resolved: 'thread' is not mapped to the built model (BanterRoom #275 vs Post), and 'no room membership' is not reconciled with the built BanterRoomMember join / leave, My Bants and 'posting requires membership' (#275); the scope of 'moderation' beyond room status (#357) is not stated. New row B-117. (17) COUNTRY HAS TWO SEPARATE FIELDS. (a) SAFEGUARDING country: declared at the Age Gate and derived from the IP lookup (B-023..B-025). Stored separately, never shown, never editable by any profile action; it alone decides US under-13 card verification and demographic grouping (#368 stands). (b) PROFILE country: a separate, nullable, OPTIONAL field. It is BLANK at Create Profile (not prefilled, not read-only), the user may fill it in, and it is editable at any time in Edit Profile (B-083). It is shown on a user's profile only if they filled it in, so a minor's country is visible only if the minor chooses to enter it. AMENDS #394 A1 (Country read-only at Create Profile) and the 'country' item of #371 (profile shows country): those rows stand except for these points. DEFAULT, VETO-ABLE: a country select from the full country list. B-038 stores the profile country as its own column, NOT the derived or declared safeguarding fields. Counsel review of country display stays on the legal list with reduced scope because the field is optional. (18) PRODUCTION WIRING (MaxMind, Render environment variables, Postmark, JWT secrets, TRUST_PROXY_HOPS) is deferred to the launch gate B-090; the code fails safe until it is done. (19) NEW REGISTER ROWS: password-reset email placeholder-address fallback (B-115); API test-suite worker flake, the suite needs --maxWorkers=4 (B-116); admin search bar (B-114, item 5). Rows added from the other items: B-113 (Figma re-sync, items 1-14 and 17), B-117 (Bants open forum), B-118 (email-verification gate on social writes). Build register: B-113 to B-118 new; status lines on B-002, B-003, B-006, B-007, B-012, B-013, B-018, B-020, B-023, B-024, B-026, B-027, B-038, B-039, B-042, B-044, B-045, B-054, B-071, B-079, B-080, B-081, B-082, B-083, B-090, B-091, B-092, B-095, B-096, B-098, B-099, B-102, B-103, B-107, B-108, B-112. STILL OPEN: counsel wording for every [COPY PENDING LEGAL REVIEW] item; the Bants mapping questions in (16); build vs hide for the admin search bar (B-114); whether carousel views count as impressions (B-092); whether the 'Closed (not a finalist)' copy may reveal anything about uploads before the reveal; how other users reach a finalist's entry after the reveal; what the Contest tab shows from 00:00 to 08:00 on day 1; which routes count as 'social writes' (B-118); the interaction of Block with #346 / #347; crest licensing in Fixtures (#85, #97); the CSAM path; the length of every window stated as configuration other than the withdrawal throttle. [2026-10-17: Item 15 (unverified-email users cannot perform social writes) is built: B-118 (backend/w3-gates, PR #412). The creating forms are gated by EmailVerifiedGuard; the undo and own-content forms stay open (docs/backend-w3-gates-report.md, section 5, call 1, adopted by #404, item 12). Two open points of this entry are closed by #404: the forfeit pop-up reading of 'Contest page' and several forfeited weeks (item 4), and whether carousel views count as impressions (items 6 and 15).] [2026-10-17: Items 2 and 15 are built in the backend (PR #416): the decline counter is internal and never returned by any API (item 2); a DOB-correction restart resets it and writes an audit entry (item 15, user.dob_corrected). Item 15's unverified-email rule is already noted above (PR #412). The Contest notification question 'does an unverified-email account receive them' is answered by #405, item 4.] [2026-10-18: Figma pass K2 (docs/figma-pass-k2-report.md section 6, candidate 7): item 17's rule 'show the country line only when filled' is unchanged, but the general profile frames show a filled sample country line while the pass H frames hide it; which sample is canonical is not decided (register row B-148).]</w:t>
             </w:r>
           </w:p>
         </w:tc>
@@ -27215,7 +27215,7 @@
           </w:tcPr>
           <w:p>
             <w:r>
-              <w:t>Resolved -- recorded. FOUNDER-ADOPTED DEFAULTS, VETO-ABLE, all ten items. Items 4, 5 and 6 confirm behaviour already in the shipped code (PR #416, PR #417); items 1, 2, 7, 8, 9 and 10 are DECIDED, NOT BUILT; item 3 confirms the existing design. Item numbers are the founder's own. Original text of every entry named in the forward-pointers below is unchanged (dated notes appended). (1) PIN REMOVED, FINAL ENTRY BECOMES AN ORDINARY POST. When the contest ends at the end of its month and the pin is removed (#404 items 9 and 15), the final entry becomes an ordinary post and appears in the Community feed like any other post. Closes the open point of #404 (item 9 said it becomes an ordinary post; item 15 said only that the pin is removed): item 9's reading stands for the end state. Unchanged: during the contest month the entry is not also a normal feed post; the carousel is the daily exposure. The pin removal and the flip are new build work (B-091, B-092, B-082); nothing exists. Not decided: the time of day of the flip. (2) NOTIFICATION DESTINATIONS AS DRAWN IN FIGMA PASS J2 (docs/figma-pass-j2-report.md, section 2). Week opens opens the Contest details page; votes closing opens the Voting page; week result opens the leaderboard Contest tab (that week's winners-in frame); finalist qualification and the finalist upload reminder open Create Post &gt; Contest, Upload Open; 'The final is live' opens the Final week carousel in the Community feed; final result opens the leaderboard Contest tab, Crowned frame (winners) or No Winner This Month frame. NO notification opens a profile. This settles candidates 1, 2 and 4 of that report's section 6 and supersedes the link list written in register row B-123 (reveal and final to the leaderboard Contest tab; winners to the finalist's profile). B-123 updated. (3) PERSONAL WINNER NOTIFICATION. It stays the existing contest_win row (#278), not duplicated and not replaced by a new type; there is no separate personal-winner row in the Notification Centre. Closes the J2 candidate 3 and the 'separate personal winner row' leg of B-121. (4) UNVERIFIED EMAIL. Accounts with an unverified email receive no Contest notifications. Closes the open point of #404 item 16. Matches B-122 as built (one filter constant). (5) DATE OF BIRTH TOOLS. Moderator and superadmin may read and correct a date of birth, and each view is audited. Closes the open point 'which admin roles may read a decrypted DOB' (B-109, #398 D4, #390). Matches B-103 and B-109 as built (PR #416): the correction audit row holds admin, target, reason, old and new tier and never a DOB; every response that contains a DOB writes a user.dob_viewed row and fails closed if that write fails. An editor cannot use either. (6) GUARDIAN RESEND STAYS EMAIL-KEYED. The resend route stays the existing POST /auth/guardian-consent/resend, keyed by the minor's registered email and rate-limited, not JWT. Clarifies the words 'existing authenticated resend' in #402 item 1 and #389 (the authenticated route is change-guardian-email, #365). Matches B-110 as built. Implication, not a decision: the in-account decline page calls the resend route with the account's own registered email. (7) CAROUSEL IMPRESSION THRESHOLD. A carousel tile counts as an impression when at least 50 percent of it is in view for at least 1 second. Closes the OPEN threshold of #404 items 6 and 15 and of B-092. Not stated: whether the second must be continuous and whether a tile counts again on re-entry; the per-viewer daily cap and the tolerance of #388 are unchanged. (8) 2FA. Backup codes are 10 characters shown in two groups of five (5-5), upper-case letters and digits without 0, O, 1 and I; stored hashed (#402); single use. The TOTP secret is encrypted at rest with the existing date-of-birth encryption (AES-256-GCM, DOB_ENCRYPTION_KEY, #362). Recovery lockout stays per account (5 wrong tries in 15 minutes lock recovery for 15 minutes). Closes the character-set, TOTP-secret-storage and per-account-or-per-IP points of #404 item 7 and #402 item 5. Consequences recorded for the founder, not decisions: one key now protects both date-of-birth and TOTP secrets, so loss or rotation of DOB_ENCRYPTION_KEY affects both (docs/dob-encryption-rollback.md covers date of birth only); a per-account lock lets a stranger lock out an account holder (the trade-off #404 already named). Counsel (legal copy Part C row 44) still open. (9) LEGACY PROFILE FRAMES. The legacy absolute-layout profile frames 1455:4362, 1455:6626, 5702:8250 and 5778:8490 are archived (hidden, ARCHIVED prefix), not deleted. Confirms the default of #404 item 2; the Figma work is still owed (B-113, B-082). (10) FIGMA COMPONENT ADOPTION. The Field component, the eight Dialogs and the eight Tables that Figma pass J did not adopt stay local frames; the 257 hidden ARCHIVED originals left by that pass stay until the launch gate (B-090). Settles the 'still open' adoption of pass J (B-113, B-095). Not decided: whether the 257 are deleted at the gate. (REGISTER) New rows B-124 (pending-copy guard), B-125 (apps/web onboarding routing on the server's nextStep) and B-126 (OPEN, no decision: declined-at-1-or-2 rows have no expiry); status lines on B-015, B-030, B-082, B-086, B-087, B-090, B-091, B-092, B-095, B-102, B-103, B-104, B-109, B-110, B-111, B-113, B-121, B-122, B-123; the BUILT lines of B-102, B-103, B-109, B-110 and B-122 (PR #416, PR #417) were already present and were verified, not duplicated. 126 B-IDs; 146 gap frames unchanged. Arithmetic: docs/build-register.md Section 19. (FORWARD-POINTERS) Dated notes appended (original text unchanged) to #337, #338, #339, #340, #365, #372, #375, #389, #390, #395, #398, #402, #403 and #404. NOT DECIDED HERE: the pending-copy guard's exact scope (the instruction named it but its definition did not arrive; B-124 is Claude's reading of the name and the repo, to confirm or replace); whether a row declined at 1 or 2 should expire, be reminded or be left alone (B-126, OPEN); the time of day of the pin-removal flip; continuity of the 1-second view; whether the 257 archived originals are deleted at the launch gate; counsel wording for every [COPY PENDING LEGAL REVIEW] item. [2026-10-18: Amended by #406. Item 5 (date of birth tools): User Detail no longer shows the DOB; it appears only on the correction form and the server rejects a reason containing a date (#406, item 4); roles unchanged. Open points closed: the time of the pin-removal flip of item 1 (00:00 London time on the 1st, #406 item 5) and the continuous-second and re-entry points of item 7 (#406 item 6).]</w:t>
+              <w:t>Resolved -- recorded. FOUNDER-ADOPTED DEFAULTS, VETO-ABLE, all ten items. Items 4, 5 and 6 confirm behaviour already in the shipped code (PR #416, PR #417); items 1, 2, 7, 8, 9 and 10 are DECIDED, NOT BUILT; item 3 confirms the existing design. Item numbers are the founder's own. Original text of every entry named in the forward-pointers below is unchanged (dated notes appended). (1) PIN REMOVED, FINAL ENTRY BECOMES AN ORDINARY POST. When the contest ends at the end of its month and the pin is removed (#404 items 9 and 15), the final entry becomes an ordinary post and appears in the Community feed like any other post. Closes the open point of #404 (item 9 said it becomes an ordinary post; item 15 said only that the pin is removed): item 9's reading stands for the end state. Unchanged: during the contest month the entry is not also a normal feed post; the carousel is the daily exposure. The pin removal and the flip are new build work (B-091, B-092, B-082); nothing exists. Not decided: the time of day of the flip. (2) NOTIFICATION DESTINATIONS AS DRAWN IN FIGMA PASS J2 (docs/figma-pass-j2-report.md, section 2). Week opens opens the Contest details page; votes closing opens the Voting page; week result opens the leaderboard Contest tab (that week's winners-in frame); finalist qualification and the finalist upload reminder open Create Post &gt; Contest, Upload Open; 'The final is live' opens the Final week carousel in the Community feed; final result opens the leaderboard Contest tab, Crowned frame (winners) or No Winner This Month frame. NO notification opens a profile. This settles candidates 1, 2 and 4 of that report's section 6 and supersedes the link list written in register row B-123 (reveal and final to the leaderboard Contest tab; winners to the finalist's profile). B-123 updated. (3) PERSONAL WINNER NOTIFICATION. It stays the existing contest_win row (#278), not duplicated and not replaced by a new type; there is no separate personal-winner row in the Notification Centre. Closes the J2 candidate 3 and the 'separate personal winner row' leg of B-121. (4) UNVERIFIED EMAIL. Accounts with an unverified email receive no Contest notifications. Closes the open point of #404 item 16. Matches B-122 as built (one filter constant). (5) DATE OF BIRTH TOOLS. Moderator and superadmin may read and correct a date of birth, and each view is audited. Closes the open point 'which admin roles may read a decrypted DOB' (B-109, #398 D4, #390). Matches B-103 and B-109 as built (PR #416): the correction audit row holds admin, target, reason, old and new tier and never a DOB; every response that contains a DOB writes a user.dob_viewed row and fails closed if that write fails. An editor cannot use either. (6) GUARDIAN RESEND STAYS EMAIL-KEYED. The resend route stays the existing POST /auth/guardian-consent/resend, keyed by the minor's registered email and rate-limited, not JWT. Clarifies the words 'existing authenticated resend' in #402 item 1 and #389 (the authenticated route is change-guardian-email, #365). Matches B-110 as built. Implication, not a decision: the in-account decline page calls the resend route with the account's own registered email. (7) CAROUSEL IMPRESSION THRESHOLD. A carousel tile counts as an impression when at least 50 percent of it is in view for at least 1 second. Closes the OPEN threshold of #404 items 6 and 15 and of B-092. Not stated: whether the second must be continuous and whether a tile counts again on re-entry; the per-viewer daily cap and the tolerance of #388 are unchanged. (8) 2FA. Backup codes are 10 characters shown in two groups of five (5-5), upper-case letters and digits without 0, O, 1 and I; stored hashed (#402); single use. The TOTP secret is encrypted at rest with the existing date-of-birth encryption (AES-256-GCM, DOB_ENCRYPTION_KEY, #362). Recovery lockout stays per account (5 wrong tries in 15 minutes lock recovery for 15 minutes). Closes the character-set, TOTP-secret-storage and per-account-or-per-IP points of #404 item 7 and #402 item 5. Consequences recorded for the founder, not decisions: one key now protects both date-of-birth and TOTP secrets, so loss or rotation of DOB_ENCRYPTION_KEY affects both (docs/dob-encryption-rollback.md covers date of birth only); a per-account lock lets a stranger lock out an account holder (the trade-off #404 already named). Counsel (legal copy Part C row 44) still open. (9) LEGACY PROFILE FRAMES. The legacy absolute-layout profile frames 1455:4362, 1455:6626, 5702:8250 and 5778:8490 are archived (hidden, ARCHIVED prefix), not deleted. Confirms the default of #404 item 2; the Figma work is still owed (B-113, B-082). (10) FIGMA COMPONENT ADOPTION. The Field component, the eight Dialogs and the eight Tables that Figma pass J did not adopt stay local frames; the 257 hidden ARCHIVED originals left by that pass stay until the launch gate (B-090). Settles the 'still open' adoption of pass J (B-113, B-095). Not decided: whether the 257 are deleted at the gate. (REGISTER) New rows B-124 (pending-copy guard), B-125 (apps/web onboarding routing on the server's nextStep) and B-126 (OPEN, no decision: declined-at-1-or-2 rows have no expiry); status lines on B-015, B-030, B-082, B-086, B-087, B-090, B-091, B-092, B-095, B-102, B-103, B-104, B-109, B-110, B-111, B-113, B-121, B-122, B-123; the BUILT lines of B-102, B-103, B-109, B-110 and B-122 (PR #416, PR #417) were already present and were verified, not duplicated. 126 B-IDs; 146 gap frames unchanged. Arithmetic: docs/build-register.md Section 19. (FORWARD-POINTERS) Dated notes appended (original text unchanged) to #337, #338, #339, #340, #365, #372, #375, #389, #390, #395, #398, #402, #403 and #404. NOT DECIDED HERE: the pending-copy guard's exact scope (the instruction named it but its definition did not arrive; B-124 is Claude's reading of the name and the repo, to confirm or replace); whether a row declined at 1 or 2 should expire, be reminded or be left alone (B-126, OPEN); the time of day of the pin-removal flip; continuity of the 1-second view; whether the 257 archived originals are deleted at the launch gate; counsel wording for every [COPY PENDING LEGAL REVIEW] item. [2026-10-18: Amended by #406. Item 5 (date of birth tools): User Detail no longer shows the DOB; it appears only on the correction form and the server rejects a reason containing a date (#406, item 4); roles unchanged. Open points closed: the time of the pin-removal flip of item 1 (00:00 London time on the 1st, #406 item 5) and the continuous-second and re-entry points of item 7 (#406 item 6).] [2026-10-18: Item 5 (date of birth tools), as built in W3d (B-129, PR #424): User Detail has a summary read without the DOB and the age tier (GET /admin/users/:id/summary, no audit row); user.dob_viewed is written only by the full read GET /admin/users/:id, which the correction form uses; a correction reason containing a date-shaped string is a 400 reason_contains_date. QA run (PR #426), D-07: apps/admin User Detail still opens on the full read, so each open writes audit rows and sends the DOB to the browser; the frontend leg is not built (B-129).]</w:t>
             </w:r>
           </w:p>
         </w:tc>
@@ -27257,7 +27257,49 @@
           </w:tcPr>
           <w:p>
             <w:r>
-              <w:t>Resolved -- recorded. FOUNDER-ADOPTED DEFAULTS, VETO-ABLE, all thirteen items. DECIDED, NOT BUILT, except item 8 (as built in W4, PR #420), item 9 (the drawing exists, Figma pass K) and item 10 (as built in FC2, PR #421), which confirm what already exists. Item numbers are the founder's own. Original text of every entry named in the forward-pointers below is unchanged (dated notes appended). (1) DECLINED-AT-1-OR-2 ROWS EXPIRE (closes B-126 in principle). A guardian-consent row declined at decline 1 or 2 and not reopened (no resend, no change of guardian email) within 14 days (a configuration value) takes the same lapse path as an unanswered request (#337-#340, #389). The backend agent confirms the mechanics before building: where the 14 days start, whether the one automatic re-send and warning comes first or the row goes straight to the second-lapse outcome, and that an expiry does not count among the three declines (#389). Resolves, in principle, the conflict with legal copy v0.8 Part 4.4 (a minor's account cannot remain restricted-pending indefinitely); counsel still to review; the legal copy is not edited here. (2) LIGHT THEME. The onboarding, guardian and consent screens in apps/web move to the light theme to match their Figma frames: Age Gate, Guardian Details, Guardian Consent, Verify Email and its prompt, Create Profile and the Club Picker step (the set the FC2 browser check found dark). No new colour. Build row B-127. (3) RESEND VERIFICATION. A rate-limited resend-verification-email endpoint is added; #37 recorded that none exists. The limits, and who may call it, are set in the build PR and are not decided here. Build row B-128. (4) DATE OF BIRTH ON USER DETAIL. User Detail reads without the date of birth; the DOB appears only on the correction form; the server rejects a correction reason that contains a date. Amends #405 item 5 and #398 D4 (GET /admin/users/:id returned the decrypted DOB, each view audited): roles are unchanged (moderator and superadmin). For the backend agent to confirm: how the form gets the current DOB (a separate read), whether that read is audited like user.dob_viewed, and which date formats the reason check rejects (a reason cannot be proven free of every date form). Build row B-129. (5) PIN REMOVAL TIME. The pin is removed from the finalist's profile at 00:00 Europe/London on the 1st of the month after the contest month, and at that moment the final entry becomes an ordinary Community-feed post. Closes the 'time of day of the flip' open point of #405 item 1. B-091, B-092, B-082. (6) IMPRESSION SECOND. The 1-second view of #405 item 7 is continuous (the tile stays at least 50 percent in view for one uninterrupted second); a re-entry counts again, within the per-viewer daily cap of #388 (week 4 only). Closes the two 'not stated' points of #405 item 7. B-092. (7) NOTIFICATIONS. Notification icons as drawn in Figma pass K are accepted; the Notification Centre empty-state line and the coming-soon line are updated to mention Contest. Observation, not a decision: the coming-soon line written under #279 already names 'Contest activity' as upcoming, which is no longer true now that Contest notifications exist; the Figma agent sets the final wording. B-121, B-123. (8) USERNAME. A 30-day change cooldown with one free correction (as built, B-032) and no hold on a handle the user releases; the 30-day hold applies to an admin revoke only (#398 D3, #402 item 3). Not addressed: a handle released by anonymisation is released immediately as built; whether to hold it is not decided. B-032, B-033. (9) INCORRECT-DETAILS SCREEN. The founder accepts the admin screen as drawn in Figma pass K (8 frames, docs/figma-pass-k-report.md); B-120 builds from it, with no field, column or control beyond the frames. The four SCOPE OPEN notes of that pass (confirmation step, host sidebar item, success message, link to User Detail) are settled only where the drawing settles them. B-119, B-120. (10) RESTRICTED MINORS. A restricted-pending minor may open pages by URL read-only; there is no front-end route block and the server still blocks every write (#370, #12). Confirms the shipped behaviour. B-026, B-125, B-076. (11) STATUS RESPONSE. The status response adds the guardian's first name and the last decision date, never the decline count. The founder did not name the response; the reading is the minor's GET /auth/guardian-consent/status. For the backend agent to confirm: how a first name is derived from the single full-name field (Option A, #393), what 'last decision' covers (decline, approval, withdrawal) and whether a column is needed (the schema has no decline timestamp). Build row B-131. (12) BLOCKED NOT-FOUND. A blocked user's not-found view is identical to the generic not-found view and to a non-existent profile (same page, same status; nothing reveals a block). Confirms #404/#396 and the Figma pass K frames. B-007, B-039, B-082, B-108. (13) GUARDIAN CONFIRM FOOTNOTE. The footnote 'Declining closes the account and schedules it for deletion' on the guardian confirm page is wrong for declines 1 and 2; it is replaced by the existing cap sentence addressed to the guardian, tagged [COPY PENDING LEGAL REVIEW]. The change alters guardian-visible wording, so CONSENT_SCREEN_VERSION is bumped (v3 to v4) with the tripwire hash (#348) and the pending-copy manifest row is replaced. Found while checking, NOT covered by the founder's wording: the page's post-decline state ('Your decision has been recorded ... will be scheduled for deletion') has the same fault. Build row B-130. (REGISTER) B-124 scope is apps/web and apps/admin only (as built); the services/api email wording tagged [COPY PENDING LEGAL REVIEW] is added to docs/pending-copy-manifest.md as OPEN (three templates tagged in code comments: guardian-approved-minor, the third-decline guardian-consent-declined, username-revoked; other child- and guardian-facing templates carry no tag). New rows B-127 to B-139: B-127 light theme, B-128 resend verification, B-129 User Detail without the DOB, B-130 guardian confirm footnote, B-131 status response fields, B-132 horizontal overflow at 390 px, B-133 Edit Profile username (never send null; show the error codes), B-134 real-API end-to-end smoke test, B-135 Figma approval-on-hold, B-136 Figma verify-email prompt, B-137 Figma guardian fields of the DOB correction, B-138 Figma general profile frames (plain other-user; own Posts, Media, Saved) that must exist before the four legacy profile frames 1455:4362, 1455:6626, 5702:8250 and 5778:8490 can be archived, B-139 RevokedUsername retention and appeal path (OPEN, no decision). Status lines on 27 register rows. 139 B-IDs; 146 gap frames unchanged. Arithmetic: docs/build-register.md Section 22. (FORWARD-POINTERS) Dated notes appended (original text unchanged) to #364, #367, #368, #369, #398, #402 and #404 (from docs/backend-w4-username-report.md section 7) and to #37, #389, #395 and #405 (points #406 amends or closes). NOT DECIDED HERE: the retention and appeal path of RevokedUsername (B-139, OPEN); the mechanics of item 1; the limits of item 3; the form of the DOB read in item 4; the final wording of item 7; the response and derivation in item 11; the post-decline state in item 13; whether the pending-copy guard is ever extended to services/api; counsel wording of every [COPY PENDING LEGAL REVIEW] string.</w:t>
+              <w:t>Resolved -- recorded. FOUNDER-ADOPTED DEFAULTS, VETO-ABLE, all thirteen items. DECIDED, NOT BUILT, except item 8 (as built in W4, PR #420), item 9 (the drawing exists, Figma pass K) and item 10 (as built in FC2, PR #421), which confirm what already exists. Item numbers are the founder's own. Original text of every entry named in the forward-pointers below is unchanged (dated notes appended). (1) DECLINED-AT-1-OR-2 ROWS EXPIRE (closes B-126 in principle). A guardian-consent row declined at decline 1 or 2 and not reopened (no resend, no change of guardian email) within 14 days (a configuration value) takes the same lapse path as an unanswered request (#337-#340, #389). The backend agent confirms the mechanics before building: where the 14 days start, whether the one automatic re-send and warning comes first or the row goes straight to the second-lapse outcome, and that an expiry does not count among the three declines (#389). Resolves, in principle, the conflict with legal copy v0.8 Part 4.4 (a minor's account cannot remain restricted-pending indefinitely); counsel still to review; the legal copy is not edited here. (2) LIGHT THEME. The onboarding, guardian and consent screens in apps/web move to the light theme to match their Figma frames: Age Gate, Guardian Details, Guardian Consent, Verify Email and its prompt, Create Profile and the Club Picker step (the set the FC2 browser check found dark). No new colour. Build row B-127. (3) RESEND VERIFICATION. A rate-limited resend-verification-email endpoint is added; #37 recorded that none exists. The limits, and who may call it, are set in the build PR and are not decided here. Build row B-128. (4) DATE OF BIRTH ON USER DETAIL. User Detail reads without the date of birth; the DOB appears only on the correction form; the server rejects a correction reason that contains a date. Amends #405 item 5 and #398 D4 (GET /admin/users/:id returned the decrypted DOB, each view audited): roles are unchanged (moderator and superadmin). For the backend agent to confirm: how the form gets the current DOB (a separate read), whether that read is audited like user.dob_viewed, and which date formats the reason check rejects (a reason cannot be proven free of every date form). Build row B-129. (5) PIN REMOVAL TIME. The pin is removed from the finalist's profile at 00:00 Europe/London on the 1st of the month after the contest month, and at that moment the final entry becomes an ordinary Community-feed post. Closes the 'time of day of the flip' open point of #405 item 1. B-091, B-092, B-082. (6) IMPRESSION SECOND. The 1-second view of #405 item 7 is continuous (the tile stays at least 50 percent in view for one uninterrupted second); a re-entry counts again, within the per-viewer daily cap of #388 (week 4 only). Closes the two 'not stated' points of #405 item 7. B-092. (7) NOTIFICATIONS. Notification icons as drawn in Figma pass K are accepted; the Notification Centre empty-state line and the coming-soon line are updated to mention Contest. Observation, not a decision: the coming-soon line written under #279 already names 'Contest activity' as upcoming, which is no longer true now that Contest notifications exist; the Figma agent sets the final wording. B-121, B-123. (8) USERNAME. A 30-day change cooldown with one free correction (as built, B-032) and no hold on a handle the user releases; the 30-day hold applies to an admin revoke only (#398 D3, #402 item 3). Not addressed: a handle released by anonymisation is released immediately as built; whether to hold it is not decided. B-032, B-033. (9) INCORRECT-DETAILS SCREEN. The founder accepts the admin screen as drawn in Figma pass K (8 frames, docs/figma-pass-k-report.md); B-120 builds from it, with no field, column or control beyond the frames. The four SCOPE OPEN notes of that pass (confirmation step, host sidebar item, success message, link to User Detail) are settled only where the drawing settles them. B-119, B-120. (10) RESTRICTED MINORS. A restricted-pending minor may open pages by URL read-only; there is no front-end route block and the server still blocks every write (#370, #12). Confirms the shipped behaviour. B-026, B-125, B-076. (11) STATUS RESPONSE. The status response adds the guardian's first name and the last decision date, never the decline count. The founder did not name the response; the reading is the minor's GET /auth/guardian-consent/status. For the backend agent to confirm: how a first name is derived from the single full-name field (Option A, #393), what 'last decision' covers (decline, approval, withdrawal) and whether a column is needed (the schema has no decline timestamp). Build row B-131. (12) BLOCKED NOT-FOUND. A blocked user's not-found view is identical to the generic not-found view and to a non-existent profile (same page, same status; nothing reveals a block). Confirms #404/#396 and the Figma pass K frames. B-007, B-039, B-082, B-108. (13) GUARDIAN CONFIRM FOOTNOTE. The footnote 'Declining closes the account and schedules it for deletion' on the guardian confirm page is wrong for declines 1 and 2; it is replaced by the existing cap sentence addressed to the guardian, tagged [COPY PENDING LEGAL REVIEW]. The change alters guardian-visible wording, so CONSENT_SCREEN_VERSION is bumped (v3 to v4) with the tripwire hash (#348) and the pending-copy manifest row is replaced. Found while checking, NOT covered by the founder's wording: the page's post-decline state ('Your decision has been recorded ... will be scheduled for deletion') has the same fault. Build row B-130. (REGISTER) B-124 scope is apps/web and apps/admin only (as built); the services/api email wording tagged [COPY PENDING LEGAL REVIEW] is added to docs/pending-copy-manifest.md as OPEN (three templates tagged in code comments: guardian-approved-minor, the third-decline guardian-consent-declined, username-revoked; other child- and guardian-facing templates carry no tag). New rows B-127 to B-139: B-127 light theme, B-128 resend verification, B-129 User Detail without the DOB, B-130 guardian confirm footnote, B-131 status response fields, B-132 horizontal overflow at 390 px, B-133 Edit Profile username (never send null; show the error codes), B-134 real-API end-to-end smoke test, B-135 Figma approval-on-hold, B-136 Figma verify-email prompt, B-137 Figma guardian fields of the DOB correction, B-138 Figma general profile frames (plain other-user; own Posts, Media, Saved) that must exist before the four legacy profile frames 1455:4362, 1455:6626, 5702:8250 and 5778:8490 can be archived, B-139 RevokedUsername retention and appeal path (OPEN, no decision). Status lines on 27 register rows. 139 B-IDs; 146 gap frames unchanged. Arithmetic: docs/build-register.md Section 22. (FORWARD-POINTERS) Dated notes appended (original text unchanged) to #364, #367, #368, #369, #398, #402 and #404 (from docs/backend-w4-username-report.md section 7) and to #37, #389, #395 and #405 (points #406 amends or closes). NOT DECIDED HERE: the retention and appeal path of RevokedUsername (B-139, OPEN); the mechanics of item 1; the limits of item 3; the form of the DOB read in item 4; the final wording of item 7; the response and derivation in item 11; the post-decline state in item 13; whether the pending-copy guard is ever extended to services/api; counsel wording of every [COPY PENDING LEGAL REVIEW] string. [2026-10-18: Built in W3d (PR #424, docs/backend-w3d-report.md section 7), backend only: item 1 as B-126 (14 days counted from the new Guardian.consentDeclinedAt; the automatic re-send and the minor's warning come first; an expiry does not count among the three declines); item 3 as B-128 (POST /auth/resend-verification-email, unauthenticated and keyed by email, 5 per 60 s per IP plus 3 per hour per account, one response for every outcome); item 4 as B-129 (see #405); item 11 as B-131 (guardianFirstName and lastDecisionAt on the minor's status response, the decline count never returned). Frontend legs of items 3, 4, 11 and 13 are not built. Figma pass K2 (PR #425, docs/figma-pass-k2-report.md) drew B-135 to B-138 and archived the four legacy profile frames; its open candidates are rows B-144 to B-150. The QA end-to-end run (PR #426) checked items 3, 4 and 13 and measured the 390 px overflow: D-08, D-07, D-10 and D-11/D-12 map to B-128, B-129, B-130 and B-132; the other defects and gaps are mapped in docs/build-register.md Section 25 and recorded in #407.]</w:t>
+            </w:r>
+          </w:p>
+        </w:tc>
+      </w:tr>
+      <w:tr>
+        <w:tc>
+          <w:tcPr>
+            <w:tcW w:type="dxa" w:w="500"/>
+          </w:tcPr>
+          <w:p>
+            <w:r>
+              <w:t>407</w:t>
+            </w:r>
+          </w:p>
+        </w:tc>
+        <w:tc>
+          <w:tcPr>
+            <w:tcW w:type="dxa" w:w="4700"/>
+          </w:tcPr>
+          <w:p>
+            <w:r>
+              <w:t>Founder decisions 2026-10-18 on the end-to-end onboarding QA report (7 items): the web app stops sending credentials 'include' on registerUser and the API restricts CORS to WEB_APP_BASE_URL and a new ADMIN_APP_BASE_URL (plus localhost in development); the age-5 floor of #19 is enforced server-side with a 400; the username filter matches long unambiguous hate and sexual terms by CONTAINS with a tested list of innocent words, short ambiguous ones stay exact; the restricted-pending and guardian screens no longer promise 'follow'; the guardian approval screen no longer says the account is active; the stale-decline re-send to a guardian who declined stays as built; the legacy Saved frame 1460:8940 is archived.</w:t>
+            </w:r>
+          </w:p>
+        </w:tc>
+        <w:tc>
+          <w:tcPr>
+            <w:tcW w:type="dxa" w:w="1850"/>
+          </w:tcPr>
+          <w:p>
+            <w:r>
+              <w:t>docs/decisions-qa-defects-2026-10-18 (docs only, 2026-10-18; founder decisions 2026-10-18, items 1-7 and the register instruction; docs/build-register.md Section 25, CLAUDE.md; sources docs/qa-e2e-onboarding-report.md (PR #426), docs/backend-w3d-report.md sections 6 and 7 (PR #424), docs/figma-pass-k2-report.md section 6 (PR #425))</w:t>
+            </w:r>
+          </w:p>
+        </w:tc>
+        <w:tc>
+          <w:tcPr>
+            <w:tcW w:type="dxa" w:w="2300"/>
+          </w:tcPr>
+          <w:p>
+            <w:r>
+              <w:t>Resolved -- recorded. FOUNDER-ADOPTED DEFAULTS, VETO-ABLE, all seven items. DECIDED, NOT BUILT, except item 6, which confirms what is already built (W3d, PR #424). Item numbers are the order of the founder's instruction. Original text of every entry named in the forward-pointers below is unchanged (dated notes appended). Source: the QA run of PR #426 (docs/qa-e2e-onboarding-report.md): 165 browser tests against the real API, 17 defects (D-01 to D-17) and 3 gaps (G-1 to G-3). (1) CORS (QA D-01, BLOCKER / SAFEGUARDING). apps/web/src/api/auth.ts registerUser sends credentials 'include' and services/api/src/main.ts calls app.enableCors() with no options (it answers '*'); browsers refuse that combination, so sign-up fails in every browser when web and API are on different origins, as in production, and no request reaches the API. Decided: registerUser stops sending credentials 'include'; the API restricts CORS to the origins in WEB_APP_BASE_URL and a new ADMIN_APP_BASE_URL, plus localhost origins in development. The new variable is added to render.yaml (both services), .env.example and the env-completeness check; the founder sets its production value in Render. The API sets no cookie and returns the refresh token in the response body, so the credentials option appears to have no function (to confirm in the build PR). Not decided: what the API does when a variable is unset in production, and origins other than the two apps. Build row B-140 (W1). (2) AGE-5 FLOOR (QA D-02, BLOCKER / SAFEGUARDING). #19 says signup is hard-blocked below age 5 regardless of guardian consent, but the floor exists only in the web Age Gate: POST /auth/register with a date of birth 4 years ago and a valid guardian block returns 201 and creates the account and the guardian request. Decided: the floor is enforced server-side with a 400; exactly age 5 stays accepted. Not decided: the error code and message; the build PR checks the DOB-correction tool (#390) cannot set a date of birth below the floor. Build row B-141 (W1). (3) USERNAME FILTER (QA D-06). Hate and sexual terms glued to other letters (xxhitlerxx, nazifan) are accepted because the filter's EXACT list matches only the whole handle or an underscore token. Decided: long, unambiguous terms are matched by CONTAINS, with a tested list of innocent words that must still be accepted; short or ambiguous terms stay exact. Not decided: the term lists and the length threshold (set in the build PR, for founder review). Build row B-142 (W4). (4) 'FOLLOW' PROMISES (QA D-13). The restricted-pending view says 'Browse and follow' and the guardian page lists 'Follow teams and check scores', but a restricted-pending minor's follow is refused with 403 (#370). Decided: both screens stop promising follow and the wording says what works, tagged [COPY PENDING LEGAL REVIEW] and added to the pending-copy manifest; the guardian-page change is guardian-visible, so CONSENT_SCREEN_VERSION and the tripwire hash (#348) are bumped under the rule of B-130. The Figma frames are not checked here for the same promise. Build row B-154 (W9). (5) GUARDIAN APPROVAL SCREEN (QA D-09). After approval the guardian is told 'The account is now active', but the minor still has to verify email and create a profile. Decided: the screen no longer says the account is active; it says the approval is recorded and registration continues ([COPY PENDING LEGAL REVIEW]), matching the Figma Approved screens (#403 item 3). Build row B-153 (W9). (6) STALE-DECLINE RE-SEND STAYS. A guardian who declined at decline 1 or 2 is still sent a new consent request by the platform when the row lapses after 14 days (#406 item 1, built as B-126), after the minor is warned. This settles judgment call 1 of docs/backend-w3d-report.md (section 5). The alternative, warning the minor and closing after a further window without re-sending, stays a one-place change (GuardianStaleDeclineSweepService); the cap of three declines bounds the re-sends. Counsel review of legal copy v0.8 Part 4.4 is still pending. Rows B-126, B-102. (7) LEGACY SAVED FRAME. The Figma frame 1460:8940 (own Saved, absolute layout) is archived, now that 6747:29445 replaces it (Figma pass K2, candidate 2): hidden and renamed 'ARCHIVED - ...', nothing deleted, after a page-wide reference scan, and added to docs/figma-archive-index.md. Build row B-144 (W0). (REGISTER) docs/build-register.md Section 25: B-140 to B-162 added (23 rows); every QA defect and gap, every open item of the W3d report (section 6) and every K2 candidate (1-10) is mapped to a row, reused (B-120, B-128, B-129, B-130, B-131, B-132, B-133, B-134, B-078, B-138) or new. D-01 and D-02 are marked BLOCKER / SAFEGUARDING. Status lines on 23 existing rows. 162 B-IDs; 146 gap frames unchanged. Arithmetic: Section 25g. (FORWARD-POINTERS) Dated notes appended (original text unchanged) to #19, #199, #337, #338, #339, #340, #368, #369, #370, #377, #389, #395, #402, #403, #405 and #406 (the W3d report's section 7 pointers, the status of K2 and of the QA run). NOT DECIDED HERE: the behaviour when an origin variable is unset in production, and any further CORS origin; the error code of the 400; the term and innocent-word lists; the Figma side of the 'follow' promise; the post-decline state of the guardian confirm page (D-10, same fault as the footnote of #406 item 13, still not covered by the founder's wording); K2 candidates 1, 3, 4, 6, 7, 8 (register rows B-147 to B-150 are OPEN); the W3d open items on earlier verification links (B-160) and on a non-active account with a stale decline (B-161); counsel wording of every [COPY PENDING LEGAL REVIEW] string.</w:t>
             </w:r>
           </w:p>
         </w:tc>

</xml_diff>

<commit_message>
docs: Decision Log #408 and build register B-163 to B-177 (founder decisions 2026-10-19)
Docs only. Records the founder's 2026-10-19 decisions on the open points of
W3e (PR #429), FC3a (PR #430), FC3b (PR #431) and Figma pass K3 (PR #428) as
Decision Log #408, adds register rows B-163 to B-177 (Section 27), status lines
on 25 rows, dated forward-pointers on 14 Decision Log rows, one line in the QA
report (CORS proxy removed in PR #429) and corrects four stale "not merged"
lines in CLAUDE.md. docs/pending-copy-manifest.md is deliberately unchanged:
its inventory test fails on a row with no tagged string in source (B-169).

Co-Authored-By: Claude Sonnet 5.5 <noreply@anthropic.com>
</commit_message>
<xml_diff>
--- a/docs/Soccernity_MVP_Build_Plan_v1.7.docx
+++ b/docs/Soccernity_MVP_Build_Plan_v1.7.docx
@@ -10153,7 +10153,7 @@
                 <w:sz w:val="19"/>
                 <w:szCs w:val="19"/>
               </w:rPr>
-              <w:t>Resolved and implemented — PR #38 shipped MINIMUM_SIGNUP_AGE = 5 in AgeGateStep.tsx, backed by 7 tests [2026-10-18: QA run (PR #426, docs/qa-e2e-onboarding-report.md), D-02: the age-5 floor is enforced only in the web Age Gate; POST /auth/register with a date of birth 4 years ago and a valid guardian block returns 201 and creates the account and the guardian request, because age.util.ts leaves the floor to the frontend. Decided 2026-10-18 (#407, item 2): the floor is enforced server-side with a 400. Register row B-141.]</w:t>
+              <w:t>Resolved and implemented — PR #38 shipped MINIMUM_SIGNUP_AGE = 5 in AgeGateStep.tsx, backed by 7 tests [2026-10-18: QA run (PR #426, docs/qa-e2e-onboarding-report.md), D-02: the age-5 floor is enforced only in the web Age Gate; POST /auth/register with a date of birth 4 years ago and a valid guardian block returns 201 and creates the account and the guardian request, because age.util.ts leaves the floor to the frontend. Decided 2026-10-18 (#407, item 2): the floor is enforced server-side with a 400. Register row B-141.] [2026-10-19: Enforced server-side by backend/w3e (PR #429, #407 item 2): POST /auth/register and the DOB-correction tool return 400 below_minimum_age below age 5; exactly 5 is accepted.]</w:t>
             </w:r>
           </w:p>
         </w:tc>
@@ -13864,7 +13864,7 @@
           </w:tcPr>
           <w:p>
             <w:r>
-              <w:t>Resolved. Token: semantic/alert (VariableID:5670:8226) in the Soccernity Theme collection (VariableCollectionId:5096:2). Value #FA0606 kept as-is (it is already the value in ~110 places — a pure hex→token rebind, zero visual change) in BOTH Light and Dark modes: every use is a small non-text indicator, and a distinct dark red would risk reading as a different state; revisit the Dark value only if a future contrast pass finds a specific text use failing, and disclose it then. This is a deliberate, founder-authorised exception to the two-colour palette rule — red is permitted ONLY as a semantic loss / destructive / alert colour, now a single auditable bound token rather than loose hex. Bound at 2819:4084 (avatar unread dot) and across the 110 paints listed in #97.</w:t>
+              <w:t>Resolved. Token: semantic/alert (VariableID:5670:8226) in the Soccernity Theme collection (VariableCollectionId:5096:2). Value #FA0606 kept as-is (it is already the value in ~110 places — a pure hex→token rebind, zero visual change) in BOTH Light and Dark modes: every use is a small non-text indicator, and a distinct dark red would risk reading as a different state; revisit the Dark value only if a future contrast pass finds a specific text use failing, and disclose it then. This is a deliberate, founder-authorised exception to the two-colour palette rule — red is permitted ONLY as a semantic loss / destructive / alert colour, now a single auditable bound token rather than loose hex. Bound at 2819:4084 (avatar unread dot) and across the 110 paints listed in #97. [2026-10-19: #408 item 4 authorises semantic/alert in apps/web and apps/admin for error callouts (the accent bar, border and icon, not text or button fills); the exception recorded here for Figma now also covers that use in code (B-166). The LIVE indicator and the unread dot are not covered.]</w:t>
             </w:r>
           </w:p>
         </w:tc>
@@ -24775,7 +24775,7 @@
           </w:tcPr>
           <w:p>
             <w:r>
-              <w:t>Resolved - implemented (backend). OPERATIONAL MEANING: consentScreenVersion is a MANUALLY BUMPED string constant (CONSENT_SCREEN_VERSION = 'v1', services/api/src/modules/auth/guardian-consent/consent-screen-version.constants.ts). Nothing derives it from the screen's content, a hash or a git revision, and nothing detects drift: whoever materially changes the guardian-consent confirmation screen's wording or substance (apps/web GuardianConsentConfirmPage.tsx / its Figma frame) must bump it in the same PR. Cosmetic changes need no bump. deviceType is a coarse 'mobile' | 'desktop' | 'unknown' derived from the User-Agent header at confirmation; the raw User-Agent is never stored (data minimisation). WHERE: ConsentAuditRecord only exists from anonymization time (a snapshot), so both values are stamped onto the Guardian row (new nullable consentScreenVersion / consentDeviceType) in the SAME updateMany as consentTimestamp in confirmConsent - no new write path - then snapshotted into ConsentAuditRecord.consentScreenVersion / deviceType by AccountDeletionSweepService. Flagged: two additive nullable columns on Guardian (beyond Section 3; safeguarding fields untouched, nothing weakened). Existing rows carry NULL, not backfilled. No admin/compliance export of ConsentAuditRecord exists to update. Open: the version constant is only as reliable as reviewers remembering to bump it; the guardian-facing page is not yet checked against it in CI; an idempotent re-confirm never overwrites the original evidence.</w:t>
+              <w:t>Resolved - implemented (backend). OPERATIONAL MEANING: consentScreenVersion is a MANUALLY BUMPED string constant (CONSENT_SCREEN_VERSION = 'v1', services/api/src/modules/auth/guardian-consent/consent-screen-version.constants.ts). Nothing derives it from the screen's content, a hash or a git revision, and nothing detects drift: whoever materially changes the guardian-consent confirmation screen's wording or substance (apps/web GuardianConsentConfirmPage.tsx / its Figma frame) must bump it in the same PR. Cosmetic changes need no bump. deviceType is a coarse 'mobile' | 'desktop' | 'unknown' derived from the User-Agent header at confirmation; the raw User-Agent is never stored (data minimisation). WHERE: ConsentAuditRecord only exists from anonymization time (a snapshot), so both values are stamped onto the Guardian row (new nullable consentScreenVersion / consentDeviceType) in the SAME updateMany as consentTimestamp in confirmConsent - no new write path - then snapshotted into ConsentAuditRecord.consentScreenVersion / deviceType by AccountDeletionSweepService. Flagged: two additive nullable columns on Guardian (beyond Section 3; safeguarding fields untouched, nothing weakened). Existing rows carry NULL, not backfilled. No admin/compliance export of ConsentAuditRecord exists to update. Open: the version constant is only as reliable as reviewers remembering to bump it; the guardian-facing page is not yet checked against it in CI; an idempotent re-confirm never overwrites the original evidence. [2026-10-19: FC3a (PR #430) bumped CONSENT_SCREEN_VERSION v3 to v4 and the hash when the guardian page wording changed (B-130, B-153, B-154). #408 item 6 tags the post-decline clause, which forces a further bump to v5 in its build PR (B-169).]</w:t>
             </w:r>
           </w:p>
         </w:tc>
@@ -25682,7 +25682,7 @@
           </w:tcPr>
           <w:p>
             <w:r>
-              <w:t>Resolved -- decided, NOT yet built. A username is required at Create Profile so that no user, minor or adult, is shown to other users under a real name. Until Create Profile is complete an account is shown to others under a neutral placeholder name, cannot post, and is redirected to Create Profile on every login. Applies to adults and to approved minors. Builds on #364 (User.username, shipped optional, 'username first, display name fallback'), which this makes mandatory for any account that completes onboarding; legacy accounts with no username fall under the same gate. Username moderation rules (reserved words, impersonation, profanity, no personal data in usernames, change cooldown, released-handle holding period, admin revoke built code-first with a design follow-up) are specified in the build PR, not here. OPEN: what the placeholder name is, and how the gate treats accounts that already exist without a username. [2026-10-16: Amended by #403. The placeholder name for incomplete profiles is 'Soccernity member' (closes the first OPEN point). The second OPEN point (accounts that already exist without a username) is not addressed.] [2026-10-17: The second OPEN point (accounts that already exist without a username) is resolved by B-027, which is built (backend/w3-gates, PR #412): legacy accounts are inside the incomplete-profile gate, and the placeholder other users see is 'Soccernity member' (#403, item 15). The wording of the gate is unchanged. Recorded in #404.] [2026-10-18: Rules specified and built by B-032 (docs/backend-w4-username-report.md): reserved words, impersonation (club names), profanity, contact details, personal data, 30-day change cooldown, revoked-handle hold. A user can no longer clear their own username (B-031). Recorded in #406, item 8: one free correction; no hold on a handle the user releases.] [2026-10-18: QA run (PR #426, docs/qa-e2e-onboarding-report.md), D-06: hate and sexual terms glued to other letters (xxhitlerxx, nazifan) are accepted while hitler_1488, nazi_fan and fuckface are refused, because the EXACT list matches only the whole handle or an underscore token. Decided 2026-10-18 (#407, item 3): long unambiguous terms match by CONTAINS with a tested list of innocent words; short ambiguous terms stay exact. Register row B-142. D-05: Edit Profile still labels the username 'Optional' (B-133).]</w:t>
+              <w:t>Resolved -- decided, NOT yet built. A username is required at Create Profile so that no user, minor or adult, is shown to other users under a real name. Until Create Profile is complete an account is shown to others under a neutral placeholder name, cannot post, and is redirected to Create Profile on every login. Applies to adults and to approved minors. Builds on #364 (User.username, shipped optional, 'username first, display name fallback'), which this makes mandatory for any account that completes onboarding; legacy accounts with no username fall under the same gate. Username moderation rules (reserved words, impersonation, profanity, no personal data in usernames, change cooldown, released-handle holding period, admin revoke built code-first with a design follow-up) are specified in the build PR, not here. OPEN: what the placeholder name is, and how the gate treats accounts that already exist without a username. [2026-10-16: Amended by #403. The placeholder name for incomplete profiles is 'Soccernity member' (closes the first OPEN point). The second OPEN point (accounts that already exist without a username) is not addressed.] [2026-10-17: The second OPEN point (accounts that already exist without a username) is resolved by B-027, which is built (backend/w3-gates, PR #412): legacy accounts are inside the incomplete-profile gate, and the placeholder other users see is 'Soccernity member' (#403, item 15). The wording of the gate is unchanged. Recorded in #404.] [2026-10-18: Rules specified and built by B-032 (docs/backend-w4-username-report.md): reserved words, impersonation (club names), profanity, contact details, personal data, 30-day change cooldown, revoked-handle hold. A user can no longer clear their own username (B-031). Recorded in #406, item 8: one free correction; no hold on a handle the user releases.] [2026-10-18: QA run (PR #426, docs/qa-e2e-onboarding-report.md), D-06: hate and sexual terms glued to other letters (xxhitlerxx, nazifan) are accepted while hitler_1488, nazi_fan and fuckface are refused, because the EXACT list matches only the whole handle or an underscore token. Decided 2026-10-18 (#407, item 3): long unambiguous terms match by CONTAINS with a tested list of innocent words; short ambiguous terms stay exact. Register row B-142. D-05: Edit Profile still labels the username 'Optional' (B-133).] [2026-10-19: Built by backend/w3e (PR #429, #407 item 3): long unambiguous terms match by CONTAINS, nazi with named innocent exceptions. #408 item 3 allows the exact whole handles nazif, nazifa and nazifah and still refuses nazifan (B-165); the term lists and the 5-letter threshold are recorded in #408 and stay open for founder review.]</w:t>
             </w:r>
           </w:p>
         </w:tc>
@@ -26018,7 +26018,7 @@
           </w:tcPr>
           <w:p>
             <w:r>
-              <w:t>Future consideration, NOT in MVP, not decided. Possible later: players linked to Grassroots clubs through the Grassroots feature get a player profile card linked to their accounts. Because no position, school-team, stats or photo fields exist in the schema, API or UI, the 'Build a player profile / position, club or school team, and stats' and 'Add your position and photo' claims are removed from the guardian flow copy (GuardianConsentConfirmPage.tsx, GuardianConsentPage.tsx; Figma 5113:6669, 5114:6698; audit Q6). Do not build without a new decision (CLAUDE.md non-negotiable #4: no Discover/Careers-pillar work without an explicit go-ahead). [2026-10-18: QA run (PR #426, docs/qa-e2e-onboarding-report.md), D-15: the guardian page still shows 'Build a player profile - Position, club or school team, and stats they add themselves' and a visible drafting note ('[COPY PENDING LEGAL REVIEW -- expiry/deletion/withdrawal copy from the Figma frame is not reproduced here ...]'). Tracked in register row B-078; not built.]</w:t>
+              <w:t>Future consideration, NOT in MVP, not decided. Possible later: players linked to Grassroots clubs through the Grassroots feature get a player profile card linked to their accounts. Because no position, school-team, stats or photo fields exist in the schema, API or UI, the 'Build a player profile / position, club or school team, and stats' and 'Add your position and photo' claims are removed from the guardian flow copy (GuardianConsentConfirmPage.tsx, GuardianConsentPage.tsx; Figma 5113:6669, 5114:6698; audit Q6). Do not build without a new decision (CLAUDE.md non-negotiable #4: no Discover/Careers-pillar work without an explicit go-ahead). [2026-10-18: QA run (PR #426, docs/qa-e2e-onboarding-report.md), D-15: the guardian page still shows 'Build a player profile - Position, club or school team, and stats they add themselves' and a visible drafting note ('[COPY PENDING LEGAL REVIEW -- expiry/deletion/withdrawal copy from the Figma frame is not reproduced here ...]'). Tracked in register row B-078; not built.] [2026-10-19: FC3a (PR #430) removed 'Build a player profile' from the guardian page and the position and photo promise from the pending view (B-078, B-154). The Figma frames 5491:8241, 5501:8453 and 5108:6629 still say 'follow teams': B-177.]</w:t>
             </w:r>
           </w:p>
         </w:tc>
@@ -26522,7 +26522,7 @@
           </w:tcPr>
           <w:p>
             <w:r>
-              <w:t>Resolved -- decided, NOT yet built. SUPERSEDES #374 'as-is' for explicit declines on a still-valid request (the rest of #374 is retained). A guardian's explicit decline lets the minor resend or change the guardian email; the decline frames 5491:8241 / 5501:8453 must be wired to this logic (this settles #374's 'archive or rewrite' choice: rewrite and wire). MAX 3 declines; after the 3rd the account moves to pending deletion via the existing refuseConsentAndScheduleDeletion path (sessions revoked, 30-day grace, anonymise, purge rule #375). An expired request / second lapse does NOT count among the 3 and goes straight to the original plan (pending deletion). A guardian withdrawing consent after approval goes straight to the original plan. Changing the guardian email does NOT reset the count. Abuse protection: a cap on requests per day and a 'don't contact me again' option for the recipient. Retained from #374: 72h token TTL (GUARDIAN_CONSENT_TOKEN_TTL_HOURS), first lapse = automatic re-send plus a reminder to the minor, second lapse = implicit decline -&gt; original plan. Known bug to fix with this work: GuardianConsentPage currently treats 'declined' as pending (audit section 5 item 5). Note: between declines the minor's sessions must stay valid for them to resend; today every decline revokes sessions and 'declined' is terminal in code, so a per-account decline counter and a revised state model are new build work. Not yet in the legal copy draft (to add). Build register B-102, B-003. Forward-pointer: #374. [2026-10-17: Backend built (B-102, B-110; PR #416): the per-account counter (internal), declines 1 and 2 non-final with sessions valid, the third decline final via refuseConsentAndScheduleDeletion. Not built from this entry: the per-day request cap and the do-not-contact option (superseded by #395 B2, which has neither). Frontend still open: the in-account decline page and GuardianConsentPage's 'declined' rendering (audit section 5 item 5). New open item: B-126.] [2026-10-18: A row declined at decline 1 or 2 and not reopened within 14 days (configuration) takes the same lapse path as an unanswered request (#406, item 1; mechanics for the backend agent to confirm; counsel still to review). The guardian confirm page footnote 'Declining closes the account and schedules it for deletion' is wrong for declines 1-2 and is replaced (#406, item 13).] [2026-10-18: Built (B-126, PR #424): a row declined at decline 1 or 2 and not reopened within 14 days is chased and may end in closure; closure by this route is an expiry, so it is not a fourth decline (see #337). QA run (PR #426): declines 1 and 2 keep the account active and sessions valid, send no email and show the decline view with the cap sentence and no running count; decline 3 blocks login at once (generic 401, pending deletion, one email); a change of guardian restarts approval without resetting the count. The decline view's Resend approval request and Change guardian email actions are broken in apps/web (D-03 = B-151, D-04 = B-152). Judgment call 1 of the W3d report (the platform sends a new request to a guardian who declined) stays as built: #407 item 6.]</w:t>
+              <w:t>Resolved -- decided, NOT yet built. SUPERSEDES #374 'as-is' for explicit declines on a still-valid request (the rest of #374 is retained). A guardian's explicit decline lets the minor resend or change the guardian email; the decline frames 5491:8241 / 5501:8453 must be wired to this logic (this settles #374's 'archive or rewrite' choice: rewrite and wire). MAX 3 declines; after the 3rd the account moves to pending deletion via the existing refuseConsentAndScheduleDeletion path (sessions revoked, 30-day grace, anonymise, purge rule #375). An expired request / second lapse does NOT count among the 3 and goes straight to the original plan (pending deletion). A guardian withdrawing consent after approval goes straight to the original plan. Changing the guardian email does NOT reset the count. Abuse protection: a cap on requests per day and a 'don't contact me again' option for the recipient. Retained from #374: 72h token TTL (GUARDIAN_CONSENT_TOKEN_TTL_HOURS), first lapse = automatic re-send plus a reminder to the minor, second lapse = implicit decline -&gt; original plan. Known bug to fix with this work: GuardianConsentPage currently treats 'declined' as pending (audit section 5 item 5). Note: between declines the minor's sessions must stay valid for them to resend; today every decline revokes sessions and 'declined' is terminal in code, so a per-account decline counter and a revised state model are new build work. Not yet in the legal copy draft (to add). Build register B-102, B-003. Forward-pointer: #374. [2026-10-17: Backend built (B-102, B-110; PR #416): the per-account counter (internal), declines 1 and 2 non-final with sessions valid, the third decline final via refuseConsentAndScheduleDeletion. Not built from this entry: the per-day request cap and the do-not-contact option (superseded by #395 B2, which has neither). Frontend still open: the in-account decline page and GuardianConsentPage's 'declined' rendering (audit section 5 item 5). New open item: B-126.] [2026-10-18: A row declined at decline 1 or 2 and not reopened within 14 days (configuration) takes the same lapse path as an unanswered request (#406, item 1; mechanics for the backend agent to confirm; counsel still to review). The guardian confirm page footnote 'Declining closes the account and schedules it for deletion' is wrong for declines 1-2 and is replaced (#406, item 13).] [2026-10-18: Built (B-126, PR #424): a row declined at decline 1 or 2 and not reopened within 14 days is chased and may end in closure; closure by this route is an expiry, so it is not a fourth decline (see #337). QA run (PR #426): declines 1 and 2 keep the account active and sessions valid, send no email and show the decline view with the cap sentence and no running count; decline 3 blocks login at once (generic 401, pending deletion, one email); a change of guardian restarts approval without resetting the count. The decline view's Resend approval request and Change guardian email actions are broken in apps/web (D-03 = B-151, D-04 = B-152). Judgment call 1 of the W3d report (the platform sends a new request to a guardian who declined) stays as built: #407 item 6.] [2026-10-19: The decline view's Resend approval request and Change guardian email actions (QA D-03, D-04) are fixed by FC3a (PR #430). The post-decline clause 'so it stays switched off' is tagged by #408 item 6 (B-169).]</w:t>
             </w:r>
           </w:p>
         </w:tc>
@@ -26564,7 +26564,7 @@
           </w:tcPr>
           <w:p>
             <w:r>
-              <w:t>Resolved -- decided, NOT yet built. Resolves the open point in #367 ('a user who mistypes their date of birth at the Age Gate has no self-service correction path'). DOB stays read-only after the Age Gate for users. Support can correct it through an admin action (a tool to be built if none exists; none exists today), audited. A correction RE-RUNS the age-tier checks (under-13 / under-16 / under-18 flags, card-verification policy, restrictions). The guardian flow is RE-TRIGGERED when a correction turns an adult account that has never gone through the flow into a minor account. Note: the existing age-reclassification sweep (#349) recomputes isMinor/isUnder16 flags but does not create Guardian rows, so the re-trigger is new build work; the exact audit record fields and the effect on an in-flight request are not specified. Not yet in the legal copy draft. Build register B-103, B-104. Forward-pointer: #367. [2026-10-17: Built (B-103; PR #416): POST /admin/users/:id/dob-correction, moderator and superadmin (confirmed by #405, item 5). It re-runs the age tier and the card-verification policy in one transaction; an age-tier change cancels (to adult) or restarts (to minor) an in-flight request, the restart resets the decline counter and the incorrect-details flag is always cleared (#395 B4, #403 item 15). The audit row user.dob_corrected holds admin, target, reason, old and new tier, never a DOB. Frontend (B-104) not built.]</w:t>
+              <w:t>Resolved -- decided, NOT yet built. Resolves the open point in #367 ('a user who mistypes their date of birth at the Age Gate has no self-service correction path'). DOB stays read-only after the Age Gate for users. Support can correct it through an admin action (a tool to be built if none exists; none exists today), audited. A correction RE-RUNS the age-tier checks (under-13 / under-16 / under-18 flags, card-verification policy, restrictions). The guardian flow is RE-TRIGGERED when a correction turns an adult account that has never gone through the flow into a minor account. Note: the existing age-reclassification sweep (#349) recomputes isMinor/isUnder16 flags but does not create Guardian rows, so the re-trigger is new build work; the exact audit record fields and the effect on an in-flight request are not specified. Not yet in the legal copy draft. Build register B-103, B-104. Forward-pointer: #367. [2026-10-17: Built (B-103; PR #416): POST /admin/users/:id/dob-correction, moderator and superadmin (confirmed by #405, item 5). It re-runs the age tier and the card-verification policy in one transaction; an age-tier change cancels (to adult) or restarts (to minor) an in-flight request, the restart resets the decline counter and the incorrect-details flag is always cleared (#395 B4, #403 item 15). The audit row user.dob_corrected holds admin, target, reason, old and new tier, never a DOB. Frontend (B-104) not built.] [2026-10-19: backend/w3e (PR #429) checked the DOB-correction tool as #407 asked: it refuses a date below age 5 with below_minimum_age. FC3b (PR #431) built the guardian block for an adult corrected to a minor up front (B-104) and moved User Detail to the summary read with no DOB (B-129). Whether User Detail should show the age tier is open: B-172.]</w:t>
             </w:r>
           </w:p>
         </w:tc>
@@ -26783,7 +26783,7 @@
               <w:t>Resolved -- recorded; DECIDED, NOT BUILT. Source: founder decisions 2026-10-15/16. Extends and amends #389; builds on #374, #340 and #390. (B1) The decline frame already exists in Figma (5491:8241 / 5501:8453). After decline 1 and decline 2 the minor sees the existing decline page. It is shown at the minor's next LOGIN ATTEMPT, before a session exists (#374 revokes all sessions and blocks login, so it cannot be shown inside a session): the server answers the login with a 'declined' result instead of issuing a token. BACKEND TO CONFIRM: backend-api must confirm this is buildable, including how the page's resend / change-guardian-email actions are authorised without a session (those routes are JwtAuthGuard-gated today) and that it is consistent with the note in #389 that sessions must stay valid between declines. Recorded as the intended behaviour, not as a verified design. (B2) Decline 3: the account enters the deletion sequence and the minor receives an EMAIL ONLY (no page). No decline count is shown anywhere to anyone; the counter is internal. There is NO 'don't contact me again' option. There is NO requests-per-day cap (only one request can run at a time). Three declines in one day delete the account immediately. Three declines in total, ever, per account. Founder decision; no counsel review needed. This WITHDRAWS the abuse-protection sentence of #389 (a cap on requests per day and a 'don't contact me again' option) and supersedes the open points of build register B-102 and B-003 accordingly; the rest of #389 stands (72h token; first lapse = automatic re-send; expiry, second lapse and post-approval withdrawal go straight to pending deletion and do not count among the three; changing the guardian email does not reset the count). (B3) Guardian withdrawal page (B-013): a LINK is added to the consent email and to the approved screen that pre-fills the code. Throttle ('Too many attempts'): a fixed window held in configuration, no countdown shown, 'Try again' returns to frame 1. 'Request a new link' (expired or used link) returns to frame 1 where the guardian re-enters their email; the page reads identically whether or not an account matched. BACKEND TO CONFIRM: the withdrawal token is issued only when a withdrawal is requested (#340), so what a link in the consent email can pre-fill at that moment must be confirmed. (B4) DOB correction (B-103, B-104; #390): if the corrected age tier changes, an in-flight guardian request is CANCELLED and restarted. This settles the 'effect on an in-flight request' point #390 left open. Build register: B-003, B-013, B-080, B-102, B-103, B-104, B-110 (declined-login result), B-112 (withdrawal link); Figma re-sync in B-107. STILL OPEN: counsel wording; the length of the throttle window (stated as configuration); whether 'delete the account immediately' on a third decline also skips the 30-day grace of #375 (recorded as: enters the deletion sequence immediately, grace not altered by this entry); whether a restart caused by a DOB correction resets the decline counter; the shipped per-minor guardian-email-change cap (5 per 24h, #365) is a separate control and is not altered here.</w:t>
             </w:r>
             <w:r>
-              <w:t xml:space="preserve"> [2026-10-16: Amended by #402. (B1) is AMENDED: sessions stay valid between declines (#389); after decline 1 and 2 the minor sees the existing decline page INSIDE the account via the existing authenticated resend / change-guardian-email routes; the 'declined' login result and its BACKEND TO CONFIRM point are WITHDRAWN (build register B-110 re-scoped). (B2) The open question on the 30-day grace is answered: the third decline blocks login at once and enters pending deletion WITH the existing 30-day grace (#375). The remainder stands.] [2026-10-16: Amended by #403. (B2) The decline page keeps its static sentence stating the cap (Figma node 6627:22230); 'No decline count is shown' means no running 'decline N of 3' counter. (B4) A restart caused by a DOB correction RESETS the decline counter and writes an audit entry (answers the STILL OPEN point). (B3) The withdrawal throttle default is 5 attempts per 15 minutes, held in configuration (sets the window left open).] [2026-10-17: Backend built in PR #416. B1 stays withdrawn (#402). B2: the third decline blocks login at once and enters pending deletion with the 30-day grace, one email. B3: unchanged here. B4 built as B-103: an age-tier change cancels or restarts the request and a restart resets the counter. Open, no decision: a row declined at 1 or 2 and never reopened has no expiry (register row B-126). Frontend decline page not built.] [2026-10-18: Amended by #406: a declined-at-1-or-2 row not reopened within 14 days expires (item 1); the status response adds the guardian's first name and the last decision date, never the decline count (item 11); the guardian confirm page footnote is replaced by the cap sentence (item 13).] [2026-10-18: Built in W3d (B-126, B-128, B-129, B-131; PR #424): see #406 and #389. QA run (PR #426): B2 and B4 behave as decided; the web decline view's Resend and Change guardian email actions are broken (D-03, D-04: B-151, B-152). Judgment call 1 of the W3d report stays as built (#407 item 6).]</w:t>
+              <w:t xml:space="preserve"> [2026-10-16: Amended by #402. (B1) is AMENDED: sessions stay valid between declines (#389); after decline 1 and 2 the minor sees the existing decline page INSIDE the account via the existing authenticated resend / change-guardian-email routes; the 'declined' login result and its BACKEND TO CONFIRM point are WITHDRAWN (build register B-110 re-scoped). (B2) The open question on the 30-day grace is answered: the third decline blocks login at once and enters pending deletion WITH the existing 30-day grace (#375). The remainder stands.] [2026-10-16: Amended by #403. (B2) The decline page keeps its static sentence stating the cap (Figma node 6627:22230); 'No decline count is shown' means no running 'decline N of 3' counter. (B4) A restart caused by a DOB correction RESETS the decline counter and writes an audit entry (answers the STILL OPEN point). (B3) The withdrawal throttle default is 5 attempts per 15 minutes, held in configuration (sets the window left open).] [2026-10-17: Backend built in PR #416. B1 stays withdrawn (#402). B2: the third decline blocks login at once and enters pending deletion with the 30-day grace, one email. B3: unchanged here. B4 built as B-103: an age-tier change cancels or restarts the request and a restart resets the counter. Open, no decision: a row declined at 1 or 2 and never reopened has no expiry (register row B-126). Frontend decline page not built.] [2026-10-18: Amended by #406: a declined-at-1-or-2 row not reopened within 14 days expires (item 1); the status response adds the guardian's first name and the last decision date, never the decline count (item 11); the guardian confirm page footnote is replaced by the cap sentence (item 13).] [2026-10-18: Built in W3d (B-126, B-128, B-129, B-131; PR #424): see #406 and #389. QA run (PR #426): B2 and B4 behave as decided; the web decline view's Resend and Change guardian email actions are broken (D-03, D-04: B-151, B-152). Judgment call 1 of the W3d report stays as built (#407 item 6).] [2026-10-19: QA D-03 and D-04 (the decline view's resend and change-guardian-email actions) are fixed by FC3a (PR #430, B-151, B-152). The guardian page's post-decline state carries the cap sentence (B-130); its clause 'so it stays switched off' is tagged by #408 item 6.]</w:t>
             </w:r>
           </w:p>
         </w:tc>
@@ -26828,7 +26828,7 @@
               <w:t>Resolved -- recorded; DECIDED, NOT BUILT. Source: founder decisions 2026-10-15/16. Settles the semantics left undefined for Block in #371 and build register B-039. (C1) Own profile and other-user profile are two SEPARATE variants; the Block action lives on the other-user variant (mobile included). (C2) A Block model is created. Adopted as decided: blocking hides the blocked user's posts from the blocker; stops messages in both directions; removes follows in both directions; has an optional reason field; can be undone (unblock); and there is a blocked-users list in Settings. The data model and endpoints are backend work. Build register: B-039 (extended: model, endpoints, unblock, list, reason), B-082, B-067, B-107 (remaining Figma states and the mobile trigger), B-108 (frontend, Settings list, unblock). NOT STATED, so left open and not decided here: whether the blocked user is told; whether blocking also affects Bants rooms, comments, likes, search results, group rosters and the leaderboard; whether an unblock restores the removed follows; how Block interacts with the guardian-consent, under-16 and adult-to-minor rules (#346, #347).</w:t>
             </w:r>
             <w:r>
-              <w:t xml:space="preserve"> [2026-10-16: Amended by #402 (founder-adopted defaults, veto-able). The blocked user is not told; a block hides content and search results in both directions (posts, comments, likes, search, rosters); the leaderboard is unaffected; unblock does not restore follows. Still open: Bants rooms, exact like mechanics, and the interaction with #346 / #347.]</w:t>
+              <w:t xml:space="preserve"> [2026-10-16: Amended by #402 (founder-adopted defaults, veto-able). The blocked user is not told; a block hides content and search results in both directions (posts, comments, likes, search, rosters); the leaderboard is unaffected; unblock does not restore follows. Still open: Bants rooms, exact like mechanics, and the interaction with #346 / #347.] [2026-10-19: Figma pass K3 (PR #428) removed the Block row from the own Saved frame 6747:29445, as C1 says (own variant); the legacy frame 1460:8940 had it. Archived.]</w:t>
             </w:r>
           </w:p>
         </w:tc>
@@ -26918,7 +26918,7 @@
               <w:t>Resolved -- recorded; DECIDED, NOT BUILT. Source: founder decisions 2026-10-15/16. Extends #376, #371, #369 and #390. (D1) 'Reporter acted in bad faith' and 'Legal hold' (#376): each has a confirmation step and a reason field, a 'lift hold' control exists, and both actions also APPEAR on Appeal Review (not only Report Detail). The held-investigations list (GET /admin/users/held-investigations) shows the hold TYPE and a marker (per the open points of W0 Figma pass C). (D2) Flagged-image queue (#371): the reject reason is shown to the uploader. The CSAM / statutory path stays under counsel (#371). (D3) Username revoke: an admin action, manual, from User Detail, available at any time after the username exists, triggered by a report or an admin review (offensive, impersonating or personal-data usernames). No account exists without a username (#369), so a revoke returns the account to the incomplete-profile gate (#369): a neutral placeholder name to other users, cannot post, redirected to Create Profile at next login to choose a new username. A REASON is REQUIRED and is stored in the audit record. The user is emailed (wording [COPY PENDING LEGAL REVIEW]). The revoked handle is held for 30 days before anyone can take it, and that user cannot re-pick it. (D4) Everything needed for the DOB correction tool (#390) and for username revoke is built: a single-user admin read endpoint returning the fields the admin needs (including the date of birth) and a User Detail admin screen (build register B-109, a prerequisite of B-103, B-104 and B-033). The audit fields for both tools are specified in the build PR. Build register: B-012, B-032, B-033, B-037, B-044, B-045, B-109; Figma re-sync in B-107. STILL OPEN: the CSAM path (counsel); counsel wording; whether 'that user cannot re-pick it' is permanent or lasts only the 30 days (recorded verbatim; the sentence is ambiguous).</w:t>
             </w:r>
             <w:r>
-              <w:t xml:space="preserve"> [2026-10-16: Amended by #402 (founder-adopted default, veto-able). The revoked handle is held 30 days for everyone, and the revoked user can never re-pick it (permanent for that user).] [2026-10-17: D4 built (B-109; PR #416): GET /admin/users/:id for moderator and superadmin, DOB decrypted server-side only, a user.dob_viewed audit row for every response that contains a DOB, request fails closed if that write fails. The open point 'which admin roles may read a decrypted DOB' is closed by #405, item 5. The User Detail screen in apps/admin is not built (B-104, B-109 frontend leg).] [2026-10-18: Built by B-033: POST /admin/users/:id/username-revoke (moderator, superadmin), reason required and stored in the audit record, user emailed [COPY PENDING LEGAL REVIEW], account back in the incomplete-profile gate, handle held 30 days for everyone and barred for ever for that user. The User Detail screen in apps/admin is not built for the revoke (disabled in FC2). D4 is amended by #406, item 4: User Detail no longer shows the date of birth.]</w:t>
+              <w:t xml:space="preserve"> [2026-10-16: Amended by #402 (founder-adopted default, veto-able). The revoked handle is held 30 days for everyone, and the revoked user can never re-pick it (permanent for that user).] [2026-10-17: D4 built (B-109; PR #416): GET /admin/users/:id for moderator and superadmin, DOB decrypted server-side only, a user.dob_viewed audit row for every response that contains a DOB, request fails closed if that write fails. The open point 'which admin roles may read a decrypted DOB' is closed by #405, item 5. The User Detail screen in apps/admin is not built (B-104, B-109 frontend leg).] [2026-10-18: Built by B-033: POST /admin/users/:id/username-revoke (moderator, superadmin), reason required and stored in the audit record, user emailed [COPY PENDING LEGAL REVIEW], account back in the incomplete-profile gate, handle held 30 days for everyone and barred for ever for that user. The User Detail screen in apps/admin is not built for the revoke (disabled in FC2). D4 is amended by #406, item 4: User Detail no longer shows the date of birth.] [2026-10-19: D3 built in apps/admin by FC3b (PR #431): the Revoke username dialog with a required reason (10 to 500 characters), the revoked state and the error state (B-033, B-143). #408 item 5 adds a line saying the username is held for 30 days to the dialog and result frames, admin-facing only (B-167, B-168). Revocation history stays not shown.]</w:t>
             </w:r>
           </w:p>
         </w:tc>
@@ -27089,7 +27089,7 @@
           </w:tcPr>
           <w:p>
             <w:r>
-              <w:t>Resolved -- recorded; DECIDED, NOT BUILT. FOUNDER-ADOPTED DEFAULTS, VETO-ABLE: each item below is adopted now so build work is not blocked, and stands until the founder says otherwise. Amends #395 and closes open points of #395-#399; the original text of those entries is unchanged (dated notes appended). (1) DECLINE 1 AND 2 -- AMENDS #395 B1. #389 already decided that sessions STAY VALID between declines; only the THIRD decline revokes sessions. After decline 1 and decline 2 the minor sees the existing decline page (5491:8241 / 5501:8453) INSIDE the account, using the existing authenticated resend and change-guardian-email routes. The 'declined login result' design of #395 B1 (a login that answers 'declined' with no token) is WITHDRAWN; so is its BACKEND TO CONFIRM point. Build implications recorded, not decisions: today every decline revokes sessions and 'declined' is terminal in code (#337-#340), and resend / change-guardian-email refuse a declined account (#365), so decline 1 and 2 must stop revoking and those routes must accept the account while fewer than three declines have been recorded. Bug fixed by the same work: GuardianConsentPage treats 'declined' as pending (audit section 5 item 5). Build register: B-110 is RE-SCOPED to this and merged into B-102's dependency chain (B-102 now depends on B-110); the B-ID is kept. (2) THIRD DECLINE. Login is blocked at once and the account enters pending deletion with the EXISTING 30-day grace (#375, via refuseConsentAndScheduleDeletion as in #389). This answers #395's open question: 'delete the account immediately' does NOT skip the grace; the minor still receives the email only, no page and no count (#395 B2 stands). (3) REVOKED USERNAME (#398 D3). The handle is held 30 days for everyone (nobody can take it); the revoked user can NEVER re-pick it. This answers #398's ambiguous 'cannot re-pick' point: permanent for that user, 30 days for others. (4) BLOCK (#396). The blocked user is NOT told. A block hides content and search results in both directions: posts, comments, likes, search, rosters. The leaderboard is unaffected. Unblock does NOT restore follows. Still open: Bants rooms (room membership / room listing; the blocked user's posts are covered by 'posts'), the exact like mechanics, and the interaction with the guardian-consent, under-16 and adult-to-minor rules (#346, #347). (5) 2FA (#397). 10 single-use backup codes, stored HASHED. Lost-device recovery needs a backup code, OR email confirmation plus password. Noted for the founder's veto: the email-plus-password path makes 2FA recovery only as strong as the email account. Still open: backup-code format, storage and encryption of the TOTP secret itself, counsel (legal copy Part C row 44). (6) CONTEST EXPOSURE SETTINGS (#399 E4/E5, #388). Tolerance and the per-viewer daily cap apply to WEEK 4 ONLY, not per contest or per week. Their ranges (1-50 percent; 1-50) stay as validation bounds on the week-4 settings; they lock when week 4 starts (day 22), not when week 1 starts. Watch limit (3-120 s) is unchanged. Build register: B-110 (re-scoped), B-102, B-003, B-107 (decline page behaviour note), B-032, B-033, B-039, B-108, B-086, B-087, B-111, B-091, B-092, B-095, B-097. Not decided here and still open: see docs/build-register.md Section 11d. [2026-10-17: Items 1 and 2 are built in the backend (B-110, B-102; PR #416): sessions stay valid after declines 1 and 2, the third decline blocks login at once with the 30-day grace. The 'existing authenticated resend' wording of item 1 is clarified by #405, item 6: the route is the existing email-keyed POST /auth/guardian-consent/resend, not JWT; change-guardian-email is the JWT one. Item 5 (2FA): the backup-code character set, the TOTP secret storage and the per-account lock are decided by #405, item 8.] [2026-10-18: Item 3 built: RevokedUsername (30-day hold for everyone, permanent bar for the revoked user). Retention and appeal path of that record are OPEN, no decision (B-139, #406).] [2026-10-18: QA run (PR #426) confirmed sessions stay valid between declines 1 and 2 and the third decline blocks login at once with the existing 30-day grace. Two of the decline view's three actions are broken in apps/web (B-151, B-152).]</w:t>
+              <w:t>Resolved -- recorded; DECIDED, NOT BUILT. FOUNDER-ADOPTED DEFAULTS, VETO-ABLE: each item below is adopted now so build work is not blocked, and stands until the founder says otherwise. Amends #395 and closes open points of #395-#399; the original text of those entries is unchanged (dated notes appended). (1) DECLINE 1 AND 2 -- AMENDS #395 B1. #389 already decided that sessions STAY VALID between declines; only the THIRD decline revokes sessions. After decline 1 and decline 2 the minor sees the existing decline page (5491:8241 / 5501:8453) INSIDE the account, using the existing authenticated resend and change-guardian-email routes. The 'declined login result' design of #395 B1 (a login that answers 'declined' with no token) is WITHDRAWN; so is its BACKEND TO CONFIRM point. Build implications recorded, not decisions: today every decline revokes sessions and 'declined' is terminal in code (#337-#340), and resend / change-guardian-email refuse a declined account (#365), so decline 1 and 2 must stop revoking and those routes must accept the account while fewer than three declines have been recorded. Bug fixed by the same work: GuardianConsentPage treats 'declined' as pending (audit section 5 item 5). Build register: B-110 is RE-SCOPED to this and merged into B-102's dependency chain (B-102 now depends on B-110); the B-ID is kept. (2) THIRD DECLINE. Login is blocked at once and the account enters pending deletion with the EXISTING 30-day grace (#375, via refuseConsentAndScheduleDeletion as in #389). This answers #395's open question: 'delete the account immediately' does NOT skip the grace; the minor still receives the email only, no page and no count (#395 B2 stands). (3) REVOKED USERNAME (#398 D3). The handle is held 30 days for everyone (nobody can take it); the revoked user can NEVER re-pick it. This answers #398's ambiguous 'cannot re-pick' point: permanent for that user, 30 days for others. (4) BLOCK (#396). The blocked user is NOT told. A block hides content and search results in both directions: posts, comments, likes, search, rosters. The leaderboard is unaffected. Unblock does NOT restore follows. Still open: Bants rooms (room membership / room listing; the blocked user's posts are covered by 'posts'), the exact like mechanics, and the interaction with the guardian-consent, under-16 and adult-to-minor rules (#346, #347). (5) 2FA (#397). 10 single-use backup codes, stored HASHED. Lost-device recovery needs a backup code, OR email confirmation plus password. Noted for the founder's veto: the email-plus-password path makes 2FA recovery only as strong as the email account. Still open: backup-code format, storage and encryption of the TOTP secret itself, counsel (legal copy Part C row 44). (6) CONTEST EXPOSURE SETTINGS (#399 E4/E5, #388). Tolerance and the per-viewer daily cap apply to WEEK 4 ONLY, not per contest or per week. Their ranges (1-50 percent; 1-50) stay as validation bounds on the week-4 settings; they lock when week 4 starts (day 22), not when week 1 starts. Watch limit (3-120 s) is unchanged. Build register: B-110 (re-scoped), B-102, B-003, B-107 (decline page behaviour note), B-032, B-033, B-039, B-108, B-086, B-087, B-111, B-091, B-092, B-095, B-097. Not decided here and still open: see docs/build-register.md Section 11d. [2026-10-17: Items 1 and 2 are built in the backend (B-110, B-102; PR #416): sessions stay valid after declines 1 and 2, the third decline blocks login at once with the 30-day grace. The 'existing authenticated resend' wording of item 1 is clarified by #405, item 6: the route is the existing email-keyed POST /auth/guardian-consent/resend, not JWT; change-guardian-email is the JWT one. Item 5 (2FA): the backup-code character set, the TOTP secret storage and the per-account lock are decided by #405, item 8.] [2026-10-18: Item 3 built: RevokedUsername (30-day hold for everyone, permanent bar for the revoked user). Retention and appeal path of that record are OPEN, no decision (B-139, #406).] [2026-10-18: QA run (PR #426) confirmed sessions stay valid between declines 1 and 2 and the third decline blocks login at once with the existing 30-day grace. Two of the decline view's three actions are broken in apps/web (B-151, B-152).] [2026-10-19: Item 3 (a revoked username is held 30 days for everyone) is not yet shown to the admin: #408 item 5 adds the line (B-167, B-168).]</w:t>
             </w:r>
           </w:p>
         </w:tc>
@@ -27131,7 +27131,7 @@
           </w:tcPr>
           <w:p>
             <w:r>
-              <w:t>Resolved -- recorded; DECIDED, NOT BUILT. Source: founder decisions 2026-10-16, numbered 1-19 as given to this entry. Amends #400 (items 1, 9, 11), #395 (items 2, 15), #401 (item 7), #369 (item 15), #394 and #371 (item 17) by dated notes appended to those rows; the original text of every row is unchanged. It also changes points recorded in #398 D1 (item 8), #399 E3 (item 10) and #402 item 4 (item 16): those three rows were NOT edited (this entry is the record), see docs/build-register.md Section 12. The founder labelled the country select in item 17 a veto-able default and the withdrawal throttle in item 15 a default held in configuration; everything else is stated as a decision. (1) NON-FINALIST CONTEST TAB -- AMENDS #400 E8. The Create Post Contest tab for a non-finalist is NOT hidden. The tab stays visible, and a non-finalist who opens it during days 22-24 sees the existing 'Closed (not a finalist)' frames (desktop 6660:31044, mobile 6660:35699), which are RESTORED (un-archived, by a Figma pass, not by this entry). The minimum tally x stays admin-only (E8's second sentence stands). (2) DECLINE PAGE CAP SENTENCE -- clarifies #395 B2. The decline page keeps its static sentence that states the cap (Figma node 6627:22230). 'No decline count is shown' means no RUNNING 'decline N of 3' counter. The sentence is minor-facing copy and stays [COPY PENDING LEGAL REVIEW]. (3) GUARDIAN 'APPROVED' SCREENS. 5488:7164 and 5501:8225 are reworded to match the flow (approval continues to Create Profile; extends #394 A5); the new wording is [COPY PENDING LEGAL REVIEW]. (4) ADMIN COMPONENTS. The component frame at Figma node 6671:27364 (Pass F2) exists so that admin screens and apps/admin share ONE Button, Pill, Field, Callout, Banner, Note, Dialog and Table. Adoption is on the Pass C and Pass F1 admin frames only (not on older admin frames). A spacing / radius variable collection is added (a Figma pass does this; 'Soccernity Theme' stays the colour collection). (5) ADMIN SHELL SEARCH BAR. It stays visible on admin screens and is NOT functional ('not available yet'). New register row B-114: decide build vs hide. (6) EXCEPTION TO 'NEVER DELETE' (Figma passes). The ten hidden legacy absolute layers inside the ten rebuilt Create Post frames (the 'ARCHIVED -- legacy absolute layer' children from Pass F2 inside 2008:655, 2009:5168, 2009:2913, 6171:14797, 6171:16994, 2496:4462, 2565:3951, 6660:28736, 6660:31044, 6660:33353) may be deleted, and ONLY those. (7) VOTING PAGE ADOPTS THE ALREADY VOTED DESIGN -- closes the open point of #401. The Voting page (desktop 2094:994, mobile 5802:8726) takes the Already Voted page's design (entries column + board column, fan cards) and carries the vote toggle (#401). The separate Already Voted screens (5802:8978 / 5815:8916, and the auto-layout rebuild 6671:27155) are archived AFTERWARDS, by a Figma pass; the Voting &lt;-&gt; Already Voted navigation of #387 therefore goes with them. (8) LIFT HOLD -- changes #398 D1 / #376. Lift hold applies to BOTH the legal hold and the 6-month bad-faith hold. A reason is required. The held user is NOT notified. Appeal Review reuses the shared hold dialogs (Bad faith / Legal hold / Lift hold) used on Report Detail. (9) FORFEIT POP-UP -- AMENDS #400 E11. Shown ONLY on the Contest page. On every load of that page the user sees one pop-up per forfeited week, from when the week is deemed forfeited (docs/contest-spec.md Section 7); the reason is shown; nothing is remembered between loads. The leaderboard Contest tab shows the forfeited writing in place of the three names for that week (no pop-up there). (10) FINAL TASK TEXT -- changes #399 E3. The week-4 task text shows on the live-ranking and uploading states only (not on the 'No winner this month' or crowned states). (11) COMMUNITY-FEED 'FINAL WEEK' MODULE -- AMENDS #400 E10 and the open point carried by #402. The module STAYS. The dead 'View on the Contest page' link is removed. Its videos become a carousel that keeps the current frame size and serves as a preview slot reusable for other showcases later. It shows only during a final contest week and not at all when there is none. OPEN: whether carousel views count as impressions (B-092). (12) MOBILE BLOCK PATTERN: the '...' menu (confirms the Pass F1 trigger, node 6669:27188). (13) CREATE POST FIGMA CHANGES ACCEPTED: the scrim token change (white 71% to color/overlay/scrim) and the typographic crest marks in the Fixtures module of the Create Post frames. Licensing of club crests in Fixtures stays OPEN (#85, #97). (14) FONT: user-facing read-only fields need a Montserrat Field variant (the admin components are Inter). (15) DEFAULTS CLOSING OPEN POINTS: the placeholder name for incomplete profiles is 'Soccernity member' (closes #369's open point); a DOB-correction restart RESETS the decline counter and writes an audit entry (closes #395 B4's open point); the withdrawal throttle default is 5 attempts per 15 minutes, held in configuration (sets the window left open in #395 B3); unverified-email users are blocked from social writes as well as from PATCH /users/:id (extends the guard built under B-020; new row B-118). (16) BANTS -- an OPEN FORUM, no private messages. Anyone can start a thread and others comment on it; likes work as on a blog or forum (one like per user per item, toggled, public count). Accounts aged 16 and 17 have FULL Bants access (the limit in #346 applies to under-16s only, who stay fully disabled); this is a founder decision, not read-only. Bants will have moderation. Block hides the blocked user's posts, comments and like identities in both directions; counts unchanged; no room membership. This settles the 'Bants rooms' and 'exact like mechanics' points #402 item 4 left open; the interaction with #346 / #347 stays open. OPEN, recorded not resolved: 'thread' is not mapped to the built model (BanterRoom #275 vs Post), and 'no room membership' is not reconciled with the built BanterRoomMember join / leave, My Bants and 'posting requires membership' (#275); the scope of 'moderation' beyond room status (#357) is not stated. New row B-117. (17) COUNTRY HAS TWO SEPARATE FIELDS. (a) SAFEGUARDING country: declared at the Age Gate and derived from the IP lookup (B-023..B-025). Stored separately, never shown, never editable by any profile action; it alone decides US under-13 card verification and demographic grouping (#368 stands). (b) PROFILE country: a separate, nullable, OPTIONAL field. It is BLANK at Create Profile (not prefilled, not read-only), the user may fill it in, and it is editable at any time in Edit Profile (B-083). It is shown on a user's profile only if they filled it in, so a minor's country is visible only if the minor chooses to enter it. AMENDS #394 A1 (Country read-only at Create Profile) and the 'country' item of #371 (profile shows country): those rows stand except for these points. DEFAULT, VETO-ABLE: a country select from the full country list. B-038 stores the profile country as its own column, NOT the derived or declared safeguarding fields. Counsel review of country display stays on the legal list with reduced scope because the field is optional. (18) PRODUCTION WIRING (MaxMind, Render environment variables, Postmark, JWT secrets, TRUST_PROXY_HOPS) is deferred to the launch gate B-090; the code fails safe until it is done. (19) NEW REGISTER ROWS: password-reset email placeholder-address fallback (B-115); API test-suite worker flake, the suite needs --maxWorkers=4 (B-116); admin search bar (B-114, item 5). Rows added from the other items: B-113 (Figma re-sync, items 1-14 and 17), B-117 (Bants open forum), B-118 (email-verification gate on social writes). Build register: B-113 to B-118 new; status lines on B-002, B-003, B-006, B-007, B-012, B-013, B-018, B-020, B-023, B-024, B-026, B-027, B-038, B-039, B-042, B-044, B-045, B-054, B-071, B-079, B-080, B-081, B-082, B-083, B-090, B-091, B-092, B-095, B-096, B-098, B-099, B-102, B-103, B-107, B-108, B-112. STILL OPEN: counsel wording for every [COPY PENDING LEGAL REVIEW] item; the Bants mapping questions in (16); build vs hide for the admin search bar (B-114); whether carousel views count as impressions (B-092); whether the 'Closed (not a finalist)' copy may reveal anything about uploads before the reveal; how other users reach a finalist's entry after the reveal; what the Contest tab shows from 00:00 to 08:00 on day 1; which routes count as 'social writes' (B-118); the interaction of Block with #346 / #347; crest licensing in Fixtures (#85, #97); the CSAM path; the length of every window stated as configuration other than the withdrawal throttle. [2026-10-17: Item 15 (unverified-email users cannot perform social writes) is built: B-118 (backend/w3-gates, PR #412). The creating forms are gated by EmailVerifiedGuard; the undo and own-content forms stay open (docs/backend-w3-gates-report.md, section 5, call 1, adopted by #404, item 12). Two open points of this entry are closed by #404: the forfeit pop-up reading of 'Contest page' and several forfeited weeks (item 4), and whether carousel views count as impressions (items 6 and 15).] [2026-10-17: Items 2 and 15 are built in the backend (PR #416): the decline counter is internal and never returned by any API (item 2); a DOB-correction restart resets it and writes an audit entry (item 15, user.dob_corrected). Item 15's unverified-email rule is already noted above (PR #412). The Contest notification question 'does an unverified-email account receive them' is answered by #405, item 4.] [2026-10-18: Figma pass K2 (docs/figma-pass-k2-report.md section 6, candidate 7): item 17's rule 'show the country line only when filled' is unchanged, but the general profile frames show a filled sample country line while the pass H frames hide it; which sample is canonical is not decided (register row B-148).]</w:t>
+              <w:t>Resolved -- recorded; DECIDED, NOT BUILT. Source: founder decisions 2026-10-16, numbered 1-19 as given to this entry. Amends #400 (items 1, 9, 11), #395 (items 2, 15), #401 (item 7), #369 (item 15), #394 and #371 (item 17) by dated notes appended to those rows; the original text of every row is unchanged. It also changes points recorded in #398 D1 (item 8), #399 E3 (item 10) and #402 item 4 (item 16): those three rows were NOT edited (this entry is the record), see docs/build-register.md Section 12. The founder labelled the country select in item 17 a veto-able default and the withdrawal throttle in item 15 a default held in configuration; everything else is stated as a decision. (1) NON-FINALIST CONTEST TAB -- AMENDS #400 E8. The Create Post Contest tab for a non-finalist is NOT hidden. The tab stays visible, and a non-finalist who opens it during days 22-24 sees the existing 'Closed (not a finalist)' frames (desktop 6660:31044, mobile 6660:35699), which are RESTORED (un-archived, by a Figma pass, not by this entry). The minimum tally x stays admin-only (E8's second sentence stands). (2) DECLINE PAGE CAP SENTENCE -- clarifies #395 B2. The decline page keeps its static sentence that states the cap (Figma node 6627:22230). 'No decline count is shown' means no RUNNING 'decline N of 3' counter. The sentence is minor-facing copy and stays [COPY PENDING LEGAL REVIEW]. (3) GUARDIAN 'APPROVED' SCREENS. 5488:7164 and 5501:8225 are reworded to match the flow (approval continues to Create Profile; extends #394 A5); the new wording is [COPY PENDING LEGAL REVIEW]. (4) ADMIN COMPONENTS. The component frame at Figma node 6671:27364 (Pass F2) exists so that admin screens and apps/admin share ONE Button, Pill, Field, Callout, Banner, Note, Dialog and Table. Adoption is on the Pass C and Pass F1 admin frames only (not on older admin frames). A spacing / radius variable collection is added (a Figma pass does this; 'Soccernity Theme' stays the colour collection). (5) ADMIN SHELL SEARCH BAR. It stays visible on admin screens and is NOT functional ('not available yet'). New register row B-114: decide build vs hide. (6) EXCEPTION TO 'NEVER DELETE' (Figma passes). The ten hidden legacy absolute layers inside the ten rebuilt Create Post frames (the 'ARCHIVED -- legacy absolute layer' children from Pass F2 inside 2008:655, 2009:5168, 2009:2913, 6171:14797, 6171:16994, 2496:4462, 2565:3951, 6660:28736, 6660:31044, 6660:33353) may be deleted, and ONLY those. (7) VOTING PAGE ADOPTS THE ALREADY VOTED DESIGN -- closes the open point of #401. The Voting page (desktop 2094:994, mobile 5802:8726) takes the Already Voted page's design (entries column + board column, fan cards) and carries the vote toggle (#401). The separate Already Voted screens (5802:8978 / 5815:8916, and the auto-layout rebuild 6671:27155) are archived AFTERWARDS, by a Figma pass; the Voting &lt;-&gt; Already Voted navigation of #387 therefore goes with them. (8) LIFT HOLD -- changes #398 D1 / #376. Lift hold applies to BOTH the legal hold and the 6-month bad-faith hold. A reason is required. The held user is NOT notified. Appeal Review reuses the shared hold dialogs (Bad faith / Legal hold / Lift hold) used on Report Detail. (9) FORFEIT POP-UP -- AMENDS #400 E11. Shown ONLY on the Contest page. On every load of that page the user sees one pop-up per forfeited week, from when the week is deemed forfeited (docs/contest-spec.md Section 7); the reason is shown; nothing is remembered between loads. The leaderboard Contest tab shows the forfeited writing in place of the three names for that week (no pop-up there). (10) FINAL TASK TEXT -- changes #399 E3. The week-4 task text shows on the live-ranking and uploading states only (not on the 'No winner this month' or crowned states). (11) COMMUNITY-FEED 'FINAL WEEK' MODULE -- AMENDS #400 E10 and the open point carried by #402. The module STAYS. The dead 'View on the Contest page' link is removed. Its videos become a carousel that keeps the current frame size and serves as a preview slot reusable for other showcases later. It shows only during a final contest week and not at all when there is none. OPEN: whether carousel views count as impressions (B-092). (12) MOBILE BLOCK PATTERN: the '...' menu (confirms the Pass F1 trigger, node 6669:27188). (13) CREATE POST FIGMA CHANGES ACCEPTED: the scrim token change (white 71% to color/overlay/scrim) and the typographic crest marks in the Fixtures module of the Create Post frames. Licensing of club crests in Fixtures stays OPEN (#85, #97). (14) FONT: user-facing read-only fields need a Montserrat Field variant (the admin components are Inter). (15) DEFAULTS CLOSING OPEN POINTS: the placeholder name for incomplete profiles is 'Soccernity member' (closes #369's open point); a DOB-correction restart RESETS the decline counter and writes an audit entry (closes #395 B4's open point); the withdrawal throttle default is 5 attempts per 15 minutes, held in configuration (sets the window left open in #395 B3); unverified-email users are blocked from social writes as well as from PATCH /users/:id (extends the guard built under B-020; new row B-118). (16) BANTS -- an OPEN FORUM, no private messages. Anyone can start a thread and others comment on it; likes work as on a blog or forum (one like per user per item, toggled, public count). Accounts aged 16 and 17 have FULL Bants access (the limit in #346 applies to under-16s only, who stay fully disabled); this is a founder decision, not read-only. Bants will have moderation. Block hides the blocked user's posts, comments and like identities in both directions; counts unchanged; no room membership. This settles the 'Bants rooms' and 'exact like mechanics' points #402 item 4 left open; the interaction with #346 / #347 stays open. OPEN, recorded not resolved: 'thread' is not mapped to the built model (BanterRoom #275 vs Post), and 'no room membership' is not reconciled with the built BanterRoomMember join / leave, My Bants and 'posting requires membership' (#275); the scope of 'moderation' beyond room status (#357) is not stated. New row B-117. (17) COUNTRY HAS TWO SEPARATE FIELDS. (a) SAFEGUARDING country: declared at the Age Gate and derived from the IP lookup (B-023..B-025). Stored separately, never shown, never editable by any profile action; it alone decides US under-13 card verification and demographic grouping (#368 stands). (b) PROFILE country: a separate, nullable, OPTIONAL field. It is BLANK at Create Profile (not prefilled, not read-only), the user may fill it in, and it is editable at any time in Edit Profile (B-083). It is shown on a user's profile only if they filled it in, so a minor's country is visible only if the minor chooses to enter it. AMENDS #394 A1 (Country read-only at Create Profile) and the 'country' item of #371 (profile shows country): those rows stand except for these points. DEFAULT, VETO-ABLE: a country select from the full country list. B-038 stores the profile country as its own column, NOT the derived or declared safeguarding fields. Counsel review of country display stays on the legal list with reduced scope because the field is optional. (18) PRODUCTION WIRING (MaxMind, Render environment variables, Postmark, JWT secrets, TRUST_PROXY_HOPS) is deferred to the launch gate B-090; the code fails safe until it is done. (19) NEW REGISTER ROWS: password-reset email placeholder-address fallback (B-115); API test-suite worker flake, the suite needs --maxWorkers=4 (B-116); admin search bar (B-114, item 5). Rows added from the other items: B-113 (Figma re-sync, items 1-14 and 17), B-117 (Bants open forum), B-118 (email-verification gate on social writes). Build register: B-113 to B-118 new; status lines on B-002, B-003, B-006, B-007, B-012, B-013, B-018, B-020, B-023, B-024, B-026, B-027, B-038, B-039, B-042, B-044, B-045, B-054, B-071, B-079, B-080, B-081, B-082, B-083, B-090, B-091, B-092, B-095, B-096, B-098, B-099, B-102, B-103, B-107, B-108, B-112. STILL OPEN: counsel wording for every [COPY PENDING LEGAL REVIEW] item; the Bants mapping questions in (16); build vs hide for the admin search bar (B-114); whether carousel views count as impressions (B-092); whether the 'Closed (not a finalist)' copy may reveal anything about uploads before the reveal; how other users reach a finalist's entry after the reveal; what the Contest tab shows from 00:00 to 08:00 on day 1; which routes count as 'social writes' (B-118); the interaction of Block with #346 / #347; crest licensing in Fixtures (#85, #97); the CSAM path; the length of every window stated as configuration other than the withdrawal throttle. [2026-10-17: Item 15 (unverified-email users cannot perform social writes) is built: B-118 (backend/w3-gates, PR #412). The creating forms are gated by EmailVerifiedGuard; the undo and own-content forms stay open (docs/backend-w3-gates-report.md, section 5, call 1, adopted by #404, item 12). Two open points of this entry are closed by #404: the forfeit pop-up reading of 'Contest page' and several forfeited weeks (item 4), and whether carousel views count as impressions (items 6 and 15).] [2026-10-17: Items 2 and 15 are built in the backend (PR #416): the decline counter is internal and never returned by any API (item 2); a DOB-correction restart resets it and writes an audit entry (item 15, user.dob_corrected). Item 15's unverified-email rule is already noted above (PR #412). The Contest notification question 'does an unverified-email account receive them' is answered by #405, item 4.] [2026-10-18: Figma pass K2 (docs/figma-pass-k2-report.md section 6, candidate 7): item 17's rule 'show the country line only when filled' is unchanged, but the general profile frames show a filled sample country line while the pass H frames hide it; which sample is canonical is not decided (register row B-148).] [2026-10-19: Item 13 (typographic crest marks accepted) is applied by Figma pass K3 on the own Saved frame 6747:29445 (PR #428); fixture crest licensing stays open. K3 found that the K2 profile frames 6747:28894, 6747:29094 and 6747:29291 were not diffed against their legacy twins (#408, B-170).]</w:t>
             </w:r>
           </w:p>
         </w:tc>
@@ -27257,7 +27257,7 @@
           </w:tcPr>
           <w:p>
             <w:r>
-              <w:t>Resolved -- recorded. FOUNDER-ADOPTED DEFAULTS, VETO-ABLE, all thirteen items. DECIDED, NOT BUILT, except item 8 (as built in W4, PR #420), item 9 (the drawing exists, Figma pass K) and item 10 (as built in FC2, PR #421), which confirm what already exists. Item numbers are the founder's own. Original text of every entry named in the forward-pointers below is unchanged (dated notes appended). (1) DECLINED-AT-1-OR-2 ROWS EXPIRE (closes B-126 in principle). A guardian-consent row declined at decline 1 or 2 and not reopened (no resend, no change of guardian email) within 14 days (a configuration value) takes the same lapse path as an unanswered request (#337-#340, #389). The backend agent confirms the mechanics before building: where the 14 days start, whether the one automatic re-send and warning comes first or the row goes straight to the second-lapse outcome, and that an expiry does not count among the three declines (#389). Resolves, in principle, the conflict with legal copy v0.8 Part 4.4 (a minor's account cannot remain restricted-pending indefinitely); counsel still to review; the legal copy is not edited here. (2) LIGHT THEME. The onboarding, guardian and consent screens in apps/web move to the light theme to match their Figma frames: Age Gate, Guardian Details, Guardian Consent, Verify Email and its prompt, Create Profile and the Club Picker step (the set the FC2 browser check found dark). No new colour. Build row B-127. (3) RESEND VERIFICATION. A rate-limited resend-verification-email endpoint is added; #37 recorded that none exists. The limits, and who may call it, are set in the build PR and are not decided here. Build row B-128. (4) DATE OF BIRTH ON USER DETAIL. User Detail reads without the date of birth; the DOB appears only on the correction form; the server rejects a correction reason that contains a date. Amends #405 item 5 and #398 D4 (GET /admin/users/:id returned the decrypted DOB, each view audited): roles are unchanged (moderator and superadmin). For the backend agent to confirm: how the form gets the current DOB (a separate read), whether that read is audited like user.dob_viewed, and which date formats the reason check rejects (a reason cannot be proven free of every date form). Build row B-129. (5) PIN REMOVAL TIME. The pin is removed from the finalist's profile at 00:00 Europe/London on the 1st of the month after the contest month, and at that moment the final entry becomes an ordinary Community-feed post. Closes the 'time of day of the flip' open point of #405 item 1. B-091, B-092, B-082. (6) IMPRESSION SECOND. The 1-second view of #405 item 7 is continuous (the tile stays at least 50 percent in view for one uninterrupted second); a re-entry counts again, within the per-viewer daily cap of #388 (week 4 only). Closes the two 'not stated' points of #405 item 7. B-092. (7) NOTIFICATIONS. Notification icons as drawn in Figma pass K are accepted; the Notification Centre empty-state line and the coming-soon line are updated to mention Contest. Observation, not a decision: the coming-soon line written under #279 already names 'Contest activity' as upcoming, which is no longer true now that Contest notifications exist; the Figma agent sets the final wording. B-121, B-123. (8) USERNAME. A 30-day change cooldown with one free correction (as built, B-032) and no hold on a handle the user releases; the 30-day hold applies to an admin revoke only (#398 D3, #402 item 3). Not addressed: a handle released by anonymisation is released immediately as built; whether to hold it is not decided. B-032, B-033. (9) INCORRECT-DETAILS SCREEN. The founder accepts the admin screen as drawn in Figma pass K (8 frames, docs/figma-pass-k-report.md); B-120 builds from it, with no field, column or control beyond the frames. The four SCOPE OPEN notes of that pass (confirmation step, host sidebar item, success message, link to User Detail) are settled only where the drawing settles them. B-119, B-120. (10) RESTRICTED MINORS. A restricted-pending minor may open pages by URL read-only; there is no front-end route block and the server still blocks every write (#370, #12). Confirms the shipped behaviour. B-026, B-125, B-076. (11) STATUS RESPONSE. The status response adds the guardian's first name and the last decision date, never the decline count. The founder did not name the response; the reading is the minor's GET /auth/guardian-consent/status. For the backend agent to confirm: how a first name is derived from the single full-name field (Option A, #393), what 'last decision' covers (decline, approval, withdrawal) and whether a column is needed (the schema has no decline timestamp). Build row B-131. (12) BLOCKED NOT-FOUND. A blocked user's not-found view is identical to the generic not-found view and to a non-existent profile (same page, same status; nothing reveals a block). Confirms #404/#396 and the Figma pass K frames. B-007, B-039, B-082, B-108. (13) GUARDIAN CONFIRM FOOTNOTE. The footnote 'Declining closes the account and schedules it for deletion' on the guardian confirm page is wrong for declines 1 and 2; it is replaced by the existing cap sentence addressed to the guardian, tagged [COPY PENDING LEGAL REVIEW]. The change alters guardian-visible wording, so CONSENT_SCREEN_VERSION is bumped (v3 to v4) with the tripwire hash (#348) and the pending-copy manifest row is replaced. Found while checking, NOT covered by the founder's wording: the page's post-decline state ('Your decision has been recorded ... will be scheduled for deletion') has the same fault. Build row B-130. (REGISTER) B-124 scope is apps/web and apps/admin only (as built); the services/api email wording tagged [COPY PENDING LEGAL REVIEW] is added to docs/pending-copy-manifest.md as OPEN (three templates tagged in code comments: guardian-approved-minor, the third-decline guardian-consent-declined, username-revoked; other child- and guardian-facing templates carry no tag). New rows B-127 to B-139: B-127 light theme, B-128 resend verification, B-129 User Detail without the DOB, B-130 guardian confirm footnote, B-131 status response fields, B-132 horizontal overflow at 390 px, B-133 Edit Profile username (never send null; show the error codes), B-134 real-API end-to-end smoke test, B-135 Figma approval-on-hold, B-136 Figma verify-email prompt, B-137 Figma guardian fields of the DOB correction, B-138 Figma general profile frames (plain other-user; own Posts, Media, Saved) that must exist before the four legacy profile frames 1455:4362, 1455:6626, 5702:8250 and 5778:8490 can be archived, B-139 RevokedUsername retention and appeal path (OPEN, no decision). Status lines on 27 register rows. 139 B-IDs; 146 gap frames unchanged. Arithmetic: docs/build-register.md Section 22. (FORWARD-POINTERS) Dated notes appended (original text unchanged) to #364, #367, #368, #369, #398, #402 and #404 (from docs/backend-w4-username-report.md section 7) and to #37, #389, #395 and #405 (points #406 amends or closes). NOT DECIDED HERE: the retention and appeal path of RevokedUsername (B-139, OPEN); the mechanics of item 1; the limits of item 3; the form of the DOB read in item 4; the final wording of item 7; the response and derivation in item 11; the post-decline state in item 13; whether the pending-copy guard is ever extended to services/api; counsel wording of every [COPY PENDING LEGAL REVIEW] string. [2026-10-18: Built in W3d (PR #424, docs/backend-w3d-report.md section 7), backend only: item 1 as B-126 (14 days counted from the new Guardian.consentDeclinedAt; the automatic re-send and the minor's warning come first; an expiry does not count among the three declines); item 3 as B-128 (POST /auth/resend-verification-email, unauthenticated and keyed by email, 5 per 60 s per IP plus 3 per hour per account, one response for every outcome); item 4 as B-129 (see #405); item 11 as B-131 (guardianFirstName and lastDecisionAt on the minor's status response, the decline count never returned). Frontend legs of items 3, 4, 11 and 13 are not built. Figma pass K2 (PR #425, docs/figma-pass-k2-report.md) drew B-135 to B-138 and archived the four legacy profile frames; its open candidates are rows B-144 to B-150. The QA end-to-end run (PR #426) checked items 3, 4 and 13 and measured the 390 px overflow: D-08, D-07, D-10 and D-11/D-12 map to B-128, B-129, B-130 and B-132; the other defects and gaps are mapped in docs/build-register.md Section 25 and recorded in #407.]</w:t>
+              <w:t>Resolved -- recorded. FOUNDER-ADOPTED DEFAULTS, VETO-ABLE, all thirteen items. DECIDED, NOT BUILT, except item 8 (as built in W4, PR #420), item 9 (the drawing exists, Figma pass K) and item 10 (as built in FC2, PR #421), which confirm what already exists. Item numbers are the founder's own. Original text of every entry named in the forward-pointers below is unchanged (dated notes appended). (1) DECLINED-AT-1-OR-2 ROWS EXPIRE (closes B-126 in principle). A guardian-consent row declined at decline 1 or 2 and not reopened (no resend, no change of guardian email) within 14 days (a configuration value) takes the same lapse path as an unanswered request (#337-#340, #389). The backend agent confirms the mechanics before building: where the 14 days start, whether the one automatic re-send and warning comes first or the row goes straight to the second-lapse outcome, and that an expiry does not count among the three declines (#389). Resolves, in principle, the conflict with legal copy v0.8 Part 4.4 (a minor's account cannot remain restricted-pending indefinitely); counsel still to review; the legal copy is not edited here. (2) LIGHT THEME. The onboarding, guardian and consent screens in apps/web move to the light theme to match their Figma frames: Age Gate, Guardian Details, Guardian Consent, Verify Email and its prompt, Create Profile and the Club Picker step (the set the FC2 browser check found dark). No new colour. Build row B-127. (3) RESEND VERIFICATION. A rate-limited resend-verification-email endpoint is added; #37 recorded that none exists. The limits, and who may call it, are set in the build PR and are not decided here. Build row B-128. (4) DATE OF BIRTH ON USER DETAIL. User Detail reads without the date of birth; the DOB appears only on the correction form; the server rejects a correction reason that contains a date. Amends #405 item 5 and #398 D4 (GET /admin/users/:id returned the decrypted DOB, each view audited): roles are unchanged (moderator and superadmin). For the backend agent to confirm: how the form gets the current DOB (a separate read), whether that read is audited like user.dob_viewed, and which date formats the reason check rejects (a reason cannot be proven free of every date form). Build row B-129. (5) PIN REMOVAL TIME. The pin is removed from the finalist's profile at 00:00 Europe/London on the 1st of the month after the contest month, and at that moment the final entry becomes an ordinary Community-feed post. Closes the 'time of day of the flip' open point of #405 item 1. B-091, B-092, B-082. (6) IMPRESSION SECOND. The 1-second view of #405 item 7 is continuous (the tile stays at least 50 percent in view for one uninterrupted second); a re-entry counts again, within the per-viewer daily cap of #388 (week 4 only). Closes the two 'not stated' points of #405 item 7. B-092. (7) NOTIFICATIONS. Notification icons as drawn in Figma pass K are accepted; the Notification Centre empty-state line and the coming-soon line are updated to mention Contest. Observation, not a decision: the coming-soon line written under #279 already names 'Contest activity' as upcoming, which is no longer true now that Contest notifications exist; the Figma agent sets the final wording. B-121, B-123. (8) USERNAME. A 30-day change cooldown with one free correction (as built, B-032) and no hold on a handle the user releases; the 30-day hold applies to an admin revoke only (#398 D3, #402 item 3). Not addressed: a handle released by anonymisation is released immediately as built; whether to hold it is not decided. B-032, B-033. (9) INCORRECT-DETAILS SCREEN. The founder accepts the admin screen as drawn in Figma pass K (8 frames, docs/figma-pass-k-report.md); B-120 builds from it, with no field, column or control beyond the frames. The four SCOPE OPEN notes of that pass (confirmation step, host sidebar item, success message, link to User Detail) are settled only where the drawing settles them. B-119, B-120. (10) RESTRICTED MINORS. A restricted-pending minor may open pages by URL read-only; there is no front-end route block and the server still blocks every write (#370, #12). Confirms the shipped behaviour. B-026, B-125, B-076. (11) STATUS RESPONSE. The status response adds the guardian's first name and the last decision date, never the decline count. The founder did not name the response; the reading is the minor's GET /auth/guardian-consent/status. For the backend agent to confirm: how a first name is derived from the single full-name field (Option A, #393), what 'last decision' covers (decline, approval, withdrawal) and whether a column is needed (the schema has no decline timestamp). Build row B-131. (12) BLOCKED NOT-FOUND. A blocked user's not-found view is identical to the generic not-found view and to a non-existent profile (same page, same status; nothing reveals a block). Confirms #404/#396 and the Figma pass K frames. B-007, B-039, B-082, B-108. (13) GUARDIAN CONFIRM FOOTNOTE. The footnote 'Declining closes the account and schedules it for deletion' on the guardian confirm page is wrong for declines 1 and 2; it is replaced by the existing cap sentence addressed to the guardian, tagged [COPY PENDING LEGAL REVIEW]. The change alters guardian-visible wording, so CONSENT_SCREEN_VERSION is bumped (v3 to v4) with the tripwire hash (#348) and the pending-copy manifest row is replaced. Found while checking, NOT covered by the founder's wording: the page's post-decline state ('Your decision has been recorded ... will be scheduled for deletion') has the same fault. Build row B-130. (REGISTER) B-124 scope is apps/web and apps/admin only (as built); the services/api email wording tagged [COPY PENDING LEGAL REVIEW] is added to docs/pending-copy-manifest.md as OPEN (three templates tagged in code comments: guardian-approved-minor, the third-decline guardian-consent-declined, username-revoked; other child- and guardian-facing templates carry no tag). New rows B-127 to B-139: B-127 light theme, B-128 resend verification, B-129 User Detail without the DOB, B-130 guardian confirm footnote, B-131 status response fields, B-132 horizontal overflow at 390 px, B-133 Edit Profile username (never send null; show the error codes), B-134 real-API end-to-end smoke test, B-135 Figma approval-on-hold, B-136 Figma verify-email prompt, B-137 Figma guardian fields of the DOB correction, B-138 Figma general profile frames (plain other-user; own Posts, Media, Saved) that must exist before the four legacy profile frames 1455:4362, 1455:6626, 5702:8250 and 5778:8490 can be archived, B-139 RevokedUsername retention and appeal path (OPEN, no decision). Status lines on 27 register rows. 139 B-IDs; 146 gap frames unchanged. Arithmetic: docs/build-register.md Section 22. (FORWARD-POINTERS) Dated notes appended (original text unchanged) to #364, #367, #368, #369, #398, #402 and #404 (from docs/backend-w4-username-report.md section 7) and to #37, #389, #395 and #405 (points #406 amends or closes). NOT DECIDED HERE: the retention and appeal path of RevokedUsername (B-139, OPEN); the mechanics of item 1; the limits of item 3; the form of the DOB read in item 4; the final wording of item 7; the response and derivation in item 11; the post-decline state in item 13; whether the pending-copy guard is ever extended to services/api; counsel wording of every [COPY PENDING LEGAL REVIEW] string. [2026-10-18: Built in W3d (PR #424, docs/backend-w3d-report.md section 7), backend only: item 1 as B-126 (14 days counted from the new Guardian.consentDeclinedAt; the automatic re-send and the minor's warning come first; an expiry does not count among the three declines); item 3 as B-128 (POST /auth/resend-verification-email, unauthenticated and keyed by email, 5 per 60 s per IP plus 3 per hour per account, one response for every outcome); item 4 as B-129 (see #405); item 11 as B-131 (guardianFirstName and lastDecisionAt on the minor's status response, the decline count never returned). Frontend legs of items 3, 4, 11 and 13 are not built. Figma pass K2 (PR #425, docs/figma-pass-k2-report.md) drew B-135 to B-138 and archived the four legacy profile frames; its open candidates are rows B-144 to B-150. The QA end-to-end run (PR #426) checked items 3, 4 and 13 and measured the 390 px overflow: D-08, D-07, D-10 and D-11/D-12 map to B-128, B-129, B-130 and B-132; the other defects and gaps are mapped in docs/build-register.md Section 25 and recorded in #407.] [2026-10-19: Built since: item 2 (light theme), item 3 (the resend button), item 11 (the screens that show the guardian's first name and the decision date) and item 13 (the footnote replaced by the cap sentence, CONSENT_SCREEN_VERSION v4) by FC3a (PR #430); item 4 (User Detail on the summary read, the DOB only on the correction form, the reason-date message) and item 9 (the incorrect-details reports screen) by FC3b (PR #431). Register instruction on the general profile frames (B-138): Figma pass K3 (PR #428) found that K2's replacements were not diffed against their legacy twins; see #408 and B-170.]</w:t>
             </w:r>
           </w:p>
         </w:tc>
@@ -27299,7 +27299,49 @@
           </w:tcPr>
           <w:p>
             <w:r>
-              <w:t>Resolved -- recorded. FOUNDER-ADOPTED DEFAULTS, VETO-ABLE, all seven items. DECIDED, NOT BUILT, except item 6, which confirms what is already built (W3d, PR #424). Item numbers are the order of the founder's instruction. Original text of every entry named in the forward-pointers below is unchanged (dated notes appended). Source: the QA run of PR #426 (docs/qa-e2e-onboarding-report.md): 165 browser tests against the real API, 17 defects (D-01 to D-17) and 3 gaps (G-1 to G-3). (1) CORS (QA D-01, BLOCKER / SAFEGUARDING). apps/web/src/api/auth.ts registerUser sends credentials 'include' and services/api/src/main.ts calls app.enableCors() with no options (it answers '*'); browsers refuse that combination, so sign-up fails in every browser when web and API are on different origins, as in production, and no request reaches the API. Decided: registerUser stops sending credentials 'include'; the API restricts CORS to the origins in WEB_APP_BASE_URL and a new ADMIN_APP_BASE_URL, plus localhost origins in development. The new variable is added to render.yaml (both services), .env.example and the env-completeness check; the founder sets its production value in Render. The API sets no cookie and returns the refresh token in the response body, so the credentials option appears to have no function (to confirm in the build PR). Not decided: what the API does when a variable is unset in production, and origins other than the two apps. Build row B-140 (W1). (2) AGE-5 FLOOR (QA D-02, BLOCKER / SAFEGUARDING). #19 says signup is hard-blocked below age 5 regardless of guardian consent, but the floor exists only in the web Age Gate: POST /auth/register with a date of birth 4 years ago and a valid guardian block returns 201 and creates the account and the guardian request. Decided: the floor is enforced server-side with a 400; exactly age 5 stays accepted. Not decided: the error code and message; the build PR checks the DOB-correction tool (#390) cannot set a date of birth below the floor. Build row B-141 (W1). (3) USERNAME FILTER (QA D-06). Hate and sexual terms glued to other letters (xxhitlerxx, nazifan) are accepted because the filter's EXACT list matches only the whole handle or an underscore token. Decided: long, unambiguous terms are matched by CONTAINS, with a tested list of innocent words that must still be accepted; short or ambiguous terms stay exact. Not decided: the term lists and the length threshold (set in the build PR, for founder review). Build row B-142 (W4). (4) 'FOLLOW' PROMISES (QA D-13). The restricted-pending view says 'Browse and follow' and the guardian page lists 'Follow teams and check scores', but a restricted-pending minor's follow is refused with 403 (#370). Decided: both screens stop promising follow and the wording says what works, tagged [COPY PENDING LEGAL REVIEW] and added to the pending-copy manifest; the guardian-page change is guardian-visible, so CONSENT_SCREEN_VERSION and the tripwire hash (#348) are bumped under the rule of B-130. The Figma frames are not checked here for the same promise. Build row B-154 (W9). (5) GUARDIAN APPROVAL SCREEN (QA D-09). After approval the guardian is told 'The account is now active', but the minor still has to verify email and create a profile. Decided: the screen no longer says the account is active; it says the approval is recorded and registration continues ([COPY PENDING LEGAL REVIEW]), matching the Figma Approved screens (#403 item 3). Build row B-153 (W9). (6) STALE-DECLINE RE-SEND STAYS. A guardian who declined at decline 1 or 2 is still sent a new consent request by the platform when the row lapses after 14 days (#406 item 1, built as B-126), after the minor is warned. This settles judgment call 1 of docs/backend-w3d-report.md (section 5). The alternative, warning the minor and closing after a further window without re-sending, stays a one-place change (GuardianStaleDeclineSweepService); the cap of three declines bounds the re-sends. Counsel review of legal copy v0.8 Part 4.4 is still pending. Rows B-126, B-102. (7) LEGACY SAVED FRAME. The Figma frame 1460:8940 (own Saved, absolute layout) is archived, now that 6747:29445 replaces it (Figma pass K2, candidate 2): hidden and renamed 'ARCHIVED - ...', nothing deleted, after a page-wide reference scan, and added to docs/figma-archive-index.md. Build row B-144 (W0). (REGISTER) docs/build-register.md Section 25: B-140 to B-162 added (23 rows); every QA defect and gap, every open item of the W3d report (section 6) and every K2 candidate (1-10) is mapped to a row, reused (B-120, B-128, B-129, B-130, B-131, B-132, B-133, B-134, B-078, B-138) or new. D-01 and D-02 are marked BLOCKER / SAFEGUARDING. Status lines on 23 existing rows. 162 B-IDs; 146 gap frames unchanged. Arithmetic: Section 25g. (FORWARD-POINTERS) Dated notes appended (original text unchanged) to #19, #199, #337, #338, #339, #340, #368, #369, #370, #377, #389, #395, #402, #403, #405 and #406 (the W3d report's section 7 pointers, the status of K2 and of the QA run). NOT DECIDED HERE: the behaviour when an origin variable is unset in production, and any further CORS origin; the error code of the 400; the term and innocent-word lists; the Figma side of the 'follow' promise; the post-decline state of the guardian confirm page (D-10, same fault as the footnote of #406 item 13, still not covered by the founder's wording); K2 candidates 1, 3, 4, 6, 7, 8 (register rows B-147 to B-150 are OPEN); the W3d open items on earlier verification links (B-160) and on a non-active account with a stale decline (B-161); counsel wording of every [COPY PENDING LEGAL REVIEW] string.</w:t>
+              <w:t>Resolved -- recorded. FOUNDER-ADOPTED DEFAULTS, VETO-ABLE, all seven items. DECIDED, NOT BUILT, except item 6, which confirms what is already built (W3d, PR #424). Item numbers are the order of the founder's instruction. Original text of every entry named in the forward-pointers below is unchanged (dated notes appended). Source: the QA run of PR #426 (docs/qa-e2e-onboarding-report.md): 165 browser tests against the real API, 17 defects (D-01 to D-17) and 3 gaps (G-1 to G-3). (1) CORS (QA D-01, BLOCKER / SAFEGUARDING). apps/web/src/api/auth.ts registerUser sends credentials 'include' and services/api/src/main.ts calls app.enableCors() with no options (it answers '*'); browsers refuse that combination, so sign-up fails in every browser when web and API are on different origins, as in production, and no request reaches the API. Decided: registerUser stops sending credentials 'include'; the API restricts CORS to the origins in WEB_APP_BASE_URL and a new ADMIN_APP_BASE_URL, plus localhost origins in development. The new variable is added to render.yaml (both services), .env.example and the env-completeness check; the founder sets its production value in Render. The API sets no cookie and returns the refresh token in the response body, so the credentials option appears to have no function (to confirm in the build PR). Not decided: what the API does when a variable is unset in production, and origins other than the two apps. Build row B-140 (W1). (2) AGE-5 FLOOR (QA D-02, BLOCKER / SAFEGUARDING). #19 says signup is hard-blocked below age 5 regardless of guardian consent, but the floor exists only in the web Age Gate: POST /auth/register with a date of birth 4 years ago and a valid guardian block returns 201 and creates the account and the guardian request. Decided: the floor is enforced server-side with a 400; exactly age 5 stays accepted. Not decided: the error code and message; the build PR checks the DOB-correction tool (#390) cannot set a date of birth below the floor. Build row B-141 (W1). (3) USERNAME FILTER (QA D-06). Hate and sexual terms glued to other letters (xxhitlerxx, nazifan) are accepted because the filter's EXACT list matches only the whole handle or an underscore token. Decided: long, unambiguous terms are matched by CONTAINS, with a tested list of innocent words that must still be accepted; short or ambiguous terms stay exact. Not decided: the term lists and the length threshold (set in the build PR, for founder review). Build row B-142 (W4). (4) 'FOLLOW' PROMISES (QA D-13). The restricted-pending view says 'Browse and follow' and the guardian page lists 'Follow teams and check scores', but a restricted-pending minor's follow is refused with 403 (#370). Decided: both screens stop promising follow and the wording says what works, tagged [COPY PENDING LEGAL REVIEW] and added to the pending-copy manifest; the guardian-page change is guardian-visible, so CONSENT_SCREEN_VERSION and the tripwire hash (#348) are bumped under the rule of B-130. The Figma frames are not checked here for the same promise. Build row B-154 (W9). (5) GUARDIAN APPROVAL SCREEN (QA D-09). After approval the guardian is told 'The account is now active', but the minor still has to verify email and create a profile. Decided: the screen no longer says the account is active; it says the approval is recorded and registration continues ([COPY PENDING LEGAL REVIEW]), matching the Figma Approved screens (#403 item 3). Build row B-153 (W9). (6) STALE-DECLINE RE-SEND STAYS. A guardian who declined at decline 1 or 2 is still sent a new consent request by the platform when the row lapses after 14 days (#406 item 1, built as B-126), after the minor is warned. This settles judgment call 1 of docs/backend-w3d-report.md (section 5). The alternative, warning the minor and closing after a further window without re-sending, stays a one-place change (GuardianStaleDeclineSweepService); the cap of three declines bounds the re-sends. Counsel review of legal copy v0.8 Part 4.4 is still pending. Rows B-126, B-102. (7) LEGACY SAVED FRAME. The Figma frame 1460:8940 (own Saved, absolute layout) is archived, now that 6747:29445 replaces it (Figma pass K2, candidate 2): hidden and renamed 'ARCHIVED - ...', nothing deleted, after a page-wide reference scan, and added to docs/figma-archive-index.md. Build row B-144 (W0). (REGISTER) docs/build-register.md Section 25: B-140 to B-162 added (23 rows); every QA defect and gap, every open item of the W3d report (section 6) and every K2 candidate (1-10) is mapped to a row, reused (B-120, B-128, B-129, B-130, B-131, B-132, B-133, B-134, B-078, B-138) or new. D-01 and D-02 are marked BLOCKER / SAFEGUARDING. Status lines on 23 existing rows. 162 B-IDs; 146 gap frames unchanged. Arithmetic: Section 25g. (FORWARD-POINTERS) Dated notes appended (original text unchanged) to #19, #199, #337, #338, #339, #340, #368, #369, #370, #377, #389, #395, #402, #403, #405 and #406 (the W3d report's section 7 pointers, the status of K2 and of the QA run). NOT DECIDED HERE: the behaviour when an origin variable is unset in production, and any further CORS origin; the error code of the 400; the term and innocent-word lists; the Figma side of the 'follow' promise; the post-decline state of the guardian confirm page (D-10, same fault as the footnote of #406 item 13, still not covered by the founder's wording); K2 candidates 1, 3, 4, 6, 7, 8 (register rows B-147 to B-150 are OPEN); the W3d open items on earlier verification links (B-160) and on a non-active account with a stale decline (B-161); counsel wording of every [COPY PENDING LEGAL REVIEW] string. [2026-10-19: Built since: items 1, 2 and 3 and the expired-consent email by backend/w3e (PR #429: B-140, B-141, B-142; the email half of B-158); items 4 and 5 and QA defects D-03 to D-05 and D-08 to D-17 by FC3a (PR #430; D-15 and D-17 in part); D-07, G-1 and G-2 by FC3b (PR #431); item 7 (the archive of 1460:8940) by Figma pass K3 (PR #428, B-144). The open point of item 1 (what the API does when an origin variable is unset in production) is decided by #408 item 1: it refuses to boot (B-163). Item 3 is amended by #408 item 3: the exact whole handles nazif, nazifa and nazifah are allowed (B-165) and the term lists W3e built stay open for review. The error code below_minimum_age and its message are W3e's choice and are still not confirmed. The QA harness's CORS proxy is gone (PR #429).]</w:t>
+            </w:r>
+          </w:p>
+        </w:tc>
+      </w:tr>
+      <w:tr>
+        <w:tc>
+          <w:tcPr>
+            <w:tcW w:type="dxa" w:w="500"/>
+          </w:tcPr>
+          <w:p>
+            <w:r>
+              <w:t>408</w:t>
+            </w:r>
+          </w:p>
+        </w:tc>
+        <w:tc>
+          <w:tcPr>
+            <w:tcW w:type="dxa" w:w="4700"/>
+          </w:tcPr>
+          <w:p>
+            <w:r>
+              <w:t>Founder decisions 2026-10-19 on the open points of the W3e, FC3a, FC3b and K3 passes (7 items) and one recorded finding: in production an unset or invalid WEB_APP_BASE_URL or ADMIN_APP_BASE_URL refuses to boot; a cross-tab lock for the refresh-token rotation in apps/web; the username filter allows the exact whole handles nazif, nazifa and nazifah and still refuses nazifan, with the built term lists recorded and left open for review; semantic/alert is authorised in apps/web and apps/admin for error callouts; the Revoke username frames and dialog gain a line saying the username is held for 30 days (admin-facing only); the guardian post-decline clause 'so it stays switched off' is tagged [COPY PENDING LEGAL REVIEW] with a manifest row; five behaviours are kept as built; K3 finding: the K2 profile replacement frames 6747:28894, 6747:29094 and 6747:29291 were never diffed against their legacy twins</w:t>
+            </w:r>
+          </w:p>
+        </w:tc>
+        <w:tc>
+          <w:tcPr>
+            <w:tcW w:type="dxa" w:w="1850"/>
+          </w:tcPr>
+          <w:p>
+            <w:r>
+              <w:t>docs/decisions-founder-2026-10-19 (docs only, 2026-10-19; founder decisions 2026-10-19, items 1-7, the K3 finding and the register instructions; docs/build-register.md Section 27, docs/qa-e2e-onboarding-report.md, CLAUDE.md; sources docs/backend-w3e-report.md sections 2 and 4 (PR #429), docs/fc3a-onboarding-fixes-report.md sections 6 and 7 (PR #430), docs/fc3b-admin-report.md open points (PR #431), docs/figma-pass-k3-report.md section 7 (PR #428), docs/backend-w3d-report.md section 6 (PR #424))</w:t>
+            </w:r>
+          </w:p>
+        </w:tc>
+        <w:tc>
+          <w:tcPr>
+            <w:tcW w:type="dxa" w:w="2300"/>
+          </w:tcPr>
+          <w:p>
+            <w:r>
+              <w:t>Resolved -- recorded. FOUNDER-ADOPTED DEFAULTS, VETO-ABLE, all seven items. DECIDED, NOT BUILT, except item 7, which confirms what is already built (PRs #428, #430, #431). Item numbers are the order of the founder's instruction. Original text of every entry named in the forward-pointers below is unchanged (dated notes appended). Sources: the open points of backend/w3e (PR #429), FC3a (PR #430), FC3b (PR #431) and Figma pass K3 (PR #428). (1) PRODUCTION BOOT CHECK (settles the open point of #407 item 1). W3e built CORS fail-closed with a boot log: an unset, non-URL, placeholder or (in production) unusable WEB_APP_BASE_URL or ADMIN_APP_BASE_URL contributes no origin and a [cors] line is logged, but the API still starts, so a bad production deploy comes up healthy and no browser can call it. Decided: in production the same condition refuses to boot, through assertProductionEnv (services/api/src/validate-runtime-env.ts), the way a missing or placeholder JWT_SECRET or ADMIN_JWT_SECRET already does (B-018). Outside production nothing changes (log only, localhost allowed). The build reuses the test cors-options.ts already applies and does not write a second one. Render sets NODE_ENV=production at runtime on both services, so staging is covered as well and each service needs both values before its next deploy (to confirm in the build PR). Not decided: origins other than the two apps (preview deployments, a mobile web view). Build row B-163 (W1). (2) CROSS-TAB REFRESH LOCK. The refresh token rotates and the server treats a second use of an old token as reuse; apps/web/src/lib/silentRefresh.ts is single-flight inside one tab only, so two open tabs that refresh together can log the person out. W3e found it when a test went intermittent and worked around it in that one test; it is not a test problem. Decided: a cross-tab lock so only one tab calls POST /auth/refresh at a time; the other tabs wait and then use the tokens the first tab stored. The alternative W3e named, a short server-side reuse grace, is not chosen and the server's reuse detection is unchanged. Not decided: the mechanism (Web Locks API, a storage-based lock or a BroadcastChannel); the build PR picks it and states its fallback. Build row B-164 (W9). (3) USERNAME FILTER (extends #407 item 3). Decided: the exact whole handles nazif, nazifa and nazifah are allowed (real given names; W3e refused them because they cannot be told from nazi + fan); nazifan and every other glued form stay refused. HOW: they are an exact allow-list of whole handles checked before the CONTAINS rule, not substring exceptions. Adding nazif to the named innocent exceptions of the nazi rule would cut it out of nazifan, leave 'an', and accept it. Handles that only contain a name (nazif_10, nazifa2, xxnazifxx) are not covered by this decision; under the adopted reading they stay refused; whether suffixes should be accepted is not decided. RECORDED AS BUILT AND LEFT OPEN FOR THE FOUNDER'S REVIEW, verbatim from docs/backend-w3e-report.md (D-06): CONTAINS, 5+ letters and unambiguous: hitler, pussy, paedo, swastika, whitepower, gangbang, deepthroat, creampie, orgasm, masturbat, erotic. nazi is four letters and sits in real names, so it is CONTAINS with named innocent exceptions (nazir, nazim, nazia, nazih, nazik): those are cut out, the rest is searched; nazifan, xxnazixx and nazirnazi are refused, nazir_10 is accepted. Short or ambiguous terms stay exact: dick, cock, rape, ass, sex, sexy, anal, cum, pedo, isis, kkk, twat, wank, ... (the report's list ends with '...'; the full exact list is PROFANITY_EXACT in services/api/src/modules/users/username-rules.constants.ts: dick, cock, anal, anus, sex, sexy, rape, nazi, kkk, isis, pedo, tits, boobs, ass, arse, twat, wank, cum, nude, nudes). Tested: 18 glued or leet refusals, guarded-term cases, short-term-exact cases and a 37-handle innocent list (Essex, Sussex, Hancock, Hitchcock, Peacock, Dickson, Nazir, Torpedo, ...). Known false positives unchanged and deliberately not in the list: scunthorpe, penistone, therapist. The 5-letter threshold, every list above and the innocent list are W3e's adopted defaults; none is decided here. The older CONTAINS terms from B-032 (fuck, shit, ... terrorist) are outside this review. Build row B-165 (W4). (4) SEMANTIC/ALERT IN CODE. Decision Log #99 authorised semantic/alert (#FA0606, Light = Dark) in Figma only, as a deliberate exception to non-negotiable #3 (loss, destructive or alert colour only). Decided: the token is authorised in apps/web and apps/admin for error callouts. Adopted reading, veto-able: the colour is the non-text accent (bar, border, icon) of an error callout, not text colour and not a button fill, because the Settings rebuild (PR #116) measured white on semantic/alert at 4.12:1, below AA; error text stays navy. Not covered and left as they are: the Grassroots LIVE indicator and the notification unread dot (brand green), destructive buttons (navy). CLAUDE.md non-negotiable #3 is not rewritten; #99 and this entry are the recorded exception for code. Build row B-166 (W9). (5) REVOKE USERNAME HOLD LINE (admin-facing only). The three Revoke username frames (dialog 6647:25789, success 6649:24462, error 6649:24714) say only what is removed. Decided: the frames and the dialog gain a line saying the username is held for 30 days (the backend already holds a revoked handle for 30 days for everyone, #402 item 3, and the response carries heldUntil). Admin-facing only: the email to the revoked user and every user-facing screen are unchanged. Adopted reading, veto-able: the line goes in the dialog and the success frame; the error frame gets none because it says nothing was changed. Not decided: the exact wording (set in the Figma pass), whether the success frame shows the date from heldUntil, and whether the line takes [COPY PENDING LEGAL REVIEW] (the existing dialog body already does). Build rows B-167 (Figma, W0), B-168 (apps/admin, W9). (6) POST-DECLINE CLAUSE TAGGED. The guardian page's declined state says 'You have declined permission for this account, so it stays switched off.' That clause is not founder wording, was not tagged by FC3a, and #406 does not cover the state. Decided: it is tagged [COPY PENDING LEGAL REVIEW] and gets a docs/pending-copy-manifest.md row. Consequence for the build, not a decision: the tag is part of the guardian-visible text the tripwire hashes, so CONSENT_SCREEN_VERSION and CONSENT_SCREEN_TEXT_HASH must be bumped in the same PR (#348); the manifest row is added with the tag, never before it (the inventory test fails on a row with no matching string), so this docs pass does NOT add it. Build row B-169 (W9). (7) KEPT AS BUILT (confirms what exists; no build row): (a) the link on the Users list that opens the incorrect-details reports screen (FC3b added it outside the frames; the frames left the entry point SCOPE OPEN); (b) the one-row 'Copy Profile Link' menu on the own Saved frame 6747:29445 (K3 open point 1); (c) the hidden K2 column 6747:29556 inside 6747:29445 stays until the launch gate, then is deleted with the other hidden ARCHIVED originals (B-090); (d) the revocation history (usernameRevocations in the user summary) stays not shown; (e) the mobile header keeps a short scrolling icon row at 390 px with the search box hidden (FC3a judgment call 3), although the Figma mobile navbars draw no icon row. (K3 FINDING, recorded, not a decision) Figma pass K3 rebuilt the own Saved desktop frame 6747:29445 after finding that K2's version was a single-column simplification of the legacy frame 1460:8940, because K2 checked counts and bounds only. The K2 replacement frames 6747:28894 (other user, Posts), 6747:29094 (own, Posts) and 6747:29291 (own, Media) were not diffed against their legacy twins and very likely carry the same simplifications; their twins 1455:4362 and 1455:6626 were archived on K2's say-so. The K2 claim that B-138 closes on the design side therefore does not hold for those three frames. The fix is a diff-first pass, K4, that does what K3 did and leaves the legacy frames archived (nothing deleted). Build row B-170 (W0). (REGISTER) docs/build-register.md Section 27: B-163 to B-177 added (15 rows); items 1 to 6 and the K3 finding each have a row; the W3d items not built map to B-160 and B-161 (already rows, reused, no duplicate), B-171 and B-172 (new, OPEN); the apps/admin developer notes are B-173; the mobile verify-prompt and Club Picker comparisons are B-174 and B-175; the guardian confirm layout is B-176; B-177 (the guardian frames that still say 'follow') is added beyond the founder's list because FC3a records it as open and no row owned it. Status lines on 25 existing rows. 177 B-IDs; 146 gap frames unchanged. Arithmetic: Section 27e. (FORWARD-POINTERS) Dated notes appended (original text unchanged) to #19, #99, #348, #369, #377, #389, #390, #395, #396, #398, #402, #403, #406 and #407 (what W3e, FC3a, FC3b and K3 built or found). NOT DECIDED HERE: origins other than the two apps; the lock mechanism; whether handles that merely contain nazif, nazifa or nazifah are accepted; every term list, the 5-letter threshold and the innocent list; any use of semantic/alert beyond error callouts and its use as text colour; the wording of the hold line, its date and its tag; the final wording of the post-decline clause (counsel); which legacy twin belongs to which K2 frame; the error code below_minimum_age and its message (W3e's choice, still not confirmed since #407); the open W3d items B-160, B-161, B-171 and B-172; whether the Figma frames carry the same fixes (B-177); counsel wording of every [COPY PENDING LEGAL REVIEW] string.</w:t>
             </w:r>
           </w:p>
         </w:tc>

</xml_diff>

<commit_message>
docs: Decision Log #408 item 8 (mobile header) and build register B-178
Item (7) no longer lists the mobile header icon row as kept as built; item (8)
added (signed in: header follows Figma and the Navigation Drawer, nine-icon row
removed; logged out: K4 draws a logged-out mobile navigation, FC4 builds it).
Register: B-178 added, B-132 note appended, totals 177 -> 178, Section 28 added.

Co-Authored-By: Claude Sonnet 5.5 <noreply@anthropic.com>
</commit_message>
<xml_diff>
--- a/docs/Soccernity_MVP_Build_Plan_v1.7.docx
+++ b/docs/Soccernity_MVP_Build_Plan_v1.7.docx
@@ -27321,27 +27321,27 @@
           </w:tcPr>
           <w:p>
             <w:r>
-              <w:t>Founder decisions 2026-10-19 on the open points of the W3e, FC3a, FC3b and K3 passes (7 items) and one recorded finding: in production an unset or invalid WEB_APP_BASE_URL or ADMIN_APP_BASE_URL refuses to boot; a cross-tab lock for the refresh-token rotation in apps/web; the username filter allows the exact whole handles nazif, nazifa and nazifah and still refuses nazifan, with the built term lists recorded and left open for review; semantic/alert is authorised in apps/web and apps/admin for error callouts; the Revoke username frames and dialog gain a line saying the username is held for 30 days (admin-facing only); the guardian post-decline clause 'so it stays switched off' is tagged [COPY PENDING LEGAL REVIEW] with a manifest row; five behaviours are kept as built; K3 finding: the K2 profile replacement frames 6747:28894, 6747:29094 and 6747:29291 were never diffed against their legacy twins</w:t>
-            </w:r>
-          </w:p>
-        </w:tc>
-        <w:tc>
-          <w:tcPr>
-            <w:tcW w:type="dxa" w:w="1850"/>
-          </w:tcPr>
-          <w:p>
-            <w:r>
-              <w:t>docs/decisions-founder-2026-10-19 (docs only, 2026-10-19; founder decisions 2026-10-19, items 1-7, the K3 finding and the register instructions; docs/build-register.md Section 27, docs/qa-e2e-onboarding-report.md, CLAUDE.md; sources docs/backend-w3e-report.md sections 2 and 4 (PR #429), docs/fc3a-onboarding-fixes-report.md sections 6 and 7 (PR #430), docs/fc3b-admin-report.md open points (PR #431), docs/figma-pass-k3-report.md section 7 (PR #428), docs/backend-w3d-report.md section 6 (PR #424))</w:t>
-            </w:r>
-          </w:p>
-        </w:tc>
-        <w:tc>
-          <w:tcPr>
-            <w:tcW w:type="dxa" w:w="2300"/>
-          </w:tcPr>
-          <w:p>
-            <w:r>
-              <w:t>Resolved -- recorded. FOUNDER-ADOPTED DEFAULTS, VETO-ABLE, all seven items. DECIDED, NOT BUILT, except item 7, which confirms what is already built (PRs #428, #430, #431). Item numbers are the order of the founder's instruction. Original text of every entry named in the forward-pointers below is unchanged (dated notes appended). Sources: the open points of backend/w3e (PR #429), FC3a (PR #430), FC3b (PR #431) and Figma pass K3 (PR #428). (1) PRODUCTION BOOT CHECK (settles the open point of #407 item 1). W3e built CORS fail-closed with a boot log: an unset, non-URL, placeholder or (in production) unusable WEB_APP_BASE_URL or ADMIN_APP_BASE_URL contributes no origin and a [cors] line is logged, but the API still starts, so a bad production deploy comes up healthy and no browser can call it. Decided: in production the same condition refuses to boot, through assertProductionEnv (services/api/src/validate-runtime-env.ts), the way a missing or placeholder JWT_SECRET or ADMIN_JWT_SECRET already does (B-018). Outside production nothing changes (log only, localhost allowed). The build reuses the test cors-options.ts already applies and does not write a second one. Render sets NODE_ENV=production at runtime on both services, so staging is covered as well and each service needs both values before its next deploy (to confirm in the build PR). Not decided: origins other than the two apps (preview deployments, a mobile web view). Build row B-163 (W1). (2) CROSS-TAB REFRESH LOCK. The refresh token rotates and the server treats a second use of an old token as reuse; apps/web/src/lib/silentRefresh.ts is single-flight inside one tab only, so two open tabs that refresh together can log the person out. W3e found it when a test went intermittent and worked around it in that one test; it is not a test problem. Decided: a cross-tab lock so only one tab calls POST /auth/refresh at a time; the other tabs wait and then use the tokens the first tab stored. The alternative W3e named, a short server-side reuse grace, is not chosen and the server's reuse detection is unchanged. Not decided: the mechanism (Web Locks API, a storage-based lock or a BroadcastChannel); the build PR picks it and states its fallback. Build row B-164 (W9). (3) USERNAME FILTER (extends #407 item 3). Decided: the exact whole handles nazif, nazifa and nazifah are allowed (real given names; W3e refused them because they cannot be told from nazi + fan); nazifan and every other glued form stay refused. HOW: they are an exact allow-list of whole handles checked before the CONTAINS rule, not substring exceptions. Adding nazif to the named innocent exceptions of the nazi rule would cut it out of nazifan, leave 'an', and accept it. Handles that only contain a name (nazif_10, nazifa2, xxnazifxx) are not covered by this decision; under the adopted reading they stay refused; whether suffixes should be accepted is not decided. RECORDED AS BUILT AND LEFT OPEN FOR THE FOUNDER'S REVIEW, verbatim from docs/backend-w3e-report.md (D-06): CONTAINS, 5+ letters and unambiguous: hitler, pussy, paedo, swastika, whitepower, gangbang, deepthroat, creampie, orgasm, masturbat, erotic. nazi is four letters and sits in real names, so it is CONTAINS with named innocent exceptions (nazir, nazim, nazia, nazih, nazik): those are cut out, the rest is searched; nazifan, xxnazixx and nazirnazi are refused, nazir_10 is accepted. Short or ambiguous terms stay exact: dick, cock, rape, ass, sex, sexy, anal, cum, pedo, isis, kkk, twat, wank, ... (the report's list ends with '...'; the full exact list is PROFANITY_EXACT in services/api/src/modules/users/username-rules.constants.ts: dick, cock, anal, anus, sex, sexy, rape, nazi, kkk, isis, pedo, tits, boobs, ass, arse, twat, wank, cum, nude, nudes). Tested: 18 glued or leet refusals, guarded-term cases, short-term-exact cases and a 37-handle innocent list (Essex, Sussex, Hancock, Hitchcock, Peacock, Dickson, Nazir, Torpedo, ...). Known false positives unchanged and deliberately not in the list: scunthorpe, penistone, therapist. The 5-letter threshold, every list above and the innocent list are W3e's adopted defaults; none is decided here. The older CONTAINS terms from B-032 (fuck, shit, ... terrorist) are outside this review. Build row B-165 (W4). (4) SEMANTIC/ALERT IN CODE. Decision Log #99 authorised semantic/alert (#FA0606, Light = Dark) in Figma only, as a deliberate exception to non-negotiable #3 (loss, destructive or alert colour only). Decided: the token is authorised in apps/web and apps/admin for error callouts. Adopted reading, veto-able: the colour is the non-text accent (bar, border, icon) of an error callout, not text colour and not a button fill, because the Settings rebuild (PR #116) measured white on semantic/alert at 4.12:1, below AA; error text stays navy. Not covered and left as they are: the Grassroots LIVE indicator and the notification unread dot (brand green), destructive buttons (navy). CLAUDE.md non-negotiable #3 is not rewritten; #99 and this entry are the recorded exception for code. Build row B-166 (W9). (5) REVOKE USERNAME HOLD LINE (admin-facing only). The three Revoke username frames (dialog 6647:25789, success 6649:24462, error 6649:24714) say only what is removed. Decided: the frames and the dialog gain a line saying the username is held for 30 days (the backend already holds a revoked handle for 30 days for everyone, #402 item 3, and the response carries heldUntil). Admin-facing only: the email to the revoked user and every user-facing screen are unchanged. Adopted reading, veto-able: the line goes in the dialog and the success frame; the error frame gets none because it says nothing was changed. Not decided: the exact wording (set in the Figma pass), whether the success frame shows the date from heldUntil, and whether the line takes [COPY PENDING LEGAL REVIEW] (the existing dialog body already does). Build rows B-167 (Figma, W0), B-168 (apps/admin, W9). (6) POST-DECLINE CLAUSE TAGGED. The guardian page's declined state says 'You have declined permission for this account, so it stays switched off.' That clause is not founder wording, was not tagged by FC3a, and #406 does not cover the state. Decided: it is tagged [COPY PENDING LEGAL REVIEW] and gets a docs/pending-copy-manifest.md row. Consequence for the build, not a decision: the tag is part of the guardian-visible text the tripwire hashes, so CONSENT_SCREEN_VERSION and CONSENT_SCREEN_TEXT_HASH must be bumped in the same PR (#348); the manifest row is added with the tag, never before it (the inventory test fails on a row with no matching string), so this docs pass does NOT add it. Build row B-169 (W9). (7) KEPT AS BUILT (confirms what exists; no build row): (a) the link on the Users list that opens the incorrect-details reports screen (FC3b added it outside the frames; the frames left the entry point SCOPE OPEN); (b) the one-row 'Copy Profile Link' menu on the own Saved frame 6747:29445 (K3 open point 1); (c) the hidden K2 column 6747:29556 inside 6747:29445 stays until the launch gate, then is deleted with the other hidden ARCHIVED originals (B-090); (d) the revocation history (usernameRevocations in the user summary) stays not shown; (e) the mobile header keeps a short scrolling icon row at 390 px with the search box hidden (FC3a judgment call 3), although the Figma mobile navbars draw no icon row. (K3 FINDING, recorded, not a decision) Figma pass K3 rebuilt the own Saved desktop frame 6747:29445 after finding that K2's version was a single-column simplification of the legacy frame 1460:8940, because K2 checked counts and bounds only. The K2 replacement frames 6747:28894 (other user, Posts), 6747:29094 (own, Posts) and 6747:29291 (own, Media) were not diffed against their legacy twins and very likely carry the same simplifications; their twins 1455:4362 and 1455:6626 were archived on K2's say-so. The K2 claim that B-138 closes on the design side therefore does not hold for those three frames. The fix is a diff-first pass, K4, that does what K3 did and leaves the legacy frames archived (nothing deleted). Build row B-170 (W0). (REGISTER) docs/build-register.md Section 27: B-163 to B-177 added (15 rows); items 1 to 6 and the K3 finding each have a row; the W3d items not built map to B-160 and B-161 (already rows, reused, no duplicate), B-171 and B-172 (new, OPEN); the apps/admin developer notes are B-173; the mobile verify-prompt and Club Picker comparisons are B-174 and B-175; the guardian confirm layout is B-176; B-177 (the guardian frames that still say 'follow') is added beyond the founder's list because FC3a records it as open and no row owned it. Status lines on 25 existing rows. 177 B-IDs; 146 gap frames unchanged. Arithmetic: Section 27e. (FORWARD-POINTERS) Dated notes appended (original text unchanged) to #19, #99, #348, #369, #377, #389, #390, #395, #396, #398, #402, #403, #406 and #407 (what W3e, FC3a, FC3b and K3 built or found). NOT DECIDED HERE: origins other than the two apps; the lock mechanism; whether handles that merely contain nazif, nazifa or nazifah are accepted; every term list, the 5-letter threshold and the innocent list; any use of semantic/alert beyond error callouts and its use as text colour; the wording of the hold line, its date and its tag; the final wording of the post-decline clause (counsel); which legacy twin belongs to which K2 frame; the error code below_minimum_age and its message (W3e's choice, still not confirmed since #407); the open W3d items B-160, B-161, B-171 and B-172; whether the Figma frames carry the same fixes (B-177); counsel wording of every [COPY PENDING LEGAL REVIEW] string.</w:t>
+              <w:t>Founder decisions 2026-10-19 on the open points of the W3e, FC3a, FC3b and K3 passes (8 items) and one recorded finding: in production an unset or invalid WEB_APP_BASE_URL or ADMIN_APP_BASE_URL refuses to boot; a cross-tab lock for the refresh-token rotation in apps/web; the username filter allows the exact whole handles nazif, nazifa and nazifah and still refuses nazifan, with the built term lists recorded and left open for review; semantic/alert is authorised in apps/web and apps/admin for error callouts; the Revoke username frames and dialog gain a line saying the username is held for 30 days (admin-facing only); the guardian post-decline clause 'so it stays switched off' is tagged [COPY PENDING LEGAL REVIEW] with a manifest row; four behaviours are kept as built; the mobile header follows the Figma header and the Navigation Drawer signed in (the nine-icon row is removed), and a logged-out mobile navigation is drawn in K4 and built in FC4; K3 finding: the K2 profile replacement frames 6747:28894, 6747:29094 and 6747:29291 were never diffed against their legacy twins</w:t>
+            </w:r>
+          </w:p>
+        </w:tc>
+        <w:tc>
+          <w:tcPr>
+            <w:tcW w:type="dxa" w:w="1850"/>
+          </w:tcPr>
+          <w:p>
+            <w:r>
+              <w:t>docs/decisions-founder-2026-10-19 (docs only, 2026-10-19; founder decisions 2026-10-19, items 1-8, the K3 finding and the register instructions; docs/build-register.md Section 27, docs/qa-e2e-onboarding-report.md, CLAUDE.md; sources docs/backend-w3e-report.md sections 2 and 4 (PR #429), docs/fc3a-onboarding-fixes-report.md sections 6 and 7 (PR #430), docs/fc3b-admin-report.md open points (PR #431), docs/figma-pass-k3-report.md section 7 (PR #428), docs/backend-w3d-report.md section 6 (PR #424))</w:t>
+            </w:r>
+          </w:p>
+        </w:tc>
+        <w:tc>
+          <w:tcPr>
+            <w:tcW w:type="dxa" w:w="2300"/>
+          </w:tcPr>
+          <w:p>
+            <w:r>
+              <w:t>Resolved -- recorded. FOUNDER-ADOPTED DEFAULTS, VETO-ABLE, all eight items. DECIDED, NOT BUILT, except item 7, which confirms what is already built (PRs #428, #430, #431). Item numbers are the order of the founder's instruction. Original text of every entry named in the forward-pointers below is unchanged (dated notes appended). Sources: the open points of backend/w3e (PR #429), FC3a (PR #430), FC3b (PR #431) and Figma pass K3 (PR #428). (1) PRODUCTION BOOT CHECK (settles the open point of #407 item 1). W3e built CORS fail-closed with a boot log: an unset, non-URL, placeholder or (in production) unusable WEB_APP_BASE_URL or ADMIN_APP_BASE_URL contributes no origin and a [cors] line is logged, but the API still starts, so a bad production deploy comes up healthy and no browser can call it. Decided: in production the same condition refuses to boot, through assertProductionEnv (services/api/src/validate-runtime-env.ts), the way a missing or placeholder JWT_SECRET or ADMIN_JWT_SECRET already does (B-018). Outside production nothing changes (log only, localhost allowed). The build reuses the test cors-options.ts already applies and does not write a second one. Render sets NODE_ENV=production at runtime on both services, so staging is covered as well and each service needs both values before its next deploy (to confirm in the build PR). Not decided: origins other than the two apps (preview deployments, a mobile web view). Build row B-163 (W1). (2) CROSS-TAB REFRESH LOCK. The refresh token rotates and the server treats a second use of an old token as reuse; apps/web/src/lib/silentRefresh.ts is single-flight inside one tab only, so two open tabs that refresh together can log the person out. W3e found it when a test went intermittent and worked around it in that one test; it is not a test problem. Decided: a cross-tab lock so only one tab calls POST /auth/refresh at a time; the other tabs wait and then use the tokens the first tab stored. The alternative W3e named, a short server-side reuse grace, is not chosen and the server's reuse detection is unchanged. Not decided: the mechanism (Web Locks API, a storage-based lock or a BroadcastChannel); the build PR picks it and states its fallback. Build row B-164 (W9). (3) USERNAME FILTER (extends #407 item 3). Decided: the exact whole handles nazif, nazifa and nazifah are allowed (real given names; W3e refused them because they cannot be told from nazi + fan); nazifan and every other glued form stay refused. HOW: they are an exact allow-list of whole handles checked before the CONTAINS rule, not substring exceptions. Adding nazif to the named innocent exceptions of the nazi rule would cut it out of nazifan, leave 'an', and accept it. Handles that only contain a name (nazif_10, nazifa2, xxnazifxx) are not covered by this decision; under the adopted reading they stay refused; whether suffixes should be accepted is not decided. RECORDED AS BUILT AND LEFT OPEN FOR THE FOUNDER'S REVIEW, verbatim from docs/backend-w3e-report.md (D-06): CONTAINS, 5+ letters and unambiguous: hitler, pussy, paedo, swastika, whitepower, gangbang, deepthroat, creampie, orgasm, masturbat, erotic. nazi is four letters and sits in real names, so it is CONTAINS with named innocent exceptions (nazir, nazim, nazia, nazih, nazik): those are cut out, the rest is searched; nazifan, xxnazixx and nazirnazi are refused, nazir_10 is accepted. Short or ambiguous terms stay exact: dick, cock, rape, ass, sex, sexy, anal, cum, pedo, isis, kkk, twat, wank, ... (the report's list ends with '...'; the full exact list is PROFANITY_EXACT in services/api/src/modules/users/username-rules.constants.ts: dick, cock, anal, anus, sex, sexy, rape, nazi, kkk, isis, pedo, tits, boobs, ass, arse, twat, wank, cum, nude, nudes). Tested: 18 glued or leet refusals, guarded-term cases, short-term-exact cases and a 37-handle innocent list (Essex, Sussex, Hancock, Hitchcock, Peacock, Dickson, Nazir, Torpedo, ...). Known false positives unchanged and deliberately not in the list: scunthorpe, penistone, therapist. The 5-letter threshold, every list above and the innocent list are W3e's adopted defaults; none is decided here. The older CONTAINS terms from B-032 (fuck, shit, ... terrorist) are outside this review. Build row B-165 (W4). (4) SEMANTIC/ALERT IN CODE. Decision Log #99 authorised semantic/alert (#FA0606, Light = Dark) in Figma only, as a deliberate exception to non-negotiable #3 (loss, destructive or alert colour only). Decided: the token is authorised in apps/web and apps/admin for error callouts. Adopted reading, veto-able: the colour is the non-text accent (bar, border, icon) of an error callout, not text colour and not a button fill, because the Settings rebuild (PR #116) measured white on semantic/alert at 4.12:1, below AA; error text stays navy. Not covered and left as they are: the Grassroots LIVE indicator and the notification unread dot (brand green), destructive buttons (navy). CLAUDE.md non-negotiable #3 is not rewritten; #99 and this entry are the recorded exception for code. Build row B-166 (W9). (5) REVOKE USERNAME HOLD LINE (admin-facing only). The three Revoke username frames (dialog 6647:25789, success 6649:24462, error 6649:24714) say only what is removed. Decided: the frames and the dialog gain a line saying the username is held for 30 days (the backend already holds a revoked handle for 30 days for everyone, #402 item 3, and the response carries heldUntil). Admin-facing only: the email to the revoked user and every user-facing screen are unchanged. Adopted reading, veto-able: the line goes in the dialog and the success frame; the error frame gets none because it says nothing was changed. Not decided: the exact wording (set in the Figma pass), whether the success frame shows the date from heldUntil, and whether the line takes [COPY PENDING LEGAL REVIEW] (the existing dialog body already does). Build rows B-167 (Figma, W0), B-168 (apps/admin, W9). (6) POST-DECLINE CLAUSE TAGGED. The guardian page's declined state says 'You have declined permission for this account, so it stays switched off.' That clause is not founder wording, was not tagged by FC3a, and #406 does not cover the state. Decided: it is tagged [COPY PENDING LEGAL REVIEW] and gets a docs/pending-copy-manifest.md row. Consequence for the build, not a decision: the tag is part of the guardian-visible text the tripwire hashes, so CONSENT_SCREEN_VERSION and CONSENT_SCREEN_TEXT_HASH must be bumped in the same PR (#348); the manifest row is added with the tag, never before it (the inventory test fails on a row with no matching string), so this docs pass does NOT add it. Build row B-169 (W9). (7) KEPT AS BUILT (confirms what exists; no build row): (a) the link on the Users list that opens the incorrect-details reports screen (FC3b added it outside the frames; the frames left the entry point SCOPE OPEN); (b) the one-row 'Copy Profile Link' menu on the own Saved frame 6747:29445 (K3 open point 1); (c) the hidden K2 column 6747:29556 inside 6747:29445 stays until the launch gate, then is deleted with the other hidden ARCHIVED originals (B-090); (d) the revocation history (usernameRevocations in the user summary) stays not shown. (8) Mobile header: signed in, the mobile header follows the Figma header (logo, search field, avatar that opens the Navigation Drawer) and the nine-icon row is removed (FC3a left it in; QA B-132 note updated). Logged out, Figma draws no navigation; K4 draws a logged-out mobile navigation (a menu control opening a drawer with the public sections plus Login and Sign up) and FC4 builds it. Until FC4 merges, logged-out visitors keep the scrolling icon row. Build row B-178 (W9; FC4 depends on both this PR and K4). (K3 FINDING, recorded, not a decision) Figma pass K3 rebuilt the own Saved desktop frame 6747:29445 after finding that K2's version was a single-column simplification of the legacy frame 1460:8940, because K2 checked counts and bounds only. The K2 replacement frames 6747:28894 (other user, Posts), 6747:29094 (own, Posts) and 6747:29291 (own, Media) were not diffed against their legacy twins and very likely carry the same simplifications; their twins 1455:4362 and 1455:6626 were archived on K2's say-so. The K2 claim that B-138 closes on the design side therefore does not hold for those three frames. The fix is a diff-first pass, K4, that does what K3 did and leaves the legacy frames archived (nothing deleted). Build row B-170 (W0). (REGISTER) docs/build-register.md Sections 27 and 28: B-163 to B-178 added (16 rows); items 1 to 6, item 8 and the K3 finding each have a row; the W3d items not built map to B-160 and B-161 (already rows, reused, no duplicate), B-171 and B-172 (new, OPEN); the apps/admin developer notes are B-173; the mobile verify-prompt and Club Picker comparisons are B-174 and B-175; the guardian confirm layout is B-176; B-177 (the guardian frames that still say 'follow') is added beyond the founder's list because FC3a records it as open and no row owned it. Status lines on 26 existing rows (B-132 gets a note under item 8). 178 B-IDs; 146 gap frames unchanged. Arithmetic: Sections 27e and 28b. (FORWARD-POINTERS) Dated notes appended (original text unchanged) to #19, #99, #348, #369, #377, #389, #390, #395, #396, #398, #402, #403, #406 and #407 (what W3e, FC3a, FC3b and K3 built or found). NOT DECIDED HERE: the wording and the list of public sections of the logged-out mobile drawer (item 8); origins other than the two apps; the lock mechanism; whether handles that merely contain nazif, nazifa or nazifah are accepted; every term list, the 5-letter threshold and the innocent list; any use of semantic/alert beyond error callouts and its use as text colour; the wording of the hold line, its date and its tag; the final wording of the post-decline clause (counsel); which legacy twin belongs to which K2 frame; the error code below_minimum_age and its message (W3e's choice, still not confirmed since #407); the open W3d items B-160, B-161, B-171 and B-172; whether the Figma frames carry the same fixes (B-177); counsel wording of every [COPY PENDING LEGAL REVIEW] string.</w:t>
             </w:r>
           </w:p>
         </w:tc>

</xml_diff>

<commit_message>
docs: Decision Log #409 and build register B-179, B-180 (hosting shape, launch-gate runbook)
Records the founder's 2026-10-20 decisions: apps/web and apps/admin as separate
Render static sites (three services per environment), production wiring still
deferred to the launch gate B-090, and a plain-language launch-gate runbook
produced at that gate. Docs only; render.yaml and docs/deployment.md untouched.

Co-Authored-By: Claude Sonnet 5.5 <noreply@anthropic.com>
</commit_message>
<xml_diff>
--- a/docs/Soccernity_MVP_Build_Plan_v1.7.docx
+++ b/docs/Soccernity_MVP_Build_Plan_v1.7.docx
@@ -10756,7 +10756,7 @@
           </w:tcPr>
           <w:p>
             <w:r>
-              <w:t>Resolved (platform chosen, config prepared) — open action: real Neon/Upstash/Render accounts still needed before any live deploy</w:t>
+              <w:t>Resolved (platform chosen, config prepared) — open action: real Neon/Upstash/Render accounts still needed before any live deploy [2026-10-20: #409 records the hosting shape for the two frontends: apps/web and apps/admin are separate Render static sites, three services per environment (the API, the web app, the admin app), each on its own https origin. render.yaml defines only the API services today (B-179). Live deployment stays deferred to the launch gate B-090; a plain-language runbook is produced at that gate (B-180, docs/launch-gate-runbook.md) and supersedes docs/deployment.md.]</w:t>
             </w:r>
           </w:p>
         </w:tc>
@@ -27131,7 +27131,7 @@
           </w:tcPr>
           <w:p>
             <w:r>
-              <w:t>Resolved -- recorded; DECIDED, NOT BUILT. Source: founder decisions 2026-10-16, numbered 1-19 as given to this entry. Amends #400 (items 1, 9, 11), #395 (items 2, 15), #401 (item 7), #369 (item 15), #394 and #371 (item 17) by dated notes appended to those rows; the original text of every row is unchanged. It also changes points recorded in #398 D1 (item 8), #399 E3 (item 10) and #402 item 4 (item 16): those three rows were NOT edited (this entry is the record), see docs/build-register.md Section 12. The founder labelled the country select in item 17 a veto-able default and the withdrawal throttle in item 15 a default held in configuration; everything else is stated as a decision. (1) NON-FINALIST CONTEST TAB -- AMENDS #400 E8. The Create Post Contest tab for a non-finalist is NOT hidden. The tab stays visible, and a non-finalist who opens it during days 22-24 sees the existing 'Closed (not a finalist)' frames (desktop 6660:31044, mobile 6660:35699), which are RESTORED (un-archived, by a Figma pass, not by this entry). The minimum tally x stays admin-only (E8's second sentence stands). (2) DECLINE PAGE CAP SENTENCE -- clarifies #395 B2. The decline page keeps its static sentence that states the cap (Figma node 6627:22230). 'No decline count is shown' means no RUNNING 'decline N of 3' counter. The sentence is minor-facing copy and stays [COPY PENDING LEGAL REVIEW]. (3) GUARDIAN 'APPROVED' SCREENS. 5488:7164 and 5501:8225 are reworded to match the flow (approval continues to Create Profile; extends #394 A5); the new wording is [COPY PENDING LEGAL REVIEW]. (4) ADMIN COMPONENTS. The component frame at Figma node 6671:27364 (Pass F2) exists so that admin screens and apps/admin share ONE Button, Pill, Field, Callout, Banner, Note, Dialog and Table. Adoption is on the Pass C and Pass F1 admin frames only (not on older admin frames). A spacing / radius variable collection is added (a Figma pass does this; 'Soccernity Theme' stays the colour collection). (5) ADMIN SHELL SEARCH BAR. It stays visible on admin screens and is NOT functional ('not available yet'). New register row B-114: decide build vs hide. (6) EXCEPTION TO 'NEVER DELETE' (Figma passes). The ten hidden legacy absolute layers inside the ten rebuilt Create Post frames (the 'ARCHIVED -- legacy absolute layer' children from Pass F2 inside 2008:655, 2009:5168, 2009:2913, 6171:14797, 6171:16994, 2496:4462, 2565:3951, 6660:28736, 6660:31044, 6660:33353) may be deleted, and ONLY those. (7) VOTING PAGE ADOPTS THE ALREADY VOTED DESIGN -- closes the open point of #401. The Voting page (desktop 2094:994, mobile 5802:8726) takes the Already Voted page's design (entries column + board column, fan cards) and carries the vote toggle (#401). The separate Already Voted screens (5802:8978 / 5815:8916, and the auto-layout rebuild 6671:27155) are archived AFTERWARDS, by a Figma pass; the Voting &lt;-&gt; Already Voted navigation of #387 therefore goes with them. (8) LIFT HOLD -- changes #398 D1 / #376. Lift hold applies to BOTH the legal hold and the 6-month bad-faith hold. A reason is required. The held user is NOT notified. Appeal Review reuses the shared hold dialogs (Bad faith / Legal hold / Lift hold) used on Report Detail. (9) FORFEIT POP-UP -- AMENDS #400 E11. Shown ONLY on the Contest page. On every load of that page the user sees one pop-up per forfeited week, from when the week is deemed forfeited (docs/contest-spec.md Section 7); the reason is shown; nothing is remembered between loads. The leaderboard Contest tab shows the forfeited writing in place of the three names for that week (no pop-up there). (10) FINAL TASK TEXT -- changes #399 E3. The week-4 task text shows on the live-ranking and uploading states only (not on the 'No winner this month' or crowned states). (11) COMMUNITY-FEED 'FINAL WEEK' MODULE -- AMENDS #400 E10 and the open point carried by #402. The module STAYS. The dead 'View on the Contest page' link is removed. Its videos become a carousel that keeps the current frame size and serves as a preview slot reusable for other showcases later. It shows only during a final contest week and not at all when there is none. OPEN: whether carousel views count as impressions (B-092). (12) MOBILE BLOCK PATTERN: the '...' menu (confirms the Pass F1 trigger, node 6669:27188). (13) CREATE POST FIGMA CHANGES ACCEPTED: the scrim token change (white 71% to color/overlay/scrim) and the typographic crest marks in the Fixtures module of the Create Post frames. Licensing of club crests in Fixtures stays OPEN (#85, #97). (14) FONT: user-facing read-only fields need a Montserrat Field variant (the admin components are Inter). (15) DEFAULTS CLOSING OPEN POINTS: the placeholder name for incomplete profiles is 'Soccernity member' (closes #369's open point); a DOB-correction restart RESETS the decline counter and writes an audit entry (closes #395 B4's open point); the withdrawal throttle default is 5 attempts per 15 minutes, held in configuration (sets the window left open in #395 B3); unverified-email users are blocked from social writes as well as from PATCH /users/:id (extends the guard built under B-020; new row B-118). (16) BANTS -- an OPEN FORUM, no private messages. Anyone can start a thread and others comment on it; likes work as on a blog or forum (one like per user per item, toggled, public count). Accounts aged 16 and 17 have FULL Bants access (the limit in #346 applies to under-16s only, who stay fully disabled); this is a founder decision, not read-only. Bants will have moderation. Block hides the blocked user's posts, comments and like identities in both directions; counts unchanged; no room membership. This settles the 'Bants rooms' and 'exact like mechanics' points #402 item 4 left open; the interaction with #346 / #347 stays open. OPEN, recorded not resolved: 'thread' is not mapped to the built model (BanterRoom #275 vs Post), and 'no room membership' is not reconciled with the built BanterRoomMember join / leave, My Bants and 'posting requires membership' (#275); the scope of 'moderation' beyond room status (#357) is not stated. New row B-117. (17) COUNTRY HAS TWO SEPARATE FIELDS. (a) SAFEGUARDING country: declared at the Age Gate and derived from the IP lookup (B-023..B-025). Stored separately, never shown, never editable by any profile action; it alone decides US under-13 card verification and demographic grouping (#368 stands). (b) PROFILE country: a separate, nullable, OPTIONAL field. It is BLANK at Create Profile (not prefilled, not read-only), the user may fill it in, and it is editable at any time in Edit Profile (B-083). It is shown on a user's profile only if they filled it in, so a minor's country is visible only if the minor chooses to enter it. AMENDS #394 A1 (Country read-only at Create Profile) and the 'country' item of #371 (profile shows country): those rows stand except for these points. DEFAULT, VETO-ABLE: a country select from the full country list. B-038 stores the profile country as its own column, NOT the derived or declared safeguarding fields. Counsel review of country display stays on the legal list with reduced scope because the field is optional. (18) PRODUCTION WIRING (MaxMind, Render environment variables, Postmark, JWT secrets, TRUST_PROXY_HOPS) is deferred to the launch gate B-090; the code fails safe until it is done. (19) NEW REGISTER ROWS: password-reset email placeholder-address fallback (B-115); API test-suite worker flake, the suite needs --maxWorkers=4 (B-116); admin search bar (B-114, item 5). Rows added from the other items: B-113 (Figma re-sync, items 1-14 and 17), B-117 (Bants open forum), B-118 (email-verification gate on social writes). Build register: B-113 to B-118 new; status lines on B-002, B-003, B-006, B-007, B-012, B-013, B-018, B-020, B-023, B-024, B-026, B-027, B-038, B-039, B-042, B-044, B-045, B-054, B-071, B-079, B-080, B-081, B-082, B-083, B-090, B-091, B-092, B-095, B-096, B-098, B-099, B-102, B-103, B-107, B-108, B-112. STILL OPEN: counsel wording for every [COPY PENDING LEGAL REVIEW] item; the Bants mapping questions in (16); build vs hide for the admin search bar (B-114); whether carousel views count as impressions (B-092); whether the 'Closed (not a finalist)' copy may reveal anything about uploads before the reveal; how other users reach a finalist's entry after the reveal; what the Contest tab shows from 00:00 to 08:00 on day 1; which routes count as 'social writes' (B-118); the interaction of Block with #346 / #347; crest licensing in Fixtures (#85, #97); the CSAM path; the length of every window stated as configuration other than the withdrawal throttle. [2026-10-17: Item 15 (unverified-email users cannot perform social writes) is built: B-118 (backend/w3-gates, PR #412). The creating forms are gated by EmailVerifiedGuard; the undo and own-content forms stay open (docs/backend-w3-gates-report.md, section 5, call 1, adopted by #404, item 12). Two open points of this entry are closed by #404: the forfeit pop-up reading of 'Contest page' and several forfeited weeks (item 4), and whether carousel views count as impressions (items 6 and 15).] [2026-10-17: Items 2 and 15 are built in the backend (PR #416): the decline counter is internal and never returned by any API (item 2); a DOB-correction restart resets it and writes an audit entry (item 15, user.dob_corrected). Item 15's unverified-email rule is already noted above (PR #412). The Contest notification question 'does an unverified-email account receive them' is answered by #405, item 4.] [2026-10-18: Figma pass K2 (docs/figma-pass-k2-report.md section 6, candidate 7): item 17's rule 'show the country line only when filled' is unchanged, but the general profile frames show a filled sample country line while the pass H frames hide it; which sample is canonical is not decided (register row B-148).] [2026-10-19: Item 13 (typographic crest marks accepted) is applied by Figma pass K3 on the own Saved frame 6747:29445 (PR #428); fixture crest licensing stays open. K3 found that the K2 profile frames 6747:28894, 6747:29094 and 6747:29291 were not diffed against their legacy twins (#408, B-170).]</w:t>
+              <w:t>Resolved -- recorded; DECIDED, NOT BUILT. Source: founder decisions 2026-10-16, numbered 1-19 as given to this entry. Amends #400 (items 1, 9, 11), #395 (items 2, 15), #401 (item 7), #369 (item 15), #394 and #371 (item 17) by dated notes appended to those rows; the original text of every row is unchanged. It also changes points recorded in #398 D1 (item 8), #399 E3 (item 10) and #402 item 4 (item 16): those three rows were NOT edited (this entry is the record), see docs/build-register.md Section 12. The founder labelled the country select in item 17 a veto-able default and the withdrawal throttle in item 15 a default held in configuration; everything else is stated as a decision. (1) NON-FINALIST CONTEST TAB -- AMENDS #400 E8. The Create Post Contest tab for a non-finalist is NOT hidden. The tab stays visible, and a non-finalist who opens it during days 22-24 sees the existing 'Closed (not a finalist)' frames (desktop 6660:31044, mobile 6660:35699), which are RESTORED (un-archived, by a Figma pass, not by this entry). The minimum tally x stays admin-only (E8's second sentence stands). (2) DECLINE PAGE CAP SENTENCE -- clarifies #395 B2. The decline page keeps its static sentence that states the cap (Figma node 6627:22230). 'No decline count is shown' means no RUNNING 'decline N of 3' counter. The sentence is minor-facing copy and stays [COPY PENDING LEGAL REVIEW]. (3) GUARDIAN 'APPROVED' SCREENS. 5488:7164 and 5501:8225 are reworded to match the flow (approval continues to Create Profile; extends #394 A5); the new wording is [COPY PENDING LEGAL REVIEW]. (4) ADMIN COMPONENTS. The component frame at Figma node 6671:27364 (Pass F2) exists so that admin screens and apps/admin share ONE Button, Pill, Field, Callout, Banner, Note, Dialog and Table. Adoption is on the Pass C and Pass F1 admin frames only (not on older admin frames). A spacing / radius variable collection is added (a Figma pass does this; 'Soccernity Theme' stays the colour collection). (5) ADMIN SHELL SEARCH BAR. It stays visible on admin screens and is NOT functional ('not available yet'). New register row B-114: decide build vs hide. (6) EXCEPTION TO 'NEVER DELETE' (Figma passes). The ten hidden legacy absolute layers inside the ten rebuilt Create Post frames (the 'ARCHIVED -- legacy absolute layer' children from Pass F2 inside 2008:655, 2009:5168, 2009:2913, 6171:14797, 6171:16994, 2496:4462, 2565:3951, 6660:28736, 6660:31044, 6660:33353) may be deleted, and ONLY those. (7) VOTING PAGE ADOPTS THE ALREADY VOTED DESIGN -- closes the open point of #401. The Voting page (desktop 2094:994, mobile 5802:8726) takes the Already Voted page's design (entries column + board column, fan cards) and carries the vote toggle (#401). The separate Already Voted screens (5802:8978 / 5815:8916, and the auto-layout rebuild 6671:27155) are archived AFTERWARDS, by a Figma pass; the Voting &lt;-&gt; Already Voted navigation of #387 therefore goes with them. (8) LIFT HOLD -- changes #398 D1 / #376. Lift hold applies to BOTH the legal hold and the 6-month bad-faith hold. A reason is required. The held user is NOT notified. Appeal Review reuses the shared hold dialogs (Bad faith / Legal hold / Lift hold) used on Report Detail. (9) FORFEIT POP-UP -- AMENDS #400 E11. Shown ONLY on the Contest page. On every load of that page the user sees one pop-up per forfeited week, from when the week is deemed forfeited (docs/contest-spec.md Section 7); the reason is shown; nothing is remembered between loads. The leaderboard Contest tab shows the forfeited writing in place of the three names for that week (no pop-up there). (10) FINAL TASK TEXT -- changes #399 E3. The week-4 task text shows on the live-ranking and uploading states only (not on the 'No winner this month' or crowned states). (11) COMMUNITY-FEED 'FINAL WEEK' MODULE -- AMENDS #400 E10 and the open point carried by #402. The module STAYS. The dead 'View on the Contest page' link is removed. Its videos become a carousel that keeps the current frame size and serves as a preview slot reusable for other showcases later. It shows only during a final contest week and not at all when there is none. OPEN: whether carousel views count as impressions (B-092). (12) MOBILE BLOCK PATTERN: the '...' menu (confirms the Pass F1 trigger, node 6669:27188). (13) CREATE POST FIGMA CHANGES ACCEPTED: the scrim token change (white 71% to color/overlay/scrim) and the typographic crest marks in the Fixtures module of the Create Post frames. Licensing of club crests in Fixtures stays OPEN (#85, #97). (14) FONT: user-facing read-only fields need a Montserrat Field variant (the admin components are Inter). (15) DEFAULTS CLOSING OPEN POINTS: the placeholder name for incomplete profiles is 'Soccernity member' (closes #369's open point); a DOB-correction restart RESETS the decline counter and writes an audit entry (closes #395 B4's open point); the withdrawal throttle default is 5 attempts per 15 minutes, held in configuration (sets the window left open in #395 B3); unverified-email users are blocked from social writes as well as from PATCH /users/:id (extends the guard built under B-020; new row B-118). (16) BANTS -- an OPEN FORUM, no private messages. Anyone can start a thread and others comment on it; likes work as on a blog or forum (one like per user per item, toggled, public count). Accounts aged 16 and 17 have FULL Bants access (the limit in #346 applies to under-16s only, who stay fully disabled); this is a founder decision, not read-only. Bants will have moderation. Block hides the blocked user's posts, comments and like identities in both directions; counts unchanged; no room membership. This settles the 'Bants rooms' and 'exact like mechanics' points #402 item 4 left open; the interaction with #346 / #347 stays open. OPEN, recorded not resolved: 'thread' is not mapped to the built model (BanterRoom #275 vs Post), and 'no room membership' is not reconciled with the built BanterRoomMember join / leave, My Bants and 'posting requires membership' (#275); the scope of 'moderation' beyond room status (#357) is not stated. New row B-117. (17) COUNTRY HAS TWO SEPARATE FIELDS. (a) SAFEGUARDING country: declared at the Age Gate and derived from the IP lookup (B-023..B-025). Stored separately, never shown, never editable by any profile action; it alone decides US under-13 card verification and demographic grouping (#368 stands). (b) PROFILE country: a separate, nullable, OPTIONAL field. It is BLANK at Create Profile (not prefilled, not read-only), the user may fill it in, and it is editable at any time in Edit Profile (B-083). It is shown on a user's profile only if they filled it in, so a minor's country is visible only if the minor chooses to enter it. AMENDS #394 A1 (Country read-only at Create Profile) and the 'country' item of #371 (profile shows country): those rows stand except for these points. DEFAULT, VETO-ABLE: a country select from the full country list. B-038 stores the profile country as its own column, NOT the derived or declared safeguarding fields. Counsel review of country display stays on the legal list with reduced scope because the field is optional. (18) PRODUCTION WIRING (MaxMind, Render environment variables, Postmark, JWT secrets, TRUST_PROXY_HOPS) is deferred to the launch gate B-090; the code fails safe until it is done. (19) NEW REGISTER ROWS: password-reset email placeholder-address fallback (B-115); API test-suite worker flake, the suite needs --maxWorkers=4 (B-116); admin search bar (B-114, item 5). Rows added from the other items: B-113 (Figma re-sync, items 1-14 and 17), B-117 (Bants open forum), B-118 (email-verification gate on social writes). Build register: B-113 to B-118 new; status lines on B-002, B-003, B-006, B-007, B-012, B-013, B-018, B-020, B-023, B-024, B-026, B-027, B-038, B-039, B-042, B-044, B-045, B-054, B-071, B-079, B-080, B-081, B-082, B-083, B-090, B-091, B-092, B-095, B-096, B-098, B-099, B-102, B-103, B-107, B-108, B-112. STILL OPEN: counsel wording for every [COPY PENDING LEGAL REVIEW] item; the Bants mapping questions in (16); build vs hide for the admin search bar (B-114); whether carousel views count as impressions (B-092); whether the 'Closed (not a finalist)' copy may reveal anything about uploads before the reveal; how other users reach a finalist's entry after the reveal; what the Contest tab shows from 00:00 to 08:00 on day 1; which routes count as 'social writes' (B-118); the interaction of Block with #346 / #347; crest licensing in Fixtures (#85, #97); the CSAM path; the length of every window stated as configuration other than the withdrawal throttle. [2026-10-17: Item 15 (unverified-email users cannot perform social writes) is built: B-118 (backend/w3-gates, PR #412). The creating forms are gated by EmailVerifiedGuard; the undo and own-content forms stay open (docs/backend-w3-gates-report.md, section 5, call 1, adopted by #404, item 12). Two open points of this entry are closed by #404: the forfeit pop-up reading of 'Contest page' and several forfeited weeks (item 4), and whether carousel views count as impressions (items 6 and 15).] [2026-10-17: Items 2 and 15 are built in the backend (PR #416): the decline counter is internal and never returned by any API (item 2); a DOB-correction restart resets it and writes an audit entry (item 15, user.dob_corrected). Item 15's unverified-email rule is already noted above (PR #412). The Contest notification question 'does an unverified-email account receive them' is answered by #405, item 4.] [2026-10-18: Figma pass K2 (docs/figma-pass-k2-report.md section 6, candidate 7): item 17's rule 'show the country line only when filled' is unchanged, but the general profile frames show a filled sample country line while the pass H frames hide it; which sample is canonical is not decided (register row B-148).] [2026-10-19: Item 13 (typographic crest marks accepted) is applied by Figma pass K3 on the own Saved frame 6747:29445 (PR #428); fixture crest licensing stays open. K3 found that the K2 profile frames 6747:28894, 6747:29094 and 6747:29291 were not diffed against their legacy twins (#408, B-170).] [2026-10-20: #409 item 2 restates the deferral of item 18 (production wiring waits for the launch gate B-090; the founder is saving money) and extends it to the two Render static sites for apps/web and apps/admin (B-179). At the gate one runbook is produced (B-180, docs/launch-gate-runbook.md).]</w:t>
             </w:r>
           </w:p>
         </w:tc>
@@ -27299,7 +27299,7 @@
           </w:tcPr>
           <w:p>
             <w:r>
-              <w:t>Resolved -- recorded. FOUNDER-ADOPTED DEFAULTS, VETO-ABLE, all seven items. DECIDED, NOT BUILT, except item 6, which confirms what is already built (W3d, PR #424). Item numbers are the order of the founder's instruction. Original text of every entry named in the forward-pointers below is unchanged (dated notes appended). Source: the QA run of PR #426 (docs/qa-e2e-onboarding-report.md): 165 browser tests against the real API, 17 defects (D-01 to D-17) and 3 gaps (G-1 to G-3). (1) CORS (QA D-01, BLOCKER / SAFEGUARDING). apps/web/src/api/auth.ts registerUser sends credentials 'include' and services/api/src/main.ts calls app.enableCors() with no options (it answers '*'); browsers refuse that combination, so sign-up fails in every browser when web and API are on different origins, as in production, and no request reaches the API. Decided: registerUser stops sending credentials 'include'; the API restricts CORS to the origins in WEB_APP_BASE_URL and a new ADMIN_APP_BASE_URL, plus localhost origins in development. The new variable is added to render.yaml (both services), .env.example and the env-completeness check; the founder sets its production value in Render. The API sets no cookie and returns the refresh token in the response body, so the credentials option appears to have no function (to confirm in the build PR). Not decided: what the API does when a variable is unset in production, and origins other than the two apps. Build row B-140 (W1). (2) AGE-5 FLOOR (QA D-02, BLOCKER / SAFEGUARDING). #19 says signup is hard-blocked below age 5 regardless of guardian consent, but the floor exists only in the web Age Gate: POST /auth/register with a date of birth 4 years ago and a valid guardian block returns 201 and creates the account and the guardian request. Decided: the floor is enforced server-side with a 400; exactly age 5 stays accepted. Not decided: the error code and message; the build PR checks the DOB-correction tool (#390) cannot set a date of birth below the floor. Build row B-141 (W1). (3) USERNAME FILTER (QA D-06). Hate and sexual terms glued to other letters (xxhitlerxx, nazifan) are accepted because the filter's EXACT list matches only the whole handle or an underscore token. Decided: long, unambiguous terms are matched by CONTAINS, with a tested list of innocent words that must still be accepted; short or ambiguous terms stay exact. Not decided: the term lists and the length threshold (set in the build PR, for founder review). Build row B-142 (W4). (4) 'FOLLOW' PROMISES (QA D-13). The restricted-pending view says 'Browse and follow' and the guardian page lists 'Follow teams and check scores', but a restricted-pending minor's follow is refused with 403 (#370). Decided: both screens stop promising follow and the wording says what works, tagged [COPY PENDING LEGAL REVIEW] and added to the pending-copy manifest; the guardian-page change is guardian-visible, so CONSENT_SCREEN_VERSION and the tripwire hash (#348) are bumped under the rule of B-130. The Figma frames are not checked here for the same promise. Build row B-154 (W9). (5) GUARDIAN APPROVAL SCREEN (QA D-09). After approval the guardian is told 'The account is now active', but the minor still has to verify email and create a profile. Decided: the screen no longer says the account is active; it says the approval is recorded and registration continues ([COPY PENDING LEGAL REVIEW]), matching the Figma Approved screens (#403 item 3). Build row B-153 (W9). (6) STALE-DECLINE RE-SEND STAYS. A guardian who declined at decline 1 or 2 is still sent a new consent request by the platform when the row lapses after 14 days (#406 item 1, built as B-126), after the minor is warned. This settles judgment call 1 of docs/backend-w3d-report.md (section 5). The alternative, warning the minor and closing after a further window without re-sending, stays a one-place change (GuardianStaleDeclineSweepService); the cap of three declines bounds the re-sends. Counsel review of legal copy v0.8 Part 4.4 is still pending. Rows B-126, B-102. (7) LEGACY SAVED FRAME. The Figma frame 1460:8940 (own Saved, absolute layout) is archived, now that 6747:29445 replaces it (Figma pass K2, candidate 2): hidden and renamed 'ARCHIVED - ...', nothing deleted, after a page-wide reference scan, and added to docs/figma-archive-index.md. Build row B-144 (W0). (REGISTER) docs/build-register.md Section 25: B-140 to B-162 added (23 rows); every QA defect and gap, every open item of the W3d report (section 6) and every K2 candidate (1-10) is mapped to a row, reused (B-120, B-128, B-129, B-130, B-131, B-132, B-133, B-134, B-078, B-138) or new. D-01 and D-02 are marked BLOCKER / SAFEGUARDING. Status lines on 23 existing rows. 162 B-IDs; 146 gap frames unchanged. Arithmetic: Section 25g. (FORWARD-POINTERS) Dated notes appended (original text unchanged) to #19, #199, #337, #338, #339, #340, #368, #369, #370, #377, #389, #395, #402, #403, #405 and #406 (the W3d report's section 7 pointers, the status of K2 and of the QA run). NOT DECIDED HERE: the behaviour when an origin variable is unset in production, and any further CORS origin; the error code of the 400; the term and innocent-word lists; the Figma side of the 'follow' promise; the post-decline state of the guardian confirm page (D-10, same fault as the footnote of #406 item 13, still not covered by the founder's wording); K2 candidates 1, 3, 4, 6, 7, 8 (register rows B-147 to B-150 are OPEN); the W3d open items on earlier verification links (B-160) and on a non-active account with a stale decline (B-161); counsel wording of every [COPY PENDING LEGAL REVIEW] string. [2026-10-19: Built since: items 1, 2 and 3 and the expired-consent email by backend/w3e (PR #429: B-140, B-141, B-142; the email half of B-158); items 4 and 5 and QA defects D-03 to D-05 and D-08 to D-17 by FC3a (PR #430; D-15 and D-17 in part); D-07, G-1 and G-2 by FC3b (PR #431); item 7 (the archive of 1460:8940) by Figma pass K3 (PR #428, B-144). The open point of item 1 (what the API does when an origin variable is unset in production) is decided by #408 item 1: it refuses to boot (B-163). Item 3 is amended by #408 item 3: the exact whole handles nazif, nazifa and nazifah are allowed (B-165) and the term lists W3e built stay open for review. The error code below_minimum_age and its message are W3e's choice and are still not confirmed. The QA harness's CORS proxy is gone (PR #429).]</w:t>
+              <w:t>Resolved -- recorded. FOUNDER-ADOPTED DEFAULTS, VETO-ABLE, all seven items. DECIDED, NOT BUILT, except item 6, which confirms what is already built (W3d, PR #424). Item numbers are the order of the founder's instruction. Original text of every entry named in the forward-pointers below is unchanged (dated notes appended). Source: the QA run of PR #426 (docs/qa-e2e-onboarding-report.md): 165 browser tests against the real API, 17 defects (D-01 to D-17) and 3 gaps (G-1 to G-3). (1) CORS (QA D-01, BLOCKER / SAFEGUARDING). apps/web/src/api/auth.ts registerUser sends credentials 'include' and services/api/src/main.ts calls app.enableCors() with no options (it answers '*'); browsers refuse that combination, so sign-up fails in every browser when web and API are on different origins, as in production, and no request reaches the API. Decided: registerUser stops sending credentials 'include'; the API restricts CORS to the origins in WEB_APP_BASE_URL and a new ADMIN_APP_BASE_URL, plus localhost origins in development. The new variable is added to render.yaml (both services), .env.example and the env-completeness check; the founder sets its production value in Render. The API sets no cookie and returns the refresh token in the response body, so the credentials option appears to have no function (to confirm in the build PR). Not decided: what the API does when a variable is unset in production, and origins other than the two apps. Build row B-140 (W1). (2) AGE-5 FLOOR (QA D-02, BLOCKER / SAFEGUARDING). #19 says signup is hard-blocked below age 5 regardless of guardian consent, but the floor exists only in the web Age Gate: POST /auth/register with a date of birth 4 years ago and a valid guardian block returns 201 and creates the account and the guardian request. Decided: the floor is enforced server-side with a 400; exactly age 5 stays accepted. Not decided: the error code and message; the build PR checks the DOB-correction tool (#390) cannot set a date of birth below the floor. Build row B-141 (W1). (3) USERNAME FILTER (QA D-06). Hate and sexual terms glued to other letters (xxhitlerxx, nazifan) are accepted because the filter's EXACT list matches only the whole handle or an underscore token. Decided: long, unambiguous terms are matched by CONTAINS, with a tested list of innocent words that must still be accepted; short or ambiguous terms stay exact. Not decided: the term lists and the length threshold (set in the build PR, for founder review). Build row B-142 (W4). (4) 'FOLLOW' PROMISES (QA D-13). The restricted-pending view says 'Browse and follow' and the guardian page lists 'Follow teams and check scores', but a restricted-pending minor's follow is refused with 403 (#370). Decided: both screens stop promising follow and the wording says what works, tagged [COPY PENDING LEGAL REVIEW] and added to the pending-copy manifest; the guardian-page change is guardian-visible, so CONSENT_SCREEN_VERSION and the tripwire hash (#348) are bumped under the rule of B-130. The Figma frames are not checked here for the same promise. Build row B-154 (W9). (5) GUARDIAN APPROVAL SCREEN (QA D-09). After approval the guardian is told 'The account is now active', but the minor still has to verify email and create a profile. Decided: the screen no longer says the account is active; it says the approval is recorded and registration continues ([COPY PENDING LEGAL REVIEW]), matching the Figma Approved screens (#403 item 3). Build row B-153 (W9). (6) STALE-DECLINE RE-SEND STAYS. A guardian who declined at decline 1 or 2 is still sent a new consent request by the platform when the row lapses after 14 days (#406 item 1, built as B-126), after the minor is warned. This settles judgment call 1 of docs/backend-w3d-report.md (section 5). The alternative, warning the minor and closing after a further window without re-sending, stays a one-place change (GuardianStaleDeclineSweepService); the cap of three declines bounds the re-sends. Counsel review of legal copy v0.8 Part 4.4 is still pending. Rows B-126, B-102. (7) LEGACY SAVED FRAME. The Figma frame 1460:8940 (own Saved, absolute layout) is archived, now that 6747:29445 replaces it (Figma pass K2, candidate 2): hidden and renamed 'ARCHIVED - ...', nothing deleted, after a page-wide reference scan, and added to docs/figma-archive-index.md. Build row B-144 (W0). (REGISTER) docs/build-register.md Section 25: B-140 to B-162 added (23 rows); every QA defect and gap, every open item of the W3d report (section 6) and every K2 candidate (1-10) is mapped to a row, reused (B-120, B-128, B-129, B-130, B-131, B-132, B-133, B-134, B-078, B-138) or new. D-01 and D-02 are marked BLOCKER / SAFEGUARDING. Status lines on 23 existing rows. 162 B-IDs; 146 gap frames unchanged. Arithmetic: Section 25g. (FORWARD-POINTERS) Dated notes appended (original text unchanged) to #19, #199, #337, #338, #339, #340, #368, #369, #370, #377, #389, #395, #402, #403, #405 and #406 (the W3d report's section 7 pointers, the status of K2 and of the QA run). NOT DECIDED HERE: the behaviour when an origin variable is unset in production, and any further CORS origin; the error code of the 400; the term and innocent-word lists; the Figma side of the 'follow' promise; the post-decline state of the guardian confirm page (D-10, same fault as the footnote of #406 item 13, still not covered by the founder's wording); K2 candidates 1, 3, 4, 6, 7, 8 (register rows B-147 to B-150 are OPEN); the W3d open items on earlier verification links (B-160) and on a non-active account with a stale decline (B-161); counsel wording of every [COPY PENDING LEGAL REVIEW] string. [2026-10-19: Built since: items 1, 2 and 3 and the expired-consent email by backend/w3e (PR #429: B-140, B-141, B-142; the email half of B-158); items 4 and 5 and QA defects D-03 to D-05 and D-08 to D-17 by FC3a (PR #430; D-15 and D-17 in part); D-07, G-1 and G-2 by FC3b (PR #431); item 7 (the archive of 1460:8940) by Figma pass K3 (PR #428, B-144). The open point of item 1 (what the API does when an origin variable is unset in production) is decided by #408 item 1: it refuses to boot (B-163). Item 3 is amended by #408 item 3: the exact whole handles nazif, nazifa and nazifah are allowed (B-165) and the term lists W3e built stay open for review. The error code below_minimum_age and its message are W3e's choice and are still not confirmed. The QA harness's CORS proxy is gone (PR #429).] [2026-10-20: #409 item 1 fixes the origins the CORS allow-list names: WEB_APP_BASE_URL is the https origin of the web static site and ADMIN_APP_BASE_URL that of the admin static site, each separate from the API's own origin (B-179). Both must be set to the final https origins in production (the API refuses to boot otherwise, B-163). Nothing is deployed before the launch gate B-090.]</w:t>
             </w:r>
           </w:p>
         </w:tc>
@@ -27342,6 +27342,48 @@
           <w:p>
             <w:r>
               <w:t>Resolved -- recorded. FOUNDER-ADOPTED DEFAULTS, VETO-ABLE, all eight items. DECIDED, NOT BUILT, except item 7, which confirms what is already built (PRs #428, #430, #431). Item numbers are the order of the founder's instruction. Original text of every entry named in the forward-pointers below is unchanged (dated notes appended). Sources: the open points of backend/w3e (PR #429), FC3a (PR #430), FC3b (PR #431) and Figma pass K3 (PR #428). (1) PRODUCTION BOOT CHECK (settles the open point of #407 item 1). W3e built CORS fail-closed with a boot log: an unset, non-URL, placeholder or (in production) unusable WEB_APP_BASE_URL or ADMIN_APP_BASE_URL contributes no origin and a [cors] line is logged, but the API still starts, so a bad production deploy comes up healthy and no browser can call it. Decided: in production the same condition refuses to boot, through assertProductionEnv (services/api/src/validate-runtime-env.ts), the way a missing or placeholder JWT_SECRET or ADMIN_JWT_SECRET already does (B-018). Outside production nothing changes (log only, localhost allowed). The build reuses the test cors-options.ts already applies and does not write a second one. Render sets NODE_ENV=production at runtime on both services, so staging is covered as well and each service needs both values before its next deploy (to confirm in the build PR). Not decided: origins other than the two apps (preview deployments, a mobile web view). Build row B-163 (W1). (2) CROSS-TAB REFRESH LOCK. The refresh token rotates and the server treats a second use of an old token as reuse; apps/web/src/lib/silentRefresh.ts is single-flight inside one tab only, so two open tabs that refresh together can log the person out. W3e found it when a test went intermittent and worked around it in that one test; it is not a test problem. Decided: a cross-tab lock so only one tab calls POST /auth/refresh at a time; the other tabs wait and then use the tokens the first tab stored. The alternative W3e named, a short server-side reuse grace, is not chosen and the server's reuse detection is unchanged. Not decided: the mechanism (Web Locks API, a storage-based lock or a BroadcastChannel); the build PR picks it and states its fallback. Build row B-164 (W9). (3) USERNAME FILTER (extends #407 item 3). Decided: the exact whole handles nazif, nazifa and nazifah are allowed (real given names; W3e refused them because they cannot be told from nazi + fan); nazifan and every other glued form stay refused. HOW: they are an exact allow-list of whole handles checked before the CONTAINS rule, not substring exceptions. Adding nazif to the named innocent exceptions of the nazi rule would cut it out of nazifan, leave 'an', and accept it. Handles that only contain a name (nazif_10, nazifa2, xxnazifxx) are not covered by this decision; under the adopted reading they stay refused; whether suffixes should be accepted is not decided. RECORDED AS BUILT AND LEFT OPEN FOR THE FOUNDER'S REVIEW, verbatim from docs/backend-w3e-report.md (D-06): CONTAINS, 5+ letters and unambiguous: hitler, pussy, paedo, swastika, whitepower, gangbang, deepthroat, creampie, orgasm, masturbat, erotic. nazi is four letters and sits in real names, so it is CONTAINS with named innocent exceptions (nazir, nazim, nazia, nazih, nazik): those are cut out, the rest is searched; nazifan, xxnazixx and nazirnazi are refused, nazir_10 is accepted. Short or ambiguous terms stay exact: dick, cock, rape, ass, sex, sexy, anal, cum, pedo, isis, kkk, twat, wank, ... (the report's list ends with '...'; the full exact list is PROFANITY_EXACT in services/api/src/modules/users/username-rules.constants.ts: dick, cock, anal, anus, sex, sexy, rape, nazi, kkk, isis, pedo, tits, boobs, ass, arse, twat, wank, cum, nude, nudes). Tested: 18 glued or leet refusals, guarded-term cases, short-term-exact cases and a 37-handle innocent list (Essex, Sussex, Hancock, Hitchcock, Peacock, Dickson, Nazir, Torpedo, ...). Known false positives unchanged and deliberately not in the list: scunthorpe, penistone, therapist. The 5-letter threshold, every list above and the innocent list are W3e's adopted defaults; none is decided here. The older CONTAINS terms from B-032 (fuck, shit, ... terrorist) are outside this review. Build row B-165 (W4). (4) SEMANTIC/ALERT IN CODE. Decision Log #99 authorised semantic/alert (#FA0606, Light = Dark) in Figma only, as a deliberate exception to non-negotiable #3 (loss, destructive or alert colour only). Decided: the token is authorised in apps/web and apps/admin for error callouts. Adopted reading, veto-able: the colour is the non-text accent (bar, border, icon) of an error callout, not text colour and not a button fill, because the Settings rebuild (PR #116) measured white on semantic/alert at 4.12:1, below AA; error text stays navy. Not covered and left as they are: the Grassroots LIVE indicator and the notification unread dot (brand green), destructive buttons (navy). CLAUDE.md non-negotiable #3 is not rewritten; #99 and this entry are the recorded exception for code. Build row B-166 (W9). (5) REVOKE USERNAME HOLD LINE (admin-facing only). The three Revoke username frames (dialog 6647:25789, success 6649:24462, error 6649:24714) say only what is removed. Decided: the frames and the dialog gain a line saying the username is held for 30 days (the backend already holds a revoked handle for 30 days for everyone, #402 item 3, and the response carries heldUntil). Admin-facing only: the email to the revoked user and every user-facing screen are unchanged. Adopted reading, veto-able: the line goes in the dialog and the success frame; the error frame gets none because it says nothing was changed. Not decided: the exact wording (set in the Figma pass), whether the success frame shows the date from heldUntil, and whether the line takes [COPY PENDING LEGAL REVIEW] (the existing dialog body already does). Build rows B-167 (Figma, W0), B-168 (apps/admin, W9). (6) POST-DECLINE CLAUSE TAGGED. The guardian page's declined state says 'You have declined permission for this account, so it stays switched off.' That clause is not founder wording, was not tagged by FC3a, and #406 does not cover the state. Decided: it is tagged [COPY PENDING LEGAL REVIEW] and gets a docs/pending-copy-manifest.md row. Consequence for the build, not a decision: the tag is part of the guardian-visible text the tripwire hashes, so CONSENT_SCREEN_VERSION and CONSENT_SCREEN_TEXT_HASH must be bumped in the same PR (#348); the manifest row is added with the tag, never before it (the inventory test fails on a row with no matching string), so this docs pass does NOT add it. Build row B-169 (W9). (7) KEPT AS BUILT (confirms what exists; no build row): (a) the link on the Users list that opens the incorrect-details reports screen (FC3b added it outside the frames; the frames left the entry point SCOPE OPEN); (b) the one-row 'Copy Profile Link' menu on the own Saved frame 6747:29445 (K3 open point 1); (c) the hidden K2 column 6747:29556 inside 6747:29445 stays until the launch gate, then is deleted with the other hidden ARCHIVED originals (B-090); (d) the revocation history (usernameRevocations in the user summary) stays not shown. (8) Mobile header: signed in, the mobile header follows the Figma header (logo, search field, avatar that opens the Navigation Drawer) and the nine-icon row is removed (FC3a left it in; QA B-132 note updated). Logged out, Figma draws no navigation; K4 draws a logged-out mobile navigation (a menu control opening a drawer with the public sections plus Login and Sign up) and FC4 builds it. Until FC4 merges, logged-out visitors keep the scrolling icon row. Build row B-178 (W9; FC4 depends on both this PR and K4). (K3 FINDING, recorded, not a decision) Figma pass K3 rebuilt the own Saved desktop frame 6747:29445 after finding that K2's version was a single-column simplification of the legacy frame 1460:8940, because K2 checked counts and bounds only. The K2 replacement frames 6747:28894 (other user, Posts), 6747:29094 (own, Posts) and 6747:29291 (own, Media) were not diffed against their legacy twins and very likely carry the same simplifications; their twins 1455:4362 and 1455:6626 were archived on K2's say-so. The K2 claim that B-138 closes on the design side therefore does not hold for those three frames. The fix is a diff-first pass, K4, that does what K3 did and leaves the legacy frames archived (nothing deleted). Build row B-170 (W0). (REGISTER) docs/build-register.md Sections 27 and 28: B-163 to B-178 added (16 rows); items 1 to 6, item 8 and the K3 finding each have a row; the W3d items not built map to B-160 and B-161 (already rows, reused, no duplicate), B-171 and B-172 (new, OPEN); the apps/admin developer notes are B-173; the mobile verify-prompt and Club Picker comparisons are B-174 and B-175; the guardian confirm layout is B-176; B-177 (the guardian frames that still say 'follow') is added beyond the founder's list because FC3a records it as open and no row owned it. Status lines on 26 existing rows (B-132 gets a note under item 8). 178 B-IDs; 146 gap frames unchanged. Arithmetic: Sections 27e and 28b. (FORWARD-POINTERS) Dated notes appended (original text unchanged) to #19, #99, #348, #369, #377, #389, #390, #395, #396, #398, #402, #403, #406 and #407 (what W3e, FC3a, FC3b and K3 built or found). NOT DECIDED HERE: the wording and the list of public sections of the logged-out mobile drawer (item 8); origins other than the two apps; the lock mechanism; whether handles that merely contain nazif, nazifa or nazifah are accepted; every term list, the 5-letter threshold and the innocent list; any use of semantic/alert beyond error callouts and its use as text colour; the wording of the hold line, its date and its tag; the final wording of the post-decline clause (counsel); which legacy twin belongs to which K2 frame; the error code below_minimum_age and its message (W3e's choice, still not confirmed since #407); the open W3d items B-160, B-161, B-171 and B-172; whether the Figma frames carry the same fixes (B-177); counsel wording of every [COPY PENDING LEGAL REVIEW] string.</w:t>
+            </w:r>
+          </w:p>
+        </w:tc>
+      </w:tr>
+      <w:tr>
+        <w:tc>
+          <w:tcPr>
+            <w:tcW w:type="dxa" w:w="500"/>
+          </w:tcPr>
+          <w:p>
+            <w:r>
+              <w:t>409</w:t>
+            </w:r>
+          </w:p>
+        </w:tc>
+        <w:tc>
+          <w:tcPr>
+            <w:tcW w:type="dxa" w:w="4700"/>
+          </w:tcPr>
+          <w:p>
+            <w:r>
+              <w:t>Founder decisions 2026-10-20 on the hosting shape of the frontends and on the launch-gate runbook (3 items): apps/web and apps/admin are deployed as separate Render static sites, apart from each other and from the API, three services per environment, each on its own https origin; Render and production wiring stay deferred to the launch gate B-090 (restated); and when the launch gate starts one deliverable is produced, a complete plain-language deployment and migration runbook for a non-technical founder (planned docs/launch-gate-runbook.md).</w:t>
+            </w:r>
+          </w:p>
+        </w:tc>
+        <w:tc>
+          <w:tcPr>
+            <w:tcW w:type="dxa" w:w="1850"/>
+          </w:tcPr>
+          <w:p>
+            <w:r>
+              <w:t>docs/decisions-hosting-shape-launch-runbook (docs only, 2026-10-20; founder decisions 2026-10-20, items 1-3 and the register instructions; docs/build-register.md Section 29, CLAUDE.md; sources render.yaml, docs/deployment.md, package.json build:release, scripts/check-pending-copy-dist.mjs, apps/web/.env.example, apps/admin/.env.example)</w:t>
+            </w:r>
+          </w:p>
+        </w:tc>
+        <w:tc>
+          <w:tcPr>
+            <w:tcW w:type="dxa" w:w="2300"/>
+          </w:tcPr>
+          <w:p>
+            <w:r>
+              <w:t>Resolved -- recorded. FOUNDER-ADOPTED DEFAULTS, VETO-ABLE, all three items. DECIDED, NOT BUILT, and DEFERRED to the launch gate B-090. Item numbers are the order of the founder's instruction. Original text of every entry named in the forward-pointers below is unchanged (dated notes appended). render.yaml and docs/deployment.md are NOT changed by the PR that records this entry. (1) HOSTING SHAPE ON RENDER. apps/web and apps/admin are deployed separately from each other and from the API, as three Render services per environment: the API (the web service defined in render.yaml), the web app (a static site) and the admin app (a static site), each on its own https origin (for example the main domain or www for web, an admin subdomain for admin, an api subdomain for the API; the final names are not decided). Reasons recorded by the founder: the admin bundle is never served to the public; admin can later be restricted (for example by IP; not designed); and it matches the separate CORS origins (WEB_APP_BASE_URL, ADMIN_APP_BASE_URL, #407) and the separate admin auth domain (ADMIN_JWT_SECRET). Each static site needs VITE_API_BASE_URL set to the API's https address at BUILD time (baked into the build; a change means a rebuild), a rewrite rule sending every path to index.html (single-page apps), and the web build must use npm run build:release so the pending-copy release check runs. The API's WEB_APP_BASE_URL and ADMIN_APP_BASE_URL must be set to the final https origins (in production the API refuses to boot on an unset or invalid one, #408 item 1, B-163). Staging gets the same three services. Checked in the repo on 2026-10-20: render.yaml defines only the two API services (soccernity-api-staging, soccernity-api); the static sites are NOT defined in render.yaml, docs/deployment.md or any workflow; apps/web and apps/admin both read VITE_API_BASE_URL; build:release is a ROOT script that builds both apps and then runs check:pending-copy over apps/web/dist and apps/admin/dist, and that check fails today by design until counsel clears the tagged strings (B-124), so how the two sites' build commands use it is for the build row (B-179) to choose and state. (2) THIS STAYS DEFERRED to the launch gate (B-090). The founder is saving money; Render and production wiring are not pushed before then (restates #403 item 18 and extends it to the two static sites). (3) LAUNCH-GATE RUNBOOK. When the launch gate starts, one deliverable is produced: a complete, plain-language, step-by-step deployment and migration guide for a non-technical founder covering every part of the platform, so nothing needs back-and-forth. Planned file docs/launch-gate-runbook.md (the format may change to a Docs artifact; decided then). It is written at the launch gate from the repo and the vendors' current documentation as they are then, never from memory, and it supersedes and links docs/deployment.md. Its required scope, recorded now so nothing is lost: a glossary of every term; what the founder does versus what an agent does versus what needs counsel; the order of operations; for each part the exact click-by-click steps, which value goes in which setting, how to check it worked and what to do if it did not: Neon production and staging databases and branches, running the migrations (including the free-plan pre-deploy limitation) and the DOB backfill; Upstash Redis; generating and storing every secret (JWT_SECRET, ADMIN_JWT_SECRET, DOB_ENCRYPTION_KEY - one key protects both the date of birth and the 2FA secrets, #405 item 8 - per environment, with the loss-and-rollback implications from docs/dob-encryption-rollback.md); the API service on Render and its health check; the web and admin static sites (build command, publish directory, VITE_API_BASE_URL, rewrite rule, the build:release gate); custom domains, DNS and https for all three; CORS origins; Postmark (account, sender domain, SPF/DKIM/DMARC, the email templates and the counsel-pending wording); MaxMind GeoLite2 (account id, licence key, what happens without it); Stripe (live keys, webhook, the card-verification flow); Cloudflare R2 media storage (bucket, keys, the public base URL gap); the Highlightly sports data key and daily budget; Sentry; creating the first superadmin and admin accounts; branch and release strategy (staging versus main); the pending-copy release check and counsel sign-off; legal pages, DPIA and safeguarding sign-off items still open at that time; backups, monitoring and alerting; a post-deploy smoke test (the QA suite against staging, then production); rollback for each part; ongoing monthly costs; and a final go/no-go checklist. It must list every launch-gate item still open in docs/build-register.md at that time so none is dropped. (REGISTER) New rows B-179 (render.yaml and docs/deployment.md gain the two static sites for staging and production with the settings of item 1; owner backend-api; launch gate; DEFERRED; depends on B-090) and B-180 (the launch-gate runbook with the scope of item 3; owner docs agent; launch gate; DEFERRED; depends on B-179 and on every open launch-gate row); status lines on B-090 (asked for) and B-088 (added: B-088 is the generic hosting row, B-179 its repo-side definition; B-088 stays open for the account and domain side). Dated notes appended to #26 (hosting), #403 (the row that records the production-wiring deferral, item 18) and #407 (CORS origins). STILL OPEN: the final domain and subdomain names; the Render plan and monthly cost of two static sites per environment; how the two sites' build commands use build:release and how a failing release check stops a Render deploy (to be confirmed from Render's current documentation at the gate); whether and how admin is later restricted; the runbook's format; whether 'docs agent' (not among the eight agents in .claude/agents/) means the session that writes it.</w:t>
             </w:r>
           </w:p>
         </w:tc>

</xml_diff>

<commit_message>
docs: Decision Log #410 and build register B-181 to B-192 (founder decisions 2026-10-20, second set)
Records the founder's second set of 2026-10-20 decisions on the open points of W3f (#434), K4 (#433)
and FC4 (#435): Revoke username hold wording approved as built; Nazif allow-list v2; same-tab refresh
race as a known limitation; Logged Out Figma variants; mobile profile sample values; guardian footnote
sentences in code; kept-as-built items; Restricted Pending correction of record (K5).

Register: 12 new rows, status lines on 14 existing rows, Sections 1, 3, 7 updated, Section 30 added
with the K4 OPEN 1-9 mapping and the arithmetic. Decision Log: row #410 and dated notes on 15 rows.
CLAUDE.md: one bullet for this pass plus backfilled bullets for W3f, K4 and FC4. Docs only.

Co-Authored-By: Claude Sonnet 5.5 <noreply@anthropic.com>
</commit_message>
<xml_diff>
--- a/docs/Soccernity_MVP_Build_Plan_v1.7.docx
+++ b/docs/Soccernity_MVP_Build_Plan_v1.7.docx
@@ -10756,7 +10756,7 @@
           </w:tcPr>
           <w:p>
             <w:r>
-              <w:t>Resolved (platform chosen, config prepared) — open action: real Neon/Upstash/Render accounts still needed before any live deploy [2026-10-20: #409 records the hosting shape for the two frontends: apps/web and apps/admin are separate Render static sites, three services per environment (the API, the web app, the admin app), each on its own https origin. render.yaml defines only the API services today (B-179). Live deployment stays deferred to the launch gate B-090; a plain-language runbook is produced at that gate (B-180, docs/launch-gate-runbook.md) and supersedes docs/deployment.md.]</w:t>
+              <w:t>Resolved (platform chosen, config prepared) — open action: real Neon/Upstash/Render accounts still needed before any live deploy [2026-10-20: #409 records the hosting shape for the two frontends: apps/web and apps/admin are separate Render static sites, three services per environment (the API, the web app, the admin app), each on its own https origin. render.yaml defines only the API services today (B-179). Live deployment stays deferred to the launch gate B-090; a plain-language runbook is produced at that gate (B-180, docs/launch-gate-runbook.md) and supersedes docs/deployment.md.] [2026-10-20: the #409 note above merged in PR #436 (A7). Nothing is built: hosting stays deferred to the launch gate B-090.]</w:t>
             </w:r>
           </w:p>
         </w:tc>
@@ -13261,7 +13261,7 @@
           </w:tcPr>
           <w:p>
             <w:r>
-              <w:t>Resolved (design). Built 5647:8023 (logged out) and 5647:8169 (logged in). Judgment calls: (a) mobile uses real header 7 — mobile / header 4 — mobile Navbar instances, not the desktop's bespoke legacy top bar (left untouched); (b) desktop 432px left sidebar reflowed to search field + scrollable league chip row + 'Browse all leagues &amp; countries' row; (c) club crests rendered as typographic initial discs, not licensed crest artwork (PR #97 precedent). Blocked: fixture list + Most Recent Stories have no data source (Decision Log #6; no Section 4 endpoint) — figma-to-code must not wire either.</w:t>
+              <w:t>Resolved (design). Built 5647:8023 (logged out) and 5647:8169 (logged in). Judgment calls: (a) mobile uses real header 7 — mobile / header 4 — mobile Navbar instances, not the desktop's bespoke legacy top bar (left untouched); (b) desktop 432px left sidebar reflowed to search field + scrollable league chip row + 'Browse all leagues &amp; countries' row; (c) club crests rendered as typographic initial discs, not licensed crest artwork (PR #97 precedent). Blocked: fixture list + Most Recent Stories have no data source (Decision Log #6; no Section 4 endpoint) — figma-to-code must not wire either. [2026-10-20: Figma pass K4 (PR #433) confirmed the crest question is still open: typographic marks stay in the profile and Fixtures frames. #410 records it as an open row with no decision (B-189).]</w:t>
             </w:r>
           </w:p>
         </w:tc>
@@ -13777,7 +13777,7 @@
           </w:tcPr>
           <w:p>
             <w:r>
-              <w:t>Resolved (flag only — not touched this pass, per the task’s instruction to flag rather than change unrelated content). Found in: Sports Hub H2H (756:11) &amp; Standing (756:6433) win/loss form indicators (Rectangle 99, ~36 nodes); Admin Categories (128:488), Categories - Add Category (138:93), Users - team members (917:218) table-cell blocks (Rectangle 43, ~3); Mobile Drop Down Components (1870:2753) &amp; Messages mobile window 3 "Block User" labels (~4). All predate this task. Needs its own sweep + a decision on introducing a negative/destructive semantic token vs. deriving from the two-colour palette.  [RESOLVED by sprint-2/avatar-notification-dropdown-wiring]: founder authorised a semantic/alert COLOR token (VariableID:5670:8226, #FA0606, same value Light and Dark) as a deliberate exception to non-negotiable #3 — red retained ONLY as a semantic loss/destructive/alert colour. All loose #fa0606 paints (110) rebound to it: Sports Hub H2H/Standing loss dots (Rectangle 99 ×29 + Rectangle 101 ×1), Admin table-cell blocks (Rectangle 43 ×3), Block User labels ×4 + block icons ×3, and 70 ant-design:delete-outlined trash-icon vectors found in the same audit. Excluded: 1 — the #fa0606 fill inside the YouTube-logo vector (761:13), an external brand mark. See #99.</w:t>
+              <w:t>Resolved (flag only — not touched this pass, per the task’s instruction to flag rather than change unrelated content). Found in: Sports Hub H2H (756:11) &amp; Standing (756:6433) win/loss form indicators (Rectangle 99, ~36 nodes); Admin Categories (128:488), Categories - Add Category (138:93), Users - team members (917:218) table-cell blocks (Rectangle 43, ~3); Mobile Drop Down Components (1870:2753) &amp; Messages mobile window 3 "Block User" labels (~4). All predate this task. Needs its own sweep + a decision on introducing a negative/destructive semantic token vs. deriving from the two-colour palette.  [RESOLVED by sprint-2/avatar-notification-dropdown-wiring]: founder authorised a semantic/alert COLOR token (VariableID:5670:8226, #FA0606, same value Light and Dark) as a deliberate exception to non-negotiable #3 — red retained ONLY as a semantic loss/destructive/alert colour. All loose #fa0606 paints (110) rebound to it: Sports Hub H2H/Standing loss dots (Rectangle 99 ×29 + Rectangle 101 ×1), Admin table-cell blocks (Rectangle 43 ×3), Block User labels ×4 + block icons ×3, and 70 ant-design:delete-outlined trash-icon vectors found in the same audit. Excluded: 1 — the #fa0606 fill inside the YouTube-logo vector (761:13), an external brand mark. See #99. [2026-10-20: Figma pass K4 (PR #433) left the Fixtures crest rows as they were; whether licensed crests may ever be shown is open (B-189, #410).]</w:t>
             </w:r>
           </w:p>
         </w:tc>
@@ -13864,7 +13864,7 @@
           </w:tcPr>
           <w:p>
             <w:r>
-              <w:t>Resolved. Token: semantic/alert (VariableID:5670:8226) in the Soccernity Theme collection (VariableCollectionId:5096:2). Value #FA0606 kept as-is (it is already the value in ~110 places — a pure hex→token rebind, zero visual change) in BOTH Light and Dark modes: every use is a small non-text indicator, and a distinct dark red would risk reading as a different state; revisit the Dark value only if a future contrast pass finds a specific text use failing, and disclose it then. This is a deliberate, founder-authorised exception to the two-colour palette rule — red is permitted ONLY as a semantic loss / destructive / alert colour, now a single auditable bound token rather than loose hex. Bound at 2819:4084 (avatar unread dot) and across the 110 paints listed in #97. [2026-10-19: #408 item 4 authorises semantic/alert in apps/web and apps/admin for error callouts (the accent bar, border and icon, not text or button fills); the exception recorded here for Figma now also covers that use in code (B-166). The LIVE indicator and the unread dot are not covered.]</w:t>
+              <w:t>Resolved. Token: semantic/alert (VariableID:5670:8226) in the Soccernity Theme collection (VariableCollectionId:5096:2). Value #FA0606 kept as-is (it is already the value in ~110 places — a pure hex→token rebind, zero visual change) in BOTH Light and Dark modes: every use is a small non-text indicator, and a distinct dark red would risk reading as a different state; revisit the Dark value only if a future contrast pass finds a specific text use failing, and disclose it then. This is a deliberate, founder-authorised exception to the two-colour palette rule — red is permitted ONLY as a semantic loss / destructive / alert colour, now a single auditable bound token rather than loose hex. Bound at 2819:4084 (avatar unread dot) and across the 110 paints listed in #97. [2026-10-19: #408 item 4 authorises semantic/alert in apps/web and apps/admin for error callouts (the accent bar, border and icon, not text or button fills); the exception recorded here for Figma now also covers that use in code (B-166). The LIVE indicator and the unread dot are not covered.] [2026-10-20: FC4 (PR #435) added semanticAlert #FA0606 to packages/shared and both apps' theme and uses it for the accent bar, border and icon of the error callouts on the admin users screens (B-166). Error text and buttons stay navy. #410 item 7 keeps the other admin error callouts (articles, contest, media, moderation) navy where the frames draw no red.]</w:t>
             </w:r>
           </w:p>
         </w:tc>
@@ -21902,7 +21902,7 @@
           </w:tcPr>
           <w:p>
             <w:r>
-              <w:t>Resolved. Figma design only, no app/backend code. Verified directly before any edit — Frame 5858 (the icon row) is genuine HORIZONTAL auto-layout (HUG x HUG, itemSpacing 30) on both live variants, header 4 (2838:3502) and header 7 (2841:4104), confirming rather than assuming the DL #272 Grassroots precedent transfers; also confirmed the two variants are protected from overflow by two DIFFERENT mechanisms, not the same one — header 4's root uses primaryAxisAlignItems SPACE_BETWEEN against a fixed 1440 width, so the AUTO-positioned avatar cluster (Frame 5880) stays pinned to the right as the icon row's gap shrinks; header 7's Login button (Frame 5805) is layoutPositioning ABSOLUTE, fully decoupled from the row's flow. Built two new tinted-style icons (31x31 brand/green-tint @12% tile + 24x24 brand/navy-stroke glyph, matching Clubs (DL #159) and Grassroots (DL #272) exactly, not the five baked-in-artwork icons) — Scouting: binoculars; Academy: graduation cap with tassel. Constructed via figma.createNodeFromSvg (the DL #159 Apple-mark precedent), then every descendant vector/ellipse re-bound to VariableID:5096:4 (brand/navy) for strokes and VariableID:5096:5 (brand/green-tint) for the tile fill — never left as literal, unbound colour, per the standing createVector/createNodeFromSvg unbound-stroke gotcha. Appended last, after Grassroots, on both Frame 5858 instances (2838:3517 on header 4, 2841:4115 on header 7) — order now: Sports Hub . Blog . Community . Leaderboard . Bants . Clubs . Grassroots . Scouting . Academy. Row grew 444.41 -&gt; 566.41px on both variants (two tiles x (31 + 30 spacing) = 122px, exactly as predicted before building). Clearance re-measured after growth, not assumed: header 4 clearance to the avatar cluster 309.3px -&gt; 187.3px; header 7 clearance to the Login button ~290px -&gt; 168.0px — both confirmed clean via full-navbar screenshots (no overlap, no clipping). Propagation verified across all 8 live header 7 instances and a diverse 7-frame sample of the 95 live header 4 instances (Settings, Create Post, Leaderboard, Contest, Grassroots, Sports Page, Homepage, Blog, Article Detail, the 3 Legal pages) — all show the two new icons in the correct order with an identical 566.41px row width; the one instance that did not (inside the already-archived, hidden 'ARCHIVED — Blog Page Desktop (superseded by ...)' frame) is pre-existing, out-of-scope archived content, confirmed hidden and unrelated to this edit, not a propagation gap. Zero stray top-level nodes left on the page after construction (group-then-appendChild fully reparents, confirmed). Both icons route to a Coming Soon destination once figma-screen-builder designs that screen in its own separate, parallel task — this PR adds icons only, does not touch the mobile Navigation Drawer or the account dropdown (Scouting/Academy are navbar-only, unlike Community Groups, DL #282), and does not touch Discover- or Careers-pillar schema/backend, per non-negotiable #4 and DL #3. Standing policy confirmed in writing: the 9-icon Web app Navbar COMPONENT_SET is now fully populated and closed to further additions by default — Scouting and Academy were its last two reserved slots (per the standing nav policy DL #282 first recorded); any future pillar or account-adjacent feature defaults to the account dropdown/drawer (the Community Groups precedent, DL #282), not the navbar. CODE HALF DONE -- see #286: sprint-3/coming-soon-scouting-academy-to-code mirrors this icon placement into apps/web/src/layout/navigation.ts (primaryNavItems), routing both icons to a shared ComingSoonPage.</w:t>
+              <w:t>Resolved. Figma design only, no app/backend code. Verified directly before any edit — Frame 5858 (the icon row) is genuine HORIZONTAL auto-layout (HUG x HUG, itemSpacing 30) on both live variants, header 4 (2838:3502) and header 7 (2841:4104), confirming rather than assuming the DL #272 Grassroots precedent transfers; also confirmed the two variants are protected from overflow by two DIFFERENT mechanisms, not the same one — header 4's root uses primaryAxisAlignItems SPACE_BETWEEN against a fixed 1440 width, so the AUTO-positioned avatar cluster (Frame 5880) stays pinned to the right as the icon row's gap shrinks; header 7's Login button (Frame 5805) is layoutPositioning ABSOLUTE, fully decoupled from the row's flow. Built two new tinted-style icons (31x31 brand/green-tint @12% tile + 24x24 brand/navy-stroke glyph, matching Clubs (DL #159) and Grassroots (DL #272) exactly, not the five baked-in-artwork icons) — Scouting: binoculars; Academy: graduation cap with tassel. Constructed via figma.createNodeFromSvg (the DL #159 Apple-mark precedent), then every descendant vector/ellipse re-bound to VariableID:5096:4 (brand/navy) for strokes and VariableID:5096:5 (brand/green-tint) for the tile fill — never left as literal, unbound colour, per the standing createVector/createNodeFromSvg unbound-stroke gotcha. Appended last, after Grassroots, on both Frame 5858 instances (2838:3517 on header 4, 2841:4115 on header 7) — order now: Sports Hub . Blog . Community . Leaderboard . Bants . Clubs . Grassroots . Scouting . Academy. Row grew 444.41 -&gt; 566.41px on both variants (two tiles x (31 + 30 spacing) = 122px, exactly as predicted before building). Clearance re-measured after growth, not assumed: header 4 clearance to the avatar cluster 309.3px -&gt; 187.3px; header 7 clearance to the Login button ~290px -&gt; 168.0px — both confirmed clean via full-navbar screenshots (no overlap, no clipping). Propagation verified across all 8 live header 7 instances and a diverse 7-frame sample of the 95 live header 4 instances (Settings, Create Post, Leaderboard, Contest, Grassroots, Sports Page, Homepage, Blog, Article Detail, the 3 Legal pages) — all show the two new icons in the correct order with an identical 566.41px row width; the one instance that did not (inside the already-archived, hidden 'ARCHIVED — Blog Page Desktop (superseded by ...)' frame) is pre-existing, out-of-scope archived content, confirmed hidden and unrelated to this edit, not a propagation gap. Zero stray top-level nodes left on the page after construction (group-then-appendChild fully reparents, confirmed). Both icons route to a Coming Soon destination once figma-screen-builder designs that screen in its own separate, parallel task — this PR adds icons only, does not touch the mobile Navigation Drawer or the account dropdown (Scouting/Academy are navbar-only, unlike Community Groups, DL #282), and does not touch Discover- or Careers-pillar schema/backend, per non-negotiable #4 and DL #3. Standing policy confirmed in writing: the 9-icon Web app Navbar COMPONENT_SET is now fully populated and closed to further additions by default — Scouting and Academy were its last two reserved slots (per the standing nav policy DL #282 first recorded); any future pillar or account-adjacent feature defaults to the account dropdown/drawer (the Community Groups precedent, DL #282), not the navbar. CODE HALF DONE -- see #286: sprint-3/coming-soon-scouting-academy-to-code mirrors this icon placement into apps/web/src/layout/navigation.ts (primaryNavItems), routing both icons to a shared ComingSoonPage. [2026-10-20: #410 item 4 amends the navbar-only placement for the LOGGED-OUT mobile drawer only: it lists Scouting and Academy (built by FC4, PR #435, to the K4 frames; B-183 adds the Figma component variants). The signed-in drawer, the account dropdown and the desktop navbar are unchanged.]</w:t>
             </w:r>
           </w:p>
         </w:tc>
@@ -21986,7 +21986,7 @@
           </w:tcPr>
           <w:p>
             <w:r>
-              <w:t>Resolved (built). apps/web only, no Figma/backend code touched. Read both Decision Log #284/#285 entries and the fileKey/node IDs before writing any code, per this project's standing discipline. Exported the real Scouting/Academy glyph SVGs directly from the shared Web app Navbar COMPONENT_SET (nodes 6472:18581 / 6472:18589) as nav-scouting.svg / nav-academy.svg -- matching nav-clubs.svg / nav-grassroots.svg's exact convention, never hand-drawn. navigation.ts's primaryNavItems gained two real entries (available by default, not `available: false`), Scouting -&gt; /scouting and Academy -&gt; /academy, tinted, appended after Grassroots -- the exact order Decision Log #284 landed in Figma. Confirmed the standing nav policy: NOT added to the mobile Navigation Drawer or the account dropdown -- navbar only, matching how Scouting/Academy were deliberately excluded from those two surfaces in #284/#282's own reasoning (unlike Community Groups). One new reusable ComingSoonPage component (apps/web/src/pages/ComingSoonPage.tsx), converted from Decision Log #285's four Figma frames (6477:20050/20402/20677/20764) -- icon disc, COMING SOON badge, feature-name heading, the fixed generic sub-line verbatim from the frame's own text node, and a 'Back to Soccernity' CTA -- with a `featureName` prop as its only variable content, exactly per the brief: ONE component, not two duplicated page files. The icon disc SVG (coming-soon-icon.svg) was exported from the Figma node (6477:20165), not hand-drawn. Two routes in router.tsx, /scouting and /academy, both render &lt;ComingSoonPage featureName=.../&gt; -- configured differently, same component. Both nested under FooterLayout, not a direct AppShell child: the Coming Soon Figma frames carry the canonical site footer (Decision Log #209/#210/#213), the same reason Home/Sports Hub/Blog/Article Detail sit there -- FooterLayout.tsx's own route-list comment and router.test.tsx's FooterLayout-membership test were both updated to include them. No login gate on either route -- like Blog/Sports Hub, the Figma content is identical regardless of auth state, and the shared Header already renders the correct logged-in/out chrome; a Coming Soon page has nothing that depends on the caller's identity. Header.test.tsx updated for the new 9-icon canonical order (was 7) and gained dedicated cases: Scouting/Academy are the last two items, both tinted, pointing at /scouting and /academy; neither appears in drawerNavItems or accountMenuItems. Verified, all re-run in this session, none estimated: apps/web vitest -- 37 files / 255 tests, 0 failures (up from 36/253 -- new ComingSoonPage.test.tsx, 4 cases; router.test.tsx +3; Header.test.tsx net +2, no existing test removed); `npx tsc --noEmit` clean; `npm run lint` clean; `npm run build` clean production bundle. Dev-server smoke test: /, /scouting, /academy, /sports-hub, /community, /clubs all real HTTP 200, clean log; the built page for /scouting was also fetched directly and confirmed to render the real app shell (&lt;title&gt;Soccernity&lt;/title&gt;). No real browser/Playwright check available in this environment -- same verification ceiling as every prior apps/web figma-to-code PR.</w:t>
+              <w:t>Resolved (built). apps/web only, no Figma/backend code touched. Read both Decision Log #284/#285 entries and the fileKey/node IDs before writing any code, per this project's standing discipline. Exported the real Scouting/Academy glyph SVGs directly from the shared Web app Navbar COMPONENT_SET (nodes 6472:18581 / 6472:18589) as nav-scouting.svg / nav-academy.svg -- matching nav-clubs.svg / nav-grassroots.svg's exact convention, never hand-drawn. navigation.ts's primaryNavItems gained two real entries (available by default, not `available: false`), Scouting -&gt; /scouting and Academy -&gt; /academy, tinted, appended after Grassroots -- the exact order Decision Log #284 landed in Figma. Confirmed the standing nav policy: NOT added to the mobile Navigation Drawer or the account dropdown -- navbar only, matching how Scouting/Academy were deliberately excluded from those two surfaces in #284/#282's own reasoning (unlike Community Groups). One new reusable ComingSoonPage component (apps/web/src/pages/ComingSoonPage.tsx), converted from Decision Log #285's four Figma frames (6477:20050/20402/20677/20764) -- icon disc, COMING SOON badge, feature-name heading, the fixed generic sub-line verbatim from the frame's own text node, and a 'Back to Soccernity' CTA -- with a `featureName` prop as its only variable content, exactly per the brief: ONE component, not two duplicated page files. The icon disc SVG (coming-soon-icon.svg) was exported from the Figma node (6477:20165), not hand-drawn. Two routes in router.tsx, /scouting and /academy, both render &lt;ComingSoonPage featureName=.../&gt; -- configured differently, same component. Both nested under FooterLayout, not a direct AppShell child: the Coming Soon Figma frames carry the canonical site footer (Decision Log #209/#210/#213), the same reason Home/Sports Hub/Blog/Article Detail sit there -- FooterLayout.tsx's own route-list comment and router.test.tsx's FooterLayout-membership test were both updated to include them. No login gate on either route -- like Blog/Sports Hub, the Figma content is identical regardless of auth state, and the shared Header already renders the correct logged-in/out chrome; a Coming Soon page has nothing that depends on the caller's identity. Header.test.tsx updated for the new 9-icon canonical order (was 7) and gained dedicated cases: Scouting/Academy are the last two items, both tinted, pointing at /scouting and /academy; neither appears in drawerNavItems or accountMenuItems. Verified, all re-run in this session, none estimated: apps/web vitest -- 37 files / 255 tests, 0 failures (up from 36/253 -- new ComingSoonPage.test.tsx, 4 cases; router.test.tsx +3; Header.test.tsx net +2, no existing test removed); `npx tsc --noEmit` clean; `npm run lint` clean; `npm run build` clean production bundle. Dev-server smoke test: /, /scouting, /academy, /sports-hub, /community, /clubs all real HTTP 200, clean log; the built page for /scouting was also fetched directly and confirmed to render the real app shell (&lt;title&gt;Soccernity&lt;/title&gt;). No real browser/Playwright check available in this environment -- same verification ceiling as every prior apps/web figma-to-code PR. [2026-10-20: #410 item 4: the logged-out mobile drawer now lists Scouting and Academy (FC4, PR #435); the signed-in drawer still does not.]</w:t>
             </w:r>
           </w:p>
         </w:tc>
@@ -24775,7 +24775,7 @@
           </w:tcPr>
           <w:p>
             <w:r>
-              <w:t>Resolved - implemented (backend). OPERATIONAL MEANING: consentScreenVersion is a MANUALLY BUMPED string constant (CONSENT_SCREEN_VERSION = 'v1', services/api/src/modules/auth/guardian-consent/consent-screen-version.constants.ts). Nothing derives it from the screen's content, a hash or a git revision, and nothing detects drift: whoever materially changes the guardian-consent confirmation screen's wording or substance (apps/web GuardianConsentConfirmPage.tsx / its Figma frame) must bump it in the same PR. Cosmetic changes need no bump. deviceType is a coarse 'mobile' | 'desktop' | 'unknown' derived from the User-Agent header at confirmation; the raw User-Agent is never stored (data minimisation). WHERE: ConsentAuditRecord only exists from anonymization time (a snapshot), so both values are stamped onto the Guardian row (new nullable consentScreenVersion / consentDeviceType) in the SAME updateMany as consentTimestamp in confirmConsent - no new write path - then snapshotted into ConsentAuditRecord.consentScreenVersion / deviceType by AccountDeletionSweepService. Flagged: two additive nullable columns on Guardian (beyond Section 3; safeguarding fields untouched, nothing weakened). Existing rows carry NULL, not backfilled. No admin/compliance export of ConsentAuditRecord exists to update. Open: the version constant is only as reliable as reviewers remembering to bump it; the guardian-facing page is not yet checked against it in CI; an idempotent re-confirm never overwrites the original evidence. [2026-10-19: FC3a (PR #430) bumped CONSENT_SCREEN_VERSION v3 to v4 and the hash when the guardian page wording changed (B-130, B-153, B-154). #408 item 6 tags the post-decline clause, which forces a further bump to v5 in its build PR (B-169).]</w:t>
+              <w:t>Resolved - implemented (backend). OPERATIONAL MEANING: consentScreenVersion is a MANUALLY BUMPED string constant (CONSENT_SCREEN_VERSION = 'v1', services/api/src/modules/auth/guardian-consent/consent-screen-version.constants.ts). Nothing derives it from the screen's content, a hash or a git revision, and nothing detects drift: whoever materially changes the guardian-consent confirmation screen's wording or substance (apps/web GuardianConsentConfirmPage.tsx / its Figma frame) must bump it in the same PR. Cosmetic changes need no bump. deviceType is a coarse 'mobile' | 'desktop' | 'unknown' derived from the User-Agent header at confirmation; the raw User-Agent is never stored (data minimisation). WHERE: ConsentAuditRecord only exists from anonymization time (a snapshot), so both values are stamped onto the Guardian row (new nullable consentScreenVersion / consentDeviceType) in the SAME updateMany as consentTimestamp in confirmConsent - no new write path - then snapshotted into ConsentAuditRecord.consentScreenVersion / deviceType by AccountDeletionSweepService. Flagged: two additive nullable columns on Guardian (beyond Section 3; safeguarding fields untouched, nothing weakened). Existing rows carry NULL, not backfilled. No admin/compliance export of ConsentAuditRecord exists to update. Open: the version constant is only as reliable as reviewers remembering to bump it; the guardian-facing page is not yet checked against it in CI; an idempotent re-confirm never overwrites the original evidence. [2026-10-19: FC3a (PR #430) bumped CONSENT_SCREEN_VERSION v3 to v4 and the hash when the guardian page wording changed (B-130, B-153, B-154). #408 item 6 tags the post-decline clause, which forces a further bump to v5 in its build PR (B-169).] [2026-10-20: FC4 (PR #435) bumped CONSENT_SCREEN_VERSION v4 to v5 and the hash (the tagged post-decline clause, B-169). #410 item 6 adds the link-expiry and withdrawal sentences to the guardian footnote, which forces a further bump to v6 in its build PR (B-185).]</w:t>
             </w:r>
           </w:p>
         </w:tc>
@@ -25682,7 +25682,7 @@
           </w:tcPr>
           <w:p>
             <w:r>
-              <w:t>Resolved -- decided, NOT yet built. A username is required at Create Profile so that no user, minor or adult, is shown to other users under a real name. Until Create Profile is complete an account is shown to others under a neutral placeholder name, cannot post, and is redirected to Create Profile on every login. Applies to adults and to approved minors. Builds on #364 (User.username, shipped optional, 'username first, display name fallback'), which this makes mandatory for any account that completes onboarding; legacy accounts with no username fall under the same gate. Username moderation rules (reserved words, impersonation, profanity, no personal data in usernames, change cooldown, released-handle holding period, admin revoke built code-first with a design follow-up) are specified in the build PR, not here. OPEN: what the placeholder name is, and how the gate treats accounts that already exist without a username. [2026-10-16: Amended by #403. The placeholder name for incomplete profiles is 'Soccernity member' (closes the first OPEN point). The second OPEN point (accounts that already exist without a username) is not addressed.] [2026-10-17: The second OPEN point (accounts that already exist without a username) is resolved by B-027, which is built (backend/w3-gates, PR #412): legacy accounts are inside the incomplete-profile gate, and the placeholder other users see is 'Soccernity member' (#403, item 15). The wording of the gate is unchanged. Recorded in #404.] [2026-10-18: Rules specified and built by B-032 (docs/backend-w4-username-report.md): reserved words, impersonation (club names), profanity, contact details, personal data, 30-day change cooldown, revoked-handle hold. A user can no longer clear their own username (B-031). Recorded in #406, item 8: one free correction; no hold on a handle the user releases.] [2026-10-18: QA run (PR #426, docs/qa-e2e-onboarding-report.md), D-06: hate and sexual terms glued to other letters (xxhitlerxx, nazifan) are accepted while hitler_1488, nazi_fan and fuckface are refused, because the EXACT list matches only the whole handle or an underscore token. Decided 2026-10-18 (#407, item 3): long unambiguous terms match by CONTAINS with a tested list of innocent words; short ambiguous terms stay exact. Register row B-142. D-05: Edit Profile still labels the username 'Optional' (B-133).] [2026-10-19: Built by backend/w3e (PR #429, #407 item 3): long unambiguous terms match by CONTAINS, nazi with named innocent exceptions. #408 item 3 allows the exact whole handles nazif, nazifa and nazifah and still refuses nazifan (B-165); the term lists and the 5-letter threshold are recorded in #408 and stay open for founder review.]</w:t>
+              <w:t>Resolved -- decided, NOT yet built. A username is required at Create Profile so that no user, minor or adult, is shown to other users under a real name. Until Create Profile is complete an account is shown to others under a neutral placeholder name, cannot post, and is redirected to Create Profile on every login. Applies to adults and to approved minors. Builds on #364 (User.username, shipped optional, 'username first, display name fallback'), which this makes mandatory for any account that completes onboarding; legacy accounts with no username fall under the same gate. Username moderation rules (reserved words, impersonation, profanity, no personal data in usernames, change cooldown, released-handle holding period, admin revoke built code-first with a design follow-up) are specified in the build PR, not here. OPEN: what the placeholder name is, and how the gate treats accounts that already exist without a username. [2026-10-16: Amended by #403. The placeholder name for incomplete profiles is 'Soccernity member' (closes the first OPEN point). The second OPEN point (accounts that already exist without a username) is not addressed.] [2026-10-17: The second OPEN point (accounts that already exist without a username) is resolved by B-027, which is built (backend/w3-gates, PR #412): legacy accounts are inside the incomplete-profile gate, and the placeholder other users see is 'Soccernity member' (#403, item 15). The wording of the gate is unchanged. Recorded in #404.] [2026-10-18: Rules specified and built by B-032 (docs/backend-w4-username-report.md): reserved words, impersonation (club names), profanity, contact details, personal data, 30-day change cooldown, revoked-handle hold. A user can no longer clear their own username (B-031). Recorded in #406, item 8: one free correction; no hold on a handle the user releases.] [2026-10-18: QA run (PR #426, docs/qa-e2e-onboarding-report.md), D-06: hate and sexual terms glued to other letters (xxhitlerxx, nazifan) are accepted while hitler_1488, nazi_fan and fuckface are refused, because the EXACT list matches only the whole handle or an underscore token. Decided 2026-10-18 (#407, item 3): long unambiguous terms match by CONTAINS with a tested list of innocent words; short ambiguous terms stay exact. Register row B-142. D-05: Edit Profile still labels the username 'Optional' (B-133).] [2026-10-19: Built by backend/w3e (PR #429, #407 item 3): long unambiguous terms match by CONTAINS, nazi with named innocent exceptions. #408 item 3 allows the exact whole handles nazif, nazifa and nazifah and still refuses nazifan (B-165); the term lists and the 5-letter threshold are recorded in #408 and stay open for founder review.] [2026-10-20: W3f (PR #434) built a whole-handle allow-list for nazif, nazifa and nazifah (B-165). #410 item 2 changes the rule to an exact match on the handle as typed (case-insensitive, no underscore variants) plus the name followed only by digits (B-181). The term lists, the 5-letter threshold and the innocent-word list stay open.]</w:t>
             </w:r>
           </w:p>
         </w:tc>
@@ -26918,7 +26918,7 @@
               <w:t>Resolved -- recorded; DECIDED, NOT BUILT. Source: founder decisions 2026-10-15/16. Extends #376, #371, #369 and #390. (D1) 'Reporter acted in bad faith' and 'Legal hold' (#376): each has a confirmation step and a reason field, a 'lift hold' control exists, and both actions also APPEAR on Appeal Review (not only Report Detail). The held-investigations list (GET /admin/users/held-investigations) shows the hold TYPE and a marker (per the open points of W0 Figma pass C). (D2) Flagged-image queue (#371): the reject reason is shown to the uploader. The CSAM / statutory path stays under counsel (#371). (D3) Username revoke: an admin action, manual, from User Detail, available at any time after the username exists, triggered by a report or an admin review (offensive, impersonating or personal-data usernames). No account exists without a username (#369), so a revoke returns the account to the incomplete-profile gate (#369): a neutral placeholder name to other users, cannot post, redirected to Create Profile at next login to choose a new username. A REASON is REQUIRED and is stored in the audit record. The user is emailed (wording [COPY PENDING LEGAL REVIEW]). The revoked handle is held for 30 days before anyone can take it, and that user cannot re-pick it. (D4) Everything needed for the DOB correction tool (#390) and for username revoke is built: a single-user admin read endpoint returning the fields the admin needs (including the date of birth) and a User Detail admin screen (build register B-109, a prerequisite of B-103, B-104 and B-033). The audit fields for both tools are specified in the build PR. Build register: B-012, B-032, B-033, B-037, B-044, B-045, B-109; Figma re-sync in B-107. STILL OPEN: the CSAM path (counsel); counsel wording; whether 'that user cannot re-pick it' is permanent or lasts only the 30 days (recorded verbatim; the sentence is ambiguous).</w:t>
             </w:r>
             <w:r>
-              <w:t xml:space="preserve"> [2026-10-16: Amended by #402 (founder-adopted default, veto-able). The revoked handle is held 30 days for everyone, and the revoked user can never re-pick it (permanent for that user).] [2026-10-17: D4 built (B-109; PR #416): GET /admin/users/:id for moderator and superadmin, DOB decrypted server-side only, a user.dob_viewed audit row for every response that contains a DOB, request fails closed if that write fails. The open point 'which admin roles may read a decrypted DOB' is closed by #405, item 5. The User Detail screen in apps/admin is not built (B-104, B-109 frontend leg).] [2026-10-18: Built by B-033: POST /admin/users/:id/username-revoke (moderator, superadmin), reason required and stored in the audit record, user emailed [COPY PENDING LEGAL REVIEW], account back in the incomplete-profile gate, handle held 30 days for everyone and barred for ever for that user. The User Detail screen in apps/admin is not built for the revoke (disabled in FC2). D4 is amended by #406, item 4: User Detail no longer shows the date of birth.] [2026-10-19: D3 built in apps/admin by FC3b (PR #431): the Revoke username dialog with a required reason (10 to 500 characters), the revoked state and the error state (B-033, B-143). #408 item 5 adds a line saying the username is held for 30 days to the dialog and result frames, admin-facing only (B-167, B-168). Revocation history stays not shown.]</w:t>
+              <w:t xml:space="preserve"> [2026-10-16: Amended by #402 (founder-adopted default, veto-able). The revoked handle is held 30 days for everyone, and the revoked user can never re-pick it (permanent for that user).] [2026-10-17: D4 built (B-109; PR #416): GET /admin/users/:id for moderator and superadmin, DOB decrypted server-side only, a user.dob_viewed audit row for every response that contains a DOB, request fails closed if that write fails. The open point 'which admin roles may read a decrypted DOB' is closed by #405, item 5. The User Detail screen in apps/admin is not built (B-104, B-109 frontend leg).] [2026-10-18: Built by B-033: POST /admin/users/:id/username-revoke (moderator, superadmin), reason required and stored in the audit record, user emailed [COPY PENDING LEGAL REVIEW], account back in the incomplete-profile gate, handle held 30 days for everyone and barred for ever for that user. The User Detail screen in apps/admin is not built for the revoke (disabled in FC2). D4 is amended by #406, item 4: User Detail no longer shows the date of birth.] [2026-10-19: D3 built in apps/admin by FC3b (PR #431): the Revoke username dialog with a required reason (10 to 500 characters), the revoked state and the error state (B-033, B-143). #408 item 5 adds a line saying the username is held for 30 days to the dialog and result frames, admin-facing only (B-167, B-168). Revocation history stays not shown.] [2026-10-20: D3's 30-day hold line: Figma pass K4 (PR #433) drew it and FC4 (PR #435) built it in the dialog, the error state and the revoked banner (B-167, B-168). #410 item 1 approves the wording as built, with no tag, admin-facing. Whether the revoked state shows a held-until date is open (B-192).]</w:t>
             </w:r>
           </w:p>
         </w:tc>
@@ -27089,7 +27089,7 @@
           </w:tcPr>
           <w:p>
             <w:r>
-              <w:t>Resolved -- recorded; DECIDED, NOT BUILT. FOUNDER-ADOPTED DEFAULTS, VETO-ABLE: each item below is adopted now so build work is not blocked, and stands until the founder says otherwise. Amends #395 and closes open points of #395-#399; the original text of those entries is unchanged (dated notes appended). (1) DECLINE 1 AND 2 -- AMENDS #395 B1. #389 already decided that sessions STAY VALID between declines; only the THIRD decline revokes sessions. After decline 1 and decline 2 the minor sees the existing decline page (5491:8241 / 5501:8453) INSIDE the account, using the existing authenticated resend and change-guardian-email routes. The 'declined login result' design of #395 B1 (a login that answers 'declined' with no token) is WITHDRAWN; so is its BACKEND TO CONFIRM point. Build implications recorded, not decisions: today every decline revokes sessions and 'declined' is terminal in code (#337-#340), and resend / change-guardian-email refuse a declined account (#365), so decline 1 and 2 must stop revoking and those routes must accept the account while fewer than three declines have been recorded. Bug fixed by the same work: GuardianConsentPage treats 'declined' as pending (audit section 5 item 5). Build register: B-110 is RE-SCOPED to this and merged into B-102's dependency chain (B-102 now depends on B-110); the B-ID is kept. (2) THIRD DECLINE. Login is blocked at once and the account enters pending deletion with the EXISTING 30-day grace (#375, via refuseConsentAndScheduleDeletion as in #389). This answers #395's open question: 'delete the account immediately' does NOT skip the grace; the minor still receives the email only, no page and no count (#395 B2 stands). (3) REVOKED USERNAME (#398 D3). The handle is held 30 days for everyone (nobody can take it); the revoked user can NEVER re-pick it. This answers #398's ambiguous 'cannot re-pick' point: permanent for that user, 30 days for others. (4) BLOCK (#396). The blocked user is NOT told. A block hides content and search results in both directions: posts, comments, likes, search, rosters. The leaderboard is unaffected. Unblock does NOT restore follows. Still open: Bants rooms (room membership / room listing; the blocked user's posts are covered by 'posts'), the exact like mechanics, and the interaction with the guardian-consent, under-16 and adult-to-minor rules (#346, #347). (5) 2FA (#397). 10 single-use backup codes, stored HASHED. Lost-device recovery needs a backup code, OR email confirmation plus password. Noted for the founder's veto: the email-plus-password path makes 2FA recovery only as strong as the email account. Still open: backup-code format, storage and encryption of the TOTP secret itself, counsel (legal copy Part C row 44). (6) CONTEST EXPOSURE SETTINGS (#399 E4/E5, #388). Tolerance and the per-viewer daily cap apply to WEEK 4 ONLY, not per contest or per week. Their ranges (1-50 percent; 1-50) stay as validation bounds on the week-4 settings; they lock when week 4 starts (day 22), not when week 1 starts. Watch limit (3-120 s) is unchanged. Build register: B-110 (re-scoped), B-102, B-003, B-107 (decline page behaviour note), B-032, B-033, B-039, B-108, B-086, B-087, B-111, B-091, B-092, B-095, B-097. Not decided here and still open: see docs/build-register.md Section 11d. [2026-10-17: Items 1 and 2 are built in the backend (B-110, B-102; PR #416): sessions stay valid after declines 1 and 2, the third decline blocks login at once with the 30-day grace. The 'existing authenticated resend' wording of item 1 is clarified by #405, item 6: the route is the existing email-keyed POST /auth/guardian-consent/resend, not JWT; change-guardian-email is the JWT one. Item 5 (2FA): the backup-code character set, the TOTP secret storage and the per-account lock are decided by #405, item 8.] [2026-10-18: Item 3 built: RevokedUsername (30-day hold for everyone, permanent bar for the revoked user). Retention and appeal path of that record are OPEN, no decision (B-139, #406).] [2026-10-18: QA run (PR #426) confirmed sessions stay valid between declines 1 and 2 and the third decline blocks login at once with the existing 30-day grace. Two of the decline view's three actions are broken in apps/web (B-151, B-152).] [2026-10-19: Item 3 (a revoked username is held 30 days for everyone) is not yet shown to the admin: #408 item 5 adds the line (B-167, B-168).]</w:t>
+              <w:t>Resolved -- recorded; DECIDED, NOT BUILT. FOUNDER-ADOPTED DEFAULTS, VETO-ABLE: each item below is adopted now so build work is not blocked, and stands until the founder says otherwise. Amends #395 and closes open points of #395-#399; the original text of those entries is unchanged (dated notes appended). (1) DECLINE 1 AND 2 -- AMENDS #395 B1. #389 already decided that sessions STAY VALID between declines; only the THIRD decline revokes sessions. After decline 1 and decline 2 the minor sees the existing decline page (5491:8241 / 5501:8453) INSIDE the account, using the existing authenticated resend and change-guardian-email routes. The 'declined login result' design of #395 B1 (a login that answers 'declined' with no token) is WITHDRAWN; so is its BACKEND TO CONFIRM point. Build implications recorded, not decisions: today every decline revokes sessions and 'declined' is terminal in code (#337-#340), and resend / change-guardian-email refuse a declined account (#365), so decline 1 and 2 must stop revoking and those routes must accept the account while fewer than three declines have been recorded. Bug fixed by the same work: GuardianConsentPage treats 'declined' as pending (audit section 5 item 5). Build register: B-110 is RE-SCOPED to this and merged into B-102's dependency chain (B-102 now depends on B-110); the B-ID is kept. (2) THIRD DECLINE. Login is blocked at once and the account enters pending deletion with the EXISTING 30-day grace (#375, via refuseConsentAndScheduleDeletion as in #389). This answers #395's open question: 'delete the account immediately' does NOT skip the grace; the minor still receives the email only, no page and no count (#395 B2 stands). (3) REVOKED USERNAME (#398 D3). The handle is held 30 days for everyone (nobody can take it); the revoked user can NEVER re-pick it. This answers #398's ambiguous 'cannot re-pick' point: permanent for that user, 30 days for others. (4) BLOCK (#396). The blocked user is NOT told. A block hides content and search results in both directions: posts, comments, likes, search, rosters. The leaderboard is unaffected. Unblock does NOT restore follows. Still open: Bants rooms (room membership / room listing; the blocked user's posts are covered by 'posts'), the exact like mechanics, and the interaction with the guardian-consent, under-16 and adult-to-minor rules (#346, #347). (5) 2FA (#397). 10 single-use backup codes, stored HASHED. Lost-device recovery needs a backup code, OR email confirmation plus password. Noted for the founder's veto: the email-plus-password path makes 2FA recovery only as strong as the email account. Still open: backup-code format, storage and encryption of the TOTP secret itself, counsel (legal copy Part C row 44). (6) CONTEST EXPOSURE SETTINGS (#399 E4/E5, #388). Tolerance and the per-viewer daily cap apply to WEEK 4 ONLY, not per contest or per week. Their ranges (1-50 percent; 1-50) stay as validation bounds on the week-4 settings; they lock when week 4 starts (day 22), not when week 1 starts. Watch limit (3-120 s) is unchanged. Build register: B-110 (re-scoped), B-102, B-003, B-107 (decline page behaviour note), B-032, B-033, B-039, B-108, B-086, B-087, B-111, B-091, B-092, B-095, B-097. Not decided here and still open: see docs/build-register.md Section 11d. [2026-10-17: Items 1 and 2 are built in the backend (B-110, B-102; PR #416): sessions stay valid after declines 1 and 2, the third decline blocks login at once with the 30-day grace. The 'existing authenticated resend' wording of item 1 is clarified by #405, item 6: the route is the existing email-keyed POST /auth/guardian-consent/resend, not JWT; change-guardian-email is the JWT one. Item 5 (2FA): the backup-code character set, the TOTP secret storage and the per-account lock are decided by #405, item 8.] [2026-10-18: Item 3 built: RevokedUsername (30-day hold for everyone, permanent bar for the revoked user). Retention and appeal path of that record are OPEN, no decision (B-139, #406).] [2026-10-18: QA run (PR #426) confirmed sessions stay valid between declines 1 and 2 and the third decline blocks login at once with the existing 30-day grace. Two of the decline view's three actions are broken in apps/web (B-151, B-152).] [2026-10-19: Item 3 (a revoked username is held 30 days for everyone) is not yet shown to the admin: #408 item 5 adds the line (B-167, B-168).] [2026-10-20: item 3's 30-day hold is now shown to the admin: drawn by K4 (PR #433), built by FC4 (PR #435), wording approved by #410 item 1 (B-167, B-168).]</w:t>
             </w:r>
           </w:p>
         </w:tc>
@@ -27131,7 +27131,7 @@
           </w:tcPr>
           <w:p>
             <w:r>
-              <w:t>Resolved -- recorded; DECIDED, NOT BUILT. Source: founder decisions 2026-10-16, numbered 1-19 as given to this entry. Amends #400 (items 1, 9, 11), #395 (items 2, 15), #401 (item 7), #369 (item 15), #394 and #371 (item 17) by dated notes appended to those rows; the original text of every row is unchanged. It also changes points recorded in #398 D1 (item 8), #399 E3 (item 10) and #402 item 4 (item 16): those three rows were NOT edited (this entry is the record), see docs/build-register.md Section 12. The founder labelled the country select in item 17 a veto-able default and the withdrawal throttle in item 15 a default held in configuration; everything else is stated as a decision. (1) NON-FINALIST CONTEST TAB -- AMENDS #400 E8. The Create Post Contest tab for a non-finalist is NOT hidden. The tab stays visible, and a non-finalist who opens it during days 22-24 sees the existing 'Closed (not a finalist)' frames (desktop 6660:31044, mobile 6660:35699), which are RESTORED (un-archived, by a Figma pass, not by this entry). The minimum tally x stays admin-only (E8's second sentence stands). (2) DECLINE PAGE CAP SENTENCE -- clarifies #395 B2. The decline page keeps its static sentence that states the cap (Figma node 6627:22230). 'No decline count is shown' means no RUNNING 'decline N of 3' counter. The sentence is minor-facing copy and stays [COPY PENDING LEGAL REVIEW]. (3) GUARDIAN 'APPROVED' SCREENS. 5488:7164 and 5501:8225 are reworded to match the flow (approval continues to Create Profile; extends #394 A5); the new wording is [COPY PENDING LEGAL REVIEW]. (4) ADMIN COMPONENTS. The component frame at Figma node 6671:27364 (Pass F2) exists so that admin screens and apps/admin share ONE Button, Pill, Field, Callout, Banner, Note, Dialog and Table. Adoption is on the Pass C and Pass F1 admin frames only (not on older admin frames). A spacing / radius variable collection is added (a Figma pass does this; 'Soccernity Theme' stays the colour collection). (5) ADMIN SHELL SEARCH BAR. It stays visible on admin screens and is NOT functional ('not available yet'). New register row B-114: decide build vs hide. (6) EXCEPTION TO 'NEVER DELETE' (Figma passes). The ten hidden legacy absolute layers inside the ten rebuilt Create Post frames (the 'ARCHIVED -- legacy absolute layer' children from Pass F2 inside 2008:655, 2009:5168, 2009:2913, 6171:14797, 6171:16994, 2496:4462, 2565:3951, 6660:28736, 6660:31044, 6660:33353) may be deleted, and ONLY those. (7) VOTING PAGE ADOPTS THE ALREADY VOTED DESIGN -- closes the open point of #401. The Voting page (desktop 2094:994, mobile 5802:8726) takes the Already Voted page's design (entries column + board column, fan cards) and carries the vote toggle (#401). The separate Already Voted screens (5802:8978 / 5815:8916, and the auto-layout rebuild 6671:27155) are archived AFTERWARDS, by a Figma pass; the Voting &lt;-&gt; Already Voted navigation of #387 therefore goes with them. (8) LIFT HOLD -- changes #398 D1 / #376. Lift hold applies to BOTH the legal hold and the 6-month bad-faith hold. A reason is required. The held user is NOT notified. Appeal Review reuses the shared hold dialogs (Bad faith / Legal hold / Lift hold) used on Report Detail. (9) FORFEIT POP-UP -- AMENDS #400 E11. Shown ONLY on the Contest page. On every load of that page the user sees one pop-up per forfeited week, from when the week is deemed forfeited (docs/contest-spec.md Section 7); the reason is shown; nothing is remembered between loads. The leaderboard Contest tab shows the forfeited writing in place of the three names for that week (no pop-up there). (10) FINAL TASK TEXT -- changes #399 E3. The week-4 task text shows on the live-ranking and uploading states only (not on the 'No winner this month' or crowned states). (11) COMMUNITY-FEED 'FINAL WEEK' MODULE -- AMENDS #400 E10 and the open point carried by #402. The module STAYS. The dead 'View on the Contest page' link is removed. Its videos become a carousel that keeps the current frame size and serves as a preview slot reusable for other showcases later. It shows only during a final contest week and not at all when there is none. OPEN: whether carousel views count as impressions (B-092). (12) MOBILE BLOCK PATTERN: the '...' menu (confirms the Pass F1 trigger, node 6669:27188). (13) CREATE POST FIGMA CHANGES ACCEPTED: the scrim token change (white 71% to color/overlay/scrim) and the typographic crest marks in the Fixtures module of the Create Post frames. Licensing of club crests in Fixtures stays OPEN (#85, #97). (14) FONT: user-facing read-only fields need a Montserrat Field variant (the admin components are Inter). (15) DEFAULTS CLOSING OPEN POINTS: the placeholder name for incomplete profiles is 'Soccernity member' (closes #369's open point); a DOB-correction restart RESETS the decline counter and writes an audit entry (closes #395 B4's open point); the withdrawal throttle default is 5 attempts per 15 minutes, held in configuration (sets the window left open in #395 B3); unverified-email users are blocked from social writes as well as from PATCH /users/:id (extends the guard built under B-020; new row B-118). (16) BANTS -- an OPEN FORUM, no private messages. Anyone can start a thread and others comment on it; likes work as on a blog or forum (one like per user per item, toggled, public count). Accounts aged 16 and 17 have FULL Bants access (the limit in #346 applies to under-16s only, who stay fully disabled); this is a founder decision, not read-only. Bants will have moderation. Block hides the blocked user's posts, comments and like identities in both directions; counts unchanged; no room membership. This settles the 'Bants rooms' and 'exact like mechanics' points #402 item 4 left open; the interaction with #346 / #347 stays open. OPEN, recorded not resolved: 'thread' is not mapped to the built model (BanterRoom #275 vs Post), and 'no room membership' is not reconciled with the built BanterRoomMember join / leave, My Bants and 'posting requires membership' (#275); the scope of 'moderation' beyond room status (#357) is not stated. New row B-117. (17) COUNTRY HAS TWO SEPARATE FIELDS. (a) SAFEGUARDING country: declared at the Age Gate and derived from the IP lookup (B-023..B-025). Stored separately, never shown, never editable by any profile action; it alone decides US under-13 card verification and demographic grouping (#368 stands). (b) PROFILE country: a separate, nullable, OPTIONAL field. It is BLANK at Create Profile (not prefilled, not read-only), the user may fill it in, and it is editable at any time in Edit Profile (B-083). It is shown on a user's profile only if they filled it in, so a minor's country is visible only if the minor chooses to enter it. AMENDS #394 A1 (Country read-only at Create Profile) and the 'country' item of #371 (profile shows country): those rows stand except for these points. DEFAULT, VETO-ABLE: a country select from the full country list. B-038 stores the profile country as its own column, NOT the derived or declared safeguarding fields. Counsel review of country display stays on the legal list with reduced scope because the field is optional. (18) PRODUCTION WIRING (MaxMind, Render environment variables, Postmark, JWT secrets, TRUST_PROXY_HOPS) is deferred to the launch gate B-090; the code fails safe until it is done. (19) NEW REGISTER ROWS: password-reset email placeholder-address fallback (B-115); API test-suite worker flake, the suite needs --maxWorkers=4 (B-116); admin search bar (B-114, item 5). Rows added from the other items: B-113 (Figma re-sync, items 1-14 and 17), B-117 (Bants open forum), B-118 (email-verification gate on social writes). Build register: B-113 to B-118 new; status lines on B-002, B-003, B-006, B-007, B-012, B-013, B-018, B-020, B-023, B-024, B-026, B-027, B-038, B-039, B-042, B-044, B-045, B-054, B-071, B-079, B-080, B-081, B-082, B-083, B-090, B-091, B-092, B-095, B-096, B-098, B-099, B-102, B-103, B-107, B-108, B-112. STILL OPEN: counsel wording for every [COPY PENDING LEGAL REVIEW] item; the Bants mapping questions in (16); build vs hide for the admin search bar (B-114); whether carousel views count as impressions (B-092); whether the 'Closed (not a finalist)' copy may reveal anything about uploads before the reveal; how other users reach a finalist's entry after the reveal; what the Contest tab shows from 00:00 to 08:00 on day 1; which routes count as 'social writes' (B-118); the interaction of Block with #346 / #347; crest licensing in Fixtures (#85, #97); the CSAM path; the length of every window stated as configuration other than the withdrawal throttle. [2026-10-17: Item 15 (unverified-email users cannot perform social writes) is built: B-118 (backend/w3-gates, PR #412). The creating forms are gated by EmailVerifiedGuard; the undo and own-content forms stay open (docs/backend-w3-gates-report.md, section 5, call 1, adopted by #404, item 12). Two open points of this entry are closed by #404: the forfeit pop-up reading of 'Contest page' and several forfeited weeks (item 4), and whether carousel views count as impressions (items 6 and 15).] [2026-10-17: Items 2 and 15 are built in the backend (PR #416): the decline counter is internal and never returned by any API (item 2); a DOB-correction restart resets it and writes an audit entry (item 15, user.dob_corrected). Item 15's unverified-email rule is already noted above (PR #412). The Contest notification question 'does an unverified-email account receive them' is answered by #405, item 4.] [2026-10-18: Figma pass K2 (docs/figma-pass-k2-report.md section 6, candidate 7): item 17's rule 'show the country line only when filled' is unchanged, but the general profile frames show a filled sample country line while the pass H frames hide it; which sample is canonical is not decided (register row B-148).] [2026-10-19: Item 13 (typographic crest marks accepted) is applied by Figma pass K3 on the own Saved frame 6747:29445 (PR #428); fixture crest licensing stays open. K3 found that the K2 profile frames 6747:28894, 6747:29094 and 6747:29291 were not diffed against their legacy twins (#408, B-170).] [2026-10-20: #409 item 2 restates the deferral of item 18 (production wiring waits for the launch gate B-090; the founder is saving money) and extends it to the two Render static sites for apps/web and apps/admin (B-179). At the gate one runbook is produced (B-180, docs/launch-gate-runbook.md).]</w:t>
+              <w:t>Resolved -- recorded; DECIDED, NOT BUILT. Source: founder decisions 2026-10-16, numbered 1-19 as given to this entry. Amends #400 (items 1, 9, 11), #395 (items 2, 15), #401 (item 7), #369 (item 15), #394 and #371 (item 17) by dated notes appended to those rows; the original text of every row is unchanged. It also changes points recorded in #398 D1 (item 8), #399 E3 (item 10) and #402 item 4 (item 16): those three rows were NOT edited (this entry is the record), see docs/build-register.md Section 12. The founder labelled the country select in item 17 a veto-able default and the withdrawal throttle in item 15 a default held in configuration; everything else is stated as a decision. (1) NON-FINALIST CONTEST TAB -- AMENDS #400 E8. The Create Post Contest tab for a non-finalist is NOT hidden. The tab stays visible, and a non-finalist who opens it during days 22-24 sees the existing 'Closed (not a finalist)' frames (desktop 6660:31044, mobile 6660:35699), which are RESTORED (un-archived, by a Figma pass, not by this entry). The minimum tally x stays admin-only (E8's second sentence stands). (2) DECLINE PAGE CAP SENTENCE -- clarifies #395 B2. The decline page keeps its static sentence that states the cap (Figma node 6627:22230). 'No decline count is shown' means no RUNNING 'decline N of 3' counter. The sentence is minor-facing copy and stays [COPY PENDING LEGAL REVIEW]. (3) GUARDIAN 'APPROVED' SCREENS. 5488:7164 and 5501:8225 are reworded to match the flow (approval continues to Create Profile; extends #394 A5); the new wording is [COPY PENDING LEGAL REVIEW]. (4) ADMIN COMPONENTS. The component frame at Figma node 6671:27364 (Pass F2) exists so that admin screens and apps/admin share ONE Button, Pill, Field, Callout, Banner, Note, Dialog and Table. Adoption is on the Pass C and Pass F1 admin frames only (not on older admin frames). A spacing / radius variable collection is added (a Figma pass does this; 'Soccernity Theme' stays the colour collection). (5) ADMIN SHELL SEARCH BAR. It stays visible on admin screens and is NOT functional ('not available yet'). New register row B-114: decide build vs hide. (6) EXCEPTION TO 'NEVER DELETE' (Figma passes). The ten hidden legacy absolute layers inside the ten rebuilt Create Post frames (the 'ARCHIVED -- legacy absolute layer' children from Pass F2 inside 2008:655, 2009:5168, 2009:2913, 6171:14797, 6171:16994, 2496:4462, 2565:3951, 6660:28736, 6660:31044, 6660:33353) may be deleted, and ONLY those. (7) VOTING PAGE ADOPTS THE ALREADY VOTED DESIGN -- closes the open point of #401. The Voting page (desktop 2094:994, mobile 5802:8726) takes the Already Voted page's design (entries column + board column, fan cards) and carries the vote toggle (#401). The separate Already Voted screens (5802:8978 / 5815:8916, and the auto-layout rebuild 6671:27155) are archived AFTERWARDS, by a Figma pass; the Voting &lt;-&gt; Already Voted navigation of #387 therefore goes with them. (8) LIFT HOLD -- changes #398 D1 / #376. Lift hold applies to BOTH the legal hold and the 6-month bad-faith hold. A reason is required. The held user is NOT notified. Appeal Review reuses the shared hold dialogs (Bad faith / Legal hold / Lift hold) used on Report Detail. (9) FORFEIT POP-UP -- AMENDS #400 E11. Shown ONLY on the Contest page. On every load of that page the user sees one pop-up per forfeited week, from when the week is deemed forfeited (docs/contest-spec.md Section 7); the reason is shown; nothing is remembered between loads. The leaderboard Contest tab shows the forfeited writing in place of the three names for that week (no pop-up there). (10) FINAL TASK TEXT -- changes #399 E3. The week-4 task text shows on the live-ranking and uploading states only (not on the 'No winner this month' or crowned states). (11) COMMUNITY-FEED 'FINAL WEEK' MODULE -- AMENDS #400 E10 and the open point carried by #402. The module STAYS. The dead 'View on the Contest page' link is removed. Its videos become a carousel that keeps the current frame size and serves as a preview slot reusable for other showcases later. It shows only during a final contest week and not at all when there is none. OPEN: whether carousel views count as impressions (B-092). (12) MOBILE BLOCK PATTERN: the '...' menu (confirms the Pass F1 trigger, node 6669:27188). (13) CREATE POST FIGMA CHANGES ACCEPTED: the scrim token change (white 71% to color/overlay/scrim) and the typographic crest marks in the Fixtures module of the Create Post frames. Licensing of club crests in Fixtures stays OPEN (#85, #97). (14) FONT: user-facing read-only fields need a Montserrat Field variant (the admin components are Inter). (15) DEFAULTS CLOSING OPEN POINTS: the placeholder name for incomplete profiles is 'Soccernity member' (closes #369's open point); a DOB-correction restart RESETS the decline counter and writes an audit entry (closes #395 B4's open point); the withdrawal throttle default is 5 attempts per 15 minutes, held in configuration (sets the window left open in #395 B3); unverified-email users are blocked from social writes as well as from PATCH /users/:id (extends the guard built under B-020; new row B-118). (16) BANTS -- an OPEN FORUM, no private messages. Anyone can start a thread and others comment on it; likes work as on a blog or forum (one like per user per item, toggled, public count). Accounts aged 16 and 17 have FULL Bants access (the limit in #346 applies to under-16s only, who stay fully disabled); this is a founder decision, not read-only. Bants will have moderation. Block hides the blocked user's posts, comments and like identities in both directions; counts unchanged; no room membership. This settles the 'Bants rooms' and 'exact like mechanics' points #402 item 4 left open; the interaction with #346 / #347 stays open. OPEN, recorded not resolved: 'thread' is not mapped to the built model (BanterRoom #275 vs Post), and 'no room membership' is not reconciled with the built BanterRoomMember join / leave, My Bants and 'posting requires membership' (#275); the scope of 'moderation' beyond room status (#357) is not stated. New row B-117. (17) COUNTRY HAS TWO SEPARATE FIELDS. (a) SAFEGUARDING country: declared at the Age Gate and derived from the IP lookup (B-023..B-025). Stored separately, never shown, never editable by any profile action; it alone decides US under-13 card verification and demographic grouping (#368 stands). (b) PROFILE country: a separate, nullable, OPTIONAL field. It is BLANK at Create Profile (not prefilled, not read-only), the user may fill it in, and it is editable at any time in Edit Profile (B-083). It is shown on a user's profile only if they filled it in, so a minor's country is visible only if the minor chooses to enter it. AMENDS #394 A1 (Country read-only at Create Profile) and the 'country' item of #371 (profile shows country): those rows stand except for these points. DEFAULT, VETO-ABLE: a country select from the full country list. B-038 stores the profile country as its own column, NOT the derived or declared safeguarding fields. Counsel review of country display stays on the legal list with reduced scope because the field is optional. (18) PRODUCTION WIRING (MaxMind, Render environment variables, Postmark, JWT secrets, TRUST_PROXY_HOPS) is deferred to the launch gate B-090; the code fails safe until it is done. (19) NEW REGISTER ROWS: password-reset email placeholder-address fallback (B-115); API test-suite worker flake, the suite needs --maxWorkers=4 (B-116); admin search bar (B-114, item 5). Rows added from the other items: B-113 (Figma re-sync, items 1-14 and 17), B-117 (Bants open forum), B-118 (email-verification gate on social writes). Build register: B-113 to B-118 new; status lines on B-002, B-003, B-006, B-007, B-012, B-013, B-018, B-020, B-023, B-024, B-026, B-027, B-038, B-039, B-042, B-044, B-045, B-054, B-071, B-079, B-080, B-081, B-082, B-083, B-090, B-091, B-092, B-095, B-096, B-098, B-099, B-102, B-103, B-107, B-108, B-112. STILL OPEN: counsel wording for every [COPY PENDING LEGAL REVIEW] item; the Bants mapping questions in (16); build vs hide for the admin search bar (B-114); whether carousel views count as impressions (B-092); whether the 'Closed (not a finalist)' copy may reveal anything about uploads before the reveal; how other users reach a finalist's entry after the reveal; what the Contest tab shows from 00:00 to 08:00 on day 1; which routes count as 'social writes' (B-118); the interaction of Block with #346 / #347; crest licensing in Fixtures (#85, #97); the CSAM path; the length of every window stated as configuration other than the withdrawal throttle. [2026-10-17: Item 15 (unverified-email users cannot perform social writes) is built: B-118 (backend/w3-gates, PR #412). The creating forms are gated by EmailVerifiedGuard; the undo and own-content forms stay open (docs/backend-w3-gates-report.md, section 5, call 1, adopted by #404, item 12). Two open points of this entry are closed by #404: the forfeit pop-up reading of 'Contest page' and several forfeited weeks (item 4), and whether carousel views count as impressions (items 6 and 15).] [2026-10-17: Items 2 and 15 are built in the backend (PR #416): the decline counter is internal and never returned by any API (item 2); a DOB-correction restart resets it and writes an audit entry (item 15, user.dob_corrected). Item 15's unverified-email rule is already noted above (PR #412). The Contest notification question 'does an unverified-email account receive them' is answered by #405, item 4.] [2026-10-18: Figma pass K2 (docs/figma-pass-k2-report.md section 6, candidate 7): item 17's rule 'show the country line only when filled' is unchanged, but the general profile frames show a filled sample country line while the pass H frames hide it; which sample is canonical is not decided (register row B-148).] [2026-10-19: Item 13 (typographic crest marks accepted) is applied by Figma pass K3 on the own Saved frame 6747:29445 (PR #428); fixture crest licensing stays open. K3 found that the K2 profile frames 6747:28894, 6747:29094 and 6747:29291 were not diffed against their legacy twins (#408, B-170).] [2026-10-20: #409 item 2 restates the deferral of item 18 (production wiring waits for the launch gate B-090; the founder is saving money) and extends it to the two Render static sites for apps/web and apps/admin (B-179). At the gate one runbook is produced (B-180, docs/launch-gate-runbook.md).] [2026-10-20: the #409 note above merged in PR #436 (A7). Item 13's crest licensing stays open: nothing in the K4 frames (PR #433) settled it, and #410 records it as an open row with no decision (B-189).]</w:t>
             </w:r>
           </w:p>
         </w:tc>
@@ -27257,7 +27257,7 @@
           </w:tcPr>
           <w:p>
             <w:r>
-              <w:t>Resolved -- recorded. FOUNDER-ADOPTED DEFAULTS, VETO-ABLE, all thirteen items. DECIDED, NOT BUILT, except item 8 (as built in W4, PR #420), item 9 (the drawing exists, Figma pass K) and item 10 (as built in FC2, PR #421), which confirm what already exists. Item numbers are the founder's own. Original text of every entry named in the forward-pointers below is unchanged (dated notes appended). (1) DECLINED-AT-1-OR-2 ROWS EXPIRE (closes B-126 in principle). A guardian-consent row declined at decline 1 or 2 and not reopened (no resend, no change of guardian email) within 14 days (a configuration value) takes the same lapse path as an unanswered request (#337-#340, #389). The backend agent confirms the mechanics before building: where the 14 days start, whether the one automatic re-send and warning comes first or the row goes straight to the second-lapse outcome, and that an expiry does not count among the three declines (#389). Resolves, in principle, the conflict with legal copy v0.8 Part 4.4 (a minor's account cannot remain restricted-pending indefinitely); counsel still to review; the legal copy is not edited here. (2) LIGHT THEME. The onboarding, guardian and consent screens in apps/web move to the light theme to match their Figma frames: Age Gate, Guardian Details, Guardian Consent, Verify Email and its prompt, Create Profile and the Club Picker step (the set the FC2 browser check found dark). No new colour. Build row B-127. (3) RESEND VERIFICATION. A rate-limited resend-verification-email endpoint is added; #37 recorded that none exists. The limits, and who may call it, are set in the build PR and are not decided here. Build row B-128. (4) DATE OF BIRTH ON USER DETAIL. User Detail reads without the date of birth; the DOB appears only on the correction form; the server rejects a correction reason that contains a date. Amends #405 item 5 and #398 D4 (GET /admin/users/:id returned the decrypted DOB, each view audited): roles are unchanged (moderator and superadmin). For the backend agent to confirm: how the form gets the current DOB (a separate read), whether that read is audited like user.dob_viewed, and which date formats the reason check rejects (a reason cannot be proven free of every date form). Build row B-129. (5) PIN REMOVAL TIME. The pin is removed from the finalist's profile at 00:00 Europe/London on the 1st of the month after the contest month, and at that moment the final entry becomes an ordinary Community-feed post. Closes the 'time of day of the flip' open point of #405 item 1. B-091, B-092, B-082. (6) IMPRESSION SECOND. The 1-second view of #405 item 7 is continuous (the tile stays at least 50 percent in view for one uninterrupted second); a re-entry counts again, within the per-viewer daily cap of #388 (week 4 only). Closes the two 'not stated' points of #405 item 7. B-092. (7) NOTIFICATIONS. Notification icons as drawn in Figma pass K are accepted; the Notification Centre empty-state line and the coming-soon line are updated to mention Contest. Observation, not a decision: the coming-soon line written under #279 already names 'Contest activity' as upcoming, which is no longer true now that Contest notifications exist; the Figma agent sets the final wording. B-121, B-123. (8) USERNAME. A 30-day change cooldown with one free correction (as built, B-032) and no hold on a handle the user releases; the 30-day hold applies to an admin revoke only (#398 D3, #402 item 3). Not addressed: a handle released by anonymisation is released immediately as built; whether to hold it is not decided. B-032, B-033. (9) INCORRECT-DETAILS SCREEN. The founder accepts the admin screen as drawn in Figma pass K (8 frames, docs/figma-pass-k-report.md); B-120 builds from it, with no field, column or control beyond the frames. The four SCOPE OPEN notes of that pass (confirmation step, host sidebar item, success message, link to User Detail) are settled only where the drawing settles them. B-119, B-120. (10) RESTRICTED MINORS. A restricted-pending minor may open pages by URL read-only; there is no front-end route block and the server still blocks every write (#370, #12). Confirms the shipped behaviour. B-026, B-125, B-076. (11) STATUS RESPONSE. The status response adds the guardian's first name and the last decision date, never the decline count. The founder did not name the response; the reading is the minor's GET /auth/guardian-consent/status. For the backend agent to confirm: how a first name is derived from the single full-name field (Option A, #393), what 'last decision' covers (decline, approval, withdrawal) and whether a column is needed (the schema has no decline timestamp). Build row B-131. (12) BLOCKED NOT-FOUND. A blocked user's not-found view is identical to the generic not-found view and to a non-existent profile (same page, same status; nothing reveals a block). Confirms #404/#396 and the Figma pass K frames. B-007, B-039, B-082, B-108. (13) GUARDIAN CONFIRM FOOTNOTE. The footnote 'Declining closes the account and schedules it for deletion' on the guardian confirm page is wrong for declines 1 and 2; it is replaced by the existing cap sentence addressed to the guardian, tagged [COPY PENDING LEGAL REVIEW]. The change alters guardian-visible wording, so CONSENT_SCREEN_VERSION is bumped (v3 to v4) with the tripwire hash (#348) and the pending-copy manifest row is replaced. Found while checking, NOT covered by the founder's wording: the page's post-decline state ('Your decision has been recorded ... will be scheduled for deletion') has the same fault. Build row B-130. (REGISTER) B-124 scope is apps/web and apps/admin only (as built); the services/api email wording tagged [COPY PENDING LEGAL REVIEW] is added to docs/pending-copy-manifest.md as OPEN (three templates tagged in code comments: guardian-approved-minor, the third-decline guardian-consent-declined, username-revoked; other child- and guardian-facing templates carry no tag). New rows B-127 to B-139: B-127 light theme, B-128 resend verification, B-129 User Detail without the DOB, B-130 guardian confirm footnote, B-131 status response fields, B-132 horizontal overflow at 390 px, B-133 Edit Profile username (never send null; show the error codes), B-134 real-API end-to-end smoke test, B-135 Figma approval-on-hold, B-136 Figma verify-email prompt, B-137 Figma guardian fields of the DOB correction, B-138 Figma general profile frames (plain other-user; own Posts, Media, Saved) that must exist before the four legacy profile frames 1455:4362, 1455:6626, 5702:8250 and 5778:8490 can be archived, B-139 RevokedUsername retention and appeal path (OPEN, no decision). Status lines on 27 register rows. 139 B-IDs; 146 gap frames unchanged. Arithmetic: docs/build-register.md Section 22. (FORWARD-POINTERS) Dated notes appended (original text unchanged) to #364, #367, #368, #369, #398, #402 and #404 (from docs/backend-w4-username-report.md section 7) and to #37, #389, #395 and #405 (points #406 amends or closes). NOT DECIDED HERE: the retention and appeal path of RevokedUsername (B-139, OPEN); the mechanics of item 1; the limits of item 3; the form of the DOB read in item 4; the final wording of item 7; the response and derivation in item 11; the post-decline state in item 13; whether the pending-copy guard is ever extended to services/api; counsel wording of every [COPY PENDING LEGAL REVIEW] string. [2026-10-18: Built in W3d (PR #424, docs/backend-w3d-report.md section 7), backend only: item 1 as B-126 (14 days counted from the new Guardian.consentDeclinedAt; the automatic re-send and the minor's warning come first; an expiry does not count among the three declines); item 3 as B-128 (POST /auth/resend-verification-email, unauthenticated and keyed by email, 5 per 60 s per IP plus 3 per hour per account, one response for every outcome); item 4 as B-129 (see #405); item 11 as B-131 (guardianFirstName and lastDecisionAt on the minor's status response, the decline count never returned). Frontend legs of items 3, 4, 11 and 13 are not built. Figma pass K2 (PR #425, docs/figma-pass-k2-report.md) drew B-135 to B-138 and archived the four legacy profile frames; its open candidates are rows B-144 to B-150. The QA end-to-end run (PR #426) checked items 3, 4 and 13 and measured the 390 px overflow: D-08, D-07, D-10 and D-11/D-12 map to B-128, B-129, B-130 and B-132; the other defects and gaps are mapped in docs/build-register.md Section 25 and recorded in #407.] [2026-10-19: Built since: item 2 (light theme), item 3 (the resend button), item 11 (the screens that show the guardian's first name and the decision date) and item 13 (the footnote replaced by the cap sentence, CONSENT_SCREEN_VERSION v4) by FC3a (PR #430); item 4 (User Detail on the summary read, the DOB only on the correction form, the reason-date message) and item 9 (the incorrect-details reports screen) by FC3b (PR #431). Register instruction on the general profile frames (B-138): Figma pass K3 (PR #428) found that K2's replacements were not diffed against their legacy twins; see #408 and B-170.]</w:t>
+              <w:t>Resolved -- recorded. FOUNDER-ADOPTED DEFAULTS, VETO-ABLE, all thirteen items. DECIDED, NOT BUILT, except item 8 (as built in W4, PR #420), item 9 (the drawing exists, Figma pass K) and item 10 (as built in FC2, PR #421), which confirm what already exists. Item numbers are the founder's own. Original text of every entry named in the forward-pointers below is unchanged (dated notes appended). (1) DECLINED-AT-1-OR-2 ROWS EXPIRE (closes B-126 in principle). A guardian-consent row declined at decline 1 or 2 and not reopened (no resend, no change of guardian email) within 14 days (a configuration value) takes the same lapse path as an unanswered request (#337-#340, #389). The backend agent confirms the mechanics before building: where the 14 days start, whether the one automatic re-send and warning comes first or the row goes straight to the second-lapse outcome, and that an expiry does not count among the three declines (#389). Resolves, in principle, the conflict with legal copy v0.8 Part 4.4 (a minor's account cannot remain restricted-pending indefinitely); counsel still to review; the legal copy is not edited here. (2) LIGHT THEME. The onboarding, guardian and consent screens in apps/web move to the light theme to match their Figma frames: Age Gate, Guardian Details, Guardian Consent, Verify Email and its prompt, Create Profile and the Club Picker step (the set the FC2 browser check found dark). No new colour. Build row B-127. (3) RESEND VERIFICATION. A rate-limited resend-verification-email endpoint is added; #37 recorded that none exists. The limits, and who may call it, are set in the build PR and are not decided here. Build row B-128. (4) DATE OF BIRTH ON USER DETAIL. User Detail reads without the date of birth; the DOB appears only on the correction form; the server rejects a correction reason that contains a date. Amends #405 item 5 and #398 D4 (GET /admin/users/:id returned the decrypted DOB, each view audited): roles are unchanged (moderator and superadmin). For the backend agent to confirm: how the form gets the current DOB (a separate read), whether that read is audited like user.dob_viewed, and which date formats the reason check rejects (a reason cannot be proven free of every date form). Build row B-129. (5) PIN REMOVAL TIME. The pin is removed from the finalist's profile at 00:00 Europe/London on the 1st of the month after the contest month, and at that moment the final entry becomes an ordinary Community-feed post. Closes the 'time of day of the flip' open point of #405 item 1. B-091, B-092, B-082. (6) IMPRESSION SECOND. The 1-second view of #405 item 7 is continuous (the tile stays at least 50 percent in view for one uninterrupted second); a re-entry counts again, within the per-viewer daily cap of #388 (week 4 only). Closes the two 'not stated' points of #405 item 7. B-092. (7) NOTIFICATIONS. Notification icons as drawn in Figma pass K are accepted; the Notification Centre empty-state line and the coming-soon line are updated to mention Contest. Observation, not a decision: the coming-soon line written under #279 already names 'Contest activity' as upcoming, which is no longer true now that Contest notifications exist; the Figma agent sets the final wording. B-121, B-123. (8) USERNAME. A 30-day change cooldown with one free correction (as built, B-032) and no hold on a handle the user releases; the 30-day hold applies to an admin revoke only (#398 D3, #402 item 3). Not addressed: a handle released by anonymisation is released immediately as built; whether to hold it is not decided. B-032, B-033. (9) INCORRECT-DETAILS SCREEN. The founder accepts the admin screen as drawn in Figma pass K (8 frames, docs/figma-pass-k-report.md); B-120 builds from it, with no field, column or control beyond the frames. The four SCOPE OPEN notes of that pass (confirmation step, host sidebar item, success message, link to User Detail) are settled only where the drawing settles them. B-119, B-120. (10) RESTRICTED MINORS. A restricted-pending minor may open pages by URL read-only; there is no front-end route block and the server still blocks every write (#370, #12). Confirms the shipped behaviour. B-026, B-125, B-076. (11) STATUS RESPONSE. The status response adds the guardian's first name and the last decision date, never the decline count. The founder did not name the response; the reading is the minor's GET /auth/guardian-consent/status. For the backend agent to confirm: how a first name is derived from the single full-name field (Option A, #393), what 'last decision' covers (decline, approval, withdrawal) and whether a column is needed (the schema has no decline timestamp). Build row B-131. (12) BLOCKED NOT-FOUND. A blocked user's not-found view is identical to the generic not-found view and to a non-existent profile (same page, same status; nothing reveals a block). Confirms #404/#396 and the Figma pass K frames. B-007, B-039, B-082, B-108. (13) GUARDIAN CONFIRM FOOTNOTE. The footnote 'Declining closes the account and schedules it for deletion' on the guardian confirm page is wrong for declines 1 and 2; it is replaced by the existing cap sentence addressed to the guardian, tagged [COPY PENDING LEGAL REVIEW]. The change alters guardian-visible wording, so CONSENT_SCREEN_VERSION is bumped (v3 to v4) with the tripwire hash (#348) and the pending-copy manifest row is replaced. Found while checking, NOT covered by the founder's wording: the page's post-decline state ('Your decision has been recorded ... will be scheduled for deletion') has the same fault. Build row B-130. (REGISTER) B-124 scope is apps/web and apps/admin only (as built); the services/api email wording tagged [COPY PENDING LEGAL REVIEW] is added to docs/pending-copy-manifest.md as OPEN (three templates tagged in code comments: guardian-approved-minor, the third-decline guardian-consent-declined, username-revoked; other child- and guardian-facing templates carry no tag). New rows B-127 to B-139: B-127 light theme, B-128 resend verification, B-129 User Detail without the DOB, B-130 guardian confirm footnote, B-131 status response fields, B-132 horizontal overflow at 390 px, B-133 Edit Profile username (never send null; show the error codes), B-134 real-API end-to-end smoke test, B-135 Figma approval-on-hold, B-136 Figma verify-email prompt, B-137 Figma guardian fields of the DOB correction, B-138 Figma general profile frames (plain other-user; own Posts, Media, Saved) that must exist before the four legacy profile frames 1455:4362, 1455:6626, 5702:8250 and 5778:8490 can be archived, B-139 RevokedUsername retention and appeal path (OPEN, no decision). Status lines on 27 register rows. 139 B-IDs; 146 gap frames unchanged. Arithmetic: docs/build-register.md Section 22. (FORWARD-POINTERS) Dated notes appended (original text unchanged) to #364, #367, #368, #369, #398, #402 and #404 (from docs/backend-w4-username-report.md section 7) and to #37, #389, #395 and #405 (points #406 amends or closes). NOT DECIDED HERE: the retention and appeal path of RevokedUsername (B-139, OPEN); the mechanics of item 1; the limits of item 3; the form of the DOB read in item 4; the final wording of item 7; the response and derivation in item 11; the post-decline state in item 13; whether the pending-copy guard is ever extended to services/api; counsel wording of every [COPY PENDING LEGAL REVIEW] string. [2026-10-18: Built in W3d (PR #424, docs/backend-w3d-report.md section 7), backend only: item 1 as B-126 (14 days counted from the new Guardian.consentDeclinedAt; the automatic re-send and the minor's warning come first; an expiry does not count among the three declines); item 3 as B-128 (POST /auth/resend-verification-email, unauthenticated and keyed by email, 5 per 60 s per IP plus 3 per hour per account, one response for every outcome); item 4 as B-129 (see #405); item 11 as B-131 (guardianFirstName and lastDecisionAt on the minor's status response, the decline count never returned). Frontend legs of items 3, 4, 11 and 13 are not built. Figma pass K2 (PR #425, docs/figma-pass-k2-report.md) drew B-135 to B-138 and archived the four legacy profile frames; its open candidates are rows B-144 to B-150. The QA end-to-end run (PR #426) checked items 3, 4 and 13 and measured the 390 px overflow: D-08, D-07, D-10 and D-11/D-12 map to B-128, B-129, B-130 and B-132; the other defects and gaps are mapped in docs/build-register.md Section 25 and recorded in #407.] [2026-10-19: Built since: item 2 (light theme), item 3 (the resend button), item 11 (the screens that show the guardian's first name and the decision date) and item 13 (the footnote replaced by the cap sentence, CONSENT_SCREEN_VERSION v4) by FC3a (PR #430); item 4 (User Detail on the summary read, the DOB only on the correction form, the reason-date message) and item 9 (the incorrect-details reports screen) by FC3b (PR #431). Register instruction on the general profile frames (B-138): Figma pass K3 (PR #428) found that K2's replacements were not diffed against their legacy twins; see #408 and B-170.] [2026-10-20: item 13: K4 (PR #433) replaced the old 'Declining keeps...' footnote with the cap sentence on the guardian frames; #410 item 6 makes the Figma footnote the reference and adds its link-expiry and withdrawal sentences to the code footnote, tagged (B-185).]</w:t>
             </w:r>
           </w:p>
         </w:tc>
@@ -27299,7 +27299,7 @@
           </w:tcPr>
           <w:p>
             <w:r>
-              <w:t>Resolved -- recorded. FOUNDER-ADOPTED DEFAULTS, VETO-ABLE, all seven items. DECIDED, NOT BUILT, except item 6, which confirms what is already built (W3d, PR #424). Item numbers are the order of the founder's instruction. Original text of every entry named in the forward-pointers below is unchanged (dated notes appended). Source: the QA run of PR #426 (docs/qa-e2e-onboarding-report.md): 165 browser tests against the real API, 17 defects (D-01 to D-17) and 3 gaps (G-1 to G-3). (1) CORS (QA D-01, BLOCKER / SAFEGUARDING). apps/web/src/api/auth.ts registerUser sends credentials 'include' and services/api/src/main.ts calls app.enableCors() with no options (it answers '*'); browsers refuse that combination, so sign-up fails in every browser when web and API are on different origins, as in production, and no request reaches the API. Decided: registerUser stops sending credentials 'include'; the API restricts CORS to the origins in WEB_APP_BASE_URL and a new ADMIN_APP_BASE_URL, plus localhost origins in development. The new variable is added to render.yaml (both services), .env.example and the env-completeness check; the founder sets its production value in Render. The API sets no cookie and returns the refresh token in the response body, so the credentials option appears to have no function (to confirm in the build PR). Not decided: what the API does when a variable is unset in production, and origins other than the two apps. Build row B-140 (W1). (2) AGE-5 FLOOR (QA D-02, BLOCKER / SAFEGUARDING). #19 says signup is hard-blocked below age 5 regardless of guardian consent, but the floor exists only in the web Age Gate: POST /auth/register with a date of birth 4 years ago and a valid guardian block returns 201 and creates the account and the guardian request. Decided: the floor is enforced server-side with a 400; exactly age 5 stays accepted. Not decided: the error code and message; the build PR checks the DOB-correction tool (#390) cannot set a date of birth below the floor. Build row B-141 (W1). (3) USERNAME FILTER (QA D-06). Hate and sexual terms glued to other letters (xxhitlerxx, nazifan) are accepted because the filter's EXACT list matches only the whole handle or an underscore token. Decided: long, unambiguous terms are matched by CONTAINS, with a tested list of innocent words that must still be accepted; short or ambiguous terms stay exact. Not decided: the term lists and the length threshold (set in the build PR, for founder review). Build row B-142 (W4). (4) 'FOLLOW' PROMISES (QA D-13). The restricted-pending view says 'Browse and follow' and the guardian page lists 'Follow teams and check scores', but a restricted-pending minor's follow is refused with 403 (#370). Decided: both screens stop promising follow and the wording says what works, tagged [COPY PENDING LEGAL REVIEW] and added to the pending-copy manifest; the guardian-page change is guardian-visible, so CONSENT_SCREEN_VERSION and the tripwire hash (#348) are bumped under the rule of B-130. The Figma frames are not checked here for the same promise. Build row B-154 (W9). (5) GUARDIAN APPROVAL SCREEN (QA D-09). After approval the guardian is told 'The account is now active', but the minor still has to verify email and create a profile. Decided: the screen no longer says the account is active; it says the approval is recorded and registration continues ([COPY PENDING LEGAL REVIEW]), matching the Figma Approved screens (#403 item 3). Build row B-153 (W9). (6) STALE-DECLINE RE-SEND STAYS. A guardian who declined at decline 1 or 2 is still sent a new consent request by the platform when the row lapses after 14 days (#406 item 1, built as B-126), after the minor is warned. This settles judgment call 1 of docs/backend-w3d-report.md (section 5). The alternative, warning the minor and closing after a further window without re-sending, stays a one-place change (GuardianStaleDeclineSweepService); the cap of three declines bounds the re-sends. Counsel review of legal copy v0.8 Part 4.4 is still pending. Rows B-126, B-102. (7) LEGACY SAVED FRAME. The Figma frame 1460:8940 (own Saved, absolute layout) is archived, now that 6747:29445 replaces it (Figma pass K2, candidate 2): hidden and renamed 'ARCHIVED - ...', nothing deleted, after a page-wide reference scan, and added to docs/figma-archive-index.md. Build row B-144 (W0). (REGISTER) docs/build-register.md Section 25: B-140 to B-162 added (23 rows); every QA defect and gap, every open item of the W3d report (section 6) and every K2 candidate (1-10) is mapped to a row, reused (B-120, B-128, B-129, B-130, B-131, B-132, B-133, B-134, B-078, B-138) or new. D-01 and D-02 are marked BLOCKER / SAFEGUARDING. Status lines on 23 existing rows. 162 B-IDs; 146 gap frames unchanged. Arithmetic: Section 25g. (FORWARD-POINTERS) Dated notes appended (original text unchanged) to #19, #199, #337, #338, #339, #340, #368, #369, #370, #377, #389, #395, #402, #403, #405 and #406 (the W3d report's section 7 pointers, the status of K2 and of the QA run). NOT DECIDED HERE: the behaviour when an origin variable is unset in production, and any further CORS origin; the error code of the 400; the term and innocent-word lists; the Figma side of the 'follow' promise; the post-decline state of the guardian confirm page (D-10, same fault as the footnote of #406 item 13, still not covered by the founder's wording); K2 candidates 1, 3, 4, 6, 7, 8 (register rows B-147 to B-150 are OPEN); the W3d open items on earlier verification links (B-160) and on a non-active account with a stale decline (B-161); counsel wording of every [COPY PENDING LEGAL REVIEW] string. [2026-10-19: Built since: items 1, 2 and 3 and the expired-consent email by backend/w3e (PR #429: B-140, B-141, B-142; the email half of B-158); items 4 and 5 and QA defects D-03 to D-05 and D-08 to D-17 by FC3a (PR #430; D-15 and D-17 in part); D-07, G-1 and G-2 by FC3b (PR #431); item 7 (the archive of 1460:8940) by Figma pass K3 (PR #428, B-144). The open point of item 1 (what the API does when an origin variable is unset in production) is decided by #408 item 1: it refuses to boot (B-163). Item 3 is amended by #408 item 3: the exact whole handles nazif, nazifa and nazifah are allowed (B-165) and the term lists W3e built stay open for review. The error code below_minimum_age and its message are W3e's choice and are still not confirmed. The QA harness's CORS proxy is gone (PR #429).] [2026-10-20: #409 item 1 fixes the origins the CORS allow-list names: WEB_APP_BASE_URL is the https origin of the web static site and ADMIN_APP_BASE_URL that of the admin static site, each separate from the API's own origin (B-179). Both must be set to the final https origins in production (the API refuses to boot otherwise, B-163). Nothing is deployed before the launch gate B-090.]</w:t>
+              <w:t>Resolved -- recorded. FOUNDER-ADOPTED DEFAULTS, VETO-ABLE, all seven items. DECIDED, NOT BUILT, except item 6, which confirms what is already built (W3d, PR #424). Item numbers are the order of the founder's instruction. Original text of every entry named in the forward-pointers below is unchanged (dated notes appended). Source: the QA run of PR #426 (docs/qa-e2e-onboarding-report.md): 165 browser tests against the real API, 17 defects (D-01 to D-17) and 3 gaps (G-1 to G-3). (1) CORS (QA D-01, BLOCKER / SAFEGUARDING). apps/web/src/api/auth.ts registerUser sends credentials 'include' and services/api/src/main.ts calls app.enableCors() with no options (it answers '*'); browsers refuse that combination, so sign-up fails in every browser when web and API are on different origins, as in production, and no request reaches the API. Decided: registerUser stops sending credentials 'include'; the API restricts CORS to the origins in WEB_APP_BASE_URL and a new ADMIN_APP_BASE_URL, plus localhost origins in development. The new variable is added to render.yaml (both services), .env.example and the env-completeness check; the founder sets its production value in Render. The API sets no cookie and returns the refresh token in the response body, so the credentials option appears to have no function (to confirm in the build PR). Not decided: what the API does when a variable is unset in production, and origins other than the two apps. Build row B-140 (W1). (2) AGE-5 FLOOR (QA D-02, BLOCKER / SAFEGUARDING). #19 says signup is hard-blocked below age 5 regardless of guardian consent, but the floor exists only in the web Age Gate: POST /auth/register with a date of birth 4 years ago and a valid guardian block returns 201 and creates the account and the guardian request. Decided: the floor is enforced server-side with a 400; exactly age 5 stays accepted. Not decided: the error code and message; the build PR checks the DOB-correction tool (#390) cannot set a date of birth below the floor. Build row B-141 (W1). (3) USERNAME FILTER (QA D-06). Hate and sexual terms glued to other letters (xxhitlerxx, nazifan) are accepted because the filter's EXACT list matches only the whole handle or an underscore token. Decided: long, unambiguous terms are matched by CONTAINS, with a tested list of innocent words that must still be accepted; short or ambiguous terms stay exact. Not decided: the term lists and the length threshold (set in the build PR, for founder review). Build row B-142 (W4). (4) 'FOLLOW' PROMISES (QA D-13). The restricted-pending view says 'Browse and follow' and the guardian page lists 'Follow teams and check scores', but a restricted-pending minor's follow is refused with 403 (#370). Decided: both screens stop promising follow and the wording says what works, tagged [COPY PENDING LEGAL REVIEW] and added to the pending-copy manifest; the guardian-page change is guardian-visible, so CONSENT_SCREEN_VERSION and the tripwire hash (#348) are bumped under the rule of B-130. The Figma frames are not checked here for the same promise. Build row B-154 (W9). (5) GUARDIAN APPROVAL SCREEN (QA D-09). After approval the guardian is told 'The account is now active', but the minor still has to verify email and create a profile. Decided: the screen no longer says the account is active; it says the approval is recorded and registration continues ([COPY PENDING LEGAL REVIEW]), matching the Figma Approved screens (#403 item 3). Build row B-153 (W9). (6) STALE-DECLINE RE-SEND STAYS. A guardian who declined at decline 1 or 2 is still sent a new consent request by the platform when the row lapses after 14 days (#406 item 1, built as B-126), after the minor is warned. This settles judgment call 1 of docs/backend-w3d-report.md (section 5). The alternative, warning the minor and closing after a further window without re-sending, stays a one-place change (GuardianStaleDeclineSweepService); the cap of three declines bounds the re-sends. Counsel review of legal copy v0.8 Part 4.4 is still pending. Rows B-126, B-102. (7) LEGACY SAVED FRAME. The Figma frame 1460:8940 (own Saved, absolute layout) is archived, now that 6747:29445 replaces it (Figma pass K2, candidate 2): hidden and renamed 'ARCHIVED - ...', nothing deleted, after a page-wide reference scan, and added to docs/figma-archive-index.md. Build row B-144 (W0). (REGISTER) docs/build-register.md Section 25: B-140 to B-162 added (23 rows); every QA defect and gap, every open item of the W3d report (section 6) and every K2 candidate (1-10) is mapped to a row, reused (B-120, B-128, B-129, B-130, B-131, B-132, B-133, B-134, B-078, B-138) or new. D-01 and D-02 are marked BLOCKER / SAFEGUARDING. Status lines on 23 existing rows. 162 B-IDs; 146 gap frames unchanged. Arithmetic: Section 25g. (FORWARD-POINTERS) Dated notes appended (original text unchanged) to #19, #199, #337, #338, #339, #340, #368, #369, #370, #377, #389, #395, #402, #403, #405 and #406 (the W3d report's section 7 pointers, the status of K2 and of the QA run). NOT DECIDED HERE: the behaviour when an origin variable is unset in production, and any further CORS origin; the error code of the 400; the term and innocent-word lists; the Figma side of the 'follow' promise; the post-decline state of the guardian confirm page (D-10, same fault as the footnote of #406 item 13, still not covered by the founder's wording); K2 candidates 1, 3, 4, 6, 7, 8 (register rows B-147 to B-150 are OPEN); the W3d open items on earlier verification links (B-160) and on a non-active account with a stale decline (B-161); counsel wording of every [COPY PENDING LEGAL REVIEW] string. [2026-10-19: Built since: items 1, 2 and 3 and the expired-consent email by backend/w3e (PR #429: B-140, B-141, B-142; the email half of B-158); items 4 and 5 and QA defects D-03 to D-05 and D-08 to D-17 by FC3a (PR #430; D-15 and D-17 in part); D-07, G-1 and G-2 by FC3b (PR #431); item 7 (the archive of 1460:8940) by Figma pass K3 (PR #428, B-144). The open point of item 1 (what the API does when an origin variable is unset in production) is decided by #408 item 1: it refuses to boot (B-163). Item 3 is amended by #408 item 3: the exact whole handles nazif, nazifa and nazifah are allowed (B-165) and the term lists W3e built stay open for review. The error code below_minimum_age and its message are W3e's choice and are still not confirmed. The QA harness's CORS proxy is gone (PR #429).] [2026-10-20: #409 item 1 fixes the origins the CORS allow-list names: WEB_APP_BASE_URL is the https origin of the web static site and ADMIN_APP_BASE_URL that of the admin static site, each separate from the API's own origin (B-179). Both must be set to the final https origins in production (the API refuses to boot otherwise, B-163). Nothing is deployed before the launch gate B-090.] [2026-10-20: the #409 note above merged in PR #436 (A7). W3f (PR #434) built the boot refusal for an unset or invalid origin variable (the open point of item 1, B-163) and the Nazif allow-list (item 3, B-165); #410 item 2 changes the allow-list rule (B-181). Item 4: the Restricted Pending frames 5108:6630 / 5531:7461 still carry the 'Browse and follow' wording the code dropped (D-13); K5 fixes them (B-191, #410 item 8).]</w:t>
             </w:r>
           </w:p>
         </w:tc>
@@ -27341,7 +27341,7 @@
           </w:tcPr>
           <w:p>
             <w:r>
-              <w:t>Resolved -- recorded. FOUNDER-ADOPTED DEFAULTS, VETO-ABLE, all eight items. DECIDED, NOT BUILT, except item 7, which confirms what is already built (PRs #428, #430, #431). Item numbers are the order of the founder's instruction. Original text of every entry named in the forward-pointers below is unchanged (dated notes appended). Sources: the open points of backend/w3e (PR #429), FC3a (PR #430), FC3b (PR #431) and Figma pass K3 (PR #428). (1) PRODUCTION BOOT CHECK (settles the open point of #407 item 1). W3e built CORS fail-closed with a boot log: an unset, non-URL, placeholder or (in production) unusable WEB_APP_BASE_URL or ADMIN_APP_BASE_URL contributes no origin and a [cors] line is logged, but the API still starts, so a bad production deploy comes up healthy and no browser can call it. Decided: in production the same condition refuses to boot, through assertProductionEnv (services/api/src/validate-runtime-env.ts), the way a missing or placeholder JWT_SECRET or ADMIN_JWT_SECRET already does (B-018). Outside production nothing changes (log only, localhost allowed). The build reuses the test cors-options.ts already applies and does not write a second one. Render sets NODE_ENV=production at runtime on both services, so staging is covered as well and each service needs both values before its next deploy (to confirm in the build PR). Not decided: origins other than the two apps (preview deployments, a mobile web view). Build row B-163 (W1). (2) CROSS-TAB REFRESH LOCK. The refresh token rotates and the server treats a second use of an old token as reuse; apps/web/src/lib/silentRefresh.ts is single-flight inside one tab only, so two open tabs that refresh together can log the person out. W3e found it when a test went intermittent and worked around it in that one test; it is not a test problem. Decided: a cross-tab lock so only one tab calls POST /auth/refresh at a time; the other tabs wait and then use the tokens the first tab stored. The alternative W3e named, a short server-side reuse grace, is not chosen and the server's reuse detection is unchanged. Not decided: the mechanism (Web Locks API, a storage-based lock or a BroadcastChannel); the build PR picks it and states its fallback. Build row B-164 (W9). (3) USERNAME FILTER (extends #407 item 3). Decided: the exact whole handles nazif, nazifa and nazifah are allowed (real given names; W3e refused them because they cannot be told from nazi + fan); nazifan and every other glued form stay refused. HOW: they are an exact allow-list of whole handles checked before the CONTAINS rule, not substring exceptions. Adding nazif to the named innocent exceptions of the nazi rule would cut it out of nazifan, leave 'an', and accept it. Handles that only contain a name (nazif_10, nazifa2, xxnazifxx) are not covered by this decision; under the adopted reading they stay refused; whether suffixes should be accepted is not decided. RECORDED AS BUILT AND LEFT OPEN FOR THE FOUNDER'S REVIEW, verbatim from docs/backend-w3e-report.md (D-06): CONTAINS, 5+ letters and unambiguous: hitler, pussy, paedo, swastika, whitepower, gangbang, deepthroat, creampie, orgasm, masturbat, erotic. nazi is four letters and sits in real names, so it is CONTAINS with named innocent exceptions (nazir, nazim, nazia, nazih, nazik): those are cut out, the rest is searched; nazifan, xxnazixx and nazirnazi are refused, nazir_10 is accepted. Short or ambiguous terms stay exact: dick, cock, rape, ass, sex, sexy, anal, cum, pedo, isis, kkk, twat, wank, ... (the report's list ends with '...'; the full exact list is PROFANITY_EXACT in services/api/src/modules/users/username-rules.constants.ts: dick, cock, anal, anus, sex, sexy, rape, nazi, kkk, isis, pedo, tits, boobs, ass, arse, twat, wank, cum, nude, nudes). Tested: 18 glued or leet refusals, guarded-term cases, short-term-exact cases and a 37-handle innocent list (Essex, Sussex, Hancock, Hitchcock, Peacock, Dickson, Nazir, Torpedo, ...). Known false positives unchanged and deliberately not in the list: scunthorpe, penistone, therapist. The 5-letter threshold, every list above and the innocent list are W3e's adopted defaults; none is decided here. The older CONTAINS terms from B-032 (fuck, shit, ... terrorist) are outside this review. Build row B-165 (W4). (4) SEMANTIC/ALERT IN CODE. Decision Log #99 authorised semantic/alert (#FA0606, Light = Dark) in Figma only, as a deliberate exception to non-negotiable #3 (loss, destructive or alert colour only). Decided: the token is authorised in apps/web and apps/admin for error callouts. Adopted reading, veto-able: the colour is the non-text accent (bar, border, icon) of an error callout, not text colour and not a button fill, because the Settings rebuild (PR #116) measured white on semantic/alert at 4.12:1, below AA; error text stays navy. Not covered and left as they are: the Grassroots LIVE indicator and the notification unread dot (brand green), destructive buttons (navy). CLAUDE.md non-negotiable #3 is not rewritten; #99 and this entry are the recorded exception for code. Build row B-166 (W9). (5) REVOKE USERNAME HOLD LINE (admin-facing only). The three Revoke username frames (dialog 6647:25789, success 6649:24462, error 6649:24714) say only what is removed. Decided: the frames and the dialog gain a line saying the username is held for 30 days (the backend already holds a revoked handle for 30 days for everyone, #402 item 3, and the response carries heldUntil). Admin-facing only: the email to the revoked user and every user-facing screen are unchanged. Adopted reading, veto-able: the line goes in the dialog and the success frame; the error frame gets none because it says nothing was changed. Not decided: the exact wording (set in the Figma pass), whether the success frame shows the date from heldUntil, and whether the line takes [COPY PENDING LEGAL REVIEW] (the existing dialog body already does). Build rows B-167 (Figma, W0), B-168 (apps/admin, W9). (6) POST-DECLINE CLAUSE TAGGED. The guardian page's declined state says 'You have declined permission for this account, so it stays switched off.' That clause is not founder wording, was not tagged by FC3a, and #406 does not cover the state. Decided: it is tagged [COPY PENDING LEGAL REVIEW] and gets a docs/pending-copy-manifest.md row. Consequence for the build, not a decision: the tag is part of the guardian-visible text the tripwire hashes, so CONSENT_SCREEN_VERSION and CONSENT_SCREEN_TEXT_HASH must be bumped in the same PR (#348); the manifest row is added with the tag, never before it (the inventory test fails on a row with no matching string), so this docs pass does NOT add it. Build row B-169 (W9). (7) KEPT AS BUILT (confirms what exists; no build row): (a) the link on the Users list that opens the incorrect-details reports screen (FC3b added it outside the frames; the frames left the entry point SCOPE OPEN); (b) the one-row 'Copy Profile Link' menu on the own Saved frame 6747:29445 (K3 open point 1); (c) the hidden K2 column 6747:29556 inside 6747:29445 stays until the launch gate, then is deleted with the other hidden ARCHIVED originals (B-090); (d) the revocation history (usernameRevocations in the user summary) stays not shown. (8) Mobile header: signed in, the mobile header follows the Figma header (logo, search field, avatar that opens the Navigation Drawer) and the nine-icon row is removed (FC3a left it in; QA B-132 note updated). Logged out, Figma draws no navigation; K4 draws a logged-out mobile navigation (a menu control opening a drawer with the public sections plus Login and Sign up) and FC4 builds it. Until FC4 merges, logged-out visitors keep the scrolling icon row. Build row B-178 (W9; FC4 depends on both this PR and K4). (K3 FINDING, recorded, not a decision) Figma pass K3 rebuilt the own Saved desktop frame 6747:29445 after finding that K2's version was a single-column simplification of the legacy frame 1460:8940, because K2 checked counts and bounds only. The K2 replacement frames 6747:28894 (other user, Posts), 6747:29094 (own, Posts) and 6747:29291 (own, Media) were not diffed against their legacy twins and very likely carry the same simplifications; their twins 1455:4362 and 1455:6626 were archived on K2's say-so. The K2 claim that B-138 closes on the design side therefore does not hold for those three frames. The fix is a diff-first pass, K4, that does what K3 did and leaves the legacy frames archived (nothing deleted). Build row B-170 (W0). (REGISTER) docs/build-register.md Sections 27 and 28: B-163 to B-178 added (16 rows); items 1 to 6, item 8 and the K3 finding each have a row; the W3d items not built map to B-160 and B-161 (already rows, reused, no duplicate), B-171 and B-172 (new, OPEN); the apps/admin developer notes are B-173; the mobile verify-prompt and Club Picker comparisons are B-174 and B-175; the guardian confirm layout is B-176; B-177 (the guardian frames that still say 'follow') is added beyond the founder's list because FC3a records it as open and no row owned it. Status lines on 26 existing rows (B-132 gets a note under item 8). 178 B-IDs; 146 gap frames unchanged. Arithmetic: Sections 27e and 28b. (FORWARD-POINTERS) Dated notes appended (original text unchanged) to #19, #99, #348, #369, #377, #389, #390, #395, #396, #398, #402, #403, #406 and #407 (what W3e, FC3a, FC3b and K3 built or found). NOT DECIDED HERE: the wording and the list of public sections of the logged-out mobile drawer (item 8); origins other than the two apps; the lock mechanism; whether handles that merely contain nazif, nazifa or nazifah are accepted; every term list, the 5-letter threshold and the innocent list; any use of semantic/alert beyond error callouts and its use as text colour; the wording of the hold line, its date and its tag; the final wording of the post-decline clause (counsel); which legacy twin belongs to which K2 frame; the error code below_minimum_age and its message (W3e's choice, still not confirmed since #407); the open W3d items B-160, B-161, B-171 and B-172; whether the Figma frames carry the same fixes (B-177); counsel wording of every [COPY PENDING LEGAL REVIEW] string.</w:t>
+              <w:t>Resolved -- recorded. FOUNDER-ADOPTED DEFAULTS, VETO-ABLE, all eight items. DECIDED, NOT BUILT, except item 7, which confirms what is already built (PRs #428, #430, #431). Item numbers are the order of the founder's instruction. Original text of every entry named in the forward-pointers below is unchanged (dated notes appended). Sources: the open points of backend/w3e (PR #429), FC3a (PR #430), FC3b (PR #431) and Figma pass K3 (PR #428). (1) PRODUCTION BOOT CHECK (settles the open point of #407 item 1). W3e built CORS fail-closed with a boot log: an unset, non-URL, placeholder or (in production) unusable WEB_APP_BASE_URL or ADMIN_APP_BASE_URL contributes no origin and a [cors] line is logged, but the API still starts, so a bad production deploy comes up healthy and no browser can call it. Decided: in production the same condition refuses to boot, through assertProductionEnv (services/api/src/validate-runtime-env.ts), the way a missing or placeholder JWT_SECRET or ADMIN_JWT_SECRET already does (B-018). Outside production nothing changes (log only, localhost allowed). The build reuses the test cors-options.ts already applies and does not write a second one. Render sets NODE_ENV=production at runtime on both services, so staging is covered as well and each service needs both values before its next deploy (to confirm in the build PR). Not decided: origins other than the two apps (preview deployments, a mobile web view). Build row B-163 (W1). (2) CROSS-TAB REFRESH LOCK. The refresh token rotates and the server treats a second use of an old token as reuse; apps/web/src/lib/silentRefresh.ts is single-flight inside one tab only, so two open tabs that refresh together can log the person out. W3e found it when a test went intermittent and worked around it in that one test; it is not a test problem. Decided: a cross-tab lock so only one tab calls POST /auth/refresh at a time; the other tabs wait and then use the tokens the first tab stored. The alternative W3e named, a short server-side reuse grace, is not chosen and the server's reuse detection is unchanged. Not decided: the mechanism (Web Locks API, a storage-based lock or a BroadcastChannel); the build PR picks it and states its fallback. Build row B-164 (W9). (3) USERNAME FILTER (extends #407 item 3). Decided: the exact whole handles nazif, nazifa and nazifah are allowed (real given names; W3e refused them because they cannot be told from nazi + fan); nazifan and every other glued form stay refused. HOW: they are an exact allow-list of whole handles checked before the CONTAINS rule, not substring exceptions. Adding nazif to the named innocent exceptions of the nazi rule would cut it out of nazifan, leave 'an', and accept it. Handles that only contain a name (nazif_10, nazifa2, xxnazifxx) are not covered by this decision; under the adopted reading they stay refused; whether suffixes should be accepted is not decided. RECORDED AS BUILT AND LEFT OPEN FOR THE FOUNDER'S REVIEW, verbatim from docs/backend-w3e-report.md (D-06): CONTAINS, 5+ letters and unambiguous: hitler, pussy, paedo, swastika, whitepower, gangbang, deepthroat, creampie, orgasm, masturbat, erotic. nazi is four letters and sits in real names, so it is CONTAINS with named innocent exceptions (nazir, nazim, nazia, nazih, nazik): those are cut out, the rest is searched; nazifan, xxnazixx and nazirnazi are refused, nazir_10 is accepted. Short or ambiguous terms stay exact: dick, cock, rape, ass, sex, sexy, anal, cum, pedo, isis, kkk, twat, wank, ... (the report's list ends with '...'; the full exact list is PROFANITY_EXACT in services/api/src/modules/users/username-rules.constants.ts: dick, cock, anal, anus, sex, sexy, rape, nazi, kkk, isis, pedo, tits, boobs, ass, arse, twat, wank, cum, nude, nudes). Tested: 18 glued or leet refusals, guarded-term cases, short-term-exact cases and a 37-handle innocent list (Essex, Sussex, Hancock, Hitchcock, Peacock, Dickson, Nazir, Torpedo, ...). Known false positives unchanged and deliberately not in the list: scunthorpe, penistone, therapist. The 5-letter threshold, every list above and the innocent list are W3e's adopted defaults; none is decided here. The older CONTAINS terms from B-032 (fuck, shit, ... terrorist) are outside this review. Build row B-165 (W4). (4) SEMANTIC/ALERT IN CODE. Decision Log #99 authorised semantic/alert (#FA0606, Light = Dark) in Figma only, as a deliberate exception to non-negotiable #3 (loss, destructive or alert colour only). Decided: the token is authorised in apps/web and apps/admin for error callouts. Adopted reading, veto-able: the colour is the non-text accent (bar, border, icon) of an error callout, not text colour and not a button fill, because the Settings rebuild (PR #116) measured white on semantic/alert at 4.12:1, below AA; error text stays navy. Not covered and left as they are: the Grassroots LIVE indicator and the notification unread dot (brand green), destructive buttons (navy). CLAUDE.md non-negotiable #3 is not rewritten; #99 and this entry are the recorded exception for code. Build row B-166 (W9). (5) REVOKE USERNAME HOLD LINE (admin-facing only). The three Revoke username frames (dialog 6647:25789, success 6649:24462, error 6649:24714) say only what is removed. Decided: the frames and the dialog gain a line saying the username is held for 30 days (the backend already holds a revoked handle for 30 days for everyone, #402 item 3, and the response carries heldUntil). Admin-facing only: the email to the revoked user and every user-facing screen are unchanged. Adopted reading, veto-able: the line goes in the dialog and the success frame; the error frame gets none because it says nothing was changed. Not decided: the exact wording (set in the Figma pass), whether the success frame shows the date from heldUntil, and whether the line takes [COPY PENDING LEGAL REVIEW] (the existing dialog body already does). Build rows B-167 (Figma, W0), B-168 (apps/admin, W9). (6) POST-DECLINE CLAUSE TAGGED. The guardian page's declined state says 'You have declined permission for this account, so it stays switched off.' That clause is not founder wording, was not tagged by FC3a, and #406 does not cover the state. Decided: it is tagged [COPY PENDING LEGAL REVIEW] and gets a docs/pending-copy-manifest.md row. Consequence for the build, not a decision: the tag is part of the guardian-visible text the tripwire hashes, so CONSENT_SCREEN_VERSION and CONSENT_SCREEN_TEXT_HASH must be bumped in the same PR (#348); the manifest row is added with the tag, never before it (the inventory test fails on a row with no matching string), so this docs pass does NOT add it. Build row B-169 (W9). (7) KEPT AS BUILT (confirms what exists; no build row): (a) the link on the Users list that opens the incorrect-details reports screen (FC3b added it outside the frames; the frames left the entry point SCOPE OPEN); (b) the one-row 'Copy Profile Link' menu on the own Saved frame 6747:29445 (K3 open point 1); (c) the hidden K2 column 6747:29556 inside 6747:29445 stays until the launch gate, then is deleted with the other hidden ARCHIVED originals (B-090); (d) the revocation history (usernameRevocations in the user summary) stays not shown. (8) Mobile header: signed in, the mobile header follows the Figma header (logo, search field, avatar that opens the Navigation Drawer) and the nine-icon row is removed (FC3a left it in; QA B-132 note updated). Logged out, Figma draws no navigation; K4 draws a logged-out mobile navigation (a menu control opening a drawer with the public sections plus Login and Sign up) and FC4 builds it. Until FC4 merges, logged-out visitors keep the scrolling icon row. Build row B-178 (W9; FC4 depends on both this PR and K4). (K3 FINDING, recorded, not a decision) Figma pass K3 rebuilt the own Saved desktop frame 6747:29445 after finding that K2's version was a single-column simplification of the legacy frame 1460:8940, because K2 checked counts and bounds only. The K2 replacement frames 6747:28894 (other user, Posts), 6747:29094 (own, Posts) and 6747:29291 (own, Media) were not diffed against their legacy twins and very likely carry the same simplifications; their twins 1455:4362 and 1455:6626 were archived on K2's say-so. The K2 claim that B-138 closes on the design side therefore does not hold for those three frames. The fix is a diff-first pass, K4, that does what K3 did and leaves the legacy frames archived (nothing deleted). Build row B-170 (W0). (REGISTER) docs/build-register.md Sections 27 and 28: B-163 to B-178 added (16 rows); items 1 to 6, item 8 and the K3 finding each have a row; the W3d items not built map to B-160 and B-161 (already rows, reused, no duplicate), B-171 and B-172 (new, OPEN); the apps/admin developer notes are B-173; the mobile verify-prompt and Club Picker comparisons are B-174 and B-175; the guardian confirm layout is B-176; B-177 (the guardian frames that still say 'follow') is added beyond the founder's list because FC3a records it as open and no row owned it. Status lines on 26 existing rows (B-132 gets a note under item 8). 178 B-IDs; 146 gap frames unchanged. Arithmetic: Sections 27e and 28b. (FORWARD-POINTERS) Dated notes appended (original text unchanged) to #19, #99, #348, #369, #377, #389, #390, #395, #396, #398, #402, #403, #406 and #407 (what W3e, FC3a, FC3b and K3 built or found). NOT DECIDED HERE: the wording and the list of public sections of the logged-out mobile drawer (item 8); origins other than the two apps; the lock mechanism; whether handles that merely contain nazif, nazifa or nazifah are accepted; every term list, the 5-letter threshold and the innocent list; any use of semantic/alert beyond error callouts and its use as text colour; the wording of the hold line, its date and its tag; the final wording of the post-decline clause (counsel); which legacy twin belongs to which K2 frame; the error code below_minimum_age and its message (W3e's choice, still not confirmed since #407); the open W3d items B-160, B-161, B-171 and B-172; whether the Figma frames carry the same fixes (B-177); counsel wording of every [COPY PENDING LEGAL REVIEW] string. [2026-10-20: built since: items 1 and 3 by W3f (PR #434: B-163 boot refusal, B-165 allow-list); items 2, 4, 5, 6 and 8 by FC4 (PR #435: B-164 cross-tab lock, B-166 semantic/alert for admin error callouts, B-168 hold line, B-169 tagged clause with CONSENT_SCREEN_VERSION v5, B-178 mobile header and the logged-out drawer, built to the K4 frames). K4 (PR #433, B-170): the three K2 profile frames were diffed and rebuilt; its OPEN items are decided or tracked in #410. #410 amends item 3 (allow-list rule, B-181), approves item 5's wording as built, keeps item 7 as built (the one-row Copy Profile Link menu now also on own Posts; the hidden K2 columns until the launch gate), and records item 2's same-tab case as a known limitation (B-182).]</w:t>
             </w:r>
           </w:p>
         </w:tc>
@@ -27383,7 +27383,49 @@
           </w:tcPr>
           <w:p>
             <w:r>
-              <w:t>Resolved -- recorded. FOUNDER-ADOPTED DEFAULTS, VETO-ABLE, all three items. DECIDED, NOT BUILT, and DEFERRED to the launch gate B-090. Item numbers are the order of the founder's instruction. Original text of every entry named in the forward-pointers below is unchanged (dated notes appended). render.yaml and docs/deployment.md are NOT changed by the PR that records this entry. (1) HOSTING SHAPE ON RENDER. apps/web and apps/admin are deployed separately from each other and from the API, as three Render services per environment: the API (the web service defined in render.yaml), the web app (a static site) and the admin app (a static site), each on its own https origin (for example the main domain or www for web, an admin subdomain for admin, an api subdomain for the API; the final names are not decided). Reasons recorded by the founder: the admin bundle is never served to the public; admin can later be restricted (for example by IP; not designed); and it matches the separate CORS origins (WEB_APP_BASE_URL, ADMIN_APP_BASE_URL, #407) and the separate admin auth domain (ADMIN_JWT_SECRET). Each static site needs VITE_API_BASE_URL set to the API's https address at BUILD time (baked into the build; a change means a rebuild), a rewrite rule sending every path to index.html (single-page apps), and the web build must use npm run build:release so the pending-copy release check runs. The API's WEB_APP_BASE_URL and ADMIN_APP_BASE_URL must be set to the final https origins (in production the API refuses to boot on an unset or invalid one, #408 item 1, B-163). Staging gets the same three services. Checked in the repo on 2026-10-20: render.yaml defines only the two API services (soccernity-api-staging, soccernity-api); the static sites are NOT defined in render.yaml, docs/deployment.md or any workflow; apps/web and apps/admin both read VITE_API_BASE_URL; build:release is a ROOT script that builds both apps and then runs check:pending-copy over apps/web/dist and apps/admin/dist, and that check fails today by design until counsel clears the tagged strings (B-124), so how the two sites' build commands use it is for the build row (B-179) to choose and state. (2) THIS STAYS DEFERRED to the launch gate (B-090). The founder is saving money; Render and production wiring are not pushed before then (restates #403 item 18 and extends it to the two static sites). (3) LAUNCH-GATE RUNBOOK. When the launch gate starts, one deliverable is produced: a complete, plain-language, step-by-step deployment and migration guide for a non-technical founder covering every part of the platform, so nothing needs back-and-forth. Planned file docs/launch-gate-runbook.md (the format may change to a Docs artifact; decided then). It is written at the launch gate from the repo and the vendors' current documentation as they are then, never from memory, and it supersedes and links docs/deployment.md. Its required scope, recorded now so nothing is lost: a glossary of every term; what the founder does versus what an agent does versus what needs counsel; the order of operations; for each part the exact click-by-click steps, which value goes in which setting, how to check it worked and what to do if it did not: Neon production and staging databases and branches, running the migrations (including the free-plan pre-deploy limitation) and the DOB backfill; Upstash Redis; generating and storing every secret (JWT_SECRET, ADMIN_JWT_SECRET, DOB_ENCRYPTION_KEY - one key protects both the date of birth and the 2FA secrets, #405 item 8 - per environment, with the loss-and-rollback implications from docs/dob-encryption-rollback.md); the API service on Render and its health check; the web and admin static sites (build command, publish directory, VITE_API_BASE_URL, rewrite rule, the build:release gate); custom domains, DNS and https for all three; CORS origins; Postmark (account, sender domain, SPF/DKIM/DMARC, the email templates and the counsel-pending wording); MaxMind GeoLite2 (account id, licence key, what happens without it); Stripe (live keys, webhook, the card-verification flow); Cloudflare R2 media storage (bucket, keys, the public base URL gap); the Highlightly sports data key and daily budget; Sentry; creating the first superadmin and admin accounts; branch and release strategy (staging versus main); the pending-copy release check and counsel sign-off; legal pages, DPIA and safeguarding sign-off items still open at that time; backups, monitoring and alerting; a post-deploy smoke test (the QA suite against staging, then production); rollback for each part; ongoing monthly costs; and a final go/no-go checklist. It must list every launch-gate item still open in docs/build-register.md at that time so none is dropped. (REGISTER) New rows B-179 (render.yaml and docs/deployment.md gain the two static sites for staging and production with the settings of item 1; owner backend-api; launch gate; DEFERRED; depends on B-090) and B-180 (the launch-gate runbook with the scope of item 3; owner docs agent; launch gate; DEFERRED; depends on B-179 and on every open launch-gate row); status lines on B-090 (asked for) and B-088 (added: B-088 is the generic hosting row, B-179 its repo-side definition; B-088 stays open for the account and domain side). Dated notes appended to #26 (hosting), #403 (the row that records the production-wiring deferral, item 18) and #407 (CORS origins). STILL OPEN: the final domain and subdomain names; the Render plan and monthly cost of two static sites per environment; how the two sites' build commands use build:release and how a failing release check stops a Render deploy (to be confirmed from Render's current documentation at the gate); whether and how admin is later restricted; the runbook's format; whether 'docs agent' (not among the eight agents in .claude/agents/) means the session that writes it.</w:t>
+              <w:t>Resolved -- recorded. FOUNDER-ADOPTED DEFAULTS, VETO-ABLE, all three items. DECIDED, NOT BUILT, and DEFERRED to the launch gate B-090. Item numbers are the order of the founder's instruction. Original text of every entry named in the forward-pointers below is unchanged (dated notes appended). render.yaml and docs/deployment.md are NOT changed by the PR that records this entry. (1) HOSTING SHAPE ON RENDER. apps/web and apps/admin are deployed separately from each other and from the API, as three Render services per environment: the API (the web service defined in render.yaml), the web app (a static site) and the admin app (a static site), each on its own https origin (for example the main domain or www for web, an admin subdomain for admin, an api subdomain for the API; the final names are not decided). Reasons recorded by the founder: the admin bundle is never served to the public; admin can later be restricted (for example by IP; not designed); and it matches the separate CORS origins (WEB_APP_BASE_URL, ADMIN_APP_BASE_URL, #407) and the separate admin auth domain (ADMIN_JWT_SECRET). Each static site needs VITE_API_BASE_URL set to the API's https address at BUILD time (baked into the build; a change means a rebuild), a rewrite rule sending every path to index.html (single-page apps), and the web build must use npm run build:release so the pending-copy release check runs. The API's WEB_APP_BASE_URL and ADMIN_APP_BASE_URL must be set to the final https origins (in production the API refuses to boot on an unset or invalid one, #408 item 1, B-163). Staging gets the same three services. Checked in the repo on 2026-10-20: render.yaml defines only the two API services (soccernity-api-staging, soccernity-api); the static sites are NOT defined in render.yaml, docs/deployment.md or any workflow; apps/web and apps/admin both read VITE_API_BASE_URL; build:release is a ROOT script that builds both apps and then runs check:pending-copy over apps/web/dist and apps/admin/dist, and that check fails today by design until counsel clears the tagged strings (B-124), so how the two sites' build commands use it is for the build row (B-179) to choose and state. (2) THIS STAYS DEFERRED to the launch gate (B-090). The founder is saving money; Render and production wiring are not pushed before then (restates #403 item 18 and extends it to the two static sites). (3) LAUNCH-GATE RUNBOOK. When the launch gate starts, one deliverable is produced: a complete, plain-language, step-by-step deployment and migration guide for a non-technical founder covering every part of the platform, so nothing needs back-and-forth. Planned file docs/launch-gate-runbook.md (the format may change to a Docs artifact; decided then). It is written at the launch gate from the repo and the vendors' current documentation as they are then, never from memory, and it supersedes and links docs/deployment.md. Its required scope, recorded now so nothing is lost: a glossary of every term; what the founder does versus what an agent does versus what needs counsel; the order of operations; for each part the exact click-by-click steps, which value goes in which setting, how to check it worked and what to do if it did not: Neon production and staging databases and branches, running the migrations (including the free-plan pre-deploy limitation) and the DOB backfill; Upstash Redis; generating and storing every secret (JWT_SECRET, ADMIN_JWT_SECRET, DOB_ENCRYPTION_KEY - one key protects both the date of birth and the 2FA secrets, #405 item 8 - per environment, with the loss-and-rollback implications from docs/dob-encryption-rollback.md); the API service on Render and its health check; the web and admin static sites (build command, publish directory, VITE_API_BASE_URL, rewrite rule, the build:release gate); custom domains, DNS and https for all three; CORS origins; Postmark (account, sender domain, SPF/DKIM/DMARC, the email templates and the counsel-pending wording); MaxMind GeoLite2 (account id, licence key, what happens without it); Stripe (live keys, webhook, the card-verification flow); Cloudflare R2 media storage (bucket, keys, the public base URL gap); the Highlightly sports data key and daily budget; Sentry; creating the first superadmin and admin accounts; branch and release strategy (staging versus main); the pending-copy release check and counsel sign-off; legal pages, DPIA and safeguarding sign-off items still open at that time; backups, monitoring and alerting; a post-deploy smoke test (the QA suite against staging, then production); rollback for each part; ongoing monthly costs; and a final go/no-go checklist. It must list every launch-gate item still open in docs/build-register.md at that time so none is dropped. (REGISTER) New rows B-179 (render.yaml and docs/deployment.md gain the two static sites for staging and production with the settings of item 1; owner backend-api; launch gate; DEFERRED; depends on B-090) and B-180 (the launch-gate runbook with the scope of item 3; owner docs agent; launch gate; DEFERRED; depends on B-179 and on every open launch-gate row); status lines on B-090 (asked for) and B-088 (added: B-088 is the generic hosting row, B-179 its repo-side definition; B-088 stays open for the account and domain side). Dated notes appended to #26 (hosting), #403 (the row that records the production-wiring deferral, item 18) and #407 (CORS origins). STILL OPEN: the final domain and subdomain names; the Render plan and monthly cost of two static sites per environment; how the two sites' build commands use build:release and how a failing release check stops a Render deploy (to be confirmed from Render's current documentation at the gate); whether and how admin is later restricted; the runbook's format; whether 'docs agent' (not among the eight agents in .claude/agents/) means the session that writes it. [2026-10-20: merged in PR #436 (A7).]</w:t>
+            </w:r>
+          </w:p>
+        </w:tc>
+      </w:tr>
+      <w:tr>
+        <w:tc>
+          <w:tcPr>
+            <w:tcW w:type="dxa" w:w="500"/>
+          </w:tcPr>
+          <w:p>
+            <w:r>
+              <w:t>410</w:t>
+            </w:r>
+          </w:p>
+        </w:tc>
+        <w:tc>
+          <w:tcPr>
+            <w:tcW w:type="dxa" w:w="4700"/>
+          </w:tcPr>
+          <w:p>
+            <w:r>
+              <w:t>Founder decisions 2026-10-20 (second set) on the open points of W3f, K4 and FC4 (8 items): (1) the Revoke username 30-day hold wording is approved as built, no tag, admin-facing (dialog and error frames: 'The username is held for 30 days after it is revoked: nobody can take it, and this user cannot choose it again.'; revoked banner: 'Username revoked. The action was recorded. The username is held for 30 days.'); (2) the username allow-list becomes an exact match on the handle as typed (case-insensitive, no underscore variants) for nazif, nazifa and nazifah, plus the name followed only by digits (nazifa2, nazif_10); nazifan and any other letters stay refused; (3) the same-tab refresh race (navigating while a rotation is in flight can lose the response and sign the user out; seen in 3 of 8 runs of the 06 test) is recorded as a KNOWN LIMITATION, not fixed, to revisit with real usage, and no grace window is added; (4) the Figma components header 7 - mobile and Navigation Drawer - Mobile may be edited to add a Logged Out variant, and the logged-out drawer lists Sports Hub, Blog, Scouting, Academy plus Login and Sign up, as built; (5) the mobile profile sample values are aligned to the desktop family (@nelson_iheagwam, 5,500 Following, no posts count); (6) the Figma guardian-confirm footnote is the reference: the code adds the link-expiry and withdrawal sentences, tagged [COPY PENDING LEGAL REVIEW]; (7) kept as built: the one-row Copy Profile Link menu on own Posts, the hidden K2 columns until the launch gate, navy admin error callouts where the frames draw no red, and the logged-out search icon opening /search; (8) correction of record: the Restricted Pending frames 5108:6630 / 5531:7461 still say 'Browse and follow' / 'Set up your profile' because the K4 brief did not list them; K5 fixes them.</w:t>
+            </w:r>
+          </w:p>
+        </w:tc>
+        <w:tc>
+          <w:tcPr>
+            <w:tcW w:type="dxa" w:w="1850"/>
+          </w:tcPr>
+          <w:p>
+            <w:r>
+              <w:t>docs/decisions-founder-2026-10-20 (docs only, 2026-10-20; founder decisions 2026-10-20, items 1-8; sources docs/backend-w3f-report.md (PR #434), docs/figma-pass-k4-report.md (PR #433), docs/fc4-report.md (PR #435); docs/build-register.md Section 30, CLAUDE.md)</w:t>
+            </w:r>
+          </w:p>
+        </w:tc>
+        <w:tc>
+          <w:tcPr>
+            <w:tcW w:type="dxa" w:w="2300"/>
+          </w:tcPr>
+          <w:p>
+            <w:r>
+              <w:t>Decided 2026-10-20 (founder-adopted defaults, veto-able). Items 1 and 7 confirm what is built (FC4, PR #435); items 2-6 and 8 are DECIDED, NOT BUILT. Docs only: no code, Figma, legal copy, DPIA or Log Book. (REGISTER) docs/build-register.md Section 30: new rows B-181 (username allow-list v2, item 2), B-182 (refresh race known limitation, item 3), B-183 (Figma Logged Out variants, item 4), B-184 (mobile sample values, item 5), B-185 (guardian footnote in code, item 6), B-191 (K5 Restricted Pending frames, item 8), and for the instructions that came with the decisions: B-186 (apps/web developer-notes sweep and guard), B-187 (the four calc(100vh - 90px) pages), B-188 (K2 notes, K4 OPEN 7), B-189 (crest licensing, K4 OPEN 9; OPEN, NO DECISION), B-190 (wording check of the withdrawal-confirm frames 6654:76 / 6654:26801), B-192 (held-until date on the revoked state; OPEN, NO DECISION). Status lines on 14 existing rows (B-002, B-124, B-132, B-138, B-146, B-154, B-164, B-165, B-166, B-167, B-168, B-169, B-170, B-178), taken from the status-line sections of the W3f, K4 and FC4 reports, none dropped. 192 B-IDs (was 180); 146 gap frames unchanged. Arithmetic: Section 30d. K4 OPEN items 1-9 are each mapped in Section 30a: 1 (item 7), 2 (item 5), 3 (item 6), 4 (item 8 for the Restricted Pending frames; B-190 for the withdrawal-confirm frames), 5 (item 1 for wording, tag and the error-frame line; the date is B-192), 6 (item 4; the placement of the menu control is not decided separately), 7 (B-188), 8 (item 7), 9 (B-189). (FORWARD-POINTERS) Dated notes appended (original text unchanged) to #26, #85, #97, #99, #284, #286, #348, #369, #398, #402, #403, #406, #407, #408 and #409: W3f (PR #434) on #369, #407, #408; K4 (PR #433) on #85, #97, #398, #402, #403, #406, #408; FC4 (PR #435) on #99, #284, #286, #348, #398, #402, #408; A7 (PR #436) on #26, #403, #407, #409. TENSION RECORDED: #284 and #286 said Scouting and Academy are navbar-only and not in the mobile drawer; item 4 puts them in the LOGGED-OUT drawer (notes on #284 and #286); the signed-in drawer is unchanged. NOT DECIDED HERE: a limit on the number of digits after the name and digits before it (item 2; the underscore reading is an adopted reading); the placement of the logged-out menu control; whether the Logged Out drawer can be a variant given Figma's overlay-destination rule (#103); whether the revoked state shows a held-until date; crest licensing; whether the mobile Saved frame 5778:8567 is replaced rather than edited; the exact link-expiry and withdrawal sentences (they are in the Figma nodes); the word list for the apps/web developer-notes guard; counsel wording of every [COPY PENDING LEGAL REVIEW] string.</w:t>
             </w:r>
           </w:p>
         </w:tc>

</xml_diff>

<commit_message>
docs: Decision Log #411 and build register B-193 to B-208 (founder decisions 2026-10-24)
Records the founder's 2026-10-24 decisions on the open points of W5 (PR #439)
and K5 (PR #438) as Decision Log #411 (9 items, defaults, veto-able). Docs only:
no code, Figma, legal copy, DPIA or Log Book.

- Register: 16 new rows (B-193 to B-208), status lines on 24 existing rows,
  Section 32 (item/OPEN-item mapping, pending-copy collation, arithmetic).
  208 B-IDs (was 192); 146 gap frames unchanged.
- Decision Log: row #411 added; dated forward-pointers appended to 23 rows
  (W5, K5 and A8 pointers). 408 -> 409 data rows, no duplicates.
- CLAUDE.md: K5 backfill bullet, new decisions bullet, merge status of A8 and
  W5 corrected.

Co-Authored-By: Claude Sonnet 5.5 <noreply@anthropic.com>
</commit_message>
<xml_diff>
--- a/docs/Soccernity_MVP_Build_Plan_v1.7.docx
+++ b/docs/Soccernity_MVP_Build_Plan_v1.7.docx
@@ -14034,6 +14034,9 @@
             <w:r>
               <w:t>Resolved follow-up. Today the read/unread states are two loose components each, and switching an instance means a manual component swap plus retargeting the overlay reaction. A Has Unread boolean variant on each set would let one instance-level toggle flip both the avatar dot and which dropdown opens. Supersedes PR #113's DL #95 (which proposed the same boolean on a NEW bell component that is no longer being built). Also open from the same area: overlayBackgroundInteraction = CLOSE_ON_CLICK_OUTSIDE could not be set (read-only on COMPONENT nodes) — click-outside-to-dismiss is a follow-up.  [RESOLVED (partial by design) by sprint-2/avatar-dropdown-variant-sets]: Avatar/no notification (2819:4090) + Avatar/notification (2819:4089) are now the Avatar COMPONENT_SET (5685:9241), property Has Unread (boolean, default false); all 78 live instances on page 0:1 re-point cleanly, appearance and per-instance overlay reactions unchanged. Dropdown menu/* was deliberately NOT combined - Figma rejects a COMPONENT that is a variant inside a COMPONENT_SET as an OPEN_OVERLAY destination (see #104), which broke every avatar-&gt;dropdown overlay; it stays a slash-named family (see #105). Click-outside-dismiss: not settable via the plugin API (overlayBackgroundInteraction is readonly on every node type) - it is a one-checkbox manual step in the Figma desktop UI on the 3 avatar Open Overlay interactions (2838:3579, 5387:7675, 2819:4089) and a non-issue for figma-to-code (standard backdrop / useOnClickOutside). See #106.</w:t>
             </w:r>
+            <w:r>
+              <w:t xml:space="preserve"> [2026-10-24: K5 (PR #438) found the same limit again: the Logged Out mobile drawer is a standalone component (6793:29321) because Navigation Drawer - Mobile is a single component and the overlay destination of the signed-in avatar, and a variant cannot be an overlay destination. The header gained a variant (6793:29280) in set 2824:4309. Recorded as B-204 (#411).]</w:t>
+            </w:r>
           </w:p>
         </w:tc>
       </w:tr>
@@ -21904,6 +21907,9 @@
             <w:r>
               <w:t>Resolved. Figma design only, no app/backend code. Verified directly before any edit — Frame 5858 (the icon row) is genuine HORIZONTAL auto-layout (HUG x HUG, itemSpacing 30) on both live variants, header 4 (2838:3502) and header 7 (2841:4104), confirming rather than assuming the DL #272 Grassroots precedent transfers; also confirmed the two variants are protected from overflow by two DIFFERENT mechanisms, not the same one — header 4's root uses primaryAxisAlignItems SPACE_BETWEEN against a fixed 1440 width, so the AUTO-positioned avatar cluster (Frame 5880) stays pinned to the right as the icon row's gap shrinks; header 7's Login button (Frame 5805) is layoutPositioning ABSOLUTE, fully decoupled from the row's flow. Built two new tinted-style icons (31x31 brand/green-tint @12% tile + 24x24 brand/navy-stroke glyph, matching Clubs (DL #159) and Grassroots (DL #272) exactly, not the five baked-in-artwork icons) — Scouting: binoculars; Academy: graduation cap with tassel. Constructed via figma.createNodeFromSvg (the DL #159 Apple-mark precedent), then every descendant vector/ellipse re-bound to VariableID:5096:4 (brand/navy) for strokes and VariableID:5096:5 (brand/green-tint) for the tile fill — never left as literal, unbound colour, per the standing createVector/createNodeFromSvg unbound-stroke gotcha. Appended last, after Grassroots, on both Frame 5858 instances (2838:3517 on header 4, 2841:4115 on header 7) — order now: Sports Hub . Blog . Community . Leaderboard . Bants . Clubs . Grassroots . Scouting . Academy. Row grew 444.41 -&gt; 566.41px on both variants (two tiles x (31 + 30 spacing) = 122px, exactly as predicted before building). Clearance re-measured after growth, not assumed: header 4 clearance to the avatar cluster 309.3px -&gt; 187.3px; header 7 clearance to the Login button ~290px -&gt; 168.0px — both confirmed clean via full-navbar screenshots (no overlap, no clipping). Propagation verified across all 8 live header 7 instances and a diverse 7-frame sample of the 95 live header 4 instances (Settings, Create Post, Leaderboard, Contest, Grassroots, Sports Page, Homepage, Blog, Article Detail, the 3 Legal pages) — all show the two new icons in the correct order with an identical 566.41px row width; the one instance that did not (inside the already-archived, hidden 'ARCHIVED — Blog Page Desktop (superseded by ...)' frame) is pre-existing, out-of-scope archived content, confirmed hidden and unrelated to this edit, not a propagation gap. Zero stray top-level nodes left on the page after construction (group-then-appendChild fully reparents, confirmed). Both icons route to a Coming Soon destination once figma-screen-builder designs that screen in its own separate, parallel task — this PR adds icons only, does not touch the mobile Navigation Drawer or the account dropdown (Scouting/Academy are navbar-only, unlike Community Groups, DL #282), and does not touch Discover- or Careers-pillar schema/backend, per non-negotiable #4 and DL #3. Standing policy confirmed in writing: the 9-icon Web app Navbar COMPONENT_SET is now fully populated and closed to further additions by default — Scouting and Academy were its last two reserved slots (per the standing nav policy DL #282 first recorded); any future pillar or account-adjacent feature defaults to the account dropdown/drawer (the Community Groups precedent, DL #282), not the navbar. CODE HALF DONE -- see #286: sprint-3/coming-soon-scouting-academy-to-code mirrors this icon placement into apps/web/src/layout/navigation.ts (primaryNavItems), routing both icons to a shared ComingSoonPage. [2026-10-20: #410 item 4 amends the navbar-only placement for the LOGGED-OUT mobile drawer only: it lists Scouting and Academy (built by FC4, PR #435, to the K4 frames; B-183 adds the Figma component variants). The signed-in drawer, the account dropdown and the desktop navbar are unchanged.]</w:t>
             </w:r>
+            <w:r>
+              <w:t xml:space="preserve"> [2026-10-24: K5 (PR #438) built the logged-out mobile header variant and the Logged Out drawer component that list Sports Hub, Blog, Scouting and Academy plus Login and Sign up (B-183); Login, Sign up and the row links are not yet wired in the prototype (B-202).]</w:t>
+            </w:r>
           </w:p>
         </w:tc>
       </w:tr>
@@ -21987,6 +21993,9 @@
           <w:p>
             <w:r>
               <w:t>Resolved (built). apps/web only, no Figma/backend code touched. Read both Decision Log #284/#285 entries and the fileKey/node IDs before writing any code, per this project's standing discipline. Exported the real Scouting/Academy glyph SVGs directly from the shared Web app Navbar COMPONENT_SET (nodes 6472:18581 / 6472:18589) as nav-scouting.svg / nav-academy.svg -- matching nav-clubs.svg / nav-grassroots.svg's exact convention, never hand-drawn. navigation.ts's primaryNavItems gained two real entries (available by default, not `available: false`), Scouting -&gt; /scouting and Academy -&gt; /academy, tinted, appended after Grassroots -- the exact order Decision Log #284 landed in Figma. Confirmed the standing nav policy: NOT added to the mobile Navigation Drawer or the account dropdown -- navbar only, matching how Scouting/Academy were deliberately excluded from those two surfaces in #284/#282's own reasoning (unlike Community Groups). One new reusable ComingSoonPage component (apps/web/src/pages/ComingSoonPage.tsx), converted from Decision Log #285's four Figma frames (6477:20050/20402/20677/20764) -- icon disc, COMING SOON badge, feature-name heading, the fixed generic sub-line verbatim from the frame's own text node, and a 'Back to Soccernity' CTA -- with a `featureName` prop as its only variable content, exactly per the brief: ONE component, not two duplicated page files. The icon disc SVG (coming-soon-icon.svg) was exported from the Figma node (6477:20165), not hand-drawn. Two routes in router.tsx, /scouting and /academy, both render &lt;ComingSoonPage featureName=.../&gt; -- configured differently, same component. Both nested under FooterLayout, not a direct AppShell child: the Coming Soon Figma frames carry the canonical site footer (Decision Log #209/#210/#213), the same reason Home/Sports Hub/Blog/Article Detail sit there -- FooterLayout.tsx's own route-list comment and router.test.tsx's FooterLayout-membership test were both updated to include them. No login gate on either route -- like Blog/Sports Hub, the Figma content is identical regardless of auth state, and the shared Header already renders the correct logged-in/out chrome; a Coming Soon page has nothing that depends on the caller's identity. Header.test.tsx updated for the new 9-icon canonical order (was 7) and gained dedicated cases: Scouting/Academy are the last two items, both tinted, pointing at /scouting and /academy; neither appears in drawerNavItems or accountMenuItems. Verified, all re-run in this session, none estimated: apps/web vitest -- 37 files / 255 tests, 0 failures (up from 36/253 -- new ComingSoonPage.test.tsx, 4 cases; router.test.tsx +3; Header.test.tsx net +2, no existing test removed); `npx tsc --noEmit` clean; `npm run lint` clean; `npm run build` clean production bundle. Dev-server smoke test: /, /scouting, /academy, /sports-hub, /community, /clubs all real HTTP 200, clean log; the built page for /scouting was also fetched directly and confirmed to render the real app shell (&lt;title&gt;Soccernity&lt;/title&gt;). No real browser/Playwright check available in this environment -- same verification ceiling as every prior apps/web figma-to-code PR. [2026-10-20: #410 item 4: the logged-out mobile drawer now lists Scouting and Academy (FC4, PR #435); the signed-in drawer still does not.]</w:t>
+            </w:r>
+            <w:r>
+              <w:t xml:space="preserve"> [2026-10-24: K5 (PR #438) built the Logged Out drawer component that lists Scouting and Academy (B-183); see the note on #284.]</w:t>
             </w:r>
           </w:p>
         </w:tc>
@@ -22911,6 +22920,9 @@
               <w:br/>
               <w:t>RESOLVED (2026-09-26, sprint-4/media-storage-r2-decision): the provider is Cloudflare R2. Reasoning: R2 charges zero egress fees, the standout cost factor for a media-heavy social app where reads (feed, profile, clip playback) vastly outnumber writes and would dominate an AWS S3 bill; it is S3-compatible, so StorageService/S3StorageService needs no code change (S3_ENDPOINT = https://&lt;account-id&gt;.r2.cloudflarestorage.com, S3_REGION = "auto"). This entry records a decision only and does NOT make storage live: creating the Cloudflare account, the R2 bucket and an S3-compatible API token is a human action, and until real S3_BUCKET/S3_ACCESS_KEY/S3_SECRET_KEY/S3_ENDPOINT values are set in a real .env, POST /admin/media/upload still returns 503. Flagged, not fixed: S3StorageService builds MediaAsset.url as &lt;endpoint&gt;/&lt;bucket&gt;/&lt;key&gt;, which on R2 is the authenticated S3-API endpoint and is not publicly readable; public playback needs the bucket's r2.dev subdomain or a custom domain, so a follow-up (e.g. a public-base-URL env var) is needed before uploaded media can be displayed. The multer@2.2.0 advisory (Decision Log #309) is unrelated and unchanged.</w:t>
             </w:r>
+            <w:r>
+              <w:t xml:space="preserve"> [2026-10-24: backend W5 (PR #439) added the optional S3_PUBLIC_BASE_URL variable (B-035); the Cloudflare account, bucket and token and the value (r2.dev or a custom domain) are a human action (B-207, #411).]</w:t>
+            </w:r>
           </w:p>
         </w:tc>
       </w:tr>
@@ -24480,6 +24492,9 @@
             <w:r>
               <w:t>Resolved by the founder, IMPLEMENTED (sprint-2/account-anonymization-reconsideration). SUPERSEDES #44 (cascade) and the "hard-delete, not anonymized" step of #42; #42's 30-day grace period and its ConsentAuditRecord retention are unchanged. (1) The User row is never DELETEd: at the end of the grace period AccountDeletionSweepService.anonymizeUser runs ONE atomic transaction. User: email -&gt; deleted-&lt;id&gt;@deleted.soccernity.internal (deterministic, unique), phone -&gt; null, displayName -&gt; "[deleted user]", passwordHash -&gt; an unverifiable value, dateOfBirth -&gt; null (column made nullable), clubAffiliationId -&gt; null, accountStatus -&gt; the new terminal value 'deleted' (distinct from 'pending_deletion', which now means the 30-day grace period OR held pending investigation; both block login identically). GrassrootsTeam.createdById (made nullable) -&gt; null for every team they organised, so the team goes dormant/read-only via the existing createdById !== caller 403 checks with no new guard code. Follow, Like, SavedPost, Notification rows for the user are deleted outright (Post.likeCount is decremented so the cache does not drift). Post, Comment, Message, Result are untouched - their FKs keep pointing at the anonymized row. Guardian (minors) unchanged from #42: snapshot to ConsentAuditRecord, then delete. Report rows are NEVER touched. (2) The 15 FKs sprint-2/account-deletion-cascade flipped to CASCADE (the eleven User-referencing tables plus Comment/SavedPost/Like -&gt; Post) are RESTRICT again, so an accidental real DELETE FROM "User" fails loudly; GrassrootsTeam.createdById is nullable + RESTRICT. (3) INVESTIGATION HOLD: before anonymizing a due account the sweep checks for a non-terminal Report involving them - status open, or actioned with appealStatus pending - as reporterId, as the direct target (targetType user), or (built, it was a clean single correlated query) as the author of a reported post/comment. If found, the account is skipped for that run - fully identifiable, still login-blocked - and retried every sweep; no new "held" flag, just a query predicate. (4) Feed read-visibility now shows posts by 'active' AND 'deleted' authors (attributed to "[deleted user]"); rosters, follow graph, leaderboard and new DMs still require 'active'. Admin cannot change a 'deleted' user's status (409). (5) The Fixture/Result RESTRICT gap: GrassrootsTeam deletion is no longer attempted at all - a team is nulled, never deleted, so Fixture.teamAId/teamBId and Result.fixtureId RESTRICT can no longer be hit by account deletion; closed for this path, no separate fix needed. NOT built / flagged: no retention timer on the anonymized 'deleted' row itself; Grassroots reassignment of a dormant team to a new organiser (separate follow-up); a departing user's BanterRoomMember/CommunityGroupMember/_ClubMembership rows are not removed (rosters filter non-active users but memberCount still counts them); the investigation hold has no maximum duration. Migration 20260919144308_account_anonymization_restrict_and_nullable. ALSO FLAGGED (not built): the earlier Banter/Community-Group-member, Contest and Points cascades were left unchanged by this redesign and are now inert on the User deletion side - a cleanup candidate.</w:t>
             </w:r>
+            <w:r>
+              <w:t xml:space="preserve"> [2026-10-24: K5 (PR #438) compared the withdrawal-confirm frames with this behaviour (anonymised in place after 30 days): the frames say 'deleted after 30 days', the code email says 'permanently deleted'. #411 item 7 records it as one inconsistency for the counsel list, nothing changed (B-200).]</w:t>
+            </w:r>
           </w:p>
         </w:tc>
       </w:tr>
@@ -24777,6 +24792,9 @@
             <w:r>
               <w:t>Resolved - implemented (backend). OPERATIONAL MEANING: consentScreenVersion is a MANUALLY BUMPED string constant (CONSENT_SCREEN_VERSION = 'v1', services/api/src/modules/auth/guardian-consent/consent-screen-version.constants.ts). Nothing derives it from the screen's content, a hash or a git revision, and nothing detects drift: whoever materially changes the guardian-consent confirmation screen's wording or substance (apps/web GuardianConsentConfirmPage.tsx / its Figma frame) must bump it in the same PR. Cosmetic changes need no bump. deviceType is a coarse 'mobile' | 'desktop' | 'unknown' derived from the User-Agent header at confirmation; the raw User-Agent is never stored (data minimisation). WHERE: ConsentAuditRecord only exists from anonymization time (a snapshot), so both values are stamped onto the Guardian row (new nullable consentScreenVersion / consentDeviceType) in the SAME updateMany as consentTimestamp in confirmConsent - no new write path - then snapshotted into ConsentAuditRecord.consentScreenVersion / deviceType by AccountDeletionSweepService. Flagged: two additive nullable columns on Guardian (beyond Section 3; safeguarding fields untouched, nothing weakened). Existing rows carry NULL, not backfilled. No admin/compliance export of ConsentAuditRecord exists to update. Open: the version constant is only as reliable as reviewers remembering to bump it; the guardian-facing page is not yet checked against it in CI; an idempotent re-confirm never overwrites the original evidence. [2026-10-19: FC3a (PR #430) bumped CONSENT_SCREEN_VERSION v3 to v4 and the hash when the guardian page wording changed (B-130, B-153, B-154). #408 item 6 tags the post-decline clause, which forces a further bump to v5 in its build PR (B-169).] [2026-10-20: FC4 (PR #435) bumped CONSENT_SCREEN_VERSION v4 to v5 and the hash (the tagged post-decline clause, B-169). #410 item 6 adds the link-expiry and withdrawal sentences to the guardian footnote, which forces a further bump to v6 in its build PR (B-185).]</w:t>
             </w:r>
+            <w:r>
+              <w:t xml:space="preserve"> [2026-10-24: K5 (PR #438) fixed the final Figma guardian-confirm footnote and tagged each of its three guardian/child sentences; the code still carries only the cap sentence. Adding the link-expiry and withdrawal sentences needs a CONSENT_SCREEN_VERSION bump with the text hash (B-185, #410 item 6); the strings are listed in docs/figma-pass-k5-report.md section 6.]</w:t>
+            </w:r>
           </w:p>
         </w:tc>
       </w:tr>
@@ -25600,6 +25618,9 @@
             <w:r>
               <w:t>Resolved -- decided, NOT yet built. MINOR: Age Gate (date of birth + country) -&gt; Guardian details -&gt; submit -&gt; Register (account created, restricted-pending) -&gt; Restricted pending page (shown on every login) -&gt; guardian approves (plus card verification for a US under-13, the control built in PRs #297/#298) -&gt; Activation confirmation (its 'Go to my profile' action becomes 'Continue registration') -&gt; Create Profile -&gt; Club Picker -&gt; /. ADULT: Age Gate (date of birth + country) -&gt; Register -&gt; Create Profile -&gt; Club Picker -&gt; /. Date of birth is read-only after the Age Gate: Register and Create Profile show it auto-populated and Register has no date picker. Create Profile is blocked for a restricted-pending minor until approval. Preferred Club on Create Profile is optional free text and is run through the pre-publication sensitive-content screen (Decision Log #366, PR #388); the Club Picker follows regardless of what is entered. Bio is optional and screened. Email verification is required of every user before Create Profile. The 'What you can still do' copy on the restricted-pending page is rewritten to say registration cannot be completed until the guardian approves (including card verification where required). NOTE: the sensitive-content screen as built (#366) covers Grassroots free-text fields only; extending it to Preferred Club and Bio is new build work, not a given. OPEN, product call: a user who mistypes their date of birth at the Age Gate has no self-service correction path once it is read-only. [2026-10-14: the open DOB-correction point is resolved by #390 (support correction tool, audited, re-runs age checks, re-triggers guardian flow).] [2026-10-18: RegisterDto.countryCode is required (apps/web sends it since B-073). #406 moves the onboarding screens to the light theme (item 2) and adds a resend-verification endpoint for the verify-email prompt (item 3).]</w:t>
             </w:r>
+            <w:r>
+              <w:t xml:space="preserve"> [2026-10-24: #411 item 6: the Restricted Pending page's Registration status line ('Registration cannot be completed until your guardian approves, including card verification where required.') is added in code, tagged, with a manifest row (B-199); the frame drops the resend note and the stale SCOPE OPEN note (B-198).]</w:t>
+            </w:r>
           </w:p>
         </w:tc>
       </w:tr>
@@ -25684,6 +25705,9 @@
             <w:r>
               <w:t>Resolved -- decided, NOT yet built. A username is required at Create Profile so that no user, minor or adult, is shown to other users under a real name. Until Create Profile is complete an account is shown to others under a neutral placeholder name, cannot post, and is redirected to Create Profile on every login. Applies to adults and to approved minors. Builds on #364 (User.username, shipped optional, 'username first, display name fallback'), which this makes mandatory for any account that completes onboarding; legacy accounts with no username fall under the same gate. Username moderation rules (reserved words, impersonation, profanity, no personal data in usernames, change cooldown, released-handle holding period, admin revoke built code-first with a design follow-up) are specified in the build PR, not here. OPEN: what the placeholder name is, and how the gate treats accounts that already exist without a username. [2026-10-16: Amended by #403. The placeholder name for incomplete profiles is 'Soccernity member' (closes the first OPEN point). The second OPEN point (accounts that already exist without a username) is not addressed.] [2026-10-17: The second OPEN point (accounts that already exist without a username) is resolved by B-027, which is built (backend/w3-gates, PR #412): legacy accounts are inside the incomplete-profile gate, and the placeholder other users see is 'Soccernity member' (#403, item 15). The wording of the gate is unchanged. Recorded in #404.] [2026-10-18: Rules specified and built by B-032 (docs/backend-w4-username-report.md): reserved words, impersonation (club names), profanity, contact details, personal data, 30-day change cooldown, revoked-handle hold. A user can no longer clear their own username (B-031). Recorded in #406, item 8: one free correction; no hold on a handle the user releases.] [2026-10-18: QA run (PR #426, docs/qa-e2e-onboarding-report.md), D-06: hate and sexual terms glued to other letters (xxhitlerxx, nazifan) are accepted while hitler_1488, nazi_fan and fuckface are refused, because the EXACT list matches only the whole handle or an underscore token. Decided 2026-10-18 (#407, item 3): long unambiguous terms match by CONTAINS with a tested list of innocent words; short ambiguous terms stay exact. Register row B-142. D-05: Edit Profile still labels the username 'Optional' (B-133).] [2026-10-19: Built by backend/w3e (PR #429, #407 item 3): long unambiguous terms match by CONTAINS, nazi with named innocent exceptions. #408 item 3 allows the exact whole handles nazif, nazifa and nazifah and still refuses nazifan (B-165); the term lists and the 5-letter threshold are recorded in #408 and stay open for founder review.] [2026-10-20: W3f (PR #434) built a whole-handle allow-list for nazif, nazifa and nazifah (B-165). #410 item 2 changes the rule to an exact match on the handle as typed (case-insensitive, no underscore variants) plus the name followed only by digits (B-181). The term lists, the 5-letter threshold and the innocent-word list stay open.]</w:t>
             </w:r>
+            <w:r>
+              <w:t xml:space="preserve"> [2026-10-24: #410 item 2 (the nazif/nazifa/nazifah exact-match rule, B-181) was recorded by A8 (PR #437) but had no build prompt; #411 item 9 records that it is built in the next backend PR. Not yet built.]</w:t>
+            </w:r>
           </w:p>
         </w:tc>
       </w:tr>
@@ -25726,6 +25750,9 @@
             <w:r>
               <w:t>Resolved -- decided, NOT yet built. A restricted-pending user cannot perform any social or profile write: profile edits, represented club, follow, like, save, club join, and the like. Left open to them: report and appeal, change-guardian-email, password change, deactivate/delete, logout. Today only some writes are blocked (POST /posts, comments, rooms, DMs and Community Group create/join are consent-guarded; follow, like, save, club join and PATCH /users/:id are JwtAuthGuard-only, per the reasoning in Decision Log #21/#275) -- this entry widens the rule to a uniform write block. Needs a build PR that re-checks every JwtAuthGuard-only write route. [2026-10-17: Built: B-026 (backend/w3-gates, PR #412). GuardianConsentGuard is now on every social and profile write route; the route table is pinned in docs/backend-w3-gates-report.md and enforced by services/api/src/write-route-guards.spec.ts, so a new write route with no entry fails the build. Recorded in #404.] [2026-10-18: QA run (PR #426, docs/qa-e2e-onboarding-report.md), D-13: the restricted-pending view says 'Browse and follow' and the guardian page lists 'Follow teams and check scores', but POST /users/:id/follow returns 403 for a restricted-pending minor, as this entry decides. Decided 2026-10-18 (#407, item 4): the copy stops promising follow and says what works, [COPY PENDING LEGAL REVIEW]. Register row B-154.]</w:t>
             </w:r>
+            <w:r>
+              <w:t xml:space="preserve"> [2026-10-24: #411 item 5: Block, unblock and the blocked-users list are exempt from the consent and email-verification guards (authenticated only, B-197), like report/appeal and change-guardian-email. Grassroots record-keeping stays limited while restricted-pending (the write block as built, B-026).]</w:t>
+            </w:r>
           </w:p>
         </w:tc>
       </w:tr>
@@ -25768,6 +25795,9 @@
             <w:r>
               <w:t>Resolved -- decided, NOT yet built. Avatars and cover photos are visible to all users, including minors. The other-user profile page shows: avatar, cover photo, bio, country (in place of location -- no precise location is collected), Follow, message, Copy link, Block. There is no Share action. Storage is Cloudflare R2 (Decision Log #307). Image safety: an automated check at upload using Amazon Rekognition (EU/UK region where available); flagged images go to the admin moderation queue and are NOT live; report-and-review is the backstop; image metadata (EXIF/location) is stripped on re-encode. OPEN, counsel review pending: CSAM hash-matching (Cloudflare tooling coverage of R2 is unconfirmed) and any statutory duties that attach to hosting images of minors. Amazon becomes a new processor (cross-border/DPIA follow-up). No avatar/bio/location columns, upload endpoint or Rekognition integration exist yet (Decision Log #58 backend requirements still open). [2026-10-16: Amended by #403 (item 17). The 'country' item: the profile shows a country only if the user filled in the separate, optional PROFILE country field; it is never the declared or derived safeguarding country. A minor's country is therefore visible only if the minor enters it. Counsel review of country display stays on the legal list with reduced scope. The rest of this entry stands.]</w:t>
             </w:r>
+            <w:r>
+              <w:t xml:space="preserve"> [2026-10-24: backend W5 (PR #439): bio, avatar and profile country are columns; the avatar is uploaded on the admin media pipeline and stays pending and invisible to everyone but its owner until the image check (B-036) sets approved; cover photo not built. #411 amends: item 1 - the image check (B-036) and the review queue (B-037) are to be built before launch, the AWS account is a human step (B-193); item 3 - the preferred club is not shown to other users until a frame draws it (B-195); item 4 - the cover photo is built on the avatar pipeline with the same rule (B-196). The EXIF re-encode (B-205), the CSAM path under counsel (B-206) and the Cloudflare/public-URL step (B-207) stay open.]</w:t>
+            </w:r>
           </w:p>
         </w:tc>
       </w:tr>
@@ -25936,6 +25966,9 @@
             <w:r>
               <w:t>Resolved -- decided, NOT yet built. Supersedes Decision Log #344 ('no purge timer'). The anonymised user row is hard-deleted 30 days after anonymisation for (a) never-approved minor accounts and (b) any account with no content. Content-bearing anonymised accounts remain anonymised, and are NOT purged, until counsel reviews them. Counsel review pending. OPEN, to be settled in the build PR: the exact test for 'no content' -- User FKs from Post/Comment/Message/Result/Report etc. are RESTRICT again (Decision Log #341), so a delete on a row with any such child fails by design and the job must check for children first rather than rely on the FK; and how this interacts with the hold rule (next entry), which pauses erasure. Decision Log #344's reasoning (a retained anonymised row holds no personal data, GDPR Recital 26) is not disputed; this entry only removes rows where retaining them serves no purpose. [2026-10-17: Unchanged by PR #416: the third decline reuses the 30-day grace of this entry. Related open item recorded as register row B-126 (no decision): a row declined at decline 1 or 2 that the minor never reopens has no expiry. See #405.]</w:t>
             </w:r>
+            <w:r>
+              <w:t xml:space="preserve"> [2026-10-24: K5 (PR #438) found the withdrawal-confirm frames say 'deleted after 30 days' while the legal draft and this rule say the row is anonymised and a consent record is kept 6 months, and the code email says 'permanently deleted'. #411 item 7: one inconsistency for the counsel list, nothing changed (B-200).]</w:t>
+            </w:r>
           </w:p>
         </w:tc>
       </w:tr>
@@ -26020,6 +26053,9 @@
             <w:r>
               <w:t>Future consideration, NOT in MVP, not decided. Possible later: players linked to Grassroots clubs through the Grassroots feature get a player profile card linked to their accounts. Because no position, school-team, stats or photo fields exist in the schema, API or UI, the 'Build a player profile / position, club or school team, and stats' and 'Add your position and photo' claims are removed from the guardian flow copy (GuardianConsentConfirmPage.tsx, GuardianConsentPage.tsx; Figma 5113:6669, 5114:6698; audit Q6). Do not build without a new decision (CLAUDE.md non-negotiable #4: no Discover/Careers-pillar work without an explicit go-ahead). [2026-10-18: QA run (PR #426, docs/qa-e2e-onboarding-report.md), D-15: the guardian page still shows 'Build a player profile - Position, club or school team, and stats they add themselves' and a visible drafting note ('[COPY PENDING LEGAL REVIEW -- expiry/deletion/withdrawal copy from the Figma frame is not reproduced here ...]'). Tracked in register row B-078; not built.] [2026-10-19: FC3a (PR #430) removed 'Build a player profile' from the guardian page and the position and photo promise from the pending view (B-078, B-154). The Figma frames 5491:8241, 5501:8453 and 5108:6629 still say 'follow teams': B-177.]</w:t>
             </w:r>
+            <w:r>
+              <w:t xml:space="preserve"> [2026-10-24: K5 (PR #438) checked the Restricted Pending frames: the 'Set up your profile / Add your position and photo' row was already hidden by an earlier pass; K5 changed only the wording that still said 'Browse and follow' (B-191).]</w:t>
+            </w:r>
           </w:p>
         </w:tc>
       </w:tr>
@@ -26524,6 +26560,9 @@
             <w:r>
               <w:t>Resolved -- decided, NOT yet built. SUPERSEDES #374 'as-is' for explicit declines on a still-valid request (the rest of #374 is retained). A guardian's explicit decline lets the minor resend or change the guardian email; the decline frames 5491:8241 / 5501:8453 must be wired to this logic (this settles #374's 'archive or rewrite' choice: rewrite and wire). MAX 3 declines; after the 3rd the account moves to pending deletion via the existing refuseConsentAndScheduleDeletion path (sessions revoked, 30-day grace, anonymise, purge rule #375). An expired request / second lapse does NOT count among the 3 and goes straight to the original plan (pending deletion). A guardian withdrawing consent after approval goes straight to the original plan. Changing the guardian email does NOT reset the count. Abuse protection: a cap on requests per day and a 'don't contact me again' option for the recipient. Retained from #374: 72h token TTL (GUARDIAN_CONSENT_TOKEN_TTL_HOURS), first lapse = automatic re-send plus a reminder to the minor, second lapse = implicit decline -&gt; original plan. Known bug to fix with this work: GuardianConsentPage currently treats 'declined' as pending (audit section 5 item 5). Note: between declines the minor's sessions must stay valid for them to resend; today every decline revokes sessions and 'declined' is terminal in code, so a per-account decline counter and a revised state model are new build work. Not yet in the legal copy draft (to add). Build register B-102, B-003. Forward-pointer: #374. [2026-10-17: Backend built (B-102, B-110; PR #416): the per-account counter (internal), declines 1 and 2 non-final with sessions valid, the third decline final via refuseConsentAndScheduleDeletion. Not built from this entry: the per-day request cap and the do-not-contact option (superseded by #395 B2, which has neither). Frontend still open: the in-account decline page and GuardianConsentPage's 'declined' rendering (audit section 5 item 5). New open item: B-126.] [2026-10-18: A row declined at decline 1 or 2 and not reopened within 14 days (configuration) takes the same lapse path as an unanswered request (#406, item 1; mechanics for the backend agent to confirm; counsel still to review). The guardian confirm page footnote 'Declining closes the account and schedules it for deletion' is wrong for declines 1-2 and is replaced (#406, item 13).] [2026-10-18: Built (B-126, PR #424): a row declined at decline 1 or 2 and not reopened within 14 days is chased and may end in closure; closure by this route is an expiry, so it is not a fourth decline (see #337). QA run (PR #426): declines 1 and 2 keep the account active and sessions valid, send no email and show the decline view with the cap sentence and no running count; decline 3 blocks login at once (generic 401, pending deletion, one email); a change of guardian restarts approval without resetting the count. The decline view's Resend approval request and Change guardian email actions are broken in apps/web (D-03 = B-151, D-04 = B-152). Judgment call 1 of the W3d report (the platform sends a new request to a guardian who declined) stays as built: #407 item 6.] [2026-10-19: The decline view's Resend approval request and Change guardian email actions (QA D-03, D-04) are fixed by FC3a (PR #430). The post-decline clause 'so it stays switched off' is tagged by #408 item 6 (B-169).]</w:t>
             </w:r>
+            <w:r>
+              <w:t xml:space="preserve"> [2026-10-24: see the note on #375 - K5 (PR #438) and #411 item 7 record the withdrawal-wording inconsistency (B-200); nothing in the cap or the refusal path is changed.]</w:t>
+            </w:r>
           </w:p>
         </w:tc>
       </w:tr>
@@ -26740,6 +26779,9 @@
             <w:r>
               <w:t>Resolved -- recorded; DECIDED, NOT BUILT. Source: founder decisions 2026-10-15/16. Extends #367, #369, #371 and #366. (A1) Create Profile as drawn by W0 Figma pass B: Full Name is kept, prefilled from Register and editable; Country is shown read-only (the derived value is authoritative, #368). (A2) The profile picture is OPTIONAL; the wording of the automatic image check shown to the user is [COPY PENDING LEGAL REVIEW]. (A3) A Bio or Preferred Club value flagged by the pre-publication sensitive-content screen (#366) shows an inline 'please rephrase' state on that field. (A4) Age Gate: the heading and subheading are reworded to cover date of birth plus country (wording [COPY PENDING LEGAL REVIEW]); after a below-minimum-age denial, date of birth and country are CLEARED when the user presses Back. (A5) The Activation screen and the guardian-approval email currently say everything is 'switched on' although the flow continues to Create Profile (#367); both are reworded to 'approved, continue registration' (wording [COPY PENDING LEGAL REVIEW]). (A6) A restricted-pending minor gets NO new Create Profile screen: that minor is routed to the Restricted Pending page on every login (this answers the open point in #367 about what 'Create Profile is blocked for a restricted-pending minor' looks like on screen, and accepts the PROPOSAL recorded by W0 Figma pass D). Build register: B-001, B-002, B-006, B-009, B-028, B-030, B-035, B-036, B-038, B-073, B-077, B-081; Figma re-sync in B-107. STILL OPEN: counsel wording for every [COPY PENDING LEGAL REVIEW] item; the placeholder name for incomplete profiles (#369). Full detail: docs/build-register.md Section 10. [2026-10-16: Amended by #403 (item 17). (A1) Country is NOT shown read-only at Create Profile. Country has two separate fields: the SAFEGUARDING country (Age Gate declaration plus IP derivation, never shown, never editable) and a separate optional PROFILE country, blank at Create Profile and editable in Edit Profile. Everything else in A1 (Full Name kept, prefilled, editable) stands.]</w:t>
             </w:r>
+            <w:r>
+              <w:t xml:space="preserve"> [2026-10-24: backend W5 (PR #439): the inline 'please rephrase' (A3) is a coded 422 sensitive_content_rephrase_required on PATCH /users/:id with no override (adopted default); the profile picture upload (A2) is built on the admin media pipeline. #411 item 2 confirms it final: no override and no automatic Report; the web state is B-194.]</w:t>
+            </w:r>
           </w:p>
         </w:tc>
       </w:tr>
@@ -26785,6 +26827,9 @@
             <w:r>
               <w:t xml:space="preserve"> [2026-10-16: Amended by #402. (B1) is AMENDED: sessions stay valid between declines (#389); after decline 1 and 2 the minor sees the existing decline page INSIDE the account via the existing authenticated resend / change-guardian-email routes; the 'declined' login result and its BACKEND TO CONFIRM point are WITHDRAWN (build register B-110 re-scoped). (B2) The open question on the 30-day grace is answered: the third decline blocks login at once and enters pending deletion WITH the existing 30-day grace (#375). The remainder stands.] [2026-10-16: Amended by #403. (B2) The decline page keeps its static sentence stating the cap (Figma node 6627:22230); 'No decline count is shown' means no running 'decline N of 3' counter. (B4) A restart caused by a DOB correction RESETS the decline counter and writes an audit entry (answers the STILL OPEN point). (B3) The withdrawal throttle default is 5 attempts per 15 minutes, held in configuration (sets the window left open).] [2026-10-17: Backend built in PR #416. B1 stays withdrawn (#402). B2: the third decline blocks login at once and enters pending deletion with the 30-day grace, one email. B3: unchanged here. B4 built as B-103: an age-tier change cancels or restarts the request and a restart resets the counter. Open, no decision: a row declined at 1 or 2 and never reopened has no expiry (register row B-126). Frontend decline page not built.] [2026-10-18: Amended by #406: a declined-at-1-or-2 row not reopened within 14 days expires (item 1); the status response adds the guardian's first name and the last decision date, never the decline count (item 11); the guardian confirm page footnote is replaced by the cap sentence (item 13).] [2026-10-18: Built in W3d (B-126, B-128, B-129, B-131; PR #424): see #406 and #389. QA run (PR #426): B2 and B4 behave as decided; the web decline view's Resend and Change guardian email actions are broken (D-03, D-04: B-151, B-152). Judgment call 1 of the W3d report stays as built (#407 item 6).] [2026-10-19: QA D-03 and D-04 (the decline view's resend and change-guardian-email actions) are fixed by FC3a (PR #430, B-151, B-152). The guardian page's post-decline state carries the cap sentence (B-130); its clause 'so it stays switched off' is tagged by #408 item 6.]</w:t>
             </w:r>
+            <w:r>
+              <w:t xml:space="preserve"> [2026-10-24: K5 (PR #438) read the withdrawal-confirm frames 6654:57 / 6654:26782: 'closes the account straight away' and 'cannot be undone from this page' are accurate, 'deleted after 30 days' understates. #411 item 7: one inconsistency for the counsel list, nothing changed (B-200).]</w:t>
+            </w:r>
           </w:p>
         </w:tc>
       </w:tr>
@@ -26830,6 +26875,9 @@
             <w:r>
               <w:t xml:space="preserve"> [2026-10-16: Amended by #402 (founder-adopted defaults, veto-able). The blocked user is not told; a block hides content and search results in both directions (posts, comments, likes, search, rosters); the leaderboard is unaffected; unblock does not restore follows. Still open: Bants rooms, exact like mechanics, and the interaction with #346 / #347.] [2026-10-19: Figma pass K3 (PR #428) removed the Block row from the own Saved frame 6747:29445, as C1 says (own variant); the legacy frame 1460:8940 had it. Archived.]</w:t>
             </w:r>
+            <w:r>
+              <w:t xml:space="preserve"> [2026-10-24: backend W5 (PR #439) built B-039: the Block model and endpoints with the #402 / #404 / #406 rules (see services/api/src/modules/block/README.md). #411 item 5 settles the points W5 left open: Block is exempt from the consent and email-verification guards; Bants room listing is unaffected; no new Notification rows between a blocked pair and existing ones hidden both ways; a blocked thread stays readable with sending stopped (as built); contest winners lists are unaffected and a tap on a blocker's name opens 'not found'. Build: B-197.]</w:t>
+            </w:r>
           </w:p>
         </w:tc>
       </w:tr>
@@ -27091,6 +27139,9 @@
             <w:r>
               <w:t>Resolved -- recorded; DECIDED, NOT BUILT. FOUNDER-ADOPTED DEFAULTS, VETO-ABLE: each item below is adopted now so build work is not blocked, and stands until the founder says otherwise. Amends #395 and closes open points of #395-#399; the original text of those entries is unchanged (dated notes appended). (1) DECLINE 1 AND 2 -- AMENDS #395 B1. #389 already decided that sessions STAY VALID between declines; only the THIRD decline revokes sessions. After decline 1 and decline 2 the minor sees the existing decline page (5491:8241 / 5501:8453) INSIDE the account, using the existing authenticated resend and change-guardian-email routes. The 'declined login result' design of #395 B1 (a login that answers 'declined' with no token) is WITHDRAWN; so is its BACKEND TO CONFIRM point. Build implications recorded, not decisions: today every decline revokes sessions and 'declined' is terminal in code (#337-#340), and resend / change-guardian-email refuse a declined account (#365), so decline 1 and 2 must stop revoking and those routes must accept the account while fewer than three declines have been recorded. Bug fixed by the same work: GuardianConsentPage treats 'declined' as pending (audit section 5 item 5). Build register: B-110 is RE-SCOPED to this and merged into B-102's dependency chain (B-102 now depends on B-110); the B-ID is kept. (2) THIRD DECLINE. Login is blocked at once and the account enters pending deletion with the EXISTING 30-day grace (#375, via refuseConsentAndScheduleDeletion as in #389). This answers #395's open question: 'delete the account immediately' does NOT skip the grace; the minor still receives the email only, no page and no count (#395 B2 stands). (3) REVOKED USERNAME (#398 D3). The handle is held 30 days for everyone (nobody can take it); the revoked user can NEVER re-pick it. This answers #398's ambiguous 'cannot re-pick' point: permanent for that user, 30 days for others. (4) BLOCK (#396). The blocked user is NOT told. A block hides content and search results in both directions: posts, comments, likes, search, rosters. The leaderboard is unaffected. Unblock does NOT restore follows. Still open: Bants rooms (room membership / room listing; the blocked user's posts are covered by 'posts'), the exact like mechanics, and the interaction with the guardian-consent, under-16 and adult-to-minor rules (#346, #347). (5) 2FA (#397). 10 single-use backup codes, stored HASHED. Lost-device recovery needs a backup code, OR email confirmation plus password. Noted for the founder's veto: the email-plus-password path makes 2FA recovery only as strong as the email account. Still open: backup-code format, storage and encryption of the TOTP secret itself, counsel (legal copy Part C row 44). (6) CONTEST EXPOSURE SETTINGS (#399 E4/E5, #388). Tolerance and the per-viewer daily cap apply to WEEK 4 ONLY, not per contest or per week. Their ranges (1-50 percent; 1-50) stay as validation bounds on the week-4 settings; they lock when week 4 starts (day 22), not when week 1 starts. Watch limit (3-120 s) is unchanged. Build register: B-110 (re-scoped), B-102, B-003, B-107 (decline page behaviour note), B-032, B-033, B-039, B-108, B-086, B-087, B-111, B-091, B-092, B-095, B-097. Not decided here and still open: see docs/build-register.md Section 11d. [2026-10-17: Items 1 and 2 are built in the backend (B-110, B-102; PR #416): sessions stay valid after declines 1 and 2, the third decline blocks login at once with the 30-day grace. The 'existing authenticated resend' wording of item 1 is clarified by #405, item 6: the route is the existing email-keyed POST /auth/guardian-consent/resend, not JWT; change-guardian-email is the JWT one. Item 5 (2FA): the backup-code character set, the TOTP secret storage and the per-account lock are decided by #405, item 8.] [2026-10-18: Item 3 built: RevokedUsername (30-day hold for everyone, permanent bar for the revoked user). Retention and appeal path of that record are OPEN, no decision (B-139, #406).] [2026-10-18: QA run (PR #426) confirmed sessions stay valid between declines 1 and 2 and the third decline blocks login at once with the existing 30-day grace. Two of the decline view's three actions are broken in apps/web (B-151, B-152).] [2026-10-19: Item 3 (a revoked username is held 30 days for everyone) is not yet shown to the admin: #408 item 5 adds the line (B-167, B-168).] [2026-10-20: item 3's 30-day hold is now shown to the admin: drawn by K4 (PR #433), built by FC4 (PR #435), wording approved by #410 item 1 (B-167, B-168).]</w:t>
             </w:r>
+            <w:r>
+              <w:t xml:space="preserve"> [2026-10-24: backend W5 (PR #439) built the Block rules of item 4 as written (B-039); #411 item 5 closes the points this entry left open (see the note on #396).]</w:t>
+            </w:r>
           </w:p>
         </w:tc>
       </w:tr>
@@ -27133,6 +27184,9 @@
             <w:r>
               <w:t>Resolved -- recorded; DECIDED, NOT BUILT. Source: founder decisions 2026-10-16, numbered 1-19 as given to this entry. Amends #400 (items 1, 9, 11), #395 (items 2, 15), #401 (item 7), #369 (item 15), #394 and #371 (item 17) by dated notes appended to those rows; the original text of every row is unchanged. It also changes points recorded in #398 D1 (item 8), #399 E3 (item 10) and #402 item 4 (item 16): those three rows were NOT edited (this entry is the record), see docs/build-register.md Section 12. The founder labelled the country select in item 17 a veto-able default and the withdrawal throttle in item 15 a default held in configuration; everything else is stated as a decision. (1) NON-FINALIST CONTEST TAB -- AMENDS #400 E8. The Create Post Contest tab for a non-finalist is NOT hidden. The tab stays visible, and a non-finalist who opens it during days 22-24 sees the existing 'Closed (not a finalist)' frames (desktop 6660:31044, mobile 6660:35699), which are RESTORED (un-archived, by a Figma pass, not by this entry). The minimum tally x stays admin-only (E8's second sentence stands). (2) DECLINE PAGE CAP SENTENCE -- clarifies #395 B2. The decline page keeps its static sentence that states the cap (Figma node 6627:22230). 'No decline count is shown' means no RUNNING 'decline N of 3' counter. The sentence is minor-facing copy and stays [COPY PENDING LEGAL REVIEW]. (3) GUARDIAN 'APPROVED' SCREENS. 5488:7164 and 5501:8225 are reworded to match the flow (approval continues to Create Profile; extends #394 A5); the new wording is [COPY PENDING LEGAL REVIEW]. (4) ADMIN COMPONENTS. The component frame at Figma node 6671:27364 (Pass F2) exists so that admin screens and apps/admin share ONE Button, Pill, Field, Callout, Banner, Note, Dialog and Table. Adoption is on the Pass C and Pass F1 admin frames only (not on older admin frames). A spacing / radius variable collection is added (a Figma pass does this; 'Soccernity Theme' stays the colour collection). (5) ADMIN SHELL SEARCH BAR. It stays visible on admin screens and is NOT functional ('not available yet'). New register row B-114: decide build vs hide. (6) EXCEPTION TO 'NEVER DELETE' (Figma passes). The ten hidden legacy absolute layers inside the ten rebuilt Create Post frames (the 'ARCHIVED -- legacy absolute layer' children from Pass F2 inside 2008:655, 2009:5168, 2009:2913, 6171:14797, 6171:16994, 2496:4462, 2565:3951, 6660:28736, 6660:31044, 6660:33353) may be deleted, and ONLY those. (7) VOTING PAGE ADOPTS THE ALREADY VOTED DESIGN -- closes the open point of #401. The Voting page (desktop 2094:994, mobile 5802:8726) takes the Already Voted page's design (entries column + board column, fan cards) and carries the vote toggle (#401). The separate Already Voted screens (5802:8978 / 5815:8916, and the auto-layout rebuild 6671:27155) are archived AFTERWARDS, by a Figma pass; the Voting &lt;-&gt; Already Voted navigation of #387 therefore goes with them. (8) LIFT HOLD -- changes #398 D1 / #376. Lift hold applies to BOTH the legal hold and the 6-month bad-faith hold. A reason is required. The held user is NOT notified. Appeal Review reuses the shared hold dialogs (Bad faith / Legal hold / Lift hold) used on Report Detail. (9) FORFEIT POP-UP -- AMENDS #400 E11. Shown ONLY on the Contest page. On every load of that page the user sees one pop-up per forfeited week, from when the week is deemed forfeited (docs/contest-spec.md Section 7); the reason is shown; nothing is remembered between loads. The leaderboard Contest tab shows the forfeited writing in place of the three names for that week (no pop-up there). (10) FINAL TASK TEXT -- changes #399 E3. The week-4 task text shows on the live-ranking and uploading states only (not on the 'No winner this month' or crowned states). (11) COMMUNITY-FEED 'FINAL WEEK' MODULE -- AMENDS #400 E10 and the open point carried by #402. The module STAYS. The dead 'View on the Contest page' link is removed. Its videos become a carousel that keeps the current frame size and serves as a preview slot reusable for other showcases later. It shows only during a final contest week and not at all when there is none. OPEN: whether carousel views count as impressions (B-092). (12) MOBILE BLOCK PATTERN: the '...' menu (confirms the Pass F1 trigger, node 6669:27188). (13) CREATE POST FIGMA CHANGES ACCEPTED: the scrim token change (white 71% to color/overlay/scrim) and the typographic crest marks in the Fixtures module of the Create Post frames. Licensing of club crests in Fixtures stays OPEN (#85, #97). (14) FONT: user-facing read-only fields need a Montserrat Field variant (the admin components are Inter). (15) DEFAULTS CLOSING OPEN POINTS: the placeholder name for incomplete profiles is 'Soccernity member' (closes #369's open point); a DOB-correction restart RESETS the decline counter and writes an audit entry (closes #395 B4's open point); the withdrawal throttle default is 5 attempts per 15 minutes, held in configuration (sets the window left open in #395 B3); unverified-email users are blocked from social writes as well as from PATCH /users/:id (extends the guard built under B-020; new row B-118). (16) BANTS -- an OPEN FORUM, no private messages. Anyone can start a thread and others comment on it; likes work as on a blog or forum (one like per user per item, toggled, public count). Accounts aged 16 and 17 have FULL Bants access (the limit in #346 applies to under-16s only, who stay fully disabled); this is a founder decision, not read-only. Bants will have moderation. Block hides the blocked user's posts, comments and like identities in both directions; counts unchanged; no room membership. This settles the 'Bants rooms' and 'exact like mechanics' points #402 item 4 left open; the interaction with #346 / #347 stays open. OPEN, recorded not resolved: 'thread' is not mapped to the built model (BanterRoom #275 vs Post), and 'no room membership' is not reconciled with the built BanterRoomMember join / leave, My Bants and 'posting requires membership' (#275); the scope of 'moderation' beyond room status (#357) is not stated. New row B-117. (17) COUNTRY HAS TWO SEPARATE FIELDS. (a) SAFEGUARDING country: declared at the Age Gate and derived from the IP lookup (B-023..B-025). Stored separately, never shown, never editable by any profile action; it alone decides US under-13 card verification and demographic grouping (#368 stands). (b) PROFILE country: a separate, nullable, OPTIONAL field. It is BLANK at Create Profile (not prefilled, not read-only), the user may fill it in, and it is editable at any time in Edit Profile (B-083). It is shown on a user's profile only if they filled it in, so a minor's country is visible only if the minor chooses to enter it. AMENDS #394 A1 (Country read-only at Create Profile) and the 'country' item of #371 (profile shows country): those rows stand except for these points. DEFAULT, VETO-ABLE: a country select from the full country list. B-038 stores the profile country as its own column, NOT the derived or declared safeguarding fields. Counsel review of country display stays on the legal list with reduced scope because the field is optional. (18) PRODUCTION WIRING (MaxMind, Render environment variables, Postmark, JWT secrets, TRUST_PROXY_HOPS) is deferred to the launch gate B-090; the code fails safe until it is done. (19) NEW REGISTER ROWS: password-reset email placeholder-address fallback (B-115); API test-suite worker flake, the suite needs --maxWorkers=4 (B-116); admin search bar (B-114, item 5). Rows added from the other items: B-113 (Figma re-sync, items 1-14 and 17), B-117 (Bants open forum), B-118 (email-verification gate on social writes). Build register: B-113 to B-118 new; status lines on B-002, B-003, B-006, B-007, B-012, B-013, B-018, B-020, B-023, B-024, B-026, B-027, B-038, B-039, B-042, B-044, B-045, B-054, B-071, B-079, B-080, B-081, B-082, B-083, B-090, B-091, B-092, B-095, B-096, B-098, B-099, B-102, B-103, B-107, B-108, B-112. STILL OPEN: counsel wording for every [COPY PENDING LEGAL REVIEW] item; the Bants mapping questions in (16); build vs hide for the admin search bar (B-114); whether carousel views count as impressions (B-092); whether the 'Closed (not a finalist)' copy may reveal anything about uploads before the reveal; how other users reach a finalist's entry after the reveal; what the Contest tab shows from 00:00 to 08:00 on day 1; which routes count as 'social writes' (B-118); the interaction of Block with #346 / #347; crest licensing in Fixtures (#85, #97); the CSAM path; the length of every window stated as configuration other than the withdrawal throttle. [2026-10-17: Item 15 (unverified-email users cannot perform social writes) is built: B-118 (backend/w3-gates, PR #412). The creating forms are gated by EmailVerifiedGuard; the undo and own-content forms stay open (docs/backend-w3-gates-report.md, section 5, call 1, adopted by #404, item 12). Two open points of this entry are closed by #404: the forfeit pop-up reading of 'Contest page' and several forfeited weeks (item 4), and whether carousel views count as impressions (items 6 and 15).] [2026-10-17: Items 2 and 15 are built in the backend (PR #416): the decline counter is internal and never returned by any API (item 2); a DOB-correction restart resets it and writes an audit entry (item 15, user.dob_corrected). Item 15's unverified-email rule is already noted above (PR #412). The Contest notification question 'does an unverified-email account receive them' is answered by #405, item 4.] [2026-10-18: Figma pass K2 (docs/figma-pass-k2-report.md section 6, candidate 7): item 17's rule 'show the country line only when filled' is unchanged, but the general profile frames show a filled sample country line while the pass H frames hide it; which sample is canonical is not decided (register row B-148).] [2026-10-19: Item 13 (typographic crest marks accepted) is applied by Figma pass K3 on the own Saved frame 6747:29445 (PR #428); fixture crest licensing stays open. K3 found that the K2 profile frames 6747:28894, 6747:29094 and 6747:29291 were not diffed against their legacy twins (#408, B-170).] [2026-10-20: #409 item 2 restates the deferral of item 18 (production wiring waits for the launch gate B-090; the founder is saving money) and extends it to the two Render static sites for apps/web and apps/admin (B-179). At the gate one runbook is produced (B-180, docs/launch-gate-runbook.md).] [2026-10-20: the #409 note above merged in PR #436 (A7). Item 13's crest licensing stays open: nothing in the K4 frames (PR #433) settled it, and #410 records it as an open row with no decision (B-189).]</w:t>
             </w:r>
+            <w:r>
+              <w:t xml:space="preserve"> [2026-10-24: backend W5 (PR #439): item 16 (Block hides posts and comments both ways, counts unchanged; no like-identities list exists, #404 item 10) and item 17 (the profile country is its own column, never the declared or derived safeguarding country, shown only if filled in) are built (B-039, B-038).]</w:t>
+            </w:r>
           </w:p>
         </w:tc>
       </w:tr>
@@ -27175,6 +27229,9 @@
             <w:r>
               <w:t>Resolved -- recorded; DECIDED, NOT BUILT, except item 12, whose judgment calls are already in the shipped code (backend/w3-gates, PR #412). Items 1-14 and 17 are founder-adopted defaults, veto-able; items 15 and 16 are founder decisions and are recorded as given. Item numbers below are the founder's own. (1) ACCOUNT INFORMATION. The Account Information (Edit) frames (2924:7112, 5649:8176) drop the Country field. The profile country lives in Edit Profile, which keeps the label 'Country' (#403, item 17; Figma pass I). The safeguarding country is never shown or edited. (2) PROFILE DESIGN DIRECTION. New auto-layout desktop profile frames (the pass H frames, desktop 6707:26595 and 6707:26727 / 6707:26938) replace the legacy absolute-layout profile frames (1455:4362, 1455:6626, 5702:8250, 5778:8490). Default added in recording, veto-able: the legacy frames are archived (hidden, 'ARCHIVED' prefix), not deleted; the #403 item 6 deletion exception covers only the ten Create Post layers. (3) ADMIN COMPONENTS. The F2 components (node 6671:27364) move to match the admin screens: Pill uses auto line height with padding 3/10; Button gets size variants; Banner and Callout Title become optional; radius/10 and radius/16 are added to the spacing and radius collection. They are then adopted on the Pass C and Pass F1 admin frames with no visible change. This settles the 'which side moves', 'radius scale' and 'optional Title' candidates of docs/figma-pass-g2-report.md; the adoption itself is open Figma work (B-113, B-095). (4) FORFEIT POP-UP. 'Contest page' means the Contest details page and the Voting page. When several weeks are forfeited, one pop-up opens after another, oldest week first. Closes the two SCOPE OPEN points of Figma pass G1 and refines #403, item 9 (every load, reason shown, nothing remembered: unchanged). (5) VOTE TOGGLE. The vote count updates live by one, in either direction, when the toggle flips. No banner appears on toggle. Closes the SCOPE OPEN point of Figma pass G1 (#401, #403 item 7). (6) CAROUSEL IMPRESSIONS. Final-week carousel views count as impressions when a tile is actually visible; tile order follows the balanced rotation of #388 (docs/contest-spec.md, section 10b). Closes the open point of #403, item 11 and of B-092. OPEN (not stated): what 'actually visible' means in numbers (share of the tile in view, time in view). (7) 2FA RECOVERY. 10 backup codes, shown once, each in 5-5 groups (interpretation: ten characters shown as two groups of five; the character set is not stated). Regenerating needs the password and invalidates the old set. Turning 2FA off invalidates the codes. A wrong code and an already-used code give the same 'not accepted' message. 5 wrong tries in 15 minutes lock recovery for 15 minutes (ASSUMED per account, not per IP; a per-account lock lets a stranger lock out an account holder, a trade-off to confirm). Password re-entry is needed only to turn off and to regenerate. The 'check your email' page reads the same for unknown accounts (non-enumerating). Backup codes appear after the 6-digit code is accepted, before the '2FA is on' screen. Entry points: a 'Can't scan?' link (manual key) and a Turn off control. Closes the backup-code format and entry-point open points of #402 and Figma pass H; STILL OPEN: storage and encryption of the TOTP secret, counsel (legal copy Part C row 44). (8) BLOCKED USERS LIST. No date is shown; the reason is not editable (unblock and re-block to change it); the reason is visible to the blocker only. A blocked user sees the blocker's profile as not found (settles the SCOPE OPEN 'blocked user's own view' of Figma pass H; whether a new not-found frame is needed or the app's existing not-found state is reused is a Figma follow-up). (9) PINNED FINAL ENTRY. Others see nothing before the reveal. After the reveal the entry is pinned on the finalist's profile until the contest ends at the end of that month; then the pin is removed and the entry is an ordinary post. The label stays 'Contest post'. Item 15 repeats and extends this; where the wording differs, item 15 prevails (see item 15). (10) BANTS. A room is a thread (BanterRoom is the thread; comments are the posts in it). Posting and commenting need NO membership. 'Join' stays as a bookmark that feeds My Bants. Moderation means reporting plus admin moderation. This SUPERSEDES the 'posting requires membership' point of #275 and closes the open points of #403 item 16 and of B-117 (thread mapping, no room membership, moderation scope). Recorded as an interpretation to confirm: no like-identities list is built (none exists today), so the Block clause about like identities leaves counts unchanged. Unchanged: 16-17 full access, under-16 fully disabled (#346), Block effects (#402 item 4). (11) BLOCK AND THE AGE RULES. Block applies on top of the age rules (#346, #347). The age rules apply first. A block never reveals itself: no response, count or error tells the blocked user they are blocked. Closes the open interaction point of #402 item 4 and B-039. (12) BACKEND W3 JUDGMENT CALLS. Calls 1-7 of docs/backend-w3-gates-report.md, section 5, are adopted: (1) the restricted-pending write block is uniform and covers the undo forms, while the unverified-email block covers only the creating forms; (2) read-state and kickoff-alert subscription routes stay open; (3) the profile gate covers posting-class routes only; (4) an open incorrect-details report blocks approval and card payment, not decline or withdraw, and survives a guardian-email change; (5) username set means profile complete; (6) the approval email links to /login; (7) displayName is no longer a fallback anywhere other users can see it. BUILT (PR #412). Forward-pointers on #369, #370, #372, #373 and #403. (13) CONTEST TAB ON DAY 1. From 00:00 to 08:00 on day 1 the Contest tab shows the Between Weeks state, variant 'Week 1 opens at 08:00'. Closes the open E6 point of #403. Note: this window is 8 hours, not the 12 hours of the Between Weeks state of #400. (14) STANDING FIGMA CHECK. The whole-canvas depth-4 get_metadata pull is replaced by a findAll count per top-level node plus a top-level id hash, taken before and after. Reason: the page holds about 139,000 nodes and the pull cannot return (docs/figma-pass-g1-report.md, docs/figma-pass-h-report.md). (15) FINAL-WEEK ENTRY JOURNEY. After the reveal, finalist names on the leaderboard Contest tab open the finalist's profile, where the entry is pinned. Final-week carousel tiles open the entry itself. The entry does not also appear as a normal Community-feed post; the carousel is the daily exposure (balanced rotation, #388). A tile shown in the viewport counts as an impression. The pin lasts until the contest ends at the end of that month, then it is removed (replaces the wording of item 9). Closes 'how other users reach a finalist's entry after the reveal' (#400 E10, #403). OPEN (not stated): whether the entry, once the pin is removed, then appears in the Community feed; item 9 says it becomes an ordinary post, item 15 says only that the pin is removed. (16) CONTEST NOTIFICATIONS (founder decision; the spec had none). In-app notifications, all times Europe/London, to every non-restricted account that is eligible for the Contest under the existing rules (docs/contest-spec.md, sections 6 and 8: minors included, restricted accounts excluded): (a) week opens, 08:00 on days 1, 8, 15, 22; (b) votes-closing reminder, 19:00 on days 7, 14, 21, only to eligible accounts that have not voted that week; (c) week result, when votes lock at 20:00 on days 7, 14, 21: winners announced to everyone, plus a personal notification to each winner; (d) final qualification: a personal notification to each finalist saying the entry stays hidden until the reveal; (e) reveal, 00:00 on day 25: 'The final is live' to everyone; (f) final result: the winners, or 'No winner this month'; (g) forfeits need no extra notification, the pop-up covers them; (h) finalist upload reminder, 12:00 on day 24, to finalists who have not uploaded (default added by Claude, veto-able). One notification per account per event; a re-run never duplicates. Push and email are not decided and stay deferred to launch gate B-090. Wording is functional and tagged [COPY PENDING LEGAL REVIEW] where it reaches minors. ASSUMED, to confirm: (d) is sent when the finalists are known, at the week-3 result (20:00 on day 21); (f) is sent at the end of the contest month, because the spec states no crown moment; a forfeited week sends no (c) notification; whether an account with an unverified email receives them is not stated. BACKEND TO CONFIRM: a uniqueness key per (account, event, contest cycle, week) is needed for 'never duplicates'; Notification.type is a free string, but NotificationsService and the Notification Centre must learn each new type (the age_milestone and match_kickoff precedent: an unrendered type shows a generic row). (17) REGISTER. New rows B-119 to B-123 (admin incorrect-details reports list and resolve, Figma and code; Contest notifications backend, Figma states and frontend); status lines on the rows named in docs/build-register.md Section 14; the B-034 cursor and ordering leak stays on B-034. NOT DECIDED HERE: the visibility threshold in item 6; the TOTP secret storage; the notification timing assumptions in item 16; whether the unpinned entry reaches the Community feed. Dated notes were appended (original text unchanged) to #369, #370, #372, #373 and #403 only; #275, #400, #402 and #396 are amended in substance by this entry but were not edited, #404 is the record. [2026-10-17: Item 16 (Contest notifications) is BUILT as B-122, backend only, in-app only (backend/w3c-contest-notifications, PR #417; docs/backend-w3c-contest-notifications-report.md): the calendar is computed in a new module (no Contest calendar existed in code; B-091 is not built), the BACKEND TO CONFIRM uniqueness key is Notification.dedupeKey (nullable, UNIQUE, additive migration 20261017160000), and (d) and (f) are implemented at the ASSUMED timings. Follow-up decisions in #405 close open points of this entry: the conflict between items 9 and 15 (item 1 of #405), 'actually visible' for carousel impressions (#405, item 7), the TOTP secret storage and the backup-code character set (#405, item 8), whether an unverified-email account receives Contest notifications (#405, item 4), the notification destinations (#405, item 2) and the legacy profile frames (#405, item 9). The roles that may use the DOB tools: #405, item 5.] [2026-10-18: Item 12 / B-034 built: cursor and ordering leak closed; lists order by username, cursors carry username and id only. Open points on the pin, the impression second and the notification wording are closed or amended by #406, items 5, 6 and 7.]</w:t>
             </w:r>
+            <w:r>
+              <w:t xml:space="preserve"> [2026-10-24: backend W5 (PR #439) built items 8 and 11 as written (the blocked-users list with no date; the blocked user sees the blocker's profile as not found; Block applies after the age rules and never reveals itself); #411 item 5 settles the remaining Block points (B-197).]</w:t>
+            </w:r>
           </w:p>
         </w:tc>
       </w:tr>
@@ -27259,6 +27316,9 @@
             <w:r>
               <w:t>Resolved -- recorded. FOUNDER-ADOPTED DEFAULTS, VETO-ABLE, all thirteen items. DECIDED, NOT BUILT, except item 8 (as built in W4, PR #420), item 9 (the drawing exists, Figma pass K) and item 10 (as built in FC2, PR #421), which confirm what already exists. Item numbers are the founder's own. Original text of every entry named in the forward-pointers below is unchanged (dated notes appended). (1) DECLINED-AT-1-OR-2 ROWS EXPIRE (closes B-126 in principle). A guardian-consent row declined at decline 1 or 2 and not reopened (no resend, no change of guardian email) within 14 days (a configuration value) takes the same lapse path as an unanswered request (#337-#340, #389). The backend agent confirms the mechanics before building: where the 14 days start, whether the one automatic re-send and warning comes first or the row goes straight to the second-lapse outcome, and that an expiry does not count among the three declines (#389). Resolves, in principle, the conflict with legal copy v0.8 Part 4.4 (a minor's account cannot remain restricted-pending indefinitely); counsel still to review; the legal copy is not edited here. (2) LIGHT THEME. The onboarding, guardian and consent screens in apps/web move to the light theme to match their Figma frames: Age Gate, Guardian Details, Guardian Consent, Verify Email and its prompt, Create Profile and the Club Picker step (the set the FC2 browser check found dark). No new colour. Build row B-127. (3) RESEND VERIFICATION. A rate-limited resend-verification-email endpoint is added; #37 recorded that none exists. The limits, and who may call it, are set in the build PR and are not decided here. Build row B-128. (4) DATE OF BIRTH ON USER DETAIL. User Detail reads without the date of birth; the DOB appears only on the correction form; the server rejects a correction reason that contains a date. Amends #405 item 5 and #398 D4 (GET /admin/users/:id returned the decrypted DOB, each view audited): roles are unchanged (moderator and superadmin). For the backend agent to confirm: how the form gets the current DOB (a separate read), whether that read is audited like user.dob_viewed, and which date formats the reason check rejects (a reason cannot be proven free of every date form). Build row B-129. (5) PIN REMOVAL TIME. The pin is removed from the finalist's profile at 00:00 Europe/London on the 1st of the month after the contest month, and at that moment the final entry becomes an ordinary Community-feed post. Closes the 'time of day of the flip' open point of #405 item 1. B-091, B-092, B-082. (6) IMPRESSION SECOND. The 1-second view of #405 item 7 is continuous (the tile stays at least 50 percent in view for one uninterrupted second); a re-entry counts again, within the per-viewer daily cap of #388 (week 4 only). Closes the two 'not stated' points of #405 item 7. B-092. (7) NOTIFICATIONS. Notification icons as drawn in Figma pass K are accepted; the Notification Centre empty-state line and the coming-soon line are updated to mention Contest. Observation, not a decision: the coming-soon line written under #279 already names 'Contest activity' as upcoming, which is no longer true now that Contest notifications exist; the Figma agent sets the final wording. B-121, B-123. (8) USERNAME. A 30-day change cooldown with one free correction (as built, B-032) and no hold on a handle the user releases; the 30-day hold applies to an admin revoke only (#398 D3, #402 item 3). Not addressed: a handle released by anonymisation is released immediately as built; whether to hold it is not decided. B-032, B-033. (9) INCORRECT-DETAILS SCREEN. The founder accepts the admin screen as drawn in Figma pass K (8 frames, docs/figma-pass-k-report.md); B-120 builds from it, with no field, column or control beyond the frames. The four SCOPE OPEN notes of that pass (confirmation step, host sidebar item, success message, link to User Detail) are settled only where the drawing settles them. B-119, B-120. (10) RESTRICTED MINORS. A restricted-pending minor may open pages by URL read-only; there is no front-end route block and the server still blocks every write (#370, #12). Confirms the shipped behaviour. B-026, B-125, B-076. (11) STATUS RESPONSE. The status response adds the guardian's first name and the last decision date, never the decline count. The founder did not name the response; the reading is the minor's GET /auth/guardian-consent/status. For the backend agent to confirm: how a first name is derived from the single full-name field (Option A, #393), what 'last decision' covers (decline, approval, withdrawal) and whether a column is needed (the schema has no decline timestamp). Build row B-131. (12) BLOCKED NOT-FOUND. A blocked user's not-found view is identical to the generic not-found view and to a non-existent profile (same page, same status; nothing reveals a block). Confirms #404/#396 and the Figma pass K frames. B-007, B-039, B-082, B-108. (13) GUARDIAN CONFIRM FOOTNOTE. The footnote 'Declining closes the account and schedules it for deletion' on the guardian confirm page is wrong for declines 1 and 2; it is replaced by the existing cap sentence addressed to the guardian, tagged [COPY PENDING LEGAL REVIEW]. The change alters guardian-visible wording, so CONSENT_SCREEN_VERSION is bumped (v3 to v4) with the tripwire hash (#348) and the pending-copy manifest row is replaced. Found while checking, NOT covered by the founder's wording: the page's post-decline state ('Your decision has been recorded ... will be scheduled for deletion') has the same fault. Build row B-130. (REGISTER) B-124 scope is apps/web and apps/admin only (as built); the services/api email wording tagged [COPY PENDING LEGAL REVIEW] is added to docs/pending-copy-manifest.md as OPEN (three templates tagged in code comments: guardian-approved-minor, the third-decline guardian-consent-declined, username-revoked; other child- and guardian-facing templates carry no tag). New rows B-127 to B-139: B-127 light theme, B-128 resend verification, B-129 User Detail without the DOB, B-130 guardian confirm footnote, B-131 status response fields, B-132 horizontal overflow at 390 px, B-133 Edit Profile username (never send null; show the error codes), B-134 real-API end-to-end smoke test, B-135 Figma approval-on-hold, B-136 Figma verify-email prompt, B-137 Figma guardian fields of the DOB correction, B-138 Figma general profile frames (plain other-user; own Posts, Media, Saved) that must exist before the four legacy profile frames 1455:4362, 1455:6626, 5702:8250 and 5778:8490 can be archived, B-139 RevokedUsername retention and appeal path (OPEN, no decision). Status lines on 27 register rows. 139 B-IDs; 146 gap frames unchanged. Arithmetic: docs/build-register.md Section 22. (FORWARD-POINTERS) Dated notes appended (original text unchanged) to #364, #367, #368, #369, #398, #402 and #404 (from docs/backend-w4-username-report.md section 7) and to #37, #389, #395 and #405 (points #406 amends or closes). NOT DECIDED HERE: the retention and appeal path of RevokedUsername (B-139, OPEN); the mechanics of item 1; the limits of item 3; the form of the DOB read in item 4; the final wording of item 7; the response and derivation in item 11; the post-decline state in item 13; whether the pending-copy guard is ever extended to services/api; counsel wording of every [COPY PENDING LEGAL REVIEW] string. [2026-10-18: Built in W3d (PR #424, docs/backend-w3d-report.md section 7), backend only: item 1 as B-126 (14 days counted from the new Guardian.consentDeclinedAt; the automatic re-send and the minor's warning come first; an expiry does not count among the three declines); item 3 as B-128 (POST /auth/resend-verification-email, unauthenticated and keyed by email, 5 per 60 s per IP plus 3 per hour per account, one response for every outcome); item 4 as B-129 (see #405); item 11 as B-131 (guardianFirstName and lastDecisionAt on the minor's status response, the decline count never returned). Frontend legs of items 3, 4, 11 and 13 are not built. Figma pass K2 (PR #425, docs/figma-pass-k2-report.md) drew B-135 to B-138 and archived the four legacy profile frames; its open candidates are rows B-144 to B-150. The QA end-to-end run (PR #426) checked items 3, 4 and 13 and measured the 390 px overflow: D-08, D-07, D-10 and D-11/D-12 map to B-128, B-129, B-130 and B-132; the other defects and gaps are mapped in docs/build-register.md Section 25 and recorded in #407.] [2026-10-19: Built since: item 2 (light theme), item 3 (the resend button), item 11 (the screens that show the guardian's first name and the decision date) and item 13 (the footnote replaced by the cap sentence, CONSENT_SCREEN_VERSION v4) by FC3a (PR #430); item 4 (User Detail on the summary read, the DOB only on the correction form, the reason-date message) and item 9 (the incorrect-details reports screen) by FC3b (PR #431). Register instruction on the general profile frames (B-138): Figma pass K3 (PR #428) found that K2's replacements were not diffed against their legacy twins; see #408 and B-170.] [2026-10-20: item 13: K4 (PR #433) replaced the old 'Declining keeps...' footnote with the cap sentence on the guardian frames; #410 item 6 makes the Figma footnote the reference and adds its link-expiry and withdrawal sentences to the code footnote, tagged (B-185).]</w:t>
             </w:r>
+            <w:r>
+              <w:t xml:space="preserve"> [2026-10-24: K5 (PR #438): item 13 - the Figma guardian-confirm footnote is final and each of its three guardian/child sentences carries its own [COPY PENDING LEGAL REVIEW] tag (docs/figma-pass-k5-report.md section 6); item 12 - built by backend W5 (PR #439): a blocked viewer gets the same 404 as a missing profile.]</w:t>
+            </w:r>
           </w:p>
         </w:tc>
       </w:tr>
@@ -27301,6 +27361,9 @@
             <w:r>
               <w:t>Resolved -- recorded. FOUNDER-ADOPTED DEFAULTS, VETO-ABLE, all seven items. DECIDED, NOT BUILT, except item 6, which confirms what is already built (W3d, PR #424). Item numbers are the order of the founder's instruction. Original text of every entry named in the forward-pointers below is unchanged (dated notes appended). Source: the QA run of PR #426 (docs/qa-e2e-onboarding-report.md): 165 browser tests against the real API, 17 defects (D-01 to D-17) and 3 gaps (G-1 to G-3). (1) CORS (QA D-01, BLOCKER / SAFEGUARDING). apps/web/src/api/auth.ts registerUser sends credentials 'include' and services/api/src/main.ts calls app.enableCors() with no options (it answers '*'); browsers refuse that combination, so sign-up fails in every browser when web and API are on different origins, as in production, and no request reaches the API. Decided: registerUser stops sending credentials 'include'; the API restricts CORS to the origins in WEB_APP_BASE_URL and a new ADMIN_APP_BASE_URL, plus localhost origins in development. The new variable is added to render.yaml (both services), .env.example and the env-completeness check; the founder sets its production value in Render. The API sets no cookie and returns the refresh token in the response body, so the credentials option appears to have no function (to confirm in the build PR). Not decided: what the API does when a variable is unset in production, and origins other than the two apps. Build row B-140 (W1). (2) AGE-5 FLOOR (QA D-02, BLOCKER / SAFEGUARDING). #19 says signup is hard-blocked below age 5 regardless of guardian consent, but the floor exists only in the web Age Gate: POST /auth/register with a date of birth 4 years ago and a valid guardian block returns 201 and creates the account and the guardian request. Decided: the floor is enforced server-side with a 400; exactly age 5 stays accepted. Not decided: the error code and message; the build PR checks the DOB-correction tool (#390) cannot set a date of birth below the floor. Build row B-141 (W1). (3) USERNAME FILTER (QA D-06). Hate and sexual terms glued to other letters (xxhitlerxx, nazifan) are accepted because the filter's EXACT list matches only the whole handle or an underscore token. Decided: long, unambiguous terms are matched by CONTAINS, with a tested list of innocent words that must still be accepted; short or ambiguous terms stay exact. Not decided: the term lists and the length threshold (set in the build PR, for founder review). Build row B-142 (W4). (4) 'FOLLOW' PROMISES (QA D-13). The restricted-pending view says 'Browse and follow' and the guardian page lists 'Follow teams and check scores', but a restricted-pending minor's follow is refused with 403 (#370). Decided: both screens stop promising follow and the wording says what works, tagged [COPY PENDING LEGAL REVIEW] and added to the pending-copy manifest; the guardian-page change is guardian-visible, so CONSENT_SCREEN_VERSION and the tripwire hash (#348) are bumped under the rule of B-130. The Figma frames are not checked here for the same promise. Build row B-154 (W9). (5) GUARDIAN APPROVAL SCREEN (QA D-09). After approval the guardian is told 'The account is now active', but the minor still has to verify email and create a profile. Decided: the screen no longer says the account is active; it says the approval is recorded and registration continues ([COPY PENDING LEGAL REVIEW]), matching the Figma Approved screens (#403 item 3). Build row B-153 (W9). (6) STALE-DECLINE RE-SEND STAYS. A guardian who declined at decline 1 or 2 is still sent a new consent request by the platform when the row lapses after 14 days (#406 item 1, built as B-126), after the minor is warned. This settles judgment call 1 of docs/backend-w3d-report.md (section 5). The alternative, warning the minor and closing after a further window without re-sending, stays a one-place change (GuardianStaleDeclineSweepService); the cap of three declines bounds the re-sends. Counsel review of legal copy v0.8 Part 4.4 is still pending. Rows B-126, B-102. (7) LEGACY SAVED FRAME. The Figma frame 1460:8940 (own Saved, absolute layout) is archived, now that 6747:29445 replaces it (Figma pass K2, candidate 2): hidden and renamed 'ARCHIVED - ...', nothing deleted, after a page-wide reference scan, and added to docs/figma-archive-index.md. Build row B-144 (W0). (REGISTER) docs/build-register.md Section 25: B-140 to B-162 added (23 rows); every QA defect and gap, every open item of the W3d report (section 6) and every K2 candidate (1-10) is mapped to a row, reused (B-120, B-128, B-129, B-130, B-131, B-132, B-133, B-134, B-078, B-138) or new. D-01 and D-02 are marked BLOCKER / SAFEGUARDING. Status lines on 23 existing rows. 162 B-IDs; 146 gap frames unchanged. Arithmetic: Section 25g. (FORWARD-POINTERS) Dated notes appended (original text unchanged) to #19, #199, #337, #338, #339, #340, #368, #369, #370, #377, #389, #395, #402, #403, #405 and #406 (the W3d report's section 7 pointers, the status of K2 and of the QA run). NOT DECIDED HERE: the behaviour when an origin variable is unset in production, and any further CORS origin; the error code of the 400; the term and innocent-word lists; the Figma side of the 'follow' promise; the post-decline state of the guardian confirm page (D-10, same fault as the footnote of #406 item 13, still not covered by the founder's wording); K2 candidates 1, 3, 4, 6, 7, 8 (register rows B-147 to B-150 are OPEN); the W3d open items on earlier verification links (B-160) and on a non-active account with a stale decline (B-161); counsel wording of every [COPY PENDING LEGAL REVIEW] string. [2026-10-19: Built since: items 1, 2 and 3 and the expired-consent email by backend/w3e (PR #429: B-140, B-141, B-142; the email half of B-158); items 4 and 5 and QA defects D-03 to D-05 and D-08 to D-17 by FC3a (PR #430; D-15 and D-17 in part); D-07, G-1 and G-2 by FC3b (PR #431); item 7 (the archive of 1460:8940) by Figma pass K3 (PR #428, B-144). The open point of item 1 (what the API does when an origin variable is unset in production) is decided by #408 item 1: it refuses to boot (B-163). Item 3 is amended by #408 item 3: the exact whole handles nazif, nazifa and nazifah are allowed (B-165) and the term lists W3e built stay open for review. The error code below_minimum_age and its message are W3e's choice and are still not confirmed. The QA harness's CORS proxy is gone (PR #429).] [2026-10-20: #409 item 1 fixes the origins the CORS allow-list names: WEB_APP_BASE_URL is the https origin of the web static site and ADMIN_APP_BASE_URL that of the admin static site, each separate from the API's own origin (B-179). Both must be set to the final https origins in production (the API refuses to boot otherwise, B-163). Nothing is deployed before the launch gate B-090.] [2026-10-20: the #409 note above merged in PR #436 (A7). W3f (PR #434) built the boot refusal for an unset or invalid origin variable (the open point of item 1, B-163) and the Nazif allow-list (item 3, B-165); #410 item 2 changes the allow-list rule (B-181). Item 4: the Restricted Pending frames 5108:6630 / 5531:7461 still carry the 'Browse and follow' wording the code dropped (D-13); K5 fixes them (B-191, #410 item 8).]</w:t>
             </w:r>
+            <w:r>
+              <w:t xml:space="preserve"> [2026-10-24: K5 (PR #438), item 4 (QA D-13): the Restricted Pending frames 5108:6630 / 5531:7461 now say 'Browse and read' instead of 'Browse and follow' (B-191).]</w:t>
+            </w:r>
           </w:p>
         </w:tc>
       </w:tr>
@@ -27343,6 +27406,9 @@
             <w:r>
               <w:t>Resolved -- recorded. FOUNDER-ADOPTED DEFAULTS, VETO-ABLE, all eight items. DECIDED, NOT BUILT, except item 7, which confirms what is already built (PRs #428, #430, #431). Item numbers are the order of the founder's instruction. Original text of every entry named in the forward-pointers below is unchanged (dated notes appended). Sources: the open points of backend/w3e (PR #429), FC3a (PR #430), FC3b (PR #431) and Figma pass K3 (PR #428). (1) PRODUCTION BOOT CHECK (settles the open point of #407 item 1). W3e built CORS fail-closed with a boot log: an unset, non-URL, placeholder or (in production) unusable WEB_APP_BASE_URL or ADMIN_APP_BASE_URL contributes no origin and a [cors] line is logged, but the API still starts, so a bad production deploy comes up healthy and no browser can call it. Decided: in production the same condition refuses to boot, through assertProductionEnv (services/api/src/validate-runtime-env.ts), the way a missing or placeholder JWT_SECRET or ADMIN_JWT_SECRET already does (B-018). Outside production nothing changes (log only, localhost allowed). The build reuses the test cors-options.ts already applies and does not write a second one. Render sets NODE_ENV=production at runtime on both services, so staging is covered as well and each service needs both values before its next deploy (to confirm in the build PR). Not decided: origins other than the two apps (preview deployments, a mobile web view). Build row B-163 (W1). (2) CROSS-TAB REFRESH LOCK. The refresh token rotates and the server treats a second use of an old token as reuse; apps/web/src/lib/silentRefresh.ts is single-flight inside one tab only, so two open tabs that refresh together can log the person out. W3e found it when a test went intermittent and worked around it in that one test; it is not a test problem. Decided: a cross-tab lock so only one tab calls POST /auth/refresh at a time; the other tabs wait and then use the tokens the first tab stored. The alternative W3e named, a short server-side reuse grace, is not chosen and the server's reuse detection is unchanged. Not decided: the mechanism (Web Locks API, a storage-based lock or a BroadcastChannel); the build PR picks it and states its fallback. Build row B-164 (W9). (3) USERNAME FILTER (extends #407 item 3). Decided: the exact whole handles nazif, nazifa and nazifah are allowed (real given names; W3e refused them because they cannot be told from nazi + fan); nazifan and every other glued form stay refused. HOW: they are an exact allow-list of whole handles checked before the CONTAINS rule, not substring exceptions. Adding nazif to the named innocent exceptions of the nazi rule would cut it out of nazifan, leave 'an', and accept it. Handles that only contain a name (nazif_10, nazifa2, xxnazifxx) are not covered by this decision; under the adopted reading they stay refused; whether suffixes should be accepted is not decided. RECORDED AS BUILT AND LEFT OPEN FOR THE FOUNDER'S REVIEW, verbatim from docs/backend-w3e-report.md (D-06): CONTAINS, 5+ letters and unambiguous: hitler, pussy, paedo, swastika, whitepower, gangbang, deepthroat, creampie, orgasm, masturbat, erotic. nazi is four letters and sits in real names, so it is CONTAINS with named innocent exceptions (nazir, nazim, nazia, nazih, nazik): those are cut out, the rest is searched; nazifan, xxnazixx and nazirnazi are refused, nazir_10 is accepted. Short or ambiguous terms stay exact: dick, cock, rape, ass, sex, sexy, anal, cum, pedo, isis, kkk, twat, wank, ... (the report's list ends with '...'; the full exact list is PROFANITY_EXACT in services/api/src/modules/users/username-rules.constants.ts: dick, cock, anal, anus, sex, sexy, rape, nazi, kkk, isis, pedo, tits, boobs, ass, arse, twat, wank, cum, nude, nudes). Tested: 18 glued or leet refusals, guarded-term cases, short-term-exact cases and a 37-handle innocent list (Essex, Sussex, Hancock, Hitchcock, Peacock, Dickson, Nazir, Torpedo, ...). Known false positives unchanged and deliberately not in the list: scunthorpe, penistone, therapist. The 5-letter threshold, every list above and the innocent list are W3e's adopted defaults; none is decided here. The older CONTAINS terms from B-032 (fuck, shit, ... terrorist) are outside this review. Build row B-165 (W4). (4) SEMANTIC/ALERT IN CODE. Decision Log #99 authorised semantic/alert (#FA0606, Light = Dark) in Figma only, as a deliberate exception to non-negotiable #3 (loss, destructive or alert colour only). Decided: the token is authorised in apps/web and apps/admin for error callouts. Adopted reading, veto-able: the colour is the non-text accent (bar, border, icon) of an error callout, not text colour and not a button fill, because the Settings rebuild (PR #116) measured white on semantic/alert at 4.12:1, below AA; error text stays navy. Not covered and left as they are: the Grassroots LIVE indicator and the notification unread dot (brand green), destructive buttons (navy). CLAUDE.md non-negotiable #3 is not rewritten; #99 and this entry are the recorded exception for code. Build row B-166 (W9). (5) REVOKE USERNAME HOLD LINE (admin-facing only). The three Revoke username frames (dialog 6647:25789, success 6649:24462, error 6649:24714) say only what is removed. Decided: the frames and the dialog gain a line saying the username is held for 30 days (the backend already holds a revoked handle for 30 days for everyone, #402 item 3, and the response carries heldUntil). Admin-facing only: the email to the revoked user and every user-facing screen are unchanged. Adopted reading, veto-able: the line goes in the dialog and the success frame; the error frame gets none because it says nothing was changed. Not decided: the exact wording (set in the Figma pass), whether the success frame shows the date from heldUntil, and whether the line takes [COPY PENDING LEGAL REVIEW] (the existing dialog body already does). Build rows B-167 (Figma, W0), B-168 (apps/admin, W9). (6) POST-DECLINE CLAUSE TAGGED. The guardian page's declined state says 'You have declined permission for this account, so it stays switched off.' That clause is not founder wording, was not tagged by FC3a, and #406 does not cover the state. Decided: it is tagged [COPY PENDING LEGAL REVIEW] and gets a docs/pending-copy-manifest.md row. Consequence for the build, not a decision: the tag is part of the guardian-visible text the tripwire hashes, so CONSENT_SCREEN_VERSION and CONSENT_SCREEN_TEXT_HASH must be bumped in the same PR (#348); the manifest row is added with the tag, never before it (the inventory test fails on a row with no matching string), so this docs pass does NOT add it. Build row B-169 (W9). (7) KEPT AS BUILT (confirms what exists; no build row): (a) the link on the Users list that opens the incorrect-details reports screen (FC3b added it outside the frames; the frames left the entry point SCOPE OPEN); (b) the one-row 'Copy Profile Link' menu on the own Saved frame 6747:29445 (K3 open point 1); (c) the hidden K2 column 6747:29556 inside 6747:29445 stays until the launch gate, then is deleted with the other hidden ARCHIVED originals (B-090); (d) the revocation history (usernameRevocations in the user summary) stays not shown. (8) Mobile header: signed in, the mobile header follows the Figma header (logo, search field, avatar that opens the Navigation Drawer) and the nine-icon row is removed (FC3a left it in; QA B-132 note updated). Logged out, Figma draws no navigation; K4 draws a logged-out mobile navigation (a menu control opening a drawer with the public sections plus Login and Sign up) and FC4 builds it. Until FC4 merges, logged-out visitors keep the scrolling icon row. Build row B-178 (W9; FC4 depends on both this PR and K4). (K3 FINDING, recorded, not a decision) Figma pass K3 rebuilt the own Saved desktop frame 6747:29445 after finding that K2's version was a single-column simplification of the legacy frame 1460:8940, because K2 checked counts and bounds only. The K2 replacement frames 6747:28894 (other user, Posts), 6747:29094 (own, Posts) and 6747:29291 (own, Media) were not diffed against their legacy twins and very likely carry the same simplifications; their twins 1455:4362 and 1455:6626 were archived on K2's say-so. The K2 claim that B-138 closes on the design side therefore does not hold for those three frames. The fix is a diff-first pass, K4, that does what K3 did and leaves the legacy frames archived (nothing deleted). Build row B-170 (W0). (REGISTER) docs/build-register.md Sections 27 and 28: B-163 to B-178 added (16 rows); items 1 to 6, item 8 and the K3 finding each have a row; the W3d items not built map to B-160 and B-161 (already rows, reused, no duplicate), B-171 and B-172 (new, OPEN); the apps/admin developer notes are B-173; the mobile verify-prompt and Club Picker comparisons are B-174 and B-175; the guardian confirm layout is B-176; B-177 (the guardian frames that still say 'follow') is added beyond the founder's list because FC3a records it as open and no row owned it. Status lines on 26 existing rows (B-132 gets a note under item 8). 178 B-IDs; 146 gap frames unchanged. Arithmetic: Sections 27e and 28b. (FORWARD-POINTERS) Dated notes appended (original text unchanged) to #19, #99, #348, #369, #377, #389, #390, #395, #396, #398, #402, #403, #406 and #407 (what W3e, FC3a, FC3b and K3 built or found). NOT DECIDED HERE: the wording and the list of public sections of the logged-out mobile drawer (item 8); origins other than the two apps; the lock mechanism; whether handles that merely contain nazif, nazifa or nazifah are accepted; every term list, the 5-letter threshold and the innocent list; any use of semantic/alert beyond error callouts and its use as text colour; the wording of the hold line, its date and its tag; the final wording of the post-decline clause (counsel); which legacy twin belongs to which K2 frame; the error code below_minimum_age and its message (W3e's choice, still not confirmed since #407); the open W3d items B-160, B-161, B-171 and B-172; whether the Figma frames carry the same fixes (B-177); counsel wording of every [COPY PENDING LEGAL REVIEW] string. [2026-10-20: built since: items 1 and 3 by W3f (PR #434: B-163 boot refusal, B-165 allow-list); items 2, 4, 5, 6 and 8 by FC4 (PR #435: B-164 cross-tab lock, B-166 semantic/alert for admin error callouts, B-168 hold line, B-169 tagged clause with CONSENT_SCREEN_VERSION v5, B-178 mobile header and the logged-out drawer, built to the K4 frames). K4 (PR #433, B-170): the three K2 profile frames were diffed and rebuilt; its OPEN items are decided or tracked in #410. #410 amends item 3 (allow-list rule, B-181), approves item 5's wording as built, keeps item 7 as built (the one-row Copy Profile Link menu now also on own Posts; the hidden K2 columns until the launch gate), and records item 2's same-tab case as a known limitation (B-182).]</w:t>
             </w:r>
+            <w:r>
+              <w:t xml:space="preserve"> [2026-10-24: K5 (PR #438), item 8: the logged-out mobile header is a variant of the shared navbar set and the logged-out drawer a standalone component (B-183); the prototype links on them are not wired (B-202).]</w:t>
+            </w:r>
           </w:p>
         </w:tc>
       </w:tr>
@@ -27426,6 +27492,51 @@
           <w:p>
             <w:r>
               <w:t>Decided 2026-10-20 (founder-adopted defaults, veto-able). Items 1 and 7 confirm what is built (FC4, PR #435); items 2-6 and 8 are DECIDED, NOT BUILT. Docs only: no code, Figma, legal copy, DPIA or Log Book. (REGISTER) docs/build-register.md Section 30: new rows B-181 (username allow-list v2, item 2), B-182 (refresh race known limitation, item 3), B-183 (Figma Logged Out variants, item 4), B-184 (mobile sample values, item 5), B-185 (guardian footnote in code, item 6), B-191 (K5 Restricted Pending frames, item 8), and for the instructions that came with the decisions: B-186 (apps/web developer-notes sweep and guard), B-187 (the four calc(100vh - 90px) pages), B-188 (K2 notes, K4 OPEN 7), B-189 (crest licensing, K4 OPEN 9; OPEN, NO DECISION), B-190 (wording check of the withdrawal-confirm frames 6654:76 / 6654:26801), B-192 (held-until date on the revoked state; OPEN, NO DECISION). Status lines on 14 existing rows (B-002, B-124, B-132, B-138, B-146, B-154, B-164, B-165, B-166, B-167, B-168, B-169, B-170, B-178), taken from the status-line sections of the W3f, K4 and FC4 reports, none dropped. 192 B-IDs (was 180); 146 gap frames unchanged. Arithmetic: Section 30d. K4 OPEN items 1-9 are each mapped in Section 30a: 1 (item 7), 2 (item 5), 3 (item 6), 4 (item 8 for the Restricted Pending frames; B-190 for the withdrawal-confirm frames), 5 (item 1 for wording, tag and the error-frame line; the date is B-192), 6 (item 4; the placement of the menu control is not decided separately), 7 (B-188), 8 (item 7), 9 (B-189). (FORWARD-POINTERS) Dated notes appended (original text unchanged) to #26, #85, #97, #99, #284, #286, #348, #369, #398, #402, #403, #406, #407, #408 and #409: W3f (PR #434) on #369, #407, #408; K4 (PR #433) on #85, #97, #398, #402, #403, #406, #408; FC4 (PR #435) on #99, #284, #286, #348, #398, #402, #408; A7 (PR #436) on #26, #403, #407, #409. TENSION RECORDED: #284 and #286 said Scouting and Academy are navbar-only and not in the mobile drawer; item 4 puts them in the LOGGED-OUT drawer (notes on #284 and #286); the signed-in drawer is unchanged. NOT DECIDED HERE: a limit on the number of digits after the name and digits before it (item 2; the underscore reading is an adopted reading); the placement of the logged-out menu control; whether the Logged Out drawer can be a variant given Figma's overlay-destination rule (#103); whether the revoked state shows a held-until date; crest licensing; whether the mobile Saved frame 5778:8567 is replaced rather than edited; the exact link-expiry and withdrawal sentences (they are in the Figma nodes); the word list for the apps/web developer-notes guard; counsel wording of every [COPY PENDING LEGAL REVIEW] string.</w:t>
+            </w:r>
+            <w:r>
+              <w:t xml:space="preserve"> [2026-10-24: merged as A8 (PR #437). Status of its items: 1 and 7 confirm what FC4 (PR #435) built; item 2 (B-181) is NOT built and had no build prompt - #411 item 9: built in the next backend PR; item 4 - K5 (PR #438) built the header variant and a standalone Logged Out drawer component (B-183, B-204), links unwired (B-202); item 5 - K5 aligned 6747:29642, 6747:29709 and 5778:8567 to the desktop values (B-184), the desktop own-frame post author handles are #411 item 8 (B-201); item 6 - K5 made the Figma footnote final with three tagged sentences, the code still lacks sentences 1 and 3 (B-185); item 8 - K5 fixed the Restricted Pending frames (B-191), and #411 item 6 decides the three structural differences K5 left open (B-198, B-199).]</w:t>
+            </w:r>
+          </w:p>
+        </w:tc>
+      </w:tr>
+      <w:tr>
+        <w:tc>
+          <w:tcPr>
+            <w:tcW w:type="dxa" w:w="500"/>
+          </w:tcPr>
+          <w:p>
+            <w:r>
+              <w:t>411</w:t>
+            </w:r>
+          </w:p>
+        </w:tc>
+        <w:tc>
+          <w:tcPr>
+            <w:tcW w:type="dxa" w:w="4700"/>
+          </w:tcPr>
+          <w:p>
+            <w:r>
+              <w:t>Founder decisions 2026-10-24 on the open points of W5 (PR #439) and K5 (PR #438) (9 items): (1) avatars stay pending and invisible to everyone but the owner until the automatic image check (B-036, Amazon Rekognition) and the review queue (B-037) exist; both are to be built before launch, and the AWS account is a human step; (2) a flagged bio or preferred club is a coded 422 'please rephrase', no override and no automatic Report (as built in W5); (3) the preferred club is not shown to other users until a frame draws it; (4) the cover photo is built on the avatar pipeline with the same pending-and-invisible rule; (5) Block is exempt from the Consent and EmailVerified guards (authenticated only); Bants room listing is unaffected; no new Notification rows are created between a blocked pair and existing ones are hidden both ways; a blocked thread stays readable and sending stops (as built); contest winners lists are unaffected and a tap on a blocker's name opens 'not found'; (6) Restricted Pending: the frame drops the 'Last sent' resend note, the code adds the #367 registration status line (tagged, with a manifest row), the stale SCOPE OPEN note is deleted, and Grassroots record-keeping is limited while restricted-pending (the B-026 write block); (7) the withdrawal-confirm wording ('deleted after 30 days' on the frames, 'permanently deleted' in the code email, anonymised with a consent record kept 6 months in the legal draft) is ONE inconsistency for the counsel list, nothing changed now; (8) on the own-profile desktop frames the post author handle is aligned to @nelson_iheagwam, and @mekusa stays on the other-user frame; (9) correction of record: #410 item 2 (the username allow-list change, B-181) had no build prompt after A8 (PR #437); it is built in the next backend PR.</w:t>
+            </w:r>
+          </w:p>
+        </w:tc>
+        <w:tc>
+          <w:tcPr>
+            <w:tcW w:type="dxa" w:w="1850"/>
+          </w:tcPr>
+          <w:p>
+            <w:r>
+              <w:t>docs/decisions-founder-2026-10-24 (docs only, 2026-10-24; founder decisions 2026-10-24, items 1-9; sources docs/backend-w5-report.md (PR #439), docs/figma-pass-k5-report.md (PR #438), PR #437; docs/build-register.md Section 32, CLAUDE.md)</w:t>
+            </w:r>
+          </w:p>
+        </w:tc>
+        <w:tc>
+          <w:tcPr>
+            <w:tcW w:type="dxa" w:w="2300"/>
+          </w:tcPr>
+          <w:p>
+            <w:r>
+              <w:t>Decided 2026-10-24 (founder-adopted defaults, veto-able). Item 2 confirms what W5 built (PR #439); parts of items 1 (the pending-and-invisible rule), 5 (Bants room listing, the blocked thread) and 6 (Grassroots limited while restricted-pending, the B-026 write block) also confirm built behaviour; the rest is DECIDED, NOT BUILT. Docs only: no code, Figma, legal copy, DPIA or Log Book. (REGISTER) docs/build-register.md Section 32: new rows B-193 (AWS account, Rekognition access, region, and the launch check that no pending avatar is served; item 1), B-194 (web state for 'please rephrase'; item 2), B-195 (preferred club frame decision; item 3), B-196 (cover photo; item 4), B-197 (Block guards, notifications, contest-list QA; item 5), B-198 (Restricted Pending frames; item 6), B-199 (registration status line in code, and Grassroots QA; item 6), B-200 (withdrawal wording on the counsel list; item 7), B-201 (own-profile desktop post author handles; item 8), and for the instructions that came with the decisions: B-202 (unwired Login, Sign up and drawer-row prototype links; K5 OPEN 7), B-203 (K5 baseline check on 5701:8239 and the three other image-bearing nodes; K5 OPEN 3), B-204 (standalone Logged Out drawer; K5 OPEN 6), B-205 (EXIF re-encode), B-206 (CSAM path under counsel; OPEN, NO DECISION), B-207 (Cloudflare account and S3_PUBLIC_BASE_URL; human), B-208 (pending-copy collation). Item 9 (B-181) needs no new row. Status lines on 24 existing rows (B-007, B-026, B-035, B-036, B-037, B-038, B-039, B-076, B-081, B-082, B-108, B-124, B-138, B-146, B-154, B-158, B-170, B-181, B-183, B-184, B-185, B-188, B-190, B-191); the seven W5 status lines (already in the register from PR #439) were checked and none was dropped; the six K5 status lines were applied. 208 B-IDs (was 192); 146 gap frames unchanged. Arithmetic: Section 32e. K5 OPEN items 1-7 and the W5 OPEN items are each mapped in Section 32a. (FORWARD-POINTERS) Dated notes appended (original text unchanged) to #103, #284, #286, #307, #341, #348, #367, #369, #370, #371, #375, #377, #389, #394, #395, #396, #402, #403, #404, #406, #407, #408 and #410 (23 rows): W5 (PR #439) on #307, #371, #394, #396, #402, #403, #404, #406; K5 (PR #438) on #103, #284, #286, #341, #348, #367, #375, #377, #389, #395, #406, #407, #408; A8 (PR #437) on #369 and #410. TENSIONS RECORDED: item 5 makes Block open to an unverified or restricted-pending account, which amends how #370's uniform write block applied to Block (W5 pinned Block as consent plus email on creating and consent on undoing); #410 item 4 asked for a Logged Out variant of the drawer, K5 built a standalone component because a variant cannot be an overlay destination (#103). NOT DECIDED HERE: the CSAM path and whether avatars may go live before counsel answers; r2.dev or a custom domain for the public URL; the EXIF re-encode output format and size; cover dimensions; whether existing notifications between a blocked pair are deleted instead of hidden (adopted default: hidden at read time); whether a frame will ever draw the preferred club; the target frames of the logged-out prototype links; whether the mobile Saved frame 5778:8567 is replaced rather than edited; counsel wording of every [COPY PENDING LEGAL REVIEW] string.</w:t>
             </w:r>
           </w:p>
         </w:tc>

</xml_diff>

<commit_message>
docs: record founder decisions 2026-10-25 (Decision Log #412), register B-209 to B-217
Docs only. Decision Log #412 (docx, tables[6]) records seven founder-adopted
defaults: Notification.actorId, in-page plus notification reject reason,
cover crop to the frame ratio, Preferred Club free text, K6 tag rule, the W7
open defaults and W6 digit rules, and the FC5 admin Contest rebuild without
Figma. Dated notes appended to 12 existing rows; nothing rewritten.

build-register.md: new Section 35, rows B-209 to B-217 (K7, D11, FC5 scope
derived from the decisions), status lines on 15 rows, 217 B-IDs.

Co-Authored-By: Claude Sonnet 5.5 <noreply@anthropic.com>
</commit_message>
<xml_diff>
--- a/docs/Soccernity_MVP_Build_Plan_v1.7.docx
+++ b/docs/Soccernity_MVP_Build_Plan_v1.7.docx
@@ -20126,6 +20126,9 @@
             <w:r>
               <w:t xml:space="preserve"> NOTE 2026-10-15: the wiring described here (judge week, open final, crown) is on the admin-judged model and is superseded by #381 and build register B-095/B-097; the backend it targets (#218/#241) is replaced by B-091. Original text kept. Separately: CLAUDE.md cites a Community Groups frontend entry as #294, but this table has no row #293 or #294; none was invented here.</w:t>
             </w:r>
+            <w:r>
+              <w:t xml:space="preserve"> [2026-10-25: #412 item 7: apps/admin's Contest section is rebuilt in FC5 without a further Figma pass, on the W7 endpoints (B-097); the judging pages this entry built are removed there.]</w:t>
+            </w:r>
           </w:p>
         </w:tc>
       </w:tr>
@@ -22174,6 +22177,9 @@
             </w:r>
             <w:r>
               <w:t xml:space="preserve"> Forward-pointer: the apps/web conversion against these endpoints is now done -- see Decision Log #291 (sprint-3/notification-centre-to-code).</w:t>
+            </w:r>
+            <w:r>
+              <w:t xml:space="preserve"> [2026-10-25: #412 item 1: Notification.actorId is added (D11, B-213) and written at the like and comment trigger sites, so a like or comment row can be attributed and hidden between a blocked pair. The 'no actor' limitation recorded here is lifted for storage only; naming the actor in the data is not decided.]</w:t>
             </w:r>
           </w:p>
         </w:tc>
@@ -25708,6 +25714,9 @@
             <w:r>
               <w:t xml:space="preserve"> [2026-10-24: #410 item 2 (the nazif/nazifa/nazifah exact-match rule, B-181) was recorded by A8 (PR #437) but had no build prompt; #411 item 9 records that it is built in the next backend PR. Not yet built.]</w:t>
             </w:r>
+            <w:r>
+              <w:t xml:space="preserve"> [2026-10-25: W6 built the username allow-list (B-181); #412 item 6 confirms the digit rules: any number of digits after the name with at most one underscore between, digits before the name refused.]</w:t>
+            </w:r>
           </w:p>
         </w:tc>
       </w:tr>
@@ -25798,6 +25807,9 @@
             <w:r>
               <w:t xml:space="preserve"> [2026-10-24: backend W5 (PR #439): bio, avatar and profile country are columns; the avatar is uploaded on the admin media pipeline and stays pending and invisible to everyone but its owner until the image check (B-036) sets approved; cover photo not built. #411 amends: item 1 - the image check (B-036) and the review queue (B-037) are to be built before launch, the AWS account is a human step (B-193); item 3 - the preferred club is not shown to other users until a frame draws it (B-195); item 4 - the cover photo is built on the avatar pipeline with the same rule (B-196). The EXIF re-encode (B-205), the CSAM path under counsel (B-206) and the Cloudflare/public-URL step (B-207) stay open.]</w:t>
             </w:r>
+            <w:r>
+              <w:t xml:space="preserve"> [2026-10-25: #412 items 2 and 3: a rejected picture or cover shows its reason in the page and through the existing notification mechanism (B-214, B-211, B-217); the cover is cropped to the aspect ratio of the cover frame (B-210, B-215). The cover's pixel size and server-side ratio enforcement are not decided.]</w:t>
+            </w:r>
           </w:p>
         </w:tc>
       </w:tr>
@@ -26224,6 +26236,9 @@
             <w:r>
               <w:t>Resolved -- decided, NOT yet built. CORRECTION: the admin-judged contest (admin POST .../rounds/:week/results, enforced sequential judging, admin crown/open-final endpoints, and the Judge Week / Open the Final / Crown Winners admin screens) was never the founder's design. Contests are NOT admin-judged; that behaviour is to be replaced, not preserved. There is NO 'Level 1 / Level 2': only weeks 1-3 and the final (week 4); the wording 'Level 1 Final' is retired (Figma frames 5524:7512 / 5541:7527 to be renamed). Admin creation: each contest is created from the admin Contest tab (to be redesigned) with a contest description; the details page 'task for this week' is populated from it; the weekly mechanism is FREE TEXT. Required per contest: minimum tally (x points for final top-3 eligibility, admin-set, no default, cannot create without it); placement points for 1st/2nd/3rd (weekly and monthly, defaults in the placement-points entry); per-week view-qualifying watch limit in seconds for video entries (ASSUMED interpretation: the founder said it is 'always communicated in the contest description'; because the system must enforce it, it is recorded as a required structured numeric field as well). Per-week admin switch: followers-excluded counting. Boundary: Contest and Competition are separate features sharing the leaderboard. Backend implications and the new frames list are in the spec. Full detail: docs/contest-spec.md (sections 3, 4, 12, 13). Build register B-091, B-095, B-096, B-097, B-098, B-099. Forward-pointers: #218, #241, #61, #70, #71 (Superseded/Amended by #381).</w:t>
             </w:r>
+            <w:r>
+              <w:t xml:space="preserve"> [2026-10-25: W7 built the self-running lifecycle (PR #443, B-091). #412 item 6: the 17 OPEN defaults of docs/backend-w7-contest-report.md section 5 stand as recorded; items 2-4 there (views, exposure engine, follow and post points) are statuses that stay on B-093, B-092 and B-094. docs/contest-spec.md is not edited by that entry.]</w:t>
+            </w:r>
           </w:p>
         </w:tc>
       </w:tr>
@@ -26737,6 +26752,9 @@
             <w:r>
               <w:t xml:space="preserve"> [2026-10-16: Superseded by #400 for the lock time -- votes now lock at 20:00:00 on days 7, 14 and 21, not at 23:59:59 on day 7, and weekly winners are confirmed when the tally freezes at 20:00. The other confirmations in (d) stand.]</w:t>
             </w:r>
+            <w:r>
+              <w:t xml:space="preserve"> [2026-10-25: #412 item 4 confirms that the Preferred Club is free text (item 8 above); the Edit Profile frames that draw a select are stale (B-209).]</w:t>
+            </w:r>
           </w:p>
         </w:tc>
       </w:tr>
@@ -26782,6 +26800,9 @@
             <w:r>
               <w:t xml:space="preserve"> [2026-10-24: backend W5 (PR #439): the inline 'please rephrase' (A3) is a coded 422 sensitive_content_rephrase_required on PATCH /users/:id with no override (adopted default); the profile picture upload (A2) is built on the admin media pipeline. #411 item 2 confirms it final: no override and no automatic Report; the web state is B-194.]</w:t>
             </w:r>
+            <w:r>
+              <w:t xml:space="preserve"> [2026-10-25: #412 item 4: Preferred Club is free text (A3), built in apps/web by B-216; item 5: the [COPY PENDING LEGAL REVIEW] tag is used only on strings that carry a legal or safety promise (B-212).]</w:t>
+            </w:r>
           </w:p>
         </w:tc>
       </w:tr>
@@ -26968,6 +26989,9 @@
             <w:r>
               <w:t xml:space="preserve"> [2026-10-16: Amended by #402 (founder-adopted default, veto-able). The revoked handle is held 30 days for everyone, and the revoked user can never re-pick it (permanent for that user).] [2026-10-17: D4 built (B-109; PR #416): GET /admin/users/:id for moderator and superadmin, DOB decrypted server-side only, a user.dob_viewed audit row for every response that contains a DOB, request fails closed if that write fails. The open point 'which admin roles may read a decrypted DOB' is closed by #405, item 5. The User Detail screen in apps/admin is not built (B-104, B-109 frontend leg).] [2026-10-18: Built by B-033: POST /admin/users/:id/username-revoke (moderator, superadmin), reason required and stored in the audit record, user emailed [COPY PENDING LEGAL REVIEW], account back in the incomplete-profile gate, handle held 30 days for everyone and barred for ever for that user. The User Detail screen in apps/admin is not built for the revoke (disabled in FC2). D4 is amended by #406, item 4: User Detail no longer shows the date of birth.] [2026-10-19: D3 built in apps/admin by FC3b (PR #431): the Revoke username dialog with a required reason (10 to 500 characters), the revoked state and the error state (B-033, B-143). #408 item 5 adds a line saying the username is held for 30 days to the dialog and result frames, admin-facing only (B-167, B-168). Revocation history stays not shown.] [2026-10-20: D3's 30-day hold line: Figma pass K4 (PR #433) drew it and FC4 (PR #435) built it in the dialog, the error state and the revoked banner (B-167, B-168). #410 item 1 approves the wording as built, with no tag, admin-facing. Whether the revoked state shows a held-until date is open (B-192).]</w:t>
             </w:r>
+            <w:r>
+              <w:t xml:space="preserve"> [2026-10-25: #412 item 2 closes the delivery channel of D2: the flagged-image reject reason is shown to the uploader in the page and through the existing notification mechanism (B-214, B-211, B-217). The admin action and screen to reject stay with B-037 and B-012.]</w:t>
+            </w:r>
           </w:p>
         </w:tc>
       </w:tr>
@@ -27013,6 +27037,9 @@
             <w:r>
               <w:t xml:space="preserve"> [2026-10-16: Amended by #402 (founder-adopted default, veto-able). Tolerance and the per-viewer daily cap apply to week 4 only; their ranges stay as validation bounds on the week-4 settings and they lock when week 4 starts.]</w:t>
             </w:r>
+            <w:r>
+              <w:t xml:space="preserve"> [2026-10-25: #412 item 7: the admin Contest form is built in apps/admin by FC5 without a further Figma pass, from the Pass C, F1 and J frames and the W7 endpoints (B-097).]</w:t>
+            </w:r>
           </w:p>
         </w:tc>
       </w:tr>
@@ -27319,6 +27346,9 @@
             <w:r>
               <w:t xml:space="preserve"> [2026-10-24: K5 (PR #438): item 13 - the Figma guardian-confirm footnote is final and each of its three guardian/child sentences carries its own [COPY PENDING LEGAL REVIEW] tag (docs/figma-pass-k5-report.md section 6); item 12 - built by backend W5 (PR #439): a blocked viewer gets the same 404 as a missing profile.]</w:t>
             </w:r>
+            <w:r>
+              <w:t xml:space="preserve"> [2026-10-25: #412 item 5: the tag rule - [COPY PENDING LEGAL REVIEW] only where a string makes a legal or safety promise. The pending-copy guard (B-124) is unchanged and still treats every tagged string as blocking.]</w:t>
+            </w:r>
           </w:p>
         </w:tc>
       </w:tr>
@@ -27496,6 +27526,9 @@
             <w:r>
               <w:t xml:space="preserve"> [2026-10-24: merged as A8 (PR #437). Status of its items: 1 and 7 confirm what FC4 (PR #435) built; item 2 (B-181) is NOT built and had no build prompt - #411 item 9: built in the next backend PR; item 4 - K5 (PR #438) built the header variant and a standalone Logged Out drawer component (B-183, B-204), links unwired (B-202); item 5 - K5 aligned 6747:29642, 6747:29709 and 5778:8567 to the desktop values (B-184), the desktop own-frame post author handles are #411 item 8 (B-201); item 6 - K5 made the Figma footnote final with three tagged sentences, the code still lacks sentences 1 and 3 (B-185); item 8 - K5 fixed the Restricted Pending frames (B-191), and #411 item 6 decides the three structural differences K5 left open (B-198, B-199).]</w:t>
             </w:r>
+            <w:r>
+              <w:t xml:space="preserve"> [2026-10-25: item 2 (the allow-list) was built by W6 (PR #441, B-181); #412 item 6: the digit rules stand.]</w:t>
+            </w:r>
           </w:p>
         </w:tc>
       </w:tr>
@@ -27537,6 +27570,51 @@
           <w:p>
             <w:r>
               <w:t>Decided 2026-10-24 (founder-adopted defaults, veto-able). Item 2 confirms what W5 built (PR #439); parts of items 1 (the pending-and-invisible rule), 5 (Bants room listing, the blocked thread) and 6 (Grassroots limited while restricted-pending, the B-026 write block) also confirm built behaviour; the rest is DECIDED, NOT BUILT. Docs only: no code, Figma, legal copy, DPIA or Log Book. (REGISTER) docs/build-register.md Section 32: new rows B-193 (AWS account, Rekognition access, region, and the launch check that no pending avatar is served; item 1), B-194 (web state for 'please rephrase'; item 2), B-195 (preferred club frame decision; item 3), B-196 (cover photo; item 4), B-197 (Block guards, notifications, contest-list QA; item 5), B-198 (Restricted Pending frames; item 6), B-199 (registration status line in code, and Grassroots QA; item 6), B-200 (withdrawal wording on the counsel list; item 7), B-201 (own-profile desktop post author handles; item 8), and for the instructions that came with the decisions: B-202 (unwired Login, Sign up and drawer-row prototype links; K5 OPEN 7), B-203 (K5 baseline check on 5701:8239 and the three other image-bearing nodes; K5 OPEN 3), B-204 (standalone Logged Out drawer; K5 OPEN 6), B-205 (EXIF re-encode), B-206 (CSAM path under counsel; OPEN, NO DECISION), B-207 (Cloudflare account and S3_PUBLIC_BASE_URL; human), B-208 (pending-copy collation). Item 9 (B-181) needs no new row. Status lines on 24 existing rows (B-007, B-026, B-035, B-036, B-037, B-038, B-039, B-076, B-081, B-082, B-108, B-124, B-138, B-146, B-154, B-158, B-170, B-181, B-183, B-184, B-185, B-188, B-190, B-191); the seven W5 status lines (already in the register from PR #439) were checked and none was dropped; the six K5 status lines were applied. 208 B-IDs (was 192); 146 gap frames unchanged. Arithmetic: Section 32e. K5 OPEN items 1-7 and the W5 OPEN items are each mapped in Section 32a. (FORWARD-POINTERS) Dated notes appended (original text unchanged) to #103, #284, #286, #307, #341, #348, #367, #369, #370, #371, #375, #377, #389, #394, #395, #396, #402, #403, #404, #406, #407, #408 and #410 (23 rows): W5 (PR #439) on #307, #371, #394, #396, #402, #403, #404, #406; K5 (PR #438) on #103, #284, #286, #341, #348, #367, #375, #377, #389, #395, #406, #407, #408; A8 (PR #437) on #369 and #410. TENSIONS RECORDED: item 5 makes Block open to an unverified or restricted-pending account, which amends how #370's uniform write block applied to Block (W5 pinned Block as consent plus email on creating and consent on undoing); #410 item 4 asked for a Logged Out variant of the drawer, K5 built a standalone component because a variant cannot be an overlay destination (#103). NOT DECIDED HERE: the CSAM path and whether avatars may go live before counsel answers; r2.dev or a custom domain for the public URL; the EXIF re-encode output format and size; cover dimensions; whether existing notifications between a blocked pair are deleted instead of hidden (adopted default: hidden at read time); whether a frame will ever draw the preferred club; the target frames of the logged-out prototype links; whether the mobile Saved frame 5778:8567 is replaced rather than edited; counsel wording of every [COPY PENDING LEGAL REVIEW] string.</w:t>
+            </w:r>
+            <w:r>
+              <w:t xml:space="preserve"> [2026-10-25: #412 closes three points left open after W6 and K6: item 1 (existing like and comment rows between a blocked pair are hidden, not deleted; B-213), item 3 (the cover aspect ratio is the cover frame's; B-210, B-215) and item 2 (how the reject reason reaches the uploader; B-214).]</w:t>
+            </w:r>
+          </w:p>
+        </w:tc>
+      </w:tr>
+      <w:tr>
+        <w:tc>
+          <w:tcPr>
+            <w:tcW w:type="dxa" w:w="500"/>
+          </w:tcPr>
+          <w:p>
+            <w:r>
+              <w:t>412</w:t>
+            </w:r>
+          </w:p>
+        </w:tc>
+        <w:tc>
+          <w:tcPr>
+            <w:tcW w:type="dxa" w:w="4700"/>
+          </w:tcPr>
+          <w:p>
+            <w:r>
+              <w:t>Founder decisions 2026-10-25 on the open points of W7 (PR #443), W6 (PR #441) and K6 (PR #442), and on the scope of the next three passes K7 (Figma), D11 (backend) and FC5 (figma-to-code) (7 items): (1) Notification.actorId is added in a small additive migration; like and comment notification rows between a blocked pair are hidden at read time, not deleted; system notifications (no user actor, such as moderation_decision) are not filtered; (2) the reason an uploaded profile picture or cover photo was rejected is shown to the uploader in the page and also through the existing notification mechanism; (3) the cover photo is cropped to the aspect ratio of the cover frame; (4) the Preferred Club is free text; (5) K6's functional strings stay untagged unless they carry a legal or safety promise; (6) the 17 OPEN defaults listed in the W7 report (section 5) and the W6 digit rules for the username allow-list stand; (7) the admin Contest screens are rebuilt in FC5 without a further Figma pass.</w:t>
+            </w:r>
+          </w:p>
+        </w:tc>
+        <w:tc>
+          <w:tcPr>
+            <w:tcW w:type="dxa" w:w="1850"/>
+          </w:tcPr>
+          <w:p>
+            <w:r>
+              <w:t>docs/decisions-founder-2026-10-25 (docs only, 2026-10-25; founder decisions 2026-10-25, items 1-7; sources docs/backend-w7-contest-report.md (PR #443), docs/backend-w6-report.md (PR #441), docs/figma-pass-k6-report.md (PR #442); docs/build-register.md Section 35, CLAUDE.md)</w:t>
+            </w:r>
+          </w:p>
+        </w:tc>
+        <w:tc>
+          <w:tcPr>
+            <w:tcW w:type="dxa" w:w="2300"/>
+          </w:tcPr>
+          <w:p>
+            <w:r>
+              <w:t>Decided 2026-10-25 (founder-adopted defaults, veto-able). DECIDED, NOT BUILT, except item 6, which confirms what W7 and W6 built. Docs only: no code, schema, Figma, legal copy, DPIA or Log Book; docs/sprint-1-dpia-outline-draft.md, docs/contest-spec.md and docs/pending-copy-manifest.md are not touched. INTERPRETATIONS RECORDED: the K7, D11 and FC5 briefs were not available to this pass, so their scope is derived from the seven items; 'the existing notification' in item 2 is read as the existing Notification table and Notification Centre (a new type, no email, no push), because no notification type for an image decision exists today; 'the 17 OPEN defaults stand' (item 6) is read as accepting each default as recorded in the W7 report section 5, so items 2, 3 and 4 there (no views, no exposure engine, follow and post points still awarded) are confirmed as statuses that stay on B-093, B-092 and B-094 and are NOT a decision to leave them unbuilt, and item 15 (forfeit and API wording) stays OPEN in the pending-copy manifest. (REGISTER) docs/build-register.md Section 35: new rows B-209 (K7: Edit Profile Preferred Club as free text; item 4), B-210 (K7: cover crop step at the cover slot's ratio; item 3), B-211 (K7: rejected-image Notification Centre row and in-page reason; item 2), B-212 (K7: tag review of K6's nine strings; item 5), B-213 (D11: Notification.actorId, write sites, blocked-pair hiding; item 1), B-214 (D11: rejection reason storage, owner-only exposure and the notification; item 2), B-215 (FC5: picture and cover upload with the crop and the rejected state; items 2 and 3), B-216 (FC5: Preferred Club free-text field; item 4), B-217 (FC5: Notification Centre renders the image-decision row; item 2). Item 7 needs no new row: it is B-097 (status line on B-095 and B-097). Item 6 needs none (status lines on B-091, B-092, B-093, B-094, B-181). Status lines on 15 existing rows (B-037, B-038, B-091, B-092, B-093, B-094, B-095, B-097, B-123, B-124, B-181, B-196, B-197, B-205, B-208). 217 B-IDs (was 208); 146 gap frames unchanged. Arithmetic: Section 35e. (ITEM DETAIL) (1) adopted, not stated: actorId is a plain nullable string with no foreign key; rows created before the migration keep a NULL actorId and are not filtered; the 'Someone' wording on those rows is not changed. (2) adopted, not stated: the reason is admin-written text, required, adopted maximum 300 characters, returned only on the owner's own record, cleared on the next upload or delete; the Notification does not copy it and links to Edit Profile. (3) the ratio is the cover slot's in the profile frames, measured by K7; the crop is done in the browser. (4) confirms #392 item 8 and #393; the Edit Profile frames that draw a select are stale; the field stays owner-only (#411 item 3). (5) the rule: a string carries [COPY PENDING LEGAL REVIEW] only if it makes a legal or safety promise (what is checked, who sees it, how long it is kept, what happens to an image or to a child's data); strings already tagged in code and listed in the manifest are unchanged. (6) W6 digit rules: any number of digits after the name with at most one underscore between, digits before the name refused, no cap on the number of digits. (7) the sources are the frames of passes C, E, F1 and J and docs/contest-spec.md; a state no frame draws is built plainly and flagged. (FORWARD-POINTERS) Dated notes appended (original text unchanged) to #243, #290, #369, #371, #381, #393, #394, #398, #399, #406, #410 and #411 (12 rows). NOT DECIDED HERE: whether the actor is named on like and comment rows; whether rows created before the migration are backfilled; the cover's maximum pixel size and whether the server enforces the ratio (B-205); an avatar crop step; whether a moderator-written reason shown to a possible child needs counsel guidance; whether FC5 shows the impression view as a disclosed stub until B-092 exists; which of K6's nine strings are functional. NOT DONE: docs/contest-spec.md is not extended with the W7 defaults (the W7 report section 5 and this entry are the record); Decision Log numbers #293 and #294 are still absent from the table, as before.</w:t>
             </w:r>
           </w:p>
         </w:tc>

</xml_diff>

<commit_message>
docs: Decision Log #413 and build register Section 38 (withdrawal page, Contest Rules counsel review, username hint tag, full QA run, Block-label Figma row)
Co-Authored-By: Claude Sonnet 5.5 <noreply@anthropic.com>
</commit_message>
<xml_diff>
--- a/docs/Soccernity_MVP_Build_Plan_v1.7.docx
+++ b/docs/Soccernity_MVP_Build_Plan_v1.7.docx
@@ -19446,7 +19446,7 @@
           </w:p>
           <w:p>
             <w:r>
-              <w:t xml:space="preserve">  FORWARD-POINTER (#229, sprint-2/contest-weekly-results-footer-removal, figma-design-system, 2026-09-06): the flagged gap is CLOSED. The founder confirmed the footer reversal extends to the two Contest -- Weekly Results (Top 3) frames (5528:7260 desktop / 5545:7394 mobile) -- they are a Leaderboard Contest-tab display state, not the standalone Contest details/task page family. Both footer clones (6143:1648 / 6143:1724) removed; both frames auto-shrank to content-bottom (951-&gt;637 desktop, 1652-&gt;1234 mobile), screenshot-verified, no orphaned gap. Page-wide reaction scan clean. A final sweep confirms 0 of the 26 Leaderboard/Contest-family frames still carry a site footer.</w:t>
+              <w:t xml:space="preserve">  FORWARD-POINTER (#229, sprint-2/contest-weekly-results-footer-removal, figma-design-system, 2026-09-06): the flagged gap is CLOSED. The founder confirmed the footer reversal extends to the two Contest -- Weekly Results (Top 3) frames (5528:7260 desktop / 5545:7394 mobile) -- they are a Leaderboard Contest-tab display state, not the standalone Contest details/task page family. Both footer clones (6143:1648 / 6143:1724) removed; both frames auto-shrank to content-bottom (951-&gt;637 desktop, 1652-&gt;1234 mobile), screenshot-verified, no orphaned gap. Page-wide reaction scan clean. A final sweep confirms 0 of the 26 Leaderboard/Contest-family frames still carry a site footer. [2026-10-25: #413 item 2 changes the 'no legal-counsel review track' point: the Contest Rules copy is still written by the founder, but counsel reviews it before launch. The placeholder stays until then (B-051, B-220).]</w:t>
             </w:r>
           </w:p>
         </w:tc>
@@ -26849,7 +26849,7 @@
               <w:t xml:space="preserve"> [2026-10-16: Amended by #402. (B1) is AMENDED: sessions stay valid between declines (#389); after decline 1 and 2 the minor sees the existing decline page INSIDE the account via the existing authenticated resend / change-guardian-email routes; the 'declined' login result and its BACKEND TO CONFIRM point are WITHDRAWN (build register B-110 re-scoped). (B2) The open question on the 30-day grace is answered: the third decline blocks login at once and enters pending deletion WITH the existing 30-day grace (#375). The remainder stands.] [2026-10-16: Amended by #403. (B2) The decline page keeps its static sentence stating the cap (Figma node 6627:22230); 'No decline count is shown' means no running 'decline N of 3' counter. (B4) A restart caused by a DOB correction RESETS the decline counter and writes an audit entry (answers the STILL OPEN point). (B3) The withdrawal throttle default is 5 attempts per 15 minutes, held in configuration (sets the window left open).] [2026-10-17: Backend built in PR #416. B1 stays withdrawn (#402). B2: the third decline blocks login at once and enters pending deletion with the 30-day grace, one email. B3: unchanged here. B4 built as B-103: an age-tier change cancels or restarts the request and a restart resets the counter. Open, no decision: a row declined at 1 or 2 and never reopened has no expiry (register row B-126). Frontend decline page not built.] [2026-10-18: Amended by #406: a declined-at-1-or-2 row not reopened within 14 days expires (item 1); the status response adds the guardian's first name and the last decision date, never the decline count (item 11); the guardian confirm page footnote is replaced by the cap sentence (item 13).] [2026-10-18: Built in W3d (B-126, B-128, B-129, B-131; PR #424): see #406 and #389. QA run (PR #426): B2 and B4 behave as decided; the web decline view's Resend and Change guardian email actions are broken (D-03, D-04: B-151, B-152). Judgment call 1 of the W3d report stays as built (#407 item 6).] [2026-10-19: QA D-03 and D-04 (the decline view's resend and change-guardian-email actions) are fixed by FC3a (PR #430, B-151, B-152). The guardian page's post-decline state carries the cap sentence (B-130); its clause 'so it stays switched off' is tagged by #408 item 6.]</w:t>
             </w:r>
             <w:r>
-              <w:t xml:space="preserve"> [2026-10-24: K5 (PR #438) read the withdrawal-confirm frames 6654:57 / 6654:26782: 'closes the account straight away' and 'cannot be undone from this page' are accurate, 'deleted after 30 days' understates. #411 item 7: one inconsistency for the counsel list, nothing changed (B-200).]</w:t>
+              <w:t xml:space="preserve"> [2026-10-24: K5 (PR #438) read the withdrawal-confirm frames 6654:57 / 6654:26782: 'closes the account straight away' and 'cannot be undone from this page' are accurate, 'deleted after 30 days' understates. #411 item 7: one inconsistency for the counsel list, nothing changed (B-200).] [2026-10-25: #413 item 1: the guardian withdrawal page (B3) is to be built before launch (B-112), or the guardian-consent footnote sentence that names it is changed; B-221 holds the either/or open.]</w:t>
             </w:r>
           </w:p>
         </w:tc>
@@ -27392,7 +27392,7 @@
               <w:t>Resolved -- recorded. FOUNDER-ADOPTED DEFAULTS, VETO-ABLE, all seven items. DECIDED, NOT BUILT, except item 6, which confirms what is already built (W3d, PR #424). Item numbers are the order of the founder's instruction. Original text of every entry named in the forward-pointers below is unchanged (dated notes appended). Source: the QA run of PR #426 (docs/qa-e2e-onboarding-report.md): 165 browser tests against the real API, 17 defects (D-01 to D-17) and 3 gaps (G-1 to G-3). (1) CORS (QA D-01, BLOCKER / SAFEGUARDING). apps/web/src/api/auth.ts registerUser sends credentials 'include' and services/api/src/main.ts calls app.enableCors() with no options (it answers '*'); browsers refuse that combination, so sign-up fails in every browser when web and API are on different origins, as in production, and no request reaches the API. Decided: registerUser stops sending credentials 'include'; the API restricts CORS to the origins in WEB_APP_BASE_URL and a new ADMIN_APP_BASE_URL, plus localhost origins in development. The new variable is added to render.yaml (both services), .env.example and the env-completeness check; the founder sets its production value in Render. The API sets no cookie and returns the refresh token in the response body, so the credentials option appears to have no function (to confirm in the build PR). Not decided: what the API does when a variable is unset in production, and origins other than the two apps. Build row B-140 (W1). (2) AGE-5 FLOOR (QA D-02, BLOCKER / SAFEGUARDING). #19 says signup is hard-blocked below age 5 regardless of guardian consent, but the floor exists only in the web Age Gate: POST /auth/register with a date of birth 4 years ago and a valid guardian block returns 201 and creates the account and the guardian request. Decided: the floor is enforced server-side with a 400; exactly age 5 stays accepted. Not decided: the error code and message; the build PR checks the DOB-correction tool (#390) cannot set a date of birth below the floor. Build row B-141 (W1). (3) USERNAME FILTER (QA D-06). Hate and sexual terms glued to other letters (xxhitlerxx, nazifan) are accepted because the filter's EXACT list matches only the whole handle or an underscore token. Decided: long, unambiguous terms are matched by CONTAINS, with a tested list of innocent words that must still be accepted; short or ambiguous terms stay exact. Not decided: the term lists and the length threshold (set in the build PR, for founder review). Build row B-142 (W4). (4) 'FOLLOW' PROMISES (QA D-13). The restricted-pending view says 'Browse and follow' and the guardian page lists 'Follow teams and check scores', but a restricted-pending minor's follow is refused with 403 (#370). Decided: both screens stop promising follow and the wording says what works, tagged [COPY PENDING LEGAL REVIEW] and added to the pending-copy manifest; the guardian-page change is guardian-visible, so CONSENT_SCREEN_VERSION and the tripwire hash (#348) are bumped under the rule of B-130. The Figma frames are not checked here for the same promise. Build row B-154 (W9). (5) GUARDIAN APPROVAL SCREEN (QA D-09). After approval the guardian is told 'The account is now active', but the minor still has to verify email and create a profile. Decided: the screen no longer says the account is active; it says the approval is recorded and registration continues ([COPY PENDING LEGAL REVIEW]), matching the Figma Approved screens (#403 item 3). Build row B-153 (W9). (6) STALE-DECLINE RE-SEND STAYS. A guardian who declined at decline 1 or 2 is still sent a new consent request by the platform when the row lapses after 14 days (#406 item 1, built as B-126), after the minor is warned. This settles judgment call 1 of docs/backend-w3d-report.md (section 5). The alternative, warning the minor and closing after a further window without re-sending, stays a one-place change (GuardianStaleDeclineSweepService); the cap of three declines bounds the re-sends. Counsel review of legal copy v0.8 Part 4.4 is still pending. Rows B-126, B-102. (7) LEGACY SAVED FRAME. The Figma frame 1460:8940 (own Saved, absolute layout) is archived, now that 6747:29445 replaces it (Figma pass K2, candidate 2): hidden and renamed 'ARCHIVED - ...', nothing deleted, after a page-wide reference scan, and added to docs/figma-archive-index.md. Build row B-144 (W0). (REGISTER) docs/build-register.md Section 25: B-140 to B-162 added (23 rows); every QA defect and gap, every open item of the W3d report (section 6) and every K2 candidate (1-10) is mapped to a row, reused (B-120, B-128, B-129, B-130, B-131, B-132, B-133, B-134, B-078, B-138) or new. D-01 and D-02 are marked BLOCKER / SAFEGUARDING. Status lines on 23 existing rows. 162 B-IDs; 146 gap frames unchanged. Arithmetic: Section 25g. (FORWARD-POINTERS) Dated notes appended (original text unchanged) to #19, #199, #337, #338, #339, #340, #368, #369, #370, #377, #389, #395, #402, #403, #405 and #406 (the W3d report's section 7 pointers, the status of K2 and of the QA run). NOT DECIDED HERE: the behaviour when an origin variable is unset in production, and any further CORS origin; the error code of the 400; the term and innocent-word lists; the Figma side of the 'follow' promise; the post-decline state of the guardian confirm page (D-10, same fault as the footnote of #406 item 13, still not covered by the founder's wording); K2 candidates 1, 3, 4, 6, 7, 8 (register rows B-147 to B-150 are OPEN); the W3d open items on earlier verification links (B-160) and on a non-active account with a stale decline (B-161); counsel wording of every [COPY PENDING LEGAL REVIEW] string. [2026-10-19: Built since: items 1, 2 and 3 and the expired-consent email by backend/w3e (PR #429: B-140, B-141, B-142; the email half of B-158); items 4 and 5 and QA defects D-03 to D-05 and D-08 to D-17 by FC3a (PR #430; D-15 and D-17 in part); D-07, G-1 and G-2 by FC3b (PR #431); item 7 (the archive of 1460:8940) by Figma pass K3 (PR #428, B-144). The open point of item 1 (what the API does when an origin variable is unset in production) is decided by #408 item 1: it refuses to boot (B-163). Item 3 is amended by #408 item 3: the exact whole handles nazif, nazifa and nazifah are allowed (B-165) and the term lists W3e built stay open for review. The error code below_minimum_age and its message are W3e's choice and are still not confirmed. The QA harness's CORS proxy is gone (PR #429).] [2026-10-20: #409 item 1 fixes the origins the CORS allow-list names: WEB_APP_BASE_URL is the https origin of the web static site and ADMIN_APP_BASE_URL that of the admin static site, each separate from the API's own origin (B-179). Both must be set to the final https origins in production (the API refuses to boot otherwise, B-163). Nothing is deployed before the launch gate B-090.] [2026-10-20: the #409 note above merged in PR #436 (A7). W3f (PR #434) built the boot refusal for an unset or invalid origin variable (the open point of item 1, B-163) and the Nazif allow-list (item 3, B-165); #410 item 2 changes the allow-list rule (B-181). Item 4: the Restricted Pending frames 5108:6630 / 5531:7461 still carry the 'Browse and follow' wording the code dropped (D-13); K5 fixes them (B-191, #410 item 8).]</w:t>
             </w:r>
             <w:r>
-              <w:t xml:space="preserve"> [2026-10-24: K5 (PR #438), item 4 (QA D-13): the Restricted Pending frames 5108:6630 / 5531:7461 now say 'Browse and read' instead of 'Browse and follow' (B-191).]</w:t>
+              <w:t xml:space="preserve"> [2026-10-24: K5 (PR #438), item 4 (QA D-13): the Restricted Pending frames 5108:6630 / 5531:7461 now say 'Browse and read' instead of 'Browse and follow' (B-191).] [2026-10-25: #413 item 4: the next QA run is a full run of the 180-test Playwright suite (e2e/), not a subset; FC5 re-ran only specs 01 and 07 (B-219).]</w:t>
             </w:r>
           </w:p>
         </w:tc>
@@ -27527,7 +27527,7 @@
               <w:t xml:space="preserve"> [2026-10-24: merged as A8 (PR #437). Status of its items: 1 and 7 confirm what FC4 (PR #435) built; item 2 (B-181) is NOT built and had no build prompt - #411 item 9: built in the next backend PR; item 4 - K5 (PR #438) built the header variant and a standalone Logged Out drawer component (B-183, B-204), links unwired (B-202); item 5 - K5 aligned 6747:29642, 6747:29709 and 5778:8567 to the desktop values (B-184), the desktop own-frame post author handles are #411 item 8 (B-201); item 6 - K5 made the Figma footnote final with three tagged sentences, the code still lacks sentences 1 and 3 (B-185); item 8 - K5 fixed the Restricted Pending frames (B-191), and #411 item 6 decides the three structural differences K5 left open (B-198, B-199).]</w:t>
             </w:r>
             <w:r>
-              <w:t xml:space="preserve"> [2026-10-25: item 2 (the allow-list) was built by W6 (PR #441, B-181); #412 item 6: the digit rules stand.]</w:t>
+              <w:t xml:space="preserve"> [2026-10-25: item 2 (the allow-list) was built by W6 (PR #441, B-181); #412 item 6: the digit rules stand.] [2026-10-25: #413 item 1 on item 6: the footnote sentence that names the withdrawal page either stays and B-112 is built before launch, or is changed (then CONSENT_SCREEN_VERSION v6 -&gt; v7); B-221.]</w:t>
             </w:r>
           </w:p>
         </w:tc>
@@ -27572,7 +27572,7 @@
               <w:t>Decided 2026-10-24 (founder-adopted defaults, veto-able). Item 2 confirms what W5 built (PR #439); parts of items 1 (the pending-and-invisible rule), 5 (Bants room listing, the blocked thread) and 6 (Grassroots limited while restricted-pending, the B-026 write block) also confirm built behaviour; the rest is DECIDED, NOT BUILT. Docs only: no code, Figma, legal copy, DPIA or Log Book. (REGISTER) docs/build-register.md Section 32: new rows B-193 (AWS account, Rekognition access, region, and the launch check that no pending avatar is served; item 1), B-194 (web state for 'please rephrase'; item 2), B-195 (preferred club frame decision; item 3), B-196 (cover photo; item 4), B-197 (Block guards, notifications, contest-list QA; item 5), B-198 (Restricted Pending frames; item 6), B-199 (registration status line in code, and Grassroots QA; item 6), B-200 (withdrawal wording on the counsel list; item 7), B-201 (own-profile desktop post author handles; item 8), and for the instructions that came with the decisions: B-202 (unwired Login, Sign up and drawer-row prototype links; K5 OPEN 7), B-203 (K5 baseline check on 5701:8239 and the three other image-bearing nodes; K5 OPEN 3), B-204 (standalone Logged Out drawer; K5 OPEN 6), B-205 (EXIF re-encode), B-206 (CSAM path under counsel; OPEN, NO DECISION), B-207 (Cloudflare account and S3_PUBLIC_BASE_URL; human), B-208 (pending-copy collation). Item 9 (B-181) needs no new row. Status lines on 24 existing rows (B-007, B-026, B-035, B-036, B-037, B-038, B-039, B-076, B-081, B-082, B-108, B-124, B-138, B-146, B-154, B-158, B-170, B-181, B-183, B-184, B-185, B-188, B-190, B-191); the seven W5 status lines (already in the register from PR #439) were checked and none was dropped; the six K5 status lines were applied. 208 B-IDs (was 192); 146 gap frames unchanged. Arithmetic: Section 32e. K5 OPEN items 1-7 and the W5 OPEN items are each mapped in Section 32a. (FORWARD-POINTERS) Dated notes appended (original text unchanged) to #103, #284, #286, #307, #341, #348, #367, #369, #370, #371, #375, #377, #389, #394, #395, #396, #402, #403, #404, #406, #407, #408 and #410 (23 rows): W5 (PR #439) on #307, #371, #394, #396, #402, #403, #404, #406; K5 (PR #438) on #103, #284, #286, #341, #348, #367, #375, #377, #389, #395, #406, #407, #408; A8 (PR #437) on #369 and #410. TENSIONS RECORDED: item 5 makes Block open to an unverified or restricted-pending account, which amends how #370's uniform write block applied to Block (W5 pinned Block as consent plus email on creating and consent on undoing); #410 item 4 asked for a Logged Out variant of the drawer, K5 built a standalone component because a variant cannot be an overlay destination (#103). NOT DECIDED HERE: the CSAM path and whether avatars may go live before counsel answers; r2.dev or a custom domain for the public URL; the EXIF re-encode output format and size; cover dimensions; whether existing notifications between a blocked pair are deleted instead of hidden (adopted default: hidden at read time); whether a frame will ever draw the preferred club; the target frames of the logged-out prototype links; whether the mobile Saved frame 5778:8567 is replaced rather than edited; counsel wording of every [COPY PENDING LEGAL REVIEW] string.</w:t>
             </w:r>
             <w:r>
-              <w:t xml:space="preserve"> [2026-10-25: #412 closes three points left open after W6 and K6: item 1 (existing like and comment rows between a blocked pair are hidden, not deleted; B-213), item 3 (the cover aspect ratio is the cover frame's; B-210, B-215) and item 2 (how the reject reason reaches the uploader; B-214).]</w:t>
+              <w:t xml:space="preserve"> [2026-10-25: #412 closes three points left open after W6 and K6: item 1 (existing like and comment rows between a blocked pair are hidden, not deleted; B-213), item 3 (the cover aspect ratio is the cover frame's; B-210, B-215) and item 2 (how the reject reason reaches the uploader; B-214).] [2026-10-25: #413 item 3: the username change-cooldown hint (item 8) stays untagged unless the founder says otherwise (B-208, B-212).]</w:t>
             </w:r>
           </w:p>
         </w:tc>
@@ -27614,7 +27614,49 @@
           </w:tcPr>
           <w:p>
             <w:r>
-              <w:t>Decided 2026-10-25 (founder-adopted defaults, veto-able). DECIDED, NOT BUILT, except item 6, which confirms what W7 and W6 built. Docs only: no code, schema, Figma, legal copy, DPIA or Log Book; docs/sprint-1-dpia-outline-draft.md, docs/contest-spec.md and docs/pending-copy-manifest.md are not touched. INTERPRETATIONS RECORDED: the K7, D11 and FC5 briefs were not available to this pass, so their scope is derived from the seven items; 'the existing notification' in item 2 is read as the existing Notification table and Notification Centre (a new type, no email, no push), because no notification type for an image decision exists today; 'the 17 OPEN defaults stand' (item 6) is read as accepting each default as recorded in the W7 report section 5, so items 2, 3 and 4 there (no views, no exposure engine, follow and post points still awarded) are confirmed as statuses that stay on B-093, B-092 and B-094 and are NOT a decision to leave them unbuilt, and item 15 (forfeit and API wording) stays OPEN in the pending-copy manifest. (REGISTER) docs/build-register.md Section 35: new rows B-209 (K7: Edit Profile Preferred Club as free text; item 4), B-210 (K7: cover crop step at the cover slot's ratio; item 3), B-211 (K7: rejected-image Notification Centre row and in-page reason; item 2), B-212 (K7: tag review of K6's nine strings; item 5), B-213 (D11: Notification.actorId, write sites, blocked-pair hiding; item 1), B-214 (D11: rejection reason storage, owner-only exposure and the notification; item 2), B-215 (FC5: picture and cover upload with the crop and the rejected state; items 2 and 3), B-216 (FC5: Preferred Club free-text field; item 4), B-217 (FC5: Notification Centre renders the image-decision row; item 2). Item 7 needs no new row: it is B-097 (status line on B-095 and B-097). Item 6 needs none (status lines on B-091, B-092, B-093, B-094, B-181). Status lines on 15 existing rows (B-037, B-038, B-091, B-092, B-093, B-094, B-095, B-097, B-123, B-124, B-181, B-196, B-197, B-205, B-208). 217 B-IDs (was 208); 146 gap frames unchanged. Arithmetic: Section 35e. (ITEM DETAIL) (1) adopted, not stated: actorId is a plain nullable string with no foreign key; rows created before the migration keep a NULL actorId and are not filtered; the 'Someone' wording on those rows is not changed. (2) adopted, not stated: the reason is admin-written text, required, adopted maximum 300 characters, returned only on the owner's own record, cleared on the next upload or delete; the Notification does not copy it and links to Edit Profile. (3) the ratio is the cover slot's in the profile frames, measured by K7; the crop is done in the browser. (4) confirms #392 item 8 and #393; the Edit Profile frames that draw a select are stale; the field stays owner-only (#411 item 3). (5) the rule: a string carries [COPY PENDING LEGAL REVIEW] only if it makes a legal or safety promise (what is checked, who sees it, how long it is kept, what happens to an image or to a child's data); strings already tagged in code and listed in the manifest are unchanged. (6) W6 digit rules: any number of digits after the name with at most one underscore between, digits before the name refused, no cap on the number of digits. (7) the sources are the frames of passes C, E, F1 and J and docs/contest-spec.md; a state no frame draws is built plainly and flagged. (FORWARD-POINTERS) Dated notes appended (original text unchanged) to #243, #290, #369, #371, #381, #393, #394, #398, #399, #406, #410 and #411 (12 rows). NOT DECIDED HERE: whether the actor is named on like and comment rows; whether rows created before the migration are backfilled; the cover's maximum pixel size and whether the server enforces the ratio (B-205); an avatar crop step; whether a moderator-written reason shown to a possible child needs counsel guidance; whether FC5 shows the impression view as a disclosed stub until B-092 exists; which of K6's nine strings are functional. NOT DONE: docs/contest-spec.md is not extended with the W7 defaults (the W7 report section 5 and this entry are the record); Decision Log numbers #293 and #294 are still absent from the table, as before.</w:t>
+              <w:t>Decided 2026-10-25 (founder-adopted defaults, veto-able). DECIDED, NOT BUILT, except item 6, which confirms what W7 and W6 built. Docs only: no code, schema, Figma, legal copy, DPIA or Log Book; docs/sprint-1-dpia-outline-draft.md, docs/contest-spec.md and docs/pending-copy-manifest.md are not touched. INTERPRETATIONS RECORDED: the K7, D11 and FC5 briefs were not available to this pass, so their scope is derived from the seven items; 'the existing notification' in item 2 is read as the existing Notification table and Notification Centre (a new type, no email, no push), because no notification type for an image decision exists today; 'the 17 OPEN defaults stand' (item 6) is read as accepting each default as recorded in the W7 report section 5, so items 2, 3 and 4 there (no views, no exposure engine, follow and post points still awarded) are confirmed as statuses that stay on B-093, B-092 and B-094 and are NOT a decision to leave them unbuilt, and item 15 (forfeit and API wording) stays OPEN in the pending-copy manifest. (REGISTER) docs/build-register.md Section 35: new rows B-209 (K7: Edit Profile Preferred Club as free text; item 4), B-210 (K7: cover crop step at the cover slot's ratio; item 3), B-211 (K7: rejected-image Notification Centre row and in-page reason; item 2), B-212 (K7: tag review of K6's nine strings; item 5), B-213 (D11: Notification.actorId, write sites, blocked-pair hiding; item 1), B-214 (D11: rejection reason storage, owner-only exposure and the notification; item 2), B-215 (FC5: picture and cover upload with the crop and the rejected state; items 2 and 3), B-216 (FC5: Preferred Club free-text field; item 4), B-217 (FC5: Notification Centre renders the image-decision row; item 2). Item 7 needs no new row: it is B-097 (status line on B-095 and B-097). Item 6 needs none (status lines on B-091, B-092, B-093, B-094, B-181). Status lines on 15 existing rows (B-037, B-038, B-091, B-092, B-093, B-094, B-095, B-097, B-123, B-124, B-181, B-196, B-197, B-205, B-208). 217 B-IDs (was 208); 146 gap frames unchanged. Arithmetic: Section 35e. (ITEM DETAIL) (1) adopted, not stated: actorId is a plain nullable string with no foreign key; rows created before the migration keep a NULL actorId and are not filtered; the 'Someone' wording on those rows is not changed. (2) adopted, not stated: the reason is admin-written text, required, adopted maximum 300 characters, returned only on the owner's own record, cleared on the next upload or delete; the Notification does not copy it and links to Edit Profile. (3) the ratio is the cover slot's in the profile frames, measured by K7; the crop is done in the browser. (4) confirms #392 item 8 and #393; the Edit Profile frames that draw a select are stale; the field stays owner-only (#411 item 3). (5) the rule: a string carries [COPY PENDING LEGAL REVIEW] only if it makes a legal or safety promise (what is checked, who sees it, how long it is kept, what happens to an image or to a child's data); strings already tagged in code and listed in the manifest are unchanged. (6) W6 digit rules: any number of digits after the name with at most one underscore between, digits before the name refused, no cap on the number of digits. (7) the sources are the frames of passes C, E, F1 and J and docs/contest-spec.md; a state no frame draws is built plainly and flagged. (FORWARD-POINTERS) Dated notes appended (original text unchanged) to #243, #290, #369, #371, #381, #393, #394, #398, #399, #406, #410 and #411 (12 rows). NOT DECIDED HERE: whether the actor is named on like and comment rows; whether rows created before the migration are backfilled; the cover's maximum pixel size and whether the server enforces the ratio (B-205); an avatar crop step; whether a moderator-written reason shown to a possible child needs counsel guidance; whether FC5 shows the impression view as a disclosed stub until B-092 exists; which of K6's nine strings are functional. NOT DONE: docs/contest-spec.md is not extended with the W7 defaults (the W7 report section 5 and this entry are the record); Decision Log numbers #293 and #294 are still absent from the table, as before. [2026-10-25: #413 item 3 confirms the item 5 tag rule for the username cooldown hint; #413 adds register rows B-218 to B-221.]</w:t>
+            </w:r>
+          </w:p>
+        </w:tc>
+      </w:tr>
+      <w:tr>
+        <w:tc>
+          <w:tcPr>
+            <w:tcW w:type="dxa" w:w="500"/>
+          </w:tcPr>
+          <w:p>
+            <w:r>
+              <w:t>413</w:t>
+            </w:r>
+          </w:p>
+        </w:tc>
+        <w:tc>
+          <w:tcPr>
+            <w:tcW w:type="dxa" w:w="4700"/>
+          </w:tcPr>
+          <w:p>
+            <w:r>
+              <w:t>Founder decisions 2026-10-25 (second set) on four launch-readiness points left open by FC5 (PR #447) and the earlier Contest and consent decisions (4 items): (1) a guardian withdrawal page is to be built before launch (build register B-112), or the guardian-consent footnote sentence that names it is changed; (2) the Contest Rules copy is supplied by the founder and is reviewed by counsel before launch; (3) the username change-cooldown hint on Edit Profile stays untagged (no [COPY PENDING LEGAL REVIEW]) unless the founder says otherwise; (4) the next QA run is a full run of the 180-test Playwright suite (e2e/), not a subset.</w:t>
+            </w:r>
+          </w:p>
+        </w:tc>
+        <w:tc>
+          <w:tcPr>
+            <w:tcW w:type="dxa" w:w="1850"/>
+          </w:tcPr>
+          <w:p>
+            <w:r>
+              <w:t>docs/decisions-founder-2026-10-25b (docs only, 2026-10-25; founder decisions 2026-10-25, second set, items 1-4; sources docs/fc5-report.md (PR #447), Decision Log #227, #395, #410, #411, #412; docs/build-register.md Section 38, CLAUDE.md)</w:t>
+            </w:r>
+          </w:p>
+        </w:tc>
+        <w:tc>
+          <w:tcPr>
+            <w:tcW w:type="dxa" w:w="2300"/>
+          </w:tcPr>
+          <w:p>
+            <w:r>
+              <w:t>Decided 2026-10-25 (founder statement; the build detail below is adopted and veto-able). DECIDED, NOT BUILT: this entry records decisions and register work only. Docs only: no code, schema, Figma, legal copy, DPIA or Log Book; docs/sprint-1-dpia-outline-draft.md, docs/contest-spec.md and docs/pending-copy-manifest.md are not touched. Item 1: the guardian confirm page footnote (apps/web GuardianConsentConfirmPage.tsx) names a guardian withdrawal page that is not a web route yet; the withdraw endpoints exist (POST /auth/guardian-consent/withdraw/request and /withdraw) with no guardian-facing page (B-080, B-112, FC5 report section 3). Before launch EITHER the page is built (B-112, Figma exists per B-013) OR the sentence is changed; if the sentence is changed, CONSENT_SCREEN_VERSION goes v6 -&gt; v7 with a new tripwire hash and the pending-copy manifest row is updated (Decision Log #348, #410 item 6). New launch check B-221 holds that either/or open so it cannot be missed. Item 2: this changes one point of #227, which recorded that the founder owns the Contest Rules copy with no legal-counsel review track (unlike the ToS and Privacy Policy). The copy is still written by the founder, but counsel reviews it before launch. The visible placeholder in the Contest Rules modal (apps/web ContestRulesModal.tsx; Figma 6241:14657 / 6241:14677) stays until real copy exists. New row B-220 (launch gate); B-051 keeps the copy itself. Item 3: consistent with #412 item 5 (the tag is only for strings that make a legal or safety promise); the hint states a cooldown rule (30 days, one free correction, #411 item 8), not a safeguarding promise. Recorded on B-208 and B-212 so the collation does not re-add it. Item 4: a full 180-test run of e2e/ (Playwright, real apps/web and apps/admin against a real services/api, Postgres and Redis). FC5 re-ran only specs 01 and 07 (24 tests) after fixing the one failure of its own first run (177 passed, 1 failed, 2 did not run), so a full run has not been done since FC4 raised the suite to 180. This pass did not run it. New row B-219 (QA). INTERPRETATIONS RECORDED: (a) the instruction also asked for register rows for a 'Block-label Figma fix' without naming the label or frame; new row B-218 is written as a Figma check that reads the Block labels off the frames and aligns them with the built wording (apps/web OtherProfilePage.tsx: menu item 'Block {name}', dialog button 'Block' / 'Blocking...', 'Reason (optional)', 'You blocked {name}' with Unblock; Settings &gt; Blocked users), and lists which label differs only once the pass has looked; (b) 'before launch' is read as before the launch gate (B-090). NOT decided: whether the withdrawal page or the sentence change is the route (item 1 allows either); whether the real Contest Rules text carries the [COPY PENDING LEGAL REVIEW] tag and a manifest row (adopted: yes, once it exists); which Block label differs. Decision Log numbers #293 and #294 are still absent from the table, as before.</w:t>
             </w:r>
           </w:p>
         </w:tc>

</xml_diff>

<commit_message>
docs: Decision Log #414 and build register Section 40 (withdrawal page, cover crop, image-rejection row, B-094 in W10)
Records the founder's third set of 2026-10-25 decisions. Docs only. Dated notes
appended to Decision Log #382, #395, #411, #412, #413 (originals unchanged).
Register rows B-222 to B-227 for K9, W9, W10 and FC6 scope; status lines on
B-080, B-094, B-112, B-210, B-211, B-215, B-217, B-221.

Co-Authored-By: Claude Sonnet 5.5 <noreply@anthropic.com>
</commit_message>
<xml_diff>
--- a/docs/Soccernity_MVP_Build_Plan_v1.7.docx
+++ b/docs/Soccernity_MVP_Build_Plan_v1.7.docx
@@ -26281,6 +26281,9 @@
             <w:r>
               <w:t>Resolved -- decided, NOT yet built. Applies to EVERY engagement-based contest, challenge or competition and to every user including contestants and minors. Only VIEWS, LIKES and COMMENTS earn points; FOLLOWS AND POSTS EARN NO POINTS IN ANY CIRCUMSTANCE. Per account per item: 1 for a qualifying view (only where views are counted), 1 for a like, 1 for a comment, regardless of how many views/likes/comments that account makes (ten comments = 1). There is NO flat cap of 2: the signals depend on the contest (Phase 1 = views + likes + comments, up to 3 per account per entry; the final = likes + comments, up to 2). In contest/competition tallies SELF-ENGAGEMENT COUNTS. Accounts with restrictions never count; accounts without a verified email never count. A comment counts only if it passes the existing content screening. Non-engagement-based competition types (Prediction accuracy-scored, Commentary community-voted) are unaffected. Full detail: docs/contest-spec.md (section 9a). Build register B-093.</w:t>
             </w:r>
+            <w:r>
+              <w:t xml:space="preserve"> [2026-10-25: #414 item 4: the removal of the follow and post point awards (B-094) is built in backend pass W10; row B-226 carries the tests and documentation that change with it.]</w:t>
+            </w:r>
           </w:p>
         </w:tc>
       </w:tr>
@@ -26851,6 +26854,9 @@
             <w:r>
               <w:t xml:space="preserve"> [2026-10-24: K5 (PR #438) read the withdrawal-confirm frames 6654:57 / 6654:26782: 'closes the account straight away' and 'cannot be undone from this page' are accurate, 'deleted after 30 days' understates. #411 item 7: one inconsistency for the counsel list, nothing changed (B-200).] [2026-10-25: #413 item 1: the guardian withdrawal page (B3) is to be built before launch (B-112), or the guardian-consent footnote sentence that names it is changed; B-221 holds the either/or open.]</w:t>
             </w:r>
+            <w:r>
+              <w:t xml:space="preserve"> [2026-10-25: #414 item 1: the guardian withdrawal page (B3) is built before launch; the consent email and the Approved screen link to it without pre-fill, the withdrawal email's link opens the Confirm step with the code pre-filled; throttle 5 per 15 minutes held in configuration; no CONSENT_SCREEN_VERSION bump (B-112, B-223, B-225).]</w:t>
+            </w:r>
           </w:p>
         </w:tc>
       </w:tr>
@@ -27574,6 +27580,9 @@
             <w:r>
               <w:t xml:space="preserve"> [2026-10-25: #412 closes three points left open after W6 and K6: item 1 (existing like and comment rows between a blocked pair are hidden, not deleted; B-213), item 3 (the cover aspect ratio is the cover frame's; B-210, B-215) and item 2 (how the reject reason reaches the uploader; B-214).] [2026-10-25: #413 item 3: the username change-cooldown hint (item 8) stays untagged unless the founder says otherwise (B-208, B-212).]</w:t>
             </w:r>
+            <w:r>
+              <w:t xml:space="preserve"> [2026-10-25: #414 item 2 fixes the cover parameters left open here: one saved crop at 796:192, mobile cover-fit, browser crop, original not stored, zoom 1x to 3x, minimum width 796 px (B-210, B-222, B-227).]</w:t>
+            </w:r>
           </w:p>
         </w:tc>
       </w:tr>
@@ -27616,6 +27625,9 @@
             <w:r>
               <w:t>Decided 2026-10-25 (founder-adopted defaults, veto-able). DECIDED, NOT BUILT, except item 6, which confirms what W7 and W6 built. Docs only: no code, schema, Figma, legal copy, DPIA or Log Book; docs/sprint-1-dpia-outline-draft.md, docs/contest-spec.md and docs/pending-copy-manifest.md are not touched. INTERPRETATIONS RECORDED: the K7, D11 and FC5 briefs were not available to this pass, so their scope is derived from the seven items; 'the existing notification' in item 2 is read as the existing Notification table and Notification Centre (a new type, no email, no push), because no notification type for an image decision exists today; 'the 17 OPEN defaults stand' (item 6) is read as accepting each default as recorded in the W7 report section 5, so items 2, 3 and 4 there (no views, no exposure engine, follow and post points still awarded) are confirmed as statuses that stay on B-093, B-092 and B-094 and are NOT a decision to leave them unbuilt, and item 15 (forfeit and API wording) stays OPEN in the pending-copy manifest. (REGISTER) docs/build-register.md Section 35: new rows B-209 (K7: Edit Profile Preferred Club as free text; item 4), B-210 (K7: cover crop step at the cover slot's ratio; item 3), B-211 (K7: rejected-image Notification Centre row and in-page reason; item 2), B-212 (K7: tag review of K6's nine strings; item 5), B-213 (D11: Notification.actorId, write sites, blocked-pair hiding; item 1), B-214 (D11: rejection reason storage, owner-only exposure and the notification; item 2), B-215 (FC5: picture and cover upload with the crop and the rejected state; items 2 and 3), B-216 (FC5: Preferred Club free-text field; item 4), B-217 (FC5: Notification Centre renders the image-decision row; item 2). Item 7 needs no new row: it is B-097 (status line on B-095 and B-097). Item 6 needs none (status lines on B-091, B-092, B-093, B-094, B-181). Status lines on 15 existing rows (B-037, B-038, B-091, B-092, B-093, B-094, B-095, B-097, B-123, B-124, B-181, B-196, B-197, B-205, B-208). 217 B-IDs (was 208); 146 gap frames unchanged. Arithmetic: Section 35e. (ITEM DETAIL) (1) adopted, not stated: actorId is a plain nullable string with no foreign key; rows created before the migration keep a NULL actorId and are not filtered; the 'Someone' wording on those rows is not changed. (2) adopted, not stated: the reason is admin-written text, required, adopted maximum 300 characters, returned only on the owner's own record, cleared on the next upload or delete; the Notification does not copy it and links to Edit Profile. (3) the ratio is the cover slot's in the profile frames, measured by K7; the crop is done in the browser. (4) confirms #392 item 8 and #393; the Edit Profile frames that draw a select are stale; the field stays owner-only (#411 item 3). (5) the rule: a string carries [COPY PENDING LEGAL REVIEW] only if it makes a legal or safety promise (what is checked, who sees it, how long it is kept, what happens to an image or to a child's data); strings already tagged in code and listed in the manifest are unchanged. (6) W6 digit rules: any number of digits after the name with at most one underscore between, digits before the name refused, no cap on the number of digits. (7) the sources are the frames of passes C, E, F1 and J and docs/contest-spec.md; a state no frame draws is built plainly and flagged. (FORWARD-POINTERS) Dated notes appended (original text unchanged) to #243, #290, #369, #371, #381, #393, #394, #398, #399, #406, #410 and #411 (12 rows). NOT DECIDED HERE: whether the actor is named on like and comment rows; whether rows created before the migration are backfilled; the cover's maximum pixel size and whether the server enforces the ratio (B-205); an avatar crop step; whether a moderator-written reason shown to a possible child needs counsel guidance; whether FC5 shows the impression view as a disclosed stub until B-092 exists; which of K6's nine strings are functional. NOT DONE: docs/contest-spec.md is not extended with the W7 defaults (the W7 report section 5 and this entry are the record); Decision Log numbers #293 and #294 are still absent from the table, as before. [2026-10-25: #413 item 3 confirms the item 5 tag rule for the username cooldown hint; #413 adds register rows B-218 to B-221.]</w:t>
             </w:r>
+            <w:r>
+              <w:t xml:space="preserve"> [2026-10-25: #414 item 3: the image-decision notification row serves both the picture and the cover (B-224, B-217); item 2 turns the cover crop of item 3 here into one saved crop at 796:192 with zoom 1x to 3x and a 796 px minimum width (B-222, B-227).]</w:t>
+            </w:r>
           </w:p>
         </w:tc>
       </w:tr>
@@ -27657,6 +27669,51 @@
           <w:p>
             <w:r>
               <w:t>Decided 2026-10-25 (founder statement; the build detail below is adopted and veto-able). DECIDED, NOT BUILT: this entry records decisions and register work only. Docs only: no code, schema, Figma, legal copy, DPIA or Log Book; docs/sprint-1-dpia-outline-draft.md, docs/contest-spec.md and docs/pending-copy-manifest.md are not touched. Item 1: the guardian confirm page footnote (apps/web GuardianConsentConfirmPage.tsx) names a guardian withdrawal page that is not a web route yet; the withdraw endpoints exist (POST /auth/guardian-consent/withdraw/request and /withdraw) with no guardian-facing page (B-080, B-112, FC5 report section 3). Before launch EITHER the page is built (B-112, Figma exists per B-013) OR the sentence is changed; if the sentence is changed, CONSENT_SCREEN_VERSION goes v6 -&gt; v7 with a new tripwire hash and the pending-copy manifest row is updated (Decision Log #348, #410 item 6). New launch check B-221 holds that either/or open so it cannot be missed. Item 2: this changes one point of #227, which recorded that the founder owns the Contest Rules copy with no legal-counsel review track (unlike the ToS and Privacy Policy). The copy is still written by the founder, but counsel reviews it before launch. The visible placeholder in the Contest Rules modal (apps/web ContestRulesModal.tsx; Figma 6241:14657 / 6241:14677) stays until real copy exists. New row B-220 (launch gate); B-051 keeps the copy itself. Item 3: consistent with #412 item 5 (the tag is only for strings that make a legal or safety promise); the hint states a cooldown rule (30 days, one free correction, #411 item 8), not a safeguarding promise. Recorded on B-208 and B-212 so the collation does not re-add it. Item 4: a full 180-test run of e2e/ (Playwright, real apps/web and apps/admin against a real services/api, Postgres and Redis). FC5 re-ran only specs 01 and 07 (24 tests) after fixing the one failure of its own first run (177 passed, 1 failed, 2 did not run), so a full run has not been done since FC4 raised the suite to 180. This pass did not run it. New row B-219 (QA). INTERPRETATIONS RECORDED: (a) the instruction also asked for register rows for a 'Block-label Figma fix' without naming the label or frame; new row B-218 is written as a Figma check that reads the Block labels off the frames and aligns them with the built wording (apps/web OtherProfilePage.tsx: menu item 'Block {name}', dialog button 'Block' / 'Blocking...', 'Reason (optional)', 'You blocked {name}' with Unblock; Settings &gt; Blocked users), and lists which label differs only once the pass has looked; (b) 'before launch' is read as before the launch gate (B-090). NOT decided: whether the withdrawal page or the sentence change is the route (item 1 allows either); whether the real Contest Rules text carries the [COPY PENDING LEGAL REVIEW] tag and a manifest row (adopted: yes, once it exists); which Block label differs. Decision Log numbers #293 and #294 are still absent from the table, as before.</w:t>
+            </w:r>
+            <w:r>
+              <w:t xml:space="preserve"> [2026-10-25: #414 item 1 takes the first route of item 1: the guardian withdrawal page is built and the footnote sentence stays unchanged (B-112, B-221).]</w:t>
+            </w:r>
+          </w:p>
+        </w:tc>
+      </w:tr>
+      <w:tr>
+        <w:tc>
+          <w:tcPr>
+            <w:tcW w:type="dxa" w:w="500"/>
+          </w:tcPr>
+          <w:p>
+            <w:r>
+              <w:t>414</w:t>
+            </w:r>
+          </w:p>
+        </w:tc>
+        <w:tc>
+          <w:tcPr>
+            <w:tcW w:type="dxa" w:w="4700"/>
+          </w:tcPr>
+          <w:p>
+            <w:r>
+              <w:t>Founder decisions 2026-10-25 (third set) on four points left open after the withdrawal, cover and notification work (4 items): (1) the guardian withdrawal page is built before launch (build register B-112): the guardian consent email and the Approved screen link to it WITHOUT pre-fill; the withdrawal email gains a link that opens the Confirm frame with the code pre-filled; the throttle is 5 attempts per 15 minutes held in configuration; the guardian-consent footnote sentence is unchanged, so there is no CONSENT_SCREEN_VERSION bump; (2) the cover photo crop: ONE saved crop at the 796:192 ratio, mobile shows it cover-fit, the crop happens in the browser before upload, the original image is not stored, zoom runs from 1x to 3x, and the minimum width is 796 px; (3) the image-rejection notification row serves both the profile picture and the cover; (4) B-094 (removal of the follow and post point awards) is built in backend pass W10.</w:t>
+            </w:r>
+          </w:p>
+        </w:tc>
+        <w:tc>
+          <w:tcPr>
+            <w:tcW w:type="dxa" w:w="1850"/>
+          </w:tcPr>
+          <w:p>
+            <w:r>
+              <w:t>docs/decisions-founder-2026-10-25c (docs only, 2026-10-25; founder decisions 2026-10-25, third set, items 1-4; sources Decision Log #371, #382, #383, #393, #395, #403, #411, #412, #413; docs/build-register.md Section 40; CLAUDE.md)</w:t>
+            </w:r>
+          </w:p>
+        </w:tc>
+        <w:tc>
+          <w:tcPr>
+            <w:tcW w:type="dxa" w:w="2300"/>
+          </w:tcPr>
+          <w:p>
+            <w:r>
+              <w:t>Decided 2026-10-25 (founder statement; the build detail below is adopted and veto-able). DECIDED, NOT BUILT: this entry records decisions and register work only. Docs only: no code, schema, Figma, legal copy, DPIA or Log Book; docs/sprint-1-dpia-outline-draft.md, docs/contest-spec.md and docs/pending-copy-manifest.md are not touched. Item 1: this chooses the first route #413 item 1 allowed (build the page, do not change the footnote sentence). Code check 2026-10-25: the withdrawal-request email already links with the token pre-filled (&lt;WEB_APP_BASE_URL&gt;/guardian-consent/withdraw?token=, built under B-016) and keeps the code in the body, so that half needs no backend change; the guardian consent email carries no withdrawal link yet; the two withdrawal routes use a bare @AuthRateLimit(), i.e. the shared 'auth' throttle (default 5 per 60 s), not 5 per 15 minutes (#403 item 15). Work: K9 (Figma, B-223: the pre-filled Confirm state, the withdrawal email frame checked against the built email), backend pass W9 (B-225: a withdrawal link in the consent email WITHOUT pre-fill, and a configurable 5-per-15-minutes throttle on the two withdrawal routes), FC6 (B-080, B-112: the page, the Approved-screen link, the page honouring ?token=). Adopted, not stated: one route, where ?token= selects the Confirm step. Why no version bump is consistent: the CONSENT_SCREEN_VERSION tripwire hashes the wording of GuardianConsentConfirmPage.tsx only, and the Approved screen is shown after consent is recorded. Risk flagged: if the link's label is put inside that file the tripwire fails; the adopted default is to render the link from its own component or constant outside the hashed file, and if that cannot be done FC6 stops and asks. New wording about a guardian withdrawing is [COPY PENDING LEGAL REVIEW]. B-221 (the launch check) passes when the page is reachable from the consent email and the Approved screen. Item 2: replaces FC5's centre-crop (B-215) and supersedes pass M's separate mobile crop frame (6812:29396, 390:120). K9 (B-222: the 'image too small' state under 796 px wide, the 1x to 3x zoom label, the mobile frames showing the same crop cover-fit; B-210 carries the parameters) and FC6 (B-227: the interactive crop and the refusal). Adopted readings: the 796 px minimum is the width of the image the user chooses; 1x means the image just covers the crop window. NOT decided: the pixel size of the saved file; whether the server enforces size or ratio on the cropped file it receives (B-205; the server never sees the original). Item 3: one row, not two. The backend notification (profile_image_rejected, B-214) already carries which image it was (data.image is 'avatar' or 'cover') and no reason text; pass M's row says 'picture' only. K9 (B-224) re-words it so one design serves both (neutral wording or wording that branches on data.image); FC6 renders it for both (B-217). No second type and no second row design. Item 4: B-094 is unchanged and stays in register wave W8; it is built in backend pass W10 (the pass number, not the register wave of that name). Row B-226 carries the tests and documentation that change with it (points.util.spec.ts, feed.service.spec.ts, users.service.spec.ts, test/contest.e2e-spec.ts, test/leaderboard.e2e-spec.ts, leaderboard.constants.ts, the points and leaderboard README text); existing ledger rows need no handling (#393 (e)). New register rows B-222 to B-227 (6): K9 = B-222, B-223, B-224; W9 = B-225; W10 = B-226; FC6 = B-227 (B-080, B-112, B-215 and B-217 are the existing FC6 rows). K9, W9, W10 and FC6 scope is derived from these four items and the code checks, because the briefs were not available to this pass. (FORWARD-POINTERS) Dated notes appended (original text unchanged) to #382, #395, #411, #412 and #413 (5 rows). NOT DECIDED HERE: the throttle variable names; the saved cover file's pixel size; server-side enforcement of the cover ratio; whether the image-decision row's wording branches on data.image or is neutral; the counsel wording of the new guardian-facing lines. NOT DONE: Decision Log numbers #293 and #294 are still absent from the table, as before.</w:t>
             </w:r>
           </w:p>
         </w:tc>

</xml_diff>

<commit_message>
docs: Decision Log #415 (Approved-screen withdrawal link, v6 to v7, K10/FC7 scope), build register Section 42
Co-Authored-By: Claude Sonnet 5.5 <noreply@anthropic.com>
</commit_message>
<xml_diff>
--- a/docs/Soccernity_MVP_Build_Plan_v1.7.docx
+++ b/docs/Soccernity_MVP_Build_Plan_v1.7.docx
@@ -24799,7 +24799,7 @@
               <w:t>Resolved - implemented (backend). OPERATIONAL MEANING: consentScreenVersion is a MANUALLY BUMPED string constant (CONSENT_SCREEN_VERSION = 'v1', services/api/src/modules/auth/guardian-consent/consent-screen-version.constants.ts). Nothing derives it from the screen's content, a hash or a git revision, and nothing detects drift: whoever materially changes the guardian-consent confirmation screen's wording or substance (apps/web GuardianConsentConfirmPage.tsx / its Figma frame) must bump it in the same PR. Cosmetic changes need no bump. deviceType is a coarse 'mobile' | 'desktop' | 'unknown' derived from the User-Agent header at confirmation; the raw User-Agent is never stored (data minimisation). WHERE: ConsentAuditRecord only exists from anonymization time (a snapshot), so both values are stamped onto the Guardian row (new nullable consentScreenVersion / consentDeviceType) in the SAME updateMany as consentTimestamp in confirmConsent - no new write path - then snapshotted into ConsentAuditRecord.consentScreenVersion / deviceType by AccountDeletionSweepService. Flagged: two additive nullable columns on Guardian (beyond Section 3; safeguarding fields untouched, nothing weakened). Existing rows carry NULL, not backfilled. No admin/compliance export of ConsentAuditRecord exists to update. Open: the version constant is only as reliable as reviewers remembering to bump it; the guardian-facing page is not yet checked against it in CI; an idempotent re-confirm never overwrites the original evidence. [2026-10-19: FC3a (PR #430) bumped CONSENT_SCREEN_VERSION v3 to v4 and the hash when the guardian page wording changed (B-130, B-153, B-154). #408 item 6 tags the post-decline clause, which forces a further bump to v5 in its build PR (B-169).] [2026-10-20: FC4 (PR #435) bumped CONSENT_SCREEN_VERSION v4 to v5 and the hash (the tagged post-decline clause, B-169). #410 item 6 adds the link-expiry and withdrawal sentences to the guardian footnote, which forces a further bump to v6 in its build PR (B-185).]</w:t>
             </w:r>
             <w:r>
-              <w:t xml:space="preserve"> [2026-10-24: K5 (PR #438) fixed the final Figma guardian-confirm footnote and tagged each of its three guardian/child sentences; the code still carries only the cap sentence. Adding the link-expiry and withdrawal sentences needs a CONSENT_SCREEN_VERSION bump with the text hash (B-185, #410 item 6); the strings are listed in docs/figma-pass-k5-report.md section 6.]</w:t>
+              <w:t xml:space="preserve"> [2026-10-24: K5 (PR #438) fixed the final Figma guardian-confirm footnote and tagged each of its three guardian/child sentences; the code still carries only the cap sentence. Adding the link-expiry and withdrawal sentences needs a CONSENT_SCREEN_VERSION bump with the text hash (B-185, #410 item 6); the strings are listed in docs/figma-pass-k5-report.md section 6.] [2026-10-26: #415 item 1 puts the link to the guardian withdrawal page inside the guardian-consent footnote on the Approved screen, in GuardianConsentConfirmPage.tsx, so CONSENT_SCREEN_VERSION goes v6 to v7 in the FC7 build PR (B-229, B-185, B-221).]</w:t>
             </w:r>
           </w:p>
         </w:tc>
@@ -27626,7 +27626,7 @@
               <w:t>Decided 2026-10-25 (founder-adopted defaults, veto-able). DECIDED, NOT BUILT, except item 6, which confirms what W7 and W6 built. Docs only: no code, schema, Figma, legal copy, DPIA or Log Book; docs/sprint-1-dpia-outline-draft.md, docs/contest-spec.md and docs/pending-copy-manifest.md are not touched. INTERPRETATIONS RECORDED: the K7, D11 and FC5 briefs were not available to this pass, so their scope is derived from the seven items; 'the existing notification' in item 2 is read as the existing Notification table and Notification Centre (a new type, no email, no push), because no notification type for an image decision exists today; 'the 17 OPEN defaults stand' (item 6) is read as accepting each default as recorded in the W7 report section 5, so items 2, 3 and 4 there (no views, no exposure engine, follow and post points still awarded) are confirmed as statuses that stay on B-093, B-092 and B-094 and are NOT a decision to leave them unbuilt, and item 15 (forfeit and API wording) stays OPEN in the pending-copy manifest. (REGISTER) docs/build-register.md Section 35: new rows B-209 (K7: Edit Profile Preferred Club as free text; item 4), B-210 (K7: cover crop step at the cover slot's ratio; item 3), B-211 (K7: rejected-image Notification Centre row and in-page reason; item 2), B-212 (K7: tag review of K6's nine strings; item 5), B-213 (D11: Notification.actorId, write sites, blocked-pair hiding; item 1), B-214 (D11: rejection reason storage, owner-only exposure and the notification; item 2), B-215 (FC5: picture and cover upload with the crop and the rejected state; items 2 and 3), B-216 (FC5: Preferred Club free-text field; item 4), B-217 (FC5: Notification Centre renders the image-decision row; item 2). Item 7 needs no new row: it is B-097 (status line on B-095 and B-097). Item 6 needs none (status lines on B-091, B-092, B-093, B-094, B-181). Status lines on 15 existing rows (B-037, B-038, B-091, B-092, B-093, B-094, B-095, B-097, B-123, B-124, B-181, B-196, B-197, B-205, B-208). 217 B-IDs (was 208); 146 gap frames unchanged. Arithmetic: Section 35e. (ITEM DETAIL) (1) adopted, not stated: actorId is a plain nullable string with no foreign key; rows created before the migration keep a NULL actorId and are not filtered; the 'Someone' wording on those rows is not changed. (2) adopted, not stated: the reason is admin-written text, required, adopted maximum 300 characters, returned only on the owner's own record, cleared on the next upload or delete; the Notification does not copy it and links to Edit Profile. (3) the ratio is the cover slot's in the profile frames, measured by K7; the crop is done in the browser. (4) confirms #392 item 8 and #393; the Edit Profile frames that draw a select are stale; the field stays owner-only (#411 item 3). (5) the rule: a string carries [COPY PENDING LEGAL REVIEW] only if it makes a legal or safety promise (what is checked, who sees it, how long it is kept, what happens to an image or to a child's data); strings already tagged in code and listed in the manifest are unchanged. (6) W6 digit rules: any number of digits after the name with at most one underscore between, digits before the name refused, no cap on the number of digits. (7) the sources are the frames of passes C, E, F1 and J and docs/contest-spec.md; a state no frame draws is built plainly and flagged. (FORWARD-POINTERS) Dated notes appended (original text unchanged) to #243, #290, #369, #371, #381, #393, #394, #398, #399, #406, #410 and #411 (12 rows). NOT DECIDED HERE: whether the actor is named on like and comment rows; whether rows created before the migration are backfilled; the cover's maximum pixel size and whether the server enforces the ratio (B-205); an avatar crop step; whether a moderator-written reason shown to a possible child needs counsel guidance; whether FC5 shows the impression view as a disclosed stub until B-092 exists; which of K6's nine strings are functional. NOT DONE: docs/contest-spec.md is not extended with the W7 defaults (the W7 report section 5 and this entry are the record); Decision Log numbers #293 and #294 are still absent from the table, as before. [2026-10-25: #413 item 3 confirms the item 5 tag rule for the username cooldown hint; #413 adds register rows B-218 to B-221.]</w:t>
             </w:r>
             <w:r>
-              <w:t xml:space="preserve"> [2026-10-25: #414 item 3: the image-decision notification row serves both the picture and the cover (B-224, B-217); item 2 turns the cover crop of item 3 here into one saved crop at 796:192 with zoom 1x to 3x and a 796 px minimum width (B-222, B-227).]</w:t>
+              <w:t xml:space="preserve"> [2026-10-25: #414 item 3: the image-decision notification row serves both the picture and the cover (B-224, B-217); item 2 turns the cover crop of item 3 here into one saved crop at 796:192 with zoom 1x to 3x and a 796 px minimum width (B-222, B-227).] [2026-10-26: #415 item 4 removes the [COPY PENDING LEGAL REVIEW] tag from the blocked-profile notice frames in Figma, applying the item 5 rule here (the built notice is untagged); K10 (B-228).]</w:t>
             </w:r>
           </w:p>
         </w:tc>
@@ -27671,7 +27671,7 @@
               <w:t>Decided 2026-10-25 (founder statement; the build detail below is adopted and veto-able). DECIDED, NOT BUILT: this entry records decisions and register work only. Docs only: no code, schema, Figma, legal copy, DPIA or Log Book; docs/sprint-1-dpia-outline-draft.md, docs/contest-spec.md and docs/pending-copy-manifest.md are not touched. Item 1: the guardian confirm page footnote (apps/web GuardianConsentConfirmPage.tsx) names a guardian withdrawal page that is not a web route yet; the withdraw endpoints exist (POST /auth/guardian-consent/withdraw/request and /withdraw) with no guardian-facing page (B-080, B-112, FC5 report section 3). Before launch EITHER the page is built (B-112, Figma exists per B-013) OR the sentence is changed; if the sentence is changed, CONSENT_SCREEN_VERSION goes v6 -&gt; v7 with a new tripwire hash and the pending-copy manifest row is updated (Decision Log #348, #410 item 6). New launch check B-221 holds that either/or open so it cannot be missed. Item 2: this changes one point of #227, which recorded that the founder owns the Contest Rules copy with no legal-counsel review track (unlike the ToS and Privacy Policy). The copy is still written by the founder, but counsel reviews it before launch. The visible placeholder in the Contest Rules modal (apps/web ContestRulesModal.tsx; Figma 6241:14657 / 6241:14677) stays until real copy exists. New row B-220 (launch gate); B-051 keeps the copy itself. Item 3: consistent with #412 item 5 (the tag is only for strings that make a legal or safety promise); the hint states a cooldown rule (30 days, one free correction, #411 item 8), not a safeguarding promise. Recorded on B-208 and B-212 so the collation does not re-add it. Item 4: a full 180-test run of e2e/ (Playwright, real apps/web and apps/admin against a real services/api, Postgres and Redis). FC5 re-ran only specs 01 and 07 (24 tests) after fixing the one failure of its own first run (177 passed, 1 failed, 2 did not run), so a full run has not been done since FC4 raised the suite to 180. This pass did not run it. New row B-219 (QA). INTERPRETATIONS RECORDED: (a) the instruction also asked for register rows for a 'Block-label Figma fix' without naming the label or frame; new row B-218 is written as a Figma check that reads the Block labels off the frames and aligns them with the built wording (apps/web OtherProfilePage.tsx: menu item 'Block {name}', dialog button 'Block' / 'Blocking...', 'Reason (optional)', 'You blocked {name}' with Unblock; Settings &gt; Blocked users), and lists which label differs only once the pass has looked; (b) 'before launch' is read as before the launch gate (B-090). NOT decided: whether the withdrawal page or the sentence change is the route (item 1 allows either); whether the real Contest Rules text carries the [COPY PENDING LEGAL REVIEW] tag and a manifest row (adopted: yes, once it exists); which Block label differs. Decision Log numbers #293 and #294 are still absent from the table, as before.</w:t>
             </w:r>
             <w:r>
-              <w:t xml:space="preserve"> [2026-10-25: #414 item 1 takes the first route of item 1: the guardian withdrawal page is built and the footnote sentence stays unchanged (B-112, B-221).]</w:t>
+              <w:t xml:space="preserve"> [2026-10-25: #414 item 1 takes the first route of item 1: the guardian withdrawal page is built and the footnote sentence stays unchanged (B-112, B-221).] [2026-10-26: #415 item 1 corrects #414 item 1 on the version bump: the Approved-screen link is inside the hashed footnote, so CONSENT_SCREEN_VERSION goes v6 to v7; the page is still built (B-112, B-221), and the launch check B-221 is unchanged in meaning.]</w:t>
             </w:r>
           </w:p>
         </w:tc>
@@ -27713,7 +27713,49 @@
           </w:tcPr>
           <w:p>
             <w:r>
-              <w:t>Decided 2026-10-25 (founder statement; the build detail below is adopted and veto-able). DECIDED, NOT BUILT: this entry records decisions and register work only. Docs only: no code, schema, Figma, legal copy, DPIA or Log Book; docs/sprint-1-dpia-outline-draft.md, docs/contest-spec.md and docs/pending-copy-manifest.md are not touched. Item 1: this chooses the first route #413 item 1 allowed (build the page, do not change the footnote sentence). Code check 2026-10-25: the withdrawal-request email already links with the token pre-filled (&lt;WEB_APP_BASE_URL&gt;/guardian-consent/withdraw?token=, built under B-016) and keeps the code in the body, so that half needs no backend change; the guardian consent email carries no withdrawal link yet; the two withdrawal routes use a bare @AuthRateLimit(), i.e. the shared 'auth' throttle (default 5 per 60 s), not 5 per 15 minutes (#403 item 15). Work: K9 (Figma, B-223: the pre-filled Confirm state, the withdrawal email frame checked against the built email), backend pass W9 (B-225: a withdrawal link in the consent email WITHOUT pre-fill, and a configurable 5-per-15-minutes throttle on the two withdrawal routes), FC6 (B-080, B-112: the page, the Approved-screen link, the page honouring ?token=). Adopted, not stated: one route, where ?token= selects the Confirm step. Why no version bump is consistent: the CONSENT_SCREEN_VERSION tripwire hashes the wording of GuardianConsentConfirmPage.tsx only, and the Approved screen is shown after consent is recorded. Risk flagged: if the link's label is put inside that file the tripwire fails; the adopted default is to render the link from its own component or constant outside the hashed file, and if that cannot be done FC6 stops and asks. New wording about a guardian withdrawing is [COPY PENDING LEGAL REVIEW]. B-221 (the launch check) passes when the page is reachable from the consent email and the Approved screen. Item 2: replaces FC5's centre-crop (B-215) and supersedes pass M's separate mobile crop frame (6812:29396, 390:120). K9 (B-222: the 'image too small' state under 796 px wide, the 1x to 3x zoom label, the mobile frames showing the same crop cover-fit; B-210 carries the parameters) and FC6 (B-227: the interactive crop and the refusal). Adopted readings: the 796 px minimum is the width of the image the user chooses; 1x means the image just covers the crop window. NOT decided: the pixel size of the saved file; whether the server enforces size or ratio on the cropped file it receives (B-205; the server never sees the original). Item 3: one row, not two. The backend notification (profile_image_rejected, B-214) already carries which image it was (data.image is 'avatar' or 'cover') and no reason text; pass M's row says 'picture' only. K9 (B-224) re-words it so one design serves both (neutral wording or wording that branches on data.image); FC6 renders it for both (B-217). No second type and no second row design. Item 4: B-094 is unchanged and stays in register wave W8; it is built in backend pass W10 (the pass number, not the register wave of that name). Row B-226 carries the tests and documentation that change with it (points.util.spec.ts, feed.service.spec.ts, users.service.spec.ts, test/contest.e2e-spec.ts, test/leaderboard.e2e-spec.ts, leaderboard.constants.ts, the points and leaderboard README text); existing ledger rows need no handling (#393 (e)). New register rows B-222 to B-227 (6): K9 = B-222, B-223, B-224; W9 = B-225; W10 = B-226; FC6 = B-227 (B-080, B-112, B-215 and B-217 are the existing FC6 rows). K9, W9, W10 and FC6 scope is derived from these four items and the code checks, because the briefs were not available to this pass. (FORWARD-POINTERS) Dated notes appended (original text unchanged) to #382, #395, #411, #412 and #413 (5 rows). NOT DECIDED HERE: the throttle variable names; the saved cover file's pixel size; server-side enforcement of the cover ratio; whether the image-decision row's wording branches on data.image or is neutral; the counsel wording of the new guardian-facing lines. NOT DONE: Decision Log numbers #293 and #294 are still absent from the table, as before.</w:t>
+              <w:t>Decided 2026-10-25 (founder statement; the build detail below is adopted and veto-able). DECIDED, NOT BUILT: this entry records decisions and register work only. Docs only: no code, schema, Figma, legal copy, DPIA or Log Book; docs/sprint-1-dpia-outline-draft.md, docs/contest-spec.md and docs/pending-copy-manifest.md are not touched. Item 1: this chooses the first route #413 item 1 allowed (build the page, do not change the footnote sentence). Code check 2026-10-25: the withdrawal-request email already links with the token pre-filled (&lt;WEB_APP_BASE_URL&gt;/guardian-consent/withdraw?token=, built under B-016) and keeps the code in the body, so that half needs no backend change; the guardian consent email carries no withdrawal link yet; the two withdrawal routes use a bare @AuthRateLimit(), i.e. the shared 'auth' throttle (default 5 per 60 s), not 5 per 15 minutes (#403 item 15). Work: K9 (Figma, B-223: the pre-filled Confirm state, the withdrawal email frame checked against the built email), backend pass W9 (B-225: a withdrawal link in the consent email WITHOUT pre-fill, and a configurable 5-per-15-minutes throttle on the two withdrawal routes), FC6 (B-080, B-112: the page, the Approved-screen link, the page honouring ?token=). Adopted, not stated: one route, where ?token= selects the Confirm step. Why no version bump is consistent: the CONSENT_SCREEN_VERSION tripwire hashes the wording of GuardianConsentConfirmPage.tsx only, and the Approved screen is shown after consent is recorded. Risk flagged: if the link's label is put inside that file the tripwire fails; the adopted default is to render the link from its own component or constant outside the hashed file, and if that cannot be done FC6 stops and asks. New wording about a guardian withdrawing is [COPY PENDING LEGAL REVIEW]. B-221 (the launch check) passes when the page is reachable from the consent email and the Approved screen. Item 2: replaces FC5's centre-crop (B-215) and supersedes pass M's separate mobile crop frame (6812:29396, 390:120). K9 (B-222: the 'image too small' state under 796 px wide, the 1x to 3x zoom label, the mobile frames showing the same crop cover-fit; B-210 carries the parameters) and FC6 (B-227: the interactive crop and the refusal). Adopted readings: the 796 px minimum is the width of the image the user chooses; 1x means the image just covers the crop window. NOT decided: the pixel size of the saved file; whether the server enforces size or ratio on the cropped file it receives (B-205; the server never sees the original). Item 3: one row, not two. The backend notification (profile_image_rejected, B-214) already carries which image it was (data.image is 'avatar' or 'cover') and no reason text; pass M's row says 'picture' only. K9 (B-224) re-words it so one design serves both (neutral wording or wording that branches on data.image); FC6 renders it for both (B-217). No second type and no second row design. Item 4: B-094 is unchanged and stays in register wave W8; it is built in backend pass W10 (the pass number, not the register wave of that name). Row B-226 carries the tests and documentation that change with it (points.util.spec.ts, feed.service.spec.ts, users.service.spec.ts, test/contest.e2e-spec.ts, test/leaderboard.e2e-spec.ts, leaderboard.constants.ts, the points and leaderboard README text); existing ledger rows need no handling (#393 (e)). New register rows B-222 to B-227 (6): K9 = B-222, B-223, B-224; W9 = B-225; W10 = B-226; FC6 = B-227 (B-080, B-112, B-215 and B-217 are the existing FC6 rows). K9, W9, W10 and FC6 scope is derived from these four items and the code checks, because the briefs were not available to this pass. (FORWARD-POINTERS) Dated notes appended (original text unchanged) to #382, #395, #411, #412 and #413 (5 rows). NOT DECIDED HERE: the throttle variable names; the saved cover file's pixel size; server-side enforcement of the cover ratio; whether the image-decision row's wording branches on data.image or is neutral; the counsel wording of the new guardian-facing lines. NOT DONE: Decision Log numbers #293 and #294 are still absent from the table, as before. [2026-10-26: #415 item 1 CORRECTS item 1 here: the link on the Approved screen lives in the hashed footnote, so CONSENT_SCREEN_VERSION goes v6 to v7 (the 'no bump' statement and the 'outside the hashed file' default are withdrawn); items 2 to 5 of #415 add the cover preview, the Block frame rebase and the K10 and FC7 scope (B-228, B-229). Items 2 to 4 here are unchanged.]</w:t>
+            </w:r>
+          </w:p>
+        </w:tc>
+      </w:tr>
+      <w:tr>
+        <w:tc>
+          <w:tcPr>
+            <w:tcW w:type="dxa" w:w="500"/>
+          </w:tcPr>
+          <w:p>
+            <w:r>
+              <w:t>415</w:t>
+            </w:r>
+          </w:p>
+        </w:tc>
+        <w:tc>
+          <w:tcPr>
+            <w:tcW w:type="dxa" w:w="4700"/>
+          </w:tcPr>
+          <w:p>
+            <w:r>
+              <w:t>Founder decisions 2026-10-26 on the Approved-screen withdrawal link, the cover preview, the Block frames, the blocked-profile notice tag and the next Figma pass (5 items): (1) CORRECTION OF RECORD on #414 item 1: linking the Approved screen to the guardian withdrawal page changes the hashed consent screen, so CONSENT_SCREEN_VERSION goes v6 to v7; the footnote words 'guardian withdrawal page' become a link to /guardian-consent/withdraw without pre-fill; (2) the mobile cover preview shows the real cover-fit result of the one 796:192 crop; (3) the Block confirmation frame is rebased onto the other-user profile frame 6747:28894, and the Blocked users rows show the public name once; (4) the blocked-profile notice tag is removed in Figma to match the built, untagged notice (#412 item 5); (5) K10 draws the image-too-small state, the 1x to 3x zoom scale and the withdrawal 400 inline error.</w:t>
+            </w:r>
+          </w:p>
+        </w:tc>
+        <w:tc>
+          <w:tcPr>
+            <w:tcW w:type="dxa" w:w="1850"/>
+          </w:tcPr>
+          <w:p>
+            <w:r>
+              <w:t>docs/decisions-founder-2026-10-26 (docs only, 2026-10-26; founder decisions 2026-10-26, items 1-5; sources Decision Log #348, #396, #410, #411, #412, #413, #414; docs/build-register.md Section 42; docs/figma-pass-n-report.md; docs/fc5-report.md and the FC6 status in CLAUDE.md; apps/web GuardianConsentConfirmPage.tsx and the consent-screen tripwire files in services/api; CLAUDE.md)</w:t>
+            </w:r>
+          </w:p>
+        </w:tc>
+        <w:tc>
+          <w:tcPr>
+            <w:tcW w:type="dxa" w:w="2300"/>
+          </w:tcPr>
+          <w:p>
+            <w:r>
+              <w:t>Decided 2026-10-26 (founder statement; the build detail below is adopted and veto-able). DECIDED, NOT BUILT: this entry records decisions and register work only. Docs only: no code, schema, Figma, legal copy, DPIA or Log Book; docs/sprint-1-dpia-outline-draft.md, docs/contest-spec.md and docs/pending-copy-manifest.md are not touched. Item 1 (correction of record on #414 item 1): #414 said the Approved screen links to the withdrawal page and, at the same time, that CONSENT_SCREEN_VERSION is not bumped, with the adopted default that the link's label lives outside the hashed file. The founder now decides the label is IN the guardian-consent footnote: the words 'guardian withdrawal page' in the sentence 'You can withdraw consent at any time on the guardian withdrawal page.' become a link to /guardian-consent/withdraw WITHOUT pre-fill (the request page, the same target the consent email uses; the pre-filled Confirm step stays the withdrawal email's link). That text lives in apps/web GuardianConsentConfirmPage.tsx, the file the #348 tripwire hashes, so CONSENT_SCREEN_VERSION goes v6 to v7 in the FC7 build PR, with CONSENT_SCREEN_TEXT_HASH updated in the same constants file if it changes, and the manifest row for the sentence kept (it stays tagged [COPY PENDING LEGAL REVIEW]). This reverses the 'no bump' statement and the 'outside the hashed file' default of #414 item 1; the rest of #414 item 1 (the page, the throttle, the consent-email link, the pre-fill) is unchanged. It also settles the open point recorded under B-080 and B-221: B-221 passes when the page is reachable from the consent email and the Approved screen, and the v7 bump is part of getting there. Reading of the code, not run: the hash extractor (consent-screen-text-hash.util.ts) lowercases the JSX text and strips everything that is not a letter or a digit, so wrapping the same words in a link is likely to leave the recorded hash unchanged; FC7 checks and updates the hash only if the spec says so. The version still moves to v7 because the founder decided it, and no test ties the version to the hash alone. NOT decided: whether a v7 with an unchanged hash is wanted as a deliberate marker (assumed yes, it records that the screen now carries the link). Item 2: the mobile cover preview shows the real cover-fit result of the ONE saved 796:192 crop, not a separate mobile crop and not a stretched image. Pass N redrew the mobile crop frame 6812:29396 with a 796:192 window; the preview that frame and the profile frames show on mobile is the same crop displayed cover-fit at the mobile cover slot. K10 draws it, FC7 builds it from the K10 frames (the crop dialog in apps/web already shows a cropped preview; FC7 aligns it to the frames). NOT decided: the pixel size of the saved file (B-205), as before. Item 3: the Block confirmation frame is rebased onto the other-user profile frame 6747:28894 (pass N left the desktop dialog 6655:27355 on the legacy own-profile layout, B-218), and the Blocked users rows show the public name once, with no second display-name or @handle line (pass N left rows drawing a display name plus a handle; the endpoint returns only the public name). Figma only; K10. Item 4: the blocked-profile notice frames (6706:26750, 6707:26595) carry the [COPY PENDING LEGAL REVIEW] tag in Figma and the built notice carries none; under #412 item 5 the tag stays only on strings that make a legal or safety promise, so the tag is removed from the Figma notice. Figma only; K10. Item 5: K10 (the next Figma pass) draws the 'image too small' state shown when the chosen cover image is under 796 px wide (B-222), the 1x to 3x zoom scale labelled on the zoom control (B-222), and the inline error on the withdrawal Confirm step for a 400 (a code or link that cannot be used), drawn inside the Confirm frame rather than as the separate 'link invalid or expired' state (B-223); K10 also carries items 2, 3 and 4. The built code already refuses an image under 796 px wide and shows the zoom slider and a cropped preview (FC6); FC7 brings them, and the withdrawal 400 inline error, to the K10 frames. Work: K10 = B-228 (Figma); FC7 = B-229 (apps/web: the Approved-screen link and the v6 to v7 bump, the cover preview, the Block and Blocked users alignment, the withdrawal 400 inline error). K10 and FC7 scope is derived from these five items because their briefs were not available to this pass; if the briefs name different scope the rows move. Existing rows B-080, B-112, B-185, B-210, B-218, B-221, B-222 and B-223 carry status lines. New wording about a guardian withdrawing stays [COPY PENDING LEGAL REVIEW]; the image-too-small and zoom strings are functional and untagged (#412 item 5). (FORWARD-POINTERS) Dated notes appended (original text unchanged) to #348, #412, #413 and #414 (4 rows). NOT DECIDED HERE: whether the withdrawal 400 inline error is a separate message from the 'link invalid or expired' state or the same wording (K10 chooses; adopted: the inline error reuses the built 400 message and the separate state stays for a link opened with a bad token); the wording of the image-too-small message (K10 chooses). NOT DONE: Decision Log numbers #293 and #294 are still absent from the table, as before.</w:t>
             </w:r>
           </w:p>
         </w:tc>

</xml_diff>

<commit_message>
docs: Decision Log #416 (v7 hash correction, K10 judgment calls), build register Section 44 and K10/FC7 status lines
Docs only. Correction of record on #415 item 1: CONSENT_SCREEN_TEXT_HASH did not
change when the footnote link was added, so the v6 to v7 bump was not strictly
required; v7 stays as a deliberate marker. K10 judgment calls accepted (Eleanor
Pena set to the profile owner, Block menu detail not reproduced, hidden layers
stay hidden). Dated notes on #348, #412, #414, #415; status lines on B-222,
B-223, B-227, B-228, B-229; CLAUDE.md merge status for PR #457/#458 corrected.

Co-Authored-By: Claude Sonnet 5.5 <noreply@anthropic.com>
</commit_message>
<xml_diff>
--- a/docs/Soccernity_MVP_Build_Plan_v1.7.docx
+++ b/docs/Soccernity_MVP_Build_Plan_v1.7.docx
@@ -24799,7 +24799,7 @@
               <w:t>Resolved - implemented (backend). OPERATIONAL MEANING: consentScreenVersion is a MANUALLY BUMPED string constant (CONSENT_SCREEN_VERSION = 'v1', services/api/src/modules/auth/guardian-consent/consent-screen-version.constants.ts). Nothing derives it from the screen's content, a hash or a git revision, and nothing detects drift: whoever materially changes the guardian-consent confirmation screen's wording or substance (apps/web GuardianConsentConfirmPage.tsx / its Figma frame) must bump it in the same PR. Cosmetic changes need no bump. deviceType is a coarse 'mobile' | 'desktop' | 'unknown' derived from the User-Agent header at confirmation; the raw User-Agent is never stored (data minimisation). WHERE: ConsentAuditRecord only exists from anonymization time (a snapshot), so both values are stamped onto the Guardian row (new nullable consentScreenVersion / consentDeviceType) in the SAME updateMany as consentTimestamp in confirmConsent - no new write path - then snapshotted into ConsentAuditRecord.consentScreenVersion / deviceType by AccountDeletionSweepService. Flagged: two additive nullable columns on Guardian (beyond Section 3; safeguarding fields untouched, nothing weakened). Existing rows carry NULL, not backfilled. No admin/compliance export of ConsentAuditRecord exists to update. Open: the version constant is only as reliable as reviewers remembering to bump it; the guardian-facing page is not yet checked against it in CI; an idempotent re-confirm never overwrites the original evidence. [2026-10-19: FC3a (PR #430) bumped CONSENT_SCREEN_VERSION v3 to v4 and the hash when the guardian page wording changed (B-130, B-153, B-154). #408 item 6 tags the post-decline clause, which forces a further bump to v5 in its build PR (B-169).] [2026-10-20: FC4 (PR #435) bumped CONSENT_SCREEN_VERSION v4 to v5 and the hash (the tagged post-decline clause, B-169). #410 item 6 adds the link-expiry and withdrawal sentences to the guardian footnote, which forces a further bump to v6 in its build PR (B-185).]</w:t>
             </w:r>
             <w:r>
-              <w:t xml:space="preserve"> [2026-10-24: K5 (PR #438) fixed the final Figma guardian-confirm footnote and tagged each of its three guardian/child sentences; the code still carries only the cap sentence. Adding the link-expiry and withdrawal sentences needs a CONSENT_SCREEN_VERSION bump with the text hash (B-185, #410 item 6); the strings are listed in docs/figma-pass-k5-report.md section 6.] [2026-10-26: #415 item 1 puts the link to the guardian withdrawal page inside the guardian-consent footnote on the Approved screen, in GuardianConsentConfirmPage.tsx, so CONSENT_SCREEN_VERSION goes v6 to v7 in the FC7 build PR (B-229, B-185, B-221).]</w:t>
+              <w:t xml:space="preserve"> [2026-10-24: K5 (PR #438) fixed the final Figma guardian-confirm footnote and tagged each of its three guardian/child sentences; the code still carries only the cap sentence. Adding the link-expiry and withdrawal sentences needs a CONSENT_SCREEN_VERSION bump with the text hash (B-185, #410 item 6); the strings are listed in docs/figma-pass-k5-report.md section 6.] [2026-10-26: #415 item 1 puts the link to the guardian withdrawal page inside the guardian-consent footnote on the Approved screen, in GuardianConsentConfirmPage.tsx, so CONSENT_SCREEN_VERSION goes v6 to v7 in the FC7 build PR (B-229, B-185, B-221).] [2026-10-26: #416: FC7 (PR #458) moved CONSENT_SCREEN_VERSION to v7 for the withdrawal link in the guardian-consent footnote; CONSENT_SCREEN_TEXT_HASH did not change (the extractor reads JSX text inside child elements). v7 is a deliberate marker; the tripwire still fails on any wording change until the hash and version are updated together (B-229, B-185).]</w:t>
             </w:r>
           </w:p>
         </w:tc>
@@ -27626,7 +27626,7 @@
               <w:t>Decided 2026-10-25 (founder-adopted defaults, veto-able). DECIDED, NOT BUILT, except item 6, which confirms what W7 and W6 built. Docs only: no code, schema, Figma, legal copy, DPIA or Log Book; docs/sprint-1-dpia-outline-draft.md, docs/contest-spec.md and docs/pending-copy-manifest.md are not touched. INTERPRETATIONS RECORDED: the K7, D11 and FC5 briefs were not available to this pass, so their scope is derived from the seven items; 'the existing notification' in item 2 is read as the existing Notification table and Notification Centre (a new type, no email, no push), because no notification type for an image decision exists today; 'the 17 OPEN defaults stand' (item 6) is read as accepting each default as recorded in the W7 report section 5, so items 2, 3 and 4 there (no views, no exposure engine, follow and post points still awarded) are confirmed as statuses that stay on B-093, B-092 and B-094 and are NOT a decision to leave them unbuilt, and item 15 (forfeit and API wording) stays OPEN in the pending-copy manifest. (REGISTER) docs/build-register.md Section 35: new rows B-209 (K7: Edit Profile Preferred Club as free text; item 4), B-210 (K7: cover crop step at the cover slot's ratio; item 3), B-211 (K7: rejected-image Notification Centre row and in-page reason; item 2), B-212 (K7: tag review of K6's nine strings; item 5), B-213 (D11: Notification.actorId, write sites, blocked-pair hiding; item 1), B-214 (D11: rejection reason storage, owner-only exposure and the notification; item 2), B-215 (FC5: picture and cover upload with the crop and the rejected state; items 2 and 3), B-216 (FC5: Preferred Club free-text field; item 4), B-217 (FC5: Notification Centre renders the image-decision row; item 2). Item 7 needs no new row: it is B-097 (status line on B-095 and B-097). Item 6 needs none (status lines on B-091, B-092, B-093, B-094, B-181). Status lines on 15 existing rows (B-037, B-038, B-091, B-092, B-093, B-094, B-095, B-097, B-123, B-124, B-181, B-196, B-197, B-205, B-208). 217 B-IDs (was 208); 146 gap frames unchanged. Arithmetic: Section 35e. (ITEM DETAIL) (1) adopted, not stated: actorId is a plain nullable string with no foreign key; rows created before the migration keep a NULL actorId and are not filtered; the 'Someone' wording on those rows is not changed. (2) adopted, not stated: the reason is admin-written text, required, adopted maximum 300 characters, returned only on the owner's own record, cleared on the next upload or delete; the Notification does not copy it and links to Edit Profile. (3) the ratio is the cover slot's in the profile frames, measured by K7; the crop is done in the browser. (4) confirms #392 item 8 and #393; the Edit Profile frames that draw a select are stale; the field stays owner-only (#411 item 3). (5) the rule: a string carries [COPY PENDING LEGAL REVIEW] only if it makes a legal or safety promise (what is checked, who sees it, how long it is kept, what happens to an image or to a child's data); strings already tagged in code and listed in the manifest are unchanged. (6) W6 digit rules: any number of digits after the name with at most one underscore between, digits before the name refused, no cap on the number of digits. (7) the sources are the frames of passes C, E, F1 and J and docs/contest-spec.md; a state no frame draws is built plainly and flagged. (FORWARD-POINTERS) Dated notes appended (original text unchanged) to #243, #290, #369, #371, #381, #393, #394, #398, #399, #406, #410 and #411 (12 rows). NOT DECIDED HERE: whether the actor is named on like and comment rows; whether rows created before the migration are backfilled; the cover's maximum pixel size and whether the server enforces the ratio (B-205); an avatar crop step; whether a moderator-written reason shown to a possible child needs counsel guidance; whether FC5 shows the impression view as a disclosed stub until B-092 exists; which of K6's nine strings are functional. NOT DONE: docs/contest-spec.md is not extended with the W7 defaults (the W7 report section 5 and this entry are the record); Decision Log numbers #293 and #294 are still absent from the table, as before. [2026-10-25: #413 item 3 confirms the item 5 tag rule for the username cooldown hint; #413 adds register rows B-218 to B-221.]</w:t>
             </w:r>
             <w:r>
-              <w:t xml:space="preserve"> [2026-10-25: #414 item 3: the image-decision notification row serves both the picture and the cover (B-224, B-217); item 2 turns the cover crop of item 3 here into one saved crop at 796:192 with zoom 1x to 3x and a 796 px minimum width (B-222, B-227).] [2026-10-26: #415 item 4 removes the [COPY PENDING LEGAL REVIEW] tag from the blocked-profile notice frames in Figma, applying the item 5 rule here (the built notice is untagged); K10 (B-228).]</w:t>
+              <w:t xml:space="preserve"> [2026-10-25: #414 item 3: the image-decision notification row serves both the picture and the cover (B-224, B-217); item 2 turns the cover crop of item 3 here into one saved crop at 796:192 with zoom 1x to 3x and a 796 px minimum width (B-222, B-227).] [2026-10-26: #415 item 4 removes the [COPY PENDING LEGAL REVIEW] tag from the blocked-profile notice frames in Figma, applying the item 5 rule here (the built notice is untagged); K10 (B-228).] [2026-10-26: #416: K10 (PR #457, B-228) hid the [COPY PENDING LEGAL REVIEW] tag on the blocked-profile notice frames 6706:26750 and 6707:26595, applying the item 5 rule as #415 item 4 decided; FC7 (PR #458) added no tag to the new cover-crop strings, which are functional and untagged under item 5.]</w:t>
             </w:r>
           </w:p>
         </w:tc>
@@ -27713,7 +27713,7 @@
           </w:tcPr>
           <w:p>
             <w:r>
-              <w:t>Decided 2026-10-25 (founder statement; the build detail below is adopted and veto-able). DECIDED, NOT BUILT: this entry records decisions and register work only. Docs only: no code, schema, Figma, legal copy, DPIA or Log Book; docs/sprint-1-dpia-outline-draft.md, docs/contest-spec.md and docs/pending-copy-manifest.md are not touched. Item 1: this chooses the first route #413 item 1 allowed (build the page, do not change the footnote sentence). Code check 2026-10-25: the withdrawal-request email already links with the token pre-filled (&lt;WEB_APP_BASE_URL&gt;/guardian-consent/withdraw?token=, built under B-016) and keeps the code in the body, so that half needs no backend change; the guardian consent email carries no withdrawal link yet; the two withdrawal routes use a bare @AuthRateLimit(), i.e. the shared 'auth' throttle (default 5 per 60 s), not 5 per 15 minutes (#403 item 15). Work: K9 (Figma, B-223: the pre-filled Confirm state, the withdrawal email frame checked against the built email), backend pass W9 (B-225: a withdrawal link in the consent email WITHOUT pre-fill, and a configurable 5-per-15-minutes throttle on the two withdrawal routes), FC6 (B-080, B-112: the page, the Approved-screen link, the page honouring ?token=). Adopted, not stated: one route, where ?token= selects the Confirm step. Why no version bump is consistent: the CONSENT_SCREEN_VERSION tripwire hashes the wording of GuardianConsentConfirmPage.tsx only, and the Approved screen is shown after consent is recorded. Risk flagged: if the link's label is put inside that file the tripwire fails; the adopted default is to render the link from its own component or constant outside the hashed file, and if that cannot be done FC6 stops and asks. New wording about a guardian withdrawing is [COPY PENDING LEGAL REVIEW]. B-221 (the launch check) passes when the page is reachable from the consent email and the Approved screen. Item 2: replaces FC5's centre-crop (B-215) and supersedes pass M's separate mobile crop frame (6812:29396, 390:120). K9 (B-222: the 'image too small' state under 796 px wide, the 1x to 3x zoom label, the mobile frames showing the same crop cover-fit; B-210 carries the parameters) and FC6 (B-227: the interactive crop and the refusal). Adopted readings: the 796 px minimum is the width of the image the user chooses; 1x means the image just covers the crop window. NOT decided: the pixel size of the saved file; whether the server enforces size or ratio on the cropped file it receives (B-205; the server never sees the original). Item 3: one row, not two. The backend notification (profile_image_rejected, B-214) already carries which image it was (data.image is 'avatar' or 'cover') and no reason text; pass M's row says 'picture' only. K9 (B-224) re-words it so one design serves both (neutral wording or wording that branches on data.image); FC6 renders it for both (B-217). No second type and no second row design. Item 4: B-094 is unchanged and stays in register wave W8; it is built in backend pass W10 (the pass number, not the register wave of that name). Row B-226 carries the tests and documentation that change with it (points.util.spec.ts, feed.service.spec.ts, users.service.spec.ts, test/contest.e2e-spec.ts, test/leaderboard.e2e-spec.ts, leaderboard.constants.ts, the points and leaderboard README text); existing ledger rows need no handling (#393 (e)). New register rows B-222 to B-227 (6): K9 = B-222, B-223, B-224; W9 = B-225; W10 = B-226; FC6 = B-227 (B-080, B-112, B-215 and B-217 are the existing FC6 rows). K9, W9, W10 and FC6 scope is derived from these four items and the code checks, because the briefs were not available to this pass. (FORWARD-POINTERS) Dated notes appended (original text unchanged) to #382, #395, #411, #412 and #413 (5 rows). NOT DECIDED HERE: the throttle variable names; the saved cover file's pixel size; server-side enforcement of the cover ratio; whether the image-decision row's wording branches on data.image or is neutral; the counsel wording of the new guardian-facing lines. NOT DONE: Decision Log numbers #293 and #294 are still absent from the table, as before. [2026-10-26: #415 item 1 CORRECTS item 1 here: the link on the Approved screen lives in the hashed footnote, so CONSENT_SCREEN_VERSION goes v6 to v7 (the 'no bump' statement and the 'outside the hashed file' default are withdrawn); items 2 to 5 of #415 add the cover preview, the Block frame rebase and the K10 and FC7 scope (B-228, B-229). Items 2 to 4 here are unchanged.]</w:t>
+              <w:t>Decided 2026-10-25 (founder statement; the build detail below is adopted and veto-able). DECIDED, NOT BUILT: this entry records decisions and register work only. Docs only: no code, schema, Figma, legal copy, DPIA or Log Book; docs/sprint-1-dpia-outline-draft.md, docs/contest-spec.md and docs/pending-copy-manifest.md are not touched. Item 1: this chooses the first route #413 item 1 allowed (build the page, do not change the footnote sentence). Code check 2026-10-25: the withdrawal-request email already links with the token pre-filled (&lt;WEB_APP_BASE_URL&gt;/guardian-consent/withdraw?token=, built under B-016) and keeps the code in the body, so that half needs no backend change; the guardian consent email carries no withdrawal link yet; the two withdrawal routes use a bare @AuthRateLimit(), i.e. the shared 'auth' throttle (default 5 per 60 s), not 5 per 15 minutes (#403 item 15). Work: K9 (Figma, B-223: the pre-filled Confirm state, the withdrawal email frame checked against the built email), backend pass W9 (B-225: a withdrawal link in the consent email WITHOUT pre-fill, and a configurable 5-per-15-minutes throttle on the two withdrawal routes), FC6 (B-080, B-112: the page, the Approved-screen link, the page honouring ?token=). Adopted, not stated: one route, where ?token= selects the Confirm step. Why no version bump is consistent: the CONSENT_SCREEN_VERSION tripwire hashes the wording of GuardianConsentConfirmPage.tsx only, and the Approved screen is shown after consent is recorded. Risk flagged: if the link's label is put inside that file the tripwire fails; the adopted default is to render the link from its own component or constant outside the hashed file, and if that cannot be done FC6 stops and asks. New wording about a guardian withdrawing is [COPY PENDING LEGAL REVIEW]. B-221 (the launch check) passes when the page is reachable from the consent email and the Approved screen. Item 2: replaces FC5's centre-crop (B-215) and supersedes pass M's separate mobile crop frame (6812:29396, 390:120). K9 (B-222: the 'image too small' state under 796 px wide, the 1x to 3x zoom label, the mobile frames showing the same crop cover-fit; B-210 carries the parameters) and FC6 (B-227: the interactive crop and the refusal). Adopted readings: the 796 px minimum is the width of the image the user chooses; 1x means the image just covers the crop window. NOT decided: the pixel size of the saved file; whether the server enforces size or ratio on the cropped file it receives (B-205; the server never sees the original). Item 3: one row, not two. The backend notification (profile_image_rejected, B-214) already carries which image it was (data.image is 'avatar' or 'cover') and no reason text; pass M's row says 'picture' only. K9 (B-224) re-words it so one design serves both (neutral wording or wording that branches on data.image); FC6 renders it for both (B-217). No second type and no second row design. Item 4: B-094 is unchanged and stays in register wave W8; it is built in backend pass W10 (the pass number, not the register wave of that name). Row B-226 carries the tests and documentation that change with it (points.util.spec.ts, feed.service.spec.ts, users.service.spec.ts, test/contest.e2e-spec.ts, test/leaderboard.e2e-spec.ts, leaderboard.constants.ts, the points and leaderboard README text); existing ledger rows need no handling (#393 (e)). New register rows B-222 to B-227 (6): K9 = B-222, B-223, B-224; W9 = B-225; W10 = B-226; FC6 = B-227 (B-080, B-112, B-215 and B-217 are the existing FC6 rows). K9, W9, W10 and FC6 scope is derived from these four items and the code checks, because the briefs were not available to this pass. (FORWARD-POINTERS) Dated notes appended (original text unchanged) to #382, #395, #411, #412 and #413 (5 rows). NOT DECIDED HERE: the throttle variable names; the saved cover file's pixel size; server-side enforcement of the cover ratio; whether the image-decision row's wording branches on data.image or is neutral; the counsel wording of the new guardian-facing lines. NOT DONE: Decision Log numbers #293 and #294 are still absent from the table, as before. [2026-10-26: #415 item 1 CORRECTS item 1 here: the link on the Approved screen lives in the hashed footnote, so CONSENT_SCREEN_VERSION goes v6 to v7 (the 'no bump' statement and the 'outside the hashed file' default are withdrawn); items 2 to 5 of #415 add the cover preview, the Block frame rebase and the K10 and FC7 scope (B-228, B-229). Items 2 to 4 here are unchanged.] [2026-10-26: #416: K10 (PR #457) drew the image-too-small state, the 1x to 3x zoom scale and the withdrawal 400 inline errors, and FC7 (PR #458) built the cover preview, the zoom label and the Approved-screen withdrawal link (B-222, B-223, B-227). The v7 bump stays although the recorded text hash did not change. Items 2 to 4 here are unchanged.]</w:t>
             </w:r>
           </w:p>
         </w:tc>
@@ -27755,7 +27755,49 @@
           </w:tcPr>
           <w:p>
             <w:r>
-              <w:t>Decided 2026-10-26 (founder statement; the build detail below is adopted and veto-able). DECIDED, NOT BUILT: this entry records decisions and register work only. Docs only: no code, schema, Figma, legal copy, DPIA or Log Book; docs/sprint-1-dpia-outline-draft.md, docs/contest-spec.md and docs/pending-copy-manifest.md are not touched. Item 1 (correction of record on #414 item 1): #414 said the Approved screen links to the withdrawal page and, at the same time, that CONSENT_SCREEN_VERSION is not bumped, with the adopted default that the link's label lives outside the hashed file. The founder now decides the label is IN the guardian-consent footnote: the words 'guardian withdrawal page' in the sentence 'You can withdraw consent at any time on the guardian withdrawal page.' become a link to /guardian-consent/withdraw WITHOUT pre-fill (the request page, the same target the consent email uses; the pre-filled Confirm step stays the withdrawal email's link). That text lives in apps/web GuardianConsentConfirmPage.tsx, the file the #348 tripwire hashes, so CONSENT_SCREEN_VERSION goes v6 to v7 in the FC7 build PR, with CONSENT_SCREEN_TEXT_HASH updated in the same constants file if it changes, and the manifest row for the sentence kept (it stays tagged [COPY PENDING LEGAL REVIEW]). This reverses the 'no bump' statement and the 'outside the hashed file' default of #414 item 1; the rest of #414 item 1 (the page, the throttle, the consent-email link, the pre-fill) is unchanged. It also settles the open point recorded under B-080 and B-221: B-221 passes when the page is reachable from the consent email and the Approved screen, and the v7 bump is part of getting there. Reading of the code, not run: the hash extractor (consent-screen-text-hash.util.ts) lowercases the JSX text and strips everything that is not a letter or a digit, so wrapping the same words in a link is likely to leave the recorded hash unchanged; FC7 checks and updates the hash only if the spec says so. The version still moves to v7 because the founder decided it, and no test ties the version to the hash alone. NOT decided: whether a v7 with an unchanged hash is wanted as a deliberate marker (assumed yes, it records that the screen now carries the link). Item 2: the mobile cover preview shows the real cover-fit result of the ONE saved 796:192 crop, not a separate mobile crop and not a stretched image. Pass N redrew the mobile crop frame 6812:29396 with a 796:192 window; the preview that frame and the profile frames show on mobile is the same crop displayed cover-fit at the mobile cover slot. K10 draws it, FC7 builds it from the K10 frames (the crop dialog in apps/web already shows a cropped preview; FC7 aligns it to the frames). NOT decided: the pixel size of the saved file (B-205), as before. Item 3: the Block confirmation frame is rebased onto the other-user profile frame 6747:28894 (pass N left the desktop dialog 6655:27355 on the legacy own-profile layout, B-218), and the Blocked users rows show the public name once, with no second display-name or @handle line (pass N left rows drawing a display name plus a handle; the endpoint returns only the public name). Figma only; K10. Item 4: the blocked-profile notice frames (6706:26750, 6707:26595) carry the [COPY PENDING LEGAL REVIEW] tag in Figma and the built notice carries none; under #412 item 5 the tag stays only on strings that make a legal or safety promise, so the tag is removed from the Figma notice. Figma only; K10. Item 5: K10 (the next Figma pass) draws the 'image too small' state shown when the chosen cover image is under 796 px wide (B-222), the 1x to 3x zoom scale labelled on the zoom control (B-222), and the inline error on the withdrawal Confirm step for a 400 (a code or link that cannot be used), drawn inside the Confirm frame rather than as the separate 'link invalid or expired' state (B-223); K10 also carries items 2, 3 and 4. The built code already refuses an image under 796 px wide and shows the zoom slider and a cropped preview (FC6); FC7 brings them, and the withdrawal 400 inline error, to the K10 frames. Work: K10 = B-228 (Figma); FC7 = B-229 (apps/web: the Approved-screen link and the v6 to v7 bump, the cover preview, the Block and Blocked users alignment, the withdrawal 400 inline error). K10 and FC7 scope is derived from these five items because their briefs were not available to this pass; if the briefs name different scope the rows move. Existing rows B-080, B-112, B-185, B-210, B-218, B-221, B-222 and B-223 carry status lines. New wording about a guardian withdrawing stays [COPY PENDING LEGAL REVIEW]; the image-too-small and zoom strings are functional and untagged (#412 item 5). (FORWARD-POINTERS) Dated notes appended (original text unchanged) to #348, #412, #413 and #414 (4 rows). NOT DECIDED HERE: whether the withdrawal 400 inline error is a separate message from the 'link invalid or expired' state or the same wording (K10 chooses; adopted: the inline error reuses the built 400 message and the separate state stays for a link opened with a bad token); the wording of the image-too-small message (K10 chooses). NOT DONE: Decision Log numbers #293 and #294 are still absent from the table, as before.</w:t>
+              <w:t>Decided 2026-10-26 (founder statement; the build detail below is adopted and veto-able). DECIDED, NOT BUILT: this entry records decisions and register work only. Docs only: no code, schema, Figma, legal copy, DPIA or Log Book; docs/sprint-1-dpia-outline-draft.md, docs/contest-spec.md and docs/pending-copy-manifest.md are not touched. Item 1 (correction of record on #414 item 1): #414 said the Approved screen links to the withdrawal page and, at the same time, that CONSENT_SCREEN_VERSION is not bumped, with the adopted default that the link's label lives outside the hashed file. The founder now decides the label is IN the guardian-consent footnote: the words 'guardian withdrawal page' in the sentence 'You can withdraw consent at any time on the guardian withdrawal page.' become a link to /guardian-consent/withdraw WITHOUT pre-fill (the request page, the same target the consent email uses; the pre-filled Confirm step stays the withdrawal email's link). That text lives in apps/web GuardianConsentConfirmPage.tsx, the file the #348 tripwire hashes, so CONSENT_SCREEN_VERSION goes v6 to v7 in the FC7 build PR, with CONSENT_SCREEN_TEXT_HASH updated in the same constants file if it changes, and the manifest row for the sentence kept (it stays tagged [COPY PENDING LEGAL REVIEW]). This reverses the 'no bump' statement and the 'outside the hashed file' default of #414 item 1; the rest of #414 item 1 (the page, the throttle, the consent-email link, the pre-fill) is unchanged. It also settles the open point recorded under B-080 and B-221: B-221 passes when the page is reachable from the consent email and the Approved screen, and the v7 bump is part of getting there. Reading of the code, not run: the hash extractor (consent-screen-text-hash.util.ts) lowercases the JSX text and strips everything that is not a letter or a digit, so wrapping the same words in a link is likely to leave the recorded hash unchanged; FC7 checks and updates the hash only if the spec says so. The version still moves to v7 because the founder decided it, and no test ties the version to the hash alone. NOT decided: whether a v7 with an unchanged hash is wanted as a deliberate marker (assumed yes, it records that the screen now carries the link). Item 2: the mobile cover preview shows the real cover-fit result of the ONE saved 796:192 crop, not a separate mobile crop and not a stretched image. Pass N redrew the mobile crop frame 6812:29396 with a 796:192 window; the preview that frame and the profile frames show on mobile is the same crop displayed cover-fit at the mobile cover slot. K10 draws it, FC7 builds it from the K10 frames (the crop dialog in apps/web already shows a cropped preview; FC7 aligns it to the frames). NOT decided: the pixel size of the saved file (B-205), as before. Item 3: the Block confirmation frame is rebased onto the other-user profile frame 6747:28894 (pass N left the desktop dialog 6655:27355 on the legacy own-profile layout, B-218), and the Blocked users rows show the public name once, with no second display-name or @handle line (pass N left rows drawing a display name plus a handle; the endpoint returns only the public name). Figma only; K10. Item 4: the blocked-profile notice frames (6706:26750, 6707:26595) carry the [COPY PENDING LEGAL REVIEW] tag in Figma and the built notice carries none; under #412 item 5 the tag stays only on strings that make a legal or safety promise, so the tag is removed from the Figma notice. Figma only; K10. Item 5: K10 (the next Figma pass) draws the 'image too small' state shown when the chosen cover image is under 796 px wide (B-222), the 1x to 3x zoom scale labelled on the zoom control (B-222), and the inline error on the withdrawal Confirm step for a 400 (a code or link that cannot be used), drawn inside the Confirm frame rather than as the separate 'link invalid or expired' state (B-223); K10 also carries items 2, 3 and 4. The built code already refuses an image under 796 px wide and shows the zoom slider and a cropped preview (FC6); FC7 brings them, and the withdrawal 400 inline error, to the K10 frames. Work: K10 = B-228 (Figma); FC7 = B-229 (apps/web: the Approved-screen link and the v6 to v7 bump, the cover preview, the Block and Blocked users alignment, the withdrawal 400 inline error). K10 and FC7 scope is derived from these five items because their briefs were not available to this pass; if the briefs name different scope the rows move. Existing rows B-080, B-112, B-185, B-210, B-218, B-221, B-222 and B-223 carry status lines. New wording about a guardian withdrawing stays [COPY PENDING LEGAL REVIEW]; the image-too-small and zoom strings are functional and untagged (#412 item 5). (FORWARD-POINTERS) Dated notes appended (original text unchanged) to #348, #412, #413 and #414 (4 rows). NOT DECIDED HERE: whether the withdrawal 400 inline error is a separate message from the 'link invalid or expired' state or the same wording (K10 chooses; adopted: the inline error reuses the built 400 message and the separate state stays for a link opened with a bad token); the wording of the image-too-small message (K10 chooses). NOT DONE: Decision Log numbers #293 and #294 are still absent from the table, as before. [2026-10-26: #416 item 1 corrects the hash reading above: FC7 (PR #458, B-229) ran the tripwire spec and CONSENT_SCREEN_TEXT_HASH did not change, so the v6 to v7 bump was not strictly required; v7 stays as a deliberate marker. #416 item 2 accepts K10's judgment calls on the rebased Block frame (PR #457, B-228): Eleanor Pena set to the profile owner, Block menu detail not reproduced, hidden layers stay hidden. K10 and FC7 are merged; status lines on B-222, B-223, B-227, B-228, B-229.]</w:t>
+            </w:r>
+          </w:p>
+        </w:tc>
+      </w:tr>
+      <w:tr>
+        <w:tc>
+          <w:tcPr>
+            <w:tcW w:type="dxa" w:w="500"/>
+          </w:tcPr>
+          <w:p>
+            <w:r>
+              <w:t>416</w:t>
+            </w:r>
+          </w:p>
+        </w:tc>
+        <w:tc>
+          <w:tcPr>
+            <w:tcW w:type="dxa" w:w="4700"/>
+          </w:tcPr>
+          <w:p>
+            <w:r>
+              <w:t>Founder decisions 2026-10-26 after the K10 and FC7 passes merged (2 items): (1) CORRECTION OF RECORD on #415 item 1: the consent-screen text hash did not change when the footnote link was added (the extractor reads JSX text inside child elements), so the v6 to v7 bump was not strictly required to keep the #348 tripwire green; v7 stays; (2) the K10 judgment calls are accepted: Eleanor Pena set to the profile owner on the rebased Block frame, the Block menu detail not reproduced, hidden layers stay hidden.</w:t>
+            </w:r>
+          </w:p>
+        </w:tc>
+        <w:tc>
+          <w:tcPr>
+            <w:tcW w:type="dxa" w:w="1850"/>
+          </w:tcPr>
+          <w:p>
+            <w:r>
+              <w:t>docs/decision-log-416 (docs only, 2026-10-26; founder decisions 2026-10-26, items 1-2; sources Decision Log #348, #412, #413, #414, #415; docs/build-register.md Sections 42, 43 and 44; docs/figma-pass-k10-report.md sections 1(d) and 3; PR #457 (K10) and PR #458 (FC7) as merged; CLAUDE.md)</w:t>
+            </w:r>
+          </w:p>
+        </w:tc>
+        <w:tc>
+          <w:tcPr>
+            <w:tcW w:type="dxa" w:w="2300"/>
+          </w:tcPr>
+          <w:p>
+            <w:r>
+              <w:t>Decided 2026-10-26 (founder statement). Records decisions and status only. Docs only: no code, schema, Figma, legal copy, DPIA or Log Book; docs/sprint-1-dpia-outline-draft.md, docs/contest-spec.md and docs/pending-copy-manifest.md are not touched. Item 1 (correction of record on #415 item 1): #415 said that linking the Approved screen to the guardian withdrawal page changes the hashed consent screen, so CONSENT_SCREEN_VERSION goes v6 to v7, and expected (from reading the code, not running it) that CONSENT_SCREEN_TEXT_HASH would probably stay unchanged. FC7 (PR #458, B-229) built the link and ran the spec: CONSENT_SCREEN_TEXT_HASH did NOT change, because the extractor (consent-screen-text-hash.util.ts) reads the JSX text inside child elements, so wrapping the same words in a link neither adds nor removes hashed wording. The file is still the one the tripwire hashes, but this edit did not change its hashed text, so the bump was not strictly required to keep the #348 tripwire green. v7 STAYS: it is a deliberate marker that the guardian-consent screen now carries the withdrawal link (this settles the point #415 left under 'NOT decided' and register Section 42e). The tripwire spec gained a test pinning the link, the hashed words and the version. Unchanged: a later change to the footnote WORDING still changes the hash and still needs a hash update and a version bump together. Item 2 (K10 judgment calls accepted; docs/figma-pass-k10-report.md sections 1(d) and 3): (a) on the rebased Block confirmation frame 6655:27355, Eleanor Pena (6828:29668 and 6828:29670), who may have been a comment author rather than a post author and sits below the visible area, was set to the profile owner together with the other three post authors, for consistency; (b) the 'menu open' detail of the legacy frame (the Copy Profile Link / Block menu) is not reproduced, because the dialog covers that area; (c) the hidden layers stay hidden and nothing is deleted: the legacy profile layer 6655:27356 (renamed ARCHIVED), the 12 handle text nodes on the four Blocked users frames, and the two tag frames 6706:26838 and 6707:26725. STILL OPEN, not decided here: the rebased Block frame keeps the left-rail 'Suggested' row Emeka John @mekusa (a suggestion, not an author, left as is); the crop preview stand-in in Figma is flat, so the trimmed sides can only be read from layer names and the caption; the saved cover file's pixel size and any server check (B-205). Register: no B-ID added or removed (229 B-IDs, 146 gap frames, unchanged); status lines appended (original text unchanged) to the Spec-status cell of B-222, B-223, B-227, B-228 and B-229; B-224 carries no line because neither K10 nor FC7 touched the image-decision notification row. (FORWARD-POINTERS) Dated notes appended (original text unchanged) to #348, #412, #414 and #415 (4 rows). NOT DONE: Decision Log numbers #293 and #294 are still absent from the table, as before.</w:t>
             </w:r>
           </w:p>
         </w:tc>

</xml_diff>

<commit_message>
docs: Decision Log #417 (QA second run accepted, header avatar initials, live Contest browser coverage), build register Section 45
Docs only. Adds Decision Log #417 and dated notes on #168, #407, #411 and
#413 (originals unchanged). Register: B-230 (header avatar initials) and
B-231 (live Contest phases in a real browser) added; status lines on B-036,
B-037, B-134 and B-219; 231 B-IDs, 146 gap frames unchanged.

Co-Authored-By: Claude Sonnet 5.5 <noreply@anthropic.com>
</commit_message>
<xml_diff>
--- a/docs/Soccernity_MVP_Build_Plan_v1.7.docx
+++ b/docs/Soccernity_MVP_Build_Plan_v1.7.docx
@@ -16815,7 +16815,7 @@
           </w:tcPr>
           <w:p>
             <w:r>
-              <w:t>Resolved -- flagged, conservative choice made meanwhile. The drawer identity block renders a generic "Signed in" row with a plain avatar circle rather than fabricating a name/handle. A real identity block needs either an AuthContext that holds the user summary, or the header fetching GET /users/:id the way ProfilePage.tsx does -- both a larger change than this PR's scope. RESOLVED (sprint-2/navdrawer-real-identity, figma-to-code): the drawer identity block now shows the real displayName + an initials avatar, fetched once per session by Header via getUser(accessToken, sub) and passed to NavDrawer as a prop (no refetch on open/close). No @handle/username row -- there is no such field on UserProfile and no backend column (Decision Log #58); the Figma "@christine001" is decorative, name renders as a single line. A pending or failed fetch falls back to the generic "Signed in" row -- the drawer's navigation always works.</w:t>
+              <w:t>Resolved -- flagged, conservative choice made meanwhile. The drawer identity block renders a generic "Signed in" row with a plain avatar circle rather than fabricating a name/handle. A real identity block needs either an AuthContext that holds the user summary, or the header fetching GET /users/:id the way ProfilePage.tsx does -- both a larger change than this PR's scope. RESOLVED (sprint-2/navdrawer-real-identity, figma-to-code): the drawer identity block now shows the real displayName + an initials avatar, fetched once per session by Header via getUser(accessToken, sub) and passed to NavDrawer as a prop (no refetch on open/close). No @handle/username row -- there is no such field on UserProfile and no backend column (Decision Log #58); the Figma "@christine001" is decorative, name renders as a single line. A pending or failed fetch falls back to the generic "Signed in" row -- the drawer's navigation always works. [2026-10-26: #417 item 2: the header avatar stays an empty circle until B-036, B-037 and the AWS account exist, then shows initials from the display name when there is no approved picture; a Figma header variant comes first (B-230). The drawer's identity block is not decided by this note.]</w:t>
             </w:r>
           </w:p>
         </w:tc>
@@ -27398,7 +27398,7 @@
               <w:t>Resolved -- recorded. FOUNDER-ADOPTED DEFAULTS, VETO-ABLE, all seven items. DECIDED, NOT BUILT, except item 6, which confirms what is already built (W3d, PR #424). Item numbers are the order of the founder's instruction. Original text of every entry named in the forward-pointers below is unchanged (dated notes appended). Source: the QA run of PR #426 (docs/qa-e2e-onboarding-report.md): 165 browser tests against the real API, 17 defects (D-01 to D-17) and 3 gaps (G-1 to G-3). (1) CORS (QA D-01, BLOCKER / SAFEGUARDING). apps/web/src/api/auth.ts registerUser sends credentials 'include' and services/api/src/main.ts calls app.enableCors() with no options (it answers '*'); browsers refuse that combination, so sign-up fails in every browser when web and API are on different origins, as in production, and no request reaches the API. Decided: registerUser stops sending credentials 'include'; the API restricts CORS to the origins in WEB_APP_BASE_URL and a new ADMIN_APP_BASE_URL, plus localhost origins in development. The new variable is added to render.yaml (both services), .env.example and the env-completeness check; the founder sets its production value in Render. The API sets no cookie and returns the refresh token in the response body, so the credentials option appears to have no function (to confirm in the build PR). Not decided: what the API does when a variable is unset in production, and origins other than the two apps. Build row B-140 (W1). (2) AGE-5 FLOOR (QA D-02, BLOCKER / SAFEGUARDING). #19 says signup is hard-blocked below age 5 regardless of guardian consent, but the floor exists only in the web Age Gate: POST /auth/register with a date of birth 4 years ago and a valid guardian block returns 201 and creates the account and the guardian request. Decided: the floor is enforced server-side with a 400; exactly age 5 stays accepted. Not decided: the error code and message; the build PR checks the DOB-correction tool (#390) cannot set a date of birth below the floor. Build row B-141 (W1). (3) USERNAME FILTER (QA D-06). Hate and sexual terms glued to other letters (xxhitlerxx, nazifan) are accepted because the filter's EXACT list matches only the whole handle or an underscore token. Decided: long, unambiguous terms are matched by CONTAINS, with a tested list of innocent words that must still be accepted; short or ambiguous terms stay exact. Not decided: the term lists and the length threshold (set in the build PR, for founder review). Build row B-142 (W4). (4) 'FOLLOW' PROMISES (QA D-13). The restricted-pending view says 'Browse and follow' and the guardian page lists 'Follow teams and check scores', but a restricted-pending minor's follow is refused with 403 (#370). Decided: both screens stop promising follow and the wording says what works, tagged [COPY PENDING LEGAL REVIEW] and added to the pending-copy manifest; the guardian-page change is guardian-visible, so CONSENT_SCREEN_VERSION and the tripwire hash (#348) are bumped under the rule of B-130. The Figma frames are not checked here for the same promise. Build row B-154 (W9). (5) GUARDIAN APPROVAL SCREEN (QA D-09). After approval the guardian is told 'The account is now active', but the minor still has to verify email and create a profile. Decided: the screen no longer says the account is active; it says the approval is recorded and registration continues ([COPY PENDING LEGAL REVIEW]), matching the Figma Approved screens (#403 item 3). Build row B-153 (W9). (6) STALE-DECLINE RE-SEND STAYS. A guardian who declined at decline 1 or 2 is still sent a new consent request by the platform when the row lapses after 14 days (#406 item 1, built as B-126), after the minor is warned. This settles judgment call 1 of docs/backend-w3d-report.md (section 5). The alternative, warning the minor and closing after a further window without re-sending, stays a one-place change (GuardianStaleDeclineSweepService); the cap of three declines bounds the re-sends. Counsel review of legal copy v0.8 Part 4.4 is still pending. Rows B-126, B-102. (7) LEGACY SAVED FRAME. The Figma frame 1460:8940 (own Saved, absolute layout) is archived, now that 6747:29445 replaces it (Figma pass K2, candidate 2): hidden and renamed 'ARCHIVED - ...', nothing deleted, after a page-wide reference scan, and added to docs/figma-archive-index.md. Build row B-144 (W0). (REGISTER) docs/build-register.md Section 25: B-140 to B-162 added (23 rows); every QA defect and gap, every open item of the W3d report (section 6) and every K2 candidate (1-10) is mapped to a row, reused (B-120, B-128, B-129, B-130, B-131, B-132, B-133, B-134, B-078, B-138) or new. D-01 and D-02 are marked BLOCKER / SAFEGUARDING. Status lines on 23 existing rows. 162 B-IDs; 146 gap frames unchanged. Arithmetic: Section 25g. (FORWARD-POINTERS) Dated notes appended (original text unchanged) to #19, #199, #337, #338, #339, #340, #368, #369, #370, #377, #389, #395, #402, #403, #405 and #406 (the W3d report's section 7 pointers, the status of K2 and of the QA run). NOT DECIDED HERE: the behaviour when an origin variable is unset in production, and any further CORS origin; the error code of the 400; the term and innocent-word lists; the Figma side of the 'follow' promise; the post-decline state of the guardian confirm page (D-10, same fault as the footnote of #406 item 13, still not covered by the founder's wording); K2 candidates 1, 3, 4, 6, 7, 8 (register rows B-147 to B-150 are OPEN); the W3d open items on earlier verification links (B-160) and on a non-active account with a stale decline (B-161); counsel wording of every [COPY PENDING LEGAL REVIEW] string. [2026-10-19: Built since: items 1, 2 and 3 and the expired-consent email by backend/w3e (PR #429: B-140, B-141, B-142; the email half of B-158); items 4 and 5 and QA defects D-03 to D-05 and D-08 to D-17 by FC3a (PR #430; D-15 and D-17 in part); D-07, G-1 and G-2 by FC3b (PR #431); item 7 (the archive of 1460:8940) by Figma pass K3 (PR #428, B-144). The open point of item 1 (what the API does when an origin variable is unset in production) is decided by #408 item 1: it refuses to boot (B-163). Item 3 is amended by #408 item 3: the exact whole handles nazif, nazifa and nazifah are allowed (B-165) and the term lists W3e built stay open for review. The error code below_minimum_age and its message are W3e's choice and are still not confirmed. The QA harness's CORS proxy is gone (PR #429).] [2026-10-20: #409 item 1 fixes the origins the CORS allow-list names: WEB_APP_BASE_URL is the https origin of the web static site and ADMIN_APP_BASE_URL that of the admin static site, each separate from the API's own origin (B-179). Both must be set to the final https origins in production (the API refuses to boot otherwise, B-163). Nothing is deployed before the launch gate B-090.] [2026-10-20: the #409 note above merged in PR #436 (A7). W3f (PR #434) built the boot refusal for an unset or invalid origin variable (the open point of item 1, B-163) and the Nazif allow-list (item 3, B-165); #410 item 2 changes the allow-list rule (B-181). Item 4: the Restricted Pending frames 5108:6630 / 5531:7461 still carry the 'Browse and follow' wording the code dropped (D-13); K5 fixes them (B-191, #410 item 8).]</w:t>
             </w:r>
             <w:r>
-              <w:t xml:space="preserve"> [2026-10-24: K5 (PR #438), item 4 (QA D-13): the Restricted Pending frames 5108:6630 / 5531:7461 now say 'Browse and read' instead of 'Browse and follow' (B-191).] [2026-10-25: #413 item 4: the next QA run is a full run of the 180-test Playwright suite (e2e/), not a subset; FC5 re-ran only specs 01 and 07 (B-219).]</w:t>
+              <w:t xml:space="preserve"> [2026-10-24: K5 (PR #438), item 4 (QA D-13): the Restricted Pending frames 5108:6630 / 5531:7461 now say 'Browse and read' instead of 'Browse and follow' (B-191).] [2026-10-25: #413 item 4: the next QA run is a full run of the 180-test Playwright suite (e2e/), not a subset; FC5 re-ran only specs 01 and 07 (B-219).] [2026-10-26: #417: the second QA run (PR #460) is accepted at 221 Playwright tests (192 in specs 00-14 plus 29 in spec 15), and D-18 to D-22 were fixed in FIX1 (PR #461); the '180' figure is stale. The live Contest phases get browser coverage in the next QA run (B-231).]</w:t>
             </w:r>
           </w:p>
         </w:tc>
@@ -27581,7 +27581,7 @@
               <w:t xml:space="preserve"> [2026-10-25: #412 closes three points left open after W6 and K6: item 1 (existing like and comment rows between a blocked pair are hidden, not deleted; B-213), item 3 (the cover aspect ratio is the cover frame's; B-210, B-215) and item 2 (how the reject reason reaches the uploader; B-214).] [2026-10-25: #413 item 3: the username change-cooldown hint (item 8) stays untagged unless the founder says otherwise (B-208, B-212).]</w:t>
             </w:r>
             <w:r>
-              <w:t xml:space="preserve"> [2026-10-25: #414 item 2 fixes the cover parameters left open here: one saved crop at 796:192, mobile cover-fit, browser crop, original not stored, zoom 1x to 3x, minimum width 796 px (B-210, B-222, B-227).]</w:t>
+              <w:t xml:space="preserve"> [2026-10-25: #414 item 2 fixes the cover parameters left open here: one saved crop at 796:192, mobile cover-fit, browser crop, original not stored, zoom 1x to 3x, minimum width 796 px (B-210, B-222, B-227).] [2026-10-26: #417 item 2: until B-036 and B-037 exist the header avatar stays an empty circle; once an image can be approved, or no picture exists, the header shows initials from the display name (B-230).]</w:t>
             </w:r>
           </w:p>
         </w:tc>
@@ -27671,7 +27671,7 @@
               <w:t>Decided 2026-10-25 (founder statement; the build detail below is adopted and veto-able). DECIDED, NOT BUILT: this entry records decisions and register work only. Docs only: no code, schema, Figma, legal copy, DPIA or Log Book; docs/sprint-1-dpia-outline-draft.md, docs/contest-spec.md and docs/pending-copy-manifest.md are not touched. Item 1: the guardian confirm page footnote (apps/web GuardianConsentConfirmPage.tsx) names a guardian withdrawal page that is not a web route yet; the withdraw endpoints exist (POST /auth/guardian-consent/withdraw/request and /withdraw) with no guardian-facing page (B-080, B-112, FC5 report section 3). Before launch EITHER the page is built (B-112, Figma exists per B-013) OR the sentence is changed; if the sentence is changed, CONSENT_SCREEN_VERSION goes v6 -&gt; v7 with a new tripwire hash and the pending-copy manifest row is updated (Decision Log #348, #410 item 6). New launch check B-221 holds that either/or open so it cannot be missed. Item 2: this changes one point of #227, which recorded that the founder owns the Contest Rules copy with no legal-counsel review track (unlike the ToS and Privacy Policy). The copy is still written by the founder, but counsel reviews it before launch. The visible placeholder in the Contest Rules modal (apps/web ContestRulesModal.tsx; Figma 6241:14657 / 6241:14677) stays until real copy exists. New row B-220 (launch gate); B-051 keeps the copy itself. Item 3: consistent with #412 item 5 (the tag is only for strings that make a legal or safety promise); the hint states a cooldown rule (30 days, one free correction, #411 item 8), not a safeguarding promise. Recorded on B-208 and B-212 so the collation does not re-add it. Item 4: a full 180-test run of e2e/ (Playwright, real apps/web and apps/admin against a real services/api, Postgres and Redis). FC5 re-ran only specs 01 and 07 (24 tests) after fixing the one failure of its own first run (177 passed, 1 failed, 2 did not run), so a full run has not been done since FC4 raised the suite to 180. This pass did not run it. New row B-219 (QA). INTERPRETATIONS RECORDED: (a) the instruction also asked for register rows for a 'Block-label Figma fix' without naming the label or frame; new row B-218 is written as a Figma check that reads the Block labels off the frames and aligns them with the built wording (apps/web OtherProfilePage.tsx: menu item 'Block {name}', dialog button 'Block' / 'Blocking...', 'Reason (optional)', 'You blocked {name}' with Unblock; Settings &gt; Blocked users), and lists which label differs only once the pass has looked; (b) 'before launch' is read as before the launch gate (B-090). NOT decided: whether the withdrawal page or the sentence change is the route (item 1 allows either); whether the real Contest Rules text carries the [COPY PENDING LEGAL REVIEW] tag and a manifest row (adopted: yes, once it exists); which Block label differs. Decision Log numbers #293 and #294 are still absent from the table, as before.</w:t>
             </w:r>
             <w:r>
-              <w:t xml:space="preserve"> [2026-10-25: #414 item 1 takes the first route of item 1: the guardian withdrawal page is built and the footnote sentence stays unchanged (B-112, B-221).] [2026-10-26: #415 item 1 corrects #414 item 1 on the version bump: the Approved-screen link is inside the hashed footnote, so CONSENT_SCREEN_VERSION goes v6 to v7; the page is still built (B-112, B-221), and the launch check B-221 is unchanged in meaning.]</w:t>
+              <w:t xml:space="preserve"> [2026-10-25: #414 item 1 takes the first route of item 1: the guardian withdrawal page is built and the footnote sentence stays unchanged (B-112, B-221).] [2026-10-26: #415 item 1 corrects #414 item 1 on the version bump: the Approved-screen link is inside the hashed footnote, so CONSENT_SCREEN_VERSION goes v6 to v7; the page is still built (B-112, B-221), and the launch check B-221 is unchanged in meaning.] [2026-10-26: #417 item 1: the full run asked for in item 4 has been done as the second QA run (PR #460): 221 Playwright tests, not 180; B-219 is closed on it.]</w:t>
             </w:r>
           </w:p>
         </w:tc>
@@ -27798,6 +27798,48 @@
           <w:p>
             <w:r>
               <w:t>Decided 2026-10-26 (founder statement). Records decisions and status only. Docs only: no code, schema, Figma, legal copy, DPIA or Log Book; docs/sprint-1-dpia-outline-draft.md, docs/contest-spec.md and docs/pending-copy-manifest.md are not touched. Item 1 (correction of record on #415 item 1): #415 said that linking the Approved screen to the guardian withdrawal page changes the hashed consent screen, so CONSENT_SCREEN_VERSION goes v6 to v7, and expected (from reading the code, not running it) that CONSENT_SCREEN_TEXT_HASH would probably stay unchanged. FC7 (PR #458, B-229) built the link and ran the spec: CONSENT_SCREEN_TEXT_HASH did NOT change, because the extractor (consent-screen-text-hash.util.ts) reads the JSX text inside child elements, so wrapping the same words in a link neither adds nor removes hashed wording. The file is still the one the tripwire hashes, but this edit did not change its hashed text, so the bump was not strictly required to keep the #348 tripwire green. v7 STAYS: it is a deliberate marker that the guardian-consent screen now carries the withdrawal link (this settles the point #415 left under 'NOT decided' and register Section 42e). The tripwire spec gained a test pinning the link, the hashed words and the version. Unchanged: a later change to the footnote WORDING still changes the hash and still needs a hash update and a version bump together. Item 2 (K10 judgment calls accepted; docs/figma-pass-k10-report.md sections 1(d) and 3): (a) on the rebased Block confirmation frame 6655:27355, Eleanor Pena (6828:29668 and 6828:29670), who may have been a comment author rather than a post author and sits below the visible area, was set to the profile owner together with the other three post authors, for consistency; (b) the 'menu open' detail of the legacy frame (the Copy Profile Link / Block menu) is not reproduced, because the dialog covers that area; (c) the hidden layers stay hidden and nothing is deleted: the legacy profile layer 6655:27356 (renamed ARCHIVED), the 12 handle text nodes on the four Blocked users frames, and the two tag frames 6706:26838 and 6707:26725. STILL OPEN, not decided here: the rebased Block frame keeps the left-rail 'Suggested' row Emeka John @mekusa (a suggestion, not an author, left as is); the crop preview stand-in in Figma is flat, so the trimmed sides can only be read from layer names and the caption; the saved cover file's pixel size and any server check (B-205). Register: no B-ID added or removed (229 B-IDs, 146 gap frames, unchanged); status lines appended (original text unchanged) to the Spec-status cell of B-222, B-223, B-227, B-228 and B-229; B-224 carries no line because neither K10 nor FC7 touched the image-decision notification row. (FORWARD-POINTERS) Dated notes appended (original text unchanged) to #348, #412, #414 and #415 (4 rows). NOT DONE: Decision Log numbers #293 and #294 are still absent from the table, as before.</w:t>
+            </w:r>
+          </w:p>
+        </w:tc>
+      </w:tr>
+      <w:tr>
+        <w:tc>
+          <w:tcPr>
+            <w:tcW w:type="dxa" w:w="500"/>
+          </w:tcPr>
+          <w:p>
+            <w:r>
+              <w:t>417</w:t>
+            </w:r>
+          </w:p>
+        </w:tc>
+        <w:tc>
+          <w:tcPr>
+            <w:tcW w:type="dxa" w:w="4700"/>
+          </w:tcPr>
+          <w:p>
+            <w:r>
+              <w:t>Founder decisions 2026-10-26 on the second QA run and two follow-ups (3 items): (1) the second QA run (docs/qa-second-run-report.md, PR #460) is accepted: 221 Playwright tests (192 in specs 00-14 plus 29 in the new spec 15; 220 passed, 1 skipped by design, 0 failed), and defects D-18 to D-22 were fixed in FIX1 (PR #461); the '180' test figure quoted in earlier briefs and in #413 item 4 is stale; (2) the header avatar stays an empty circle on every signed-in screen until the automatic image check and review queue (B-036, B-037) and the AWS account exist; once they do, the header shows the person's initials from the display name when there is no approved picture, which needs a Figma header variant first; (3) the live Contest phases need browser coverage, which needs either a test clock or a seeded mid-month cycle, and this is scheduled for the next QA run.</w:t>
+            </w:r>
+          </w:p>
+        </w:tc>
+        <w:tc>
+          <w:tcPr>
+            <w:tcW w:type="dxa" w:w="1850"/>
+          </w:tcPr>
+          <w:p>
+            <w:r>
+              <w:t>docs/decision-log-417 (docs only, 2026-10-27; founder decisions 2026-10-26, items 1-3; sources docs/qa-second-run-report.md sections 1, 2, 4 and 5; PR #460 (QA second run) and PR #461 (FIX1, D-18 to D-22) as merged; Decision Log #168, #407, #411, #413; docs/build-register.md Sections 2, 44 and 45; CLAUDE.md)</w:t>
+            </w:r>
+          </w:p>
+        </w:tc>
+        <w:tc>
+          <w:tcPr>
+            <w:tcW w:type="dxa" w:w="2300"/>
+          </w:tcPr>
+          <w:p>
+            <w:r>
+              <w:t>Decided 2026-10-26 (founder statement; the build detail below is adopted and veto-able). Records decisions and register work only. Docs only: no code, schema, Figma, legal copy, DPIA or Log Book; docs/sprint-1-dpia-outline-draft.md, docs/contest-spec.md and docs/pending-copy-manifest.md are not touched. Item 1 (QA second run accepted): the run found five defects (D-18 to D-22, none release-blocking) and reported the full Playwright suite at 221 tests: specs 00-14 = 192 tests plus spec 15 = 29 tests (28 run, 1 skipped by design because the exact-throttle test needs a fresh API process; it passed when run separately). FIX1 (PR #461) fixed D-18 to D-22. The '180' in earlier briefs (and in #413 item 4, which asked for a full run of the 180-test suite) is stale; the full-run instruction of #413 item 4 is met by this run and B-219 is closed on it. Not covered by the run, as its section 5 says: the live Contest phases in a real browser (item 3), images reaching 'approved' (needs B-036/B-037 and an object store), the cover file's pixel size (B-205), mobile viewports beyond specs 12 and 14, live Stripe/Postmark/GeoLite2/R2. Item 2 (header avatar): on every signed-in screen the header avatar is an empty green circle for an account with no approved picture (QA second run, section 4; consistent with #168, which left the header and drawer with no client-side identity source for the avatar). Decided: it STAYS an empty circle until B-036, B-037 and the AWS account exist (B-193). After that, with no approved picture, it shows the person's initials taken from the display name. A Figma header variant is needed first (the navbar set 2824:4309 has no initials state); the code follows it. Adopted, not stated: the header is the owner's own view, so it uses displayName, not publicName (#364); the initials rule matches the one already used in the drawer and on cards (first letter of the first and last words, one letter for a single word, as initialsFor in NavDrawer.tsx does); the same fallback applies to the mobile header. NOT decided: whether the account dropdown and the drawer identity block change in the same pass; the exact initials colours (to be drawn from existing tokens, no new colour). Item 3 (live Contest coverage): the contest calendar follows the real clock and a contest for the current month cannot be created through the admin form (the month must not have started), so the browser suite saw only the upcoming state and the no-contest state. Decided: the next QA run adds browser coverage of the live phases (entries, voting and the vote toggle, forfeit pop-ups, week-4 upload, the live ranking, the crowned state) using EITHER a test clock for the API process OR a cycle seeded directly into the database for the current month. Adopted, not stated: the mechanism is test-harness only (the API e2e already uses an injectable clock; the browser run would set it for its own API process), and NO production time-travel or debug endpoint is added; which of the two mechanisms is used is QA's choice and is recorded in the run's report. Register: B-230 (header avatar initials, Figma then apps/web) and B-231 (live Contest browser coverage, QA) added; status lines appended (original text unchanged) to B-036, B-037, B-134 and B-219. 231 B-IDs; 146 gap frames unchanged (Section 45). (FORWARD-POINTERS) Dated notes appended (original text unchanged) to #168, #407, #411 and #413 (4 rows). NOT DONE: Decision Log numbers #293 and #294 are still absent from the table, as before.</w:t>
             </w:r>
           </w:p>
         </w:tc>

</xml_diff>

<commit_message>
docs: Decision Log #418 and build register Section 48 (W11, W12, FC8 defaults stand; carousel limit, club line, links-only video, SG1)
Docs only. Appends Decision Log #418 (2026-10-27) to the Build Plan docx and
dated notes to #383, #384, #388, #404, #405 and #412 (originals unchanged).
Register: B-232 (K12), B-233 (FC9), B-234 (W13), B-235 (video upload decision
record), B-236 (SG1) added; status lines for pass O, W11, W12 and FC8 appended
to 12 existing rows; Sections 1, 3, 7 updated, Section 48 added. CLAUDE.md
gains backfill bullets for pass O, W11 and FC8 and a bullet for this PR.
No code, schema, Figma, legal copy, DPIA or Log Book changed.

Co-Authored-By: Claude Sonnet 5.5 <noreply@anthropic.com>
</commit_message>
<xml_diff>
--- a/docs/Soccernity_MVP_Build_Plan_v1.7.docx
+++ b/docs/Soccernity_MVP_Build_Plan_v1.7.docx
@@ -26324,7 +26324,7 @@
           </w:tcPr>
           <w:p>
             <w:r>
-              <w:t>Resolved -- decided, NOT yet built. AMENDS #130 (whose baseline list was 'likes, follows, and posts'; its original text is unchanged). Rule: the account that GIVES the engagement earns FULL points (1 per qualifying view / like / comment per unique post); the creator who RECEIVES it earns one QUARTER point (0.25) per qualifying view / like / comment per unique account per post. Founder: 'it is more profitable to give than to receive', to encourage engagement. The 0.25 rule applies ONLY to baseline leaderboard points and never affects contest/competition tallies. SELF-ENGAGEMENT IS EXEMPT (a user's own views/likes/comments on their own content earn nothing). Points are REVOKED when the engagement is removed (unlike, comment deleted or removed, post removed, account later restricted); revocation also reduces that day's cap counter (ASSUMED detail). Storage: quarter-point units (1 point = 4 units); display: rounded to the nearest whole number, half rounds up; RANKING uses the exact stored value so rounding never creates false ties. DAILY CAPS (founder confirmed 2026-10-14; admin-configurable settings, not hardcoded; Europe/London calendar day): 40 points per day for GIVING and 20 points per day for RECEIVING (about 1,800/month maximum). Revisit after two weeks of live data. Verified email required; restricted accounts never earn; same rules for minors; a comment earns points only if it passes content screening. Follows and posts earn nothing: the existing awards (post 3, like 1, follow 1; #219) are to be removed, see B-094. Full detail: docs/contest-spec.md (section 9b). Build register B-093, B-094.</w:t>
+              <w:t>Resolved -- decided, NOT yet built. AMENDS #130 (whose baseline list was 'likes, follows, and posts'; its original text is unchanged). Rule: the account that GIVES the engagement earns FULL points (1 per qualifying view / like / comment per unique post); the creator who RECEIVES it earns one QUARTER point (0.25) per qualifying view / like / comment per unique account per post. Founder: 'it is more profitable to give than to receive', to encourage engagement. The 0.25 rule applies ONLY to baseline leaderboard points and never affects contest/competition tallies. SELF-ENGAGEMENT IS EXEMPT (a user's own views/likes/comments on their own content earn nothing). Points are REVOKED when the engagement is removed (unlike, comment deleted or removed, post removed, account later restricted); revocation also reduces that day's cap counter (ASSUMED detail). Storage: quarter-point units (1 point = 4 units); display: rounded to the nearest whole number, half rounds up; RANKING uses the exact stored value so rounding never creates false ties. DAILY CAPS (founder confirmed 2026-10-14; admin-configurable settings, not hardcoded; Europe/London calendar day): 40 points per day for GIVING and 20 points per day for RECEIVING (about 1,800/month maximum). Revisit after two weeks of live data. Verified email required; restricted accounts never earn; same rules for minors; a comment earns points only if it passes content screening. Follows and posts earn nothing: the existing awards (post 3, like 1, follow 1; #219) are to be removed, see B-094. Full detail: docs/contest-spec.md (section 9b). Build register B-093, B-094. [2026-10-27: W12 (PR #465, B-093) built the baseline engine. #418 item 2 confirms its open defaults 1-16, including that the weekly cap of 100 on the leaderboard rollup is removed and the two daily caps (40 given, 20 received, per Europe/London day) held in configuration replace it.]</w:t>
             </w:r>
           </w:p>
         </w:tc>
@@ -26366,7 +26366,7 @@
           </w:tcPr>
           <w:p>
             <w:r>
-              <w:t>Resolved -- decided, NOT yet built. A 'view' counted for display is distinct from a 'view POINT'; points are awarded only when thresholds are met; one view point per account per post. BASELINE: photo = at least 3 seconds on screen; video = the full length if shorter than 60 seconds, otherwise 60 seconds watched; text-only post = at least 3 seconds visible. 'Watched' = active playback while the post is visible and the tab/app is in the foreground; muted autoplay in the feed counts; skipping ahead earns no credit; a loop counts once. The creator's 0.25 for a view uses the same qualification as the viewer's. CONTEST/COMPETITION tallies: video = the viewer must watch min(video length, the contest's weekly view-qualifying limit L in seconds), so a video shorter than L must be watched completely and a longer one qualifies after L seconds; photo = at least 5 seconds. Views are not counted in the week-4 final. Backend implication: server-validated playback/dwell heartbeats (client-reported time alone is spoofable); counsel has not reviewed this new processing. Full detail: docs/contest-spec.md (section 9c). Build register B-093.</w:t>
+              <w:t>Resolved -- decided, NOT yet built. A 'view' counted for display is distinct from a 'view POINT'; points are awarded only when thresholds are met; one view point per account per post. BASELINE: photo = at least 3 seconds on screen; video = the full length if shorter than 60 seconds, otherwise 60 seconds watched; text-only post = at least 3 seconds visible. 'Watched' = active playback while the post is visible and the tab/app is in the foreground; muted autoplay in the feed counts; skipping ahead earns no credit; a loop counts once. The creator's 0.25 for a view uses the same qualification as the viewer's. CONTEST/COMPETITION tallies: video = the viewer must watch min(video length, the contest's weekly view-qualifying limit L in seconds), so a video shorter than L must be watched completely and a longer one qualifies after L seconds; photo = at least 5 seconds. Views are not counted in the week-4 final. Backend implication: server-validated playback/dwell heartbeats (client-reported time alone is spoofable); counsel has not reviewed this new processing. Full detail: docs/contest-spec.md (section 9c). Build register B-093. [2026-10-27: W12 built the server-validated view heartbeats (POST /posts/:id/view-heartbeat) and FC8 (PR #466) the client sender. #418 item 2 confirms the heartbeat constants (3 s beat, 6 s gap, 2x seek limit, 1 s position tolerance, 120 s session, 240 beats a viewer a minute) and that text-only contest entries use the 5 s photo rule. The retention period for the view and dwell rows is still undefined; the data-protection drafting is commissioned as SG1 (B-236).]</w:t>
             </w:r>
           </w:p>
         </w:tc>
@@ -26534,7 +26534,7 @@
           </w:tcPr>
           <w:p>
             <w:r>
-              <w:t>Resolved -- decided, NOT yet built. PROVENANCE: FOUNDER-DELEGATED DESIGN. The founder asked for 'a reasonable and moderate, non-biased' flow; drafted by Claude 2026-10-14; the founder APPROVED the proposal and parameters on 2026-10-14. Goal: every finalist gets comparable community exposure independent of follower count, prior engagement or upload time. Audience: all logged-in accounts that are not restricted (minors included, under the normal minor-safe feed rules). Placement: a 'Final week' showcase module pinned in the Community feed and listed on the Contest page, live from the reveal, identical for every eligible viewer. Ordering: NEVER by engagement, live leaderboard rank, follower count or recency; a per-viewer shuffle seeded per viewer per day (stable within a session). Balanced-impression rotation: impressions tracked per finalist video (impression = card rendered in the viewport); the video with the FEWEST impressions is served next, keeping counts within a tolerance. Frequency cap: a viewer sees a given finalist video at most N times per day. Confirmed parameters (admin-configurable): tolerance = within 10% of the mean impressions across live finalist videos; N = 3 per viewer per day. Followers get no extra push. Transparency: Contest page copy tells viewers every finalist is shown to everyone equally; an admin view shows the impression distribution per finalist and flags any video outside the tolerance. Unchanged by the followers-excluded switch. Fewer than 9 finalists: same rule over those that exist. Full detail: docs/contest-spec.md (section 10b). Build register B-092, B-095, B-096.</w:t>
+              <w:t>Resolved -- decided, NOT yet built. PROVENANCE: FOUNDER-DELEGATED DESIGN. The founder asked for 'a reasonable and moderate, non-biased' flow; drafted by Claude 2026-10-14; the founder APPROVED the proposal and parameters on 2026-10-14. Goal: every finalist gets comparable community exposure independent of follower count, prior engagement or upload time. Audience: all logged-in accounts that are not restricted (minors included, under the normal minor-safe feed rules). Placement: a 'Final week' showcase module pinned in the Community feed and listed on the Contest page, live from the reveal, identical for every eligible viewer. Ordering: NEVER by engagement, live leaderboard rank, follower count or recency; a per-viewer shuffle seeded per viewer per day (stable within a session). Balanced-impression rotation: impressions tracked per finalist video (impression = card rendered in the viewport); the video with the FEWEST impressions is served next, keeping counts within a tolerance. Frequency cap: a viewer sees a given finalist video at most N times per day. Confirmed parameters (admin-configurable): tolerance = within 10% of the mean impressions across live finalist videos; N = 3 per viewer per day. Followers get no extra push. Transparency: Contest page copy tells viewers every finalist is shown to everyone equally; an admin view shows the impression distribution per finalist and flags any video outside the tolerance. Unchanged by the followers-excluded switch. Fewer than 9 finalists: same rule over those that exist. Full detail: docs/contest-spec.md (section 10b). Build register B-092, B-095, B-096. [2026-10-27: W11 (PR #464, B-092) built the exposure engine and FC8 (PR #466) the carousel. #418 item 1 confirms W11's open defaults 1-18; item 4: the carousel asks for limit=9 and the footer reads 'of N finalists'; item 5: the tile club line leaves the Figma frames until the API returns a club (B-232, B-233, B-234).]</w:t>
             </w:r>
           </w:p>
         </w:tc>
@@ -27263,7 +27263,7 @@
               <w:t>Resolved -- recorded; DECIDED, NOT BUILT, except item 12, whose judgment calls are already in the shipped code (backend/w3-gates, PR #412). Items 1-14 and 17 are founder-adopted defaults, veto-able; items 15 and 16 are founder decisions and are recorded as given. Item numbers below are the founder's own. (1) ACCOUNT INFORMATION. The Account Information (Edit) frames (2924:7112, 5649:8176) drop the Country field. The profile country lives in Edit Profile, which keeps the label 'Country' (#403, item 17; Figma pass I). The safeguarding country is never shown or edited. (2) PROFILE DESIGN DIRECTION. New auto-layout desktop profile frames (the pass H frames, desktop 6707:26595 and 6707:26727 / 6707:26938) replace the legacy absolute-layout profile frames (1455:4362, 1455:6626, 5702:8250, 5778:8490). Default added in recording, veto-able: the legacy frames are archived (hidden, 'ARCHIVED' prefix), not deleted; the #403 item 6 deletion exception covers only the ten Create Post layers. (3) ADMIN COMPONENTS. The F2 components (node 6671:27364) move to match the admin screens: Pill uses auto line height with padding 3/10; Button gets size variants; Banner and Callout Title become optional; radius/10 and radius/16 are added to the spacing and radius collection. They are then adopted on the Pass C and Pass F1 admin frames with no visible change. This settles the 'which side moves', 'radius scale' and 'optional Title' candidates of docs/figma-pass-g2-report.md; the adoption itself is open Figma work (B-113, B-095). (4) FORFEIT POP-UP. 'Contest page' means the Contest details page and the Voting page. When several weeks are forfeited, one pop-up opens after another, oldest week first. Closes the two SCOPE OPEN points of Figma pass G1 and refines #403, item 9 (every load, reason shown, nothing remembered: unchanged). (5) VOTE TOGGLE. The vote count updates live by one, in either direction, when the toggle flips. No banner appears on toggle. Closes the SCOPE OPEN point of Figma pass G1 (#401, #403 item 7). (6) CAROUSEL IMPRESSIONS. Final-week carousel views count as impressions when a tile is actually visible; tile order follows the balanced rotation of #388 (docs/contest-spec.md, section 10b). Closes the open point of #403, item 11 and of B-092. OPEN (not stated): what 'actually visible' means in numbers (share of the tile in view, time in view). (7) 2FA RECOVERY. 10 backup codes, shown once, each in 5-5 groups (interpretation: ten characters shown as two groups of five; the character set is not stated). Regenerating needs the password and invalidates the old set. Turning 2FA off invalidates the codes. A wrong code and an already-used code give the same 'not accepted' message. 5 wrong tries in 15 minutes lock recovery for 15 minutes (ASSUMED per account, not per IP; a per-account lock lets a stranger lock out an account holder, a trade-off to confirm). Password re-entry is needed only to turn off and to regenerate. The 'check your email' page reads the same for unknown accounts (non-enumerating). Backup codes appear after the 6-digit code is accepted, before the '2FA is on' screen. Entry points: a 'Can't scan?' link (manual key) and a Turn off control. Closes the backup-code format and entry-point open points of #402 and Figma pass H; STILL OPEN: storage and encryption of the TOTP secret, counsel (legal copy Part C row 44). (8) BLOCKED USERS LIST. No date is shown; the reason is not editable (unblock and re-block to change it); the reason is visible to the blocker only. A blocked user sees the blocker's profile as not found (settles the SCOPE OPEN 'blocked user's own view' of Figma pass H; whether a new not-found frame is needed or the app's existing not-found state is reused is a Figma follow-up). (9) PINNED FINAL ENTRY. Others see nothing before the reveal. After the reveal the entry is pinned on the finalist's profile until the contest ends at the end of that month; then the pin is removed and the entry is an ordinary post. The label stays 'Contest post'. Item 15 repeats and extends this; where the wording differs, item 15 prevails (see item 15). (10) BANTS. A room is a thread (BanterRoom is the thread; comments are the posts in it). Posting and commenting need NO membership. 'Join' stays as a bookmark that feeds My Bants. Moderation means reporting plus admin moderation. This SUPERSEDES the 'posting requires membership' point of #275 and closes the open points of #403 item 16 and of B-117 (thread mapping, no room membership, moderation scope). Recorded as an interpretation to confirm: no like-identities list is built (none exists today), so the Block clause about like identities leaves counts unchanged. Unchanged: 16-17 full access, under-16 fully disabled (#346), Block effects (#402 item 4). (11) BLOCK AND THE AGE RULES. Block applies on top of the age rules (#346, #347). The age rules apply first. A block never reveals itself: no response, count or error tells the blocked user they are blocked. Closes the open interaction point of #402 item 4 and B-039. (12) BACKEND W3 JUDGMENT CALLS. Calls 1-7 of docs/backend-w3-gates-report.md, section 5, are adopted: (1) the restricted-pending write block is uniform and covers the undo forms, while the unverified-email block covers only the creating forms; (2) read-state and kickoff-alert subscription routes stay open; (3) the profile gate covers posting-class routes only; (4) an open incorrect-details report blocks approval and card payment, not decline or withdraw, and survives a guardian-email change; (5) username set means profile complete; (6) the approval email links to /login; (7) displayName is no longer a fallback anywhere other users can see it. BUILT (PR #412). Forward-pointers on #369, #370, #372, #373 and #403. (13) CONTEST TAB ON DAY 1. From 00:00 to 08:00 on day 1 the Contest tab shows the Between Weeks state, variant 'Week 1 opens at 08:00'. Closes the open E6 point of #403. Note: this window is 8 hours, not the 12 hours of the Between Weeks state of #400. (14) STANDING FIGMA CHECK. The whole-canvas depth-4 get_metadata pull is replaced by a findAll count per top-level node plus a top-level id hash, taken before and after. Reason: the page holds about 139,000 nodes and the pull cannot return (docs/figma-pass-g1-report.md, docs/figma-pass-h-report.md). (15) FINAL-WEEK ENTRY JOURNEY. After the reveal, finalist names on the leaderboard Contest tab open the finalist's profile, where the entry is pinned. Final-week carousel tiles open the entry itself. The entry does not also appear as a normal Community-feed post; the carousel is the daily exposure (balanced rotation, #388). A tile shown in the viewport counts as an impression. The pin lasts until the contest ends at the end of that month, then it is removed (replaces the wording of item 9). Closes 'how other users reach a finalist's entry after the reveal' (#400 E10, #403). OPEN (not stated): whether the entry, once the pin is removed, then appears in the Community feed; item 9 says it becomes an ordinary post, item 15 says only that the pin is removed. (16) CONTEST NOTIFICATIONS (founder decision; the spec had none). In-app notifications, all times Europe/London, to every non-restricted account that is eligible for the Contest under the existing rules (docs/contest-spec.md, sections 6 and 8: minors included, restricted accounts excluded): (a) week opens, 08:00 on days 1, 8, 15, 22; (b) votes-closing reminder, 19:00 on days 7, 14, 21, only to eligible accounts that have not voted that week; (c) week result, when votes lock at 20:00 on days 7, 14, 21: winners announced to everyone, plus a personal notification to each winner; (d) final qualification: a personal notification to each finalist saying the entry stays hidden until the reveal; (e) reveal, 00:00 on day 25: 'The final is live' to everyone; (f) final result: the winners, or 'No winner this month'; (g) forfeits need no extra notification, the pop-up covers them; (h) finalist upload reminder, 12:00 on day 24, to finalists who have not uploaded (default added by Claude, veto-able). One notification per account per event; a re-run never duplicates. Push and email are not decided and stay deferred to launch gate B-090. Wording is functional and tagged [COPY PENDING LEGAL REVIEW] where it reaches minors. ASSUMED, to confirm: (d) is sent when the finalists are known, at the week-3 result (20:00 on day 21); (f) is sent at the end of the contest month, because the spec states no crown moment; a forfeited week sends no (c) notification; whether an account with an unverified email receives them is not stated. BACKEND TO CONFIRM: a uniqueness key per (account, event, contest cycle, week) is needed for 'never duplicates'; Notification.type is a free string, but NotificationsService and the Notification Centre must learn each new type (the age_milestone and match_kickoff precedent: an unrendered type shows a generic row). (17) REGISTER. New rows B-119 to B-123 (admin incorrect-details reports list and resolve, Figma and code; Contest notifications backend, Figma states and frontend); status lines on the rows named in docs/build-register.md Section 14; the B-034 cursor and ordering leak stays on B-034. NOT DECIDED HERE: the visibility threshold in item 6; the TOTP secret storage; the notification timing assumptions in item 16; whether the unpinned entry reaches the Community feed. Dated notes were appended (original text unchanged) to #369, #370, #372, #373 and #403 only; #275, #400, #402 and #396 are amended in substance by this entry but were not edited, #404 is the record. [2026-10-17: Item 16 (Contest notifications) is BUILT as B-122, backend only, in-app only (backend/w3c-contest-notifications, PR #417; docs/backend-w3c-contest-notifications-report.md): the calendar is computed in a new module (no Contest calendar existed in code; B-091 is not built), the BACKEND TO CONFIRM uniqueness key is Notification.dedupeKey (nullable, UNIQUE, additive migration 20261017160000), and (d) and (f) are implemented at the ASSUMED timings. Follow-up decisions in #405 close open points of this entry: the conflict between items 9 and 15 (item 1 of #405), 'actually visible' for carousel impressions (#405, item 7), the TOTP secret storage and the backup-code character set (#405, item 8), whether an unverified-email account receives Contest notifications (#405, item 4), the notification destinations (#405, item 2) and the legacy profile frames (#405, item 9). The roles that may use the DOB tools: #405, item 5.] [2026-10-18: Item 12 / B-034 built: cursor and ordering leak closed; lists order by username, cursors carry username and id only. Open points on the pin, the impression second and the notification wording are closed or amended by #406, items 5, 6 and 7.]</w:t>
             </w:r>
             <w:r>
-              <w:t xml:space="preserve"> [2026-10-24: backend W5 (PR #439) built items 8 and 11 as written (the blocked-users list with no date; the blocked user sees the blocker's profile as not found; Block applies after the age rules and never reveals itself); #411 item 5 settles the remaining Block points (B-197).]</w:t>
+              <w:t xml:space="preserve"> [2026-10-24: backend W5 (PR #439) built items 8 and 11 as written (the blocked-users list with no date; the blocked user sees the blocker's profile as not found; Block applies after the age rules and never reveals itself); #411 item 5 settles the remaining Block points (B-197).] [2026-10-27: items 6 and 15 are built: the carousel, tiles that open /posts/:postId and the pinned final entry with locked engagement before the reveal (FC8, PR #466); Figma pass O (PR #463) drew the missing states. #418 item 5 removes the tile club line from the frames for now.]</w:t>
             </w:r>
           </w:p>
         </w:tc>
@@ -27305,7 +27305,7 @@
           </w:tcPr>
           <w:p>
             <w:r>
-              <w:t>Resolved -- recorded. FOUNDER-ADOPTED DEFAULTS, VETO-ABLE, all ten items. Items 4, 5 and 6 confirm behaviour already in the shipped code (PR #416, PR #417); items 1, 2, 7, 8, 9 and 10 are DECIDED, NOT BUILT; item 3 confirms the existing design. Item numbers are the founder's own. Original text of every entry named in the forward-pointers below is unchanged (dated notes appended). (1) PIN REMOVED, FINAL ENTRY BECOMES AN ORDINARY POST. When the contest ends at the end of its month and the pin is removed (#404 items 9 and 15), the final entry becomes an ordinary post and appears in the Community feed like any other post. Closes the open point of #404 (item 9 said it becomes an ordinary post; item 15 said only that the pin is removed): item 9's reading stands for the end state. Unchanged: during the contest month the entry is not also a normal feed post; the carousel is the daily exposure. The pin removal and the flip are new build work (B-091, B-092, B-082); nothing exists. Not decided: the time of day of the flip. (2) NOTIFICATION DESTINATIONS AS DRAWN IN FIGMA PASS J2 (docs/figma-pass-j2-report.md, section 2). Week opens opens the Contest details page; votes closing opens the Voting page; week result opens the leaderboard Contest tab (that week's winners-in frame); finalist qualification and the finalist upload reminder open Create Post &gt; Contest, Upload Open; 'The final is live' opens the Final week carousel in the Community feed; final result opens the leaderboard Contest tab, Crowned frame (winners) or No Winner This Month frame. NO notification opens a profile. This settles candidates 1, 2 and 4 of that report's section 6 and supersedes the link list written in register row B-123 (reveal and final to the leaderboard Contest tab; winners to the finalist's profile). B-123 updated. (3) PERSONAL WINNER NOTIFICATION. It stays the existing contest_win row (#278), not duplicated and not replaced by a new type; there is no separate personal-winner row in the Notification Centre. Closes the J2 candidate 3 and the 'separate personal winner row' leg of B-121. (4) UNVERIFIED EMAIL. Accounts with an unverified email receive no Contest notifications. Closes the open point of #404 item 16. Matches B-122 as built (one filter constant). (5) DATE OF BIRTH TOOLS. Moderator and superadmin may read and correct a date of birth, and each view is audited. Closes the open point 'which admin roles may read a decrypted DOB' (B-109, #398 D4, #390). Matches B-103 and B-109 as built (PR #416): the correction audit row holds admin, target, reason, old and new tier and never a DOB; every response that contains a DOB writes a user.dob_viewed row and fails closed if that write fails. An editor cannot use either. (6) GUARDIAN RESEND STAYS EMAIL-KEYED. The resend route stays the existing POST /auth/guardian-consent/resend, keyed by the minor's registered email and rate-limited, not JWT. Clarifies the words 'existing authenticated resend' in #402 item 1 and #389 (the authenticated route is change-guardian-email, #365). Matches B-110 as built. Implication, not a decision: the in-account decline page calls the resend route with the account's own registered email. (7) CAROUSEL IMPRESSION THRESHOLD. A carousel tile counts as an impression when at least 50 percent of it is in view for at least 1 second. Closes the OPEN threshold of #404 items 6 and 15 and of B-092. Not stated: whether the second must be continuous and whether a tile counts again on re-entry; the per-viewer daily cap and the tolerance of #388 are unchanged. (8) 2FA. Backup codes are 10 characters shown in two groups of five (5-5), upper-case letters and digits without 0, O, 1 and I; stored hashed (#402); single use. The TOTP secret is encrypted at rest with the existing date-of-birth encryption (AES-256-GCM, DOB_ENCRYPTION_KEY, #362). Recovery lockout stays per account (5 wrong tries in 15 minutes lock recovery for 15 minutes). Closes the character-set, TOTP-secret-storage and per-account-or-per-IP points of #404 item 7 and #402 item 5. Consequences recorded for the founder, not decisions: one key now protects both date-of-birth and TOTP secrets, so loss or rotation of DOB_ENCRYPTION_KEY affects both (docs/dob-encryption-rollback.md covers date of birth only); a per-account lock lets a stranger lock out an account holder (the trade-off #404 already named). Counsel (legal copy Part C row 44) still open. (9) LEGACY PROFILE FRAMES. The legacy absolute-layout profile frames 1455:4362, 1455:6626, 5702:8250 and 5778:8490 are archived (hidden, ARCHIVED prefix), not deleted. Confirms the default of #404 item 2; the Figma work is still owed (B-113, B-082). (10) FIGMA COMPONENT ADOPTION. The Field component, the eight Dialogs and the eight Tables that Figma pass J did not adopt stay local frames; the 257 hidden ARCHIVED originals left by that pass stay until the launch gate (B-090). Settles the 'still open' adoption of pass J (B-113, B-095). Not decided: whether the 257 are deleted at the gate. (REGISTER) New rows B-124 (pending-copy guard), B-125 (apps/web onboarding routing on the server's nextStep) and B-126 (OPEN, no decision: declined-at-1-or-2 rows have no expiry); status lines on B-015, B-030, B-082, B-086, B-087, B-090, B-091, B-092, B-095, B-102, B-103, B-104, B-109, B-110, B-111, B-113, B-121, B-122, B-123; the BUILT lines of B-102, B-103, B-109, B-110 and B-122 (PR #416, PR #417) were already present and were verified, not duplicated. 126 B-IDs; 146 gap frames unchanged. Arithmetic: docs/build-register.md Section 19. (FORWARD-POINTERS) Dated notes appended (original text unchanged) to #337, #338, #339, #340, #365, #372, #375, #389, #390, #395, #398, #402, #403 and #404. NOT DECIDED HERE: the pending-copy guard's exact scope (the instruction named it but its definition did not arrive; B-124 is Claude's reading of the name and the repo, to confirm or replace); whether a row declined at 1 or 2 should expire, be reminded or be left alone (B-126, OPEN); the time of day of the pin-removal flip; continuity of the 1-second view; whether the 257 archived originals are deleted at the launch gate; counsel wording for every [COPY PENDING LEGAL REVIEW] item. [2026-10-18: Amended by #406. Item 5 (date of birth tools): User Detail no longer shows the DOB; it appears only on the correction form and the server rejects a reason containing a date (#406, item 4); roles unchanged. Open points closed: the time of the pin-removal flip of item 1 (00:00 London time on the 1st, #406 item 5) and the continuous-second and re-entry points of item 7 (#406 item 6).] [2026-10-18: Item 5 (date of birth tools), as built in W3d (B-129, PR #424): User Detail has a summary read without the DOB and the age tier (GET /admin/users/:id/summary, no audit row); user.dob_viewed is written only by the full read GET /admin/users/:id, which the correction form uses; a correction reason containing a date-shaped string is a 400 reason_contains_date. QA run (PR #426), D-07: apps/admin User Detail still opens on the full read, so each open writes audit rows and sends the DOB to the browser; the frontend leg is not built (B-129).]</w:t>
+              <w:t>Resolved -- recorded. FOUNDER-ADOPTED DEFAULTS, VETO-ABLE, all ten items. Items 4, 5 and 6 confirm behaviour already in the shipped code (PR #416, PR #417); items 1, 2, 7, 8, 9 and 10 are DECIDED, NOT BUILT; item 3 confirms the existing design. Item numbers are the founder's own. Original text of every entry named in the forward-pointers below is unchanged (dated notes appended). (1) PIN REMOVED, FINAL ENTRY BECOMES AN ORDINARY POST. When the contest ends at the end of its month and the pin is removed (#404 items 9 and 15), the final entry becomes an ordinary post and appears in the Community feed like any other post. Closes the open point of #404 (item 9 said it becomes an ordinary post; item 15 said only that the pin is removed): item 9's reading stands for the end state. Unchanged: during the contest month the entry is not also a normal feed post; the carousel is the daily exposure. The pin removal and the flip are new build work (B-091, B-092, B-082); nothing exists. Not decided: the time of day of the flip. (2) NOTIFICATION DESTINATIONS AS DRAWN IN FIGMA PASS J2 (docs/figma-pass-j2-report.md, section 2). Week opens opens the Contest details page; votes closing opens the Voting page; week result opens the leaderboard Contest tab (that week's winners-in frame); finalist qualification and the finalist upload reminder open Create Post &gt; Contest, Upload Open; 'The final is live' opens the Final week carousel in the Community feed; final result opens the leaderboard Contest tab, Crowned frame (winners) or No Winner This Month frame. NO notification opens a profile. This settles candidates 1, 2 and 4 of that report's section 6 and supersedes the link list written in register row B-123 (reveal and final to the leaderboard Contest tab; winners to the finalist's profile). B-123 updated. (3) PERSONAL WINNER NOTIFICATION. It stays the existing contest_win row (#278), not duplicated and not replaced by a new type; there is no separate personal-winner row in the Notification Centre. Closes the J2 candidate 3 and the 'separate personal winner row' leg of B-121. (4) UNVERIFIED EMAIL. Accounts with an unverified email receive no Contest notifications. Closes the open point of #404 item 16. Matches B-122 as built (one filter constant). (5) DATE OF BIRTH TOOLS. Moderator and superadmin may read and correct a date of birth, and each view is audited. Closes the open point 'which admin roles may read a decrypted DOB' (B-109, #398 D4, #390). Matches B-103 and B-109 as built (PR #416): the correction audit row holds admin, target, reason, old and new tier and never a DOB; every response that contains a DOB writes a user.dob_viewed row and fails closed if that write fails. An editor cannot use either. (6) GUARDIAN RESEND STAYS EMAIL-KEYED. The resend route stays the existing POST /auth/guardian-consent/resend, keyed by the minor's registered email and rate-limited, not JWT. Clarifies the words 'existing authenticated resend' in #402 item 1 and #389 (the authenticated route is change-guardian-email, #365). Matches B-110 as built. Implication, not a decision: the in-account decline page calls the resend route with the account's own registered email. (7) CAROUSEL IMPRESSION THRESHOLD. A carousel tile counts as an impression when at least 50 percent of it is in view for at least 1 second. Closes the OPEN threshold of #404 items 6 and 15 and of B-092. Not stated: whether the second must be continuous and whether a tile counts again on re-entry; the per-viewer daily cap and the tolerance of #388 are unchanged. (8) 2FA. Backup codes are 10 characters shown in two groups of five (5-5), upper-case letters and digits without 0, O, 1 and I; stored hashed (#402); single use. The TOTP secret is encrypted at rest with the existing date-of-birth encryption (AES-256-GCM, DOB_ENCRYPTION_KEY, #362). Recovery lockout stays per account (5 wrong tries in 15 minutes lock recovery for 15 minutes). Closes the character-set, TOTP-secret-storage and per-account-or-per-IP points of #404 item 7 and #402 item 5. Consequences recorded for the founder, not decisions: one key now protects both date-of-birth and TOTP secrets, so loss or rotation of DOB_ENCRYPTION_KEY affects both (docs/dob-encryption-rollback.md covers date of birth only); a per-account lock lets a stranger lock out an account holder (the trade-off #404 already named). Counsel (legal copy Part C row 44) still open. (9) LEGACY PROFILE FRAMES. The legacy absolute-layout profile frames 1455:4362, 1455:6626, 5702:8250 and 5778:8490 are archived (hidden, ARCHIVED prefix), not deleted. Confirms the default of #404 item 2; the Figma work is still owed (B-113, B-082). (10) FIGMA COMPONENT ADOPTION. The Field component, the eight Dialogs and the eight Tables that Figma pass J did not adopt stay local frames; the 257 hidden ARCHIVED originals left by that pass stay until the launch gate (B-090). Settles the 'still open' adoption of pass J (B-113, B-095). Not decided: whether the 257 are deleted at the gate. (REGISTER) New rows B-124 (pending-copy guard), B-125 (apps/web onboarding routing on the server's nextStep) and B-126 (OPEN, no decision: declined-at-1-or-2 rows have no expiry); status lines on B-015, B-030, B-082, B-086, B-087, B-090, B-091, B-092, B-095, B-102, B-103, B-104, B-109, B-110, B-111, B-113, B-121, B-122, B-123; the BUILT lines of B-102, B-103, B-109, B-110 and B-122 (PR #416, PR #417) were already present and were verified, not duplicated. 126 B-IDs; 146 gap frames unchanged. Arithmetic: docs/build-register.md Section 19. (FORWARD-POINTERS) Dated notes appended (original text unchanged) to #337, #338, #339, #340, #365, #372, #375, #389, #390, #395, #398, #402, #403 and #404. NOT DECIDED HERE: the pending-copy guard's exact scope (the instruction named it but its definition did not arrive; B-124 is Claude's reading of the name and the repo, to confirm or replace); whether a row declined at 1 or 2 should expire, be reminded or be left alone (B-126, OPEN); the time of day of the pin-removal flip; continuity of the 1-second view; whether the 257 archived originals are deleted at the launch gate; counsel wording for every [COPY PENDING LEGAL REVIEW] item. [2026-10-18: Amended by #406. Item 5 (date of birth tools): User Detail no longer shows the DOB; it appears only on the correction form and the server rejects a reason containing a date (#406, item 4); roles unchanged. Open points closed: the time of the pin-removal flip of item 1 (00:00 London time on the 1st, #406 item 5) and the continuous-second and re-entry points of item 7 (#406 item 6).] [2026-10-18: Item 5 (date of birth tools), as built in W3d (B-129, PR #424): User Detail has a summary read without the DOB and the age tier (GET /admin/users/:id/summary, no audit row); user.dob_viewed is written only by the full read GET /admin/users/:id, which the correction form uses; a correction reason containing a date-shaped string is a 400 reason_contains_date. QA run (PR #426), D-07: apps/admin User Detail still opens on the full read, so each open writes audit rows and sends the DOB to the browser; the frontend leg is not built (B-129).] [2026-10-27: item 7 is built by FC8 (PR #466): at least 50 percent of a tile in view for one continuous second, re-entry counts again, within the server's daily cap; #418 items 1 and 3 confirm the W11 and FC8 defaults around it.]</w:t>
             </w:r>
           </w:p>
         </w:tc>
@@ -27626,7 +27626,7 @@
               <w:t>Decided 2026-10-25 (founder-adopted defaults, veto-able). DECIDED, NOT BUILT, except item 6, which confirms what W7 and W6 built. Docs only: no code, schema, Figma, legal copy, DPIA or Log Book; docs/sprint-1-dpia-outline-draft.md, docs/contest-spec.md and docs/pending-copy-manifest.md are not touched. INTERPRETATIONS RECORDED: the K7, D11 and FC5 briefs were not available to this pass, so their scope is derived from the seven items; 'the existing notification' in item 2 is read as the existing Notification table and Notification Centre (a new type, no email, no push), because no notification type for an image decision exists today; 'the 17 OPEN defaults stand' (item 6) is read as accepting each default as recorded in the W7 report section 5, so items 2, 3 and 4 there (no views, no exposure engine, follow and post points still awarded) are confirmed as statuses that stay on B-093, B-092 and B-094 and are NOT a decision to leave them unbuilt, and item 15 (forfeit and API wording) stays OPEN in the pending-copy manifest. (REGISTER) docs/build-register.md Section 35: new rows B-209 (K7: Edit Profile Preferred Club as free text; item 4), B-210 (K7: cover crop step at the cover slot's ratio; item 3), B-211 (K7: rejected-image Notification Centre row and in-page reason; item 2), B-212 (K7: tag review of K6's nine strings; item 5), B-213 (D11: Notification.actorId, write sites, blocked-pair hiding; item 1), B-214 (D11: rejection reason storage, owner-only exposure and the notification; item 2), B-215 (FC5: picture and cover upload with the crop and the rejected state; items 2 and 3), B-216 (FC5: Preferred Club free-text field; item 4), B-217 (FC5: Notification Centre renders the image-decision row; item 2). Item 7 needs no new row: it is B-097 (status line on B-095 and B-097). Item 6 needs none (status lines on B-091, B-092, B-093, B-094, B-181). Status lines on 15 existing rows (B-037, B-038, B-091, B-092, B-093, B-094, B-095, B-097, B-123, B-124, B-181, B-196, B-197, B-205, B-208). 217 B-IDs (was 208); 146 gap frames unchanged. Arithmetic: Section 35e. (ITEM DETAIL) (1) adopted, not stated: actorId is a plain nullable string with no foreign key; rows created before the migration keep a NULL actorId and are not filtered; the 'Someone' wording on those rows is not changed. (2) adopted, not stated: the reason is admin-written text, required, adopted maximum 300 characters, returned only on the owner's own record, cleared on the next upload or delete; the Notification does not copy it and links to Edit Profile. (3) the ratio is the cover slot's in the profile frames, measured by K7; the crop is done in the browser. (4) confirms #392 item 8 and #393; the Edit Profile frames that draw a select are stale; the field stays owner-only (#411 item 3). (5) the rule: a string carries [COPY PENDING LEGAL REVIEW] only if it makes a legal or safety promise (what is checked, who sees it, how long it is kept, what happens to an image or to a child's data); strings already tagged in code and listed in the manifest are unchanged. (6) W6 digit rules: any number of digits after the name with at most one underscore between, digits before the name refused, no cap on the number of digits. (7) the sources are the frames of passes C, E, F1 and J and docs/contest-spec.md; a state no frame draws is built plainly and flagged. (FORWARD-POINTERS) Dated notes appended (original text unchanged) to #243, #290, #369, #371, #381, #393, #394, #398, #399, #406, #410 and #411 (12 rows). NOT DECIDED HERE: whether the actor is named on like and comment rows; whether rows created before the migration are backfilled; the cover's maximum pixel size and whether the server enforces the ratio (B-205); an avatar crop step; whether a moderator-written reason shown to a possible child needs counsel guidance; whether FC5 shows the impression view as a disclosed stub until B-092 exists; which of K6's nine strings are functional. NOT DONE: docs/contest-spec.md is not extended with the W7 defaults (the W7 report section 5 and this entry are the record); Decision Log numbers #293 and #294 are still absent from the table, as before. [2026-10-25: #413 item 3 confirms the item 5 tag rule for the username cooldown hint; #413 adds register rows B-218 to B-221.]</w:t>
             </w:r>
             <w:r>
-              <w:t xml:space="preserve"> [2026-10-25: #414 item 3: the image-decision notification row serves both the picture and the cover (B-224, B-217); item 2 turns the cover crop of item 3 here into one saved crop at 796:192 with zoom 1x to 3x and a 796 px minimum width (B-222, B-227).] [2026-10-26: #415 item 4 removes the [COPY PENDING LEGAL REVIEW] tag from the blocked-profile notice frames in Figma, applying the item 5 rule here (the built notice is untagged); K10 (B-228).] [2026-10-26: #416: K10 (PR #457, B-228) hid the [COPY PENDING LEGAL REVIEW] tag on the blocked-profile notice frames 6706:26750 and 6707:26595, applying the item 5 rule as #415 item 4 decided; FC7 (PR #458) added no tag to the new cover-crop strings, which are functional and untagged under item 5.]</w:t>
+              <w:t xml:space="preserve"> [2026-10-25: #414 item 3: the image-decision notification row serves both the picture and the cover (B-224, B-217); item 2 turns the cover crop of item 3 here into one saved crop at 796:192 with zoom 1x to 3x and a 796 px minimum width (B-222, B-227).] [2026-10-26: #415 item 4 removes the [COPY PENDING LEGAL REVIEW] tag from the blocked-profile notice frames in Figma, applying the item 5 rule here (the built notice is untagged); K10 (B-228).] [2026-10-26: #416: K10 (PR #457, B-228) hid the [COPY PENDING LEGAL REVIEW] tag on the blocked-profile notice frames 6706:26750 and 6707:26595, applying the item 5 rule as #415 item 4 decided; FC7 (PR #458) added no tag to the new cover-crop strings, which are functional and untagged under item 5.] [2026-10-27: item 6's statuses are now built: the exposure engine (W11, PR #464), the points engine with views (W12, PR #465) and the removal of follow and post points (B-094, backend pass W10). #418 items 1 and 2 confirm the W11 and W12 open defaults.]</w:t>
             </w:r>
           </w:p>
         </w:tc>
@@ -27840,6 +27840,48 @@
           <w:p>
             <w:r>
               <w:t>Decided 2026-10-26 (founder statement; the build detail below is adopted and veto-able). Records decisions and register work only. Docs only: no code, schema, Figma, legal copy, DPIA or Log Book; docs/sprint-1-dpia-outline-draft.md, docs/contest-spec.md and docs/pending-copy-manifest.md are not touched. Item 1 (QA second run accepted): the run found five defects (D-18 to D-22, none release-blocking) and reported the full Playwright suite at 221 tests: specs 00-14 = 192 tests plus spec 15 = 29 tests (28 run, 1 skipped by design because the exact-throttle test needs a fresh API process; it passed when run separately). FIX1 (PR #461) fixed D-18 to D-22. The '180' in earlier briefs (and in #413 item 4, which asked for a full run of the 180-test suite) is stale; the full-run instruction of #413 item 4 is met by this run and B-219 is closed on it. Not covered by the run, as its section 5 says: the live Contest phases in a real browser (item 3), images reaching 'approved' (needs B-036/B-037 and an object store), the cover file's pixel size (B-205), mobile viewports beyond specs 12 and 14, live Stripe/Postmark/GeoLite2/R2. Item 2 (header avatar): on every signed-in screen the header avatar is an empty green circle for an account with no approved picture (QA second run, section 4; consistent with #168, which left the header and drawer with no client-side identity source for the avatar). Decided: it STAYS an empty circle until B-036, B-037 and the AWS account exist (B-193). After that, with no approved picture, it shows the person's initials taken from the display name. A Figma header variant is needed first (the navbar set 2824:4309 has no initials state); the code follows it. Adopted, not stated: the header is the owner's own view, so it uses displayName, not publicName (#364); the initials rule matches the one already used in the drawer and on cards (first letter of the first and last words, one letter for a single word, as initialsFor in NavDrawer.tsx does); the same fallback applies to the mobile header. NOT decided: whether the account dropdown and the drawer identity block change in the same pass; the exact initials colours (to be drawn from existing tokens, no new colour). Item 3 (live Contest coverage): the contest calendar follows the real clock and a contest for the current month cannot be created through the admin form (the month must not have started), so the browser suite saw only the upcoming state and the no-contest state. Decided: the next QA run adds browser coverage of the live phases (entries, voting and the vote toggle, forfeit pop-ups, week-4 upload, the live ranking, the crowned state) using EITHER a test clock for the API process OR a cycle seeded directly into the database for the current month. Adopted, not stated: the mechanism is test-harness only (the API e2e already uses an injectable clock; the browser run would set it for its own API process), and NO production time-travel or debug endpoint is added; which of the two mechanisms is used is QA's choice and is recorded in the run's report. Register: B-230 (header avatar initials, Figma then apps/web) and B-231 (live Contest browser coverage, QA) added; status lines appended (original text unchanged) to B-036, B-037, B-134 and B-219. 231 B-IDs; 146 gap frames unchanged (Section 45). (FORWARD-POINTERS) Dated notes appended (original text unchanged) to #168, #407, #411 and #413 (4 rows). NOT DONE: Decision Log numbers #293 and #294 are still absent from the table, as before.</w:t>
+            </w:r>
+          </w:p>
+        </w:tc>
+      </w:tr>
+      <w:tr>
+        <w:tc>
+          <w:tcPr>
+            <w:tcW w:type="dxa" w:w="500"/>
+          </w:tcPr>
+          <w:p>
+            <w:r>
+              <w:t>418</w:t>
+            </w:r>
+          </w:p>
+        </w:tc>
+        <w:tc>
+          <w:tcPr>
+            <w:tcW w:type="dxa" w:w="4700"/>
+          </w:tcPr>
+          <w:p>
+            <w:r>
+              <w:t>Founder decisions 2026-10-27 after Figma pass O (PR #463), backend W11 (PR #464), backend W12 (PR #465) and FC8 (PR #466) merged (8 items): (1) the open defaults of W11 (docs/backend-w11-exposure-report.md section 5, items 1-18) stand; (2) the open defaults of W12 (docs/backend-w12-points-report.md section 3, items 1-16) stand, including the removal of the weekly cap of 100 in favour of the daily caps of 40 given and 20 received held in configuration; (3) the FC8 judgment calls 1-9 (docs/fc8-report.md section 2) stand; (4) the Final week carousel requests limit=9 and its footer reads 'of N finalists'; (5) the finalist club line is removed from the tiles in the Figma frames until the API returns a club; (6) 'Your fans right now' and the 'Last week' board stay omitted from the Voting page; (7) the MVP launches with video links only unless the founder decides otherwise, and a register row records it; (8) the data-protection drafting for minors' impression and view data is commissioned (SG1).</w:t>
+            </w:r>
+          </w:p>
+        </w:tc>
+        <w:tc>
+          <w:tcPr>
+            <w:tcW w:type="dxa" w:w="1850"/>
+          </w:tcPr>
+          <w:p>
+            <w:r>
+              <w:t>docs/decisions-founder-2026-10-27 (docs only, 2026-10-27; founder decisions 2026-10-27, items 1-8; sources docs/backend-w11-exposure-report.md section 5, docs/backend-w12-points-report.md section 3, docs/fc8-report.md section 2, docs/figma-pass-o-report.md; PRs #463, #464, #465 and #466 as merged; Decision Log #382-#385, #388, #402, #404, #405, #406, #412; docs/build-register.md Sections 2, 7 and 47; CLAUDE.md)</w:t>
+            </w:r>
+          </w:p>
+        </w:tc>
+        <w:tc>
+          <w:tcPr>
+            <w:tcW w:type="dxa" w:w="2300"/>
+          </w:tcPr>
+          <w:p>
+            <w:r>
+              <w:t>Decided 2026-10-27 (founder statement; build detail adopted and veto-able). Records decisions and register work only. Docs only: no code, schema, Figma, legal copy, DPIA or Log Book; docs/sprint-1-dpia-outline-draft.md, docs/contest-spec.md and docs/pending-copy-manifest.md are not touched. Items 1 to 3 record statuses: W11 (PR #464, B-092), W12 (PR #465, B-093; B-094 confirmed intact) and FC8 (PR #466) are merged and the open defaults each report listed stand. Item 1 - W11 defaults (summary; the report is the record): tolerance is read as a band within tolerancePercent of the mean above the lowest unplaced count, each band shuffled, and the admin flag uses the spec's literal wording (more than the tolerance percent from the mean, both directions); the mean is over all live finalist videos of eligible authors; a finalist's own entry is left out of their carousel and their own impression is not stored; a restricted viewer gets live: false and a 403 on the event, an unverified-email viewer is still served and counted; only eligible authors (active, verified email, not restricted) are promoted; the shuffle seed is viewer + cycle + London day; the cap is per viewer and video per London day; the client eventId is the idempotency key; carousel size default 6, maximum 9; outside the window the carousel answers 200 live: false and the event 409; one identical 404 for unknown, hidden, weekly, ineligible-author and blocked; block rules apply both ways; only counted impressions are stored, a claim below 0.5 in view or 1000 ms is a 400, and nothing else about the viewing is kept; per-viewer rows are folded and deleted at the crown and on anonymisation; the admin endpoint takes AdminJwtAuthGuard only; no throttling beyond the cap. Item 2 - W12 defaults: points become quarterPoints (existing values x4); revocation marks the ledger row and never deletes it; the two daily caps are independent and all-or-nothing, and a capped engagement is not queued; an engagement from an ineligible account counts for nobody, but an ineligible creator does not stop the giver; baseline points also apply to engagement on contest entries; a restored engagement is re-dated to the restore time; hiding a comment counts as removing it; revocation is wired to guardian-consent refusal / withdrawal / expiry and admin suspension, is not undone when a restriction lifts, and is not triggered by self-deactivation or anonymisation; text-only contest entries use the photo rule (5 s); video length is client-reported and bounded; heartbeat constants (a beat every 3 s, a gap over 6 s earns nothing, playback over 2x is a seek, 1 s position tolerance, session 120 s, 240 beats a viewer a minute); a creator's own view of their contest entry counts in the contest tally but earns no everyday points; the caps are the environment variables POINTS_DAILY_CAP_GIVEN / POINTS_DAILY_CAP_RECEIVED (40 / 20), in configuration, not a database table or an admin screen; a heartbeat on a hidden final entry is a 404 for everyone but the author; no notification for points. The weekly cap of 100 on the leaderboard rollup is REMOVED (it contradicted the spec's 'about 1,800 per month'). Item 3 - FC8 calls: the pass O frames are the reference ('K11' was the brief's name for them); two strings are tagged [COPY PENDING LEGAL REVIEW] (the carousel's ordering sentence and the locked entry's 'Only you can see this entry until then') and everything else is untagged under #412 item 5; the admin impression settings are edited on the existing Edit screen, not inline; the footer count is the number of tiles returned; a tile shows the finalist's public name only; the pinned entry's lock is read from the current contest's calendar and the server enforces it regardless; carousel views are impressions only on the carousel; the heartbeat is sent from every PostCard; a feed video is not played inline (only the entry page and the pinned entry). Item 4 AMENDS FC8 call 4: FC8 sent no limit (server default 6, so with seven to nine finalists the balanced order decided which six were shown); the carousel now asks for 9, so N in the footer is every finalist (B-233). Item 5: the tile club line ('Yaba Athletic') is removed (adopted: hidden, not deleted) from the Figma component sets 6697:26234 / 6697:27448 until the carousel endpoint returns a club; it does not (B-234); re-adding the line is a separate later decision (B-232). Item 6: 'Your fans right now' and the 'Last week' board stay omitted from the Voting page (no data), as FC5 and FC8 built it. Item 7: the MVP launches with video LINKS only (the Final week composer takes a Video link; no media upload endpoint exists for posts or entries); reversing this needs a new founder decision and new rows (B-235). It conflicts with #378 for the four Partial composer frames of B-041; not resolved. Item 8: safeguarding-drafter drafts, for counsel, the DPIA and disclosure wording for minors' impression and view/dwell data (SG1, B-236); draft only, never approved; this PR does not touch the DPIA or the legal copy. Register: B-232 (K12, Figma), B-233 (FC9, apps/web), B-234 (W13, backend), B-235 (video upload decision record) and B-236 (SG1) added; status lines appended (original text unchanged) to B-041, B-082, B-091, B-092, B-093, B-094, B-095, B-097, B-098, B-099, B-123 and B-159 (12 rows). 236 B-IDs; 146 gap frames unchanged (Section 48). DERIVED: the K12, FC9, W13 and SG1 briefs were not available to the pass that wrote this entry; those four rows are read from the eight items and may move. NOT decided: retention periods for the points ledger, the ContestEngagement view rows and the impression rows; comment content screening; whether a minor finalist's club may be shown; whether the omitted Voting boards are removed or annotated; how a linked video is checked. (FORWARD-POINTERS) Dated notes appended (original text unchanged) to #383, #384, #388, #404, #405 and #412 (6 rows). NOT DONE: Decision Log numbers #293 and #294 are still absent from the table, as before.</w:t>
             </w:r>
           </w:p>
         </w:tc>

</xml_diff>

<commit_message>
docs: Decision Log #419 - build post and contest-entry media upload (reverses #418 item 7 links-only); register B-237 to B-241
Docs only. Appends #419 to the Decision Log and dated notes on #418, #378, #371,
#398, #412, #307; adds register rows B-237 (K13), B-238 (W14), B-239 (W15),
B-240 (FC10), B-241 (SG2) and status lines on B-041, B-036, B-037, B-205, B-206,
B-207, B-235, B-090. Original text unchanged.

Co-Authored-By: Claude Sonnet 5.5 <noreply@anthropic.com>
</commit_message>
<xml_diff>
--- a/docs/Soccernity_MVP_Build_Plan_v1.7.docx
+++ b/docs/Soccernity_MVP_Build_Plan_v1.7.docx
@@ -22929,6 +22929,9 @@
             <w:r>
               <w:t xml:space="preserve"> [2026-10-24: backend W5 (PR #439) added the optional S3_PUBLIC_BASE_URL variable (B-035); the Cloudflare account, bucket and token and the value (r2.dev or a custom domain) are a human action (B-207, #411).]</w:t>
             </w:r>
+            <w:r>
+              <w:t xml:space="preserve"> [2026-10-27: #419: the Cloudflare R2 bucket also holds post and contest-entry media, in a quarantine prefix and a public prefix; the Cloudflare account, keys and the video stripping tool on the host stay human steps (B-207, B-090).]</w:t>
+            </w:r>
           </w:p>
         </w:tc>
       </w:tr>
@@ -25810,6 +25813,9 @@
             <w:r>
               <w:t xml:space="preserve"> [2026-10-25: #412 items 2 and 3: a rejected picture or cover shows its reason in the page and through the existing notification mechanism (B-214, B-211, B-217); the cover is cropped to the aspect ratio of the cover frame (B-210, B-215). The cover's pixel size and server-side ratio enforcement are not decided.]</w:t>
             </w:r>
+            <w:r>
+              <w:t xml:space="preserve"> [2026-10-27: #419: post and contest-entry media use the same pending-and-invisible rule as profile pictures until a moderator approves them in the shared review queue (B-037, B-239); for post media the automatic image check (B-036) is a later pre-filter only. Avatars and covers keep the #411 item 1 rule unchanged.]</w:t>
+            </w:r>
           </w:p>
         </w:tc>
       </w:tr>
@@ -26110,6 +26116,9 @@
             <w:r>
               <w:t>Resolved -- decided; the build register is not yet created. All 35 Missing, 34 Stub and 71 Partial screens in docs/mvp-coverage-audit.md are launch-blocking and in scope, tracked in a build register. Apple login is removed from scope. Google and Facebook sign-in are in scope but must still pass the Age Gate (DOB and country) and the guardian flow; the provider's date of birth is never trusted; Facebook accounts without an email need a fallback. Two-factor authentication uses an authenticator app, not SMS (the Figma and the disabled UI say 'Text message'; no TOTP backend exists). Sports fields the chosen vendor does not supply (FORM column, xG, player ratings, pressure index) are hidden via the capability registry, not deleted (Decision Log #336). Decision Log #55 designed Google/Apple/Facebook; the Apple half is withdrawn here. This widens the MVP definition of done beyond Build Plan Section 7's list; Discover/Careers pillar work remains out of scope. [2026-10-14: scope confirmed by #392 item 1 -- everything is launch-blocking including the Competition umbrella (the register's 'Competition deferral' conflict is resolved in favour of building it).]</w:t>
             </w:r>
+            <w:r>
+              <w:t xml:space="preserve"> [2026-10-27: #419: post media upload (B-041) is built, not left as links only; this settles the conflict B-235 recorded between links-only and the four Partial composer frames in favour of building the upload control.]</w:t>
+            </w:r>
           </w:p>
         </w:tc>
       </w:tr>
@@ -26998,6 +27007,9 @@
             <w:r>
               <w:t xml:space="preserve"> [2026-10-25: #412 item 2 closes the delivery channel of D2: the flagged-image reject reason is shown to the uploader in the page and through the existing notification mechanism (B-214, B-211, B-217). The admin action and screen to reject stay with B-037 and B-012.]</w:t>
             </w:r>
+            <w:r>
+              <w:t xml:space="preserve"> [2026-10-27: #419 item 6: a rejected post or entry file shows its reason to the uploader in the page and by notification, as for profile pictures; the admin reject action is the same queue (B-037, B-239). Whether the media of a reported post or a legal hold is kept when its author deletes it is not decided (B-239).]</w:t>
+            </w:r>
           </w:p>
         </w:tc>
       </w:tr>
@@ -27628,6 +27640,9 @@
             <w:r>
               <w:t xml:space="preserve"> [2026-10-25: #414 item 3: the image-decision notification row serves both the picture and the cover (B-224, B-217); item 2 turns the cover crop of item 3 here into one saved crop at 796:192 with zoom 1x to 3x and a 796 px minimum width (B-222, B-227).] [2026-10-26: #415 item 4 removes the [COPY PENDING LEGAL REVIEW] tag from the blocked-profile notice frames in Figma, applying the item 5 rule here (the built notice is untagged); K10 (B-228).] [2026-10-26: #416: K10 (PR #457, B-228) hid the [COPY PENDING LEGAL REVIEW] tag on the blocked-profile notice frames 6706:26750 and 6707:26595, applying the item 5 rule as #415 item 4 decided; FC7 (PR #458) added no tag to the new cover-crop strings, which are functional and untagged under item 5.] [2026-10-27: item 6's statuses are now built: the exposure engine (W11, PR #464), the points engine with views (W12, PR #465) and the removal of follow and post points (B-094, backend pass W10). #418 items 1 and 2 confirm the W11 and W12 open defaults.]</w:t>
             </w:r>
+            <w:r>
+              <w:t xml:space="preserve"> [2026-10-27: #419 item 6 applies item 2 (the reason in the page and through the existing notification mechanism) to rejected post and contest-entry files; a notification type for it is built in B-239 and rendered in B-240.]</w:t>
+            </w:r>
           </w:p>
         </w:tc>
       </w:tr>
@@ -27882,6 +27897,51 @@
           <w:p>
             <w:r>
               <w:t>Decided 2026-10-27 (founder statement; build detail adopted and veto-able). Records decisions and register work only. Docs only: no code, schema, Figma, legal copy, DPIA or Log Book; docs/sprint-1-dpia-outline-draft.md, docs/contest-spec.md and docs/pending-copy-manifest.md are not touched. Items 1 to 3 record statuses: W11 (PR #464, B-092), W12 (PR #465, B-093; B-094 confirmed intact) and FC8 (PR #466) are merged and the open defaults each report listed stand. Item 1 - W11 defaults (summary; the report is the record): tolerance is read as a band within tolerancePercent of the mean above the lowest unplaced count, each band shuffled, and the admin flag uses the spec's literal wording (more than the tolerance percent from the mean, both directions); the mean is over all live finalist videos of eligible authors; a finalist's own entry is left out of their carousel and their own impression is not stored; a restricted viewer gets live: false and a 403 on the event, an unverified-email viewer is still served and counted; only eligible authors (active, verified email, not restricted) are promoted; the shuffle seed is viewer + cycle + London day; the cap is per viewer and video per London day; the client eventId is the idempotency key; carousel size default 6, maximum 9; outside the window the carousel answers 200 live: false and the event 409; one identical 404 for unknown, hidden, weekly, ineligible-author and blocked; block rules apply both ways; only counted impressions are stored, a claim below 0.5 in view or 1000 ms is a 400, and nothing else about the viewing is kept; per-viewer rows are folded and deleted at the crown and on anonymisation; the admin endpoint takes AdminJwtAuthGuard only; no throttling beyond the cap. Item 2 - W12 defaults: points become quarterPoints (existing values x4); revocation marks the ledger row and never deletes it; the two daily caps are independent and all-or-nothing, and a capped engagement is not queued; an engagement from an ineligible account counts for nobody, but an ineligible creator does not stop the giver; baseline points also apply to engagement on contest entries; a restored engagement is re-dated to the restore time; hiding a comment counts as removing it; revocation is wired to guardian-consent refusal / withdrawal / expiry and admin suspension, is not undone when a restriction lifts, and is not triggered by self-deactivation or anonymisation; text-only contest entries use the photo rule (5 s); video length is client-reported and bounded; heartbeat constants (a beat every 3 s, a gap over 6 s earns nothing, playback over 2x is a seek, 1 s position tolerance, session 120 s, 240 beats a viewer a minute); a creator's own view of their contest entry counts in the contest tally but earns no everyday points; the caps are the environment variables POINTS_DAILY_CAP_GIVEN / POINTS_DAILY_CAP_RECEIVED (40 / 20), in configuration, not a database table or an admin screen; a heartbeat on a hidden final entry is a 404 for everyone but the author; no notification for points. The weekly cap of 100 on the leaderboard rollup is REMOVED (it contradicted the spec's 'about 1,800 per month'). Item 3 - FC8 calls: the pass O frames are the reference ('K11' was the brief's name for them); two strings are tagged [COPY PENDING LEGAL REVIEW] (the carousel's ordering sentence and the locked entry's 'Only you can see this entry until then') and everything else is untagged under #412 item 5; the admin impression settings are edited on the existing Edit screen, not inline; the footer count is the number of tiles returned; a tile shows the finalist's public name only; the pinned entry's lock is read from the current contest's calendar and the server enforces it regardless; carousel views are impressions only on the carousel; the heartbeat is sent from every PostCard; a feed video is not played inline (only the entry page and the pinned entry). Item 4 AMENDS FC8 call 4: FC8 sent no limit (server default 6, so with seven to nine finalists the balanced order decided which six were shown); the carousel now asks for 9, so N in the footer is every finalist (B-233). Item 5: the tile club line ('Yaba Athletic') is removed (adopted: hidden, not deleted) from the Figma component sets 6697:26234 / 6697:27448 until the carousel endpoint returns a club; it does not (B-234); re-adding the line is a separate later decision (B-232). Item 6: 'Your fans right now' and the 'Last week' board stay omitted from the Voting page (no data), as FC5 and FC8 built it. Item 7: the MVP launches with video LINKS only (the Final week composer takes a Video link; no media upload endpoint exists for posts or entries); reversing this needs a new founder decision and new rows (B-235). It conflicts with #378 for the four Partial composer frames of B-041; not resolved. Item 8: safeguarding-drafter drafts, for counsel, the DPIA and disclosure wording for minors' impression and view/dwell data (SG1, B-236); draft only, never approved; this PR does not touch the DPIA or the legal copy. Register: B-232 (K12, Figma), B-233 (FC9, apps/web), B-234 (W13, backend), B-235 (video upload decision record) and B-236 (SG1) added; status lines appended (original text unchanged) to B-041, B-082, B-091, B-092, B-093, B-094, B-095, B-097, B-098, B-099, B-123 and B-159 (12 rows). 236 B-IDs; 146 gap frames unchanged (Section 48). DERIVED: the K12, FC9, W13 and SG1 briefs were not available to the pass that wrote this entry; those four rows are read from the eight items and may move. NOT decided: retention periods for the points ledger, the ContestEngagement view rows and the impression rows; comment content screening; whether a minor finalist's club may be shown; whether the omitted Voting boards are removed or annotated; how a linked video is checked. (FORWARD-POINTERS) Dated notes appended (original text unchanged) to #383, #384, #388, #404, #405 and #412 (6 rows). NOT DONE: Decision Log numbers #293 and #294 are still absent from the table, as before.</w:t>
+            </w:r>
+            <w:r>
+              <w:t xml:space="preserve"> [2026-10-27: item 7 (links only) is REVERSED the same day by #419: the MVP builds post and contest-entry media upload (B-041); the work is B-237 to B-241 (Section 49 of the build register).]</w:t>
+            </w:r>
+          </w:p>
+        </w:tc>
+      </w:tr>
+      <w:tr>
+        <w:tc>
+          <w:tcPr>
+            <w:tcW w:type="dxa" w:w="500"/>
+          </w:tcPr>
+          <w:p>
+            <w:r>
+              <w:t>419</w:t>
+            </w:r>
+          </w:p>
+        </w:tc>
+        <w:tc>
+          <w:tcPr>
+            <w:tcW w:type="dxa" w:w="4700"/>
+          </w:tcPr>
+          <w:p>
+            <w:r>
+              <w:t>Founder decision 2026-10-27, taken after the links-only launch of #418 item 7 was recorded: the MVP BUILDS post media upload (build register B-041) instead of launching with video links only (10 items): (1) direct-to-storage upload through a one-time link into a quarantine prefix, then server verification, metadata stripping and a move to the public prefix; (2) images jpeg/png/webp up to 10 MB, up to 10 per post (the existing cap), re-encoded with EXIF stripped; (3) one video per post, mp4/webm/mov up to 100 MB and 120 seconds, no transcoding, metadata stripped by remux, and video uploads FAIL CLOSED (503, nothing stored) if the stripping tool is unavailable in the runtime; (4) every upload is 'pending' and invisible to everyone but the uploader until a moderator approves it in the admin review queue (B-037 server half); the automatic image check (B-036) later acts as a pre-filter only; (5) a post stays invisible to others until all its attached media are approved; the uploader sees 'under review'; (6) a rejected file shows its reason to the uploader in the page and by notification (as for profile pictures, #412 item 2) and the uploader may remove it and resubmit; (7) contest final entries use the same pipeline and the pasted video link input is retired; a final entry whose video is not approved by the reveal is not shown; (8) the same rules apply to minors; restricted-pending accounts cannot upload; (9) deleting a post or anonymising an account deletes its media objects; (10) the human actions at the launch gate are the R2 keys and the stripping tool on the host (B-207, B-090).</w:t>
+            </w:r>
+          </w:p>
+        </w:tc>
+        <w:tc>
+          <w:tcPr>
+            <w:tcW w:type="dxa" w:w="1850"/>
+          </w:tcPr>
+          <w:p>
+            <w:r>
+              <w:t>docs/decision-419-post-media-upload (docs only, 2026-10-27; founder decision 2026-10-27, items 1-10; sources: Decision Log #418 (item 7), #378, #371, #398, #411, #412, #404, #341, #366, #307; services/api/src/modules/feed/dto/create-post.dto.ts; docs/contest-spec.md sections 4 and 5; docs/build-register.md Sections 2, 3, 48 and 49; CLAUDE.md)</w:t>
+            </w:r>
+          </w:p>
+        </w:tc>
+        <w:tc>
+          <w:tcPr>
+            <w:tcW w:type="dxa" w:w="2300"/>
+          </w:tcPr>
+          <w:p>
+            <w:r>
+              <w:t>Decided 2026-10-27 (founder statement; build detail marked ADOPTED is a default and veto-able). Records the decision and register work only. Docs only: no code, schema, Figma, legal copy, DPIA or Log Book; docs/sprint-1-dpia-outline-draft.md, docs/contest-spec.md and docs/pending-copy-manifest.md are not touched. REVERSES #418 item 7 (links only), recorded earlier the same day: B-235 said a reversal needs a new founder decision and new rows; this entry is that decision and B-237 to B-241 are those rows. It settles the conflict B-235 recorded between links-only and #378 for the four Partial composer frames of B-041 (2009:5168, 5818:8962, 2009:2913, 5818:8997): the upload control is built, the frames are wired, not redrawn as link fields. Build, per item: (1) a signed-in, consent-confirmed, verified, profile-complete user asks for an upload and receives a one-time link to a quarantine prefix of the R2 bucket, uploads straight to storage, then calls a completion step that verifies the real object, strips metadata and moves it to the public prefix as a pending file (B-238). (2) and (3) the limits are those stated; a video upload answers 503 and stores nothing if the stripping tool is missing (B-238). (4) to (7) B-239 is the server half of the review queue, the visibility gate, the rejection reason and notification, and the contest-entry consequences; B-237 draws the frames; B-240 builds the web and admin screens. (8) the upload request carries the same guards as POST /posts. (9) B-238 deletes the objects. (10) R2 keys and the video stripping tool are human steps at the launch gate (B-207, B-090). ADOPTED defaults, veto-able: the total of files on a post stays at the existing cap of 10, a video counting toward it, images and one video may be mixed; the uploader sees their own pending files through a short-lived signed read link; weekly Contest entries are ordinary posts (POST /contest/entries { postId }) and pass the same gate, so an entry whose media is unapproved when its window ends simply does not qualify; the image re-encode utility is built once with B-205 (avatar, cover and post images); for post media the review queue (B-037) is the gate and the automatic image check (B-036) is not a prerequisite, while avatars and covers keep the #411 item 1 rule unchanged. NOT decided, found while writing this entry: (a) Post.mediaUrls accepts any URL on any host today (create-post.dto.ts, @IsUrl each, max 10), so an externally hosted file would bypass the review gate; item 7 retires the link input for final entries only; (b) the contest calendar leaves no review time for a last-minute final video - the week-4 upload deadline is 23:59:59 on day 24 and the reveal is 00:00:00 on day 25 - so options are a moderator service level, an earlier upload deadline, or accepting that late uploads are not shown; (c) whether reviewers of minors' media must be child-safety vetted (AdminUser.childSafetyVetted, as for concernsMinor reports); (d) item 9 meets #341: anonymisation keeps Post rows as '[deleted user]', so deleting the objects leaves a surviving post with no files; and whether the media of a reported post or a legal hold (#398) is kept when its author deletes it or is anonymised, and what the contest history shows for an anonymised finalist; (e) retention of quarantine, abandoned and rejected files, and the life of the one-time link; (f) whether HEIC photos are accepted (item 2 lists jpeg/png/webp); (g) the video stripping tool is not named by the founder - the build PR names it and says how the host gets it; (h) whether post upload may go live before the CSAM detection and reporting path (B-206) is answered by counsel - it now covers every post image and video; (i) there is no automatic pre-filter until B-036 and no queue-size alert, so all review is by hand. Register: B-237 (K13, Figma), B-238 (W14, backend upload pipeline), B-239 (W15, backend review, visibility and contest entries), B-240 (FC10, apps/web and apps/admin) and B-241 (SG2, drafting for counsel) added; status lines appended (original text unchanged) to B-041, B-036, B-037, B-205, B-206, B-207, B-235 and B-090 (8 rows). 241 B-IDs; 146 gap frames unchanged (Section 49). DERIVED: the K13, W14, W15, FC10 and SG2 briefs were not available to the pass that wrote this entry; those five rows are read from the ten items and may move. SG2 output is draft only and never approved (non-negotiable #2). (FORWARD-POINTERS) Dated notes appended (original text unchanged) to #418, #378, #371, #398, #412 and #307 (6 rows). NOT DONE: Decision Log numbers #293 and #294 are still absent from the table, as before.</w:t>
             </w:r>
           </w:p>
         </w:tc>

</xml_diff>

<commit_message>
docs: security baseline decisions (Decision Log #420-#429; register B-242 to B-256, wave W12)
Docs only. Records the founder's ten security-baseline decisions as Decision
Log #420 to #429 and adds Section 51 and wave W12 to docs/build-register.md
(241 -> 256 B-IDs, 146 gap frames unchanged). Records the Build Plan 5.7 vs
browser-storage deviation as found, not approved, now being corrected (#422).
Status lines on B-017, B-018, B-086, B-090, B-140, B-164, B-179; dated notes
on Decision Log #7, #20, #190, #407, #409. CLAUDE.md gets a status bullet and
the stale fc10 (#477) merge line is corrected.

Co-Authored-By: Claude Sonnet 5.5 <noreply@anthropic.com>
</commit_message>
<xml_diff>
--- a/docs/Soccernity_MVP_Build_Plan_v1.7.docx
+++ b/docs/Soccernity_MVP_Build_Plan_v1.7.docx
@@ -8926,7 +8926,7 @@
                 <w:sz w:val="19"/>
                 <w:szCs w:val="19"/>
               </w:rPr>
-              <w:t xml:space="preserve">Resolved — unblocks Sprint 1</w:t>
+              <w:t>Resolved — unblocks Sprint 1 [2026-10-27: #422 (security baseline): FOUND, NOT APPROVED, NOW BEING CORRECTED: section 5.7 says the refresh token is stored in an httpOnly, Secure, SameSite cookie on web and never in localStorage; the implementation kept the access and refresh tokens in sessionStorage / localStorage (apps/web lib/session.ts, apps/admin lib/adminSession.ts) and returned the refresh token in the response body. No entry recorded or approved that deviation. Build Plan 5.7 stands; B-245 to B-248 bring the code to it (SameSite=Strict, host-only, access token in memory, native keeps body tokens). #429 refines the rate-limiting paragraph of 5.7 for shared school and club networks (login keyed per account, Redis storage). The text of 5.7 itself is not edited.]</w:t>
             </w:r>
           </w:p>
         </w:tc>
@@ -10258,7 +10258,7 @@
               <w:t>Resolved (triaged) — Tier 1 fixed immediately; Tier 2 open, scheduled for a Sprint 2 NestJS/React-Router major-upgrade ticket; Tier 3 deferred until apps/mobile has real code -- NestJS 10-&gt;11 sub-item closed by Decision Log #24 (see below); React Router 6-&gt;7 remains open.</w:t>
               <w:br/>
               <w:br/>
-              <w:t>SUPERSEDED IN PART by Decision Log #27/#28: the “React Router 6→7 remains open” line above is no longer accurate — #27 shipped React 19 (clearing the blocker #25 recorded), and #28 shipped React Router 8 on top of it. Tier 2's react-router sub-item is now fully closed; see #25/#27/#28 for the resolution chain.</w:t>
+              <w:t>SUPERSEDED IN PART by Decision Log #27/#28: the “React Router 6→7 remains open” line above is no longer accurate — #27 shipped React 19 (clearing the blocker #25 recorded), and #28 shipped React Router 8 on top of it. Tier 2's react-router sub-item is now fully closed; see #25/#27/#28 for the resolution chain. [2026-10-27: #423: the dependency findings are patched now (B-242, non-breaking updates only), scanned continuously in CI (B-250: Dependabot, CodeQL, secret scanning, an npm audit gate), and apps/admin react-router-dom 6 is upgraded in a separate breaking PR (B-255). The apps/mobile transitive advisories (Tier 3) stay deferred because apps/mobile has no application code.]</w:t>
             </w:r>
           </w:p>
         </w:tc>
@@ -17771,7 +17771,7 @@
               <w:t>Resolved -- deliberately deferred to keep this PR's verification scope to schema + auth-isolation + CRUD. A real follow-up candidate: admin/moderator accounts are a smaller, higher-value target set and may warrant a lower max-attempts limit than the shared fan-facing bucket.</w:t>
             </w:r>
             <w:r>
-              <w:t xml:space="preserve"> RESOLVED (sprint-2/admin-login-rate-limit): POST /admin/auth/login now uses a per-handler @AuthRateLimit({ limit: 5, windowMs: 15 min }) override, independent of the User-facing /auth/login bucket. Covered by test/admin-login-rate-limit.e2e-spec.ts.</w:t>
+              <w:t xml:space="preserve"> RESOLVED (sprint-2/admin-login-rate-limit): POST /admin/auth/login now uses a per-handler @AuthRateLimit({ limit: 5, windowMs: 15 min }) override, independent of the User-facing /auth/login bucket. Covered by test/admin-login-rate-limit.e2e-spec.ts. [2026-10-27: #429: the admin login limit of this entry (5 per 15 minutes) is unchanged; the user-facing login limit becomes per account (5 failed attempts per 15 minutes) with a per-IP ceiling, and the auth limiters, this one included, are stored in Redis (#421). Registered as B-256.]</w:t>
             </w:r>
           </w:p>
         </w:tc>
@@ -27410,7 +27410,7 @@
               <w:t>Resolved -- recorded. FOUNDER-ADOPTED DEFAULTS, VETO-ABLE, all seven items. DECIDED, NOT BUILT, except item 6, which confirms what is already built (W3d, PR #424). Item numbers are the order of the founder's instruction. Original text of every entry named in the forward-pointers below is unchanged (dated notes appended). Source: the QA run of PR #426 (docs/qa-e2e-onboarding-report.md): 165 browser tests against the real API, 17 defects (D-01 to D-17) and 3 gaps (G-1 to G-3). (1) CORS (QA D-01, BLOCKER / SAFEGUARDING). apps/web/src/api/auth.ts registerUser sends credentials 'include' and services/api/src/main.ts calls app.enableCors() with no options (it answers '*'); browsers refuse that combination, so sign-up fails in every browser when web and API are on different origins, as in production, and no request reaches the API. Decided: registerUser stops sending credentials 'include'; the API restricts CORS to the origins in WEB_APP_BASE_URL and a new ADMIN_APP_BASE_URL, plus localhost origins in development. The new variable is added to render.yaml (both services), .env.example and the env-completeness check; the founder sets its production value in Render. The API sets no cookie and returns the refresh token in the response body, so the credentials option appears to have no function (to confirm in the build PR). Not decided: what the API does when a variable is unset in production, and origins other than the two apps. Build row B-140 (W1). (2) AGE-5 FLOOR (QA D-02, BLOCKER / SAFEGUARDING). #19 says signup is hard-blocked below age 5 regardless of guardian consent, but the floor exists only in the web Age Gate: POST /auth/register with a date of birth 4 years ago and a valid guardian block returns 201 and creates the account and the guardian request. Decided: the floor is enforced server-side with a 400; exactly age 5 stays accepted. Not decided: the error code and message; the build PR checks the DOB-correction tool (#390) cannot set a date of birth below the floor. Build row B-141 (W1). (3) USERNAME FILTER (QA D-06). Hate and sexual terms glued to other letters (xxhitlerxx, nazifan) are accepted because the filter's EXACT list matches only the whole handle or an underscore token. Decided: long, unambiguous terms are matched by CONTAINS, with a tested list of innocent words that must still be accepted; short or ambiguous terms stay exact. Not decided: the term lists and the length threshold (set in the build PR, for founder review). Build row B-142 (W4). (4) 'FOLLOW' PROMISES (QA D-13). The restricted-pending view says 'Browse and follow' and the guardian page lists 'Follow teams and check scores', but a restricted-pending minor's follow is refused with 403 (#370). Decided: both screens stop promising follow and the wording says what works, tagged [COPY PENDING LEGAL REVIEW] and added to the pending-copy manifest; the guardian-page change is guardian-visible, so CONSENT_SCREEN_VERSION and the tripwire hash (#348) are bumped under the rule of B-130. The Figma frames are not checked here for the same promise. Build row B-154 (W9). (5) GUARDIAN APPROVAL SCREEN (QA D-09). After approval the guardian is told 'The account is now active', but the minor still has to verify email and create a profile. Decided: the screen no longer says the account is active; it says the approval is recorded and registration continues ([COPY PENDING LEGAL REVIEW]), matching the Figma Approved screens (#403 item 3). Build row B-153 (W9). (6) STALE-DECLINE RE-SEND STAYS. A guardian who declined at decline 1 or 2 is still sent a new consent request by the platform when the row lapses after 14 days (#406 item 1, built as B-126), after the minor is warned. This settles judgment call 1 of docs/backend-w3d-report.md (section 5). The alternative, warning the minor and closing after a further window without re-sending, stays a one-place change (GuardianStaleDeclineSweepService); the cap of three declines bounds the re-sends. Counsel review of legal copy v0.8 Part 4.4 is still pending. Rows B-126, B-102. (7) LEGACY SAVED FRAME. The Figma frame 1460:8940 (own Saved, absolute layout) is archived, now that 6747:29445 replaces it (Figma pass K2, candidate 2): hidden and renamed 'ARCHIVED - ...', nothing deleted, after a page-wide reference scan, and added to docs/figma-archive-index.md. Build row B-144 (W0). (REGISTER) docs/build-register.md Section 25: B-140 to B-162 added (23 rows); every QA defect and gap, every open item of the W3d report (section 6) and every K2 candidate (1-10) is mapped to a row, reused (B-120, B-128, B-129, B-130, B-131, B-132, B-133, B-134, B-078, B-138) or new. D-01 and D-02 are marked BLOCKER / SAFEGUARDING. Status lines on 23 existing rows. 162 B-IDs; 146 gap frames unchanged. Arithmetic: Section 25g. (FORWARD-POINTERS) Dated notes appended (original text unchanged) to #19, #199, #337, #338, #339, #340, #368, #369, #370, #377, #389, #395, #402, #403, #405 and #406 (the W3d report's section 7 pointers, the status of K2 and of the QA run). NOT DECIDED HERE: the behaviour when an origin variable is unset in production, and any further CORS origin; the error code of the 400; the term and innocent-word lists; the Figma side of the 'follow' promise; the post-decline state of the guardian confirm page (D-10, same fault as the footnote of #406 item 13, still not covered by the founder's wording); K2 candidates 1, 3, 4, 6, 7, 8 (register rows B-147 to B-150 are OPEN); the W3d open items on earlier verification links (B-160) and on a non-active account with a stale decline (B-161); counsel wording of every [COPY PENDING LEGAL REVIEW] string. [2026-10-19: Built since: items 1, 2 and 3 and the expired-consent email by backend/w3e (PR #429: B-140, B-141, B-142; the email half of B-158); items 4 and 5 and QA defects D-03 to D-05 and D-08 to D-17 by FC3a (PR #430; D-15 and D-17 in part); D-07, G-1 and G-2 by FC3b (PR #431); item 7 (the archive of 1460:8940) by Figma pass K3 (PR #428, B-144). The open point of item 1 (what the API does when an origin variable is unset in production) is decided by #408 item 1: it refuses to boot (B-163). Item 3 is amended by #408 item 3: the exact whole handles nazif, nazifa and nazifah are allowed (B-165) and the term lists W3e built stay open for review. The error code below_minimum_age and its message are W3e's choice and are still not confirmed. The QA harness's CORS proxy is gone (PR #429).] [2026-10-20: #409 item 1 fixes the origins the CORS allow-list names: WEB_APP_BASE_URL is the https origin of the web static site and ADMIN_APP_BASE_URL that of the admin static site, each separate from the API's own origin (B-179). Both must be set to the final https origins in production (the API refuses to boot otherwise, B-163). Nothing is deployed before the launch gate B-090.] [2026-10-20: the #409 note above merged in PR #436 (A7). W3f (PR #434) built the boot refusal for an unset or invalid origin variable (the open point of item 1, B-163) and the Nazif allow-list (item 3, B-165); #410 item 2 changes the allow-list rule (B-181). Item 4: the Restricted Pending frames 5108:6630 / 5531:7461 still carry the 'Browse and follow' wording the code dropped (D-13); K5 fixes them (B-191, #410 item 8).]</w:t>
             </w:r>
             <w:r>
-              <w:t xml:space="preserve"> [2026-10-24: K5 (PR #438), item 4 (QA D-13): the Restricted Pending frames 5108:6630 / 5531:7461 now say 'Browse and read' instead of 'Browse and follow' (B-191).] [2026-10-25: #413 item 4: the next QA run is a full run of the 180-test Playwright suite (e2e/), not a subset; FC5 re-ran only specs 01 and 07 (B-219).] [2026-10-26: #417: the second QA run (PR #460) is accepted at 221 Playwright tests (192 in specs 00-14 plus 29 in spec 15), and D-18 to D-22 were fixed in FIX1 (PR #461); the '180' figure is stale. The live Contest phases get browser coverage in the next QA run (B-231).]</w:t>
+              <w:t xml:space="preserve"> [2026-10-24: K5 (PR #438), item 4 (QA D-13): the Restricted Pending frames 5108:6630 / 5531:7461 now say 'Browse and read' instead of 'Browse and follow' (B-191).] [2026-10-25: #413 item 4: the next QA run is a full run of the 180-test Playwright suite (e2e/), not a subset; FC5 re-ran only specs 01 and 07 (B-219).] [2026-10-26: #417: the second QA run (PR #460) is accepted at 221 Playwright tests (192 in specs 00-14 plus 29 in spec 15), and D-18 to D-22 were fixed in FIX1 (PR #461); the '180' figure is stale. The live Contest phases get browser coverage in the next QA run (B-231).] [2026-10-27: #422: the credentials removal of item 1 is an unblock for the CORS wildcard defect and an interim state; exact-origin CORS stays, and credentials 'include' returns for cookie-authenticated routes (exactly WEB_APP_BASE_URL / ADMIN_APP_BASE_URL, never a wildcard) when the httpOnly refresh cookie of Build Plan 5.7 is built (B-245 to B-248). The multi-tab refresh lock of B-164 keeps its purpose; its token re-read becomes a BroadcastChannel.]</w:t>
             </w:r>
           </w:p>
         </w:tc>
@@ -27497,7 +27497,7 @@
           </w:tcPr>
           <w:p>
             <w:r>
-              <w:t>Resolved -- recorded. FOUNDER-ADOPTED DEFAULTS, VETO-ABLE, all three items. DECIDED, NOT BUILT, and DEFERRED to the launch gate B-090. Item numbers are the order of the founder's instruction. Original text of every entry named in the forward-pointers below is unchanged (dated notes appended). render.yaml and docs/deployment.md are NOT changed by the PR that records this entry. (1) HOSTING SHAPE ON RENDER. apps/web and apps/admin are deployed separately from each other and from the API, as three Render services per environment: the API (the web service defined in render.yaml), the web app (a static site) and the admin app (a static site), each on its own https origin (for example the main domain or www for web, an admin subdomain for admin, an api subdomain for the API; the final names are not decided). Reasons recorded by the founder: the admin bundle is never served to the public; admin can later be restricted (for example by IP; not designed); and it matches the separate CORS origins (WEB_APP_BASE_URL, ADMIN_APP_BASE_URL, #407) and the separate admin auth domain (ADMIN_JWT_SECRET). Each static site needs VITE_API_BASE_URL set to the API's https address at BUILD time (baked into the build; a change means a rebuild), a rewrite rule sending every path to index.html (single-page apps), and the web build must use npm run build:release so the pending-copy release check runs. The API's WEB_APP_BASE_URL and ADMIN_APP_BASE_URL must be set to the final https origins (in production the API refuses to boot on an unset or invalid one, #408 item 1, B-163). Staging gets the same three services. Checked in the repo on 2026-10-20: render.yaml defines only the two API services (soccernity-api-staging, soccernity-api); the static sites are NOT defined in render.yaml, docs/deployment.md or any workflow; apps/web and apps/admin both read VITE_API_BASE_URL; build:release is a ROOT script that builds both apps and then runs check:pending-copy over apps/web/dist and apps/admin/dist, and that check fails today by design until counsel clears the tagged strings (B-124), so how the two sites' build commands use it is for the build row (B-179) to choose and state. (2) THIS STAYS DEFERRED to the launch gate (B-090). The founder is saving money; Render and production wiring are not pushed before then (restates #403 item 18 and extends it to the two static sites). (3) LAUNCH-GATE RUNBOOK. When the launch gate starts, one deliverable is produced: a complete, plain-language, step-by-step deployment and migration guide for a non-technical founder covering every part of the platform, so nothing needs back-and-forth. Planned file docs/launch-gate-runbook.md (the format may change to a Docs artifact; decided then). It is written at the launch gate from the repo and the vendors' current documentation as they are then, never from memory, and it supersedes and links docs/deployment.md. Its required scope, recorded now so nothing is lost: a glossary of every term; what the founder does versus what an agent does versus what needs counsel; the order of operations; for each part the exact click-by-click steps, which value goes in which setting, how to check it worked and what to do if it did not: Neon production and staging databases and branches, running the migrations (including the free-plan pre-deploy limitation) and the DOB backfill; Upstash Redis; generating and storing every secret (JWT_SECRET, ADMIN_JWT_SECRET, DOB_ENCRYPTION_KEY - one key protects both the date of birth and the 2FA secrets, #405 item 8 - per environment, with the loss-and-rollback implications from docs/dob-encryption-rollback.md); the API service on Render and its health check; the web and admin static sites (build command, publish directory, VITE_API_BASE_URL, rewrite rule, the build:release gate); custom domains, DNS and https for all three; CORS origins; Postmark (account, sender domain, SPF/DKIM/DMARC, the email templates and the counsel-pending wording); MaxMind GeoLite2 (account id, licence key, what happens without it); Stripe (live keys, webhook, the card-verification flow); Cloudflare R2 media storage (bucket, keys, the public base URL gap); the Highlightly sports data key and daily budget; Sentry; creating the first superadmin and admin accounts; branch and release strategy (staging versus main); the pending-copy release check and counsel sign-off; legal pages, DPIA and safeguarding sign-off items still open at that time; backups, monitoring and alerting; a post-deploy smoke test (the QA suite against staging, then production); rollback for each part; ongoing monthly costs; and a final go/no-go checklist. It must list every launch-gate item still open in docs/build-register.md at that time so none is dropped. (REGISTER) New rows B-179 (render.yaml and docs/deployment.md gain the two static sites for staging and production with the settings of item 1; owner backend-api; launch gate; DEFERRED; depends on B-090) and B-180 (the launch-gate runbook with the scope of item 3; owner docs agent; launch gate; DEFERRED; depends on B-179 and on every open launch-gate row); status lines on B-090 (asked for) and B-088 (added: B-088 is the generic hosting row, B-179 its repo-side definition; B-088 stays open for the account and domain side). Dated notes appended to #26 (hosting), #403 (the row that records the production-wiring deferral, item 18) and #407 (CORS origins). STILL OPEN: the final domain and subdomain names; the Render plan and monthly cost of two static sites per environment; how the two sites' build commands use build:release and how a failing release check stops a Render deploy (to be confirmed from Render's current documentation at the gate); whether and how admin is later restricted; the runbook's format; whether 'docs agent' (not among the eight agents in .claude/agents/) means the session that writes it. [2026-10-20: merged in PR #436 (A7).]</w:t>
+              <w:t>Resolved -- recorded. FOUNDER-ADOPTED DEFAULTS, VETO-ABLE, all three items. DECIDED, NOT BUILT, and DEFERRED to the launch gate B-090. Item numbers are the order of the founder's instruction. Original text of every entry named in the forward-pointers below is unchanged (dated notes appended). render.yaml and docs/deployment.md are NOT changed by the PR that records this entry. (1) HOSTING SHAPE ON RENDER. apps/web and apps/admin are deployed separately from each other and from the API, as three Render services per environment: the API (the web service defined in render.yaml), the web app (a static site) and the admin app (a static site), each on its own https origin (for example the main domain or www for web, an admin subdomain for admin, an api subdomain for the API; the final names are not decided). Reasons recorded by the founder: the admin bundle is never served to the public; admin can later be restricted (for example by IP; not designed); and it matches the separate CORS origins (WEB_APP_BASE_URL, ADMIN_APP_BASE_URL, #407) and the separate admin auth domain (ADMIN_JWT_SECRET). Each static site needs VITE_API_BASE_URL set to the API's https address at BUILD time (baked into the build; a change means a rebuild), a rewrite rule sending every path to index.html (single-page apps), and the web build must use npm run build:release so the pending-copy release check runs. The API's WEB_APP_BASE_URL and ADMIN_APP_BASE_URL must be set to the final https origins (in production the API refuses to boot on an unset or invalid one, #408 item 1, B-163). Staging gets the same three services. Checked in the repo on 2026-10-20: render.yaml defines only the two API services (soccernity-api-staging, soccernity-api); the static sites are NOT defined in render.yaml, docs/deployment.md or any workflow; apps/web and apps/admin both read VITE_API_BASE_URL; build:release is a ROOT script that builds both apps and then runs check:pending-copy over apps/web/dist and apps/admin/dist, and that check fails today by design until counsel clears the tagged strings (B-124), so how the two sites' build commands use it is for the build row (B-179) to choose and state. (2) THIS STAYS DEFERRED to the launch gate (B-090). The founder is saving money; Render and production wiring are not pushed before then (restates #403 item 18 and extends it to the two static sites). (3) LAUNCH-GATE RUNBOOK. When the launch gate starts, one deliverable is produced: a complete, plain-language, step-by-step deployment and migration guide for a non-technical founder covering every part of the platform, so nothing needs back-and-forth. Planned file docs/launch-gate-runbook.md (the format may change to a Docs artifact; decided then). It is written at the launch gate from the repo and the vendors' current documentation as they are then, never from memory, and it supersedes and links docs/deployment.md. Its required scope, recorded now so nothing is lost: a glossary of every term; what the founder does versus what an agent does versus what needs counsel; the order of operations; for each part the exact click-by-click steps, which value goes in which setting, how to check it worked and what to do if it did not: Neon production and staging databases and branches, running the migrations (including the free-plan pre-deploy limitation) and the DOB backfill; Upstash Redis; generating and storing every secret (JWT_SECRET, ADMIN_JWT_SECRET, DOB_ENCRYPTION_KEY - one key protects both the date of birth and the 2FA secrets, #405 item 8 - per environment, with the loss-and-rollback implications from docs/dob-encryption-rollback.md); the API service on Render and its health check; the web and admin static sites (build command, publish directory, VITE_API_BASE_URL, rewrite rule, the build:release gate); custom domains, DNS and https for all three; CORS origins; Postmark (account, sender domain, SPF/DKIM/DMARC, the email templates and the counsel-pending wording); MaxMind GeoLite2 (account id, licence key, what happens without it); Stripe (live keys, webhook, the card-verification flow); Cloudflare R2 media storage (bucket, keys, the public base URL gap); the Highlightly sports data key and daily budget; Sentry; creating the first superadmin and admin accounts; branch and release strategy (staging versus main); the pending-copy release check and counsel sign-off; legal pages, DPIA and safeguarding sign-off items still open at that time; backups, monitoring and alerting; a post-deploy smoke test (the QA suite against staging, then production); rollback for each part; ongoing monthly costs; and a final go/no-go checklist. It must list every launch-gate item still open in docs/build-register.md at that time so none is dropped. (REGISTER) New rows B-179 (render.yaml and docs/deployment.md gain the two static sites for staging and production with the settings of item 1; owner backend-api; launch gate; DEFERRED; depends on B-090) and B-180 (the launch-gate runbook with the scope of item 3; owner docs agent; launch gate; DEFERRED; depends on B-179 and on every open launch-gate row); status lines on B-090 (asked for) and B-088 (added: B-088 is the generic hosting row, B-179 its repo-side definition; B-088 stays open for the account and domain side). Dated notes appended to #26 (hosting), #403 (the row that records the production-wiring deferral, item 18) and #407 (CORS origins). STILL OPEN: the final domain and subdomain names; the Render plan and monthly cost of two static sites per environment; how the two sites' build commands use build:release and how a failing release check stops a Render deploy (to be confirmed from Render's current documentation at the gate); whether and how admin is later restricted; the runbook's format; whether 'docs agent' (not among the eight agents in .claude/agents/) means the session that writes it. [2026-10-20: merged in PR #436 (A7).] [2026-10-27: #420 and #422: B-179 gains the static-site security headers and strict CSP (script-src 'self'; connect-src the API and object-store origins; img-src / media-src the public bucket origin, and for apps/admin also the S3 endpoint origin; no unsafe-inline) and the custom same-site domains of B-249. Both stay deferred to the launch gate B-090.]</w:t>
             </w:r>
           </w:p>
         </w:tc>
@@ -27942,6 +27942,426 @@
           <w:p>
             <w:r>
               <w:t>Decided 2026-10-27 (founder statement; build detail marked ADOPTED is a default and veto-able). Records the decision and register work only. Docs only: no code, schema, Figma, legal copy, DPIA or Log Book; docs/sprint-1-dpia-outline-draft.md, docs/contest-spec.md and docs/pending-copy-manifest.md are not touched. REVERSES #418 item 7 (links only), recorded earlier the same day: B-235 said a reversal needs a new founder decision and new rows; this entry is that decision and B-237 to B-241 are those rows. It settles the conflict B-235 recorded between links-only and #378 for the four Partial composer frames of B-041 (2009:5168, 5818:8962, 2009:2913, 5818:8997): the upload control is built, the frames are wired, not redrawn as link fields. Build, per item: (1) a signed-in, consent-confirmed, verified, profile-complete user asks for an upload and receives a one-time link to a quarantine prefix of the R2 bucket, uploads straight to storage, then calls a completion step that verifies the real object, strips metadata and moves it to the public prefix as a pending file (B-238). (2) and (3) the limits are those stated; a video upload answers 503 and stores nothing if the stripping tool is missing (B-238). (4) to (7) B-239 is the server half of the review queue, the visibility gate, the rejection reason and notification, and the contest-entry consequences; B-237 draws the frames; B-240 builds the web and admin screens. (8) the upload request carries the same guards as POST /posts. (9) B-238 deletes the objects. (10) R2 keys and the video stripping tool are human steps at the launch gate (B-207, B-090). ADOPTED defaults, veto-able: the total of files on a post stays at the existing cap of 10, a video counting toward it, images and one video may be mixed; the uploader sees their own pending files through a short-lived signed read link; weekly Contest entries are ordinary posts (POST /contest/entries { postId }) and pass the same gate, so an entry whose media is unapproved when its window ends simply does not qualify; the image re-encode utility is built once with B-205 (avatar, cover and post images); for post media the review queue (B-037) is the gate and the automatic image check (B-036) is not a prerequisite, while avatars and covers keep the #411 item 1 rule unchanged. NOT decided, found while writing this entry: (a) Post.mediaUrls accepts any URL on any host today (create-post.dto.ts, @IsUrl each, max 10), so an externally hosted file would bypass the review gate; item 7 retires the link input for final entries only; (b) the contest calendar leaves no review time for a last-minute final video - the week-4 upload deadline is 23:59:59 on day 24 and the reveal is 00:00:00 on day 25 - so options are a moderator service level, an earlier upload deadline, or accepting that late uploads are not shown; (c) whether reviewers of minors' media must be child-safety vetted (AdminUser.childSafetyVetted, as for concernsMinor reports); (d) item 9 meets #341: anonymisation keeps Post rows as '[deleted user]', so deleting the objects leaves a surviving post with no files; and whether the media of a reported post or a legal hold (#398) is kept when its author deletes it or is anonymised, and what the contest history shows for an anonymised finalist; (e) retention of quarantine, abandoned and rejected files, and the life of the one-time link; (f) whether HEIC photos are accepted (item 2 lists jpeg/png/webp); (g) the video stripping tool is not named by the founder - the build PR names it and says how the host gets it; (h) whether post upload may go live before the CSAM detection and reporting path (B-206) is answered by counsel - it now covers every post image and video; (i) there is no automatic pre-filter until B-036 and no queue-size alert, so all review is by hand. Register: B-237 (K13, Figma), B-238 (W14, backend upload pipeline), B-239 (W15, backend review, visibility and contest entries), B-240 (FC10, apps/web and apps/admin) and B-241 (SG2, drafting for counsel) added; status lines appended (original text unchanged) to B-041, B-036, B-037, B-205, B-206, B-207, B-235 and B-090 (8 rows). 241 B-IDs; 146 gap frames unchanged (Section 49). DERIVED: the K13, W14, W15, FC10 and SG2 briefs were not available to the pass that wrote this entry; those five rows are read from the ten items and may move. SG2 output is draft only and never approved (non-negotiable #2). (FORWARD-POINTERS) Dated notes appended (original text unchanged) to #418, #378, #371, #398, #412 and #307 (6 rows). NOT DONE: Decision Log numbers #293 and #294 are still absent from the table, as before.</w:t>
+            </w:r>
+          </w:p>
+        </w:tc>
+      </w:tr>
+      <w:tr>
+        <w:tc>
+          <w:tcPr>
+            <w:tcW w:type="dxa" w:w="500"/>
+          </w:tcPr>
+          <w:p>
+            <w:r>
+              <w:t>420</w:t>
+            </w:r>
+          </w:p>
+        </w:tc>
+        <w:tc>
+          <w:tcPr>
+            <w:tcW w:type="dxa" w:w="4700"/>
+          </w:tcPr>
+          <w:p>
+            <w:r>
+              <w:t>Founder decision 2026-10-27 (security baseline, item 1 of 10; founder-adopted default, veto-able): API security headers. services/api sends HTTP security headers through helmet: a Content-Security-Policy of default-src 'none' with frame-ancestors 'none' (the API serves JSON only), HSTS in production, Referrer-Policy no-referrer, and no X-Powered-By. The web and admin static sites get their own headers and a strict CSP at the launch gate, inside B-179 (deferred to B-090): script-src 'self'; connect-src the API origin AND the object-store S3 endpoint origin (browser uploads PUT to one-time signed links on it); img-src and media-src the public bucket origin (S3_PUBLIC_BASE_URL) for apps/web, and for apps/admin ALSO the S3 endpoint origin (the media review queue plays a 5-minute signed link served from it); no unsafe-inline. The static-site build must be given both storage origins. The CORS rule on the bucket that allows PUT from the web app is already a documented human step in docs/deployment.md; it is referenced here, not duplicated.</w:t>
+            </w:r>
+          </w:p>
+        </w:tc>
+        <w:tc>
+          <w:tcPr>
+            <w:tcW w:type="dxa" w:w="1850"/>
+          </w:tcPr>
+          <w:p>
+            <w:r>
+              <w:t>docs/decisions-security-baseline-2026-10-27 (docs only, 2026-10-27; founder statement, item 1 of 10; sources: Build Plan Section 5.7 (Decision Log #7), Decision Log #20, #26, #190, #407, #409; services/api/src/main.ts, services/api/src/validate-runtime-env.ts, services/api/src/crypto/dob-crypto.ts, apps/web/src/lib/session.ts, apps/admin/src/lib/adminSession.ts, .github/workflows/ci.yml; docs/build-register.md Sections 2, 3 and 51; CLAUDE.md)</w:t>
+            </w:r>
+          </w:p>
+        </w:tc>
+        <w:tc>
+          <w:tcPr>
+            <w:tcW w:type="dxa" w:w="2300"/>
+          </w:tcPr>
+          <w:p>
+            <w:r>
+              <w:t>Decided 2026-10-27 (founder statement; build detail is an adopted default and veto-able). DECIDED, NOT BUILT. Found on origin/main 25c1b1b: helmet is not a dependency of services/api and main.ts sets no security headers (it applies trust proxy and exact-origin CORS only); neither static site has a definition in render.yaml (B-179 is deferred). Register: B-243 (API headers, W12, backend-api). The static-site headers and CSP are appended to B-179 as a status line, not a new row, and stay deferred to the launch gate (#403 item 18, #409 item 2). NOT decided: how the static host applies the headers (the B-179 build PR chooses and states it); the final domain names (B-249); whether the API serves any HTML route that default-src 'none' would break (the B-243 build PR checks before relying on it). (FORWARD-POINTERS) Dated note appended (original text unchanged) to #409. NOT DONE: Decision Log numbers #293 and #294 are still absent from the table, as before.</w:t>
+            </w:r>
+          </w:p>
+        </w:tc>
+      </w:tr>
+      <w:tr>
+        <w:tc>
+          <w:tcPr>
+            <w:tcW w:type="dxa" w:w="500"/>
+          </w:tcPr>
+          <w:p>
+            <w:r>
+              <w:t>421</w:t>
+            </w:r>
+          </w:p>
+        </w:tc>
+        <w:tc>
+          <w:tcPr>
+            <w:tcW w:type="dxa" w:w="4700"/>
+          </w:tcPr>
+          <w:p>
+            <w:r>
+              <w:t>Founder decision 2026-10-27 (security baseline, item 2 of 10; founder-adopted default, veto-able): a global rate limit in services/api. Signed-in requests 120 per 60 seconds per user; anonymous requests 600 per 60 seconds per IP; writes (POST, PUT, PATCH, DELETE) 30 per 60 seconds; upload routes that pass the bytes through the API (avatar, cover, admin media upload) 10 per 10 minutes. The key is the user id, else the IP. Exempt: /health and every route with its own limiter, including POST /media/uploads (its own per-user limit, POST_MEDIA_UPLOAD_RATE_LIMIT_*, counted from PostMedia rows). A limited request gets 429 with Retry-After. All values are environment-driven. Storage: Redis for the auth and security limiters; the general limiter is in-memory at launch and fails open; it moves to Redis once there is more than one API instance.</w:t>
+            </w:r>
+          </w:p>
+        </w:tc>
+        <w:tc>
+          <w:tcPr>
+            <w:tcW w:type="dxa" w:w="1850"/>
+          </w:tcPr>
+          <w:p>
+            <w:r>
+              <w:t>docs/decisions-security-baseline-2026-10-27 (docs only, 2026-10-27; founder statement, item 2 of 10; sources: Build Plan Section 5.7 (Decision Log #7), Decision Log #20, #26, #190, #407, #409; services/api/src/main.ts, services/api/src/validate-runtime-env.ts, services/api/src/crypto/dob-crypto.ts, apps/web/src/lib/session.ts, apps/admin/src/lib/adminSession.ts, .github/workflows/ci.yml; docs/build-register.md Sections 2, 3 and 51; CLAUDE.md)</w:t>
+            </w:r>
+          </w:p>
+        </w:tc>
+        <w:tc>
+          <w:tcPr>
+            <w:tcW w:type="dxa" w:w="2300"/>
+          </w:tcPr>
+          <w:p>
+            <w:r>
+              <w:t>Decided 2026-10-27 (founder statement; build detail is an adopted default and veto-able). DECIDED, NOT BUILT. Found on origin/main 25c1b1b: the only throttler is the named 'auth' throttler of AuthRateLimitModule (5 requests per 60 seconds by default, applied by @AuthRateLimit() on a few auth routes) plus the guardian-withdrawal limiter and the post-media per-user limit; there is no global limiter, so every other route (feed, search, profile reads, writes) is unlimited. Register: B-244 (W12, backend-api); the auth limits for shared networks are B-256 (#429), which depends on it. Every new variable must also be added to render.yaml (both services), .env.example and the env-completeness spec (B-018). NOT decided: the numeric defaults are the founder's; the in-memory limiter is per API instance, so with more than one instance the effective limit multiplies until it moves to Redis (the move is part of the same decision, trigger = more than one instance). (FORWARD-POINTERS) None. NOT DONE: Decision Log numbers #293 and #294 are still absent from the table, as before.</w:t>
+            </w:r>
+          </w:p>
+        </w:tc>
+      </w:tr>
+      <w:tr>
+        <w:tc>
+          <w:tcPr>
+            <w:tcW w:type="dxa" w:w="500"/>
+          </w:tcPr>
+          <w:p>
+            <w:r>
+              <w:t>422</w:t>
+            </w:r>
+          </w:p>
+        </w:tc>
+        <w:tc>
+          <w:tcPr>
+            <w:tcW w:type="dxa" w:w="4700"/>
+          </w:tcPr>
+          <w:p>
+            <w:r>
+              <w:t>Founder decision 2026-10-27 (security baseline, item 3 of 10; ADOPTED by the founder 2026-10-27): token storage. Build Plan 5.7 stands and SUPERSEDES THE INTERIM IMPLEMENTATION, not its reasons. The refresh token moves to an httpOnly, Secure, SameSite=Strict, host-only cookie with Path /auth and /admin/auth; the access token is held in memory only; 'Stay signed in' = a persistent versus a session cookie; native clients keep body tokens; a cookie-authenticated refresh never returns the refresh token in the body; every cookie-authenticated route checks the Origin header. What is superseded (the interim code, not the reasons for it): the B-140 credentials removal (an unblock for the CORS wildcard defect; exact-origin CORS stays), the B-017 session.ts stopgap (its comments flag the AuthContext refactor as a follow-up), and the B-164 lock mechanism (its purpose stays; the token re-read becomes a BroadcastChannel). Phased: the API additive and opt-in (B-245), then apps/web (B-246), then apps/admin (B-247), then the final PR flips the browser default (B-248). The post-media frontend PR (fc10, #477) has merged: its API clients use authedFetch / adminFetch and its bucket-upload XMLHttpRequest carries no token, so B-246 and B-247 are not blocked by it. Staging needs a same-site custom subdomain (B-249, launch gate).</w:t>
+            </w:r>
+          </w:p>
+        </w:tc>
+        <w:tc>
+          <w:tcPr>
+            <w:tcW w:type="dxa" w:w="1850"/>
+          </w:tcPr>
+          <w:p>
+            <w:r>
+              <w:t>docs/decisions-security-baseline-2026-10-27 (docs only, 2026-10-27; founder statement, item 3 of 10; sources: Build Plan Section 5.7 (Decision Log #7), Decision Log #20, #26, #190, #407, #409; services/api/src/main.ts, services/api/src/validate-runtime-env.ts, services/api/src/crypto/dob-crypto.ts, apps/web/src/lib/session.ts, apps/admin/src/lib/adminSession.ts, .github/workflows/ci.yml; docs/build-register.md Sections 2, 3 and 51; CLAUDE.md)</w:t>
+            </w:r>
+          </w:p>
+        </w:tc>
+        <w:tc>
+          <w:tcPr>
+            <w:tcW w:type="dxa" w:w="2300"/>
+          </w:tcPr>
+          <w:p>
+            <w:r>
+              <w:t>Decided 2026-10-27 (adopted by the founder). DECIDED, NOT BUILT. DEVIATION FOUND, NOT APPROVED, NOW BEING CORRECTED: Build Plan 5.7 says 'Refresh token storage: httpOnly, Secure, SameSite cookie on web ... never localStorage'. The implementation does not do that: apps/web (lib/session.ts) writes the access and refresh tokens to sessionStorage or localStorage ('Stay signed in' = localStorage), apps/admin (lib/adminSession.ts) writes them to localStorage under the sn_admin_* keys, and the API returns the refresh token in the response body and sets no cookie (B-140). No Decision Log entry recorded or approved that deviation (B-017 calls session.ts a stopgap; B-140's own text quotes the cookie design as the intent). This entry records it as found and corrects it; 5.7's text is not edited. Register: B-245 (API cookie mode, opt-in), B-246 (apps/web), B-247 (apps/admin), B-248 (flip the browser default), B-249 (same-site custom domains, launch gate); status lines on B-017, B-140, B-164 and B-179. NOT decided: how a client opts in during the transition (the B-245 build PR chooses and states it); the cookie lifetimes (the existing refresh TTLs are reused unless the founder says otherwise); the migration of sessions already stored in browser storage (the final PR decides, and a forced re-login is the simplest). (FORWARD-POINTERS) Dated notes appended (original text unchanged) to #7 (Build Plan 5.7) and #407. NOT DONE: Decision Log numbers #293 and #294 are still absent from the table, as before.</w:t>
+            </w:r>
+          </w:p>
+        </w:tc>
+      </w:tr>
+      <w:tr>
+        <w:tc>
+          <w:tcPr>
+            <w:tcW w:type="dxa" w:w="500"/>
+          </w:tcPr>
+          <w:p>
+            <w:r>
+              <w:t>423</w:t>
+            </w:r>
+          </w:p>
+        </w:tc>
+        <w:tc>
+          <w:tcPr>
+            <w:tcW w:type="dxa" w:w="4700"/>
+          </w:tcPr>
+          <w:p>
+            <w:r>
+              <w:t>Founder decision 2026-10-27 (security baseline, item 4 of 10; founder-adopted default, veto-able): dependency patching now, plus recurring scanning in CI. Apply the non-breaking patch and minor updates that clear the open npm audit findings now (B-242). Add continuous checks to CI: Dependabot, CodeQL, GitHub secret scanning and an npm audit gate (B-250). The breaking upgrade of apps/admin react-router-dom 6 to the current major is a separate PR (B-255); the apps/mobile transitive advisories (for example shell-quote) stay deferred per Decision Log #20 Tier 3 because apps/mobile has no application code.</w:t>
+            </w:r>
+          </w:p>
+        </w:tc>
+        <w:tc>
+          <w:tcPr>
+            <w:tcW w:type="dxa" w:w="1850"/>
+          </w:tcPr>
+          <w:p>
+            <w:r>
+              <w:t>docs/decisions-security-baseline-2026-10-27 (docs only, 2026-10-27; founder statement, item 4 of 10; sources: Build Plan Section 5.7 (Decision Log #7), Decision Log #20, #26, #190, #407, #409; services/api/src/main.ts, services/api/src/validate-runtime-env.ts, services/api/src/crypto/dob-crypto.ts, apps/web/src/lib/session.ts, apps/admin/src/lib/adminSession.ts, .github/workflows/ci.yml; docs/build-register.md Sections 2, 3 and 51; CLAUDE.md)</w:t>
+            </w:r>
+          </w:p>
+        </w:tc>
+        <w:tc>
+          <w:tcPr>
+            <w:tcW w:type="dxa" w:w="2300"/>
+          </w:tcPr>
+          <w:p>
+            <w:r>
+              <w:t>Decided 2026-10-27 (founder statement; build detail is an adopted default and veto-able). DECIDED, NOT BUILT. Found on origin/main 25c1b1b: .github has only ci.yml and deploy.yml; there is no dependabot.yml, no CodeQL workflow and no npm audit step in ci.yml, so findings are only ever seen when someone runs npm audit by hand (as the Sprint 1 triage of #20 did). apps/admin still declares react-router-dom ^6.22.0 on React 18 by decision (the Router 7 and 8 upgrades were apps/web only). Register: B-242 (patch now), B-250 (CI scanning), B-255 (apps/admin router major). NOT decided: the audit gate's level and scope (the build PR adopts 'fail on High or Critical in production dependencies; report dev-only findings without failing' as a veto-able default); the cadence and grouping of Dependabot pull requests; whether B-255 stops at React Router 7 (peer React &gt;= 18, as apps/web did first) or goes to Router 8, which needs React 19 (#25, #27, #28). (FORWARD-POINTERS) Dated note appended (original text unchanged) to #20. NOT DONE: Decision Log numbers #293 and #294 are still absent from the table, as before.</w:t>
+            </w:r>
+          </w:p>
+        </w:tc>
+      </w:tr>
+      <w:tr>
+        <w:tc>
+          <w:tcPr>
+            <w:tcW w:type="dxa" w:w="500"/>
+          </w:tcPr>
+          <w:p>
+            <w:r>
+              <w:t>424</w:t>
+            </w:r>
+          </w:p>
+        </w:tc>
+        <w:tc>
+          <w:tcPr>
+            <w:tcW w:type="dxa" w:w="4700"/>
+          </w:tcPr>
+          <w:p>
+            <w:r>
+              <w:t>Open decision 2026-10-27 (security baseline, item 5 of 10): edge protection - a Cloudflare proxy in front of the API and the two static sites (WAF, DDoS protection, and an origin lock so the Render origin accepts traffic only from the proxy). Not decided; decided at the launch gate. Recommendation (not a decision): use the free-plan proxy.</w:t>
+            </w:r>
+          </w:p>
+        </w:tc>
+        <w:tc>
+          <w:tcPr>
+            <w:tcW w:type="dxa" w:w="1850"/>
+          </w:tcPr>
+          <w:p>
+            <w:r>
+              <w:t>docs/decisions-security-baseline-2026-10-27 (docs only, 2026-10-27; founder statement, item 5 of 10; sources: Build Plan Section 5.7 (Decision Log #7), Decision Log #20, #26, #190, #407, #409; services/api/src/main.ts, services/api/src/validate-runtime-env.ts, services/api/src/crypto/dob-crypto.ts, apps/web/src/lib/session.ts, apps/admin/src/lib/adminSession.ts, .github/workflows/ci.yml; docs/build-register.md Sections 2, 3 and 51; CLAUDE.md)</w:t>
+            </w:r>
+          </w:p>
+        </w:tc>
+        <w:tc>
+          <w:tcPr>
+            <w:tcW w:type="dxa" w:w="2300"/>
+          </w:tcPr>
+          <w:p>
+            <w:r>
+              <w:t>OPEN - to be decided at the launch gate (B-090). Recommendation only: a free-plan proxy. Register: B-251 (W12, founder then backend-api); it depends on the custom domains (B-249). FLAGGED, not decided: a proxy changes what TRUST_PROXY_HOPS must be (the launch-gate check of #429 is repeated if Cloudflare is added) and puts a new processor in the path of all traffic, including minors' requests; if the founder adopts it, the processor list and cross-border transfer rows of the legal draft and DPIA (Part C rows 36, 14, 9, 20) need updating by safeguarding-drafter for counsel (non-negotiable #2). Nothing is built or changed. (FORWARD-POINTERS) None. NOT DONE: Decision Log numbers #293 and #294 are still absent from the table, as before.</w:t>
+            </w:r>
+          </w:p>
+        </w:tc>
+      </w:tr>
+      <w:tr>
+        <w:tc>
+          <w:tcPr>
+            <w:tcW w:type="dxa" w:w="500"/>
+          </w:tcPr>
+          <w:p>
+            <w:r>
+              <w:t>425</w:t>
+            </w:r>
+          </w:p>
+        </w:tc>
+        <w:tc>
+          <w:tcPr>
+            <w:tcW w:type="dxa" w:w="4700"/>
+          </w:tcPr>
+          <w:p>
+            <w:r>
+              <w:t>Founder decision 2026-10-27 (security baseline, item 6 of 10; founder-adopted default, veto-able): a boot check for DOB_ENCRYPTION_KEY. The API refuses to boot in production unless the key is set, is not the placeholder, and decodes (base64) to exactly 32 bytes. The same key also protects the two-factor (TOTP) secrets (B-086, #405 item 8); docs/dob-encryption-rollback.md covers date of birth only.</w:t>
+            </w:r>
+          </w:p>
+        </w:tc>
+        <w:tc>
+          <w:tcPr>
+            <w:tcW w:type="dxa" w:w="1850"/>
+          </w:tcPr>
+          <w:p>
+            <w:r>
+              <w:t>docs/decisions-security-baseline-2026-10-27 (docs only, 2026-10-27; founder statement, item 6 of 10; sources: Build Plan Section 5.7 (Decision Log #7), Decision Log #20, #26, #190, #407, #409; services/api/src/main.ts, services/api/src/validate-runtime-env.ts, services/api/src/crypto/dob-crypto.ts, apps/web/src/lib/session.ts, apps/admin/src/lib/adminSession.ts, .github/workflows/ci.yml; docs/build-register.md Sections 2, 3 and 51; CLAUDE.md)</w:t>
+            </w:r>
+          </w:p>
+        </w:tc>
+        <w:tc>
+          <w:tcPr>
+            <w:tcW w:type="dxa" w:w="2300"/>
+          </w:tcPr>
+          <w:p>
+            <w:r>
+              <w:t>Decided 2026-10-27 (founder statement; build detail is an adopted default and veto-able). DECIDED, NOT BUILT. Found on origin/main 25c1b1b: the 32-byte rule exists in crypto/dob-crypto.ts (parseDobKey) but DobEncryptionService parses the key lazily on first use (if (!this.key) this.key = parseDobKey(...)), and assertProductionEnv (validate-runtime-env.ts) does not check it - so a missing or wrong-length key boots, and fails only on the first registration or login that touches a date of birth. Register: B-252 (W12, backend-api): add the check to assertProductionEnv with a test; B-086 and B-018 carry status lines. NOT decided: key rotation (the ciphertext carries a v1 prefix for it, no rotation procedure exists), and where the 2FA rollback note lives when B-086 is built. (FORWARD-POINTERS) None. NOT DONE: Decision Log numbers #293 and #294 are still absent from the table, as before.</w:t>
+            </w:r>
+          </w:p>
+        </w:tc>
+      </w:tr>
+      <w:tr>
+        <w:tc>
+          <w:tcPr>
+            <w:tcW w:type="dxa" w:w="500"/>
+          </w:tcPr>
+          <w:p>
+            <w:r>
+              <w:t>426</w:t>
+            </w:r>
+          </w:p>
+        </w:tc>
+        <w:tc>
+          <w:tcPr>
+            <w:tcW w:type="dxa" w:w="4700"/>
+          </w:tcPr>
+          <w:p>
+            <w:r>
+              <w:t>Open decision 2026-10-27 (security baseline, item 7 of 10): an incident-response and breach-notification plan - what counts as an incident, who decides, the UK ICO and Nigeria NDPA notification timelines, how and when guardians are told, evidence handling, and contact templates. Not decided. Recommendation (not a decision): it is required before any real minor's data is processed. safeguarding-drafter drafts it for counsel (Part C row 11).</w:t>
+            </w:r>
+          </w:p>
+        </w:tc>
+        <w:tc>
+          <w:tcPr>
+            <w:tcW w:type="dxa" w:w="1850"/>
+          </w:tcPr>
+          <w:p>
+            <w:r>
+              <w:t>docs/decisions-security-baseline-2026-10-27 (docs only, 2026-10-27; founder statement, item 7 of 10; sources: Build Plan Section 5.7 (Decision Log #7), Decision Log #20, #26, #190, #407, #409; services/api/src/main.ts, services/api/src/validate-runtime-env.ts, services/api/src/crypto/dob-crypto.ts, apps/web/src/lib/session.ts, apps/admin/src/lib/adminSession.ts, .github/workflows/ci.yml; docs/build-register.md Sections 2, 3 and 51; CLAUDE.md)</w:t>
+            </w:r>
+          </w:p>
+        </w:tc>
+        <w:tc>
+          <w:tcPr>
+            <w:tcW w:type="dxa" w:w="2300"/>
+          </w:tcPr>
+          <w:p>
+            <w:r>
+              <w:t>OPEN - needs the founder and counsel. Found: no incident-response or breach-notification document exists in docs/ (checked 2026-10-27); the legal draft's Part C row 11 ('Encryption-at-rest and breach-notification commitments, including guardian notification', owner Counsel) is the only place the topic is recorded. Register: B-253 (W12, safeguarding-drafter then founder), counsel-pending (Part C row 11). The output is a draft only and is never approved (non-negotiable #2). NOT decided: the deadlines (the draft states both regulators' timelines with sources), who is on call, and whether the plan is a launch-gate item in the register (recommended: yes, and a precondition of B-090). (FORWARD-POINTERS) None. NOT DONE: Decision Log numbers #293 and #294 are still absent from the table, as before.</w:t>
+            </w:r>
+          </w:p>
+        </w:tc>
+      </w:tr>
+      <w:tr>
+        <w:tc>
+          <w:tcPr>
+            <w:tcW w:type="dxa" w:w="500"/>
+          </w:tcPr>
+          <w:p>
+            <w:r>
+              <w:t>427</w:t>
+            </w:r>
+          </w:p>
+        </w:tc>
+        <w:tc>
+          <w:tcPr>
+            <w:tcW w:type="dxa" w:w="4700"/>
+          </w:tcPr>
+          <w:p>
+            <w:r>
+              <w:t>Open decision 2026-10-27 (security baseline, item 8 of 10): an external penetration test - timing, scope and budget not decided. Recommendation (not a decision): after staging is live and after two-factor authentication and image screening exist, and before launch. The scope includes the Decision Log #419 / W14 note that processed media sits in the public bucket prefix before it is approved, fetchable by anyone who holds its unguessable URL (docs/backend-w14-media-report.md).</w:t>
+            </w:r>
+          </w:p>
+        </w:tc>
+        <w:tc>
+          <w:tcPr>
+            <w:tcW w:type="dxa" w:w="1850"/>
+          </w:tcPr>
+          <w:p>
+            <w:r>
+              <w:t>docs/decisions-security-baseline-2026-10-27 (docs only, 2026-10-27; founder statement, item 8 of 10; sources: Build Plan Section 5.7 (Decision Log #7), Decision Log #20, #26, #190, #407, #409; services/api/src/main.ts, services/api/src/validate-runtime-env.ts, services/api/src/crypto/dob-crypto.ts, apps/web/src/lib/session.ts, apps/admin/src/lib/adminSession.ts, .github/workflows/ci.yml; docs/build-register.md Sections 2, 3 and 51; CLAUDE.md)</w:t>
+            </w:r>
+          </w:p>
+        </w:tc>
+        <w:tc>
+          <w:tcPr>
+            <w:tcW w:type="dxa" w:w="2300"/>
+          </w:tcPr>
+          <w:p>
+            <w:r>
+              <w:t>OPEN - timing, scope and budget need the founder. Register: B-254 (W12, a launch-gate row run by the founder with an outside vendor); it depends on B-086 (2FA), B-036 (image screening) and B-090 (staging live). The W14 note is carried verbatim from the founder's wording; the report's recommendation to copy-on-approve from a private prefix is not a decision. NOT decided: the vendor, the budget, whether admin and the API are both in scope, and the retest. Findings feed Section 7 if #428 is adopted. (FORWARD-POINTERS) None. NOT DONE: Decision Log numbers #293 and #294 are still absent from the table, as before.</w:t>
+            </w:r>
+          </w:p>
+        </w:tc>
+      </w:tr>
+      <w:tr>
+        <w:tc>
+          <w:tcPr>
+            <w:tcW w:type="dxa" w:w="500"/>
+          </w:tcPr>
+          <w:p>
+            <w:r>
+              <w:t>428</w:t>
+            </w:r>
+          </w:p>
+        </w:tc>
+        <w:tc>
+          <w:tcPr>
+            <w:tcW w:type="dxa" w:w="4700"/>
+          </w:tcPr>
+          <w:p>
+            <w:r>
+              <w:t>Open decision 2026-10-27 (security baseline, item 9 of 10): propose an added item in Build Plan Section 7 (Definition of Done): 'no open High or Critical security finding; penetration-test findings resolved'. Not adopted; needs the founder.</w:t>
+            </w:r>
+          </w:p>
+        </w:tc>
+        <w:tc>
+          <w:tcPr>
+            <w:tcW w:type="dxa" w:w="1850"/>
+          </w:tcPr>
+          <w:p>
+            <w:r>
+              <w:t>docs/decisions-security-baseline-2026-10-27 (docs only, 2026-10-27; founder statement, item 9 of 10; sources: Build Plan Section 5.7 (Decision Log #7), Decision Log #20, #26, #190, #407, #409; services/api/src/main.ts, services/api/src/validate-runtime-env.ts, services/api/src/crypto/dob-crypto.ts, apps/web/src/lib/session.ts, apps/admin/src/lib/adminSession.ts, .github/workflows/ci.yml; docs/build-register.md Sections 2, 3 and 51; CLAUDE.md)</w:t>
+            </w:r>
+          </w:p>
+        </w:tc>
+        <w:tc>
+          <w:tcPr>
+            <w:tcW w:type="dxa" w:w="2300"/>
+          </w:tcPr>
+          <w:p>
+            <w:r>
+              <w:t>OPEN - needs the founder. This entry proposes the wording and changes nothing: Section 7 of the Build Plan is NOT edited by this pass, and the register carries no row for it (the item would be a check applied at the launch gate, B-090, once B-254 has run). If adopted, a later docs PR edits Section 7 and appends a pointer here. (FORWARD-POINTERS) None. NOT DONE: Decision Log numbers #293 and #294 are still absent from the table, as before.</w:t>
+            </w:r>
+          </w:p>
+        </w:tc>
+      </w:tr>
+      <w:tr>
+        <w:tc>
+          <w:tcPr>
+            <w:tcW w:type="dxa" w:w="500"/>
+          </w:tcPr>
+          <w:p>
+            <w:r>
+              <w:t>429</w:t>
+            </w:r>
+          </w:p>
+        </w:tc>
+        <w:tc>
+          <w:tcPr>
+            <w:tcW w:type="dxa" w:w="4700"/>
+          </w:tcPr>
+          <w:p>
+            <w:r>
+              <w:t>Founder decision 2026-10-27 (security baseline, item 10 of 10; founder-adopted default, veto-able): authentication limits that work on shared school and club networks. Signup 30 per 10 minutes per IP. Login keyed per account: 5 failed attempts per 15 minutes (successes are not counted), plus a per-IP ceiling of 60 per 10 minutes. Forgot-password 3 per hour per email, plus the same per-IP ceiling. Admin login unchanged (5 per 15 minutes). Storage: Redis (#421). Launch-gate check: verify TRUST_PROXY_HOPS yields real client IPs in production, and recheck it if Cloudflare is added. A CAPTCHA fallback is noted as a later option only; it would need a DPIA and counsel.</w:t>
+            </w:r>
+          </w:p>
+        </w:tc>
+        <w:tc>
+          <w:tcPr>
+            <w:tcW w:type="dxa" w:w="1850"/>
+          </w:tcPr>
+          <w:p>
+            <w:r>
+              <w:t>docs/decisions-security-baseline-2026-10-27 (docs only, 2026-10-27; founder statement, item 10 of 10; sources: Build Plan Section 5.7 (Decision Log #7), Decision Log #20, #26, #190, #407, #409; services/api/src/main.ts, services/api/src/validate-runtime-env.ts, services/api/src/crypto/dob-crypto.ts, apps/web/src/lib/session.ts, apps/admin/src/lib/adminSession.ts, .github/workflows/ci.yml; docs/build-register.md Sections 2, 3 and 51; CLAUDE.md)</w:t>
+            </w:r>
+          </w:p>
+        </w:tc>
+        <w:tc>
+          <w:tcPr>
+            <w:tcW w:type="dxa" w:w="2300"/>
+          </w:tcPr>
+          <w:p>
+            <w:r>
+              <w:t>Decided 2026-10-27 (founder statement; build detail is an adopted default and veto-able). DECIDED, NOT BUILT. Found on origin/main 25c1b1b: @AuthRateLimit() applies the shared 'auth' throttler (AUTH_RATE_LIMIT_MAX=5 per AUTH_RATE_LIMIT_WINDOW_MS=60000 by default, keyed by IP) to register, login, forgot-password and the guardian resend, so a school or club behind one address is locked out after five sign-ups or sign-in attempts in a minute. The admin login override (5 per 15 minutes, #190) already exists. Register: B-256 (W12, backend-api), which depends on B-244. The TRUST_PROXY_HOPS check joins the launch gate (status line on B-090). NOT decided: the account key for login before an account is resolved (an unknown email must not reveal that the account exists; the build PR states how), and the CAPTCHA fallback (a DPIA and counsel question). (FORWARD-POINTERS) Dated notes appended (original text unchanged) to #190 and #7 (the rate-limiting paragraph of Build Plan 5.7). NOT DONE: Decision Log numbers #293 and #294 are still absent from the table, as before.</w:t>
             </w:r>
           </w:p>
         </w:tc>

</xml_diff>

<commit_message>
docs: media moderation correction of record (Decision Log #430) and register B-257 to B-261
Docs only. Records the founder's 2026-10-28 decisions: automatic check first
plus report-and-review is the decision of record for post and contest-entry
media (corrects #419); private prefix with copy on approval; reviewer vetting
and a per-account report limit; upload guards, 7-day unattached purge, media
in the post payload, report reason, DM free-URL removal; final-entry wording.

Decision Log: #430 appended; dated notes appended to #419 and #427 (originals
unchanged). Register: B-257 to B-261 added (261 B-IDs, 146 gap frames
unchanged), status lines on six rows, Section 52 added, six duplicate Section 2
rows removed (first copy kept; text unique to removed copies quoted in 52e).

Co-Authored-By: Claude Sonnet 5.5 <noreply@anthropic.com>
</commit_message>
<xml_diff>
--- a/docs/Soccernity_MVP_Build_Plan_v1.7.docx
+++ b/docs/Soccernity_MVP_Build_Plan_v1.7.docx
@@ -27943,6 +27943,9 @@
             <w:r>
               <w:t>Decided 2026-10-27 (founder statement; build detail marked ADOPTED is a default and veto-able). Records the decision and register work only. Docs only: no code, schema, Figma, legal copy, DPIA or Log Book; docs/sprint-1-dpia-outline-draft.md, docs/contest-spec.md and docs/pending-copy-manifest.md are not touched. REVERSES #418 item 7 (links only), recorded earlier the same day: B-235 said a reversal needs a new founder decision and new rows; this entry is that decision and B-237 to B-241 are those rows. It settles the conflict B-235 recorded between links-only and #378 for the four Partial composer frames of B-041 (2009:5168, 5818:8962, 2009:2913, 5818:8997): the upload control is built, the frames are wired, not redrawn as link fields. Build, per item: (1) a signed-in, consent-confirmed, verified, profile-complete user asks for an upload and receives a one-time link to a quarantine prefix of the R2 bucket, uploads straight to storage, then calls a completion step that verifies the real object, strips metadata and moves it to the public prefix as a pending file (B-238). (2) and (3) the limits are those stated; a video upload answers 503 and stores nothing if the stripping tool is missing (B-238). (4) to (7) B-239 is the server half of the review queue, the visibility gate, the rejection reason and notification, and the contest-entry consequences; B-237 draws the frames; B-240 builds the web and admin screens. (8) the upload request carries the same guards as POST /posts. (9) B-238 deletes the objects. (10) R2 keys and the video stripping tool are human steps at the launch gate (B-207, B-090). ADOPTED defaults, veto-able: the total of files on a post stays at the existing cap of 10, a video counting toward it, images and one video may be mixed; the uploader sees their own pending files through a short-lived signed read link; weekly Contest entries are ordinary posts (POST /contest/entries { postId }) and pass the same gate, so an entry whose media is unapproved when its window ends simply does not qualify; the image re-encode utility is built once with B-205 (avatar, cover and post images); for post media the review queue (B-037) is the gate and the automatic image check (B-036) is not a prerequisite, while avatars and covers keep the #411 item 1 rule unchanged. NOT decided, found while writing this entry: (a) Post.mediaUrls accepts any URL on any host today (create-post.dto.ts, @IsUrl each, max 10), so an externally hosted file would bypass the review gate; item 7 retires the link input for final entries only; (b) the contest calendar leaves no review time for a last-minute final video - the week-4 upload deadline is 23:59:59 on day 24 and the reveal is 00:00:00 on day 25 - so options are a moderator service level, an earlier upload deadline, or accepting that late uploads are not shown; (c) whether reviewers of minors' media must be child-safety vetted (AdminUser.childSafetyVetted, as for concernsMinor reports); (d) item 9 meets #341: anonymisation keeps Post rows as '[deleted user]', so deleting the objects leaves a surviving post with no files; and whether the media of a reported post or a legal hold (#398) is kept when its author deletes it or is anonymised, and what the contest history shows for an anonymised finalist; (e) retention of quarantine, abandoned and rejected files, and the life of the one-time link; (f) whether HEIC photos are accepted (item 2 lists jpeg/png/webp); (g) the video stripping tool is not named by the founder - the build PR names it and says how the host gets it; (h) whether post upload may go live before the CSAM detection and reporting path (B-206) is answered by counsel - it now covers every post image and video; (i) there is no automatic pre-filter until B-036 and no queue-size alert, so all review is by hand. Register: B-237 (K13, Figma), B-238 (W14, backend upload pipeline), B-239 (W15, backend review, visibility and contest entries), B-240 (FC10, apps/web and apps/admin) and B-241 (SG2, drafting for counsel) added; status lines appended (original text unchanged) to B-041, B-036, B-037, B-205, B-206, B-207, B-235 and B-090 (8 rows). 241 B-IDs; 146 gap frames unchanged (Section 49). DERIVED: the K13, W14, W15, FC10 and SG2 briefs were not available to the pass that wrote this entry; those five rows are read from the ten items and may move. SG2 output is draft only and never approved (non-negotiable #2). (FORWARD-POINTERS) Dated notes appended (original text unchanged) to #418, #378, #371, #398, #412 and #307 (6 rows). NOT DONE: Decision Log numbers #293 and #294 are still absent from the table, as before.</w:t>
             </w:r>
+            <w:r>
+              <w:t xml:space="preserve"> [2026-10-28: #430 item 1 CORRECTS this entry. Item 4 ('every upload is pending and invisible to everyone but the uploader until a moderator approves it') and the B-036 wording 'a later pre-filter only' are superseded, not erased. The decision of record is an automatic check first (Amazon Rekognition DetectModerationLabels; a video is sampled into frames) plus report-and-review: a clear pass goes live, a clear fail is rejected with a reason, only an uncertain result goes to the admin queue, and 3 reports hide an item; this is what W14 and W15 built. #430 item 2 keeps pending and rejected media in a private prefix and copies a file to the public prefix only on approval, which replaces the 'move the result to the public prefix as a pending file' step of item 1 (B-257). #430 item 3 answers note (c): reviewers of minors' media must be child-safety vetted (B-258). #430 item 4 settles part of note (e): confirmed uploads never attached to a post are purged after 7 days; rejected files are never purged until counsel decides evidence handling (B-206, OPEN under counsel). Notes (b), (d), (f) and (h) remain open; the anonymisation conflict in (d) stays OPEN.]</w:t>
+            </w:r>
           </w:p>
         </w:tc>
       </w:tr>
@@ -28279,6 +28282,9 @@
             <w:r>
               <w:t>OPEN - timing, scope and budget need the founder. Register: B-254 (W12, a launch-gate row run by the founder with an outside vendor); it depends on B-086 (2FA), B-036 (image screening) and B-090 (staging live). The W14 note is carried verbatim from the founder's wording; the report's recommendation to copy-on-approve from a private prefix is not a decision. NOT decided: the vendor, the budget, whether admin and the API are both in scope, and the retest. Findings feed Section 7 if #428 is adopted. (FORWARD-POINTERS) None. NOT DONE: Decision Log numbers #293 and #294 are still absent from the table, as before.</w:t>
             </w:r>
+            <w:r>
+              <w:t xml:space="preserve"> [2026-10-28: #430 item 2 resolves the scope item carried here: pending and rejected media now stay in a private prefix and are copied to the public prefix only on approval, so a file that is not approved is no longer fetchable by anyone who holds its URL. DECIDED, NOT BUILT: B-257. The rest of the scope (vendor, budget, whether admin and the API are both in scope, the retest) is unchanged, and the test should still check the built result.]</w:t>
+            </w:r>
           </w:p>
         </w:tc>
       </w:tr>
@@ -28362,6 +28368,48 @@
           <w:p>
             <w:r>
               <w:t>Decided 2026-10-27 (founder statement; build detail is an adopted default and veto-able). DECIDED, NOT BUILT. Found on origin/main 25c1b1b: @AuthRateLimit() applies the shared 'auth' throttler (AUTH_RATE_LIMIT_MAX=5 per AUTH_RATE_LIMIT_WINDOW_MS=60000 by default, keyed by IP) to register, login, forgot-password and the guardian resend, so a school or club behind one address is locked out after five sign-ups or sign-in attempts in a minute. The admin login override (5 per 15 minutes, #190) already exists. Register: B-256 (W12, backend-api), which depends on B-244. The TRUST_PROXY_HOPS check joins the launch gate (status line on B-090). NOT decided: the account key for login before an account is resolved (an unknown email must not reveal that the account exists; the build PR states how), and the CAPTCHA fallback (a DPIA and counsel question). (FORWARD-POINTERS) Dated notes appended (original text unchanged) to #190 and #7 (the rate-limiting paragraph of Build Plan 5.7). NOT DONE: Decision Log numbers #293 and #294 are still absent from the table, as before.</w:t>
+            </w:r>
+          </w:p>
+        </w:tc>
+      </w:tr>
+      <w:tr>
+        <w:tc>
+          <w:tcPr>
+            <w:tcW w:type="dxa" w:w="500"/>
+          </w:tcPr>
+          <w:p>
+            <w:r>
+              <w:t>430</w:t>
+            </w:r>
+          </w:p>
+        </w:tc>
+        <w:tc>
+          <w:tcPr>
+            <w:tcW w:type="dxa" w:w="4700"/>
+          </w:tcPr>
+          <w:p>
+            <w:r>
+              <w:t>Founder decisions 2026-10-28 (founder approved 2026-10-28; 5 items; the defaults are veto-able), taken after the post-media pipeline (W14, PR #474), the review queue (W15, PR #476) and the web and admin frontend (FC10, PR #477) merged: (1) CORRECTION OF RECORD for #419. #419 as written says every uploaded picture or video is approved by a person before anyone else sees it. That text is superseded, not erased. The decision of record is AUTOMATIC CHECK FIRST (Amazon Rekognition DetectModerationLabels; a video is sampled into frames) plus report-and-review, matching the founder's standing moderation decision: a clear pass goes live; a clear fail is rejected with a reason; only an uncertain result goes to the admin review queue; user reports (3 distinct reporters hide an item) feed the same queue. (2) Pending and rejected media are kept in a PRIVATE prefix and copied to the public prefix only on approval; rejected files stay private and are NOT deleted until counsel decides evidence handling (B-206, OPEN under counsel); the author's view and the reviewer's view use short-lived signed links. (3) Reviewers of minors' media must be child-safety vetted (the existing staff-vetting rule, ModerationService.assertChildSafetyVetted); POST /media/:id/report gets a per-account daily limit, default 20 per rolling 24 hours, env-driven; the hold threshold stays at 3 reports. (4) Housekeeping: the upload routes get the same guards as POST /posts (email verified, profile complete); confirmed uploads never attached to a post are purged after 7 days; rejected files are never purged (item 2); post payloads carry media: [{ id, kind }]; POST /media/:id/report accepts an optional reason of up to 500 characters; direct messages carry no free media URL (Message.mediaUrl is removed) until DM upload exists. (5) The contest final-entry frames and screens say the entry can be changed 'until you submit'.</w:t>
+            </w:r>
+          </w:p>
+        </w:tc>
+        <w:tc>
+          <w:tcPr>
+            <w:tcW w:type="dxa" w:w="1850"/>
+          </w:tcPr>
+          <w:p>
+            <w:r>
+              <w:t>docs/media-moderation-correction-and-followups-2026-10-28 (docs only, 2026-10-28; founder decisions 2026-10-28, items 1-5; sources: Decision Log #419, #427, #378, #371, #341, #398, #412, #418; docs/backend-w14-media-report.md (open points 2, 7, 18, 19, 22, 23); docs/backend-w15-review-queue-report.md (section 5, point 4); services/api/src/modules/post-media/, services/api/src/modules/moderation/moderation.service.ts (assertChildSafetyVetted), services/api/src/modules/messaging/dto/send-message.dto.ts, services/api/prisma/schema.prisma (Message.mediaUrl); docs/build-register.md Sections 2, 3, 49, 50 and 52; CLAUDE.md)</w:t>
+            </w:r>
+          </w:p>
+        </w:tc>
+        <w:tc>
+          <w:tcPr>
+            <w:tcW w:type="dxa" w:w="2300"/>
+          </w:tcPr>
+          <w:p>
+            <w:r>
+              <w:t>Decided 2026-10-28 (founder approved 2026-10-28; build detail marked ADOPTED is a default and veto-able). Records the decision and register work only. Docs only: no code, schema, Figma, legal copy, DPIA or Log Book; docs/sprint-1-dpia-outline-draft.md, docs/contest-spec.md, docs/pending-copy-manifest.md and docs/deployment.md are not touched. Item 1 is a correction of record and a status: the automatic check, the moderator queue and the reports are BUILT (W14 PR #474, W15 PR #476, FC10 PR #477); items 2 to 5 are DECIDED, NOT BUILT. ITEM 1 - what #419 got wrong and what stands: #419 item 4 ('every upload is pending and invisible to everyone but the uploader until a moderator approves it') and the note that the automatic check (B-036) would be 'a later pre-filter only' are superseded. The rest of #419 stands except where item 2 below changes it. As built: a clear pass is approved automatically; a clear fail is rejected automatically with a generic reason; only an uncertain, gave-up or never-checked item enters the moderator queue (source auto_check); user reports (source user_report) feed the same queue; nothing is ever approved by default, and with the check unconfigured an item waits 30 minutes (MEDIA_REVIEW_UNCHECKED_AFTER_MINUTES) and is then sent to the queue. KNOWN LIMITS, stated so they are not rediscovered: (a) a video upload answers 503 until the host provides ffmpeg and ffprobe, which Render's native Node runtime does not (docs/backend-w14-media-report.md, open point 19); (b) the presigned PUT has never been run against a real R2 bucket and needs the bucket CORS rule allowing PUT from the web origin, a human step in docs/deployment.md (open point 18); (c) the automatic check runs about 10 items per minute per API instance (open point 22); (d) a late contest upload is not reviewed before the reveal: the week-4 upload deadline is 23:59:59 on day 24 and the reveal is 00:00:00 on day 25, so a final video the check cannot clear in time is not shown (#419 note (b), unchanged); (e) HEIC is refused with a clear message (open point 7) and must be tried on real devices in a later QA run; (f) anonymisation versus surviving posts conflicts with #341 and #419 item 9 and stays OPEN: anonymisation keeps a Post as '[deleted user]' while item 9 deletes its media objects, so a surviving post loses its files; what happens to the media of a reported or legally held post is likewise not decided. AWS AND STORAGE LAUNCH STEPS (founder-owned, under B-036 and B-037, with B-193): create the AWS account and the IAM user (rekognition:DetectModerationLabels only), and set the AWS opt-out of AI-services data use BEFORE any real key is configured. ITEM 2: supersedes the W14 note that a processed file sits in the PUBLIC prefix before approval (open point 2 of docs/backend-w14-media-report.md): a pending or rejected file stays in a private prefix, is copied to the public prefix on approval only, and is read by its author and by the reviewer through short-lived signed links (the reviewer's 5-minute view link exists today; the author's view moves to a signed link). Rejected files stay private and are not deleted until counsel decides evidence handling (B-206, OPEN under counsel); keeping them is the founder's choice and is not counsel advice. This resolves the penetration-test scope note carried in #427. Register: B-257. ITEM 3: ADOPTED, veto-able: 20 reports per account per rolling 24 hours, held in configuration (the build PR names the variable). It limits, and does not remove, the brigading risk W15 recorded (three accounts can hide anyone's item); the hold threshold of 3 (MEDIA_REPORT_HIDE_THRESHOLD) is unchanged. Reviewer vetting: a moderator who is not child-safety vetted may not open a minor uploader's media, as assertChildSafetyVetted already applies to concernsMinor reports; whether the queue skips such an item or filters it out of the list (as GET /admin/moderation/reports does) is for the build PR to state. This answers #419 note (c). Register: B-258. ITEM 4: today the upload routes carry JwtAuthGuard and GuardianConsentGuard only (B-238 built note); the post payload carries mediaUrls only, so the web reads the upload id from the file URL (FC10 open point); POST /media/:id/report takes no body, so the web report form has no reason field; a confirmed upload never attached to a post is kept indefinitely (W14 open point 23); Message.mediaUrl is a nullable column on Message and POST /conversations/:id/messages accepts it, so removing it is a schema change and a messaging API change, flagged for the build PR (the platform is not live, so nothing needs migrating). Register: B-259. ITEM 5: FC10 found that a submitted final entry cannot be replaced, so 'until you submit' describes the built behaviour. The wording is reconciled in the Figma frames (B-261) and in the code (B-260); it carries no legal or safety promise, so it is not tagged [COPY PENDING LEGAL REVIEW] (#412 item 5). NOT decided: the name of the report-limit variable; how long a rejected file is kept beyond 'not deleted until counsel decides'; whether the private-prefix change keeps the post's mediaUrls copy stable for readers; what the queue does when the only available reviewer is not vetted; whether post upload may go live before the CSAM path (B-206) is answered by counsel; the anonymisation conflict in KNOWN LIMIT (f). Register: B-257 (media privacy: private prefix, copy on approval, signed links; BE then QA), B-258 (reviewer vetting and the per-account report limit; BE), B-259 (upload guards, 7-day unattached purge, media in the post payload, report reason, DM free-URL removal; BE), B-260 (FC10 follow-ups; FC) and B-261 (Figma reconciliation; DS or SB) added; status lines appended (original text unchanged) to B-036, B-037, B-206, B-238, B-239 and B-240 (6 rows). 261 B-IDs; 146 gap frames unchanged (Section 52). The duplicate Section 2 rows B-012 to B-015, B-095 and B-096 are removed from the register only (first copy kept; Section 52 lists each removal and quotes the text that existed only in the removed copy); the docx is not affected by that. DERIVED: no brief for B-257 to B-261 exists beyond the founder's wording; the five rows are read from the five items and may move. (FORWARD-POINTERS) Dated notes appended (original text unchanged) to #419 and #427 (2 rows). NOT DONE: Decision Log numbers #293 and #294 are still absent from the table, as before.</w:t>
             </w:r>
           </w:p>
         </w:tc>

</xml_diff>

<commit_message>
docs: security follow-ups decisions (Decision Log #431 to #435) and register B-262 to B-264
Docs only. Records the founder's 2026-10-28 security follow-up decisions: the
global writes class and the sign-in routes (#431), login lockout per account
and IP (#432), Redis outage handling for the rate limiters (#433), the multer
override until NestJS 12 (#434) and token-storage sequencing (#435). Items 1-4
are already built (PR #488, #491, #487); item 5 is decided, not built.

Adds register rows B-262 to B-264 (wave W12), status lines on 8 rows, dated
notes on Decision Log #421, #422, #423 and #429, register Section 53, and
corrects the stale "not found" notes in CLAUDE.md.

Co-Authored-By: Claude Sonnet 5.5 <noreply@anthropic.com>
</commit_message>
<xml_diff>
--- a/docs/Soccernity_MVP_Build_Plan_v1.7.docx
+++ b/docs/Soccernity_MVP_Build_Plan_v1.7.docx
@@ -28030,6 +28030,9 @@
             <w:r>
               <w:t>Decided 2026-10-27 (founder statement; build detail is an adopted default and veto-able). DECIDED, NOT BUILT. Found on origin/main 25c1b1b: the only throttler is the named 'auth' throttler of AuthRateLimitModule (5 requests per 60 seconds by default, applied by @AuthRateLimit() on a few auth routes) plus the guardian-withdrawal limiter and the post-media per-user limit; there is no global limiter, so every other route (feed, search, profile reads, writes) is unlimited. Register: B-244 (W12, backend-api); the auth limits for shared networks are B-256 (#429), which depends on it. Every new variable must also be added to render.yaml (both services), .env.example and the env-completeness spec (B-018). NOT decided: the numeric defaults are the founder's; the in-memory limiter is per API instance, so with more than one instance the effective limit multiplies until it moves to Redis (the move is part of the same decision, trigger = more than one instance). (FORWARD-POINTERS) None. NOT DONE: Decision Log numbers #293 and #294 are still absent from the table, as before.</w:t>
             </w:r>
+            <w:r>
+              <w:t xml:space="preserve"> [2026-10-28: #431: the 'global-writes' class is not applied to the sign-in routes, refresh gets its own limits (240 per 60 seconds per IP, 10 per 60 seconds per refresh token) and the limiter reports to Sentry when it fails open (B-262, PR #488). #433: the fail-open decision for the rate limiters is confirmed; the sign-in limits fall back to per-instance memory while Redis is down (PR #491); launch-gate checks sit on B-090.]</w:t>
+            </w:r>
           </w:p>
         </w:tc>
       </w:tr>
@@ -28072,6 +28075,9 @@
             <w:r>
               <w:t>Decided 2026-10-27 (adopted by the founder). DECIDED, NOT BUILT. DEVIATION FOUND, NOT APPROVED, NOW BEING CORRECTED: Build Plan 5.7 says 'Refresh token storage: httpOnly, Secure, SameSite cookie on web ... never localStorage'. The implementation does not do that: apps/web (lib/session.ts) writes the access and refresh tokens to sessionStorage or localStorage ('Stay signed in' = localStorage), apps/admin (lib/adminSession.ts) writes them to localStorage under the sn_admin_* keys, and the API returns the refresh token in the response body and sets no cookie (B-140). No Decision Log entry recorded or approved that deviation (B-017 calls session.ts a stopgap; B-140's own text quotes the cookie design as the intent). This entry records it as found and corrects it; 5.7's text is not edited. Register: B-245 (API cookie mode, opt-in), B-246 (apps/web), B-247 (apps/admin), B-248 (flip the browser default), B-249 (same-site custom domains, launch gate); status lines on B-017, B-140, B-164 and B-179. NOT decided: how a client opts in during the transition (the B-245 build PR chooses and states it); the cookie lifetimes (the existing refresh TTLs are reused unless the founder says otherwise); the migration of sessions already stored in browser storage (the final PR decides, and a forced re-login is the simplest). (FORWARD-POINTERS) Dated notes appended (original text unchanged) to #7 (Build Plan 5.7) and #407. NOT DONE: Decision Log numbers #293 and #294 are still absent from the table, as before.</w:t>
             </w:r>
+            <w:r>
+              <w:t xml:space="preserve"> [2026-10-28: #435: B-249 (custom same-site domains) is built BEFORE the web and admin token PRs B-246 and B-247; there is no dual-mode build switch; the browser default flip B-248 follows both. B-245 (the API cookie mode, PR #484) is built and unaffected.]</w:t>
+            </w:r>
           </w:p>
         </w:tc>
       </w:tr>
@@ -28114,6 +28120,9 @@
             <w:r>
               <w:t>Decided 2026-10-27 (founder statement; build detail is an adopted default and veto-able). DECIDED, NOT BUILT. Found on origin/main 25c1b1b: .github has only ci.yml and deploy.yml; there is no dependabot.yml, no CodeQL workflow and no npm audit step in ci.yml, so findings are only ever seen when someone runs npm audit by hand (as the Sprint 1 triage of #20 did). apps/admin still declares react-router-dom ^6.22.0 on React 18 by decision (the Router 7 and 8 upgrades were apps/web only). Register: B-242 (patch now), B-250 (CI scanning), B-255 (apps/admin router major). NOT decided: the audit gate's level and scope (the build PR adopts 'fail on High or Critical in production dependencies; report dev-only findings without failing' as a veto-able default); the cadence and grouping of Dependabot pull requests; whether B-255 stops at React Router 7 (peer React &gt;= 18, as apps/web did first) or goes to Router 8, which needs React 19 (#25, #27, #28). (FORWARD-POINTERS) Dated note appended (original text unchanged) to #20. NOT DONE: Decision Log numbers #293 and #294 are still absent from the table, as before.</w:t>
             </w:r>
+            <w:r>
+              <w:t xml:space="preserve"> [2026-10-28: #434: multer is pinned to 2.5.0 by an npm override (PR #487, B-264) with a build-failing guard test against any fileFilter; the override is removed when NestJS 12 is adopted. The patch-now half of this entry was built in PR #480.]</w:t>
+            </w:r>
           </w:p>
         </w:tc>
       </w:tr>
@@ -28369,6 +28378,9 @@
             <w:r>
               <w:t>Decided 2026-10-27 (founder statement; build detail is an adopted default and veto-able). DECIDED, NOT BUILT. Found on origin/main 25c1b1b: @AuthRateLimit() applies the shared 'auth' throttler (AUTH_RATE_LIMIT_MAX=5 per AUTH_RATE_LIMIT_WINDOW_MS=60000 by default, keyed by IP) to register, login, forgot-password and the guardian resend, so a school or club behind one address is locked out after five sign-ups or sign-in attempts in a minute. The admin login override (5 per 15 minutes, #190) already exists. Register: B-256 (W12, backend-api), which depends on B-244. The TRUST_PROXY_HOPS check joins the launch gate (status line on B-090). NOT decided: the account key for login before an account is resolved (an unknown email must not reveal that the account exists; the build PR states how), and the CAPTCHA fallback (a DPIA and counsel question). (FORWARD-POINTERS) Dated notes appended (original text unchanged) to #190 and #7 (the rate-limiting paragraph of Build Plan 5.7). NOT DONE: Decision Log numbers #293 and #294 are still absent from the table, as before.</w:t>
             </w:r>
+            <w:r>
+              <w:t xml:space="preserve"> [2026-10-28: #431: the global writes class no longer applies to register, login, forgot-password, the guardian-consent routes or admin login. #432: the login limit is refined from per account to per account-and-IP pair (5 failed attempts per 15 minutes), with an account-wide ceiling of 20 per 24 hours, a successful reset clearing it, and one lockout notice email per account per 24 hours (B-263, PR #491). #433: the rate limiters keep failing open; the sign-in limits fall back to per-instance memory while Redis is down. Signup and forgot-password limits are unchanged.]</w:t>
+            </w:r>
           </w:p>
         </w:tc>
       </w:tr>
@@ -28410,6 +28422,216 @@
           <w:p>
             <w:r>
               <w:t>Decided 2026-10-28 (founder approved 2026-10-28; build detail marked ADOPTED is a default and veto-able). Records the decision and register work only. Docs only: no code, schema, Figma, legal copy, DPIA or Log Book; docs/sprint-1-dpia-outline-draft.md, docs/contest-spec.md, docs/pending-copy-manifest.md and docs/deployment.md are not touched. Item 1 is a correction of record and a status: the automatic check, the moderator queue and the reports are BUILT (W14 PR #474, W15 PR #476, FC10 PR #477); items 2 to 5 are DECIDED, NOT BUILT. ITEM 1 - what #419 got wrong and what stands: #419 item 4 ('every upload is pending and invisible to everyone but the uploader until a moderator approves it') and the note that the automatic check (B-036) would be 'a later pre-filter only' are superseded. The rest of #419 stands except where item 2 below changes it. As built: a clear pass is approved automatically; a clear fail is rejected automatically with a generic reason; only an uncertain, gave-up or never-checked item enters the moderator queue (source auto_check); user reports (source user_report) feed the same queue; nothing is ever approved by default, and with the check unconfigured an item waits 30 minutes (MEDIA_REVIEW_UNCHECKED_AFTER_MINUTES) and is then sent to the queue. KNOWN LIMITS, stated so they are not rediscovered: (a) a video upload answers 503 until the host provides ffmpeg and ffprobe, which Render's native Node runtime does not (docs/backend-w14-media-report.md, open point 19); (b) the presigned PUT has never been run against a real R2 bucket and needs the bucket CORS rule allowing PUT from the web origin, a human step in docs/deployment.md (open point 18); (c) the automatic check runs about 10 items per minute per API instance (open point 22); (d) a late contest upload is not reviewed before the reveal: the week-4 upload deadline is 23:59:59 on day 24 and the reveal is 00:00:00 on day 25, so a final video the check cannot clear in time is not shown (#419 note (b), unchanged); (e) HEIC is refused with a clear message (open point 7) and must be tried on real devices in a later QA run; (f) anonymisation versus surviving posts conflicts with #341 and #419 item 9 and stays OPEN: anonymisation keeps a Post as '[deleted user]' while item 9 deletes its media objects, so a surviving post loses its files; what happens to the media of a reported or legally held post is likewise not decided. AWS AND STORAGE LAUNCH STEPS (founder-owned, under B-036 and B-037, with B-193): create the AWS account and the IAM user (rekognition:DetectModerationLabels only), and set the AWS opt-out of AI-services data use BEFORE any real key is configured. ITEM 2: supersedes the W14 note that a processed file sits in the PUBLIC prefix before approval (open point 2 of docs/backend-w14-media-report.md): a pending or rejected file stays in a private prefix, is copied to the public prefix on approval only, and is read by its author and by the reviewer through short-lived signed links (the reviewer's 5-minute view link exists today; the author's view moves to a signed link). Rejected files stay private and are not deleted until counsel decides evidence handling (B-206, OPEN under counsel); keeping them is the founder's choice and is not counsel advice. This resolves the penetration-test scope note carried in #427. Register: B-257. ITEM 3: ADOPTED, veto-able: 20 reports per account per rolling 24 hours, held in configuration (the build PR names the variable). It limits, and does not remove, the brigading risk W15 recorded (three accounts can hide anyone's item); the hold threshold of 3 (MEDIA_REPORT_HIDE_THRESHOLD) is unchanged. Reviewer vetting: a moderator who is not child-safety vetted may not open a minor uploader's media, as assertChildSafetyVetted already applies to concernsMinor reports; whether the queue skips such an item or filters it out of the list (as GET /admin/moderation/reports does) is for the build PR to state. This answers #419 note (c). Register: B-258. ITEM 4: today the upload routes carry JwtAuthGuard and GuardianConsentGuard only (B-238 built note); the post payload carries mediaUrls only, so the web reads the upload id from the file URL (FC10 open point); POST /media/:id/report takes no body, so the web report form has no reason field; a confirmed upload never attached to a post is kept indefinitely (W14 open point 23); Message.mediaUrl is a nullable column on Message and POST /conversations/:id/messages accepts it, so removing it is a schema change and a messaging API change, flagged for the build PR (the platform is not live, so nothing needs migrating). Register: B-259. ITEM 5: FC10 found that a submitted final entry cannot be replaced, so 'until you submit' describes the built behaviour. The wording is reconciled in the Figma frames (B-261) and in the code (B-260); it carries no legal or safety promise, so it is not tagged [COPY PENDING LEGAL REVIEW] (#412 item 5). NOT decided: the name of the report-limit variable; how long a rejected file is kept beyond 'not deleted until counsel decides'; whether the private-prefix change keeps the post's mediaUrls copy stable for readers; what the queue does when the only available reviewer is not vetted; whether post upload may go live before the CSAM path (B-206) is answered by counsel; the anonymisation conflict in KNOWN LIMIT (f). Register: B-257 (media privacy: private prefix, copy on approval, signed links; BE then QA), B-258 (reviewer vetting and the per-account report limit; BE), B-259 (upload guards, 7-day unattached purge, media in the post payload, report reason, DM free-URL removal; BE), B-260 (FC10 follow-ups; FC) and B-261 (Figma reconciliation; DS or SB) added; status lines appended (original text unchanged) to B-036, B-037, B-206, B-238, B-239 and B-240 (6 rows). 261 B-IDs; 146 gap frames unchanged (Section 52). The duplicate Section 2 rows B-012 to B-015, B-095 and B-096 are removed from the register only (first copy kept; Section 52 lists each removal and quotes the text that existed only in the removed copy); the docx is not affected by that. DERIVED: no brief for B-257 to B-261 exists beyond the founder's wording; the five rows are read from the five items and may move. (FORWARD-POINTERS) Dated notes appended (original text unchanged) to #419 and #427 (2 rows). NOT DONE: Decision Log numbers #293 and #294 are still absent from the table, as before.</w:t>
+            </w:r>
+          </w:p>
+        </w:tc>
+      </w:tr>
+      <w:tr>
+        <w:tc>
+          <w:tcPr>
+            <w:tcW w:type="dxa" w:w="500"/>
+          </w:tcPr>
+          <w:p>
+            <w:r>
+              <w:t>431</w:t>
+            </w:r>
+          </w:p>
+        </w:tc>
+        <w:tc>
+          <w:tcPr>
+            <w:tcW w:type="dxa" w:w="4700"/>
+          </w:tcPr>
+          <w:p>
+            <w:r>
+              <w:t>Founder decision 2026-10-28 (security follow-ups, item 1 of 5; founder approved 2026-10-28; build detail is an adopted default and veto-able; the platform is not live): the 'global-writes' class of the global rate limit (30 per 60 seconds per caller, #421) is NOT applied to register, login, forgot-password, the guardian-consent routes, admin login or refresh. Reason: a class of children behind one school IP would otherwise be capped at 30 sign-ins and sign-ups a minute in total, before the purpose-built limits of #429 are reached. Those routes keep their own limits. Refresh gets its own limits: 240 per 60 seconds per IP and 10 per 60 seconds per refresh token (adopted defaults, veto-able). A Sentry alert fires when the global limiter fails open.</w:t>
+            </w:r>
+          </w:p>
+        </w:tc>
+        <w:tc>
+          <w:tcPr>
+            <w:tcW w:type="dxa" w:w="1850"/>
+          </w:tcPr>
+          <w:p>
+            <w:r>
+              <w:t>docs/security-followups-decisions-2026-10-28 (docs only, 2026-10-28; founder statement, item 1 of 5; sources: Decision Log #7, #20, #24, #190, #421, #422, #423, #429; services/api/src/rate-limit/, services/api/src/modules/auth/rate-limit/auth-limits/, services/api/src/multer-no-filefilter.guard.spec.ts, root package.json overrides, PRs #487, #488, #491; docs/build-register.md Sections 2, 3 and 53; CLAUDE.md)</w:t>
+            </w:r>
+          </w:p>
+        </w:tc>
+        <w:tc>
+          <w:tcPr>
+            <w:tcW w:type="dxa" w:w="2300"/>
+          </w:tcPr>
+          <w:p>
+            <w:r>
+              <w:t>Decided 2026-10-28 (founder approved 2026-10-28; build detail is an adopted default and veto-able). BUILT in PR #488 (security/global-limit-signin-exemption), register row B-262. Found on origin/main 63cd3b8: @SkipGlobalWriteLimit() is honoured ONLY by the global-writes throttler; the user / anonymous class (120 / 600 per 60 seconds) and the uploads class still apply to the exempt routes. The exempt handlers are those that carry @AuthLimit(), @AuthRateLimit() or @GuardianWithdrawalRateLimit() (register, login, forgot-password, reactivate-account, delete-inactive-account, resend-verification-email, the guardian-consent and withdrawal routes, POST /reports/public, admin login) plus POST /auth/refresh; global-rate-limit.coverage.spec.ts fails the build if a handler with one of those limiters lacks the tag or any other handler carries it. @RefreshRateLimit() on POST /auth/refresh adds GLOBAL_RATE_LIMIT_REFRESH_IP_* (default 240 per 60 seconds per client IP) and GLOBAL_RATE_LIMIT_REFRESH_TOKEN_* (default 10 per 60 seconds per refresh token, keyed by a SHA-256 of the presented token, never the raw value); both are environment-driven and in render.yaml. Where the global guard catches a non-429 error and lets the request through it now also calls Sentry.captureException with the tag rate_limiter=global, at most once a minute; this is a no-op until SENTRY_DSN is a real value. Residual risks, not fixed: the writes and refresh classes are in-memory per API instance (move to Redis once there is more than one instance, #421); the refresh-IP class keys on req.ip, so the TRUST_PROXY_HOPS launch-gate check (#429) matters here too; a route exempted from writes is still bounded by the 120 / 600 per minute class. (FORWARD-POINTERS) Dated notes appended (original text unchanged) to #421 and #429. NOT DONE: Decision Log numbers #293 and #294 are still absent from the table, as before.</w:t>
+            </w:r>
+          </w:p>
+        </w:tc>
+      </w:tr>
+      <w:tr>
+        <w:tc>
+          <w:tcPr>
+            <w:tcW w:type="dxa" w:w="500"/>
+          </w:tcPr>
+          <w:p>
+            <w:r>
+              <w:t>432</w:t>
+            </w:r>
+          </w:p>
+        </w:tc>
+        <w:tc>
+          <w:tcPr>
+            <w:tcW w:type="dxa" w:w="4700"/>
+          </w:tcPr>
+          <w:p>
+            <w:r>
+              <w:t>Founder decision 2026-10-28 (security follow-ups, item 2 of 5; founder approved 2026-10-28; build detail is an adopted default and veto-able; the platform is not live): login lockout per account AND IP. Five failed attempts per 15 minutes are counted per account-and-IP pair, so a stranger cannot lock the real owner out from another network. A higher account-wide ceiling of 20 failed attempts per 24 hours applies across all IPs. A successful password reset clears that ceiling. The account owner gets one security notice email per 24 hours, the first time the per-pair budget is spent. This refines #429's per-account-only login limit. Residual risks recorded: a distributed guesser can still reach the 20-per-day ceiling; the notice email can be triggered by a stranger (capped at one a day); guardian notification for a minor's account is OPEN for the founder.</w:t>
+            </w:r>
+          </w:p>
+        </w:tc>
+        <w:tc>
+          <w:tcPr>
+            <w:tcW w:type="dxa" w:w="1850"/>
+          </w:tcPr>
+          <w:p>
+            <w:r>
+              <w:t>docs/security-followups-decisions-2026-10-28 (docs only, 2026-10-28; founder statement, item 2 of 5; sources: Decision Log #7, #20, #24, #190, #421, #422, #423, #429; services/api/src/rate-limit/, services/api/src/modules/auth/rate-limit/auth-limits/, services/api/src/multer-no-filefilter.guard.spec.ts, root package.json overrides, PRs #487, #488, #491; docs/build-register.md Sections 2, 3 and 53; CLAUDE.md)</w:t>
+            </w:r>
+          </w:p>
+        </w:tc>
+        <w:tc>
+          <w:tcPr>
+            <w:tcW w:type="dxa" w:w="2300"/>
+          </w:tcPr>
+          <w:p>
+            <w:r>
+              <w:t>Decided 2026-10-28 (founder approved 2026-10-28; build detail is an adopted default and veto-able). BUILT in PR #491 (security/login-lockout-redesign), register row B-263. Found on origin/main 63cd3b8: the pair (normalised email plus client IP, hashed together) has the 5-per-15-minutes budget; the account ceiling is AUTH_LOGIN_ACCOUNT_CEILING_* (20 per 24 hours) and, when spent, every address gets 429 until it expires; the pair is checked before the ceiling and a refused attempt gives back the slot it took; each attempt reserves its slot first and releases it on success, so 20 parallel guesses yield exactly 5 attempts per pair; successes are not counted; the per-IP ceiling of 60 per 10 minutes is kept; a real and an unknown address get the same response and the same counters. PasswordResetService.resetPassword clears the account-wide ceiling. The notice is sent by the failed attempt that spends the pair's budget (the 5th), to the account's registered address only, only if an account exists (an unknown address makes no claim and sends nothing), in the background so the response and its timing never depend on it, at most once per account per 24 hours through an atomic Redis SET NX EX (the claim is given back if nothing could be sent, for example an unusable WEB_APP_BASE_URL); it carries no IP, times or counts and links to /forgot-password. No string is tagged for legal review (no legal or safety promise, #412 item 5). Residual risks, not fixed: the 20-per-24-hours ceiling is a lockout the owner shares (anyone can send 20 wrong passwords for a victim's email from 20 addresses and block logins until the key expires or the owner resets the password); the notice can be triggered by a stranger, at most once a day per account; for a minor's account the notice goes to the account's own email only - guardian notification is NOT built and is OPEN for the founder. (FORWARD-POINTERS) Dated note appended (original text unchanged) to #429. NOT DONE: Decision Log numbers #293 and #294 are still absent from the table, as before.</w:t>
+            </w:r>
+          </w:p>
+        </w:tc>
+      </w:tr>
+      <w:tr>
+        <w:tc>
+          <w:tcPr>
+            <w:tcW w:type="dxa" w:w="500"/>
+          </w:tcPr>
+          <w:p>
+            <w:r>
+              <w:t>433</w:t>
+            </w:r>
+          </w:p>
+        </w:tc>
+        <w:tc>
+          <w:tcPr>
+            <w:tcW w:type="dxa" w:w="4700"/>
+          </w:tcPr>
+          <w:p>
+            <w:r>
+              <w:t>Founder decision 2026-10-28 (security follow-ups, item 3 of 5; founder approved 2026-10-28; the platform is not live): Redis outage handling for the rate limiters. Keep failing open rather than closed (a blip must not lock every child out), but the sign-in limits fall back to per-instance in-memory counters while Redis is down, and every fail-open event is reported to Sentry. Revisit trigger: once real users exist and the incident-response plan (B-253, #426) is in place, make the admin login fail closed on a Redis outage. Launch-gate check, founder-owned, under B-090: confirm the Upstash plan is highly available and that Sentry alerts on the rate-limiter tags are configured.</w:t>
+            </w:r>
+          </w:p>
+        </w:tc>
+        <w:tc>
+          <w:tcPr>
+            <w:tcW w:type="dxa" w:w="1850"/>
+          </w:tcPr>
+          <w:p>
+            <w:r>
+              <w:t>docs/security-followups-decisions-2026-10-28 (docs only, 2026-10-28; founder statement, item 3 of 5; sources: Decision Log #7, #20, #24, #190, #421, #422, #423, #429; services/api/src/rate-limit/, services/api/src/modules/auth/rate-limit/auth-limits/, services/api/src/multer-no-filefilter.guard.spec.ts, root package.json overrides, PRs #487, #488, #491; docs/build-register.md Sections 2, 3 and 53; CLAUDE.md)</w:t>
+            </w:r>
+          </w:p>
+        </w:tc>
+        <w:tc>
+          <w:tcPr>
+            <w:tcW w:type="dxa" w:w="2300"/>
+          </w:tcPr>
+          <w:p>
+            <w:r>
+              <w:t>Decided 2026-10-28 (founder approved 2026-10-28). The code is BUILT; the revisit trigger and the launch-gate checks are NOT done. Auth limiters: PR #491 (register row B-263) - AuthLimitsStore falls back to a per-process in-memory counter with the same semantics for every operation (hit, release, retry-after, the SET NX claim, clear) when Redis is unreachable; bounded at 10,000 entries (expired first, then oldest); counters restart empty when Redis returns; logged and reported to Sentry with the tag rate_limiter=auth at most once a minute; if the fallback itself throws, the request fails open as before. Global limiter: PR #488 (B-262) - it keeps failing open and now reports to Sentry with the tag rate_limiter=global (#431). Both reports are no-ops until SENTRY_DSN is a real value. Still not fail-closed and not shared across instances: with N API instances the effective limit is up to N times looser during an outage, and a flood of distinct keys can evict an old counter. Launch-gate items recorded as a status line on B-090 (Upstash plan highly available; Sentry alerts on rate_limiter=global and rate_limiter=auth configured). Making the admin login fail closed is a future change with the trigger above, not built. (FORWARD-POINTERS) Dated notes appended (original text unchanged) to #421 and #429. NOT DONE: Decision Log numbers #293 and #294 are still absent from the table, as before.</w:t>
+            </w:r>
+          </w:p>
+        </w:tc>
+      </w:tr>
+      <w:tr>
+        <w:tc>
+          <w:tcPr>
+            <w:tcW w:type="dxa" w:w="500"/>
+          </w:tcPr>
+          <w:p>
+            <w:r>
+              <w:t>434</w:t>
+            </w:r>
+          </w:p>
+        </w:tc>
+        <w:tc>
+          <w:tcPr>
+            <w:tcW w:type="dxa" w:w="4700"/>
+          </w:tcPr>
+          <w:p>
+            <w:r>
+              <w:t>Founder decision 2026-10-28 (security follow-ups, item 4 of 5; founder approved 2026-10-28; the platform is not live): multer override until NestJS 12. multer is pinned to 2.5.0 with an npm override because @nestjs/platform-express 11.x pins multer 2.4.0 exactly (GHSA-q7qp-rjg7-q26m, a denial of service through a pending asynchronous fileFilter after request teardown). A unit test fails the build if any fileFilter appears in services/api/src. The override is removed when NestJS 12 is adopted (a separate, large migration, #24).</w:t>
+            </w:r>
+          </w:p>
+        </w:tc>
+        <w:tc>
+          <w:tcPr>
+            <w:tcW w:type="dxa" w:w="1850"/>
+          </w:tcPr>
+          <w:p>
+            <w:r>
+              <w:t>docs/security-followups-decisions-2026-10-28 (docs only, 2026-10-28; founder statement, item 4 of 5; sources: Decision Log #7, #20, #24, #190, #421, #422, #423, #429; services/api/src/rate-limit/, services/api/src/modules/auth/rate-limit/auth-limits/, services/api/src/multer-no-filefilter.guard.spec.ts, root package.json overrides, PRs #487, #488, #491; docs/build-register.md Sections 2, 3 and 53; CLAUDE.md)</w:t>
+            </w:r>
+          </w:p>
+        </w:tc>
+        <w:tc>
+          <w:tcPr>
+            <w:tcW w:type="dxa" w:w="2300"/>
+          </w:tcPr>
+          <w:p>
+            <w:r>
+              <w:t>Decided 2026-10-28 (founder approved 2026-10-28). BUILT in PR #487 (security/multer-override), register row B-264. Found on origin/main 63cd3b8: the root package.json overrides hold multer 2.5.0 beside (not inside) the @soccernity/web block; the lockfile diff was the single node_modules/multer entry; one copy of multer remains, 2.5.0, used by services/api's own ^2.3.0 edge and by @nestjs/platform-express (still 11.2.6); npm audit total 29 -&gt; 27, high 4 -&gt; 2, nothing added. The advisory was not reachable before (no fileFilter exists anywhere in services/api/src; every FileInterceptor passes limits.fileSize only) and is not now; the override is defence in depth against a future fileFilter. services/api/src/multer-no-filefilter.guard.spec.ts fails the build if any .ts file under services/api/src (comments stripped, itself excluded) uses a fileFilter option, with a self-check that the detector catches the two usual shapes and a non-vacuity check on the number of files scanned. Removal trigger: adopt NestJS 12 (@nestjs/platform-express 12.x pins multer 2.5.0 itself); then delete the multer line from the root overrides and KEEP the guard spec. A bump within 11.x does not undo the override. (FORWARD-POINTERS) Dated note appended (original text unchanged) to #423. NOT DONE: Decision Log numbers #293 and #294 are still absent from the table, as before.</w:t>
+            </w:r>
+          </w:p>
+        </w:tc>
+      </w:tr>
+      <w:tr>
+        <w:tc>
+          <w:tcPr>
+            <w:tcW w:type="dxa" w:w="500"/>
+          </w:tcPr>
+          <w:p>
+            <w:r>
+              <w:t>435</w:t>
+            </w:r>
+          </w:p>
+        </w:tc>
+        <w:tc>
+          <w:tcPr>
+            <w:tcW w:type="dxa" w:w="4700"/>
+          </w:tcPr>
+          <w:p>
+            <w:r>
+              <w:t>Founder decision 2026-10-28 (security follow-ups, item 5 of 5; founder approved 2026-10-28; the platform is not live): token storage sequencing. B-249 (custom same-site domains for staging and production) is built BEFORE the web and admin token PRs (B-246, B-247). There is no dual-mode build switch: the web and admin apps do not ship both storage modes behind a flag. The browser default flip (B-248) follows both. Staging cannot exercise cookie mode on default onrender.com addresses, which is why the domains come first.</w:t>
+            </w:r>
+          </w:p>
+        </w:tc>
+        <w:tc>
+          <w:tcPr>
+            <w:tcW w:type="dxa" w:w="1850"/>
+          </w:tcPr>
+          <w:p>
+            <w:r>
+              <w:t>docs/security-followups-decisions-2026-10-28 (docs only, 2026-10-28; founder statement, item 5 of 5; sources: Decision Log #7, #20, #24, #190, #421, #422, #423, #429; services/api/src/rate-limit/, services/api/src/modules/auth/rate-limit/auth-limits/, services/api/src/multer-no-filefilter.guard.spec.ts, root package.json overrides, PRs #487, #488, #491; docs/build-register.md Sections 2, 3 and 53; CLAUDE.md)</w:t>
+            </w:r>
+          </w:p>
+        </w:tc>
+        <w:tc>
+          <w:tcPr>
+            <w:tcW w:type="dxa" w:w="2300"/>
+          </w:tcPr>
+          <w:p>
+            <w:r>
+              <w:t>Decided 2026-10-28 (founder approved 2026-10-28). DECIDED, NOT BUILT. Order: B-249 -&gt; B-246 and B-247 -&gt; B-248. B-245 (the API's opt-in cookie mode, PR #484) is already built and is unaffected: it is additive and off by default, so apps/web and apps/admin keep working until their own PRs land. B-249 was a launch-gate row only (#422); it is now a prerequisite of B-246, B-247 and B-248. It is still a human step (the domain, DNS and the Render custom-domain steps). NOT decided: when the domain is bought and how that fits the deferral of production wiring to the launch gate B-090 (#403 item 18, #409) while the founder is saving money; the cost; and which registrable domain. (FORWARD-POINTERS) Dated note appended (original text unchanged) to #422. NOT DONE: Decision Log numbers #293 and #294 are still absent from the table, as before.</w:t>
             </w:r>
           </w:p>
         </w:tc>

</xml_diff>

<commit_message>
docs: media follow-ups - R2 private-prefix launch step, B-257 to B-261 built status, restored Figma pass F1 text, Decision Log #436, B-265 and B-266
Co-Authored-By: Claude Sonnet 5.5 <noreply@anthropic.com>
</commit_message>
<xml_diff>
--- a/docs/Soccernity_MVP_Build_Plan_v1.7.docx
+++ b/docs/Soccernity_MVP_Build_Plan_v1.7.docx
@@ -28294,6 +28294,9 @@
             <w:r>
               <w:t xml:space="preserve"> [2026-10-28: #430 item 2 resolves the scope item carried here: pending and rejected media now stay in a private prefix and are copied to the public prefix only on approval, so a file that is not approved is no longer fetchable by anyone who holds its URL. DECIDED, NOT BUILT: B-257. The rest of the scope (vendor, budget, whether admin and the API are both in scope, the retest) is unchanged, and the test should still check the built result.]</w:t>
             </w:r>
+            <w:r>
+              <w:t xml:space="preserve"> [2026-10-28 (second note, docs/media-followups-2026-10-28, Decision Log #436): the first note above says a file that is not approved is 'no longer fetchable by anyone who holds its URL'. That is an overstatement. It holds once row B-265 is done and not before: on Cloudflare R2 the bucket's public address (S3_PUBLIC_BASE_URL, the r2.dev address or a custom domain) serves the WHOLE bucket unless a path rule or Worker limits it to the post-media/ prefix, or the private files live in a separate bucket. The private-prefix design of #430 item 2 (BUILT, PR #489) does not by itself guarantee it on R2, and it has not been verified against a real bucket. B-265 is a founder-owned launch-gate step (services/api/src/modules/post-media/README.md, deployment caveat; docs/deployment.md). The penetration test should check the built result and B-265 together.]</w:t>
+            </w:r>
           </w:p>
         </w:tc>
       </w:tr>
@@ -28423,6 +28426,9 @@
             <w:r>
               <w:t>Decided 2026-10-28 (founder approved 2026-10-28; build detail marked ADOPTED is a default and veto-able). Records the decision and register work only. Docs only: no code, schema, Figma, legal copy, DPIA or Log Book; docs/sprint-1-dpia-outline-draft.md, docs/contest-spec.md, docs/pending-copy-manifest.md and docs/deployment.md are not touched. Item 1 is a correction of record and a status: the automatic check, the moderator queue and the reports are BUILT (W14 PR #474, W15 PR #476, FC10 PR #477); items 2 to 5 are DECIDED, NOT BUILT. ITEM 1 - what #419 got wrong and what stands: #419 item 4 ('every upload is pending and invisible to everyone but the uploader until a moderator approves it') and the note that the automatic check (B-036) would be 'a later pre-filter only' are superseded. The rest of #419 stands except where item 2 below changes it. As built: a clear pass is approved automatically; a clear fail is rejected automatically with a generic reason; only an uncertain, gave-up or never-checked item enters the moderator queue (source auto_check); user reports (source user_report) feed the same queue; nothing is ever approved by default, and with the check unconfigured an item waits 30 minutes (MEDIA_REVIEW_UNCHECKED_AFTER_MINUTES) and is then sent to the queue. KNOWN LIMITS, stated so they are not rediscovered: (a) a video upload answers 503 until the host provides ffmpeg and ffprobe, which Render's native Node runtime does not (docs/backend-w14-media-report.md, open point 19); (b) the presigned PUT has never been run against a real R2 bucket and needs the bucket CORS rule allowing PUT from the web origin, a human step in docs/deployment.md (open point 18); (c) the automatic check runs about 10 items per minute per API instance (open point 22); (d) a late contest upload is not reviewed before the reveal: the week-4 upload deadline is 23:59:59 on day 24 and the reveal is 00:00:00 on day 25, so a final video the check cannot clear in time is not shown (#419 note (b), unchanged); (e) HEIC is refused with a clear message (open point 7) and must be tried on real devices in a later QA run; (f) anonymisation versus surviving posts conflicts with #341 and #419 item 9 and stays OPEN: anonymisation keeps a Post as '[deleted user]' while item 9 deletes its media objects, so a surviving post loses its files; what happens to the media of a reported or legally held post is likewise not decided. AWS AND STORAGE LAUNCH STEPS (founder-owned, under B-036 and B-037, with B-193): create the AWS account and the IAM user (rekognition:DetectModerationLabels only), and set the AWS opt-out of AI-services data use BEFORE any real key is configured. ITEM 2: supersedes the W14 note that a processed file sits in the PUBLIC prefix before approval (open point 2 of docs/backend-w14-media-report.md): a pending or rejected file stays in a private prefix, is copied to the public prefix on approval only, and is read by its author and by the reviewer through short-lived signed links (the reviewer's 5-minute view link exists today; the author's view moves to a signed link). Rejected files stay private and are not deleted until counsel decides evidence handling (B-206, OPEN under counsel); keeping them is the founder's choice and is not counsel advice. This resolves the penetration-test scope note carried in #427. Register: B-257. ITEM 3: ADOPTED, veto-able: 20 reports per account per rolling 24 hours, held in configuration (the build PR names the variable). It limits, and does not remove, the brigading risk W15 recorded (three accounts can hide anyone's item); the hold threshold of 3 (MEDIA_REPORT_HIDE_THRESHOLD) is unchanged. Reviewer vetting: a moderator who is not child-safety vetted may not open a minor uploader's media, as assertChildSafetyVetted already applies to concernsMinor reports; whether the queue skips such an item or filters it out of the list (as GET /admin/moderation/reports does) is for the build PR to state. This answers #419 note (c). Register: B-258. ITEM 4: today the upload routes carry JwtAuthGuard and GuardianConsentGuard only (B-238 built note); the post payload carries mediaUrls only, so the web reads the upload id from the file URL (FC10 open point); POST /media/:id/report takes no body, so the web report form has no reason field; a confirmed upload never attached to a post is kept indefinitely (W14 open point 23); Message.mediaUrl is a nullable column on Message and POST /conversations/:id/messages accepts it, so removing it is a schema change and a messaging API change, flagged for the build PR (the platform is not live, so nothing needs migrating). Register: B-259. ITEM 5: FC10 found that a submitted final entry cannot be replaced, so 'until you submit' describes the built behaviour. The wording is reconciled in the Figma frames (B-261) and in the code (B-260); it carries no legal or safety promise, so it is not tagged [COPY PENDING LEGAL REVIEW] (#412 item 5). NOT decided: the name of the report-limit variable; how long a rejected file is kept beyond 'not deleted until counsel decides'; whether the private-prefix change keeps the post's mediaUrls copy stable for readers; what the queue does when the only available reviewer is not vetted; whether post upload may go live before the CSAM path (B-206) is answered by counsel; the anonymisation conflict in KNOWN LIMIT (f). Register: B-257 (media privacy: private prefix, copy on approval, signed links; BE then QA), B-258 (reviewer vetting and the per-account report limit; BE), B-259 (upload guards, 7-day unattached purge, media in the post payload, report reason, DM free-URL removal; BE), B-260 (FC10 follow-ups; FC) and B-261 (Figma reconciliation; DS or SB) added; status lines appended (original text unchanged) to B-036, B-037, B-206, B-238, B-239 and B-240 (6 rows). 261 B-IDs; 146 gap frames unchanged (Section 52). The duplicate Section 2 rows B-012 to B-015, B-095 and B-096 are removed from the register only (first copy kept; Section 52 lists each removal and quotes the text that existed only in the removed copy); the docx is not affected by that. DERIVED: no brief for B-257 to B-261 exists beyond the founder's wording; the five rows are read from the five items and may move. (FORWARD-POINTERS) Dated notes appended (original text unchanged) to #419 and #427 (2 rows). NOT DONE: Decision Log numbers #293 and #294 are still absent from the table, as before.</w:t>
             </w:r>
+            <w:r>
+              <w:t xml:space="preserve"> [2026-10-28 (docs/media-followups-2026-10-28, Decision Log #436): items 2, 3 and 4 are BUILT (PR #489, backend/media-privacy-vetting-followups, migration 20261031090000_media_private_prefix_and_report_reason; the web legs of items 4 and 5 are PR #490). Item 5's wording is BUILT in code (PR #490) and in Figma (PR #486, pass R); #436 aligns the Figma wording to the built code and Figma pass S, which is pending and NOT done, builds that alignment. Item 2 carries a launch-gate step that is not yet done: on Cloudflare R2 the public address must serve post-media/ only (row B-265). Flagged and OPEN under counsel (B-206): a rejected file's private object outlives its row and its key still identifies the uploader, which conflicts with #419 item 9 and with anonymisation (#341); the 20-per-24-hours report limit of item 3 is a founder-veto-able default; a narrow keep-versus-withdraw race is healed by the 5-minute reconciler.]</w:t>
+            </w:r>
           </w:p>
         </w:tc>
       </w:tr>
@@ -28632,6 +28638,48 @@
           <w:p>
             <w:r>
               <w:t>Decided 2026-10-28 (founder approved 2026-10-28). DECIDED, NOT BUILT. Order: B-249 -&gt; B-246 and B-247 -&gt; B-248. B-245 (the API's opt-in cookie mode, PR #484) is already built and is unaffected: it is additive and off by default, so apps/web and apps/admin keep working until their own PRs land. B-249 was a launch-gate row only (#422); it is now a prerequisite of B-246, B-247 and B-248. It is still a human step (the domain, DNS and the Render custom-domain steps). NOT decided: when the domain is bought and how that fits the deferral of production wiring to the launch gate B-090 (#403 item 18, #409) while the founder is saving money; the cost; and which registrable domain. (FORWARD-POINTERS) Dated note appended (original text unchanged) to #422. NOT DONE: Decision Log numbers #293 and #294 are still absent from the table, as before.</w:t>
+            </w:r>
+          </w:p>
+        </w:tc>
+      </w:tr>
+      <w:tr>
+        <w:tc>
+          <w:tcPr>
+            <w:tcW w:type="dxa" w:w="500"/>
+          </w:tcPr>
+          <w:p>
+            <w:r>
+              <w:t>436</w:t>
+            </w:r>
+          </w:p>
+        </w:tc>
+        <w:tc>
+          <w:tcPr>
+            <w:tcW w:type="dxa" w:w="4700"/>
+          </w:tcPr>
+          <w:p>
+            <w:r>
+              <w:t>Founder decisions 2026-10-28 (three items and a wording alignment; the platform is not live), taken after the media privacy backend (PR #489), the FC10 follow-ups (PR #490) and Figma pass R (PR #486) merged: (a) The media report 'daily limit reached' sheet shows NO number. The limit stays configuration (POST_MEDIA_REPORT_DAILY_LIMIT) and the sheet's wording stays 'a limited number of reports in 24 hours'. (b) A person at that limit who has something urgent or involving a child is pointed to the general report ('report the post or the person instead'): the existing POST /reports flow, which has no per-account daily cap and stays open to restricted-pending accounts. This is a new line and button on the limit sheet, built in Figma pass S and in the frontend (B-266). (c) The six old Finalist impressions admin frames (Figma ids 6646:22745, 6646:23097, 6646:23419, 6646:23765, 6646:23984, 6646:24345, now the pre-week-4 'settings editable' frames) replace their impression figures with a plain pre-reveal state ('Counting starts at the reveal'), because impressions only start at the reveal; nothing is deleted. ALIGNMENT (recorded as a founder-veto-able default): the final-entry wording in Figma is aligned to the built code, 'You can change your video until you submit.' and 'Remove it and upload another before you submit.'; Figma pass S builds it.</w:t>
+            </w:r>
+          </w:p>
+        </w:tc>
+        <w:tc>
+          <w:tcPr>
+            <w:tcW w:type="dxa" w:w="1850"/>
+          </w:tcPr>
+          <w:p>
+            <w:r>
+              <w:t>docs/media-followups-2026-10-28 (docs only, 2026-10-28; founder decisions 2026-10-28, three items and a wording alignment; sources: Decision Log #419, #427, #430, #412 (item 5); services/api/src/modules/post-media/README.md (deployment caveat), services/api/src/modules/moderation/reports.controller.ts, docs/figma-pass-r-report.md (sections 4 and 7), docs/backend-w14-media-report.md; docs/build-register.md Sections 2, 3, 52 and 54; CLAUDE.md)</w:t>
+            </w:r>
+          </w:p>
+        </w:tc>
+        <w:tc>
+          <w:tcPr>
+            <w:tcW w:type="dxa" w:w="2300"/>
+          </w:tcPr>
+          <w:p>
+            <w:r>
+              <w:t>Decided 2026-10-28 (founder decisions; the wording alignment is a founder-veto-able default). DECIDED, NOT BUILT: nothing in this entry is built; Figma pass S (the three Figma changes) is PENDING and NOT done, and the frontend row B-266 is not started. Docs only: no code, schema, Figma, legal copy or DPIA; docs/pending-copy-manifest.md, docs/sprint-1-dpia-outline-draft.md and the Log Book are not touched. ITEM (a): the limit is a configuration value, not a number the user is shown; the wording stays 'a limited number of reports in 24 hours'; this answers open point 2 of docs/figma-pass-r-report.md section 7. ITEM (b): the limit applies to POST /media/:id/report only; POST /reports (ReportsController, JwtAuthGuard only, deliberately not consent-gated so a restricted-pending minor can still report abuse) has no per-account daily cap, so a person at the media limit still has a route to report something urgent or involving a child; this answers open point 3 of the report; the new line and button are built in Figma pass S and in apps/web as row B-266; whether the new line makes a legal or safety promise (and so needs [COPY PENDING LEGAL REVIEW]) follows the #412 item 5 rule, decided by the build. ITEM (c): impression counting starts only at the reveal (00:00 on day 25), so a number on a frame that shows the period before it is misleading; the six frames show a plain pre-reveal state instead; this answers open point 6 of the report. ALIGNMENT: pass R set the Being-checked frames to 'You can replace it until you submit.'; the built code (PR #490, checked against the real API: once submitted a file cannot be removed) reads 'You can change your video until you submit.' and 'Remove it and upload another before you submit.'; Figma follows the code. REGISTER: B-265 new (W11, launch gate, founder-owned: restrict the R2 public address to post-media/ or use a separate private bucket, and prove a private-media/ object is refused through the public address; recorded here as a launch step, not a new decision; the wording is also step 2 of the post-media list in docs/deployment.md); B-266 new (W9, the limit sheet's urgent line and button in apps/web); status lines appended (original text unchanged) to B-257, B-258, B-259, B-260, B-261, B-090 and B-179, and the Figma pass F1 text that existed only in the duplicate rows removed on 2026-10-28 restored on B-012, B-013, B-015, B-095 and B-096 (12 rows). 266 B-IDs; 146 gap frames unchanged (Section 54). NOT decided and still OPEN: pass R's other open points (the API status codes behind 'already reported' and 'daily limit'; the sample reason text; what a finalist can do after submitting; no separate video report form); which of the two R2 options (path rule or Worker versus a separate bucket); rejected-file retention and evidence handling (B-206, OPEN under counsel). The brief for pass S and for B-266 does not exist beyond the founder's wording; B-266 is read from item (b) and may move. (FORWARD-POINTERS) Dated notes appended (original text unchanged) to #430 and a second dated note to #427 (2 rows). NOT DONE: Decision Log numbers #293 and #294 are still absent from the table, as before.</w:t>
             </w:r>
           </w:p>
         </w:tc>

</xml_diff>

<commit_message>
docs: security and launch-gate decisions 2026-10-29 - Decision Log #437 to #439, register B-267, Section 55
#437 amends the order of #435 (soccernity.com domain layout; B-246 to B-248 built
and tested first against localhost; real-domain cookie check moves to the launch
gate). #438 leaves the guardian lockout notice OPEN under counsel with B-253.
#439 launches on the free Upstash plan and records the Redis exposure.
B-267 collects the launch-gate checks. Docs only; originals unchanged.

Co-Authored-By: Claude Sonnet 5.5 <noreply@anthropic.com>
</commit_message>
<xml_diff>
--- a/docs/Soccernity_MVP_Build_Plan_v1.7.docx
+++ b/docs/Soccernity_MVP_Build_Plan_v1.7.docx
@@ -28513,6 +28513,9 @@
             <w:r>
               <w:t>Decided 2026-10-28 (founder approved 2026-10-28; build detail is an adopted default and veto-able). BUILT in PR #491 (security/login-lockout-redesign), register row B-263. Found on origin/main 63cd3b8: the pair (normalised email plus client IP, hashed together) has the 5-per-15-minutes budget; the account ceiling is AUTH_LOGIN_ACCOUNT_CEILING_* (20 per 24 hours) and, when spent, every address gets 429 until it expires; the pair is checked before the ceiling and a refused attempt gives back the slot it took; each attempt reserves its slot first and releases it on success, so 20 parallel guesses yield exactly 5 attempts per pair; successes are not counted; the per-IP ceiling of 60 per 10 minutes is kept; a real and an unknown address get the same response and the same counters. PasswordResetService.resetPassword clears the account-wide ceiling. The notice is sent by the failed attempt that spends the pair's budget (the 5th), to the account's registered address only, only if an account exists (an unknown address makes no claim and sends nothing), in the background so the response and its timing never depend on it, at most once per account per 24 hours through an atomic Redis SET NX EX (the claim is given back if nothing could be sent, for example an unusable WEB_APP_BASE_URL); it carries no IP, times or counts and links to /forgot-password. No string is tagged for legal review (no legal or safety promise, #412 item 5). Residual risks, not fixed: the 20-per-24-hours ceiling is a lockout the owner shares (anyone can send 20 wrong passwords for a victim's email from 20 addresses and block logins until the key expires or the owner resets the password); the notice can be triggered by a stranger, at most once a day per account; for a minor's account the notice goes to the account's own email only - guardian notification is NOT built and is OPEN for the founder. (FORWARD-POINTERS) Dated note appended (original text unchanged) to #429. NOT DONE: Decision Log numbers #293 and #294 are still absent from the table, as before.</w:t>
             </w:r>
+            <w:r>
+              <w:t xml:space="preserve"> [2026-10-29: #438: the guardian notice for a minor's account is NOT built now and stays OPEN under counsel, decided together with the incident-response plan (B-253); the narrower alternative (notify the guardian only when the account-wide ceiling of 20 failed attempts in 24 hours trips, at most once a day) is recorded for counsel.]</w:t>
+            </w:r>
           </w:p>
         </w:tc>
       </w:tr>
@@ -28555,6 +28558,9 @@
             <w:r>
               <w:t>Decided 2026-10-28 (founder approved 2026-10-28). The code is BUILT; the revisit trigger and the launch-gate checks are NOT done. Auth limiters: PR #491 (register row B-263) - AuthLimitsStore falls back to a per-process in-memory counter with the same semantics for every operation (hit, release, retry-after, the SET NX claim, clear) when Redis is unreachable; bounded at 10,000 entries (expired first, then oldest); counters restart empty when Redis returns; logged and reported to Sentry with the tag rate_limiter=auth at most once a minute; if the fallback itself throws, the request fails open as before. Global limiter: PR #488 (B-262) - it keeps failing open and now reports to Sentry with the tag rate_limiter=global (#431). Both reports are no-ops until SENTRY_DSN is a real value. Still not fail-closed and not shared across instances: with N API instances the effective limit is up to N times looser during an outage, and a flood of distinct keys can evict an old counter. Launch-gate items recorded as a status line on B-090 (Upstash plan highly available; Sentry alerts on rate_limiter=global and rate_limiter=auth configured). Making the admin login fail closed is a future change with the trigger above, not built. (FORWARD-POINTERS) Dated notes appended (original text unchanged) to #421 and #429. NOT DONE: Decision Log numbers #293 and #294 are still absent from the table, as before.</w:t>
             </w:r>
+            <w:r>
+              <w:t xml:space="preserve"> [2026-10-29: #439: launch on the existing free Upstash plan; the Prod Pack is declined for launch. Redis also holds the refresh, password-reset and email-verification tokens with no fallback, so an outage blocks sign-in, refresh and registration until it returns (not tested); accepted for launch. The pricing and quota re-check is a launch-gate check (B-267).]</w:t>
+            </w:r>
           </w:p>
         </w:tc>
       </w:tr>
@@ -28639,6 +28645,9 @@
             <w:r>
               <w:t>Decided 2026-10-28 (founder approved 2026-10-28). DECIDED, NOT BUILT. Order: B-249 -&gt; B-246 and B-247 -&gt; B-248. B-245 (the API's opt-in cookie mode, PR #484) is already built and is unaffected: it is additive and off by default, so apps/web and apps/admin keep working until their own PRs land. B-249 was a launch-gate row only (#422); it is now a prerequisite of B-246, B-247 and B-248. It is still a human step (the domain, DNS and the Render custom-domain steps). NOT decided: when the domain is bought and how that fits the deferral of production wiring to the launch gate B-090 (#403 item 18, #409) while the founder is saving money; the cost; and which registrable domain. (FORWARD-POINTERS) Dated note appended (original text unchanged) to #422. NOT DONE: Decision Log numbers #293 and #294 are still absent from the table, as before.</w:t>
             </w:r>
+            <w:r>
+              <w:t xml:space="preserve"> [2026-10-29: #437: the order is amended. B-246, B-247 and B-248 are now built and tested first against localhost (cookie mode already works between localhost ports), still with no dual-mode switch; B-249 is no longer a prerequisite of them and stays a human launch step; the domain layout is soccernity.com (owned, registered at GoDaddy) and the real-domain cookie check is a launch-gate check (B-267). B-245 (PR #484) is unaffected.]</w:t>
+            </w:r>
           </w:p>
         </w:tc>
       </w:tr>
@@ -28680,6 +28689,132 @@
           <w:p>
             <w:r>
               <w:t>Decided 2026-10-28 (founder decisions; the wording alignment is a founder-veto-able default). DECIDED, NOT BUILT: nothing in this entry is built; Figma pass S (the three Figma changes) is PENDING and NOT done, and the frontend row B-266 is not started. Docs only: no code, schema, Figma, legal copy or DPIA; docs/pending-copy-manifest.md, docs/sprint-1-dpia-outline-draft.md and the Log Book are not touched. ITEM (a): the limit is a configuration value, not a number the user is shown; the wording stays 'a limited number of reports in 24 hours'; this answers open point 2 of docs/figma-pass-r-report.md section 7. ITEM (b): the limit applies to POST /media/:id/report only; POST /reports (ReportsController, JwtAuthGuard only, deliberately not consent-gated so a restricted-pending minor can still report abuse) has no per-account daily cap, so a person at the media limit still has a route to report something urgent or involving a child; this answers open point 3 of the report; the new line and button are built in Figma pass S and in apps/web as row B-266; whether the new line makes a legal or safety promise (and so needs [COPY PENDING LEGAL REVIEW]) follows the #412 item 5 rule, decided by the build. ITEM (c): impression counting starts only at the reveal (00:00 on day 25), so a number on a frame that shows the period before it is misleading; the six frames show a plain pre-reveal state instead; this answers open point 6 of the report. ALIGNMENT: pass R set the Being-checked frames to 'You can replace it until you submit.'; the built code (PR #490, checked against the real API: once submitted a file cannot be removed) reads 'You can change your video until you submit.' and 'Remove it and upload another before you submit.'; Figma follows the code. REGISTER: B-265 new (W11, launch gate, founder-owned: restrict the R2 public address to post-media/ or use a separate private bucket, and prove a private-media/ object is refused through the public address; recorded here as a launch step, not a new decision; the wording is also step 2 of the post-media list in docs/deployment.md); B-266 new (W9, the limit sheet's urgent line and button in apps/web); status lines appended (original text unchanged) to B-257, B-258, B-259, B-260, B-261, B-090 and B-179, and the Figma pass F1 text that existed only in the duplicate rows removed on 2026-10-28 restored on B-012, B-013, B-015, B-095 and B-096 (12 rows). 266 B-IDs; 146 gap frames unchanged (Section 54). NOT decided and still OPEN: pass R's other open points (the API status codes behind 'already reported' and 'daily limit'; the sample reason text; what a finalist can do after submitting; no separate video report form); which of the two R2 options (path rule or Worker versus a separate bucket); rejected-file retention and evidence handling (B-206, OPEN under counsel). The brief for pass S and for B-266 does not exist beyond the founder's wording; B-266 is read from item (b) and may move. (FORWARD-POINTERS) Dated notes appended (original text unchanged) to #430 and a second dated note to #427 (2 rows). NOT DONE: Decision Log numbers #293 and #294 are still absent from the table, as before.</w:t>
+            </w:r>
+          </w:p>
+        </w:tc>
+      </w:tr>
+      <w:tr>
+        <w:tc>
+          <w:tcPr>
+            <w:tcW w:type="dxa" w:w="500"/>
+          </w:tcPr>
+          <w:p>
+            <w:r>
+              <w:t>437</w:t>
+            </w:r>
+          </w:p>
+        </w:tc>
+        <w:tc>
+          <w:tcPr>
+            <w:tcW w:type="dxa" w:w="4700"/>
+          </w:tcPr>
+          <w:p>
+            <w:r>
+              <w:t>Founder decisions 2026-10-29 (security and launch gate, item 1 of 3; the platform is not live): the domain layout and the order of the token-storage PRs. This AMENDS the order set in #435. (a) Domain layout, all under soccernity.com (owned, registered at GoDaddy): production web soccernity.com (and www), admin admin.soccernity.com, API api.soccernity.com; staging web staging.soccernity.com, staging admin admin.staging.soccernity.com, staging API api.staging.soccernity.com. One registrable domain is what the host-only SameSite=Strict refresh cookie needs. (b) #435 built B-249 (custom same-site domains) before the token PRs; now B-246 (apps/web), B-247 (apps/admin) and B-248 (flip the browser default) are built and tested first against localhost (cookie mode already works between localhost ports), still with no dual-mode switch. (c) 'Cookie sign-in, refresh and sign-out verified on the custom domains, for web and admin, cookies host-only, HttpOnly, Secure, SameSite=Strict' becomes a launch-gate check (B-267); B-248's 'run the full Playwright suite on a same-site setup' also happens at the gate. (d) DNS records stay 'DNS only' (not proxied) until the edge-protection decision (#424, B-251). (e) Render is not connected until the launch gate, so no staging exists yet; the exact Render custom-domain and DNS steps go into the launch-gate runbook (B-180) at the gate, from Render's then-current documentation.</w:t>
+            </w:r>
+          </w:p>
+        </w:tc>
+        <w:tc>
+          <w:tcPr>
+            <w:tcW w:type="dxa" w:w="1850"/>
+          </w:tcPr>
+          <w:p>
+            <w:r>
+              <w:t>docs/security-launch-gate-decisions-2026-10-29 (docs only, 2026-10-29; founder statement, item 1 of 3; sources: Decision Log #422, #424, #426, #429, #432, #433, #435; services/api/src/modules/auth/token/refresh-token.store.ts, services/api/src/modules/admin/token/admin-refresh-token.store.ts, services/api/src/modules/auth/password-reset/reset-token.store.ts, services/api/src/modules/auth/registration/email-verification/email-verification-token.store.ts, services/api/test/profile-block.e2e-spec.ts; docs/build-register.md Sections 2, 3, 53 and 55; CLAUDE.md)</w:t>
+            </w:r>
+          </w:p>
+        </w:tc>
+        <w:tc>
+          <w:tcPr>
+            <w:tcW w:type="dxa" w:w="2300"/>
+          </w:tcPr>
+          <w:p>
+            <w:r>
+              <w:t>Decided 2026-10-29 (founder decisions; the platform is not live). DECIDED, NOT BUILT. Docs only: no code, schema, Figma or legal text. AMENDED: the order of #435 (B-249 first). B-249 stays a human launch step but is no longer a prerequisite of B-246, B-247 and B-248; staging still cannot exercise cookie mode on default onrender.com addresses, so the proof on real hosts moves to the launch gate (B-267 (a)) while B-246 to B-248 are tested against localhost. B-245 (the API's opt-in cookie mode, PR #484) is built and unaffected. ANSWERED: the registrable domain (soccernity.com, already owned) and so the 'when is it bought' question #435 left open. NOT decided: the Render plan and cost, and when Render is first connected (the launch gate, B-090); the edge-protection decision (#424, B-251) is still OPEN, which is why DNS stays 'DNS only'. REGISTER: B-267 new (W11, launch-gate checks); status lines appended (original text unchanged) to B-246, B-247, B-248 and B-249, and pointers on B-090, B-180, B-024 and B-256. (FORWARD-POINTERS) Dated note appended (original text unchanged) to #435. NOT DONE: Decision Log numbers #293 and #294 are still absent from the table, as before.</w:t>
+            </w:r>
+          </w:p>
+        </w:tc>
+      </w:tr>
+      <w:tr>
+        <w:tc>
+          <w:tcPr>
+            <w:tcW w:type="dxa" w:w="500"/>
+          </w:tcPr>
+          <w:p>
+            <w:r>
+              <w:t>438</w:t>
+            </w:r>
+          </w:p>
+        </w:tc>
+        <w:tc>
+          <w:tcPr>
+            <w:tcW w:type="dxa" w:w="4700"/>
+          </w:tcPr>
+          <w:p>
+            <w:r>
+              <w:t>Founder decision 2026-10-29 (security and launch gate, item 2 of 3; follow-up to #432; the platform is not live): a guardian notice when a minor's sign-in is locked is NOT built now and stays OPEN under counsel, decided together with the incident-response plan (B-253, #426). Reasons: it would use the guardian's email for a new purpose (counsel on the wording, the privacy notice and the DPIA); a notice on every mistyped password would be noisy and a stranger could trigger it; the platform is not live, so waiting costs nothing. For counsel, the narrower alternative: notify the guardian only when the account-wide ceiling (20 failed attempts across addresses in 24 hours) trips, at most once a day.</w:t>
+            </w:r>
+          </w:p>
+        </w:tc>
+        <w:tc>
+          <w:tcPr>
+            <w:tcW w:type="dxa" w:w="1850"/>
+          </w:tcPr>
+          <w:p>
+            <w:r>
+              <w:t>docs/security-launch-gate-decisions-2026-10-29 (docs only, 2026-10-29; founder statement, item 2 of 3; sources: Decision Log #422, #424, #426, #429, #432, #433, #435; services/api/src/modules/auth/token/refresh-token.store.ts, services/api/src/modules/admin/token/admin-refresh-token.store.ts, services/api/src/modules/auth/password-reset/reset-token.store.ts, services/api/src/modules/auth/registration/email-verification/email-verification-token.store.ts, services/api/test/profile-block.e2e-spec.ts; docs/build-register.md Sections 2, 3, 53 and 55; CLAUDE.md)</w:t>
+            </w:r>
+          </w:p>
+        </w:tc>
+        <w:tc>
+          <w:tcPr>
+            <w:tcW w:type="dxa" w:w="2300"/>
+          </w:tcPr>
+          <w:p>
+            <w:r>
+              <w:t>Decided 2026-10-29 (founder decision). OPEN under counsel; NOT BUILT. What exists today (PR #491, #432): the account owner's own address gets one lockout notice per 24 hours; for a minor's account nobody else is told. This entry does not change that. The narrower alternative is recorded for counsel and is NOT adopted. No string is written or tagged here; the wording, the privacy-notice line and the DPIA entry are counsel's questions. REGISTER: status lines appended (original text unchanged) to B-253 and B-263. (FORWARD-POINTERS) Dated note appended (original text unchanged) to #432. NOT DONE: Decision Log numbers #293 and #294 are still absent from the table, as before.</w:t>
+            </w:r>
+          </w:p>
+        </w:tc>
+      </w:tr>
+      <w:tr>
+        <w:tc>
+          <w:tcPr>
+            <w:tcW w:type="dxa" w:w="500"/>
+          </w:tcPr>
+          <w:p>
+            <w:r>
+              <w:t>439</w:t>
+            </w:r>
+          </w:p>
+        </w:tc>
+        <w:tc>
+          <w:tcPr>
+            <w:tcW w:type="dxa" w:w="4700"/>
+          </w:tcPr>
+          <w:p>
+            <w:r>
+              <w:t>Founder decision 2026-10-29 (security and launch gate, item 3 of 3; follow-up to #433; the platform is not live): launch on the existing FREE Upstash plan; the Prod Pack (multi-zone failover and an uptime SLA) is declined for launch. Source: https://upstash.com/pricing/redis.md fetched 2026-10-29 (free plan: primary replicas only, no SLA; Prod Pack: $200 per month per database, paid plans only). The real exposure, stated plainly: Redis also holds the user and admin refresh tokens, password-reset tokens and email-verification tokens (services/api/src/modules/auth/token/refresh-token.store.ts, services/api/src/modules/admin/token/admin-refresh-token.store.ts, services/api/src/modules/auth/password-reset/reset-token.store.ts, services/api/src/modules/auth/registration/email-verification/email-verification-token.store.ts), and none of those has a fallback, so a Redis outage blocks sign-in, refresh and registration until it returns (not tested). Only the rate limiters fail open (#433). Accepted for launch, to be revisited with real users and revenue. Launch-gate check in B-267: re-check the pricing and the free plan's usage quotas against the expected sign-in traffic.</w:t>
+            </w:r>
+          </w:p>
+        </w:tc>
+        <w:tc>
+          <w:tcPr>
+            <w:tcW w:type="dxa" w:w="1850"/>
+          </w:tcPr>
+          <w:p>
+            <w:r>
+              <w:t>docs/security-launch-gate-decisions-2026-10-29 (docs only, 2026-10-29; founder statement, item 3 of 3; sources: Decision Log #422, #424, #426, #429, #432, #433, #435; services/api/src/modules/auth/token/refresh-token.store.ts, services/api/src/modules/admin/token/admin-refresh-token.store.ts, services/api/src/modules/auth/password-reset/reset-token.store.ts, services/api/src/modules/auth/registration/email-verification/email-verification-token.store.ts, services/api/test/profile-block.e2e-spec.ts; docs/build-register.md Sections 2, 3, 53 and 55; CLAUDE.md)</w:t>
+            </w:r>
+          </w:p>
+        </w:tc>
+        <w:tc>
+          <w:tcPr>
+            <w:tcW w:type="dxa" w:w="2300"/>
+          </w:tcPr>
+          <w:p>
+            <w:r>
+              <w:t>Decided 2026-10-29 (founder decision). DECIDED, NOT BUILT (a purchasing choice; there is nothing to build). Checked in the code on origin/main d837734: the four token stores keep their tokens in Redis and a grep finds no runtime fallback in them (the only in-memory mentions are test fakes); the same outage also blocks password reset and email verification, which use the same Redis. The outage itself was never tested. The Upstash figures are the founder's statement of the page on that date; this docs pass did not re-fetch it, and B-267 (d) re-checks them at the gate. NOT decided: when to revisit (no number or date is set beyond 'real users and revenue'); what to do if the free quotas prove too small. REGISTER: B-267 new (W11); status line appended (original text unchanged) to B-263. (FORWARD-POINTERS) Dated note appended (original text unchanged) to #433. NOT DONE: Decision Log numbers #293 and #294 are still absent from the table, as before.</w:t>
             </w:r>
           </w:p>
         </w:tc>

</xml_diff>

<commit_message>
docs: Decision Log #440 (Contact Us retention), B-046 status, register Section 56
Records the founder's Contact Us retention decision (12 months from the last
message, automatic deletion, figure in configuration) as Decision Log #440,
appends a status line to B-046 and a note to the Part C row-42 line, extends
Section 7 to #440 and adds register Section 56. The B-266, B-261 and #436
status lines were already present from PR #524 and are not duplicated. No
B-ID added. Docs only; legal draft untouched.

Co-Authored-By: Claude Sonnet 5.5 <noreply@anthropic.com>
</commit_message>
<xml_diff>
--- a/docs/Soccernity_MVP_Build_Plan_v1.7.docx
+++ b/docs/Soccernity_MVP_Build_Plan_v1.7.docx
@@ -28822,6 +28822,48 @@
           </w:p>
         </w:tc>
       </w:tr>
+      <w:tr>
+        <w:tc>
+          <w:tcPr>
+            <w:tcW w:type="dxa" w:w="500"/>
+          </w:tcPr>
+          <w:p>
+            <w:r>
+              <w:t>440</w:t>
+            </w:r>
+          </w:p>
+        </w:tc>
+        <w:tc>
+          <w:tcPr>
+            <w:tcW w:type="dxa" w:w="4700"/>
+          </w:tcPr>
+          <w:p>
+            <w:r>
+              <w:t>Founder decision 2026-10-29 (Contact Us form retention; closes the 'none set' point of legal-draft Part C row 42 and the retention gap noted on build-register row B-046; the platform is not live): Contact Us submissions (name, email, category, message) are kept for 12 MONTHS from the LAST message in the enquiry and are then deleted automatically. The figure is held in configuration so it can change without a code change. This is the founder's decision alone; the founder states that it has nothing to do with counsel, and it is NOT recorded here as pending counsel or as counsel-agreed. Basis for the figure, cited as context and not as authority: the ICO says UK GDPR sets no fixed retention periods and that an organisation must set, document, justify and review its own (https://ico.org.uk/for-organisations/uk-gdpr-guidance-and-resources/data-protection-principles/a-guide-to-the-data-protection-principles/storage-limitation/, fetched 2026-10-29); common practice for enquiries is about 12 to 24 months of inactivity (Sprintlaw); one UK council keeps general enquiries and forms for 2 years from last activity (Cotswold DC retention schedule, January 2023). OPEN, a recommendation NOT yet decided by the founder: a message that is really a safeguarding concern or a complaint should become a report or case record with that record's own retention, instead of sitting in the inbox under this period; this needs an 'escalate' action in the admin inbox and would widen B-046.</w:t>
+            </w:r>
+          </w:p>
+        </w:tc>
+        <w:tc>
+          <w:tcPr>
+            <w:tcW w:type="dxa" w:w="1850"/>
+          </w:tcPr>
+          <w:p>
+            <w:r>
+              <w:t>docs/status-lines-and-contact-us-retention-2026-10-29 (docs only, 2026-10-29; founder statement; sources: docs/legal-copy-draft-tos-privacy-policy.md Part C row 42 and PP s1.9 / s9 (read, not edited); docs/build-register.md B-046 and the Part C counsel-pending table; the ICO storage-limitation page, Sprintlaw and the Cotswold DC schedule as cited in the Decision needed cell, taken from the founder's instruction and not re-fetched by this docs pass)</w:t>
+            </w:r>
+          </w:p>
+        </w:tc>
+        <w:tc>
+          <w:tcPr>
+            <w:tcW w:type="dxa" w:w="2300"/>
+          </w:tcPr>
+          <w:p>
+            <w:r>
+              <w:t>Decided 2026-10-29 (founder decision, his alone). DECIDED, NOT BUILT: the Contact Us page, endpoint and admin inbox of B-046 do not exist yet, so there is no stored data, no configuration variable and no deletion job. When built, the 12-month figure must be an environment-driven value (no hard-coded number) and the deletion must run automatically; the clock starts at the last message in the enquiry, so a reply or a follow-up from the same person restarts it. The privacy-policy sentence is NOT updated by this entry: docs/legal-copy-draft-tos-privacy-policy.md still reads '[OPEN: retention period -- Temi/counsel to set; none decided.]' (Part C row 42, PP s1.9 and s9) and stays open until the safeguarding-drafter updates it; the new sentence will be user-facing and will be tagged [COPY PENDING LEGAL REVIEW] when written (Decision Log #412 item 5). NOT decided and still OPEN: whether to add the 'escalate' action to the admin inbox (a recommendation only; it would widen B-046); what happens to an enquiry that is escalated (its record's retention); whether the figure should differ for a message from a minor. REGISTER: no B-ID added (B-046 unchanged in scope; 267 B-IDs, 146 gap frames, Section 56); status line appended (original text unchanged) to B-046, and a note appended to the Part C row-42 line. No Decision Log entry other than this one changed; the status lines the instruction also asked for on B-266, B-261 and #436 were found already present from docs/status-lines-media-followups-2026-10-29 (PR #524, merged) and were not duplicated. NOT DONE: Decision Log numbers #293 and #294 are still absent from the table, as before.</w:t>
+            </w:r>
+          </w:p>
+        </w:tc>
+      </w:tr>
     </w:tbl>
     <w:p>
       <w:r>

</xml_diff>

<commit_message>
docs: dependency policy and repository security settings (Decision Log #441, B-268, B-269)
Docs only. Records the founder's decisions of 2026-10-29 as Decision Log #441:
(a) Sentry major 11 held back, (b) majors taken by hand, (c) Dependabot version
updates paused until the launch gate (implemented by PR #529), (d) repository
settings turned on by the founder (founder-reported, consistent with a read-only
API read), (e) repository visibility consequences (OPEN).

Build register: status lines on B-246, B-247, B-250, B-252, B-255 (all built) and
B-267 (items f and g); new deferred rows B-268 (ESLint 9 flat-config migration)
and B-269 (vite + plugin-react 6 + vitest 5 as one PR); Sections 1, 3, 7 and new
Section 57. Dated forward-pointers on Decision Log #25, #27, #28 and #423.
Appended-only; no original text changed.

Co-Authored-By: Claude Sonnet 5.5 <noreply@anthropic.com>
</commit_message>
<xml_diff>
--- a/docs/Soccernity_MVP_Build_Plan_v1.7.docx
+++ b/docs/Soccernity_MVP_Build_Plan_v1.7.docx
@@ -10716,6 +10716,9 @@
               <w:br/>
               <w:t>SUPERSEDED by Decision Log #27 and #28 (founder-resolved): the “blocked on React 19” line above is no longer accurate — #27 shipped React 19 (19.2.8), clearing the blocker recorded here, and #28 shipped React Router 8 (8.3.0) on top of it. This entry's blocker is fully closed.</w:t>
             </w:r>
+            <w:r>
+              <w:t xml:space="preserve"> [2026-10-29: #441: apps/admin is no longer on React 18 and React Router 6. B-255 (PR #500) moved it to React 19.2.8 and React Router 8, like apps/web, so any statement above or in this entry that apps/admin stays on React 18 or React Router 6 is superseded.]</w:t>
+            </w:r>
           </w:p>
         </w:tc>
       </w:tr>
@@ -10800,6 +10803,9 @@
             <w:r>
               <w:t>Resolved and implemented — React 19 (19.2.8) shipped, a real hoisting regression found and fixed via scoped overrides, React Router 8's blocker now cleared</w:t>
             </w:r>
+            <w:r>
+              <w:t xml:space="preserve"> [2026-10-29: #441: apps/admin is no longer on React 18 and React Router 6. B-255 (PR #500) moved it to React 19.2.8 and React Router 8, like apps/web, so any statement above or in this entry that apps/admin stays on React 18 or React Router 6 is superseded.]</w:t>
+            </w:r>
           </w:p>
         </w:tc>
       </w:tr>
@@ -10841,6 +10847,9 @@
           <w:p>
             <w:r>
               <w:t>Resolved and implemented — React Router 8 (8.3.0) shipped; Decision Log #25's original blocker fully closed; repo Node floor honestly bumped to &gt;=22.22.0 with CI proven green on it</w:t>
+            </w:r>
+            <w:r>
+              <w:t xml:space="preserve"> [2026-10-29: #441: apps/admin is no longer on React 18 and React Router 6. B-255 (PR #500) moved it to React 19.2.8 and React Router 8, like apps/web, so any statement above or in this entry that apps/admin stays on React 18 or React Router 6 is superseded.]</w:t>
             </w:r>
           </w:p>
         </w:tc>
@@ -28123,6 +28132,9 @@
             <w:r>
               <w:t xml:space="preserve"> [2026-10-28: #434: multer is pinned to 2.5.0 by an npm override (PR #487, B-264) with a build-failing guard test against any fileFilter; the override is removed when NestJS 12 is adopted. The patch-now half of this entry was built in PR #480.]</w:t>
             </w:r>
+            <w:r>
+              <w:t xml:space="preserve"> [2026-10-29: #441: B-250 was built as shipped - one npm Dependabot entry for the repository root and a GitHub Actions entry, minor and patch updates grouped, an ignore list for the majors taken by hand (PR #498, refined in PRs #515 and #521), the CodeQL workflow codeql.yml, and a dependency-audit job in ci.yml (High and Critical advisories in production dependencies fail the job; dev dependencies and apps/mobile are report-only). B-255 was built in PR #500: apps/admin is on React 19.2.8 and React Router 8. Dependabot VERSION updates are paused until the launch gate has passed (PR #529, both open-pull-requests-limit values 0); Dependabot alerts, the dependency-audit gate and CodeQL stay on.]</w:t>
+            </w:r>
           </w:p>
         </w:tc>
       </w:tr>
@@ -28860,6 +28872,48 @@
           <w:p>
             <w:r>
               <w:t>Decided 2026-10-29 (founder decision, his alone). DECIDED, NOT BUILT: the Contact Us page, endpoint and admin inbox of B-046 do not exist yet, so there is no stored data, no configuration variable and no deletion job. When built, the 12-month figure must be an environment-driven value (no hard-coded number) and the deletion must run automatically; the clock starts at the last message in the enquiry, so a reply or a follow-up from the same person restarts it. The privacy-policy sentence is NOT updated by this entry: docs/legal-copy-draft-tos-privacy-policy.md still reads '[OPEN: retention period -- Temi/counsel to set; none decided.]' (Part C row 42, PP s1.9 and s9) and stays open until the safeguarding-drafter updates it; the new sentence will be user-facing and will be tagged [COPY PENDING LEGAL REVIEW] when written (Decision Log #412 item 5). NOT decided and still OPEN: whether to add the 'escalate' action to the admin inbox (a recommendation only; it would widen B-046); what happens to an enquiry that is escalated (its record's retention); whether the figure should differ for a message from a minor. REGISTER: no B-ID added (B-046 unchanged in scope; 267 B-IDs, 146 gap frames, Section 56); status line appended (original text unchanged) to B-046, and a note appended to the Part C row-42 line. No Decision Log entry other than this one changed; the status lines the instruction also asked for on B-266, B-261 and #436 were found already present from docs/status-lines-media-followups-2026-10-29 (PR #524, merged) and were not duplicated. NOT DONE: Decision Log numbers #293 and #294 are still absent from the table, as before.</w:t>
+            </w:r>
+          </w:p>
+        </w:tc>
+      </w:tr>
+      <w:tr>
+        <w:tc>
+          <w:tcPr>
+            <w:tcW w:type="dxa" w:w="500"/>
+          </w:tcPr>
+          <w:p>
+            <w:r>
+              <w:t>441</w:t>
+            </w:r>
+          </w:p>
+        </w:tc>
+        <w:tc>
+          <w:tcPr>
+            <w:tcW w:type="dxa" w:w="4700"/>
+          </w:tcPr>
+          <w:p>
+            <w:r>
+              <w:t>Founder decisions 2026-10-29 (dependency policy and repository security settings; the platform is not live): (a) SENTRY MAJOR 11 IS HELD BACK AND TAKEN BY HAND. Reason, as the founder states it was checked against Sentry's documentation on 2026-10-29 (the docs pass that wrote this entry did not fetch that documentation again): Sentry 11's dataCollection defaults always apply (user info, request headers, request and response bodies, database query data, URL query strings), whereas Sentry 10 sends none of that unless sendDefaultPii is set. services/api/src/instrument.ts sets neither (Sentry.init is given dsn, environment and tracesSampleRate only; the installed @sentry/nestjs is 10.76.2). Before any Sentry 11 upgrade, dataCollection must be set explicitly to off. Dependabot ignores @sentry/* majors. (b) MAJOR VERSIONS ARE TAKEN BY HAND, NEVER BY BOT PR: react and react-dom (all updates), react-router and react-router-dom, @nestjs/*, vite, prisma and @prisma/client, expo, react-native and class-validator (major and minor, both 0.x), @vitejs/plugin-react, @stripe/stripe-js and stripe, @sentry/*, eslint and vitest. Reasons on file: vitest 5 needs vite 6.4 or later (its npm peer range is vite ^6.4.0 || ^7.0.0 || ^8.0.0) while the repository is on vite 5 (5.4.21; vitest 1.6.1); @vitejs/plugin-react 6 needs vite 8 (peer vite ^8.0.0); ESLint 10 removes the eslintrc format that all three .eslintrc.cjs files (services/api, apps/web, apps/admin) use (the founder's statement), and eslint-plugin-react 7.37.5 declares support for ESLint only up to the 9.x line (its peer range ends at ^9.7, with no ESLint 10); React moves only by hand because apps/mobile is on React 18 (^18.2.0, React Native) while apps/web and apps/admin are on 19.2.8. (c) DEPENDABOT VERSION UPDATES ARE PAUSED until the launch gate has passed, then re-enabled. This is implemented by PR #529 (merged 2026-10-29): both entries in .github/dependabot.yml have open-pull-requests-limit 0, and re-enabling is setting both back to 5. Dependabot alerts, the CI dependency-audit gate and CodeQL stay on. (d) REPOSITORY SETTINGS the founder says were turned on on 2026-10-29, recorded as founder-reported because repository files cannot show repository settings: Dependabot alerts; secret scanning with push protection; code scanning; and Analyze (javascript-typescript) and dependency-audit as required checks on main. A read-only GitHub API read made by the docs pass on 2026-10-29 was consistent with this: secret scanning and push protection read 'enabled', Dependabot alerts are enabled, CodeQL results are uploaded for main, and a repository ruleset ('main-required-checks') requires Analyze (javascript-typescript), dependency-audit and build-and-test. Dependabot security updates read 'disabled' (a separate setting from alerts, not in the founder's list). (e) REPOSITORY VISIBILITY: the repository is public for now (confirmed 2026-10-29: PUBLIC); the founder plans to make it private after launch to stop cloning. OPEN, not decided: (1) GitHub provides secret scanning with push protection and code scanning free on public repositories only and sells them as paid add-ons for private ones; the current terms and price must be confirmed on GitHub's pricing page at the gate - this was NOT confirmed; (2) if the repository goes private without the add-ons, the required check Analyze (javascript-typescript) would fail to upload its results and block every merge to main; (3) the choice at the gate is to pay for the add-ons, or to remove Analyze from the required checks and add a free secret scanner in CI, or to keep the repository public; (4) making the repository private does not remove copies already cloned or forked, and any secret that was ever committed must be treated as exposed and rotated.</w:t>
+            </w:r>
+          </w:p>
+        </w:tc>
+        <w:tc>
+          <w:tcPr>
+            <w:tcW w:type="dxa" w:w="1850"/>
+          </w:tcPr>
+          <w:p>
+            <w:r>
+              <w:t>docs/security-dependency-policy-2026-10-29 (docs only, 2026-10-29; founder statement; sources: .github/dependabot.yml, .github/workflows/ci.yml and codeql.yml, services/api/src/instrument.ts, services/api/package.json, apps/web/package.json, apps/admin/package.json, the three .eslintrc.cjs files, the npm registry peer ranges of vitest 5, @vitejs/plugin-react 6 and eslint-plugin-react 7.37.5 (read 2026-10-29), a read-only GitHub API read of the repository settings (2026-10-29); Decision Log #20, #25, #27, #28, #423; docs/build-register.md Sections 2, 3, 7, 55 and 57; CLAUDE.md)</w:t>
+            </w:r>
+          </w:p>
+        </w:tc>
+        <w:tc>
+          <w:tcPr>
+            <w:tcW w:type="dxa" w:w="2300"/>
+          </w:tcPr>
+          <w:p>
+            <w:r>
+              <w:t>Decided 2026-10-29 (founder decisions). (a) and (b) are dependency policy: DECIDED. (c) BUILT in PR #529. (d) founder-reported, consistent with a read-only API read. (e) OPEN. NOT DONE: Sentry 11 is not taken; the held majors are not taken (B-268 and B-269 record two of them as deferred). REGISTER (docs/build-register.md, Section 57): status lines appended (original text unchanged) to B-246, B-247, B-250, B-252, B-255 (all built: PRs #501, #533, #498 with #515 and #521 and the pause #529, #499, #500) and B-267 (two new items: (f) re-enable Dependabot version updates and review the held majors; (g) decide the repository-visibility and scanning question before the repository goes private); two new rows, B-268 (ESLint 9 flat-config migration, the prerequisite for ever taking ESLint 10) and B-269 (vite, @vitejs/plugin-react 6 and vitest 5 as one PR), both deferred, taken by hand, not scheduled, no launch dependency; 269 B-IDs, 146 gap frames. (FORWARD-POINTERS) Dated notes appended (original text unchanged) to #25, #27 and #28 (apps/admin is on React 19.2.8 and React Router 8 per B-255) and #423 (what shipped for B-250, and the pause). NOT DONE: Decision Log numbers #293 and #294 are still absent from the table, as before.</w:t>
             </w:r>
           </w:p>
         </w:tc>

</xml_diff>

<commit_message>
docs: hold-rule defaults, RevokedUsername retention, Contact Us escalate (Decision Log #442 to #444)
Docs only. Records the founder's decisions of 2026-10-30:
- #442: approves the minimisation field list, the 30-day appeal window and the
  immediate-delete refusal default that PR #528 (B-044) built.
- #443: RevokedUsername retention, end of the permanent bar and the second-admin
  review route (B-139); decided, not built.
- #444: Contact Us 'escalate' action (resolves the open recommendation in #440);
  decided, not built.

Status lines on B-043, B-044, B-045, B-046, B-139, B-206; register Section 58; no
B-ID added. Dated notes on #376, #402, #406, #440 (originals unchanged).

Co-Authored-By: Claude Sonnet 5.5 <noreply@anthropic.com>
</commit_message>
<xml_diff>
--- a/docs/Soccernity_MVP_Build_Plan_v1.7.docx
+++ b/docs/Soccernity_MVP_Build_Plan_v1.7.docx
@@ -26036,7 +26036,7 @@
           </w:tcPr>
           <w:p>
             <w:r>
-              <w:t>Resolved -- decided, NOT yet built. Erasure stays paused while the report is open (the existing 90-day held-investigation alert stays, Decision Log #345), then until any appeal window has lapsed or the appeal is decided, then for 6 months after closure, whatever the outcome. During the hold: keep the report record, the reported content and messages, and identifiers (user ID, name, email, DOB); clear the password hash and other non-evidence data (exact field list to be approved by Temi in the build PR). REPORTED person (and authors of reported content): held 6 months after closure/appeal, then normal deletion. REPORTER: if the report is upheld, or both parties are found not culpable, the reporter's account follows the normal deletion path and only the report record is kept for the 6 months; if the reporter is found to have acted in bad faith, the reporter's account is held IN FULL for 6 months. Two new admin actions: 'Reporter acted in bad faith' and 'Legal hold' (holds both accounts in full until an admin lifts it; covers lawyers, law enforcement, disputes). COUNSEL NOTE: a reporter's data is held in full only so that records exist if the reported person takes legal action against the reporter; it is not for any other purpose. Counsel review pending. Extends Decision Log #341/#345, which held only while a report was open and set no post-closure period. OPEN: the 6-month figure and the appeal window length are not counsel-sourced; tension with the legal copy's existing 6-7 year retention of moderation case data (PP s9) to be reconciled by counsel.</w:t>
+              <w:t>Resolved -- decided, NOT yet built. Erasure stays paused while the report is open (the existing 90-day held-investigation alert stays, Decision Log #345), then until any appeal window has lapsed or the appeal is decided, then for 6 months after closure, whatever the outcome. During the hold: keep the report record, the reported content and messages, and identifiers (user ID, name, email, DOB); clear the password hash and other non-evidence data (exact field list to be approved by Temi in the build PR). REPORTED person (and authors of reported content): held 6 months after closure/appeal, then normal deletion. REPORTER: if the report is upheld, or both parties are found not culpable, the reporter's account follows the normal deletion path and only the report record is kept for the 6 months; if the reporter is found to have acted in bad faith, the reporter's account is held IN FULL for 6 months. Two new admin actions: 'Reporter acted in bad faith' and 'Legal hold' (holds both accounts in full until an admin lifts it; covers lawyers, law enforcement, disputes). COUNSEL NOTE: a reporter's data is held in full only so that records exist if the reported person takes legal action against the reporter; it is not for any other purpose. Counsel review pending. Extends Decision Log #341/#345, which held only while a report was open and set no post-closure period. OPEN: the 6-month figure and the appeal window length are not counsel-sourced; tension with the legal copy's existing 6-7 year retention of moderation case data (PP s9) to be reconciled by counsel. [2026-10-30: Follow-up in #442 (founder, 2026-10-30). The minimisation field list for a report-held account is APPROVED as built in PR #528; the appeal window is kept at 30 days and is now a decision (still a configuration value); an admin's immediate delete is refused only while a legal hold or a bad-faith hold is active. The 6-month values above are unchanged. Still OPEN: that none of the figures is counsel-sourced, and the tension with the legal copy's 6-7 year retention of moderation case data.]</w:t>
             </w:r>
           </w:p>
         </w:tc>
@@ -27194,7 +27194,7 @@
               <w:t>Resolved -- recorded; DECIDED, NOT BUILT. FOUNDER-ADOPTED DEFAULTS, VETO-ABLE: each item below is adopted now so build work is not blocked, and stands until the founder says otherwise. Amends #395 and closes open points of #395-#399; the original text of those entries is unchanged (dated notes appended). (1) DECLINE 1 AND 2 -- AMENDS #395 B1. #389 already decided that sessions STAY VALID between declines; only the THIRD decline revokes sessions. After decline 1 and decline 2 the minor sees the existing decline page (5491:8241 / 5501:8453) INSIDE the account, using the existing authenticated resend and change-guardian-email routes. The 'declined login result' design of #395 B1 (a login that answers 'declined' with no token) is WITHDRAWN; so is its BACKEND TO CONFIRM point. Build implications recorded, not decisions: today every decline revokes sessions and 'declined' is terminal in code (#337-#340), and resend / change-guardian-email refuse a declined account (#365), so decline 1 and 2 must stop revoking and those routes must accept the account while fewer than three declines have been recorded. Bug fixed by the same work: GuardianConsentPage treats 'declined' as pending (audit section 5 item 5). Build register: B-110 is RE-SCOPED to this and merged into B-102's dependency chain (B-102 now depends on B-110); the B-ID is kept. (2) THIRD DECLINE. Login is blocked at once and the account enters pending deletion with the EXISTING 30-day grace (#375, via refuseConsentAndScheduleDeletion as in #389). This answers #395's open question: 'delete the account immediately' does NOT skip the grace; the minor still receives the email only, no page and no count (#395 B2 stands). (3) REVOKED USERNAME (#398 D3). The handle is held 30 days for everyone (nobody can take it); the revoked user can NEVER re-pick it. This answers #398's ambiguous 'cannot re-pick' point: permanent for that user, 30 days for others. (4) BLOCK (#396). The blocked user is NOT told. A block hides content and search results in both directions: posts, comments, likes, search, rosters. The leaderboard is unaffected. Unblock does NOT restore follows. Still open: Bants rooms (room membership / room listing; the blocked user's posts are covered by 'posts'), the exact like mechanics, and the interaction with the guardian-consent, under-16 and adult-to-minor rules (#346, #347). (5) 2FA (#397). 10 single-use backup codes, stored HASHED. Lost-device recovery needs a backup code, OR email confirmation plus password. Noted for the founder's veto: the email-plus-password path makes 2FA recovery only as strong as the email account. Still open: backup-code format, storage and encryption of the TOTP secret itself, counsel (legal copy Part C row 44). (6) CONTEST EXPOSURE SETTINGS (#399 E4/E5, #388). Tolerance and the per-viewer daily cap apply to WEEK 4 ONLY, not per contest or per week. Their ranges (1-50 percent; 1-50) stay as validation bounds on the week-4 settings; they lock when week 4 starts (day 22), not when week 1 starts. Watch limit (3-120 s) is unchanged. Build register: B-110 (re-scoped), B-102, B-003, B-107 (decline page behaviour note), B-032, B-033, B-039, B-108, B-086, B-087, B-111, B-091, B-092, B-095, B-097. Not decided here and still open: see docs/build-register.md Section 11d. [2026-10-17: Items 1 and 2 are built in the backend (B-110, B-102; PR #416): sessions stay valid after declines 1 and 2, the third decline blocks login at once with the 30-day grace. The 'existing authenticated resend' wording of item 1 is clarified by #405, item 6: the route is the existing email-keyed POST /auth/guardian-consent/resend, not JWT; change-guardian-email is the JWT one. Item 5 (2FA): the backup-code character set, the TOTP secret storage and the per-account lock are decided by #405, item 8.] [2026-10-18: Item 3 built: RevokedUsername (30-day hold for everyone, permanent bar for the revoked user). Retention and appeal path of that record are OPEN, no decision (B-139, #406).] [2026-10-18: QA run (PR #426) confirmed sessions stay valid between declines 1 and 2 and the third decline blocks login at once with the existing 30-day grace. Two of the decline view's three actions are broken in apps/web (B-151, B-152).] [2026-10-19: Item 3 (a revoked username is held 30 days for everyone) is not yet shown to the admin: #408 item 5 adds the line (B-167, B-168).] [2026-10-20: item 3's 30-day hold is now shown to the admin: drawn by K4 (PR #433), built by FC4 (PR #435), wording approved by #410 item 1 (B-167, B-168).]</w:t>
             </w:r>
             <w:r>
-              <w:t xml:space="preserve"> [2026-10-24: backend W5 (PR #439) built the Block rules of item 4 as written (B-039); #411 item 5 closes the points this entry left open (see the note on #396).]</w:t>
+              <w:t xml:space="preserve"> [2026-10-24: backend W5 (PR #439) built the Block rules of item 4 as written (B-039); #411 item 5 closes the points this entry left open (see the note on #396).] [2026-10-30: Item 3's permanent bar ('the revoked user can NEVER re-pick it') is limited by #443: the RevokedUsername record is deleted when the account is anonymised, or when the 30-day handle hold ends if that is later, so the bar ends when the account is anonymised. NOT BUILT.]</w:t>
             </w:r>
           </w:p>
         </w:tc>
@@ -27374,7 +27374,7 @@
               <w:t xml:space="preserve"> [2026-10-24: K5 (PR #438): item 13 - the Figma guardian-confirm footnote is final and each of its three guardian/child sentences carries its own [COPY PENDING LEGAL REVIEW] tag (docs/figma-pass-k5-report.md section 6); item 12 - built by backend W5 (PR #439): a blocked viewer gets the same 404 as a missing profile.]</w:t>
             </w:r>
             <w:r>
-              <w:t xml:space="preserve"> [2026-10-25: #412 item 5: the tag rule - [COPY PENDING LEGAL REVIEW] only where a string makes a legal or safety promise. The pending-copy guard (B-124) is unchanged and still treats every tagged string as blocking.]</w:t>
+              <w:t xml:space="preserve"> [2026-10-25: #412 item 5: the tag rule - [COPY PENDING LEGAL REVIEW] only where a string makes a legal or safety promise. The pending-copy guard (B-124) is unchanged and still treats every tagged string as blocking.] [2026-10-30: The RevokedUsername retention and appeal point (B-139) is DECIDED in #443 (founder, adopted as recommended): the record is kept while the account exists and deleted when the account is anonymised, or when the 30-day handle hold ends if that is later; the permanent bar ends at anonymisation; a revoked user asks support and a DIFFERENT admin decides (the second-admin principle of #138). NOT BUILT: no reinstate action exists and the route needs a design.]</w:t>
             </w:r>
           </w:p>
         </w:tc>
@@ -28871,7 +28871,7 @@
           </w:tcPr>
           <w:p>
             <w:r>
-              <w:t>Decided 2026-10-29 (founder decision, his alone). DECIDED, NOT BUILT: the Contact Us page, endpoint and admin inbox of B-046 do not exist yet, so there is no stored data, no configuration variable and no deletion job. When built, the 12-month figure must be an environment-driven value (no hard-coded number) and the deletion must run automatically; the clock starts at the last message in the enquiry, so a reply or a follow-up from the same person restarts it. The privacy-policy sentence is NOT updated by this entry: docs/legal-copy-draft-tos-privacy-policy.md still reads '[OPEN: retention period -- Temi/counsel to set; none decided.]' (Part C row 42, PP s1.9 and s9) and stays open until the safeguarding-drafter updates it; the new sentence will be user-facing and will be tagged [COPY PENDING LEGAL REVIEW] when written (Decision Log #412 item 5). NOT decided and still OPEN: whether to add the 'escalate' action to the admin inbox (a recommendation only; it would widen B-046); what happens to an enquiry that is escalated (its record's retention); whether the figure should differ for a message from a minor. REGISTER: no B-ID added (B-046 unchanged in scope; 267 B-IDs, 146 gap frames, Section 56); status line appended (original text unchanged) to B-046, and a note appended to the Part C row-42 line. No Decision Log entry other than this one changed; the status lines the instruction also asked for on B-266, B-261 and #436 were found already present from docs/status-lines-media-followups-2026-10-29 (PR #524, merged) and were not duplicated. NOT DONE: Decision Log numbers #293 and #294 are still absent from the table, as before.</w:t>
+              <w:t>Decided 2026-10-29 (founder decision, his alone). DECIDED, NOT BUILT: the Contact Us page, endpoint and admin inbox of B-046 do not exist yet, so there is no stored data, no configuration variable and no deletion job. When built, the 12-month figure must be an environment-driven value (no hard-coded number) and the deletion must run automatically; the clock starts at the last message in the enquiry, so a reply or a follow-up from the same person restarts it. The privacy-policy sentence is NOT updated by this entry: docs/legal-copy-draft-tos-privacy-policy.md still reads '[OPEN: retention period -- Temi/counsel to set; none decided.]' (Part C row 42, PP s1.9 and s9) and stays open until the safeguarding-drafter updates it; the new sentence will be user-facing and will be tagged [COPY PENDING LEGAL REVIEW] when written (Decision Log #412 item 5). NOT decided and still OPEN: whether to add the 'escalate' action to the admin inbox (a recommendation only; it would widen B-046); what happens to an enquiry that is escalated (its record's retention); whether the figure should differ for a message from a minor. REGISTER: no B-ID added (B-046 unchanged in scope; 267 B-IDs, 146 gap frames, Section 56); status line appended (original text unchanged) to B-046, and a note appended to the Part C row-42 line. No Decision Log entry other than this one changed; the status lines the instruction also asked for on B-266, B-261 and #436 were found already present from docs/status-lines-media-followups-2026-10-29 (PR #524, merged) and were not duplicated. NOT DONE: Decision Log numbers #293 and #294 are still absent from the table, as before. [2026-10-30: The OPEN 'escalate' recommendation is DECIDED in #444 (founder, adopted): an admin can escalate an enquiry that is really a safeguarding concern or a complaint into a report or case record; from then the retention of that linked record applies to that enquiry and the 12-month deletion no longer does; no new figure is set. NOT BUILT; the report or case record, the inbox and the action have no Figma frames and no design yet. Still OPEN: whether the figure should differ for a message from a minor.]</w:t>
             </w:r>
           </w:p>
         </w:tc>
@@ -28914,6 +28914,132 @@
           <w:p>
             <w:r>
               <w:t>Decided 2026-10-29 (founder decisions). (a) and (b) are dependency policy: DECIDED. (c) BUILT in PR #529. (d) founder-reported, consistent with a read-only API read. (e) OPEN. NOT DONE: Sentry 11 is not taken; the held majors are not taken (B-268 and B-269 record two of them as deferred). REGISTER (docs/build-register.md, Section 57): status lines appended (original text unchanged) to B-246, B-247, B-250, B-252, B-255 (all built: PRs #501, #533, #498 with #515 and #521 and the pause #529, #499, #500) and B-267 (two new items: (f) re-enable Dependabot version updates and review the held majors; (g) decide the repository-visibility and scanning question before the repository goes private); two new rows, B-268 (ESLint 9 flat-config migration, the prerequisite for ever taking ESLint 10) and B-269 (vite, @vitejs/plugin-react 6 and vitest 5 as one PR), both deferred, taken by hand, not scheduled, no launch dependency; 269 B-IDs, 146 gap frames. (FORWARD-POINTERS) Dated notes appended (original text unchanged) to #25, #27 and #28 (apps/admin is on React 19.2.8 and React Router 8 per B-255) and #423 (what shipped for B-250, and the pause). NOT DONE: Decision Log numbers #293 and #294 are still absent from the table, as before.</w:t>
+            </w:r>
+          </w:p>
+        </w:tc>
+      </w:tr>
+      <w:tr>
+        <w:tc>
+          <w:tcPr>
+            <w:tcW w:type="dxa" w:w="500"/>
+          </w:tcPr>
+          <w:p>
+            <w:r>
+              <w:t>442</w:t>
+            </w:r>
+          </w:p>
+        </w:tc>
+        <w:tc>
+          <w:tcPr>
+            <w:tcW w:type="dxa" w:w="4700"/>
+          </w:tcPr>
+          <w:p>
+            <w:r>
+              <w:t>Follow-up to #376, #398 D1 and #403 item 8 (build register B-044): the list of fields cleared when an account is held only because of a report, the length of the appeal window, and when an admin's immediate delete is refused.</w:t>
+            </w:r>
+          </w:p>
+        </w:tc>
+        <w:tc>
+          <w:tcPr>
+            <w:tcW w:type="dxa" w:w="1850"/>
+          </w:tcPr>
+          <w:p>
+            <w:r>
+              <w:t>docs/decisions-hold-defaults-b139-escalate-2026-10-30 (docs only, 2026-10-30; founder decisions 2026-10-30; sources: Decision Log #376, #398 D1, #403 item 8; services/api/src/modules/account-deletion/account-deletion-sweep.service.ts (minimiseHeldUser, deleteBehaviouralRows, PR #528); services/api/src/modules/account-hold/account-hold.config.ts; services/api/src/modules/admin-users/admin-users.constants.ts; build-register rows B-043, B-044, B-045)</w:t>
+            </w:r>
+          </w:p>
+        </w:tc>
+        <w:tc>
+          <w:tcPr>
+            <w:tcW w:type="dxa" w:w="2300"/>
+          </w:tcPr>
+          <w:p>
+            <w:r>
+              <w:t>Resolved -- decided 2026-10-30 by the founder. (a), (b) and (c) are behaviour that PR #528 (B-044) already built, so this entry approves what exists and adds no code; the platform is not live. (a) MINIMISATION FIELD LIST for an account held ONLY because of a report: APPROVED by the founder (this is the 'exact field list to be approved by Temi' that #376 left for the build PR). CLEARED: the password hash (replaced with the unusable value '!anonymized'), phone, bio, preferred club, profile country, club affiliation, represented club, avatar and cover (the database columns and the stored files), and the behavioural rows (likes, saved posts, follows in both directions, blocks in both directions, notifications, contest impressions, kickoff subscriptions, and Banter Room, Community Group and Club page memberships). KEPT: id, email, display name, username, date of birth, minor flag, declared and derived country, the guardian record and consent data, posts, comments, messages, results, reports, post media, grassroots team ownership, points and leaderboard rows, and every audit row. It applies ONLY to a hold derived from a report; a legal hold or a bad-faith hold keeps the whole account. Where it lives: minimiseHeldUser and deleteBehaviouralRows in services/api/src/modules/account-deletion/account-deletion-sweep.service.ts. (b) APPEAL WINDOW: the founder keeps 30 days (REPORT_APPEAL_WINDOW_DAYS=30). It started as a placeholder; it is now a decision and stays a configuration value. An appeal made after the window is refused with 403, code appeal_window_closed. (The code comment in account-hold.config.ts and the note in .env.example still call the figure a PLACEHOLDER; they are not edited by this docs PR.) (c) DEFAULT THAT STANDS, NOT VETOED: an admin's immediate delete (PATCH /admin/users/:id with status 'deleted') is refused with 409, code account_hold_active, only while a legal hold or a bad-faith hold is active; report-based holds do not stop it, because the admin chose the delete explicitly. The 6-month values (the hold after a report is closed, and the bad-faith hold) are cited as #376 states them ('held 6 months after closure/appeal'; a reporter found to have acted in bad faith held in full 'for 6 months') and as #403 item 8 calls them ('the 6-month bad-faith hold'); they are not restated or changed here. STILL OPEN, as recorded in #376: the 6-month figures and the appeal window are not counsel-sourced, and the tension with the legal copy's 6-7 year retention of moderation case data (PP s9) is for counsel to reconcile. Not changed here: the Lift hold control, which is not built (see the status lines on B-045). REGISTER: status line on B-044 (and on B-043 and B-045); no B-ID added (Section 58).</w:t>
+            </w:r>
+          </w:p>
+        </w:tc>
+      </w:tr>
+      <w:tr>
+        <w:tc>
+          <w:tcPr>
+            <w:tcW w:type="dxa" w:w="500"/>
+          </w:tcPr>
+          <w:p>
+            <w:r>
+              <w:t>443</w:t>
+            </w:r>
+          </w:p>
+        </w:tc>
+        <w:tc>
+          <w:tcPr>
+            <w:tcW w:type="dxa" w:w="4700"/>
+          </w:tcPr>
+          <w:p>
+            <w:r>
+              <w:t>RevokedUsername record: how long it is kept, what happens to the permanent bar, and who reviews a revocation (build register B-139; resolves the OPEN item recorded in #406).</w:t>
+            </w:r>
+          </w:p>
+        </w:tc>
+        <w:tc>
+          <w:tcPr>
+            <w:tcW w:type="dxa" w:w="1850"/>
+          </w:tcPr>
+          <w:p>
+            <w:r>
+              <w:t>docs/decisions-hold-defaults-b139-escalate-2026-10-30 (docs only, 2026-10-30; founder decision 2026-10-30, adopted as recommended; sources: Decision Log #138, #398 D3, #402 item 3, #406; docs/backend-w4-username-report.md section 5 (as cited in #406); services/api/src/modules/account-deletion/anonymized-row-purge.references.ts; build-register rows B-033, B-043, B-139)</w:t>
+            </w:r>
+          </w:p>
+        </w:tc>
+        <w:tc>
+          <w:tcPr>
+            <w:tcW w:type="dxa" w:w="2300"/>
+          </w:tcPr>
+          <w:p>
+            <w:r>
+              <w:t>Resolved -- decided 2026-10-30 by the founder, ADOPTED as recommended. DECIDED, NOT BUILT; the platform is not live. (a) RETENTION: the RevokedUsername record (handle, user, revoked-at, hold-until) is kept while the account exists and is deleted when the account is anonymised, or when the 30-day handle hold ends if that is later. (b) CONSEQUENCE ACCEPTED: the permanent bar that stops the revoked user taking that handle again (#402 item 3: 'the revoked user can NEVER re-pick it') ends when the account is anonymised; once the 30-day hold has also ended, the handle is free for anyone. (c) REVIEW, one route: the revoked user asks support, and a DIFFERENT admin from the one who revoked decides. This applies the second-admin principle of #138 ('an appeal is reviewed by a SECOND admin/moderator -- never the admin/moderator who made the original decision'), which #138 states for moderation appeals; here it is carried over to username revocation. NOT BUILT: no action to reinstate a revoked username exists, and the route needs a design (the support request, the second admin's screen, what reinstating does to the 30-day hold and the permanent bar, and which admin roles may decide are not stated and belong to that design). (d) PURGE JOB: the purge job (B-043, PR #526) currently treats the RevokedUsername record as blocking a purge -- 'RevokedUsername.userId': 'content', a veto-able default recorded in services/api/src/modules/account-deletion/anonymized-row-purge.references.ts while B-139 was OPEN. That rule is reversed when the build lands: the anonymisation step must delete the record on the terms in (a), and the classification in the references file must change with it. REGISTER: B-139 status line (decided, NOT BUILT); no B-ID added (Section 58). Forward-pointer appended to the B-139 point in #406 and to #402 item 3, whose permanent bar (b) limits.</w:t>
+            </w:r>
+          </w:p>
+        </w:tc>
+      </w:tr>
+      <w:tr>
+        <w:tc>
+          <w:tcPr>
+            <w:tcW w:type="dxa" w:w="500"/>
+          </w:tcPr>
+          <w:p>
+            <w:r>
+              <w:t>444</w:t>
+            </w:r>
+          </w:p>
+        </w:tc>
+        <w:tc>
+          <w:tcPr>
+            <w:tcW w:type="dxa" w:w="4700"/>
+          </w:tcPr>
+          <w:p>
+            <w:r>
+              <w:t>Contact Us: an 'escalate' action for an enquiry that is really a safeguarding concern or a complaint (build register B-046; resolves the OPEN recommendation recorded inside #440).</w:t>
+            </w:r>
+          </w:p>
+        </w:tc>
+        <w:tc>
+          <w:tcPr>
+            <w:tcW w:type="dxa" w:w="1850"/>
+          </w:tcPr>
+          <w:p>
+            <w:r>
+              <w:t>docs/decisions-hold-defaults-b139-escalate-2026-10-30 (docs only, 2026-10-30; founder decision 2026-10-30; sources: Decision Log #440, #376; docs/legal-copy-draft-tos-privacy-policy.md Part C row 42 and PP s1.9 / s9 (read, not edited); build-register row B-046)</w:t>
+            </w:r>
+          </w:p>
+        </w:tc>
+        <w:tc>
+          <w:tcPr>
+            <w:tcW w:type="dxa" w:w="2300"/>
+          </w:tcPr>
+          <w:p>
+            <w:r>
+              <w:t>Resolved -- decided 2026-10-30 by the founder, ADOPTED. DECIDED, NOT BUILT; the platform is not live. An admin can escalate a Contact Us enquiry that is really a safeguarding concern or a complaint into a report or case record. From then, the retention of that linked record applies to that enquiry and the 12-month deletion of #440 no longer does; no new retention figure is set. B-046 is widened (page, endpoint, inbox, deletion job, plus the escalate action and a link from an enquiry to the record) by a status line on B-046 and no new B-ID, as #440 did. FOR COUNSEL: the privacy-policy wording for Part C row 42 must say that an enquiry can be kept longer; that is a separate drafting PR by the safeguarding-drafter and the new user-facing sentence will be tagged [COPY PENDING LEGAL REVIEW] (Decision Log #412 item 5). Not edited here: docs/legal-copy-draft-tos-privacy-policy.md still reads '[OPEN: retention period -- Temi/counsel to set; none decided.]'. OPEN: the report or case record that an escalation creates (which model, what fields), the admin inbox and the escalate action have NO Figma frames and no design yet. Still OPEN from #440 and not decided here: whether the 12-month figure should differ for a message from a minor. Forward-pointer appended to #440.</w:t>
             </w:r>
           </w:p>
         </w:tc>

</xml_diff>

<commit_message>
docs: W7 Contact Us build defaults (Decision Log #445, register Section 59)
Docs only. Records the founder's W7 Contact Us build defaults (rate limits,
Contact enquiries inbox tab, mailto replies, no acknowledgement email,
escalate fields, submitter id and anonymisation rule, categories, notice
under the form) as Decision Log #445, with forward notes on #440 and #444.
Status lines on B-046 and B-047; Section 7 extended to #445; Section 59
added. No B-ID added (269).

Correction of the instruction: the Contact Category Dropdown has five
options, not six ('Data / Livescores Issues' is one).

Co-Authored-By: Claude Sonnet 5.5 <noreply@anthropic.com>
</commit_message>
<xml_diff>
--- a/docs/Soccernity_MVP_Build_Plan_v1.7.docx
+++ b/docs/Soccernity_MVP_Build_Plan_v1.7.docx
@@ -28871,7 +28871,7 @@
           </w:tcPr>
           <w:p>
             <w:r>
-              <w:t>Decided 2026-10-29 (founder decision, his alone). DECIDED, NOT BUILT: the Contact Us page, endpoint and admin inbox of B-046 do not exist yet, so there is no stored data, no configuration variable and no deletion job. When built, the 12-month figure must be an environment-driven value (no hard-coded number) and the deletion must run automatically; the clock starts at the last message in the enquiry, so a reply or a follow-up from the same person restarts it. The privacy-policy sentence is NOT updated by this entry: docs/legal-copy-draft-tos-privacy-policy.md still reads '[OPEN: retention period -- Temi/counsel to set; none decided.]' (Part C row 42, PP s1.9 and s9) and stays open until the safeguarding-drafter updates it; the new sentence will be user-facing and will be tagged [COPY PENDING LEGAL REVIEW] when written (Decision Log #412 item 5). NOT decided and still OPEN: whether to add the 'escalate' action to the admin inbox (a recommendation only; it would widen B-046); what happens to an enquiry that is escalated (its record's retention); whether the figure should differ for a message from a minor. REGISTER: no B-ID added (B-046 unchanged in scope; 267 B-IDs, 146 gap frames, Section 56); status line appended (original text unchanged) to B-046, and a note appended to the Part C row-42 line. No Decision Log entry other than this one changed; the status lines the instruction also asked for on B-266, B-261 and #436 were found already present from docs/status-lines-media-followups-2026-10-29 (PR #524, merged) and were not duplicated. NOT DONE: Decision Log numbers #293 and #294 are still absent from the table, as before. [2026-10-30: The OPEN 'escalate' recommendation is DECIDED in #444 (founder, adopted): an admin can escalate an enquiry that is really a safeguarding concern or a complaint into a report or case record; from then the retention of that linked record applies to that enquiry and the 12-month deletion no longer does; no new figure is set. NOT BUILT; the report or case record, the inbox and the action have no Figma frames and no design yet. Still OPEN: whether the figure should differ for a message from a minor.]</w:t>
+              <w:t>Decided 2026-10-29 (founder decision, his alone). DECIDED, NOT BUILT: the Contact Us page, endpoint and admin inbox of B-046 do not exist yet, so there is no stored data, no configuration variable and no deletion job. When built, the 12-month figure must be an environment-driven value (no hard-coded number) and the deletion must run automatically; the clock starts at the last message in the enquiry, so a reply or a follow-up from the same person restarts it. The privacy-policy sentence is NOT updated by this entry: docs/legal-copy-draft-tos-privacy-policy.md still reads '[OPEN: retention period -- Temi/counsel to set; none decided.]' (Part C row 42, PP s1.9 and s9) and stays open until the safeguarding-drafter updates it; the new sentence will be user-facing and will be tagged [COPY PENDING LEGAL REVIEW] when written (Decision Log #412 item 5). NOT decided and still OPEN: whether to add the 'escalate' action to the admin inbox (a recommendation only; it would widen B-046); what happens to an enquiry that is escalated (its record's retention); whether the figure should differ for a message from a minor. REGISTER: no B-ID added (B-046 unchanged in scope; 267 B-IDs, 146 gap frames, Section 56); status line appended (original text unchanged) to B-046, and a note appended to the Part C row-42 line. No Decision Log entry other than this one changed; the status lines the instruction also asked for on B-266, B-261 and #436 were found already present from docs/status-lines-media-followups-2026-10-29 (PR #524, merged) and were not duplicated. NOT DONE: Decision Log numbers #293 and #294 are still absent from the table, as before. [2026-10-30: The OPEN 'escalate' recommendation is DECIDED in #444 (founder, adopted): an admin can escalate an enquiry that is really a safeguarding concern or a complaint into a report or case record; from then the retention of that linked record applies to that enquiry and the 12-month deletion no longer does; no new figure is set. NOT BUILT; the report or case record, the inbox and the action have no Figma frames and no design yet. Still OPEN: whether the figure should differ for a message from a minor.] [2026-10-30: The build defaults for the Contact Us route, rate limits, admin inbox and escalate action are recorded in #445 (founder, adopted by default, veto-able). NOT BUILT. The 12-month clock runs from receipt in v1, because there is no in-app reply. Still OPEN: whether a repeat message from the same person restarts it, and whether the figure should differ for a message from a minor.]</w:t>
             </w:r>
           </w:p>
         </w:tc>
@@ -29039,7 +29039,49 @@
           </w:tcPr>
           <w:p>
             <w:r>
-              <w:t>Resolved -- decided 2026-10-30 by the founder, ADOPTED. DECIDED, NOT BUILT; the platform is not live. An admin can escalate a Contact Us enquiry that is really a safeguarding concern or a complaint into a report or case record. From then, the retention of that linked record applies to that enquiry and the 12-month deletion of #440 no longer does; no new retention figure is set. B-046 is widened (page, endpoint, inbox, deletion job, plus the escalate action and a link from an enquiry to the record) by a status line on B-046 and no new B-ID, as #440 did. FOR COUNSEL: the privacy-policy wording for Part C row 42 must say that an enquiry can be kept longer; that is a separate drafting PR by the safeguarding-drafter and the new user-facing sentence will be tagged [COPY PENDING LEGAL REVIEW] (Decision Log #412 item 5). Not edited here: docs/legal-copy-draft-tos-privacy-policy.md still reads '[OPEN: retention period -- Temi/counsel to set; none decided.]'. OPEN: the report or case record that an escalation creates (which model, what fields), the admin inbox and the escalate action have NO Figma frames and no design yet. Still OPEN from #440 and not decided here: whether the 12-month figure should differ for a message from a minor. Forward-pointer appended to #440.</w:t>
+              <w:t>Resolved -- decided 2026-10-30 by the founder, ADOPTED. DECIDED, NOT BUILT; the platform is not live. An admin can escalate a Contact Us enquiry that is really a safeguarding concern or a complaint into a report or case record. From then, the retention of that linked record applies to that enquiry and the 12-month deletion of #440 no longer does; no new retention figure is set. B-046 is widened (page, endpoint, inbox, deletion job, plus the escalate action and a link from an enquiry to the record) by a status line on B-046 and no new B-ID, as #440 did. FOR COUNSEL: the privacy-policy wording for Part C row 42 must say that an enquiry can be kept longer; that is a separate drafting PR by the safeguarding-drafter and the new user-facing sentence will be tagged [COPY PENDING LEGAL REVIEW] (Decision Log #412 item 5). Not edited here: docs/legal-copy-draft-tos-privacy-policy.md still reads '[OPEN: retention period -- Temi/counsel to set; none decided.]'. OPEN: the report or case record that an escalation creates (which model, what fields), the admin inbox and the escalate action have NO Figma frames and no design yet. Still OPEN from #440 and not decided here: whether the 12-month figure should differ for a message from a minor. Forward-pointer appended to #440. [2026-10-30: The build defaults for the escalate action are recorded in #445 (founder, adopted by default, veto-able): an admin gives a severity, a 'concerns a minor' flag and a reason of 10 to 500 characters; the system creates a Report with targetType 'enquiry' and no reporter account, so no account hold can arise for the enquirer; the child-safety vetting gate applies when the minor flag is set; the escalated enquiry is never deleted by the 12-month job. NOT BUILT. #445 also flags that the existing outcome email would go to the enquirer's copied contact email; not decided.]</w:t>
+            </w:r>
+          </w:p>
+        </w:tc>
+      </w:tr>
+      <w:tr>
+        <w:tc>
+          <w:tcPr>
+            <w:tcW w:type="dxa" w:w="500"/>
+          </w:tcPr>
+          <w:p>
+            <w:r>
+              <w:t>445</w:t>
+            </w:r>
+          </w:p>
+        </w:tc>
+        <w:tc>
+          <w:tcPr>
+            <w:tcW w:type="dxa" w:w="4700"/>
+          </w:tcPr>
+          <w:p>
+            <w:r>
+              <w:t>Founder decision 2026-10-30 (W7 Contact Us build defaults; follows #440, the 12-month retention, and #444, the 'escalate' action; build-register rows B-046 and B-047; the platform is not live). The founder's instruction: build everything B-046 needs, including the admin inbox and the escalate action decided in #444. The defaults below are founder-adopted by default and VETO-ABLE. (a) RATE LIMIT on the Contact Us submit route: the same shared limit as the public report route POST /reports/public (@AuthRateLimit(); 5 requests per 60 seconds per IP address), PLUS 3 submissions per email address per hour, with the address hashed (the figure the forgot-password route already uses); both are configuration values; no figure was invented. (b) INBOX: a 'Contact enquiries' tab on the Moderation Queue, beside Held investigations and Media review; moderator and superadmin roles, like user management; an enquiry's status is new or handled and can be reopened. (c) REPLIES are by email from support@soccernity.com (Decision Log #37) through a mailto link; there is no in-app reply in v1, so the 12-month clock of #440 runs from receipt; the field lastMessageAt exists so that a later in-app reply could extend it. (d) NO automatic acknowledgement email to the enquirer, because anyone can type another person's address; support gets a notification that carries the category and a link, never the message text. (e) ESCALATE (#444): an admin gives a severity, a 'concerns a minor' flag and a reason of 10 to 500 characters; the system creates a Report with targetType 'enquiry' and no reporter account (the contact name and email are copied), so no account hold can arise for the enquirer; the child-safety vetting gate applies when the minor flag is set; the escalated enquiry is never deleted by the 12-month job and follows the report's retention. (f) A signed-in submitter's user id is stored; when that account is anonymised their unescalated enquiries are deleted, and an escalated one blocks the purge of that account row (the report is the record). (g) CATEGORIES: the five options in the Contact Category Dropdown component (Technical issues, Editorial Complaints, Data / Livescores Issues, Suggestions, Enquiries/Feedback). (h) NOTICE under the form: a short notice saying what happens to the message, that it is kept 12 months, that it may be kept longer if escalated, with a link to the Privacy Policy; drafted by the safeguarding-drafter and tagged [COPY PENDING LEGAL REVIEW].</w:t>
+            </w:r>
+          </w:p>
+        </w:tc>
+        <w:tc>
+          <w:tcPr>
+            <w:tcW w:type="dxa" w:w="1850"/>
+          </w:tcPr>
+          <w:p>
+            <w:r>
+              <w:t>docs/w7-contact-us-defaults-2026-10-30 (docs only, 2026-10-30; founder instruction 2026-10-30; sources: Decision Log #37, #138, #143, #205, #376, #440, #444; build-register rows B-046, B-047; services/api/src/modules/moderation/public-reports.controller.ts, services/api/src/modules/auth/rate-limit/rate-limit.constants.ts, .env.example and render.yaml (AUTH_FORGOT_PASSWORD_EMAIL_*), services/api/src/modules/moderation/moderation.constants.ts (REPORT_TARGET_TYPES); Figma node 6130:14653 read live 2026-10-30; docs/legal-copy-draft-tos-privacy-policy.md Part C row 42 (read, not edited))</w:t>
+            </w:r>
+          </w:p>
+        </w:tc>
+        <w:tc>
+          <w:tcPr>
+            <w:tcW w:type="dxa" w:w="2300"/>
+          </w:tcPr>
+          <w:p>
+            <w:r>
+              <w:t>Resolved -- decided 2026-10-30 by the founder, ADOPTED by default and veto-able. DECIDED, NOT BUILT; the platform is not live: no Contact Us route, page, endpoint, enquiry table, admin tab, escalate action, deletion job or configuration value exists. CORRECTION OF THE INSTRUCTION, item (g): it counted six categories. The Contact Category Dropdown component (Figma 6130:14653 desktop, 6130:14664 mobile; read live 2026-10-30, and as recorded in the Decision Log #205 pass) has FIVE options, because 'Data / Livescores Issues' is ONE option. The five are recorded. Splitting it into two options would be a Figma and code change, not made here. CHECKED against the code, not copied: the public report route carries a bare @AuthRateLimit() (5 per 60000 ms by default: DEFAULT_AUTH_RATE_LIMIT and DEFAULT_AUTH_RATE_LIMIT_WINDOW_MS); the forgot-password per-email limit is AUTH_FORGOT_PASSWORD_EMAIL_MAX=3 with AUTH_FORGOT_PASSWORD_EMAIL_WINDOW_MS=3600000, keyed on a hash of the address. REGISTER: no B-ID added (269; Section 59); status lines on B-046 (build split into design, backend, screens) and B-047 (rides with B-046); B-139 unchanged. Forward notes appended to #440 and #444. NOTES FOR THE BUILD, not decisions: (1) the Report an escalation creates copies the contact email, and the existing moderation outcome email (Decision Log #143) goes to a public reporter's contact email, so as built an escalated enquiry would email the enquirer when the report is actioned, to an address that (d) says may not be theirs; whether to suppress that is NOT decided; (2) REPORT_TARGET_TYPES has six values, so 'enquiry' is a seventh and needs an existence check, a reported-user resolver that returns nobody (so no hold on anyone) and admin labels; (3) whether the route also carries @SkipGlobalWriteLimit() like the public report route is the build PR's call; (4) the per-email limit is new configuration (or reuses the forgot-password variables); any new variable must be in render.yaml and .env.example, which the drift guard in env-completeness.spec.ts enforces; (5) the submitter's user id, if stored without a foreign key, must be added to the purge job's reference list (B-043), and the unescalated deletion belongs in the anonymisation transaction; the minimisation list of #442 does not mention enquiries and is left as is. OPEN, not decided: whether a second message from the same person or address is the same enquiry (restarting the #440 clock through lastMessageAt) or a new one; which channel notifies support (the existing transactional email path is the only one in the code); whether the 12 months should differ for a message from a minor (still open from #440); the design: the four Contact Us frames (6113:14053, 6113:14199, 6115:14611, 6115:14684) exist, but nothing is drawn for the notice under the form, the submit success, error and rate-limited states, the 'Contact enquiries' tab, the enquiry list and detail, or the escalate dialog, so a Figma pass comes first. For counsel: the notice (h) and the Privacy Policy wording (legal copy v0.9, Part C row 42) must agree; the notice is drafted separately by the safeguarding-drafter and stays [COPY PENDING LEGAL REVIEW].</w:t>
             </w:r>
           </w:p>
         </w:tc>

</xml_diff>

<commit_message>
docs: Dependabot security updates, admin session, two-factor (Decision Log #446, B-270, B-271)
Records the founder's decisions of 2026-10-29/30 as Decision Log #446
(security updates ON, admin session cookie ends on browser close, mandatory
admin and optional user two-factor, admin recovery, and the veto-able
ADMIN_2FA_ENFORCED default). Adds register Section 60, B-270 and B-271 (W10),
status lines on nine rows, a dated forward-pointer on #441, and corrects the
CLAUDE.md bullets this makes stale. Docs only.

Co-Authored-By: Claude Sonnet 5.5 <noreply@anthropic.com>
</commit_message>
<xml_diff>
--- a/docs/Soccernity_MVP_Build_Plan_v1.7.docx
+++ b/docs/Soccernity_MVP_Build_Plan_v1.7.docx
@@ -28913,7 +28913,7 @@
           </w:tcPr>
           <w:p>
             <w:r>
-              <w:t>Decided 2026-10-29 (founder decisions). (a) and (b) are dependency policy: DECIDED. (c) BUILT in PR #529. (d) founder-reported, consistent with a read-only API read. (e) OPEN. NOT DONE: Sentry 11 is not taken; the held majors are not taken (B-268 and B-269 record two of them as deferred). REGISTER (docs/build-register.md, Section 57): status lines appended (original text unchanged) to B-246, B-247, B-250, B-252, B-255 (all built: PRs #501, #533, #498 with #515 and #521 and the pause #529, #499, #500) and B-267 (two new items: (f) re-enable Dependabot version updates and review the held majors; (g) decide the repository-visibility and scanning question before the repository goes private); two new rows, B-268 (ESLint 9 flat-config migration, the prerequisite for ever taking ESLint 10) and B-269 (vite, @vitejs/plugin-react 6 and vitest 5 as one PR), both deferred, taken by hand, not scheduled, no launch dependency; 269 B-IDs, 146 gap frames. (FORWARD-POINTERS) Dated notes appended (original text unchanged) to #25, #27 and #28 (apps/admin is on React 19.2.8 and React Router 8 per B-255) and #423 (what shipped for B-250, and the pause). NOT DONE: Decision Log numbers #293 and #294 are still absent from the table, as before.</w:t>
+              <w:t>Decided 2026-10-29 (founder decisions). (a) and (b) are dependency policy: DECIDED. (c) BUILT in PR #529. (d) founder-reported, consistent with a read-only API read. (e) OPEN. NOT DONE: Sentry 11 is not taken; the held majors are not taken (B-268 and B-269 record two of them as deferred). REGISTER (docs/build-register.md, Section 57): status lines appended (original text unchanged) to B-246, B-247, B-250, B-252, B-255 (all built: PRs #501, #533, #498 with #515 and #521 and the pause #529, #499, #500) and B-267 (two new items: (f) re-enable Dependabot version updates and review the held majors; (g) decide the repository-visibility and scanning question before the repository goes private); two new rows, B-268 (ESLint 9 flat-config migration, the prerequisite for ever taking ESLint 10) and B-269 (vite, @vitejs/plugin-react 6 and vitest 5 as one PR), both deferred, taken by hand, not scheduled, no launch dependency; 269 B-IDs, 146 gap frames. (FORWARD-POINTERS) Dated notes appended (original text unchanged) to #25, #27 and #28 (apps/admin is on React 19.2.8 and React Router 8 per B-255) and #423 (what shipped for B-250, and the pause). NOT DONE: Decision Log numbers #293 and #294 are still absent from the table, as before. [2026-10-30: Dependabot SECURITY updates, which (d) records as 'disabled' on 2026-10-29, are now ON: the founder wants security-fix PRs (#446 (a)); a read-only GitHub API read on 2026-10-30 shows dependabot_security_updates 'enabled'. Version updates stay paused (c). PR #540 stopped the react and react-dom ignore entries from suppressing security updates; PR #537 (shell-quote) was merged and PRs #538 and #539 were closed without merging.]</w:t>
             </w:r>
           </w:p>
         </w:tc>
@@ -29082,6 +29082,48 @@
           <w:p>
             <w:r>
               <w:t>Resolved -- decided 2026-10-30 by the founder, ADOPTED by default and veto-able. DECIDED, NOT BUILT; the platform is not live: no Contact Us route, page, endpoint, enquiry table, admin tab, escalate action, deletion job or configuration value exists. CORRECTION OF THE INSTRUCTION, item (g): it counted six categories. The Contact Category Dropdown component (Figma 6130:14653 desktop, 6130:14664 mobile; read live 2026-10-30, and as recorded in the Decision Log #205 pass) has FIVE options, because 'Data / Livescores Issues' is ONE option. The five are recorded. Splitting it into two options would be a Figma and code change, not made here. CHECKED against the code, not copied: the public report route carries a bare @AuthRateLimit() (5 per 60000 ms by default: DEFAULT_AUTH_RATE_LIMIT and DEFAULT_AUTH_RATE_LIMIT_WINDOW_MS); the forgot-password per-email limit is AUTH_FORGOT_PASSWORD_EMAIL_MAX=3 with AUTH_FORGOT_PASSWORD_EMAIL_WINDOW_MS=3600000, keyed on a hash of the address. REGISTER: no B-ID added (269; Section 59); status lines on B-046 (build split into design, backend, screens) and B-047 (rides with B-046); B-139 unchanged. Forward notes appended to #440 and #444. NOTES FOR THE BUILD, not decisions: (1) the Report an escalation creates copies the contact email, and the existing moderation outcome email (Decision Log #143) goes to a public reporter's contact email, so as built an escalated enquiry would email the enquirer when the report is actioned, to an address that (d) says may not be theirs; whether to suppress that is NOT decided; (2) REPORT_TARGET_TYPES has six values, so 'enquiry' is a seventh and needs an existence check, a reported-user resolver that returns nobody (so no hold on anyone) and admin labels; (3) whether the route also carries @SkipGlobalWriteLimit() like the public report route is the build PR's call; (4) the per-email limit is new configuration (or reuses the forgot-password variables); any new variable must be in render.yaml and .env.example, which the drift guard in env-completeness.spec.ts enforces; (5) the submitter's user id, if stored without a foreign key, must be added to the purge job's reference list (B-043), and the unescalated deletion belongs in the anonymisation transaction; the minimisation list of #442 does not mention enquiries and is left as is. OPEN, not decided: whether a second message from the same person or address is the same enquiry (restarting the #440 clock through lastMessageAt) or a new one; which channel notifies support (the existing transactional email path is the only one in the code); whether the 12 months should differ for a message from a minor (still open from #440); the design: the four Contact Us frames (6113:14053, 6113:14199, 6115:14611, 6115:14684) exist, but nothing is drawn for the notice under the form, the submit success, error and rate-limited states, the 'Contact enquiries' tab, the enquiry list and detail, or the escalate dialog, so a Figma pass comes first. For counsel: the notice (h) and the Privacy Policy wording (legal copy v0.9, Part C row 42) must agree; the notice is drafted separately by the safeguarding-drafter and stays [COPY PENDING LEGAL REVIEW].</w:t>
+            </w:r>
+          </w:p>
+        </w:tc>
+      </w:tr>
+      <w:tr>
+        <w:tc>
+          <w:tcPr>
+            <w:tcW w:type="dxa" w:w="500"/>
+          </w:tcPr>
+          <w:p>
+            <w:r>
+              <w:t>446</w:t>
+            </w:r>
+          </w:p>
+        </w:tc>
+        <w:tc>
+          <w:tcPr>
+            <w:tcW w:type="dxa" w:w="4700"/>
+          </w:tcPr>
+          <w:p>
+            <w:r>
+              <w:t>Founder decisions 2026-10-29 and 2026-10-30 (Dependabot security updates, the Admin Console session, and two-factor; follows #441 (dependency policy), #422 and #437 (token storage) and #378, #397, #404 and #405 (authenticator-app two-factor); the platform is not live). Items (a) to (d) and (f) are the founder's statements; item (e) is a DEFAULT proposed by the drafter and is VETO-ABLE. (a) DEPENDABOT SECURITY UPDATES ARE ON. Founder, 2026-10-29: "Yes I want security-fix PRs for known-vulnerable packages." Dependabot VERSION updates stay paused until the launch gate (#441 (c), built by PR #529). Facts observed, not decisions: security updates ignore the ignore rules in .github/dependabot.yml (PR #539 proposed vite 8 and vitest 5 although major bumps of both are on the ignore list); they scan every manifest folder (for example /e2e); closing a group PR does not stop Dependabot from recreating it; alerts for dev-only tooling can be dismissed in the repository's Security tab with a reason. HANDLING, checked with gh on 2026-10-30: PR #537 (shell-quote 1.10.0 to 1.12.0; the founder states it is a critical advisory pulled in only by apps/mobile's React Native tooling) was MERGED on 2026-10-30; PR #538 (vite 6.4.5) and PR #539 (vite 8.3.5, vitest 5.0.5, Playwright 1.64.1) were CLOSED without merging on 2026-10-30. PR #540 (merged 2026-10-30) scoped the react and react-dom ignore entries by update type so they no longer suppress security updates. The repository setting itself reads dependabot_security_updates 'enabled' (read-only GitHub API read, 2026-10-30), where #441 (d) recorded 'disabled' on 2026-10-29. BUILT. (b) ADMIN CONSOLE SESSIONS END WHEN THE BROWSER CLOSES: the admin refresh cookie is a session cookie and admins have no 'stay signed in'. BUILT by PR #541 (merged 2026-10-30). (c) TWO-FACTOR (authenticator app). (1) Admin accounts: mandatory before launch; enrolled at the next sign-in with no grace period. (2) User accounts: optional for everyone; the app only advises; turning it off needs the password. (3) The backend is built first; the screens wait for the Figma pass (B-015, B-087, B-111). DECIDED, NOT BUILT. (d) ADMIN TWO-FACTOR RECOVERY: 10 single-use backup codes, or another superadmin resets it; nobody can reset their own; the last remaining superadmin recovers through a documented database step in the launch runbook (B-180), in a file docs/admin-two-factor-recovery.md that the build PR will write. DECIDED, NOT BUILT. (e) DEFAULT, VETO-ABLE (proposed by the drafter, not stated by the founder): the requirement in (c)(1) is enforced by an environment switch ADMIN_2FA_ENFORCED, off by default until the admin screens exist, because turning it on earlier would lock every admin out of the Admin Console; a launch-gate check (B-267 (j)) requires it to be true in production. DECIDED as a default, NOT BUILT. (f) COUNSEL: Part C row 44 of the legal copy draft stays open as before; nothing in this entry is a new counsel item.</w:t>
+            </w:r>
+          </w:p>
+        </w:tc>
+        <w:tc>
+          <w:tcPr>
+            <w:tcW w:type="dxa" w:w="1850"/>
+          </w:tcPr>
+          <w:p>
+            <w:r>
+              <w:t>docs/security-decisions-2fa-dependabot-2026-10-30 (docs only, 2026-10-30; founder statements 2026-10-29 and 2026-10-30; sources: .github/dependabot.yml, gh pr view of PRs #529, #536, #537, #538, #539, #540 and #541, a read-only GitHub API read of the repository's security_and_analysis settings (2026-10-30), Decision Log #378, #397, #404, #405, #422, #437, #441; docs/build-register.md Sections 2, 3, 7, 57 and 59; CLAUDE.md; no ADMIN_2FA_ENFORCED variable and no docs/admin-two-factor-recovery.md exist in the repository)</w:t>
+            </w:r>
+          </w:p>
+        </w:tc>
+        <w:tc>
+          <w:tcPr>
+            <w:tcW w:type="dxa" w:w="2300"/>
+          </w:tcPr>
+          <w:p>
+            <w:r>
+              <w:t>Resolved -- decided by the founder (2026-10-29 and 2026-10-30), except (e), which is a DEFAULT proposed by the drafter and VETO-ABLE. (a) and (b) are BUILT: PRs #537, #540 and #541 merged; PRs #538 and #539 closed without merging. (c), (d) and (e) are DECIDED, NOT BUILT; the platform is not live: no admin two-factor, no ADMIN_2FA_ENFORCED switch, no admin two-factor screens and no docs/admin-two-factor-recovery.md exist yet. REGISTER (docs/build-register.md, Section 60): two new rows, B-270 (admin two-factor: mandatory enrolment at next sign-in behind ADMIN_2FA_ENFORCED, peer-superadmin reset, last-superadmin database step; shares the TOTP backend of B-086) and B-271 (Admin Console two-factor screens; needs a Figma pass first, no admin frames exist; depends on B-270); status lines on B-086, B-087, B-111, B-180, B-247, B-248, B-250, B-267 and B-269; 271 B-IDs, 146 gap frames. (FORWARD-POINTER) A dated note is appended to #441 (Dependabot security updates are now ON). NOT DONE: the build brief for B-270 follows this docs PR; Decision Log numbers #293 and #294 are still absent from the table, as before. For counsel: nothing new; Part C row 44 stays open.</w:t>
             </w:r>
           </w:p>
         </w:tc>

</xml_diff>

<commit_message>
docs: record 2026-10-31 two-factor and key-rotation decisions (Decision Log #447, B-272)
Docs only. Adds Decision Log #447 (admin refresh gate, per-account code lock,
Redis outage point, DOB_ENCRYPTION_KEY rotation, backup-code timing), build
register row B-272 and Section 61, status lines on B-086/B-087/B-111/B-180/
B-252/B-267/B-270/B-271, forward-pointers on #446 and #425, and corrects stale
merge statuses in CLAUDE.md.

Co-Authored-By: Claude Sonnet 5.5 <noreply@anthropic.com>
</commit_message>
<xml_diff>
--- a/docs/Soccernity_MVP_Build_Plan_v1.7.docx
+++ b/docs/Soccernity_MVP_Build_Plan_v1.7.docx
@@ -28217,7 +28217,7 @@
           </w:tcPr>
           <w:p>
             <w:r>
-              <w:t>Decided 2026-10-27 (founder statement; build detail is an adopted default and veto-able). DECIDED, NOT BUILT. Found on origin/main 25c1b1b: the 32-byte rule exists in crypto/dob-crypto.ts (parseDobKey) but DobEncryptionService parses the key lazily on first use (if (!this.key) this.key = parseDobKey(...)), and assertProductionEnv (validate-runtime-env.ts) does not check it - so a missing or wrong-length key boots, and fails only on the first registration or login that touches a date of birth. Register: B-252 (W12, backend-api): add the check to assertProductionEnv with a test; B-086 and B-018 carry status lines. NOT decided: key rotation (the ciphertext carries a v1 prefix for it, no rotation procedure exists), and where the 2FA rollback note lives when B-086 is built. (FORWARD-POINTERS) None. NOT DONE: Decision Log numbers #293 and #294 are still absent from the table, as before.</w:t>
+              <w:t>Decided 2026-10-27 (founder statement; build detail is an adopted default and veto-able). DECIDED, NOT BUILT. Found on origin/main 25c1b1b: the 32-byte rule exists in crypto/dob-crypto.ts (parseDobKey) but DobEncryptionService parses the key lazily on first use (if (!this.key) this.key = parseDobKey(...)), and assertProductionEnv (validate-runtime-env.ts) does not check it - so a missing or wrong-length key boots, and fails only on the first registration or login that touches a date of birth. Register: B-252 (W12, backend-api): add the check to assertProductionEnv with a test; B-086 and B-018 carry status lines. NOT decided: key rotation (the ciphertext carries a v1 prefix for it, no rotation procedure exists), and where the 2FA rollback note lives when B-086 is built. (FORWARD-POINTERS) None. NOT DONE: Decision Log numbers #293 and #294 are still absent from the table, as before. [2026-10-31: The boot check is extended by PR #566 (key version and previous key) and a key-rotation procedure now exists (docs/dob-encryption-rollback.md; build-register row B-272); see Decision Log #447 (d). The 'NOT decided: key rotation' point in the Status above is superseded.]</w:t>
             </w:r>
           </w:p>
         </w:tc>
@@ -29123,7 +29123,49 @@
           </w:tcPr>
           <w:p>
             <w:r>
-              <w:t>Resolved -- decided by the founder (2026-10-29 and 2026-10-30), except (e), which is a DEFAULT proposed by the drafter and VETO-ABLE. (a) and (b) are BUILT: PRs #537, #540 and #541 merged; PRs #538 and #539 closed without merging. (c), (d) and (e) are DECIDED, NOT BUILT; the platform is not live: no admin two-factor, no ADMIN_2FA_ENFORCED switch, no admin two-factor screens and no docs/admin-two-factor-recovery.md exist yet. REGISTER (docs/build-register.md, Section 60): two new rows, B-270 (admin two-factor: mandatory enrolment at next sign-in behind ADMIN_2FA_ENFORCED, peer-superadmin reset, last-superadmin database step; shares the TOTP backend of B-086) and B-271 (Admin Console two-factor screens; needs a Figma pass first, no admin frames exist; depends on B-270); status lines on B-086, B-087, B-111, B-180, B-247, B-248, B-250, B-267 and B-269; 271 B-IDs, 146 gap frames. (FORWARD-POINTER) A dated note is appended to #441 (Dependabot security updates are now ON). NOT DONE: the build brief for B-270 follows this docs PR; Decision Log numbers #293 and #294 are still absent from the table, as before. For counsel: nothing new; Part C row 44 stays open.</w:t>
+              <w:t>Resolved -- decided by the founder (2026-10-29 and 2026-10-30), except (e), which is a DEFAULT proposed by the drafter and VETO-ABLE. (a) and (b) are BUILT: PRs #537, #540 and #541 merged; PRs #538 and #539 closed without merging. (c), (d) and (e) are DECIDED, NOT BUILT; the platform is not live: no admin two-factor, no ADMIN_2FA_ENFORCED switch, no admin two-factor screens and no docs/admin-two-factor-recovery.md exist yet. REGISTER (docs/build-register.md, Section 60): two new rows, B-270 (admin two-factor: mandatory enrolment at next sign-in behind ADMIN_2FA_ENFORCED, peer-superadmin reset, last-superadmin database step; shares the TOTP backend of B-086) and B-271 (Admin Console two-factor screens; needs a Figma pass first, no admin frames exist; depends on B-270); status lines on B-086, B-087, B-111, B-180, B-247, B-248, B-250, B-267 and B-269; 271 B-IDs, 146 gap frames. (FORWARD-POINTER) A dated note is appended to #441 (Dependabot security updates are now ON). NOT DONE: the build brief for B-270 follows this docs PR; Decision Log numbers #293 and #294 are still absent from the table, as before. For counsel: nothing new; Part C row 44 stays open. [2026-10-31: Its two-factor items (c) to (e) are now BUILT on the backend by PR #564 and PR #565 (the screens, B-271 and B-087, are not built), and its ADMIN_2FA_ENFORCED switch is gated at refresh by PR #565: with the switch on, an admin session without two-factor ends at its next refresh (Decision Log #447 (a)). The switch is still off by default until the admin screens exist.]</w:t>
+            </w:r>
+          </w:p>
+        </w:tc>
+      </w:tr>
+      <w:tr>
+        <w:tc>
+          <w:tcPr>
+            <w:tcW w:type="dxa" w:w="500"/>
+          </w:tcPr>
+          <w:p>
+            <w:r>
+              <w:t>447</w:t>
+            </w:r>
+          </w:p>
+        </w:tc>
+        <w:tc>
+          <w:tcPr>
+            <w:tcW w:type="dxa" w:w="4700"/>
+          </w:tcPr>
+          <w:p>
+            <w:r>
+              <w:t>Founder decisions 2026-10-31 on the two-factor and key-rotation work that followed #446 (build-register rows B-086, B-270, B-252 and the new B-272; the platform is not live). Items (a) and (b) are the founder's statements; (c) is an accepted point, not a new decision; (d) records a founder decision whose design is a DEFAULT and is VETO-ABLE; (e) is a build detail, recorded in one sentence. (a) ADMIN REFRESH GATE. With ADMIN_2FA_ENFORCED on, an admin session that exists without two-factor stops working at its next token refresh: the admin must sign in and enrol. Founder, 2026-10-31: "Yes, block at next refresh." BUILT by PR #565. Behaviour as merged: POST /admin/auth/refresh answers 401 with the code admin_two_factor_enrolment_required and ends all of that admin's sessions; the check runs after the refresh token has been validated and consumed (a bad or replayed token is the ordinary 401 and touches no account). Accepted, not fixed: access tokens already issued stay valid until they expire (15 minutes by default); there is no per-request database check. (b) THE TWO-FACTOR CODE LOCK STAYS PER ACCOUNT (#404): 5 wrong codes in 15 minutes lock code entry for that account for 15 minutes. The founder was offered a per-account-and-IP model with a daily ceiling and chose to keep per-account. Consequence, stated plainly: someone who already knows a password can keep the real owner's code entry locked for 15 minutes at a time. BUILT as such by PR #564. (c) REDIS OUTAGE AND THE CODE LOCK: no change. Every code check (the sign-in challenge and enrolment confirmation) already needs Redis for its challenge token or pending secret, so no code can be checked without the lock; this is the behaviour already accepted in #439. Recorded as an accepted point, not a new decision. (d) DOB_ENCRYPTION_KEY ROTATION gets its own PR before the launch gate (founder, 2026-10-31). BUILT by PR #566, with a design that is a DEFAULT and VETO-ABLE: two keys are live during a rotation; stored values keep the v&lt;N&gt;:&lt;iv&gt;:&lt;tag&gt;:&lt;ciphertext&gt; layout and the number says which key made the value; new settings DOB_ENCRYPTION_KEY_VERSION (default 1) and DOB_ENCRYPTION_KEY_PREVIOUS (optional); a re-encrypt script, rotate-dob-encryption-key.js, with a dry run and a verification pass; the boot check of #425 (B-252) is extended; one script rotates dates of birth and both two-factor secrets together; there is no automatic undo (a rollback is another rotation). It also fixed a hazard: the pre-deploy backfill would have encrypted rotated values a second time. It was not exercised against a real Render or Neon account (none exists). (e) BUILD DETAIL, not a decision: the backup-code check now runs exactly 10 hash verifications per attempt whatever the number of unused codes, so timing no longer shows how many codes are left (PR #565).</w:t>
+            </w:r>
+          </w:p>
+        </w:tc>
+        <w:tc>
+          <w:tcPr>
+            <w:tcW w:type="dxa" w:w="1850"/>
+          </w:tcPr>
+          <w:p>
+            <w:r>
+              <w:t>docs/decisions-2fa-followups-key-rotation-2026-10-31 (docs only, 2026-10-31; founder statements 2026-10-31; sources: gh pr view of PRs #564, #565 and #566 (merge states and times), services/api/src/modules/admin/admin-auth.service.ts, services/api/src/modules/two-factor/two-factor.service.ts and two-factor.constants.ts, services/api/src/validate-runtime-env.ts, services/api/src/crypto/dob-crypto.ts, services/api/src/scripts/rotate-dob-encryption-key.ts, docs/dob-encryption-rollback.md, docs/admin-two-factor-recovery.md, Decision Log #404, #405, #425, #439, #446; docs/build-register.md Sections 2 and 60; CLAUDE.md)</w:t>
+            </w:r>
+          </w:p>
+        </w:tc>
+        <w:tc>
+          <w:tcPr>
+            <w:tcW w:type="dxa" w:w="2300"/>
+          </w:tcPr>
+          <w:p>
+            <w:r>
+              <w:t>Resolved -- decided by the founder (2026-10-31), except that the design in (d) is a DEFAULT and VETO-ABLE. BUILT: (a) by PR #565 (merged 2026-10-31 10:18 UTC), (b) as part of PR #564 (merged 2026-10-31 08:57 UTC), (d) by PR #566 (merged 2026-10-31 10:35 UTC), (e) by PR #565. (c) is an accepted point, no change. Not exercised against a real Render or Neon account: the rotation was run only on test databases. REGISTER (docs/build-register.md, Section 61): new row B-272 (DOB_ENCRYPTION_KEY rotation, BUILT by PR #566); status lines on B-086, B-270, B-271, B-087, B-111, B-252, B-180 and B-267 (new item (k): rehearse one full key rotation on staging before launch, a DEFAULT, veto-able). 272 B-IDs, 146 gap frames. (FORWARD-POINTERS) Dated notes are appended to #446 and #425. For counsel: nothing new; Part C row 44 stays open. NOT DONE: Decision Log numbers #293 and #294 are still absent from the table, as before.</w:t>
             </w:r>
           </w:p>
         </w:tc>

</xml_diff>